<commit_message>
Deploying to gh-pages from @ d-morrison/wai@581dae1e2dc029022164176d6d0dc845a2b0db3a 🚀
</commit_message>
<xml_diff>
--- a/chapters/coding-agents.docx
+++ b/chapters/coding-agents.docx
@@ -15,7 +15,7 @@
         <w:pStyle w:val="Date"/>
       </w:pPr>
       <w:r>
-        <w:t xml:space="preserve">Last modified: 2026-07-29 12:53:55 (PDT)</w:t>
+        <w:t xml:space="preserve">Last modified: 2026-07-29 19:02:52 (PDT)</w:t>
       </w:r>
     </w:p>
     <w:p>
@@ -30083,26 +30083,1797 @@
     </w:p>
     <w:bookmarkEnd w:id="250"/>
     <w:bookmarkEnd w:id="251"/>
-    <w:bookmarkStart w:id="275" w:name="references"/>
+    <w:bookmarkStart w:id="261" w:name="sec-ai-mcp-server-setup"/>
     <w:p>
       <w:pPr>
         <w:pStyle w:val="Heading1"/>
       </w:pPr>
       <w:r>
-        <w:t xml:space="preserve">References</w:t>
-      </w:r>
-    </w:p>
-    <w:bookmarkStart w:id="274" w:name="refs"/>
-    <w:bookmarkStart w:id="253" w:name="ref-space_odyssey"/>
-    <w:p>
-      <w:pPr>
-        <w:pStyle w:val="Bibliography"/>
-      </w:pPr>
+        <w:t xml:space="preserve">29. Setting up MCP servers</w:t>
+      </w:r>
+    </w:p>
+    <w:p>
+      <w:pPr>
+        <w:pStyle w:val="FirstParagraph"/>
+      </w:pPr>
+      <w:r>
+        <w:t xml:space="preserve">The</w:t>
+      </w:r>
+      <w:r>
+        <w:t xml:space="preserve"> </w:t>
+      </w:r>
+      <w:hyperlink r:id="rId26">
+        <w:r>
+          <w:rPr>
+            <w:rStyle w:val="Hyperlink"/>
+          </w:rPr>
+          <w:t xml:space="preserve">Model Context Protocol</w:t>
+        </w:r>
+      </w:hyperlink>
+      <w:r>
+        <w:t xml:space="preserve"> </w:t>
+      </w:r>
+      <w:r>
+        <w:t xml:space="preserve">(MCP)</w:t>
+      </w:r>
+      <w:r>
+        <w:t xml:space="preserve"> </w:t>
+      </w:r>
+      <w:r>
+        <w:t xml:space="preserve">is how a harness gains typed access to external systems.</w:t>
+      </w:r>
+      <w:r>
+        <w:t xml:space="preserve"> </w:t>
+      </w:r>
+      <w:r>
+        <w:t xml:space="preserve">Configuring a server is usually a one-line command.</w:t>
+      </w:r>
+      <w:r>
+        <w:t xml:space="preserve"> </w:t>
+      </w:r>
+      <w:r>
+        <w:t xml:space="preserve">Diagnosing one that</w:t>
+      </w:r>
+      <w:r>
+        <w:t xml:space="preserve"> </w:t>
+      </w:r>
       <w:r>
         <w:rPr>
           <w:i/>
           <w:iCs/>
         </w:rPr>
+        <w:t xml:space="preserve">silently</w:t>
+      </w:r>
+      <w:r>
+        <w:t xml:space="preserve"> </w:t>
+      </w:r>
+      <w:r>
+        <w:t xml:space="preserve">isn’t working is the part worth writing down,</w:t>
+      </w:r>
+      <w:r>
+        <w:t xml:space="preserve"> </w:t>
+      </w:r>
+      <w:r>
+        <w:t xml:space="preserve">because the common failure mode produces no error at all —</w:t>
+      </w:r>
+      <w:r>
+        <w:t xml:space="preserve"> </w:t>
+      </w:r>
+      <w:r>
+        <w:t xml:space="preserve">only a quiet absence of tools you assumed were there.</w:t>
+      </w:r>
+    </w:p>
+    <w:tbl>
+      <w:tblPr>
+        <w:tblStyle w:val="Table"/>
+        <w:tblLook w:firstRow="0" w:lastRow="0" w:firstColumn="0" w:lastColumn="0" w:noHBand="0" w:noVBand="0" w:val="0000"/>
+        <w:tblBorders>
+          <w:top w:val="single" w:sz="4" w:space="0" w:color="0758E5"/>
+          <w:left w:val="single" w:sz="24" w:space="0" w:color="0758E5"/>
+          <w:bottom w:val="single" w:sz="4" w:space="0" w:color="0758E5"/>
+          <w:right w:val="single" w:sz="4" w:space="0" w:color="0758E5"/>
+        </w:tblBorders>
+        <w:tblCellMar>
+          <w:left w:w="144" w:type="dxa"/>
+          <w:right w:w="144" w:type="dxa"/>
+        </w:tblCellMar>
+        <w:tblLook w:firstRow="0" w:lastRow="0" w:firstColumn="0" w:lastColumn="0" w:noHBand="0" w:noVBand="0" w:val="0000"/>
+      </w:tblPr>
+      <w:tr>
+        <w:trPr>
+          <w:cantSplit/>
+        </w:trPr>
+        <w:tc>
+          <w:tcPr>
+            <w:shd w:color="auto" w:fill="dae6fb" w:val="clear"/>
+            <w:tcMar>
+              <w:top w:w="92" w:type="dxa"/>
+              <w:bottom w:w="92" w:type="dxa"/>
+            </w:tcMar>
+          </w:tcPr>
+          <w:p>
+            <w:pPr>
+              <w:pStyle w:val="BodyText"/>
+            </w:pPr>
+            <w:pPr>
+              <w:spacing w:before="0" w:after="0"/>
+              <w:textAlignment w:val="center"/>
+            </w:pPr>
+            <w:r>
+              <w:drawing>
+                <wp:inline>
+                  <wp:extent cx="152400" cy="152400"/>
+                  <wp:effectExtent b="0" l="0" r="0" t="0"/>
+                  <wp:docPr descr="" title="" id="252" name="Picture"/>
+                  <a:graphic>
+                    <a:graphicData uri="http://schemas.openxmlformats.org/drawingml/2006/picture">
+                      <pic:pic>
+                        <pic:nvPicPr>
+                          <pic:cNvPr descr="/opt/quarto/share/formats/docx/note.png" id="253" name="Picture"/>
+                          <pic:cNvPicPr>
+                            <a:picLocks noChangeArrowheads="1" noChangeAspect="1"/>
+                          </pic:cNvPicPr>
+                        </pic:nvPicPr>
+                        <pic:blipFill>
+                          <a:blip r:embed="rId117"/>
+                          <a:stretch>
+                            <a:fillRect/>
+                          </a:stretch>
+                        </pic:blipFill>
+                        <pic:spPr bwMode="auto">
+                          <a:xfrm>
+                            <a:off x="0" y="0"/>
+                            <a:ext cx="152400" cy="152400"/>
+                          </a:xfrm>
+                          <a:prstGeom prst="rect">
+                            <a:avLst/>
+                          </a:prstGeom>
+                          <a:noFill/>
+                          <a:ln w="9525">
+                            <a:noFill/>
+                            <a:headEnd/>
+                            <a:tailEnd/>
+                          </a:ln>
+                        </pic:spPr>
+                      </pic:pic>
+                    </a:graphicData>
+                  </a:graphic>
+                </wp:inline>
+              </w:drawing>
+            </w:r>
+            <w:r>
+              <w:t xml:space="preserve"> </w:t>
+            </w:r>
+            <w:r>
+              <w:t xml:space="preserve"> </w:t>
+            </w:r>
+            <w:r>
+              <w:t xml:space="preserve">Note</w:t>
+            </w:r>
+          </w:p>
+        </w:tc>
+      </w:tr>
+      <w:tr>
+        <w:trPr>
+          <w:cantSplit/>
+        </w:trPr>
+        <w:tc>
+          <w:tcPr>
+            <w:tcMar>
+              <w:top w:w="108" w:type="dxa"/>
+              <w:bottom w:w="108" w:type="dxa"/>
+            </w:tcMar>
+          </w:tcPr>
+          <w:p>
+            <w:pPr>
+              <w:pStyle w:val="BodyText"/>
+            </w:pPr>
+            <w:pPr>
+              <w:spacing w:before="16" w:after="16"/>
+            </w:pPr>
+            <w:r>
+              <w:t xml:space="preserve">These notes were written in July 2026,</w:t>
+            </w:r>
+            <w:r>
+              <w:t xml:space="preserve"> </w:t>
+            </w:r>
+            <w:r>
+              <w:t xml:space="preserve">from a real diagnosis on a Linux machine.</w:t>
+            </w:r>
+            <w:r>
+              <w:t xml:space="preserve"> </w:t>
+            </w:r>
+            <w:r>
+              <w:t xml:space="preserve">As with the rest of this chapter,</w:t>
+            </w:r>
+            <w:r>
+              <w:t xml:space="preserve"> </w:t>
+            </w:r>
+            <w:r>
+              <w:t xml:space="preserve">treat the specifics with caution —</w:t>
+            </w:r>
+            <w:r>
+              <w:t xml:space="preserve"> </w:t>
+            </w:r>
+            <w:r>
+              <w:t xml:space="preserve">harness internals and vendor defaults change quickly.</w:t>
+            </w:r>
+          </w:p>
+          <w:p/>
+        </w:tc>
+      </w:tr>
+    </w:tbl>
+    <w:bookmarkStart w:id="255" w:name="installed-is-not-registered"/>
+    <w:p>
+      <w:pPr>
+        <w:pStyle w:val="Heading4"/>
+      </w:pPr>
+      <w:r>
+        <w:t xml:space="preserve">Installed is not registered</w:t>
+      </w:r>
+    </w:p>
+    <w:p>
+      <w:pPr>
+        <w:pStyle w:val="FirstParagraph"/>
+      </w:pPr>
+      <w:r>
+        <w:t xml:space="preserve">A server binary sitting on disk is not available to your agent.</w:t>
+      </w:r>
+      <w:r>
+        <w:t xml:space="preserve"> </w:t>
+      </w:r>
+      <w:r>
+        <w:t xml:space="preserve">The harness knows only what its configuration declares,</w:t>
+      </w:r>
+      <w:r>
+        <w:t xml:space="preserve"> </w:t>
+      </w:r>
+      <w:r>
+        <w:t xml:space="preserve">so installing</w:t>
+      </w:r>
+      <w:r>
+        <w:t xml:space="preserve"> </w:t>
+      </w:r>
+      <w:hyperlink r:id="rId254">
+        <w:r>
+          <w:rPr>
+            <w:rStyle w:val="VerbatimChar"/>
+          </w:rPr>
+          <w:t xml:space="preserve">github-mcp-server</w:t>
+        </w:r>
+      </w:hyperlink>
+      <w:r>
+        <w:t xml:space="preserve"> </w:t>
+      </w:r>
+      <w:r>
+        <w:t xml:space="preserve">and</w:t>
+      </w:r>
+      <w:r>
+        <w:t xml:space="preserve"> </w:t>
+      </w:r>
+      <w:r>
+        <w:rPr>
+          <w:i/>
+          <w:iCs/>
+        </w:rPr>
+        <w:t xml:space="preserve">registering</w:t>
+      </w:r>
+      <w:r>
+        <w:t xml:space="preserve"> </w:t>
+      </w:r>
+      <w:r>
+        <w:t xml:space="preserve">it are two separate acts.</w:t>
+      </w:r>
+      <w:r>
+        <w:t xml:space="preserve"> </w:t>
+      </w:r>
+      <w:r>
+        <w:t xml:space="preserve">Skipping the second is easy to miss,</w:t>
+      </w:r>
+      <w:r>
+        <w:t xml:space="preserve"> </w:t>
+      </w:r>
+      <w:r>
+        <w:t xml:space="preserve">because the first one felt like the hard part.</w:t>
+      </w:r>
+    </w:p>
+    <w:p>
+      <w:pPr>
+        <w:pStyle w:val="BodyText"/>
+      </w:pPr>
+      <w:r>
+        <w:t xml:space="preserve">The check is one command:</w:t>
+      </w:r>
+    </w:p>
+    <w:p>
+      <w:pPr>
+        <w:pStyle w:val="SourceCode"/>
+      </w:pPr>
+      <w:r>
+        <w:rPr>
+          <w:rStyle w:val="ExtensionTok"/>
+        </w:rPr>
+        <w:t xml:space="preserve">claude</w:t>
+      </w:r>
+      <w:r>
+        <w:rPr>
+          <w:rStyle w:val="NormalTok"/>
+        </w:rPr>
+        <w:t xml:space="preserve"> mcp list</w:t>
+      </w:r>
+    </w:p>
+    <w:bookmarkEnd w:id="255"/>
+    <w:bookmarkStart w:id="256" w:name="Xf6682145328c756d2e167d2c91be34f7f913a7f"/>
+    <w:p>
+      <w:pPr>
+        <w:pStyle w:val="Heading4"/>
+      </w:pPr>
+      <w:r>
+        <w:t xml:space="preserve">A broken server can occupy the name your working one wanted</w:t>
+      </w:r>
+    </w:p>
+    <w:p>
+      <w:pPr>
+        <w:pStyle w:val="FirstParagraph"/>
+      </w:pPr>
+      <w:r>
+        <w:t xml:space="preserve">This is the failure worth knowing about,</w:t>
+      </w:r>
+      <w:r>
+        <w:t xml:space="preserve"> </w:t>
+      </w:r>
+      <w:r>
+        <w:t xml:space="preserve">and it is nastier than a missing entry,</w:t>
+      </w:r>
+      <w:r>
+        <w:t xml:space="preserve"> </w:t>
+      </w:r>
+      <w:r>
+        <w:t xml:space="preserve">because</w:t>
+      </w:r>
+      <w:r>
+        <w:t xml:space="preserve"> </w:t>
+      </w:r>
+      <w:r>
+        <w:rPr>
+          <w:rStyle w:val="VerbatimChar"/>
+        </w:rPr>
+        <w:t xml:space="preserve">claude mcp list</w:t>
+      </w:r>
+      <w:r>
+        <w:t xml:space="preserve"> </w:t>
+      </w:r>
+      <w:r>
+        <w:t xml:space="preserve">shows you something that looks right.</w:t>
+      </w:r>
+    </w:p>
+    <w:p>
+      <w:pPr>
+        <w:pStyle w:val="BodyText"/>
+      </w:pPr>
+      <w:r>
+        <w:t xml:space="preserve">Plugin marketplaces can register servers of their own.</w:t>
+      </w:r>
+      <w:r>
+        <w:t xml:space="preserve"> </w:t>
+      </w:r>
+      <w:r>
+        <w:t xml:space="preserve">An official GitHub plugin may install a</w:t>
+      </w:r>
+      <w:r>
+        <w:t xml:space="preserve"> </w:t>
+      </w:r>
+      <w:r>
+        <w:rPr>
+          <w:b/>
+          <w:bCs/>
+        </w:rPr>
+        <w:t xml:space="preserve">remote</w:t>
+      </w:r>
+      <w:r>
+        <w:t xml:space="preserve"> </w:t>
+      </w:r>
+      <w:r>
+        <w:t xml:space="preserve">server</w:t>
+      </w:r>
+      <w:r>
+        <w:t xml:space="preserve"> </w:t>
+      </w:r>
+      <w:r>
+        <w:t xml:space="preserve">under exactly the name you meant to give your</w:t>
+      </w:r>
+      <w:r>
+        <w:t xml:space="preserve"> </w:t>
+      </w:r>
+      <w:r>
+        <w:rPr>
+          <w:b/>
+          <w:bCs/>
+        </w:rPr>
+        <w:t xml:space="preserve">local</w:t>
+      </w:r>
+      <w:r>
+        <w:t xml:space="preserve"> </w:t>
+      </w:r>
+      <w:r>
+        <w:t xml:space="preserve">one.</w:t>
+      </w:r>
+      <w:r>
+        <w:t xml:space="preserve"> </w:t>
+      </w:r>
+      <w:r>
+        <w:t xml:space="preserve">The listing then reports a</w:t>
+      </w:r>
+      <w:r>
+        <w:t xml:space="preserve"> </w:t>
+      </w:r>
+      <w:r>
+        <w:rPr>
+          <w:rStyle w:val="VerbatimChar"/>
+        </w:rPr>
+        <w:t xml:space="preserve">github</w:t>
+      </w:r>
+      <w:r>
+        <w:t xml:space="preserve"> </w:t>
+      </w:r>
+      <w:r>
+        <w:t xml:space="preserve">server that is not your setup at all,</w:t>
+      </w:r>
+      <w:r>
+        <w:t xml:space="preserve"> </w:t>
+      </w:r>
+      <w:r>
+        <w:t xml:space="preserve">and the local binary you installed goes unregistered and unnoticed.</w:t>
+      </w:r>
+    </w:p>
+    <w:p>
+      <w:pPr>
+        <w:pStyle w:val="BodyText"/>
+      </w:pPr>
+      <w:r>
+        <w:t xml:space="preserve">So read the listing for the</w:t>
+      </w:r>
+      <w:r>
+        <w:t xml:space="preserve"> </w:t>
+      </w:r>
+      <w:r>
+        <w:rPr>
+          <w:i/>
+          <w:iCs/>
+        </w:rPr>
+        <w:t xml:space="preserve">transport and address</w:t>
+      </w:r>
+      <w:r>
+        <w:t xml:space="preserve">,</w:t>
+      </w:r>
+      <w:r>
+        <w:t xml:space="preserve"> </w:t>
+      </w:r>
+      <w:r>
+        <w:t xml:space="preserve">not just the name:</w:t>
+      </w:r>
+    </w:p>
+    <w:p>
+      <w:pPr>
+        <w:pStyle w:val="SourceCode"/>
+      </w:pPr>
+      <w:r>
+        <w:rPr>
+          <w:rStyle w:val="VerbatimChar"/>
+        </w:rPr>
+        <w:t xml:space="preserve">plugin:github:github: https://api.githubcopilot.com/mcp/ (HTTP) - X Failed to</w:t>
+      </w:r>
+      <w:r>
+        <w:br/>
+      </w:r>
+      <w:r>
+        <w:rPr>
+          <w:rStyle w:val="VerbatimChar"/>
+        </w:rPr>
+        <w:t xml:space="preserve">connect - HTTP 400: ... Authorization header is badly formatted</w:t>
+      </w:r>
+    </w:p>
+    <w:p>
+      <w:pPr>
+        <w:pStyle w:val="FirstParagraph"/>
+      </w:pPr>
+      <w:r>
+        <w:t xml:space="preserve">An</w:t>
+      </w:r>
+      <w:r>
+        <w:t xml:space="preserve"> </w:t>
+      </w:r>
+      <w:r>
+        <w:rPr>
+          <w:rStyle w:val="VerbatimChar"/>
+        </w:rPr>
+        <w:t xml:space="preserve">(HTTP)</w:t>
+      </w:r>
+      <w:r>
+        <w:t xml:space="preserve"> </w:t>
+      </w:r>
+      <w:r>
+        <w:t xml:space="preserve">entry pointing at a vendor URL is a remote server.</w:t>
+      </w:r>
+      <w:r>
+        <w:t xml:space="preserve"> </w:t>
+      </w:r>
+      <w:r>
+        <w:t xml:space="preserve">A local one shows a command path instead.</w:t>
+      </w:r>
+    </w:p>
+    <w:bookmarkEnd w:id="256"/>
+    <w:bookmarkStart w:id="257" w:name="and-401-mean-different-things"/>
+    <w:p>
+      <w:pPr>
+        <w:pStyle w:val="Heading4"/>
+      </w:pPr>
+      <w:r>
+        <w:t xml:space="preserve">400 and 401 mean different things</w:t>
+      </w:r>
+    </w:p>
+    <w:p>
+      <w:pPr>
+        <w:pStyle w:val="FirstParagraph"/>
+      </w:pPr>
+      <w:r>
+        <w:t xml:space="preserve">The status code is the whole diagnosis here,</w:t>
+      </w:r>
+      <w:r>
+        <w:t xml:space="preserve"> </w:t>
+      </w:r>
+      <w:r>
+        <w:t xml:space="preserve">and it is easy to skim past.</w:t>
+      </w:r>
+    </w:p>
+    <w:p>
+      <w:pPr>
+        <w:pStyle w:val="BodyText"/>
+      </w:pPr>
+      <w:r>
+        <w:t xml:space="preserve">The configuration a plugin ships may hardcode a credential placeholder:</w:t>
+      </w:r>
+    </w:p>
+    <w:p>
+      <w:pPr>
+        <w:pStyle w:val="SourceCode"/>
+      </w:pPr>
+      <w:r>
+        <w:rPr>
+          <w:rStyle w:val="FunctionTok"/>
+        </w:rPr>
+        <w:t xml:space="preserve">{</w:t>
+      </w:r>
+      <w:r>
+        <w:rPr>
+          <w:rStyle w:val="DataTypeTok"/>
+        </w:rPr>
+        <w:t xml:space="preserve">"headers"</w:t>
+      </w:r>
+      <w:r>
+        <w:rPr>
+          <w:rStyle w:val="FunctionTok"/>
+        </w:rPr>
+        <w:t xml:space="preserve">:</w:t>
+      </w:r>
+      <w:r>
+        <w:rPr>
+          <w:rStyle w:val="NormalTok"/>
+        </w:rPr>
+        <w:t xml:space="preserve"> </w:t>
+      </w:r>
+      <w:r>
+        <w:rPr>
+          <w:rStyle w:val="FunctionTok"/>
+        </w:rPr>
+        <w:t xml:space="preserve">{</w:t>
+      </w:r>
+      <w:r>
+        <w:rPr>
+          <w:rStyle w:val="DataTypeTok"/>
+        </w:rPr>
+        <w:t xml:space="preserve">"Authorization"</w:t>
+      </w:r>
+      <w:r>
+        <w:rPr>
+          <w:rStyle w:val="FunctionTok"/>
+        </w:rPr>
+        <w:t xml:space="preserve">:</w:t>
+      </w:r>
+      <w:r>
+        <w:rPr>
+          <w:rStyle w:val="NormalTok"/>
+        </w:rPr>
+        <w:t xml:space="preserve"> </w:t>
+      </w:r>
+      <w:r>
+        <w:rPr>
+          <w:rStyle w:val="StringTok"/>
+        </w:rPr>
+        <w:t xml:space="preserve">"Bearer ${GITHUB_PERSONAL_ACCESS_TOKEN}"</w:t>
+      </w:r>
+      <w:r>
+        <w:rPr>
+          <w:rStyle w:val="FunctionTok"/>
+        </w:rPr>
+        <w:t xml:space="preserve">}}</w:t>
+      </w:r>
+    </w:p>
+    <w:p>
+      <w:pPr>
+        <w:pStyle w:val="FirstParagraph"/>
+      </w:pPr>
+      <w:r>
+        <w:t xml:space="preserve">If that variable has no value when the harness starts,</w:t>
+      </w:r>
+      <w:r>
+        <w:t xml:space="preserve"> </w:t>
+      </w:r>
+      <w:r>
+        <w:t xml:space="preserve">the header goes out as a bare</w:t>
+      </w:r>
+      <w:r>
+        <w:t xml:space="preserve"> </w:t>
+      </w:r>
+      <w:r>
+        <w:rPr>
+          <w:rStyle w:val="VerbatimChar"/>
+        </w:rPr>
+        <w:t xml:space="preserve">Bearer</w:t>
+      </w:r>
+      <w:r>
+        <w:t xml:space="preserve"> </w:t>
+      </w:r>
+      <w:r>
+        <w:t xml:space="preserve">with nothing after it.</w:t>
+      </w:r>
+      <w:r>
+        <w:t xml:space="preserve"> </w:t>
+      </w:r>
+      <w:r>
+        <w:t xml:space="preserve">That is</w:t>
+      </w:r>
+      <w:r>
+        <w:t xml:space="preserve"> </w:t>
+      </w:r>
+      <w:r>
+        <w:rPr>
+          <w:b/>
+          <w:bCs/>
+        </w:rPr>
+        <w:t xml:space="preserve">malformed</w:t>
+      </w:r>
+      <w:r>
+        <w:t xml:space="preserve">, not</w:t>
+      </w:r>
+      <w:r>
+        <w:t xml:space="preserve"> </w:t>
+      </w:r>
+      <w:r>
+        <w:rPr>
+          <w:b/>
+          <w:bCs/>
+        </w:rPr>
+        <w:t xml:space="preserve">unauthorized</w:t>
+      </w:r>
+      <w:r>
+        <w:t xml:space="preserve">:</w:t>
+      </w:r>
+    </w:p>
+    <w:p>
+      <w:pPr>
+        <w:pStyle w:val="Compact"/>
+        <w:numPr>
+          <w:ilvl w:val="0"/>
+          <w:numId w:val="1126"/>
+        </w:numPr>
+      </w:pPr>
+      <w:r>
+        <w:rPr>
+          <w:b/>
+          <w:bCs/>
+        </w:rPr>
+        <w:t xml:space="preserve">401</w:t>
+      </w:r>
+      <w:r>
+        <w:t xml:space="preserve"> </w:t>
+      </w:r>
+      <w:r>
+        <w:t xml:space="preserve">means the server read your token and rejected it —</w:t>
+      </w:r>
+      <w:r>
+        <w:t xml:space="preserve"> </w:t>
+      </w:r>
+      <w:r>
+        <w:t xml:space="preserve">a real credential problem: expired, wrong scopes, wrong account.</w:t>
+      </w:r>
+    </w:p>
+    <w:p>
+      <w:pPr>
+        <w:pStyle w:val="Compact"/>
+        <w:numPr>
+          <w:ilvl w:val="0"/>
+          <w:numId w:val="1126"/>
+        </w:numPr>
+      </w:pPr>
+      <w:r>
+        <w:rPr>
+          <w:b/>
+          <w:bCs/>
+        </w:rPr>
+        <w:t xml:space="preserve">400</w:t>
+      </w:r>
+      <w:r>
+        <w:t xml:space="preserve"> </w:t>
+      </w:r>
+      <w:r>
+        <w:t xml:space="preserve">means no token was ever substituted —</w:t>
+      </w:r>
+      <w:r>
+        <w:t xml:space="preserve"> </w:t>
+      </w:r>
+      <w:r>
+        <w:t xml:space="preserve">a</w:t>
+      </w:r>
+      <w:r>
+        <w:t xml:space="preserve"> </w:t>
+      </w:r>
+      <w:r>
+        <w:rPr>
+          <w:i/>
+          <w:iCs/>
+        </w:rPr>
+        <w:t xml:space="preserve">configuration</w:t>
+      </w:r>
+      <w:r>
+        <w:t xml:space="preserve"> </w:t>
+      </w:r>
+      <w:r>
+        <w:t xml:space="preserve">problem, and no amount of re-issuing tokens will fix it.</w:t>
+      </w:r>
+    </w:p>
+    <w:p>
+      <w:pPr>
+        <w:pStyle w:val="FirstParagraph"/>
+      </w:pPr>
+      <w:r>
+        <w:t xml:space="preserve">Chasing a 400 as though it were a 401</w:t>
+      </w:r>
+      <w:r>
+        <w:t xml:space="preserve"> </w:t>
+      </w:r>
+      <w:r>
+        <w:t xml:space="preserve">sends you to the token-minting page for a problem that lives in a config file.</w:t>
+      </w:r>
+    </w:p>
+    <w:bookmarkEnd w:id="257"/>
+    <w:bookmarkStart w:id="258" w:name="X2adb24e9b1a0644f0fbebe685525dadd8a56387"/>
+    <w:p>
+      <w:pPr>
+        <w:pStyle w:val="Heading4"/>
+      </w:pPr>
+      <w:r>
+        <w:t xml:space="preserve">Supply credentials without storing a token</w:t>
+      </w:r>
+    </w:p>
+    <w:p>
+      <w:pPr>
+        <w:pStyle w:val="FirstParagraph"/>
+      </w:pPr>
+      <w:r>
+        <w:t xml:space="preserve">The obvious registration bakes a token straight into harness config:</w:t>
+      </w:r>
+    </w:p>
+    <w:p>
+      <w:pPr>
+        <w:pStyle w:val="SourceCode"/>
+      </w:pPr>
+      <w:r>
+        <w:rPr>
+          <w:rStyle w:val="ExtensionTok"/>
+        </w:rPr>
+        <w:t xml:space="preserve">claude</w:t>
+      </w:r>
+      <w:r>
+        <w:rPr>
+          <w:rStyle w:val="NormalTok"/>
+        </w:rPr>
+        <w:t xml:space="preserve"> mcp add github </w:t>
+      </w:r>
+      <w:r>
+        <w:rPr>
+          <w:rStyle w:val="AttributeTok"/>
+        </w:rPr>
+        <w:t xml:space="preserve">-e</w:t>
+      </w:r>
+      <w:r>
+        <w:rPr>
+          <w:rStyle w:val="NormalTok"/>
+        </w:rPr>
+        <w:t xml:space="preserve"> GITHUB_PERSONAL_ACCESS_TOKEN=</w:t>
+      </w:r>
+      <w:r>
+        <w:rPr>
+          <w:rStyle w:val="OperatorTok"/>
+        </w:rPr>
+        <w:t xml:space="preserve">&lt;</w:t>
+      </w:r>
+      <w:r>
+        <w:rPr>
+          <w:rStyle w:val="NormalTok"/>
+        </w:rPr>
+        <w:t xml:space="preserve">pat</w:t>
+      </w:r>
+      <w:r>
+        <w:rPr>
+          <w:rStyle w:val="OperatorTok"/>
+        </w:rPr>
+        <w:t xml:space="preserve">&gt;</w:t>
+      </w:r>
+      <w:r>
+        <w:rPr>
+          <w:rStyle w:val="NormalTok"/>
+        </w:rPr>
+        <w:t xml:space="preserve"> -- </w:t>
+      </w:r>
+      <w:r>
+        <w:rPr>
+          <w:rStyle w:val="OperatorTok"/>
+        </w:rPr>
+        <w:t xml:space="preserve">&lt;</w:t>
+      </w:r>
+      <w:r>
+        <w:rPr>
+          <w:rStyle w:val="NormalTok"/>
+        </w:rPr>
+        <w:t xml:space="preserve">server</w:t>
+      </w:r>
+      <w:r>
+        <w:rPr>
+          <w:rStyle w:val="OperatorTok"/>
+        </w:rPr>
+        <w:t xml:space="preserve">&gt;</w:t>
+      </w:r>
+      <w:r>
+        <w:rPr>
+          <w:rStyle w:val="NormalTok"/>
+        </w:rPr>
+        <w:t xml:space="preserve"> stdio</w:t>
+      </w:r>
+    </w:p>
+    <w:p>
+      <w:pPr>
+        <w:pStyle w:val="FirstParagraph"/>
+      </w:pPr>
+      <w:r>
+        <w:t xml:space="preserve">That writes a live credential to a config file in plain text,</w:t>
+      </w:r>
+      <w:r>
+        <w:t xml:space="preserve"> </w:t>
+      </w:r>
+      <w:r>
+        <w:t xml:space="preserve">and pins you to one token that will eventually expire.</w:t>
+      </w:r>
+    </w:p>
+    <w:p>
+      <w:pPr>
+        <w:pStyle w:val="BodyText"/>
+      </w:pPr>
+      <w:r>
+        <w:t xml:space="preserve">A launch wrapper avoids both.</w:t>
+      </w:r>
+      <w:r>
+        <w:t xml:space="preserve"> </w:t>
+      </w:r>
+      <w:r>
+        <w:t xml:space="preserve">It reads the credential at start time from a tool that already holds one,</w:t>
+      </w:r>
+      <w:r>
+        <w:t xml:space="preserve"> </w:t>
+      </w:r>
+      <w:r>
+        <w:t xml:space="preserve">so nothing is stored</w:t>
+      </w:r>
+      <w:r>
+        <w:t xml:space="preserve"> </w:t>
+      </w:r>
+      <w:r>
+        <w:t xml:space="preserve">and the server follows whatever account you are currently logged in as:</w:t>
+      </w:r>
+    </w:p>
+    <w:p>
+      <w:pPr>
+        <w:pStyle w:val="SourceCode"/>
+      </w:pPr>
+      <w:r>
+        <w:rPr>
+          <w:rStyle w:val="CommentTok"/>
+        </w:rPr>
+        <w:t xml:space="preserve">#!/bin/sh</w:t>
+      </w:r>
+      <w:r>
+        <w:br/>
+      </w:r>
+      <w:r>
+        <w:rPr>
+          <w:rStyle w:val="BuiltInTok"/>
+        </w:rPr>
+        <w:t xml:space="preserve">set</w:t>
+      </w:r>
+      <w:r>
+        <w:rPr>
+          <w:rStyle w:val="NormalTok"/>
+        </w:rPr>
+        <w:t xml:space="preserve"> </w:t>
+      </w:r>
+      <w:r>
+        <w:rPr>
+          <w:rStyle w:val="AttributeTok"/>
+        </w:rPr>
+        <w:t xml:space="preserve">-eu</w:t>
+      </w:r>
+      <w:r>
+        <w:br/>
+      </w:r>
+      <w:r>
+        <w:br/>
+      </w:r>
+      <w:r>
+        <w:rPr>
+          <w:rStyle w:val="VariableTok"/>
+        </w:rPr>
+        <w:t xml:space="preserve">GITHUB_TOOLSETS</w:t>
+      </w:r>
+      <w:r>
+        <w:rPr>
+          <w:rStyle w:val="OperatorTok"/>
+        </w:rPr>
+        <w:t xml:space="preserve">=</w:t>
+      </w:r>
+      <w:r>
+        <w:rPr>
+          <w:rStyle w:val="StringTok"/>
+        </w:rPr>
+        <w:t xml:space="preserve">"</w:t>
+      </w:r>
+      <w:r>
+        <w:rPr>
+          <w:rStyle w:val="VariableTok"/>
+        </w:rPr>
+        <w:t xml:space="preserve">${GITHUB_TOOLSETS</w:t>
+      </w:r>
+      <w:r>
+        <w:rPr>
+          <w:rStyle w:val="OperatorTok"/>
+        </w:rPr>
+        <w:t xml:space="preserve">:-</w:t>
+      </w:r>
+      <w:r>
+        <w:rPr>
+          <w:rStyle w:val="NormalTok"/>
+        </w:rPr>
+        <w:t xml:space="preserve">default,actions</w:t>
+      </w:r>
+      <w:r>
+        <w:rPr>
+          <w:rStyle w:val="VariableTok"/>
+        </w:rPr>
+        <w:t xml:space="preserve">}</w:t>
+      </w:r>
+      <w:r>
+        <w:rPr>
+          <w:rStyle w:val="StringTok"/>
+        </w:rPr>
+        <w:t xml:space="preserve">"</w:t>
+      </w:r>
+      <w:r>
+        <w:br/>
+      </w:r>
+      <w:r>
+        <w:rPr>
+          <w:rStyle w:val="BuiltInTok"/>
+        </w:rPr>
+        <w:t xml:space="preserve">export</w:t>
+      </w:r>
+      <w:r>
+        <w:rPr>
+          <w:rStyle w:val="NormalTok"/>
+        </w:rPr>
+        <w:t xml:space="preserve"> </w:t>
+      </w:r>
+      <w:r>
+        <w:rPr>
+          <w:rStyle w:val="VariableTok"/>
+        </w:rPr>
+        <w:t xml:space="preserve">GITHUB_TOOLSETS</w:t>
+      </w:r>
+      <w:r>
+        <w:br/>
+      </w:r>
+      <w:r>
+        <w:br/>
+      </w:r>
+      <w:r>
+        <w:rPr>
+          <w:rStyle w:val="VariableTok"/>
+        </w:rPr>
+        <w:t xml:space="preserve">GITHUB_PERSONAL_ACCESS_TOKEN</w:t>
+      </w:r>
+      <w:r>
+        <w:rPr>
+          <w:rStyle w:val="OperatorTok"/>
+        </w:rPr>
+        <w:t xml:space="preserve">=</w:t>
+      </w:r>
+      <w:r>
+        <w:rPr>
+          <w:rStyle w:val="StringTok"/>
+        </w:rPr>
+        <w:t xml:space="preserve">"</w:t>
+      </w:r>
+      <w:r>
+        <w:rPr>
+          <w:rStyle w:val="VariableTok"/>
+        </w:rPr>
+        <w:t xml:space="preserve">$(</w:t>
+      </w:r>
+      <w:r>
+        <w:rPr>
+          <w:rStyle w:val="ExtensionTok"/>
+        </w:rPr>
+        <w:t xml:space="preserve">gh</w:t>
+      </w:r>
+      <w:r>
+        <w:rPr>
+          <w:rStyle w:val="NormalTok"/>
+        </w:rPr>
+        <w:t xml:space="preserve"> auth token</w:t>
+      </w:r>
+      <w:r>
+        <w:rPr>
+          <w:rStyle w:val="VariableTok"/>
+        </w:rPr>
+        <w:t xml:space="preserve">)</w:t>
+      </w:r>
+      <w:r>
+        <w:rPr>
+          <w:rStyle w:val="StringTok"/>
+        </w:rPr>
+        <w:t xml:space="preserve">"</w:t>
+      </w:r>
+      <w:r>
+        <w:br/>
+      </w:r>
+      <w:r>
+        <w:rPr>
+          <w:rStyle w:val="ControlFlowTok"/>
+        </w:rPr>
+        <w:t xml:space="preserve">if</w:t>
+      </w:r>
+      <w:r>
+        <w:rPr>
+          <w:rStyle w:val="NormalTok"/>
+        </w:rPr>
+        <w:t xml:space="preserve"> </w:t>
+      </w:r>
+      <w:r>
+        <w:rPr>
+          <w:rStyle w:val="BuiltInTok"/>
+        </w:rPr>
+        <w:t xml:space="preserve">[</w:t>
+      </w:r>
+      <w:r>
+        <w:rPr>
+          <w:rStyle w:val="NormalTok"/>
+        </w:rPr>
+        <w:t xml:space="preserve"> </w:t>
+      </w:r>
+      <w:r>
+        <w:rPr>
+          <w:rStyle w:val="OtherTok"/>
+        </w:rPr>
+        <w:t xml:space="preserve">-z</w:t>
+      </w:r>
+      <w:r>
+        <w:rPr>
+          <w:rStyle w:val="NormalTok"/>
+        </w:rPr>
+        <w:t xml:space="preserve"> </w:t>
+      </w:r>
+      <w:r>
+        <w:rPr>
+          <w:rStyle w:val="StringTok"/>
+        </w:rPr>
+        <w:t xml:space="preserve">"</w:t>
+      </w:r>
+      <w:r>
+        <w:rPr>
+          <w:rStyle w:val="VariableTok"/>
+        </w:rPr>
+        <w:t xml:space="preserve">$GITHUB_PERSONAL_ACCESS_TOKEN</w:t>
+      </w:r>
+      <w:r>
+        <w:rPr>
+          <w:rStyle w:val="StringTok"/>
+        </w:rPr>
+        <w:t xml:space="preserve">"</w:t>
+      </w:r>
+      <w:r>
+        <w:rPr>
+          <w:rStyle w:val="NormalTok"/>
+        </w:rPr>
+        <w:t xml:space="preserve"> </w:t>
+      </w:r>
+      <w:r>
+        <w:rPr>
+          <w:rStyle w:val="BuiltInTok"/>
+        </w:rPr>
+        <w:t xml:space="preserve">]</w:t>
+      </w:r>
+      <w:r>
+        <w:rPr>
+          <w:rStyle w:val="KeywordTok"/>
+        </w:rPr>
+        <w:t xml:space="preserve">;</w:t>
+      </w:r>
+      <w:r>
+        <w:rPr>
+          <w:rStyle w:val="NormalTok"/>
+        </w:rPr>
+        <w:t xml:space="preserve"> </w:t>
+      </w:r>
+      <w:r>
+        <w:rPr>
+          <w:rStyle w:val="ControlFlowTok"/>
+        </w:rPr>
+        <w:t xml:space="preserve">then</w:t>
+      </w:r>
+      <w:r>
+        <w:br/>
+      </w:r>
+      <w:r>
+        <w:rPr>
+          <w:rStyle w:val="NormalTok"/>
+        </w:rPr>
+        <w:t xml:space="preserve">  </w:t>
+      </w:r>
+      <w:r>
+        <w:rPr>
+          <w:rStyle w:val="BuiltInTok"/>
+        </w:rPr>
+        <w:t xml:space="preserve">echo</w:t>
+      </w:r>
+      <w:r>
+        <w:rPr>
+          <w:rStyle w:val="NormalTok"/>
+        </w:rPr>
+        <w:t xml:space="preserve"> </w:t>
+      </w:r>
+      <w:r>
+        <w:rPr>
+          <w:rStyle w:val="StringTok"/>
+        </w:rPr>
+        <w:t xml:space="preserve">"empty token; run 'gh auth login'"</w:t>
+      </w:r>
+      <w:r>
+        <w:rPr>
+          <w:rStyle w:val="NormalTok"/>
+        </w:rPr>
+        <w:t xml:space="preserve"> </w:t>
+      </w:r>
+      <w:r>
+        <w:rPr>
+          <w:rStyle w:val="OperatorTok"/>
+        </w:rPr>
+        <w:t xml:space="preserve">&gt;&amp;</w:t>
+      </w:r>
+      <w:r>
+        <w:rPr>
+          <w:rStyle w:val="DecValTok"/>
+        </w:rPr>
+        <w:t xml:space="preserve">2</w:t>
+      </w:r>
+      <w:r>
+        <w:br/>
+      </w:r>
+      <w:r>
+        <w:rPr>
+          <w:rStyle w:val="NormalTok"/>
+        </w:rPr>
+        <w:t xml:space="preserve">  </w:t>
+      </w:r>
+      <w:r>
+        <w:rPr>
+          <w:rStyle w:val="BuiltInTok"/>
+        </w:rPr>
+        <w:t xml:space="preserve">exit</w:t>
+      </w:r>
+      <w:r>
+        <w:rPr>
+          <w:rStyle w:val="NormalTok"/>
+        </w:rPr>
+        <w:t xml:space="preserve"> 1</w:t>
+      </w:r>
+      <w:r>
+        <w:br/>
+      </w:r>
+      <w:r>
+        <w:rPr>
+          <w:rStyle w:val="ControlFlowTok"/>
+        </w:rPr>
+        <w:t xml:space="preserve">fi</w:t>
+      </w:r>
+      <w:r>
+        <w:br/>
+      </w:r>
+      <w:r>
+        <w:rPr>
+          <w:rStyle w:val="BuiltInTok"/>
+        </w:rPr>
+        <w:t xml:space="preserve">export</w:t>
+      </w:r>
+      <w:r>
+        <w:rPr>
+          <w:rStyle w:val="NormalTok"/>
+        </w:rPr>
+        <w:t xml:space="preserve"> </w:t>
+      </w:r>
+      <w:r>
+        <w:rPr>
+          <w:rStyle w:val="VariableTok"/>
+        </w:rPr>
+        <w:t xml:space="preserve">GITHUB_PERSONAL_ACCESS_TOKEN</w:t>
+      </w:r>
+      <w:r>
+        <w:br/>
+      </w:r>
+      <w:r>
+        <w:br/>
+      </w:r>
+      <w:r>
+        <w:rPr>
+          <w:rStyle w:val="BuiltInTok"/>
+        </w:rPr>
+        <w:t xml:space="preserve">exec</w:t>
+      </w:r>
+      <w:r>
+        <w:rPr>
+          <w:rStyle w:val="NormalTok"/>
+        </w:rPr>
+        <w:t xml:space="preserve"> </w:t>
+      </w:r>
+      <w:r>
+        <w:rPr>
+          <w:rStyle w:val="StringTok"/>
+        </w:rPr>
+        <w:t xml:space="preserve">"</w:t>
+      </w:r>
+      <w:r>
+        <w:rPr>
+          <w:rStyle w:val="VariableTok"/>
+        </w:rPr>
+        <w:t xml:space="preserve">$HOME</w:t>
+      </w:r>
+      <w:r>
+        <w:rPr>
+          <w:rStyle w:val="StringTok"/>
+        </w:rPr>
+        <w:t xml:space="preserve">/.local/bin/github-mcp-server"</w:t>
+      </w:r>
+      <w:r>
+        <w:rPr>
+          <w:rStyle w:val="NormalTok"/>
+        </w:rPr>
+        <w:t xml:space="preserve"> stdio </w:t>
+      </w:r>
+      <w:r>
+        <w:rPr>
+          <w:rStyle w:val="StringTok"/>
+        </w:rPr>
+        <w:t xml:space="preserve">"</w:t>
+      </w:r>
+      <w:r>
+        <w:rPr>
+          <w:rStyle w:val="VariableTok"/>
+        </w:rPr>
+        <w:t xml:space="preserve">$@</w:t>
+      </w:r>
+      <w:r>
+        <w:rPr>
+          <w:rStyle w:val="StringTok"/>
+        </w:rPr>
+        <w:t xml:space="preserve">"</w:t>
+      </w:r>
+    </w:p>
+    <w:p>
+      <w:pPr>
+        <w:pStyle w:val="FirstParagraph"/>
+      </w:pPr>
+      <w:r>
+        <w:t xml:space="preserve">Register the wrapper rather than the binary:</w:t>
+      </w:r>
+    </w:p>
+    <w:p>
+      <w:pPr>
+        <w:pStyle w:val="SourceCode"/>
+      </w:pPr>
+      <w:r>
+        <w:rPr>
+          <w:rStyle w:val="ExtensionTok"/>
+        </w:rPr>
+        <w:t xml:space="preserve">claude</w:t>
+      </w:r>
+      <w:r>
+        <w:rPr>
+          <w:rStyle w:val="NormalTok"/>
+        </w:rPr>
+        <w:t xml:space="preserve"> mcp add </w:t>
+      </w:r>
+      <w:r>
+        <w:rPr>
+          <w:rStyle w:val="AttributeTok"/>
+        </w:rPr>
+        <w:t xml:space="preserve">--scope</w:t>
+      </w:r>
+      <w:r>
+        <w:rPr>
+          <w:rStyle w:val="NormalTok"/>
+        </w:rPr>
+        <w:t xml:space="preserve"> user github </w:t>
+      </w:r>
+      <w:r>
+        <w:rPr>
+          <w:rStyle w:val="AttributeTok"/>
+        </w:rPr>
+        <w:t xml:space="preserve">--</w:t>
+      </w:r>
+      <w:r>
+        <w:rPr>
+          <w:rStyle w:val="NormalTok"/>
+        </w:rPr>
+        <w:t xml:space="preserve"> ~/.local/bin/github-mcp-server-stdio</w:t>
+      </w:r>
+    </w:p>
+    <w:p>
+      <w:pPr>
+        <w:pStyle w:val="FirstParagraph"/>
+      </w:pPr>
+      <w:r>
+        <w:t xml:space="preserve">Note the explicit failure when the token comes back empty.</w:t>
+      </w:r>
+      <w:r>
+        <w:t xml:space="preserve"> </w:t>
+      </w:r>
+      <w:r>
+        <w:t xml:space="preserve">A wrapper that silently exports an empty string</w:t>
+      </w:r>
+      <w:r>
+        <w:t xml:space="preserve"> </w:t>
+      </w:r>
+      <w:r>
+        <w:t xml:space="preserve">reproduces the bare-</w:t>
+      </w:r>
+      <w:r>
+        <w:rPr>
+          <w:rStyle w:val="VerbatimChar"/>
+        </w:rPr>
+        <w:t xml:space="preserve">Bearer</w:t>
+      </w:r>
+      <w:r>
+        <w:t xml:space="preserve"> </w:t>
+      </w:r>
+      <w:r>
+        <w:t xml:space="preserve">bug you just finished diagnosing.</w:t>
+      </w:r>
+    </w:p>
+    <w:bookmarkEnd w:id="258"/>
+    <w:bookmarkStart w:id="259" w:name="X448547516ab06679b064b391b05a896db41ea57"/>
+    <w:p>
+      <w:pPr>
+        <w:pStyle w:val="Heading4"/>
+      </w:pPr>
+      <w:r>
+        <w:t xml:space="preserve">Toolsets are opt-in, and the default may omit what you need</w:t>
+      </w:r>
+    </w:p>
+    <w:p>
+      <w:pPr>
+        <w:pStyle w:val="FirstParagraph"/>
+      </w:pPr>
+      <w:r>
+        <w:t xml:space="preserve">A server does not necessarily expose everything it can do.</w:t>
+      </w:r>
+      <w:r>
+        <w:t xml:space="preserve"> </w:t>
+      </w:r>
+      <w:r>
+        <w:t xml:space="preserve">GitHub’s server exposes a default group,</w:t>
+      </w:r>
+      <w:r>
+        <w:t xml:space="preserve"> </w:t>
+      </w:r>
+      <w:r>
+        <w:t xml:space="preserve">and that default carries</w:t>
+      </w:r>
+      <w:r>
+        <w:t xml:space="preserve"> </w:t>
+      </w:r>
+      <w:r>
+        <w:rPr>
+          <w:b/>
+          <w:bCs/>
+        </w:rPr>
+        <w:t xml:space="preserve">no continuous-integration access at all</w:t>
+      </w:r>
+      <w:r>
+        <w:t xml:space="preserve"> </w:t>
+      </w:r>
+      <w:r>
+        <w:t xml:space="preserve">—</w:t>
+      </w:r>
+      <w:r>
+        <w:t xml:space="preserve"> </w:t>
+      </w:r>
+      <w:r>
+        <w:t xml:space="preserve">no workflow runs, no job logs, no re-run trigger.</w:t>
+      </w:r>
+    </w:p>
+    <w:p>
+      <w:pPr>
+        <w:pStyle w:val="BodyText"/>
+      </w:pPr>
+      <w:r>
+        <w:t xml:space="preserve">If your workflow involves driving pull requests to a clean state,</w:t>
+      </w:r>
+      <w:r>
+        <w:t xml:space="preserve"> </w:t>
+      </w:r>
+      <w:r>
+        <w:t xml:space="preserve">that omission matters,</w:t>
+      </w:r>
+      <w:r>
+        <w:t xml:space="preserve"> </w:t>
+      </w:r>
+      <w:r>
+        <w:t xml:space="preserve">because reading check status is most of the job.</w:t>
+      </w:r>
+      <w:r>
+        <w:t xml:space="preserve"> </w:t>
+      </w:r>
+      <w:r>
+        <w:t xml:space="preserve">Request the extra group explicitly:</w:t>
+      </w:r>
+    </w:p>
+    <w:p>
+      <w:pPr>
+        <w:pStyle w:val="SourceCode"/>
+      </w:pPr>
+      <w:r>
+        <w:rPr>
+          <w:rStyle w:val="VariableTok"/>
+        </w:rPr>
+        <w:t xml:space="preserve">GITHUB_TOOLSETS</w:t>
+      </w:r>
+      <w:r>
+        <w:rPr>
+          <w:rStyle w:val="OperatorTok"/>
+        </w:rPr>
+        <w:t xml:space="preserve">=</w:t>
+      </w:r>
+      <w:r>
+        <w:rPr>
+          <w:rStyle w:val="NormalTok"/>
+        </w:rPr>
+        <w:t xml:space="preserve">default,actions</w:t>
+      </w:r>
+    </w:p>
+    <w:p>
+      <w:pPr>
+        <w:pStyle w:val="FirstParagraph"/>
+      </w:pPr>
+      <w:r>
+        <w:t xml:space="preserve">Note that the selection</w:t>
+      </w:r>
+      <w:r>
+        <w:t xml:space="preserve"> </w:t>
+      </w:r>
+      <w:r>
+        <w:rPr>
+          <w:b/>
+          <w:bCs/>
+        </w:rPr>
+        <w:t xml:space="preserve">replaces</w:t>
+      </w:r>
+      <w:r>
+        <w:t xml:space="preserve"> </w:t>
+      </w:r>
+      <w:r>
+        <w:t xml:space="preserve">the default rather than extending it,</w:t>
+      </w:r>
+      <w:r>
+        <w:t xml:space="preserve"> </w:t>
+      </w:r>
+      <w:r>
+        <w:t xml:space="preserve">which is why the value above names</w:t>
+      </w:r>
+      <w:r>
+        <w:t xml:space="preserve"> </w:t>
+      </w:r>
+      <w:r>
+        <w:rPr>
+          <w:rStyle w:val="VerbatimChar"/>
+        </w:rPr>
+        <w:t xml:space="preserve">default</w:t>
+      </w:r>
+      <w:r>
+        <w:t xml:space="preserve"> </w:t>
+      </w:r>
+      <w:r>
+        <w:t xml:space="preserve">explicitly.</w:t>
+      </w:r>
+      <w:r>
+        <w:t xml:space="preserve"> </w:t>
+      </w:r>
+      <w:r>
+        <w:t xml:space="preserve">Writing</w:t>
+      </w:r>
+      <w:r>
+        <w:t xml:space="preserve"> </w:t>
+      </w:r>
+      <w:r>
+        <w:rPr>
+          <w:rStyle w:val="VerbatimChar"/>
+        </w:rPr>
+        <w:t xml:space="preserve">actions</w:t>
+      </w:r>
+      <w:r>
+        <w:t xml:space="preserve"> </w:t>
+      </w:r>
+      <w:r>
+        <w:t xml:space="preserve">alone would silently trade away every default tool</w:t>
+      </w:r>
+      <w:r>
+        <w:t xml:space="preserve"> </w:t>
+      </w:r>
+      <w:r>
+        <w:t xml:space="preserve">for the four you asked for —</w:t>
+      </w:r>
+      <w:r>
+        <w:t xml:space="preserve"> </w:t>
+      </w:r>
+      <w:r>
+        <w:t xml:space="preserve">a net</w:t>
+      </w:r>
+      <w:r>
+        <w:t xml:space="preserve"> </w:t>
+      </w:r>
+      <w:r>
+        <w:rPr>
+          <w:i/>
+          <w:iCs/>
+        </w:rPr>
+        <w:t xml:space="preserve">loss</w:t>
+      </w:r>
+      <w:r>
+        <w:t xml:space="preserve"> </w:t>
+      </w:r>
+      <w:r>
+        <w:t xml:space="preserve">that looks like a successful configuration change.</w:t>
+      </w:r>
+    </w:p>
+    <w:p>
+      <w:pPr>
+        <w:pStyle w:val="BodyText"/>
+      </w:pPr>
+      <w:r>
+        <w:t xml:space="preserve">So compare the tool list before and after,</w:t>
+      </w:r>
+      <w:r>
+        <w:t xml:space="preserve"> </w:t>
+      </w:r>
+      <w:r>
+        <w:t xml:space="preserve">and confirm the count went up rather than sideways.</w:t>
+      </w:r>
+    </w:p>
+    <w:bookmarkEnd w:id="259"/>
+    <w:bookmarkStart w:id="260" w:name="Xb256c2a3c0a422f2f687a98903d3521fd60a1b1"/>
+    <w:p>
+      <w:pPr>
+        <w:pStyle w:val="Heading4"/>
+      </w:pPr>
+      <w:r>
+        <w:t xml:space="preserve">Verify with a real call, and expect to restart</w:t>
+      </w:r>
+    </w:p>
+    <w:p>
+      <w:pPr>
+        <w:pStyle w:val="FirstParagraph"/>
+      </w:pPr>
+      <w:r>
+        <w:t xml:space="preserve">Two habits close this out.</w:t>
+      </w:r>
+    </w:p>
+    <w:p>
+      <w:pPr>
+        <w:pStyle w:val="BodyText"/>
+      </w:pPr>
+      <w:r>
+        <w:rPr>
+          <w:b/>
+          <w:bCs/>
+        </w:rPr>
+        <w:t xml:space="preserve">Verify by calling, not by reading a list.</w:t>
+      </w:r>
+      <w:r>
+        <w:t xml:space="preserve"> </w:t>
+      </w:r>
+      <w:r>
+        <w:t xml:space="preserve">A tool appearing in the registry proves the harness parsed a config file.</w:t>
+      </w:r>
+      <w:r>
+        <w:t xml:space="preserve"> </w:t>
+      </w:r>
+      <w:r>
+        <w:t xml:space="preserve">It does not prove the server started,</w:t>
+      </w:r>
+      <w:r>
+        <w:t xml:space="preserve"> </w:t>
+      </w:r>
+      <w:r>
+        <w:t xml:space="preserve">authenticated,</w:t>
+      </w:r>
+      <w:r>
+        <w:t xml:space="preserve"> </w:t>
+      </w:r>
+      <w:r>
+        <w:t xml:space="preserve">or can reach the API.</w:t>
+      </w:r>
+      <w:r>
+        <w:t xml:space="preserve"> </w:t>
+      </w:r>
+      <w:r>
+        <w:t xml:space="preserve">One cheap identity call plus one read</w:t>
+      </w:r>
+      <w:r>
+        <w:t xml:space="preserve"> </w:t>
+      </w:r>
+      <w:r>
+        <w:t xml:space="preserve">(for GitHub:</w:t>
+      </w:r>
+      <w:r>
+        <w:t xml:space="preserve"> </w:t>
+      </w:r>
+      <w:r>
+        <w:rPr>
+          <w:rStyle w:val="VerbatimChar"/>
+        </w:rPr>
+        <w:t xml:space="preserve">get_me</w:t>
+      </w:r>
+      <w:r>
+        <w:t xml:space="preserve">, then listing pull requests on a repo you know)</w:t>
+      </w:r>
+      <w:r>
+        <w:t xml:space="preserve"> </w:t>
+      </w:r>
+      <w:r>
+        <w:t xml:space="preserve">proves the whole path end to end.</w:t>
+      </w:r>
+    </w:p>
+    <w:p>
+      <w:pPr>
+        <w:pStyle w:val="BodyText"/>
+      </w:pPr>
+      <w:r>
+        <w:rPr>
+          <w:b/>
+          <w:bCs/>
+        </w:rPr>
+        <w:t xml:space="preserve">Expect the tools to be missing until you restart.</w:t>
+      </w:r>
+      <w:r>
+        <w:t xml:space="preserve"> </w:t>
+      </w:r>
+      <w:r>
+        <w:t xml:space="preserve">MCP servers connect when a session starts,</w:t>
+      </w:r>
+      <w:r>
+        <w:t xml:space="preserve"> </w:t>
+      </w:r>
+      <w:r>
+        <w:t xml:space="preserve">so a server registered mid-session is inert for the rest of it.</w:t>
+      </w:r>
+      <w:r>
+        <w:t xml:space="preserve"> </w:t>
+      </w:r>
+      <w:r>
+        <w:t xml:space="preserve">This is a common false alarm:</w:t>
+      </w:r>
+      <w:r>
+        <w:t xml:space="preserve"> </w:t>
+      </w:r>
+      <w:r>
+        <w:t xml:space="preserve">the registration worked,</w:t>
+      </w:r>
+      <w:r>
+        <w:t xml:space="preserve"> </w:t>
+      </w:r>
+      <w:r>
+        <w:t xml:space="preserve">and the tools genuinely are not there yet.</w:t>
+      </w:r>
+    </w:p>
+    <w:p>
+      <w:pPr>
+        <w:pStyle w:val="BodyText"/>
+      </w:pPr>
+      <w:r>
+        <w:t xml:space="preserve">Finally, note which new tools can</w:t>
+      </w:r>
+      <w:r>
+        <w:t xml:space="preserve"> </w:t>
+      </w:r>
+      <w:r>
+        <w:rPr>
+          <w:i/>
+          <w:iCs/>
+        </w:rPr>
+        <w:t xml:space="preserve">write</w:t>
+      </w:r>
+      <w:r>
+        <w:t xml:space="preserve">.</w:t>
+      </w:r>
+      <w:r>
+        <w:t xml:space="preserve"> </w:t>
+      </w:r>
+      <w:r>
+        <w:t xml:space="preserve">A re-run or dispatch tool can trigger CI,</w:t>
+      </w:r>
+      <w:r>
+        <w:t xml:space="preserve"> </w:t>
+      </w:r>
+      <w:r>
+        <w:t xml:space="preserve">and permissive permission modes will not prompt before it does.</w:t>
+      </w:r>
+      <w:r>
+        <w:t xml:space="preserve"> </w:t>
+      </w:r>
+      <w:r>
+        <w:t xml:space="preserve">Treat those the way you would treat a merge —</w:t>
+      </w:r>
+      <w:r>
+        <w:t xml:space="preserve"> </w:t>
+      </w:r>
+      <w:r>
+        <w:t xml:space="preserve">something a human authorizes,</w:t>
+      </w:r>
+      <w:r>
+        <w:t xml:space="preserve"> </w:t>
+      </w:r>
+      <w:r>
+        <w:t xml:space="preserve">not something an agent does in passing.</w:t>
+      </w:r>
+    </w:p>
+    <w:bookmarkEnd w:id="260"/>
+    <w:bookmarkEnd w:id="261"/>
+    <w:bookmarkStart w:id="285" w:name="references"/>
+    <w:p>
+      <w:pPr>
+        <w:pStyle w:val="Heading1"/>
+      </w:pPr>
+      <w:r>
+        <w:t xml:space="preserve">References</w:t>
+      </w:r>
+    </w:p>
+    <w:bookmarkStart w:id="284" w:name="refs"/>
+    <w:bookmarkStart w:id="263" w:name="ref-space_odyssey"/>
+    <w:p>
+      <w:pPr>
+        <w:pStyle w:val="Bibliography"/>
+      </w:pPr>
+      <w:r>
+        <w:rPr>
+          <w:i/>
+          <w:iCs/>
+        </w:rPr>
         <w:t xml:space="preserve">2001: A Space Odyssey</w:t>
       </w:r>
       <w:r>
@@ -30111,7 +31882,7 @@
       <w:r>
         <w:t xml:space="preserve"> </w:t>
       </w:r>
-      <w:hyperlink r:id="rId252">
+      <w:hyperlink r:id="rId262">
         <w:r>
           <w:rPr>
             <w:rStyle w:val="Hyperlink"/>
@@ -30123,8 +31894,8 @@
         <w:t xml:space="preserve">.</w:t>
       </w:r>
     </w:p>
-    <w:bookmarkEnd w:id="253"/>
-    <w:bookmarkStart w:id="255" w:name="ref-i_robot"/>
+    <w:bookmarkEnd w:id="263"/>
+    <w:bookmarkStart w:id="265" w:name="ref-i_robot"/>
     <w:p>
       <w:pPr>
         <w:pStyle w:val="Bibliography"/>
@@ -30148,7 +31919,7 @@
       <w:r>
         <w:t xml:space="preserve"> </w:t>
       </w:r>
-      <w:hyperlink r:id="rId254">
+      <w:hyperlink r:id="rId264">
         <w:r>
           <w:rPr>
             <w:rStyle w:val="Hyperlink"/>
@@ -30160,8 +31931,8 @@
         <w:t xml:space="preserve">.</w:t>
       </w:r>
     </w:p>
-    <w:bookmarkEnd w:id="255"/>
-    <w:bookmarkStart w:id="257" w:name="ref-battlestar_galactica_2004"/>
+    <w:bookmarkEnd w:id="265"/>
+    <w:bookmarkStart w:id="267" w:name="ref-battlestar_galactica_2004"/>
     <w:p>
       <w:pPr>
         <w:pStyle w:val="Bibliography"/>
@@ -30179,7 +31950,7 @@
       <w:r>
         <w:t xml:space="preserve"> </w:t>
       </w:r>
-      <w:hyperlink r:id="rId256">
+      <w:hyperlink r:id="rId266">
         <w:r>
           <w:rPr>
             <w:rStyle w:val="Hyperlink"/>
@@ -30191,8 +31962,8 @@
         <w:t xml:space="preserve">.</w:t>
       </w:r>
     </w:p>
-    <w:bookmarkEnd w:id="257"/>
-    <w:bookmarkStart w:id="259" w:name="ref-blade_runner"/>
+    <w:bookmarkEnd w:id="267"/>
+    <w:bookmarkStart w:id="269" w:name="ref-blade_runner"/>
     <w:p>
       <w:pPr>
         <w:pStyle w:val="Bibliography"/>
@@ -30210,7 +31981,7 @@
       <w:r>
         <w:t xml:space="preserve"> </w:t>
       </w:r>
-      <w:hyperlink r:id="rId258">
+      <w:hyperlink r:id="rId268">
         <w:r>
           <w:rPr>
             <w:rStyle w:val="Hyperlink"/>
@@ -30222,8 +31993,8 @@
         <w:t xml:space="preserve">.</w:t>
       </w:r>
     </w:p>
-    <w:bookmarkEnd w:id="259"/>
-    <w:bookmarkStart w:id="261" w:name="ref-enders_game"/>
+    <w:bookmarkEnd w:id="269"/>
+    <w:bookmarkStart w:id="271" w:name="ref-enders_game"/>
     <w:p>
       <w:pPr>
         <w:pStyle w:val="Bibliography"/>
@@ -30247,7 +32018,7 @@
       <w:r>
         <w:t xml:space="preserve"> </w:t>
       </w:r>
-      <w:hyperlink r:id="rId260">
+      <w:hyperlink r:id="rId270">
         <w:r>
           <w:rPr>
             <w:rStyle w:val="Hyperlink"/>
@@ -30259,8 +32030,8 @@
         <w:t xml:space="preserve">.</w:t>
       </w:r>
     </w:p>
-    <w:bookmarkEnd w:id="261"/>
-    <w:bookmarkStart w:id="263" w:name="ref-humans_are_dead"/>
+    <w:bookmarkEnd w:id="271"/>
+    <w:bookmarkStart w:id="273" w:name="ref-humans_are_dead"/>
     <w:p>
       <w:pPr>
         <w:pStyle w:val="Bibliography"/>
@@ -30284,7 +32055,7 @@
       <w:r>
         <w:t xml:space="preserve"> </w:t>
       </w:r>
-      <w:hyperlink r:id="rId262">
+      <w:hyperlink r:id="rId272">
         <w:r>
           <w:rPr>
             <w:rStyle w:val="Hyperlink"/>
@@ -30296,8 +32067,8 @@
         <w:t xml:space="preserve">.</w:t>
       </w:r>
     </w:p>
-    <w:bookmarkEnd w:id="263"/>
-    <w:bookmarkStart w:id="265" w:name="ref-dune"/>
+    <w:bookmarkEnd w:id="273"/>
+    <w:bookmarkStart w:id="275" w:name="ref-dune"/>
     <w:p>
       <w:pPr>
         <w:pStyle w:val="Bibliography"/>
@@ -30321,7 +32092,7 @@
       <w:r>
         <w:t xml:space="preserve"> </w:t>
       </w:r>
-      <w:hyperlink r:id="rId264">
+      <w:hyperlink r:id="rId274">
         <w:r>
           <w:rPr>
             <w:rStyle w:val="Hyperlink"/>
@@ -30333,8 +32104,8 @@
         <w:t xml:space="preserve">.</w:t>
       </w:r>
     </w:p>
-    <w:bookmarkEnd w:id="265"/>
-    <w:bookmarkStart w:id="267" w:name="ref-lecun_world_models"/>
+    <w:bookmarkEnd w:id="275"/>
+    <w:bookmarkStart w:id="277" w:name="ref-lecun_world_models"/>
     <w:p>
       <w:pPr>
         <w:pStyle w:val="Bibliography"/>
@@ -30358,7 +32129,7 @@
       <w:r>
         <w:t xml:space="preserve"> </w:t>
       </w:r>
-      <w:hyperlink r:id="rId266">
+      <w:hyperlink r:id="rId276">
         <w:r>
           <w:rPr>
             <w:rStyle w:val="Hyperlink"/>
@@ -30370,8 +32141,8 @@
         <w:t xml:space="preserve">.</w:t>
       </w:r>
     </w:p>
-    <w:bookmarkEnd w:id="267"/>
-    <w:bookmarkStart w:id="269" w:name="ref-terminator"/>
+    <w:bookmarkEnd w:id="277"/>
+    <w:bookmarkStart w:id="279" w:name="ref-terminator"/>
     <w:p>
       <w:pPr>
         <w:pStyle w:val="Bibliography"/>
@@ -30389,7 +32160,7 @@
       <w:r>
         <w:t xml:space="preserve"> </w:t>
       </w:r>
-      <w:hyperlink r:id="rId268">
+      <w:hyperlink r:id="rId278">
         <w:r>
           <w:rPr>
             <w:rStyle w:val="Hyperlink"/>
@@ -30401,8 +32172,8 @@
         <w:t xml:space="preserve">.</w:t>
       </w:r>
     </w:p>
-    <w:bookmarkEnd w:id="269"/>
-    <w:bookmarkStart w:id="271" w:name="ref-matrix"/>
+    <w:bookmarkEnd w:id="279"/>
+    <w:bookmarkStart w:id="281" w:name="ref-matrix"/>
     <w:p>
       <w:pPr>
         <w:pStyle w:val="Bibliography"/>
@@ -30420,7 +32191,7 @@
       <w:r>
         <w:t xml:space="preserve"> </w:t>
       </w:r>
-      <w:hyperlink r:id="rId270">
+      <w:hyperlink r:id="rId280">
         <w:r>
           <w:rPr>
             <w:rStyle w:val="Hyperlink"/>
@@ -30432,8 +32203,8 @@
         <w:t xml:space="preserve">.</w:t>
       </w:r>
     </w:p>
-    <w:bookmarkEnd w:id="271"/>
-    <w:bookmarkStart w:id="273" w:name="ref-wargames"/>
+    <w:bookmarkEnd w:id="281"/>
+    <w:bookmarkStart w:id="283" w:name="ref-wargames"/>
     <w:p>
       <w:pPr>
         <w:pStyle w:val="Bibliography"/>
@@ -30451,7 +32222,7 @@
       <w:r>
         <w:t xml:space="preserve"> </w:t>
       </w:r>
-      <w:hyperlink r:id="rId272">
+      <w:hyperlink r:id="rId282">
         <w:r>
           <w:rPr>
             <w:rStyle w:val="Hyperlink"/>
@@ -30463,9 +32234,9 @@
         <w:t xml:space="preserve">.</w:t>
       </w:r>
     </w:p>
-    <w:bookmarkEnd w:id="273"/>
-    <w:bookmarkEnd w:id="274"/>
-    <w:bookmarkEnd w:id="275"/>
+    <w:bookmarkEnd w:id="283"/>
+    <w:bookmarkEnd w:id="284"/>
+    <w:bookmarkEnd w:id="285"/>
     <w:sectPr>
       <w:footnotePr>
         <w:numRestart w:val="eachSect"/>
@@ -31673,6 +33444,9 @@
     <w:lvlOverride w:ilvl="8">
       <w:startOverride w:val="1"/>
     </w:lvlOverride>
+  </w:num>
+  <w:num w:numId="1126">
+    <w:abstractNumId w:val="991"/>
   </w:num>
 </w:numbering>
 </file>

</xml_diff>

<commit_message>
Deploying to gh-pages from @ Morrison-Lab/wai@db3a15deb1ab501b2735f9ab66fb033da0440835 🚀
</commit_message>
<xml_diff>
--- a/chapters/coding-agents.docx
+++ b/chapters/coding-agents.docx
@@ -15,7 +15,7 @@
         <w:pStyle w:val="Date"/>
       </w:pPr>
       <w:r>
-        <w:t xml:space="preserve">Last modified: 2026-08-05 17:30:25 (PDT)</w:t>
+        <w:t xml:space="preserve">Last modified: 2026-08-05 18:40:33 (PDT)</w:t>
       </w:r>
     </w:p>
     <w:p>
@@ -9398,7 +9398,7 @@
           <w:rPr>
             <w:rStyle w:val="Hyperlink"/>
           </w:rPr>
-          <w:t xml:space="preserve">Section 24</w:t>
+          <w:t xml:space="preserve">Section 25</w:t>
         </w:r>
       </w:hyperlink>
       <w:r>
@@ -9749,7 +9749,7 @@
           <w:rPr>
             <w:rStyle w:val="Hyperlink"/>
           </w:rPr>
-          <w:t xml:space="preserve">Section 24</w:t>
+          <w:t xml:space="preserve">Section 25</w:t>
         </w:r>
       </w:hyperlink>
       <w:r>
@@ -27119,7 +27119,7 @@
           <w:rPr>
             <w:rStyle w:val="Hyperlink"/>
           </w:rPr>
-          <w:t xml:space="preserve">Section 30</w:t>
+          <w:t xml:space="preserve">Section 31</w:t>
         </w:r>
       </w:hyperlink>
       <w:r>
@@ -28191,13 +28191,941 @@
     </w:p>
     <w:bookmarkEnd w:id="229"/>
     <w:bookmarkEnd w:id="230"/>
-    <w:bookmarkStart w:id="237" w:name="sec-ai-claude-cloud-env"/>
+    <w:bookmarkStart w:id="235" w:name="sec-ai-config-install"/>
     <w:p>
       <w:pPr>
         <w:pStyle w:val="Heading1"/>
       </w:pPr>
       <w:r>
-        <w:t xml:space="preserve">23. Claude Code Cloud Environments</w:t>
+        <w:t xml:space="preserve">23. How the Config Reaches a Machine</w:t>
+      </w:r>
+    </w:p>
+    <w:p>
+      <w:pPr>
+        <w:pStyle w:val="FirstParagraph"/>
+      </w:pPr>
+      <w:hyperlink w:anchor="sec-ai-customization">
+        <w:r>
+          <w:rPr>
+            <w:rStyle w:val="Hyperlink"/>
+          </w:rPr>
+          <w:t xml:space="preserve">Section 22</w:t>
+        </w:r>
+      </w:hyperlink>
+      <w:r>
+        <w:t xml:space="preserve"> </w:t>
+      </w:r>
+      <w:r>
+        <w:t xml:space="preserve">describes</w:t>
+      </w:r>
+      <w:r>
+        <w:t xml:space="preserve"> </w:t>
+      </w:r>
+      <w:r>
+        <w:rPr>
+          <w:i/>
+          <w:iCs/>
+        </w:rPr>
+        <w:t xml:space="preserve">which</w:t>
+      </w:r>
+      <w:r>
+        <w:t xml:space="preserve"> </w:t>
+      </w:r>
+      <w:r>
+        <w:t xml:space="preserve">mechanism a customization should use.</w:t>
+      </w:r>
+      <w:r>
+        <w:t xml:space="preserve"> </w:t>
+      </w:r>
+      <w:r>
+        <w:t xml:space="preserve">This section is about the step after that decision:</w:t>
+      </w:r>
+      <w:r>
+        <w:t xml:space="preserve"> </w:t>
+      </w:r>
+      <w:r>
+        <w:t xml:space="preserve">how a config like a shared instruction repository</w:t>
+      </w:r>
+      <w:r>
+        <w:t xml:space="preserve"> </w:t>
+      </w:r>
+      <w:r>
+        <w:t xml:space="preserve">actually reaches a machine,</w:t>
+      </w:r>
+      <w:r>
+        <w:t xml:space="preserve"> </w:t>
+      </w:r>
+      <w:r>
+        <w:t xml:space="preserve">and how a broken install fails.</w:t>
+      </w:r>
+    </w:p>
+    <w:p>
+      <w:pPr>
+        <w:pStyle w:val="BodyText"/>
+      </w:pPr>
+      <w:r>
+        <w:t xml:space="preserve">Two agents can load the identical instruction corpus and still behave differently,</w:t>
+      </w:r>
+      <w:r>
+        <w:t xml:space="preserve"> </w:t>
+      </w:r>
+      <w:r>
+        <w:t xml:space="preserve">because behavior depends not only on what the config says</w:t>
+      </w:r>
+      <w:r>
+        <w:t xml:space="preserve"> </w:t>
+      </w:r>
+      <w:r>
+        <w:t xml:space="preserve">but on how it is installed where the agent runs.</w:t>
+      </w:r>
+      <w:r>
+        <w:t xml:space="preserve"> </w:t>
+      </w:r>
+      <w:r>
+        <w:t xml:space="preserve">An install problem is quiet by construction —</w:t>
+      </w:r>
+      <w:r>
+        <w:t xml:space="preserve"> </w:t>
+      </w:r>
+      <w:r>
+        <w:t xml:space="preserve">nothing errors, the work still gets done,</w:t>
+      </w:r>
+      <w:r>
+        <w:t xml:space="preserve"> </w:t>
+      </w:r>
+      <w:r>
+        <w:t xml:space="preserve">and a capability simply goes missing with no message that it existed.</w:t>
+      </w:r>
+    </w:p>
+    <w:bookmarkStart w:id="231" w:name="X09c076bdbd05e35ade785c409b9eb4387af137d"/>
+    <w:p>
+      <w:pPr>
+        <w:pStyle w:val="Heading4"/>
+      </w:pPr>
+      <w:r>
+        <w:t xml:space="preserve">Two Ways the Same Config Reaches a Machine</w:t>
+      </w:r>
+    </w:p>
+    <w:p>
+      <w:pPr>
+        <w:pStyle w:val="FirstParagraph"/>
+      </w:pPr>
+      <w:r>
+        <w:t xml:space="preserve">A repository of skills, hooks, and instruction files can be delivered two ways,</w:t>
+      </w:r>
+      <w:r>
+        <w:t xml:space="preserve"> </w:t>
+      </w:r>
+      <w:r>
+        <w:t xml:space="preserve">and they are alternatives rather than layers.</w:t>
+      </w:r>
+    </w:p>
+    <w:p>
+      <w:pPr>
+        <w:pStyle w:val="Compact"/>
+        <w:numPr>
+          <w:ilvl w:val="0"/>
+          <w:numId w:val="1104"/>
+        </w:numPr>
+      </w:pPr>
+      <w:r>
+        <w:rPr>
+          <w:b/>
+          <w:bCs/>
+        </w:rPr>
+        <w:t xml:space="preserve">As a plugin.</w:t>
+      </w:r>
+      <w:r>
+        <w:t xml:space="preserve"> </w:t>
+      </w:r>
+      <w:r>
+        <w:t xml:space="preserve">You enable the repository as a plugin from a marketplace,</w:t>
+      </w:r>
+      <w:r>
+        <w:t xml:space="preserve"> </w:t>
+      </w:r>
+      <w:r>
+        <w:t xml:space="preserve">and the harness loads its skills, commands, and hooks directly</w:t>
+      </w:r>
+      <w:r>
+        <w:t xml:space="preserve"> </w:t>
+      </w:r>
+      <w:r>
+        <w:t xml:space="preserve">from the plugin’s own checkout at session start.</w:t>
+      </w:r>
+      <w:r>
+        <w:t xml:space="preserve"> </w:t>
+      </w:r>
+      <w:r>
+        <w:t xml:space="preserve">It refreshes when the marketplace updates.</w:t>
+      </w:r>
+    </w:p>
+    <w:p>
+      <w:pPr>
+        <w:pStyle w:val="Compact"/>
+        <w:numPr>
+          <w:ilvl w:val="0"/>
+          <w:numId w:val="1104"/>
+        </w:numPr>
+      </w:pPr>
+      <w:r>
+        <w:rPr>
+          <w:b/>
+          <w:bCs/>
+        </w:rPr>
+        <w:t xml:space="preserve">As a per-machine install.</w:t>
+      </w:r>
+      <w:r>
+        <w:t xml:space="preserve"> </w:t>
+      </w:r>
+      <w:r>
+        <w:t xml:space="preserve">You symlink (or copy) the repository’s children into</w:t>
+      </w:r>
+      <w:r>
+        <w:t xml:space="preserve"> </w:t>
+      </w:r>
+      <w:r>
+        <w:rPr>
+          <w:rStyle w:val="VerbatimChar"/>
+        </w:rPr>
+        <w:t xml:space="preserve">~/.claude/</w:t>
+      </w:r>
+      <w:r>
+        <w:t xml:space="preserve"> </w:t>
+      </w:r>
+      <w:r>
+        <w:t xml:space="preserve">—</w:t>
+      </w:r>
+      <w:r>
+        <w:t xml:space="preserve"> </w:t>
+      </w:r>
+      <w:r>
+        <w:rPr>
+          <w:rStyle w:val="VerbatimChar"/>
+        </w:rPr>
+        <w:t xml:space="preserve">skills/</w:t>
+      </w:r>
+      <w:r>
+        <w:t xml:space="preserve">,</w:t>
+      </w:r>
+      <w:r>
+        <w:t xml:space="preserve"> </w:t>
+      </w:r>
+      <w:r>
+        <w:rPr>
+          <w:rStyle w:val="VerbatimChar"/>
+        </w:rPr>
+        <w:t xml:space="preserve">shared/</w:t>
+      </w:r>
+      <w:r>
+        <w:t xml:space="preserve">,</w:t>
+      </w:r>
+      <w:r>
+        <w:t xml:space="preserve"> </w:t>
+      </w:r>
+      <w:r>
+        <w:rPr>
+          <w:rStyle w:val="VerbatimChar"/>
+        </w:rPr>
+        <w:t xml:space="preserve">memories/</w:t>
+      </w:r>
+      <w:r>
+        <w:t xml:space="preserve">,</w:t>
+      </w:r>
+      <w:r>
+        <w:t xml:space="preserve"> </w:t>
+      </w:r>
+      <w:r>
+        <w:rPr>
+          <w:rStyle w:val="VerbatimChar"/>
+        </w:rPr>
+        <w:t xml:space="preserve">hooks/</w:t>
+      </w:r>
+      <w:r>
+        <w:t xml:space="preserve">, and</w:t>
+      </w:r>
+      <w:r>
+        <w:t xml:space="preserve"> </w:t>
+      </w:r>
+      <w:r>
+        <w:rPr>
+          <w:rStyle w:val="VerbatimChar"/>
+        </w:rPr>
+        <w:t xml:space="preserve">CLAUDE.md</w:t>
+      </w:r>
+      <w:r>
+        <w:t xml:space="preserve"> </w:t>
+      </w:r>
+      <w:r>
+        <w:t xml:space="preserve">—</w:t>
+      </w:r>
+      <w:r>
+        <w:t xml:space="preserve"> </w:t>
+      </w:r>
+      <w:r>
+        <w:t xml:space="preserve">and register the hooks into</w:t>
+      </w:r>
+      <w:r>
+        <w:t xml:space="preserve"> </w:t>
+      </w:r>
+      <w:r>
+        <w:rPr>
+          <w:rStyle w:val="VerbatimChar"/>
+        </w:rPr>
+        <w:t xml:space="preserve">~/.claude/settings.json</w:t>
+      </w:r>
+      <w:r>
+        <w:t xml:space="preserve"> </w:t>
+      </w:r>
+      <w:r>
+        <w:t xml:space="preserve">by hand or with a script.</w:t>
+      </w:r>
+    </w:p>
+    <w:p>
+      <w:pPr>
+        <w:pStyle w:val="FirstParagraph"/>
+      </w:pPr>
+      <w:r>
+        <w:t xml:space="preserve">The trap is running both at once.</w:t>
+      </w:r>
+      <w:r>
+        <w:t xml:space="preserve"> </w:t>
+      </w:r>
+      <w:r>
+        <w:t xml:space="preserve">The plugin path and the settings-file path carry different command strings,</w:t>
+      </w:r>
+      <w:r>
+        <w:t xml:space="preserve"> </w:t>
+      </w:r>
+      <w:r>
+        <w:t xml:space="preserve">so the harness keeps both,</w:t>
+      </w:r>
+      <w:r>
+        <w:t xml:space="preserve"> </w:t>
+      </w:r>
+      <w:r>
+        <w:t xml:space="preserve">and every hook fires twice.</w:t>
+      </w:r>
+      <w:r>
+        <w:t xml:space="preserve"> </w:t>
+      </w:r>
+      <w:r>
+        <w:t xml:space="preserve">This fails in the safe direction —</w:t>
+      </w:r>
+      <w:r>
+        <w:t xml:space="preserve"> </w:t>
+      </w:r>
+      <w:r>
+        <w:t xml:space="preserve">a doubled guard warns or blocks twice, it never goes missing —</w:t>
+      </w:r>
+      <w:r>
+        <w:t xml:space="preserve"> </w:t>
+      </w:r>
+      <w:r>
+        <w:t xml:space="preserve">which is exactly why it is easy to leave in place unnoticed.</w:t>
+      </w:r>
+      <w:r>
+        <w:t xml:space="preserve"> </w:t>
+      </w:r>
+      <w:r>
+        <w:t xml:space="preserve">Pick one path.</w:t>
+      </w:r>
+    </w:p>
+    <w:bookmarkEnd w:id="231"/>
+    <w:bookmarkStart w:id="232" w:name="the-.claude-layout"/>
+    <w:p>
+      <w:pPr>
+        <w:pStyle w:val="Heading4"/>
+      </w:pPr>
+      <w:r>
+        <w:t xml:space="preserve">The</w:t>
+      </w:r>
+      <w:r>
+        <w:t xml:space="preserve"> </w:t>
+      </w:r>
+      <w:r>
+        <w:rPr>
+          <w:rStyle w:val="VerbatimChar"/>
+        </w:rPr>
+        <w:t xml:space="preserve">~/.claude</w:t>
+      </w:r>
+      <w:r>
+        <w:t xml:space="preserve"> </w:t>
+      </w:r>
+      <w:r>
+        <w:t xml:space="preserve">Layout</w:t>
+      </w:r>
+    </w:p>
+    <w:p>
+      <w:pPr>
+        <w:pStyle w:val="FirstParagraph"/>
+      </w:pPr>
+      <w:r>
+        <w:t xml:space="preserve">On a symlink-capable system,</w:t>
+      </w:r>
+      <w:r>
+        <w:t xml:space="preserve"> </w:t>
+      </w:r>
+      <w:r>
+        <w:t xml:space="preserve">the children of</w:t>
+      </w:r>
+      <w:r>
+        <w:t xml:space="preserve"> </w:t>
+      </w:r>
+      <w:r>
+        <w:rPr>
+          <w:rStyle w:val="VerbatimChar"/>
+        </w:rPr>
+        <w:t xml:space="preserve">~/.claude</w:t>
+      </w:r>
+      <w:r>
+        <w:t xml:space="preserve"> </w:t>
+      </w:r>
+      <w:r>
+        <w:t xml:space="preserve">are symlinks into a working checkout of the repository,</w:t>
+      </w:r>
+      <w:r>
+        <w:t xml:space="preserve"> </w:t>
+      </w:r>
+      <w:r>
+        <w:t xml:space="preserve">so a</w:t>
+      </w:r>
+      <w:r>
+        <w:t xml:space="preserve"> </w:t>
+      </w:r>
+      <w:r>
+        <w:rPr>
+          <w:rStyle w:val="VerbatimChar"/>
+        </w:rPr>
+        <w:t xml:space="preserve">git pull</w:t>
+      </w:r>
+      <w:r>
+        <w:t xml:space="preserve"> </w:t>
+      </w:r>
+      <w:r>
+        <w:t xml:space="preserve">in that checkout refreshes every skill and rule for free.</w:t>
+      </w:r>
+      <w:r>
+        <w:t xml:space="preserve"> </w:t>
+      </w:r>
+      <w:r>
+        <w:t xml:space="preserve">Windows Git Bash is the common exception:</w:t>
+      </w:r>
+      <w:r>
+        <w:t xml:space="preserve"> </w:t>
+      </w:r>
+      <w:r>
+        <w:t xml:space="preserve">without symlink privileges configured (Developer Mode, or</w:t>
+      </w:r>
+      <w:r>
+        <w:t xml:space="preserve"> </w:t>
+      </w:r>
+      <w:r>
+        <w:rPr>
+          <w:rStyle w:val="VerbatimChar"/>
+        </w:rPr>
+        <w:t xml:space="preserve">MSYS=winsymlinks:nativestrict</w:t>
+      </w:r>
+      <w:r>
+        <w:t xml:space="preserve">),</w:t>
+      </w:r>
+      <w:r>
+        <w:t xml:space="preserve"> </w:t>
+      </w:r>
+      <w:r>
+        <w:t xml:space="preserve">its</w:t>
+      </w:r>
+      <w:r>
+        <w:t xml:space="preserve"> </w:t>
+      </w:r>
+      <w:r>
+        <w:rPr>
+          <w:rStyle w:val="VerbatimChar"/>
+        </w:rPr>
+        <w:t xml:space="preserve">ln -s</w:t>
+      </w:r>
+      <w:r>
+        <w:t xml:space="preserve"> </w:t>
+      </w:r>
+      <w:r>
+        <w:t xml:space="preserve">falls back to real copies,</w:t>
+      </w:r>
+      <w:r>
+        <w:t xml:space="preserve"> </w:t>
+      </w:r>
+      <w:r>
+        <w:t xml:space="preserve">so a pull does not propagate and the copies must be re-synced.</w:t>
+      </w:r>
+    </w:p>
+    <w:p>
+      <w:pPr>
+        <w:pStyle w:val="BodyText"/>
+      </w:pPr>
+      <w:r>
+        <w:t xml:space="preserve">Two health checks answer two different questions,</w:t>
+      </w:r>
+      <w:r>
+        <w:t xml:space="preserve"> </w:t>
+      </w:r>
+      <w:r>
+        <w:t xml:space="preserve">and a clean answer to one says nothing about the other.</w:t>
+      </w:r>
+    </w:p>
+    <w:p>
+      <w:pPr>
+        <w:pStyle w:val="Compact"/>
+        <w:numPr>
+          <w:ilvl w:val="0"/>
+          <w:numId w:val="1105"/>
+        </w:numPr>
+      </w:pPr>
+      <w:r>
+        <w:rPr>
+          <w:b/>
+          <w:bCs/>
+        </w:rPr>
+        <w:t xml:space="preserve">Files.</w:t>
+      </w:r>
+      <w:r>
+        <w:t xml:space="preserve"> </w:t>
+      </w:r>
+      <w:r>
+        <w:t xml:space="preserve">Does</w:t>
+      </w:r>
+      <w:r>
+        <w:t xml:space="preserve"> </w:t>
+      </w:r>
+      <w:r>
+        <w:rPr>
+          <w:rStyle w:val="VerbatimChar"/>
+        </w:rPr>
+        <w:t xml:space="preserve">~/.claude/hooks/&lt;script&gt;</w:t>
+      </w:r>
+      <w:r>
+        <w:t xml:space="preserve"> </w:t>
+      </w:r>
+      <w:r>
+        <w:t xml:space="preserve">still track the checkout,</w:t>
+      </w:r>
+      <w:r>
+        <w:t xml:space="preserve"> </w:t>
+      </w:r>
+      <w:r>
+        <w:t xml:space="preserve">or has it drifted, gone missing, or become a dangling link?</w:t>
+      </w:r>
+    </w:p>
+    <w:p>
+      <w:pPr>
+        <w:pStyle w:val="Compact"/>
+        <w:numPr>
+          <w:ilvl w:val="0"/>
+          <w:numId w:val="1105"/>
+        </w:numPr>
+      </w:pPr>
+      <w:r>
+        <w:rPr>
+          <w:b/>
+          <w:bCs/>
+        </w:rPr>
+        <w:t xml:space="preserve">Bindings.</w:t>
+      </w:r>
+      <w:r>
+        <w:t xml:space="preserve"> </w:t>
+      </w:r>
+      <w:r>
+        <w:t xml:space="preserve">Does</w:t>
+      </w:r>
+      <w:r>
+        <w:t xml:space="preserve"> </w:t>
+      </w:r>
+      <w:r>
+        <w:rPr>
+          <w:rStyle w:val="VerbatimChar"/>
+        </w:rPr>
+        <w:t xml:space="preserve">settings.json</w:t>
+      </w:r>
+      <w:r>
+        <w:t xml:space="preserve"> </w:t>
+      </w:r>
+      <w:r>
+        <w:t xml:space="preserve">actually invoke that script on an event?</w:t>
+      </w:r>
+    </w:p>
+    <w:p>
+      <w:pPr>
+        <w:pStyle w:val="FirstParagraph"/>
+      </w:pPr>
+      <w:r>
+        <w:t xml:space="preserve">A guard can be a perfectly linked file that is registered to nothing,</w:t>
+      </w:r>
+      <w:r>
+        <w:t xml:space="preserve"> </w:t>
+      </w:r>
+      <w:r>
+        <w:t xml:space="preserve">and an unregistered guard and a guard with nothing to block</w:t>
+      </w:r>
+      <w:r>
+        <w:t xml:space="preserve"> </w:t>
+      </w:r>
+      <w:r>
+        <w:t xml:space="preserve">produce the same output: none.</w:t>
+      </w:r>
+      <w:r>
+        <w:t xml:space="preserve"> </w:t>
+      </w:r>
+      <w:r>
+        <w:t xml:space="preserve">So verify both, and read the two results separately.</w:t>
+      </w:r>
+    </w:p>
+    <w:bookmarkEnd w:id="232"/>
+    <w:bookmarkStart w:id="233" w:name="one-plugin-per-capability"/>
+    <w:p>
+      <w:pPr>
+        <w:pStyle w:val="Heading4"/>
+      </w:pPr>
+      <w:r>
+        <w:t xml:space="preserve">One Plugin Per Capability</w:t>
+      </w:r>
+    </w:p>
+    <w:p>
+      <w:pPr>
+        <w:pStyle w:val="FirstParagraph"/>
+      </w:pPr>
+      <w:r>
+        <w:t xml:space="preserve">Enabling the</w:t>
+      </w:r>
+      <w:r>
+        <w:t xml:space="preserve"> </w:t>
+      </w:r>
+      <w:r>
+        <w:rPr>
+          <w:i/>
+          <w:iCs/>
+        </w:rPr>
+        <w:t xml:space="preserve">same</w:t>
+      </w:r>
+      <w:r>
+        <w:t xml:space="preserve"> </w:t>
+      </w:r>
+      <w:r>
+        <w:t xml:space="preserve">repository as a plugin from two marketplaces —</w:t>
+      </w:r>
+      <w:r>
+        <w:t xml:space="preserve"> </w:t>
+      </w:r>
+      <w:r>
+        <w:t xml:space="preserve">a personal fork and a lab org, say —</w:t>
+      </w:r>
+      <w:r>
+        <w:t xml:space="preserve"> </w:t>
+      </w:r>
+      <w:r>
+        <w:t xml:space="preserve">loads its whole skill set into every session twice.</w:t>
+      </w:r>
+      <w:r>
+        <w:t xml:space="preserve"> </w:t>
+      </w:r>
+      <w:r>
+        <w:t xml:space="preserve">That is not just untidy.</w:t>
+      </w:r>
+      <w:r>
+        <w:t xml:space="preserve"> </w:t>
+      </w:r>
+      <w:r>
+        <w:t xml:space="preserve">A large instruction corpus is already a substantial share of a session’s context,</w:t>
+      </w:r>
+      <w:r>
+        <w:t xml:space="preserve"> </w:t>
+      </w:r>
+      <w:r>
+        <w:t xml:space="preserve">and a duplicated one can push a session far enough over</w:t>
+      </w:r>
+      <w:r>
+        <w:t xml:space="preserve"> </w:t>
+      </w:r>
+      <w:r>
+        <w:t xml:space="preserve">the model’s context limit to break subagent delegation,</w:t>
+      </w:r>
+      <w:r>
+        <w:t xml:space="preserve"> </w:t>
+      </w:r>
+      <w:r>
+        <w:t xml:space="preserve">because a subagent independently re-loads</w:t>
+      </w:r>
+      <w:r>
+        <w:t xml:space="preserve"> </w:t>
+      </w:r>
+      <w:r>
+        <w:t xml:space="preserve">that same duplicated skill set at start,</w:t>
+      </w:r>
+      <w:r>
+        <w:t xml:space="preserve"> </w:t>
+      </w:r>
+      <w:r>
+        <w:t xml:space="preserve">and that alone can exceed the limit before any work begins.</w:t>
+      </w:r>
+      <w:r>
+        <w:t xml:space="preserve"> </w:t>
+      </w:r>
+      <w:r>
+        <w:t xml:space="preserve">Keep one copy enabled.</w:t>
+      </w:r>
+    </w:p>
+    <w:bookmarkEnd w:id="233"/>
+    <w:bookmarkStart w:id="234" w:name="failure-modes-and-their-symptoms"/>
+    <w:p>
+      <w:pPr>
+        <w:pStyle w:val="Heading4"/>
+      </w:pPr>
+      <w:r>
+        <w:t xml:space="preserve">Failure Modes and Their Symptoms</w:t>
+      </w:r>
+    </w:p>
+    <w:p>
+      <w:pPr>
+        <w:pStyle w:val="FirstParagraph"/>
+      </w:pPr>
+      <w:r>
+        <w:t xml:space="preserve">A broken install rarely announces itself; you read it backward from a symptom.</w:t>
+      </w:r>
+    </w:p>
+    <w:p>
+      <w:pPr>
+        <w:pStyle w:val="Compact"/>
+        <w:numPr>
+          <w:ilvl w:val="0"/>
+          <w:numId w:val="1106"/>
+        </w:numPr>
+      </w:pPr>
+      <w:r>
+        <w:rPr>
+          <w:b/>
+          <w:bCs/>
+        </w:rPr>
+        <w:t xml:space="preserve">A stale hook reference blocks the tool it guards.</w:t>
+      </w:r>
+      <w:r>
+        <w:t xml:space="preserve"> </w:t>
+      </w:r>
+      <w:r>
+        <w:t xml:space="preserve">A</w:t>
+      </w:r>
+      <w:r>
+        <w:t xml:space="preserve"> </w:t>
+      </w:r>
+      <w:r>
+        <w:rPr>
+          <w:rStyle w:val="VerbatimChar"/>
+        </w:rPr>
+        <w:t xml:space="preserve">settings.json</w:t>
+      </w:r>
+      <w:r>
+        <w:t xml:space="preserve"> </w:t>
+      </w:r>
+      <w:r>
+        <w:t xml:space="preserve">entry pointing at a hook script that no longer exists</w:t>
+      </w:r>
+      <w:r>
+        <w:t xml:space="preserve"> </w:t>
+      </w:r>
+      <w:r>
+        <w:t xml:space="preserve">errors before the guarded tool runs,</w:t>
+      </w:r>
+      <w:r>
+        <w:t xml:space="preserve"> </w:t>
+      </w:r>
+      <w:r>
+        <w:t xml:space="preserve">so every call to that tool fails with the hook’s error rather than the tool’s output.</w:t>
+      </w:r>
+      <w:r>
+        <w:t xml:space="preserve"> </w:t>
+      </w:r>
+      <w:r>
+        <w:t xml:space="preserve">A</w:t>
+      </w:r>
+      <w:r>
+        <w:t xml:space="preserve"> </w:t>
+      </w:r>
+      <w:r>
+        <w:rPr>
+          <w:rStyle w:val="VerbatimChar"/>
+        </w:rPr>
+        <w:t xml:space="preserve">PreToolUse</w:t>
+      </w:r>
+      <w:r>
+        <w:t xml:space="preserve"> </w:t>
+      </w:r>
+      <w:r>
+        <w:t xml:space="preserve">hook on</w:t>
+      </w:r>
+      <w:r>
+        <w:t xml:space="preserve"> </w:t>
+      </w:r>
+      <w:r>
+        <w:rPr>
+          <w:rStyle w:val="VerbatimChar"/>
+        </w:rPr>
+        <w:t xml:space="preserve">Bash</w:t>
+      </w:r>
+      <w:r>
+        <w:t xml:space="preserve"> </w:t>
+      </w:r>
+      <w:r>
+        <w:t xml:space="preserve">that references a missing script,</w:t>
+      </w:r>
+      <w:r>
+        <w:t xml:space="preserve"> </w:t>
+      </w:r>
+      <w:r>
+        <w:t xml:space="preserve">for instance, blocks</w:t>
+      </w:r>
+      <w:r>
+        <w:t xml:space="preserve"> </w:t>
+      </w:r>
+      <w:r>
+        <w:rPr>
+          <w:i/>
+          <w:iCs/>
+        </w:rPr>
+        <w:t xml:space="preserve">all</w:t>
+      </w:r>
+      <w:r>
+        <w:t xml:space="preserve"> </w:t>
+      </w:r>
+      <w:r>
+        <w:t xml:space="preserve">shell commands until the entry is removed.</w:t>
+      </w:r>
+    </w:p>
+    <w:p>
+      <w:pPr>
+        <w:pStyle w:val="Compact"/>
+        <w:numPr>
+          <w:ilvl w:val="0"/>
+          <w:numId w:val="1106"/>
+        </w:numPr>
+      </w:pPr>
+      <w:r>
+        <w:rPr>
+          <w:b/>
+          <w:bCs/>
+        </w:rPr>
+        <w:t xml:space="preserve">A dangling symlink silently drops a file.</w:t>
+      </w:r>
+      <w:r>
+        <w:t xml:space="preserve"> </w:t>
+      </w:r>
+      <w:r>
+        <w:t xml:space="preserve">A</w:t>
+      </w:r>
+      <w:r>
+        <w:t xml:space="preserve"> </w:t>
+      </w:r>
+      <w:r>
+        <w:rPr>
+          <w:rStyle w:val="VerbatimChar"/>
+        </w:rPr>
+        <w:t xml:space="preserve">~/.claude</w:t>
+      </w:r>
+      <w:r>
+        <w:t xml:space="preserve"> </w:t>
+      </w:r>
+      <w:r>
+        <w:t xml:space="preserve">child symlinked into a temporary worktree or a since-deleted clone</w:t>
+      </w:r>
+      <w:r>
+        <w:t xml:space="preserve"> </w:t>
+      </w:r>
+      <w:r>
+        <w:t xml:space="preserve">becomes a dead link when that directory is removed,</w:t>
+      </w:r>
+      <w:r>
+        <w:t xml:space="preserve"> </w:t>
+      </w:r>
+      <w:r>
+        <w:t xml:space="preserve">and the instructions or agent definition it provided quietly stop loading.</w:t>
+      </w:r>
+    </w:p>
+    <w:p>
+      <w:pPr>
+        <w:pStyle w:val="Compact"/>
+        <w:numPr>
+          <w:ilvl w:val="0"/>
+          <w:numId w:val="1106"/>
+        </w:numPr>
+      </w:pPr>
+      <w:r>
+        <w:rPr>
+          <w:b/>
+          <w:bCs/>
+        </w:rPr>
+        <w:t xml:space="preserve">A check run against the wrong checkout cries wolf.</w:t>
+      </w:r>
+      <w:r>
+        <w:t xml:space="preserve"> </w:t>
+      </w:r>
+      <w:r>
+        <w:t xml:space="preserve">A verification that compares the installed copies against a stale</w:t>
+      </w:r>
+      <w:r>
+        <w:t xml:space="preserve"> </w:t>
+      </w:r>
+      <w:r>
+        <w:t xml:space="preserve">or unintended checkout can report every entry as misdirected.</w:t>
+      </w:r>
+      <w:r>
+        <w:t xml:space="preserve"> </w:t>
+      </w:r>
+      <w:r>
+        <w:t xml:space="preserve">That is a false alarm from a check aimed at the wrong target, not a fleet of real problems;</w:t>
+      </w:r>
+      <w:r>
+        <w:t xml:space="preserve"> </w:t>
+      </w:r>
+      <w:r>
+        <w:t xml:space="preserve">re-run it against the checkout the install is actually anchored to before acting.</w:t>
+      </w:r>
+    </w:p>
+    <w:p>
+      <w:pPr>
+        <w:pStyle w:val="FirstParagraph"/>
+      </w:pPr>
+      <w:r>
+        <w:t xml:space="preserve">The common thread is that the install layer is a real surface,</w:t>
+      </w:r>
+      <w:r>
+        <w:t xml:space="preserve"> </w:t>
+      </w:r>
+      <w:r>
+        <w:t xml:space="preserve">distinct from the content of the config,</w:t>
+      </w:r>
+      <w:r>
+        <w:t xml:space="preserve"> </w:t>
+      </w:r>
+      <w:r>
+        <w:t xml:space="preserve">with its own failure modes and its own checks.</w:t>
+      </w:r>
+      <w:r>
+        <w:t xml:space="preserve"> </w:t>
+      </w:r>
+      <w:r>
+        <w:t xml:space="preserve">When an agent behaves as though a rule or skill you wrote does not exist,</w:t>
+      </w:r>
+      <w:r>
+        <w:t xml:space="preserve"> </w:t>
+      </w:r>
+      <w:r>
+        <w:t xml:space="preserve">suspect the install before you suspect the rule.</w:t>
+      </w:r>
+    </w:p>
+    <w:bookmarkEnd w:id="234"/>
+    <w:bookmarkEnd w:id="235"/>
+    <w:bookmarkStart w:id="242" w:name="sec-ai-claude-cloud-env"/>
+    <w:p>
+      <w:pPr>
+        <w:pStyle w:val="Heading1"/>
+      </w:pPr>
+      <w:r>
+        <w:t xml:space="preserve">24. Claude Code Cloud Environments</w:t>
       </w:r>
     </w:p>
     <w:p>
@@ -28233,7 +29161,7 @@
       <w:r>
         <w:t xml:space="preserve"> </w:t>
       </w:r>
-      <w:hyperlink r:id="rId231">
+      <w:hyperlink r:id="rId236">
         <w:r>
           <w:rPr>
             <w:rStyle w:val="Hyperlink"/>
@@ -28313,7 +29241,7 @@
         <w:pStyle w:val="Compact"/>
         <w:numPr>
           <w:ilvl w:val="0"/>
-          <w:numId w:val="1104"/>
+          <w:numId w:val="1107"/>
         </w:numPr>
       </w:pPr>
       <w:r>
@@ -28350,7 +29278,7 @@
         <w:pStyle w:val="Compact"/>
         <w:numPr>
           <w:ilvl w:val="0"/>
-          <w:numId w:val="1104"/>
+          <w:numId w:val="1107"/>
         </w:numPr>
       </w:pPr>
       <w:r>
@@ -28405,7 +29333,7 @@
         <w:pStyle w:val="Compact"/>
         <w:numPr>
           <w:ilvl w:val="0"/>
-          <w:numId w:val="1104"/>
+          <w:numId w:val="1107"/>
         </w:numPr>
       </w:pPr>
       <w:r>
@@ -28431,7 +29359,7 @@
         <w:t xml:space="preserve">for example to install dependencies.</w:t>
       </w:r>
     </w:p>
-    <w:bookmarkStart w:id="236" w:name="X99b85cd9c84d17a9c31061ff898ea0b26b46932"/>
+    <w:bookmarkStart w:id="241" w:name="X99b85cd9c84d17a9c31061ff898ea0b26b46932"/>
     <w:p>
       <w:pPr>
         <w:pStyle w:val="Heading4"/>
@@ -28508,7 +29436,7 @@
         <w:pStyle w:val="Compact"/>
         <w:numPr>
           <w:ilvl w:val="0"/>
-          <w:numId w:val="1105"/>
+          <w:numId w:val="1108"/>
         </w:numPr>
       </w:pPr>
       <w:r>
@@ -28526,7 +29454,7 @@
         <w:pStyle w:val="Compact"/>
         <w:numPr>
           <w:ilvl w:val="0"/>
-          <w:numId w:val="1105"/>
+          <w:numId w:val="1108"/>
         </w:numPr>
       </w:pPr>
       <w:r>
@@ -28592,7 +29520,7 @@
       <w:r>
         <w:t xml:space="preserve"> </w:t>
       </w:r>
-      <w:hyperlink r:id="rId231">
+      <w:hyperlink r:id="rId236">
         <w:r>
           <w:rPr>
             <w:rStyle w:val="Hyperlink"/>
@@ -28687,12 +29615,12 @@
                 <wp:inline>
                   <wp:extent cx="152400" cy="152400"/>
                   <wp:effectExtent b="0" l="0" r="0" t="0"/>
-                  <wp:docPr descr="" title="" id="232" name="Picture"/>
+                  <wp:docPr descr="" title="" id="237" name="Picture"/>
                   <a:graphic>
                     <a:graphicData uri="http://schemas.openxmlformats.org/drawingml/2006/picture">
                       <pic:pic>
                         <pic:nvPicPr>
-                          <pic:cNvPr descr="/opt/quarto/share/formats/docx/note.png" id="233" name="Picture"/>
+                          <pic:cNvPr descr="/opt/quarto/share/formats/docx/note.png" id="238" name="Picture"/>
                           <pic:cNvPicPr>
                             <a:picLocks noChangeArrowheads="1" noChangeAspect="1"/>
                           </pic:cNvPicPr>
@@ -28808,7 +29736,7 @@
       <w:r>
         <w:t xml:space="preserve"> </w:t>
       </w:r>
-      <w:hyperlink r:id="rId234">
+      <w:hyperlink r:id="rId239">
         <w:r>
           <w:rPr>
             <w:rStyle w:val="Hyperlink"/>
@@ -28825,7 +29753,7 @@
       <w:r>
         <w:t xml:space="preserve"> </w:t>
       </w:r>
-      <w:hyperlink r:id="rId235">
+      <w:hyperlink r:id="rId240">
         <w:r>
           <w:rPr>
             <w:rStyle w:val="Hyperlink"/>
@@ -28837,15 +29765,15 @@
         <w:t xml:space="preserve">.</w:t>
       </w:r>
     </w:p>
-    <w:bookmarkEnd w:id="236"/>
-    <w:bookmarkEnd w:id="237"/>
-    <w:bookmarkStart w:id="241" w:name="sec-ai-when-to-use"/>
+    <w:bookmarkEnd w:id="241"/>
+    <w:bookmarkEnd w:id="242"/>
+    <w:bookmarkStart w:id="246" w:name="sec-ai-when-to-use"/>
     <w:p>
       <w:pPr>
         <w:pStyle w:val="Heading1"/>
       </w:pPr>
       <w:r>
-        <w:t xml:space="preserve">24. When to use a coding agent</w:t>
+        <w:t xml:space="preserve">25. When to use a coding agent</w:t>
       </w:r>
     </w:p>
     <w:p>
@@ -28859,7 +29787,7 @@
         <w:rPr>
           <w:rStyle w:val="FootnoteReference"/>
         </w:rPr>
-        <w:footnoteReference w:id="238"/>
+        <w:footnoteReference w:id="243"/>
       </w:r>
       <w:r>
         <w:t xml:space="preserve"> </w:t>
@@ -28891,7 +29819,7 @@
       <w:r>
         <w:t xml:space="preserve"> </w:t>
       </w:r>
-      <w:hyperlink r:id="rId239">
+      <w:hyperlink r:id="rId244">
         <w:r>
           <w:rPr>
             <w:rStyle w:val="Hyperlink"/>
@@ -28950,7 +29878,7 @@
       <w:r>
         <w:t xml:space="preserve"> </w:t>
       </w:r>
-      <w:hyperlink r:id="rId240">
+      <w:hyperlink r:id="rId245">
         <w:r>
           <w:rPr>
             <w:rStyle w:val="Hyperlink"/>
@@ -29069,14 +29997,14 @@
         <w:t xml:space="preserve">just like you would for any other skill you want to maintain.</w:t>
       </w:r>
     </w:p>
-    <w:bookmarkEnd w:id="241"/>
-    <w:bookmarkStart w:id="246" w:name="editing-with-.docx-files"/>
+    <w:bookmarkEnd w:id="246"/>
+    <w:bookmarkStart w:id="251" w:name="editing-with-.docx-files"/>
     <w:p>
       <w:pPr>
         <w:pStyle w:val="Heading1"/>
       </w:pPr>
       <w:r>
-        <w:t xml:space="preserve">25. Editing with</w:t>
+        <w:t xml:space="preserve">26. Editing with</w:t>
       </w:r>
       <w:r>
         <w:t xml:space="preserve"> </w:t>
@@ -29122,7 +30050,7 @@
         <w:pStyle w:val="Compact"/>
         <w:numPr>
           <w:ilvl w:val="0"/>
-          <w:numId w:val="1106"/>
+          <w:numId w:val="1109"/>
         </w:numPr>
       </w:pPr>
       <w:r>
@@ -29134,7 +30062,7 @@
         <w:pStyle w:val="Compact"/>
         <w:numPr>
           <w:ilvl w:val="0"/>
-          <w:numId w:val="1106"/>
+          <w:numId w:val="1109"/>
         </w:numPr>
       </w:pPr>
       <w:r>
@@ -29146,7 +30074,7 @@
         <w:pStyle w:val="Compact"/>
         <w:numPr>
           <w:ilvl w:val="0"/>
-          <w:numId w:val="1106"/>
+          <w:numId w:val="1109"/>
         </w:numPr>
       </w:pPr>
       <w:r>
@@ -29181,7 +30109,7 @@
         <w:pStyle w:val="Compact"/>
         <w:numPr>
           <w:ilvl w:val="0"/>
-          <w:numId w:val="1107"/>
+          <w:numId w:val="1110"/>
         </w:numPr>
       </w:pPr>
       <w:r>
@@ -29208,7 +30136,7 @@
         <w:pStyle w:val="Compact"/>
         <w:numPr>
           <w:ilvl w:val="0"/>
-          <w:numId w:val="1107"/>
+          <w:numId w:val="1110"/>
         </w:numPr>
       </w:pPr>
       <w:r>
@@ -29235,7 +30163,7 @@
         <w:pStyle w:val="Compact"/>
         <w:numPr>
           <w:ilvl w:val="0"/>
-          <w:numId w:val="1107"/>
+          <w:numId w:val="1110"/>
         </w:numPr>
       </w:pPr>
       <w:r>
@@ -29250,7 +30178,7 @@
         <w:t xml:space="preserve">This approach makes it easier for collaborators who are more comfortable with Word to contribute while maintaining the source files in Quarto format.</w:t>
       </w:r>
     </w:p>
-    <w:bookmarkStart w:id="245" w:name="known-issue-document-1-warning-in-word"/>
+    <w:bookmarkStart w:id="250" w:name="known-issue-document-1-warning-in-word"/>
     <w:p>
       <w:pPr>
         <w:pStyle w:val="Heading4"/>
@@ -29332,10 +30260,10 @@
         <w:pStyle w:val="Compact"/>
         <w:numPr>
           <w:ilvl w:val="0"/>
-          <w:numId w:val="1108"/>
-        </w:numPr>
-      </w:pPr>
-      <w:hyperlink r:id="rId242">
+          <w:numId w:val="1111"/>
+        </w:numPr>
+      </w:pPr>
+      <w:hyperlink r:id="rId247">
         <w:r>
           <w:rPr>
             <w:rStyle w:val="Hyperlink"/>
@@ -29349,10 +30277,10 @@
         <w:pStyle w:val="Compact"/>
         <w:numPr>
           <w:ilvl w:val="0"/>
-          <w:numId w:val="1108"/>
-        </w:numPr>
-      </w:pPr>
-      <w:hyperlink r:id="rId243">
+          <w:numId w:val="1111"/>
+        </w:numPr>
+      </w:pPr>
+      <w:hyperlink r:id="rId248">
         <w:r>
           <w:rPr>
             <w:rStyle w:val="Hyperlink"/>
@@ -29366,10 +30294,10 @@
         <w:pStyle w:val="Compact"/>
         <w:numPr>
           <w:ilvl w:val="0"/>
-          <w:numId w:val="1108"/>
-        </w:numPr>
-      </w:pPr>
-      <w:hyperlink r:id="rId244">
+          <w:numId w:val="1111"/>
+        </w:numPr>
+      </w:pPr>
+      <w:hyperlink r:id="rId249">
         <w:r>
           <w:rPr>
             <w:rStyle w:val="Hyperlink"/>
@@ -29407,7 +30335,7 @@
         <w:pStyle w:val="Compact"/>
         <w:numPr>
           <w:ilvl w:val="0"/>
-          <w:numId w:val="1109"/>
+          <w:numId w:val="1112"/>
         </w:numPr>
       </w:pPr>
       <w:r>
@@ -29419,7 +30347,7 @@
         <w:pStyle w:val="Compact"/>
         <w:numPr>
           <w:ilvl w:val="0"/>
-          <w:numId w:val="1109"/>
+          <w:numId w:val="1112"/>
         </w:numPr>
       </w:pPr>
       <w:r>
@@ -29431,7 +30359,7 @@
         <w:pStyle w:val="Compact"/>
         <w:numPr>
           <w:ilvl w:val="0"/>
-          <w:numId w:val="1109"/>
+          <w:numId w:val="1112"/>
         </w:numPr>
       </w:pPr>
       <w:r>
@@ -29449,7 +30377,7 @@
         <w:pStyle w:val="Compact"/>
         <w:numPr>
           <w:ilvl w:val="0"/>
-          <w:numId w:val="1109"/>
+          <w:numId w:val="1112"/>
         </w:numPr>
       </w:pPr>
       <w:r>
@@ -29482,15 +30410,15 @@
         <w:t xml:space="preserve">warning and can immediately add comments and track changes without issues.</w:t>
       </w:r>
     </w:p>
-    <w:bookmarkEnd w:id="245"/>
-    <w:bookmarkEnd w:id="246"/>
-    <w:bookmarkStart w:id="248" w:name="copilot-instructions-for-this-repository"/>
+    <w:bookmarkEnd w:id="250"/>
+    <w:bookmarkEnd w:id="251"/>
+    <w:bookmarkStart w:id="253" w:name="copilot-instructions-for-this-repository"/>
     <w:p>
       <w:pPr>
         <w:pStyle w:val="Heading1"/>
       </w:pPr>
       <w:r>
-        <w:t xml:space="preserve">26. Copilot Instructions for this Repository</w:t>
+        <w:t xml:space="preserve">27. Copilot Instructions for this Repository</w:t>
       </w:r>
     </w:p>
     <w:p>
@@ -29571,7 +30499,7 @@
         <w:pStyle w:val="Compact"/>
         <w:numPr>
           <w:ilvl w:val="0"/>
-          <w:numId w:val="1110"/>
+          <w:numId w:val="1113"/>
         </w:numPr>
       </w:pPr>
       <w:r>
@@ -29583,7 +30511,7 @@
         <w:pStyle w:val="Compact"/>
         <w:numPr>
           <w:ilvl w:val="0"/>
-          <w:numId w:val="1110"/>
+          <w:numId w:val="1113"/>
         </w:numPr>
       </w:pPr>
       <w:r>
@@ -29607,7 +30535,7 @@
         <w:pStyle w:val="Compact"/>
         <w:numPr>
           <w:ilvl w:val="0"/>
-          <w:numId w:val="1110"/>
+          <w:numId w:val="1113"/>
         </w:numPr>
       </w:pPr>
       <w:r>
@@ -29619,7 +30547,7 @@
         <w:pStyle w:val="Compact"/>
         <w:numPr>
           <w:ilvl w:val="0"/>
-          <w:numId w:val="1110"/>
+          <w:numId w:val="1113"/>
         </w:numPr>
       </w:pPr>
       <w:r>
@@ -29631,7 +30559,7 @@
         <w:pStyle w:val="Compact"/>
         <w:numPr>
           <w:ilvl w:val="0"/>
-          <w:numId w:val="1110"/>
+          <w:numId w:val="1113"/>
         </w:numPr>
       </w:pPr>
       <w:r>
@@ -29649,7 +30577,7 @@
         <w:pStyle w:val="Compact"/>
         <w:numPr>
           <w:ilvl w:val="0"/>
-          <w:numId w:val="1110"/>
+          <w:numId w:val="1113"/>
         </w:numPr>
       </w:pPr>
       <w:r>
@@ -29716,7 +30644,7 @@
       <w:r>
         <w:t xml:space="preserve"> </w:t>
       </w:r>
-      <w:hyperlink r:id="rId247">
+      <w:hyperlink r:id="rId252">
         <w:r>
           <w:rPr>
             <w:rStyle w:val="VerbatimChar"/>
@@ -29731,14 +30659,14 @@
         <w:t xml:space="preserve">for a working example.</w:t>
       </w:r>
     </w:p>
-    <w:bookmarkEnd w:id="248"/>
-    <w:bookmarkStart w:id="249" w:name="using-copilot-review-before-human-review"/>
+    <w:bookmarkEnd w:id="253"/>
+    <w:bookmarkStart w:id="254" w:name="using-copilot-review-before-human-review"/>
     <w:p>
       <w:pPr>
         <w:pStyle w:val="Heading1"/>
       </w:pPr>
       <w:r>
-        <w:t xml:space="preserve">27. Using Copilot Review Before Human Review</w:t>
+        <w:t xml:space="preserve">28. Using Copilot Review Before Human Review</w:t>
       </w:r>
     </w:p>
     <w:p>
@@ -29797,7 +30725,7 @@
         <w:pStyle w:val="Compact"/>
         <w:numPr>
           <w:ilvl w:val="0"/>
-          <w:numId w:val="1111"/>
+          <w:numId w:val="1114"/>
         </w:numPr>
       </w:pPr>
       <w:r>
@@ -29816,7 +30744,7 @@
         <w:pStyle w:val="Compact"/>
         <w:numPr>
           <w:ilvl w:val="0"/>
-          <w:numId w:val="1111"/>
+          <w:numId w:val="1114"/>
         </w:numPr>
       </w:pPr>
       <w:r>
@@ -29835,7 +30763,7 @@
         <w:pStyle w:val="Compact"/>
         <w:numPr>
           <w:ilvl w:val="0"/>
-          <w:numId w:val="1111"/>
+          <w:numId w:val="1114"/>
         </w:numPr>
       </w:pPr>
       <w:r>
@@ -29854,7 +30782,7 @@
         <w:pStyle w:val="Compact"/>
         <w:numPr>
           <w:ilvl w:val="0"/>
-          <w:numId w:val="1111"/>
+          <w:numId w:val="1114"/>
         </w:numPr>
       </w:pPr>
       <w:r>
@@ -29873,7 +30801,7 @@
         <w:pStyle w:val="Compact"/>
         <w:numPr>
           <w:ilvl w:val="0"/>
-          <w:numId w:val="1111"/>
+          <w:numId w:val="1114"/>
         </w:numPr>
       </w:pPr>
       <w:r>
@@ -29903,7 +30831,7 @@
       <w:pPr>
         <w:numPr>
           <w:ilvl w:val="0"/>
-          <w:numId w:val="1112"/>
+          <w:numId w:val="1115"/>
         </w:numPr>
       </w:pPr>
       <w:r>
@@ -29951,7 +30879,7 @@
       <w:pPr>
         <w:numPr>
           <w:ilvl w:val="0"/>
-          <w:numId w:val="1112"/>
+          <w:numId w:val="1115"/>
         </w:numPr>
       </w:pPr>
       <w:r>
@@ -29988,7 +30916,7 @@
         <w:pStyle w:val="Compact"/>
         <w:numPr>
           <w:ilvl w:val="1"/>
-          <w:numId w:val="1113"/>
+          <w:numId w:val="1116"/>
         </w:numPr>
       </w:pPr>
       <w:r>
@@ -30007,7 +30935,7 @@
         <w:pStyle w:val="Compact"/>
         <w:numPr>
           <w:ilvl w:val="1"/>
-          <w:numId w:val="1113"/>
+          <w:numId w:val="1116"/>
         </w:numPr>
       </w:pPr>
       <w:r>
@@ -30026,7 +30954,7 @@
         <w:pStyle w:val="Compact"/>
         <w:numPr>
           <w:ilvl w:val="1"/>
-          <w:numId w:val="1113"/>
+          <w:numId w:val="1116"/>
         </w:numPr>
       </w:pPr>
       <w:r>
@@ -30044,7 +30972,7 @@
       <w:pPr>
         <w:numPr>
           <w:ilvl w:val="0"/>
-          <w:numId w:val="1112"/>
+          <w:numId w:val="1115"/>
         </w:numPr>
       </w:pPr>
       <w:r>
@@ -30080,7 +31008,7 @@
       <w:pPr>
         <w:numPr>
           <w:ilvl w:val="0"/>
-          <w:numId w:val="1112"/>
+          <w:numId w:val="1115"/>
         </w:numPr>
       </w:pPr>
       <w:r>
@@ -30110,7 +31038,7 @@
       <w:pPr>
         <w:numPr>
           <w:ilvl w:val="0"/>
-          <w:numId w:val="1112"/>
+          <w:numId w:val="1115"/>
         </w:numPr>
       </w:pPr>
       <w:r>
@@ -30165,7 +31093,7 @@
         <w:pStyle w:val="Compact"/>
         <w:numPr>
           <w:ilvl w:val="0"/>
-          <w:numId w:val="1114"/>
+          <w:numId w:val="1117"/>
         </w:numPr>
       </w:pPr>
       <w:r>
@@ -30184,7 +31112,7 @@
         <w:pStyle w:val="Compact"/>
         <w:numPr>
           <w:ilvl w:val="0"/>
-          <w:numId w:val="1114"/>
+          <w:numId w:val="1117"/>
         </w:numPr>
       </w:pPr>
       <w:r>
@@ -30203,7 +31131,7 @@
         <w:pStyle w:val="Compact"/>
         <w:numPr>
           <w:ilvl w:val="0"/>
-          <w:numId w:val="1114"/>
+          <w:numId w:val="1117"/>
         </w:numPr>
       </w:pPr>
       <w:r>
@@ -30222,7 +31150,7 @@
         <w:pStyle w:val="Compact"/>
         <w:numPr>
           <w:ilvl w:val="0"/>
-          <w:numId w:val="1114"/>
+          <w:numId w:val="1117"/>
         </w:numPr>
       </w:pPr>
       <w:r>
@@ -30318,14 +31246,14 @@
         <w:t xml:space="preserve">This ensures you’re reviewing code that has already been through initial automated quality checks.</w:t>
       </w:r>
     </w:p>
-    <w:bookmarkEnd w:id="249"/>
-    <w:bookmarkStart w:id="251" w:name="reviewing-a-copilot-pr-you-didnt-create"/>
+    <w:bookmarkEnd w:id="254"/>
+    <w:bookmarkStart w:id="256" w:name="reviewing-a-copilot-pr-you-didnt-create"/>
     <w:p>
       <w:pPr>
         <w:pStyle w:val="Heading1"/>
       </w:pPr>
       <w:r>
-        <w:t xml:space="preserve">28. Reviewing a Copilot PR You Didn’t Create</w:t>
+        <w:t xml:space="preserve">29. Reviewing a Copilot PR You Didn’t Create</w:t>
       </w:r>
     </w:p>
     <w:p>
@@ -30370,7 +31298,7 @@
       <w:r>
         <w:t xml:space="preserve"> </w:t>
       </w:r>
-      <w:hyperlink r:id="rId250">
+      <w:hyperlink r:id="rId255">
         <w:r>
           <w:rPr>
             <w:rStyle w:val="Hyperlink"/>
@@ -30393,7 +31321,7 @@
         <w:pStyle w:val="Compact"/>
         <w:numPr>
           <w:ilvl w:val="0"/>
-          <w:numId w:val="1115"/>
+          <w:numId w:val="1118"/>
         </w:numPr>
       </w:pPr>
       <w:r>
@@ -30448,7 +31376,7 @@
         <w:pStyle w:val="Compact"/>
         <w:numPr>
           <w:ilvl w:val="0"/>
-          <w:numId w:val="1115"/>
+          <w:numId w:val="1118"/>
         </w:numPr>
       </w:pPr>
       <w:r>
@@ -30503,7 +31431,7 @@
         <w:pStyle w:val="Compact"/>
         <w:numPr>
           <w:ilvl w:val="0"/>
-          <w:numId w:val="1116"/>
+          <w:numId w:val="1119"/>
         </w:numPr>
       </w:pPr>
       <w:r>
@@ -30524,7 +31452,7 @@
         <w:pStyle w:val="Compact"/>
         <w:numPr>
           <w:ilvl w:val="0"/>
-          <w:numId w:val="1116"/>
+          <w:numId w:val="1119"/>
         </w:numPr>
       </w:pPr>
       <w:r>
@@ -30536,7 +31464,7 @@
         <w:pStyle w:val="Compact"/>
         <w:numPr>
           <w:ilvl w:val="1"/>
-          <w:numId w:val="1117"/>
+          <w:numId w:val="1120"/>
         </w:numPr>
       </w:pPr>
       <w:r>
@@ -30548,7 +31476,7 @@
         <w:pStyle w:val="Compact"/>
         <w:numPr>
           <w:ilvl w:val="1"/>
-          <w:numId w:val="1117"/>
+          <w:numId w:val="1120"/>
         </w:numPr>
       </w:pPr>
       <w:r>
@@ -30560,7 +31488,7 @@
         <w:pStyle w:val="Compact"/>
         <w:numPr>
           <w:ilvl w:val="1"/>
-          <w:numId w:val="1117"/>
+          <w:numId w:val="1120"/>
         </w:numPr>
       </w:pPr>
       <w:r>
@@ -30572,7 +31500,7 @@
         <w:pStyle w:val="Compact"/>
         <w:numPr>
           <w:ilvl w:val="0"/>
-          <w:numId w:val="1116"/>
+          <w:numId w:val="1119"/>
         </w:numPr>
       </w:pPr>
       <w:r>
@@ -30584,7 +31512,7 @@
         <w:pStyle w:val="Compact"/>
         <w:numPr>
           <w:ilvl w:val="0"/>
-          <w:numId w:val="1116"/>
+          <w:numId w:val="1119"/>
         </w:numPr>
       </w:pPr>
       <w:r>
@@ -30596,7 +31524,7 @@
         <w:pStyle w:val="Compact"/>
         <w:numPr>
           <w:ilvl w:val="0"/>
-          <w:numId w:val="1116"/>
+          <w:numId w:val="1119"/>
         </w:numPr>
       </w:pPr>
       <w:r>
@@ -30652,7 +31580,7 @@
         <w:pStyle w:val="Compact"/>
         <w:numPr>
           <w:ilvl w:val="0"/>
-          <w:numId w:val="1118"/>
+          <w:numId w:val="1121"/>
         </w:numPr>
       </w:pPr>
       <w:r>
@@ -30727,7 +31655,7 @@
         <w:pStyle w:val="Compact"/>
         <w:numPr>
           <w:ilvl w:val="1"/>
-          <w:numId w:val="1119"/>
+          <w:numId w:val="1122"/>
         </w:numPr>
       </w:pPr>
       <w:r>
@@ -30755,7 +31683,7 @@
         <w:pStyle w:val="Compact"/>
         <w:numPr>
           <w:ilvl w:val="1"/>
-          <w:numId w:val="1119"/>
+          <w:numId w:val="1122"/>
         </w:numPr>
       </w:pPr>
       <w:r>
@@ -30783,7 +31711,7 @@
         <w:pStyle w:val="Compact"/>
         <w:numPr>
           <w:ilvl w:val="1"/>
-          <w:numId w:val="1119"/>
+          <w:numId w:val="1122"/>
         </w:numPr>
       </w:pPr>
       <w:r>
@@ -30795,7 +31723,7 @@
         <w:pStyle w:val="Compact"/>
         <w:numPr>
           <w:ilvl w:val="0"/>
-          <w:numId w:val="1118"/>
+          <w:numId w:val="1121"/>
         </w:numPr>
       </w:pPr>
       <w:r>
@@ -30814,7 +31742,7 @@
         <w:pStyle w:val="Compact"/>
         <w:numPr>
           <w:ilvl w:val="1"/>
-          <w:numId w:val="1120"/>
+          <w:numId w:val="1123"/>
         </w:numPr>
       </w:pPr>
       <w:r>
@@ -30826,7 +31754,7 @@
         <w:pStyle w:val="Compact"/>
         <w:numPr>
           <w:ilvl w:val="1"/>
-          <w:numId w:val="1120"/>
+          <w:numId w:val="1123"/>
         </w:numPr>
       </w:pPr>
       <w:r>
@@ -30838,7 +31766,7 @@
         <w:pStyle w:val="Compact"/>
         <w:numPr>
           <w:ilvl w:val="0"/>
-          <w:numId w:val="1118"/>
+          <w:numId w:val="1121"/>
         </w:numPr>
       </w:pPr>
       <w:r>
@@ -30857,7 +31785,7 @@
         <w:pStyle w:val="Compact"/>
         <w:numPr>
           <w:ilvl w:val="1"/>
-          <w:numId w:val="1121"/>
+          <w:numId w:val="1124"/>
         </w:numPr>
       </w:pPr>
       <w:r>
@@ -30869,7 +31797,7 @@
         <w:pStyle w:val="Compact"/>
         <w:numPr>
           <w:ilvl w:val="1"/>
-          <w:numId w:val="1121"/>
+          <w:numId w:val="1124"/>
         </w:numPr>
       </w:pPr>
       <w:r>
@@ -30881,7 +31809,7 @@
         <w:pStyle w:val="Compact"/>
         <w:numPr>
           <w:ilvl w:val="1"/>
-          <w:numId w:val="1121"/>
+          <w:numId w:val="1124"/>
         </w:numPr>
       </w:pPr>
       <w:r>
@@ -30913,7 +31841,7 @@
         <w:pStyle w:val="Compact"/>
         <w:numPr>
           <w:ilvl w:val="0"/>
-          <w:numId w:val="1122"/>
+          <w:numId w:val="1125"/>
         </w:numPr>
       </w:pPr>
       <w:r>
@@ -30932,7 +31860,7 @@
         <w:pStyle w:val="Compact"/>
         <w:numPr>
           <w:ilvl w:val="1"/>
-          <w:numId w:val="1123"/>
+          <w:numId w:val="1126"/>
         </w:numPr>
       </w:pPr>
       <w:r>
@@ -30944,7 +31872,7 @@
         <w:pStyle w:val="Compact"/>
         <w:numPr>
           <w:ilvl w:val="1"/>
-          <w:numId w:val="1123"/>
+          <w:numId w:val="1126"/>
         </w:numPr>
       </w:pPr>
       <w:r>
@@ -30956,7 +31884,7 @@
         <w:pStyle w:val="Compact"/>
         <w:numPr>
           <w:ilvl w:val="1"/>
-          <w:numId w:val="1123"/>
+          <w:numId w:val="1126"/>
         </w:numPr>
       </w:pPr>
       <w:r>
@@ -30968,7 +31896,7 @@
         <w:pStyle w:val="Compact"/>
         <w:numPr>
           <w:ilvl w:val="0"/>
-          <w:numId w:val="1122"/>
+          <w:numId w:val="1125"/>
         </w:numPr>
       </w:pPr>
       <w:r>
@@ -30987,7 +31915,7 @@
         <w:pStyle w:val="Compact"/>
         <w:numPr>
           <w:ilvl w:val="1"/>
-          <w:numId w:val="1124"/>
+          <w:numId w:val="1127"/>
         </w:numPr>
       </w:pPr>
       <w:r>
@@ -31006,7 +31934,7 @@
         <w:pStyle w:val="Compact"/>
         <w:numPr>
           <w:ilvl w:val="1"/>
-          <w:numId w:val="1124"/>
+          <w:numId w:val="1127"/>
         </w:numPr>
       </w:pPr>
       <w:r>
@@ -31025,7 +31953,7 @@
         <w:pStyle w:val="Compact"/>
         <w:numPr>
           <w:ilvl w:val="1"/>
-          <w:numId w:val="1124"/>
+          <w:numId w:val="1127"/>
         </w:numPr>
       </w:pPr>
       <w:r>
@@ -31050,7 +31978,7 @@
         <w:pStyle w:val="Compact"/>
         <w:numPr>
           <w:ilvl w:val="0"/>
-          <w:numId w:val="1122"/>
+          <w:numId w:val="1125"/>
         </w:numPr>
       </w:pPr>
       <w:r>
@@ -31069,7 +31997,7 @@
         <w:pStyle w:val="Compact"/>
         <w:numPr>
           <w:ilvl w:val="1"/>
-          <w:numId w:val="1125"/>
+          <w:numId w:val="1128"/>
         </w:numPr>
       </w:pPr>
       <w:r>
@@ -31081,7 +32009,7 @@
         <w:pStyle w:val="Compact"/>
         <w:numPr>
           <w:ilvl w:val="1"/>
-          <w:numId w:val="1125"/>
+          <w:numId w:val="1128"/>
         </w:numPr>
       </w:pPr>
       <w:r>
@@ -31093,7 +32021,7 @@
         <w:pStyle w:val="Compact"/>
         <w:numPr>
           <w:ilvl w:val="1"/>
-          <w:numId w:val="1125"/>
+          <w:numId w:val="1128"/>
         </w:numPr>
       </w:pPr>
       <w:r>
@@ -31105,7 +32033,7 @@
         <w:pStyle w:val="Compact"/>
         <w:numPr>
           <w:ilvl w:val="1"/>
-          <w:numId w:val="1125"/>
+          <w:numId w:val="1128"/>
         </w:numPr>
       </w:pPr>
       <w:r>
@@ -31161,7 +32089,7 @@
         <w:pStyle w:val="Compact"/>
         <w:numPr>
           <w:ilvl w:val="0"/>
-          <w:numId w:val="1126"/>
+          <w:numId w:val="1129"/>
         </w:numPr>
       </w:pPr>
       <w:r>
@@ -31173,7 +32101,7 @@
         <w:pStyle w:val="Compact"/>
         <w:numPr>
           <w:ilvl w:val="0"/>
-          <w:numId w:val="1126"/>
+          <w:numId w:val="1129"/>
         </w:numPr>
       </w:pPr>
       <w:r>
@@ -31185,7 +32113,7 @@
         <w:pStyle w:val="Compact"/>
         <w:numPr>
           <w:ilvl w:val="0"/>
-          <w:numId w:val="1126"/>
+          <w:numId w:val="1129"/>
         </w:numPr>
       </w:pPr>
       <w:r>
@@ -31205,7 +32133,7 @@
         <w:pStyle w:val="Compact"/>
         <w:numPr>
           <w:ilvl w:val="0"/>
-          <w:numId w:val="1127"/>
+          <w:numId w:val="1130"/>
         </w:numPr>
       </w:pPr>
       <w:r>
@@ -31217,7 +32145,7 @@
         <w:pStyle w:val="Compact"/>
         <w:numPr>
           <w:ilvl w:val="0"/>
-          <w:numId w:val="1127"/>
+          <w:numId w:val="1130"/>
         </w:numPr>
       </w:pPr>
       <w:r>
@@ -31229,7 +32157,7 @@
         <w:pStyle w:val="Compact"/>
         <w:numPr>
           <w:ilvl w:val="0"/>
-          <w:numId w:val="1127"/>
+          <w:numId w:val="1130"/>
         </w:numPr>
       </w:pPr>
       <w:r>
@@ -31241,7 +32169,7 @@
         <w:pStyle w:val="Compact"/>
         <w:numPr>
           <w:ilvl w:val="0"/>
-          <w:numId w:val="1127"/>
+          <w:numId w:val="1130"/>
         </w:numPr>
       </w:pPr>
       <w:r>
@@ -31274,14 +32202,14 @@
         <w:t xml:space="preserve">while benefiting from collaborative human review and Copilot’s implementation capabilities.</w:t>
       </w:r>
     </w:p>
-    <w:bookmarkEnd w:id="251"/>
-    <w:bookmarkStart w:id="270" w:name="sec-ai-claude-code-windows"/>
+    <w:bookmarkEnd w:id="256"/>
+    <w:bookmarkStart w:id="275" w:name="sec-ai-claude-code-windows"/>
     <w:p>
       <w:pPr>
         <w:pStyle w:val="Heading1"/>
       </w:pPr>
       <w:r>
-        <w:t xml:space="preserve">29. Installing Claude Code on Windows</w:t>
+        <w:t xml:space="preserve">30. Installing Claude Code on Windows</w:t>
       </w:r>
     </w:p>
     <w:p>
@@ -31374,12 +32302,12 @@
                 <wp:inline>
                   <wp:extent cx="152400" cy="152400"/>
                   <wp:effectExtent b="0" l="0" r="0" t="0"/>
-                  <wp:docPr descr="" title="" id="252" name="Picture"/>
+                  <wp:docPr descr="" title="" id="257" name="Picture"/>
                   <a:graphic>
                     <a:graphicData uri="http://schemas.openxmlformats.org/drawingml/2006/picture">
                       <pic:pic>
                         <pic:nvPicPr>
-                          <pic:cNvPr descr="/opt/quarto/share/formats/docx/note.png" id="253" name="Picture"/>
+                          <pic:cNvPr descr="/opt/quarto/share/formats/docx/note.png" id="258" name="Picture"/>
                           <pic:cNvPicPr>
                             <a:picLocks noChangeArrowheads="1" noChangeAspect="1"/>
                           </pic:cNvPicPr>
@@ -31467,7 +32395,7 @@
         </w:tc>
       </w:tr>
     </w:tbl>
-    <w:bookmarkStart w:id="256" w:name="run-it-from-a-unix-like-terminal"/>
+    <w:bookmarkStart w:id="261" w:name="run-it-from-a-unix-like-terminal"/>
     <w:p>
       <w:pPr>
         <w:pStyle w:val="Heading4"/>
@@ -31495,7 +32423,7 @@
         <w:pStyle w:val="Compact"/>
         <w:numPr>
           <w:ilvl w:val="0"/>
-          <w:numId w:val="1128"/>
+          <w:numId w:val="1131"/>
         </w:numPr>
       </w:pPr>
       <w:r>
@@ -31514,7 +32442,7 @@
       <w:r>
         <w:t xml:space="preserve"> </w:t>
       </w:r>
-      <w:hyperlink r:id="rId254">
+      <w:hyperlink r:id="rId259">
         <w:r>
           <w:rPr>
             <w:rStyle w:val="Hyperlink"/>
@@ -31531,7 +32459,7 @@
         <w:pStyle w:val="Compact"/>
         <w:numPr>
           <w:ilvl w:val="0"/>
-          <w:numId w:val="1128"/>
+          <w:numId w:val="1131"/>
         </w:numPr>
       </w:pPr>
       <w:r>
@@ -31547,7 +32475,7 @@
       <w:r>
         <w:t xml:space="preserve">(</w:t>
       </w:r>
-      <w:hyperlink r:id="rId255">
+      <w:hyperlink r:id="rId260">
         <w:r>
           <w:rPr>
             <w:rStyle w:val="Hyperlink"/>
@@ -31585,7 +32513,7 @@
         <w:pStyle w:val="Compact"/>
         <w:numPr>
           <w:ilvl w:val="0"/>
-          <w:numId w:val="1128"/>
+          <w:numId w:val="1131"/>
         </w:numPr>
       </w:pPr>
       <w:r>
@@ -31698,8 +32626,8 @@
         <w:t xml:space="preserve">gotchas below don’t apply.</w:t>
       </w:r>
     </w:p>
-    <w:bookmarkEnd w:id="256"/>
-    <w:bookmarkStart w:id="261" w:name="install-claude-code"/>
+    <w:bookmarkEnd w:id="261"/>
+    <w:bookmarkStart w:id="266" w:name="install-claude-code"/>
     <w:p>
       <w:pPr>
         <w:pStyle w:val="Heading4"/>
@@ -31720,7 +32648,7 @@
       <w:pPr>
         <w:numPr>
           <w:ilvl w:val="0"/>
-          <w:numId w:val="1129"/>
+          <w:numId w:val="1132"/>
         </w:numPr>
       </w:pPr>
       <w:r>
@@ -31845,7 +32773,7 @@
       <w:pPr>
         <w:numPr>
           <w:ilvl w:val="0"/>
-          <w:numId w:val="1129"/>
+          <w:numId w:val="1132"/>
         </w:numPr>
       </w:pPr>
       <w:r>
@@ -31864,7 +32792,7 @@
       <w:r>
         <w:t xml:space="preserve"> </w:t>
       </w:r>
-      <w:hyperlink r:id="rId257">
+      <w:hyperlink r:id="rId262">
         <w:r>
           <w:rPr>
             <w:rStyle w:val="Hyperlink"/>
@@ -31950,12 +32878,12 @@
                 <wp:inline>
                   <wp:extent cx="152400" cy="152400"/>
                   <wp:effectExtent b="0" l="0" r="0" t="0"/>
-                  <wp:docPr descr="" title="" id="258" name="Picture"/>
+                  <wp:docPr descr="" title="" id="263" name="Picture"/>
                   <a:graphic>
                     <a:graphicData uri="http://schemas.openxmlformats.org/drawingml/2006/picture">
                       <pic:pic>
                         <pic:nvPicPr>
-                          <pic:cNvPr descr="/opt/quarto/share/formats/docx/important.png" id="259" name="Picture"/>
+                          <pic:cNvPr descr="/opt/quarto/share/formats/docx/important.png" id="264" name="Picture"/>
                           <pic:cNvPicPr>
                             <a:picLocks noChangeArrowheads="1" noChangeAspect="1"/>
                           </pic:cNvPicPr>
@@ -32111,7 +33039,7 @@
             <w:r>
               <w:t xml:space="preserve"> </w:t>
             </w:r>
-            <w:hyperlink r:id="rId260">
+            <w:hyperlink r:id="rId265">
               <w:r>
                 <w:rPr>
                   <w:rStyle w:val="Hyperlink"/>
@@ -32202,8 +33130,8 @@
         </w:tc>
       </w:tr>
     </w:tbl>
-    <w:bookmarkEnd w:id="261"/>
-    <w:bookmarkStart w:id="263" w:name="make-sure-your-shell-can-find-claude"/>
+    <w:bookmarkEnd w:id="266"/>
+    <w:bookmarkStart w:id="268" w:name="make-sure-your-shell-can-find-claude"/>
     <w:p>
       <w:pPr>
         <w:pStyle w:val="Heading4"/>
@@ -32801,7 +33729,7 @@
       <w:r>
         <w:t xml:space="preserve"> </w:t>
       </w:r>
-      <w:hyperlink r:id="rId262">
+      <w:hyperlink r:id="rId267">
         <w:r>
           <w:rPr>
             <w:rStyle w:val="Hyperlink"/>
@@ -32907,8 +33835,8 @@
         <w:t xml:space="preserve">initializes).</w:t>
       </w:r>
     </w:p>
-    <w:bookmarkEnd w:id="263"/>
-    <w:bookmarkStart w:id="266" w:name="X604325b0223e79803e04f87e7874b1d7f4a0663"/>
+    <w:bookmarkEnd w:id="268"/>
+    <w:bookmarkStart w:id="271" w:name="X604325b0223e79803e04f87e7874b1d7f4a0663"/>
     <w:p>
       <w:pPr>
         <w:pStyle w:val="Heading4"/>
@@ -32958,12 +33886,12 @@
                 <wp:inline>
                   <wp:extent cx="152400" cy="152400"/>
                   <wp:effectExtent b="0" l="0" r="0" t="0"/>
-                  <wp:docPr descr="" title="" id="264" name="Picture"/>
+                  <wp:docPr descr="" title="" id="269" name="Picture"/>
                   <a:graphic>
                     <a:graphicData uri="http://schemas.openxmlformats.org/drawingml/2006/picture">
                       <pic:pic>
                         <pic:nvPicPr>
-                          <pic:cNvPr descr="/opt/quarto/share/formats/docx/warning.png" id="265" name="Picture"/>
+                          <pic:cNvPr descr="/opt/quarto/share/formats/docx/warning.png" id="270" name="Picture"/>
                           <pic:cNvPicPr>
                             <a:picLocks noChangeArrowheads="1" noChangeAspect="1"/>
                           </pic:cNvPicPr>
@@ -33231,8 +34159,8 @@
         </w:tc>
       </w:tr>
     </w:tbl>
-    <w:bookmarkEnd w:id="266"/>
-    <w:bookmarkStart w:id="268" w:name="X1745fd502df7963ed7ce48d0465493b4d59ad92"/>
+    <w:bookmarkEnd w:id="271"/>
+    <w:bookmarkStart w:id="273" w:name="X1745fd502df7963ed7ce48d0465493b4d59ad92"/>
     <w:p>
       <w:pPr>
         <w:pStyle w:val="Heading4"/>
@@ -33251,7 +34179,7 @@
       <w:r>
         <w:t xml:space="preserve"> </w:t>
       </w:r>
-      <w:hyperlink r:id="rId267">
+      <w:hyperlink r:id="rId272">
         <w:r>
           <w:rPr>
             <w:rStyle w:val="Hyperlink"/>
@@ -33412,8 +34340,8 @@
         <w:t xml:space="preserve">.</w:t>
       </w:r>
     </w:p>
-    <w:bookmarkEnd w:id="268"/>
-    <w:bookmarkStart w:id="269" w:name="verify-the-install"/>
+    <w:bookmarkEnd w:id="273"/>
+    <w:bookmarkStart w:id="274" w:name="verify-the-install"/>
     <w:p>
       <w:pPr>
         <w:pStyle w:val="Heading4"/>
@@ -33582,15 +34510,15 @@
         <w:t xml:space="preserve">(or open a fresh window) after changing it.</w:t>
       </w:r>
     </w:p>
-    <w:bookmarkEnd w:id="269"/>
-    <w:bookmarkEnd w:id="270"/>
-    <w:bookmarkStart w:id="280" w:name="sec-ai-mcp-server-setup"/>
+    <w:bookmarkEnd w:id="274"/>
+    <w:bookmarkEnd w:id="275"/>
+    <w:bookmarkStart w:id="285" w:name="sec-ai-mcp-server-setup"/>
     <w:p>
       <w:pPr>
         <w:pStyle w:val="Heading1"/>
       </w:pPr>
       <w:r>
-        <w:t xml:space="preserve">30. Setting up MCP servers</w:t>
+        <w:t xml:space="preserve">31. Setting up MCP servers</w:t>
       </w:r>
     </w:p>
     <w:p>
@@ -33705,12 +34633,12 @@
                 <wp:inline>
                   <wp:extent cx="152400" cy="152400"/>
                   <wp:effectExtent b="0" l="0" r="0" t="0"/>
-                  <wp:docPr descr="" title="" id="271" name="Picture"/>
+                  <wp:docPr descr="" title="" id="276" name="Picture"/>
                   <a:graphic>
                     <a:graphicData uri="http://schemas.openxmlformats.org/drawingml/2006/picture">
                       <pic:pic>
                         <pic:nvPicPr>
-                          <pic:cNvPr descr="/opt/quarto/share/formats/docx/note.png" id="272" name="Picture"/>
+                          <pic:cNvPr descr="/opt/quarto/share/formats/docx/note.png" id="277" name="Picture"/>
                           <pic:cNvPicPr>
                             <a:picLocks noChangeArrowheads="1" noChangeAspect="1"/>
                           </pic:cNvPicPr>
@@ -33804,7 +34732,7 @@
         </w:tc>
       </w:tr>
     </w:tbl>
-    <w:bookmarkStart w:id="274" w:name="installed-is-not-registered"/>
+    <w:bookmarkStart w:id="279" w:name="installed-is-not-registered"/>
     <w:p>
       <w:pPr>
         <w:pStyle w:val="Heading4"/>
@@ -33835,7 +34763,7 @@
       <w:r>
         <w:t xml:space="preserve"> </w:t>
       </w:r>
-      <w:hyperlink r:id="rId273">
+      <w:hyperlink r:id="rId278">
         <w:r>
           <w:rPr>
             <w:rStyle w:val="VerbatimChar"/>
@@ -33903,8 +34831,8 @@
         <w:t xml:space="preserve"> mcp list</w:t>
       </w:r>
     </w:p>
-    <w:bookmarkEnd w:id="274"/>
-    <w:bookmarkStart w:id="275" w:name="Xf6682145328c756d2e167d2c91be34f7f913a7f"/>
+    <w:bookmarkEnd w:id="279"/>
+    <w:bookmarkStart w:id="280" w:name="Xf6682145328c756d2e167d2c91be34f7f913a7f"/>
     <w:p>
       <w:pPr>
         <w:pStyle w:val="Heading4"/>
@@ -34103,8 +35031,8 @@
         <w:t xml:space="preserve">A local one shows a command path instead.</w:t>
       </w:r>
     </w:p>
-    <w:bookmarkEnd w:id="275"/>
-    <w:bookmarkStart w:id="276" w:name="and-401-mean-different-things"/>
+    <w:bookmarkEnd w:id="280"/>
+    <w:bookmarkStart w:id="281" w:name="and-401-mean-different-things"/>
     <w:p>
       <w:pPr>
         <w:pStyle w:val="Heading4"/>
@@ -34266,7 +35194,7 @@
         <w:pStyle w:val="Compact"/>
         <w:numPr>
           <w:ilvl w:val="0"/>
-          <w:numId w:val="1130"/>
+          <w:numId w:val="1133"/>
         </w:numPr>
       </w:pPr>
       <w:r>
@@ -34294,7 +35222,7 @@
         <w:pStyle w:val="Compact"/>
         <w:numPr>
           <w:ilvl w:val="0"/>
-          <w:numId w:val="1130"/>
+          <w:numId w:val="1133"/>
         </w:numPr>
       </w:pPr>
       <w:r>
@@ -34347,8 +35275,8 @@
         <w:t xml:space="preserve">sends you to the token-minting page for a problem that lives in a config file.</w:t>
       </w:r>
     </w:p>
-    <w:bookmarkEnd w:id="276"/>
-    <w:bookmarkStart w:id="277" w:name="X2adb24e9b1a0644f0fbebe685525dadd8a56387"/>
+    <w:bookmarkEnd w:id="281"/>
+    <w:bookmarkStart w:id="282" w:name="X2adb24e9b1a0644f0fbebe685525dadd8a56387"/>
     <w:p>
       <w:pPr>
         <w:pStyle w:val="Heading4"/>
@@ -34967,8 +35895,8 @@
         <w:t xml:space="preserve">bug you just finished diagnosing.</w:t>
       </w:r>
     </w:p>
-    <w:bookmarkEnd w:id="277"/>
-    <w:bookmarkStart w:id="278" w:name="X448547516ab06679b064b391b05a896db41ea57"/>
+    <w:bookmarkEnd w:id="282"/>
+    <w:bookmarkStart w:id="283" w:name="X448547516ab06679b064b391b05a896db41ea57"/>
     <w:p>
       <w:pPr>
         <w:pStyle w:val="Heading4"/>
@@ -35176,8 +36104,8 @@
         <w:t xml:space="preserve">and confirm the count went up rather than sideways.</w:t>
       </w:r>
     </w:p>
-    <w:bookmarkEnd w:id="278"/>
-    <w:bookmarkStart w:id="279" w:name="Xb256c2a3c0a422f2f687a98903d3521fd60a1b1"/>
+    <w:bookmarkEnd w:id="283"/>
+    <w:bookmarkStart w:id="284" w:name="Xb256c2a3c0a422f2f687a98903d3521fd60a1b1"/>
     <w:p>
       <w:pPr>
         <w:pStyle w:val="Heading4"/>
@@ -35353,9 +36281,9 @@
         <w:t xml:space="preserve">not something an agent does in passing.</w:t>
       </w:r>
     </w:p>
-    <w:bookmarkEnd w:id="279"/>
-    <w:bookmarkEnd w:id="280"/>
-    <w:bookmarkStart w:id="304" w:name="references"/>
+    <w:bookmarkEnd w:id="284"/>
+    <w:bookmarkEnd w:id="285"/>
+    <w:bookmarkStart w:id="309" w:name="references"/>
     <w:p>
       <w:pPr>
         <w:pStyle w:val="Heading1"/>
@@ -35364,8 +36292,8 @@
         <w:t xml:space="preserve">References</w:t>
       </w:r>
     </w:p>
-    <w:bookmarkStart w:id="303" w:name="refs"/>
-    <w:bookmarkStart w:id="282" w:name="ref-space_odyssey"/>
+    <w:bookmarkStart w:id="308" w:name="refs"/>
+    <w:bookmarkStart w:id="287" w:name="ref-space_odyssey"/>
     <w:p>
       <w:pPr>
         <w:pStyle w:val="Bibliography"/>
@@ -35383,7 +36311,7 @@
       <w:r>
         <w:t xml:space="preserve"> </w:t>
       </w:r>
-      <w:hyperlink r:id="rId281">
+      <w:hyperlink r:id="rId286">
         <w:r>
           <w:rPr>
             <w:rStyle w:val="Hyperlink"/>
@@ -35395,8 +36323,8 @@
         <w:t xml:space="preserve">.</w:t>
       </w:r>
     </w:p>
-    <w:bookmarkEnd w:id="282"/>
-    <w:bookmarkStart w:id="284" w:name="ref-i_robot"/>
+    <w:bookmarkEnd w:id="287"/>
+    <w:bookmarkStart w:id="289" w:name="ref-i_robot"/>
     <w:p>
       <w:pPr>
         <w:pStyle w:val="Bibliography"/>
@@ -35420,7 +36348,7 @@
       <w:r>
         <w:t xml:space="preserve"> </w:t>
       </w:r>
-      <w:hyperlink r:id="rId283">
+      <w:hyperlink r:id="rId288">
         <w:r>
           <w:rPr>
             <w:rStyle w:val="Hyperlink"/>
@@ -35432,8 +36360,8 @@
         <w:t xml:space="preserve">.</w:t>
       </w:r>
     </w:p>
-    <w:bookmarkEnd w:id="284"/>
-    <w:bookmarkStart w:id="286" w:name="ref-battlestar_galactica_2004"/>
+    <w:bookmarkEnd w:id="289"/>
+    <w:bookmarkStart w:id="291" w:name="ref-battlestar_galactica_2004"/>
     <w:p>
       <w:pPr>
         <w:pStyle w:val="Bibliography"/>
@@ -35451,7 +36379,7 @@
       <w:r>
         <w:t xml:space="preserve"> </w:t>
       </w:r>
-      <w:hyperlink r:id="rId285">
+      <w:hyperlink r:id="rId290">
         <w:r>
           <w:rPr>
             <w:rStyle w:val="Hyperlink"/>
@@ -35463,8 +36391,8 @@
         <w:t xml:space="preserve">.</w:t>
       </w:r>
     </w:p>
-    <w:bookmarkEnd w:id="286"/>
-    <w:bookmarkStart w:id="288" w:name="ref-blade_runner"/>
+    <w:bookmarkEnd w:id="291"/>
+    <w:bookmarkStart w:id="293" w:name="ref-blade_runner"/>
     <w:p>
       <w:pPr>
         <w:pStyle w:val="Bibliography"/>
@@ -35482,7 +36410,7 @@
       <w:r>
         <w:t xml:space="preserve"> </w:t>
       </w:r>
-      <w:hyperlink r:id="rId287">
+      <w:hyperlink r:id="rId292">
         <w:r>
           <w:rPr>
             <w:rStyle w:val="Hyperlink"/>
@@ -35494,8 +36422,8 @@
         <w:t xml:space="preserve">.</w:t>
       </w:r>
     </w:p>
-    <w:bookmarkEnd w:id="288"/>
-    <w:bookmarkStart w:id="290" w:name="ref-enders_game"/>
+    <w:bookmarkEnd w:id="293"/>
+    <w:bookmarkStart w:id="295" w:name="ref-enders_game"/>
     <w:p>
       <w:pPr>
         <w:pStyle w:val="Bibliography"/>
@@ -35519,7 +36447,7 @@
       <w:r>
         <w:t xml:space="preserve"> </w:t>
       </w:r>
-      <w:hyperlink r:id="rId289">
+      <w:hyperlink r:id="rId294">
         <w:r>
           <w:rPr>
             <w:rStyle w:val="Hyperlink"/>
@@ -35531,8 +36459,8 @@
         <w:t xml:space="preserve">.</w:t>
       </w:r>
     </w:p>
-    <w:bookmarkEnd w:id="290"/>
-    <w:bookmarkStart w:id="292" w:name="ref-humans_are_dead"/>
+    <w:bookmarkEnd w:id="295"/>
+    <w:bookmarkStart w:id="297" w:name="ref-humans_are_dead"/>
     <w:p>
       <w:pPr>
         <w:pStyle w:val="Bibliography"/>
@@ -35556,7 +36484,7 @@
       <w:r>
         <w:t xml:space="preserve"> </w:t>
       </w:r>
-      <w:hyperlink r:id="rId291">
+      <w:hyperlink r:id="rId296">
         <w:r>
           <w:rPr>
             <w:rStyle w:val="Hyperlink"/>
@@ -35568,8 +36496,8 @@
         <w:t xml:space="preserve">.</w:t>
       </w:r>
     </w:p>
-    <w:bookmarkEnd w:id="292"/>
-    <w:bookmarkStart w:id="294" w:name="ref-dune"/>
+    <w:bookmarkEnd w:id="297"/>
+    <w:bookmarkStart w:id="299" w:name="ref-dune"/>
     <w:p>
       <w:pPr>
         <w:pStyle w:val="Bibliography"/>
@@ -35593,7 +36521,7 @@
       <w:r>
         <w:t xml:space="preserve"> </w:t>
       </w:r>
-      <w:hyperlink r:id="rId293">
+      <w:hyperlink r:id="rId298">
         <w:r>
           <w:rPr>
             <w:rStyle w:val="Hyperlink"/>
@@ -35605,8 +36533,8 @@
         <w:t xml:space="preserve">.</w:t>
       </w:r>
     </w:p>
-    <w:bookmarkEnd w:id="294"/>
-    <w:bookmarkStart w:id="296" w:name="ref-lecun_world_models"/>
+    <w:bookmarkEnd w:id="299"/>
+    <w:bookmarkStart w:id="301" w:name="ref-lecun_world_models"/>
     <w:p>
       <w:pPr>
         <w:pStyle w:val="Bibliography"/>
@@ -35630,7 +36558,7 @@
       <w:r>
         <w:t xml:space="preserve"> </w:t>
       </w:r>
-      <w:hyperlink r:id="rId295">
+      <w:hyperlink r:id="rId300">
         <w:r>
           <w:rPr>
             <w:rStyle w:val="Hyperlink"/>
@@ -35642,8 +36570,8 @@
         <w:t xml:space="preserve">.</w:t>
       </w:r>
     </w:p>
-    <w:bookmarkEnd w:id="296"/>
-    <w:bookmarkStart w:id="298" w:name="ref-terminator"/>
+    <w:bookmarkEnd w:id="301"/>
+    <w:bookmarkStart w:id="303" w:name="ref-terminator"/>
     <w:p>
       <w:pPr>
         <w:pStyle w:val="Bibliography"/>
@@ -35661,7 +36589,7 @@
       <w:r>
         <w:t xml:space="preserve"> </w:t>
       </w:r>
-      <w:hyperlink r:id="rId297">
+      <w:hyperlink r:id="rId302">
         <w:r>
           <w:rPr>
             <w:rStyle w:val="Hyperlink"/>
@@ -35673,8 +36601,8 @@
         <w:t xml:space="preserve">.</w:t>
       </w:r>
     </w:p>
-    <w:bookmarkEnd w:id="298"/>
-    <w:bookmarkStart w:id="300" w:name="ref-matrix"/>
+    <w:bookmarkEnd w:id="303"/>
+    <w:bookmarkStart w:id="305" w:name="ref-matrix"/>
     <w:p>
       <w:pPr>
         <w:pStyle w:val="Bibliography"/>
@@ -35692,7 +36620,7 @@
       <w:r>
         <w:t xml:space="preserve"> </w:t>
       </w:r>
-      <w:hyperlink r:id="rId299">
+      <w:hyperlink r:id="rId304">
         <w:r>
           <w:rPr>
             <w:rStyle w:val="Hyperlink"/>
@@ -35704,8 +36632,8 @@
         <w:t xml:space="preserve">.</w:t>
       </w:r>
     </w:p>
-    <w:bookmarkEnd w:id="300"/>
-    <w:bookmarkStart w:id="302" w:name="ref-wargames"/>
+    <w:bookmarkEnd w:id="305"/>
+    <w:bookmarkStart w:id="307" w:name="ref-wargames"/>
     <w:p>
       <w:pPr>
         <w:pStyle w:val="Bibliography"/>
@@ -35723,7 +36651,7 @@
       <w:r>
         <w:t xml:space="preserve"> </w:t>
       </w:r>
-      <w:hyperlink r:id="rId301">
+      <w:hyperlink r:id="rId306">
         <w:r>
           <w:rPr>
             <w:rStyle w:val="Hyperlink"/>
@@ -35735,9 +36663,9 @@
         <w:t xml:space="preserve">.</w:t>
       </w:r>
     </w:p>
-    <w:bookmarkEnd w:id="302"/>
-    <w:bookmarkEnd w:id="303"/>
-    <w:bookmarkEnd w:id="304"/>
+    <w:bookmarkEnd w:id="307"/>
+    <w:bookmarkEnd w:id="308"/>
+    <w:bookmarkEnd w:id="309"/>
     <w:sectPr>
       <w:footnotePr>
         <w:numRestart w:val="eachSect"/>
@@ -35767,7 +36695,7 @@
       </w:r>
     </w:p>
   </w:footnote>
-  <w:footnote w:id="238">
+  <w:footnote w:id="243">
     <w:p>
       <w:pPr>
         <w:pStyle w:val="FootnoteText"/>
@@ -36698,34 +37626,7 @@
     <w:abstractNumId w:val="991"/>
   </w:num>
   <w:num w:numId="1106">
-    <w:abstractNumId w:val="99411"/>
-    <w:lvlOverride w:ilvl="0">
-      <w:startOverride w:val="1"/>
-    </w:lvlOverride>
-    <w:lvlOverride w:ilvl="1">
-      <w:startOverride w:val="1"/>
-    </w:lvlOverride>
-    <w:lvlOverride w:ilvl="2">
-      <w:startOverride w:val="1"/>
-    </w:lvlOverride>
-    <w:lvlOverride w:ilvl="3">
-      <w:startOverride w:val="1"/>
-    </w:lvlOverride>
-    <w:lvlOverride w:ilvl="4">
-      <w:startOverride w:val="1"/>
-    </w:lvlOverride>
-    <w:lvlOverride w:ilvl="5">
-      <w:startOverride w:val="1"/>
-    </w:lvlOverride>
-    <w:lvlOverride w:ilvl="6">
-      <w:startOverride w:val="1"/>
-    </w:lvlOverride>
-    <w:lvlOverride w:ilvl="7">
-      <w:startOverride w:val="1"/>
-    </w:lvlOverride>
-    <w:lvlOverride w:ilvl="8">
-      <w:startOverride w:val="1"/>
-    </w:lvlOverride>
+    <w:abstractNumId w:val="991"/>
   </w:num>
   <w:num w:numId="1107">
     <w:abstractNumId w:val="991"/>
@@ -36806,15 +37707,6 @@
     <w:abstractNumId w:val="991"/>
   </w:num>
   <w:num w:numId="1115">
-    <w:abstractNumId w:val="991"/>
-  </w:num>
-  <w:num w:numId="1116">
-    <w:abstractNumId w:val="991"/>
-  </w:num>
-  <w:num w:numId="1117">
-    <w:abstractNumId w:val="991"/>
-  </w:num>
-  <w:num w:numId="1118">
     <w:abstractNumId w:val="99411"/>
     <w:lvlOverride w:ilvl="0">
       <w:startOverride w:val="1"/>
@@ -36844,6 +37736,15 @@
       <w:startOverride w:val="1"/>
     </w:lvlOverride>
   </w:num>
+  <w:num w:numId="1116">
+    <w:abstractNumId w:val="991"/>
+  </w:num>
+  <w:num w:numId="1117">
+    <w:abstractNumId w:val="991"/>
+  </w:num>
+  <w:num w:numId="1118">
+    <w:abstractNumId w:val="991"/>
+  </w:num>
   <w:num w:numId="1119">
     <w:abstractNumId w:val="991"/>
   </w:num>
@@ -36851,9 +37752,6 @@
     <w:abstractNumId w:val="991"/>
   </w:num>
   <w:num w:numId="1121">
-    <w:abstractNumId w:val="991"/>
-  </w:num>
-  <w:num w:numId="1122">
     <w:abstractNumId w:val="99411"/>
     <w:lvlOverride w:ilvl="0">
       <w:startOverride w:val="1"/>
@@ -36883,6 +37781,9 @@
       <w:startOverride w:val="1"/>
     </w:lvlOverride>
   </w:num>
+  <w:num w:numId="1122">
+    <w:abstractNumId w:val="991"/>
+  </w:num>
   <w:num w:numId="1123">
     <w:abstractNumId w:val="991"/>
   </w:num>
@@ -36890,12 +37791,6 @@
     <w:abstractNumId w:val="991"/>
   </w:num>
   <w:num w:numId="1125">
-    <w:abstractNumId w:val="991"/>
-  </w:num>
-  <w:num w:numId="1126">
-    <w:abstractNumId w:val="991"/>
-  </w:num>
-  <w:num w:numId="1127">
     <w:abstractNumId w:val="99411"/>
     <w:lvlOverride w:ilvl="0">
       <w:startOverride w:val="1"/>
@@ -36925,10 +37820,19 @@
       <w:startOverride w:val="1"/>
     </w:lvlOverride>
   </w:num>
+  <w:num w:numId="1126">
+    <w:abstractNumId w:val="991"/>
+  </w:num>
+  <w:num w:numId="1127">
+    <w:abstractNumId w:val="991"/>
+  </w:num>
   <w:num w:numId="1128">
     <w:abstractNumId w:val="991"/>
   </w:num>
   <w:num w:numId="1129">
+    <w:abstractNumId w:val="991"/>
+  </w:num>
+  <w:num w:numId="1130">
     <w:abstractNumId w:val="99411"/>
     <w:lvlOverride w:ilvl="0">
       <w:startOverride w:val="1"/>
@@ -36958,7 +37862,40 @@
       <w:startOverride w:val="1"/>
     </w:lvlOverride>
   </w:num>
-  <w:num w:numId="1130">
+  <w:num w:numId="1131">
+    <w:abstractNumId w:val="991"/>
+  </w:num>
+  <w:num w:numId="1132">
+    <w:abstractNumId w:val="99411"/>
+    <w:lvlOverride w:ilvl="0">
+      <w:startOverride w:val="1"/>
+    </w:lvlOverride>
+    <w:lvlOverride w:ilvl="1">
+      <w:startOverride w:val="1"/>
+    </w:lvlOverride>
+    <w:lvlOverride w:ilvl="2">
+      <w:startOverride w:val="1"/>
+    </w:lvlOverride>
+    <w:lvlOverride w:ilvl="3">
+      <w:startOverride w:val="1"/>
+    </w:lvlOverride>
+    <w:lvlOverride w:ilvl="4">
+      <w:startOverride w:val="1"/>
+    </w:lvlOverride>
+    <w:lvlOverride w:ilvl="5">
+      <w:startOverride w:val="1"/>
+    </w:lvlOverride>
+    <w:lvlOverride w:ilvl="6">
+      <w:startOverride w:val="1"/>
+    </w:lvlOverride>
+    <w:lvlOverride w:ilvl="7">
+      <w:startOverride w:val="1"/>
+    </w:lvlOverride>
+    <w:lvlOverride w:ilvl="8">
+      <w:startOverride w:val="1"/>
+    </w:lvlOverride>
+  </w:num>
+  <w:num w:numId="1133">
     <w:abstractNumId w:val="991"/>
   </w:num>
 </w:numbering>

</xml_diff>

<commit_message>
Deploying to gh-pages from @ Morrison-Lab/wai@9003cfd6b95ddf9557ca0df78912837e62992a2c 🚀
</commit_message>
<xml_diff>
--- a/chapters/coding-agents.docx
+++ b/chapters/coding-agents.docx
@@ -15,7 +15,7 @@
         <w:pStyle w:val="Date"/>
       </w:pPr>
       <w:r>
-        <w:t xml:space="preserve">Last modified: 2026-08-08 11:23:13 (PDT)</w:t>
+        <w:t xml:space="preserve">Last modified: 2026-08-08 16:16:00 (PDT)</w:t>
       </w:r>
     </w:p>
     <w:p>
@@ -37801,7 +37801,7 @@
     </w:p>
     <w:bookmarkEnd w:id="297"/>
     <w:bookmarkEnd w:id="298"/>
-    <w:bookmarkStart w:id="308" w:name="sec-ai-mcp-server-setup"/>
+    <w:bookmarkStart w:id="310" w:name="sec-ai-mcp-server-setup"/>
     <w:p>
       <w:pPr>
         <w:pStyle w:val="Heading1"/>
@@ -38565,12 +38565,267 @@
       </w:r>
     </w:p>
     <w:bookmarkEnd w:id="304"/>
-    <w:bookmarkStart w:id="305" w:name="X2adb24e9b1a0644f0fbebe685525dadd8a56387"/>
+    <w:bookmarkStart w:id="305" w:name="install-the-binary-the-platforms-own-way"/>
     <w:p>
       <w:pPr>
         <w:pStyle w:val="Heading4"/>
       </w:pPr>
       <w:r>
+        <w:t xml:space="preserve">Install the binary the platform’s own way</w:t>
+      </w:r>
+    </w:p>
+    <w:p>
+      <w:pPr>
+        <w:pStyle w:val="FirstParagraph"/>
+      </w:pPr>
+      <w:r>
+        <w:t xml:space="preserve">These notes started from a Linux install,</w:t>
+      </w:r>
+      <w:r>
+        <w:t xml:space="preserve"> </w:t>
+      </w:r>
+      <w:r>
+        <w:t xml:space="preserve">where the binary lands under</w:t>
+      </w:r>
+      <w:r>
+        <w:t xml:space="preserve"> </w:t>
+      </w:r>
+      <w:r>
+        <w:rPr>
+          <w:rStyle w:val="VerbatimChar"/>
+        </w:rPr>
+        <w:t xml:space="preserve">$HOME/.local/bin</w:t>
+      </w:r>
+      <w:r>
+        <w:t xml:space="preserve">.</w:t>
+      </w:r>
+      <w:r>
+        <w:t xml:space="preserve"> </w:t>
+      </w:r>
+      <w:r>
+        <w:t xml:space="preserve">On macOS the same server is a Homebrew formula,</w:t>
+      </w:r>
+      <w:r>
+        <w:t xml:space="preserve"> </w:t>
+      </w:r>
+      <w:r>
+        <w:t xml:space="preserve">and getting it is one command:</w:t>
+      </w:r>
+    </w:p>
+    <w:p>
+      <w:pPr>
+        <w:pStyle w:val="SourceCode"/>
+      </w:pPr>
+      <w:r>
+        <w:rPr>
+          <w:rStyle w:val="ExtensionTok"/>
+        </w:rPr>
+        <w:t xml:space="preserve">brew</w:t>
+      </w:r>
+      <w:r>
+        <w:rPr>
+          <w:rStyle w:val="NormalTok"/>
+        </w:rPr>
+        <w:t xml:space="preserve"> install github-mcp-server</w:t>
+      </w:r>
+    </w:p>
+    <w:p>
+      <w:pPr>
+        <w:pStyle w:val="FirstParagraph"/>
+      </w:pPr>
+      <w:r>
+        <w:t xml:space="preserve">That installs to</w:t>
+      </w:r>
+      <w:r>
+        <w:t xml:space="preserve"> </w:t>
+      </w:r>
+      <w:r>
+        <w:rPr>
+          <w:rStyle w:val="VerbatimChar"/>
+        </w:rPr>
+        <w:t xml:space="preserve">/opt/homebrew/bin</w:t>
+      </w:r>
+      <w:r>
+        <w:t xml:space="preserve"> </w:t>
+      </w:r>
+      <w:r>
+        <w:t xml:space="preserve">on Apple silicon</w:t>
+      </w:r>
+      <w:r>
+        <w:t xml:space="preserve"> </w:t>
+      </w:r>
+      <w:r>
+        <w:t xml:space="preserve">(</w:t>
+      </w:r>
+      <w:r>
+        <w:rPr>
+          <w:rStyle w:val="VerbatimChar"/>
+        </w:rPr>
+        <w:t xml:space="preserve">/usr/local/bin</w:t>
+      </w:r>
+      <w:r>
+        <w:t xml:space="preserve"> </w:t>
+      </w:r>
+      <w:r>
+        <w:t xml:space="preserve">under Intel Homebrew),</w:t>
+      </w:r>
+      <w:r>
+        <w:t xml:space="preserve"> </w:t>
+      </w:r>
+      <w:r>
+        <w:t xml:space="preserve">so no manual download is needed.</w:t>
+      </w:r>
+    </w:p>
+    <w:p>
+      <w:pPr>
+        <w:pStyle w:val="BodyText"/>
+      </w:pPr>
+      <w:r>
+        <w:t xml:space="preserve">The official install guide leads with a Docker recipe instead,</w:t>
+      </w:r>
+      <w:r>
+        <w:t xml:space="preserve"> </w:t>
+      </w:r>
+      <w:r>
+        <w:t xml:space="preserve">and it has a catch worth knowing before you follow it:</w:t>
+      </w:r>
+      <w:r>
+        <w:t xml:space="preserve"> </w:t>
+      </w:r>
+      <w:r>
+        <w:rPr>
+          <w:rStyle w:val="VerbatimChar"/>
+        </w:rPr>
+        <w:t xml:space="preserve">docker</w:t>
+      </w:r>
+      <w:r>
+        <w:t xml:space="preserve"> </w:t>
+      </w:r>
+      <w:r>
+        <w:t xml:space="preserve">being on</w:t>
+      </w:r>
+      <w:r>
+        <w:t xml:space="preserve"> </w:t>
+      </w:r>
+      <w:r>
+        <w:rPr>
+          <w:rStyle w:val="VerbatimChar"/>
+        </w:rPr>
+        <w:t xml:space="preserve">PATH</w:t>
+      </w:r>
+      <w:r>
+        <w:t xml:space="preserve"> </w:t>
+      </w:r>
+      <w:r>
+        <w:t xml:space="preserve">does not mean the daemon is running.</w:t>
+      </w:r>
+      <w:r>
+        <w:t xml:space="preserve"> </w:t>
+      </w:r>
+      <w:r>
+        <w:t xml:space="preserve">With Docker Desktop stopped,</w:t>
+      </w:r>
+      <w:r>
+        <w:t xml:space="preserve"> </w:t>
+      </w:r>
+      <w:r>
+        <w:t xml:space="preserve">the server fails to connect to the Docker API,</w:t>
+      </w:r>
+      <w:r>
+        <w:t xml:space="preserve"> </w:t>
+      </w:r>
+      <w:r>
+        <w:t xml:space="preserve">and that failure surfaces at</w:t>
+      </w:r>
+      <w:r>
+        <w:t xml:space="preserve"> </w:t>
+      </w:r>
+      <w:r>
+        <w:rPr>
+          <w:i/>
+          <w:iCs/>
+        </w:rPr>
+        <w:t xml:space="preserve">server start</w:t>
+      </w:r>
+      <w:r>
+        <w:t xml:space="preserve">, not at registration —</w:t>
+      </w:r>
+      <w:r>
+        <w:t xml:space="preserve"> </w:t>
+      </w:r>
+      <w:r>
+        <w:t xml:space="preserve">so</w:t>
+      </w:r>
+      <w:r>
+        <w:t xml:space="preserve"> </w:t>
+      </w:r>
+      <w:r>
+        <w:rPr>
+          <w:rStyle w:val="VerbatimChar"/>
+        </w:rPr>
+        <w:t xml:space="preserve">claude mcp add</w:t>
+      </w:r>
+      <w:r>
+        <w:t xml:space="preserve"> </w:t>
+      </w:r>
+      <w:r>
+        <w:t xml:space="preserve">succeeds,</w:t>
+      </w:r>
+      <w:r>
+        <w:t xml:space="preserve"> </w:t>
+      </w:r>
+      <w:r>
+        <w:t xml:space="preserve">and the break only shows up later, as a silent absence of tools.</w:t>
+      </w:r>
+      <w:r>
+        <w:t xml:space="preserve"> </w:t>
+      </w:r>
+      <w:r>
+        <w:t xml:space="preserve">That is one more reason to prefer the binary path above.</w:t>
+      </w:r>
+    </w:p>
+    <w:p>
+      <w:pPr>
+        <w:pStyle w:val="BodyText"/>
+      </w:pPr>
+      <w:r>
+        <w:t xml:space="preserve">Because the binary’s location differs by platform and by installer,</w:t>
+      </w:r>
+      <w:r>
+        <w:t xml:space="preserve"> </w:t>
+      </w:r>
+      <w:r>
+        <w:t xml:space="preserve">a launch wrapper should resolve it from</w:t>
+      </w:r>
+      <w:r>
+        <w:t xml:space="preserve"> </w:t>
+      </w:r>
+      <w:r>
+        <w:rPr>
+          <w:rStyle w:val="VerbatimChar"/>
+        </w:rPr>
+        <w:t xml:space="preserve">PATH</w:t>
+      </w:r>
+      <w:r>
+        <w:t xml:space="preserve"> </w:t>
+      </w:r>
+      <w:r>
+        <w:t xml:space="preserve">rather than hardcode it,</w:t>
+      </w:r>
+      <w:r>
+        <w:t xml:space="preserve"> </w:t>
+      </w:r>
+      <w:r>
+        <w:t xml:space="preserve">with an override for the case where it isn’t on one.</w:t>
+      </w:r>
+    </w:p>
+    <w:bookmarkEnd w:id="305"/>
+    <w:bookmarkStart w:id="306" w:name="X2adb24e9b1a0644f0fbebe685525dadd8a56387"/>
+    <w:p>
+      <w:pPr>
+        <w:pStyle w:val="Heading4"/>
+      </w:pPr>
+      <w:r>
         <w:t xml:space="preserve">Supply credentials without storing a token</w:t>
       </w:r>
     </w:p>
@@ -38740,6 +38995,264 @@
         <w:rPr>
           <w:rStyle w:val="VariableTok"/>
         </w:rPr>
+        <w:t xml:space="preserve">SERVER</w:t>
+      </w:r>
+      <w:r>
+        <w:rPr>
+          <w:rStyle w:val="OperatorTok"/>
+        </w:rPr>
+        <w:t xml:space="preserve">=</w:t>
+      </w:r>
+      <w:r>
+        <w:rPr>
+          <w:rStyle w:val="StringTok"/>
+        </w:rPr>
+        <w:t xml:space="preserve">"</w:t>
+      </w:r>
+      <w:r>
+        <w:rPr>
+          <w:rStyle w:val="VariableTok"/>
+        </w:rPr>
+        <w:t xml:space="preserve">${GITHUB_MCP_SERVER_BIN</w:t>
+      </w:r>
+      <w:r>
+        <w:rPr>
+          <w:rStyle w:val="OperatorTok"/>
+        </w:rPr>
+        <w:t xml:space="preserve">:-</w:t>
+      </w:r>
+      <w:r>
+        <w:rPr>
+          <w:rStyle w:val="VariableTok"/>
+        </w:rPr>
+        <w:t xml:space="preserve">$(</w:t>
+      </w:r>
+      <w:r>
+        <w:rPr>
+          <w:rStyle w:val="BuiltInTok"/>
+        </w:rPr>
+        <w:t xml:space="preserve">command</w:t>
+      </w:r>
+      <w:r>
+        <w:rPr>
+          <w:rStyle w:val="NormalTok"/>
+        </w:rPr>
+        <w:t xml:space="preserve"> </w:t>
+      </w:r>
+      <w:r>
+        <w:rPr>
+          <w:rStyle w:val="AttributeTok"/>
+        </w:rPr>
+        <w:t xml:space="preserve">-v</w:t>
+      </w:r>
+      <w:r>
+        <w:rPr>
+          <w:rStyle w:val="NormalTok"/>
+        </w:rPr>
+        <w:t xml:space="preserve"> github-mcp-server </w:t>
+      </w:r>
+      <w:r>
+        <w:rPr>
+          <w:rStyle w:val="KeywordTok"/>
+        </w:rPr>
+        <w:t xml:space="preserve">||</w:t>
+      </w:r>
+      <w:r>
+        <w:rPr>
+          <w:rStyle w:val="NormalTok"/>
+        </w:rPr>
+        <w:t xml:space="preserve"> </w:t>
+      </w:r>
+      <w:r>
+        <w:rPr>
+          <w:rStyle w:val="FunctionTok"/>
+        </w:rPr>
+        <w:t xml:space="preserve">true</w:t>
+      </w:r>
+      <w:r>
+        <w:rPr>
+          <w:rStyle w:val="VariableTok"/>
+        </w:rPr>
+        <w:t xml:space="preserve">)}</w:t>
+      </w:r>
+      <w:r>
+        <w:rPr>
+          <w:rStyle w:val="StringTok"/>
+        </w:rPr>
+        <w:t xml:space="preserve">"</w:t>
+      </w:r>
+      <w:r>
+        <w:br/>
+      </w:r>
+      <w:r>
+        <w:rPr>
+          <w:rStyle w:val="ControlFlowTok"/>
+        </w:rPr>
+        <w:t xml:space="preserve">if</w:t>
+      </w:r>
+      <w:r>
+        <w:rPr>
+          <w:rStyle w:val="NormalTok"/>
+        </w:rPr>
+        <w:t xml:space="preserve"> </w:t>
+      </w:r>
+      <w:r>
+        <w:rPr>
+          <w:rStyle w:val="BuiltInTok"/>
+        </w:rPr>
+        <w:t xml:space="preserve">[</w:t>
+      </w:r>
+      <w:r>
+        <w:rPr>
+          <w:rStyle w:val="NormalTok"/>
+        </w:rPr>
+        <w:t xml:space="preserve"> </w:t>
+      </w:r>
+      <w:r>
+        <w:rPr>
+          <w:rStyle w:val="OtherTok"/>
+        </w:rPr>
+        <w:t xml:space="preserve">-z</w:t>
+      </w:r>
+      <w:r>
+        <w:rPr>
+          <w:rStyle w:val="NormalTok"/>
+        </w:rPr>
+        <w:t xml:space="preserve"> </w:t>
+      </w:r>
+      <w:r>
+        <w:rPr>
+          <w:rStyle w:val="StringTok"/>
+        </w:rPr>
+        <w:t xml:space="preserve">"</w:t>
+      </w:r>
+      <w:r>
+        <w:rPr>
+          <w:rStyle w:val="VariableTok"/>
+        </w:rPr>
+        <w:t xml:space="preserve">$SERVER</w:t>
+      </w:r>
+      <w:r>
+        <w:rPr>
+          <w:rStyle w:val="StringTok"/>
+        </w:rPr>
+        <w:t xml:space="preserve">"</w:t>
+      </w:r>
+      <w:r>
+        <w:rPr>
+          <w:rStyle w:val="NormalTok"/>
+        </w:rPr>
+        <w:t xml:space="preserve"> </w:t>
+      </w:r>
+      <w:r>
+        <w:rPr>
+          <w:rStyle w:val="BuiltInTok"/>
+        </w:rPr>
+        <w:t xml:space="preserve">]</w:t>
+      </w:r>
+      <w:r>
+        <w:rPr>
+          <w:rStyle w:val="KeywordTok"/>
+        </w:rPr>
+        <w:t xml:space="preserve">;</w:t>
+      </w:r>
+      <w:r>
+        <w:rPr>
+          <w:rStyle w:val="NormalTok"/>
+        </w:rPr>
+        <w:t xml:space="preserve"> </w:t>
+      </w:r>
+      <w:r>
+        <w:rPr>
+          <w:rStyle w:val="ControlFlowTok"/>
+        </w:rPr>
+        <w:t xml:space="preserve">then</w:t>
+      </w:r>
+      <w:r>
+        <w:br/>
+      </w:r>
+      <w:r>
+        <w:rPr>
+          <w:rStyle w:val="NormalTok"/>
+        </w:rPr>
+        <w:t xml:space="preserve">  </w:t>
+      </w:r>
+      <w:r>
+        <w:rPr>
+          <w:rStyle w:val="BuiltInTok"/>
+        </w:rPr>
+        <w:t xml:space="preserve">echo</w:t>
+      </w:r>
+      <w:r>
+        <w:rPr>
+          <w:rStyle w:val="NormalTok"/>
+        </w:rPr>
+        <w:t xml:space="preserve"> </w:t>
+      </w:r>
+      <w:r>
+        <w:rPr>
+          <w:rStyle w:val="StringTok"/>
+        </w:rPr>
+        <w:t xml:space="preserve">"github-mcp-server not on PATH; install it or set GITHUB_MCP_SERVER_BIN"</w:t>
+      </w:r>
+      <w:r>
+        <w:rPr>
+          <w:rStyle w:val="NormalTok"/>
+        </w:rPr>
+        <w:t xml:space="preserve"> </w:t>
+      </w:r>
+      <w:r>
+        <w:rPr>
+          <w:rStyle w:val="OperatorTok"/>
+        </w:rPr>
+        <w:t xml:space="preserve">&gt;&amp;</w:t>
+      </w:r>
+      <w:r>
+        <w:rPr>
+          <w:rStyle w:val="DecValTok"/>
+        </w:rPr>
+        <w:t xml:space="preserve">2</w:t>
+      </w:r>
+      <w:r>
+        <w:br/>
+      </w:r>
+      <w:r>
+        <w:rPr>
+          <w:rStyle w:val="NormalTok"/>
+        </w:rPr>
+        <w:t xml:space="preserve">  </w:t>
+      </w:r>
+      <w:r>
+        <w:rPr>
+          <w:rStyle w:val="BuiltInTok"/>
+        </w:rPr>
+        <w:t xml:space="preserve">exit</w:t>
+      </w:r>
+      <w:r>
+        <w:rPr>
+          <w:rStyle w:val="NormalTok"/>
+        </w:rPr>
+        <w:t xml:space="preserve"> 1</w:t>
+      </w:r>
+      <w:r>
+        <w:br/>
+      </w:r>
+      <w:r>
+        <w:rPr>
+          <w:rStyle w:val="ControlFlowTok"/>
+        </w:rPr>
+        <w:t xml:space="preserve">fi</w:t>
+      </w:r>
+      <w:r>
+        <w:br/>
+      </w:r>
+      <w:r>
+        <w:br/>
+      </w:r>
+      <w:r>
+        <w:rPr>
+          <w:rStyle w:val="VariableTok"/>
+        </w:rPr>
         <w:t xml:space="preserve">GITHUB_TOOLSETS</w:t>
       </w:r>
       <w:r>
@@ -39070,13 +39583,13 @@
         <w:rPr>
           <w:rStyle w:val="VariableTok"/>
         </w:rPr>
-        <w:t xml:space="preserve">$HOME</w:t>
+        <w:t xml:space="preserve">$SERVER</w:t>
       </w:r>
       <w:r>
         <w:rPr>
           <w:rStyle w:val="StringTok"/>
         </w:rPr>
-        <w:t xml:space="preserve">/.local/bin/github-mcp-server"</w:t>
+        <w:t xml:space="preserve">"</w:t>
       </w:r>
       <w:r>
         <w:rPr>
@@ -39184,8 +39697,8 @@
         <w:t xml:space="preserve">bug you just finished diagnosing.</w:t>
       </w:r>
     </w:p>
-    <w:bookmarkEnd w:id="305"/>
-    <w:bookmarkStart w:id="306" w:name="X448547516ab06679b064b391b05a896db41ea57"/>
+    <w:bookmarkEnd w:id="306"/>
+    <w:bookmarkStart w:id="307" w:name="X448547516ab06679b064b391b05a896db41ea57"/>
     <w:p>
       <w:pPr>
         <w:pStyle w:val="Heading4"/>
@@ -39235,6 +39748,81 @@
       <w:r>
         <w:t xml:space="preserve">no workflow runs, no job logs, no re-run trigger.</w:t>
       </w:r>
+      <w:r>
+        <w:t xml:space="preserve"> </w:t>
+      </w:r>
+      <w:r>
+        <w:t xml:space="preserve">As of this writing (server v1.7.0)</w:t>
+      </w:r>
+      <w:r>
+        <w:t xml:space="preserve"> </w:t>
+      </w:r>
+      <w:r>
+        <w:t xml:space="preserve">the actions toolset’s four tools are</w:t>
+      </w:r>
+      <w:r>
+        <w:t xml:space="preserve"> </w:t>
+      </w:r>
+      <w:r>
+        <w:rPr>
+          <w:rStyle w:val="VerbatimChar"/>
+        </w:rPr>
+        <w:t xml:space="preserve">actions_get</w:t>
+      </w:r>
+      <w:r>
+        <w:t xml:space="preserve">,</w:t>
+      </w:r>
+      <w:r>
+        <w:t xml:space="preserve"> </w:t>
+      </w:r>
+      <w:r>
+        <w:rPr>
+          <w:rStyle w:val="VerbatimChar"/>
+        </w:rPr>
+        <w:t xml:space="preserve">actions_list</w:t>
+      </w:r>
+      <w:r>
+        <w:t xml:space="preserve">,</w:t>
+      </w:r>
+      <w:r>
+        <w:t xml:space="preserve"> </w:t>
+      </w:r>
+      <w:r>
+        <w:rPr>
+          <w:rStyle w:val="VerbatimChar"/>
+        </w:rPr>
+        <w:t xml:space="preserve">actions_run_trigger</w:t>
+      </w:r>
+      <w:r>
+        <w:t xml:space="preserve">, and</w:t>
+      </w:r>
+      <w:r>
+        <w:t xml:space="preserve"> </w:t>
+      </w:r>
+      <w:r>
+        <w:rPr>
+          <w:rStyle w:val="VerbatimChar"/>
+        </w:rPr>
+        <w:t xml:space="preserve">get_job_logs</w:t>
+      </w:r>
+      <w:r>
+        <w:t xml:space="preserve"> </w:t>
+      </w:r>
+      <w:r>
+        <w:t xml:space="preserve">—</w:t>
+      </w:r>
+      <w:r>
+        <w:t xml:space="preserve"> </w:t>
+      </w:r>
+      <w:r>
+        <w:t xml:space="preserve">the exact names have moved around across releases,</w:t>
+      </w:r>
+      <w:r>
+        <w:t xml:space="preserve"> </w:t>
+      </w:r>
+      <w:r>
+        <w:t xml:space="preserve">so treat this list as a snapshot rather than a promise.</w:t>
+      </w:r>
     </w:p>
     <w:p>
       <w:pPr>
@@ -39392,9 +39980,149 @@
       <w:r>
         <w:t xml:space="preserve">and confirm the count went up rather than sideways.</w:t>
       </w:r>
-    </w:p>
-    <w:bookmarkEnd w:id="306"/>
-    <w:bookmarkStart w:id="307" w:name="Xb256c2a3c0a422f2f687a98903d3521fd60a1b1"/>
+      <w:r>
+        <w:t xml:space="preserve"> </w:t>
+      </w:r>
+      <w:r>
+        <w:t xml:space="preserve">On the same v1.7.0 server,</w:t>
+      </w:r>
+      <w:r>
+        <w:t xml:space="preserve"> </w:t>
+      </w:r>
+      <w:r>
+        <w:t xml:space="preserve">the default group carries 44 tools,</w:t>
+      </w:r>
+      <w:r>
+        <w:t xml:space="preserve"> </w:t>
+      </w:r>
+      <w:r>
+        <w:t xml:space="preserve">and</w:t>
+      </w:r>
+      <w:r>
+        <w:t xml:space="preserve"> </w:t>
+      </w:r>
+      <w:r>
+        <w:rPr>
+          <w:rStyle w:val="VerbatimChar"/>
+        </w:rPr>
+        <w:t xml:space="preserve">default,actions,discussions,dependabot,labels,notifications</w:t>
+      </w:r>
+      <w:r>
+        <w:t xml:space="preserve"> </w:t>
+      </w:r>
+      <w:r>
+        <w:t xml:space="preserve">carries 63 —</w:t>
+      </w:r>
+      <w:r>
+        <w:t xml:space="preserve"> </w:t>
+      </w:r>
+      <w:r>
+        <w:t xml:space="preserve">the count moving the right direction, as the check above expects.</w:t>
+      </w:r>
+    </w:p>
+    <w:bookmarkEnd w:id="307"/>
+    <w:bookmarkStart w:id="308" w:name="X4a4c9992603eee0123b58b5b37e7fedbb817150"/>
+    <w:p>
+      <w:pPr>
+        <w:pStyle w:val="Heading4"/>
+      </w:pPr>
+      <w:r>
+        <w:rPr>
+          <w:rStyle w:val="VerbatimChar"/>
+        </w:rPr>
+        <w:t xml:space="preserve">subscribe_pr_activity</w:t>
+      </w:r>
+      <w:r>
+        <w:t xml:space="preserve"> </w:t>
+      </w:r>
+      <w:r>
+        <w:t xml:space="preserve">isn’t a local-server tool</w:t>
+      </w:r>
+    </w:p>
+    <w:p>
+      <w:pPr>
+        <w:pStyle w:val="FirstParagraph"/>
+      </w:pPr>
+      <w:r>
+        <w:t xml:space="preserve">Workflow guidance written for remote or web agent sessions</w:t>
+      </w:r>
+      <w:r>
+        <w:t xml:space="preserve"> </w:t>
+      </w:r>
+      <w:r>
+        <w:t xml:space="preserve">sometimes names</w:t>
+      </w:r>
+      <w:r>
+        <w:t xml:space="preserve"> </w:t>
+      </w:r>
+      <w:r>
+        <w:rPr>
+          <w:rStyle w:val="VerbatimChar"/>
+        </w:rPr>
+        <w:t xml:space="preserve">subscribe_pr_activity</w:t>
+      </w:r>
+      <w:r>
+        <w:t xml:space="preserve"> </w:t>
+      </w:r>
+      <w:r>
+        <w:t xml:space="preserve">as the way to watch a pull request’s activity.</w:t>
+      </w:r>
+      <w:r>
+        <w:t xml:space="preserve"> </w:t>
+      </w:r>
+      <w:r>
+        <w:t xml:space="preserve">It doesn’t appear in a locally-run GitHub MCP server,</w:t>
+      </w:r>
+      <w:r>
+        <w:t xml:space="preserve"> </w:t>
+      </w:r>
+      <w:r>
+        <w:t xml:space="preserve">under any toolset combination.</w:t>
+      </w:r>
+    </w:p>
+    <w:p>
+      <w:pPr>
+        <w:pStyle w:val="BodyText"/>
+      </w:pPr>
+      <w:r>
+        <w:t xml:space="preserve">The local analogues are</w:t>
+      </w:r>
+      <w:r>
+        <w:t xml:space="preserve"> </w:t>
+      </w:r>
+      <w:r>
+        <w:rPr>
+          <w:rStyle w:val="VerbatimChar"/>
+        </w:rPr>
+        <w:t xml:space="preserve">manage_notification_subscription</w:t>
+      </w:r>
+      <w:r>
+        <w:t xml:space="preserve"> </w:t>
+      </w:r>
+      <w:r>
+        <w:t xml:space="preserve">and</w:t>
+      </w:r>
+      <w:r>
+        <w:t xml:space="preserve"> </w:t>
+      </w:r>
+      <w:r>
+        <w:rPr>
+          <w:rStyle w:val="VerbatimChar"/>
+        </w:rPr>
+        <w:t xml:space="preserve">manage_repository_notification_subscription</w:t>
+      </w:r>
+      <w:r>
+        <w:t xml:space="preserve">.</w:t>
+      </w:r>
+      <w:r>
+        <w:t xml:space="preserve"> </w:t>
+      </w:r>
+      <w:r>
+        <w:t xml:space="preserve">Reach for those instead when working from a local harness.</w:t>
+      </w:r>
+    </w:p>
+    <w:bookmarkEnd w:id="308"/>
+    <w:bookmarkStart w:id="309" w:name="Xb256c2a3c0a422f2f687a98903d3521fd60a1b1"/>
     <w:p>
       <w:pPr>
         <w:pStyle w:val="Heading4"/>
@@ -39570,9 +40298,9 @@
         <w:t xml:space="preserve">not something an agent does in passing.</w:t>
       </w:r>
     </w:p>
-    <w:bookmarkEnd w:id="307"/>
-    <w:bookmarkEnd w:id="308"/>
-    <w:bookmarkStart w:id="338" w:name="references"/>
+    <w:bookmarkEnd w:id="309"/>
+    <w:bookmarkEnd w:id="310"/>
+    <w:bookmarkStart w:id="340" w:name="references"/>
     <w:p>
       <w:pPr>
         <w:pStyle w:val="Heading1"/>
@@ -39581,8 +40309,8 @@
         <w:t xml:space="preserve">References</w:t>
       </w:r>
     </w:p>
-    <w:bookmarkStart w:id="337" w:name="refs"/>
-    <w:bookmarkStart w:id="310" w:name="ref-space_odyssey"/>
+    <w:bookmarkStart w:id="339" w:name="refs"/>
+    <w:bookmarkStart w:id="312" w:name="ref-space_odyssey"/>
     <w:p>
       <w:pPr>
         <w:pStyle w:val="Bibliography"/>
@@ -39600,7 +40328,7 @@
       <w:r>
         <w:t xml:space="preserve"> </w:t>
       </w:r>
-      <w:hyperlink r:id="rId309">
+      <w:hyperlink r:id="rId311">
         <w:r>
           <w:rPr>
             <w:rStyle w:val="Hyperlink"/>
@@ -39612,8 +40340,8 @@
         <w:t xml:space="preserve">.</w:t>
       </w:r>
     </w:p>
-    <w:bookmarkEnd w:id="310"/>
-    <w:bookmarkStart w:id="312" w:name="ref-i_robot"/>
+    <w:bookmarkEnd w:id="312"/>
+    <w:bookmarkStart w:id="314" w:name="ref-i_robot"/>
     <w:p>
       <w:pPr>
         <w:pStyle w:val="Bibliography"/>
@@ -39637,7 +40365,7 @@
       <w:r>
         <w:t xml:space="preserve"> </w:t>
       </w:r>
-      <w:hyperlink r:id="rId311">
+      <w:hyperlink r:id="rId313">
         <w:r>
           <w:rPr>
             <w:rStyle w:val="Hyperlink"/>
@@ -39649,8 +40377,8 @@
         <w:t xml:space="preserve">.</w:t>
       </w:r>
     </w:p>
-    <w:bookmarkEnd w:id="312"/>
-    <w:bookmarkStart w:id="314" w:name="ref-battlestar_galactica_2004"/>
+    <w:bookmarkEnd w:id="314"/>
+    <w:bookmarkStart w:id="316" w:name="ref-battlestar_galactica_2004"/>
     <w:p>
       <w:pPr>
         <w:pStyle w:val="Bibliography"/>
@@ -39668,7 +40396,7 @@
       <w:r>
         <w:t xml:space="preserve"> </w:t>
       </w:r>
-      <w:hyperlink r:id="rId313">
+      <w:hyperlink r:id="rId315">
         <w:r>
           <w:rPr>
             <w:rStyle w:val="Hyperlink"/>
@@ -39680,8 +40408,8 @@
         <w:t xml:space="preserve">.</w:t>
       </w:r>
     </w:p>
-    <w:bookmarkEnd w:id="314"/>
-    <w:bookmarkStart w:id="316" w:name="ref-slm_agentic_ai"/>
+    <w:bookmarkEnd w:id="316"/>
+    <w:bookmarkStart w:id="318" w:name="ref-slm_agentic_ai"/>
     <w:p>
       <w:pPr>
         <w:pStyle w:val="Bibliography"/>
@@ -39705,7 +40433,7 @@
       <w:r>
         <w:t xml:space="preserve"> </w:t>
       </w:r>
-      <w:hyperlink r:id="rId315">
+      <w:hyperlink r:id="rId317">
         <w:r>
           <w:rPr>
             <w:rStyle w:val="Hyperlink"/>
@@ -39717,8 +40445,8 @@
         <w:t xml:space="preserve">.</w:t>
       </w:r>
     </w:p>
-    <w:bookmarkEnd w:id="316"/>
-    <w:bookmarkStart w:id="318" w:name="ref-blade_runner"/>
+    <w:bookmarkEnd w:id="318"/>
+    <w:bookmarkStart w:id="320" w:name="ref-blade_runner"/>
     <w:p>
       <w:pPr>
         <w:pStyle w:val="Bibliography"/>
@@ -39736,7 +40464,7 @@
       <w:r>
         <w:t xml:space="preserve"> </w:t>
       </w:r>
-      <w:hyperlink r:id="rId317">
+      <w:hyperlink r:id="rId319">
         <w:r>
           <w:rPr>
             <w:rStyle w:val="Hyperlink"/>
@@ -39748,8 +40476,8 @@
         <w:t xml:space="preserve">.</w:t>
       </w:r>
     </w:p>
-    <w:bookmarkEnd w:id="318"/>
-    <w:bookmarkStart w:id="320" w:name="ref-enders_game"/>
+    <w:bookmarkEnd w:id="320"/>
+    <w:bookmarkStart w:id="322" w:name="ref-enders_game"/>
     <w:p>
       <w:pPr>
         <w:pStyle w:val="Bibliography"/>
@@ -39773,7 +40501,7 @@
       <w:r>
         <w:t xml:space="preserve"> </w:t>
       </w:r>
-      <w:hyperlink r:id="rId319">
+      <w:hyperlink r:id="rId321">
         <w:r>
           <w:rPr>
             <w:rStyle w:val="Hyperlink"/>
@@ -39785,8 +40513,8 @@
         <w:t xml:space="preserve">.</w:t>
       </w:r>
     </w:p>
-    <w:bookmarkEnd w:id="320"/>
-    <w:bookmarkStart w:id="322" w:name="ref-qlora"/>
+    <w:bookmarkEnd w:id="322"/>
+    <w:bookmarkStart w:id="324" w:name="ref-qlora"/>
     <w:p>
       <w:pPr>
         <w:pStyle w:val="Bibliography"/>
@@ -39810,7 +40538,7 @@
       <w:r>
         <w:t xml:space="preserve"> </w:t>
       </w:r>
-      <w:hyperlink r:id="rId321">
+      <w:hyperlink r:id="rId323">
         <w:r>
           <w:rPr>
             <w:rStyle w:val="Hyperlink"/>
@@ -39822,8 +40550,8 @@
         <w:t xml:space="preserve">.</w:t>
       </w:r>
     </w:p>
-    <w:bookmarkEnd w:id="322"/>
-    <w:bookmarkStart w:id="324" w:name="ref-humans_are_dead"/>
+    <w:bookmarkEnd w:id="324"/>
+    <w:bookmarkStart w:id="326" w:name="ref-humans_are_dead"/>
     <w:p>
       <w:pPr>
         <w:pStyle w:val="Bibliography"/>
@@ -39847,7 +40575,7 @@
       <w:r>
         <w:t xml:space="preserve"> </w:t>
       </w:r>
-      <w:hyperlink r:id="rId323">
+      <w:hyperlink r:id="rId325">
         <w:r>
           <w:rPr>
             <w:rStyle w:val="Hyperlink"/>
@@ -39859,8 +40587,8 @@
         <w:t xml:space="preserve">.</w:t>
       </w:r>
     </w:p>
-    <w:bookmarkEnd w:id="324"/>
-    <w:bookmarkStart w:id="326" w:name="ref-dune"/>
+    <w:bookmarkEnd w:id="326"/>
+    <w:bookmarkStart w:id="328" w:name="ref-dune"/>
     <w:p>
       <w:pPr>
         <w:pStyle w:val="Bibliography"/>
@@ -39884,7 +40612,7 @@
       <w:r>
         <w:t xml:space="preserve"> </w:t>
       </w:r>
-      <w:hyperlink r:id="rId325">
+      <w:hyperlink r:id="rId327">
         <w:r>
           <w:rPr>
             <w:rStyle w:val="Hyperlink"/>
@@ -39896,8 +40624,8 @@
         <w:t xml:space="preserve">.</w:t>
       </w:r>
     </w:p>
-    <w:bookmarkEnd w:id="326"/>
-    <w:bookmarkStart w:id="328" w:name="ref-lora"/>
+    <w:bookmarkEnd w:id="328"/>
+    <w:bookmarkStart w:id="330" w:name="ref-lora"/>
     <w:p>
       <w:pPr>
         <w:pStyle w:val="Bibliography"/>
@@ -39921,7 +40649,7 @@
       <w:r>
         <w:t xml:space="preserve"> </w:t>
       </w:r>
-      <w:hyperlink r:id="rId327">
+      <w:hyperlink r:id="rId329">
         <w:r>
           <w:rPr>
             <w:rStyle w:val="Hyperlink"/>
@@ -39933,8 +40661,8 @@
         <w:t xml:space="preserve">.</w:t>
       </w:r>
     </w:p>
-    <w:bookmarkEnd w:id="328"/>
-    <w:bookmarkStart w:id="330" w:name="ref-lecun_world_models"/>
+    <w:bookmarkEnd w:id="330"/>
+    <w:bookmarkStart w:id="332" w:name="ref-lecun_world_models"/>
     <w:p>
       <w:pPr>
         <w:pStyle w:val="Bibliography"/>
@@ -39958,7 +40686,7 @@
       <w:r>
         <w:t xml:space="preserve"> </w:t>
       </w:r>
-      <w:hyperlink r:id="rId329">
+      <w:hyperlink r:id="rId331">
         <w:r>
           <w:rPr>
             <w:rStyle w:val="Hyperlink"/>
@@ -39970,8 +40698,8 @@
         <w:t xml:space="preserve">.</w:t>
       </w:r>
     </w:p>
-    <w:bookmarkEnd w:id="330"/>
-    <w:bookmarkStart w:id="332" w:name="ref-terminator"/>
+    <w:bookmarkEnd w:id="332"/>
+    <w:bookmarkStart w:id="334" w:name="ref-terminator"/>
     <w:p>
       <w:pPr>
         <w:pStyle w:val="Bibliography"/>
@@ -39989,7 +40717,7 @@
       <w:r>
         <w:t xml:space="preserve"> </w:t>
       </w:r>
-      <w:hyperlink r:id="rId331">
+      <w:hyperlink r:id="rId333">
         <w:r>
           <w:rPr>
             <w:rStyle w:val="Hyperlink"/>
@@ -40001,8 +40729,8 @@
         <w:t xml:space="preserve">.</w:t>
       </w:r>
     </w:p>
-    <w:bookmarkEnd w:id="332"/>
-    <w:bookmarkStart w:id="334" w:name="ref-matrix"/>
+    <w:bookmarkEnd w:id="334"/>
+    <w:bookmarkStart w:id="336" w:name="ref-matrix"/>
     <w:p>
       <w:pPr>
         <w:pStyle w:val="Bibliography"/>
@@ -40020,7 +40748,7 @@
       <w:r>
         <w:t xml:space="preserve"> </w:t>
       </w:r>
-      <w:hyperlink r:id="rId333">
+      <w:hyperlink r:id="rId335">
         <w:r>
           <w:rPr>
             <w:rStyle w:val="Hyperlink"/>
@@ -40032,8 +40760,8 @@
         <w:t xml:space="preserve">.</w:t>
       </w:r>
     </w:p>
-    <w:bookmarkEnd w:id="334"/>
-    <w:bookmarkStart w:id="336" w:name="ref-wargames"/>
+    <w:bookmarkEnd w:id="336"/>
+    <w:bookmarkStart w:id="338" w:name="ref-wargames"/>
     <w:p>
       <w:pPr>
         <w:pStyle w:val="Bibliography"/>
@@ -40051,7 +40779,7 @@
       <w:r>
         <w:t xml:space="preserve"> </w:t>
       </w:r>
-      <w:hyperlink r:id="rId335">
+      <w:hyperlink r:id="rId337">
         <w:r>
           <w:rPr>
             <w:rStyle w:val="Hyperlink"/>
@@ -40063,9 +40791,9 @@
         <w:t xml:space="preserve">.</w:t>
       </w:r>
     </w:p>
-    <w:bookmarkEnd w:id="336"/>
-    <w:bookmarkEnd w:id="337"/>
     <w:bookmarkEnd w:id="338"/>
+    <w:bookmarkEnd w:id="339"/>
+    <w:bookmarkEnd w:id="340"/>
     <w:sectPr>
       <w:footnotePr>
         <w:numRestart w:val="eachSect"/>

</xml_diff>

<commit_message>
Deploying to gh-pages from @ Morrison-Lab/wai@034f4b1d21add2e526939e6acca479b5ddbb47ec 🚀
</commit_message>
<xml_diff>
--- a/chapters/coding-agents.docx
+++ b/chapters/coding-agents.docx
@@ -15,7 +15,7 @@
         <w:pStyle w:val="Date"/>
       </w:pPr>
       <w:r>
-        <w:t xml:space="preserve">Last modified: 2026-08-17 14:51:55 (PDT)</w:t>
+        <w:t xml:space="preserve">Last modified: 2026-08-17 19:23:17 (PDT)</w:t>
       </w:r>
     </w:p>
     <w:p>
@@ -49525,17 +49525,844 @@
     </w:p>
     <w:bookmarkEnd w:id="340"/>
     <w:bookmarkEnd w:id="341"/>
-    <w:bookmarkStart w:id="371" w:name="references"/>
+    <w:bookmarkStart w:id="349" w:name="sec-ai-gemini-spend-management"/>
     <w:p>
       <w:pPr>
         <w:pStyle w:val="Heading1"/>
       </w:pPr>
       <w:r>
+        <w:t xml:space="preserve">34. Managing Gemini API Spend and Cost Optimization</w:t>
+      </w:r>
+    </w:p>
+    <w:p>
+      <w:pPr>
+        <w:pStyle w:val="FirstParagraph"/>
+      </w:pPr>
+      <w:r>
+        <w:t xml:space="preserve">This guide describes how to manage Google AI Studio and Google Cloud Gemini API spend caps,</w:t>
+      </w:r>
+      <w:r>
+        <w:t xml:space="preserve"> </w:t>
+      </w:r>
+      <w:r>
+        <w:t xml:space="preserve">unpause paused API services,</w:t>
+      </w:r>
+      <w:r>
+        <w:t xml:space="preserve"> </w:t>
+      </w:r>
+      <w:r>
+        <w:t xml:space="preserve">and optimize token consumption across local tools and GitHub Actions workflows.</w:t>
+      </w:r>
+    </w:p>
+    <w:bookmarkStart w:id="343" w:name="Xd8c10be17edf039db5b664720f228274181ba18"/>
+    <w:p>
+      <w:pPr>
+        <w:pStyle w:val="Heading4"/>
+      </w:pPr>
+      <w:r>
+        <w:t xml:space="preserve">Identifying Paused Projects (Project Numbers vs. Friendly Names)</w:t>
+      </w:r>
+    </w:p>
+    <w:p>
+      <w:pPr>
+        <w:pStyle w:val="FirstParagraph"/>
+      </w:pPr>
+      <w:r>
+        <w:t xml:space="preserve">When a project reaches its monthly budget limit,</w:t>
+      </w:r>
+      <w:r>
+        <w:t xml:space="preserve"> </w:t>
+      </w:r>
+      <w:r>
+        <w:t xml:space="preserve">Google sends an email notification stating that Gemini API service has been paused.</w:t>
+      </w:r>
+      <w:r>
+        <w:t xml:space="preserve"> </w:t>
+      </w:r>
+      <w:r>
+        <w:t xml:space="preserve">These email notifications identify the affected project using its internal</w:t>
+      </w:r>
+      <w:r>
+        <w:t xml:space="preserve"> </w:t>
+      </w:r>
+      <w:r>
+        <w:rPr>
+          <w:b/>
+          <w:bCs/>
+        </w:rPr>
+        <w:t xml:space="preserve">numerical GCP Project Number</w:t>
+      </w:r>
+      <w:r>
+        <w:t xml:space="preserve"> </w:t>
+      </w:r>
+      <w:r>
+        <w:t xml:space="preserve">(e.g. </w:t>
+      </w:r>
+      <w:r>
+        <w:rPr>
+          <w:rStyle w:val="VerbatimChar"/>
+        </w:rPr>
+        <w:t xml:space="preserve">156839315029</w:t>
+      </w:r>
+      <w:r>
+        <w:t xml:space="preserve">).</w:t>
+      </w:r>
+    </w:p>
+    <w:p>
+      <w:pPr>
+        <w:pStyle w:val="BodyText"/>
+      </w:pPr>
+      <w:r>
+        <w:t xml:space="preserve">In contrast,</w:t>
+      </w:r>
+      <w:r>
+        <w:t xml:space="preserve"> </w:t>
+      </w:r>
+      <w:hyperlink r:id="rId342">
+        <w:r>
+          <w:rPr>
+            <w:rStyle w:val="Hyperlink"/>
+          </w:rPr>
+          <w:t xml:space="preserve">Google AI Studio</w:t>
+        </w:r>
+      </w:hyperlink>
+      <w:r>
+        <w:t xml:space="preserve"> </w:t>
+      </w:r>
+      <w:r>
+        <w:t xml:space="preserve">lists projects by their</w:t>
+      </w:r>
+      <w:r>
+        <w:t xml:space="preserve"> </w:t>
+      </w:r>
+      <w:r>
+        <w:rPr>
+          <w:b/>
+          <w:bCs/>
+        </w:rPr>
+        <w:t xml:space="preserve">friendly display names</w:t>
+      </w:r>
+      <w:r>
+        <w:t xml:space="preserve"> </w:t>
+      </w:r>
+      <w:r>
+        <w:t xml:space="preserve">(such as</w:t>
+      </w:r>
+      <w:r>
+        <w:t xml:space="preserve"> </w:t>
+      </w:r>
+      <w:r>
+        <w:rPr>
+          <w:rStyle w:val="VerbatimChar"/>
+        </w:rPr>
+        <w:t xml:space="preserve">ai-config Project</w:t>
+      </w:r>
+      <w:r>
+        <w:t xml:space="preserve"> </w:t>
+      </w:r>
+      <w:r>
+        <w:t xml:space="preserve">or</w:t>
+      </w:r>
+      <w:r>
+        <w:t xml:space="preserve"> </w:t>
+      </w:r>
+      <w:r>
+        <w:rPr>
+          <w:rStyle w:val="VerbatimChar"/>
+        </w:rPr>
+        <w:t xml:space="preserve">gha-project</w:t>
+      </w:r>
+      <w:r>
+        <w:t xml:space="preserve">)</w:t>
+      </w:r>
+      <w:r>
+        <w:t xml:space="preserve"> </w:t>
+      </w:r>
+      <w:r>
+        <w:t xml:space="preserve">and alphanumeric client IDs (</w:t>
+      </w:r>
+      <w:r>
+        <w:rPr>
+          <w:rStyle w:val="VerbatimChar"/>
+        </w:rPr>
+        <w:t xml:space="preserve">gen-lang-client-...</w:t>
+      </w:r>
+      <w:r>
+        <w:t xml:space="preserve">).</w:t>
+      </w:r>
+    </w:p>
+    <w:p>
+      <w:pPr>
+        <w:pStyle w:val="BodyText"/>
+      </w:pPr>
+      <w:r>
+        <w:t xml:space="preserve">To find which project in AI Studio corresponds to the notification email:</w:t>
+      </w:r>
+    </w:p>
+    <w:p>
+      <w:pPr>
+        <w:pStyle w:val="Compact"/>
+        <w:numPr>
+          <w:ilvl w:val="0"/>
+          <w:numId w:val="1149"/>
+        </w:numPr>
+      </w:pPr>
+      <w:r>
+        <w:t xml:space="preserve">Open</w:t>
+      </w:r>
+      <w:r>
+        <w:t xml:space="preserve"> </w:t>
+      </w:r>
+      <w:hyperlink r:id="rId342">
+        <w:r>
+          <w:rPr>
+            <w:rStyle w:val="Hyperlink"/>
+          </w:rPr>
+          <w:t xml:space="preserve">Google AI Studio Projects</w:t>
+        </w:r>
+      </w:hyperlink>
+      <w:r>
+        <w:t xml:space="preserve">.</w:t>
+      </w:r>
+    </w:p>
+    <w:p>
+      <w:pPr>
+        <w:pStyle w:val="Compact"/>
+        <w:numPr>
+          <w:ilvl w:val="0"/>
+          <w:numId w:val="1149"/>
+        </w:numPr>
+      </w:pPr>
+      <w:r>
+        <w:t xml:space="preserve">Locate the project corresponding to your client ID or spend alert.</w:t>
+      </w:r>
+    </w:p>
+    <w:p>
+      <w:pPr>
+        <w:pStyle w:val="Compact"/>
+        <w:numPr>
+          <w:ilvl w:val="0"/>
+          <w:numId w:val="1149"/>
+        </w:numPr>
+      </w:pPr>
+      <w:r>
+        <w:t xml:space="preserve">Any project that has hit its monthly spend cap will have its API requests paused until the limit is updated.</w:t>
+      </w:r>
+    </w:p>
+    <w:bookmarkEnd w:id="343"/>
+    <w:bookmarkStart w:id="345" w:name="adjusting-and-unpausing-spend-caps"/>
+    <w:p>
+      <w:pPr>
+        <w:pStyle w:val="Heading4"/>
+      </w:pPr>
+      <w:r>
+        <w:t xml:space="preserve">Adjusting and Unpausing Spend Caps</w:t>
+      </w:r>
+    </w:p>
+    <w:p>
+      <w:pPr>
+        <w:pStyle w:val="FirstParagraph"/>
+      </w:pPr>
+      <w:r>
+        <w:t xml:space="preserve">To restore API access for a paused project:</w:t>
+      </w:r>
+    </w:p>
+    <w:p>
+      <w:pPr>
+        <w:pStyle w:val="Compact"/>
+        <w:numPr>
+          <w:ilvl w:val="0"/>
+          <w:numId w:val="1150"/>
+        </w:numPr>
+      </w:pPr>
+      <w:r>
+        <w:t xml:space="preserve">Open</w:t>
+      </w:r>
+      <w:r>
+        <w:t xml:space="preserve"> </w:t>
+      </w:r>
+      <w:hyperlink r:id="rId344">
+        <w:r>
+          <w:rPr>
+            <w:rStyle w:val="Hyperlink"/>
+          </w:rPr>
+          <w:t xml:space="preserve">Google AI Studio Spend</w:t>
+        </w:r>
+      </w:hyperlink>
+      <w:r>
+        <w:t xml:space="preserve">.</w:t>
+      </w:r>
+    </w:p>
+    <w:p>
+      <w:pPr>
+        <w:pStyle w:val="Compact"/>
+        <w:numPr>
+          <w:ilvl w:val="0"/>
+          <w:numId w:val="1150"/>
+        </w:numPr>
+      </w:pPr>
+      <w:r>
+        <w:t xml:space="preserve">Increase the monthly spend cap dollar amount or set it to unlimited.</w:t>
+      </w:r>
+    </w:p>
+    <w:p>
+      <w:pPr>
+        <w:pStyle w:val="Compact"/>
+        <w:numPr>
+          <w:ilvl w:val="0"/>
+          <w:numId w:val="1150"/>
+        </w:numPr>
+      </w:pPr>
+      <w:r>
+        <w:t xml:space="preserve">Save your changes. API requests will automatically resume within a few minutes.</w:t>
+      </w:r>
+    </w:p>
+    <w:p>
+      <w:pPr>
+        <w:pStyle w:val="FirstParagraph"/>
+      </w:pPr>
+      <w:r>
+        <w:t xml:space="preserve">If no manual action is taken,</w:t>
+      </w:r>
+      <w:r>
+        <w:t xml:space="preserve"> </w:t>
+      </w:r>
+      <w:r>
+        <w:t xml:space="preserve">accumulated spend resets to</w:t>
+      </w:r>
+      <w:r>
+        <w:t xml:space="preserve"> </w:t>
+      </w:r>
+      <w:r>
+        <w:rPr>
+          <w:b/>
+          <w:bCs/>
+        </w:rPr>
+        <w:t xml:space="preserve">$0 on the 1st of the next month</w:t>
+      </w:r>
+      <w:r>
+        <w:t xml:space="preserve">,</w:t>
+      </w:r>
+      <w:r>
+        <w:t xml:space="preserve"> </w:t>
+      </w:r>
+      <w:r>
+        <w:t xml:space="preserve">and API service automatically resumes up to the configured cap.</w:t>
+      </w:r>
+    </w:p>
+    <w:bookmarkEnd w:id="345"/>
+    <w:bookmarkStart w:id="347" w:name="setting-up-google-cloud-budget-alerts"/>
+    <w:p>
+      <w:pPr>
+        <w:pStyle w:val="Heading4"/>
+      </w:pPr>
+      <w:r>
+        <w:t xml:space="preserve">Setting Up Google Cloud Budget Alerts</w:t>
+      </w:r>
+    </w:p>
+    <w:p>
+      <w:pPr>
+        <w:pStyle w:val="FirstParagraph"/>
+      </w:pPr>
+      <w:r>
+        <w:t xml:space="preserve">To receive early warnings before reaching a spend cap:</w:t>
+      </w:r>
+    </w:p>
+    <w:p>
+      <w:pPr>
+        <w:pStyle w:val="Compact"/>
+        <w:numPr>
+          <w:ilvl w:val="0"/>
+          <w:numId w:val="1151"/>
+        </w:numPr>
+      </w:pPr>
+      <w:r>
+        <w:t xml:space="preserve">Open</w:t>
+      </w:r>
+      <w:r>
+        <w:t xml:space="preserve"> </w:t>
+      </w:r>
+      <w:hyperlink r:id="rId346">
+        <w:r>
+          <w:rPr>
+            <w:rStyle w:val="Hyperlink"/>
+          </w:rPr>
+          <w:t xml:space="preserve">Google Cloud Console Billing Budgets &amp; Alerts</w:t>
+        </w:r>
+      </w:hyperlink>
+      <w:r>
+        <w:t xml:space="preserve">.</w:t>
+      </w:r>
+    </w:p>
+    <w:p>
+      <w:pPr>
+        <w:pStyle w:val="Compact"/>
+        <w:numPr>
+          <w:ilvl w:val="0"/>
+          <w:numId w:val="1151"/>
+        </w:numPr>
+      </w:pPr>
+      <w:r>
+        <w:t xml:space="preserve">Select your billing account and click</w:t>
+      </w:r>
+      <w:r>
+        <w:t xml:space="preserve"> </w:t>
+      </w:r>
+      <w:r>
+        <w:rPr>
+          <w:b/>
+          <w:bCs/>
+        </w:rPr>
+        <w:t xml:space="preserve">Create Budget</w:t>
+      </w:r>
+      <w:r>
+        <w:t xml:space="preserve">.</w:t>
+      </w:r>
+    </w:p>
+    <w:p>
+      <w:pPr>
+        <w:pStyle w:val="Compact"/>
+        <w:numPr>
+          <w:ilvl w:val="0"/>
+          <w:numId w:val="1151"/>
+        </w:numPr>
+      </w:pPr>
+      <w:r>
+        <w:t xml:space="preserve">Name the budget (e.g.,</w:t>
+      </w:r>
+      <w:r>
+        <w:t xml:space="preserve"> </w:t>
+      </w:r>
+      <w:r>
+        <w:rPr>
+          <w:rStyle w:val="VerbatimChar"/>
+        </w:rPr>
+        <w:t xml:space="preserve">Lab AI API Monthly Budget</w:t>
+      </w:r>
+      <w:r>
+        <w:t xml:space="preserve">) and select the relevant GCP projects.</w:t>
+      </w:r>
+    </w:p>
+    <w:p>
+      <w:pPr>
+        <w:pStyle w:val="Compact"/>
+        <w:numPr>
+          <w:ilvl w:val="0"/>
+          <w:numId w:val="1151"/>
+        </w:numPr>
+      </w:pPr>
+      <w:r>
+        <w:t xml:space="preserve">Set your target monthly budget amount.</w:t>
+      </w:r>
+    </w:p>
+    <w:p>
+      <w:pPr>
+        <w:pStyle w:val="Compact"/>
+        <w:numPr>
+          <w:ilvl w:val="0"/>
+          <w:numId w:val="1151"/>
+        </w:numPr>
+      </w:pPr>
+      <w:r>
+        <w:t xml:space="preserve">Configure trigger rules for email notifications at</w:t>
+      </w:r>
+      <w:r>
+        <w:t xml:space="preserve"> </w:t>
+      </w:r>
+      <w:r>
+        <w:rPr>
+          <w:b/>
+          <w:bCs/>
+        </w:rPr>
+        <w:t xml:space="preserve">50%</w:t>
+      </w:r>
+      <w:r>
+        <w:t xml:space="preserve">,</w:t>
+      </w:r>
+      <w:r>
+        <w:t xml:space="preserve"> </w:t>
+      </w:r>
+      <w:r>
+        <w:rPr>
+          <w:b/>
+          <w:bCs/>
+        </w:rPr>
+        <w:t xml:space="preserve">75%</w:t>
+      </w:r>
+      <w:r>
+        <w:t xml:space="preserve">, and</w:t>
+      </w:r>
+      <w:r>
+        <w:t xml:space="preserve"> </w:t>
+      </w:r>
+      <w:r>
+        <w:rPr>
+          <w:b/>
+          <w:bCs/>
+        </w:rPr>
+        <w:t xml:space="preserve">90%</w:t>
+      </w:r>
+      <w:r>
+        <w:t xml:space="preserve"> </w:t>
+      </w:r>
+      <w:r>
+        <w:t xml:space="preserve">of the budget.</w:t>
+      </w:r>
+    </w:p>
+    <w:p>
+      <w:pPr>
+        <w:pStyle w:val="Compact"/>
+        <w:numPr>
+          <w:ilvl w:val="0"/>
+          <w:numId w:val="1151"/>
+        </w:numPr>
+      </w:pPr>
+      <w:r>
+        <w:t xml:space="preserve">Click</w:t>
+      </w:r>
+      <w:r>
+        <w:t xml:space="preserve"> </w:t>
+      </w:r>
+      <w:r>
+        <w:rPr>
+          <w:b/>
+          <w:bCs/>
+        </w:rPr>
+        <w:t xml:space="preserve">Finish</w:t>
+      </w:r>
+      <w:r>
+        <w:t xml:space="preserve">. You will receive email alerts before any project hits its spend cap.</w:t>
+      </w:r>
+    </w:p>
+    <w:bookmarkEnd w:id="347"/>
+    <w:bookmarkStart w:id="348" w:name="cost-optimization-best-practices"/>
+    <w:p>
+      <w:pPr>
+        <w:pStyle w:val="Heading4"/>
+      </w:pPr>
+      <w:r>
+        <w:t xml:space="preserve">Cost Optimization Best Practices</w:t>
+      </w:r>
+    </w:p>
+    <w:p>
+      <w:pPr>
+        <w:pStyle w:val="FirstParagraph"/>
+      </w:pPr>
+      <w:r>
+        <w:t xml:space="preserve">To maximize the efficiency of your API spend across local CLI sessions, subagents, and automated workflows:</w:t>
+      </w:r>
+    </w:p>
+    <w:p>
+      <w:pPr>
+        <w:pStyle w:val="Compact"/>
+        <w:numPr>
+          <w:ilvl w:val="0"/>
+          <w:numId w:val="1152"/>
+        </w:numPr>
+      </w:pPr>
+      <w:r>
+        <w:rPr>
+          <w:b/>
+          <w:bCs/>
+        </w:rPr>
+        <w:t xml:space="preserve">Right-Size Model Selection</w:t>
+      </w:r>
+      <w:r>
+        <w:t xml:space="preserve">:</w:t>
+      </w:r>
+      <w:r>
+        <w:t xml:space="preserve"> </w:t>
+      </w:r>
+      <w:r>
+        <w:t xml:space="preserve">For general Gemini API, Python SDK, or custom scripts, prefer Flash-tier models (such as</w:t>
+      </w:r>
+      <w:r>
+        <w:t xml:space="preserve"> </w:t>
+      </w:r>
+      <w:r>
+        <w:rPr>
+          <w:rStyle w:val="VerbatimChar"/>
+        </w:rPr>
+        <w:t xml:space="preserve">gemini-2.5-flash</w:t>
+      </w:r>
+      <w:r>
+        <w:t xml:space="preserve">) over Pro-tier models (</w:t>
+      </w:r>
+      <w:r>
+        <w:rPr>
+          <w:rStyle w:val="VerbatimChar"/>
+        </w:rPr>
+        <w:t xml:space="preserve">gemini-2.5-pro</w:t>
+      </w:r>
+      <w:r>
+        <w:t xml:space="preserve">).</w:t>
+      </w:r>
+      <w:r>
+        <w:t xml:space="preserve"> </w:t>
+      </w:r>
+      <w:r>
+        <w:t xml:space="preserve">Flash models provide a substantially lower token cost for routine search, log parsing, and background processing.</w:t>
+      </w:r>
+      <w:r>
+        <w:t xml:space="preserve"> </w:t>
+      </w:r>
+      <w:r>
+        <w:t xml:space="preserve">For Antigravity Agent workflows (</w:t>
+      </w:r>
+      <w:r>
+        <w:rPr>
+          <w:rStyle w:val="VerbatimChar"/>
+        </w:rPr>
+        <w:t xml:space="preserve">google-antigravity</w:t>
+      </w:r>
+      <w:r>
+        <w:t xml:space="preserve">), the agent defaults to</w:t>
+      </w:r>
+      <w:r>
+        <w:t xml:space="preserve"> </w:t>
+      </w:r>
+      <w:r>
+        <w:rPr>
+          <w:rStyle w:val="VerbatimChar"/>
+        </w:rPr>
+        <w:t xml:space="preserve">gemini-3.7-flash</w:t>
+      </w:r>
+      <w:r>
+        <w:t xml:space="preserve"> </w:t>
+      </w:r>
+      <w:r>
+        <w:t xml:space="preserve">(already a Flash-tier model).</w:t>
+      </w:r>
+      <w:r>
+        <w:t xml:space="preserve"> </w:t>
+      </w:r>
+      <w:r>
+        <w:t xml:space="preserve">Supported Antigravity Agent model options include</w:t>
+      </w:r>
+      <w:r>
+        <w:t xml:space="preserve"> </w:t>
+      </w:r>
+      <w:r>
+        <w:rPr>
+          <w:rStyle w:val="VerbatimChar"/>
+        </w:rPr>
+        <w:t xml:space="preserve">gemini-3.7-flash</w:t>
+      </w:r>
+      <w:r>
+        <w:t xml:space="preserve">,</w:t>
+      </w:r>
+      <w:r>
+        <w:t xml:space="preserve"> </w:t>
+      </w:r>
+      <w:r>
+        <w:rPr>
+          <w:rStyle w:val="VerbatimChar"/>
+        </w:rPr>
+        <w:t xml:space="preserve">gemini-3.6-flash</w:t>
+      </w:r>
+      <w:r>
+        <w:t xml:space="preserve">,</w:t>
+      </w:r>
+      <w:r>
+        <w:t xml:space="preserve"> </w:t>
+      </w:r>
+      <w:r>
+        <w:rPr>
+          <w:rStyle w:val="VerbatimChar"/>
+        </w:rPr>
+        <w:t xml:space="preserve">gemini-3.5-flash</w:t>
+      </w:r>
+      <w:r>
+        <w:t xml:space="preserve">, and</w:t>
+      </w:r>
+      <w:r>
+        <w:t xml:space="preserve"> </w:t>
+      </w:r>
+      <w:r>
+        <w:rPr>
+          <w:rStyle w:val="VerbatimChar"/>
+        </w:rPr>
+        <w:t xml:space="preserve">gemini-3.5-flash-lite</w:t>
+      </w:r>
+      <w:r>
+        <w:t xml:space="preserve">.</w:t>
+      </w:r>
+    </w:p>
+    <w:p>
+      <w:pPr>
+        <w:pStyle w:val="Compact"/>
+        <w:numPr>
+          <w:ilvl w:val="0"/>
+          <w:numId w:val="1152"/>
+        </w:numPr>
+      </w:pPr>
+      <w:r>
+        <w:rPr>
+          <w:b/>
+          <w:bCs/>
+        </w:rPr>
+        <w:t xml:space="preserve">Use Context Caching</w:t>
+      </w:r>
+      <w:r>
+        <w:t xml:space="preserve">:</w:t>
+      </w:r>
+      <w:r>
+        <w:t xml:space="preserve"> </w:t>
+      </w:r>
+      <w:r>
+        <w:t xml:space="preserve">For workloads that repeatedly pass static context over 2,048 tokens (such as large reference docs, system prompts, or codebase indices),</w:t>
+      </w:r>
+      <w:r>
+        <w:t xml:space="preserve"> </w:t>
+      </w:r>
+      <w:r>
+        <w:t xml:space="preserve">use Gemini Context Caching. Cached input tokens receive a substantial discount compared to standard input tokens.</w:t>
+      </w:r>
+    </w:p>
+    <w:p>
+      <w:pPr>
+        <w:pStyle w:val="Compact"/>
+        <w:numPr>
+          <w:ilvl w:val="0"/>
+          <w:numId w:val="1152"/>
+        </w:numPr>
+      </w:pPr>
+      <w:r>
+        <w:rPr>
+          <w:b/>
+          <w:bCs/>
+        </w:rPr>
+        <w:t xml:space="preserve">Use the Batch API for Non-Realtime Tasks</w:t>
+      </w:r>
+      <w:r>
+        <w:t xml:space="preserve">:</w:t>
+      </w:r>
+      <w:r>
+        <w:t xml:space="preserve"> </w:t>
+      </w:r>
+      <w:r>
+        <w:t xml:space="preserve">For offline batch processing, evaluation suites, or background doc updates,</w:t>
+      </w:r>
+      <w:r>
+        <w:t xml:space="preserve"> </w:t>
+      </w:r>
+      <w:r>
+        <w:t xml:space="preserve">submit requests via the Gemini Batch API to receive a 50% discount on input and output tokens.</w:t>
+      </w:r>
+    </w:p>
+    <w:p>
+      <w:pPr>
+        <w:pStyle w:val="Compact"/>
+        <w:numPr>
+          <w:ilvl w:val="0"/>
+          <w:numId w:val="1152"/>
+        </w:numPr>
+      </w:pPr>
+      <w:r>
+        <w:rPr>
+          <w:b/>
+          <w:bCs/>
+        </w:rPr>
+        <w:t xml:space="preserve">GitHub UI Diff Collapsing</w:t>
+      </w:r>
+      <w:r>
+        <w:t xml:space="preserve">:</w:t>
+      </w:r>
+      <w:r>
+        <w:t xml:space="preserve"> </w:t>
+      </w:r>
+      <w:r>
+        <w:t xml:space="preserve">Mark dependency lockfiles (</w:t>
+      </w:r>
+      <w:r>
+        <w:rPr>
+          <w:rStyle w:val="VerbatimChar"/>
+        </w:rPr>
+        <w:t xml:space="preserve">*.lock</w:t>
+      </w:r>
+      <w:r>
+        <w:t xml:space="preserve">,</w:t>
+      </w:r>
+      <w:r>
+        <w:t xml:space="preserve"> </w:t>
+      </w:r>
+      <w:r>
+        <w:rPr>
+          <w:rStyle w:val="VerbatimChar"/>
+        </w:rPr>
+        <w:t xml:space="preserve">package-lock.json</w:t>
+      </w:r>
+      <w:r>
+        <w:t xml:space="preserve">,</w:t>
+      </w:r>
+      <w:r>
+        <w:t xml:space="preserve"> </w:t>
+      </w:r>
+      <w:r>
+        <w:rPr>
+          <w:rStyle w:val="VerbatimChar"/>
+        </w:rPr>
+        <w:t xml:space="preserve">yarn.lock</w:t>
+      </w:r>
+      <w:r>
+        <w:t xml:space="preserve">,</w:t>
+      </w:r>
+      <w:r>
+        <w:t xml:space="preserve"> </w:t>
+      </w:r>
+      <w:r>
+        <w:rPr>
+          <w:rStyle w:val="VerbatimChar"/>
+        </w:rPr>
+        <w:t xml:space="preserve">renv.lock</w:t>
+      </w:r>
+      <w:r>
+        <w:t xml:space="preserve">) and generated build artifacts as</w:t>
+      </w:r>
+      <w:r>
+        <w:t xml:space="preserve"> </w:t>
+      </w:r>
+      <w:r>
+        <w:rPr>
+          <w:rStyle w:val="VerbatimChar"/>
+        </w:rPr>
+        <w:t xml:space="preserve">linguist-generated=true</w:t>
+      </w:r>
+      <w:r>
+        <w:t xml:space="preserve"> </w:t>
+      </w:r>
+      <w:r>
+        <w:t xml:space="preserve">in</w:t>
+      </w:r>
+      <w:r>
+        <w:t xml:space="preserve"> </w:t>
+      </w:r>
+      <w:r>
+        <w:rPr>
+          <w:rStyle w:val="VerbatimChar"/>
+        </w:rPr>
+        <w:t xml:space="preserve">.gitattributes</w:t>
+      </w:r>
+      <w:r>
+        <w:t xml:space="preserve"> </w:t>
+      </w:r>
+      <w:r>
+        <w:t xml:space="preserve">to collapse them in GitHub’s web diff view and exclude them from repository language statistics.</w:t>
+      </w:r>
+    </w:p>
+    <w:bookmarkEnd w:id="348"/>
+    <w:bookmarkEnd w:id="349"/>
+    <w:bookmarkStart w:id="379" w:name="references"/>
+    <w:p>
+      <w:pPr>
+        <w:pStyle w:val="Heading1"/>
+      </w:pPr>
+      <w:r>
         <w:t xml:space="preserve">References</w:t>
       </w:r>
     </w:p>
-    <w:bookmarkStart w:id="370" w:name="refs"/>
-    <w:bookmarkStart w:id="343" w:name="ref-space_odyssey"/>
+    <w:bookmarkStart w:id="378" w:name="refs"/>
+    <w:bookmarkStart w:id="351" w:name="ref-space_odyssey"/>
     <w:p>
       <w:pPr>
         <w:pStyle w:val="Bibliography"/>
@@ -49553,7 +50380,7 @@
       <w:r>
         <w:t xml:space="preserve"> </w:t>
       </w:r>
-      <w:hyperlink r:id="rId342">
+      <w:hyperlink r:id="rId350">
         <w:r>
           <w:rPr>
             <w:rStyle w:val="Hyperlink"/>
@@ -49565,8 +50392,8 @@
         <w:t xml:space="preserve">.</w:t>
       </w:r>
     </w:p>
-    <w:bookmarkEnd w:id="343"/>
-    <w:bookmarkStart w:id="345" w:name="ref-i_robot"/>
+    <w:bookmarkEnd w:id="351"/>
+    <w:bookmarkStart w:id="353" w:name="ref-i_robot"/>
     <w:p>
       <w:pPr>
         <w:pStyle w:val="Bibliography"/>
@@ -49590,7 +50417,7 @@
       <w:r>
         <w:t xml:space="preserve"> </w:t>
       </w:r>
-      <w:hyperlink r:id="rId344">
+      <w:hyperlink r:id="rId352">
         <w:r>
           <w:rPr>
             <w:rStyle w:val="Hyperlink"/>
@@ -49602,8 +50429,8 @@
         <w:t xml:space="preserve">.</w:t>
       </w:r>
     </w:p>
-    <w:bookmarkEnd w:id="345"/>
-    <w:bookmarkStart w:id="347" w:name="ref-battlestar_galactica_2004"/>
+    <w:bookmarkEnd w:id="353"/>
+    <w:bookmarkStart w:id="355" w:name="ref-battlestar_galactica_2004"/>
     <w:p>
       <w:pPr>
         <w:pStyle w:val="Bibliography"/>
@@ -49621,7 +50448,7 @@
       <w:r>
         <w:t xml:space="preserve"> </w:t>
       </w:r>
-      <w:hyperlink r:id="rId346">
+      <w:hyperlink r:id="rId354">
         <w:r>
           <w:rPr>
             <w:rStyle w:val="Hyperlink"/>
@@ -49633,8 +50460,8 @@
         <w:t xml:space="preserve">.</w:t>
       </w:r>
     </w:p>
-    <w:bookmarkEnd w:id="347"/>
-    <w:bookmarkStart w:id="349" w:name="ref-slm_agentic_ai"/>
+    <w:bookmarkEnd w:id="355"/>
+    <w:bookmarkStart w:id="357" w:name="ref-slm_agentic_ai"/>
     <w:p>
       <w:pPr>
         <w:pStyle w:val="Bibliography"/>
@@ -49658,7 +50485,7 @@
       <w:r>
         <w:t xml:space="preserve"> </w:t>
       </w:r>
-      <w:hyperlink r:id="rId348">
+      <w:hyperlink r:id="rId356">
         <w:r>
           <w:rPr>
             <w:rStyle w:val="Hyperlink"/>
@@ -49670,8 +50497,8 @@
         <w:t xml:space="preserve">.</w:t>
       </w:r>
     </w:p>
-    <w:bookmarkEnd w:id="349"/>
-    <w:bookmarkStart w:id="351" w:name="ref-blade_runner"/>
+    <w:bookmarkEnd w:id="357"/>
+    <w:bookmarkStart w:id="359" w:name="ref-blade_runner"/>
     <w:p>
       <w:pPr>
         <w:pStyle w:val="Bibliography"/>
@@ -49689,7 +50516,7 @@
       <w:r>
         <w:t xml:space="preserve"> </w:t>
       </w:r>
-      <w:hyperlink r:id="rId350">
+      <w:hyperlink r:id="rId358">
         <w:r>
           <w:rPr>
             <w:rStyle w:val="Hyperlink"/>
@@ -49701,8 +50528,8 @@
         <w:t xml:space="preserve">.</w:t>
       </w:r>
     </w:p>
-    <w:bookmarkEnd w:id="351"/>
-    <w:bookmarkStart w:id="353" w:name="ref-enders_game"/>
+    <w:bookmarkEnd w:id="359"/>
+    <w:bookmarkStart w:id="361" w:name="ref-enders_game"/>
     <w:p>
       <w:pPr>
         <w:pStyle w:val="Bibliography"/>
@@ -49726,7 +50553,7 @@
       <w:r>
         <w:t xml:space="preserve"> </w:t>
       </w:r>
-      <w:hyperlink r:id="rId352">
+      <w:hyperlink r:id="rId360">
         <w:r>
           <w:rPr>
             <w:rStyle w:val="Hyperlink"/>
@@ -49738,8 +50565,8 @@
         <w:t xml:space="preserve">.</w:t>
       </w:r>
     </w:p>
-    <w:bookmarkEnd w:id="353"/>
-    <w:bookmarkStart w:id="355" w:name="ref-qlora"/>
+    <w:bookmarkEnd w:id="361"/>
+    <w:bookmarkStart w:id="363" w:name="ref-qlora"/>
     <w:p>
       <w:pPr>
         <w:pStyle w:val="Bibliography"/>
@@ -49763,7 +50590,7 @@
       <w:r>
         <w:t xml:space="preserve"> </w:t>
       </w:r>
-      <w:hyperlink r:id="rId354">
+      <w:hyperlink r:id="rId362">
         <w:r>
           <w:rPr>
             <w:rStyle w:val="Hyperlink"/>
@@ -49775,8 +50602,8 @@
         <w:t xml:space="preserve">.</w:t>
       </w:r>
     </w:p>
-    <w:bookmarkEnd w:id="355"/>
-    <w:bookmarkStart w:id="357" w:name="ref-humans_are_dead"/>
+    <w:bookmarkEnd w:id="363"/>
+    <w:bookmarkStart w:id="365" w:name="ref-humans_are_dead"/>
     <w:p>
       <w:pPr>
         <w:pStyle w:val="Bibliography"/>
@@ -49800,7 +50627,7 @@
       <w:r>
         <w:t xml:space="preserve"> </w:t>
       </w:r>
-      <w:hyperlink r:id="rId356">
+      <w:hyperlink r:id="rId364">
         <w:r>
           <w:rPr>
             <w:rStyle w:val="Hyperlink"/>
@@ -49812,8 +50639,8 @@
         <w:t xml:space="preserve">.</w:t>
       </w:r>
     </w:p>
-    <w:bookmarkEnd w:id="357"/>
-    <w:bookmarkStart w:id="359" w:name="ref-dune"/>
+    <w:bookmarkEnd w:id="365"/>
+    <w:bookmarkStart w:id="367" w:name="ref-dune"/>
     <w:p>
       <w:pPr>
         <w:pStyle w:val="Bibliography"/>
@@ -49837,7 +50664,7 @@
       <w:r>
         <w:t xml:space="preserve"> </w:t>
       </w:r>
-      <w:hyperlink r:id="rId358">
+      <w:hyperlink r:id="rId366">
         <w:r>
           <w:rPr>
             <w:rStyle w:val="Hyperlink"/>
@@ -49849,8 +50676,8 @@
         <w:t xml:space="preserve">.</w:t>
       </w:r>
     </w:p>
-    <w:bookmarkEnd w:id="359"/>
-    <w:bookmarkStart w:id="361" w:name="ref-lora"/>
+    <w:bookmarkEnd w:id="367"/>
+    <w:bookmarkStart w:id="369" w:name="ref-lora"/>
     <w:p>
       <w:pPr>
         <w:pStyle w:val="Bibliography"/>
@@ -49874,7 +50701,7 @@
       <w:r>
         <w:t xml:space="preserve"> </w:t>
       </w:r>
-      <w:hyperlink r:id="rId360">
+      <w:hyperlink r:id="rId368">
         <w:r>
           <w:rPr>
             <w:rStyle w:val="Hyperlink"/>
@@ -49886,8 +50713,8 @@
         <w:t xml:space="preserve">.</w:t>
       </w:r>
     </w:p>
-    <w:bookmarkEnd w:id="361"/>
-    <w:bookmarkStart w:id="363" w:name="ref-lecun_world_models"/>
+    <w:bookmarkEnd w:id="369"/>
+    <w:bookmarkStart w:id="371" w:name="ref-lecun_world_models"/>
     <w:p>
       <w:pPr>
         <w:pStyle w:val="Bibliography"/>
@@ -49911,7 +50738,7 @@
       <w:r>
         <w:t xml:space="preserve"> </w:t>
       </w:r>
-      <w:hyperlink r:id="rId362">
+      <w:hyperlink r:id="rId370">
         <w:r>
           <w:rPr>
             <w:rStyle w:val="Hyperlink"/>
@@ -49923,8 +50750,8 @@
         <w:t xml:space="preserve">.</w:t>
       </w:r>
     </w:p>
-    <w:bookmarkEnd w:id="363"/>
-    <w:bookmarkStart w:id="365" w:name="ref-terminator"/>
+    <w:bookmarkEnd w:id="371"/>
+    <w:bookmarkStart w:id="373" w:name="ref-terminator"/>
     <w:p>
       <w:pPr>
         <w:pStyle w:val="Bibliography"/>
@@ -49942,7 +50769,7 @@
       <w:r>
         <w:t xml:space="preserve"> </w:t>
       </w:r>
-      <w:hyperlink r:id="rId364">
+      <w:hyperlink r:id="rId372">
         <w:r>
           <w:rPr>
             <w:rStyle w:val="Hyperlink"/>
@@ -49954,8 +50781,8 @@
         <w:t xml:space="preserve">.</w:t>
       </w:r>
     </w:p>
-    <w:bookmarkEnd w:id="365"/>
-    <w:bookmarkStart w:id="367" w:name="ref-matrix"/>
+    <w:bookmarkEnd w:id="373"/>
+    <w:bookmarkStart w:id="375" w:name="ref-matrix"/>
     <w:p>
       <w:pPr>
         <w:pStyle w:val="Bibliography"/>
@@ -49973,7 +50800,7 @@
       <w:r>
         <w:t xml:space="preserve"> </w:t>
       </w:r>
-      <w:hyperlink r:id="rId366">
+      <w:hyperlink r:id="rId374">
         <w:r>
           <w:rPr>
             <w:rStyle w:val="Hyperlink"/>
@@ -49985,8 +50812,8 @@
         <w:t xml:space="preserve">.</w:t>
       </w:r>
     </w:p>
-    <w:bookmarkEnd w:id="367"/>
-    <w:bookmarkStart w:id="369" w:name="ref-wargames"/>
+    <w:bookmarkEnd w:id="375"/>
+    <w:bookmarkStart w:id="377" w:name="ref-wargames"/>
     <w:p>
       <w:pPr>
         <w:pStyle w:val="Bibliography"/>
@@ -50004,7 +50831,7 @@
       <w:r>
         <w:t xml:space="preserve"> </w:t>
       </w:r>
-      <w:hyperlink r:id="rId368">
+      <w:hyperlink r:id="rId376">
         <w:r>
           <w:rPr>
             <w:rStyle w:val="Hyperlink"/>
@@ -50016,9 +50843,9 @@
         <w:t xml:space="preserve">.</w:t>
       </w:r>
     </w:p>
-    <w:bookmarkEnd w:id="369"/>
-    <w:bookmarkEnd w:id="370"/>
-    <w:bookmarkEnd w:id="371"/>
+    <w:bookmarkEnd w:id="377"/>
+    <w:bookmarkEnd w:id="378"/>
+    <w:bookmarkEnd w:id="379"/>
     <w:sectPr>
       <w:footnotePr>
         <w:numRestart w:val="eachSect"/>
@@ -51348,6 +52175,99 @@
     </w:lvlOverride>
   </w:num>
   <w:num w:numId="1148">
+    <w:abstractNumId w:val="991"/>
+  </w:num>
+  <w:num w:numId="1149">
+    <w:abstractNumId w:val="99411"/>
+    <w:lvlOverride w:ilvl="0">
+      <w:startOverride w:val="1"/>
+    </w:lvlOverride>
+    <w:lvlOverride w:ilvl="1">
+      <w:startOverride w:val="1"/>
+    </w:lvlOverride>
+    <w:lvlOverride w:ilvl="2">
+      <w:startOverride w:val="1"/>
+    </w:lvlOverride>
+    <w:lvlOverride w:ilvl="3">
+      <w:startOverride w:val="1"/>
+    </w:lvlOverride>
+    <w:lvlOverride w:ilvl="4">
+      <w:startOverride w:val="1"/>
+    </w:lvlOverride>
+    <w:lvlOverride w:ilvl="5">
+      <w:startOverride w:val="1"/>
+    </w:lvlOverride>
+    <w:lvlOverride w:ilvl="6">
+      <w:startOverride w:val="1"/>
+    </w:lvlOverride>
+    <w:lvlOverride w:ilvl="7">
+      <w:startOverride w:val="1"/>
+    </w:lvlOverride>
+    <w:lvlOverride w:ilvl="8">
+      <w:startOverride w:val="1"/>
+    </w:lvlOverride>
+  </w:num>
+  <w:num w:numId="1150">
+    <w:abstractNumId w:val="99411"/>
+    <w:lvlOverride w:ilvl="0">
+      <w:startOverride w:val="1"/>
+    </w:lvlOverride>
+    <w:lvlOverride w:ilvl="1">
+      <w:startOverride w:val="1"/>
+    </w:lvlOverride>
+    <w:lvlOverride w:ilvl="2">
+      <w:startOverride w:val="1"/>
+    </w:lvlOverride>
+    <w:lvlOverride w:ilvl="3">
+      <w:startOverride w:val="1"/>
+    </w:lvlOverride>
+    <w:lvlOverride w:ilvl="4">
+      <w:startOverride w:val="1"/>
+    </w:lvlOverride>
+    <w:lvlOverride w:ilvl="5">
+      <w:startOverride w:val="1"/>
+    </w:lvlOverride>
+    <w:lvlOverride w:ilvl="6">
+      <w:startOverride w:val="1"/>
+    </w:lvlOverride>
+    <w:lvlOverride w:ilvl="7">
+      <w:startOverride w:val="1"/>
+    </w:lvlOverride>
+    <w:lvlOverride w:ilvl="8">
+      <w:startOverride w:val="1"/>
+    </w:lvlOverride>
+  </w:num>
+  <w:num w:numId="1151">
+    <w:abstractNumId w:val="99411"/>
+    <w:lvlOverride w:ilvl="0">
+      <w:startOverride w:val="1"/>
+    </w:lvlOverride>
+    <w:lvlOverride w:ilvl="1">
+      <w:startOverride w:val="1"/>
+    </w:lvlOverride>
+    <w:lvlOverride w:ilvl="2">
+      <w:startOverride w:val="1"/>
+    </w:lvlOverride>
+    <w:lvlOverride w:ilvl="3">
+      <w:startOverride w:val="1"/>
+    </w:lvlOverride>
+    <w:lvlOverride w:ilvl="4">
+      <w:startOverride w:val="1"/>
+    </w:lvlOverride>
+    <w:lvlOverride w:ilvl="5">
+      <w:startOverride w:val="1"/>
+    </w:lvlOverride>
+    <w:lvlOverride w:ilvl="6">
+      <w:startOverride w:val="1"/>
+    </w:lvlOverride>
+    <w:lvlOverride w:ilvl="7">
+      <w:startOverride w:val="1"/>
+    </w:lvlOverride>
+    <w:lvlOverride w:ilvl="8">
+      <w:startOverride w:val="1"/>
+    </w:lvlOverride>
+  </w:num>
+  <w:num w:numId="1152">
     <w:abstractNumId w:val="991"/>
   </w:num>
 </w:numbering>

</xml_diff>

<commit_message>
Deploying to gh-pages from @ Morrison-Lab/wai@8afecf7a014dbecb9bbd6084fc73e1966e96989a 🚀
</commit_message>
<xml_diff>
--- a/chapters/coding-agents.docx
+++ b/chapters/coding-agents.docx
@@ -15,7 +15,7 @@
         <w:pStyle w:val="Date"/>
       </w:pPr>
       <w:r>
-        <w:t xml:space="preserve">Last modified: 2026-08-20 09:32:05 (PDT)</w:t>
+        <w:t xml:space="preserve">Last modified: 2026-08-22 11:04:29 (PDT)</w:t>
       </w:r>
     </w:p>
     <w:p>
@@ -51143,7 +51143,7 @@
     </w:p>
     <w:bookmarkEnd w:id="348"/>
     <w:bookmarkEnd w:id="349"/>
-    <w:bookmarkStart w:id="361" w:name="sec-ai-mcp-server-setup"/>
+    <w:bookmarkStart w:id="363" w:name="sec-ai-mcp-server-setup"/>
     <w:p>
       <w:pPr>
         <w:pStyle w:val="Heading1"/>
@@ -53641,14 +53641,13 @@
       </w:r>
     </w:p>
     <w:bookmarkEnd w:id="360"/>
-    <w:bookmarkEnd w:id="361"/>
-    <w:bookmarkStart w:id="369" w:name="sec-ai-gemini-spend-management"/>
-    <w:p>
-      <w:pPr>
-        <w:pStyle w:val="Heading1"/>
-      </w:pPr>
-      <w:r>
-        <w:t xml:space="preserve">35. Managing Gemini API Spend and Cost Optimization</w:t>
+    <w:bookmarkStart w:id="362" w:name="Xd44df015462fcf288556a538677f0a762c9ef1d"/>
+    <w:p>
+      <w:pPr>
+        <w:pStyle w:val="Heading4"/>
+      </w:pPr>
+      <w:r>
+        <w:t xml:space="preserve">Copilot on GitHub uses a different config surface</w:t>
       </w:r>
     </w:p>
     <w:p>
@@ -53656,48 +53655,65 @@
         <w:pStyle w:val="FirstParagraph"/>
       </w:pPr>
       <w:r>
-        <w:t xml:space="preserve">This guide describes how to manage Google AI Studio and Google Cloud Gemini API spend caps,</w:t>
-      </w:r>
-      <w:r>
-        <w:t xml:space="preserve"> </w:t>
-      </w:r>
-      <w:r>
-        <w:t xml:space="preserve">unpause paused API services,</w:t>
-      </w:r>
-      <w:r>
-        <w:t xml:space="preserve"> </w:t>
-      </w:r>
-      <w:r>
-        <w:t xml:space="preserve">and optimize token consumption across local tools and GitHub Actions workflows.</w:t>
-      </w:r>
-    </w:p>
-    <w:bookmarkStart w:id="363" w:name="Xd8c10be17edf039db5b664720f228274181ba18"/>
-    <w:p>
-      <w:pPr>
-        <w:pStyle w:val="Heading4"/>
-      </w:pPr>
-      <w:r>
-        <w:t xml:space="preserve">Identifying Paused Projects (Project Numbers vs. Friendly Names)</w:t>
-      </w:r>
-    </w:p>
-    <w:p>
-      <w:pPr>
-        <w:pStyle w:val="FirstParagraph"/>
-      </w:pPr>
-      <w:r>
-        <w:t xml:space="preserve">When a project reaches its monthly budget limit,</w:t>
-      </w:r>
-      <w:r>
-        <w:t xml:space="preserve"> </w:t>
-      </w:r>
-      <w:r>
-        <w:t xml:space="preserve">Google sends an email notification stating that Gemini API service has been paused.</w:t>
-      </w:r>
-      <w:r>
-        <w:t xml:space="preserve"> </w:t>
-      </w:r>
-      <w:r>
-        <w:t xml:space="preserve">These email notifications identify the affected project using its internal</w:t>
+        <w:t xml:space="preserve">The notes above are for a local harness</w:t>
+      </w:r>
+      <w:r>
+        <w:t xml:space="preserve"> </w:t>
+      </w:r>
+      <w:r>
+        <w:t xml:space="preserve">(</w:t>
+      </w:r>
+      <w:r>
+        <w:rPr>
+          <w:rStyle w:val="VerbatimChar"/>
+        </w:rPr>
+        <w:t xml:space="preserve">claude mcp list</w:t>
+      </w:r>
+      <w:r>
+        <w:t xml:space="preserve">, a binary on</w:t>
+      </w:r>
+      <w:r>
+        <w:t xml:space="preserve"> </w:t>
+      </w:r>
+      <w:r>
+        <w:rPr>
+          <w:rStyle w:val="VerbatimChar"/>
+        </w:rPr>
+        <w:t xml:space="preserve">PATH</w:t>
+      </w:r>
+      <w:r>
+        <w:t xml:space="preserve">).</w:t>
+      </w:r>
+      <w:r>
+        <w:t xml:space="preserve"> </w:t>
+      </w:r>
+      <w:hyperlink r:id="rId9">
+        <w:r>
+          <w:rPr>
+            <w:rStyle w:val="Hyperlink"/>
+          </w:rPr>
+          <w:t xml:space="preserve">Copilot cloud agent</w:t>
+        </w:r>
+      </w:hyperlink>
+      <w:r>
+        <w:t xml:space="preserve"> </w:t>
+      </w:r>
+      <w:r>
+        <w:t xml:space="preserve">and Copilot code review on GitHub.com</w:t>
+      </w:r>
+      <w:r>
+        <w:t xml:space="preserve"> </w:t>
+      </w:r>
+      <w:r>
+        <w:t xml:space="preserve">do not read that file.</w:t>
+      </w:r>
+    </w:p>
+    <w:p>
+      <w:pPr>
+        <w:pStyle w:val="BodyText"/>
+      </w:pPr>
+      <w:r>
+        <w:t xml:space="preserve">Repository administrators configure those agents from</w:t>
       </w:r>
       <w:r>
         <w:t xml:space="preserve"> </w:t>
@@ -53707,6 +53723,288 @@
           <w:b/>
           <w:bCs/>
         </w:rPr>
+        <w:t xml:space="preserve">Settings &gt; Copilot &gt; MCP servers</w:t>
+      </w:r>
+      <w:r>
+        <w:t xml:space="preserve"> </w:t>
+      </w:r>
+      <w:r>
+        <w:t xml:space="preserve">using a JSON</w:t>
+      </w:r>
+      <w:r>
+        <w:t xml:space="preserve"> </w:t>
+      </w:r>
+      <w:r>
+        <w:rPr>
+          <w:rStyle w:val="VerbatimChar"/>
+        </w:rPr>
+        <w:t xml:space="preserve">mcpServers</w:t>
+      </w:r>
+      <w:r>
+        <w:t xml:space="preserve"> </w:t>
+      </w:r>
+      <w:r>
+        <w:t xml:space="preserve">object.</w:t>
+      </w:r>
+      <w:r>
+        <w:t xml:space="preserve"> </w:t>
+      </w:r>
+      <w:r>
+        <w:t xml:space="preserve">GitHub’s</w:t>
+      </w:r>
+      <w:r>
+        <w:t xml:space="preserve"> </w:t>
+      </w:r>
+      <w:hyperlink r:id="rId361">
+        <w:r>
+          <w:rPr>
+            <w:rStyle w:val="Hyperlink"/>
+          </w:rPr>
+          <w:t xml:space="preserve">Configure MCP servers</w:t>
+        </w:r>
+      </w:hyperlink>
+      <w:r>
+        <w:t xml:space="preserve"> </w:t>
+      </w:r>
+      <w:r>
+        <w:t xml:space="preserve">page is the source of truth for the schema.</w:t>
+      </w:r>
+      <w:r>
+        <w:t xml:space="preserve"> </w:t>
+      </w:r>
+      <w:r>
+        <w:t xml:space="preserve">As of that page:</w:t>
+      </w:r>
+    </w:p>
+    <w:p>
+      <w:pPr>
+        <w:pStyle w:val="Compact"/>
+        <w:numPr>
+          <w:ilvl w:val="0"/>
+          <w:numId w:val="1156"/>
+        </w:numPr>
+      </w:pPr>
+      <w:r>
+        <w:t xml:space="preserve">The GitHub MCP server and the Playwright MCP server are enabled by default.</w:t>
+      </w:r>
+    </w:p>
+    <w:p>
+      <w:pPr>
+        <w:pStyle w:val="Compact"/>
+        <w:numPr>
+          <w:ilvl w:val="0"/>
+          <w:numId w:val="1156"/>
+        </w:numPr>
+      </w:pPr>
+      <w:r>
+        <w:t xml:space="preserve">Cloud agent and code review share the repository config;</w:t>
+      </w:r>
+      <w:r>
+        <w:t xml:space="preserve"> </w:t>
+      </w:r>
+      <w:r>
+        <w:t xml:space="preserve">a separate toggle can disable MCP tools for code review only.</w:t>
+      </w:r>
+    </w:p>
+    <w:p>
+      <w:pPr>
+        <w:pStyle w:val="Compact"/>
+        <w:numPr>
+          <w:ilvl w:val="0"/>
+          <w:numId w:val="1156"/>
+        </w:numPr>
+      </w:pPr>
+      <w:r>
+        <w:t xml:space="preserve">Only MCP</w:t>
+      </w:r>
+      <w:r>
+        <w:t xml:space="preserve"> </w:t>
+      </w:r>
+      <w:r>
+        <w:rPr>
+          <w:i/>
+          <w:iCs/>
+        </w:rPr>
+        <w:t xml:space="preserve">tools</w:t>
+      </w:r>
+      <w:r>
+        <w:t xml:space="preserve"> </w:t>
+      </w:r>
+      <w:r>
+        <w:t xml:space="preserve">are supported, not resources or prompts.</w:t>
+      </w:r>
+    </w:p>
+    <w:p>
+      <w:pPr>
+        <w:pStyle w:val="Compact"/>
+        <w:numPr>
+          <w:ilvl w:val="0"/>
+          <w:numId w:val="1156"/>
+        </w:numPr>
+      </w:pPr>
+      <w:r>
+        <w:t xml:space="preserve">Remote servers that authenticate with OAuth are not supported.</w:t>
+      </w:r>
+    </w:p>
+    <w:p>
+      <w:pPr>
+        <w:pStyle w:val="Compact"/>
+        <w:numPr>
+          <w:ilvl w:val="0"/>
+          <w:numId w:val="1156"/>
+        </w:numPr>
+      </w:pPr>
+      <w:r>
+        <w:t xml:space="preserve">Secrets and variables must be named with a</w:t>
+      </w:r>
+      <w:r>
+        <w:t xml:space="preserve"> </w:t>
+      </w:r>
+      <w:r>
+        <w:rPr>
+          <w:rStyle w:val="VerbatimChar"/>
+        </w:rPr>
+        <w:t xml:space="preserve">COPILOT_MCP_</w:t>
+      </w:r>
+      <w:r>
+        <w:t xml:space="preserve"> </w:t>
+      </w:r>
+      <w:r>
+        <w:t xml:space="preserve">prefix</w:t>
+      </w:r>
+      <w:r>
+        <w:t xml:space="preserve"> </w:t>
+      </w:r>
+      <w:r>
+        <w:t xml:space="preserve">or they are invisible to the config.</w:t>
+      </w:r>
+    </w:p>
+    <w:p>
+      <w:pPr>
+        <w:pStyle w:val="Compact"/>
+        <w:numPr>
+          <w:ilvl w:val="0"/>
+          <w:numId w:val="1156"/>
+        </w:numPr>
+      </w:pPr>
+      <w:r>
+        <w:t xml:space="preserve">Once a tool is enabled, Copilot uses it without asking for approval,</w:t>
+      </w:r>
+      <w:r>
+        <w:t xml:space="preserve"> </w:t>
+      </w:r>
+      <w:r>
+        <w:t xml:space="preserve">so allowlist specific read-only tools rather than</w:t>
+      </w:r>
+      <w:r>
+        <w:t xml:space="preserve"> </w:t>
+      </w:r>
+      <w:r>
+        <w:rPr>
+          <w:rStyle w:val="VerbatimChar"/>
+        </w:rPr>
+        <w:t xml:space="preserve">*</w:t>
+      </w:r>
+      <w:r>
+        <w:t xml:space="preserve">.</w:t>
+      </w:r>
+    </w:p>
+    <w:p>
+      <w:pPr>
+        <w:pStyle w:val="FirstParagraph"/>
+      </w:pPr>
+      <w:r>
+        <w:t xml:space="preserve">Do not copy a local</w:t>
+      </w:r>
+      <w:r>
+        <w:t xml:space="preserve"> </w:t>
+      </w:r>
+      <w:r>
+        <w:rPr>
+          <w:rStyle w:val="VerbatimChar"/>
+        </w:rPr>
+        <w:t xml:space="preserve">claude mcp add</w:t>
+      </w:r>
+      <w:r>
+        <w:t xml:space="preserve"> </w:t>
+      </w:r>
+      <w:r>
+        <w:t xml:space="preserve">registration into that JSON</w:t>
+      </w:r>
+      <w:r>
+        <w:t xml:space="preserve"> </w:t>
+      </w:r>
+      <w:r>
+        <w:t xml:space="preserve">and expect it to work.</w:t>
+      </w:r>
+    </w:p>
+    <w:bookmarkEnd w:id="362"/>
+    <w:bookmarkEnd w:id="363"/>
+    <w:bookmarkStart w:id="371" w:name="sec-ai-gemini-spend-management"/>
+    <w:p>
+      <w:pPr>
+        <w:pStyle w:val="Heading1"/>
+      </w:pPr>
+      <w:r>
+        <w:t xml:space="preserve">35. Managing Gemini API Spend and Cost Optimization</w:t>
+      </w:r>
+    </w:p>
+    <w:p>
+      <w:pPr>
+        <w:pStyle w:val="FirstParagraph"/>
+      </w:pPr>
+      <w:r>
+        <w:t xml:space="preserve">This guide describes how to manage Google AI Studio and Google Cloud Gemini API spend caps,</w:t>
+      </w:r>
+      <w:r>
+        <w:t xml:space="preserve"> </w:t>
+      </w:r>
+      <w:r>
+        <w:t xml:space="preserve">unpause paused API services,</w:t>
+      </w:r>
+      <w:r>
+        <w:t xml:space="preserve"> </w:t>
+      </w:r>
+      <w:r>
+        <w:t xml:space="preserve">and optimize token consumption across local tools and GitHub Actions workflows.</w:t>
+      </w:r>
+    </w:p>
+    <w:bookmarkStart w:id="365" w:name="Xd8c10be17edf039db5b664720f228274181ba18"/>
+    <w:p>
+      <w:pPr>
+        <w:pStyle w:val="Heading4"/>
+      </w:pPr>
+      <w:r>
+        <w:t xml:space="preserve">Identifying Paused Projects (Project Numbers vs. Friendly Names)</w:t>
+      </w:r>
+    </w:p>
+    <w:p>
+      <w:pPr>
+        <w:pStyle w:val="FirstParagraph"/>
+      </w:pPr>
+      <w:r>
+        <w:t xml:space="preserve">When a project reaches its monthly budget limit,</w:t>
+      </w:r>
+      <w:r>
+        <w:t xml:space="preserve"> </w:t>
+      </w:r>
+      <w:r>
+        <w:t xml:space="preserve">Google sends an email notification stating that Gemini API service has been paused.</w:t>
+      </w:r>
+      <w:r>
+        <w:t xml:space="preserve"> </w:t>
+      </w:r>
+      <w:r>
+        <w:t xml:space="preserve">These email notifications identify the affected project using its internal</w:t>
+      </w:r>
+      <w:r>
+        <w:t xml:space="preserve"> </w:t>
+      </w:r>
+      <w:r>
+        <w:rPr>
+          <w:b/>
+          <w:bCs/>
+        </w:rPr>
         <w:t xml:space="preserve">numerical GCP Project Number</w:t>
       </w:r>
       <w:r>
@@ -53735,7 +54033,7 @@
       <w:r>
         <w:t xml:space="preserve"> </w:t>
       </w:r>
-      <w:hyperlink r:id="rId362">
+      <w:hyperlink r:id="rId364">
         <w:r>
           <w:rPr>
             <w:rStyle w:val="Hyperlink"/>
@@ -53821,7 +54119,7 @@
         <w:pStyle w:val="Compact"/>
         <w:numPr>
           <w:ilvl w:val="0"/>
-          <w:numId w:val="1156"/>
+          <w:numId w:val="1157"/>
         </w:numPr>
       </w:pPr>
       <w:r>
@@ -53830,7 +54128,7 @@
       <w:r>
         <w:t xml:space="preserve"> </w:t>
       </w:r>
-      <w:hyperlink r:id="rId362">
+      <w:hyperlink r:id="rId364">
         <w:r>
           <w:rPr>
             <w:rStyle w:val="Hyperlink"/>
@@ -53847,41 +54145,11 @@
         <w:pStyle w:val="Compact"/>
         <w:numPr>
           <w:ilvl w:val="0"/>
-          <w:numId w:val="1156"/>
+          <w:numId w:val="1157"/>
         </w:numPr>
       </w:pPr>
       <w:r>
         <w:t xml:space="preserve">Locate the project corresponding to your client ID or spend alert.</w:t>
-      </w:r>
-    </w:p>
-    <w:p>
-      <w:pPr>
-        <w:pStyle w:val="Compact"/>
-        <w:numPr>
-          <w:ilvl w:val="0"/>
-          <w:numId w:val="1156"/>
-        </w:numPr>
-      </w:pPr>
-      <w:r>
-        <w:t xml:space="preserve">Any project that has hit its monthly spend cap will have its API requests paused until the limit is updated.</w:t>
-      </w:r>
-    </w:p>
-    <w:bookmarkEnd w:id="363"/>
-    <w:bookmarkStart w:id="365" w:name="adjusting-and-unpausing-spend-caps"/>
-    <w:p>
-      <w:pPr>
-        <w:pStyle w:val="Heading4"/>
-      </w:pPr>
-      <w:r>
-        <w:t xml:space="preserve">Adjusting and Unpausing Spend Caps</w:t>
-      </w:r>
-    </w:p>
-    <w:p>
-      <w:pPr>
-        <w:pStyle w:val="FirstParagraph"/>
-      </w:pPr>
-      <w:r>
-        <w:t xml:space="preserve">To restore API access for a paused project:</w:t>
       </w:r>
     </w:p>
     <w:p>
@@ -53893,12 +54161,42 @@
         </w:numPr>
       </w:pPr>
       <w:r>
+        <w:t xml:space="preserve">Any project that has hit its monthly spend cap will have its API requests paused until the limit is updated.</w:t>
+      </w:r>
+    </w:p>
+    <w:bookmarkEnd w:id="365"/>
+    <w:bookmarkStart w:id="367" w:name="adjusting-and-unpausing-spend-caps"/>
+    <w:p>
+      <w:pPr>
+        <w:pStyle w:val="Heading4"/>
+      </w:pPr>
+      <w:r>
+        <w:t xml:space="preserve">Adjusting and Unpausing Spend Caps</w:t>
+      </w:r>
+    </w:p>
+    <w:p>
+      <w:pPr>
+        <w:pStyle w:val="FirstParagraph"/>
+      </w:pPr>
+      <w:r>
+        <w:t xml:space="preserve">To restore API access for a paused project:</w:t>
+      </w:r>
+    </w:p>
+    <w:p>
+      <w:pPr>
+        <w:pStyle w:val="Compact"/>
+        <w:numPr>
+          <w:ilvl w:val="0"/>
+          <w:numId w:val="1158"/>
+        </w:numPr>
+      </w:pPr>
+      <w:r>
         <w:t xml:space="preserve">Open</w:t>
       </w:r>
       <w:r>
         <w:t xml:space="preserve"> </w:t>
       </w:r>
-      <w:hyperlink r:id="rId364">
+      <w:hyperlink r:id="rId366">
         <w:r>
           <w:rPr>
             <w:rStyle w:val="Hyperlink"/>
@@ -53915,74 +54213,11 @@
         <w:pStyle w:val="Compact"/>
         <w:numPr>
           <w:ilvl w:val="0"/>
-          <w:numId w:val="1157"/>
+          <w:numId w:val="1158"/>
         </w:numPr>
       </w:pPr>
       <w:r>
         <w:t xml:space="preserve">Increase the monthly spend cap dollar amount or set it to unlimited.</w:t>
-      </w:r>
-    </w:p>
-    <w:p>
-      <w:pPr>
-        <w:pStyle w:val="Compact"/>
-        <w:numPr>
-          <w:ilvl w:val="0"/>
-          <w:numId w:val="1157"/>
-        </w:numPr>
-      </w:pPr>
-      <w:r>
-        <w:t xml:space="preserve">Save your changes. API requests will automatically resume within a few minutes.</w:t>
-      </w:r>
-    </w:p>
-    <w:p>
-      <w:pPr>
-        <w:pStyle w:val="FirstParagraph"/>
-      </w:pPr>
-      <w:r>
-        <w:t xml:space="preserve">If no manual action is taken,</w:t>
-      </w:r>
-      <w:r>
-        <w:t xml:space="preserve"> </w:t>
-      </w:r>
-      <w:r>
-        <w:t xml:space="preserve">accumulated spend resets to</w:t>
-      </w:r>
-      <w:r>
-        <w:t xml:space="preserve"> </w:t>
-      </w:r>
-      <w:r>
-        <w:rPr>
-          <w:b/>
-          <w:bCs/>
-        </w:rPr>
-        <w:t xml:space="preserve">$0 on the 1st of the next month</w:t>
-      </w:r>
-      <w:r>
-        <w:t xml:space="preserve">,</w:t>
-      </w:r>
-      <w:r>
-        <w:t xml:space="preserve"> </w:t>
-      </w:r>
-      <w:r>
-        <w:t xml:space="preserve">and API service automatically resumes up to the configured cap.</w:t>
-      </w:r>
-    </w:p>
-    <w:bookmarkEnd w:id="365"/>
-    <w:bookmarkStart w:id="367" w:name="setting-up-google-cloud-budget-alerts"/>
-    <w:p>
-      <w:pPr>
-        <w:pStyle w:val="Heading4"/>
-      </w:pPr>
-      <w:r>
-        <w:t xml:space="preserve">Setting Up Google Cloud Budget Alerts</w:t>
-      </w:r>
-    </w:p>
-    <w:p>
-      <w:pPr>
-        <w:pStyle w:val="FirstParagraph"/>
-      </w:pPr>
-      <w:r>
-        <w:t xml:space="preserve">To receive early warnings before reaching a spend cap:</w:t>
       </w:r>
     </w:p>
     <w:p>
@@ -53994,12 +54229,75 @@
         </w:numPr>
       </w:pPr>
       <w:r>
+        <w:t xml:space="preserve">Save your changes. API requests will automatically resume within a few minutes.</w:t>
+      </w:r>
+    </w:p>
+    <w:p>
+      <w:pPr>
+        <w:pStyle w:val="FirstParagraph"/>
+      </w:pPr>
+      <w:r>
+        <w:t xml:space="preserve">If no manual action is taken,</w:t>
+      </w:r>
+      <w:r>
+        <w:t xml:space="preserve"> </w:t>
+      </w:r>
+      <w:r>
+        <w:t xml:space="preserve">accumulated spend resets to</w:t>
+      </w:r>
+      <w:r>
+        <w:t xml:space="preserve"> </w:t>
+      </w:r>
+      <w:r>
+        <w:rPr>
+          <w:b/>
+          <w:bCs/>
+        </w:rPr>
+        <w:t xml:space="preserve">$0 on the 1st of the next month</w:t>
+      </w:r>
+      <w:r>
+        <w:t xml:space="preserve">,</w:t>
+      </w:r>
+      <w:r>
+        <w:t xml:space="preserve"> </w:t>
+      </w:r>
+      <w:r>
+        <w:t xml:space="preserve">and API service automatically resumes up to the configured cap.</w:t>
+      </w:r>
+    </w:p>
+    <w:bookmarkEnd w:id="367"/>
+    <w:bookmarkStart w:id="369" w:name="setting-up-google-cloud-budget-alerts"/>
+    <w:p>
+      <w:pPr>
+        <w:pStyle w:val="Heading4"/>
+      </w:pPr>
+      <w:r>
+        <w:t xml:space="preserve">Setting Up Google Cloud Budget Alerts</w:t>
+      </w:r>
+    </w:p>
+    <w:p>
+      <w:pPr>
+        <w:pStyle w:val="FirstParagraph"/>
+      </w:pPr>
+      <w:r>
+        <w:t xml:space="preserve">To receive early warnings before reaching a spend cap:</w:t>
+      </w:r>
+    </w:p>
+    <w:p>
+      <w:pPr>
+        <w:pStyle w:val="Compact"/>
+        <w:numPr>
+          <w:ilvl w:val="0"/>
+          <w:numId w:val="1159"/>
+        </w:numPr>
+      </w:pPr>
+      <w:r>
         <w:t xml:space="preserve">Open</w:t>
       </w:r>
       <w:r>
         <w:t xml:space="preserve"> </w:t>
       </w:r>
-      <w:hyperlink r:id="rId366">
+      <w:hyperlink r:id="rId368">
         <w:r>
           <w:rPr>
             <w:rStyle w:val="Hyperlink"/>
@@ -54016,7 +54314,7 @@
         <w:pStyle w:val="Compact"/>
         <w:numPr>
           <w:ilvl w:val="0"/>
-          <w:numId w:val="1158"/>
+          <w:numId w:val="1159"/>
         </w:numPr>
       </w:pPr>
       <w:r>
@@ -54034,139 +54332,6 @@
       </w:r>
       <w:r>
         <w:t xml:space="preserve">.</w:t>
-      </w:r>
-    </w:p>
-    <w:p>
-      <w:pPr>
-        <w:pStyle w:val="Compact"/>
-        <w:numPr>
-          <w:ilvl w:val="0"/>
-          <w:numId w:val="1158"/>
-        </w:numPr>
-      </w:pPr>
-      <w:r>
-        <w:t xml:space="preserve">Name the budget (e.g.,</w:t>
-      </w:r>
-      <w:r>
-        <w:t xml:space="preserve"> </w:t>
-      </w:r>
-      <w:r>
-        <w:rPr>
-          <w:rStyle w:val="VerbatimChar"/>
-        </w:rPr>
-        <w:t xml:space="preserve">Lab AI API Monthly Budget</w:t>
-      </w:r>
-      <w:r>
-        <w:t xml:space="preserve">) and select the relevant GCP projects.</w:t>
-      </w:r>
-    </w:p>
-    <w:p>
-      <w:pPr>
-        <w:pStyle w:val="Compact"/>
-        <w:numPr>
-          <w:ilvl w:val="0"/>
-          <w:numId w:val="1158"/>
-        </w:numPr>
-      </w:pPr>
-      <w:r>
-        <w:t xml:space="preserve">Set your target monthly budget amount.</w:t>
-      </w:r>
-    </w:p>
-    <w:p>
-      <w:pPr>
-        <w:pStyle w:val="Compact"/>
-        <w:numPr>
-          <w:ilvl w:val="0"/>
-          <w:numId w:val="1158"/>
-        </w:numPr>
-      </w:pPr>
-      <w:r>
-        <w:t xml:space="preserve">Configure trigger rules for email notifications at</w:t>
-      </w:r>
-      <w:r>
-        <w:t xml:space="preserve"> </w:t>
-      </w:r>
-      <w:r>
-        <w:rPr>
-          <w:b/>
-          <w:bCs/>
-        </w:rPr>
-        <w:t xml:space="preserve">50%</w:t>
-      </w:r>
-      <w:r>
-        <w:t xml:space="preserve">,</w:t>
-      </w:r>
-      <w:r>
-        <w:t xml:space="preserve"> </w:t>
-      </w:r>
-      <w:r>
-        <w:rPr>
-          <w:b/>
-          <w:bCs/>
-        </w:rPr>
-        <w:t xml:space="preserve">75%</w:t>
-      </w:r>
-      <w:r>
-        <w:t xml:space="preserve">, and</w:t>
-      </w:r>
-      <w:r>
-        <w:t xml:space="preserve"> </w:t>
-      </w:r>
-      <w:r>
-        <w:rPr>
-          <w:b/>
-          <w:bCs/>
-        </w:rPr>
-        <w:t xml:space="preserve">90%</w:t>
-      </w:r>
-      <w:r>
-        <w:t xml:space="preserve"> </w:t>
-      </w:r>
-      <w:r>
-        <w:t xml:space="preserve">of the budget.</w:t>
-      </w:r>
-    </w:p>
-    <w:p>
-      <w:pPr>
-        <w:pStyle w:val="Compact"/>
-        <w:numPr>
-          <w:ilvl w:val="0"/>
-          <w:numId w:val="1158"/>
-        </w:numPr>
-      </w:pPr>
-      <w:r>
-        <w:t xml:space="preserve">Click</w:t>
-      </w:r>
-      <w:r>
-        <w:t xml:space="preserve"> </w:t>
-      </w:r>
-      <w:r>
-        <w:rPr>
-          <w:b/>
-          <w:bCs/>
-        </w:rPr>
-        <w:t xml:space="preserve">Finish</w:t>
-      </w:r>
-      <w:r>
-        <w:t xml:space="preserve">. You will receive email alerts before any project hits its spend cap.</w:t>
-      </w:r>
-    </w:p>
-    <w:bookmarkEnd w:id="367"/>
-    <w:bookmarkStart w:id="368" w:name="cost-optimization-best-practices"/>
-    <w:p>
-      <w:pPr>
-        <w:pStyle w:val="Heading4"/>
-      </w:pPr>
-      <w:r>
-        <w:t xml:space="preserve">Cost Optimization Best Practices</w:t>
-      </w:r>
-    </w:p>
-    <w:p>
-      <w:pPr>
-        <w:pStyle w:val="FirstParagraph"/>
-      </w:pPr>
-      <w:r>
-        <w:t xml:space="preserve">To maximize the efficiency of your API spend across local CLI sessions, subagents, and automated workflows:</w:t>
       </w:r>
     </w:p>
     <w:p>
@@ -54178,20 +54343,7 @@
         </w:numPr>
       </w:pPr>
       <w:r>
-        <w:rPr>
-          <w:b/>
-          <w:bCs/>
-        </w:rPr>
-        <w:t xml:space="preserve">Right-Size Model Selection</w:t>
-      </w:r>
-      <w:r>
-        <w:t xml:space="preserve">:</w:t>
-      </w:r>
-      <w:r>
-        <w:t xml:space="preserve"> </w:t>
-      </w:r>
-      <w:r>
-        <w:t xml:space="preserve">For general Gemini API, Python SDK, or custom scripts, prefer Flash-tier models (such as</w:t>
+        <w:t xml:space="preserve">Name the budget (e.g.,</w:t>
       </w:r>
       <w:r>
         <w:t xml:space="preserve"> </w:t>
@@ -54200,109 +54352,10 @@
         <w:rPr>
           <w:rStyle w:val="VerbatimChar"/>
         </w:rPr>
-        <w:t xml:space="preserve">gemini-2.5-flash</w:t>
-      </w:r>
-      <w:r>
-        <w:t xml:space="preserve">) over Pro-tier models (</w:t>
-      </w:r>
-      <w:r>
-        <w:rPr>
-          <w:rStyle w:val="VerbatimChar"/>
-        </w:rPr>
-        <w:t xml:space="preserve">gemini-2.5-pro</w:t>
-      </w:r>
-      <w:r>
-        <w:t xml:space="preserve">).</w:t>
-      </w:r>
-      <w:r>
-        <w:t xml:space="preserve"> </w:t>
-      </w:r>
-      <w:r>
-        <w:t xml:space="preserve">Flash models provide a substantially lower token cost for routine search, log parsing, and background processing.</w:t>
-      </w:r>
-      <w:r>
-        <w:t xml:space="preserve"> </w:t>
-      </w:r>
-      <w:r>
-        <w:t xml:space="preserve">For Antigravity Agent workflows (</w:t>
-      </w:r>
-      <w:r>
-        <w:rPr>
-          <w:rStyle w:val="VerbatimChar"/>
-        </w:rPr>
-        <w:t xml:space="preserve">google-antigravity</w:t>
-      </w:r>
-      <w:r>
-        <w:t xml:space="preserve">), the agent defaults to</w:t>
-      </w:r>
-      <w:r>
-        <w:t xml:space="preserve"> </w:t>
-      </w:r>
-      <w:r>
-        <w:rPr>
-          <w:rStyle w:val="VerbatimChar"/>
-        </w:rPr>
-        <w:t xml:space="preserve">gemini-3.7-flash</w:t>
-      </w:r>
-      <w:r>
-        <w:t xml:space="preserve"> </w:t>
-      </w:r>
-      <w:r>
-        <w:t xml:space="preserve">(already a Flash-tier model).</w:t>
-      </w:r>
-      <w:r>
-        <w:t xml:space="preserve"> </w:t>
-      </w:r>
-      <w:r>
-        <w:t xml:space="preserve">Supported Antigravity Agent model options include</w:t>
-      </w:r>
-      <w:r>
-        <w:t xml:space="preserve"> </w:t>
-      </w:r>
-      <w:r>
-        <w:rPr>
-          <w:rStyle w:val="VerbatimChar"/>
-        </w:rPr>
-        <w:t xml:space="preserve">gemini-3.7-flash</w:t>
-      </w:r>
-      <w:r>
-        <w:t xml:space="preserve">,</w:t>
-      </w:r>
-      <w:r>
-        <w:t xml:space="preserve"> </w:t>
-      </w:r>
-      <w:r>
-        <w:rPr>
-          <w:rStyle w:val="VerbatimChar"/>
-        </w:rPr>
-        <w:t xml:space="preserve">gemini-3.6-flash</w:t>
-      </w:r>
-      <w:r>
-        <w:t xml:space="preserve">,</w:t>
-      </w:r>
-      <w:r>
-        <w:t xml:space="preserve"> </w:t>
-      </w:r>
-      <w:r>
-        <w:rPr>
-          <w:rStyle w:val="VerbatimChar"/>
-        </w:rPr>
-        <w:t xml:space="preserve">gemini-3.5-flash</w:t>
-      </w:r>
-      <w:r>
-        <w:t xml:space="preserve">, and</w:t>
-      </w:r>
-      <w:r>
-        <w:t xml:space="preserve"> </w:t>
-      </w:r>
-      <w:r>
-        <w:rPr>
-          <w:rStyle w:val="VerbatimChar"/>
-        </w:rPr>
-        <w:t xml:space="preserve">gemini-3.5-flash-lite</w:t>
-      </w:r>
-      <w:r>
-        <w:t xml:space="preserve">.</w:t>
+        <w:t xml:space="preserve">Lab AI API Monthly Budget</w:t>
+      </w:r>
+      <w:r>
+        <w:t xml:space="preserve">) and select the relevant GCP projects.</w:t>
       </w:r>
     </w:p>
     <w:p>
@@ -54314,26 +54367,7 @@
         </w:numPr>
       </w:pPr>
       <w:r>
-        <w:rPr>
-          <w:b/>
-          <w:bCs/>
-        </w:rPr>
-        <w:t xml:space="preserve">Use Context Caching</w:t>
-      </w:r>
-      <w:r>
-        <w:t xml:space="preserve">:</w:t>
-      </w:r>
-      <w:r>
-        <w:t xml:space="preserve"> </w:t>
-      </w:r>
-      <w:r>
-        <w:t xml:space="preserve">For workloads that repeatedly pass static context over 2,048 tokens (such as large reference docs, system prompts, or codebase indices),</w:t>
-      </w:r>
-      <w:r>
-        <w:t xml:space="preserve"> </w:t>
-      </w:r>
-      <w:r>
-        <w:t xml:space="preserve">use Gemini Context Caching. Cached input tokens receive a substantial discount compared to standard input tokens.</w:t>
+        <w:t xml:space="preserve">Set your target monthly budget amount.</w:t>
       </w:r>
     </w:p>
     <w:p>
@@ -54345,26 +54379,49 @@
         </w:numPr>
       </w:pPr>
       <w:r>
+        <w:t xml:space="preserve">Configure trigger rules for email notifications at</w:t>
+      </w:r>
+      <w:r>
+        <w:t xml:space="preserve"> </w:t>
+      </w:r>
+      <w:r>
         <w:rPr>
           <w:b/>
           <w:bCs/>
         </w:rPr>
-        <w:t xml:space="preserve">Use the Batch API for Non-Realtime Tasks</w:t>
-      </w:r>
-      <w:r>
-        <w:t xml:space="preserve">:</w:t>
-      </w:r>
-      <w:r>
-        <w:t xml:space="preserve"> </w:t>
-      </w:r>
-      <w:r>
-        <w:t xml:space="preserve">For offline batch processing, evaluation suites, or background doc updates,</w:t>
-      </w:r>
-      <w:r>
-        <w:t xml:space="preserve"> </w:t>
-      </w:r>
-      <w:r>
-        <w:t xml:space="preserve">submit requests via the Gemini Batch API to receive a 50% discount on input and output tokens.</w:t>
+        <w:t xml:space="preserve">50%</w:t>
+      </w:r>
+      <w:r>
+        <w:t xml:space="preserve">,</w:t>
+      </w:r>
+      <w:r>
+        <w:t xml:space="preserve"> </w:t>
+      </w:r>
+      <w:r>
+        <w:rPr>
+          <w:b/>
+          <w:bCs/>
+        </w:rPr>
+        <w:t xml:space="preserve">75%</w:t>
+      </w:r>
+      <w:r>
+        <w:t xml:space="preserve">, and</w:t>
+      </w:r>
+      <w:r>
+        <w:t xml:space="preserve"> </w:t>
+      </w:r>
+      <w:r>
+        <w:rPr>
+          <w:b/>
+          <w:bCs/>
+        </w:rPr>
+        <w:t xml:space="preserve">90%</w:t>
+      </w:r>
+      <w:r>
+        <w:t xml:space="preserve"> </w:t>
+      </w:r>
+      <w:r>
+        <w:t xml:space="preserve">of the budget.</w:t>
       </w:r>
     </w:p>
     <w:p>
@@ -54376,10 +54433,251 @@
         </w:numPr>
       </w:pPr>
       <w:r>
+        <w:t xml:space="preserve">Click</w:t>
+      </w:r>
+      <w:r>
+        <w:t xml:space="preserve"> </w:t>
+      </w:r>
+      <w:r>
         <w:rPr>
           <w:b/>
           <w:bCs/>
         </w:rPr>
+        <w:t xml:space="preserve">Finish</w:t>
+      </w:r>
+      <w:r>
+        <w:t xml:space="preserve">. You will receive email alerts before any project hits its spend cap.</w:t>
+      </w:r>
+    </w:p>
+    <w:bookmarkEnd w:id="369"/>
+    <w:bookmarkStart w:id="370" w:name="cost-optimization-best-practices"/>
+    <w:p>
+      <w:pPr>
+        <w:pStyle w:val="Heading4"/>
+      </w:pPr>
+      <w:r>
+        <w:t xml:space="preserve">Cost Optimization Best Practices</w:t>
+      </w:r>
+    </w:p>
+    <w:p>
+      <w:pPr>
+        <w:pStyle w:val="FirstParagraph"/>
+      </w:pPr>
+      <w:r>
+        <w:t xml:space="preserve">To maximize the efficiency of your API spend across local CLI sessions, subagents, and automated workflows:</w:t>
+      </w:r>
+    </w:p>
+    <w:p>
+      <w:pPr>
+        <w:pStyle w:val="Compact"/>
+        <w:numPr>
+          <w:ilvl w:val="0"/>
+          <w:numId w:val="1160"/>
+        </w:numPr>
+      </w:pPr>
+      <w:r>
+        <w:rPr>
+          <w:b/>
+          <w:bCs/>
+        </w:rPr>
+        <w:t xml:space="preserve">Right-Size Model Selection</w:t>
+      </w:r>
+      <w:r>
+        <w:t xml:space="preserve">:</w:t>
+      </w:r>
+      <w:r>
+        <w:t xml:space="preserve"> </w:t>
+      </w:r>
+      <w:r>
+        <w:t xml:space="preserve">For general Gemini API, Python SDK, or custom scripts, prefer Flash-tier models (such as</w:t>
+      </w:r>
+      <w:r>
+        <w:t xml:space="preserve"> </w:t>
+      </w:r>
+      <w:r>
+        <w:rPr>
+          <w:rStyle w:val="VerbatimChar"/>
+        </w:rPr>
+        <w:t xml:space="preserve">gemini-2.5-flash</w:t>
+      </w:r>
+      <w:r>
+        <w:t xml:space="preserve">) over Pro-tier models (</w:t>
+      </w:r>
+      <w:r>
+        <w:rPr>
+          <w:rStyle w:val="VerbatimChar"/>
+        </w:rPr>
+        <w:t xml:space="preserve">gemini-2.5-pro</w:t>
+      </w:r>
+      <w:r>
+        <w:t xml:space="preserve">).</w:t>
+      </w:r>
+      <w:r>
+        <w:t xml:space="preserve"> </w:t>
+      </w:r>
+      <w:r>
+        <w:t xml:space="preserve">Flash models provide a substantially lower token cost for routine search, log parsing, and background processing.</w:t>
+      </w:r>
+      <w:r>
+        <w:t xml:space="preserve"> </w:t>
+      </w:r>
+      <w:r>
+        <w:t xml:space="preserve">For Antigravity Agent workflows (</w:t>
+      </w:r>
+      <w:r>
+        <w:rPr>
+          <w:rStyle w:val="VerbatimChar"/>
+        </w:rPr>
+        <w:t xml:space="preserve">google-antigravity</w:t>
+      </w:r>
+      <w:r>
+        <w:t xml:space="preserve">), the agent defaults to</w:t>
+      </w:r>
+      <w:r>
+        <w:t xml:space="preserve"> </w:t>
+      </w:r>
+      <w:r>
+        <w:rPr>
+          <w:rStyle w:val="VerbatimChar"/>
+        </w:rPr>
+        <w:t xml:space="preserve">gemini-3.7-flash</w:t>
+      </w:r>
+      <w:r>
+        <w:t xml:space="preserve"> </w:t>
+      </w:r>
+      <w:r>
+        <w:t xml:space="preserve">(already a Flash-tier model).</w:t>
+      </w:r>
+      <w:r>
+        <w:t xml:space="preserve"> </w:t>
+      </w:r>
+      <w:r>
+        <w:t xml:space="preserve">Supported Antigravity Agent model options include</w:t>
+      </w:r>
+      <w:r>
+        <w:t xml:space="preserve"> </w:t>
+      </w:r>
+      <w:r>
+        <w:rPr>
+          <w:rStyle w:val="VerbatimChar"/>
+        </w:rPr>
+        <w:t xml:space="preserve">gemini-3.7-flash</w:t>
+      </w:r>
+      <w:r>
+        <w:t xml:space="preserve">,</w:t>
+      </w:r>
+      <w:r>
+        <w:t xml:space="preserve"> </w:t>
+      </w:r>
+      <w:r>
+        <w:rPr>
+          <w:rStyle w:val="VerbatimChar"/>
+        </w:rPr>
+        <w:t xml:space="preserve">gemini-3.6-flash</w:t>
+      </w:r>
+      <w:r>
+        <w:t xml:space="preserve">,</w:t>
+      </w:r>
+      <w:r>
+        <w:t xml:space="preserve"> </w:t>
+      </w:r>
+      <w:r>
+        <w:rPr>
+          <w:rStyle w:val="VerbatimChar"/>
+        </w:rPr>
+        <w:t xml:space="preserve">gemini-3.5-flash</w:t>
+      </w:r>
+      <w:r>
+        <w:t xml:space="preserve">, and</w:t>
+      </w:r>
+      <w:r>
+        <w:t xml:space="preserve"> </w:t>
+      </w:r>
+      <w:r>
+        <w:rPr>
+          <w:rStyle w:val="VerbatimChar"/>
+        </w:rPr>
+        <w:t xml:space="preserve">gemini-3.5-flash-lite</w:t>
+      </w:r>
+      <w:r>
+        <w:t xml:space="preserve">.</w:t>
+      </w:r>
+    </w:p>
+    <w:p>
+      <w:pPr>
+        <w:pStyle w:val="Compact"/>
+        <w:numPr>
+          <w:ilvl w:val="0"/>
+          <w:numId w:val="1160"/>
+        </w:numPr>
+      </w:pPr>
+      <w:r>
+        <w:rPr>
+          <w:b/>
+          <w:bCs/>
+        </w:rPr>
+        <w:t xml:space="preserve">Use Context Caching</w:t>
+      </w:r>
+      <w:r>
+        <w:t xml:space="preserve">:</w:t>
+      </w:r>
+      <w:r>
+        <w:t xml:space="preserve"> </w:t>
+      </w:r>
+      <w:r>
+        <w:t xml:space="preserve">For workloads that repeatedly pass static context over 2,048 tokens (such as large reference docs, system prompts, or codebase indices),</w:t>
+      </w:r>
+      <w:r>
+        <w:t xml:space="preserve"> </w:t>
+      </w:r>
+      <w:r>
+        <w:t xml:space="preserve">use Gemini Context Caching. Cached input tokens receive a substantial discount compared to standard input tokens.</w:t>
+      </w:r>
+    </w:p>
+    <w:p>
+      <w:pPr>
+        <w:pStyle w:val="Compact"/>
+        <w:numPr>
+          <w:ilvl w:val="0"/>
+          <w:numId w:val="1160"/>
+        </w:numPr>
+      </w:pPr>
+      <w:r>
+        <w:rPr>
+          <w:b/>
+          <w:bCs/>
+        </w:rPr>
+        <w:t xml:space="preserve">Use the Batch API for Non-Realtime Tasks</w:t>
+      </w:r>
+      <w:r>
+        <w:t xml:space="preserve">:</w:t>
+      </w:r>
+      <w:r>
+        <w:t xml:space="preserve"> </w:t>
+      </w:r>
+      <w:r>
+        <w:t xml:space="preserve">For offline batch processing, evaluation suites, or background doc updates,</w:t>
+      </w:r>
+      <w:r>
+        <w:t xml:space="preserve"> </w:t>
+      </w:r>
+      <w:r>
+        <w:t xml:space="preserve">submit requests via the Gemini Batch API to receive a 50% discount on input and output tokens.</w:t>
+      </w:r>
+    </w:p>
+    <w:p>
+      <w:pPr>
+        <w:pStyle w:val="Compact"/>
+        <w:numPr>
+          <w:ilvl w:val="0"/>
+          <w:numId w:val="1160"/>
+        </w:numPr>
+      </w:pPr>
+      <w:r>
+        <w:rPr>
+          <w:b/>
+          <w:bCs/>
+        </w:rPr>
         <w:t xml:space="preserve">GitHub UI Diff Collapsing</w:t>
       </w:r>
       <w:r>
@@ -54467,9 +54765,9 @@
         <w:t xml:space="preserve">to collapse them in GitHub’s web diff view and exclude them from repository language statistics.</w:t>
       </w:r>
     </w:p>
-    <w:bookmarkEnd w:id="368"/>
-    <w:bookmarkEnd w:id="369"/>
-    <w:bookmarkStart w:id="399" w:name="references"/>
+    <w:bookmarkEnd w:id="370"/>
+    <w:bookmarkEnd w:id="371"/>
+    <w:bookmarkStart w:id="401" w:name="references"/>
     <w:p>
       <w:pPr>
         <w:pStyle w:val="Heading1"/>
@@ -54478,8 +54776,8 @@
         <w:t xml:space="preserve">References</w:t>
       </w:r>
     </w:p>
-    <w:bookmarkStart w:id="398" w:name="refs"/>
-    <w:bookmarkStart w:id="371" w:name="ref-space_odyssey"/>
+    <w:bookmarkStart w:id="400" w:name="refs"/>
+    <w:bookmarkStart w:id="373" w:name="ref-space_odyssey"/>
     <w:p>
       <w:pPr>
         <w:pStyle w:val="Bibliography"/>
@@ -54497,7 +54795,7 @@
       <w:r>
         <w:t xml:space="preserve"> </w:t>
       </w:r>
-      <w:hyperlink r:id="rId370">
+      <w:hyperlink r:id="rId372">
         <w:r>
           <w:rPr>
             <w:rStyle w:val="Hyperlink"/>
@@ -54509,8 +54807,8 @@
         <w:t xml:space="preserve">.</w:t>
       </w:r>
     </w:p>
-    <w:bookmarkEnd w:id="371"/>
-    <w:bookmarkStart w:id="373" w:name="ref-i_robot"/>
+    <w:bookmarkEnd w:id="373"/>
+    <w:bookmarkStart w:id="375" w:name="ref-i_robot"/>
     <w:p>
       <w:pPr>
         <w:pStyle w:val="Bibliography"/>
@@ -54534,7 +54832,7 @@
       <w:r>
         <w:t xml:space="preserve"> </w:t>
       </w:r>
-      <w:hyperlink r:id="rId372">
+      <w:hyperlink r:id="rId374">
         <w:r>
           <w:rPr>
             <w:rStyle w:val="Hyperlink"/>
@@ -54546,8 +54844,8 @@
         <w:t xml:space="preserve">.</w:t>
       </w:r>
     </w:p>
-    <w:bookmarkEnd w:id="373"/>
-    <w:bookmarkStart w:id="375" w:name="ref-battlestar_galactica_2004"/>
+    <w:bookmarkEnd w:id="375"/>
+    <w:bookmarkStart w:id="377" w:name="ref-battlestar_galactica_2004"/>
     <w:p>
       <w:pPr>
         <w:pStyle w:val="Bibliography"/>
@@ -54565,7 +54863,7 @@
       <w:r>
         <w:t xml:space="preserve"> </w:t>
       </w:r>
-      <w:hyperlink r:id="rId374">
+      <w:hyperlink r:id="rId376">
         <w:r>
           <w:rPr>
             <w:rStyle w:val="Hyperlink"/>
@@ -54577,8 +54875,8 @@
         <w:t xml:space="preserve">.</w:t>
       </w:r>
     </w:p>
-    <w:bookmarkEnd w:id="375"/>
-    <w:bookmarkStart w:id="377" w:name="ref-slm_agentic_ai"/>
+    <w:bookmarkEnd w:id="377"/>
+    <w:bookmarkStart w:id="379" w:name="ref-slm_agentic_ai"/>
     <w:p>
       <w:pPr>
         <w:pStyle w:val="Bibliography"/>
@@ -54602,7 +54900,7 @@
       <w:r>
         <w:t xml:space="preserve"> </w:t>
       </w:r>
-      <w:hyperlink r:id="rId376">
+      <w:hyperlink r:id="rId378">
         <w:r>
           <w:rPr>
             <w:rStyle w:val="Hyperlink"/>
@@ -54614,8 +54912,8 @@
         <w:t xml:space="preserve">.</w:t>
       </w:r>
     </w:p>
-    <w:bookmarkEnd w:id="377"/>
-    <w:bookmarkStart w:id="379" w:name="ref-blade_runner"/>
+    <w:bookmarkEnd w:id="379"/>
+    <w:bookmarkStart w:id="381" w:name="ref-blade_runner"/>
     <w:p>
       <w:pPr>
         <w:pStyle w:val="Bibliography"/>
@@ -54633,7 +54931,7 @@
       <w:r>
         <w:t xml:space="preserve"> </w:t>
       </w:r>
-      <w:hyperlink r:id="rId378">
+      <w:hyperlink r:id="rId380">
         <w:r>
           <w:rPr>
             <w:rStyle w:val="Hyperlink"/>
@@ -54645,8 +54943,8 @@
         <w:t xml:space="preserve">.</w:t>
       </w:r>
     </w:p>
-    <w:bookmarkEnd w:id="379"/>
-    <w:bookmarkStart w:id="381" w:name="ref-enders_game"/>
+    <w:bookmarkEnd w:id="381"/>
+    <w:bookmarkStart w:id="383" w:name="ref-enders_game"/>
     <w:p>
       <w:pPr>
         <w:pStyle w:val="Bibliography"/>
@@ -54670,7 +54968,7 @@
       <w:r>
         <w:t xml:space="preserve"> </w:t>
       </w:r>
-      <w:hyperlink r:id="rId380">
+      <w:hyperlink r:id="rId382">
         <w:r>
           <w:rPr>
             <w:rStyle w:val="Hyperlink"/>
@@ -54682,8 +54980,8 @@
         <w:t xml:space="preserve">.</w:t>
       </w:r>
     </w:p>
-    <w:bookmarkEnd w:id="381"/>
-    <w:bookmarkStart w:id="383" w:name="ref-qlora"/>
+    <w:bookmarkEnd w:id="383"/>
+    <w:bookmarkStart w:id="385" w:name="ref-qlora"/>
     <w:p>
       <w:pPr>
         <w:pStyle w:val="Bibliography"/>
@@ -54707,7 +55005,7 @@
       <w:r>
         <w:t xml:space="preserve"> </w:t>
       </w:r>
-      <w:hyperlink r:id="rId382">
+      <w:hyperlink r:id="rId384">
         <w:r>
           <w:rPr>
             <w:rStyle w:val="Hyperlink"/>
@@ -54719,8 +55017,8 @@
         <w:t xml:space="preserve">.</w:t>
       </w:r>
     </w:p>
-    <w:bookmarkEnd w:id="383"/>
-    <w:bookmarkStart w:id="385" w:name="ref-humans_are_dead"/>
+    <w:bookmarkEnd w:id="385"/>
+    <w:bookmarkStart w:id="387" w:name="ref-humans_are_dead"/>
     <w:p>
       <w:pPr>
         <w:pStyle w:val="Bibliography"/>
@@ -54744,7 +55042,7 @@
       <w:r>
         <w:t xml:space="preserve"> </w:t>
       </w:r>
-      <w:hyperlink r:id="rId384">
+      <w:hyperlink r:id="rId386">
         <w:r>
           <w:rPr>
             <w:rStyle w:val="Hyperlink"/>
@@ -54756,8 +55054,8 @@
         <w:t xml:space="preserve">.</w:t>
       </w:r>
     </w:p>
-    <w:bookmarkEnd w:id="385"/>
-    <w:bookmarkStart w:id="387" w:name="ref-dune"/>
+    <w:bookmarkEnd w:id="387"/>
+    <w:bookmarkStart w:id="389" w:name="ref-dune"/>
     <w:p>
       <w:pPr>
         <w:pStyle w:val="Bibliography"/>
@@ -54781,7 +55079,7 @@
       <w:r>
         <w:t xml:space="preserve"> </w:t>
       </w:r>
-      <w:hyperlink r:id="rId386">
+      <w:hyperlink r:id="rId388">
         <w:r>
           <w:rPr>
             <w:rStyle w:val="Hyperlink"/>
@@ -54793,8 +55091,8 @@
         <w:t xml:space="preserve">.</w:t>
       </w:r>
     </w:p>
-    <w:bookmarkEnd w:id="387"/>
-    <w:bookmarkStart w:id="389" w:name="ref-lora"/>
+    <w:bookmarkEnd w:id="389"/>
+    <w:bookmarkStart w:id="391" w:name="ref-lora"/>
     <w:p>
       <w:pPr>
         <w:pStyle w:val="Bibliography"/>
@@ -54818,7 +55116,7 @@
       <w:r>
         <w:t xml:space="preserve"> </w:t>
       </w:r>
-      <w:hyperlink r:id="rId388">
+      <w:hyperlink r:id="rId390">
         <w:r>
           <w:rPr>
             <w:rStyle w:val="Hyperlink"/>
@@ -54830,8 +55128,8 @@
         <w:t xml:space="preserve">.</w:t>
       </w:r>
     </w:p>
-    <w:bookmarkEnd w:id="389"/>
-    <w:bookmarkStart w:id="391" w:name="ref-lecun_world_models"/>
+    <w:bookmarkEnd w:id="391"/>
+    <w:bookmarkStart w:id="393" w:name="ref-lecun_world_models"/>
     <w:p>
       <w:pPr>
         <w:pStyle w:val="Bibliography"/>
@@ -54855,7 +55153,7 @@
       <w:r>
         <w:t xml:space="preserve"> </w:t>
       </w:r>
-      <w:hyperlink r:id="rId390">
+      <w:hyperlink r:id="rId392">
         <w:r>
           <w:rPr>
             <w:rStyle w:val="Hyperlink"/>
@@ -54867,8 +55165,8 @@
         <w:t xml:space="preserve">.</w:t>
       </w:r>
     </w:p>
-    <w:bookmarkEnd w:id="391"/>
-    <w:bookmarkStart w:id="393" w:name="ref-terminator"/>
+    <w:bookmarkEnd w:id="393"/>
+    <w:bookmarkStart w:id="395" w:name="ref-terminator"/>
     <w:p>
       <w:pPr>
         <w:pStyle w:val="Bibliography"/>
@@ -54886,7 +55184,7 @@
       <w:r>
         <w:t xml:space="preserve"> </w:t>
       </w:r>
-      <w:hyperlink r:id="rId392">
+      <w:hyperlink r:id="rId394">
         <w:r>
           <w:rPr>
             <w:rStyle w:val="Hyperlink"/>
@@ -54898,8 +55196,8 @@
         <w:t xml:space="preserve">.</w:t>
       </w:r>
     </w:p>
-    <w:bookmarkEnd w:id="393"/>
-    <w:bookmarkStart w:id="395" w:name="ref-matrix"/>
+    <w:bookmarkEnd w:id="395"/>
+    <w:bookmarkStart w:id="397" w:name="ref-matrix"/>
     <w:p>
       <w:pPr>
         <w:pStyle w:val="Bibliography"/>
@@ -54917,7 +55215,7 @@
       <w:r>
         <w:t xml:space="preserve"> </w:t>
       </w:r>
-      <w:hyperlink r:id="rId394">
+      <w:hyperlink r:id="rId396">
         <w:r>
           <w:rPr>
             <w:rStyle w:val="Hyperlink"/>
@@ -54929,8 +55227,8 @@
         <w:t xml:space="preserve">.</w:t>
       </w:r>
     </w:p>
-    <w:bookmarkEnd w:id="395"/>
-    <w:bookmarkStart w:id="397" w:name="ref-wargames"/>
+    <w:bookmarkEnd w:id="397"/>
+    <w:bookmarkStart w:id="399" w:name="ref-wargames"/>
     <w:p>
       <w:pPr>
         <w:pStyle w:val="Bibliography"/>
@@ -54948,7 +55246,7 @@
       <w:r>
         <w:t xml:space="preserve"> </w:t>
       </w:r>
-      <w:hyperlink r:id="rId396">
+      <w:hyperlink r:id="rId398">
         <w:r>
           <w:rPr>
             <w:rStyle w:val="Hyperlink"/>
@@ -54960,9 +55258,9 @@
         <w:t xml:space="preserve">.</w:t>
       </w:r>
     </w:p>
-    <w:bookmarkEnd w:id="397"/>
-    <w:bookmarkEnd w:id="398"/>
     <w:bookmarkEnd w:id="399"/>
+    <w:bookmarkEnd w:id="400"/>
+    <w:bookmarkEnd w:id="401"/>
     <w:sectPr>
       <w:footnotePr>
         <w:numRestart w:val="eachSect"/>
@@ -56397,34 +56695,7 @@
     <w:abstractNumId w:val="991"/>
   </w:num>
   <w:num w:numId="1156">
-    <w:abstractNumId w:val="99411"/>
-    <w:lvlOverride w:ilvl="0">
-      <w:startOverride w:val="1"/>
-    </w:lvlOverride>
-    <w:lvlOverride w:ilvl="1">
-      <w:startOverride w:val="1"/>
-    </w:lvlOverride>
-    <w:lvlOverride w:ilvl="2">
-      <w:startOverride w:val="1"/>
-    </w:lvlOverride>
-    <w:lvlOverride w:ilvl="3">
-      <w:startOverride w:val="1"/>
-    </w:lvlOverride>
-    <w:lvlOverride w:ilvl="4">
-      <w:startOverride w:val="1"/>
-    </w:lvlOverride>
-    <w:lvlOverride w:ilvl="5">
-      <w:startOverride w:val="1"/>
-    </w:lvlOverride>
-    <w:lvlOverride w:ilvl="6">
-      <w:startOverride w:val="1"/>
-    </w:lvlOverride>
-    <w:lvlOverride w:ilvl="7">
-      <w:startOverride w:val="1"/>
-    </w:lvlOverride>
-    <w:lvlOverride w:ilvl="8">
-      <w:startOverride w:val="1"/>
-    </w:lvlOverride>
+    <w:abstractNumId w:val="991"/>
   </w:num>
   <w:num w:numId="1157">
     <w:abstractNumId w:val="99411"/>
@@ -56487,6 +56758,36 @@
     </w:lvlOverride>
   </w:num>
   <w:num w:numId="1159">
+    <w:abstractNumId w:val="99411"/>
+    <w:lvlOverride w:ilvl="0">
+      <w:startOverride w:val="1"/>
+    </w:lvlOverride>
+    <w:lvlOverride w:ilvl="1">
+      <w:startOverride w:val="1"/>
+    </w:lvlOverride>
+    <w:lvlOverride w:ilvl="2">
+      <w:startOverride w:val="1"/>
+    </w:lvlOverride>
+    <w:lvlOverride w:ilvl="3">
+      <w:startOverride w:val="1"/>
+    </w:lvlOverride>
+    <w:lvlOverride w:ilvl="4">
+      <w:startOverride w:val="1"/>
+    </w:lvlOverride>
+    <w:lvlOverride w:ilvl="5">
+      <w:startOverride w:val="1"/>
+    </w:lvlOverride>
+    <w:lvlOverride w:ilvl="6">
+      <w:startOverride w:val="1"/>
+    </w:lvlOverride>
+    <w:lvlOverride w:ilvl="7">
+      <w:startOverride w:val="1"/>
+    </w:lvlOverride>
+    <w:lvlOverride w:ilvl="8">
+      <w:startOverride w:val="1"/>
+    </w:lvlOverride>
+  </w:num>
+  <w:num w:numId="1160">
     <w:abstractNumId w:val="991"/>
   </w:num>
 </w:numbering>

</xml_diff>

<commit_message>
Deploying to gh-pages from @ Morrison-Lab/wai@c828dbd4ac77b215d34f0eb82a8a4e21b9815922 🚀
</commit_message>
<xml_diff>
--- a/chapters/coding-agents.docx
+++ b/chapters/coding-agents.docx
@@ -15,7 +15,7 @@
         <w:pStyle w:val="Date"/>
       </w:pPr>
       <w:r>
-        <w:t xml:space="preserve">Last modified: 2026-08-22 12:01:12 (PDT)</w:t>
+        <w:t xml:space="preserve">Last modified: 2026-08-22 18:12:39 (PDT)</w:t>
       </w:r>
     </w:p>
     <w:p>
@@ -33431,7 +33431,7 @@
     </w:p>
     <w:bookmarkEnd w:id="246"/>
     <w:bookmarkEnd w:id="247"/>
-    <w:bookmarkStart w:id="257" w:name="sec-ai-byok-vscode"/>
+    <w:bookmarkStart w:id="262" w:name="sec-ai-byok-vscode"/>
     <w:p>
       <w:pPr>
         <w:pStyle w:val="Heading1"/>
@@ -33509,7 +33509,19 @@
         <w:pStyle w:val="BodyText"/>
       </w:pPr>
       <w:r>
-        <w:t xml:space="preserve">This section describes the wiring and four errors you are likely to hit.</w:t>
+        <w:t xml:space="preserve">This section describes the wiring,</w:t>
+      </w:r>
+      <w:r>
+        <w:t xml:space="preserve"> </w:t>
+      </w:r>
+      <w:r>
+        <w:t xml:space="preserve">four errors that report themselves in the chat panel,</w:t>
+      </w:r>
+      <w:r>
+        <w:t xml:space="preserve"> </w:t>
+      </w:r>
+      <w:r>
+        <w:t xml:space="preserve">and three more that do not.</w:t>
       </w:r>
     </w:p>
     <w:bookmarkStart w:id="250" w:name="wiring-the-extension-to-databricks"/>
@@ -36546,14 +36558,135 @@
         <w:t xml:space="preserve">An accurate local entry cannot make a retired endpoint work.</w:t>
       </w:r>
     </w:p>
+    <w:p>
+      <w:pPr>
+        <w:pStyle w:val="BodyText"/>
+      </w:pPr>
+      <w:r>
+        <w:t xml:space="preserve">An individual endpoint page may also carry a banner reading</w:t>
+      </w:r>
+      <w:r>
+        <w:t xml:space="preserve"> </w:t>
+      </w:r>
+      <w:r>
+        <w:t xml:space="preserve">“This serving endpoint is deprecated.</w:t>
+      </w:r>
+      <w:r>
+        <w:t xml:space="preserve"> </w:t>
+      </w:r>
+      <w:r>
+        <w:t xml:space="preserve">Foundation models are now managed in Unity AI Gateway.”</w:t>
+      </w:r>
+      <w:r>
+        <w:t xml:space="preserve"> </w:t>
+      </w:r>
+      <w:r>
+        <w:t xml:space="preserve">That is a statement about where Databricks intends to manage these models,</w:t>
+      </w:r>
+      <w:r>
+        <w:t xml:space="preserve"> </w:t>
+      </w:r>
+      <w:r>
+        <w:t xml:space="preserve">not an outage:</w:t>
+      </w:r>
+      <w:r>
+        <w:t xml:space="preserve"> </w:t>
+      </w:r>
+      <w:r>
+        <w:t xml:space="preserve">the</w:t>
+      </w:r>
+      <w:r>
+        <w:t xml:space="preserve"> </w:t>
+      </w:r>
+      <w:r>
+        <w:rPr>
+          <w:rStyle w:val="VerbatimChar"/>
+        </w:rPr>
+        <w:t xml:space="preserve">/serving-endpoints</w:t>
+      </w:r>
+      <w:r>
+        <w:t xml:space="preserve"> </w:t>
+      </w:r>
+      <w:r>
+        <w:t xml:space="preserve">path keeps serving while the banner is up.</w:t>
+      </w:r>
+      <w:r>
+        <w:t xml:space="preserve"> </w:t>
+      </w:r>
+      <w:r>
+        <w:t xml:space="preserve">Unity AI Gateway’s</w:t>
+      </w:r>
+      <w:r>
+        <w:t xml:space="preserve"> </w:t>
+      </w:r>
+      <w:r>
+        <w:rPr>
+          <w:b/>
+          <w:bCs/>
+        </w:rPr>
+        <w:t xml:space="preserve">LLMs</w:t>
+      </w:r>
+      <w:r>
+        <w:t xml:space="preserve"> </w:t>
+      </w:r>
+      <w:r>
+        <w:t xml:space="preserve">and</w:t>
+      </w:r>
+      <w:r>
+        <w:t xml:space="preserve"> </w:t>
+      </w:r>
+      <w:r>
+        <w:rPr>
+          <w:b/>
+          <w:bCs/>
+        </w:rPr>
+        <w:t xml:space="preserve">Providers</w:t>
+      </w:r>
+      <w:r>
+        <w:t xml:space="preserve"> </w:t>
+      </w:r>
+      <w:r>
+        <w:t xml:space="preserve">tabs are in beta,</w:t>
+      </w:r>
+      <w:r>
+        <w:t xml:space="preserve"> </w:t>
+      </w:r>
+      <w:r>
+        <w:t xml:space="preserve">and they are inactive in a workspace that has not been enabled for them.</w:t>
+      </w:r>
+      <w:r>
+        <w:t xml:space="preserve"> </w:t>
+      </w:r>
+      <w:r>
+        <w:t xml:space="preserve">In that state there is no gateway base URL to move to,</w:t>
+      </w:r>
+      <w:r>
+        <w:t xml:space="preserve"> </w:t>
+      </w:r>
+      <w:r>
+        <w:t xml:space="preserve">and the configuration in this section is still the working one.</w:t>
+      </w:r>
+      <w:r>
+        <w:t xml:space="preserve"> </w:t>
+      </w:r>
+      <w:r>
+        <w:t xml:space="preserve">Re-check when those tabs become active.</w:t>
+      </w:r>
+      <w:r>
+        <w:t xml:space="preserve"> </w:t>
+      </w:r>
+      <w:r>
+        <w:t xml:space="preserve">Observed 2026-08-20.</w:t>
+      </w:r>
+    </w:p>
     <w:bookmarkEnd w:id="253"/>
-    <w:bookmarkStart w:id="256" w:name="four-errors-and-why-they-stack"/>
+    <w:bookmarkStart w:id="258" w:name="Xeefb66738a7cdd8d123f77fc3c435ee9098e612"/>
     <w:p>
       <w:pPr>
         <w:pStyle w:val="Heading4"/>
       </w:pPr>
       <w:r>
-        <w:t xml:space="preserve">Four errors, and why they stack</w:t>
+        <w:t xml:space="preserve">Four errors that report themselves, and why they stack</w:t>
       </w:r>
     </w:p>
     <w:p>
@@ -37569,9 +37702,1312 @@
         </w:tc>
       </w:tr>
     </w:tbl>
-    <w:bookmarkEnd w:id="256"/>
-    <w:bookmarkEnd w:id="257"/>
-    <w:bookmarkStart w:id="271" w:name="configuring-the-agent-environment"/>
+    <w:p>
+      <w:pPr>
+        <w:pStyle w:val="BodyText"/>
+      </w:pPr>
+      <w:r>
+        <w:t xml:space="preserve"> </w:t>
+      </w:r>
+    </w:p>
+    <w:tbl>
+      <w:tblPr>
+        <w:tblStyle w:val="Table"/>
+        <w:tblLook w:firstRow="0" w:lastRow="0" w:firstColumn="0" w:lastColumn="0" w:noHBand="0" w:noVBand="0" w:val="0000"/>
+        <w:tblBorders>
+          <w:top w:val="single" w:sz="4" w:space="0" w:color="CC1914"/>
+          <w:left w:val="single" w:sz="24" w:space="0" w:color="CC1914"/>
+          <w:bottom w:val="single" w:sz="4" w:space="0" w:color="CC1914"/>
+          <w:right w:val="single" w:sz="4" w:space="0" w:color="CC1914"/>
+        </w:tblBorders>
+        <w:tblCellMar>
+          <w:left w:w="144" w:type="dxa"/>
+          <w:right w:w="144" w:type="dxa"/>
+        </w:tblCellMar>
+        <w:tblLook w:firstRow="0" w:lastRow="0" w:firstColumn="0" w:lastColumn="0" w:noHBand="0" w:noVBand="0" w:val="0000"/>
+      </w:tblPr>
+      <w:tr>
+        <w:trPr>
+          <w:cantSplit/>
+        </w:trPr>
+        <w:tc>
+          <w:tcPr>
+            <w:shd w:color="auto" w:fill="f7dddc" w:val="clear"/>
+            <w:tcMar>
+              <w:top w:w="92" w:type="dxa"/>
+              <w:bottom w:w="92" w:type="dxa"/>
+            </w:tcMar>
+          </w:tcPr>
+          <w:p>
+            <w:pPr>
+              <w:pStyle w:val="BodyText"/>
+            </w:pPr>
+            <w:pPr>
+              <w:spacing w:before="0" w:after="0"/>
+              <w:textAlignment w:val="center"/>
+            </w:pPr>
+            <w:r>
+              <w:drawing>
+                <wp:inline>
+                  <wp:extent cx="152400" cy="152400"/>
+                  <wp:effectExtent b="0" l="0" r="0" t="0"/>
+                  <wp:docPr descr="" title="" id="256" name="Picture"/>
+                  <a:graphic>
+                    <a:graphicData uri="http://schemas.openxmlformats.org/drawingml/2006/picture">
+                      <pic:pic>
+                        <pic:nvPicPr>
+                          <pic:cNvPr descr="/opt/quarto/share/formats/docx/important.png" id="257" name="Picture"/>
+                          <pic:cNvPicPr>
+                            <a:picLocks noChangeArrowheads="1" noChangeAspect="1"/>
+                          </pic:cNvPicPr>
+                        </pic:nvPicPr>
+                        <pic:blipFill>
+                          <a:blip r:embed="rId154"/>
+                          <a:stretch>
+                            <a:fillRect/>
+                          </a:stretch>
+                        </pic:blipFill>
+                        <pic:spPr bwMode="auto">
+                          <a:xfrm>
+                            <a:off x="0" y="0"/>
+                            <a:ext cx="152400" cy="152400"/>
+                          </a:xfrm>
+                          <a:prstGeom prst="rect">
+                            <a:avLst/>
+                          </a:prstGeom>
+                          <a:noFill/>
+                          <a:ln w="9525">
+                            <a:noFill/>
+                            <a:headEnd/>
+                            <a:tailEnd/>
+                          </a:ln>
+                        </pic:spPr>
+                      </pic:pic>
+                    </a:graphicData>
+                  </a:graphic>
+                </wp:inline>
+              </w:drawing>
+            </w:r>
+            <w:r>
+              <w:t xml:space="preserve"> </w:t>
+            </w:r>
+            <w:r>
+              <w:t xml:space="preserve"> </w:t>
+            </w:r>
+            <w:r>
+              <w:t xml:space="preserve">Check the workspace host before minting another token</w:t>
+            </w:r>
+          </w:p>
+        </w:tc>
+      </w:tr>
+      <w:tr>
+        <w:trPr>
+          <w:cantSplit/>
+        </w:trPr>
+        <w:tc>
+          <w:tcPr>
+            <w:tcMar>
+              <w:top w:w="108" w:type="dxa"/>
+              <w:bottom w:w="108" w:type="dxa"/>
+            </w:tcMar>
+          </w:tcPr>
+          <w:p>
+            <w:pPr>
+              <w:pStyle w:val="BodyText"/>
+            </w:pPr>
+            <w:pPr>
+              <w:spacing w:before="16"/>
+            </w:pPr>
+            <w:r>
+              <w:t xml:space="preserve">Both the 404 and the 403 above assume the request reached the workspace you</w:t>
+            </w:r>
+            <w:r>
+              <w:t xml:space="preserve"> </w:t>
+            </w:r>
+            <w:r>
+              <w:t xml:space="preserve">think it did.</w:t>
+            </w:r>
+            <w:r>
+              <w:t xml:space="preserve"> </w:t>
+            </w:r>
+            <w:r>
+              <w:t xml:space="preserve">A</w:t>
+            </w:r>
+            <w:r>
+              <w:t xml:space="preserve"> </w:t>
+            </w:r>
+            <w:r>
+              <w:rPr>
+                <w:rStyle w:val="VerbatimChar"/>
+              </w:rPr>
+              <w:t xml:space="preserve">baseUrl</w:t>
+            </w:r>
+            <w:r>
+              <w:t xml:space="preserve"> </w:t>
+            </w:r>
+            <w:r>
+              <w:t xml:space="preserve">whose</w:t>
+            </w:r>
+            <w:r>
+              <w:t xml:space="preserve"> </w:t>
+            </w:r>
+            <w:r>
+              <w:rPr>
+                <w:rStyle w:val="VerbatimChar"/>
+              </w:rPr>
+              <w:t xml:space="preserve">dbc-</w:t>
+            </w:r>
+            <w:r>
+              <w:t xml:space="preserve"> </w:t>
+            </w:r>
+            <w:r>
+              <w:t xml:space="preserve">host belongs to a</w:t>
+            </w:r>
+            <w:r>
+              <w:t xml:space="preserve"> </w:t>
+            </w:r>
+            <w:r>
+              <w:rPr>
+                <w:i/>
+                <w:iCs/>
+              </w:rPr>
+              <w:t xml:space="preserve">different</w:t>
+            </w:r>
+            <w:r>
+              <w:t xml:space="preserve"> </w:t>
+            </w:r>
+            <w:r>
+              <w:t xml:space="preserve">workspace produces those</w:t>
+            </w:r>
+            <w:r>
+              <w:t xml:space="preserve"> </w:t>
+            </w:r>
+            <w:r>
+              <w:t xml:space="preserve">same two errors and survives every remedy listed for them.</w:t>
+            </w:r>
+            <w:r>
+              <w:t xml:space="preserve"> </w:t>
+            </w:r>
+            <w:r>
+              <w:t xml:space="preserve">The endpoint name is real and the token is valid;</w:t>
+            </w:r>
+            <w:r>
+              <w:t xml:space="preserve"> </w:t>
+            </w:r>
+            <w:r>
+              <w:t xml:space="preserve">neither one is in the workspace being asked.</w:t>
+            </w:r>
+            <w:r>
+              <w:t xml:space="preserve"> </w:t>
+            </w:r>
+            <w:r>
+              <w:t xml:space="preserve">Issuing a fresh token then fails in exactly the same way, indefinitely.</w:t>
+            </w:r>
+          </w:p>
+          <w:p>
+            <w:pPr>
+              <w:pStyle w:val="BodyText"/>
+            </w:pPr>
+            <w:r>
+              <w:t xml:space="preserve">Compare the host in</w:t>
+            </w:r>
+            <w:r>
+              <w:t xml:space="preserve"> </w:t>
+            </w:r>
+            <w:r>
+              <w:rPr>
+                <w:rStyle w:val="VerbatimChar"/>
+              </w:rPr>
+              <w:t xml:space="preserve">oaicopilot.baseUrl</w:t>
+            </w:r>
+            <w:r>
+              <w:t xml:space="preserve"> </w:t>
+            </w:r>
+            <w:r>
+              <w:t xml:space="preserve">against the invocations URL shown at</w:t>
+            </w:r>
+            <w:r>
+              <w:t xml:space="preserve"> </w:t>
+            </w:r>
+            <w:r>
+              <w:t xml:space="preserve">the top of the endpoint’s page in the Databricks console</w:t>
+            </w:r>
+            <w:r>
+              <w:t xml:space="preserve"> </w:t>
+            </w:r>
+            <w:r>
+              <w:t xml:space="preserve">(</w:t>
+            </w:r>
+            <w:r>
+              <w:rPr>
+                <w:b/>
+                <w:bCs/>
+              </w:rPr>
+              <w:t xml:space="preserve">Serving</w:t>
+            </w:r>
+            <w:r>
+              <w:t xml:space="preserve">, then the endpoint).</w:t>
+            </w:r>
+            <w:r>
+              <w:t xml:space="preserve"> </w:t>
+            </w:r>
+            <w:r>
+              <w:t xml:space="preserve">Check every per-model</w:t>
+            </w:r>
+            <w:r>
+              <w:t xml:space="preserve"> </w:t>
+            </w:r>
+            <w:r>
+              <w:rPr>
+                <w:rStyle w:val="VerbatimChar"/>
+              </w:rPr>
+              <w:t xml:space="preserve">baseUrl</w:t>
+            </w:r>
+            <w:r>
+              <w:t xml:space="preserve"> </w:t>
+            </w:r>
+            <w:r>
+              <w:t xml:space="preserve">as well:</w:t>
+            </w:r>
+            <w:r>
+              <w:t xml:space="preserve"> </w:t>
+            </w:r>
+            <w:r>
+              <w:t xml:space="preserve">each model entry may carry its own copy of the host,</w:t>
+            </w:r>
+            <w:r>
+              <w:t xml:space="preserve"> </w:t>
+            </w:r>
+            <w:r>
+              <w:t xml:space="preserve">so a single corrected setting can leave dozens of stale ones behind it.</w:t>
+            </w:r>
+          </w:p>
+          <w:p>
+            <w:pPr>
+              <w:pStyle w:val="BodyText"/>
+            </w:pPr>
+            <w:pPr>
+              <w:spacing w:after="16"/>
+            </w:pPr>
+            <w:r>
+              <w:t xml:space="preserve">Observed 2026-08-20, where a stale host appeared 42 times in one</w:t>
+            </w:r>
+            <w:r>
+              <w:t xml:space="preserve"> </w:t>
+            </w:r>
+            <w:r>
+              <w:rPr>
+                <w:rStyle w:val="VerbatimChar"/>
+              </w:rPr>
+              <w:t xml:space="preserve">settings.json</w:t>
+            </w:r>
+            <w:r>
+              <w:t xml:space="preserve">: once at the top level and once in each of 41 model entries.</w:t>
+            </w:r>
+            <w:r>
+              <w:t xml:space="preserve"> </w:t>
+            </w:r>
+            <w:r>
+              <w:t xml:space="preserve">A second VS Code installation on the same machine carried the same stale host</w:t>
+            </w:r>
+            <w:r>
+              <w:t xml:space="preserve"> </w:t>
+            </w:r>
+            <w:r>
+              <w:t xml:space="preserve">in its own copy of the setting.</w:t>
+            </w:r>
+          </w:p>
+          <w:p/>
+        </w:tc>
+      </w:tr>
+    </w:tbl>
+    <w:bookmarkEnd w:id="258"/>
+    <w:bookmarkStart w:id="261" w:name="X2af9a430a52e3ae5bb0cdcfef1e620fec8864fe"/>
+    <w:p>
+      <w:pPr>
+        <w:pStyle w:val="Heading4"/>
+      </w:pPr>
+      <w:r>
+        <w:t xml:space="preserve">Three failures that name no error in the chat panel</w:t>
+      </w:r>
+    </w:p>
+    <w:p>
+      <w:pPr>
+        <w:pStyle w:val="FirstParagraph"/>
+      </w:pPr>
+      <w:r>
+        <w:t xml:space="preserve">The four errors above print their own text.</w:t>
+      </w:r>
+      <w:r>
+        <w:t xml:space="preserve"> </w:t>
+      </w:r>
+      <w:r>
+        <w:t xml:space="preserve">These three do not name an error.</w:t>
+      </w:r>
+      <w:r>
+        <w:t xml:space="preserve"> </w:t>
+      </w:r>
+      <w:r>
+        <w:t xml:space="preserve">Failures 5 and 6 leave an ordinary-looking reply in the chat panel,</w:t>
+      </w:r>
+      <w:r>
+        <w:t xml:space="preserve"> </w:t>
+      </w:r>
+      <w:r>
+        <w:t xml:space="preserve">and the only record is in VS Code’s</w:t>
+      </w:r>
+      <w:r>
+        <w:t xml:space="preserve"> </w:t>
+      </w:r>
+      <w:r>
+        <w:rPr>
+          <w:b/>
+          <w:bCs/>
+        </w:rPr>
+        <w:t xml:space="preserve">GitHub Copilot Chat</w:t>
+      </w:r>
+      <w:r>
+        <w:t xml:space="preserve"> </w:t>
+      </w:r>
+      <w:r>
+        <w:t xml:space="preserve">output channel</w:t>
+      </w:r>
+      <w:r>
+        <w:t xml:space="preserve"> </w:t>
+      </w:r>
+      <w:r>
+        <w:t xml:space="preserve">(</w:t>
+      </w:r>
+      <w:r>
+        <w:rPr>
+          <w:b/>
+          <w:bCs/>
+        </w:rPr>
+        <w:t xml:space="preserve">View</w:t>
+      </w:r>
+      <w:r>
+        <w:t xml:space="preserve">, then</w:t>
+      </w:r>
+      <w:r>
+        <w:t xml:space="preserve"> </w:t>
+      </w:r>
+      <w:r>
+        <w:rPr>
+          <w:b/>
+          <w:bCs/>
+        </w:rPr>
+        <w:t xml:space="preserve">Output</w:t>
+      </w:r>
+      <w:r>
+        <w:t xml:space="preserve">, then pick that channel).</w:t>
+      </w:r>
+      <w:r>
+        <w:t xml:space="preserve"> </w:t>
+      </w:r>
+      <w:r>
+        <w:t xml:space="preserve">Failure 7 is visible in the panel as a</w:t>
+      </w:r>
+      <w:r>
+        <w:t xml:space="preserve"> </w:t>
+      </w:r>
+      <w:r>
+        <w:rPr>
+          <w:rStyle w:val="VerbatimChar"/>
+        </w:rPr>
+        <w:t xml:space="preserve">[object Object]</w:t>
+      </w:r>
+      <w:r>
+        <w:t xml:space="preserve"> </w:t>
+      </w:r>
+      <w:r>
+        <w:t xml:space="preserve">prefix on the reply;</w:t>
+      </w:r>
+      <w:r>
+        <w:t xml:space="preserve"> </w:t>
+      </w:r>
+      <w:r>
+        <w:t xml:space="preserve">it is still a display bug rather than a named error.</w:t>
+      </w:r>
+      <w:r>
+        <w:t xml:space="preserve"> </w:t>
+      </w:r>
+      <w:r>
+        <w:t xml:space="preserve">Open the output channel first whenever a BYOK reply is wrong in a way that names no error.</w:t>
+      </w:r>
+    </w:p>
+    <w:p>
+      <w:pPr>
+        <w:pStyle w:val="BodyText"/>
+      </w:pPr>
+      <w:r>
+        <w:t xml:space="preserve">A reply that begins</w:t>
+      </w:r>
+      <w:r>
+        <w:t xml:space="preserve"> </w:t>
+      </w:r>
+      <w:r>
+        <w:rPr>
+          <w:rStyle w:val="VerbatimChar"/>
+        </w:rPr>
+        <w:t xml:space="preserve">[object Object]</w:t>
+      </w:r>
+      <w:r>
+        <w:t xml:space="preserve"> </w:t>
+      </w:r>
+      <w:r>
+        <w:t xml:space="preserve">and then answers as though you had asked nothing</w:t>
+      </w:r>
+      <w:r>
+        <w:t xml:space="preserve"> </w:t>
+      </w:r>
+      <w:r>
+        <w:t xml:space="preserve">is the symptom that produced all three of these at once.</w:t>
+      </w:r>
+      <w:r>
+        <w:t xml:space="preserve"> </w:t>
+      </w:r>
+      <w:r>
+        <w:t xml:space="preserve">Observed 2026-08-20 with VS Code 1.135.0-insider,</w:t>
+      </w:r>
+      <w:r>
+        <w:t xml:space="preserve"> </w:t>
+      </w:r>
+      <w:r>
+        <w:t xml:space="preserve">Copilot Chat 0.63.2026082004,</w:t>
+      </w:r>
+      <w:r>
+        <w:t xml:space="preserve"> </w:t>
+      </w:r>
+      <w:r>
+        <w:rPr>
+          <w:rStyle w:val="VerbatimChar"/>
+        </w:rPr>
+        <w:t xml:space="preserve">oai-compatible-copilot</w:t>
+      </w:r>
+      <w:r>
+        <w:t xml:space="preserve"> </w:t>
+      </w:r>
+      <w:r>
+        <w:t xml:space="preserve">0.4.2,</w:t>
+      </w:r>
+      <w:r>
+        <w:t xml:space="preserve"> </w:t>
+      </w:r>
+      <w:r>
+        <w:t xml:space="preserve">and</w:t>
+      </w:r>
+      <w:r>
+        <w:t xml:space="preserve"> </w:t>
+      </w:r>
+      <w:r>
+        <w:rPr>
+          <w:rStyle w:val="VerbatimChar"/>
+        </w:rPr>
+        <w:t xml:space="preserve">databricks-claude-sonnet-5</w:t>
+      </w:r>
+      <w:r>
+        <w:t xml:space="preserve">.</w:t>
+      </w:r>
+    </w:p>
+    <w:p>
+      <w:pPr>
+        <w:pStyle w:val="BodyText"/>
+      </w:pPr>
+      <w:r>
+        <w:rPr>
+          <w:b/>
+          <w:bCs/>
+        </w:rPr>
+        <w:t xml:space="preserve">5.</w:t>
+      </w:r>
+      <w:r>
+        <w:rPr>
+          <w:b/>
+          <w:bCs/>
+        </w:rPr>
+        <w:t xml:space="preserve"> </w:t>
+      </w:r>
+      <w:r>
+        <w:rPr>
+          <w:rStyle w:val="VerbatimChar"/>
+          <w:b/>
+          <w:bCs/>
+        </w:rPr>
+        <w:t xml:space="preserve">OAI Compatible API key not found</w:t>
+      </w:r>
+    </w:p>
+    <w:p>
+      <w:pPr>
+        <w:pStyle w:val="SourceCode"/>
+      </w:pPr>
+      <w:r>
+        <w:rPr>
+          <w:rStyle w:val="VerbatimChar"/>
+        </w:rPr>
+        <w:t xml:space="preserve">OAI Compatible API key not found</w:t>
+      </w:r>
+      <w:r>
+        <w:br/>
+      </w:r>
+      <w:r>
+        <w:rPr>
+          <w:rStyle w:val="VerbatimChar"/>
+        </w:rPr>
+        <w:t xml:space="preserve">  at ...provideLanguageModelChatResponse (out/provider.js:173)</w:t>
+      </w:r>
+    </w:p>
+    <w:p>
+      <w:pPr>
+        <w:pStyle w:val="FirstParagraph"/>
+      </w:pPr>
+      <w:r>
+        <w:t xml:space="preserve">The extension keeps the token in VS Code’s encrypted secret storage,</w:t>
+      </w:r>
+      <w:r>
+        <w:t xml:space="preserve"> </w:t>
+      </w:r>
+      <w:r>
+        <w:t xml:space="preserve">which is per install, not per profile.</w:t>
+      </w:r>
+      <w:r>
+        <w:t xml:space="preserve"> </w:t>
+      </w:r>
+      <w:r>
+        <w:rPr>
+          <w:rStyle w:val="VerbatimChar"/>
+        </w:rPr>
+        <w:t xml:space="preserve">settings.json</w:t>
+      </w:r>
+      <w:r>
+        <w:t xml:space="preserve"> </w:t>
+      </w:r>
+      <w:r>
+        <w:t xml:space="preserve">travels through Settings Sync; the secret does not.</w:t>
+      </w:r>
+      <w:r>
+        <w:t xml:space="preserve"> </w:t>
+      </w:r>
+      <w:r>
+        <w:t xml:space="preserve">So a second install, such as Insiders beside stable,</w:t>
+      </w:r>
+      <w:r>
+        <w:t xml:space="preserve"> </w:t>
+      </w:r>
+      <w:r>
+        <w:t xml:space="preserve">shows a complete-looking</w:t>
+      </w:r>
+      <w:r>
+        <w:t xml:space="preserve"> </w:t>
+      </w:r>
+      <w:r>
+        <w:rPr>
+          <w:rStyle w:val="VerbatimChar"/>
+        </w:rPr>
+        <w:t xml:space="preserve">oaicopilot</w:t>
+      </w:r>
+      <w:r>
+        <w:t xml:space="preserve"> </w:t>
+      </w:r>
+      <w:r>
+        <w:t xml:space="preserve">configuration with no token behind it.</w:t>
+      </w:r>
+      <w:r>
+        <w:t xml:space="preserve"> </w:t>
+      </w:r>
+      <w:r>
+        <w:t xml:space="preserve">A new profile in the same install still sees the existing token.</w:t>
+      </w:r>
+      <w:r>
+        <w:t xml:space="preserve"> </w:t>
+      </w:r>
+      <w:r>
+        <w:t xml:space="preserve">Re-run</w:t>
+      </w:r>
+      <w:r>
+        <w:t xml:space="preserve"> </w:t>
+      </w:r>
+      <w:r>
+        <w:rPr>
+          <w:b/>
+          <w:bCs/>
+        </w:rPr>
+        <w:t xml:space="preserve">Set OAI Compatible Multi-Provider Apikey</w:t>
+      </w:r>
+      <w:r>
+        <w:t xml:space="preserve"> </w:t>
+      </w:r>
+      <w:r>
+        <w:t xml:space="preserve">in the install that is</w:t>
+      </w:r>
+      <w:r>
+        <w:t xml:space="preserve"> </w:t>
+      </w:r>
+      <w:r>
+        <w:t xml:space="preserve">failing.</w:t>
+      </w:r>
+    </w:p>
+    <w:p>
+      <w:pPr>
+        <w:pStyle w:val="BodyText"/>
+      </w:pPr>
+      <w:r>
+        <w:t xml:space="preserve">This is not the same as the 403 above.</w:t>
+      </w:r>
+      <w:r>
+        <w:t xml:space="preserve"> </w:t>
+      </w:r>
+      <w:r>
+        <w:t xml:space="preserve">There, a token was sent and the provider rejected it;</w:t>
+      </w:r>
+      <w:r>
+        <w:t xml:space="preserve"> </w:t>
+      </w:r>
+      <w:r>
+        <w:t xml:space="preserve">here, no request reaches the provider at all.</w:t>
+      </w:r>
+    </w:p>
+    <w:p>
+      <w:pPr>
+        <w:pStyle w:val="BodyText"/>
+      </w:pPr>
+      <w:r>
+        <w:rPr>
+          <w:b/>
+          <w:bCs/>
+        </w:rPr>
+        <w:t xml:space="preserve">6.</w:t>
+      </w:r>
+      <w:r>
+        <w:rPr>
+          <w:b/>
+          <w:bCs/>
+        </w:rPr>
+        <w:t xml:space="preserve"> </w:t>
+      </w:r>
+      <w:r>
+        <w:rPr>
+          <w:rStyle w:val="VerbatimChar"/>
+          <w:b/>
+          <w:bCs/>
+        </w:rPr>
+        <w:t xml:space="preserve">No lowest priority node found</w:t>
+      </w:r>
+    </w:p>
+    <w:p>
+      <w:pPr>
+        <w:pStyle w:val="SourceCode"/>
+      </w:pPr>
+      <w:r>
+        <w:rPr>
+          <w:rStyle w:val="VerbatimChar"/>
+        </w:rPr>
+        <w:t xml:space="preserve">Error: No lowest priority node found (path: ...)</w:t>
+      </w:r>
+      <w:r>
+        <w:br/>
+      </w:r>
+      <w:r>
+        <w:rPr>
+          <w:rStyle w:val="VerbatimChar"/>
+        </w:rPr>
+        <w:t xml:space="preserve">  ... [ConversationHistorySummarizer] summarization failed</w:t>
+      </w:r>
+    </w:p>
+    <w:p>
+      <w:pPr>
+        <w:pStyle w:val="FirstParagraph"/>
+      </w:pPr>
+      <w:r>
+        <w:t xml:space="preserve">This one comes from Copilot Chat’s prompt renderer, not from Databricks.</w:t>
+      </w:r>
+      <w:r>
+        <w:t xml:space="preserve"> </w:t>
+      </w:r>
+      <w:r>
+        <w:t xml:space="preserve">The renderer drops prompt elements in priority order until the prompt fits the</w:t>
+      </w:r>
+      <w:r>
+        <w:t xml:space="preserve"> </w:t>
+      </w:r>
+      <w:r>
+        <w:t xml:space="preserve">input budget the extension advertises,</w:t>
+      </w:r>
+      <w:r>
+        <w:t xml:space="preserve"> </w:t>
+      </w:r>
+      <w:r>
+        <w:t xml:space="preserve">which is</w:t>
+      </w:r>
+      <w:r>
+        <w:t xml:space="preserve"> </w:t>
+      </w:r>
+      <w:r>
+        <w:rPr>
+          <w:rStyle w:val="VerbatimChar"/>
+        </w:rPr>
+        <w:t xml:space="preserve">context_length</w:t>
+      </w:r>
+      <w:r>
+        <w:t xml:space="preserve"> </w:t>
+      </w:r>
+      <w:r>
+        <w:t xml:space="preserve">minus</w:t>
+      </w:r>
+      <w:r>
+        <w:t xml:space="preserve"> </w:t>
+      </w:r>
+      <w:r>
+        <w:rPr>
+          <w:rStyle w:val="VerbatimChar"/>
+        </w:rPr>
+        <w:t xml:space="preserve">max_tokens</w:t>
+      </w:r>
+      <w:r>
+        <w:t xml:space="preserve">,</w:t>
+      </w:r>
+      <w:r>
+        <w:t xml:space="preserve"> </w:t>
+      </w:r>
+      <w:r>
+        <w:t xml:space="preserve">or 48,000 tokens at the Claude defaults in</w:t>
+      </w:r>
+      <w:r>
+        <w:t xml:space="preserve"> </w:t>
+      </w:r>
+      <w:hyperlink w:anchor="tbl-databricks-oaicopilot-defaults">
+        <w:r>
+          <w:rPr>
+            <w:rStyle w:val="Hyperlink"/>
+          </w:rPr>
+          <w:t xml:space="preserve">Table 3</w:t>
+        </w:r>
+      </w:hyperlink>
+      <w:r>
+        <w:t xml:space="preserve">.</w:t>
+      </w:r>
+      <w:r>
+        <w:t xml:space="preserve"> </w:t>
+      </w:r>
+      <w:r>
+        <w:t xml:space="preserve">The error is what it raises when it has nothing left to drop</w:t>
+      </w:r>
+      <w:r>
+        <w:t xml:space="preserve"> </w:t>
+      </w:r>
+      <w:r>
+        <w:t xml:space="preserve">and the prompt is still over budget.</w:t>
+      </w:r>
+      <w:r>
+        <w:t xml:space="preserve"> </w:t>
+      </w:r>
+      <w:r>
+        <w:t xml:space="preserve">A prompt pruned that far need not still contain your own message,</w:t>
+      </w:r>
+      <w:r>
+        <w:t xml:space="preserve"> </w:t>
+      </w:r>
+      <w:r>
+        <w:t xml:space="preserve">which fits a model that replies it cannot see a request.</w:t>
+      </w:r>
+    </w:p>
+    <w:p>
+      <w:pPr>
+        <w:pStyle w:val="BodyText"/>
+      </w:pPr>
+      <w:r>
+        <w:t xml:space="preserve">Agent mode reaches this sooner than ordinary chat,</w:t>
+      </w:r>
+      <w:r>
+        <w:t xml:space="preserve"> </w:t>
+      </w:r>
+      <w:r>
+        <w:t xml:space="preserve">because tool definitions and instruction files consume the budget before any</w:t>
+      </w:r>
+      <w:r>
+        <w:t xml:space="preserve"> </w:t>
+      </w:r>
+      <w:r>
+        <w:t xml:space="preserve">conversation does.</w:t>
+      </w:r>
+      <w:r>
+        <w:t xml:space="preserve"> </w:t>
+      </w:r>
+      <w:r>
+        <w:t xml:space="preserve">Raise the model’s</w:t>
+      </w:r>
+      <w:r>
+        <w:t xml:space="preserve"> </w:t>
+      </w:r>
+      <w:r>
+        <w:rPr>
+          <w:rStyle w:val="VerbatimChar"/>
+        </w:rPr>
+        <w:t xml:space="preserve">context_length</w:t>
+      </w:r>
+      <w:r>
+        <w:t xml:space="preserve"> </w:t>
+      </w:r>
+      <w:r>
+        <w:t xml:space="preserve">and leave</w:t>
+      </w:r>
+      <w:r>
+        <w:t xml:space="preserve"> </w:t>
+      </w:r>
+      <w:r>
+        <w:rPr>
+          <w:rStyle w:val="VerbatimChar"/>
+        </w:rPr>
+        <w:t xml:space="preserve">max_tokens</w:t>
+      </w:r>
+      <w:r>
+        <w:t xml:space="preserve"> </w:t>
+      </w:r>
+      <w:r>
+        <w:t xml:space="preserve">alone:</w:t>
+      </w:r>
+      <w:r>
+        <w:t xml:space="preserve"> </w:t>
+      </w:r>
+      <w:r>
+        <w:t xml:space="preserve">that widens the input allowance without reserving more output tokens per</w:t>
+      </w:r>
+      <w:r>
+        <w:t xml:space="preserve"> </w:t>
+      </w:r>
+      <w:r>
+        <w:t xml:space="preserve">minute.</w:t>
+      </w:r>
+      <w:r>
+        <w:t xml:space="preserve"> </w:t>
+      </w:r>
+      <w:r>
+        <w:t xml:space="preserve">Reducing the number of active tools and instruction files works too.</w:t>
+      </w:r>
+      <w:r>
+        <w:t xml:space="preserve"> </w:t>
+      </w:r>
+      <w:r>
+        <w:t xml:space="preserve">Weigh both against</w:t>
+      </w:r>
+      <w:r>
+        <w:t xml:space="preserve"> </w:t>
+      </w:r>
+      <w:hyperlink w:anchor="tbl-databricks-oaicopilot-defaults">
+        <w:r>
+          <w:rPr>
+            <w:rStyle w:val="Hyperlink"/>
+          </w:rPr>
+          <w:t xml:space="preserve">Table 3</w:t>
+        </w:r>
+      </w:hyperlink>
+      <w:r>
+        <w:t xml:space="preserve">,</w:t>
+      </w:r>
+      <w:r>
+        <w:t xml:space="preserve"> </w:t>
+      </w:r>
+      <w:r>
+        <w:t xml:space="preserve">whose context values are chosen to keep one client inside an ITPM tier,</w:t>
+      </w:r>
+      <w:r>
+        <w:t xml:space="preserve"> </w:t>
+      </w:r>
+      <w:r>
+        <w:t xml:space="preserve">so buying prompt headroom this way costs more 429s.</w:t>
+      </w:r>
+    </w:p>
+    <w:p>
+      <w:pPr>
+        <w:pStyle w:val="BodyText"/>
+      </w:pPr>
+      <w:r>
+        <w:rPr>
+          <w:b/>
+          <w:bCs/>
+        </w:rPr>
+        <w:t xml:space="preserve">7.</w:t>
+      </w:r>
+      <w:r>
+        <w:rPr>
+          <w:b/>
+          <w:bCs/>
+        </w:rPr>
+        <w:t xml:space="preserve"> </w:t>
+      </w:r>
+      <w:r>
+        <w:rPr>
+          <w:rStyle w:val="VerbatimChar"/>
+          <w:b/>
+          <w:bCs/>
+        </w:rPr>
+        <w:t xml:space="preserve">[object Object]</w:t>
+      </w:r>
+      <w:r>
+        <w:rPr>
+          <w:b/>
+          <w:bCs/>
+        </w:rPr>
+        <w:t xml:space="preserve"> </w:t>
+      </w:r>
+      <w:r>
+        <w:rPr>
+          <w:b/>
+          <w:bCs/>
+        </w:rPr>
+        <w:t xml:space="preserve">in the reply text</w:t>
+      </w:r>
+    </w:p>
+    <w:p>
+      <w:pPr>
+        <w:pStyle w:val="BodyText"/>
+      </w:pPr>
+      <w:r>
+        <w:t xml:space="preserve">Version 0.4.2 renders streamed content with</w:t>
+      </w:r>
+      <w:r>
+        <w:t xml:space="preserve"> </w:t>
+      </w:r>
+      <w:r>
+        <w:rPr>
+          <w:rStyle w:val="VerbatimChar"/>
+        </w:rPr>
+        <w:t xml:space="preserve">String(deltaObj.content)</w:t>
+      </w:r>
+      <w:r>
+        <w:t xml:space="preserve"> </w:t>
+      </w:r>
+      <w:r>
+        <w:t xml:space="preserve">in both of its streaming paths, in</w:t>
+      </w:r>
+      <w:r>
+        <w:t xml:space="preserve"> </w:t>
+      </w:r>
+      <w:r>
+        <w:rPr>
+          <w:rStyle w:val="VerbatimChar"/>
+        </w:rPr>
+        <w:t xml:space="preserve">out/openai/openaiApi.js</w:t>
+      </w:r>
+      <w:r>
+        <w:t xml:space="preserve">.</w:t>
+      </w:r>
+      <w:r>
+        <w:t xml:space="preserve"> </w:t>
+      </w:r>
+      <w:r>
+        <w:t xml:space="preserve">A chunk whose</w:t>
+      </w:r>
+      <w:r>
+        <w:t xml:space="preserve"> </w:t>
+      </w:r>
+      <w:r>
+        <w:rPr>
+          <w:rStyle w:val="VerbatimChar"/>
+        </w:rPr>
+        <w:t xml:space="preserve">content</w:t>
+      </w:r>
+      <w:r>
+        <w:t xml:space="preserve"> </w:t>
+      </w:r>
+      <w:r>
+        <w:t xml:space="preserve">is a plain string renders normally.</w:t>
+      </w:r>
+      <w:r>
+        <w:t xml:space="preserve"> </w:t>
+      </w:r>
+      <w:r>
+        <w:t xml:space="preserve">A chunk that carries structured content instead prints as the literal text</w:t>
+      </w:r>
+      <w:r>
+        <w:t xml:space="preserve"> </w:t>
+      </w:r>
+      <w:r>
+        <w:rPr>
+          <w:rStyle w:val="VerbatimChar"/>
+        </w:rPr>
+        <w:t xml:space="preserve">[object Object]</w:t>
+      </w:r>
+      <w:r>
+        <w:t xml:space="preserve">,</w:t>
+      </w:r>
+      <w:r>
+        <w:t xml:space="preserve"> </w:t>
+      </w:r>
+      <w:r>
+        <w:t xml:space="preserve">because that is what JavaScript’s</w:t>
+      </w:r>
+      <w:r>
+        <w:t xml:space="preserve"> </w:t>
+      </w:r>
+      <w:r>
+        <w:rPr>
+          <w:rStyle w:val="VerbatimChar"/>
+        </w:rPr>
+        <w:t xml:space="preserve">String()</w:t>
+      </w:r>
+      <w:r>
+        <w:t xml:space="preserve"> </w:t>
+      </w:r>
+      <w:r>
+        <w:t xml:space="preserve">returns for an object.</w:t>
+      </w:r>
+      <w:r>
+        <w:t xml:space="preserve"> </w:t>
+      </w:r>
+      <w:r>
+        <w:t xml:space="preserve">Later chunks that carry a plain string render normally.</w:t>
+      </w:r>
+      <w:r>
+        <w:t xml:space="preserve"> </w:t>
+      </w:r>
+      <w:r>
+        <w:t xml:space="preserve">In the 2026-08-20 session the prefix appeared once,</w:t>
+      </w:r>
+      <w:r>
+        <w:t xml:space="preserve"> </w:t>
+      </w:r>
+      <w:r>
+        <w:t xml:space="preserve">at the start of the reply.</w:t>
+      </w:r>
+      <w:r>
+        <w:t xml:space="preserve"> </w:t>
+      </w:r>
+      <w:r>
+        <w:t xml:space="preserve">That is an observation from that session,</w:t>
+      </w:r>
+      <w:r>
+        <w:t xml:space="preserve"> </w:t>
+      </w:r>
+      <w:r>
+        <w:t xml:space="preserve">not a guarantee that later chunks cannot also be structured.</w:t>
+      </w:r>
+    </w:p>
+    <w:p>
+      <w:pPr>
+        <w:pStyle w:val="BodyText"/>
+      </w:pPr>
+      <w:r>
+        <w:t xml:space="preserve">This is a display bug in the extension rather than a configuration error,</w:t>
+      </w:r>
+      <w:r>
+        <w:t xml:space="preserve"> </w:t>
+      </w:r>
+      <w:r>
+        <w:t xml:space="preserve">so no setting turns it off.</w:t>
+      </w:r>
+      <w:r>
+        <w:t xml:space="preserve"> </w:t>
+      </w:r>
+      <w:r>
+        <w:t xml:space="preserve">Report it upstream and read past the prefix.</w:t>
+      </w:r>
+    </w:p>
+    <w:tbl>
+      <w:tblPr>
+        <w:tblStyle w:val="Table"/>
+        <w:tblLook w:firstRow="0" w:lastRow="0" w:firstColumn="0" w:lastColumn="0" w:noHBand="0" w:noVBand="0" w:val="0000"/>
+        <w:tblBorders>
+          <w:top w:val="single" w:sz="4" w:space="0" w:color="0758E5"/>
+          <w:left w:val="single" w:sz="24" w:space="0" w:color="0758E5"/>
+          <w:bottom w:val="single" w:sz="4" w:space="0" w:color="0758E5"/>
+          <w:right w:val="single" w:sz="4" w:space="0" w:color="0758E5"/>
+        </w:tblBorders>
+        <w:tblCellMar>
+          <w:left w:w="144" w:type="dxa"/>
+          <w:right w:w="144" w:type="dxa"/>
+        </w:tblCellMar>
+        <w:tblLook w:firstRow="0" w:lastRow="0" w:firstColumn="0" w:lastColumn="0" w:noHBand="0" w:noVBand="0" w:val="0000"/>
+      </w:tblPr>
+      <w:tr>
+        <w:trPr>
+          <w:cantSplit/>
+        </w:trPr>
+        <w:tc>
+          <w:tcPr>
+            <w:shd w:color="auto" w:fill="dae6fb" w:val="clear"/>
+            <w:tcMar>
+              <w:top w:w="92" w:type="dxa"/>
+              <w:bottom w:w="92" w:type="dxa"/>
+            </w:tcMar>
+          </w:tcPr>
+          <w:p>
+            <w:pPr>
+              <w:pStyle w:val="BodyText"/>
+            </w:pPr>
+            <w:pPr>
+              <w:spacing w:before="0" w:after="0"/>
+              <w:textAlignment w:val="center"/>
+            </w:pPr>
+            <w:r>
+              <w:drawing>
+                <wp:inline>
+                  <wp:extent cx="152400" cy="152400"/>
+                  <wp:effectExtent b="0" l="0" r="0" t="0"/>
+                  <wp:docPr descr="" title="" id="259" name="Picture"/>
+                  <a:graphic>
+                    <a:graphicData uri="http://schemas.openxmlformats.org/drawingml/2006/picture">
+                      <pic:pic>
+                        <pic:nvPicPr>
+                          <pic:cNvPr descr="/opt/quarto/share/formats/docx/note.png" id="260" name="Picture"/>
+                          <pic:cNvPicPr>
+                            <a:picLocks noChangeArrowheads="1" noChangeAspect="1"/>
+                          </pic:cNvPicPr>
+                        </pic:nvPicPr>
+                        <pic:blipFill>
+                          <a:blip r:embed="rId118"/>
+                          <a:stretch>
+                            <a:fillRect/>
+                          </a:stretch>
+                        </pic:blipFill>
+                        <pic:spPr bwMode="auto">
+                          <a:xfrm>
+                            <a:off x="0" y="0"/>
+                            <a:ext cx="152400" cy="152400"/>
+                          </a:xfrm>
+                          <a:prstGeom prst="rect">
+                            <a:avLst/>
+                          </a:prstGeom>
+                          <a:noFill/>
+                          <a:ln w="9525">
+                            <a:noFill/>
+                            <a:headEnd/>
+                            <a:tailEnd/>
+                          </a:ln>
+                        </pic:spPr>
+                      </pic:pic>
+                    </a:graphicData>
+                  </a:graphic>
+                </wp:inline>
+              </w:drawing>
+            </w:r>
+            <w:r>
+              <w:t xml:space="preserve"> </w:t>
+            </w:r>
+            <w:r>
+              <w:t xml:space="preserve"> </w:t>
+            </w:r>
+            <w:r>
+              <w:t xml:space="preserve">Note</w:t>
+            </w:r>
+          </w:p>
+        </w:tc>
+      </w:tr>
+      <w:tr>
+        <w:trPr>
+          <w:cantSplit/>
+        </w:trPr>
+        <w:tc>
+          <w:tcPr>
+            <w:tcMar>
+              <w:top w:w="108" w:type="dxa"/>
+              <w:bottom w:w="108" w:type="dxa"/>
+            </w:tcMar>
+          </w:tcPr>
+          <w:p>
+            <w:pPr>
+              <w:pStyle w:val="BodyText"/>
+            </w:pPr>
+            <w:pPr>
+              <w:spacing w:before="16" w:after="16"/>
+            </w:pPr>
+            <w:r>
+              <w:t xml:space="preserve">Copilot’s own hosted quota still applies to some background chores even when</w:t>
+            </w:r>
+            <w:r>
+              <w:t xml:space="preserve"> </w:t>
+            </w:r>
+            <w:r>
+              <w:t xml:space="preserve">the main chat model is BYOK.</w:t>
+            </w:r>
+            <w:r>
+              <w:t xml:space="preserve"> </w:t>
+            </w:r>
+            <w:r>
+              <w:t xml:space="preserve">A log line reading</w:t>
+            </w:r>
+            <w:r>
+              <w:t xml:space="preserve"> </w:t>
+            </w:r>
+            <w:r>
+              <w:rPr>
+                <w:rStyle w:val="VerbatimChar"/>
+              </w:rPr>
+              <w:t xml:space="preserve">quotaExceeded | gpt-4o-mini-2024-07-18 | [title]</w:t>
+            </w:r>
+            <w:r>
+              <w:t xml:space="preserve"> </w:t>
+            </w:r>
+            <w:r>
+              <w:t xml:space="preserve">is conversation-title generation failing against GitHub’s models,</w:t>
+            </w:r>
+            <w:r>
+              <w:t xml:space="preserve"> </w:t>
+            </w:r>
+            <w:r>
+              <w:t xml:space="preserve">and it says nothing about whether your provider is working.</w:t>
+            </w:r>
+            <w:r>
+              <w:t xml:space="preserve"> </w:t>
+            </w:r>
+            <w:r>
+              <w:t xml:space="preserve">In the 2026-08-20 session above,</w:t>
+            </w:r>
+            <w:r>
+              <w:t xml:space="preserve"> </w:t>
+            </w:r>
+            <w:r>
+              <w:rPr>
+                <w:rStyle w:val="VerbatimChar"/>
+              </w:rPr>
+              <w:t xml:space="preserve">chat.byokUtilityModelDefault</w:t>
+            </w:r>
+            <w:r>
+              <w:t xml:space="preserve"> </w:t>
+            </w:r>
+            <w:r>
+              <w:t xml:space="preserve">was already set to</w:t>
+            </w:r>
+            <w:r>
+              <w:t xml:space="preserve"> </w:t>
+            </w:r>
+            <w:r>
+              <w:rPr>
+                <w:rStyle w:val="VerbatimChar"/>
+              </w:rPr>
+              <w:t xml:space="preserve">"mainAgent"</w:t>
+            </w:r>
+            <w:r>
+              <w:t xml:space="preserve"> </w:t>
+            </w:r>
+            <w:r>
+              <w:t xml:space="preserve">and the title request still went to</w:t>
+            </w:r>
+            <w:r>
+              <w:t xml:space="preserve"> </w:t>
+            </w:r>
+            <w:r>
+              <w:rPr>
+                <w:rStyle w:val="VerbatimChar"/>
+              </w:rPr>
+              <w:t xml:space="preserve">gpt-4o-mini</w:t>
+            </w:r>
+            <w:r>
+              <w:t xml:space="preserve">,</w:t>
+            </w:r>
+            <w:r>
+              <w:t xml:space="preserve"> </w:t>
+            </w:r>
+            <w:r>
+              <w:t xml:space="preserve">so that setting did not cover conversation titles in this version.</w:t>
+            </w:r>
+          </w:p>
+          <w:p/>
+        </w:tc>
+      </w:tr>
+    </w:tbl>
+    <w:bookmarkEnd w:id="261"/>
+    <w:bookmarkEnd w:id="262"/>
+    <w:bookmarkStart w:id="276" w:name="configuring-the-agent-environment"/>
     <w:p>
       <w:pPr>
         <w:pStyle w:val="Heading1"/>
@@ -37627,7 +39063,7 @@
         <w:t xml:space="preserve">so that Copilot can build, test, and lint your code more reliably.</w:t>
       </w:r>
     </w:p>
-    <w:bookmarkStart w:id="258" w:name="why-configure-the-environment"/>
+    <w:bookmarkStart w:id="263" w:name="why-configure-the-environment"/>
     <w:p>
       <w:pPr>
         <w:pStyle w:val="Heading4"/>
@@ -37710,8 +39146,8 @@
         <w:t xml:space="preserve">Consistent development environment across all agent sessions</w:t>
       </w:r>
     </w:p>
-    <w:bookmarkEnd w:id="258"/>
-    <w:bookmarkStart w:id="259" w:name="file-location-and-structure"/>
+    <w:bookmarkEnd w:id="263"/>
+    <w:bookmarkStart w:id="264" w:name="file-location-and-structure"/>
     <w:p>
       <w:pPr>
         <w:pStyle w:val="Heading4"/>
@@ -37780,8 +39216,8 @@
         <w:t xml:space="preserve">.</w:t>
       </w:r>
     </w:p>
-    <w:bookmarkEnd w:id="259"/>
-    <w:bookmarkStart w:id="261" w:name="basic-configuration-example"/>
+    <w:bookmarkEnd w:id="264"/>
+    <w:bookmarkStart w:id="266" w:name="basic-configuration-example"/>
     <w:p>
       <w:pPr>
         <w:pStyle w:val="Heading4"/>
@@ -37800,7 +39236,7 @@
       <w:r>
         <w:t xml:space="preserve"> </w:t>
       </w:r>
-      <w:hyperlink r:id="rId260">
+      <w:hyperlink r:id="rId265">
         <w:r>
           <w:rPr>
             <w:rStyle w:val="VerbatimChar"/>
@@ -37815,8 +39251,8 @@
         <w:t xml:space="preserve">for a configuration adapted for R and Quarto projects.</w:t>
       </w:r>
     </w:p>
-    <w:bookmarkEnd w:id="261"/>
-    <w:bookmarkStart w:id="264" w:name="using-actionscheckout"/>
+    <w:bookmarkEnd w:id="266"/>
+    <w:bookmarkStart w:id="269" w:name="using-actionscheckout"/>
     <w:p>
       <w:pPr>
         <w:pStyle w:val="Heading4"/>
@@ -37844,7 +39280,7 @@
       <w:r>
         <w:t xml:space="preserve"> </w:t>
       </w:r>
-      <w:hyperlink r:id="rId262">
+      <w:hyperlink r:id="rId267">
         <w:r>
           <w:rPr>
             <w:rStyle w:val="VerbatimChar"/>
@@ -38183,7 +39619,7 @@
       <w:r>
         <w:t xml:space="preserve"> </w:t>
       </w:r>
-      <w:hyperlink r:id="rId263">
+      <w:hyperlink r:id="rId268">
         <w:r>
           <w:rPr>
             <w:rStyle w:val="Hyperlink"/>
@@ -38251,8 +39687,8 @@
         <w:t xml:space="preserve">including comparing changes and understanding the context of your pull request.</w:t>
       </w:r>
     </w:p>
-    <w:bookmarkEnd w:id="264"/>
-    <w:bookmarkStart w:id="265" w:name="configurable-options"/>
+    <w:bookmarkEnd w:id="269"/>
+    <w:bookmarkStart w:id="270" w:name="configurable-options"/>
     <w:p>
       <w:pPr>
         <w:pStyle w:val="Heading4"/>
@@ -38418,8 +39854,8 @@
         <w:t xml:space="preserve">All other workflow settings are ignored by Copilot.</w:t>
       </w:r>
     </w:p>
-    <w:bookmarkEnd w:id="265"/>
-    <w:bookmarkStart w:id="266" w:name="common-setup-tasks"/>
+    <w:bookmarkEnd w:id="270"/>
+    <w:bookmarkStart w:id="271" w:name="common-setup-tasks"/>
     <w:p>
       <w:pPr>
         <w:pStyle w:val="Heading4"/>
@@ -39034,8 +40470,8 @@
         <w:t xml:space="preserve"> r-lib/actions/setup-renv@v2</w:t>
       </w:r>
     </w:p>
-    <w:bookmarkEnd w:id="266"/>
-    <w:bookmarkStart w:id="267" w:name="environment-variables-and-secrets"/>
+    <w:bookmarkEnd w:id="271"/>
+    <w:bookmarkStart w:id="272" w:name="environment-variables-and-secrets"/>
     <w:p>
       <w:pPr>
         <w:pStyle w:val="Heading4"/>
@@ -39143,8 +40579,8 @@
         <w:t xml:space="preserve">Use secrets for sensitive values like API keys or passwords.</w:t>
       </w:r>
     </w:p>
-    <w:bookmarkEnd w:id="267"/>
-    <w:bookmarkStart w:id="268" w:name="testing-your-configuration"/>
+    <w:bookmarkEnd w:id="272"/>
+    <w:bookmarkStart w:id="273" w:name="testing-your-configuration"/>
     <w:p>
       <w:pPr>
         <w:pStyle w:val="Heading4"/>
@@ -39239,8 +40675,8 @@
         <w:t xml:space="preserve">and begin working with the current environment state.</w:t>
       </w:r>
     </w:p>
-    <w:bookmarkEnd w:id="268"/>
-    <w:bookmarkStart w:id="269" w:name="advanced-configuration"/>
+    <w:bookmarkEnd w:id="273"/>
+    <w:bookmarkStart w:id="274" w:name="advanced-configuration"/>
     <w:p>
       <w:pPr>
         <w:pStyle w:val="Heading4"/>
@@ -39560,8 +40996,8 @@
         <w:t xml:space="preserve">true</w:t>
       </w:r>
     </w:p>
-    <w:bookmarkEnd w:id="269"/>
-    <w:bookmarkStart w:id="270" w:name="further-reading-1"/>
+    <w:bookmarkEnd w:id="274"/>
+    <w:bookmarkStart w:id="275" w:name="further-reading-1"/>
     <w:p>
       <w:pPr>
         <w:pStyle w:val="Heading4"/>
@@ -39586,7 +41022,7 @@
       <w:r>
         <w:t xml:space="preserve"> </w:t>
       </w:r>
-      <w:hyperlink r:id="rId263">
+      <w:hyperlink r:id="rId268">
         <w:r>
           <w:rPr>
             <w:rStyle w:val="Hyperlink"/>
@@ -39598,9 +41034,9 @@
         <w:t xml:space="preserve">.</w:t>
       </w:r>
     </w:p>
-    <w:bookmarkEnd w:id="270"/>
-    <w:bookmarkEnd w:id="271"/>
-    <w:bookmarkStart w:id="279" w:name="sec-ai-agent-skills"/>
+    <w:bookmarkEnd w:id="275"/>
+    <w:bookmarkEnd w:id="276"/>
+    <w:bookmarkStart w:id="284" w:name="sec-ai-agent-skills"/>
     <w:p>
       <w:pPr>
         <w:pStyle w:val="Heading1"/>
@@ -39613,7 +41049,7 @@
       <w:pPr>
         <w:pStyle w:val="FirstParagraph"/>
       </w:pPr>
-      <w:hyperlink r:id="rId272">
+      <w:hyperlink r:id="rId277">
         <w:r>
           <w:rPr>
             <w:rStyle w:val="Hyperlink"/>
@@ -39648,7 +41084,7 @@
       <w:r>
         <w:t xml:space="preserve"> </w:t>
       </w:r>
-      <w:hyperlink r:id="rId273">
+      <w:hyperlink r:id="rId278">
         <w:r>
           <w:rPr>
             <w:rStyle w:val="Hyperlink"/>
@@ -39669,7 +41105,7 @@
         <w:t xml:space="preserve">tool-agnostic format that any compatible agent can load.</w:t>
       </w:r>
     </w:p>
-    <w:bookmarkStart w:id="274" w:name="what-is-a-skill"/>
+    <w:bookmarkStart w:id="279" w:name="what-is-a-skill"/>
     <w:p>
       <w:pPr>
         <w:pStyle w:val="Heading4"/>
@@ -39739,7 +41175,7 @@
       <w:r>
         <w:t xml:space="preserve"> </w:t>
       </w:r>
-      <w:hyperlink r:id="rId273">
+      <w:hyperlink r:id="rId278">
         <w:r>
           <w:rPr>
             <w:rStyle w:val="Hyperlink"/>
@@ -39846,8 +41282,8 @@
         <w:t xml:space="preserve">└── assets/           # Optional: templates, resources</w:t>
       </w:r>
     </w:p>
-    <w:bookmarkEnd w:id="274"/>
-    <w:bookmarkStart w:id="275" w:name="how-agents-load-skills"/>
+    <w:bookmarkEnd w:id="279"/>
+    <w:bookmarkStart w:id="280" w:name="how-agents-load-skills"/>
     <w:p>
       <w:pPr>
         <w:pStyle w:val="Heading4"/>
@@ -39990,8 +41426,8 @@
         <w:t xml:space="preserve">so agents can maintain many skills with a small context footprint.</w:t>
       </w:r>
     </w:p>
-    <w:bookmarkEnd w:id="275"/>
-    <w:bookmarkStart w:id="276" w:name="why-use-skills"/>
+    <w:bookmarkEnd w:id="280"/>
+    <w:bookmarkStart w:id="281" w:name="why-use-skills"/>
     <w:p>
       <w:pPr>
         <w:pStyle w:val="Heading4"/>
@@ -40077,8 +41513,8 @@
         <w:t xml:space="preserve">: Build a skill once and use it across any skills-compatible agent</w:t>
       </w:r>
     </w:p>
-    <w:bookmarkEnd w:id="276"/>
-    <w:bookmarkStart w:id="278" w:name="further-reading-2"/>
+    <w:bookmarkEnd w:id="281"/>
+    <w:bookmarkStart w:id="283" w:name="further-reading-2"/>
     <w:p>
       <w:pPr>
         <w:pStyle w:val="Heading4"/>
@@ -40103,7 +41539,7 @@
       <w:r>
         <w:t xml:space="preserve"> </w:t>
       </w:r>
-      <w:hyperlink r:id="rId272">
+      <w:hyperlink r:id="rId277">
         <w:r>
           <w:rPr>
             <w:rStyle w:val="Hyperlink"/>
@@ -40218,7 +41654,7 @@
       <w:r>
         <w:t xml:space="preserve"> </w:t>
       </w:r>
-      <w:hyperlink r:id="rId277">
+      <w:hyperlink r:id="rId282">
         <w:r>
           <w:rPr>
             <w:rStyle w:val="Hyperlink"/>
@@ -40245,9 +41681,9 @@
         <w:t xml:space="preserve">including user-level skills, hooks, and subagents, synced across machines via Git.</w:t>
       </w:r>
     </w:p>
-    <w:bookmarkEnd w:id="278"/>
-    <w:bookmarkEnd w:id="279"/>
-    <w:bookmarkStart w:id="285" w:name="sec-ai-useful-plugins"/>
+    <w:bookmarkEnd w:id="283"/>
+    <w:bookmarkEnd w:id="284"/>
+    <w:bookmarkStart w:id="290" w:name="sec-ai-useful-plugins"/>
     <w:p>
       <w:pPr>
         <w:pStyle w:val="Heading1"/>
@@ -40266,7 +41702,7 @@
       <w:r>
         <w:t xml:space="preserve"> </w:t>
       </w:r>
-      <w:hyperlink r:id="rId280">
+      <w:hyperlink r:id="rId285">
         <w:r>
           <w:rPr>
             <w:rStyle w:val="Hyperlink"/>
@@ -40303,7 +41739,7 @@
       <w:pPr>
         <w:pStyle w:val="BodyText"/>
       </w:pPr>
-      <w:hyperlink r:id="rId281">
+      <w:hyperlink r:id="rId286">
         <w:r>
           <w:rPr>
             <w:rStyle w:val="Hyperlink"/>
@@ -40365,7 +41801,7 @@
       <w:r>
         <w:t xml:space="preserve"> </w:t>
       </w:r>
-      <w:hyperlink r:id="rId282">
+      <w:hyperlink r:id="rId287">
         <w:r>
           <w:rPr>
             <w:rStyle w:val="Hyperlink"/>
@@ -40437,7 +41873,7 @@
           <w:numId w:val="1120"/>
         </w:numPr>
       </w:pPr>
-      <w:hyperlink r:id="rId283">
+      <w:hyperlink r:id="rId288">
         <w:r>
           <w:rPr>
             <w:rStyle w:val="Hyperlink"/>
@@ -40503,7 +41939,7 @@
       <w:r>
         <w:t xml:space="preserve"> </w:t>
       </w:r>
-      <w:hyperlink r:id="rId277">
+      <w:hyperlink r:id="rId282">
         <w:r>
           <w:rPr>
             <w:rStyle w:val="VerbatimChar"/>
@@ -40520,7 +41956,7 @@
       <w:r>
         <w:t xml:space="preserve"> </w:t>
       </w:r>
-      <w:hyperlink r:id="rId284">
+      <w:hyperlink r:id="rId289">
         <w:r>
           <w:rPr>
             <w:rStyle w:val="VerbatimChar"/>
@@ -40593,8 +42029,8 @@
         <w:t xml:space="preserve">is the worked example of what the corpus contains.</w:t>
       </w:r>
     </w:p>
-    <w:bookmarkEnd w:id="285"/>
-    <w:bookmarkStart w:id="305" w:name="sec-ai-customization"/>
+    <w:bookmarkEnd w:id="290"/>
+    <w:bookmarkStart w:id="310" w:name="sec-ai-customization"/>
     <w:p>
       <w:pPr>
         <w:pStyle w:val="Heading1"/>
@@ -40719,7 +42155,7 @@
         <w:t xml:space="preserve">.</w:t>
       </w:r>
     </w:p>
-    <w:bookmarkStart w:id="287" w:name="the-question-that-picks-the-mechanism"/>
+    <w:bookmarkStart w:id="292" w:name="the-question-that-picks-the-mechanism"/>
     <w:p>
       <w:pPr>
         <w:pStyle w:val="Heading4"/>
@@ -40820,7 +42256,7 @@
       <w:r>
         <w:t xml:space="preserve"> </w:t>
       </w:r>
-      <w:hyperlink r:id="rId286">
+      <w:hyperlink r:id="rId291">
         <w:r>
           <w:rPr>
             <w:rStyle w:val="Hyperlink"/>
@@ -40905,8 +42341,8 @@
         <w:t xml:space="preserve">.</w:t>
       </w:r>
     </w:p>
-    <w:bookmarkEnd w:id="287"/>
-    <w:bookmarkStart w:id="289" w:name="instruction-files-always-on-context"/>
+    <w:bookmarkEnd w:id="292"/>
+    <w:bookmarkStart w:id="294" w:name="instruction-files-always-on-context"/>
     <w:p>
       <w:pPr>
         <w:pStyle w:val="Heading4"/>
@@ -41010,7 +42446,7 @@
       <w:r>
         <w:t xml:space="preserve"> </w:t>
       </w:r>
-      <w:hyperlink r:id="rId286">
+      <w:hyperlink r:id="rId291">
         <w:r>
           <w:rPr>
             <w:rStyle w:val="Hyperlink"/>
@@ -41153,7 +42589,7 @@
       <w:r>
         <w:t xml:space="preserve"> </w:t>
       </w:r>
-      <w:hyperlink r:id="rId286">
+      <w:hyperlink r:id="rId291">
         <w:r>
           <w:rPr>
             <w:rStyle w:val="Hyperlink"/>
@@ -41257,7 +42693,7 @@
       <w:r>
         <w:t xml:space="preserve"> </w:t>
       </w:r>
-      <w:hyperlink r:id="rId288">
+      <w:hyperlink r:id="rId293">
         <w:r>
           <w:rPr>
             <w:rStyle w:val="Hyperlink"/>
@@ -41377,8 +42813,8 @@
         <w:t xml:space="preserve">and guaranteed nothing about acting on it alike.</w:t>
       </w:r>
     </w:p>
-    <w:bookmarkEnd w:id="289"/>
-    <w:bookmarkStart w:id="290" w:name="workspace-rules-and-activation-modes"/>
+    <w:bookmarkEnd w:id="294"/>
+    <w:bookmarkStart w:id="295" w:name="workspace-rules-and-activation-modes"/>
     <w:p>
       <w:pPr>
         <w:pStyle w:val="Heading4"/>
@@ -41647,8 +43083,8 @@
         <w:t xml:space="preserve">).</w:t>
       </w:r>
     </w:p>
-    <w:bookmarkEnd w:id="290"/>
-    <w:bookmarkStart w:id="293" w:name="skills-and-the-commands-that-became-them"/>
+    <w:bookmarkEnd w:id="295"/>
+    <w:bookmarkStart w:id="298" w:name="skills-and-the-commands-that-became-them"/>
     <w:p>
       <w:pPr>
         <w:pStyle w:val="Heading4"/>
@@ -41673,7 +43109,7 @@
       <w:r>
         <w:t xml:space="preserve"> </w:t>
       </w:r>
-      <w:hyperlink r:id="rId291">
+      <w:hyperlink r:id="rId296">
         <w:r>
           <w:rPr>
             <w:rStyle w:val="Hyperlink"/>
@@ -42112,7 +43548,7 @@
       <w:r>
         <w:t xml:space="preserve"> </w:t>
       </w:r>
-      <w:hyperlink r:id="rId273">
+      <w:hyperlink r:id="rId278">
         <w:r>
           <w:rPr>
             <w:rStyle w:val="Hyperlink"/>
@@ -42231,7 +43667,7 @@
       <w:r>
         <w:t xml:space="preserve"> </w:t>
       </w:r>
-      <w:hyperlink r:id="rId292">
+      <w:hyperlink r:id="rId297">
         <w:r>
           <w:rPr>
             <w:rStyle w:val="Hyperlink"/>
@@ -42297,8 +43733,8 @@
         <w:t xml:space="preserve">a competitor’s directory name.</w:t>
       </w:r>
     </w:p>
-    <w:bookmarkEnd w:id="293"/>
-    <w:bookmarkStart w:id="295" w:name="subagents-delegating-to-a-fresh-context"/>
+    <w:bookmarkEnd w:id="298"/>
+    <w:bookmarkStart w:id="300" w:name="subagents-delegating-to-a-fresh-context"/>
     <w:p>
       <w:pPr>
         <w:pStyle w:val="Heading4"/>
@@ -42447,7 +43883,7 @@
       <w:r>
         <w:t xml:space="preserve"> </w:t>
       </w:r>
-      <w:hyperlink r:id="rId294">
+      <w:hyperlink r:id="rId299">
         <w:r>
           <w:rPr>
             <w:rStyle w:val="Hyperlink"/>
@@ -42470,7 +43906,7 @@
       <w:r>
         <w:t xml:space="preserve"> </w:t>
       </w:r>
-      <w:hyperlink r:id="rId291">
+      <w:hyperlink r:id="rId296">
         <w:r>
           <w:rPr>
             <w:rStyle w:val="Hyperlink"/>
@@ -42535,8 +43971,8 @@
         <w:t xml:space="preserve">The @-mention controls which subagent Claude invokes, not what prompt it receives.</w:t>
       </w:r>
     </w:p>
-    <w:bookmarkEnd w:id="295"/>
-    <w:bookmarkStart w:id="297" w:name="Xf185306762ce2c53b5a7ee53d7e6e74f0af7607"/>
+    <w:bookmarkEnd w:id="300"/>
+    <w:bookmarkStart w:id="302" w:name="Xf185306762ce2c53b5a7ee53d7e6e74f0af7607"/>
     <w:p>
       <w:pPr>
         <w:pStyle w:val="Heading4"/>
@@ -42580,7 +44016,7 @@
       <w:r>
         <w:t xml:space="preserve"> </w:t>
       </w:r>
-      <w:hyperlink r:id="rId296">
+      <w:hyperlink r:id="rId301">
         <w:r>
           <w:rPr>
             <w:rStyle w:val="Hyperlink"/>
@@ -42615,7 +44051,7 @@
       <w:r>
         <w:t xml:space="preserve"> </w:t>
       </w:r>
-      <w:hyperlink r:id="rId286">
+      <w:hyperlink r:id="rId291">
         <w:r>
           <w:rPr>
             <w:rStyle w:val="Hyperlink"/>
@@ -42834,8 +44270,8 @@
         <w:t xml:space="preserve">hook decides.</w:t>
       </w:r>
     </w:p>
-    <w:bookmarkEnd w:id="297"/>
-    <w:bookmarkStart w:id="299" w:name="X661523c6623257371ddb85eca0962e6d24391f6"/>
+    <w:bookmarkEnd w:id="302"/>
+    <w:bookmarkStart w:id="304" w:name="X661523c6623257371ddb85eca0962e6d24391f6"/>
     <w:p>
       <w:pPr>
         <w:pStyle w:val="Heading4"/>
@@ -42917,7 +44353,7 @@
       <w:r>
         <w:t xml:space="preserve"> </w:t>
       </w:r>
-      <w:hyperlink r:id="rId298">
+      <w:hyperlink r:id="rId303">
         <w:r>
           <w:rPr>
             <w:rStyle w:val="Hyperlink"/>
@@ -43076,8 +44512,8 @@
         <w:t xml:space="preserve">a repository can tighten what you allow, and cannot quietly loosen it.</w:t>
       </w:r>
     </w:p>
-    <w:bookmarkEnd w:id="299"/>
-    <w:bookmarkStart w:id="300" w:name="Xb9141ee8bf4b59ff8b077a4423dd913151d282a"/>
+    <w:bookmarkEnd w:id="304"/>
+    <w:bookmarkStart w:id="305" w:name="Xb9141ee8bf4b59ff8b077a4423dd913151d282a"/>
     <w:p>
       <w:pPr>
         <w:pStyle w:val="Heading4"/>
@@ -43210,8 +44646,8 @@
         <w:t xml:space="preserve">covers configuration and its failure modes.</w:t>
       </w:r>
     </w:p>
-    <w:bookmarkEnd w:id="300"/>
-    <w:bookmarkStart w:id="301" w:name="choosing"/>
+    <w:bookmarkEnd w:id="305"/>
+    <w:bookmarkStart w:id="306" w:name="choosing"/>
     <w:p>
       <w:pPr>
         <w:pStyle w:val="Heading4"/>
@@ -43568,8 +45004,8 @@
         </w:tc>
       </w:tr>
     </w:tbl>
-    <w:bookmarkEnd w:id="301"/>
-    <w:bookmarkStart w:id="303" w:name="what-travels-between-tools"/>
+    <w:bookmarkEnd w:id="306"/>
+    <w:bookmarkStart w:id="308" w:name="what-travels-between-tools"/>
     <w:p>
       <w:pPr>
         <w:pStyle w:val="Heading4"/>
@@ -44022,7 +45458,7 @@
             <w:pPr>
               <w:pStyle w:val="Compact"/>
             </w:pPr>
-            <w:hyperlink r:id="rId302">
+            <w:hyperlink r:id="rId307">
               <w:r>
                 <w:rPr>
                   <w:rStyle w:val="Hyperlink"/>
@@ -44119,8 +45555,8 @@
         <w:t xml:space="preserve">and are worth writing as enforcement of rules that are also stated somewhere portable.</w:t>
       </w:r>
     </w:p>
-    <w:bookmarkEnd w:id="303"/>
-    <w:bookmarkStart w:id="304" w:name="a-worked-example"/>
+    <w:bookmarkEnd w:id="308"/>
+    <w:bookmarkStart w:id="309" w:name="a-worked-example"/>
     <w:p>
       <w:pPr>
         <w:pStyle w:val="Heading4"/>
@@ -44139,7 +45575,7 @@
       <w:r>
         <w:t xml:space="preserve"> </w:t>
       </w:r>
-      <w:hyperlink r:id="rId277">
+      <w:hyperlink r:id="rId282">
         <w:r>
           <w:rPr>
             <w:rStyle w:val="VerbatimChar"/>
@@ -44395,9 +45831,9 @@
         <w:t xml:space="preserve">globs attach them only when you edit a matching file.</w:t>
       </w:r>
     </w:p>
-    <w:bookmarkEnd w:id="304"/>
-    <w:bookmarkEnd w:id="305"/>
-    <w:bookmarkStart w:id="310" w:name="sec-ai-config-install"/>
+    <w:bookmarkEnd w:id="309"/>
+    <w:bookmarkEnd w:id="310"/>
+    <w:bookmarkStart w:id="315" w:name="sec-ai-config-install"/>
     <w:p>
       <w:pPr>
         <w:pStyle w:val="Heading1"/>
@@ -44503,7 +45939,7 @@
         <w:t xml:space="preserve">and a capability simply goes missing with no message that it existed.</w:t>
       </w:r>
     </w:p>
-    <w:bookmarkStart w:id="306" w:name="X09c076bdbd05e35ade785c409b9eb4387af137d"/>
+    <w:bookmarkStart w:id="311" w:name="X09c076bdbd05e35ade785c409b9eb4387af137d"/>
     <w:p>
       <w:pPr>
         <w:pStyle w:val="Heading4"/>
@@ -44737,8 +46173,8 @@
         <w:t xml:space="preserve">Pick one path.</w:t>
       </w:r>
     </w:p>
-    <w:bookmarkEnd w:id="306"/>
-    <w:bookmarkStart w:id="307" w:name="the-.claude-layout"/>
+    <w:bookmarkEnd w:id="311"/>
+    <w:bookmarkStart w:id="312" w:name="the-.claude-layout"/>
     <w:p>
       <w:pPr>
         <w:pStyle w:val="Heading4"/>
@@ -44983,8 +46419,8 @@
         <w:t xml:space="preserve">So verify both, and read the two results separately.</w:t>
       </w:r>
     </w:p>
-    <w:bookmarkEnd w:id="307"/>
-    <w:bookmarkStart w:id="308" w:name="one-plugin-per-capability"/>
+    <w:bookmarkEnd w:id="312"/>
+    <w:bookmarkStart w:id="313" w:name="one-plugin-per-capability"/>
     <w:p>
       <w:pPr>
         <w:pStyle w:val="Heading4"/>
@@ -45077,8 +46513,8 @@
         <w:t xml:space="preserve">Keep one copy enabled.</w:t>
       </w:r>
     </w:p>
-    <w:bookmarkEnd w:id="308"/>
-    <w:bookmarkStart w:id="309" w:name="failure-modes-and-their-symptoms"/>
+    <w:bookmarkEnd w:id="313"/>
+    <w:bookmarkStart w:id="314" w:name="failure-modes-and-their-symptoms"/>
     <w:p>
       <w:pPr>
         <w:pStyle w:val="Heading4"/>
@@ -45323,9 +46759,9 @@
         <w:t xml:space="preserve">suspect the install before you suspect the rule.</w:t>
       </w:r>
     </w:p>
-    <w:bookmarkEnd w:id="309"/>
-    <w:bookmarkEnd w:id="310"/>
-    <w:bookmarkStart w:id="317" w:name="sec-ai-claude-cloud-env"/>
+    <w:bookmarkEnd w:id="314"/>
+    <w:bookmarkEnd w:id="315"/>
+    <w:bookmarkStart w:id="322" w:name="sec-ai-claude-cloud-env"/>
     <w:p>
       <w:pPr>
         <w:pStyle w:val="Heading1"/>
@@ -45367,7 +46803,7 @@
       <w:r>
         <w:t xml:space="preserve"> </w:t>
       </w:r>
-      <w:hyperlink r:id="rId311">
+      <w:hyperlink r:id="rId316">
         <w:r>
           <w:rPr>
             <w:rStyle w:val="Hyperlink"/>
@@ -45565,7 +47001,7 @@
         <w:t xml:space="preserve">for example to install dependencies.</w:t>
       </w:r>
     </w:p>
-    <w:bookmarkStart w:id="316" w:name="X99b85cd9c84d17a9c31061ff898ea0b26b46932"/>
+    <w:bookmarkStart w:id="321" w:name="X99b85cd9c84d17a9c31061ff898ea0b26b46932"/>
     <w:p>
       <w:pPr>
         <w:pStyle w:val="Heading4"/>
@@ -45726,7 +47162,7 @@
       <w:r>
         <w:t xml:space="preserve"> </w:t>
       </w:r>
-      <w:hyperlink r:id="rId311">
+      <w:hyperlink r:id="rId316">
         <w:r>
           <w:rPr>
             <w:rStyle w:val="Hyperlink"/>
@@ -45821,12 +47257,12 @@
                 <wp:inline>
                   <wp:extent cx="152400" cy="152400"/>
                   <wp:effectExtent b="0" l="0" r="0" t="0"/>
-                  <wp:docPr descr="" title="" id="312" name="Picture"/>
+                  <wp:docPr descr="" title="" id="317" name="Picture"/>
                   <a:graphic>
                     <a:graphicData uri="http://schemas.openxmlformats.org/drawingml/2006/picture">
                       <pic:pic>
                         <pic:nvPicPr>
-                          <pic:cNvPr descr="/opt/quarto/share/formats/docx/note.png" id="313" name="Picture"/>
+                          <pic:cNvPr descr="/opt/quarto/share/formats/docx/note.png" id="318" name="Picture"/>
                           <pic:cNvPicPr>
                             <a:picLocks noChangeArrowheads="1" noChangeAspect="1"/>
                           </pic:cNvPicPr>
@@ -45942,7 +47378,7 @@
       <w:r>
         <w:t xml:space="preserve"> </w:t>
       </w:r>
-      <w:hyperlink r:id="rId314">
+      <w:hyperlink r:id="rId319">
         <w:r>
           <w:rPr>
             <w:rStyle w:val="Hyperlink"/>
@@ -45959,7 +47395,7 @@
       <w:r>
         <w:t xml:space="preserve"> </w:t>
       </w:r>
-      <w:hyperlink r:id="rId315">
+      <w:hyperlink r:id="rId320">
         <w:r>
           <w:rPr>
             <w:rStyle w:val="Hyperlink"/>
@@ -45971,9 +47407,9 @@
         <w:t xml:space="preserve">.</w:t>
       </w:r>
     </w:p>
-    <w:bookmarkEnd w:id="316"/>
-    <w:bookmarkEnd w:id="317"/>
-    <w:bookmarkStart w:id="327" w:name="sec-ai-pr-activity-notifications"/>
+    <w:bookmarkEnd w:id="321"/>
+    <w:bookmarkEnd w:id="322"/>
+    <w:bookmarkStart w:id="332" w:name="sec-ai-pr-activity-notifications"/>
     <w:p>
       <w:pPr>
         <w:pStyle w:val="Heading1"/>
@@ -46317,7 +47753,7 @@
         </w:tc>
       </w:tr>
     </w:tbl>
-    <w:bookmarkStart w:id="318" w:name="the-channel-an-agent-controls"/>
+    <w:bookmarkStart w:id="323" w:name="the-channel-an-agent-controls"/>
     <w:p>
       <w:pPr>
         <w:pStyle w:val="Heading4"/>
@@ -46591,8 +48027,8 @@
         <w:t xml:space="preserve">real state, not a replacement for it.</w:t>
       </w:r>
     </w:p>
-    <w:bookmarkEnd w:id="318"/>
-    <w:bookmarkStart w:id="319" w:name="the-channel-only-a-human-controls"/>
+    <w:bookmarkEnd w:id="323"/>
+    <w:bookmarkStart w:id="324" w:name="the-channel-only-a-human-controls"/>
     <w:p>
       <w:pPr>
         <w:pStyle w:val="Heading4"/>
@@ -46895,8 +48331,8 @@
         <w:t xml:space="preserve">for the web-session context these run in.</w:t>
       </w:r>
     </w:p>
-    <w:bookmarkEnd w:id="319"/>
-    <w:bookmarkStart w:id="320" w:name="the-instruction-template-is-boilerplate"/>
+    <w:bookmarkEnd w:id="324"/>
+    <w:bookmarkStart w:id="325" w:name="the-instruction-template-is-boilerplate"/>
     <w:p>
       <w:pPr>
         <w:pStyle w:val="Heading4"/>
@@ -47162,8 +48598,8 @@
         <w:t xml:space="preserve">rather than as an instruction that a fix is owed.</w:t>
       </w:r>
     </w:p>
-    <w:bookmarkEnd w:id="320"/>
-    <w:bookmarkStart w:id="321" w:name="X3e28e99804e56791cb9e57e9eb83869f0ead0b2"/>
+    <w:bookmarkEnd w:id="325"/>
+    <w:bookmarkStart w:id="326" w:name="X3e28e99804e56791cb9e57e9eb83869f0ead0b2"/>
     <w:p>
       <w:pPr>
         <w:pStyle w:val="Heading4"/>
@@ -47292,8 +48728,8 @@
         <w:t xml:space="preserve">Toggling one says nothing about the other.</w:t>
       </w:r>
     </w:p>
-    <w:bookmarkEnd w:id="321"/>
-    <w:bookmarkStart w:id="326" w:name="treat-what-arrives-as-untrusted"/>
+    <w:bookmarkEnd w:id="326"/>
+    <w:bookmarkStart w:id="331" w:name="treat-what-arrives-as-untrusted"/>
     <w:p>
       <w:pPr>
         <w:pStyle w:val="Heading4"/>
@@ -47662,12 +49098,12 @@
                 <wp:inline>
                   <wp:extent cx="152400" cy="152400"/>
                   <wp:effectExtent b="0" l="0" r="0" t="0"/>
-                  <wp:docPr descr="" title="" id="322" name="Picture"/>
+                  <wp:docPr descr="" title="" id="327" name="Picture"/>
                   <a:graphic>
                     <a:graphicData uri="http://schemas.openxmlformats.org/drawingml/2006/picture">
                       <pic:pic>
                         <pic:nvPicPr>
-                          <pic:cNvPr descr="/opt/quarto/share/formats/docx/warning.png" id="323" name="Picture"/>
+                          <pic:cNvPr descr="/opt/quarto/share/formats/docx/warning.png" id="328" name="Picture"/>
                           <pic:cNvPicPr>
                             <a:picLocks noChangeArrowheads="1" noChangeAspect="1"/>
                           </pic:cNvPicPr>
@@ -47838,12 +49274,12 @@
                 <wp:inline>
                   <wp:extent cx="152400" cy="152400"/>
                   <wp:effectExtent b="0" l="0" r="0" t="0"/>
-                  <wp:docPr descr="" title="" id="324" name="Picture"/>
+                  <wp:docPr descr="" title="" id="329" name="Picture"/>
                   <a:graphic>
                     <a:graphicData uri="http://schemas.openxmlformats.org/drawingml/2006/picture">
                       <pic:pic>
                         <pic:nvPicPr>
-                          <pic:cNvPr descr="/opt/quarto/share/formats/docx/note.png" id="325" name="Picture"/>
+                          <pic:cNvPr descr="/opt/quarto/share/formats/docx/note.png" id="330" name="Picture"/>
                           <pic:cNvPicPr>
                             <a:picLocks noChangeArrowheads="1" noChangeAspect="1"/>
                           </pic:cNvPicPr>
@@ -47949,9 +49385,9 @@
         </w:tc>
       </w:tr>
     </w:tbl>
-    <w:bookmarkEnd w:id="326"/>
-    <w:bookmarkEnd w:id="327"/>
-    <w:bookmarkStart w:id="331" w:name="sec-ai-when-to-use"/>
+    <w:bookmarkEnd w:id="331"/>
+    <w:bookmarkEnd w:id="332"/>
+    <w:bookmarkStart w:id="336" w:name="sec-ai-when-to-use"/>
     <w:p>
       <w:pPr>
         <w:pStyle w:val="Heading1"/>
@@ -47971,7 +49407,7 @@
         <w:rPr>
           <w:rStyle w:val="FootnoteReference"/>
         </w:rPr>
-        <w:footnoteReference w:id="328"/>
+        <w:footnoteReference w:id="333"/>
       </w:r>
       <w:r>
         <w:t xml:space="preserve"> </w:t>
@@ -48003,7 +49439,7 @@
       <w:r>
         <w:t xml:space="preserve"> </w:t>
       </w:r>
-      <w:hyperlink r:id="rId329">
+      <w:hyperlink r:id="rId334">
         <w:r>
           <w:rPr>
             <w:rStyle w:val="Hyperlink"/>
@@ -48062,7 +49498,7 @@
       <w:r>
         <w:t xml:space="preserve"> </w:t>
       </w:r>
-      <w:hyperlink r:id="rId330">
+      <w:hyperlink r:id="rId335">
         <w:r>
           <w:rPr>
             <w:rStyle w:val="Hyperlink"/>
@@ -48181,8 +49617,8 @@
         <w:t xml:space="preserve">just like you would for any other skill you want to maintain.</w:t>
       </w:r>
     </w:p>
-    <w:bookmarkEnd w:id="331"/>
-    <w:bookmarkStart w:id="336" w:name="editing-with-.docx-files"/>
+    <w:bookmarkEnd w:id="336"/>
+    <w:bookmarkStart w:id="341" w:name="editing-with-.docx-files"/>
     <w:p>
       <w:pPr>
         <w:pStyle w:val="Heading1"/>
@@ -48362,7 +49798,7 @@
         <w:t xml:space="preserve">This approach makes it easier for collaborators who are more comfortable with Word to contribute while maintaining the source files in Quarto format.</w:t>
       </w:r>
     </w:p>
-    <w:bookmarkStart w:id="335" w:name="known-issue-document-1-warning-in-word"/>
+    <w:bookmarkStart w:id="340" w:name="known-issue-document-1-warning-in-word"/>
     <w:p>
       <w:pPr>
         <w:pStyle w:val="Heading4"/>
@@ -48447,7 +49883,7 @@
           <w:numId w:val="1136"/>
         </w:numPr>
       </w:pPr>
-      <w:hyperlink r:id="rId332">
+      <w:hyperlink r:id="rId337">
         <w:r>
           <w:rPr>
             <w:rStyle w:val="Hyperlink"/>
@@ -48464,7 +49900,7 @@
           <w:numId w:val="1136"/>
         </w:numPr>
       </w:pPr>
-      <w:hyperlink r:id="rId333">
+      <w:hyperlink r:id="rId338">
         <w:r>
           <w:rPr>
             <w:rStyle w:val="Hyperlink"/>
@@ -48481,7 +49917,7 @@
           <w:numId w:val="1136"/>
         </w:numPr>
       </w:pPr>
-      <w:hyperlink r:id="rId334">
+      <w:hyperlink r:id="rId339">
         <w:r>
           <w:rPr>
             <w:rStyle w:val="Hyperlink"/>
@@ -48594,9 +50030,9 @@
         <w:t xml:space="preserve">warning and can immediately add comments and track changes without issues.</w:t>
       </w:r>
     </w:p>
-    <w:bookmarkEnd w:id="335"/>
-    <w:bookmarkEnd w:id="336"/>
-    <w:bookmarkStart w:id="338" w:name="copilot-instructions-for-this-repository"/>
+    <w:bookmarkEnd w:id="340"/>
+    <w:bookmarkEnd w:id="341"/>
+    <w:bookmarkStart w:id="343" w:name="copilot-instructions-for-this-repository"/>
     <w:p>
       <w:pPr>
         <w:pStyle w:val="Heading1"/>
@@ -48828,7 +50264,7 @@
       <w:r>
         <w:t xml:space="preserve"> </w:t>
       </w:r>
-      <w:hyperlink r:id="rId337">
+      <w:hyperlink r:id="rId342">
         <w:r>
           <w:rPr>
             <w:rStyle w:val="VerbatimChar"/>
@@ -48843,8 +50279,8 @@
         <w:t xml:space="preserve">for a working example.</w:t>
       </w:r>
     </w:p>
-    <w:bookmarkEnd w:id="338"/>
-    <w:bookmarkStart w:id="339" w:name="using-copilot-review-before-human-review"/>
+    <w:bookmarkEnd w:id="343"/>
+    <w:bookmarkStart w:id="344" w:name="using-copilot-review-before-human-review"/>
     <w:p>
       <w:pPr>
         <w:pStyle w:val="Heading1"/>
@@ -49430,8 +50866,8 @@
         <w:t xml:space="preserve">This ensures you’re reviewing code that has already been through initial automated quality checks.</w:t>
       </w:r>
     </w:p>
-    <w:bookmarkEnd w:id="339"/>
-    <w:bookmarkStart w:id="341" w:name="reviewing-a-copilot-pr-you-didnt-create"/>
+    <w:bookmarkEnd w:id="344"/>
+    <w:bookmarkStart w:id="346" w:name="reviewing-a-copilot-pr-you-didnt-create"/>
     <w:p>
       <w:pPr>
         <w:pStyle w:val="Heading1"/>
@@ -49482,7 +50918,7 @@
       <w:r>
         <w:t xml:space="preserve"> </w:t>
       </w:r>
-      <w:hyperlink r:id="rId340">
+      <w:hyperlink r:id="rId345">
         <w:r>
           <w:rPr>
             <w:rStyle w:val="Hyperlink"/>
@@ -50386,8 +51822,8 @@
         <w:t xml:space="preserve">while benefiting from collaborative human review and Copilot’s implementation capabilities.</w:t>
       </w:r>
     </w:p>
-    <w:bookmarkEnd w:id="341"/>
-    <w:bookmarkStart w:id="360" w:name="sec-ai-claude-code-windows"/>
+    <w:bookmarkEnd w:id="346"/>
+    <w:bookmarkStart w:id="365" w:name="sec-ai-claude-code-windows"/>
     <w:p>
       <w:pPr>
         <w:pStyle w:val="Heading1"/>
@@ -50486,12 +51922,12 @@
                 <wp:inline>
                   <wp:extent cx="152400" cy="152400"/>
                   <wp:effectExtent b="0" l="0" r="0" t="0"/>
-                  <wp:docPr descr="" title="" id="342" name="Picture"/>
+                  <wp:docPr descr="" title="" id="347" name="Picture"/>
                   <a:graphic>
                     <a:graphicData uri="http://schemas.openxmlformats.org/drawingml/2006/picture">
                       <pic:pic>
                         <pic:nvPicPr>
-                          <pic:cNvPr descr="/opt/quarto/share/formats/docx/note.png" id="343" name="Picture"/>
+                          <pic:cNvPr descr="/opt/quarto/share/formats/docx/note.png" id="348" name="Picture"/>
                           <pic:cNvPicPr>
                             <a:picLocks noChangeArrowheads="1" noChangeAspect="1"/>
                           </pic:cNvPicPr>
@@ -50579,7 +52015,7 @@
         </w:tc>
       </w:tr>
     </w:tbl>
-    <w:bookmarkStart w:id="346" w:name="run-it-from-a-unix-like-terminal"/>
+    <w:bookmarkStart w:id="351" w:name="run-it-from-a-unix-like-terminal"/>
     <w:p>
       <w:pPr>
         <w:pStyle w:val="Heading4"/>
@@ -50626,7 +52062,7 @@
       <w:r>
         <w:t xml:space="preserve"> </w:t>
       </w:r>
-      <w:hyperlink r:id="rId344">
+      <w:hyperlink r:id="rId349">
         <w:r>
           <w:rPr>
             <w:rStyle w:val="Hyperlink"/>
@@ -50659,7 +52095,7 @@
       <w:r>
         <w:t xml:space="preserve">(</w:t>
       </w:r>
-      <w:hyperlink r:id="rId345">
+      <w:hyperlink r:id="rId350">
         <w:r>
           <w:rPr>
             <w:rStyle w:val="Hyperlink"/>
@@ -50810,8 +52246,8 @@
         <w:t xml:space="preserve">gotchas below don’t apply.</w:t>
       </w:r>
     </w:p>
-    <w:bookmarkEnd w:id="346"/>
-    <w:bookmarkStart w:id="351" w:name="install-claude-code"/>
+    <w:bookmarkEnd w:id="351"/>
+    <w:bookmarkStart w:id="356" w:name="install-claude-code"/>
     <w:p>
       <w:pPr>
         <w:pStyle w:val="Heading4"/>
@@ -50976,7 +52412,7 @@
       <w:r>
         <w:t xml:space="preserve"> </w:t>
       </w:r>
-      <w:hyperlink r:id="rId347">
+      <w:hyperlink r:id="rId352">
         <w:r>
           <w:rPr>
             <w:rStyle w:val="Hyperlink"/>
@@ -51062,12 +52498,12 @@
                 <wp:inline>
                   <wp:extent cx="152400" cy="152400"/>
                   <wp:effectExtent b="0" l="0" r="0" t="0"/>
-                  <wp:docPr descr="" title="" id="348" name="Picture"/>
+                  <wp:docPr descr="" title="" id="353" name="Picture"/>
                   <a:graphic>
                     <a:graphicData uri="http://schemas.openxmlformats.org/drawingml/2006/picture">
                       <pic:pic>
                         <pic:nvPicPr>
-                          <pic:cNvPr descr="/opt/quarto/share/formats/docx/important.png" id="349" name="Picture"/>
+                          <pic:cNvPr descr="/opt/quarto/share/formats/docx/important.png" id="354" name="Picture"/>
                           <pic:cNvPicPr>
                             <a:picLocks noChangeArrowheads="1" noChangeAspect="1"/>
                           </pic:cNvPicPr>
@@ -51223,7 +52659,7 @@
             <w:r>
               <w:t xml:space="preserve"> </w:t>
             </w:r>
-            <w:hyperlink r:id="rId350">
+            <w:hyperlink r:id="rId355">
               <w:r>
                 <w:rPr>
                   <w:rStyle w:val="Hyperlink"/>
@@ -51314,8 +52750,8 @@
         </w:tc>
       </w:tr>
     </w:tbl>
-    <w:bookmarkEnd w:id="351"/>
-    <w:bookmarkStart w:id="353" w:name="make-sure-your-shell-can-find-claude"/>
+    <w:bookmarkEnd w:id="356"/>
+    <w:bookmarkStart w:id="358" w:name="make-sure-your-shell-can-find-claude"/>
     <w:p>
       <w:pPr>
         <w:pStyle w:val="Heading4"/>
@@ -51913,7 +53349,7 @@
       <w:r>
         <w:t xml:space="preserve"> </w:t>
       </w:r>
-      <w:hyperlink r:id="rId352">
+      <w:hyperlink r:id="rId357">
         <w:r>
           <w:rPr>
             <w:rStyle w:val="Hyperlink"/>
@@ -52019,8 +53455,8 @@
         <w:t xml:space="preserve">initializes).</w:t>
       </w:r>
     </w:p>
-    <w:bookmarkEnd w:id="353"/>
-    <w:bookmarkStart w:id="356" w:name="X604325b0223e79803e04f87e7874b1d7f4a0663"/>
+    <w:bookmarkEnd w:id="358"/>
+    <w:bookmarkStart w:id="361" w:name="X604325b0223e79803e04f87e7874b1d7f4a0663"/>
     <w:p>
       <w:pPr>
         <w:pStyle w:val="Heading4"/>
@@ -52070,12 +53506,12 @@
                 <wp:inline>
                   <wp:extent cx="152400" cy="152400"/>
                   <wp:effectExtent b="0" l="0" r="0" t="0"/>
-                  <wp:docPr descr="" title="" id="354" name="Picture"/>
+                  <wp:docPr descr="" title="" id="359" name="Picture"/>
                   <a:graphic>
                     <a:graphicData uri="http://schemas.openxmlformats.org/drawingml/2006/picture">
                       <pic:pic>
                         <pic:nvPicPr>
-                          <pic:cNvPr descr="/opt/quarto/share/formats/docx/warning.png" id="355" name="Picture"/>
+                          <pic:cNvPr descr="/opt/quarto/share/formats/docx/warning.png" id="360" name="Picture"/>
                           <pic:cNvPicPr>
                             <a:picLocks noChangeArrowheads="1" noChangeAspect="1"/>
                           </pic:cNvPicPr>
@@ -52343,8 +53779,8 @@
         </w:tc>
       </w:tr>
     </w:tbl>
-    <w:bookmarkEnd w:id="356"/>
-    <w:bookmarkStart w:id="358" w:name="X1745fd502df7963ed7ce48d0465493b4d59ad92"/>
+    <w:bookmarkEnd w:id="361"/>
+    <w:bookmarkStart w:id="363" w:name="X1745fd502df7963ed7ce48d0465493b4d59ad92"/>
     <w:p>
       <w:pPr>
         <w:pStyle w:val="Heading4"/>
@@ -52363,7 +53799,7 @@
       <w:r>
         <w:t xml:space="preserve"> </w:t>
       </w:r>
-      <w:hyperlink r:id="rId357">
+      <w:hyperlink r:id="rId362">
         <w:r>
           <w:rPr>
             <w:rStyle w:val="Hyperlink"/>
@@ -52524,8 +53960,8 @@
         <w:t xml:space="preserve">.</w:t>
       </w:r>
     </w:p>
-    <w:bookmarkEnd w:id="358"/>
-    <w:bookmarkStart w:id="359" w:name="verify-the-install"/>
+    <w:bookmarkEnd w:id="363"/>
+    <w:bookmarkStart w:id="364" w:name="verify-the-install"/>
     <w:p>
       <w:pPr>
         <w:pStyle w:val="Heading4"/>
@@ -52694,9 +54130,9 @@
         <w:t xml:space="preserve">(or open a fresh window) after changing it.</w:t>
       </w:r>
     </w:p>
-    <w:bookmarkEnd w:id="359"/>
-    <w:bookmarkEnd w:id="360"/>
-    <w:bookmarkStart w:id="374" w:name="sec-ai-mcp-server-setup"/>
+    <w:bookmarkEnd w:id="364"/>
+    <w:bookmarkEnd w:id="365"/>
+    <w:bookmarkStart w:id="379" w:name="sec-ai-mcp-server-setup"/>
     <w:p>
       <w:pPr>
         <w:pStyle w:val="Heading1"/>
@@ -52817,12 +54253,12 @@
                 <wp:inline>
                   <wp:extent cx="152400" cy="152400"/>
                   <wp:effectExtent b="0" l="0" r="0" t="0"/>
-                  <wp:docPr descr="" title="" id="361" name="Picture"/>
+                  <wp:docPr descr="" title="" id="366" name="Picture"/>
                   <a:graphic>
                     <a:graphicData uri="http://schemas.openxmlformats.org/drawingml/2006/picture">
                       <pic:pic>
                         <pic:nvPicPr>
-                          <pic:cNvPr descr="/opt/quarto/share/formats/docx/note.png" id="362" name="Picture"/>
+                          <pic:cNvPr descr="/opt/quarto/share/formats/docx/note.png" id="367" name="Picture"/>
                           <pic:cNvPicPr>
                             <a:picLocks noChangeArrowheads="1" noChangeAspect="1"/>
                           </pic:cNvPicPr>
@@ -52916,7 +54352,7 @@
         </w:tc>
       </w:tr>
     </w:tbl>
-    <w:bookmarkStart w:id="364" w:name="installed-is-not-registered"/>
+    <w:bookmarkStart w:id="369" w:name="installed-is-not-registered"/>
     <w:p>
       <w:pPr>
         <w:pStyle w:val="Heading4"/>
@@ -52947,7 +54383,7 @@
       <w:r>
         <w:t xml:space="preserve"> </w:t>
       </w:r>
-      <w:hyperlink r:id="rId363">
+      <w:hyperlink r:id="rId368">
         <w:r>
           <w:rPr>
             <w:rStyle w:val="VerbatimChar"/>
@@ -53015,8 +54451,8 @@
         <w:t xml:space="preserve"> mcp list</w:t>
       </w:r>
     </w:p>
-    <w:bookmarkEnd w:id="364"/>
-    <w:bookmarkStart w:id="365" w:name="Xf6682145328c756d2e167d2c91be34f7f913a7f"/>
+    <w:bookmarkEnd w:id="369"/>
+    <w:bookmarkStart w:id="370" w:name="Xf6682145328c756d2e167d2c91be34f7f913a7f"/>
     <w:p>
       <w:pPr>
         <w:pStyle w:val="Heading4"/>
@@ -53215,8 +54651,8 @@
         <w:t xml:space="preserve">A local one shows a command path instead.</w:t>
       </w:r>
     </w:p>
-    <w:bookmarkEnd w:id="365"/>
-    <w:bookmarkStart w:id="366" w:name="and-401-mean-different-things"/>
+    <w:bookmarkEnd w:id="370"/>
+    <w:bookmarkStart w:id="371" w:name="and-401-mean-different-things"/>
     <w:p>
       <w:pPr>
         <w:pStyle w:val="Heading4"/>
@@ -53459,8 +54895,8 @@
         <w:t xml:space="preserve">sends you to the token-minting page for a problem that lives in a config file.</w:t>
       </w:r>
     </w:p>
-    <w:bookmarkEnd w:id="366"/>
-    <w:bookmarkStart w:id="367" w:name="install-the-binary-the-platforms-own-way"/>
+    <w:bookmarkEnd w:id="371"/>
+    <w:bookmarkStart w:id="372" w:name="install-the-binary-the-platforms-own-way"/>
     <w:p>
       <w:pPr>
         <w:pStyle w:val="Heading4"/>
@@ -53714,8 +55150,8 @@
         <w:t xml:space="preserve">with an override for the case where it isn’t on one.</w:t>
       </w:r>
     </w:p>
-    <w:bookmarkEnd w:id="367"/>
-    <w:bookmarkStart w:id="368" w:name="X2adb24e9b1a0644f0fbebe685525dadd8a56387"/>
+    <w:bookmarkEnd w:id="372"/>
+    <w:bookmarkStart w:id="373" w:name="X2adb24e9b1a0644f0fbebe685525dadd8a56387"/>
     <w:p>
       <w:pPr>
         <w:pStyle w:val="Heading4"/>
@@ -54592,8 +56028,8 @@
         <w:t xml:space="preserve">bug you just finished diagnosing.</w:t>
       </w:r>
     </w:p>
-    <w:bookmarkEnd w:id="368"/>
-    <w:bookmarkStart w:id="369" w:name="X448547516ab06679b064b391b05a896db41ea57"/>
+    <w:bookmarkEnd w:id="373"/>
+    <w:bookmarkStart w:id="374" w:name="X448547516ab06679b064b391b05a896db41ea57"/>
     <w:p>
       <w:pPr>
         <w:pStyle w:val="Heading4"/>
@@ -54915,8 +56351,8 @@
         <w:t xml:space="preserve">the count moving the right direction, as the check above expects.</w:t>
       </w:r>
     </w:p>
-    <w:bookmarkEnd w:id="369"/>
-    <w:bookmarkStart w:id="370" w:name="X4a4c9992603eee0123b58b5b37e7fedbb817150"/>
+    <w:bookmarkEnd w:id="374"/>
+    <w:bookmarkStart w:id="375" w:name="X4a4c9992603eee0123b58b5b37e7fedbb817150"/>
     <w:p>
       <w:pPr>
         <w:pStyle w:val="Heading4"/>
@@ -55016,8 +56452,8 @@
         <w:t xml:space="preserve">Reach for those instead when working from a local harness.</w:t>
       </w:r>
     </w:p>
-    <w:bookmarkEnd w:id="370"/>
-    <w:bookmarkStart w:id="371" w:name="Xb256c2a3c0a422f2f687a98903d3521fd60a1b1"/>
+    <w:bookmarkEnd w:id="375"/>
+    <w:bookmarkStart w:id="376" w:name="Xb256c2a3c0a422f2f687a98903d3521fd60a1b1"/>
     <w:p>
       <w:pPr>
         <w:pStyle w:val="Heading4"/>
@@ -55193,8 +56629,8 @@
         <w:t xml:space="preserve">not something an agent does in passing.</w:t>
       </w:r>
     </w:p>
-    <w:bookmarkEnd w:id="371"/>
-    <w:bookmarkStart w:id="373" w:name="Xd44df015462fcf288556a538677f0a762c9ef1d"/>
+    <w:bookmarkEnd w:id="376"/>
+    <w:bookmarkStart w:id="378" w:name="Xd44df015462fcf288556a538677f0a762c9ef1d"/>
     <w:p>
       <w:pPr>
         <w:pStyle w:val="Heading4"/>
@@ -55308,7 +56744,7 @@
       <w:r>
         <w:t xml:space="preserve"> </w:t>
       </w:r>
-      <w:hyperlink r:id="rId372">
+      <w:hyperlink r:id="rId377">
         <w:r>
           <w:rPr>
             <w:rStyle w:val="Hyperlink"/>
@@ -55491,9 +56927,9 @@
         <w:t xml:space="preserve">and expect it to work.</w:t>
       </w:r>
     </w:p>
-    <w:bookmarkEnd w:id="373"/>
-    <w:bookmarkEnd w:id="374"/>
-    <w:bookmarkStart w:id="382" w:name="sec-ai-gemini-spend-management"/>
+    <w:bookmarkEnd w:id="378"/>
+    <w:bookmarkEnd w:id="379"/>
+    <w:bookmarkStart w:id="387" w:name="sec-ai-gemini-spend-management"/>
     <w:p>
       <w:pPr>
         <w:pStyle w:val="Heading1"/>
@@ -55522,7 +56958,7 @@
         <w:t xml:space="preserve">and optimize token consumption across local tools and GitHub Actions workflows.</w:t>
       </w:r>
     </w:p>
-    <w:bookmarkStart w:id="376" w:name="Xd8c10be17edf039db5b664720f228274181ba18"/>
+    <w:bookmarkStart w:id="381" w:name="Xd8c10be17edf039db5b664720f228274181ba18"/>
     <w:p>
       <w:pPr>
         <w:pStyle w:val="Heading4"/>
@@ -55586,7 +57022,7 @@
       <w:r>
         <w:t xml:space="preserve"> </w:t>
       </w:r>
-      <w:hyperlink r:id="rId375">
+      <w:hyperlink r:id="rId380">
         <w:r>
           <w:rPr>
             <w:rStyle w:val="Hyperlink"/>
@@ -55681,7 +57117,7 @@
       <w:r>
         <w:t xml:space="preserve"> </w:t>
       </w:r>
-      <w:hyperlink r:id="rId375">
+      <w:hyperlink r:id="rId380">
         <w:r>
           <w:rPr>
             <w:rStyle w:val="Hyperlink"/>
@@ -55717,8 +57153,8 @@
         <w:t xml:space="preserve">Any project that has hit its monthly spend cap will have its API requests paused until the limit is updated.</w:t>
       </w:r>
     </w:p>
-    <w:bookmarkEnd w:id="376"/>
-    <w:bookmarkStart w:id="378" w:name="adjusting-and-unpausing-spend-caps"/>
+    <w:bookmarkEnd w:id="381"/>
+    <w:bookmarkStart w:id="383" w:name="adjusting-and-unpausing-spend-caps"/>
     <w:p>
       <w:pPr>
         <w:pStyle w:val="Heading4"/>
@@ -55749,7 +57185,7 @@
       <w:r>
         <w:t xml:space="preserve"> </w:t>
       </w:r>
-      <w:hyperlink r:id="rId377">
+      <w:hyperlink r:id="rId382">
         <w:r>
           <w:rPr>
             <w:rStyle w:val="Hyperlink"/>
@@ -55818,8 +57254,8 @@
         <w:t xml:space="preserve">and API service automatically resumes up to the configured cap.</w:t>
       </w:r>
     </w:p>
-    <w:bookmarkEnd w:id="378"/>
-    <w:bookmarkStart w:id="380" w:name="setting-up-google-cloud-budget-alerts"/>
+    <w:bookmarkEnd w:id="383"/>
+    <w:bookmarkStart w:id="385" w:name="setting-up-google-cloud-budget-alerts"/>
     <w:p>
       <w:pPr>
         <w:pStyle w:val="Heading4"/>
@@ -55850,7 +57286,7 @@
       <w:r>
         <w:t xml:space="preserve"> </w:t>
       </w:r>
-      <w:hyperlink r:id="rId379">
+      <w:hyperlink r:id="rId384">
         <w:r>
           <w:rPr>
             <w:rStyle w:val="Hyperlink"/>
@@ -56002,8 +57438,8 @@
         <w:t xml:space="preserve">. You will receive email alerts before any project hits its spend cap.</w:t>
       </w:r>
     </w:p>
-    <w:bookmarkEnd w:id="380"/>
-    <w:bookmarkStart w:id="381" w:name="cost-optimization-best-practices"/>
+    <w:bookmarkEnd w:id="385"/>
+    <w:bookmarkStart w:id="386" w:name="cost-optimization-best-practices"/>
     <w:p>
       <w:pPr>
         <w:pStyle w:val="Heading4"/>
@@ -56318,9 +57754,9 @@
         <w:t xml:space="preserve">to collapse them in GitHub’s web diff view and exclude them from repository language statistics.</w:t>
       </w:r>
     </w:p>
-    <w:bookmarkEnd w:id="381"/>
-    <w:bookmarkEnd w:id="382"/>
-    <w:bookmarkStart w:id="412" w:name="references"/>
+    <w:bookmarkEnd w:id="386"/>
+    <w:bookmarkEnd w:id="387"/>
+    <w:bookmarkStart w:id="417" w:name="references"/>
     <w:p>
       <w:pPr>
         <w:pStyle w:val="Heading1"/>
@@ -56329,8 +57765,8 @@
         <w:t xml:space="preserve">References</w:t>
       </w:r>
     </w:p>
-    <w:bookmarkStart w:id="411" w:name="refs"/>
-    <w:bookmarkStart w:id="384" w:name="ref-space_odyssey"/>
+    <w:bookmarkStart w:id="416" w:name="refs"/>
+    <w:bookmarkStart w:id="389" w:name="ref-space_odyssey"/>
     <w:p>
       <w:pPr>
         <w:pStyle w:val="Bibliography"/>
@@ -56348,7 +57784,7 @@
       <w:r>
         <w:t xml:space="preserve"> </w:t>
       </w:r>
-      <w:hyperlink r:id="rId383">
+      <w:hyperlink r:id="rId388">
         <w:r>
           <w:rPr>
             <w:rStyle w:val="Hyperlink"/>
@@ -56360,8 +57796,8 @@
         <w:t xml:space="preserve">.</w:t>
       </w:r>
     </w:p>
-    <w:bookmarkEnd w:id="384"/>
-    <w:bookmarkStart w:id="386" w:name="ref-i_robot"/>
+    <w:bookmarkEnd w:id="389"/>
+    <w:bookmarkStart w:id="391" w:name="ref-i_robot"/>
     <w:p>
       <w:pPr>
         <w:pStyle w:val="Bibliography"/>
@@ -56385,7 +57821,7 @@
       <w:r>
         <w:t xml:space="preserve"> </w:t>
       </w:r>
-      <w:hyperlink r:id="rId385">
+      <w:hyperlink r:id="rId390">
         <w:r>
           <w:rPr>
             <w:rStyle w:val="Hyperlink"/>
@@ -56397,8 +57833,8 @@
         <w:t xml:space="preserve">.</w:t>
       </w:r>
     </w:p>
-    <w:bookmarkEnd w:id="386"/>
-    <w:bookmarkStart w:id="388" w:name="ref-battlestar_galactica_2004"/>
+    <w:bookmarkEnd w:id="391"/>
+    <w:bookmarkStart w:id="393" w:name="ref-battlestar_galactica_2004"/>
     <w:p>
       <w:pPr>
         <w:pStyle w:val="Bibliography"/>
@@ -56416,7 +57852,7 @@
       <w:r>
         <w:t xml:space="preserve"> </w:t>
       </w:r>
-      <w:hyperlink r:id="rId387">
+      <w:hyperlink r:id="rId392">
         <w:r>
           <w:rPr>
             <w:rStyle w:val="Hyperlink"/>
@@ -56428,8 +57864,8 @@
         <w:t xml:space="preserve">.</w:t>
       </w:r>
     </w:p>
-    <w:bookmarkEnd w:id="388"/>
-    <w:bookmarkStart w:id="390" w:name="ref-slm_agentic_ai"/>
+    <w:bookmarkEnd w:id="393"/>
+    <w:bookmarkStart w:id="395" w:name="ref-slm_agentic_ai"/>
     <w:p>
       <w:pPr>
         <w:pStyle w:val="Bibliography"/>
@@ -56453,7 +57889,7 @@
       <w:r>
         <w:t xml:space="preserve"> </w:t>
       </w:r>
-      <w:hyperlink r:id="rId389">
+      <w:hyperlink r:id="rId394">
         <w:r>
           <w:rPr>
             <w:rStyle w:val="Hyperlink"/>
@@ -56465,8 +57901,8 @@
         <w:t xml:space="preserve">.</w:t>
       </w:r>
     </w:p>
-    <w:bookmarkEnd w:id="390"/>
-    <w:bookmarkStart w:id="392" w:name="ref-blade_runner"/>
+    <w:bookmarkEnd w:id="395"/>
+    <w:bookmarkStart w:id="397" w:name="ref-blade_runner"/>
     <w:p>
       <w:pPr>
         <w:pStyle w:val="Bibliography"/>
@@ -56484,7 +57920,7 @@
       <w:r>
         <w:t xml:space="preserve"> </w:t>
       </w:r>
-      <w:hyperlink r:id="rId391">
+      <w:hyperlink r:id="rId396">
         <w:r>
           <w:rPr>
             <w:rStyle w:val="Hyperlink"/>
@@ -56496,8 +57932,8 @@
         <w:t xml:space="preserve">.</w:t>
       </w:r>
     </w:p>
-    <w:bookmarkEnd w:id="392"/>
-    <w:bookmarkStart w:id="394" w:name="ref-enders_game"/>
+    <w:bookmarkEnd w:id="397"/>
+    <w:bookmarkStart w:id="399" w:name="ref-enders_game"/>
     <w:p>
       <w:pPr>
         <w:pStyle w:val="Bibliography"/>
@@ -56521,7 +57957,7 @@
       <w:r>
         <w:t xml:space="preserve"> </w:t>
       </w:r>
-      <w:hyperlink r:id="rId393">
+      <w:hyperlink r:id="rId398">
         <w:r>
           <w:rPr>
             <w:rStyle w:val="Hyperlink"/>
@@ -56533,8 +57969,8 @@
         <w:t xml:space="preserve">.</w:t>
       </w:r>
     </w:p>
-    <w:bookmarkEnd w:id="394"/>
-    <w:bookmarkStart w:id="396" w:name="ref-qlora"/>
+    <w:bookmarkEnd w:id="399"/>
+    <w:bookmarkStart w:id="401" w:name="ref-qlora"/>
     <w:p>
       <w:pPr>
         <w:pStyle w:val="Bibliography"/>
@@ -56558,7 +57994,7 @@
       <w:r>
         <w:t xml:space="preserve"> </w:t>
       </w:r>
-      <w:hyperlink r:id="rId395">
+      <w:hyperlink r:id="rId400">
         <w:r>
           <w:rPr>
             <w:rStyle w:val="Hyperlink"/>
@@ -56570,8 +58006,8 @@
         <w:t xml:space="preserve">.</w:t>
       </w:r>
     </w:p>
-    <w:bookmarkEnd w:id="396"/>
-    <w:bookmarkStart w:id="398" w:name="ref-humans_are_dead"/>
+    <w:bookmarkEnd w:id="401"/>
+    <w:bookmarkStart w:id="403" w:name="ref-humans_are_dead"/>
     <w:p>
       <w:pPr>
         <w:pStyle w:val="Bibliography"/>
@@ -56595,7 +58031,7 @@
       <w:r>
         <w:t xml:space="preserve"> </w:t>
       </w:r>
-      <w:hyperlink r:id="rId397">
+      <w:hyperlink r:id="rId402">
         <w:r>
           <w:rPr>
             <w:rStyle w:val="Hyperlink"/>
@@ -56607,8 +58043,8 @@
         <w:t xml:space="preserve">.</w:t>
       </w:r>
     </w:p>
-    <w:bookmarkEnd w:id="398"/>
-    <w:bookmarkStart w:id="400" w:name="ref-dune"/>
+    <w:bookmarkEnd w:id="403"/>
+    <w:bookmarkStart w:id="405" w:name="ref-dune"/>
     <w:p>
       <w:pPr>
         <w:pStyle w:val="Bibliography"/>
@@ -56632,7 +58068,7 @@
       <w:r>
         <w:t xml:space="preserve"> </w:t>
       </w:r>
-      <w:hyperlink r:id="rId399">
+      <w:hyperlink r:id="rId404">
         <w:r>
           <w:rPr>
             <w:rStyle w:val="Hyperlink"/>
@@ -56644,8 +58080,8 @@
         <w:t xml:space="preserve">.</w:t>
       </w:r>
     </w:p>
-    <w:bookmarkEnd w:id="400"/>
-    <w:bookmarkStart w:id="402" w:name="ref-lora"/>
+    <w:bookmarkEnd w:id="405"/>
+    <w:bookmarkStart w:id="407" w:name="ref-lora"/>
     <w:p>
       <w:pPr>
         <w:pStyle w:val="Bibliography"/>
@@ -56669,7 +58105,7 @@
       <w:r>
         <w:t xml:space="preserve"> </w:t>
       </w:r>
-      <w:hyperlink r:id="rId401">
+      <w:hyperlink r:id="rId406">
         <w:r>
           <w:rPr>
             <w:rStyle w:val="Hyperlink"/>
@@ -56681,8 +58117,8 @@
         <w:t xml:space="preserve">.</w:t>
       </w:r>
     </w:p>
-    <w:bookmarkEnd w:id="402"/>
-    <w:bookmarkStart w:id="404" w:name="ref-lecun_world_models"/>
+    <w:bookmarkEnd w:id="407"/>
+    <w:bookmarkStart w:id="409" w:name="ref-lecun_world_models"/>
     <w:p>
       <w:pPr>
         <w:pStyle w:val="Bibliography"/>
@@ -56706,7 +58142,7 @@
       <w:r>
         <w:t xml:space="preserve"> </w:t>
       </w:r>
-      <w:hyperlink r:id="rId403">
+      <w:hyperlink r:id="rId408">
         <w:r>
           <w:rPr>
             <w:rStyle w:val="Hyperlink"/>
@@ -56718,8 +58154,8 @@
         <w:t xml:space="preserve">.</w:t>
       </w:r>
     </w:p>
-    <w:bookmarkEnd w:id="404"/>
-    <w:bookmarkStart w:id="406" w:name="ref-terminator"/>
+    <w:bookmarkEnd w:id="409"/>
+    <w:bookmarkStart w:id="411" w:name="ref-terminator"/>
     <w:p>
       <w:pPr>
         <w:pStyle w:val="Bibliography"/>
@@ -56737,7 +58173,7 @@
       <w:r>
         <w:t xml:space="preserve"> </w:t>
       </w:r>
-      <w:hyperlink r:id="rId405">
+      <w:hyperlink r:id="rId410">
         <w:r>
           <w:rPr>
             <w:rStyle w:val="Hyperlink"/>
@@ -56749,8 +58185,8 @@
         <w:t xml:space="preserve">.</w:t>
       </w:r>
     </w:p>
-    <w:bookmarkEnd w:id="406"/>
-    <w:bookmarkStart w:id="408" w:name="ref-matrix"/>
+    <w:bookmarkEnd w:id="411"/>
+    <w:bookmarkStart w:id="413" w:name="ref-matrix"/>
     <w:p>
       <w:pPr>
         <w:pStyle w:val="Bibliography"/>
@@ -56768,7 +58204,7 @@
       <w:r>
         <w:t xml:space="preserve"> </w:t>
       </w:r>
-      <w:hyperlink r:id="rId407">
+      <w:hyperlink r:id="rId412">
         <w:r>
           <w:rPr>
             <w:rStyle w:val="Hyperlink"/>
@@ -56780,8 +58216,8 @@
         <w:t xml:space="preserve">.</w:t>
       </w:r>
     </w:p>
-    <w:bookmarkEnd w:id="408"/>
-    <w:bookmarkStart w:id="410" w:name="ref-wargames"/>
+    <w:bookmarkEnd w:id="413"/>
+    <w:bookmarkStart w:id="415" w:name="ref-wargames"/>
     <w:p>
       <w:pPr>
         <w:pStyle w:val="Bibliography"/>
@@ -56799,7 +58235,7 @@
       <w:r>
         <w:t xml:space="preserve"> </w:t>
       </w:r>
-      <w:hyperlink r:id="rId409">
+      <w:hyperlink r:id="rId414">
         <w:r>
           <w:rPr>
             <w:rStyle w:val="Hyperlink"/>
@@ -56811,9 +58247,9 @@
         <w:t xml:space="preserve">.</w:t>
       </w:r>
     </w:p>
-    <w:bookmarkEnd w:id="410"/>
-    <w:bookmarkEnd w:id="411"/>
-    <w:bookmarkEnd w:id="412"/>
+    <w:bookmarkEnd w:id="415"/>
+    <w:bookmarkEnd w:id="416"/>
+    <w:bookmarkEnd w:id="417"/>
     <w:sectPr>
       <w:footnotePr>
         <w:numRestart w:val="eachSect"/>
@@ -56843,7 +58279,7 @@
       </w:r>
     </w:p>
   </w:footnote>
-  <w:footnote w:id="328">
+  <w:footnote w:id="333">
     <w:p>
       <w:pPr>
         <w:pStyle w:val="FootnoteText"/>

</xml_diff>

<commit_message>
Deploying to gh-pages from @ Morrison-Lab/wai@6ad09887ad26ca9b05bebccdc0e348625a4dcdcb 🚀
</commit_message>
<xml_diff>
--- a/chapters/coding-agents.docx
+++ b/chapters/coding-agents.docx
@@ -15,7 +15,7 @@
         <w:pStyle w:val="Date"/>
       </w:pPr>
       <w:r>
-        <w:t xml:space="preserve">Last modified: 2026-08-23 00:43:06 (PDT)</w:t>
+        <w:t xml:space="preserve">Last modified: 2026-08-23 20:25:47 (PDT)</w:t>
       </w:r>
     </w:p>
     <w:p>
@@ -9453,7 +9453,7 @@
           <w:rPr>
             <w:rStyle w:val="Hyperlink"/>
           </w:rPr>
-          <w:t xml:space="preserve">Section 30</w:t>
+          <w:t xml:space="preserve">Section 31</w:t>
         </w:r>
       </w:hyperlink>
       <w:r>
@@ -9804,7 +9804,7 @@
           <w:rPr>
             <w:rStyle w:val="Hyperlink"/>
           </w:rPr>
-          <w:t xml:space="preserve">Section 30</w:t>
+          <w:t xml:space="preserve">Section 31</w:t>
         </w:r>
       </w:hyperlink>
       <w:r>
@@ -44636,7 +44636,7 @@
           <w:rPr>
             <w:rStyle w:val="Hyperlink"/>
           </w:rPr>
-          <w:t xml:space="preserve">Section 36</w:t>
+          <w:t xml:space="preserve">Section 37</w:t>
         </w:r>
       </w:hyperlink>
       <w:r>
@@ -47409,13 +47409,959 @@
     </w:p>
     <w:bookmarkEnd w:id="321"/>
     <w:bookmarkEnd w:id="322"/>
-    <w:bookmarkStart w:id="332" w:name="sec-ai-pr-activity-notifications"/>
+    <w:bookmarkStart w:id="329" w:name="sec-ai-codex-github-review"/>
     <w:p>
       <w:pPr>
         <w:pStyle w:val="Heading1"/>
       </w:pPr>
       <w:r>
-        <w:t xml:space="preserve">29. How a Session Learns a PR Changed</w:t>
+        <w:t xml:space="preserve">29. Using a ChatGPT Account for Codex Pull-Request Reviews</w:t>
+      </w:r>
+    </w:p>
+    <w:p>
+      <w:pPr>
+        <w:pStyle w:val="FirstParagraph"/>
+      </w:pPr>
+      <w:r>
+        <w:t xml:space="preserve">OpenAI Codex can act as a reviewer on GitHub pull requests.</w:t>
+      </w:r>
+      <w:r>
+        <w:t xml:space="preserve"> </w:t>
+      </w:r>
+      <w:r>
+        <w:t xml:space="preserve">The native integration uses the Codex service connected to a ChatGPT workspace</w:t>
+      </w:r>
+      <w:r>
+        <w:t xml:space="preserve"> </w:t>
+      </w:r>
+      <w:r>
+        <w:t xml:space="preserve">and posts a standard GitHub review through the Codex connector bot.</w:t>
+      </w:r>
+      <w:r>
+        <w:t xml:space="preserve"> </w:t>
+      </w:r>
+      <w:r>
+        <w:t xml:space="preserve">It does not require you to build a separate GitHub Action.</w:t>
+      </w:r>
+    </w:p>
+    <w:bookmarkStart w:id="323" w:name="prerequisites"/>
+    <w:p>
+      <w:pPr>
+        <w:pStyle w:val="Heading4"/>
+      </w:pPr>
+      <w:r>
+        <w:t xml:space="preserve">Prerequisites</w:t>
+      </w:r>
+    </w:p>
+    <w:p>
+      <w:pPr>
+        <w:pStyle w:val="FirstParagraph"/>
+      </w:pPr>
+      <w:r>
+        <w:t xml:space="preserve">The native reviewer depends on</w:t>
+      </w:r>
+      <w:r>
+        <w:t xml:space="preserve"> </w:t>
+      </w:r>
+      <w:r>
+        <w:rPr>
+          <w:b/>
+          <w:bCs/>
+        </w:rPr>
+        <w:t xml:space="preserve">Codex Cloud</w:t>
+      </w:r>
+      <w:r>
+        <w:t xml:space="preserve">.</w:t>
+      </w:r>
+      <w:r>
+        <w:t xml:space="preserve"> </w:t>
+      </w:r>
+      <w:r>
+        <w:t xml:space="preserve">Before it can review a repository,</w:t>
+      </w:r>
+      <w:r>
+        <w:t xml:space="preserve"> </w:t>
+      </w:r>
+      <w:r>
+        <w:t xml:space="preserve">you need:</w:t>
+      </w:r>
+    </w:p>
+    <w:p>
+      <w:pPr>
+        <w:pStyle w:val="Compact"/>
+        <w:numPr>
+          <w:ilvl w:val="0"/>
+          <w:numId w:val="1130"/>
+        </w:numPr>
+      </w:pPr>
+      <w:r>
+        <w:t xml:space="preserve">Codex Cloud enabled for your active ChatGPT workspace;</w:t>
+      </w:r>
+    </w:p>
+    <w:p>
+      <w:pPr>
+        <w:pStyle w:val="Compact"/>
+        <w:numPr>
+          <w:ilvl w:val="0"/>
+          <w:numId w:val="1130"/>
+        </w:numPr>
+      </w:pPr>
+      <w:r>
+        <w:t xml:space="preserve">the repository connected to Codex Cloud;</w:t>
+      </w:r>
+    </w:p>
+    <w:p>
+      <w:pPr>
+        <w:pStyle w:val="Compact"/>
+        <w:numPr>
+          <w:ilvl w:val="0"/>
+          <w:numId w:val="1130"/>
+        </w:numPr>
+      </w:pPr>
+      <w:r>
+        <w:t xml:space="preserve">access to the Codex code-review settings; and</w:t>
+      </w:r>
+    </w:p>
+    <w:p>
+      <w:pPr>
+        <w:pStyle w:val="Compact"/>
+        <w:numPr>
+          <w:ilvl w:val="0"/>
+          <w:numId w:val="1130"/>
+        </w:numPr>
+      </w:pPr>
+      <w:r>
+        <w:t xml:space="preserve">GitHub push or admin permission</w:t>
+      </w:r>
+      <w:r>
+        <w:t xml:space="preserve"> </w:t>
+      </w:r>
+      <w:r>
+        <w:t xml:space="preserve">if you want to configure automatic reviews.</w:t>
+      </w:r>
+    </w:p>
+    <w:p>
+      <w:pPr>
+        <w:pStyle w:val="FirstParagraph"/>
+      </w:pPr>
+      <w:r>
+        <w:t xml:space="preserve">An</w:t>
+      </w:r>
+      <w:r>
+        <w:t xml:space="preserve"> </w:t>
+      </w:r>
+      <w:r>
+        <w:rPr>
+          <w:rStyle w:val="VerbatimChar"/>
+        </w:rPr>
+        <w:t xml:space="preserve">AGENTS.md</w:t>
+      </w:r>
+      <w:r>
+        <w:t xml:space="preserve"> </w:t>
+      </w:r>
+      <w:r>
+        <w:t xml:space="preserve">file is optional,</w:t>
+      </w:r>
+      <w:r>
+        <w:t xml:space="preserve"> </w:t>
+      </w:r>
+      <w:r>
+        <w:t xml:space="preserve">but it lets the reviewer follow repository-specific guidance.</w:t>
+      </w:r>
+    </w:p>
+    <w:bookmarkEnd w:id="323"/>
+    <w:bookmarkStart w:id="324" w:name="requesting-and-automating-reviews"/>
+    <w:p>
+      <w:pPr>
+        <w:pStyle w:val="Heading4"/>
+      </w:pPr>
+      <w:r>
+        <w:t xml:space="preserve">Requesting and automating reviews</w:t>
+      </w:r>
+    </w:p>
+    <w:p>
+      <w:pPr>
+        <w:pStyle w:val="FirstParagraph"/>
+      </w:pPr>
+      <w:r>
+        <w:t xml:space="preserve">After an administrator or repository owner connects the repository</w:t>
+      </w:r>
+      <w:r>
+        <w:t xml:space="preserve"> </w:t>
+      </w:r>
+      <w:r>
+        <w:t xml:space="preserve">and enables code review in Codex settings,</w:t>
+      </w:r>
+      <w:r>
+        <w:t xml:space="preserve"> </w:t>
+      </w:r>
+      <w:r>
+        <w:t xml:space="preserve">request a review by adding this comment to a pull request:</w:t>
+      </w:r>
+    </w:p>
+    <w:p>
+      <w:pPr>
+        <w:pStyle w:val="SourceCode"/>
+      </w:pPr>
+      <w:r>
+        <w:rPr>
+          <w:rStyle w:val="VerbatimChar"/>
+        </w:rPr>
+        <w:t xml:space="preserve">@codex review</w:t>
+      </w:r>
+    </w:p>
+    <w:p>
+      <w:pPr>
+        <w:pStyle w:val="FirstParagraph"/>
+      </w:pPr>
+      <w:r>
+        <w:t xml:space="preserve">You can add a one-off focus to the same comment,</w:t>
+      </w:r>
+      <w:r>
+        <w:t xml:space="preserve"> </w:t>
+      </w:r>
+      <w:r>
+        <w:t xml:space="preserve">for example:</w:t>
+      </w:r>
+    </w:p>
+    <w:p>
+      <w:pPr>
+        <w:pStyle w:val="SourceCode"/>
+      </w:pPr>
+      <w:r>
+        <w:rPr>
+          <w:rStyle w:val="VerbatimChar"/>
+        </w:rPr>
+        <w:t xml:space="preserve">@codex review for security regressions and missing tests</w:t>
+      </w:r>
+    </w:p>
+    <w:p>
+      <w:pPr>
+        <w:pStyle w:val="FirstParagraph"/>
+      </w:pPr>
+      <w:r>
+        <w:t xml:space="preserve">Where the workspace configuration permits it,</w:t>
+      </w:r>
+      <w:r>
+        <w:t xml:space="preserve"> </w:t>
+      </w:r>
+      <w:r>
+        <w:t xml:space="preserve">Codex can also review new pull requests automatically.</w:t>
+      </w:r>
+      <w:r>
+        <w:t xml:space="preserve"> </w:t>
+      </w:r>
+      <w:r>
+        <w:t xml:space="preserve">In GitHub,</w:t>
+      </w:r>
+      <w:r>
+        <w:t xml:space="preserve"> </w:t>
+      </w:r>
+      <w:r>
+        <w:t xml:space="preserve">the general code review reports only high-priority P0 and P1 findings</w:t>
+      </w:r>
+      <w:r>
+        <w:t xml:space="preserve"> </w:t>
+      </w:r>
+      <w:r>
+        <w:t xml:space="preserve">to keep its comments focused.</w:t>
+      </w:r>
+    </w:p>
+    <w:p>
+      <w:pPr>
+        <w:pStyle w:val="BodyText"/>
+      </w:pPr>
+      <w:r>
+        <w:t xml:space="preserve">A separate</w:t>
+      </w:r>
+      <w:r>
+        <w:t xml:space="preserve"> </w:t>
+      </w:r>
+      <w:r>
+        <w:rPr>
+          <w:b/>
+          <w:bCs/>
+        </w:rPr>
+        <w:t xml:space="preserve">Security Review</w:t>
+      </w:r>
+      <w:r>
+        <w:t xml:space="preserve"> </w:t>
+      </w:r>
+      <w:r>
+        <w:t xml:space="preserve">(research preview) is a deeper pass</w:t>
+      </w:r>
+      <w:r>
+        <w:t xml:space="preserve"> </w:t>
+      </w:r>
+      <w:r>
+        <w:t xml:space="preserve">on security-specific risks.</w:t>
+      </w:r>
+      <w:r>
+        <w:t xml:space="preserve"> </w:t>
+      </w:r>
+      <w:r>
+        <w:t xml:space="preserve">Request it with</w:t>
+      </w:r>
+      <w:r>
+        <w:t xml:space="preserve"> </w:t>
+      </w:r>
+      <w:r>
+        <w:rPr>
+          <w:rStyle w:val="VerbatimChar"/>
+        </w:rPr>
+        <w:t xml:space="preserve">@codex security review</w:t>
+      </w:r>
+      <w:r>
+        <w:t xml:space="preserve">.</w:t>
+      </w:r>
+      <w:r>
+        <w:t xml:space="preserve"> </w:t>
+      </w:r>
+      <w:r>
+        <w:t xml:space="preserve">It can overlap with the general review’s security findings.</w:t>
+      </w:r>
+    </w:p>
+    <w:bookmarkEnd w:id="324"/>
+    <w:bookmarkStart w:id="325" w:name="Xcb3957535c68d0d36c3ddb2e418364eec25d64f"/>
+    <w:p>
+      <w:pPr>
+        <w:pStyle w:val="Heading4"/>
+      </w:pPr>
+      <w:r>
+        <w:t xml:space="preserve">When an administrator has disabled Codex Cloud</w:t>
+      </w:r>
+    </w:p>
+    <w:p>
+      <w:pPr>
+        <w:pStyle w:val="FirstParagraph"/>
+      </w:pPr>
+      <w:r>
+        <w:t xml:space="preserve">The message</w:t>
+      </w:r>
+      <w:r>
+        <w:t xml:space="preserve"> </w:t>
+      </w:r>
+      <w:r>
+        <w:rPr>
+          <w:b/>
+          <w:bCs/>
+        </w:rPr>
+        <w:t xml:space="preserve">“Your admin has turned off Codex Cloud”</w:t>
+      </w:r>
+      <w:r>
+        <w:t xml:space="preserve"> </w:t>
+      </w:r>
+      <w:r>
+        <w:t xml:space="preserve">is a workspace-policy restriction,</w:t>
+      </w:r>
+      <w:r>
+        <w:t xml:space="preserve"> </w:t>
+      </w:r>
+      <w:r>
+        <w:t xml:space="preserve">not a GitHub repository error.</w:t>
+      </w:r>
+      <w:r>
+        <w:t xml:space="preserve"> </w:t>
+      </w:r>
+      <w:r>
+        <w:t xml:space="preserve">The native</w:t>
+      </w:r>
+      <w:r>
+        <w:t xml:space="preserve"> </w:t>
+      </w:r>
+      <w:r>
+        <w:rPr>
+          <w:rStyle w:val="VerbatimChar"/>
+        </w:rPr>
+        <w:t xml:space="preserve">@codex review</w:t>
+      </w:r>
+      <w:r>
+        <w:t xml:space="preserve"> </w:t>
+      </w:r>
+      <w:r>
+        <w:t xml:space="preserve">bot cannot run</w:t>
+      </w:r>
+      <w:r>
+        <w:t xml:space="preserve"> </w:t>
+      </w:r>
+      <w:r>
+        <w:t xml:space="preserve">because GitHub reviews execute through Codex Cloud.</w:t>
+      </w:r>
+      <w:r>
+        <w:t xml:space="preserve"> </w:t>
+      </w:r>
+      <w:r>
+        <w:t xml:space="preserve">Local Codex use can continue.</w:t>
+      </w:r>
+      <w:r>
+        <w:t xml:space="preserve"> </w:t>
+      </w:r>
+      <w:r>
+        <w:t xml:space="preserve">Run</w:t>
+      </w:r>
+      <w:r>
+        <w:t xml:space="preserve"> </w:t>
+      </w:r>
+      <w:r>
+        <w:rPr>
+          <w:rStyle w:val="VerbatimChar"/>
+        </w:rPr>
+        <w:t xml:space="preserve">/review</w:t>
+      </w:r>
+      <w:r>
+        <w:t xml:space="preserve"> </w:t>
+      </w:r>
+      <w:r>
+        <w:t xml:space="preserve">against a checked-out diff in any of:</w:t>
+      </w:r>
+    </w:p>
+    <w:p>
+      <w:pPr>
+        <w:pStyle w:val="Compact"/>
+        <w:numPr>
+          <w:ilvl w:val="0"/>
+          <w:numId w:val="1131"/>
+        </w:numPr>
+      </w:pPr>
+      <w:r>
+        <w:t xml:space="preserve">the Codex app</w:t>
+      </w:r>
+    </w:p>
+    <w:p>
+      <w:pPr>
+        <w:pStyle w:val="Compact"/>
+        <w:numPr>
+          <w:ilvl w:val="0"/>
+          <w:numId w:val="1131"/>
+        </w:numPr>
+      </w:pPr>
+      <w:r>
+        <w:t xml:space="preserve">the IDE composer</w:t>
+      </w:r>
+    </w:p>
+    <w:p>
+      <w:pPr>
+        <w:pStyle w:val="Compact"/>
+        <w:numPr>
+          <w:ilvl w:val="0"/>
+          <w:numId w:val="1131"/>
+        </w:numPr>
+      </w:pPr>
+      <w:r>
+        <w:t xml:space="preserve">the CLI</w:t>
+      </w:r>
+    </w:p>
+    <w:p>
+      <w:pPr>
+        <w:pStyle w:val="FirstParagraph"/>
+      </w:pPr>
+      <w:r>
+        <w:t xml:space="preserve">That is a local review.</w:t>
+      </w:r>
+      <w:r>
+        <w:t xml:space="preserve"> </w:t>
+      </w:r>
+      <w:r>
+        <w:t xml:space="preserve">It does not post a GitHub review</w:t>
+      </w:r>
+      <w:r>
+        <w:t xml:space="preserve"> </w:t>
+      </w:r>
+      <w:r>
+        <w:t xml:space="preserve">and does not create an always-on GitHub bot.</w:t>
+      </w:r>
+    </w:p>
+    <w:p>
+      <w:pPr>
+        <w:pStyle w:val="BodyText"/>
+      </w:pPr>
+      <w:r>
+        <w:t xml:space="preserve">Resolve the restriction in one of these ways:</w:t>
+      </w:r>
+    </w:p>
+    <w:p>
+      <w:pPr>
+        <w:pStyle w:val="Compact"/>
+        <w:numPr>
+          <w:ilvl w:val="0"/>
+          <w:numId w:val="1132"/>
+        </w:numPr>
+      </w:pPr>
+      <w:r>
+        <w:t xml:space="preserve">A workspace administrator can enable Codex Cloud</w:t>
+      </w:r>
+      <w:r>
+        <w:t xml:space="preserve"> </w:t>
+      </w:r>
+      <w:r>
+        <w:t xml:space="preserve">in the workspace’s admin permissions.</w:t>
+      </w:r>
+    </w:p>
+    <w:p>
+      <w:pPr>
+        <w:pStyle w:val="Compact"/>
+        <w:numPr>
+          <w:ilvl w:val="0"/>
+          <w:numId w:val="1132"/>
+        </w:numPr>
+      </w:pPr>
+      <w:r>
+        <w:t xml:space="preserve">A user can connect a</w:t>
+      </w:r>
+      <w:r>
+        <w:t xml:space="preserve"> </w:t>
+      </w:r>
+      <w:r>
+        <w:rPr>
+          <w:i/>
+          <w:iCs/>
+        </w:rPr>
+        <w:t xml:space="preserve">personal</w:t>
+      </w:r>
+      <w:r>
+        <w:t xml:space="preserve"> </w:t>
+      </w:r>
+      <w:r>
+        <w:t xml:space="preserve">repository</w:t>
+      </w:r>
+      <w:r>
+        <w:t xml:space="preserve"> </w:t>
+      </w:r>
+      <w:r>
+        <w:t xml:space="preserve">from a personal workspace that permits Codex Cloud.</w:t>
+      </w:r>
+      <w:r>
+        <w:t xml:space="preserve"> </w:t>
+      </w:r>
+      <w:r>
+        <w:t xml:space="preserve">Do not use a personal workspace to connect organization-owned repositories —</w:t>
+      </w:r>
+      <w:r>
+        <w:t xml:space="preserve"> </w:t>
+      </w:r>
+      <w:r>
+        <w:t xml:space="preserve">that bypasses the workspace policy your administrator set</w:t>
+      </w:r>
+      <w:r>
+        <w:t xml:space="preserve"> </w:t>
+      </w:r>
+      <w:r>
+        <w:t xml:space="preserve">and moves the code outside your organization’s controls.</w:t>
+      </w:r>
+    </w:p>
+    <w:p>
+      <w:pPr>
+        <w:pStyle w:val="Compact"/>
+        <w:numPr>
+          <w:ilvl w:val="0"/>
+          <w:numId w:val="1132"/>
+        </w:numPr>
+      </w:pPr>
+      <w:r>
+        <w:t xml:space="preserve">If cloud access must remain disabled,</w:t>
+      </w:r>
+      <w:r>
+        <w:t xml:space="preserve"> </w:t>
+      </w:r>
+      <w:r>
+        <w:t xml:space="preserve">use the local</w:t>
+      </w:r>
+      <w:r>
+        <w:t xml:space="preserve"> </w:t>
+      </w:r>
+      <w:r>
+        <w:rPr>
+          <w:rStyle w:val="VerbatimChar"/>
+        </w:rPr>
+        <w:t xml:space="preserve">/review</w:t>
+      </w:r>
+      <w:r>
+        <w:t xml:space="preserve"> </w:t>
+      </w:r>
+      <w:r>
+        <w:t xml:space="preserve">path above.</w:t>
+      </w:r>
+    </w:p>
+    <w:p>
+      <w:pPr>
+        <w:pStyle w:val="FirstParagraph"/>
+      </w:pPr>
+      <w:r>
+        <w:t xml:space="preserve">GitHub organizations may separately require an owner to approve</w:t>
+      </w:r>
+      <w:r>
+        <w:t xml:space="preserve"> </w:t>
+      </w:r>
+      <w:r>
+        <w:t xml:space="preserve">the repository connection.</w:t>
+      </w:r>
+      <w:r>
+        <w:t xml:space="preserve"> </w:t>
+      </w:r>
+      <w:r>
+        <w:t xml:space="preserve">Changing that authorization does not override a ChatGPT workspace policy;</w:t>
+      </w:r>
+      <w:r>
+        <w:t xml:space="preserve"> </w:t>
+      </w:r>
+      <w:r>
+        <w:t xml:space="preserve">both sides must permit the integration.</w:t>
+      </w:r>
+    </w:p>
+    <w:bookmarkEnd w:id="325"/>
+    <w:bookmarkStart w:id="326" w:name="X5db1f82696679006fc24d2d9f8d9499d172a6a5"/>
+    <w:p>
+      <w:pPr>
+        <w:pStyle w:val="Heading4"/>
+      </w:pPr>
+      <w:r>
+        <w:t xml:space="preserve">Native review versus API-backed automation</w:t>
+      </w:r>
+    </w:p>
+    <w:p>
+      <w:pPr>
+        <w:pStyle w:val="FirstParagraph"/>
+      </w:pPr>
+      <w:r>
+        <w:t xml:space="preserve">Do not confuse the native integration with a custom GitHub Action</w:t>
+      </w:r>
+      <w:r>
+        <w:t xml:space="preserve"> </w:t>
+      </w:r>
+      <w:r>
+        <w:t xml:space="preserve">that calls an OpenAI model.</w:t>
+      </w:r>
+      <w:r>
+        <w:t xml:space="preserve"> </w:t>
+      </w:r>
+      <w:r>
+        <w:t xml:space="preserve">The native reviewer is configured through Codex and the linked ChatGPT</w:t>
+      </w:r>
+      <w:r>
+        <w:t xml:space="preserve"> </w:t>
+      </w:r>
+      <w:r>
+        <w:t xml:space="preserve">workspace.</w:t>
+      </w:r>
+      <w:r>
+        <w:t xml:space="preserve"> </w:t>
+      </w:r>
+      <w:r>
+        <w:t xml:space="preserve">A custom action instead needs API credentials</w:t>
+      </w:r>
+      <w:r>
+        <w:t xml:space="preserve"> </w:t>
+      </w:r>
+      <w:r>
+        <w:t xml:space="preserve">and uses API billing and limits.</w:t>
+      </w:r>
+      <w:r>
+        <w:t xml:space="preserve"> </w:t>
+      </w:r>
+      <w:r>
+        <w:t xml:space="preserve">It also requires you to implement:</w:t>
+      </w:r>
+    </w:p>
+    <w:p>
+      <w:pPr>
+        <w:pStyle w:val="Compact"/>
+        <w:numPr>
+          <w:ilvl w:val="0"/>
+          <w:numId w:val="1133"/>
+        </w:numPr>
+      </w:pPr>
+      <w:r>
+        <w:t xml:space="preserve">the review prompt</w:t>
+      </w:r>
+    </w:p>
+    <w:p>
+      <w:pPr>
+        <w:pStyle w:val="Compact"/>
+        <w:numPr>
+          <w:ilvl w:val="0"/>
+          <w:numId w:val="1133"/>
+        </w:numPr>
+      </w:pPr>
+      <w:r>
+        <w:t xml:space="preserve">permissions</w:t>
+      </w:r>
+    </w:p>
+    <w:p>
+      <w:pPr>
+        <w:pStyle w:val="Compact"/>
+        <w:numPr>
+          <w:ilvl w:val="0"/>
+          <w:numId w:val="1133"/>
+        </w:numPr>
+      </w:pPr>
+      <w:r>
+        <w:t xml:space="preserve">comment-posting behavior</w:t>
+      </w:r>
+    </w:p>
+    <w:p>
+      <w:pPr>
+        <w:pStyle w:val="FirstParagraph"/>
+      </w:pPr>
+      <w:r>
+        <w:t xml:space="preserve">Do not copy personal ChatGPT or Codex login credentials into CI secrets.</w:t>
+      </w:r>
+    </w:p>
+    <w:bookmarkEnd w:id="326"/>
+    <w:bookmarkStart w:id="328" w:name="adding-repository-specific-review-rules"/>
+    <w:p>
+      <w:pPr>
+        <w:pStyle w:val="Heading4"/>
+      </w:pPr>
+      <w:r>
+        <w:t xml:space="preserve">Adding repository-specific review rules</w:t>
+      </w:r>
+    </w:p>
+    <w:p>
+      <w:pPr>
+        <w:pStyle w:val="FirstParagraph"/>
+      </w:pPr>
+      <w:r>
+        <w:t xml:space="preserve">Codex reads applicable</w:t>
+      </w:r>
+      <w:r>
+        <w:t xml:space="preserve"> </w:t>
+      </w:r>
+      <w:r>
+        <w:rPr>
+          <w:rStyle w:val="VerbatimChar"/>
+        </w:rPr>
+        <w:t xml:space="preserve">AGENTS.md</w:t>
+      </w:r>
+      <w:r>
+        <w:t xml:space="preserve"> </w:t>
+      </w:r>
+      <w:r>
+        <w:t xml:space="preserve">files.</w:t>
+      </w:r>
+      <w:r>
+        <w:t xml:space="preserve"> </w:t>
+      </w:r>
+      <w:r>
+        <w:t xml:space="preserve">Put broad guidance in the repository root</w:t>
+      </w:r>
+      <w:r>
+        <w:t xml:space="preserve"> </w:t>
+      </w:r>
+      <w:r>
+        <w:t xml:space="preserve">and narrower guidance in a file closer to the code it governs.</w:t>
+      </w:r>
+      <w:r>
+        <w:t xml:space="preserve"> </w:t>
+      </w:r>
+      <w:r>
+        <w:t xml:space="preserve">Review-only guidance belongs under a</w:t>
+      </w:r>
+      <w:r>
+        <w:t xml:space="preserve"> </w:t>
+      </w:r>
+      <w:r>
+        <w:rPr>
+          <w:rStyle w:val="VerbatimChar"/>
+        </w:rPr>
+        <w:t xml:space="preserve">## Code Review Rules</w:t>
+      </w:r>
+      <w:r>
+        <w:t xml:space="preserve"> </w:t>
+      </w:r>
+      <w:r>
+        <w:t xml:space="preserve">heading:</w:t>
+      </w:r>
+    </w:p>
+    <w:p>
+      <w:pPr>
+        <w:pStyle w:val="SourceCode"/>
+      </w:pPr>
+      <w:r>
+        <w:rPr>
+          <w:rStyle w:val="FunctionTok"/>
+        </w:rPr>
+        <w:t xml:space="preserve">## Code Review Rules</w:t>
+      </w:r>
+      <w:r>
+        <w:br/>
+      </w:r>
+      <w:r>
+        <w:br/>
+      </w:r>
+      <w:r>
+        <w:rPr>
+          <w:rStyle w:val="SpecialStringTok"/>
+        </w:rPr>
+        <w:t xml:space="preserve">- </w:t>
+      </w:r>
+      <w:r>
+        <w:rPr>
+          <w:rStyle w:val="NormalTok"/>
+        </w:rPr>
+        <w:t xml:space="preserve">Flag schema changes that are not backward compatible.</w:t>
+      </w:r>
+      <w:r>
+        <w:br/>
+      </w:r>
+      <w:r>
+        <w:rPr>
+          <w:rStyle w:val="NormalTok"/>
+        </w:rPr>
+        <w:t xml:space="preserve">  A safe migration must support both deployed application versions.</w:t>
+      </w:r>
+      <w:r>
+        <w:br/>
+      </w:r>
+      <w:r>
+        <w:rPr>
+          <w:rStyle w:val="SpecialStringTok"/>
+        </w:rPr>
+        <w:t xml:space="preserve">- </w:t>
+      </w:r>
+      <w:r>
+        <w:rPr>
+          <w:rStyle w:val="NormalTok"/>
+        </w:rPr>
+        <w:t xml:space="preserve">Flag behavior changes without a regression test.</w:t>
+      </w:r>
+    </w:p>
+    <w:p>
+      <w:pPr>
+        <w:pStyle w:val="FirstParagraph"/>
+      </w:pPr>
+      <w:r>
+        <w:t xml:space="preserve">Keep deterministic formatting and lint checks in continuous integration.</w:t>
+      </w:r>
+      <w:r>
+        <w:t xml:space="preserve"> </w:t>
+      </w:r>
+      <w:r>
+        <w:t xml:space="preserve">Code-review guidance should:</w:t>
+      </w:r>
+    </w:p>
+    <w:p>
+      <w:pPr>
+        <w:pStyle w:val="Compact"/>
+        <w:numPr>
+          <w:ilvl w:val="0"/>
+          <w:numId w:val="1134"/>
+        </w:numPr>
+      </w:pPr>
+      <w:r>
+        <w:t xml:space="preserve">focus on consequential behavior</w:t>
+      </w:r>
+    </w:p>
+    <w:p>
+      <w:pPr>
+        <w:pStyle w:val="Compact"/>
+        <w:numPr>
+          <w:ilvl w:val="0"/>
+          <w:numId w:val="1134"/>
+        </w:numPr>
+      </w:pPr>
+      <w:r>
+        <w:t xml:space="preserve">state the safe alternative or exception</w:t>
+      </w:r>
+    </w:p>
+    <w:p>
+      <w:pPr>
+        <w:pStyle w:val="Compact"/>
+        <w:numPr>
+          <w:ilvl w:val="0"/>
+          <w:numId w:val="1134"/>
+        </w:numPr>
+      </w:pPr>
+      <w:r>
+        <w:t xml:space="preserve">remain concise enough to apply consistently</w:t>
+      </w:r>
+    </w:p>
+    <w:p>
+      <w:pPr>
+        <w:pStyle w:val="FirstParagraph"/>
+      </w:pPr>
+      <w:r>
+        <w:t xml:space="preserve">Codex review is an additional signal;</w:t>
+      </w:r>
+      <w:r>
+        <w:t xml:space="preserve"> </w:t>
+      </w:r>
+      <w:r>
+        <w:t xml:space="preserve">it does not replace:</w:t>
+      </w:r>
+    </w:p>
+    <w:p>
+      <w:pPr>
+        <w:pStyle w:val="Compact"/>
+        <w:numPr>
+          <w:ilvl w:val="0"/>
+          <w:numId w:val="1135"/>
+        </w:numPr>
+      </w:pPr>
+      <w:r>
+        <w:t xml:space="preserve">tests</w:t>
+      </w:r>
+    </w:p>
+    <w:p>
+      <w:pPr>
+        <w:pStyle w:val="Compact"/>
+        <w:numPr>
+          <w:ilvl w:val="0"/>
+          <w:numId w:val="1135"/>
+        </w:numPr>
+      </w:pPr>
+      <w:r>
+        <w:t xml:space="preserve">branch protection</w:t>
+      </w:r>
+    </w:p>
+    <w:p>
+      <w:pPr>
+        <w:pStyle w:val="Compact"/>
+        <w:numPr>
+          <w:ilvl w:val="0"/>
+          <w:numId w:val="1135"/>
+        </w:numPr>
+      </w:pPr>
+      <w:r>
+        <w:t xml:space="preserve">required human approval</w:t>
+      </w:r>
+    </w:p>
+    <w:p>
+      <w:pPr>
+        <w:pStyle w:val="FirstParagraph"/>
+      </w:pPr>
+      <w:r>
+        <w:t xml:space="preserve">For current setup details,</w:t>
+      </w:r>
+      <w:r>
+        <w:t xml:space="preserve"> </w:t>
+      </w:r>
+      <w:r>
+        <w:t xml:space="preserve">see OpenAI’s</w:t>
+      </w:r>
+      <w:r>
+        <w:t xml:space="preserve"> </w:t>
+      </w:r>
+      <w:hyperlink r:id="rId327">
+        <w:r>
+          <w:rPr>
+            <w:rStyle w:val="Hyperlink"/>
+          </w:rPr>
+          <w:t xml:space="preserve">GitHub code-review documentation</w:t>
+        </w:r>
+      </w:hyperlink>
+      <w:r>
+        <w:t xml:space="preserve">.</w:t>
+      </w:r>
+    </w:p>
+    <w:bookmarkEnd w:id="328"/>
+    <w:bookmarkEnd w:id="329"/>
+    <w:bookmarkStart w:id="339" w:name="sec-ai-pr-activity-notifications"/>
+    <w:p>
+      <w:pPr>
+        <w:pStyle w:val="Heading1"/>
+      </w:pPr>
+      <w:r>
+        <w:t xml:space="preserve">30. How a Session Learns a PR Changed</w:t>
       </w:r>
     </w:p>
     <w:p>
@@ -47753,7 +48699,7 @@
         </w:tc>
       </w:tr>
     </w:tbl>
-    <w:bookmarkStart w:id="323" w:name="the-channel-an-agent-controls"/>
+    <w:bookmarkStart w:id="330" w:name="the-channel-an-agent-controls"/>
     <w:p>
       <w:pPr>
         <w:pStyle w:val="Heading4"/>
@@ -47932,7 +48878,7 @@
           <w:rPr>
             <w:rStyle w:val="Hyperlink"/>
           </w:rPr>
-          <w:t xml:space="preserve">Section 36</w:t>
+          <w:t xml:space="preserve">Section 37</w:t>
         </w:r>
       </w:hyperlink>
       <w:r>
@@ -48027,8 +48973,8 @@
         <w:t xml:space="preserve">real state, not a replacement for it.</w:t>
       </w:r>
     </w:p>
-    <w:bookmarkEnd w:id="323"/>
-    <w:bookmarkStart w:id="324" w:name="the-channel-only-a-human-controls"/>
+    <w:bookmarkEnd w:id="330"/>
+    <w:bookmarkStart w:id="331" w:name="the-channel-only-a-human-controls"/>
     <w:p>
       <w:pPr>
         <w:pStyle w:val="Heading4"/>
@@ -48138,7 +49084,7 @@
         <w:pStyle w:val="Compact"/>
         <w:numPr>
           <w:ilvl w:val="0"/>
-          <w:numId w:val="1130"/>
+          <w:numId w:val="1136"/>
         </w:numPr>
       </w:pPr>
       <w:r>
@@ -48193,7 +49139,7 @@
         <w:pStyle w:val="Compact"/>
         <w:numPr>
           <w:ilvl w:val="0"/>
-          <w:numId w:val="1130"/>
+          <w:numId w:val="1136"/>
         </w:numPr>
       </w:pPr>
       <w:r>
@@ -48233,7 +49179,7 @@
         <w:pStyle w:val="Compact"/>
         <w:numPr>
           <w:ilvl w:val="0"/>
-          <w:numId w:val="1130"/>
+          <w:numId w:val="1136"/>
         </w:numPr>
       </w:pPr>
       <w:r>
@@ -48331,8 +49277,8 @@
         <w:t xml:space="preserve">for the web-session context these run in.</w:t>
       </w:r>
     </w:p>
-    <w:bookmarkEnd w:id="324"/>
-    <w:bookmarkStart w:id="325" w:name="the-instruction-template-is-boilerplate"/>
+    <w:bookmarkEnd w:id="331"/>
+    <w:bookmarkStart w:id="332" w:name="the-instruction-template-is-boilerplate"/>
     <w:p>
       <w:pPr>
         <w:pStyle w:val="Heading4"/>
@@ -48388,7 +49334,7 @@
         <w:pStyle w:val="Compact"/>
         <w:numPr>
           <w:ilvl w:val="0"/>
-          <w:numId w:val="1131"/>
+          <w:numId w:val="1137"/>
         </w:numPr>
       </w:pPr>
       <w:r>
@@ -48400,7 +49346,7 @@
         <w:pStyle w:val="Compact"/>
         <w:numPr>
           <w:ilvl w:val="0"/>
-          <w:numId w:val="1131"/>
+          <w:numId w:val="1137"/>
         </w:numPr>
       </w:pPr>
       <w:r>
@@ -48412,7 +49358,7 @@
         <w:pStyle w:val="Compact"/>
         <w:numPr>
           <w:ilvl w:val="0"/>
-          <w:numId w:val="1131"/>
+          <w:numId w:val="1137"/>
         </w:numPr>
       </w:pPr>
       <w:r>
@@ -48424,7 +49370,7 @@
         <w:pStyle w:val="Compact"/>
         <w:numPr>
           <w:ilvl w:val="0"/>
-          <w:numId w:val="1131"/>
+          <w:numId w:val="1137"/>
         </w:numPr>
       </w:pPr>
       <w:r>
@@ -48436,7 +49382,7 @@
         <w:pStyle w:val="Compact"/>
         <w:numPr>
           <w:ilvl w:val="0"/>
-          <w:numId w:val="1131"/>
+          <w:numId w:val="1137"/>
         </w:numPr>
       </w:pPr>
       <w:r>
@@ -48484,7 +49430,7 @@
         <w:pStyle w:val="Compact"/>
         <w:numPr>
           <w:ilvl w:val="0"/>
-          <w:numId w:val="1132"/>
+          <w:numId w:val="1138"/>
         </w:numPr>
       </w:pPr>
       <w:r>
@@ -48508,7 +49454,7 @@
         <w:pStyle w:val="Compact"/>
         <w:numPr>
           <w:ilvl w:val="0"/>
-          <w:numId w:val="1132"/>
+          <w:numId w:val="1138"/>
         </w:numPr>
       </w:pPr>
       <w:r>
@@ -48529,7 +49475,7 @@
         <w:pStyle w:val="Compact"/>
         <w:numPr>
           <w:ilvl w:val="0"/>
-          <w:numId w:val="1132"/>
+          <w:numId w:val="1138"/>
         </w:numPr>
       </w:pPr>
       <w:r>
@@ -48598,8 +49544,8 @@
         <w:t xml:space="preserve">rather than as an instruction that a fix is owed.</w:t>
       </w:r>
     </w:p>
-    <w:bookmarkEnd w:id="325"/>
-    <w:bookmarkStart w:id="326" w:name="X3e28e99804e56791cb9e57e9eb83869f0ead0b2"/>
+    <w:bookmarkEnd w:id="332"/>
+    <w:bookmarkStart w:id="333" w:name="X3e28e99804e56791cb9e57e9eb83869f0ead0b2"/>
     <w:p>
       <w:pPr>
         <w:pStyle w:val="Heading4"/>
@@ -48728,8 +49674,8 @@
         <w:t xml:space="preserve">Toggling one says nothing about the other.</w:t>
       </w:r>
     </w:p>
-    <w:bookmarkEnd w:id="326"/>
-    <w:bookmarkStart w:id="331" w:name="treat-what-arrives-as-untrusted"/>
+    <w:bookmarkEnd w:id="333"/>
+    <w:bookmarkStart w:id="338" w:name="treat-what-arrives-as-untrusted"/>
     <w:p>
       <w:pPr>
         <w:pStyle w:val="Heading4"/>
@@ -48942,7 +49888,7 @@
         <w:pStyle w:val="Compact"/>
         <w:numPr>
           <w:ilvl w:val="0"/>
-          <w:numId w:val="1133"/>
+          <w:numId w:val="1139"/>
         </w:numPr>
       </w:pPr>
       <w:r>
@@ -48970,7 +49916,7 @@
         <w:pStyle w:val="Compact"/>
         <w:numPr>
           <w:ilvl w:val="0"/>
-          <w:numId w:val="1133"/>
+          <w:numId w:val="1139"/>
         </w:numPr>
       </w:pPr>
       <w:r>
@@ -49098,12 +50044,12 @@
                 <wp:inline>
                   <wp:extent cx="152400" cy="152400"/>
                   <wp:effectExtent b="0" l="0" r="0" t="0"/>
-                  <wp:docPr descr="" title="" id="327" name="Picture"/>
+                  <wp:docPr descr="" title="" id="334" name="Picture"/>
                   <a:graphic>
                     <a:graphicData uri="http://schemas.openxmlformats.org/drawingml/2006/picture">
                       <pic:pic>
                         <pic:nvPicPr>
-                          <pic:cNvPr descr="/opt/quarto/share/formats/docx/warning.png" id="328" name="Picture"/>
+                          <pic:cNvPr descr="/opt/quarto/share/formats/docx/warning.png" id="335" name="Picture"/>
                           <pic:cNvPicPr>
                             <a:picLocks noChangeArrowheads="1" noChangeAspect="1"/>
                           </pic:cNvPicPr>
@@ -49274,12 +50220,12 @@
                 <wp:inline>
                   <wp:extent cx="152400" cy="152400"/>
                   <wp:effectExtent b="0" l="0" r="0" t="0"/>
-                  <wp:docPr descr="" title="" id="329" name="Picture"/>
+                  <wp:docPr descr="" title="" id="336" name="Picture"/>
                   <a:graphic>
                     <a:graphicData uri="http://schemas.openxmlformats.org/drawingml/2006/picture">
                       <pic:pic>
                         <pic:nvPicPr>
-                          <pic:cNvPr descr="/opt/quarto/share/formats/docx/note.png" id="330" name="Picture"/>
+                          <pic:cNvPr descr="/opt/quarto/share/formats/docx/note.png" id="337" name="Picture"/>
                           <pic:cNvPicPr>
                             <a:picLocks noChangeArrowheads="1" noChangeAspect="1"/>
                           </pic:cNvPicPr>
@@ -49385,15 +50331,15 @@
         </w:tc>
       </w:tr>
     </w:tbl>
-    <w:bookmarkEnd w:id="331"/>
-    <w:bookmarkEnd w:id="332"/>
-    <w:bookmarkStart w:id="336" w:name="sec-ai-when-to-use"/>
+    <w:bookmarkEnd w:id="338"/>
+    <w:bookmarkEnd w:id="339"/>
+    <w:bookmarkStart w:id="343" w:name="sec-ai-when-to-use"/>
     <w:p>
       <w:pPr>
         <w:pStyle w:val="Heading1"/>
       </w:pPr>
       <w:r>
-        <w:t xml:space="preserve">30. When to use a coding agent</w:t>
+        <w:t xml:space="preserve">31. When to use a coding agent</w:t>
       </w:r>
     </w:p>
     <w:p>
@@ -49407,7 +50353,7 @@
         <w:rPr>
           <w:rStyle w:val="FootnoteReference"/>
         </w:rPr>
-        <w:footnoteReference w:id="333"/>
+        <w:footnoteReference w:id="340"/>
       </w:r>
       <w:r>
         <w:t xml:space="preserve"> </w:t>
@@ -49439,7 +50385,7 @@
       <w:r>
         <w:t xml:space="preserve"> </w:t>
       </w:r>
-      <w:hyperlink r:id="rId334">
+      <w:hyperlink r:id="rId341">
         <w:r>
           <w:rPr>
             <w:rStyle w:val="Hyperlink"/>
@@ -49498,7 +50444,7 @@
       <w:r>
         <w:t xml:space="preserve"> </w:t>
       </w:r>
-      <w:hyperlink r:id="rId335">
+      <w:hyperlink r:id="rId342">
         <w:r>
           <w:rPr>
             <w:rStyle w:val="Hyperlink"/>
@@ -49617,14 +50563,14 @@
         <w:t xml:space="preserve">just like you would for any other skill you want to maintain.</w:t>
       </w:r>
     </w:p>
-    <w:bookmarkEnd w:id="336"/>
-    <w:bookmarkStart w:id="341" w:name="editing-with-.docx-files"/>
+    <w:bookmarkEnd w:id="343"/>
+    <w:bookmarkStart w:id="348" w:name="editing-with-.docx-files"/>
     <w:p>
       <w:pPr>
         <w:pStyle w:val="Heading1"/>
       </w:pPr>
       <w:r>
-        <w:t xml:space="preserve">31. Editing with</w:t>
+        <w:t xml:space="preserve">32. Editing with</w:t>
       </w:r>
       <w:r>
         <w:t xml:space="preserve"> </w:t>
@@ -49670,7 +50616,7 @@
         <w:pStyle w:val="Compact"/>
         <w:numPr>
           <w:ilvl w:val="0"/>
-          <w:numId w:val="1134"/>
+          <w:numId w:val="1140"/>
         </w:numPr>
       </w:pPr>
       <w:r>
@@ -49682,7 +50628,7 @@
         <w:pStyle w:val="Compact"/>
         <w:numPr>
           <w:ilvl w:val="0"/>
-          <w:numId w:val="1134"/>
+          <w:numId w:val="1140"/>
         </w:numPr>
       </w:pPr>
       <w:r>
@@ -49694,7 +50640,7 @@
         <w:pStyle w:val="Compact"/>
         <w:numPr>
           <w:ilvl w:val="0"/>
-          <w:numId w:val="1134"/>
+          <w:numId w:val="1140"/>
         </w:numPr>
       </w:pPr>
       <w:r>
@@ -49729,7 +50675,7 @@
         <w:pStyle w:val="Compact"/>
         <w:numPr>
           <w:ilvl w:val="0"/>
-          <w:numId w:val="1135"/>
+          <w:numId w:val="1141"/>
         </w:numPr>
       </w:pPr>
       <w:r>
@@ -49756,7 +50702,7 @@
         <w:pStyle w:val="Compact"/>
         <w:numPr>
           <w:ilvl w:val="0"/>
-          <w:numId w:val="1135"/>
+          <w:numId w:val="1141"/>
         </w:numPr>
       </w:pPr>
       <w:r>
@@ -49783,7 +50729,7 @@
         <w:pStyle w:val="Compact"/>
         <w:numPr>
           <w:ilvl w:val="0"/>
-          <w:numId w:val="1135"/>
+          <w:numId w:val="1141"/>
         </w:numPr>
       </w:pPr>
       <w:r>
@@ -49798,7 +50744,7 @@
         <w:t xml:space="preserve">This approach makes it easier for collaborators who are more comfortable with Word to contribute while maintaining the source files in Quarto format.</w:t>
       </w:r>
     </w:p>
-    <w:bookmarkStart w:id="340" w:name="known-issue-document-1-warning-in-word"/>
+    <w:bookmarkStart w:id="347" w:name="known-issue-document-1-warning-in-word"/>
     <w:p>
       <w:pPr>
         <w:pStyle w:val="Heading4"/>
@@ -49880,10 +50826,10 @@
         <w:pStyle w:val="Compact"/>
         <w:numPr>
           <w:ilvl w:val="0"/>
-          <w:numId w:val="1136"/>
+          <w:numId w:val="1142"/>
         </w:numPr>
       </w:pPr>
-      <w:hyperlink r:id="rId337">
+      <w:hyperlink r:id="rId344">
         <w:r>
           <w:rPr>
             <w:rStyle w:val="Hyperlink"/>
@@ -49897,10 +50843,10 @@
         <w:pStyle w:val="Compact"/>
         <w:numPr>
           <w:ilvl w:val="0"/>
-          <w:numId w:val="1136"/>
+          <w:numId w:val="1142"/>
         </w:numPr>
       </w:pPr>
-      <w:hyperlink r:id="rId338">
+      <w:hyperlink r:id="rId345">
         <w:r>
           <w:rPr>
             <w:rStyle w:val="Hyperlink"/>
@@ -49914,10 +50860,10 @@
         <w:pStyle w:val="Compact"/>
         <w:numPr>
           <w:ilvl w:val="0"/>
-          <w:numId w:val="1136"/>
+          <w:numId w:val="1142"/>
         </w:numPr>
       </w:pPr>
-      <w:hyperlink r:id="rId339">
+      <w:hyperlink r:id="rId346">
         <w:r>
           <w:rPr>
             <w:rStyle w:val="Hyperlink"/>
@@ -49955,7 +50901,7 @@
         <w:pStyle w:val="Compact"/>
         <w:numPr>
           <w:ilvl w:val="0"/>
-          <w:numId w:val="1137"/>
+          <w:numId w:val="1143"/>
         </w:numPr>
       </w:pPr>
       <w:r>
@@ -49967,7 +50913,7 @@
         <w:pStyle w:val="Compact"/>
         <w:numPr>
           <w:ilvl w:val="0"/>
-          <w:numId w:val="1137"/>
+          <w:numId w:val="1143"/>
         </w:numPr>
       </w:pPr>
       <w:r>
@@ -49979,7 +50925,7 @@
         <w:pStyle w:val="Compact"/>
         <w:numPr>
           <w:ilvl w:val="0"/>
-          <w:numId w:val="1137"/>
+          <w:numId w:val="1143"/>
         </w:numPr>
       </w:pPr>
       <w:r>
@@ -49997,7 +50943,7 @@
         <w:pStyle w:val="Compact"/>
         <w:numPr>
           <w:ilvl w:val="0"/>
-          <w:numId w:val="1137"/>
+          <w:numId w:val="1143"/>
         </w:numPr>
       </w:pPr>
       <w:r>
@@ -50030,15 +50976,15 @@
         <w:t xml:space="preserve">warning and can immediately add comments and track changes without issues.</w:t>
       </w:r>
     </w:p>
-    <w:bookmarkEnd w:id="340"/>
-    <w:bookmarkEnd w:id="341"/>
-    <w:bookmarkStart w:id="343" w:name="copilot-instructions-for-this-repository"/>
+    <w:bookmarkEnd w:id="347"/>
+    <w:bookmarkEnd w:id="348"/>
+    <w:bookmarkStart w:id="350" w:name="copilot-instructions-for-this-repository"/>
     <w:p>
       <w:pPr>
         <w:pStyle w:val="Heading1"/>
       </w:pPr>
       <w:r>
-        <w:t xml:space="preserve">32. Copilot Instructions for this Repository</w:t>
+        <w:t xml:space="preserve">33. Copilot Instructions for this Repository</w:t>
       </w:r>
     </w:p>
     <w:p>
@@ -50119,7 +51065,7 @@
         <w:pStyle w:val="Compact"/>
         <w:numPr>
           <w:ilvl w:val="0"/>
-          <w:numId w:val="1138"/>
+          <w:numId w:val="1144"/>
         </w:numPr>
       </w:pPr>
       <w:r>
@@ -50131,7 +51077,7 @@
         <w:pStyle w:val="Compact"/>
         <w:numPr>
           <w:ilvl w:val="0"/>
-          <w:numId w:val="1138"/>
+          <w:numId w:val="1144"/>
         </w:numPr>
       </w:pPr>
       <w:r>
@@ -50155,7 +51101,7 @@
         <w:pStyle w:val="Compact"/>
         <w:numPr>
           <w:ilvl w:val="0"/>
-          <w:numId w:val="1138"/>
+          <w:numId w:val="1144"/>
         </w:numPr>
       </w:pPr>
       <w:r>
@@ -50167,7 +51113,7 @@
         <w:pStyle w:val="Compact"/>
         <w:numPr>
           <w:ilvl w:val="0"/>
-          <w:numId w:val="1138"/>
+          <w:numId w:val="1144"/>
         </w:numPr>
       </w:pPr>
       <w:r>
@@ -50179,7 +51125,7 @@
         <w:pStyle w:val="Compact"/>
         <w:numPr>
           <w:ilvl w:val="0"/>
-          <w:numId w:val="1138"/>
+          <w:numId w:val="1144"/>
         </w:numPr>
       </w:pPr>
       <w:r>
@@ -50197,7 +51143,7 @@
         <w:pStyle w:val="Compact"/>
         <w:numPr>
           <w:ilvl w:val="0"/>
-          <w:numId w:val="1138"/>
+          <w:numId w:val="1144"/>
         </w:numPr>
       </w:pPr>
       <w:r>
@@ -50264,7 +51210,7 @@
       <w:r>
         <w:t xml:space="preserve"> </w:t>
       </w:r>
-      <w:hyperlink r:id="rId342">
+      <w:hyperlink r:id="rId349">
         <w:r>
           <w:rPr>
             <w:rStyle w:val="VerbatimChar"/>
@@ -50279,14 +51225,14 @@
         <w:t xml:space="preserve">for a working example.</w:t>
       </w:r>
     </w:p>
-    <w:bookmarkEnd w:id="343"/>
-    <w:bookmarkStart w:id="344" w:name="using-copilot-review-before-human-review"/>
+    <w:bookmarkEnd w:id="350"/>
+    <w:bookmarkStart w:id="351" w:name="using-copilot-review-before-human-review"/>
     <w:p>
       <w:pPr>
         <w:pStyle w:val="Heading1"/>
       </w:pPr>
       <w:r>
-        <w:t xml:space="preserve">33. Using Copilot Review Before Human Review</w:t>
+        <w:t xml:space="preserve">34. Using Copilot Review Before Human Review</w:t>
       </w:r>
     </w:p>
     <w:p>
@@ -50345,7 +51291,7 @@
         <w:pStyle w:val="Compact"/>
         <w:numPr>
           <w:ilvl w:val="0"/>
-          <w:numId w:val="1139"/>
+          <w:numId w:val="1145"/>
         </w:numPr>
       </w:pPr>
       <w:r>
@@ -50364,7 +51310,7 @@
         <w:pStyle w:val="Compact"/>
         <w:numPr>
           <w:ilvl w:val="0"/>
-          <w:numId w:val="1139"/>
+          <w:numId w:val="1145"/>
         </w:numPr>
       </w:pPr>
       <w:r>
@@ -50383,7 +51329,7 @@
         <w:pStyle w:val="Compact"/>
         <w:numPr>
           <w:ilvl w:val="0"/>
-          <w:numId w:val="1139"/>
+          <w:numId w:val="1145"/>
         </w:numPr>
       </w:pPr>
       <w:r>
@@ -50402,7 +51348,7 @@
         <w:pStyle w:val="Compact"/>
         <w:numPr>
           <w:ilvl w:val="0"/>
-          <w:numId w:val="1139"/>
+          <w:numId w:val="1145"/>
         </w:numPr>
       </w:pPr>
       <w:r>
@@ -50421,7 +51367,7 @@
         <w:pStyle w:val="Compact"/>
         <w:numPr>
           <w:ilvl w:val="0"/>
-          <w:numId w:val="1139"/>
+          <w:numId w:val="1145"/>
         </w:numPr>
       </w:pPr>
       <w:r>
@@ -50451,7 +51397,7 @@
       <w:pPr>
         <w:numPr>
           <w:ilvl w:val="0"/>
-          <w:numId w:val="1140"/>
+          <w:numId w:val="1146"/>
         </w:numPr>
       </w:pPr>
       <w:r>
@@ -50499,7 +51445,7 @@
       <w:pPr>
         <w:numPr>
           <w:ilvl w:val="0"/>
-          <w:numId w:val="1140"/>
+          <w:numId w:val="1146"/>
         </w:numPr>
       </w:pPr>
       <w:r>
@@ -50536,7 +51482,7 @@
         <w:pStyle w:val="Compact"/>
         <w:numPr>
           <w:ilvl w:val="1"/>
-          <w:numId w:val="1141"/>
+          <w:numId w:val="1147"/>
         </w:numPr>
       </w:pPr>
       <w:r>
@@ -50555,7 +51501,7 @@
         <w:pStyle w:val="Compact"/>
         <w:numPr>
           <w:ilvl w:val="1"/>
-          <w:numId w:val="1141"/>
+          <w:numId w:val="1147"/>
         </w:numPr>
       </w:pPr>
       <w:r>
@@ -50574,7 +51520,7 @@
         <w:pStyle w:val="Compact"/>
         <w:numPr>
           <w:ilvl w:val="1"/>
-          <w:numId w:val="1141"/>
+          <w:numId w:val="1147"/>
         </w:numPr>
       </w:pPr>
       <w:r>
@@ -50592,7 +51538,7 @@
       <w:pPr>
         <w:numPr>
           <w:ilvl w:val="0"/>
-          <w:numId w:val="1140"/>
+          <w:numId w:val="1146"/>
         </w:numPr>
       </w:pPr>
       <w:r>
@@ -50628,7 +51574,7 @@
       <w:pPr>
         <w:numPr>
           <w:ilvl w:val="0"/>
-          <w:numId w:val="1140"/>
+          <w:numId w:val="1146"/>
         </w:numPr>
       </w:pPr>
       <w:r>
@@ -50658,7 +51604,7 @@
       <w:pPr>
         <w:numPr>
           <w:ilvl w:val="0"/>
-          <w:numId w:val="1140"/>
+          <w:numId w:val="1146"/>
         </w:numPr>
       </w:pPr>
       <w:r>
@@ -50713,7 +51659,7 @@
         <w:pStyle w:val="Compact"/>
         <w:numPr>
           <w:ilvl w:val="0"/>
-          <w:numId w:val="1142"/>
+          <w:numId w:val="1148"/>
         </w:numPr>
       </w:pPr>
       <w:r>
@@ -50732,7 +51678,7 @@
         <w:pStyle w:val="Compact"/>
         <w:numPr>
           <w:ilvl w:val="0"/>
-          <w:numId w:val="1142"/>
+          <w:numId w:val="1148"/>
         </w:numPr>
       </w:pPr>
       <w:r>
@@ -50751,7 +51697,7 @@
         <w:pStyle w:val="Compact"/>
         <w:numPr>
           <w:ilvl w:val="0"/>
-          <w:numId w:val="1142"/>
+          <w:numId w:val="1148"/>
         </w:numPr>
       </w:pPr>
       <w:r>
@@ -50770,7 +51716,7 @@
         <w:pStyle w:val="Compact"/>
         <w:numPr>
           <w:ilvl w:val="0"/>
-          <w:numId w:val="1142"/>
+          <w:numId w:val="1148"/>
         </w:numPr>
       </w:pPr>
       <w:r>
@@ -50866,14 +51812,14 @@
         <w:t xml:space="preserve">This ensures you’re reviewing code that has already been through initial automated quality checks.</w:t>
       </w:r>
     </w:p>
-    <w:bookmarkEnd w:id="344"/>
-    <w:bookmarkStart w:id="346" w:name="reviewing-a-copilot-pr-you-didnt-create"/>
+    <w:bookmarkEnd w:id="351"/>
+    <w:bookmarkStart w:id="353" w:name="reviewing-a-copilot-pr-you-didnt-create"/>
     <w:p>
       <w:pPr>
         <w:pStyle w:val="Heading1"/>
       </w:pPr>
       <w:r>
-        <w:t xml:space="preserve">34. Reviewing a Copilot PR You Didn’t Create</w:t>
+        <w:t xml:space="preserve">35. Reviewing a Copilot PR You Didn’t Create</w:t>
       </w:r>
     </w:p>
     <w:p>
@@ -50918,7 +51864,7 @@
       <w:r>
         <w:t xml:space="preserve"> </w:t>
       </w:r>
-      <w:hyperlink r:id="rId345">
+      <w:hyperlink r:id="rId352">
         <w:r>
           <w:rPr>
             <w:rStyle w:val="Hyperlink"/>
@@ -50941,7 +51887,7 @@
         <w:pStyle w:val="Compact"/>
         <w:numPr>
           <w:ilvl w:val="0"/>
-          <w:numId w:val="1143"/>
+          <w:numId w:val="1149"/>
         </w:numPr>
       </w:pPr>
       <w:r>
@@ -50996,7 +51942,7 @@
         <w:pStyle w:val="Compact"/>
         <w:numPr>
           <w:ilvl w:val="0"/>
-          <w:numId w:val="1143"/>
+          <w:numId w:val="1149"/>
         </w:numPr>
       </w:pPr>
       <w:r>
@@ -51044,416 +51990,6 @@
           <w:bCs/>
         </w:rPr>
         <w:t xml:space="preserve">The scenario:</w:t>
-      </w:r>
-    </w:p>
-    <w:p>
-      <w:pPr>
-        <w:pStyle w:val="Compact"/>
-        <w:numPr>
-          <w:ilvl w:val="0"/>
-          <w:numId w:val="1144"/>
-        </w:numPr>
-      </w:pPr>
-      <w:r>
-        <w:t xml:space="preserve">One team member (the</w:t>
-      </w:r>
-      <w:r>
-        <w:t xml:space="preserve"> </w:t>
-      </w:r>
-      <w:r>
-        <w:t xml:space="preserve">“PR prompter”</w:t>
-      </w:r>
-      <w:r>
-        <w:t xml:space="preserve">) assigned Copilot to work on an issue or explicitly prompted Copilot to start working</w:t>
-      </w:r>
-    </w:p>
-    <w:p>
-      <w:pPr>
-        <w:pStyle w:val="Compact"/>
-        <w:numPr>
-          <w:ilvl w:val="0"/>
-          <w:numId w:val="1144"/>
-        </w:numPr>
-      </w:pPr>
-      <w:r>
-        <w:t xml:space="preserve">The prompter may or may not be the same person who originally created the issue</w:t>
-      </w:r>
-    </w:p>
-    <w:p>
-      <w:pPr>
-        <w:pStyle w:val="Compact"/>
-        <w:numPr>
-          <w:ilvl w:val="1"/>
-          <w:numId w:val="1145"/>
-        </w:numPr>
-      </w:pPr>
-      <w:r>
-        <w:t xml:space="preserve">In projects with a user base, users often submit issues (bug reports, feature requests)</w:t>
-      </w:r>
-    </w:p>
-    <w:p>
-      <w:pPr>
-        <w:pStyle w:val="Compact"/>
-        <w:numPr>
-          <w:ilvl w:val="1"/>
-          <w:numId w:val="1145"/>
-        </w:numPr>
-      </w:pPr>
-      <w:r>
-        <w:t xml:space="preserve">A project maintainer then steps in, adds their perspective, and assigns the issue to Copilot</w:t>
-      </w:r>
-    </w:p>
-    <w:p>
-      <w:pPr>
-        <w:pStyle w:val="Compact"/>
-        <w:numPr>
-          <w:ilvl w:val="1"/>
-          <w:numId w:val="1145"/>
-        </w:numPr>
-      </w:pPr>
-      <w:r>
-        <w:t xml:space="preserve">In this case, the maintainer who assigned Copilot is the prompter, not the original issue creator</w:t>
-      </w:r>
-    </w:p>
-    <w:p>
-      <w:pPr>
-        <w:pStyle w:val="Compact"/>
-        <w:numPr>
-          <w:ilvl w:val="0"/>
-          <w:numId w:val="1144"/>
-        </w:numPr>
-      </w:pPr>
-      <w:r>
-        <w:t xml:space="preserve">Copilot created the PR with the prompter as co-author</w:t>
-      </w:r>
-    </w:p>
-    <w:p>
-      <w:pPr>
-        <w:pStyle w:val="Compact"/>
-        <w:numPr>
-          <w:ilvl w:val="0"/>
-          <w:numId w:val="1144"/>
-        </w:numPr>
-      </w:pPr>
-      <w:r>
-        <w:t xml:space="preserve">The prompter (now acting as PR manager) requested your review</w:t>
-      </w:r>
-    </w:p>
-    <w:p>
-      <w:pPr>
-        <w:pStyle w:val="Compact"/>
-        <w:numPr>
-          <w:ilvl w:val="0"/>
-          <w:numId w:val="1144"/>
-        </w:numPr>
-      </w:pPr>
-      <w:r>
-        <w:t xml:space="preserve">Copilot may have also automatically reviewed the PR</w:t>
-      </w:r>
-    </w:p>
-    <w:p>
-      <w:pPr>
-        <w:pStyle w:val="FirstParagraph"/>
-      </w:pPr>
-      <w:r>
-        <w:rPr>
-          <w:b/>
-          <w:bCs/>
-        </w:rPr>
-        <w:t xml:space="preserve">As a non-manager reviewer, your role is to provide feedback,</w:t>
-      </w:r>
-      <w:r>
-        <w:rPr>
-          <w:b/>
-          <w:bCs/>
-        </w:rPr>
-        <w:t xml:space="preserve"> </w:t>
-      </w:r>
-      <w:r>
-        <w:rPr>
-          <w:b/>
-          <w:bCs/>
-        </w:rPr>
-        <w:t xml:space="preserve">not to directly initiate more work by Copilot.</w:t>
-      </w:r>
-      <w:r>
-        <w:t xml:space="preserve"> </w:t>
-      </w:r>
-      <w:r>
-        <w:t xml:space="preserve">The PR manager should remain in control of when and how Copilot makes additional changes.</w:t>
-      </w:r>
-    </w:p>
-    <w:p>
-      <w:pPr>
-        <w:pStyle w:val="BodyText"/>
-      </w:pPr>
-      <w:r>
-        <w:rPr>
-          <w:b/>
-          <w:bCs/>
-        </w:rPr>
-        <w:t xml:space="preserve">Recommended review workflow:</w:t>
-      </w:r>
-    </w:p>
-    <w:p>
-      <w:pPr>
-        <w:pStyle w:val="Compact"/>
-        <w:numPr>
-          <w:ilvl w:val="0"/>
-          <w:numId w:val="1146"/>
-        </w:numPr>
-      </w:pPr>
-      <w:r>
-        <w:rPr>
-          <w:b/>
-          <w:bCs/>
-        </w:rPr>
-        <w:t xml:space="preserve">Use</w:t>
-      </w:r>
-      <w:r>
-        <w:rPr>
-          <w:b/>
-          <w:bCs/>
-        </w:rPr>
-        <w:t xml:space="preserve"> </w:t>
-      </w:r>
-      <w:r>
-        <w:rPr>
-          <w:b/>
-          <w:bCs/>
-        </w:rPr>
-        <w:t xml:space="preserve">“Comment”</w:t>
-      </w:r>
-      <w:r>
-        <w:rPr>
-          <w:b/>
-          <w:bCs/>
-        </w:rPr>
-        <w:t xml:space="preserve"> </w:t>
-      </w:r>
-      <w:r>
-        <w:rPr>
-          <w:b/>
-          <w:bCs/>
-        </w:rPr>
-        <w:t xml:space="preserve">or</w:t>
-      </w:r>
-      <w:r>
-        <w:rPr>
-          <w:b/>
-          <w:bCs/>
-        </w:rPr>
-        <w:t xml:space="preserve"> </w:t>
-      </w:r>
-      <w:r>
-        <w:rPr>
-          <w:b/>
-          <w:bCs/>
-        </w:rPr>
-        <w:t xml:space="preserve">“Request changes”</w:t>
-      </w:r>
-      <w:r>
-        <w:rPr>
-          <w:b/>
-          <w:bCs/>
-        </w:rPr>
-        <w:t xml:space="preserve"> </w:t>
-      </w:r>
-      <w:r>
-        <w:rPr>
-          <w:b/>
-          <w:bCs/>
-        </w:rPr>
-        <w:t xml:space="preserve">based on the severity of issues</w:t>
-      </w:r>
-      <w:r>
-        <w:t xml:space="preserve">:</w:t>
-      </w:r>
-    </w:p>
-    <w:p>
-      <w:pPr>
-        <w:pStyle w:val="Compact"/>
-        <w:numPr>
-          <w:ilvl w:val="1"/>
-          <w:numId w:val="1147"/>
-        </w:numPr>
-      </w:pPr>
-      <w:r>
-        <w:t xml:space="preserve">Use</w:t>
-      </w:r>
-      <w:r>
-        <w:t xml:space="preserve"> </w:t>
-      </w:r>
-      <w:r>
-        <w:rPr>
-          <w:b/>
-          <w:bCs/>
-        </w:rPr>
-        <w:t xml:space="preserve">“Comment”</w:t>
-      </w:r>
-      <w:r>
-        <w:t xml:space="preserve"> </w:t>
-      </w:r>
-      <w:r>
-        <w:t xml:space="preserve">for suggestions, questions, or minor issues that don’t block merging</w:t>
-      </w:r>
-    </w:p>
-    <w:p>
-      <w:pPr>
-        <w:pStyle w:val="Compact"/>
-        <w:numPr>
-          <w:ilvl w:val="1"/>
-          <w:numId w:val="1147"/>
-        </w:numPr>
-      </w:pPr>
-      <w:r>
-        <w:t xml:space="preserve">Use</w:t>
-      </w:r>
-      <w:r>
-        <w:t xml:space="preserve"> </w:t>
-      </w:r>
-      <w:r>
-        <w:rPr>
-          <w:b/>
-          <w:bCs/>
-        </w:rPr>
-        <w:t xml:space="preserve">“Request changes”</w:t>
-      </w:r>
-      <w:r>
-        <w:t xml:space="preserve"> </w:t>
-      </w:r>
-      <w:r>
-        <w:t xml:space="preserve">for significant issues that must be addressed before merging</w:t>
-      </w:r>
-    </w:p>
-    <w:p>
-      <w:pPr>
-        <w:pStyle w:val="Compact"/>
-        <w:numPr>
-          <w:ilvl w:val="1"/>
-          <w:numId w:val="1147"/>
-        </w:numPr>
-      </w:pPr>
-      <w:r>
-        <w:t xml:space="preserve">Both options allow you to provide feedback without directly triggering Copilot</w:t>
-      </w:r>
-    </w:p>
-    <w:p>
-      <w:pPr>
-        <w:pStyle w:val="Compact"/>
-        <w:numPr>
-          <w:ilvl w:val="0"/>
-          <w:numId w:val="1146"/>
-        </w:numPr>
-      </w:pPr>
-      <w:r>
-        <w:rPr>
-          <w:b/>
-          <w:bCs/>
-        </w:rPr>
-        <w:t xml:space="preserve">Don’t ask Copilot to make changes directly</w:t>
-      </w:r>
-      <w:r>
-        <w:t xml:space="preserve">:</w:t>
-      </w:r>
-    </w:p>
-    <w:p>
-      <w:pPr>
-        <w:pStyle w:val="Compact"/>
-        <w:numPr>
-          <w:ilvl w:val="1"/>
-          <w:numId w:val="1148"/>
-        </w:numPr>
-      </w:pPr>
-      <w:r>
-        <w:t xml:space="preserve">Avoid using features that would trigger Copilot to start working immediately</w:t>
-      </w:r>
-    </w:p>
-    <w:p>
-      <w:pPr>
-        <w:pStyle w:val="Compact"/>
-        <w:numPr>
-          <w:ilvl w:val="1"/>
-          <w:numId w:val="1148"/>
-        </w:numPr>
-      </w:pPr>
-      <w:r>
-        <w:t xml:space="preserve">Let the PR manager decide whether to ask Copilot to address your comments or make changes themselves</w:t>
-      </w:r>
-    </w:p>
-    <w:p>
-      <w:pPr>
-        <w:pStyle w:val="Compact"/>
-        <w:numPr>
-          <w:ilvl w:val="0"/>
-          <w:numId w:val="1146"/>
-        </w:numPr>
-      </w:pPr>
-      <w:r>
-        <w:rPr>
-          <w:b/>
-          <w:bCs/>
-        </w:rPr>
-        <w:t xml:space="preserve">Write clear, actionable comments</w:t>
-      </w:r>
-      <w:r>
-        <w:t xml:space="preserve">:</w:t>
-      </w:r>
-    </w:p>
-    <w:p>
-      <w:pPr>
-        <w:pStyle w:val="Compact"/>
-        <w:numPr>
-          <w:ilvl w:val="1"/>
-          <w:numId w:val="1149"/>
-        </w:numPr>
-      </w:pPr>
-      <w:r>
-        <w:t xml:space="preserve">Explain what needs to change and why</w:t>
-      </w:r>
-    </w:p>
-    <w:p>
-      <w:pPr>
-        <w:pStyle w:val="Compact"/>
-        <w:numPr>
-          <w:ilvl w:val="1"/>
-          <w:numId w:val="1149"/>
-        </w:numPr>
-      </w:pPr>
-      <w:r>
-        <w:t xml:space="preserve">Suggest specific solutions when appropriate</w:t>
-      </w:r>
-    </w:p>
-    <w:p>
-      <w:pPr>
-        <w:pStyle w:val="Compact"/>
-        <w:numPr>
-          <w:ilvl w:val="1"/>
-          <w:numId w:val="1149"/>
-        </w:numPr>
-      </w:pPr>
-      <w:r>
-        <w:t xml:space="preserve">The PR manager will decide how to address your feedback</w:t>
-      </w:r>
-    </w:p>
-    <w:p>
-      <w:pPr>
-        <w:pStyle w:val="FirstParagraph"/>
-      </w:pPr>
-      <w:r>
-        <w:rPr>
-          <w:b/>
-          <w:bCs/>
-        </w:rPr>
-        <w:t xml:space="preserve">For PR managers:</w:t>
-      </w:r>
-    </w:p>
-    <w:p>
-      <w:pPr>
-        <w:pStyle w:val="BodyText"/>
-      </w:pPr>
-      <w:r>
-        <w:t xml:space="preserve">After receiving reviews from other team members:</w:t>
       </w:r>
     </w:p>
     <w:p>
@@ -51465,14 +52001,28 @@
         </w:numPr>
       </w:pPr>
       <w:r>
-        <w:rPr>
-          <w:b/>
-          <w:bCs/>
-        </w:rPr>
-        <w:t xml:space="preserve">Review all comments carefully</w:t>
-      </w:r>
-      <w:r>
-        <w:t xml:space="preserve">:</w:t>
+        <w:t xml:space="preserve">One team member (the</w:t>
+      </w:r>
+      <w:r>
+        <w:t xml:space="preserve"> </w:t>
+      </w:r>
+      <w:r>
+        <w:t xml:space="preserve">“PR prompter”</w:t>
+      </w:r>
+      <w:r>
+        <w:t xml:space="preserve">) assigned Copilot to work on an issue or explicitly prompted Copilot to start working</w:t>
+      </w:r>
+    </w:p>
+    <w:p>
+      <w:pPr>
+        <w:pStyle w:val="Compact"/>
+        <w:numPr>
+          <w:ilvl w:val="0"/>
+          <w:numId w:val="1150"/>
+        </w:numPr>
+      </w:pPr>
+      <w:r>
+        <w:t xml:space="preserve">The prompter may or may not be the same person who originally created the issue</w:t>
       </w:r>
     </w:p>
     <w:p>
@@ -51484,7 +52034,7 @@
         </w:numPr>
       </w:pPr>
       <w:r>
-        <w:t xml:space="preserve">Decide which comments you agree with</w:t>
+        <w:t xml:space="preserve">In projects with a user base, users often submit issues (bug reports, feature requests)</w:t>
       </w:r>
     </w:p>
     <w:p>
@@ -51496,7 +52046,7 @@
         </w:numPr>
       </w:pPr>
       <w:r>
-        <w:t xml:space="preserve">Dismiss or respond to comments you don’t entirely agree with</w:t>
+        <w:t xml:space="preserve">A project maintainer then steps in, adds their perspective, and assigns the issue to Copilot</w:t>
       </w:r>
     </w:p>
     <w:p>
@@ -51508,7 +52058,7 @@
         </w:numPr>
       </w:pPr>
       <w:r>
-        <w:t xml:space="preserve">This ensures Copilot only addresses feedback you’ve validated</w:t>
+        <w:t xml:space="preserve">In this case, the maintainer who assigned Copilot is the prompter, not the original issue creator</w:t>
       </w:r>
     </w:p>
     <w:p>
@@ -51520,77 +52070,7 @@
         </w:numPr>
       </w:pPr>
       <w:r>
-        <w:rPr>
-          <w:b/>
-          <w:bCs/>
-        </w:rPr>
-        <w:t xml:space="preserve">Choose how to address valid feedback</w:t>
-      </w:r>
-      <w:r>
-        <w:t xml:space="preserve">:</w:t>
-      </w:r>
-    </w:p>
-    <w:p>
-      <w:pPr>
-        <w:pStyle w:val="Compact"/>
-        <w:numPr>
-          <w:ilvl w:val="1"/>
-          <w:numId w:val="1152"/>
-        </w:numPr>
-      </w:pPr>
-      <w:r>
-        <w:rPr>
-          <w:b/>
-          <w:bCs/>
-        </w:rPr>
-        <w:t xml:space="preserve">Option A</w:t>
-      </w:r>
-      <w:r>
-        <w:t xml:space="preserve">: Make the changes yourself (faster for simple fixes)</w:t>
-      </w:r>
-    </w:p>
-    <w:p>
-      <w:pPr>
-        <w:pStyle w:val="Compact"/>
-        <w:numPr>
-          <w:ilvl w:val="1"/>
-          <w:numId w:val="1152"/>
-        </w:numPr>
-      </w:pPr>
-      <w:r>
-        <w:rPr>
-          <w:b/>
-          <w:bCs/>
-        </w:rPr>
-        <w:t xml:space="preserve">Option B</w:t>
-      </w:r>
-      <w:r>
-        <w:t xml:space="preserve">: Ask Copilot to address the feedback (better for complex changes)</w:t>
-      </w:r>
-    </w:p>
-    <w:p>
-      <w:pPr>
-        <w:pStyle w:val="Compact"/>
-        <w:numPr>
-          <w:ilvl w:val="1"/>
-          <w:numId w:val="1152"/>
-        </w:numPr>
-      </w:pPr>
-      <w:r>
-        <w:rPr>
-          <w:b/>
-          <w:bCs/>
-        </w:rPr>
-        <w:t xml:space="preserve">Option C</w:t>
-      </w:r>
-      <w:r>
-        <w:t xml:space="preserve">: Add your own review summarizing which comments Copilot should address,</w:t>
-      </w:r>
-      <w:r>
-        <w:t xml:space="preserve"> </w:t>
-      </w:r>
-      <w:r>
-        <w:t xml:space="preserve">then ask Copilot to respond to the open comment threads</w:t>
+        <w:t xml:space="preserve">Copilot created the PR with the prompter as co-author</w:t>
       </w:r>
     </w:p>
     <w:p>
@@ -51602,11 +52082,135 @@
         </w:numPr>
       </w:pPr>
       <w:r>
+        <w:t xml:space="preserve">The prompter (now acting as PR manager) requested your review</w:t>
+      </w:r>
+    </w:p>
+    <w:p>
+      <w:pPr>
+        <w:pStyle w:val="Compact"/>
+        <w:numPr>
+          <w:ilvl w:val="0"/>
+          <w:numId w:val="1150"/>
+        </w:numPr>
+      </w:pPr>
+      <w:r>
+        <w:t xml:space="preserve">Copilot may have also automatically reviewed the PR</w:t>
+      </w:r>
+    </w:p>
+    <w:p>
+      <w:pPr>
+        <w:pStyle w:val="FirstParagraph"/>
+      </w:pPr>
+      <w:r>
         <w:rPr>
           <w:b/>
           <w:bCs/>
         </w:rPr>
-        <w:t xml:space="preserve">Maintain clear communication</w:t>
+        <w:t xml:space="preserve">As a non-manager reviewer, your role is to provide feedback,</w:t>
+      </w:r>
+      <w:r>
+        <w:rPr>
+          <w:b/>
+          <w:bCs/>
+        </w:rPr>
+        <w:t xml:space="preserve"> </w:t>
+      </w:r>
+      <w:r>
+        <w:rPr>
+          <w:b/>
+          <w:bCs/>
+        </w:rPr>
+        <w:t xml:space="preserve">not to directly initiate more work by Copilot.</w:t>
+      </w:r>
+      <w:r>
+        <w:t xml:space="preserve"> </w:t>
+      </w:r>
+      <w:r>
+        <w:t xml:space="preserve">The PR manager should remain in control of when and how Copilot makes additional changes.</w:t>
+      </w:r>
+    </w:p>
+    <w:p>
+      <w:pPr>
+        <w:pStyle w:val="BodyText"/>
+      </w:pPr>
+      <w:r>
+        <w:rPr>
+          <w:b/>
+          <w:bCs/>
+        </w:rPr>
+        <w:t xml:space="preserve">Recommended review workflow:</w:t>
+      </w:r>
+    </w:p>
+    <w:p>
+      <w:pPr>
+        <w:pStyle w:val="Compact"/>
+        <w:numPr>
+          <w:ilvl w:val="0"/>
+          <w:numId w:val="1152"/>
+        </w:numPr>
+      </w:pPr>
+      <w:r>
+        <w:rPr>
+          <w:b/>
+          <w:bCs/>
+        </w:rPr>
+        <w:t xml:space="preserve">Use</w:t>
+      </w:r>
+      <w:r>
+        <w:rPr>
+          <w:b/>
+          <w:bCs/>
+        </w:rPr>
+        <w:t xml:space="preserve"> </w:t>
+      </w:r>
+      <w:r>
+        <w:rPr>
+          <w:b/>
+          <w:bCs/>
+        </w:rPr>
+        <w:t xml:space="preserve">“Comment”</w:t>
+      </w:r>
+      <w:r>
+        <w:rPr>
+          <w:b/>
+          <w:bCs/>
+        </w:rPr>
+        <w:t xml:space="preserve"> </w:t>
+      </w:r>
+      <w:r>
+        <w:rPr>
+          <w:b/>
+          <w:bCs/>
+        </w:rPr>
+        <w:t xml:space="preserve">or</w:t>
+      </w:r>
+      <w:r>
+        <w:rPr>
+          <w:b/>
+          <w:bCs/>
+        </w:rPr>
+        <w:t xml:space="preserve"> </w:t>
+      </w:r>
+      <w:r>
+        <w:rPr>
+          <w:b/>
+          <w:bCs/>
+        </w:rPr>
+        <w:t xml:space="preserve">“Request changes”</w:t>
+      </w:r>
+      <w:r>
+        <w:rPr>
+          <w:b/>
+          <w:bCs/>
+        </w:rPr>
+        <w:t xml:space="preserve"> </w:t>
+      </w:r>
+      <w:r>
+        <w:rPr>
+          <w:b/>
+          <w:bCs/>
+        </w:rPr>
+        <w:t xml:space="preserve">based on the severity of issues</w:t>
       </w:r>
       <w:r>
         <w:t xml:space="preserve">:</w:t>
@@ -51621,7 +52225,23 @@
         </w:numPr>
       </w:pPr>
       <w:r>
-        <w:t xml:space="preserve">Let reviewers know how you plan to address their feedback</w:t>
+        <w:t xml:space="preserve">Use</w:t>
+      </w:r>
+      <w:r>
+        <w:t xml:space="preserve"> </w:t>
+      </w:r>
+      <w:r>
+        <w:rPr>
+          <w:b/>
+          <w:bCs/>
+        </w:rPr>
+        <w:t xml:space="preserve">“Comment”</w:t>
+      </w:r>
+      <w:r>
+        <w:t xml:space="preserve"> </w:t>
+      </w:r>
+      <w:r>
+        <w:t xml:space="preserve">for suggestions, questions, or minor issues that don’t block merging</w:t>
       </w:r>
     </w:p>
     <w:p>
@@ -51633,7 +52253,23 @@
         </w:numPr>
       </w:pPr>
       <w:r>
-        <w:t xml:space="preserve">Mark conversations as resolved after addressing them</w:t>
+        <w:t xml:space="preserve">Use</w:t>
+      </w:r>
+      <w:r>
+        <w:t xml:space="preserve"> </w:t>
+      </w:r>
+      <w:r>
+        <w:rPr>
+          <w:b/>
+          <w:bCs/>
+        </w:rPr>
+        <w:t xml:space="preserve">“Request changes”</w:t>
+      </w:r>
+      <w:r>
+        <w:t xml:space="preserve"> </w:t>
+      </w:r>
+      <w:r>
+        <w:t xml:space="preserve">for significant issues that must be addressed before merging</w:t>
       </w:r>
     </w:p>
     <w:p>
@@ -51645,7 +52281,26 @@
         </w:numPr>
       </w:pPr>
       <w:r>
-        <w:t xml:space="preserve">Request re-review from humans after Copilot makes significant changes</w:t>
+        <w:t xml:space="preserve">Both options allow you to provide feedback without directly triggering Copilot</w:t>
+      </w:r>
+    </w:p>
+    <w:p>
+      <w:pPr>
+        <w:pStyle w:val="Compact"/>
+        <w:numPr>
+          <w:ilvl w:val="0"/>
+          <w:numId w:val="1152"/>
+        </w:numPr>
+      </w:pPr>
+      <w:r>
+        <w:rPr>
+          <w:b/>
+          <w:bCs/>
+        </w:rPr>
+        <w:t xml:space="preserve">Don’t ask Copilot to make changes directly</w:t>
+      </w:r>
+      <w:r>
+        <w:t xml:space="preserve">:</w:t>
       </w:r>
     </w:p>
     <w:p>
@@ -51653,55 +52308,23 @@
         <w:pStyle w:val="Compact"/>
         <w:numPr>
           <w:ilvl w:val="1"/>
-          <w:numId w:val="1153"/>
+          <w:numId w:val="1154"/>
         </w:numPr>
       </w:pPr>
       <w:r>
-        <w:t xml:space="preserve">Update the PR’s</w:t>
-      </w:r>
-      <w:r>
-        <w:t xml:space="preserve"> </w:t>
-      </w:r>
-      <w:r>
-        <w:t xml:space="preserve">“Assignees”</w:t>
-      </w:r>
-      <w:r>
-        <w:t xml:space="preserve"> </w:t>
-      </w:r>
-      <w:r>
-        <w:t xml:space="preserve">field to reflect who is currently responsible for the PR</w:t>
-      </w:r>
-    </w:p>
-    <w:p>
-      <w:pPr>
-        <w:pStyle w:val="FirstParagraph"/>
-      </w:pPr>
-      <w:r>
-        <w:rPr>
-          <w:b/>
-          <w:bCs/>
-        </w:rPr>
-        <w:t xml:space="preserve">Transferring the PR manager role:</w:t>
-      </w:r>
-    </w:p>
-    <w:p>
-      <w:pPr>
-        <w:pStyle w:val="BodyText"/>
-      </w:pPr>
-      <w:r>
-        <w:t xml:space="preserve">The original PR manager can hand over a PR to another person,</w:t>
-      </w:r>
-      <w:r>
-        <w:t xml:space="preserve"> </w:t>
-      </w:r>
-      <w:r>
-        <w:t xml:space="preserve">who then becomes the new PR manager with control over Copilot’s work on that PR.</w:t>
-      </w:r>
-      <w:r>
-        <w:t xml:space="preserve"> </w:t>
-      </w:r>
-      <w:r>
-        <w:t xml:space="preserve">This might be useful when:</w:t>
+        <w:t xml:space="preserve">Avoid using features that would trigger Copilot to start working immediately</w:t>
+      </w:r>
+    </w:p>
+    <w:p>
+      <w:pPr>
+        <w:pStyle w:val="Compact"/>
+        <w:numPr>
+          <w:ilvl w:val="1"/>
+          <w:numId w:val="1154"/>
+        </w:numPr>
+      </w:pPr>
+      <w:r>
+        <w:t xml:space="preserve">Let the PR manager decide whether to ask Copilot to address your comments or make changes themselves</w:t>
       </w:r>
     </w:p>
     <w:p>
@@ -51709,11 +52332,74 @@
         <w:pStyle w:val="Compact"/>
         <w:numPr>
           <w:ilvl w:val="0"/>
-          <w:numId w:val="1154"/>
+          <w:numId w:val="1152"/>
         </w:numPr>
       </w:pPr>
       <w:r>
-        <w:t xml:space="preserve">The original PR manager is unavailable or on leave</w:t>
+        <w:rPr>
+          <w:b/>
+          <w:bCs/>
+        </w:rPr>
+        <w:t xml:space="preserve">Write clear, actionable comments</w:t>
+      </w:r>
+      <w:r>
+        <w:t xml:space="preserve">:</w:t>
+      </w:r>
+    </w:p>
+    <w:p>
+      <w:pPr>
+        <w:pStyle w:val="Compact"/>
+        <w:numPr>
+          <w:ilvl w:val="1"/>
+          <w:numId w:val="1155"/>
+        </w:numPr>
+      </w:pPr>
+      <w:r>
+        <w:t xml:space="preserve">Explain what needs to change and why</w:t>
+      </w:r>
+    </w:p>
+    <w:p>
+      <w:pPr>
+        <w:pStyle w:val="Compact"/>
+        <w:numPr>
+          <w:ilvl w:val="1"/>
+          <w:numId w:val="1155"/>
+        </w:numPr>
+      </w:pPr>
+      <w:r>
+        <w:t xml:space="preserve">Suggest specific solutions when appropriate</w:t>
+      </w:r>
+    </w:p>
+    <w:p>
+      <w:pPr>
+        <w:pStyle w:val="Compact"/>
+        <w:numPr>
+          <w:ilvl w:val="1"/>
+          <w:numId w:val="1155"/>
+        </w:numPr>
+      </w:pPr>
+      <w:r>
+        <w:t xml:space="preserve">The PR manager will decide how to address your feedback</w:t>
+      </w:r>
+    </w:p>
+    <w:p>
+      <w:pPr>
+        <w:pStyle w:val="FirstParagraph"/>
+      </w:pPr>
+      <w:r>
+        <w:rPr>
+          <w:b/>
+          <w:bCs/>
+        </w:rPr>
+        <w:t xml:space="preserve">For PR managers:</w:t>
+      </w:r>
+    </w:p>
+    <w:p>
+      <w:pPr>
+        <w:pStyle w:val="BodyText"/>
+      </w:pPr>
+      <w:r>
+        <w:t xml:space="preserve">After receiving reviews from other team members:</w:t>
       </w:r>
     </w:p>
     <w:p>
@@ -51721,11 +52407,54 @@
         <w:pStyle w:val="Compact"/>
         <w:numPr>
           <w:ilvl w:val="0"/>
-          <w:numId w:val="1154"/>
+          <w:numId w:val="1156"/>
         </w:numPr>
       </w:pPr>
       <w:r>
-        <w:t xml:space="preserve">Someone with different expertise needs to guide the remaining work</w:t>
+        <w:rPr>
+          <w:b/>
+          <w:bCs/>
+        </w:rPr>
+        <w:t xml:space="preserve">Review all comments carefully</w:t>
+      </w:r>
+      <w:r>
+        <w:t xml:space="preserve">:</w:t>
+      </w:r>
+    </w:p>
+    <w:p>
+      <w:pPr>
+        <w:pStyle w:val="Compact"/>
+        <w:numPr>
+          <w:ilvl w:val="1"/>
+          <w:numId w:val="1157"/>
+        </w:numPr>
+      </w:pPr>
+      <w:r>
+        <w:t xml:space="preserve">Decide which comments you agree with</w:t>
+      </w:r>
+    </w:p>
+    <w:p>
+      <w:pPr>
+        <w:pStyle w:val="Compact"/>
+        <w:numPr>
+          <w:ilvl w:val="1"/>
+          <w:numId w:val="1157"/>
+        </w:numPr>
+      </w:pPr>
+      <w:r>
+        <w:t xml:space="preserve">Dismiss or respond to comments you don’t entirely agree with</w:t>
+      </w:r>
+    </w:p>
+    <w:p>
+      <w:pPr>
+        <w:pStyle w:val="Compact"/>
+        <w:numPr>
+          <w:ilvl w:val="1"/>
+          <w:numId w:val="1157"/>
+        </w:numPr>
+      </w:pPr>
+      <w:r>
+        <w:t xml:space="preserve">This ensures Copilot only addresses feedback you’ve validated</w:t>
       </w:r>
     </w:p>
     <w:p>
@@ -51733,19 +52462,81 @@
         <w:pStyle w:val="Compact"/>
         <w:numPr>
           <w:ilvl w:val="0"/>
-          <w:numId w:val="1154"/>
+          <w:numId w:val="1156"/>
         </w:numPr>
       </w:pPr>
       <w:r>
-        <w:t xml:space="preserve">Responsibilities are being redistributed within the team</w:t>
-      </w:r>
-    </w:p>
-    <w:p>
-      <w:pPr>
-        <w:pStyle w:val="FirstParagraph"/>
-      </w:pPr>
-      <w:r>
-        <w:t xml:space="preserve">To transfer the PR manager role:</w:t>
+        <w:rPr>
+          <w:b/>
+          <w:bCs/>
+        </w:rPr>
+        <w:t xml:space="preserve">Choose how to address valid feedback</w:t>
+      </w:r>
+      <w:r>
+        <w:t xml:space="preserve">:</w:t>
+      </w:r>
+    </w:p>
+    <w:p>
+      <w:pPr>
+        <w:pStyle w:val="Compact"/>
+        <w:numPr>
+          <w:ilvl w:val="1"/>
+          <w:numId w:val="1158"/>
+        </w:numPr>
+      </w:pPr>
+      <w:r>
+        <w:rPr>
+          <w:b/>
+          <w:bCs/>
+        </w:rPr>
+        <w:t xml:space="preserve">Option A</w:t>
+      </w:r>
+      <w:r>
+        <w:t xml:space="preserve">: Make the changes yourself (faster for simple fixes)</w:t>
+      </w:r>
+    </w:p>
+    <w:p>
+      <w:pPr>
+        <w:pStyle w:val="Compact"/>
+        <w:numPr>
+          <w:ilvl w:val="1"/>
+          <w:numId w:val="1158"/>
+        </w:numPr>
+      </w:pPr>
+      <w:r>
+        <w:rPr>
+          <w:b/>
+          <w:bCs/>
+        </w:rPr>
+        <w:t xml:space="preserve">Option B</w:t>
+      </w:r>
+      <w:r>
+        <w:t xml:space="preserve">: Ask Copilot to address the feedback (better for complex changes)</w:t>
+      </w:r>
+    </w:p>
+    <w:p>
+      <w:pPr>
+        <w:pStyle w:val="Compact"/>
+        <w:numPr>
+          <w:ilvl w:val="1"/>
+          <w:numId w:val="1158"/>
+        </w:numPr>
+      </w:pPr>
+      <w:r>
+        <w:rPr>
+          <w:b/>
+          <w:bCs/>
+        </w:rPr>
+        <w:t xml:space="preserve">Option C</w:t>
+      </w:r>
+      <w:r>
+        <w:t xml:space="preserve">: Add your own review summarizing which comments Copilot should address,</w:t>
+      </w:r>
+      <w:r>
+        <w:t xml:space="preserve"> </w:t>
+      </w:r>
+      <w:r>
+        <w:t xml:space="preserve">then ask Copilot to respond to the open comment threads</w:t>
       </w:r>
     </w:p>
     <w:p>
@@ -51753,11 +52544,110 @@
         <w:pStyle w:val="Compact"/>
         <w:numPr>
           <w:ilvl w:val="0"/>
-          <w:numId w:val="1155"/>
+          <w:numId w:val="1156"/>
         </w:numPr>
       </w:pPr>
       <w:r>
-        <w:t xml:space="preserve">The original PR manager should clearly communicate the handover to all reviewers</w:t>
+        <w:rPr>
+          <w:b/>
+          <w:bCs/>
+        </w:rPr>
+        <w:t xml:space="preserve">Maintain clear communication</w:t>
+      </w:r>
+      <w:r>
+        <w:t xml:space="preserve">:</w:t>
+      </w:r>
+    </w:p>
+    <w:p>
+      <w:pPr>
+        <w:pStyle w:val="Compact"/>
+        <w:numPr>
+          <w:ilvl w:val="1"/>
+          <w:numId w:val="1159"/>
+        </w:numPr>
+      </w:pPr>
+      <w:r>
+        <w:t xml:space="preserve">Let reviewers know how you plan to address their feedback</w:t>
+      </w:r>
+    </w:p>
+    <w:p>
+      <w:pPr>
+        <w:pStyle w:val="Compact"/>
+        <w:numPr>
+          <w:ilvl w:val="1"/>
+          <w:numId w:val="1159"/>
+        </w:numPr>
+      </w:pPr>
+      <w:r>
+        <w:t xml:space="preserve">Mark conversations as resolved after addressing them</w:t>
+      </w:r>
+    </w:p>
+    <w:p>
+      <w:pPr>
+        <w:pStyle w:val="Compact"/>
+        <w:numPr>
+          <w:ilvl w:val="1"/>
+          <w:numId w:val="1159"/>
+        </w:numPr>
+      </w:pPr>
+      <w:r>
+        <w:t xml:space="preserve">Request re-review from humans after Copilot makes significant changes</w:t>
+      </w:r>
+    </w:p>
+    <w:p>
+      <w:pPr>
+        <w:pStyle w:val="Compact"/>
+        <w:numPr>
+          <w:ilvl w:val="1"/>
+          <w:numId w:val="1159"/>
+        </w:numPr>
+      </w:pPr>
+      <w:r>
+        <w:t xml:space="preserve">Update the PR’s</w:t>
+      </w:r>
+      <w:r>
+        <w:t xml:space="preserve"> </w:t>
+      </w:r>
+      <w:r>
+        <w:t xml:space="preserve">“Assignees”</w:t>
+      </w:r>
+      <w:r>
+        <w:t xml:space="preserve"> </w:t>
+      </w:r>
+      <w:r>
+        <w:t xml:space="preserve">field to reflect who is currently responsible for the PR</w:t>
+      </w:r>
+    </w:p>
+    <w:p>
+      <w:pPr>
+        <w:pStyle w:val="FirstParagraph"/>
+      </w:pPr>
+      <w:r>
+        <w:rPr>
+          <w:b/>
+          <w:bCs/>
+        </w:rPr>
+        <w:t xml:space="preserve">Transferring the PR manager role:</w:t>
+      </w:r>
+    </w:p>
+    <w:p>
+      <w:pPr>
+        <w:pStyle w:val="BodyText"/>
+      </w:pPr>
+      <w:r>
+        <w:t xml:space="preserve">The original PR manager can hand over a PR to another person,</w:t>
+      </w:r>
+      <w:r>
+        <w:t xml:space="preserve"> </w:t>
+      </w:r>
+      <w:r>
+        <w:t xml:space="preserve">who then becomes the new PR manager with control over Copilot’s work on that PR.</w:t>
+      </w:r>
+      <w:r>
+        <w:t xml:space="preserve"> </w:t>
+      </w:r>
+      <w:r>
+        <w:t xml:space="preserve">This might be useful when:</w:t>
       </w:r>
     </w:p>
     <w:p>
@@ -51765,11 +52655,11 @@
         <w:pStyle w:val="Compact"/>
         <w:numPr>
           <w:ilvl w:val="0"/>
-          <w:numId w:val="1155"/>
+          <w:numId w:val="1160"/>
         </w:numPr>
       </w:pPr>
       <w:r>
-        <w:t xml:space="preserve">The new PR manager should review the PR’s history and any open feedback</w:t>
+        <w:t xml:space="preserve">The original PR manager is unavailable or on leave</w:t>
       </w:r>
     </w:p>
     <w:p>
@@ -51777,11 +52667,11 @@
         <w:pStyle w:val="Compact"/>
         <w:numPr>
           <w:ilvl w:val="0"/>
-          <w:numId w:val="1155"/>
+          <w:numId w:val="1160"/>
         </w:numPr>
       </w:pPr>
       <w:r>
-        <w:t xml:space="preserve">The new PR manager should take over responding to Copilot and managing future iterations</w:t>
+        <w:t xml:space="preserve">Someone with different expertise needs to guide the remaining work</w:t>
       </w:r>
     </w:p>
     <w:p>
@@ -51789,10 +52679,66 @@
         <w:pStyle w:val="Compact"/>
         <w:numPr>
           <w:ilvl w:val="0"/>
-          <w:numId w:val="1155"/>
+          <w:numId w:val="1160"/>
         </w:numPr>
       </w:pPr>
       <w:r>
+        <w:t xml:space="preserve">Responsibilities are being redistributed within the team</w:t>
+      </w:r>
+    </w:p>
+    <w:p>
+      <w:pPr>
+        <w:pStyle w:val="FirstParagraph"/>
+      </w:pPr>
+      <w:r>
+        <w:t xml:space="preserve">To transfer the PR manager role:</w:t>
+      </w:r>
+    </w:p>
+    <w:p>
+      <w:pPr>
+        <w:pStyle w:val="Compact"/>
+        <w:numPr>
+          <w:ilvl w:val="0"/>
+          <w:numId w:val="1161"/>
+        </w:numPr>
+      </w:pPr>
+      <w:r>
+        <w:t xml:space="preserve">The original PR manager should clearly communicate the handover to all reviewers</w:t>
+      </w:r>
+    </w:p>
+    <w:p>
+      <w:pPr>
+        <w:pStyle w:val="Compact"/>
+        <w:numPr>
+          <w:ilvl w:val="0"/>
+          <w:numId w:val="1161"/>
+        </w:numPr>
+      </w:pPr>
+      <w:r>
+        <w:t xml:space="preserve">The new PR manager should review the PR’s history and any open feedback</w:t>
+      </w:r>
+    </w:p>
+    <w:p>
+      <w:pPr>
+        <w:pStyle w:val="Compact"/>
+        <w:numPr>
+          <w:ilvl w:val="0"/>
+          <w:numId w:val="1161"/>
+        </w:numPr>
+      </w:pPr>
+      <w:r>
+        <w:t xml:space="preserve">The new PR manager should take over responding to Copilot and managing future iterations</w:t>
+      </w:r>
+    </w:p>
+    <w:p>
+      <w:pPr>
+        <w:pStyle w:val="Compact"/>
+        <w:numPr>
+          <w:ilvl w:val="0"/>
+          <w:numId w:val="1161"/>
+        </w:numPr>
+      </w:pPr>
+      <w:r>
         <w:t xml:space="preserve">The team should update the PR’s</w:t>
       </w:r>
       <w:r>
@@ -51822,14 +52768,14 @@
         <w:t xml:space="preserve">while benefiting from collaborative human review and Copilot’s implementation capabilities.</w:t>
       </w:r>
     </w:p>
-    <w:bookmarkEnd w:id="346"/>
-    <w:bookmarkStart w:id="365" w:name="sec-ai-claude-code-windows"/>
+    <w:bookmarkEnd w:id="353"/>
+    <w:bookmarkStart w:id="372" w:name="sec-ai-claude-code-windows"/>
     <w:p>
       <w:pPr>
         <w:pStyle w:val="Heading1"/>
       </w:pPr>
       <w:r>
-        <w:t xml:space="preserve">35. Installing Claude Code on Windows</w:t>
+        <w:t xml:space="preserve">36. Installing Claude Code on Windows</w:t>
       </w:r>
     </w:p>
     <w:p>
@@ -51922,12 +52868,12 @@
                 <wp:inline>
                   <wp:extent cx="152400" cy="152400"/>
                   <wp:effectExtent b="0" l="0" r="0" t="0"/>
-                  <wp:docPr descr="" title="" id="347" name="Picture"/>
+                  <wp:docPr descr="" title="" id="354" name="Picture"/>
                   <a:graphic>
                     <a:graphicData uri="http://schemas.openxmlformats.org/drawingml/2006/picture">
                       <pic:pic>
                         <pic:nvPicPr>
-                          <pic:cNvPr descr="/opt/quarto/share/formats/docx/note.png" id="348" name="Picture"/>
+                          <pic:cNvPr descr="/opt/quarto/share/formats/docx/note.png" id="355" name="Picture"/>
                           <pic:cNvPicPr>
                             <a:picLocks noChangeArrowheads="1" noChangeAspect="1"/>
                           </pic:cNvPicPr>
@@ -52015,7 +52961,7 @@
         </w:tc>
       </w:tr>
     </w:tbl>
-    <w:bookmarkStart w:id="351" w:name="run-it-from-a-unix-like-terminal"/>
+    <w:bookmarkStart w:id="358" w:name="run-it-from-a-unix-like-terminal"/>
     <w:p>
       <w:pPr>
         <w:pStyle w:val="Heading4"/>
@@ -52043,7 +52989,7 @@
         <w:pStyle w:val="Compact"/>
         <w:numPr>
           <w:ilvl w:val="0"/>
-          <w:numId w:val="1156"/>
+          <w:numId w:val="1162"/>
         </w:numPr>
       </w:pPr>
       <w:r>
@@ -52062,7 +53008,7 @@
       <w:r>
         <w:t xml:space="preserve"> </w:t>
       </w:r>
-      <w:hyperlink r:id="rId349">
+      <w:hyperlink r:id="rId356">
         <w:r>
           <w:rPr>
             <w:rStyle w:val="Hyperlink"/>
@@ -52079,7 +53025,7 @@
         <w:pStyle w:val="Compact"/>
         <w:numPr>
           <w:ilvl w:val="0"/>
-          <w:numId w:val="1156"/>
+          <w:numId w:val="1162"/>
         </w:numPr>
       </w:pPr>
       <w:r>
@@ -52095,7 +53041,7 @@
       <w:r>
         <w:t xml:space="preserve">(</w:t>
       </w:r>
-      <w:hyperlink r:id="rId350">
+      <w:hyperlink r:id="rId357">
         <w:r>
           <w:rPr>
             <w:rStyle w:val="Hyperlink"/>
@@ -52133,7 +53079,7 @@
         <w:pStyle w:val="Compact"/>
         <w:numPr>
           <w:ilvl w:val="0"/>
-          <w:numId w:val="1156"/>
+          <w:numId w:val="1162"/>
         </w:numPr>
       </w:pPr>
       <w:r>
@@ -52246,8 +53192,8 @@
         <w:t xml:space="preserve">gotchas below don’t apply.</w:t>
       </w:r>
     </w:p>
-    <w:bookmarkEnd w:id="351"/>
-    <w:bookmarkStart w:id="356" w:name="install-claude-code"/>
+    <w:bookmarkEnd w:id="358"/>
+    <w:bookmarkStart w:id="363" w:name="install-claude-code"/>
     <w:p>
       <w:pPr>
         <w:pStyle w:val="Heading4"/>
@@ -52268,7 +53214,7 @@
       <w:pPr>
         <w:numPr>
           <w:ilvl w:val="0"/>
-          <w:numId w:val="1157"/>
+          <w:numId w:val="1163"/>
         </w:numPr>
       </w:pPr>
       <w:r>
@@ -52393,7 +53339,7 @@
       <w:pPr>
         <w:numPr>
           <w:ilvl w:val="0"/>
-          <w:numId w:val="1157"/>
+          <w:numId w:val="1163"/>
         </w:numPr>
       </w:pPr>
       <w:r>
@@ -52412,7 +53358,7 @@
       <w:r>
         <w:t xml:space="preserve"> </w:t>
       </w:r>
-      <w:hyperlink r:id="rId352">
+      <w:hyperlink r:id="rId359">
         <w:r>
           <w:rPr>
             <w:rStyle w:val="Hyperlink"/>
@@ -52498,12 +53444,12 @@
                 <wp:inline>
                   <wp:extent cx="152400" cy="152400"/>
                   <wp:effectExtent b="0" l="0" r="0" t="0"/>
-                  <wp:docPr descr="" title="" id="353" name="Picture"/>
+                  <wp:docPr descr="" title="" id="360" name="Picture"/>
                   <a:graphic>
                     <a:graphicData uri="http://schemas.openxmlformats.org/drawingml/2006/picture">
                       <pic:pic>
                         <pic:nvPicPr>
-                          <pic:cNvPr descr="/opt/quarto/share/formats/docx/important.png" id="354" name="Picture"/>
+                          <pic:cNvPr descr="/opt/quarto/share/formats/docx/important.png" id="361" name="Picture"/>
                           <pic:cNvPicPr>
                             <a:picLocks noChangeArrowheads="1" noChangeAspect="1"/>
                           </pic:cNvPicPr>
@@ -52659,7 +53605,7 @@
             <w:r>
               <w:t xml:space="preserve"> </w:t>
             </w:r>
-            <w:hyperlink r:id="rId355">
+            <w:hyperlink r:id="rId362">
               <w:r>
                 <w:rPr>
                   <w:rStyle w:val="Hyperlink"/>
@@ -52750,8 +53696,8 @@
         </w:tc>
       </w:tr>
     </w:tbl>
-    <w:bookmarkEnd w:id="356"/>
-    <w:bookmarkStart w:id="358" w:name="make-sure-your-shell-can-find-claude"/>
+    <w:bookmarkEnd w:id="363"/>
+    <w:bookmarkStart w:id="365" w:name="make-sure-your-shell-can-find-claude"/>
     <w:p>
       <w:pPr>
         <w:pStyle w:val="Heading4"/>
@@ -53349,7 +54295,7 @@
       <w:r>
         <w:t xml:space="preserve"> </w:t>
       </w:r>
-      <w:hyperlink r:id="rId357">
+      <w:hyperlink r:id="rId364">
         <w:r>
           <w:rPr>
             <w:rStyle w:val="Hyperlink"/>
@@ -53455,8 +54401,8 @@
         <w:t xml:space="preserve">initializes).</w:t>
       </w:r>
     </w:p>
-    <w:bookmarkEnd w:id="358"/>
-    <w:bookmarkStart w:id="361" w:name="X604325b0223e79803e04f87e7874b1d7f4a0663"/>
+    <w:bookmarkEnd w:id="365"/>
+    <w:bookmarkStart w:id="368" w:name="X604325b0223e79803e04f87e7874b1d7f4a0663"/>
     <w:p>
       <w:pPr>
         <w:pStyle w:val="Heading4"/>
@@ -53506,12 +54452,12 @@
                 <wp:inline>
                   <wp:extent cx="152400" cy="152400"/>
                   <wp:effectExtent b="0" l="0" r="0" t="0"/>
-                  <wp:docPr descr="" title="" id="359" name="Picture"/>
+                  <wp:docPr descr="" title="" id="366" name="Picture"/>
                   <a:graphic>
                     <a:graphicData uri="http://schemas.openxmlformats.org/drawingml/2006/picture">
                       <pic:pic>
                         <pic:nvPicPr>
-                          <pic:cNvPr descr="/opt/quarto/share/formats/docx/warning.png" id="360" name="Picture"/>
+                          <pic:cNvPr descr="/opt/quarto/share/formats/docx/warning.png" id="367" name="Picture"/>
                           <pic:cNvPicPr>
                             <a:picLocks noChangeArrowheads="1" noChangeAspect="1"/>
                           </pic:cNvPicPr>
@@ -53779,8 +54725,8 @@
         </w:tc>
       </w:tr>
     </w:tbl>
-    <w:bookmarkEnd w:id="361"/>
-    <w:bookmarkStart w:id="363" w:name="X1745fd502df7963ed7ce48d0465493b4d59ad92"/>
+    <w:bookmarkEnd w:id="368"/>
+    <w:bookmarkStart w:id="370" w:name="X1745fd502df7963ed7ce48d0465493b4d59ad92"/>
     <w:p>
       <w:pPr>
         <w:pStyle w:val="Heading4"/>
@@ -53799,7 +54745,7 @@
       <w:r>
         <w:t xml:space="preserve"> </w:t>
       </w:r>
-      <w:hyperlink r:id="rId362">
+      <w:hyperlink r:id="rId369">
         <w:r>
           <w:rPr>
             <w:rStyle w:val="Hyperlink"/>
@@ -53960,8 +54906,8 @@
         <w:t xml:space="preserve">.</w:t>
       </w:r>
     </w:p>
-    <w:bookmarkEnd w:id="363"/>
-    <w:bookmarkStart w:id="364" w:name="verify-the-install"/>
+    <w:bookmarkEnd w:id="370"/>
+    <w:bookmarkStart w:id="371" w:name="verify-the-install"/>
     <w:p>
       <w:pPr>
         <w:pStyle w:val="Heading4"/>
@@ -54130,15 +55076,15 @@
         <w:t xml:space="preserve">(or open a fresh window) after changing it.</w:t>
       </w:r>
     </w:p>
-    <w:bookmarkEnd w:id="364"/>
-    <w:bookmarkEnd w:id="365"/>
-    <w:bookmarkStart w:id="379" w:name="sec-ai-mcp-server-setup"/>
+    <w:bookmarkEnd w:id="371"/>
+    <w:bookmarkEnd w:id="372"/>
+    <w:bookmarkStart w:id="386" w:name="sec-ai-mcp-server-setup"/>
     <w:p>
       <w:pPr>
         <w:pStyle w:val="Heading1"/>
       </w:pPr>
       <w:r>
-        <w:t xml:space="preserve">36. Setting up MCP servers</w:t>
+        <w:t xml:space="preserve">37. Setting up MCP servers</w:t>
       </w:r>
     </w:p>
     <w:p>
@@ -54253,12 +55199,12 @@
                 <wp:inline>
                   <wp:extent cx="152400" cy="152400"/>
                   <wp:effectExtent b="0" l="0" r="0" t="0"/>
-                  <wp:docPr descr="" title="" id="366" name="Picture"/>
+                  <wp:docPr descr="" title="" id="373" name="Picture"/>
                   <a:graphic>
                     <a:graphicData uri="http://schemas.openxmlformats.org/drawingml/2006/picture">
                       <pic:pic>
                         <pic:nvPicPr>
-                          <pic:cNvPr descr="/opt/quarto/share/formats/docx/note.png" id="367" name="Picture"/>
+                          <pic:cNvPr descr="/opt/quarto/share/formats/docx/note.png" id="374" name="Picture"/>
                           <pic:cNvPicPr>
                             <a:picLocks noChangeArrowheads="1" noChangeAspect="1"/>
                           </pic:cNvPicPr>
@@ -54352,7 +55298,7 @@
         </w:tc>
       </w:tr>
     </w:tbl>
-    <w:bookmarkStart w:id="369" w:name="installed-is-not-registered"/>
+    <w:bookmarkStart w:id="376" w:name="installed-is-not-registered"/>
     <w:p>
       <w:pPr>
         <w:pStyle w:val="Heading4"/>
@@ -54383,7 +55329,7 @@
       <w:r>
         <w:t xml:space="preserve"> </w:t>
       </w:r>
-      <w:hyperlink r:id="rId368">
+      <w:hyperlink r:id="rId375">
         <w:r>
           <w:rPr>
             <w:rStyle w:val="VerbatimChar"/>
@@ -54451,8 +55397,8 @@
         <w:t xml:space="preserve"> mcp list</w:t>
       </w:r>
     </w:p>
-    <w:bookmarkEnd w:id="369"/>
-    <w:bookmarkStart w:id="370" w:name="Xf6682145328c756d2e167d2c91be34f7f913a7f"/>
+    <w:bookmarkEnd w:id="376"/>
+    <w:bookmarkStart w:id="377" w:name="Xf6682145328c756d2e167d2c91be34f7f913a7f"/>
     <w:p>
       <w:pPr>
         <w:pStyle w:val="Heading4"/>
@@ -54651,8 +55597,8 @@
         <w:t xml:space="preserve">A local one shows a command path instead.</w:t>
       </w:r>
     </w:p>
-    <w:bookmarkEnd w:id="370"/>
-    <w:bookmarkStart w:id="371" w:name="and-401-mean-different-things"/>
+    <w:bookmarkEnd w:id="377"/>
+    <w:bookmarkStart w:id="378" w:name="and-401-mean-different-things"/>
     <w:p>
       <w:pPr>
         <w:pStyle w:val="Heading4"/>
@@ -54814,7 +55760,7 @@
         <w:pStyle w:val="Compact"/>
         <w:numPr>
           <w:ilvl w:val="0"/>
-          <w:numId w:val="1158"/>
+          <w:numId w:val="1164"/>
         </w:numPr>
       </w:pPr>
       <w:r>
@@ -54842,7 +55788,7 @@
         <w:pStyle w:val="Compact"/>
         <w:numPr>
           <w:ilvl w:val="0"/>
-          <w:numId w:val="1158"/>
+          <w:numId w:val="1164"/>
         </w:numPr>
       </w:pPr>
       <w:r>
@@ -54895,8 +55841,8 @@
         <w:t xml:space="preserve">sends you to the token-minting page for a problem that lives in a config file.</w:t>
       </w:r>
     </w:p>
-    <w:bookmarkEnd w:id="371"/>
-    <w:bookmarkStart w:id="372" w:name="install-the-binary-the-platforms-own-way"/>
+    <w:bookmarkEnd w:id="378"/>
+    <w:bookmarkStart w:id="379" w:name="install-the-binary-the-platforms-own-way"/>
     <w:p>
       <w:pPr>
         <w:pStyle w:val="Heading4"/>
@@ -55150,8 +56096,8 @@
         <w:t xml:space="preserve">with an override for the case where it isn’t on one.</w:t>
       </w:r>
     </w:p>
-    <w:bookmarkEnd w:id="372"/>
-    <w:bookmarkStart w:id="373" w:name="X2adb24e9b1a0644f0fbebe685525dadd8a56387"/>
+    <w:bookmarkEnd w:id="379"/>
+    <w:bookmarkStart w:id="380" w:name="X2adb24e9b1a0644f0fbebe685525dadd8a56387"/>
     <w:p>
       <w:pPr>
         <w:pStyle w:val="Heading4"/>
@@ -56028,8 +56974,8 @@
         <w:t xml:space="preserve">bug you just finished diagnosing.</w:t>
       </w:r>
     </w:p>
-    <w:bookmarkEnd w:id="373"/>
-    <w:bookmarkStart w:id="374" w:name="X448547516ab06679b064b391b05a896db41ea57"/>
+    <w:bookmarkEnd w:id="380"/>
+    <w:bookmarkStart w:id="381" w:name="X448547516ab06679b064b391b05a896db41ea57"/>
     <w:p>
       <w:pPr>
         <w:pStyle w:val="Heading4"/>
@@ -56351,8 +57297,8 @@
         <w:t xml:space="preserve">the count moving the right direction, as the check above expects.</w:t>
       </w:r>
     </w:p>
-    <w:bookmarkEnd w:id="374"/>
-    <w:bookmarkStart w:id="375" w:name="X4a4c9992603eee0123b58b5b37e7fedbb817150"/>
+    <w:bookmarkEnd w:id="381"/>
+    <w:bookmarkStart w:id="382" w:name="X4a4c9992603eee0123b58b5b37e7fedbb817150"/>
     <w:p>
       <w:pPr>
         <w:pStyle w:val="Heading4"/>
@@ -56452,8 +57398,8 @@
         <w:t xml:space="preserve">Reach for those instead when working from a local harness.</w:t>
       </w:r>
     </w:p>
-    <w:bookmarkEnd w:id="375"/>
-    <w:bookmarkStart w:id="376" w:name="Xb256c2a3c0a422f2f687a98903d3521fd60a1b1"/>
+    <w:bookmarkEnd w:id="382"/>
+    <w:bookmarkStart w:id="383" w:name="Xb256c2a3c0a422f2f687a98903d3521fd60a1b1"/>
     <w:p>
       <w:pPr>
         <w:pStyle w:val="Heading4"/>
@@ -56629,8 +57575,8 @@
         <w:t xml:space="preserve">not something an agent does in passing.</w:t>
       </w:r>
     </w:p>
-    <w:bookmarkEnd w:id="376"/>
-    <w:bookmarkStart w:id="378" w:name="Xd44df015462fcf288556a538677f0a762c9ef1d"/>
+    <w:bookmarkEnd w:id="383"/>
+    <w:bookmarkStart w:id="385" w:name="Xd44df015462fcf288556a538677f0a762c9ef1d"/>
     <w:p>
       <w:pPr>
         <w:pStyle w:val="Heading4"/>
@@ -56744,7 +57690,7 @@
       <w:r>
         <w:t xml:space="preserve"> </w:t>
       </w:r>
-      <w:hyperlink r:id="rId377">
+      <w:hyperlink r:id="rId384">
         <w:r>
           <w:rPr>
             <w:rStyle w:val="Hyperlink"/>
@@ -56770,7 +57716,7 @@
         <w:pStyle w:val="Compact"/>
         <w:numPr>
           <w:ilvl w:val="0"/>
-          <w:numId w:val="1159"/>
+          <w:numId w:val="1165"/>
         </w:numPr>
       </w:pPr>
       <w:r>
@@ -56782,7 +57728,7 @@
         <w:pStyle w:val="Compact"/>
         <w:numPr>
           <w:ilvl w:val="0"/>
-          <w:numId w:val="1159"/>
+          <w:numId w:val="1165"/>
         </w:numPr>
       </w:pPr>
       <w:r>
@@ -56800,7 +57746,7 @@
         <w:pStyle w:val="Compact"/>
         <w:numPr>
           <w:ilvl w:val="0"/>
-          <w:numId w:val="1159"/>
+          <w:numId w:val="1165"/>
         </w:numPr>
       </w:pPr>
       <w:r>
@@ -56828,7 +57774,7 @@
         <w:pStyle w:val="Compact"/>
         <w:numPr>
           <w:ilvl w:val="0"/>
-          <w:numId w:val="1159"/>
+          <w:numId w:val="1165"/>
         </w:numPr>
       </w:pPr>
       <w:r>
@@ -56840,7 +57786,7 @@
         <w:pStyle w:val="Compact"/>
         <w:numPr>
           <w:ilvl w:val="0"/>
-          <w:numId w:val="1159"/>
+          <w:numId w:val="1165"/>
         </w:numPr>
       </w:pPr>
       <w:r>
@@ -56873,7 +57819,7 @@
         <w:pStyle w:val="Compact"/>
         <w:numPr>
           <w:ilvl w:val="0"/>
-          <w:numId w:val="1159"/>
+          <w:numId w:val="1165"/>
         </w:numPr>
       </w:pPr>
       <w:r>
@@ -56927,15 +57873,15 @@
         <w:t xml:space="preserve">and expect it to work.</w:t>
       </w:r>
     </w:p>
-    <w:bookmarkEnd w:id="378"/>
-    <w:bookmarkEnd w:id="379"/>
-    <w:bookmarkStart w:id="387" w:name="sec-ai-gemini-spend-management"/>
+    <w:bookmarkEnd w:id="385"/>
+    <w:bookmarkEnd w:id="386"/>
+    <w:bookmarkStart w:id="394" w:name="sec-ai-gemini-spend-management"/>
     <w:p>
       <w:pPr>
         <w:pStyle w:val="Heading1"/>
       </w:pPr>
       <w:r>
-        <w:t xml:space="preserve">37. Managing Gemini API Spend and Cost Optimization</w:t>
+        <w:t xml:space="preserve">38. Managing Gemini API Spend and Cost Optimization</w:t>
       </w:r>
     </w:p>
     <w:p>
@@ -56958,7 +57904,7 @@
         <w:t xml:space="preserve">and optimize token consumption across local tools and GitHub Actions workflows.</w:t>
       </w:r>
     </w:p>
-    <w:bookmarkStart w:id="381" w:name="Xd8c10be17edf039db5b664720f228274181ba18"/>
+    <w:bookmarkStart w:id="388" w:name="Xd8c10be17edf039db5b664720f228274181ba18"/>
     <w:p>
       <w:pPr>
         <w:pStyle w:val="Heading4"/>
@@ -57022,7 +57968,7 @@
       <w:r>
         <w:t xml:space="preserve"> </w:t>
       </w:r>
-      <w:hyperlink r:id="rId380">
+      <w:hyperlink r:id="rId387">
         <w:r>
           <w:rPr>
             <w:rStyle w:val="Hyperlink"/>
@@ -57108,7 +58054,7 @@
         <w:pStyle w:val="Compact"/>
         <w:numPr>
           <w:ilvl w:val="0"/>
-          <w:numId w:val="1160"/>
+          <w:numId w:val="1166"/>
         </w:numPr>
       </w:pPr>
       <w:r>
@@ -57117,7 +58063,7 @@
       <w:r>
         <w:t xml:space="preserve"> </w:t>
       </w:r>
-      <w:hyperlink r:id="rId380">
+      <w:hyperlink r:id="rId387">
         <w:r>
           <w:rPr>
             <w:rStyle w:val="Hyperlink"/>
@@ -57134,7 +58080,7 @@
         <w:pStyle w:val="Compact"/>
         <w:numPr>
           <w:ilvl w:val="0"/>
-          <w:numId w:val="1160"/>
+          <w:numId w:val="1166"/>
         </w:numPr>
       </w:pPr>
       <w:r>
@@ -57146,15 +58092,15 @@
         <w:pStyle w:val="Compact"/>
         <w:numPr>
           <w:ilvl w:val="0"/>
-          <w:numId w:val="1160"/>
+          <w:numId w:val="1166"/>
         </w:numPr>
       </w:pPr>
       <w:r>
         <w:t xml:space="preserve">Any project that has hit its monthly spend cap will have its API requests paused until the limit is updated.</w:t>
       </w:r>
     </w:p>
-    <w:bookmarkEnd w:id="381"/>
-    <w:bookmarkStart w:id="383" w:name="adjusting-and-unpausing-spend-caps"/>
+    <w:bookmarkEnd w:id="388"/>
+    <w:bookmarkStart w:id="390" w:name="adjusting-and-unpausing-spend-caps"/>
     <w:p>
       <w:pPr>
         <w:pStyle w:val="Heading4"/>
@@ -57176,7 +58122,7 @@
         <w:pStyle w:val="Compact"/>
         <w:numPr>
           <w:ilvl w:val="0"/>
-          <w:numId w:val="1161"/>
+          <w:numId w:val="1167"/>
         </w:numPr>
       </w:pPr>
       <w:r>
@@ -57185,7 +58131,7 @@
       <w:r>
         <w:t xml:space="preserve"> </w:t>
       </w:r>
-      <w:hyperlink r:id="rId382">
+      <w:hyperlink r:id="rId389">
         <w:r>
           <w:rPr>
             <w:rStyle w:val="Hyperlink"/>
@@ -57202,7 +58148,7 @@
         <w:pStyle w:val="Compact"/>
         <w:numPr>
           <w:ilvl w:val="0"/>
-          <w:numId w:val="1161"/>
+          <w:numId w:val="1167"/>
         </w:numPr>
       </w:pPr>
       <w:r>
@@ -57214,7 +58160,7 @@
         <w:pStyle w:val="Compact"/>
         <w:numPr>
           <w:ilvl w:val="0"/>
-          <w:numId w:val="1161"/>
+          <w:numId w:val="1167"/>
         </w:numPr>
       </w:pPr>
       <w:r>
@@ -57254,8 +58200,8 @@
         <w:t xml:space="preserve">and API service automatically resumes up to the configured cap.</w:t>
       </w:r>
     </w:p>
-    <w:bookmarkEnd w:id="383"/>
-    <w:bookmarkStart w:id="385" w:name="setting-up-google-cloud-budget-alerts"/>
+    <w:bookmarkEnd w:id="390"/>
+    <w:bookmarkStart w:id="392" w:name="setting-up-google-cloud-budget-alerts"/>
     <w:p>
       <w:pPr>
         <w:pStyle w:val="Heading4"/>
@@ -57277,7 +58223,7 @@
         <w:pStyle w:val="Compact"/>
         <w:numPr>
           <w:ilvl w:val="0"/>
-          <w:numId w:val="1162"/>
+          <w:numId w:val="1168"/>
         </w:numPr>
       </w:pPr>
       <w:r>
@@ -57286,7 +58232,7 @@
       <w:r>
         <w:t xml:space="preserve"> </w:t>
       </w:r>
-      <w:hyperlink r:id="rId384">
+      <w:hyperlink r:id="rId391">
         <w:r>
           <w:rPr>
             <w:rStyle w:val="Hyperlink"/>
@@ -57303,7 +58249,7 @@
         <w:pStyle w:val="Compact"/>
         <w:numPr>
           <w:ilvl w:val="0"/>
-          <w:numId w:val="1162"/>
+          <w:numId w:val="1168"/>
         </w:numPr>
       </w:pPr>
       <w:r>
@@ -57328,7 +58274,7 @@
         <w:pStyle w:val="Compact"/>
         <w:numPr>
           <w:ilvl w:val="0"/>
-          <w:numId w:val="1162"/>
+          <w:numId w:val="1168"/>
         </w:numPr>
       </w:pPr>
       <w:r>
@@ -57352,7 +58298,7 @@
         <w:pStyle w:val="Compact"/>
         <w:numPr>
           <w:ilvl w:val="0"/>
-          <w:numId w:val="1162"/>
+          <w:numId w:val="1168"/>
         </w:numPr>
       </w:pPr>
       <w:r>
@@ -57364,7 +58310,7 @@
         <w:pStyle w:val="Compact"/>
         <w:numPr>
           <w:ilvl w:val="0"/>
-          <w:numId w:val="1162"/>
+          <w:numId w:val="1168"/>
         </w:numPr>
       </w:pPr>
       <w:r>
@@ -57418,7 +58364,7 @@
         <w:pStyle w:val="Compact"/>
         <w:numPr>
           <w:ilvl w:val="0"/>
-          <w:numId w:val="1162"/>
+          <w:numId w:val="1168"/>
         </w:numPr>
       </w:pPr>
       <w:r>
@@ -57438,8 +58384,8 @@
         <w:t xml:space="preserve">. You will receive email alerts before any project hits its spend cap.</w:t>
       </w:r>
     </w:p>
-    <w:bookmarkEnd w:id="385"/>
-    <w:bookmarkStart w:id="386" w:name="cost-optimization-best-practices"/>
+    <w:bookmarkEnd w:id="392"/>
+    <w:bookmarkStart w:id="393" w:name="cost-optimization-best-practices"/>
     <w:p>
       <w:pPr>
         <w:pStyle w:val="Heading4"/>
@@ -57461,7 +58407,7 @@
         <w:pStyle w:val="Compact"/>
         <w:numPr>
           <w:ilvl w:val="0"/>
-          <w:numId w:val="1163"/>
+          <w:numId w:val="1169"/>
         </w:numPr>
       </w:pPr>
       <w:r>
@@ -57597,7 +58543,7 @@
         <w:pStyle w:val="Compact"/>
         <w:numPr>
           <w:ilvl w:val="0"/>
-          <w:numId w:val="1163"/>
+          <w:numId w:val="1169"/>
         </w:numPr>
       </w:pPr>
       <w:r>
@@ -57628,7 +58574,7 @@
         <w:pStyle w:val="Compact"/>
         <w:numPr>
           <w:ilvl w:val="0"/>
-          <w:numId w:val="1163"/>
+          <w:numId w:val="1169"/>
         </w:numPr>
       </w:pPr>
       <w:r>
@@ -57659,7 +58605,7 @@
         <w:pStyle w:val="Compact"/>
         <w:numPr>
           <w:ilvl w:val="0"/>
-          <w:numId w:val="1163"/>
+          <w:numId w:val="1169"/>
         </w:numPr>
       </w:pPr>
       <w:r>
@@ -57754,9 +58700,9 @@
         <w:t xml:space="preserve">to collapse them in GitHub’s web diff view and exclude them from repository language statistics.</w:t>
       </w:r>
     </w:p>
-    <w:bookmarkEnd w:id="386"/>
-    <w:bookmarkEnd w:id="387"/>
-    <w:bookmarkStart w:id="417" w:name="references"/>
+    <w:bookmarkEnd w:id="393"/>
+    <w:bookmarkEnd w:id="394"/>
+    <w:bookmarkStart w:id="424" w:name="references"/>
     <w:p>
       <w:pPr>
         <w:pStyle w:val="Heading1"/>
@@ -57765,8 +58711,8 @@
         <w:t xml:space="preserve">References</w:t>
       </w:r>
     </w:p>
-    <w:bookmarkStart w:id="416" w:name="refs"/>
-    <w:bookmarkStart w:id="389" w:name="ref-space_odyssey"/>
+    <w:bookmarkStart w:id="423" w:name="refs"/>
+    <w:bookmarkStart w:id="396" w:name="ref-space_odyssey"/>
     <w:p>
       <w:pPr>
         <w:pStyle w:val="Bibliography"/>
@@ -57784,7 +58730,7 @@
       <w:r>
         <w:t xml:space="preserve"> </w:t>
       </w:r>
-      <w:hyperlink r:id="rId388">
+      <w:hyperlink r:id="rId395">
         <w:r>
           <w:rPr>
             <w:rStyle w:val="Hyperlink"/>
@@ -57796,8 +58742,8 @@
         <w:t xml:space="preserve">.</w:t>
       </w:r>
     </w:p>
-    <w:bookmarkEnd w:id="389"/>
-    <w:bookmarkStart w:id="391" w:name="ref-i_robot"/>
+    <w:bookmarkEnd w:id="396"/>
+    <w:bookmarkStart w:id="398" w:name="ref-i_robot"/>
     <w:p>
       <w:pPr>
         <w:pStyle w:val="Bibliography"/>
@@ -57821,7 +58767,7 @@
       <w:r>
         <w:t xml:space="preserve"> </w:t>
       </w:r>
-      <w:hyperlink r:id="rId390">
+      <w:hyperlink r:id="rId397">
         <w:r>
           <w:rPr>
             <w:rStyle w:val="Hyperlink"/>
@@ -57833,8 +58779,8 @@
         <w:t xml:space="preserve">.</w:t>
       </w:r>
     </w:p>
-    <w:bookmarkEnd w:id="391"/>
-    <w:bookmarkStart w:id="393" w:name="ref-battlestar_galactica_2004"/>
+    <w:bookmarkEnd w:id="398"/>
+    <w:bookmarkStart w:id="400" w:name="ref-battlestar_galactica_2004"/>
     <w:p>
       <w:pPr>
         <w:pStyle w:val="Bibliography"/>
@@ -57852,7 +58798,7 @@
       <w:r>
         <w:t xml:space="preserve"> </w:t>
       </w:r>
-      <w:hyperlink r:id="rId392">
+      <w:hyperlink r:id="rId399">
         <w:r>
           <w:rPr>
             <w:rStyle w:val="Hyperlink"/>
@@ -57864,8 +58810,8 @@
         <w:t xml:space="preserve">.</w:t>
       </w:r>
     </w:p>
-    <w:bookmarkEnd w:id="393"/>
-    <w:bookmarkStart w:id="395" w:name="ref-slm_agentic_ai"/>
+    <w:bookmarkEnd w:id="400"/>
+    <w:bookmarkStart w:id="402" w:name="ref-slm_agentic_ai"/>
     <w:p>
       <w:pPr>
         <w:pStyle w:val="Bibliography"/>
@@ -57889,7 +58835,7 @@
       <w:r>
         <w:t xml:space="preserve"> </w:t>
       </w:r>
-      <w:hyperlink r:id="rId394">
+      <w:hyperlink r:id="rId401">
         <w:r>
           <w:rPr>
             <w:rStyle w:val="Hyperlink"/>
@@ -57901,8 +58847,8 @@
         <w:t xml:space="preserve">.</w:t>
       </w:r>
     </w:p>
-    <w:bookmarkEnd w:id="395"/>
-    <w:bookmarkStart w:id="397" w:name="ref-blade_runner"/>
+    <w:bookmarkEnd w:id="402"/>
+    <w:bookmarkStart w:id="404" w:name="ref-blade_runner"/>
     <w:p>
       <w:pPr>
         <w:pStyle w:val="Bibliography"/>
@@ -57920,7 +58866,7 @@
       <w:r>
         <w:t xml:space="preserve"> </w:t>
       </w:r>
-      <w:hyperlink r:id="rId396">
+      <w:hyperlink r:id="rId403">
         <w:r>
           <w:rPr>
             <w:rStyle w:val="Hyperlink"/>
@@ -57932,8 +58878,8 @@
         <w:t xml:space="preserve">.</w:t>
       </w:r>
     </w:p>
-    <w:bookmarkEnd w:id="397"/>
-    <w:bookmarkStart w:id="399" w:name="ref-enders_game"/>
+    <w:bookmarkEnd w:id="404"/>
+    <w:bookmarkStart w:id="406" w:name="ref-enders_game"/>
     <w:p>
       <w:pPr>
         <w:pStyle w:val="Bibliography"/>
@@ -57957,7 +58903,7 @@
       <w:r>
         <w:t xml:space="preserve"> </w:t>
       </w:r>
-      <w:hyperlink r:id="rId398">
+      <w:hyperlink r:id="rId405">
         <w:r>
           <w:rPr>
             <w:rStyle w:val="Hyperlink"/>
@@ -57969,8 +58915,8 @@
         <w:t xml:space="preserve">.</w:t>
       </w:r>
     </w:p>
-    <w:bookmarkEnd w:id="399"/>
-    <w:bookmarkStart w:id="401" w:name="ref-qlora"/>
+    <w:bookmarkEnd w:id="406"/>
+    <w:bookmarkStart w:id="408" w:name="ref-qlora"/>
     <w:p>
       <w:pPr>
         <w:pStyle w:val="Bibliography"/>
@@ -57994,7 +58940,7 @@
       <w:r>
         <w:t xml:space="preserve"> </w:t>
       </w:r>
-      <w:hyperlink r:id="rId400">
+      <w:hyperlink r:id="rId407">
         <w:r>
           <w:rPr>
             <w:rStyle w:val="Hyperlink"/>
@@ -58006,8 +58952,8 @@
         <w:t xml:space="preserve">.</w:t>
       </w:r>
     </w:p>
-    <w:bookmarkEnd w:id="401"/>
-    <w:bookmarkStart w:id="403" w:name="ref-humans_are_dead"/>
+    <w:bookmarkEnd w:id="408"/>
+    <w:bookmarkStart w:id="410" w:name="ref-humans_are_dead"/>
     <w:p>
       <w:pPr>
         <w:pStyle w:val="Bibliography"/>
@@ -58031,7 +58977,7 @@
       <w:r>
         <w:t xml:space="preserve"> </w:t>
       </w:r>
-      <w:hyperlink r:id="rId402">
+      <w:hyperlink r:id="rId409">
         <w:r>
           <w:rPr>
             <w:rStyle w:val="Hyperlink"/>
@@ -58043,8 +58989,8 @@
         <w:t xml:space="preserve">.</w:t>
       </w:r>
     </w:p>
-    <w:bookmarkEnd w:id="403"/>
-    <w:bookmarkStart w:id="405" w:name="ref-dune"/>
+    <w:bookmarkEnd w:id="410"/>
+    <w:bookmarkStart w:id="412" w:name="ref-dune"/>
     <w:p>
       <w:pPr>
         <w:pStyle w:val="Bibliography"/>
@@ -58068,7 +59014,7 @@
       <w:r>
         <w:t xml:space="preserve"> </w:t>
       </w:r>
-      <w:hyperlink r:id="rId404">
+      <w:hyperlink r:id="rId411">
         <w:r>
           <w:rPr>
             <w:rStyle w:val="Hyperlink"/>
@@ -58080,8 +59026,8 @@
         <w:t xml:space="preserve">.</w:t>
       </w:r>
     </w:p>
-    <w:bookmarkEnd w:id="405"/>
-    <w:bookmarkStart w:id="407" w:name="ref-lora"/>
+    <w:bookmarkEnd w:id="412"/>
+    <w:bookmarkStart w:id="414" w:name="ref-lora"/>
     <w:p>
       <w:pPr>
         <w:pStyle w:val="Bibliography"/>
@@ -58105,7 +59051,7 @@
       <w:r>
         <w:t xml:space="preserve"> </w:t>
       </w:r>
-      <w:hyperlink r:id="rId406">
+      <w:hyperlink r:id="rId413">
         <w:r>
           <w:rPr>
             <w:rStyle w:val="Hyperlink"/>
@@ -58117,8 +59063,8 @@
         <w:t xml:space="preserve">.</w:t>
       </w:r>
     </w:p>
-    <w:bookmarkEnd w:id="407"/>
-    <w:bookmarkStart w:id="409" w:name="ref-lecun_world_models"/>
+    <w:bookmarkEnd w:id="414"/>
+    <w:bookmarkStart w:id="416" w:name="ref-lecun_world_models"/>
     <w:p>
       <w:pPr>
         <w:pStyle w:val="Bibliography"/>
@@ -58142,7 +59088,7 @@
       <w:r>
         <w:t xml:space="preserve"> </w:t>
       </w:r>
-      <w:hyperlink r:id="rId408">
+      <w:hyperlink r:id="rId415">
         <w:r>
           <w:rPr>
             <w:rStyle w:val="Hyperlink"/>
@@ -58154,8 +59100,8 @@
         <w:t xml:space="preserve">.</w:t>
       </w:r>
     </w:p>
-    <w:bookmarkEnd w:id="409"/>
-    <w:bookmarkStart w:id="411" w:name="ref-terminator"/>
+    <w:bookmarkEnd w:id="416"/>
+    <w:bookmarkStart w:id="418" w:name="ref-terminator"/>
     <w:p>
       <w:pPr>
         <w:pStyle w:val="Bibliography"/>
@@ -58173,7 +59119,7 @@
       <w:r>
         <w:t xml:space="preserve"> </w:t>
       </w:r>
-      <w:hyperlink r:id="rId410">
+      <w:hyperlink r:id="rId417">
         <w:r>
           <w:rPr>
             <w:rStyle w:val="Hyperlink"/>
@@ -58185,8 +59131,8 @@
         <w:t xml:space="preserve">.</w:t>
       </w:r>
     </w:p>
-    <w:bookmarkEnd w:id="411"/>
-    <w:bookmarkStart w:id="413" w:name="ref-matrix"/>
+    <w:bookmarkEnd w:id="418"/>
+    <w:bookmarkStart w:id="420" w:name="ref-matrix"/>
     <w:p>
       <w:pPr>
         <w:pStyle w:val="Bibliography"/>
@@ -58204,7 +59150,7 @@
       <w:r>
         <w:t xml:space="preserve"> </w:t>
       </w:r>
-      <w:hyperlink r:id="rId412">
+      <w:hyperlink r:id="rId419">
         <w:r>
           <w:rPr>
             <w:rStyle w:val="Hyperlink"/>
@@ -58216,8 +59162,8 @@
         <w:t xml:space="preserve">.</w:t>
       </w:r>
     </w:p>
-    <w:bookmarkEnd w:id="413"/>
-    <w:bookmarkStart w:id="415" w:name="ref-wargames"/>
+    <w:bookmarkEnd w:id="420"/>
+    <w:bookmarkStart w:id="422" w:name="ref-wargames"/>
     <w:p>
       <w:pPr>
         <w:pStyle w:val="Bibliography"/>
@@ -58235,7 +59181,7 @@
       <w:r>
         <w:t xml:space="preserve"> </w:t>
       </w:r>
-      <w:hyperlink r:id="rId414">
+      <w:hyperlink r:id="rId421">
         <w:r>
           <w:rPr>
             <w:rStyle w:val="Hyperlink"/>
@@ -58247,9 +59193,9 @@
         <w:t xml:space="preserve">.</w:t>
       </w:r>
     </w:p>
-    <w:bookmarkEnd w:id="415"/>
-    <w:bookmarkEnd w:id="416"/>
-    <w:bookmarkEnd w:id="417"/>
+    <w:bookmarkEnd w:id="422"/>
+    <w:bookmarkEnd w:id="423"/>
+    <w:bookmarkEnd w:id="424"/>
     <w:sectPr>
       <w:footnotePr>
         <w:numRestart w:val="eachSect"/>
@@ -58279,7 +59225,7 @@
       </w:r>
     </w:p>
   </w:footnote>
-  <w:footnote w:id="333">
+  <w:footnote w:id="340">
     <w:p>
       <w:pPr>
         <w:pStyle w:val="FootnoteText"/>
@@ -59456,34 +60402,7 @@
     <w:abstractNumId w:val="991"/>
   </w:num>
   <w:num w:numId="1134">
-    <w:abstractNumId w:val="99411"/>
-    <w:lvlOverride w:ilvl="0">
-      <w:startOverride w:val="1"/>
-    </w:lvlOverride>
-    <w:lvlOverride w:ilvl="1">
-      <w:startOverride w:val="1"/>
-    </w:lvlOverride>
-    <w:lvlOverride w:ilvl="2">
-      <w:startOverride w:val="1"/>
-    </w:lvlOverride>
-    <w:lvlOverride w:ilvl="3">
-      <w:startOverride w:val="1"/>
-    </w:lvlOverride>
-    <w:lvlOverride w:ilvl="4">
-      <w:startOverride w:val="1"/>
-    </w:lvlOverride>
-    <w:lvlOverride w:ilvl="5">
-      <w:startOverride w:val="1"/>
-    </w:lvlOverride>
-    <w:lvlOverride w:ilvl="6">
-      <w:startOverride w:val="1"/>
-    </w:lvlOverride>
-    <w:lvlOverride w:ilvl="7">
-      <w:startOverride w:val="1"/>
-    </w:lvlOverride>
-    <w:lvlOverride w:ilvl="8">
-      <w:startOverride w:val="1"/>
-    </w:lvlOverride>
+    <w:abstractNumId w:val="991"/>
   </w:num>
   <w:num w:numId="1135">
     <w:abstractNumId w:val="991"/>
@@ -59492,34 +60411,7 @@
     <w:abstractNumId w:val="991"/>
   </w:num>
   <w:num w:numId="1137">
-    <w:abstractNumId w:val="99411"/>
-    <w:lvlOverride w:ilvl="0">
-      <w:startOverride w:val="1"/>
-    </w:lvlOverride>
-    <w:lvlOverride w:ilvl="1">
-      <w:startOverride w:val="1"/>
-    </w:lvlOverride>
-    <w:lvlOverride w:ilvl="2">
-      <w:startOverride w:val="1"/>
-    </w:lvlOverride>
-    <w:lvlOverride w:ilvl="3">
-      <w:startOverride w:val="1"/>
-    </w:lvlOverride>
-    <w:lvlOverride w:ilvl="4">
-      <w:startOverride w:val="1"/>
-    </w:lvlOverride>
-    <w:lvlOverride w:ilvl="5">
-      <w:startOverride w:val="1"/>
-    </w:lvlOverride>
-    <w:lvlOverride w:ilvl="6">
-      <w:startOverride w:val="1"/>
-    </w:lvlOverride>
-    <w:lvlOverride w:ilvl="7">
-      <w:startOverride w:val="1"/>
-    </w:lvlOverride>
-    <w:lvlOverride w:ilvl="8">
-      <w:startOverride w:val="1"/>
-    </w:lvlOverride>
+    <w:abstractNumId w:val="991"/>
   </w:num>
   <w:num w:numId="1138">
     <w:abstractNumId w:val="991"/>
@@ -59564,7 +60456,34 @@
     <w:abstractNumId w:val="991"/>
   </w:num>
   <w:num w:numId="1143">
-    <w:abstractNumId w:val="991"/>
+    <w:abstractNumId w:val="99411"/>
+    <w:lvlOverride w:ilvl="0">
+      <w:startOverride w:val="1"/>
+    </w:lvlOverride>
+    <w:lvlOverride w:ilvl="1">
+      <w:startOverride w:val="1"/>
+    </w:lvlOverride>
+    <w:lvlOverride w:ilvl="2">
+      <w:startOverride w:val="1"/>
+    </w:lvlOverride>
+    <w:lvlOverride w:ilvl="3">
+      <w:startOverride w:val="1"/>
+    </w:lvlOverride>
+    <w:lvlOverride w:ilvl="4">
+      <w:startOverride w:val="1"/>
+    </w:lvlOverride>
+    <w:lvlOverride w:ilvl="5">
+      <w:startOverride w:val="1"/>
+    </w:lvlOverride>
+    <w:lvlOverride w:ilvl="6">
+      <w:startOverride w:val="1"/>
+    </w:lvlOverride>
+    <w:lvlOverride w:ilvl="7">
+      <w:startOverride w:val="1"/>
+    </w:lvlOverride>
+    <w:lvlOverride w:ilvl="8">
+      <w:startOverride w:val="1"/>
+    </w:lvlOverride>
   </w:num>
   <w:num w:numId="1144">
     <w:abstractNumId w:val="991"/>
@@ -59612,6 +60531,12 @@
     <w:abstractNumId w:val="991"/>
   </w:num>
   <w:num w:numId="1150">
+    <w:abstractNumId w:val="991"/>
+  </w:num>
+  <w:num w:numId="1151">
+    <w:abstractNumId w:val="991"/>
+  </w:num>
+  <w:num w:numId="1152">
     <w:abstractNumId w:val="99411"/>
     <w:lvlOverride w:ilvl="0">
       <w:startOverride w:val="1"/>
@@ -59641,12 +60566,6 @@
       <w:startOverride w:val="1"/>
     </w:lvlOverride>
   </w:num>
-  <w:num w:numId="1151">
-    <w:abstractNumId w:val="991"/>
-  </w:num>
-  <w:num w:numId="1152">
-    <w:abstractNumId w:val="991"/>
-  </w:num>
   <w:num w:numId="1153">
     <w:abstractNumId w:val="991"/>
   </w:num>
@@ -59654,6 +60573,9 @@
     <w:abstractNumId w:val="991"/>
   </w:num>
   <w:num w:numId="1155">
+    <w:abstractNumId w:val="991"/>
+  </w:num>
+  <w:num w:numId="1156">
     <w:abstractNumId w:val="99411"/>
     <w:lvlOverride w:ilvl="0">
       <w:startOverride w:val="1"/>
@@ -59683,38 +60605,8 @@
       <w:startOverride w:val="1"/>
     </w:lvlOverride>
   </w:num>
-  <w:num w:numId="1156">
+  <w:num w:numId="1157">
     <w:abstractNumId w:val="991"/>
-  </w:num>
-  <w:num w:numId="1157">
-    <w:abstractNumId w:val="99411"/>
-    <w:lvlOverride w:ilvl="0">
-      <w:startOverride w:val="1"/>
-    </w:lvlOverride>
-    <w:lvlOverride w:ilvl="1">
-      <w:startOverride w:val="1"/>
-    </w:lvlOverride>
-    <w:lvlOverride w:ilvl="2">
-      <w:startOverride w:val="1"/>
-    </w:lvlOverride>
-    <w:lvlOverride w:ilvl="3">
-      <w:startOverride w:val="1"/>
-    </w:lvlOverride>
-    <w:lvlOverride w:ilvl="4">
-      <w:startOverride w:val="1"/>
-    </w:lvlOverride>
-    <w:lvlOverride w:ilvl="5">
-      <w:startOverride w:val="1"/>
-    </w:lvlOverride>
-    <w:lvlOverride w:ilvl="6">
-      <w:startOverride w:val="1"/>
-    </w:lvlOverride>
-    <w:lvlOverride w:ilvl="7">
-      <w:startOverride w:val="1"/>
-    </w:lvlOverride>
-    <w:lvlOverride w:ilvl="8">
-      <w:startOverride w:val="1"/>
-    </w:lvlOverride>
   </w:num>
   <w:num w:numId="1158">
     <w:abstractNumId w:val="991"/>
@@ -59723,34 +60615,7 @@
     <w:abstractNumId w:val="991"/>
   </w:num>
   <w:num w:numId="1160">
-    <w:abstractNumId w:val="99411"/>
-    <w:lvlOverride w:ilvl="0">
-      <w:startOverride w:val="1"/>
-    </w:lvlOverride>
-    <w:lvlOverride w:ilvl="1">
-      <w:startOverride w:val="1"/>
-    </w:lvlOverride>
-    <w:lvlOverride w:ilvl="2">
-      <w:startOverride w:val="1"/>
-    </w:lvlOverride>
-    <w:lvlOverride w:ilvl="3">
-      <w:startOverride w:val="1"/>
-    </w:lvlOverride>
-    <w:lvlOverride w:ilvl="4">
-      <w:startOverride w:val="1"/>
-    </w:lvlOverride>
-    <w:lvlOverride w:ilvl="5">
-      <w:startOverride w:val="1"/>
-    </w:lvlOverride>
-    <w:lvlOverride w:ilvl="6">
-      <w:startOverride w:val="1"/>
-    </w:lvlOverride>
-    <w:lvlOverride w:ilvl="7">
-      <w:startOverride w:val="1"/>
-    </w:lvlOverride>
-    <w:lvlOverride w:ilvl="8">
-      <w:startOverride w:val="1"/>
-    </w:lvlOverride>
+    <w:abstractNumId w:val="991"/>
   </w:num>
   <w:num w:numId="1161">
     <w:abstractNumId w:val="99411"/>
@@ -59783,6 +60648,9 @@
     </w:lvlOverride>
   </w:num>
   <w:num w:numId="1162">
+    <w:abstractNumId w:val="991"/>
+  </w:num>
+  <w:num w:numId="1163">
     <w:abstractNumId w:val="99411"/>
     <w:lvlOverride w:ilvl="0">
       <w:startOverride w:val="1"/>
@@ -59812,7 +60680,103 @@
       <w:startOverride w:val="1"/>
     </w:lvlOverride>
   </w:num>
-  <w:num w:numId="1163">
+  <w:num w:numId="1164">
+    <w:abstractNumId w:val="991"/>
+  </w:num>
+  <w:num w:numId="1165">
+    <w:abstractNumId w:val="991"/>
+  </w:num>
+  <w:num w:numId="1166">
+    <w:abstractNumId w:val="99411"/>
+    <w:lvlOverride w:ilvl="0">
+      <w:startOverride w:val="1"/>
+    </w:lvlOverride>
+    <w:lvlOverride w:ilvl="1">
+      <w:startOverride w:val="1"/>
+    </w:lvlOverride>
+    <w:lvlOverride w:ilvl="2">
+      <w:startOverride w:val="1"/>
+    </w:lvlOverride>
+    <w:lvlOverride w:ilvl="3">
+      <w:startOverride w:val="1"/>
+    </w:lvlOverride>
+    <w:lvlOverride w:ilvl="4">
+      <w:startOverride w:val="1"/>
+    </w:lvlOverride>
+    <w:lvlOverride w:ilvl="5">
+      <w:startOverride w:val="1"/>
+    </w:lvlOverride>
+    <w:lvlOverride w:ilvl="6">
+      <w:startOverride w:val="1"/>
+    </w:lvlOverride>
+    <w:lvlOverride w:ilvl="7">
+      <w:startOverride w:val="1"/>
+    </w:lvlOverride>
+    <w:lvlOverride w:ilvl="8">
+      <w:startOverride w:val="1"/>
+    </w:lvlOverride>
+  </w:num>
+  <w:num w:numId="1167">
+    <w:abstractNumId w:val="99411"/>
+    <w:lvlOverride w:ilvl="0">
+      <w:startOverride w:val="1"/>
+    </w:lvlOverride>
+    <w:lvlOverride w:ilvl="1">
+      <w:startOverride w:val="1"/>
+    </w:lvlOverride>
+    <w:lvlOverride w:ilvl="2">
+      <w:startOverride w:val="1"/>
+    </w:lvlOverride>
+    <w:lvlOverride w:ilvl="3">
+      <w:startOverride w:val="1"/>
+    </w:lvlOverride>
+    <w:lvlOverride w:ilvl="4">
+      <w:startOverride w:val="1"/>
+    </w:lvlOverride>
+    <w:lvlOverride w:ilvl="5">
+      <w:startOverride w:val="1"/>
+    </w:lvlOverride>
+    <w:lvlOverride w:ilvl="6">
+      <w:startOverride w:val="1"/>
+    </w:lvlOverride>
+    <w:lvlOverride w:ilvl="7">
+      <w:startOverride w:val="1"/>
+    </w:lvlOverride>
+    <w:lvlOverride w:ilvl="8">
+      <w:startOverride w:val="1"/>
+    </w:lvlOverride>
+  </w:num>
+  <w:num w:numId="1168">
+    <w:abstractNumId w:val="99411"/>
+    <w:lvlOverride w:ilvl="0">
+      <w:startOverride w:val="1"/>
+    </w:lvlOverride>
+    <w:lvlOverride w:ilvl="1">
+      <w:startOverride w:val="1"/>
+    </w:lvlOverride>
+    <w:lvlOverride w:ilvl="2">
+      <w:startOverride w:val="1"/>
+    </w:lvlOverride>
+    <w:lvlOverride w:ilvl="3">
+      <w:startOverride w:val="1"/>
+    </w:lvlOverride>
+    <w:lvlOverride w:ilvl="4">
+      <w:startOverride w:val="1"/>
+    </w:lvlOverride>
+    <w:lvlOverride w:ilvl="5">
+      <w:startOverride w:val="1"/>
+    </w:lvlOverride>
+    <w:lvlOverride w:ilvl="6">
+      <w:startOverride w:val="1"/>
+    </w:lvlOverride>
+    <w:lvlOverride w:ilvl="7">
+      <w:startOverride w:val="1"/>
+    </w:lvlOverride>
+    <w:lvlOverride w:ilvl="8">
+      <w:startOverride w:val="1"/>
+    </w:lvlOverride>
+  </w:num>
+  <w:num w:numId="1169">
     <w:abstractNumId w:val="991"/>
   </w:num>
 </w:numbering>

</xml_diff>

<commit_message>
Deploying to gh-pages from @ Morrison-Lab/wai@7e6a685083d6a0399f77782ba65ddcbc7cc3018f 🚀
</commit_message>
<xml_diff>
--- a/chapters/coding-agents.docx
+++ b/chapters/coding-agents.docx
@@ -15,7 +15,7 @@
         <w:pStyle w:val="Date"/>
       </w:pPr>
       <w:r>
-        <w:t xml:space="preserve">Last modified: 2026-08-26 23:09:33 (PDT)</w:t>
+        <w:t xml:space="preserve">Last modified: 2026-08-26 23:09:54 (PDT)</w:t>
       </w:r>
     </w:p>
     <w:p>
@@ -803,7 +803,7 @@
       </w:r>
     </w:p>
     <w:bookmarkEnd w:id="16"/>
-    <w:bookmarkStart w:id="25" w:name="sec-ai-coding-agent-platforms"/>
+    <w:bookmarkStart w:id="26" w:name="sec-ai-coding-agent-platforms"/>
     <w:p>
       <w:pPr>
         <w:pStyle w:val="Heading1"/>
@@ -832,7 +832,7 @@
         <w:t xml:space="preserve">model to the task and your repository’s security requirements.</w:t>
       </w:r>
     </w:p>
-    <w:bookmarkStart w:id="24" w:name="common-coding-agent-platforms"/>
+    <w:bookmarkStart w:id="25" w:name="common-coding-agent-platforms"/>
     <w:p>
       <w:pPr>
         <w:pStyle w:val="Heading4"/>
@@ -1317,9 +1317,49 @@
         <w:t xml:space="preserve">details in the linked official documentation before adopting one.</w:t>
       </w:r>
     </w:p>
-    <w:bookmarkEnd w:id="24"/>
+    <w:p>
+      <w:pPr>
+        <w:pStyle w:val="BodyText"/>
+      </w:pPr>
+      <w:r>
+        <w:t xml:space="preserve">A separate category — named, persistent teammates with their own</w:t>
+      </w:r>
+      <w:r>
+        <w:t xml:space="preserve"> </w:t>
+      </w:r>
+      <w:r>
+        <w:t xml:space="preserve">browser-and-shell computer, rather than a repository checkout —</w:t>
+      </w:r>
+      <w:r>
+        <w:t xml:space="preserve"> </w:t>
+      </w:r>
+      <w:r>
+        <w:t xml:space="preserve">is reviewed in</w:t>
+      </w:r>
+      <w:r>
+        <w:t xml:space="preserve"> </w:t>
+      </w:r>
+      <w:hyperlink r:id="rId24">
+        <w:r>
+          <w:rPr>
+            <w:rStyle w:val="Hyperlink"/>
+          </w:rPr>
+          <w:t xml:space="preserve">Grok Bot and Alternatives</w:t>
+        </w:r>
+      </w:hyperlink>
+      <w:r>
+        <w:t xml:space="preserve">.</w:t>
+      </w:r>
+      <w:r>
+        <w:t xml:space="preserve"> </w:t>
+      </w:r>
+      <w:r>
+        <w:t xml:space="preserve">Those products do not replace the platforms above.</w:t>
+      </w:r>
+    </w:p>
     <w:bookmarkEnd w:id="25"/>
-    <w:bookmarkStart w:id="33" w:name="sec-ai-harnesses"/>
+    <w:bookmarkEnd w:id="26"/>
+    <w:bookmarkStart w:id="34" w:name="sec-ai-harnesses"/>
     <w:p>
       <w:pPr>
         <w:pStyle w:val="Heading1"/>
@@ -1388,7 +1428,7 @@
         <w:t xml:space="preserve">and carry state across turns and sessions.</w:t>
       </w:r>
     </w:p>
-    <w:bookmarkStart w:id="30" w:name="layers-of-a-harness"/>
+    <w:bookmarkStart w:id="31" w:name="layers-of-a-harness"/>
     <w:p>
       <w:pPr>
         <w:pStyle w:val="Heading4"/>
@@ -1430,7 +1470,7 @@
       <w:r>
         <w:t xml:space="preserve"> </w:t>
       </w:r>
-      <w:hyperlink r:id="rId26">
+      <w:hyperlink r:id="rId27">
         <w:r>
           <w:rPr>
             <w:rStyle w:val="Hyperlink"/>
@@ -1472,7 +1512,7 @@
       <w:r>
         <w:t xml:space="preserve"> </w:t>
       </w:r>
-      <w:hyperlink r:id="rId27">
+      <w:hyperlink r:id="rId28">
         <w:r>
           <w:rPr>
             <w:rStyle w:val="Hyperlink"/>
@@ -1636,7 +1676,7 @@
       <w:r>
         <w:t xml:space="preserve"> </w:t>
       </w:r>
-      <w:hyperlink r:id="rId28">
+      <w:hyperlink r:id="rId29">
         <w:r>
           <w:rPr>
             <w:rStyle w:val="Hyperlink"/>
@@ -1705,7 +1745,7 @@
       <w:r>
         <w:t xml:space="preserve">/</w:t>
       </w:r>
-      <w:hyperlink r:id="rId29">
+      <w:hyperlink r:id="rId30">
         <w:r>
           <w:rPr>
             <w:rStyle w:val="VerbatimChar"/>
@@ -1732,8 +1772,8 @@
         <w:t xml:space="preserve">so the harness does not relearn your conventions every time.</w:t>
       </w:r>
     </w:p>
-    <w:bookmarkEnd w:id="30"/>
-    <w:bookmarkStart w:id="32" w:name="using-harness-features-well"/>
+    <w:bookmarkEnd w:id="31"/>
+    <w:bookmarkStart w:id="33" w:name="using-harness-features-well"/>
     <w:p>
       <w:pPr>
         <w:pStyle w:val="Heading4"/>
@@ -1965,7 +2005,7 @@
       <w:r>
         <w:t xml:space="preserve"> </w:t>
       </w:r>
-      <w:hyperlink r:id="rId31">
+      <w:hyperlink r:id="rId32">
         <w:r>
           <w:rPr>
             <w:rStyle w:val="Hyperlink"/>
@@ -1977,9 +2017,9 @@
         <w:t xml:space="preserve">.</w:t>
       </w:r>
     </w:p>
-    <w:bookmarkEnd w:id="32"/>
     <w:bookmarkEnd w:id="33"/>
-    <w:bookmarkStart w:id="38" w:name="sec-ai-agent-implementation"/>
+    <w:bookmarkEnd w:id="34"/>
+    <w:bookmarkStart w:id="39" w:name="sec-ai-agent-implementation"/>
     <w:p>
       <w:pPr>
         <w:pStyle w:val="Heading1"/>
@@ -2056,7 +2096,7 @@
         <w:t xml:space="preserve">a main conversation, and any number of subagents it spawns.</w:t>
       </w:r>
     </w:p>
-    <w:bookmarkStart w:id="34" w:name="the-shape-of-an-agent"/>
+    <w:bookmarkStart w:id="35" w:name="the-shape-of-an-agent"/>
     <w:p>
       <w:pPr>
         <w:pStyle w:val="Heading4"/>
@@ -2228,8 +2268,8 @@
         <w:t xml:space="preserve">or must call a schema-validated tool to return a typed result.</w:t>
       </w:r>
     </w:p>
-    <w:bookmarkEnd w:id="34"/>
-    <w:bookmarkStart w:id="35" w:name="how-an-agent-runs"/>
+    <w:bookmarkEnd w:id="35"/>
+    <w:bookmarkStart w:id="36" w:name="how-an-agent-runs"/>
     <w:p>
       <w:pPr>
         <w:pStyle w:val="Heading4"/>
@@ -2416,8 +2456,8 @@
         <w:t xml:space="preserve">it is a context-isolation boundary, not just a prompt.</w:t>
       </w:r>
     </w:p>
-    <w:bookmarkEnd w:id="35"/>
-    <w:bookmarkStart w:id="36" w:name="composability-and-its-limits"/>
+    <w:bookmarkEnd w:id="36"/>
+    <w:bookmarkStart w:id="37" w:name="composability-and-its-limits"/>
     <w:p>
       <w:pPr>
         <w:pStyle w:val="Heading4"/>
@@ -2488,8 +2528,8 @@
         <w:t xml:space="preserve">not a different execution model.</w:t>
       </w:r>
     </w:p>
-    <w:bookmarkEnd w:id="36"/>
-    <w:bookmarkStart w:id="37" w:name="two-axes-that-define-an-agents-behavior"/>
+    <w:bookmarkEnd w:id="37"/>
+    <w:bookmarkStart w:id="38" w:name="two-axes-that-define-an-agents-behavior"/>
     <w:p>
       <w:pPr>
         <w:pStyle w:val="Heading4"/>
@@ -2596,9 +2636,9 @@
         <w:t xml:space="preserve">even though internally it is still a multi-turn loop.</w:t>
       </w:r>
     </w:p>
-    <w:bookmarkEnd w:id="37"/>
     <w:bookmarkEnd w:id="38"/>
-    <w:bookmarkStart w:id="47" w:name="sec-ai-harness-construction"/>
+    <w:bookmarkEnd w:id="39"/>
+    <w:bookmarkStart w:id="48" w:name="sec-ai-harness-construction"/>
     <w:p>
       <w:pPr>
         <w:pStyle w:val="Heading1"/>
@@ -2627,7 +2667,7 @@
         <w:t xml:space="preserve">others are just text files the harness reads at runtime.</w:t>
       </w:r>
     </w:p>
-    <w:bookmarkStart w:id="39" w:name="Xb3d1c69caf486dc703e7e8178df274f009cb4ba"/>
+    <w:bookmarkStart w:id="40" w:name="Xb3d1c69caf486dc703e7e8178df274f009cb4ba"/>
     <w:p>
       <w:pPr>
         <w:pStyle w:val="Heading4"/>
@@ -2698,8 +2738,8 @@
         <w:t xml:space="preserve">rather than just a prompt someone wrote.</w:t>
       </w:r>
     </w:p>
-    <w:bookmarkEnd w:id="39"/>
-    <w:bookmarkStart w:id="42" w:name="X34d81458ca858ec581962c07e58f97cb46499cc"/>
+    <w:bookmarkEnd w:id="40"/>
+    <w:bookmarkStart w:id="43" w:name="X34d81458ca858ec581962c07e58f97cb46499cc"/>
     <w:p>
       <w:pPr>
         <w:pStyle w:val="Heading4"/>
@@ -2730,7 +2770,7 @@
       <w:r>
         <w:t xml:space="preserve"> </w:t>
       </w:r>
-      <w:hyperlink r:id="rId40">
+      <w:hyperlink r:id="rId41">
         <w:r>
           <w:rPr>
             <w:rStyle w:val="Hyperlink"/>
@@ -2759,7 +2799,7 @@
       <w:r>
         <w:t xml:space="preserve"> </w:t>
       </w:r>
-      <w:hyperlink r:id="rId41">
+      <w:hyperlink r:id="rId42">
         <w:r>
           <w:rPr>
             <w:rStyle w:val="Hyperlink"/>
@@ -2975,8 +3015,8 @@
         <w:t xml:space="preserve">the harness reads the file and uses it directly.</w:t>
       </w:r>
     </w:p>
-    <w:bookmarkEnd w:id="42"/>
-    <w:bookmarkStart w:id="44" w:name="tools-are-a-schema-paired-with-a-handler"/>
+    <w:bookmarkEnd w:id="43"/>
+    <w:bookmarkStart w:id="45" w:name="tools-are-a-schema-paired-with-a-handler"/>
     <w:p>
       <w:pPr>
         <w:pStyle w:val="Heading4"/>
@@ -3001,7 +3041,7 @@
       <w:r>
         <w:t xml:space="preserve"> </w:t>
       </w:r>
-      <w:hyperlink r:id="rId43">
+      <w:hyperlink r:id="rId44">
         <w:r>
           <w:rPr>
             <w:rStyle w:val="Hyperlink"/>
@@ -3052,8 +3092,8 @@
         <w:t xml:space="preserve">the handler is real software the model never inspects or writes.</w:t>
       </w:r>
     </w:p>
-    <w:bookmarkEnd w:id="44"/>
-    <w:bookmarkStart w:id="45" w:name="orchestration-needs-real-code"/>
+    <w:bookmarkEnd w:id="45"/>
+    <w:bookmarkStart w:id="46" w:name="orchestration-needs-real-code"/>
     <w:p>
       <w:pPr>
         <w:pStyle w:val="Heading4"/>
@@ -3112,8 +3152,8 @@
         <w:t xml:space="preserve">not parsed as prompt text the way an agent definition is.</w:t>
       </w:r>
     </w:p>
-    <w:bookmarkEnd w:id="45"/>
-    <w:bookmarkStart w:id="46" w:name="memory-is-just-prose"/>
+    <w:bookmarkEnd w:id="46"/>
+    <w:bookmarkStart w:id="47" w:name="memory-is-just-prose"/>
     <w:p>
       <w:pPr>
         <w:pStyle w:val="Heading4"/>
@@ -3147,7 +3187,7 @@
       <w:r>
         <w:t xml:space="preserve">/</w:t>
       </w:r>
-      <w:hyperlink r:id="rId29">
+      <w:hyperlink r:id="rId30">
         <w:r>
           <w:rPr>
             <w:rStyle w:val="VerbatimChar"/>
@@ -3183,9 +3223,9 @@
         <w:t xml:space="preserve">the same way it follows any other instruction in its context.</w:t>
       </w:r>
     </w:p>
-    <w:bookmarkEnd w:id="46"/>
     <w:bookmarkEnd w:id="47"/>
-    <w:bookmarkStart w:id="57" w:name="sec-ai-agent-program-kind"/>
+    <w:bookmarkEnd w:id="48"/>
+    <w:bookmarkStart w:id="58" w:name="sec-ai-agent-program-kind"/>
     <w:p>
       <w:pPr>
         <w:pStyle w:val="Heading1"/>
@@ -3210,7 +3250,7 @@
       <w:r>
         <w:t xml:space="preserve"> </w:t>
       </w:r>
-      <w:hyperlink r:id="rId48">
+      <w:hyperlink r:id="rId49">
         <w:r>
           <w:rPr>
             <w:rStyle w:val="Hyperlink"/>
@@ -3239,7 +3279,7 @@
         <w:t xml:space="preserve">compiler or a web server.</w:t>
       </w:r>
     </w:p>
-    <w:bookmarkStart w:id="50" w:name="it-is-io-bound-not-compute-bound"/>
+    <w:bookmarkStart w:id="51" w:name="it-is-io-bound-not-compute-bound"/>
     <w:p>
       <w:pPr>
         <w:pStyle w:val="Heading4"/>
@@ -3300,7 +3340,7 @@
       <w:r>
         <w:t xml:space="preserve"> </w:t>
       </w:r>
-      <w:hyperlink r:id="rId49">
+      <w:hyperlink r:id="rId50">
         <w:r>
           <w:rPr>
             <w:rStyle w:val="Hyperlink"/>
@@ -3630,8 +3670,8 @@
         <w:t xml:space="preserve">not a replacement for it.</w:t>
       </w:r>
     </w:p>
-    <w:bookmarkEnd w:id="50"/>
-    <w:bookmarkStart w:id="54" w:name="real-open-source-examples"/>
+    <w:bookmarkEnd w:id="51"/>
+    <w:bookmarkStart w:id="55" w:name="real-open-source-examples"/>
     <w:p>
       <w:pPr>
         <w:pStyle w:val="Heading4"/>
@@ -3662,7 +3702,7 @@
           <w:numId w:val="1010"/>
         </w:numPr>
       </w:pPr>
-      <w:hyperlink r:id="rId51">
+      <w:hyperlink r:id="rId52">
         <w:r>
           <w:rPr>
             <w:rStyle w:val="Hyperlink"/>
@@ -3693,7 +3733,7 @@
           <w:numId w:val="1010"/>
         </w:numPr>
       </w:pPr>
-      <w:hyperlink r:id="rId52">
+      <w:hyperlink r:id="rId53">
         <w:r>
           <w:rPr>
             <w:rStyle w:val="Hyperlink"/>
@@ -3730,7 +3770,7 @@
           <w:numId w:val="1010"/>
         </w:numPr>
       </w:pPr>
-      <w:hyperlink r:id="rId53">
+      <w:hyperlink r:id="rId54">
         <w:r>
           <w:rPr>
             <w:rStyle w:val="Hyperlink"/>
@@ -3845,8 +3885,8 @@
         <w:t xml:space="preserve">).</w:t>
       </w:r>
     </w:p>
-    <w:bookmarkEnd w:id="54"/>
-    <w:bookmarkStart w:id="56" w:name="where-it-runs"/>
+    <w:bookmarkEnd w:id="55"/>
+    <w:bookmarkStart w:id="57" w:name="where-it-runs"/>
     <w:p>
       <w:pPr>
         <w:pStyle w:val="Heading4"/>
@@ -3953,7 +3993,7 @@
       <w:r>
         <w:t xml:space="preserve"> </w:t>
       </w:r>
-      <w:hyperlink r:id="rId55">
+      <w:hyperlink r:id="rId56">
         <w:r>
           <w:rPr>
             <w:rStyle w:val="Hyperlink"/>
@@ -4031,9 +4071,9 @@
         <w:t xml:space="preserve">tool calls, and ends the moment a stopping condition fires.</w:t>
       </w:r>
     </w:p>
-    <w:bookmarkEnd w:id="56"/>
     <w:bookmarkEnd w:id="57"/>
-    <w:bookmarkStart w:id="63" w:name="sec-ai-harness-agent-relationship"/>
+    <w:bookmarkEnd w:id="58"/>
+    <w:bookmarkStart w:id="64" w:name="sec-ai-harness-agent-relationship"/>
     <w:p>
       <w:pPr>
         <w:pStyle w:val="Heading1"/>
@@ -4052,7 +4092,7 @@
       <w:r>
         <w:t xml:space="preserve"> </w:t>
       </w:r>
-      <w:hyperlink r:id="rId58">
+      <w:hyperlink r:id="rId59">
         <w:r>
           <w:rPr>
             <w:rStyle w:val="Hyperlink"/>
@@ -4069,7 +4109,7 @@
         <w:t xml:space="preserve">running a program than to two peers calling each other.</w:t>
       </w:r>
     </w:p>
-    <w:bookmarkStart w:id="59" w:name="Xf124c0ed5ce5da7d4b2c70e70abc0080ffb56c4"/>
+    <w:bookmarkStart w:id="60" w:name="Xf124c0ed5ce5da7d4b2c70e70abc0080ffb56c4"/>
     <w:p>
       <w:pPr>
         <w:pStyle w:val="Heading4"/>
@@ -4212,7 +4252,7 @@
       <w:r>
         <w:t xml:space="preserve"> </w:t>
       </w:r>
-      <w:hyperlink r:id="rId27">
+      <w:hyperlink r:id="rId28">
         <w:r>
           <w:rPr>
             <w:rStyle w:val="Hyperlink"/>
@@ -4383,8 +4423,8 @@
         <w:t xml:space="preserve">harness returns that agent’s output to the parent.</w:t>
       </w:r>
     </w:p>
-    <w:bookmarkEnd w:id="59"/>
-    <w:bookmarkStart w:id="60" w:name="sketching-the-harnesss-own-loop"/>
+    <w:bookmarkEnd w:id="60"/>
+    <w:bookmarkStart w:id="61" w:name="sketching-the-harnesss-own-loop"/>
     <w:p>
       <w:pPr>
         <w:pStyle w:val="Heading4"/>
@@ -5153,8 +5193,8 @@
         <w:t xml:space="preserve">described in the previous subsection.</w:t>
       </w:r>
     </w:p>
-    <w:bookmarkEnd w:id="60"/>
-    <w:bookmarkStart w:id="62" w:name="what-do-you-launch-when-you-type-claude"/>
+    <w:bookmarkEnd w:id="61"/>
+    <w:bookmarkStart w:id="63" w:name="what-do-you-launch-when-you-type-claude"/>
     <w:p>
       <w:pPr>
         <w:pStyle w:val="Heading4"/>
@@ -5405,7 +5445,7 @@
       <w:r>
         <w:t xml:space="preserve"> </w:t>
       </w:r>
-      <w:hyperlink r:id="rId61">
+      <w:hyperlink r:id="rId62">
         <w:r>
           <w:rPr>
             <w:rStyle w:val="Hyperlink"/>
@@ -5596,9 +5636,9 @@
         <w:t xml:space="preserve">At startup, those two come into existence together.</w:t>
       </w:r>
     </w:p>
-    <w:bookmarkEnd w:id="62"/>
     <w:bookmarkEnd w:id="63"/>
-    <w:bookmarkStart w:id="71" w:name="X9f4c11ae04cc9485e43baf6a6309f5c2ca7049b"/>
+    <w:bookmarkEnd w:id="64"/>
+    <w:bookmarkStart w:id="72" w:name="X9f4c11ae04cc9485e43baf6a6309f5c2ca7049b"/>
     <w:p>
       <w:pPr>
         <w:pStyle w:val="Heading1"/>
@@ -5617,7 +5657,7 @@
       <w:r>
         <w:t xml:space="preserve"> </w:t>
       </w:r>
-      <w:hyperlink r:id="rId64">
+      <w:hyperlink r:id="rId65">
         <w:r>
           <w:rPr>
             <w:rStyle w:val="Hyperlink"/>
@@ -5640,7 +5680,7 @@
       <w:r>
         <w:t xml:space="preserve"> </w:t>
       </w:r>
-      <w:hyperlink r:id="rId65">
+      <w:hyperlink r:id="rId66">
         <w:r>
           <w:rPr>
             <w:rStyle w:val="Hyperlink"/>
@@ -5664,7 +5704,7 @@
         <w:t xml:space="preserve">and our responsibility in using them.</w:t>
       </w:r>
     </w:p>
-    <w:bookmarkStart w:id="66" w:name="what-is-the-technological-singularity"/>
+    <w:bookmarkStart w:id="67" w:name="what-is-the-technological-singularity"/>
     <w:p>
       <w:pPr>
         <w:pStyle w:val="Heading4"/>
@@ -5717,8 +5757,8 @@
         <w:t xml:space="preserve">leading to an intelligence explosion beyond human comprehension or control.</w:t>
       </w:r>
     </w:p>
-    <w:bookmarkEnd w:id="66"/>
-    <w:bookmarkStart w:id="67" w:name="X6232a8e050102ddacd6ff22d335da20b6c2adec"/>
+    <w:bookmarkEnd w:id="67"/>
+    <w:bookmarkStart w:id="68" w:name="X6232a8e050102ddacd6ff22d335da20b6c2adec"/>
     <w:p>
       <w:pPr>
         <w:pStyle w:val="Heading4"/>
@@ -5969,8 +6009,8 @@
         <w:t xml:space="preserve">or operate without human authorization.</w:t>
       </w:r>
     </w:p>
-    <w:bookmarkEnd w:id="67"/>
-    <w:bookmarkStart w:id="68" w:name="why-this-matters-for-responsible-ai-use"/>
+    <w:bookmarkEnd w:id="68"/>
+    <w:bookmarkStart w:id="69" w:name="why-this-matters-for-responsible-ai-use"/>
     <w:p>
       <w:pPr>
         <w:pStyle w:val="Heading4"/>
@@ -6151,8 +6191,8 @@
         <w:t xml:space="preserve">while remaining under human control and oversight.</w:t>
       </w:r>
     </w:p>
-    <w:bookmarkEnd w:id="68"/>
-    <w:bookmarkStart w:id="70" w:name="further-reading"/>
+    <w:bookmarkEnd w:id="69"/>
+    <w:bookmarkStart w:id="71" w:name="further-reading"/>
     <w:p>
       <w:pPr>
         <w:pStyle w:val="Heading4"/>
@@ -6177,7 +6217,7 @@
       <w:r>
         <w:t xml:space="preserve"> </w:t>
       </w:r>
-      <w:hyperlink r:id="rId69">
+      <w:hyperlink r:id="rId70">
         <w:r>
           <w:rPr>
             <w:rStyle w:val="Hyperlink"/>
@@ -6186,9 +6226,9 @@
         </w:r>
       </w:hyperlink>
     </w:p>
-    <w:bookmarkEnd w:id="70"/>
     <w:bookmarkEnd w:id="71"/>
-    <w:bookmarkStart w:id="88" w:name="relative-advantages-of-ai-and-humans"/>
+    <w:bookmarkEnd w:id="72"/>
+    <w:bookmarkStart w:id="89" w:name="relative-advantages-of-ai-and-humans"/>
     <w:p>
       <w:pPr>
         <w:pStyle w:val="Heading1"/>
@@ -6217,7 +6257,7 @@
         <w:t xml:space="preserve">and when to handle tasks yourself.</w:t>
       </w:r>
     </w:p>
-    <w:bookmarkStart w:id="86" w:name="Xd4b14538cacfc1a6b4e96642aaf3a62c42920b7"/>
+    <w:bookmarkStart w:id="87" w:name="Xd4b14538cacfc1a6b4e96642aaf3a62c42920b7"/>
     <w:p>
       <w:pPr>
         <w:pStyle w:val="Heading4"/>
@@ -6264,7 +6304,7 @@
       <w:tr>
         <w:tc>
           <w:tcPr/>
-          <w:bookmarkStart w:id="72" w:name="tbl-ai-human-comparison"/>
+          <w:bookmarkStart w:id="73" w:name="tbl-ai-human-comparison"/>
           <w:p>
             <w:pPr>
               <w:jc w:val="center"/>
@@ -6416,7 +6456,7 @@
               </w:tc>
             </w:tr>
           </w:tbl>
-          <w:bookmarkEnd w:id="72"/>
+          <w:bookmarkEnd w:id="73"/>
           <w:p/>
         </w:tc>
       </w:tr>
@@ -6449,7 +6489,7 @@
       <w:tr>
         <w:tc>
           <w:tcPr/>
-          <w:bookmarkStart w:id="85" w:name="tbl-matrix-meme-table"/>
+          <w:bookmarkStart w:id="86" w:name="tbl-matrix-meme-table"/>
           <w:p>
             <w:pPr>
               <w:jc w:val="center"/>
@@ -6541,18 +6581,18 @@
                       <wp:inline>
                         <wp:extent cx="4286250" cy="2946796"/>
                         <wp:effectExtent b="0" l="0" r="0" t="0"/>
-                        <wp:docPr descr="Happy Neo" title="" id="74" name="Picture"/>
+                        <wp:docPr descr="Happy Neo" title="" id="75" name="Picture"/>
                         <a:graphic>
                           <a:graphicData uri="http://schemas.openxmlformats.org/drawingml/2006/picture">
                             <pic:pic>
                               <pic:nvPicPr>
-                                <pic:cNvPr descr="assets/images/The-Matrix-Neo-Flying.png" id="75" name="Picture"/>
+                                <pic:cNvPr descr="assets/images/The-Matrix-Neo-Flying.png" id="76" name="Picture"/>
                                 <pic:cNvPicPr>
                                   <a:picLocks noChangeArrowheads="1" noChangeAspect="1"/>
                                 </pic:cNvPicPr>
                               </pic:nvPicPr>
                               <pic:blipFill>
-                                <a:blip r:embed="rId73"/>
+                                <a:blip r:embed="rId74"/>
                                 <a:stretch>
                                   <a:fillRect/>
                                 </a:stretch>
@@ -6592,18 +6632,18 @@
                       <wp:inline>
                         <wp:extent cx="4286250" cy="1785937"/>
                         <wp:effectExtent b="0" l="0" r="0" t="0"/>
-                        <wp:docPr descr="Angry Agent Smith" title="" id="77" name="Picture"/>
+                        <wp:docPr descr="Angry Agent Smith" title="" id="78" name="Picture"/>
                         <a:graphic>
                           <a:graphicData uri="http://schemas.openxmlformats.org/drawingml/2006/picture">
                             <pic:pic>
                               <pic:nvPicPr>
-                                <pic:cNvPr descr="assets/images/agent-smith-no-its-not-fair.jpg" id="78" name="Picture"/>
+                                <pic:cNvPr descr="assets/images/agent-smith-no-its-not-fair.jpg" id="79" name="Picture"/>
                                 <pic:cNvPicPr>
                                   <a:picLocks noChangeArrowheads="1" noChangeAspect="1"/>
                                 </pic:cNvPicPr>
                               </pic:nvPicPr>
                               <pic:blipFill>
-                                <a:blip r:embed="rId76"/>
+                                <a:blip r:embed="rId77"/>
                                 <a:stretch>
                                   <a:fillRect/>
                                 </a:stretch>
@@ -6661,18 +6701,18 @@
                       <wp:inline>
                         <wp:extent cx="4286250" cy="2703909"/>
                         <wp:effectExtent b="0" l="0" r="0" t="0"/>
-                        <wp:docPr descr="Sad Keanu" title="" id="80" name="Picture"/>
+                        <wp:docPr descr="Sad Keanu" title="" id="81" name="Picture"/>
                         <a:graphic>
                           <a:graphicData uri="http://schemas.openxmlformats.org/drawingml/2006/picture">
                             <pic:pic>
                               <pic:nvPicPr>
-                                <pic:cNvPr descr="assets/images/sad-keanu.png" id="81" name="Picture"/>
+                                <pic:cNvPr descr="assets/images/sad-keanu.png" id="82" name="Picture"/>
                                 <pic:cNvPicPr>
                                   <a:picLocks noChangeArrowheads="1" noChangeAspect="1"/>
                                 </pic:cNvPicPr>
                               </pic:nvPicPr>
                               <pic:blipFill>
-                                <a:blip r:embed="rId79"/>
+                                <a:blip r:embed="rId80"/>
                                 <a:stretch>
                                   <a:fillRect/>
                                 </a:stretch>
@@ -6712,18 +6752,18 @@
                       <wp:inline>
                         <wp:extent cx="4286250" cy="2143125"/>
                         <wp:effectExtent b="0" l="0" r="0" t="0"/>
-                        <wp:docPr descr="Happy Agent Smith" title="" id="83" name="Picture"/>
+                        <wp:docPr descr="Happy Agent Smith" title="" id="84" name="Picture"/>
                         <a:graphic>
                           <a:graphicData uri="http://schemas.openxmlformats.org/drawingml/2006/picture">
                             <pic:pic>
                               <pic:nvPicPr>
-                                <pic:cNvPr descr="assets/images/grinning-smith.png" id="84" name="Picture"/>
+                                <pic:cNvPr descr="assets/images/grinning-smith.png" id="85" name="Picture"/>
                                 <pic:cNvPicPr>
                                   <a:picLocks noChangeArrowheads="1" noChangeAspect="1"/>
                                 </pic:cNvPicPr>
                               </pic:nvPicPr>
                               <pic:blipFill>
-                                <a:blip r:embed="rId82"/>
+                                <a:blip r:embed="rId83"/>
                                 <a:stretch>
                                   <a:fillRect/>
                                 </a:stretch>
@@ -6753,7 +6793,7 @@
               </w:tc>
             </w:tr>
           </w:tbl>
-          <w:bookmarkEnd w:id="85"/>
+          <w:bookmarkEnd w:id="86"/>
           <w:p/>
         </w:tc>
       </w:tr>
@@ -6883,8 +6923,8 @@
         <w:t xml:space="preserve">Understand when agent suggestions are incorrect or suboptimal</w:t>
       </w:r>
     </w:p>
-    <w:bookmarkEnd w:id="86"/>
-    <w:bookmarkStart w:id="87" w:name="future-developments-world-models"/>
+    <w:bookmarkEnd w:id="87"/>
+    <w:bookmarkStart w:id="88" w:name="future-developments-world-models"/>
     <w:p>
       <w:pPr>
         <w:pStyle w:val="Heading4"/>
@@ -7082,9 +7122,9 @@
         <w:t xml:space="preserve">so you can effectively work with increasingly capable AI systems.</w:t>
       </w:r>
     </w:p>
-    <w:bookmarkEnd w:id="87"/>
     <w:bookmarkEnd w:id="88"/>
-    <w:bookmarkStart w:id="99" w:name="how-to-work-with-coding-agents"/>
+    <w:bookmarkEnd w:id="89"/>
+    <w:bookmarkStart w:id="100" w:name="how-to-work-with-coding-agents"/>
     <w:p>
       <w:pPr>
         <w:pStyle w:val="Heading1"/>
@@ -7119,7 +7159,7 @@
         <w:t xml:space="preserve">and collaboration style.</w:t>
       </w:r>
     </w:p>
-    <w:bookmarkStart w:id="89" w:name="ways-to-interact-with-coding-agents"/>
+    <w:bookmarkStart w:id="90" w:name="ways-to-interact-with-coding-agents"/>
     <w:p>
       <w:pPr>
         <w:pStyle w:val="Heading4"/>
@@ -7420,8 +7460,8 @@
         <w:t xml:space="preserve">for assigning and managing coding tasks.</w:t>
       </w:r>
     </w:p>
-    <w:bookmarkEnd w:id="89"/>
-    <w:bookmarkStart w:id="90" w:name="assigning-issues-to-copilot"/>
+    <w:bookmarkEnd w:id="90"/>
+    <w:bookmarkStart w:id="91" w:name="assigning-issues-to-copilot"/>
     <w:p>
       <w:pPr>
         <w:pStyle w:val="Heading4"/>
@@ -7537,8 +7577,8 @@
         <w:t xml:space="preserve">Delegate tasks to Copilot directly from the chat interface in supported editors</w:t>
       </w:r>
     </w:p>
-    <w:bookmarkEnd w:id="90"/>
-    <w:bookmarkStart w:id="91" w:name="the-agent-workflow"/>
+    <w:bookmarkEnd w:id="91"/>
+    <w:bookmarkStart w:id="92" w:name="the-agent-workflow"/>
     <w:p>
       <w:pPr>
         <w:pStyle w:val="Heading4"/>
@@ -7735,8 +7775,8 @@
         <w:t xml:space="preserve">the agent will iterate based on your feedback</w:t>
       </w:r>
     </w:p>
-    <w:bookmarkEnd w:id="91"/>
-    <w:bookmarkStart w:id="92" w:name="collaborating-with-coding-agents"/>
+    <w:bookmarkEnd w:id="92"/>
+    <w:bookmarkStart w:id="93" w:name="collaborating-with-coding-agents"/>
     <w:p>
       <w:pPr>
         <w:pStyle w:val="Heading4"/>
@@ -7909,8 +7949,8 @@
         <w:t xml:space="preserve">Then assign new work to the agent for the next iteration.</w:t>
       </w:r>
     </w:p>
-    <w:bookmarkEnd w:id="92"/>
-    <w:bookmarkStart w:id="93" w:name="directly-prompting-for-pull-requests"/>
+    <w:bookmarkEnd w:id="93"/>
+    <w:bookmarkStart w:id="94" w:name="directly-prompting-for-pull-requests"/>
     <w:p>
       <w:pPr>
         <w:pStyle w:val="Heading4"/>
@@ -7963,8 +8003,8 @@
         <w:t xml:space="preserve">This is useful for quick fixes or well-defined tasks</w:t>
       </w:r>
     </w:p>
-    <w:bookmarkEnd w:id="93"/>
-    <w:bookmarkStart w:id="94" w:name="important-safeguards"/>
+    <w:bookmarkEnd w:id="94"/>
+    <w:bookmarkStart w:id="95" w:name="important-safeguards"/>
     <w:p>
       <w:pPr>
         <w:pStyle w:val="Heading4"/>
@@ -8060,8 +8100,8 @@
         <w:t xml:space="preserve">All agent actions are logged and visible in the PR</w:t>
       </w:r>
     </w:p>
-    <w:bookmarkEnd w:id="94"/>
-    <w:bookmarkStart w:id="98" w:name="workflow-approval-requirements"/>
+    <w:bookmarkEnd w:id="95"/>
+    <w:bookmarkStart w:id="99" w:name="workflow-approval-requirements"/>
     <w:p>
       <w:pPr>
         <w:pStyle w:val="Heading4"/>
@@ -8318,7 +8358,7 @@
           <w:numId w:val="1024"/>
         </w:numPr>
       </w:pPr>
-      <w:hyperlink r:id="rId95">
+      <w:hyperlink r:id="rId96">
         <w:r>
           <w:rPr>
             <w:rStyle w:val="Hyperlink"/>
@@ -8344,7 +8384,7 @@
           <w:numId w:val="1024"/>
         </w:numPr>
       </w:pPr>
-      <w:hyperlink r:id="rId96">
+      <w:hyperlink r:id="rId97">
         <w:r>
           <w:rPr>
             <w:rStyle w:val="Hyperlink"/>
@@ -8378,7 +8418,7 @@
       <w:r>
         <w:t xml:space="preserve"> </w:t>
       </w:r>
-      <w:hyperlink r:id="rId97">
+      <w:hyperlink r:id="rId98">
         <w:r>
           <w:rPr>
             <w:rStyle w:val="Hyperlink"/>
@@ -8390,9 +8430,9 @@
         <w:t xml:space="preserve">.</w:t>
       </w:r>
     </w:p>
-    <w:bookmarkEnd w:id="98"/>
     <w:bookmarkEnd w:id="99"/>
-    <w:bookmarkStart w:id="102" w:name="useful-prompt-formats"/>
+    <w:bookmarkEnd w:id="100"/>
+    <w:bookmarkStart w:id="103" w:name="useful-prompt-formats"/>
     <w:p>
       <w:pPr>
         <w:pStyle w:val="Heading1"/>
@@ -8421,7 +8461,7 @@
         <w:t xml:space="preserve">Here are some useful prompt formats that you can use when requesting assistance from coding agents:</w:t>
       </w:r>
     </w:p>
-    <w:bookmarkStart w:id="100" w:name="common-task-patterns"/>
+    <w:bookmarkStart w:id="101" w:name="common-task-patterns"/>
     <w:p>
       <w:pPr>
         <w:pStyle w:val="Heading4"/>
@@ -8808,8 +8848,8 @@
         <w:t xml:space="preserve">“clarify the explanation of the analysis workflow”</w:t>
       </w:r>
     </w:p>
-    <w:bookmarkEnd w:id="100"/>
-    <w:bookmarkStart w:id="101" w:name="tips-for-effective-prompts"/>
+    <w:bookmarkEnd w:id="101"/>
+    <w:bookmarkStart w:id="102" w:name="tips-for-effective-prompts"/>
     <w:p>
       <w:pPr>
         <w:pStyle w:val="Heading4"/>
@@ -8894,9 +8934,9 @@
         <w:t xml:space="preserve">: Ask the agent to test or verify its changes when appropriate</w:t>
       </w:r>
     </w:p>
-    <w:bookmarkEnd w:id="101"/>
     <w:bookmarkEnd w:id="102"/>
-    <w:bookmarkStart w:id="112" w:name="sec-ai-addressing-failing-workflows"/>
+    <w:bookmarkEnd w:id="103"/>
+    <w:bookmarkStart w:id="113" w:name="sec-ai-addressing-failing-workflows"/>
     <w:p>
       <w:pPr>
         <w:pStyle w:val="Heading1"/>
@@ -8943,7 +8983,7 @@
         <w:t xml:space="preserve">or in the workflow configuration itself.</w:t>
       </w:r>
     </w:p>
-    <w:bookmarkStart w:id="103" w:name="X16724e8c4d0535f38e98d560729d113d43f9447"/>
+    <w:bookmarkStart w:id="104" w:name="X16724e8c4d0535f38e98d560729d113d43f9447"/>
     <w:p>
       <w:pPr>
         <w:pStyle w:val="Heading4"/>
@@ -9138,8 +9178,8 @@
         <w:t xml:space="preserve">your carefully-configured CI/CD pipeline.</w:t>
       </w:r>
     </w:p>
-    <w:bookmarkEnd w:id="103"/>
-    <w:bookmarkStart w:id="107" w:name="X609a80533191ba40baf6d2372d9b8d862b0620d"/>
+    <w:bookmarkEnd w:id="104"/>
+    <w:bookmarkStart w:id="108" w:name="X609a80533191ba40baf6d2372d9b8d862b0620d"/>
     <w:p>
       <w:pPr>
         <w:pStyle w:val="Heading4"/>
@@ -9297,18 +9337,18 @@
                 <wp:inline>
                   <wp:extent cx="152400" cy="152400"/>
                   <wp:effectExtent b="0" l="0" r="0" t="0"/>
-                  <wp:docPr descr="" title="" id="105" name="Picture"/>
+                  <wp:docPr descr="" title="" id="106" name="Picture"/>
                   <a:graphic>
                     <a:graphicData uri="http://schemas.openxmlformats.org/drawingml/2006/picture">
                       <pic:pic>
                         <pic:nvPicPr>
-                          <pic:cNvPr descr="/opt/quarto/share/formats/docx/warning.png" id="106" name="Picture"/>
+                          <pic:cNvPr descr="/opt/quarto/share/formats/docx/warning.png" id="107" name="Picture"/>
                           <pic:cNvPicPr>
                             <a:picLocks noChangeArrowheads="1" noChangeAspect="1"/>
                           </pic:cNvPicPr>
                         </pic:nvPicPr>
                         <pic:blipFill>
-                          <a:blip r:embed="rId104"/>
+                          <a:blip r:embed="rId105"/>
                           <a:stretch>
                             <a:fillRect/>
                           </a:stretch>
@@ -9559,8 +9599,8 @@
         <w:t xml:space="preserve">for more guidance.</w:t>
       </w:r>
     </w:p>
-    <w:bookmarkEnd w:id="107"/>
-    <w:bookmarkStart w:id="108" w:name="X73d86ac2fd20fdb79b2a5c7f2662f883788810e"/>
+    <w:bookmarkEnd w:id="108"/>
+    <w:bookmarkStart w:id="109" w:name="X73d86ac2fd20fdb79b2a5c7f2662f883788810e"/>
     <w:p>
       <w:pPr>
         <w:pStyle w:val="Heading4"/>
@@ -9796,8 +9836,8 @@
         <w:t xml:space="preserve">3. Prompt: "fix the linting errors in src/analysis.R"</w:t>
       </w:r>
     </w:p>
-    <w:bookmarkEnd w:id="108"/>
-    <w:bookmarkStart w:id="111" w:name="additional-resources"/>
+    <w:bookmarkEnd w:id="109"/>
+    <w:bookmarkStart w:id="112" w:name="additional-resources"/>
     <w:p>
       <w:pPr>
         <w:pStyle w:val="Heading4"/>
@@ -9820,7 +9860,7 @@
       <w:r>
         <w:t xml:space="preserve"> </w:t>
       </w:r>
-      <w:hyperlink r:id="rId109">
+      <w:hyperlink r:id="rId110">
         <w:r>
           <w:rPr>
             <w:rStyle w:val="Hyperlink"/>
@@ -9924,7 +9964,7 @@
       <w:r>
         <w:t xml:space="preserve"> </w:t>
       </w:r>
-      <w:hyperlink r:id="rId110">
+      <w:hyperlink r:id="rId111">
         <w:r>
           <w:rPr>
             <w:rStyle w:val="Hyperlink"/>
@@ -9939,9 +9979,9 @@
         <w:t xml:space="preserve">for workflow syntax and troubleshooting</w:t>
       </w:r>
     </w:p>
-    <w:bookmarkEnd w:id="111"/>
     <w:bookmarkEnd w:id="112"/>
-    <w:bookmarkStart w:id="118" w:name="sec-ai-benefits-hazards"/>
+    <w:bookmarkEnd w:id="113"/>
+    <w:bookmarkStart w:id="119" w:name="sec-ai-benefits-hazards"/>
     <w:p>
       <w:pPr>
         <w:pStyle w:val="Heading1"/>
@@ -10325,7 +10365,7 @@
         <w:t xml:space="preserve">) or setup configurations can inadvertently or maliciously compromise repository security, expose secrets, or execute harmful commands</w:t>
       </w:r>
     </w:p>
-    <w:bookmarkStart w:id="117" w:name="further-readingviewing"/>
+    <w:bookmarkStart w:id="118" w:name="further-readingviewing"/>
     <w:p>
       <w:pPr>
         <w:pStyle w:val="Heading4"/>
@@ -10578,18 +10618,18 @@
           <wp:inline>
             <wp:extent cx="5334000" cy="2224278"/>
             <wp:effectExtent b="0" l="0" r="0" t="0"/>
-            <wp:docPr descr="Agents" title="" id="114" name="Picture"/>
+            <wp:docPr descr="Agents" title="" id="115" name="Picture"/>
             <a:graphic>
               <a:graphicData uri="http://schemas.openxmlformats.org/drawingml/2006/picture">
                 <pic:pic>
                   <pic:nvPicPr>
-                    <pic:cNvPr descr="assets/images/matrix-agents.png" id="115" name="Picture"/>
+                    <pic:cNvPr descr="assets/images/matrix-agents.png" id="116" name="Picture"/>
                     <pic:cNvPicPr>
                       <a:picLocks noChangeArrowheads="1" noChangeAspect="1"/>
                     </pic:cNvPicPr>
                   </pic:nvPicPr>
                   <pic:blipFill>
-                    <a:blip r:embed="rId113"/>
+                    <a:blip r:embed="rId114"/>
                     <a:stretch>
                       <a:fillRect/>
                     </a:stretch>
@@ -10620,7 +10660,7 @@
       <w:pPr>
         <w:pStyle w:val="ImageCaption"/>
       </w:pPr>
-      <w:hyperlink r:id="rId116">
+      <w:hyperlink r:id="rId117">
         <w:r>
           <w:rPr>
             <w:rStyle w:val="Hyperlink"/>
@@ -10629,9 +10669,9 @@
         </w:r>
       </w:hyperlink>
     </w:p>
-    <w:bookmarkEnd w:id="117"/>
     <w:bookmarkEnd w:id="118"/>
-    <w:bookmarkStart w:id="125" w:name="sec-ai-best-practices"/>
+    <w:bookmarkEnd w:id="119"/>
+    <w:bookmarkStart w:id="126" w:name="sec-ai-best-practices"/>
     <w:p>
       <w:pPr>
         <w:pStyle w:val="Heading1"/>
@@ -10965,18 +11005,18 @@
                 <wp:inline>
                   <wp:extent cx="152400" cy="152400"/>
                   <wp:effectExtent b="0" l="0" r="0" t="0"/>
-                  <wp:docPr descr="" title="" id="120" name="Picture"/>
+                  <wp:docPr descr="" title="" id="121" name="Picture"/>
                   <a:graphic>
                     <a:graphicData uri="http://schemas.openxmlformats.org/drawingml/2006/picture">
                       <pic:pic>
                         <pic:nvPicPr>
-                          <pic:cNvPr descr="/opt/quarto/share/formats/docx/note.png" id="121" name="Picture"/>
+                          <pic:cNvPr descr="/opt/quarto/share/formats/docx/note.png" id="122" name="Picture"/>
                           <pic:cNvPicPr>
                             <a:picLocks noChangeArrowheads="1" noChangeAspect="1"/>
                           </pic:cNvPicPr>
                         </pic:nvPicPr>
                         <pic:blipFill>
-                          <a:blip r:embed="rId119"/>
+                          <a:blip r:embed="rId120"/>
                           <a:stretch>
                             <a:fillRect/>
                           </a:stretch>
@@ -11038,7 +11078,7 @@
             <w:r>
               <w:t xml:space="preserve"> </w:t>
             </w:r>
-            <w:hyperlink r:id="rId122">
+            <w:hyperlink r:id="rId123">
               <w:r>
                 <w:rPr>
                   <w:rStyle w:val="Hyperlink"/>
@@ -11145,18 +11185,18 @@
                 <wp:inline>
                   <wp:extent cx="152400" cy="152400"/>
                   <wp:effectExtent b="0" l="0" r="0" t="0"/>
-                  <wp:docPr descr="" title="" id="123" name="Picture"/>
+                  <wp:docPr descr="" title="" id="124" name="Picture"/>
                   <a:graphic>
                     <a:graphicData uri="http://schemas.openxmlformats.org/drawingml/2006/picture">
                       <pic:pic>
                         <pic:nvPicPr>
-                          <pic:cNvPr descr="/opt/quarto/share/formats/docx/warning.png" id="124" name="Picture"/>
+                          <pic:cNvPr descr="/opt/quarto/share/formats/docx/warning.png" id="125" name="Picture"/>
                           <pic:cNvPicPr>
                             <a:picLocks noChangeArrowheads="1" noChangeAspect="1"/>
                           </pic:cNvPicPr>
                         </pic:nvPicPr>
                         <pic:blipFill>
-                          <a:blip r:embed="rId104"/>
+                          <a:blip r:embed="rId105"/>
                           <a:stretch>
                             <a:fillRect/>
                           </a:stretch>
@@ -11422,8 +11462,8 @@
         <w:t xml:space="preserve">The quality and correctness of your work remains your responsibility.</w:t>
       </w:r>
     </w:p>
-    <w:bookmarkEnd w:id="125"/>
-    <w:bookmarkStart w:id="136" w:name="firewall-and-network-configuration"/>
+    <w:bookmarkEnd w:id="126"/>
+    <w:bookmarkStart w:id="137" w:name="firewall-and-network-configuration"/>
     <w:p>
       <w:pPr>
         <w:pStyle w:val="Heading1"/>
@@ -11452,7 +11492,7 @@
         <w:t xml:space="preserve">you may need to configure allowlists to enable coding agent functionality.</w:t>
       </w:r>
     </w:p>
-    <w:bookmarkStart w:id="127" w:name="built-in-agent-firewall"/>
+    <w:bookmarkStart w:id="128" w:name="built-in-agent-firewall"/>
     <w:p>
       <w:pPr>
         <w:pStyle w:val="Heading4"/>
@@ -11589,7 +11629,7 @@
       <w:r>
         <w:t xml:space="preserve"> </w:t>
       </w:r>
-      <w:hyperlink r:id="rId126">
+      <w:hyperlink r:id="rId127">
         <w:r>
           <w:rPr>
             <w:rStyle w:val="Hyperlink"/>
@@ -11601,8 +11641,8 @@
         <w:t xml:space="preserve">.</w:t>
       </w:r>
     </w:p>
-    <w:bookmarkEnd w:id="127"/>
-    <w:bookmarkStart w:id="129" w:name="customizing-agent-firewall-settings"/>
+    <w:bookmarkEnd w:id="128"/>
+    <w:bookmarkStart w:id="130" w:name="customizing-agent-firewall-settings"/>
     <w:p>
       <w:pPr>
         <w:pStyle w:val="Heading4"/>
@@ -11709,7 +11749,7 @@
       <w:r>
         <w:t xml:space="preserve"> </w:t>
       </w:r>
-      <w:hyperlink r:id="rId128">
+      <w:hyperlink r:id="rId129">
         <w:r>
           <w:rPr>
             <w:rStyle w:val="Hyperlink"/>
@@ -11721,8 +11761,8 @@
         <w:t xml:space="preserve">.</w:t>
       </w:r>
     </w:p>
-    <w:bookmarkEnd w:id="129"/>
-    <w:bookmarkStart w:id="135" w:name="Xbbad9df60dbc05443efb3cae36c1e0daa9b491b"/>
+    <w:bookmarkEnd w:id="130"/>
+    <w:bookmarkStart w:id="136" w:name="Xbbad9df60dbc05443efb3cae36c1e0daa9b491b"/>
     <w:p>
       <w:pPr>
         <w:pStyle w:val="Heading4"/>
@@ -12647,18 +12687,18 @@
                 <wp:inline>
                   <wp:extent cx="152400" cy="152400"/>
                   <wp:effectExtent b="0" l="0" r="0" t="0"/>
-                  <wp:docPr descr="" title="" id="131" name="Picture"/>
+                  <wp:docPr descr="" title="" id="132" name="Picture"/>
                   <a:graphic>
                     <a:graphicData uri="http://schemas.openxmlformats.org/drawingml/2006/picture">
                       <pic:pic>
                         <pic:nvPicPr>
-                          <pic:cNvPr descr="/opt/quarto/share/formats/docx/tip.png" id="132" name="Picture"/>
+                          <pic:cNvPr descr="/opt/quarto/share/formats/docx/tip.png" id="133" name="Picture"/>
                           <pic:cNvPicPr>
                             <a:picLocks noChangeArrowheads="1" noChangeAspect="1"/>
                           </pic:cNvPicPr>
                         </pic:nvPicPr>
                         <pic:blipFill>
-                          <a:blip r:embed="rId130"/>
+                          <a:blip r:embed="rId131"/>
                           <a:stretch>
                             <a:fillRect/>
                           </a:stretch>
@@ -12824,18 +12864,18 @@
                 <wp:inline>
                   <wp:extent cx="152400" cy="152400"/>
                   <wp:effectExtent b="0" l="0" r="0" t="0"/>
-                  <wp:docPr descr="" title="" id="133" name="Picture"/>
+                  <wp:docPr descr="" title="" id="134" name="Picture"/>
                   <a:graphic>
                     <a:graphicData uri="http://schemas.openxmlformats.org/drawingml/2006/picture">
                       <pic:pic>
                         <pic:nvPicPr>
-                          <pic:cNvPr descr="/opt/quarto/share/formats/docx/note.png" id="134" name="Picture"/>
+                          <pic:cNvPr descr="/opt/quarto/share/formats/docx/note.png" id="135" name="Picture"/>
                           <pic:cNvPicPr>
                             <a:picLocks noChangeArrowheads="1" noChangeAspect="1"/>
                           </pic:cNvPicPr>
                         </pic:nvPicPr>
                         <pic:blipFill>
-                          <a:blip r:embed="rId119"/>
+                          <a:blip r:embed="rId120"/>
                           <a:stretch>
                             <a:fillRect/>
                           </a:stretch>
@@ -12970,9 +13010,9 @@
         </w:tc>
       </w:tr>
     </w:tbl>
-    <w:bookmarkEnd w:id="135"/>
     <w:bookmarkEnd w:id="136"/>
-    <w:bookmarkStart w:id="187" w:name="sec-ai-offline"/>
+    <w:bookmarkEnd w:id="137"/>
+    <w:bookmarkStart w:id="188" w:name="sec-ai-offline"/>
     <w:p>
       <w:pPr>
         <w:pStyle w:val="Heading1"/>
@@ -13066,18 +13106,18 @@
                 <wp:inline>
                   <wp:extent cx="152400" cy="152400"/>
                   <wp:effectExtent b="0" l="0" r="0" t="0"/>
-                  <wp:docPr descr="" title="" id="137" name="Picture"/>
+                  <wp:docPr descr="" title="" id="138" name="Picture"/>
                   <a:graphic>
                     <a:graphicData uri="http://schemas.openxmlformats.org/drawingml/2006/picture">
                       <pic:pic>
                         <pic:nvPicPr>
-                          <pic:cNvPr descr="/opt/quarto/share/formats/docx/note.png" id="138" name="Picture"/>
+                          <pic:cNvPr descr="/opt/quarto/share/formats/docx/note.png" id="139" name="Picture"/>
                           <pic:cNvPicPr>
                             <a:picLocks noChangeArrowheads="1" noChangeAspect="1"/>
                           </pic:cNvPicPr>
                         </pic:nvPicPr>
                         <pic:blipFill>
-                          <a:blip r:embed="rId119"/>
+                          <a:blip r:embed="rId120"/>
                           <a:stretch>
                             <a:fillRect/>
                           </a:stretch>
@@ -13183,7 +13223,7 @@
         </w:tc>
       </w:tr>
     </w:tbl>
-    <w:bookmarkStart w:id="148" w:name="running-a-local-model-with-ollama"/>
+    <w:bookmarkStart w:id="149" w:name="running-a-local-model-with-ollama"/>
     <w:p>
       <w:pPr>
         <w:pStyle w:val="Heading4"/>
@@ -13196,7 +13236,7 @@
       <w:pPr>
         <w:pStyle w:val="FirstParagraph"/>
       </w:pPr>
-      <w:hyperlink r:id="rId139">
+      <w:hyperlink r:id="rId140">
         <w:r>
           <w:rPr>
             <w:rStyle w:val="Hyperlink"/>
@@ -13276,18 +13316,18 @@
                 <wp:inline>
                   <wp:extent cx="152400" cy="152400"/>
                   <wp:effectExtent b="0" l="0" r="0" t="0"/>
-                  <wp:docPr descr="" title="" id="141" name="Picture"/>
+                  <wp:docPr descr="" title="" id="142" name="Picture"/>
                   <a:graphic>
                     <a:graphicData uri="http://schemas.openxmlformats.org/drawingml/2006/picture">
                       <pic:pic>
                         <pic:nvPicPr>
-                          <pic:cNvPr descr="/opt/quarto/share/formats/docx/caution.png" id="142" name="Picture"/>
+                          <pic:cNvPr descr="/opt/quarto/share/formats/docx/caution.png" id="143" name="Picture"/>
                           <pic:cNvPicPr>
                             <a:picLocks noChangeArrowheads="1" noChangeAspect="1"/>
                           </pic:cNvPicPr>
                         </pic:nvPicPr>
                         <pic:blipFill>
-                          <a:blip r:embed="rId140"/>
+                          <a:blip r:embed="rId141"/>
                           <a:stretch>
                             <a:fillRect/>
                           </a:stretch>
@@ -13484,7 +13524,7 @@
             <w:r>
               <w:t xml:space="preserve"> </w:t>
             </w:r>
-            <w:hyperlink r:id="rId143">
+            <w:hyperlink r:id="rId144">
               <w:r>
                 <w:rPr>
                   <w:rStyle w:val="Hyperlink"/>
@@ -13604,7 +13644,7 @@
       <w:r>
         <w:t xml:space="preserve"> </w:t>
       </w:r>
-      <w:hyperlink r:id="rId144">
+      <w:hyperlink r:id="rId145">
         <w:r>
           <w:rPr>
             <w:rStyle w:val="Hyperlink"/>
@@ -13724,7 +13764,7 @@
       <w:r>
         <w:t xml:space="preserve"> </w:t>
       </w:r>
-      <w:hyperlink r:id="rId145">
+      <w:hyperlink r:id="rId146">
         <w:r>
           <w:rPr>
             <w:rStyle w:val="Hyperlink"/>
@@ -13792,18 +13832,18 @@
                 <wp:inline>
                   <wp:extent cx="152400" cy="152400"/>
                   <wp:effectExtent b="0" l="0" r="0" t="0"/>
-                  <wp:docPr descr="" title="" id="146" name="Picture"/>
+                  <wp:docPr descr="" title="" id="147" name="Picture"/>
                   <a:graphic>
                     <a:graphicData uri="http://schemas.openxmlformats.org/drawingml/2006/picture">
                       <pic:pic>
                         <pic:nvPicPr>
-                          <pic:cNvPr descr="/opt/quarto/share/formats/docx/warning.png" id="147" name="Picture"/>
+                          <pic:cNvPr descr="/opt/quarto/share/formats/docx/warning.png" id="148" name="Picture"/>
                           <pic:cNvPicPr>
                             <a:picLocks noChangeArrowheads="1" noChangeAspect="1"/>
                           </pic:cNvPicPr>
                         </pic:nvPicPr>
                         <pic:blipFill>
-                          <a:blip r:embed="rId104"/>
+                          <a:blip r:embed="rId105"/>
                           <a:stretch>
                             <a:fillRect/>
                           </a:stretch>
@@ -15355,8 +15395,8 @@
         <w:t xml:space="preserve">.</w:t>
       </w:r>
     </w:p>
-    <w:bookmarkEnd w:id="148"/>
-    <w:bookmarkStart w:id="151" w:name="connecting-positron-assistant-to-ollama"/>
+    <w:bookmarkEnd w:id="149"/>
+    <w:bookmarkStart w:id="152" w:name="connecting-positron-assistant-to-ollama"/>
     <w:p>
       <w:pPr>
         <w:pStyle w:val="Heading4"/>
@@ -15369,7 +15409,7 @@
       <w:pPr>
         <w:pStyle w:val="FirstParagraph"/>
       </w:pPr>
-      <w:hyperlink r:id="rId149">
+      <w:hyperlink r:id="rId150">
         <w:r>
           <w:rPr>
             <w:rStyle w:val="Hyperlink"/>
@@ -15386,7 +15426,7 @@
       <w:r>
         <w:t xml:space="preserve"> </w:t>
       </w:r>
-      <w:hyperlink r:id="rId150">
+      <w:hyperlink r:id="rId151">
         <w:r>
           <w:rPr>
             <w:rStyle w:val="Hyperlink"/>
@@ -15595,8 +15635,8 @@
         <w:t xml:space="preserve">instead of a cloud provider.</w:t>
       </w:r>
     </w:p>
-    <w:bookmarkEnd w:id="151"/>
-    <w:bookmarkStart w:id="153" w:name="Xdb900790d603e9eb1dbc219acfc2383290fd98a"/>
+    <w:bookmarkEnd w:id="152"/>
+    <w:bookmarkStart w:id="154" w:name="Xdb900790d603e9eb1dbc219acfc2383290fd98a"/>
     <w:p>
       <w:pPr>
         <w:pStyle w:val="Heading4"/>
@@ -15609,7 +15649,7 @@
       <w:pPr>
         <w:pStyle w:val="FirstParagraph"/>
       </w:pPr>
-      <w:hyperlink r:id="rId152">
+      <w:hyperlink r:id="rId153">
         <w:r>
           <w:rPr>
             <w:rStyle w:val="Hyperlink"/>
@@ -15718,8 +15758,8 @@
         <w:t xml:space="preserve">but routed entirely to your local model.</w:t>
       </w:r>
     </w:p>
-    <w:bookmarkEnd w:id="153"/>
-    <w:bookmarkStart w:id="160" w:name="Xa49787af61dbef3b2520e4c56cd107733cf2925"/>
+    <w:bookmarkEnd w:id="154"/>
+    <w:bookmarkStart w:id="161" w:name="Xa49787af61dbef3b2520e4c56cd107733cf2925"/>
     <w:p>
       <w:pPr>
         <w:pStyle w:val="Heading4"/>
@@ -15753,7 +15793,7 @@
       <w:r>
         <w:t xml:space="preserve">and commits them to git—the local counterpart to a cloud coding agent—</w:t>
       </w:r>
-      <w:hyperlink r:id="rId154">
+      <w:hyperlink r:id="rId155">
         <w:r>
           <w:rPr>
             <w:rStyle w:val="VerbatimChar"/>
@@ -16015,18 +16055,18 @@
                 <wp:inline>
                   <wp:extent cx="152400" cy="152400"/>
                   <wp:effectExtent b="0" l="0" r="0" t="0"/>
-                  <wp:docPr descr="" title="" id="156" name="Picture"/>
+                  <wp:docPr descr="" title="" id="157" name="Picture"/>
                   <a:graphic>
                     <a:graphicData uri="http://schemas.openxmlformats.org/drawingml/2006/picture">
                       <pic:pic>
                         <pic:nvPicPr>
-                          <pic:cNvPr descr="/opt/quarto/share/formats/docx/important.png" id="157" name="Picture"/>
+                          <pic:cNvPr descr="/opt/quarto/share/formats/docx/important.png" id="158" name="Picture"/>
                           <pic:cNvPicPr>
                             <a:picLocks noChangeArrowheads="1" noChangeAspect="1"/>
                           </pic:cNvPicPr>
                         </pic:nvPicPr>
                         <pic:blipFill>
-                          <a:blip r:embed="rId155"/>
+                          <a:blip r:embed="rId156"/>
                           <a:stretch>
                             <a:fillRect/>
                           </a:stretch>
@@ -16906,18 +16946,18 @@
                 <wp:inline>
                   <wp:extent cx="152400" cy="152400"/>
                   <wp:effectExtent b="0" l="0" r="0" t="0"/>
-                  <wp:docPr descr="" title="" id="158" name="Picture"/>
+                  <wp:docPr descr="" title="" id="159" name="Picture"/>
                   <a:graphic>
                     <a:graphicData uri="http://schemas.openxmlformats.org/drawingml/2006/picture">
                       <pic:pic>
                         <pic:nvPicPr>
-                          <pic:cNvPr descr="/opt/quarto/share/formats/docx/caution.png" id="159" name="Picture"/>
+                          <pic:cNvPr descr="/opt/quarto/share/formats/docx/caution.png" id="160" name="Picture"/>
                           <pic:cNvPicPr>
                             <a:picLocks noChangeArrowheads="1" noChangeAspect="1"/>
                           </pic:cNvPicPr>
                         </pic:nvPicPr>
                         <pic:blipFill>
-                          <a:blip r:embed="rId140"/>
+                          <a:blip r:embed="rId141"/>
                           <a:stretch>
                             <a:fillRect/>
                           </a:stretch>
@@ -17059,8 +17099,8 @@
         </w:tc>
       </w:tr>
     </w:tbl>
-    <w:bookmarkEnd w:id="160"/>
-    <w:bookmarkStart w:id="161" w:name="Xfaca38e7659e63d88eb8a6433eb2bd1e6d3e705"/>
+    <w:bookmarkEnd w:id="161"/>
+    <w:bookmarkStart w:id="162" w:name="Xfaca38e7659e63d88eb8a6433eb2bd1e6d3e705"/>
     <w:p>
       <w:pPr>
         <w:pStyle w:val="Heading4"/>
@@ -17177,8 +17217,8 @@
         <w:t xml:space="preserve">Speech-to-text voice input support</w:t>
       </w:r>
     </w:p>
-    <w:bookmarkEnd w:id="161"/>
-    <w:bookmarkStart w:id="164" w:name="integrating-aider-into-vs-code"/>
+    <w:bookmarkEnd w:id="162"/>
+    <w:bookmarkStart w:id="165" w:name="integrating-aider-into-vs-code"/>
     <w:p>
       <w:pPr>
         <w:pStyle w:val="Heading4"/>
@@ -17560,18 +17600,18 @@
                 <wp:inline>
                   <wp:extent cx="152400" cy="152400"/>
                   <wp:effectExtent b="0" l="0" r="0" t="0"/>
-                  <wp:docPr descr="" title="" id="162" name="Picture"/>
+                  <wp:docPr descr="" title="" id="163" name="Picture"/>
                   <a:graphic>
                     <a:graphicData uri="http://schemas.openxmlformats.org/drawingml/2006/picture">
                       <pic:pic>
                         <pic:nvPicPr>
-                          <pic:cNvPr descr="/opt/quarto/share/formats/docx/important.png" id="163" name="Picture"/>
+                          <pic:cNvPr descr="/opt/quarto/share/formats/docx/important.png" id="164" name="Picture"/>
                           <pic:cNvPicPr>
                             <a:picLocks noChangeArrowheads="1" noChangeAspect="1"/>
                           </pic:cNvPicPr>
                         </pic:nvPicPr>
                         <pic:blipFill>
-                          <a:blip r:embed="rId155"/>
+                          <a:blip r:embed="rId156"/>
                           <a:stretch>
                             <a:fillRect/>
                           </a:stretch>
@@ -18126,8 +18166,8 @@
         </w:tc>
       </w:tr>
     </w:tbl>
-    <w:bookmarkEnd w:id="164"/>
-    <w:bookmarkStart w:id="168" w:name="connecting-claude-code-to-ollama"/>
+    <w:bookmarkEnd w:id="165"/>
+    <w:bookmarkStart w:id="169" w:name="connecting-claude-code-to-ollama"/>
     <w:p>
       <w:pPr>
         <w:pStyle w:val="Heading4"/>
@@ -18192,7 +18232,7 @@
       <w:r>
         <w:t xml:space="preserve"> </w:t>
       </w:r>
-      <w:hyperlink r:id="rId165">
+      <w:hyperlink r:id="rId166">
         <w:r>
           <w:rPr>
             <w:rStyle w:val="Hyperlink"/>
@@ -18544,18 +18584,18 @@
                 <wp:inline>
                   <wp:extent cx="152400" cy="152400"/>
                   <wp:effectExtent b="0" l="0" r="0" t="0"/>
-                  <wp:docPr descr="" title="" id="166" name="Picture"/>
+                  <wp:docPr descr="" title="" id="167" name="Picture"/>
                   <a:graphic>
                     <a:graphicData uri="http://schemas.openxmlformats.org/drawingml/2006/picture">
                       <pic:pic>
                         <pic:nvPicPr>
-                          <pic:cNvPr descr="/opt/quarto/share/formats/docx/warning.png" id="167" name="Picture"/>
+                          <pic:cNvPr descr="/opt/quarto/share/formats/docx/warning.png" id="168" name="Picture"/>
                           <pic:cNvPicPr>
                             <a:picLocks noChangeArrowheads="1" noChangeAspect="1"/>
                           </pic:cNvPicPr>
                         </pic:nvPicPr>
                         <pic:blipFill>
-                          <a:blip r:embed="rId104"/>
+                          <a:blip r:embed="rId105"/>
                           <a:stretch>
                             <a:fillRect/>
                           </a:stretch>
@@ -18979,8 +19019,8 @@
         </w:tc>
       </w:tr>
     </w:tbl>
-    <w:bookmarkEnd w:id="168"/>
-    <w:bookmarkStart w:id="174" w:name="X59411e82da523ef2314b797b4d6b6b495bf0db8"/>
+    <w:bookmarkEnd w:id="169"/>
+    <w:bookmarkStart w:id="175" w:name="X59411e82da523ef2314b797b4d6b6b495bf0db8"/>
     <w:p>
       <w:pPr>
         <w:pStyle w:val="Heading4"/>
@@ -19031,7 +19071,7 @@
       <w:pPr>
         <w:pStyle w:val="BodyText"/>
       </w:pPr>
-      <w:hyperlink r:id="rId169">
+      <w:hyperlink r:id="rId170">
         <w:r>
           <w:rPr>
             <w:rStyle w:val="VerbatimChar"/>
@@ -19810,18 +19850,18 @@
                 <wp:inline>
                   <wp:extent cx="152400" cy="152400"/>
                   <wp:effectExtent b="0" l="0" r="0" t="0"/>
-                  <wp:docPr descr="" title="" id="170" name="Picture"/>
+                  <wp:docPr descr="" title="" id="171" name="Picture"/>
                   <a:graphic>
                     <a:graphicData uri="http://schemas.openxmlformats.org/drawingml/2006/picture">
                       <pic:pic>
                         <pic:nvPicPr>
-                          <pic:cNvPr descr="/opt/quarto/share/formats/docx/note.png" id="171" name="Picture"/>
+                          <pic:cNvPr descr="/opt/quarto/share/formats/docx/note.png" id="172" name="Picture"/>
                           <pic:cNvPicPr>
                             <a:picLocks noChangeArrowheads="1" noChangeAspect="1"/>
                           </pic:cNvPicPr>
                         </pic:nvPicPr>
                         <pic:blipFill>
-                          <a:blip r:embed="rId119"/>
+                          <a:blip r:embed="rId120"/>
                           <a:stretch>
                             <a:fillRect/>
                           </a:stretch>
@@ -19964,18 +20004,18 @@
                 <wp:inline>
                   <wp:extent cx="152400" cy="152400"/>
                   <wp:effectExtent b="0" l="0" r="0" t="0"/>
-                  <wp:docPr descr="" title="" id="172" name="Picture"/>
+                  <wp:docPr descr="" title="" id="173" name="Picture"/>
                   <a:graphic>
                     <a:graphicData uri="http://schemas.openxmlformats.org/drawingml/2006/picture">
                       <pic:pic>
                         <pic:nvPicPr>
-                          <pic:cNvPr descr="/opt/quarto/share/formats/docx/caution.png" id="173" name="Picture"/>
+                          <pic:cNvPr descr="/opt/quarto/share/formats/docx/caution.png" id="174" name="Picture"/>
                           <pic:cNvPicPr>
                             <a:picLocks noChangeArrowheads="1" noChangeAspect="1"/>
                           </pic:cNvPicPr>
                         </pic:nvPicPr>
                         <pic:blipFill>
-                          <a:blip r:embed="rId140"/>
+                          <a:blip r:embed="rId141"/>
                           <a:stretch>
                             <a:fillRect/>
                           </a:stretch>
@@ -20066,8 +20106,8 @@
         </w:tc>
       </w:tr>
     </w:tbl>
-    <w:bookmarkEnd w:id="174"/>
-    <w:bookmarkStart w:id="182" w:name="working-in-hpc-cluster-environments"/>
+    <w:bookmarkEnd w:id="175"/>
+    <w:bookmarkStart w:id="183" w:name="working-in-hpc-cluster-environments"/>
     <w:p>
       <w:pPr>
         <w:pStyle w:val="Heading4"/>
@@ -20131,18 +20171,18 @@
                 <wp:inline>
                   <wp:extent cx="152400" cy="152400"/>
                   <wp:effectExtent b="0" l="0" r="0" t="0"/>
-                  <wp:docPr descr="" title="" id="175" name="Picture"/>
+                  <wp:docPr descr="" title="" id="176" name="Picture"/>
                   <a:graphic>
                     <a:graphicData uri="http://schemas.openxmlformats.org/drawingml/2006/picture">
                       <pic:pic>
                         <pic:nvPicPr>
-                          <pic:cNvPr descr="/opt/quarto/share/formats/docx/note.png" id="176" name="Picture"/>
+                          <pic:cNvPr descr="/opt/quarto/share/formats/docx/note.png" id="177" name="Picture"/>
                           <pic:cNvPicPr>
                             <a:picLocks noChangeArrowheads="1" noChangeAspect="1"/>
                           </pic:cNvPicPr>
                         </pic:nvPicPr>
                         <pic:blipFill>
-                          <a:blip r:embed="rId119"/>
+                          <a:blip r:embed="rId120"/>
                           <a:stretch>
                             <a:fillRect/>
                           </a:stretch>
@@ -20279,7 +20319,7 @@
             <w:r>
               <w:t xml:space="preserve"> </w:t>
             </w:r>
-            <w:hyperlink r:id="rId143">
+            <w:hyperlink r:id="rId144">
               <w:r>
                 <w:rPr>
                   <w:rStyle w:val="Hyperlink"/>
@@ -20455,18 +20495,18 @@
                 <wp:inline>
                   <wp:extent cx="152400" cy="152400"/>
                   <wp:effectExtent b="0" l="0" r="0" t="0"/>
-                  <wp:docPr descr="" title="" id="177" name="Picture"/>
+                  <wp:docPr descr="" title="" id="178" name="Picture"/>
                   <a:graphic>
                     <a:graphicData uri="http://schemas.openxmlformats.org/drawingml/2006/picture">
                       <pic:pic>
                         <pic:nvPicPr>
-                          <pic:cNvPr descr="/opt/quarto/share/formats/docx/warning.png" id="178" name="Picture"/>
+                          <pic:cNvPr descr="/opt/quarto/share/formats/docx/warning.png" id="179" name="Picture"/>
                           <pic:cNvPicPr>
                             <a:picLocks noChangeArrowheads="1" noChangeAspect="1"/>
                           </pic:cNvPicPr>
                         </pic:nvPicPr>
                         <pic:blipFill>
-                          <a:blip r:embed="rId104"/>
+                          <a:blip r:embed="rId105"/>
                           <a:stretch>
                             <a:fillRect/>
                           </a:stretch>
@@ -21271,18 +21311,18 @@
                 <wp:inline>
                   <wp:extent cx="152400" cy="152400"/>
                   <wp:effectExtent b="0" l="0" r="0" t="0"/>
-                  <wp:docPr descr="" title="" id="179" name="Picture"/>
+                  <wp:docPr descr="" title="" id="180" name="Picture"/>
                   <a:graphic>
                     <a:graphicData uri="http://schemas.openxmlformats.org/drawingml/2006/picture">
                       <pic:pic>
                         <pic:nvPicPr>
-                          <pic:cNvPr descr="/opt/quarto/share/formats/docx/warning.png" id="180" name="Picture"/>
+                          <pic:cNvPr descr="/opt/quarto/share/formats/docx/warning.png" id="181" name="Picture"/>
                           <pic:cNvPicPr>
                             <a:picLocks noChangeArrowheads="1" noChangeAspect="1"/>
                           </pic:cNvPicPr>
                         </pic:nvPicPr>
                         <pic:blipFill>
-                          <a:blip r:embed="rId104"/>
+                          <a:blip r:embed="rId105"/>
                           <a:stretch>
                             <a:fillRect/>
                           </a:stretch>
@@ -21374,7 +21414,7 @@
             <w:r>
               <w:t xml:space="preserve"> </w:t>
             </w:r>
-            <w:hyperlink r:id="rId181">
+            <w:hyperlink r:id="rId182">
               <w:r>
                 <w:rPr>
                   <w:rStyle w:val="Hyperlink"/>
@@ -21393,8 +21433,8 @@
         </w:tc>
       </w:tr>
     </w:tbl>
-    <w:bookmarkEnd w:id="182"/>
-    <w:bookmarkStart w:id="185" w:name="privacy-considerations"/>
+    <w:bookmarkEnd w:id="183"/>
+    <w:bookmarkStart w:id="186" w:name="privacy-considerations"/>
     <w:p>
       <w:pPr>
         <w:pStyle w:val="Heading4"/>
@@ -21520,18 +21560,18 @@
                 <wp:inline>
                   <wp:extent cx="152400" cy="152400"/>
                   <wp:effectExtent b="0" l="0" r="0" t="0"/>
-                  <wp:docPr descr="" title="" id="183" name="Picture"/>
+                  <wp:docPr descr="" title="" id="184" name="Picture"/>
                   <a:graphic>
                     <a:graphicData uri="http://schemas.openxmlformats.org/drawingml/2006/picture">
                       <pic:pic>
                         <pic:nvPicPr>
-                          <pic:cNvPr descr="/opt/quarto/share/formats/docx/important.png" id="184" name="Picture"/>
+                          <pic:cNvPr descr="/opt/quarto/share/formats/docx/important.png" id="185" name="Picture"/>
                           <pic:cNvPicPr>
                             <a:picLocks noChangeArrowheads="1" noChangeAspect="1"/>
                           </pic:cNvPicPr>
                         </pic:nvPicPr>
                         <pic:blipFill>
-                          <a:blip r:embed="rId155"/>
+                          <a:blip r:embed="rId156"/>
                           <a:stretch>
                             <a:fillRect/>
                           </a:stretch>
@@ -21683,7 +21723,7 @@
             <w:r>
               <w:t xml:space="preserve"> </w:t>
             </w:r>
-            <w:hyperlink r:id="rId145">
+            <w:hyperlink r:id="rId146">
               <w:r>
                 <w:rPr>
                   <w:rStyle w:val="Hyperlink"/>
@@ -21823,8 +21863,8 @@
         </w:tc>
       </w:tr>
     </w:tbl>
-    <w:bookmarkEnd w:id="185"/>
-    <w:bookmarkStart w:id="186" w:name="verifying-you-are-genuinely-offline"/>
+    <w:bookmarkEnd w:id="186"/>
+    <w:bookmarkStart w:id="187" w:name="verifying-you-are-genuinely-offline"/>
     <w:p>
       <w:pPr>
         <w:pStyle w:val="Heading4"/>
@@ -22232,9 +22272,9 @@
         <w:t xml:space="preserve">and looks exactly like success.</w:t>
       </w:r>
     </w:p>
-    <w:bookmarkEnd w:id="186"/>
     <w:bookmarkEnd w:id="187"/>
-    <w:bookmarkStart w:id="193" w:name="sec-ai-opencode-ollama"/>
+    <w:bookmarkEnd w:id="188"/>
+    <w:bookmarkStart w:id="194" w:name="sec-ai-opencode-ollama"/>
     <w:p>
       <w:pPr>
         <w:pStyle w:val="Heading1"/>
@@ -22247,7 +22287,7 @@
       <w:pPr>
         <w:pStyle w:val="FirstParagraph"/>
       </w:pPr>
-      <w:hyperlink r:id="rId188">
+      <w:hyperlink r:id="rId189">
         <w:r>
           <w:rPr>
             <w:rStyle w:val="Hyperlink"/>
@@ -22438,7 +22478,7 @@
       <w:r>
         <w:t xml:space="preserve"> </w:t>
       </w:r>
-      <w:hyperlink r:id="rId189">
+      <w:hyperlink r:id="rId190">
         <w:r>
           <w:rPr>
             <w:rStyle w:val="VerbatimChar"/>
@@ -22685,18 +22725,18 @@
                 <wp:inline>
                   <wp:extent cx="152400" cy="152400"/>
                   <wp:effectExtent b="0" l="0" r="0" t="0"/>
-                  <wp:docPr descr="" title="" id="190" name="Picture"/>
+                  <wp:docPr descr="" title="" id="191" name="Picture"/>
                   <a:graphic>
                     <a:graphicData uri="http://schemas.openxmlformats.org/drawingml/2006/picture">
                       <pic:pic>
                         <pic:nvPicPr>
-                          <pic:cNvPr descr="/opt/quarto/share/formats/docx/note.png" id="191" name="Picture"/>
+                          <pic:cNvPr descr="/opt/quarto/share/formats/docx/note.png" id="192" name="Picture"/>
                           <pic:cNvPicPr>
                             <a:picLocks noChangeArrowheads="1" noChangeAspect="1"/>
                           </pic:cNvPicPr>
                         </pic:nvPicPr>
                         <pic:blipFill>
-                          <a:blip r:embed="rId119"/>
+                          <a:blip r:embed="rId120"/>
                           <a:stretch>
                             <a:fillRect/>
                           </a:stretch>
@@ -22764,7 +22804,7 @@
             <w:r>
               <w:t xml:space="preserve"> </w:t>
             </w:r>
-            <w:hyperlink r:id="rId192">
+            <w:hyperlink r:id="rId193">
               <w:r>
                 <w:rPr>
                   <w:rStyle w:val="VerbatimChar"/>
@@ -22869,8 +22909,8 @@
         <w:t xml:space="preserve">.</w:t>
       </w:r>
     </w:p>
-    <w:bookmarkEnd w:id="193"/>
-    <w:bookmarkStart w:id="198" w:name="sec-ai-opencode-openrouter"/>
+    <w:bookmarkEnd w:id="194"/>
+    <w:bookmarkStart w:id="199" w:name="sec-ai-opencode-openrouter"/>
     <w:p>
       <w:pPr>
         <w:pStyle w:val="Heading1"/>
@@ -22883,7 +22923,7 @@
       <w:pPr>
         <w:pStyle w:val="FirstParagraph"/>
       </w:pPr>
-      <w:hyperlink r:id="rId194">
+      <w:hyperlink r:id="rId195">
         <w:r>
           <w:rPr>
             <w:rStyle w:val="Hyperlink"/>
@@ -22992,7 +23032,7 @@
       <w:r>
         <w:t xml:space="preserve"> </w:t>
       </w:r>
-      <w:hyperlink r:id="rId195">
+      <w:hyperlink r:id="rId196">
         <w:r>
           <w:rPr>
             <w:rStyle w:val="Hyperlink"/>
@@ -23009,7 +23049,7 @@
       <w:r>
         <w:t xml:space="preserve"> </w:t>
       </w:r>
-      <w:hyperlink r:id="rId196">
+      <w:hyperlink r:id="rId197">
         <w:r>
           <w:rPr>
             <w:rStyle w:val="Hyperlink"/>
@@ -24055,7 +24095,7 @@
       <w:r>
         <w:t xml:space="preserve">(</w:t>
       </w:r>
-      <w:hyperlink r:id="rId197">
+      <w:hyperlink r:id="rId198">
         <w:r>
           <w:rPr>
             <w:rStyle w:val="Hyperlink"/>
@@ -24075,8 +24115,8 @@
         <w:t xml:space="preserve">Config loads at startup, so restart OpenCode after editing it.</w:t>
       </w:r>
     </w:p>
-    <w:bookmarkEnd w:id="198"/>
-    <w:bookmarkStart w:id="235" w:name="sec-ai-small-local-models"/>
+    <w:bookmarkEnd w:id="199"/>
+    <w:bookmarkStart w:id="236" w:name="sec-ai-small-local-models"/>
     <w:p>
       <w:pPr>
         <w:pStyle w:val="Heading1"/>
@@ -24224,18 +24264,18 @@
                 <wp:inline>
                   <wp:extent cx="152400" cy="152400"/>
                   <wp:effectExtent b="0" l="0" r="0" t="0"/>
-                  <wp:docPr descr="" title="" id="199" name="Picture"/>
+                  <wp:docPr descr="" title="" id="200" name="Picture"/>
                   <a:graphic>
                     <a:graphicData uri="http://schemas.openxmlformats.org/drawingml/2006/picture">
                       <pic:pic>
                         <pic:nvPicPr>
-                          <pic:cNvPr descr="/opt/quarto/share/formats/docx/warning.png" id="200" name="Picture"/>
+                          <pic:cNvPr descr="/opt/quarto/share/formats/docx/warning.png" id="201" name="Picture"/>
                           <pic:cNvPicPr>
                             <a:picLocks noChangeArrowheads="1" noChangeAspect="1"/>
                           </pic:cNvPicPr>
                         </pic:nvPicPr>
                         <pic:blipFill>
-                          <a:blip r:embed="rId104"/>
+                          <a:blip r:embed="rId105"/>
                           <a:stretch>
                             <a:fillRect/>
                           </a:stretch>
@@ -24365,7 +24405,7 @@
         </w:tc>
       </w:tr>
     </w:tbl>
-    <w:bookmarkStart w:id="201" w:name="the-honest-catch"/>
+    <w:bookmarkStart w:id="202" w:name="the-honest-catch"/>
     <w:p>
       <w:pPr>
         <w:pStyle w:val="Heading4"/>
@@ -24535,8 +24575,8 @@
         <w:t xml:space="preserve">below.</w:t>
       </w:r>
     </w:p>
-    <w:bookmarkEnd w:id="201"/>
-    <w:bookmarkStart w:id="216" w:name="model-landscape"/>
+    <w:bookmarkEnd w:id="202"/>
+    <w:bookmarkStart w:id="217" w:name="model-landscape"/>
     <w:p>
       <w:pPr>
         <w:pStyle w:val="Heading4"/>
@@ -24668,7 +24708,7 @@
             <w:pPr>
               <w:pStyle w:val="Compact"/>
             </w:pPr>
-            <w:hyperlink r:id="rId202">
+            <w:hyperlink r:id="rId203">
               <w:r>
                 <w:rPr>
                   <w:rStyle w:val="Hyperlink"/>
@@ -24743,7 +24783,7 @@
             <w:pPr>
               <w:pStyle w:val="Compact"/>
             </w:pPr>
-            <w:hyperlink r:id="rId203">
+            <w:hyperlink r:id="rId204">
               <w:r>
                 <w:rPr>
                   <w:rStyle w:val="Hyperlink"/>
@@ -24794,7 +24834,7 @@
             <w:pPr>
               <w:pStyle w:val="Compact"/>
             </w:pPr>
-            <w:hyperlink r:id="rId204">
+            <w:hyperlink r:id="rId205">
               <w:r>
                 <w:rPr>
                   <w:rStyle w:val="Hyperlink"/>
@@ -24869,7 +24909,7 @@
             <w:pPr>
               <w:pStyle w:val="Compact"/>
             </w:pPr>
-            <w:hyperlink r:id="rId205">
+            <w:hyperlink r:id="rId206">
               <w:r>
                 <w:rPr>
                   <w:rStyle w:val="Hyperlink"/>
@@ -24920,7 +24960,7 @@
             <w:pPr>
               <w:pStyle w:val="Compact"/>
             </w:pPr>
-            <w:hyperlink r:id="rId206">
+            <w:hyperlink r:id="rId207">
               <w:r>
                 <w:rPr>
                   <w:rStyle w:val="Hyperlink"/>
@@ -24971,7 +25011,7 @@
             <w:pPr>
               <w:pStyle w:val="Compact"/>
             </w:pPr>
-            <w:hyperlink r:id="rId207">
+            <w:hyperlink r:id="rId208">
               <w:r>
                 <w:rPr>
                   <w:rStyle w:val="Hyperlink"/>
@@ -25022,7 +25062,7 @@
             <w:pPr>
               <w:pStyle w:val="Compact"/>
             </w:pPr>
-            <w:hyperlink r:id="rId208">
+            <w:hyperlink r:id="rId209">
               <w:r>
                 <w:rPr>
                   <w:rStyle w:val="Hyperlink"/>
@@ -25073,7 +25113,7 @@
             <w:pPr>
               <w:pStyle w:val="Compact"/>
             </w:pPr>
-            <w:hyperlink r:id="rId209">
+            <w:hyperlink r:id="rId210">
               <w:r>
                 <w:rPr>
                   <w:rStyle w:val="Hyperlink"/>
@@ -25100,7 +25140,7 @@
             <w:pPr>
               <w:pStyle w:val="Compact"/>
             </w:pPr>
-            <w:hyperlink r:id="rId210">
+            <w:hyperlink r:id="rId211">
               <w:r>
                 <w:rPr>
                   <w:rStyle w:val="Hyperlink"/>
@@ -25129,7 +25169,7 @@
             <w:pPr>
               <w:pStyle w:val="Compact"/>
             </w:pPr>
-            <w:hyperlink r:id="rId211">
+            <w:hyperlink r:id="rId212">
               <w:r>
                 <w:rPr>
                   <w:rStyle w:val="Hyperlink"/>
@@ -25156,7 +25196,7 @@
             <w:pPr>
               <w:pStyle w:val="Compact"/>
             </w:pPr>
-            <w:hyperlink r:id="rId212">
+            <w:hyperlink r:id="rId213">
               <w:r>
                 <w:rPr>
                   <w:rStyle w:val="Hyperlink"/>
@@ -25191,7 +25231,7 @@
             <w:pPr>
               <w:pStyle w:val="Compact"/>
             </w:pPr>
-            <w:hyperlink r:id="rId213">
+            <w:hyperlink r:id="rId214">
               <w:r>
                 <w:rPr>
                   <w:rStyle w:val="Hyperlink"/>
@@ -25445,18 +25485,18 @@
                 <wp:inline>
                   <wp:extent cx="152400" cy="152400"/>
                   <wp:effectExtent b="0" l="0" r="0" t="0"/>
-                  <wp:docPr descr="" title="" id="214" name="Picture"/>
+                  <wp:docPr descr="" title="" id="215" name="Picture"/>
                   <a:graphic>
                     <a:graphicData uri="http://schemas.openxmlformats.org/drawingml/2006/picture">
                       <pic:pic>
                         <pic:nvPicPr>
-                          <pic:cNvPr descr="/opt/quarto/share/formats/docx/important.png" id="215" name="Picture"/>
+                          <pic:cNvPr descr="/opt/quarto/share/formats/docx/important.png" id="216" name="Picture"/>
                           <pic:cNvPicPr>
                             <a:picLocks noChangeArrowheads="1" noChangeAspect="1"/>
                           </pic:cNvPicPr>
                         </pic:nvPicPr>
                         <pic:blipFill>
-                          <a:blip r:embed="rId155"/>
+                          <a:blip r:embed="rId156"/>
                           <a:stretch>
                             <a:fillRect/>
                           </a:stretch>
@@ -25877,8 +25917,8 @@
         </w:tc>
       </w:tr>
     </w:tbl>
-    <w:bookmarkEnd w:id="216"/>
-    <w:bookmarkStart w:id="219" w:name="hardware-tiers"/>
+    <w:bookmarkEnd w:id="217"/>
+    <w:bookmarkStart w:id="220" w:name="hardware-tiers"/>
     <w:p>
       <w:pPr>
         <w:pStyle w:val="Heading4"/>
@@ -26130,7 +26170,7 @@
       <w:r>
         <w:t xml:space="preserve"> </w:t>
       </w:r>
-      <w:hyperlink r:id="rId145">
+      <w:hyperlink r:id="rId146">
         <w:r>
           <w:rPr>
             <w:rStyle w:val="Hyperlink"/>
@@ -26198,18 +26238,18 @@
                 <wp:inline>
                   <wp:extent cx="152400" cy="152400"/>
                   <wp:effectExtent b="0" l="0" r="0" t="0"/>
-                  <wp:docPr descr="" title="" id="217" name="Picture"/>
+                  <wp:docPr descr="" title="" id="218" name="Picture"/>
                   <a:graphic>
                     <a:graphicData uri="http://schemas.openxmlformats.org/drawingml/2006/picture">
                       <pic:pic>
                         <pic:nvPicPr>
-                          <pic:cNvPr descr="/opt/quarto/share/formats/docx/warning.png" id="218" name="Picture"/>
+                          <pic:cNvPr descr="/opt/quarto/share/formats/docx/warning.png" id="219" name="Picture"/>
                           <pic:cNvPicPr>
                             <a:picLocks noChangeArrowheads="1" noChangeAspect="1"/>
                           </pic:cNvPicPr>
                         </pic:nvPicPr>
                         <pic:blipFill>
-                          <a:blip r:embed="rId104"/>
+                          <a:blip r:embed="rId105"/>
                           <a:stretch>
                             <a:fillRect/>
                           </a:stretch>
@@ -26501,8 +26541,8 @@
         </w:tc>
       </w:tr>
     </w:tbl>
-    <w:bookmarkEnd w:id="219"/>
-    <w:bookmarkStart w:id="222" w:name="action-latency-and-memory-bandwidth"/>
+    <w:bookmarkEnd w:id="220"/>
+    <w:bookmarkStart w:id="223" w:name="action-latency-and-memory-bandwidth"/>
     <w:p>
       <w:pPr>
         <w:pStyle w:val="Heading4"/>
@@ -27209,18 +27249,18 @@
                 <wp:inline>
                   <wp:extent cx="152400" cy="152400"/>
                   <wp:effectExtent b="0" l="0" r="0" t="0"/>
-                  <wp:docPr descr="" title="" id="220" name="Picture"/>
+                  <wp:docPr descr="" title="" id="221" name="Picture"/>
                   <a:graphic>
                     <a:graphicData uri="http://schemas.openxmlformats.org/drawingml/2006/picture">
                       <pic:pic>
                         <pic:nvPicPr>
-                          <pic:cNvPr descr="/opt/quarto/share/formats/docx/note.png" id="221" name="Picture"/>
+                          <pic:cNvPr descr="/opt/quarto/share/formats/docx/note.png" id="222" name="Picture"/>
                           <pic:cNvPicPr>
                             <a:picLocks noChangeArrowheads="1" noChangeAspect="1"/>
                           </pic:cNvPicPr>
                         </pic:nvPicPr>
                         <pic:blipFill>
-                          <a:blip r:embed="rId119"/>
+                          <a:blip r:embed="rId120"/>
                           <a:stretch>
                             <a:fillRect/>
                           </a:stretch>
@@ -27344,8 +27384,8 @@
         </w:tc>
       </w:tr>
     </w:tbl>
-    <w:bookmarkEnd w:id="222"/>
-    <w:bookmarkStart w:id="223" w:name="X58a4330bb9d721536d3df1abbb820879339bea7"/>
+    <w:bookmarkEnd w:id="223"/>
+    <w:bookmarkStart w:id="224" w:name="X58a4330bb9d721536d3df1abbb820879339bea7"/>
     <w:p>
       <w:pPr>
         <w:pStyle w:val="Heading4"/>
@@ -27635,8 +27675,8 @@
         <w:t xml:space="preserve">Feeds the command outputs back into the conversation context as tool messages.</w:t>
       </w:r>
     </w:p>
-    <w:bookmarkEnd w:id="223"/>
-    <w:bookmarkStart w:id="224" w:name="X98fbc317b6061ff02292f6372a6a1c929c09878"/>
+    <w:bookmarkEnd w:id="224"/>
+    <w:bookmarkStart w:id="225" w:name="X98fbc317b6061ff02292f6372a6a1c929c09878"/>
     <w:p>
       <w:pPr>
         <w:pStyle w:val="Heading4"/>
@@ -27913,8 +27953,8 @@
         <w:t xml:space="preserve">) in favor of immediate tool invocation.</w:t>
       </w:r>
     </w:p>
-    <w:bookmarkEnd w:id="224"/>
-    <w:bookmarkStart w:id="225" w:name="X97e83cd81a11ec4a50ee2033f7ad0a1c352c515"/>
+    <w:bookmarkEnd w:id="225"/>
+    <w:bookmarkStart w:id="226" w:name="X97e83cd81a11ec4a50ee2033f7ad0a1c352c515"/>
     <w:p>
       <w:pPr>
         <w:pStyle w:val="Heading4"/>
@@ -28306,8 +28346,8 @@
         <w:t xml:space="preserve">and the loop still needs a way to catch that.</w:t>
       </w:r>
     </w:p>
-    <w:bookmarkEnd w:id="225"/>
-    <w:bookmarkStart w:id="228" w:name="guardrails-for-autonomy"/>
+    <w:bookmarkEnd w:id="226"/>
+    <w:bookmarkStart w:id="229" w:name="guardrails-for-autonomy"/>
     <w:p>
       <w:pPr>
         <w:pStyle w:val="Heading4"/>
@@ -28357,18 +28397,18 @@
                 <wp:inline>
                   <wp:extent cx="152400" cy="152400"/>
                   <wp:effectExtent b="0" l="0" r="0" t="0"/>
-                  <wp:docPr descr="" title="" id="226" name="Picture"/>
+                  <wp:docPr descr="" title="" id="227" name="Picture"/>
                   <a:graphic>
                     <a:graphicData uri="http://schemas.openxmlformats.org/drawingml/2006/picture">
                       <pic:pic>
                         <pic:nvPicPr>
-                          <pic:cNvPr descr="/opt/quarto/share/formats/docx/important.png" id="227" name="Picture"/>
+                          <pic:cNvPr descr="/opt/quarto/share/formats/docx/important.png" id="228" name="Picture"/>
                           <pic:cNvPicPr>
                             <a:picLocks noChangeArrowheads="1" noChangeAspect="1"/>
                           </pic:cNvPicPr>
                         </pic:nvPicPr>
                         <pic:blipFill>
-                          <a:blip r:embed="rId155"/>
+                          <a:blip r:embed="rId156"/>
                           <a:stretch>
                             <a:fillRect/>
                           </a:stretch>
@@ -28661,7 +28701,7 @@
       <w:r>
         <w:t xml:space="preserve"> </w:t>
       </w:r>
-      <w:hyperlink r:id="rId55">
+      <w:hyperlink r:id="rId56">
         <w:r>
           <w:rPr>
             <w:rStyle w:val="VerbatimChar"/>
@@ -29099,8 +29139,8 @@
         <w:t xml:space="preserve">below.</w:t>
       </w:r>
     </w:p>
-    <w:bookmarkEnd w:id="228"/>
-    <w:bookmarkStart w:id="229" w:name="stack-specific-notes"/>
+    <w:bookmarkEnd w:id="229"/>
+    <w:bookmarkStart w:id="230" w:name="stack-specific-notes"/>
     <w:p>
       <w:pPr>
         <w:pStyle w:val="Heading4"/>
@@ -29473,8 +29513,8 @@
         <w:t xml:space="preserve">Markdown fix run unattended.</w:t>
       </w:r>
     </w:p>
-    <w:bookmarkEnd w:id="229"/>
-    <w:bookmarkStart w:id="231" w:name="fine-tuning-closing-the-idiom-gap"/>
+    <w:bookmarkEnd w:id="230"/>
+    <w:bookmarkStart w:id="232" w:name="fine-tuning-closing-the-idiom-gap"/>
     <w:p>
       <w:pPr>
         <w:pStyle w:val="Heading4"/>
@@ -29709,7 +29749,7 @@
       <w:r>
         <w:t xml:space="preserve"> </w:t>
       </w:r>
-      <w:hyperlink r:id="rId230">
+      <w:hyperlink r:id="rId231">
         <w:r>
           <w:rPr>
             <w:rStyle w:val="Hyperlink"/>
@@ -29798,8 +29838,8 @@
         <w:t xml:space="preserve">performs on the next genuinely new task.</w:t>
       </w:r>
     </w:p>
-    <w:bookmarkEnd w:id="231"/>
-    <w:bookmarkStart w:id="234" w:name="companion-work"/>
+    <w:bookmarkEnd w:id="232"/>
+    <w:bookmarkStart w:id="235" w:name="companion-work"/>
     <w:p>
       <w:pPr>
         <w:pStyle w:val="Heading4"/>
@@ -29841,7 +29881,7 @@
           <w:numId w:val="1074"/>
         </w:numPr>
       </w:pPr>
-      <w:hyperlink r:id="rId232">
+      <w:hyperlink r:id="rId233">
         <w:r>
           <w:rPr>
             <w:rStyle w:val="VerbatimChar"/>
@@ -29911,7 +29951,7 @@
           <w:numId w:val="1074"/>
         </w:numPr>
       </w:pPr>
-      <w:hyperlink r:id="rId233">
+      <w:hyperlink r:id="rId234">
         <w:r>
           <w:rPr>
             <w:rStyle w:val="VerbatimChar"/>
@@ -30019,9 +30059,9 @@
         <w:t xml:space="preserve">bibliography DOIs</w:t>
       </w:r>
     </w:p>
-    <w:bookmarkEnd w:id="234"/>
     <w:bookmarkEnd w:id="235"/>
-    <w:bookmarkStart w:id="248" w:name="sec-ai-copilot-settings"/>
+    <w:bookmarkEnd w:id="236"/>
+    <w:bookmarkStart w:id="249" w:name="sec-ai-copilot-settings"/>
     <w:p>
       <w:pPr>
         <w:pStyle w:val="Heading1"/>
@@ -30056,7 +30096,7 @@
         <w:t xml:space="preserve">and provides guidance on which options to enable based on your use case.</w:t>
       </w:r>
     </w:p>
-    <w:bookmarkStart w:id="239" w:name="model-selection-options"/>
+    <w:bookmarkStart w:id="240" w:name="model-selection-options"/>
     <w:p>
       <w:pPr>
         <w:pStyle w:val="Heading4"/>
@@ -30505,7 +30545,7 @@
       <w:r>
         <w:t xml:space="preserve"> </w:t>
       </w:r>
-      <w:hyperlink r:id="rId236">
+      <w:hyperlink r:id="rId237">
         <w:r>
           <w:rPr>
             <w:rStyle w:val="VerbatimChar"/>
@@ -30549,7 +30589,7 @@
       <w:r>
         <w:t xml:space="preserve"> </w:t>
       </w:r>
-      <w:hyperlink r:id="rId237">
+      <w:hyperlink r:id="rId238">
         <w:r>
           <w:rPr>
             <w:rStyle w:val="Hyperlink"/>
@@ -30587,7 +30627,7 @@
       <w:r>
         <w:t xml:space="preserve"> </w:t>
       </w:r>
-      <w:hyperlink r:id="rId238">
+      <w:hyperlink r:id="rId239">
         <w:r>
           <w:rPr>
             <w:rStyle w:val="Hyperlink"/>
@@ -30890,8 +30930,8 @@
         <w:t xml:space="preserve">: Specific scenarios where variant optimizations matter</w:t>
       </w:r>
     </w:p>
-    <w:bookmarkEnd w:id="239"/>
-    <w:bookmarkStart w:id="244" w:name="connecting-positron-assistant-to-openai"/>
+    <w:bookmarkEnd w:id="240"/>
+    <w:bookmarkStart w:id="245" w:name="connecting-positron-assistant-to-openai"/>
     <w:p>
       <w:pPr>
         <w:pStyle w:val="Heading4"/>
@@ -30936,7 +30976,7 @@
       <w:r>
         <w:t xml:space="preserve"> </w:t>
       </w:r>
-      <w:hyperlink r:id="rId240">
+      <w:hyperlink r:id="rId241">
         <w:r>
           <w:rPr>
             <w:rStyle w:val="Hyperlink"/>
@@ -31092,7 +31132,7 @@
       <w:r>
         <w:t xml:space="preserve"> </w:t>
       </w:r>
-      <w:hyperlink r:id="rId241">
+      <w:hyperlink r:id="rId242">
         <w:r>
           <w:rPr>
             <w:rStyle w:val="Hyperlink"/>
@@ -31144,7 +31184,7 @@
       <w:r>
         <w:t xml:space="preserve"> </w:t>
       </w:r>
-      <w:hyperlink r:id="rId241">
+      <w:hyperlink r:id="rId242">
         <w:r>
           <w:rPr>
             <w:rStyle w:val="Hyperlink"/>
@@ -31158,7 +31198,7 @@
       <w:r>
         <w:t xml:space="preserve"> </w:t>
       </w:r>
-      <w:hyperlink r:id="rId242">
+      <w:hyperlink r:id="rId243">
         <w:r>
           <w:rPr>
             <w:rStyle w:val="Hyperlink"/>
@@ -31172,7 +31212,7 @@
       <w:r>
         <w:t xml:space="preserve"> </w:t>
       </w:r>
-      <w:hyperlink r:id="rId243">
+      <w:hyperlink r:id="rId244">
         <w:r>
           <w:rPr>
             <w:rStyle w:val="Hyperlink"/>
@@ -31441,8 +31481,8 @@
         <w:t xml:space="preserve">enabled for quick inline completions.</w:t>
       </w:r>
     </w:p>
-    <w:bookmarkEnd w:id="244"/>
-    <w:bookmarkStart w:id="245" w:name="feature-settings"/>
+    <w:bookmarkEnd w:id="245"/>
+    <w:bookmarkStart w:id="246" w:name="feature-settings"/>
     <w:p>
       <w:pPr>
         <w:pStyle w:val="Heading4"/>
@@ -32196,8 +32236,8 @@
         <w:t xml:space="preserve">for access to current information</w:t>
       </w:r>
     </w:p>
-    <w:bookmarkEnd w:id="245"/>
-    <w:bookmarkStart w:id="246" w:name="advanced-settings"/>
+    <w:bookmarkEnd w:id="246"/>
+    <w:bookmarkStart w:id="247" w:name="advanced-settings"/>
     <w:p>
       <w:pPr>
         <w:pStyle w:val="Heading4"/>
@@ -33263,8 +33303,8 @@
         <w:t xml:space="preserve">for sharing capability</w:t>
       </w:r>
     </w:p>
-    <w:bookmarkEnd w:id="246"/>
-    <w:bookmarkStart w:id="247" w:name="summary-of-recommended-settings"/>
+    <w:bookmarkEnd w:id="247"/>
+    <w:bookmarkStart w:id="248" w:name="summary-of-recommended-settings"/>
     <w:p>
       <w:pPr>
         <w:pStyle w:val="Heading4"/>
@@ -33525,9 +33565,9 @@
         <w:t xml:space="preserve">).</w:t>
       </w:r>
     </w:p>
-    <w:bookmarkEnd w:id="247"/>
     <w:bookmarkEnd w:id="248"/>
-    <w:bookmarkStart w:id="263" w:name="sec-ai-byok-vscode"/>
+    <w:bookmarkEnd w:id="249"/>
+    <w:bookmarkStart w:id="264" w:name="sec-ai-byok-vscode"/>
     <w:p>
       <w:pPr>
         <w:pStyle w:val="Heading1"/>
@@ -33588,7 +33628,7 @@
       <w:r>
         <w:t xml:space="preserve"> </w:t>
       </w:r>
-      <w:hyperlink r:id="rId249">
+      <w:hyperlink r:id="rId250">
         <w:r>
           <w:rPr>
             <w:rStyle w:val="VerbatimChar"/>
@@ -33620,7 +33660,7 @@
         <w:t xml:space="preserve">and three more that do not.</w:t>
       </w:r>
     </w:p>
-    <w:bookmarkStart w:id="251" w:name="wiring-the-extension-to-databricks"/>
+    <w:bookmarkStart w:id="252" w:name="wiring-the-extension-to-databricks"/>
     <w:p>
       <w:pPr>
         <w:pStyle w:val="Heading4"/>
@@ -34933,7 +34973,7 @@
       <w:r>
         <w:t xml:space="preserve"> </w:t>
       </w:r>
-      <w:hyperlink r:id="rId250">
+      <w:hyperlink r:id="rId251">
         <w:r>
           <w:rPr>
             <w:rStyle w:val="Hyperlink"/>
@@ -35122,8 +35162,8 @@
         <w:t xml:space="preserve">header.</w:t>
       </w:r>
     </w:p>
-    <w:bookmarkEnd w:id="251"/>
-    <w:bookmarkStart w:id="254" w:name="sizing-context-and-output-limits"/>
+    <w:bookmarkEnd w:id="252"/>
+    <w:bookmarkStart w:id="255" w:name="sizing-context-and-output-limits"/>
     <w:p>
       <w:pPr>
         <w:pStyle w:val="Heading4"/>
@@ -35368,7 +35408,7 @@
       <w:r>
         <w:t xml:space="preserve"> </w:t>
       </w:r>
-      <w:hyperlink r:id="rId252">
+      <w:hyperlink r:id="rId253">
         <w:r>
           <w:rPr>
             <w:rStyle w:val="Hyperlink"/>
@@ -35469,7 +35509,7 @@
       <w:tr>
         <w:tc>
           <w:tcPr/>
-          <w:bookmarkStart w:id="253" w:name="tbl-databricks-oaicopilot-defaults"/>
+          <w:bookmarkStart w:id="254" w:name="tbl-databricks-oaicopilot-defaults"/>
           <w:p>
             <w:pPr>
               <w:jc w:val="center"/>
@@ -36095,7 +36135,7 @@
               </w:tc>
             </w:tr>
           </w:tbl>
-          <w:bookmarkEnd w:id="253"/>
+          <w:bookmarkEnd w:id="254"/>
           <w:p/>
         </w:tc>
       </w:tr>
@@ -36775,8 +36815,8 @@
         <w:t xml:space="preserve">Observed 2026-08-20.</w:t>
       </w:r>
     </w:p>
-    <w:bookmarkEnd w:id="254"/>
-    <w:bookmarkStart w:id="259" w:name="Xeefb66738a7cdd8d123f77fc3c435ee9098e612"/>
+    <w:bookmarkEnd w:id="255"/>
+    <w:bookmarkStart w:id="260" w:name="Xeefb66738a7cdd8d123f77fc3c435ee9098e612"/>
     <w:p>
       <w:pPr>
         <w:pStyle w:val="Heading4"/>
@@ -37705,18 +37745,18 @@
                 <wp:inline>
                   <wp:extent cx="152400" cy="152400"/>
                   <wp:effectExtent b="0" l="0" r="0" t="0"/>
-                  <wp:docPr descr="" title="" id="255" name="Picture"/>
+                  <wp:docPr descr="" title="" id="256" name="Picture"/>
                   <a:graphic>
                     <a:graphicData uri="http://schemas.openxmlformats.org/drawingml/2006/picture">
                       <pic:pic>
                         <pic:nvPicPr>
-                          <pic:cNvPr descr="/opt/quarto/share/formats/docx/tip.png" id="256" name="Picture"/>
+                          <pic:cNvPr descr="/opt/quarto/share/formats/docx/tip.png" id="257" name="Picture"/>
                           <pic:cNvPicPr>
                             <a:picLocks noChangeArrowheads="1" noChangeAspect="1"/>
                           </pic:cNvPicPr>
                         </pic:nvPicPr>
                         <pic:blipFill>
-                          <a:blip r:embed="rId130"/>
+                          <a:blip r:embed="rId131"/>
                           <a:stretch>
                             <a:fillRect/>
                           </a:stretch>
@@ -37847,18 +37887,18 @@
                 <wp:inline>
                   <wp:extent cx="152400" cy="152400"/>
                   <wp:effectExtent b="0" l="0" r="0" t="0"/>
-                  <wp:docPr descr="" title="" id="257" name="Picture"/>
+                  <wp:docPr descr="" title="" id="258" name="Picture"/>
                   <a:graphic>
                     <a:graphicData uri="http://schemas.openxmlformats.org/drawingml/2006/picture">
                       <pic:pic>
                         <pic:nvPicPr>
-                          <pic:cNvPr descr="/opt/quarto/share/formats/docx/important.png" id="258" name="Picture"/>
+                          <pic:cNvPr descr="/opt/quarto/share/formats/docx/important.png" id="259" name="Picture"/>
                           <pic:cNvPicPr>
                             <a:picLocks noChangeArrowheads="1" noChangeAspect="1"/>
                           </pic:cNvPicPr>
                         </pic:nvPicPr>
                         <pic:blipFill>
-                          <a:blip r:embed="rId155"/>
+                          <a:blip r:embed="rId156"/>
                           <a:stretch>
                             <a:fillRect/>
                           </a:stretch>
@@ -38117,8 +38157,8 @@
         </w:tc>
       </w:tr>
     </w:tbl>
-    <w:bookmarkEnd w:id="259"/>
-    <w:bookmarkStart w:id="262" w:name="X2af9a430a52e3ae5bb0cdcfef1e620fec8864fe"/>
+    <w:bookmarkEnd w:id="260"/>
+    <w:bookmarkStart w:id="263" w:name="X2af9a430a52e3ae5bb0cdcfef1e620fec8864fe"/>
     <w:p>
       <w:pPr>
         <w:pStyle w:val="Heading4"/>
@@ -38939,18 +38979,18 @@
                 <wp:inline>
                   <wp:extent cx="152400" cy="152400"/>
                   <wp:effectExtent b="0" l="0" r="0" t="0"/>
-                  <wp:docPr descr="" title="" id="260" name="Picture"/>
+                  <wp:docPr descr="" title="" id="261" name="Picture"/>
                   <a:graphic>
                     <a:graphicData uri="http://schemas.openxmlformats.org/drawingml/2006/picture">
                       <pic:pic>
                         <pic:nvPicPr>
-                          <pic:cNvPr descr="/opt/quarto/share/formats/docx/note.png" id="261" name="Picture"/>
+                          <pic:cNvPr descr="/opt/quarto/share/formats/docx/note.png" id="262" name="Picture"/>
                           <pic:cNvPicPr>
                             <a:picLocks noChangeArrowheads="1" noChangeAspect="1"/>
                           </pic:cNvPicPr>
                         </pic:nvPicPr>
                         <pic:blipFill>
-                          <a:blip r:embed="rId119"/>
+                          <a:blip r:embed="rId120"/>
                           <a:stretch>
                             <a:fillRect/>
                           </a:stretch>
@@ -39101,9 +39141,9 @@
         </w:tc>
       </w:tr>
     </w:tbl>
-    <w:bookmarkEnd w:id="262"/>
     <w:bookmarkEnd w:id="263"/>
-    <w:bookmarkStart w:id="277" w:name="configuring-the-agent-environment"/>
+    <w:bookmarkEnd w:id="264"/>
+    <w:bookmarkStart w:id="278" w:name="configuring-the-agent-environment"/>
     <w:p>
       <w:pPr>
         <w:pStyle w:val="Heading1"/>
@@ -39159,7 +39199,7 @@
         <w:t xml:space="preserve">so that Copilot can build, test, and lint your code more reliably.</w:t>
       </w:r>
     </w:p>
-    <w:bookmarkStart w:id="264" w:name="why-configure-the-environment"/>
+    <w:bookmarkStart w:id="265" w:name="why-configure-the-environment"/>
     <w:p>
       <w:pPr>
         <w:pStyle w:val="Heading4"/>
@@ -39242,8 +39282,8 @@
         <w:t xml:space="preserve">Consistent development environment across all agent sessions</w:t>
       </w:r>
     </w:p>
-    <w:bookmarkEnd w:id="264"/>
-    <w:bookmarkStart w:id="265" w:name="file-location-and-structure"/>
+    <w:bookmarkEnd w:id="265"/>
+    <w:bookmarkStart w:id="266" w:name="file-location-and-structure"/>
     <w:p>
       <w:pPr>
         <w:pStyle w:val="Heading4"/>
@@ -39312,8 +39352,8 @@
         <w:t xml:space="preserve">.</w:t>
       </w:r>
     </w:p>
-    <w:bookmarkEnd w:id="265"/>
-    <w:bookmarkStart w:id="267" w:name="basic-configuration-example"/>
+    <w:bookmarkEnd w:id="266"/>
+    <w:bookmarkStart w:id="268" w:name="basic-configuration-example"/>
     <w:p>
       <w:pPr>
         <w:pStyle w:val="Heading4"/>
@@ -39332,7 +39372,7 @@
       <w:r>
         <w:t xml:space="preserve"> </w:t>
       </w:r>
-      <w:hyperlink r:id="rId266">
+      <w:hyperlink r:id="rId267">
         <w:r>
           <w:rPr>
             <w:rStyle w:val="VerbatimChar"/>
@@ -39347,8 +39387,8 @@
         <w:t xml:space="preserve">for a configuration adapted for R and Quarto projects.</w:t>
       </w:r>
     </w:p>
-    <w:bookmarkEnd w:id="267"/>
-    <w:bookmarkStart w:id="270" w:name="using-actionscheckout"/>
+    <w:bookmarkEnd w:id="268"/>
+    <w:bookmarkStart w:id="271" w:name="using-actionscheckout"/>
     <w:p>
       <w:pPr>
         <w:pStyle w:val="Heading4"/>
@@ -39376,7 +39416,7 @@
       <w:r>
         <w:t xml:space="preserve"> </w:t>
       </w:r>
-      <w:hyperlink r:id="rId268">
+      <w:hyperlink r:id="rId269">
         <w:r>
           <w:rPr>
             <w:rStyle w:val="VerbatimChar"/>
@@ -39715,7 +39755,7 @@
       <w:r>
         <w:t xml:space="preserve"> </w:t>
       </w:r>
-      <w:hyperlink r:id="rId269">
+      <w:hyperlink r:id="rId270">
         <w:r>
           <w:rPr>
             <w:rStyle w:val="Hyperlink"/>
@@ -39783,8 +39823,8 @@
         <w:t xml:space="preserve">including comparing changes and understanding the context of your pull request.</w:t>
       </w:r>
     </w:p>
-    <w:bookmarkEnd w:id="270"/>
-    <w:bookmarkStart w:id="271" w:name="configurable-options"/>
+    <w:bookmarkEnd w:id="271"/>
+    <w:bookmarkStart w:id="272" w:name="configurable-options"/>
     <w:p>
       <w:pPr>
         <w:pStyle w:val="Heading4"/>
@@ -39950,8 +39990,8 @@
         <w:t xml:space="preserve">All other workflow settings are ignored by Copilot.</w:t>
       </w:r>
     </w:p>
-    <w:bookmarkEnd w:id="271"/>
-    <w:bookmarkStart w:id="272" w:name="common-setup-tasks"/>
+    <w:bookmarkEnd w:id="272"/>
+    <w:bookmarkStart w:id="273" w:name="common-setup-tasks"/>
     <w:p>
       <w:pPr>
         <w:pStyle w:val="Heading4"/>
@@ -40566,8 +40606,8 @@
         <w:t xml:space="preserve"> r-lib/actions/setup-renv@v2</w:t>
       </w:r>
     </w:p>
-    <w:bookmarkEnd w:id="272"/>
-    <w:bookmarkStart w:id="273" w:name="environment-variables-and-secrets"/>
+    <w:bookmarkEnd w:id="273"/>
+    <w:bookmarkStart w:id="274" w:name="environment-variables-and-secrets"/>
     <w:p>
       <w:pPr>
         <w:pStyle w:val="Heading4"/>
@@ -40675,8 +40715,8 @@
         <w:t xml:space="preserve">Use secrets for sensitive values like API keys or passwords.</w:t>
       </w:r>
     </w:p>
-    <w:bookmarkEnd w:id="273"/>
-    <w:bookmarkStart w:id="274" w:name="testing-your-configuration"/>
+    <w:bookmarkEnd w:id="274"/>
+    <w:bookmarkStart w:id="275" w:name="testing-your-configuration"/>
     <w:p>
       <w:pPr>
         <w:pStyle w:val="Heading4"/>
@@ -40771,8 +40811,8 @@
         <w:t xml:space="preserve">and begin working with the current environment state.</w:t>
       </w:r>
     </w:p>
-    <w:bookmarkEnd w:id="274"/>
-    <w:bookmarkStart w:id="275" w:name="advanced-configuration"/>
+    <w:bookmarkEnd w:id="275"/>
+    <w:bookmarkStart w:id="276" w:name="advanced-configuration"/>
     <w:p>
       <w:pPr>
         <w:pStyle w:val="Heading4"/>
@@ -41092,8 +41132,8 @@
         <w:t xml:space="preserve">true</w:t>
       </w:r>
     </w:p>
-    <w:bookmarkEnd w:id="275"/>
-    <w:bookmarkStart w:id="276" w:name="further-reading-1"/>
+    <w:bookmarkEnd w:id="276"/>
+    <w:bookmarkStart w:id="277" w:name="further-reading-1"/>
     <w:p>
       <w:pPr>
         <w:pStyle w:val="Heading4"/>
@@ -41118,7 +41158,7 @@
       <w:r>
         <w:t xml:space="preserve"> </w:t>
       </w:r>
-      <w:hyperlink r:id="rId269">
+      <w:hyperlink r:id="rId270">
         <w:r>
           <w:rPr>
             <w:rStyle w:val="Hyperlink"/>
@@ -41130,9 +41170,9 @@
         <w:t xml:space="preserve">.</w:t>
       </w:r>
     </w:p>
-    <w:bookmarkEnd w:id="276"/>
     <w:bookmarkEnd w:id="277"/>
-    <w:bookmarkStart w:id="285" w:name="sec-ai-agent-skills"/>
+    <w:bookmarkEnd w:id="278"/>
+    <w:bookmarkStart w:id="286" w:name="sec-ai-agent-skills"/>
     <w:p>
       <w:pPr>
         <w:pStyle w:val="Heading1"/>
@@ -41145,7 +41185,7 @@
       <w:pPr>
         <w:pStyle w:val="FirstParagraph"/>
       </w:pPr>
-      <w:hyperlink r:id="rId278">
+      <w:hyperlink r:id="rId279">
         <w:r>
           <w:rPr>
             <w:rStyle w:val="Hyperlink"/>
@@ -41180,7 +41220,7 @@
       <w:r>
         <w:t xml:space="preserve"> </w:t>
       </w:r>
-      <w:hyperlink r:id="rId279">
+      <w:hyperlink r:id="rId280">
         <w:r>
           <w:rPr>
             <w:rStyle w:val="Hyperlink"/>
@@ -41201,7 +41241,7 @@
         <w:t xml:space="preserve">tool-agnostic format that any compatible agent can load.</w:t>
       </w:r>
     </w:p>
-    <w:bookmarkStart w:id="280" w:name="what-is-a-skill"/>
+    <w:bookmarkStart w:id="281" w:name="what-is-a-skill"/>
     <w:p>
       <w:pPr>
         <w:pStyle w:val="Heading4"/>
@@ -41271,7 +41311,7 @@
       <w:r>
         <w:t xml:space="preserve"> </w:t>
       </w:r>
-      <w:hyperlink r:id="rId279">
+      <w:hyperlink r:id="rId280">
         <w:r>
           <w:rPr>
             <w:rStyle w:val="Hyperlink"/>
@@ -41378,8 +41418,8 @@
         <w:t xml:space="preserve">└── assets/           # Optional: templates, resources</w:t>
       </w:r>
     </w:p>
-    <w:bookmarkEnd w:id="280"/>
-    <w:bookmarkStart w:id="281" w:name="how-agents-load-skills"/>
+    <w:bookmarkEnd w:id="281"/>
+    <w:bookmarkStart w:id="282" w:name="how-agents-load-skills"/>
     <w:p>
       <w:pPr>
         <w:pStyle w:val="Heading4"/>
@@ -41522,8 +41562,8 @@
         <w:t xml:space="preserve">so agents can maintain many skills with a small context footprint.</w:t>
       </w:r>
     </w:p>
-    <w:bookmarkEnd w:id="281"/>
-    <w:bookmarkStart w:id="282" w:name="why-use-skills"/>
+    <w:bookmarkEnd w:id="282"/>
+    <w:bookmarkStart w:id="283" w:name="why-use-skills"/>
     <w:p>
       <w:pPr>
         <w:pStyle w:val="Heading4"/>
@@ -41609,8 +41649,8 @@
         <w:t xml:space="preserve">: Build a skill once and use it across any skills-compatible agent</w:t>
       </w:r>
     </w:p>
-    <w:bookmarkEnd w:id="282"/>
-    <w:bookmarkStart w:id="284" w:name="further-reading-2"/>
+    <w:bookmarkEnd w:id="283"/>
+    <w:bookmarkStart w:id="285" w:name="further-reading-2"/>
     <w:p>
       <w:pPr>
         <w:pStyle w:val="Heading4"/>
@@ -41635,7 +41675,7 @@
       <w:r>
         <w:t xml:space="preserve"> </w:t>
       </w:r>
-      <w:hyperlink r:id="rId278">
+      <w:hyperlink r:id="rId279">
         <w:r>
           <w:rPr>
             <w:rStyle w:val="Hyperlink"/>
@@ -41750,7 +41790,7 @@
       <w:r>
         <w:t xml:space="preserve"> </w:t>
       </w:r>
-      <w:hyperlink r:id="rId283">
+      <w:hyperlink r:id="rId284">
         <w:r>
           <w:rPr>
             <w:rStyle w:val="Hyperlink"/>
@@ -41777,9 +41817,9 @@
         <w:t xml:space="preserve">including user-level skills, hooks, and subagents, synced across machines via Git.</w:t>
       </w:r>
     </w:p>
-    <w:bookmarkEnd w:id="284"/>
     <w:bookmarkEnd w:id="285"/>
-    <w:bookmarkStart w:id="291" w:name="sec-ai-useful-plugins"/>
+    <w:bookmarkEnd w:id="286"/>
+    <w:bookmarkStart w:id="292" w:name="sec-ai-useful-plugins"/>
     <w:p>
       <w:pPr>
         <w:pStyle w:val="Heading1"/>
@@ -41798,7 +41838,7 @@
       <w:r>
         <w:t xml:space="preserve"> </w:t>
       </w:r>
-      <w:hyperlink r:id="rId286">
+      <w:hyperlink r:id="rId287">
         <w:r>
           <w:rPr>
             <w:rStyle w:val="Hyperlink"/>
@@ -41835,7 +41875,7 @@
       <w:pPr>
         <w:pStyle w:val="BodyText"/>
       </w:pPr>
-      <w:hyperlink r:id="rId287">
+      <w:hyperlink r:id="rId288">
         <w:r>
           <w:rPr>
             <w:rStyle w:val="Hyperlink"/>
@@ -41897,7 +41937,7 @@
       <w:r>
         <w:t xml:space="preserve"> </w:t>
       </w:r>
-      <w:hyperlink r:id="rId288">
+      <w:hyperlink r:id="rId289">
         <w:r>
           <w:rPr>
             <w:rStyle w:val="Hyperlink"/>
@@ -41969,7 +42009,7 @@
           <w:numId w:val="1121"/>
         </w:numPr>
       </w:pPr>
-      <w:hyperlink r:id="rId289">
+      <w:hyperlink r:id="rId290">
         <w:r>
           <w:rPr>
             <w:rStyle w:val="Hyperlink"/>
@@ -42035,7 +42075,7 @@
       <w:r>
         <w:t xml:space="preserve"> </w:t>
       </w:r>
-      <w:hyperlink r:id="rId283">
+      <w:hyperlink r:id="rId284">
         <w:r>
           <w:rPr>
             <w:rStyle w:val="VerbatimChar"/>
@@ -42052,7 +42092,7 @@
       <w:r>
         <w:t xml:space="preserve"> </w:t>
       </w:r>
-      <w:hyperlink r:id="rId290">
+      <w:hyperlink r:id="rId291">
         <w:r>
           <w:rPr>
             <w:rStyle w:val="VerbatimChar"/>
@@ -42125,8 +42165,8 @@
         <w:t xml:space="preserve">is the worked example of what the corpus contains.</w:t>
       </w:r>
     </w:p>
-    <w:bookmarkEnd w:id="291"/>
-    <w:bookmarkStart w:id="311" w:name="sec-ai-customization"/>
+    <w:bookmarkEnd w:id="292"/>
+    <w:bookmarkStart w:id="312" w:name="sec-ai-customization"/>
     <w:p>
       <w:pPr>
         <w:pStyle w:val="Heading1"/>
@@ -42194,7 +42234,7 @@
       <w:r>
         <w:t xml:space="preserve"> </w:t>
       </w:r>
-      <w:hyperlink r:id="rId40">
+      <w:hyperlink r:id="rId41">
         <w:r>
           <w:rPr>
             <w:rStyle w:val="Hyperlink"/>
@@ -42251,7 +42291,7 @@
         <w:t xml:space="preserve">.</w:t>
       </w:r>
     </w:p>
-    <w:bookmarkStart w:id="293" w:name="the-question-that-picks-the-mechanism"/>
+    <w:bookmarkStart w:id="294" w:name="the-question-that-picks-the-mechanism"/>
     <w:p>
       <w:pPr>
         <w:pStyle w:val="Heading4"/>
@@ -42352,7 +42392,7 @@
       <w:r>
         <w:t xml:space="preserve"> </w:t>
       </w:r>
-      <w:hyperlink r:id="rId292">
+      <w:hyperlink r:id="rId293">
         <w:r>
           <w:rPr>
             <w:rStyle w:val="Hyperlink"/>
@@ -42437,8 +42477,8 @@
         <w:t xml:space="preserve">.</w:t>
       </w:r>
     </w:p>
-    <w:bookmarkEnd w:id="293"/>
-    <w:bookmarkStart w:id="295" w:name="instruction-files-always-on-context"/>
+    <w:bookmarkEnd w:id="294"/>
+    <w:bookmarkStart w:id="296" w:name="instruction-files-always-on-context"/>
     <w:p>
       <w:pPr>
         <w:pStyle w:val="Heading4"/>
@@ -42466,7 +42506,7 @@
       <w:r>
         <w:t xml:space="preserve"> </w:t>
       </w:r>
-      <w:hyperlink r:id="rId29">
+      <w:hyperlink r:id="rId30">
         <w:r>
           <w:rPr>
             <w:rStyle w:val="VerbatimChar"/>
@@ -42542,7 +42582,7 @@
       <w:r>
         <w:t xml:space="preserve"> </w:t>
       </w:r>
-      <w:hyperlink r:id="rId292">
+      <w:hyperlink r:id="rId293">
         <w:r>
           <w:rPr>
             <w:rStyle w:val="Hyperlink"/>
@@ -42685,7 +42725,7 @@
       <w:r>
         <w:t xml:space="preserve"> </w:t>
       </w:r>
-      <w:hyperlink r:id="rId292">
+      <w:hyperlink r:id="rId293">
         <w:r>
           <w:rPr>
             <w:rStyle w:val="Hyperlink"/>
@@ -42789,7 +42829,7 @@
       <w:r>
         <w:t xml:space="preserve"> </w:t>
       </w:r>
-      <w:hyperlink r:id="rId294">
+      <w:hyperlink r:id="rId295">
         <w:r>
           <w:rPr>
             <w:rStyle w:val="Hyperlink"/>
@@ -42909,8 +42949,8 @@
         <w:t xml:space="preserve">and guaranteed nothing about acting on it alike.</w:t>
       </w:r>
     </w:p>
-    <w:bookmarkEnd w:id="295"/>
-    <w:bookmarkStart w:id="296" w:name="workspace-rules-and-activation-modes"/>
+    <w:bookmarkEnd w:id="296"/>
+    <w:bookmarkStart w:id="297" w:name="workspace-rules-and-activation-modes"/>
     <w:p>
       <w:pPr>
         <w:pStyle w:val="Heading4"/>
@@ -43179,8 +43219,8 @@
         <w:t xml:space="preserve">).</w:t>
       </w:r>
     </w:p>
-    <w:bookmarkEnd w:id="296"/>
-    <w:bookmarkStart w:id="299" w:name="skills-and-the-commands-that-became-them"/>
+    <w:bookmarkEnd w:id="297"/>
+    <w:bookmarkStart w:id="300" w:name="skills-and-the-commands-that-became-them"/>
     <w:p>
       <w:pPr>
         <w:pStyle w:val="Heading4"/>
@@ -43205,7 +43245,7 @@
       <w:r>
         <w:t xml:space="preserve"> </w:t>
       </w:r>
-      <w:hyperlink r:id="rId297">
+      <w:hyperlink r:id="rId298">
         <w:r>
           <w:rPr>
             <w:rStyle w:val="Hyperlink"/>
@@ -43644,7 +43684,7 @@
       <w:r>
         <w:t xml:space="preserve"> </w:t>
       </w:r>
-      <w:hyperlink r:id="rId279">
+      <w:hyperlink r:id="rId280">
         <w:r>
           <w:rPr>
             <w:rStyle w:val="Hyperlink"/>
@@ -43763,7 +43803,7 @@
       <w:r>
         <w:t xml:space="preserve"> </w:t>
       </w:r>
-      <w:hyperlink r:id="rId298">
+      <w:hyperlink r:id="rId299">
         <w:r>
           <w:rPr>
             <w:rStyle w:val="Hyperlink"/>
@@ -43829,8 +43869,8 @@
         <w:t xml:space="preserve">a competitor’s directory name.</w:t>
       </w:r>
     </w:p>
-    <w:bookmarkEnd w:id="299"/>
-    <w:bookmarkStart w:id="301" w:name="subagents-delegating-to-a-fresh-context"/>
+    <w:bookmarkEnd w:id="300"/>
+    <w:bookmarkStart w:id="302" w:name="subagents-delegating-to-a-fresh-context"/>
     <w:p>
       <w:pPr>
         <w:pStyle w:val="Heading4"/>
@@ -43979,7 +44019,7 @@
       <w:r>
         <w:t xml:space="preserve"> </w:t>
       </w:r>
-      <w:hyperlink r:id="rId300">
+      <w:hyperlink r:id="rId301">
         <w:r>
           <w:rPr>
             <w:rStyle w:val="Hyperlink"/>
@@ -44002,7 +44042,7 @@
       <w:r>
         <w:t xml:space="preserve"> </w:t>
       </w:r>
-      <w:hyperlink r:id="rId297">
+      <w:hyperlink r:id="rId298">
         <w:r>
           <w:rPr>
             <w:rStyle w:val="Hyperlink"/>
@@ -44067,8 +44107,8 @@
         <w:t xml:space="preserve">The @-mention controls which subagent Claude invokes, not what prompt it receives.</w:t>
       </w:r>
     </w:p>
-    <w:bookmarkEnd w:id="301"/>
-    <w:bookmarkStart w:id="303" w:name="Xf185306762ce2c53b5a7ee53d7e6e74f0af7607"/>
+    <w:bookmarkEnd w:id="302"/>
+    <w:bookmarkStart w:id="304" w:name="Xf185306762ce2c53b5a7ee53d7e6e74f0af7607"/>
     <w:p>
       <w:pPr>
         <w:pStyle w:val="Heading4"/>
@@ -44112,7 +44152,7 @@
       <w:r>
         <w:t xml:space="preserve"> </w:t>
       </w:r>
-      <w:hyperlink r:id="rId302">
+      <w:hyperlink r:id="rId303">
         <w:r>
           <w:rPr>
             <w:rStyle w:val="Hyperlink"/>
@@ -44147,7 +44187,7 @@
       <w:r>
         <w:t xml:space="preserve"> </w:t>
       </w:r>
-      <w:hyperlink r:id="rId292">
+      <w:hyperlink r:id="rId293">
         <w:r>
           <w:rPr>
             <w:rStyle w:val="Hyperlink"/>
@@ -44366,8 +44406,8 @@
         <w:t xml:space="preserve">hook decides.</w:t>
       </w:r>
     </w:p>
-    <w:bookmarkEnd w:id="303"/>
-    <w:bookmarkStart w:id="305" w:name="X661523c6623257371ddb85eca0962e6d24391f6"/>
+    <w:bookmarkEnd w:id="304"/>
+    <w:bookmarkStart w:id="306" w:name="X661523c6623257371ddb85eca0962e6d24391f6"/>
     <w:p>
       <w:pPr>
         <w:pStyle w:val="Heading4"/>
@@ -44449,7 +44489,7 @@
       <w:r>
         <w:t xml:space="preserve"> </w:t>
       </w:r>
-      <w:hyperlink r:id="rId304">
+      <w:hyperlink r:id="rId305">
         <w:r>
           <w:rPr>
             <w:rStyle w:val="Hyperlink"/>
@@ -44608,8 +44648,8 @@
         <w:t xml:space="preserve">a repository can tighten what you allow, and cannot quietly loosen it.</w:t>
       </w:r>
     </w:p>
-    <w:bookmarkEnd w:id="305"/>
-    <w:bookmarkStart w:id="306" w:name="Xb9141ee8bf4b59ff8b077a4423dd913151d282a"/>
+    <w:bookmarkEnd w:id="306"/>
+    <w:bookmarkStart w:id="307" w:name="Xb9141ee8bf4b59ff8b077a4423dd913151d282a"/>
     <w:p>
       <w:pPr>
         <w:pStyle w:val="Heading4"/>
@@ -44647,7 +44687,7 @@
       <w:r>
         <w:t xml:space="preserve"> </w:t>
       </w:r>
-      <w:hyperlink r:id="rId28">
+      <w:hyperlink r:id="rId29">
         <w:r>
           <w:rPr>
             <w:rStyle w:val="Hyperlink"/>
@@ -44742,8 +44782,8 @@
         <w:t xml:space="preserve">covers configuration and its failure modes.</w:t>
       </w:r>
     </w:p>
-    <w:bookmarkEnd w:id="306"/>
-    <w:bookmarkStart w:id="307" w:name="choosing"/>
+    <w:bookmarkEnd w:id="307"/>
+    <w:bookmarkStart w:id="308" w:name="choosing"/>
     <w:p>
       <w:pPr>
         <w:pStyle w:val="Heading4"/>
@@ -45100,8 +45140,8 @@
         </w:tc>
       </w:tr>
     </w:tbl>
-    <w:bookmarkEnd w:id="307"/>
-    <w:bookmarkStart w:id="309" w:name="what-travels-between-tools"/>
+    <w:bookmarkEnd w:id="308"/>
+    <w:bookmarkStart w:id="310" w:name="what-travels-between-tools"/>
     <w:p>
       <w:pPr>
         <w:pStyle w:val="Heading4"/>
@@ -45554,7 +45594,7 @@
             <w:pPr>
               <w:pStyle w:val="Compact"/>
             </w:pPr>
-            <w:hyperlink r:id="rId308">
+            <w:hyperlink r:id="rId309">
               <w:r>
                 <w:rPr>
                   <w:rStyle w:val="Hyperlink"/>
@@ -45651,8 +45691,8 @@
         <w:t xml:space="preserve">and are worth writing as enforcement of rules that are also stated somewhere portable.</w:t>
       </w:r>
     </w:p>
-    <w:bookmarkEnd w:id="309"/>
-    <w:bookmarkStart w:id="310" w:name="a-worked-example"/>
+    <w:bookmarkEnd w:id="310"/>
+    <w:bookmarkStart w:id="311" w:name="a-worked-example"/>
     <w:p>
       <w:pPr>
         <w:pStyle w:val="Heading4"/>
@@ -45671,7 +45711,7 @@
       <w:r>
         <w:t xml:space="preserve"> </w:t>
       </w:r>
-      <w:hyperlink r:id="rId283">
+      <w:hyperlink r:id="rId284">
         <w:r>
           <w:rPr>
             <w:rStyle w:val="VerbatimChar"/>
@@ -45927,9 +45967,9 @@
         <w:t xml:space="preserve">globs attach them only when you edit a matching file.</w:t>
       </w:r>
     </w:p>
-    <w:bookmarkEnd w:id="310"/>
     <w:bookmarkEnd w:id="311"/>
-    <w:bookmarkStart w:id="316" w:name="sec-ai-config-install"/>
+    <w:bookmarkEnd w:id="312"/>
+    <w:bookmarkStart w:id="317" w:name="sec-ai-config-install"/>
     <w:p>
       <w:pPr>
         <w:pStyle w:val="Heading1"/>
@@ -46035,7 +46075,7 @@
         <w:t xml:space="preserve">and a capability simply goes missing with no message that it existed.</w:t>
       </w:r>
     </w:p>
-    <w:bookmarkStart w:id="312" w:name="X09c076bdbd05e35ade785c409b9eb4387af137d"/>
+    <w:bookmarkStart w:id="313" w:name="X09c076bdbd05e35ade785c409b9eb4387af137d"/>
     <w:p>
       <w:pPr>
         <w:pStyle w:val="Heading4"/>
@@ -46269,8 +46309,8 @@
         <w:t xml:space="preserve">Pick one path.</w:t>
       </w:r>
     </w:p>
-    <w:bookmarkEnd w:id="312"/>
-    <w:bookmarkStart w:id="313" w:name="the-.claude-layout"/>
+    <w:bookmarkEnd w:id="313"/>
+    <w:bookmarkStart w:id="314" w:name="the-.claude-layout"/>
     <w:p>
       <w:pPr>
         <w:pStyle w:val="Heading4"/>
@@ -46515,8 +46555,8 @@
         <w:t xml:space="preserve">So verify both, and read the two results separately.</w:t>
       </w:r>
     </w:p>
-    <w:bookmarkEnd w:id="313"/>
-    <w:bookmarkStart w:id="314" w:name="one-plugin-per-capability"/>
+    <w:bookmarkEnd w:id="314"/>
+    <w:bookmarkStart w:id="315" w:name="one-plugin-per-capability"/>
     <w:p>
       <w:pPr>
         <w:pStyle w:val="Heading4"/>
@@ -46609,8 +46649,8 @@
         <w:t xml:space="preserve">Keep one copy enabled.</w:t>
       </w:r>
     </w:p>
-    <w:bookmarkEnd w:id="314"/>
-    <w:bookmarkStart w:id="315" w:name="failure-modes-and-their-symptoms"/>
+    <w:bookmarkEnd w:id="315"/>
+    <w:bookmarkStart w:id="316" w:name="failure-modes-and-their-symptoms"/>
     <w:p>
       <w:pPr>
         <w:pStyle w:val="Heading4"/>
@@ -46855,9 +46895,9 @@
         <w:t xml:space="preserve">suspect the install before you suspect the rule.</w:t>
       </w:r>
     </w:p>
-    <w:bookmarkEnd w:id="315"/>
     <w:bookmarkEnd w:id="316"/>
-    <w:bookmarkStart w:id="323" w:name="sec-ai-claude-cloud-env"/>
+    <w:bookmarkEnd w:id="317"/>
+    <w:bookmarkStart w:id="324" w:name="sec-ai-claude-cloud-env"/>
     <w:p>
       <w:pPr>
         <w:pStyle w:val="Heading1"/>
@@ -46899,7 +46939,7 @@
       <w:r>
         <w:t xml:space="preserve"> </w:t>
       </w:r>
-      <w:hyperlink r:id="rId317">
+      <w:hyperlink r:id="rId318">
         <w:r>
           <w:rPr>
             <w:rStyle w:val="Hyperlink"/>
@@ -47097,7 +47137,7 @@
         <w:t xml:space="preserve">for example to install dependencies.</w:t>
       </w:r>
     </w:p>
-    <w:bookmarkStart w:id="322" w:name="X99b85cd9c84d17a9c31061ff898ea0b26b46932"/>
+    <w:bookmarkStart w:id="323" w:name="X99b85cd9c84d17a9c31061ff898ea0b26b46932"/>
     <w:p>
       <w:pPr>
         <w:pStyle w:val="Heading4"/>
@@ -47258,7 +47298,7 @@
       <w:r>
         <w:t xml:space="preserve"> </w:t>
       </w:r>
-      <w:hyperlink r:id="rId317">
+      <w:hyperlink r:id="rId318">
         <w:r>
           <w:rPr>
             <w:rStyle w:val="Hyperlink"/>
@@ -47353,18 +47393,18 @@
                 <wp:inline>
                   <wp:extent cx="152400" cy="152400"/>
                   <wp:effectExtent b="0" l="0" r="0" t="0"/>
-                  <wp:docPr descr="" title="" id="318" name="Picture"/>
+                  <wp:docPr descr="" title="" id="319" name="Picture"/>
                   <a:graphic>
                     <a:graphicData uri="http://schemas.openxmlformats.org/drawingml/2006/picture">
                       <pic:pic>
                         <pic:nvPicPr>
-                          <pic:cNvPr descr="/opt/quarto/share/formats/docx/note.png" id="319" name="Picture"/>
+                          <pic:cNvPr descr="/opt/quarto/share/formats/docx/note.png" id="320" name="Picture"/>
                           <pic:cNvPicPr>
                             <a:picLocks noChangeArrowheads="1" noChangeAspect="1"/>
                           </pic:cNvPicPr>
                         </pic:nvPicPr>
                         <pic:blipFill>
-                          <a:blip r:embed="rId119"/>
+                          <a:blip r:embed="rId120"/>
                           <a:stretch>
                             <a:fillRect/>
                           </a:stretch>
@@ -47474,7 +47514,7 @@
       <w:r>
         <w:t xml:space="preserve"> </w:t>
       </w:r>
-      <w:hyperlink r:id="rId320">
+      <w:hyperlink r:id="rId321">
         <w:r>
           <w:rPr>
             <w:rStyle w:val="Hyperlink"/>
@@ -47491,7 +47531,7 @@
       <w:r>
         <w:t xml:space="preserve"> </w:t>
       </w:r>
-      <w:hyperlink r:id="rId321">
+      <w:hyperlink r:id="rId322">
         <w:r>
           <w:rPr>
             <w:rStyle w:val="Hyperlink"/>
@@ -47503,9 +47543,9 @@
         <w:t xml:space="preserve">.</w:t>
       </w:r>
     </w:p>
-    <w:bookmarkEnd w:id="322"/>
     <w:bookmarkEnd w:id="323"/>
-    <w:bookmarkStart w:id="330" w:name="sec-ai-codex-github-review"/>
+    <w:bookmarkEnd w:id="324"/>
+    <w:bookmarkStart w:id="331" w:name="sec-ai-codex-github-review"/>
     <w:p>
       <w:pPr>
         <w:pStyle w:val="Heading1"/>
@@ -47540,7 +47580,7 @@
         <w:t xml:space="preserve">It does not require you to build a separate GitHub Action.</w:t>
       </w:r>
     </w:p>
-    <w:bookmarkStart w:id="324" w:name="prerequisites"/>
+    <w:bookmarkStart w:id="325" w:name="prerequisites"/>
     <w:p>
       <w:pPr>
         <w:pStyle w:val="Heading4"/>
@@ -47665,8 +47705,8 @@
         <w:t xml:space="preserve">but it lets the reviewer follow repository-specific guidance.</w:t>
       </w:r>
     </w:p>
-    <w:bookmarkEnd w:id="324"/>
-    <w:bookmarkStart w:id="325" w:name="requesting-and-automating-reviews"/>
+    <w:bookmarkEnd w:id="325"/>
+    <w:bookmarkStart w:id="326" w:name="requesting-and-automating-reviews"/>
     <w:p>
       <w:pPr>
         <w:pStyle w:val="Heading4"/>
@@ -47817,8 +47857,8 @@
         <w:t xml:space="preserve">It can overlap with the general review’s security findings.</w:t>
       </w:r>
     </w:p>
-    <w:bookmarkEnd w:id="325"/>
-    <w:bookmarkStart w:id="326" w:name="Xcb3957535c68d0d36c3ddb2e418364eec25d64f"/>
+    <w:bookmarkEnd w:id="326"/>
+    <w:bookmarkStart w:id="327" w:name="Xcb3957535c68d0d36c3ddb2e418364eec25d64f"/>
     <w:p>
       <w:pPr>
         <w:pStyle w:val="Heading4"/>
@@ -48104,8 +48144,8 @@
         <w:t xml:space="preserve">both sides must permit the integration.</w:t>
       </w:r>
     </w:p>
-    <w:bookmarkEnd w:id="326"/>
-    <w:bookmarkStart w:id="327" w:name="X5db1f82696679006fc24d2d9f8d9499d172a6a5"/>
+    <w:bookmarkEnd w:id="327"/>
+    <w:bookmarkStart w:id="328" w:name="X5db1f82696679006fc24d2d9f8d9499d172a6a5"/>
     <w:p>
       <w:pPr>
         <w:pStyle w:val="Heading4"/>
@@ -48202,8 +48242,8 @@
         <w:t xml:space="preserve">Do not copy personal ChatGPT or Codex login credentials into CI secrets.</w:t>
       </w:r>
     </w:p>
-    <w:bookmarkEnd w:id="327"/>
-    <w:bookmarkStart w:id="329" w:name="adding-repository-specific-review-rules"/>
+    <w:bookmarkEnd w:id="328"/>
+    <w:bookmarkStart w:id="330" w:name="adding-repository-specific-review-rules"/>
     <w:p>
       <w:pPr>
         <w:pStyle w:val="Heading4"/>
@@ -48437,7 +48477,7 @@
       <w:r>
         <w:t xml:space="preserve"> </w:t>
       </w:r>
-      <w:hyperlink r:id="rId328">
+      <w:hyperlink r:id="rId329">
         <w:r>
           <w:rPr>
             <w:rStyle w:val="Hyperlink"/>
@@ -48449,9 +48489,9 @@
         <w:t xml:space="preserve">.</w:t>
       </w:r>
     </w:p>
-    <w:bookmarkEnd w:id="329"/>
     <w:bookmarkEnd w:id="330"/>
-    <w:bookmarkStart w:id="345" w:name="sec-ai-claude-code-action-review"/>
+    <w:bookmarkEnd w:id="331"/>
+    <w:bookmarkStart w:id="346" w:name="sec-ai-claude-code-action-review"/>
     <w:p>
       <w:pPr>
         <w:pStyle w:val="Heading1"/>
@@ -48470,7 +48510,7 @@
       <w:r>
         <w:t xml:space="preserve"> </w:t>
       </w:r>
-      <w:hyperlink r:id="rId331">
+      <w:hyperlink r:id="rId332">
         <w:r>
           <w:rPr>
             <w:rStyle w:val="Hyperlink"/>
@@ -48576,7 +48616,7 @@
         <w:t xml:space="preserve">paths can move).</w:t>
       </w:r>
     </w:p>
-    <w:bookmarkStart w:id="335" w:name="one-action-many-behaviors"/>
+    <w:bookmarkStart w:id="336" w:name="one-action-many-behaviors"/>
     <w:p>
       <w:pPr>
         <w:pStyle w:val="Heading4"/>
@@ -48595,7 +48635,7 @@
       <w:r>
         <w:t xml:space="preserve"> </w:t>
       </w:r>
-      <w:hyperlink r:id="rId332">
+      <w:hyperlink r:id="rId333">
         <w:r>
           <w:rPr>
             <w:rStyle w:val="VerbatimChar"/>
@@ -48754,7 +48794,7 @@
       <w:r>
         <w:t xml:space="preserve"> </w:t>
       </w:r>
-      <w:hyperlink r:id="rId333">
+      <w:hyperlink r:id="rId334">
         <w:r>
           <w:rPr>
             <w:rStyle w:val="VerbatimChar"/>
@@ -48792,7 +48832,7 @@
       <w:r>
         <w:t xml:space="preserve"> </w:t>
       </w:r>
-      <w:hyperlink r:id="rId334">
+      <w:hyperlink r:id="rId335">
         <w:r>
           <w:rPr>
             <w:rStyle w:val="VerbatimChar"/>
@@ -48816,8 +48856,8 @@
         <w:t xml:space="preserve">not the in-repo path.</w:t>
       </w:r>
     </w:p>
-    <w:bookmarkEnd w:id="335"/>
-    <w:bookmarkStart w:id="340" w:name="where-the-repository-reviews-its-own-prs"/>
+    <w:bookmarkEnd w:id="336"/>
+    <w:bookmarkStart w:id="341" w:name="where-the-repository-reviews-its-own-prs"/>
     <w:p>
       <w:pPr>
         <w:pStyle w:val="Heading4"/>
@@ -48833,7 +48873,7 @@
           <w:numId w:val="1138"/>
         </w:numPr>
       </w:pPr>
-      <w:hyperlink r:id="rId336">
+      <w:hyperlink r:id="rId337">
         <w:r>
           <w:rPr>
             <w:rStyle w:val="VerbatimChar"/>
@@ -48918,7 +48958,7 @@
           <w:numId w:val="1138"/>
         </w:numPr>
       </w:pPr>
-      <w:hyperlink r:id="rId337">
+      <w:hyperlink r:id="rId338">
         <w:r>
           <w:rPr>
             <w:rStyle w:val="VerbatimChar"/>
@@ -48962,7 +49002,7 @@
       <w:r>
         <w:t xml:space="preserve"> </w:t>
       </w:r>
-      <w:hyperlink r:id="rId338">
+      <w:hyperlink r:id="rId339">
         <w:r>
           <w:rPr>
             <w:rStyle w:val="VerbatimChar"/>
@@ -49076,7 +49116,7 @@
           <w:numId w:val="1138"/>
         </w:numPr>
       </w:pPr>
-      <w:hyperlink r:id="rId339">
+      <w:hyperlink r:id="rId340">
         <w:r>
           <w:rPr>
             <w:rStyle w:val="VerbatimChar"/>
@@ -49103,8 +49143,8 @@
         <w:t xml:space="preserve">are copy-paste templates for adding review to another repository.</w:t>
       </w:r>
     </w:p>
-    <w:bookmarkEnd w:id="340"/>
-    <w:bookmarkStart w:id="341" w:name="adding-review-to-your-own-repository"/>
+    <w:bookmarkEnd w:id="341"/>
+    <w:bookmarkStart w:id="342" w:name="adding-review-to-your-own-repository"/>
     <w:p>
       <w:pPr>
         <w:pStyle w:val="Heading4"/>
@@ -49270,8 +49310,8 @@
         <w:t xml:space="preserve">so you edit it the way you would edit any review checklist.</w:t>
       </w:r>
     </w:p>
-    <w:bookmarkEnd w:id="341"/>
-    <w:bookmarkStart w:id="343" w:name="reviewer-versus-claude-agent"/>
+    <w:bookmarkEnd w:id="342"/>
+    <w:bookmarkStart w:id="344" w:name="reviewer-versus-claude-agent"/>
     <w:p>
       <w:pPr>
         <w:pStyle w:val="Heading4"/>
@@ -49305,7 +49345,7 @@
       <w:r>
         <w:t xml:space="preserve"> </w:t>
       </w:r>
-      <w:hyperlink r:id="rId342">
+      <w:hyperlink r:id="rId343">
         <w:r>
           <w:rPr>
             <w:rStyle w:val="VerbatimChar"/>
@@ -49553,8 +49593,8 @@
         <w:t xml:space="preserve">-triggered workflow does.</w:t>
       </w:r>
     </w:p>
-    <w:bookmarkEnd w:id="343"/>
-    <w:bookmarkStart w:id="344" w:name="relation-to-codex-native-review"/>
+    <w:bookmarkEnd w:id="344"/>
+    <w:bookmarkStart w:id="345" w:name="relation-to-codex-native-review"/>
     <w:p>
       <w:pPr>
         <w:pStyle w:val="Heading4"/>
@@ -49627,9 +49667,9 @@
         <w:t xml:space="preserve">and triggering events are all visible and editable in your repository.</w:t>
       </w:r>
     </w:p>
-    <w:bookmarkEnd w:id="344"/>
     <w:bookmarkEnd w:id="345"/>
-    <w:bookmarkStart w:id="355" w:name="sec-ai-pr-activity-notifications"/>
+    <w:bookmarkEnd w:id="346"/>
+    <w:bookmarkStart w:id="356" w:name="sec-ai-pr-activity-notifications"/>
     <w:p>
       <w:pPr>
         <w:pStyle w:val="Heading1"/>
@@ -49973,7 +50013,7 @@
         </w:tc>
       </w:tr>
     </w:tbl>
-    <w:bookmarkStart w:id="346" w:name="the-channel-an-agent-controls"/>
+    <w:bookmarkStart w:id="347" w:name="the-channel-an-agent-controls"/>
     <w:p>
       <w:pPr>
         <w:pStyle w:val="Heading4"/>
@@ -50247,8 +50287,8 @@
         <w:t xml:space="preserve">real state, not a replacement for it.</w:t>
       </w:r>
     </w:p>
-    <w:bookmarkEnd w:id="346"/>
-    <w:bookmarkStart w:id="347" w:name="the-channel-only-a-human-controls"/>
+    <w:bookmarkEnd w:id="347"/>
+    <w:bookmarkStart w:id="348" w:name="the-channel-only-a-human-controls"/>
     <w:p>
       <w:pPr>
         <w:pStyle w:val="Heading4"/>
@@ -50551,8 +50591,8 @@
         <w:t xml:space="preserve">for the web-session context these run in.</w:t>
       </w:r>
     </w:p>
-    <w:bookmarkEnd w:id="347"/>
-    <w:bookmarkStart w:id="348" w:name="the-instruction-template-is-boilerplate"/>
+    <w:bookmarkEnd w:id="348"/>
+    <w:bookmarkStart w:id="349" w:name="the-instruction-template-is-boilerplate"/>
     <w:p>
       <w:pPr>
         <w:pStyle w:val="Heading4"/>
@@ -50818,8 +50858,8 @@
         <w:t xml:space="preserve">rather than as an instruction that a fix is owed.</w:t>
       </w:r>
     </w:p>
-    <w:bookmarkEnd w:id="348"/>
-    <w:bookmarkStart w:id="349" w:name="X3e28e99804e56791cb9e57e9eb83869f0ead0b2"/>
+    <w:bookmarkEnd w:id="349"/>
+    <w:bookmarkStart w:id="350" w:name="X3e28e99804e56791cb9e57e9eb83869f0ead0b2"/>
     <w:p>
       <w:pPr>
         <w:pStyle w:val="Heading4"/>
@@ -50948,8 +50988,8 @@
         <w:t xml:space="preserve">Toggling one says nothing about the other.</w:t>
       </w:r>
     </w:p>
-    <w:bookmarkEnd w:id="349"/>
-    <w:bookmarkStart w:id="354" w:name="treat-what-arrives-as-untrusted"/>
+    <w:bookmarkEnd w:id="350"/>
+    <w:bookmarkStart w:id="355" w:name="treat-what-arrives-as-untrusted"/>
     <w:p>
       <w:pPr>
         <w:pStyle w:val="Heading4"/>
@@ -51318,18 +51358,18 @@
                 <wp:inline>
                   <wp:extent cx="152400" cy="152400"/>
                   <wp:effectExtent b="0" l="0" r="0" t="0"/>
-                  <wp:docPr descr="" title="" id="350" name="Picture"/>
+                  <wp:docPr descr="" title="" id="351" name="Picture"/>
                   <a:graphic>
                     <a:graphicData uri="http://schemas.openxmlformats.org/drawingml/2006/picture">
                       <pic:pic>
                         <pic:nvPicPr>
-                          <pic:cNvPr descr="/opt/quarto/share/formats/docx/warning.png" id="351" name="Picture"/>
+                          <pic:cNvPr descr="/opt/quarto/share/formats/docx/warning.png" id="352" name="Picture"/>
                           <pic:cNvPicPr>
                             <a:picLocks noChangeArrowheads="1" noChangeAspect="1"/>
                           </pic:cNvPicPr>
                         </pic:nvPicPr>
                         <pic:blipFill>
-                          <a:blip r:embed="rId104"/>
+                          <a:blip r:embed="rId105"/>
                           <a:stretch>
                             <a:fillRect/>
                           </a:stretch>
@@ -51494,18 +51534,18 @@
                 <wp:inline>
                   <wp:extent cx="152400" cy="152400"/>
                   <wp:effectExtent b="0" l="0" r="0" t="0"/>
-                  <wp:docPr descr="" title="" id="352" name="Picture"/>
+                  <wp:docPr descr="" title="" id="353" name="Picture"/>
                   <a:graphic>
                     <a:graphicData uri="http://schemas.openxmlformats.org/drawingml/2006/picture">
                       <pic:pic>
                         <pic:nvPicPr>
-                          <pic:cNvPr descr="/opt/quarto/share/formats/docx/note.png" id="353" name="Picture"/>
+                          <pic:cNvPr descr="/opt/quarto/share/formats/docx/note.png" id="354" name="Picture"/>
                           <pic:cNvPicPr>
                             <a:picLocks noChangeArrowheads="1" noChangeAspect="1"/>
                           </pic:cNvPicPr>
                         </pic:nvPicPr>
                         <pic:blipFill>
-                          <a:blip r:embed="rId119"/>
+                          <a:blip r:embed="rId120"/>
                           <a:stretch>
                             <a:fillRect/>
                           </a:stretch>
@@ -51605,9 +51645,9 @@
         </w:tc>
       </w:tr>
     </w:tbl>
-    <w:bookmarkEnd w:id="354"/>
     <w:bookmarkEnd w:id="355"/>
-    <w:bookmarkStart w:id="359" w:name="sec-ai-when-to-use"/>
+    <w:bookmarkEnd w:id="356"/>
+    <w:bookmarkStart w:id="360" w:name="sec-ai-when-to-use"/>
     <w:p>
       <w:pPr>
         <w:pStyle w:val="Heading1"/>
@@ -51627,7 +51667,7 @@
         <w:rPr>
           <w:rStyle w:val="FootnoteReference"/>
         </w:rPr>
-        <w:footnoteReference w:id="356"/>
+        <w:footnoteReference w:id="357"/>
       </w:r>
       <w:r>
         <w:t xml:space="preserve"> </w:t>
@@ -51659,7 +51699,7 @@
       <w:r>
         <w:t xml:space="preserve"> </w:t>
       </w:r>
-      <w:hyperlink r:id="rId357">
+      <w:hyperlink r:id="rId358">
         <w:r>
           <w:rPr>
             <w:rStyle w:val="Hyperlink"/>
@@ -51718,7 +51758,7 @@
       <w:r>
         <w:t xml:space="preserve"> </w:t>
       </w:r>
-      <w:hyperlink r:id="rId358">
+      <w:hyperlink r:id="rId359">
         <w:r>
           <w:rPr>
             <w:rStyle w:val="Hyperlink"/>
@@ -51837,8 +51877,8 @@
         <w:t xml:space="preserve">just like you would for any other skill you want to maintain.</w:t>
       </w:r>
     </w:p>
-    <w:bookmarkEnd w:id="359"/>
-    <w:bookmarkStart w:id="364" w:name="editing-with-.docx-files"/>
+    <w:bookmarkEnd w:id="360"/>
+    <w:bookmarkStart w:id="365" w:name="editing-with-.docx-files"/>
     <w:p>
       <w:pPr>
         <w:pStyle w:val="Heading1"/>
@@ -52018,7 +52058,7 @@
         <w:t xml:space="preserve">This approach makes it easier for collaborators who are more comfortable with Word to contribute while maintaining the source files in Quarto format.</w:t>
       </w:r>
     </w:p>
-    <w:bookmarkStart w:id="363" w:name="known-issue-document-1-warning-in-word"/>
+    <w:bookmarkStart w:id="364" w:name="known-issue-document-1-warning-in-word"/>
     <w:p>
       <w:pPr>
         <w:pStyle w:val="Heading4"/>
@@ -52103,7 +52143,7 @@
           <w:numId w:val="1146"/>
         </w:numPr>
       </w:pPr>
-      <w:hyperlink r:id="rId360">
+      <w:hyperlink r:id="rId361">
         <w:r>
           <w:rPr>
             <w:rStyle w:val="Hyperlink"/>
@@ -52120,7 +52160,7 @@
           <w:numId w:val="1146"/>
         </w:numPr>
       </w:pPr>
-      <w:hyperlink r:id="rId361">
+      <w:hyperlink r:id="rId362">
         <w:r>
           <w:rPr>
             <w:rStyle w:val="Hyperlink"/>
@@ -52137,7 +52177,7 @@
           <w:numId w:val="1146"/>
         </w:numPr>
       </w:pPr>
-      <w:hyperlink r:id="rId362">
+      <w:hyperlink r:id="rId363">
         <w:r>
           <w:rPr>
             <w:rStyle w:val="Hyperlink"/>
@@ -52250,9 +52290,9 @@
         <w:t xml:space="preserve">warning and can immediately add comments and track changes without issues.</w:t>
       </w:r>
     </w:p>
-    <w:bookmarkEnd w:id="363"/>
     <w:bookmarkEnd w:id="364"/>
-    <w:bookmarkStart w:id="366" w:name="copilot-instructions-for-this-repository"/>
+    <w:bookmarkEnd w:id="365"/>
+    <w:bookmarkStart w:id="367" w:name="copilot-instructions-for-this-repository"/>
     <w:p>
       <w:pPr>
         <w:pStyle w:val="Heading1"/>
@@ -52484,7 +52524,7 @@
       <w:r>
         <w:t xml:space="preserve"> </w:t>
       </w:r>
-      <w:hyperlink r:id="rId365">
+      <w:hyperlink r:id="rId366">
         <w:r>
           <w:rPr>
             <w:rStyle w:val="VerbatimChar"/>
@@ -52499,8 +52539,8 @@
         <w:t xml:space="preserve">for a working example.</w:t>
       </w:r>
     </w:p>
-    <w:bookmarkEnd w:id="366"/>
-    <w:bookmarkStart w:id="367" w:name="using-copilot-review-before-human-review"/>
+    <w:bookmarkEnd w:id="367"/>
+    <w:bookmarkStart w:id="368" w:name="using-copilot-review-before-human-review"/>
     <w:p>
       <w:pPr>
         <w:pStyle w:val="Heading1"/>
@@ -53086,8 +53126,8 @@
         <w:t xml:space="preserve">This ensures you’re reviewing code that has already been through initial automated quality checks.</w:t>
       </w:r>
     </w:p>
-    <w:bookmarkEnd w:id="367"/>
-    <w:bookmarkStart w:id="369" w:name="reviewing-a-copilot-pr-you-didnt-create"/>
+    <w:bookmarkEnd w:id="368"/>
+    <w:bookmarkStart w:id="370" w:name="reviewing-a-copilot-pr-you-didnt-create"/>
     <w:p>
       <w:pPr>
         <w:pStyle w:val="Heading1"/>
@@ -53138,7 +53178,7 @@
       <w:r>
         <w:t xml:space="preserve"> </w:t>
       </w:r>
-      <w:hyperlink r:id="rId368">
+      <w:hyperlink r:id="rId369">
         <w:r>
           <w:rPr>
             <w:rStyle w:val="Hyperlink"/>
@@ -54042,8 +54082,8 @@
         <w:t xml:space="preserve">while benefiting from collaborative human review and Copilot’s implementation capabilities.</w:t>
       </w:r>
     </w:p>
-    <w:bookmarkEnd w:id="369"/>
-    <w:bookmarkStart w:id="388" w:name="sec-ai-claude-code-windows"/>
+    <w:bookmarkEnd w:id="370"/>
+    <w:bookmarkStart w:id="389" w:name="sec-ai-claude-code-windows"/>
     <w:p>
       <w:pPr>
         <w:pStyle w:val="Heading1"/>
@@ -54142,18 +54182,18 @@
                 <wp:inline>
                   <wp:extent cx="152400" cy="152400"/>
                   <wp:effectExtent b="0" l="0" r="0" t="0"/>
-                  <wp:docPr descr="" title="" id="370" name="Picture"/>
+                  <wp:docPr descr="" title="" id="371" name="Picture"/>
                   <a:graphic>
                     <a:graphicData uri="http://schemas.openxmlformats.org/drawingml/2006/picture">
                       <pic:pic>
                         <pic:nvPicPr>
-                          <pic:cNvPr descr="/opt/quarto/share/formats/docx/note.png" id="371" name="Picture"/>
+                          <pic:cNvPr descr="/opt/quarto/share/formats/docx/note.png" id="372" name="Picture"/>
                           <pic:cNvPicPr>
                             <a:picLocks noChangeArrowheads="1" noChangeAspect="1"/>
                           </pic:cNvPicPr>
                         </pic:nvPicPr>
                         <pic:blipFill>
-                          <a:blip r:embed="rId119"/>
+                          <a:blip r:embed="rId120"/>
                           <a:stretch>
                             <a:fillRect/>
                           </a:stretch>
@@ -54235,7 +54275,7 @@
         </w:tc>
       </w:tr>
     </w:tbl>
-    <w:bookmarkStart w:id="374" w:name="run-it-from-a-unix-like-terminal"/>
+    <w:bookmarkStart w:id="375" w:name="run-it-from-a-unix-like-terminal"/>
     <w:p>
       <w:pPr>
         <w:pStyle w:val="Heading4"/>
@@ -54282,7 +54322,7 @@
       <w:r>
         <w:t xml:space="preserve"> </w:t>
       </w:r>
-      <w:hyperlink r:id="rId372">
+      <w:hyperlink r:id="rId373">
         <w:r>
           <w:rPr>
             <w:rStyle w:val="Hyperlink"/>
@@ -54315,7 +54355,7 @@
       <w:r>
         <w:t xml:space="preserve">(</w:t>
       </w:r>
-      <w:hyperlink r:id="rId373">
+      <w:hyperlink r:id="rId374">
         <w:r>
           <w:rPr>
             <w:rStyle w:val="Hyperlink"/>
@@ -54466,8 +54506,8 @@
         <w:t xml:space="preserve">gotchas below don’t apply.</w:t>
       </w:r>
     </w:p>
-    <w:bookmarkEnd w:id="374"/>
-    <w:bookmarkStart w:id="379" w:name="install-claude-code"/>
+    <w:bookmarkEnd w:id="375"/>
+    <w:bookmarkStart w:id="380" w:name="install-claude-code"/>
     <w:p>
       <w:pPr>
         <w:pStyle w:val="Heading4"/>
@@ -54632,7 +54672,7 @@
       <w:r>
         <w:t xml:space="preserve"> </w:t>
       </w:r>
-      <w:hyperlink r:id="rId375">
+      <w:hyperlink r:id="rId376">
         <w:r>
           <w:rPr>
             <w:rStyle w:val="Hyperlink"/>
@@ -54718,18 +54758,18 @@
                 <wp:inline>
                   <wp:extent cx="152400" cy="152400"/>
                   <wp:effectExtent b="0" l="0" r="0" t="0"/>
-                  <wp:docPr descr="" title="" id="376" name="Picture"/>
+                  <wp:docPr descr="" title="" id="377" name="Picture"/>
                   <a:graphic>
                     <a:graphicData uri="http://schemas.openxmlformats.org/drawingml/2006/picture">
                       <pic:pic>
                         <pic:nvPicPr>
-                          <pic:cNvPr descr="/opt/quarto/share/formats/docx/important.png" id="377" name="Picture"/>
+                          <pic:cNvPr descr="/opt/quarto/share/formats/docx/important.png" id="378" name="Picture"/>
                           <pic:cNvPicPr>
                             <a:picLocks noChangeArrowheads="1" noChangeAspect="1"/>
                           </pic:cNvPicPr>
                         </pic:nvPicPr>
                         <pic:blipFill>
-                          <a:blip r:embed="rId155"/>
+                          <a:blip r:embed="rId156"/>
                           <a:stretch>
                             <a:fillRect/>
                           </a:stretch>
@@ -54879,7 +54919,7 @@
             <w:r>
               <w:t xml:space="preserve"> </w:t>
             </w:r>
-            <w:hyperlink r:id="rId378">
+            <w:hyperlink r:id="rId379">
               <w:r>
                 <w:rPr>
                   <w:rStyle w:val="Hyperlink"/>
@@ -54970,8 +55010,8 @@
         </w:tc>
       </w:tr>
     </w:tbl>
-    <w:bookmarkEnd w:id="379"/>
-    <w:bookmarkStart w:id="381" w:name="make-sure-your-shell-can-find-claude"/>
+    <w:bookmarkEnd w:id="380"/>
+    <w:bookmarkStart w:id="382" w:name="make-sure-your-shell-can-find-claude"/>
     <w:p>
       <w:pPr>
         <w:pStyle w:val="Heading4"/>
@@ -55569,7 +55609,7 @@
       <w:r>
         <w:t xml:space="preserve"> </w:t>
       </w:r>
-      <w:hyperlink r:id="rId380">
+      <w:hyperlink r:id="rId381">
         <w:r>
           <w:rPr>
             <w:rStyle w:val="Hyperlink"/>
@@ -55675,8 +55715,8 @@
         <w:t xml:space="preserve">initializes).</w:t>
       </w:r>
     </w:p>
-    <w:bookmarkEnd w:id="381"/>
-    <w:bookmarkStart w:id="384" w:name="X604325b0223e79803e04f87e7874b1d7f4a0663"/>
+    <w:bookmarkEnd w:id="382"/>
+    <w:bookmarkStart w:id="385" w:name="X604325b0223e79803e04f87e7874b1d7f4a0663"/>
     <w:p>
       <w:pPr>
         <w:pStyle w:val="Heading4"/>
@@ -55726,18 +55766,18 @@
                 <wp:inline>
                   <wp:extent cx="152400" cy="152400"/>
                   <wp:effectExtent b="0" l="0" r="0" t="0"/>
-                  <wp:docPr descr="" title="" id="382" name="Picture"/>
+                  <wp:docPr descr="" title="" id="383" name="Picture"/>
                   <a:graphic>
                     <a:graphicData uri="http://schemas.openxmlformats.org/drawingml/2006/picture">
                       <pic:pic>
                         <pic:nvPicPr>
-                          <pic:cNvPr descr="/opt/quarto/share/formats/docx/warning.png" id="383" name="Picture"/>
+                          <pic:cNvPr descr="/opt/quarto/share/formats/docx/warning.png" id="384" name="Picture"/>
                           <pic:cNvPicPr>
                             <a:picLocks noChangeArrowheads="1" noChangeAspect="1"/>
                           </pic:cNvPicPr>
                         </pic:nvPicPr>
                         <pic:blipFill>
-                          <a:blip r:embed="rId104"/>
+                          <a:blip r:embed="rId105"/>
                           <a:stretch>
                             <a:fillRect/>
                           </a:stretch>
@@ -55999,8 +56039,8 @@
         </w:tc>
       </w:tr>
     </w:tbl>
-    <w:bookmarkEnd w:id="384"/>
-    <w:bookmarkStart w:id="386" w:name="X1745fd502df7963ed7ce48d0465493b4d59ad92"/>
+    <w:bookmarkEnd w:id="385"/>
+    <w:bookmarkStart w:id="387" w:name="X1745fd502df7963ed7ce48d0465493b4d59ad92"/>
     <w:p>
       <w:pPr>
         <w:pStyle w:val="Heading4"/>
@@ -56019,7 +56059,7 @@
       <w:r>
         <w:t xml:space="preserve"> </w:t>
       </w:r>
-      <w:hyperlink r:id="rId385">
+      <w:hyperlink r:id="rId386">
         <w:r>
           <w:rPr>
             <w:rStyle w:val="Hyperlink"/>
@@ -56180,8 +56220,8 @@
         <w:t xml:space="preserve">.</w:t>
       </w:r>
     </w:p>
-    <w:bookmarkEnd w:id="386"/>
-    <w:bookmarkStart w:id="387" w:name="verify-the-install"/>
+    <w:bookmarkEnd w:id="387"/>
+    <w:bookmarkStart w:id="388" w:name="verify-the-install"/>
     <w:p>
       <w:pPr>
         <w:pStyle w:val="Heading4"/>
@@ -56350,9 +56390,9 @@
         <w:t xml:space="preserve">(or open a fresh window) after changing it.</w:t>
       </w:r>
     </w:p>
-    <w:bookmarkEnd w:id="387"/>
     <w:bookmarkEnd w:id="388"/>
-    <w:bookmarkStart w:id="402" w:name="sec-ai-mcp-server-setup"/>
+    <w:bookmarkEnd w:id="389"/>
+    <w:bookmarkStart w:id="403" w:name="sec-ai-mcp-server-setup"/>
     <w:p>
       <w:pPr>
         <w:pStyle w:val="Heading1"/>
@@ -56371,7 +56411,7 @@
       <w:r>
         <w:t xml:space="preserve"> </w:t>
       </w:r>
-      <w:hyperlink r:id="rId28">
+      <w:hyperlink r:id="rId29">
         <w:r>
           <w:rPr>
             <w:rStyle w:val="Hyperlink"/>
@@ -56473,18 +56513,18 @@
                 <wp:inline>
                   <wp:extent cx="152400" cy="152400"/>
                   <wp:effectExtent b="0" l="0" r="0" t="0"/>
-                  <wp:docPr descr="" title="" id="389" name="Picture"/>
+                  <wp:docPr descr="" title="" id="390" name="Picture"/>
                   <a:graphic>
                     <a:graphicData uri="http://schemas.openxmlformats.org/drawingml/2006/picture">
                       <pic:pic>
                         <pic:nvPicPr>
-                          <pic:cNvPr descr="/opt/quarto/share/formats/docx/note.png" id="390" name="Picture"/>
+                          <pic:cNvPr descr="/opt/quarto/share/formats/docx/note.png" id="391" name="Picture"/>
                           <pic:cNvPicPr>
                             <a:picLocks noChangeArrowheads="1" noChangeAspect="1"/>
                           </pic:cNvPicPr>
                         </pic:nvPicPr>
                         <pic:blipFill>
-                          <a:blip r:embed="rId119"/>
+                          <a:blip r:embed="rId120"/>
                           <a:stretch>
                             <a:fillRect/>
                           </a:stretch>
@@ -56572,7 +56612,7 @@
         </w:tc>
       </w:tr>
     </w:tbl>
-    <w:bookmarkStart w:id="392" w:name="installed-is-not-registered"/>
+    <w:bookmarkStart w:id="393" w:name="installed-is-not-registered"/>
     <w:p>
       <w:pPr>
         <w:pStyle w:val="Heading4"/>
@@ -56603,7 +56643,7 @@
       <w:r>
         <w:t xml:space="preserve"> </w:t>
       </w:r>
-      <w:hyperlink r:id="rId391">
+      <w:hyperlink r:id="rId392">
         <w:r>
           <w:rPr>
             <w:rStyle w:val="VerbatimChar"/>
@@ -56671,8 +56711,8 @@
         <w:t xml:space="preserve"> mcp list</w:t>
       </w:r>
     </w:p>
-    <w:bookmarkEnd w:id="392"/>
-    <w:bookmarkStart w:id="393" w:name="Xf6682145328c756d2e167d2c91be34f7f913a7f"/>
+    <w:bookmarkEnd w:id="393"/>
+    <w:bookmarkStart w:id="394" w:name="Xf6682145328c756d2e167d2c91be34f7f913a7f"/>
     <w:p>
       <w:pPr>
         <w:pStyle w:val="Heading4"/>
@@ -56871,8 +56911,8 @@
         <w:t xml:space="preserve">A local one shows a command path instead.</w:t>
       </w:r>
     </w:p>
-    <w:bookmarkEnd w:id="393"/>
-    <w:bookmarkStart w:id="394" w:name="and-401-mean-different-things"/>
+    <w:bookmarkEnd w:id="394"/>
+    <w:bookmarkStart w:id="395" w:name="and-401-mean-different-things"/>
     <w:p>
       <w:pPr>
         <w:pStyle w:val="Heading4"/>
@@ -57115,8 +57155,8 @@
         <w:t xml:space="preserve">sends you to the token-minting page for a problem that lives in a config file.</w:t>
       </w:r>
     </w:p>
-    <w:bookmarkEnd w:id="394"/>
-    <w:bookmarkStart w:id="395" w:name="install-the-binary-the-platforms-own-way"/>
+    <w:bookmarkEnd w:id="395"/>
+    <w:bookmarkStart w:id="396" w:name="install-the-binary-the-platforms-own-way"/>
     <w:p>
       <w:pPr>
         <w:pStyle w:val="Heading4"/>
@@ -57370,8 +57410,8 @@
         <w:t xml:space="preserve">with an override for the case where it isn’t on one.</w:t>
       </w:r>
     </w:p>
-    <w:bookmarkEnd w:id="395"/>
-    <w:bookmarkStart w:id="396" w:name="X2adb24e9b1a0644f0fbebe685525dadd8a56387"/>
+    <w:bookmarkEnd w:id="396"/>
+    <w:bookmarkStart w:id="397" w:name="X2adb24e9b1a0644f0fbebe685525dadd8a56387"/>
     <w:p>
       <w:pPr>
         <w:pStyle w:val="Heading4"/>
@@ -58248,8 +58288,8 @@
         <w:t xml:space="preserve">bug you just finished diagnosing.</w:t>
       </w:r>
     </w:p>
-    <w:bookmarkEnd w:id="396"/>
-    <w:bookmarkStart w:id="397" w:name="X448547516ab06679b064b391b05a896db41ea57"/>
+    <w:bookmarkEnd w:id="397"/>
+    <w:bookmarkStart w:id="398" w:name="X448547516ab06679b064b391b05a896db41ea57"/>
     <w:p>
       <w:pPr>
         <w:pStyle w:val="Heading4"/>
@@ -58571,8 +58611,8 @@
         <w:t xml:space="preserve">the count moving the right direction, as the check above expects.</w:t>
       </w:r>
     </w:p>
-    <w:bookmarkEnd w:id="397"/>
-    <w:bookmarkStart w:id="398" w:name="X4a4c9992603eee0123b58b5b37e7fedbb817150"/>
+    <w:bookmarkEnd w:id="398"/>
+    <w:bookmarkStart w:id="399" w:name="X4a4c9992603eee0123b58b5b37e7fedbb817150"/>
     <w:p>
       <w:pPr>
         <w:pStyle w:val="Heading4"/>
@@ -58672,8 +58712,8 @@
         <w:t xml:space="preserve">Reach for those instead when working from a local harness.</w:t>
       </w:r>
     </w:p>
-    <w:bookmarkEnd w:id="398"/>
-    <w:bookmarkStart w:id="399" w:name="Xb256c2a3c0a422f2f687a98903d3521fd60a1b1"/>
+    <w:bookmarkEnd w:id="399"/>
+    <w:bookmarkStart w:id="400" w:name="Xb256c2a3c0a422f2f687a98903d3521fd60a1b1"/>
     <w:p>
       <w:pPr>
         <w:pStyle w:val="Heading4"/>
@@ -58849,8 +58889,8 @@
         <w:t xml:space="preserve">not something an agent does in passing.</w:t>
       </w:r>
     </w:p>
-    <w:bookmarkEnd w:id="399"/>
-    <w:bookmarkStart w:id="401" w:name="Xd44df015462fcf288556a538677f0a762c9ef1d"/>
+    <w:bookmarkEnd w:id="400"/>
+    <w:bookmarkStart w:id="402" w:name="Xd44df015462fcf288556a538677f0a762c9ef1d"/>
     <w:p>
       <w:pPr>
         <w:pStyle w:val="Heading4"/>
@@ -58964,7 +59004,7 @@
       <w:r>
         <w:t xml:space="preserve"> </w:t>
       </w:r>
-      <w:hyperlink r:id="rId400">
+      <w:hyperlink r:id="rId401">
         <w:r>
           <w:rPr>
             <w:rStyle w:val="Hyperlink"/>
@@ -59147,9 +59187,9 @@
         <w:t xml:space="preserve">and expect it to work.</w:t>
       </w:r>
     </w:p>
-    <w:bookmarkEnd w:id="401"/>
     <w:bookmarkEnd w:id="402"/>
-    <w:bookmarkStart w:id="410" w:name="sec-ai-gemini-spend-management"/>
+    <w:bookmarkEnd w:id="403"/>
+    <w:bookmarkStart w:id="411" w:name="sec-ai-gemini-spend-management"/>
     <w:p>
       <w:pPr>
         <w:pStyle w:val="Heading1"/>
@@ -59178,7 +59218,7 @@
         <w:t xml:space="preserve">and optimize token consumption across local tools and GitHub Actions workflows.</w:t>
       </w:r>
     </w:p>
-    <w:bookmarkStart w:id="404" w:name="Xd8c10be17edf039db5b664720f228274181ba18"/>
+    <w:bookmarkStart w:id="405" w:name="Xd8c10be17edf039db5b664720f228274181ba18"/>
     <w:p>
       <w:pPr>
         <w:pStyle w:val="Heading4"/>
@@ -59242,7 +59282,7 @@
       <w:r>
         <w:t xml:space="preserve"> </w:t>
       </w:r>
-      <w:hyperlink r:id="rId403">
+      <w:hyperlink r:id="rId404">
         <w:r>
           <w:rPr>
             <w:rStyle w:val="Hyperlink"/>
@@ -59337,7 +59377,7 @@
       <w:r>
         <w:t xml:space="preserve"> </w:t>
       </w:r>
-      <w:hyperlink r:id="rId403">
+      <w:hyperlink r:id="rId404">
         <w:r>
           <w:rPr>
             <w:rStyle w:val="Hyperlink"/>
@@ -59373,8 +59413,8 @@
         <w:t xml:space="preserve">Any project that has hit its monthly spend cap will have its API requests paused until the limit is updated.</w:t>
       </w:r>
     </w:p>
-    <w:bookmarkEnd w:id="404"/>
-    <w:bookmarkStart w:id="406" w:name="adjusting-and-unpausing-spend-caps"/>
+    <w:bookmarkEnd w:id="405"/>
+    <w:bookmarkStart w:id="407" w:name="adjusting-and-unpausing-spend-caps"/>
     <w:p>
       <w:pPr>
         <w:pStyle w:val="Heading4"/>
@@ -59405,7 +59445,7 @@
       <w:r>
         <w:t xml:space="preserve"> </w:t>
       </w:r>
-      <w:hyperlink r:id="rId405">
+      <w:hyperlink r:id="rId406">
         <w:r>
           <w:rPr>
             <w:rStyle w:val="Hyperlink"/>
@@ -59474,8 +59514,8 @@
         <w:t xml:space="preserve">and API service automatically resumes up to the configured cap.</w:t>
       </w:r>
     </w:p>
-    <w:bookmarkEnd w:id="406"/>
-    <w:bookmarkStart w:id="408" w:name="setting-up-google-cloud-budget-alerts"/>
+    <w:bookmarkEnd w:id="407"/>
+    <w:bookmarkStart w:id="409" w:name="setting-up-google-cloud-budget-alerts"/>
     <w:p>
       <w:pPr>
         <w:pStyle w:val="Heading4"/>
@@ -59506,7 +59546,7 @@
       <w:r>
         <w:t xml:space="preserve"> </w:t>
       </w:r>
-      <w:hyperlink r:id="rId407">
+      <w:hyperlink r:id="rId408">
         <w:r>
           <w:rPr>
             <w:rStyle w:val="Hyperlink"/>
@@ -59658,8 +59698,8 @@
         <w:t xml:space="preserve">. You will receive email alerts before any project hits its spend cap.</w:t>
       </w:r>
     </w:p>
-    <w:bookmarkEnd w:id="408"/>
-    <w:bookmarkStart w:id="409" w:name="cost-optimization-best-practices"/>
+    <w:bookmarkEnd w:id="409"/>
+    <w:bookmarkStart w:id="410" w:name="cost-optimization-best-practices"/>
     <w:p>
       <w:pPr>
         <w:pStyle w:val="Heading4"/>
@@ -59974,9 +60014,9 @@
         <w:t xml:space="preserve">to collapse them in GitHub’s web diff view and exclude them from repository language statistics.</w:t>
       </w:r>
     </w:p>
-    <w:bookmarkEnd w:id="409"/>
     <w:bookmarkEnd w:id="410"/>
-    <w:bookmarkStart w:id="440" w:name="references"/>
+    <w:bookmarkEnd w:id="411"/>
+    <w:bookmarkStart w:id="441" w:name="references"/>
     <w:p>
       <w:pPr>
         <w:pStyle w:val="Heading1"/>
@@ -59985,8 +60025,8 @@
         <w:t xml:space="preserve">References</w:t>
       </w:r>
     </w:p>
-    <w:bookmarkStart w:id="439" w:name="refs"/>
-    <w:bookmarkStart w:id="412" w:name="ref-space_odyssey"/>
+    <w:bookmarkStart w:id="440" w:name="refs"/>
+    <w:bookmarkStart w:id="413" w:name="ref-space_odyssey"/>
     <w:p>
       <w:pPr>
         <w:pStyle w:val="Bibliography"/>
@@ -60004,7 +60044,7 @@
       <w:r>
         <w:t xml:space="preserve"> </w:t>
       </w:r>
-      <w:hyperlink r:id="rId411">
+      <w:hyperlink r:id="rId412">
         <w:r>
           <w:rPr>
             <w:rStyle w:val="Hyperlink"/>
@@ -60016,8 +60056,8 @@
         <w:t xml:space="preserve">.</w:t>
       </w:r>
     </w:p>
-    <w:bookmarkEnd w:id="412"/>
-    <w:bookmarkStart w:id="414" w:name="ref-i_robot"/>
+    <w:bookmarkEnd w:id="413"/>
+    <w:bookmarkStart w:id="415" w:name="ref-i_robot"/>
     <w:p>
       <w:pPr>
         <w:pStyle w:val="Bibliography"/>
@@ -60041,7 +60081,7 @@
       <w:r>
         <w:t xml:space="preserve"> </w:t>
       </w:r>
-      <w:hyperlink r:id="rId413">
+      <w:hyperlink r:id="rId414">
         <w:r>
           <w:rPr>
             <w:rStyle w:val="Hyperlink"/>
@@ -60053,8 +60093,8 @@
         <w:t xml:space="preserve">.</w:t>
       </w:r>
     </w:p>
-    <w:bookmarkEnd w:id="414"/>
-    <w:bookmarkStart w:id="416" w:name="ref-battlestar_galactica_2004"/>
+    <w:bookmarkEnd w:id="415"/>
+    <w:bookmarkStart w:id="417" w:name="ref-battlestar_galactica_2004"/>
     <w:p>
       <w:pPr>
         <w:pStyle w:val="Bibliography"/>
@@ -60072,7 +60112,7 @@
       <w:r>
         <w:t xml:space="preserve"> </w:t>
       </w:r>
-      <w:hyperlink r:id="rId415">
+      <w:hyperlink r:id="rId416">
         <w:r>
           <w:rPr>
             <w:rStyle w:val="Hyperlink"/>
@@ -60084,8 +60124,8 @@
         <w:t xml:space="preserve">.</w:t>
       </w:r>
     </w:p>
-    <w:bookmarkEnd w:id="416"/>
-    <w:bookmarkStart w:id="418" w:name="ref-slm_agentic_ai"/>
+    <w:bookmarkEnd w:id="417"/>
+    <w:bookmarkStart w:id="419" w:name="ref-slm_agentic_ai"/>
     <w:p>
       <w:pPr>
         <w:pStyle w:val="Bibliography"/>
@@ -60109,7 +60149,7 @@
       <w:r>
         <w:t xml:space="preserve"> </w:t>
       </w:r>
-      <w:hyperlink r:id="rId417">
+      <w:hyperlink r:id="rId418">
         <w:r>
           <w:rPr>
             <w:rStyle w:val="Hyperlink"/>
@@ -60121,8 +60161,8 @@
         <w:t xml:space="preserve">.</w:t>
       </w:r>
     </w:p>
-    <w:bookmarkEnd w:id="418"/>
-    <w:bookmarkStart w:id="420" w:name="ref-blade_runner"/>
+    <w:bookmarkEnd w:id="419"/>
+    <w:bookmarkStart w:id="421" w:name="ref-blade_runner"/>
     <w:p>
       <w:pPr>
         <w:pStyle w:val="Bibliography"/>
@@ -60140,7 +60180,7 @@
       <w:r>
         <w:t xml:space="preserve"> </w:t>
       </w:r>
-      <w:hyperlink r:id="rId419">
+      <w:hyperlink r:id="rId420">
         <w:r>
           <w:rPr>
             <w:rStyle w:val="Hyperlink"/>
@@ -60152,8 +60192,8 @@
         <w:t xml:space="preserve">.</w:t>
       </w:r>
     </w:p>
-    <w:bookmarkEnd w:id="420"/>
-    <w:bookmarkStart w:id="422" w:name="ref-enders_game"/>
+    <w:bookmarkEnd w:id="421"/>
+    <w:bookmarkStart w:id="423" w:name="ref-enders_game"/>
     <w:p>
       <w:pPr>
         <w:pStyle w:val="Bibliography"/>
@@ -60177,7 +60217,7 @@
       <w:r>
         <w:t xml:space="preserve"> </w:t>
       </w:r>
-      <w:hyperlink r:id="rId421">
+      <w:hyperlink r:id="rId422">
         <w:r>
           <w:rPr>
             <w:rStyle w:val="Hyperlink"/>
@@ -60189,8 +60229,8 @@
         <w:t xml:space="preserve">.</w:t>
       </w:r>
     </w:p>
-    <w:bookmarkEnd w:id="422"/>
-    <w:bookmarkStart w:id="424" w:name="ref-qlora"/>
+    <w:bookmarkEnd w:id="423"/>
+    <w:bookmarkStart w:id="425" w:name="ref-qlora"/>
     <w:p>
       <w:pPr>
         <w:pStyle w:val="Bibliography"/>
@@ -60214,7 +60254,7 @@
       <w:r>
         <w:t xml:space="preserve"> </w:t>
       </w:r>
-      <w:hyperlink r:id="rId423">
+      <w:hyperlink r:id="rId424">
         <w:r>
           <w:rPr>
             <w:rStyle w:val="Hyperlink"/>
@@ -60226,8 +60266,8 @@
         <w:t xml:space="preserve">.</w:t>
       </w:r>
     </w:p>
-    <w:bookmarkEnd w:id="424"/>
-    <w:bookmarkStart w:id="426" w:name="ref-humans_are_dead"/>
+    <w:bookmarkEnd w:id="425"/>
+    <w:bookmarkStart w:id="427" w:name="ref-humans_are_dead"/>
     <w:p>
       <w:pPr>
         <w:pStyle w:val="Bibliography"/>
@@ -60251,7 +60291,7 @@
       <w:r>
         <w:t xml:space="preserve"> </w:t>
       </w:r>
-      <w:hyperlink r:id="rId425">
+      <w:hyperlink r:id="rId426">
         <w:r>
           <w:rPr>
             <w:rStyle w:val="Hyperlink"/>
@@ -60263,8 +60303,8 @@
         <w:t xml:space="preserve">.</w:t>
       </w:r>
     </w:p>
-    <w:bookmarkEnd w:id="426"/>
-    <w:bookmarkStart w:id="428" w:name="ref-dune"/>
+    <w:bookmarkEnd w:id="427"/>
+    <w:bookmarkStart w:id="429" w:name="ref-dune"/>
     <w:p>
       <w:pPr>
         <w:pStyle w:val="Bibliography"/>
@@ -60288,7 +60328,7 @@
       <w:r>
         <w:t xml:space="preserve"> </w:t>
       </w:r>
-      <w:hyperlink r:id="rId427">
+      <w:hyperlink r:id="rId428">
         <w:r>
           <w:rPr>
             <w:rStyle w:val="Hyperlink"/>
@@ -60300,8 +60340,8 @@
         <w:t xml:space="preserve">.</w:t>
       </w:r>
     </w:p>
-    <w:bookmarkEnd w:id="428"/>
-    <w:bookmarkStart w:id="430" w:name="ref-lora"/>
+    <w:bookmarkEnd w:id="429"/>
+    <w:bookmarkStart w:id="431" w:name="ref-lora"/>
     <w:p>
       <w:pPr>
         <w:pStyle w:val="Bibliography"/>
@@ -60325,7 +60365,7 @@
       <w:r>
         <w:t xml:space="preserve"> </w:t>
       </w:r>
-      <w:hyperlink r:id="rId429">
+      <w:hyperlink r:id="rId430">
         <w:r>
           <w:rPr>
             <w:rStyle w:val="Hyperlink"/>
@@ -60337,8 +60377,8 @@
         <w:t xml:space="preserve">.</w:t>
       </w:r>
     </w:p>
-    <w:bookmarkEnd w:id="430"/>
-    <w:bookmarkStart w:id="432" w:name="ref-lecun_world_models"/>
+    <w:bookmarkEnd w:id="431"/>
+    <w:bookmarkStart w:id="433" w:name="ref-lecun_world_models"/>
     <w:p>
       <w:pPr>
         <w:pStyle w:val="Bibliography"/>
@@ -60362,7 +60402,7 @@
       <w:r>
         <w:t xml:space="preserve"> </w:t>
       </w:r>
-      <w:hyperlink r:id="rId431">
+      <w:hyperlink r:id="rId432">
         <w:r>
           <w:rPr>
             <w:rStyle w:val="Hyperlink"/>
@@ -60374,8 +60414,8 @@
         <w:t xml:space="preserve">.</w:t>
       </w:r>
     </w:p>
-    <w:bookmarkEnd w:id="432"/>
-    <w:bookmarkStart w:id="434" w:name="ref-terminator"/>
+    <w:bookmarkEnd w:id="433"/>
+    <w:bookmarkStart w:id="435" w:name="ref-terminator"/>
     <w:p>
       <w:pPr>
         <w:pStyle w:val="Bibliography"/>
@@ -60393,7 +60433,7 @@
       <w:r>
         <w:t xml:space="preserve"> </w:t>
       </w:r>
-      <w:hyperlink r:id="rId433">
+      <w:hyperlink r:id="rId434">
         <w:r>
           <w:rPr>
             <w:rStyle w:val="Hyperlink"/>
@@ -60405,8 +60445,8 @@
         <w:t xml:space="preserve">.</w:t>
       </w:r>
     </w:p>
-    <w:bookmarkEnd w:id="434"/>
-    <w:bookmarkStart w:id="436" w:name="ref-matrix"/>
+    <w:bookmarkEnd w:id="435"/>
+    <w:bookmarkStart w:id="437" w:name="ref-matrix"/>
     <w:p>
       <w:pPr>
         <w:pStyle w:val="Bibliography"/>
@@ -60424,7 +60464,7 @@
       <w:r>
         <w:t xml:space="preserve"> </w:t>
       </w:r>
-      <w:hyperlink r:id="rId435">
+      <w:hyperlink r:id="rId436">
         <w:r>
           <w:rPr>
             <w:rStyle w:val="Hyperlink"/>
@@ -60436,8 +60476,8 @@
         <w:t xml:space="preserve">.</w:t>
       </w:r>
     </w:p>
-    <w:bookmarkEnd w:id="436"/>
-    <w:bookmarkStart w:id="438" w:name="ref-wargames"/>
+    <w:bookmarkEnd w:id="437"/>
+    <w:bookmarkStart w:id="439" w:name="ref-wargames"/>
     <w:p>
       <w:pPr>
         <w:pStyle w:val="Bibliography"/>
@@ -60455,7 +60495,7 @@
       <w:r>
         <w:t xml:space="preserve"> </w:t>
       </w:r>
-      <w:hyperlink r:id="rId437">
+      <w:hyperlink r:id="rId438">
         <w:r>
           <w:rPr>
             <w:rStyle w:val="Hyperlink"/>
@@ -60467,9 +60507,9 @@
         <w:t xml:space="preserve">.</w:t>
       </w:r>
     </w:p>
-    <w:bookmarkEnd w:id="438"/>
     <w:bookmarkEnd w:id="439"/>
     <w:bookmarkEnd w:id="440"/>
+    <w:bookmarkEnd w:id="441"/>
     <w:sectPr>
       <w:footnotePr>
         <w:numRestart w:val="eachSect"/>
@@ -60499,7 +60539,7 @@
       </w:r>
     </w:p>
   </w:footnote>
-  <w:footnote w:id="356">
+  <w:footnote w:id="357">
     <w:p>
       <w:pPr>
         <w:pStyle w:val="FootnoteText"/>

</xml_diff>

<commit_message>
Deploying to gh-pages from @ Morrison-Lab/wai@0d0075442db71e8ae4a9faa667af8b54a2466ed6 🚀
</commit_message>
<xml_diff>
--- a/chapters/coding-agents.docx
+++ b/chapters/coding-agents.docx
@@ -15,7 +15,7 @@
         <w:pStyle w:val="Date"/>
       </w:pPr>
       <w:r>
-        <w:t xml:space="preserve">Last modified: 2026-08-26 23:14:14 (PDT)</w:t>
+        <w:t xml:space="preserve">Last modified: 2026-08-27 00:29:31 (PDT)</w:t>
       </w:r>
     </w:p>
     <w:p>
@@ -33567,7 +33567,7 @@
     </w:p>
     <w:bookmarkEnd w:id="248"/>
     <w:bookmarkEnd w:id="249"/>
-    <w:bookmarkStart w:id="264" w:name="sec-ai-byok-vscode"/>
+    <w:bookmarkStart w:id="267" w:name="sec-ai-byok-vscode"/>
     <w:p>
       <w:pPr>
         <w:pStyle w:val="Heading1"/>
@@ -36160,19 +36160,19 @@
         <w:t xml:space="preserve"> </w:t>
       </w:r>
       <w:r>
-        <w:t xml:space="preserve">for GPT-5.3 Codex</w:t>
-      </w:r>
-      <w:r>
-        <w:t xml:space="preserve"> </w:t>
-      </w:r>
-      <w:r>
-        <w:t xml:space="preserve">and any other endpoint that the current catalog marks as Responses-API-only.</w:t>
-      </w:r>
-      <w:r>
-        <w:t xml:space="preserve"> </w:t>
-      </w:r>
-      <w:r>
-        <w:t xml:space="preserve">Use</w:t>
+        <w:t xml:space="preserve">for any endpoint that the current catalog marks as</w:t>
+      </w:r>
+      <w:r>
+        <w:t xml:space="preserve"> </w:t>
+      </w:r>
+      <w:r>
+        <w:t xml:space="preserve">requiring the Responses API,</w:t>
+      </w:r>
+      <w:r>
+        <w:t xml:space="preserve"> </w:t>
+      </w:r>
+      <w:r>
+        <w:t xml:space="preserve">and</w:t>
       </w:r>
       <w:r>
         <w:t xml:space="preserve"> </w:t>
@@ -36187,7 +36187,31 @@
         <w:t xml:space="preserve"> </w:t>
       </w:r>
       <w:r>
-        <w:t xml:space="preserve">for the other models in the table.</w:t>
+        <w:t xml:space="preserve">for the rest.</w:t>
+      </w:r>
+      <w:r>
+        <w:t xml:space="preserve"> </w:t>
+      </w:r>
+      <w:r>
+        <w:t xml:space="preserve">Checked 2026-08-26,</w:t>
+      </w:r>
+      <w:r>
+        <w:t xml:space="preserve"> </w:t>
+      </w:r>
+      <w:r>
+        <w:t xml:space="preserve">the catalog gives that instruction for GPT-5.5 Pro, GPT-5.5, and GPT-5.3 Codex.</w:t>
+      </w:r>
+      <w:r>
+        <w:t xml:space="preserve"> </w:t>
+      </w:r>
+      <w:r>
+        <w:t xml:space="preserve">Read the catalog rather than the list,</w:t>
+      </w:r>
+      <w:r>
+        <w:t xml:space="preserve"> </w:t>
+      </w:r>
+      <w:r>
+        <w:t xml:space="preserve">since an endpoint can change API mode without any model being added.</w:t>
       </w:r>
       <w:r>
         <w:t xml:space="preserve"> </w:t>
@@ -36262,54 +36286,36 @@
         <w:t xml:space="preserve">after checking their actual quota.</w:t>
       </w:r>
     </w:p>
+    <w:bookmarkEnd w:id="255"/>
+    <w:bookmarkStart w:id="257" w:name="X4ffc414c72f461a5c730b8d4c31add4bb84ada1"/>
+    <w:p>
+      <w:pPr>
+        <w:pStyle w:val="Heading4"/>
+      </w:pPr>
+      <w:r>
+        <w:t xml:space="preserve">Why the context and delay columns move together</w:t>
+      </w:r>
+    </w:p>
+    <w:p>
+      <w:pPr>
+        <w:pStyle w:val="FirstParagraph"/>
+      </w:pPr>
+      <w:r>
+        <w:t xml:space="preserve">The context and delay columns are one setting expressed twice,</w:t>
+      </w:r>
+      <w:r>
+        <w:t xml:space="preserve"> </w:t>
+      </w:r>
+      <w:r>
+        <w:t xml:space="preserve">so changing either alone breaks the pairing.</w:t>
+      </w:r>
+    </w:p>
     <w:p>
       <w:pPr>
         <w:pStyle w:val="BodyText"/>
       </w:pPr>
       <w:r>
-        <w:t xml:space="preserve">The 64,000/16,000 combination limits one prompt to about 48,000 input tokens.</w:t>
-      </w:r>
-      <w:r>
-        <w:t xml:space="preserve"> </w:t>
-      </w:r>
-      <w:r>
-        <w:t xml:space="preserve">Together with 15-second pacing,</w:t>
-      </w:r>
-      <w:r>
-        <w:t xml:space="preserve"> </w:t>
-      </w:r>
-      <w:r>
-        <w:t xml:space="preserve">that keeps one busy client near rather than far above a 200,000 ITPM tier.</w:t>
-      </w:r>
-      <w:r>
-        <w:t xml:space="preserve"> </w:t>
-      </w:r>
-      <w:r>
-        <w:t xml:space="preserve">It is not a guarantee:</w:t>
-      </w:r>
-      <w:r>
-        <w:t xml:space="preserve"> </w:t>
-      </w:r>
-      <w:r>
-        <w:t xml:space="preserve">the quota is shared across the workspace,</w:t>
-      </w:r>
-      <w:r>
-        <w:t xml:space="preserve"> </w:t>
-      </w:r>
-      <w:r>
-        <w:t xml:space="preserve">prompt sizes vary,</w:t>
-      </w:r>
-      <w:r>
-        <w:t xml:space="preserve"> </w:t>
-      </w:r>
-      <w:r>
-        <w:t xml:space="preserve">and concurrent users or clients consume the same allowance.</w:t>
-      </w:r>
-      <w:r>
-        <w:t xml:space="preserve"> </w:t>
-      </w:r>
-      <w:r>
-        <w:t xml:space="preserve">Increase the delay or reduce</w:t>
+        <w:t xml:space="preserve">A workspace admits</w:t>
       </w:r>
       <w:r>
         <w:t xml:space="preserve"> </w:t>
@@ -36318,235 +36324,144 @@
         <w:rPr>
           <w:rStyle w:val="VerbatimChar"/>
         </w:rPr>
+        <w:t xml:space="preserve">ITPM</w:t>
+      </w:r>
+      <w:r>
+        <w:t xml:space="preserve"> </w:t>
+      </w:r>
+      <w:r>
+        <w:t xml:space="preserve">input tokens per minute.</w:t>
+      </w:r>
+      <w:r>
+        <w:t xml:space="preserve"> </w:t>
+      </w:r>
+      <w:r>
+        <w:t xml:space="preserve">The extension advertises</w:t>
+      </w:r>
+      <w:r>
+        <w:t xml:space="preserve"> </w:t>
+      </w:r>
+      <w:r>
+        <w:rPr>
+          <w:rStyle w:val="VerbatimChar"/>
+        </w:rPr>
         <w:t xml:space="preserve">context_length</w:t>
       </w:r>
       <w:r>
         <w:t xml:space="preserve"> </w:t>
       </w:r>
       <w:r>
-        <w:t xml:space="preserve">further when 429s continue.</w:t>
+        <w:t xml:space="preserve">minus</w:t>
+      </w:r>
+      <w:r>
+        <w:t xml:space="preserve"> </w:t>
+      </w:r>
+      <w:r>
+        <w:rPr>
+          <w:rStyle w:val="VerbatimChar"/>
+        </w:rPr>
+        <w:t xml:space="preserve">max_tokens</w:t>
+      </w:r>
+      <w:r>
+        <w:t xml:space="preserve"> </w:t>
+      </w:r>
+      <w:r>
+        <w:t xml:space="preserve">as the model’s input budget,</w:t>
+      </w:r>
+      <w:r>
+        <w:t xml:space="preserve"> </w:t>
+      </w:r>
+      <w:r>
+        <w:t xml:space="preserve">and the delay sets how often a request can be sent.</w:t>
+      </w:r>
+      <w:r>
+        <w:t xml:space="preserve"> </w:t>
+      </w:r>
+      <w:r>
+        <w:t xml:space="preserve">Sustained work therefore needs</w:t>
       </w:r>
     </w:p>
     <w:p>
       <w:pPr>
         <w:pStyle w:val="BodyText"/>
       </w:pPr>
-      <w:r>
-        <w:t xml:space="preserve">Use longer retry spacing than the extension’s one-second default:</w:t>
-      </w:r>
-    </w:p>
-    <w:p>
-      <w:pPr>
-        <w:pStyle w:val="SourceCode"/>
-      </w:pPr>
-      <w:r>
-        <w:rPr>
-          <w:rStyle w:val="StringTok"/>
-        </w:rPr>
-        <w:t xml:space="preserve">"oaicopilot.retry"</w:t>
-      </w:r>
-      <w:r>
-        <w:rPr>
-          <w:rStyle w:val="ErrorTok"/>
-        </w:rPr>
-        <w:t xml:space="preserve">:</w:t>
-      </w:r>
-      <w:r>
-        <w:rPr>
-          <w:rStyle w:val="NormalTok"/>
-        </w:rPr>
-        <w:t xml:space="preserve"> </w:t>
-      </w:r>
-      <w:r>
-        <w:rPr>
-          <w:rStyle w:val="FunctionTok"/>
-        </w:rPr>
-        <w:t xml:space="preserve">{</w:t>
-      </w:r>
-      <w:r>
-        <w:br/>
-      </w:r>
-      <w:r>
-        <w:rPr>
-          <w:rStyle w:val="NormalTok"/>
-        </w:rPr>
-        <w:t xml:space="preserve">  </w:t>
-      </w:r>
-      <w:r>
-        <w:rPr>
-          <w:rStyle w:val="DataTypeTok"/>
-        </w:rPr>
-        <w:t xml:space="preserve">"enabled"</w:t>
-      </w:r>
-      <w:r>
-        <w:rPr>
-          <w:rStyle w:val="FunctionTok"/>
-        </w:rPr>
-        <w:t xml:space="preserve">:</w:t>
-      </w:r>
-      <w:r>
-        <w:rPr>
-          <w:rStyle w:val="NormalTok"/>
-        </w:rPr>
-        <w:t xml:space="preserve"> </w:t>
-      </w:r>
-      <w:r>
-        <w:rPr>
-          <w:rStyle w:val="KeywordTok"/>
-        </w:rPr>
-        <w:t xml:space="preserve">true</w:t>
-      </w:r>
-      <w:r>
-        <w:rPr>
-          <w:rStyle w:val="FunctionTok"/>
-        </w:rPr>
-        <w:t xml:space="preserve">,</w:t>
-      </w:r>
-      <w:r>
-        <w:br/>
-      </w:r>
-      <w:r>
-        <w:rPr>
-          <w:rStyle w:val="NormalTok"/>
-        </w:rPr>
-        <w:t xml:space="preserve">  </w:t>
-      </w:r>
-      <w:r>
-        <w:rPr>
-          <w:rStyle w:val="DataTypeTok"/>
-        </w:rPr>
-        <w:t xml:space="preserve">"max_attempts"</w:t>
-      </w:r>
-      <w:r>
-        <w:rPr>
-          <w:rStyle w:val="FunctionTok"/>
-        </w:rPr>
-        <w:t xml:space="preserve">:</w:t>
-      </w:r>
-      <w:r>
-        <w:rPr>
-          <w:rStyle w:val="NormalTok"/>
-        </w:rPr>
-        <w:t xml:space="preserve"> </w:t>
-      </w:r>
-      <w:r>
-        <w:rPr>
-          <w:rStyle w:val="DecValTok"/>
-        </w:rPr>
-        <w:t xml:space="preserve">3</w:t>
-      </w:r>
-      <w:r>
-        <w:rPr>
-          <w:rStyle w:val="FunctionTok"/>
-        </w:rPr>
-        <w:t xml:space="preserve">,</w:t>
-      </w:r>
-      <w:r>
-        <w:br/>
-      </w:r>
-      <w:r>
-        <w:rPr>
-          <w:rStyle w:val="NormalTok"/>
-        </w:rPr>
-        <w:t xml:space="preserve">  </w:t>
-      </w:r>
-      <w:r>
-        <w:rPr>
-          <w:rStyle w:val="DataTypeTok"/>
-        </w:rPr>
-        <w:t xml:space="preserve">"interval_ms"</w:t>
-      </w:r>
-      <w:r>
-        <w:rPr>
-          <w:rStyle w:val="FunctionTok"/>
-        </w:rPr>
-        <w:t xml:space="preserve">:</w:t>
-      </w:r>
-      <w:r>
-        <w:rPr>
-          <w:rStyle w:val="NormalTok"/>
-        </w:rPr>
-        <w:t xml:space="preserve"> </w:t>
-      </w:r>
-      <w:r>
-        <w:rPr>
-          <w:rStyle w:val="DecValTok"/>
-        </w:rPr>
-        <w:t xml:space="preserve">15000</w:t>
-      </w:r>
-      <w:r>
-        <w:rPr>
-          <w:rStyle w:val="FunctionTok"/>
-        </w:rPr>
-        <w:t xml:space="preserve">,</w:t>
-      </w:r>
-      <w:r>
-        <w:br/>
-      </w:r>
-      <w:r>
-        <w:rPr>
-          <w:rStyle w:val="NormalTok"/>
-        </w:rPr>
-        <w:t xml:space="preserve">  </w:t>
-      </w:r>
-      <w:r>
-        <w:rPr>
-          <w:rStyle w:val="DataTypeTok"/>
-        </w:rPr>
-        <w:t xml:space="preserve">"status_codes"</w:t>
-      </w:r>
-      <w:r>
-        <w:rPr>
-          <w:rStyle w:val="FunctionTok"/>
-        </w:rPr>
-        <w:t xml:space="preserve">:</w:t>
-      </w:r>
-      <w:r>
-        <w:rPr>
-          <w:rStyle w:val="NormalTok"/>
-        </w:rPr>
-        <w:t xml:space="preserve"> </w:t>
-      </w:r>
-      <w:r>
-        <w:rPr>
-          <w:rStyle w:val="OtherTok"/>
-        </w:rPr>
-        <w:t xml:space="preserve">[]</w:t>
-      </w:r>
-      <w:r>
-        <w:br/>
-      </w:r>
-      <w:r>
-        <w:rPr>
-          <w:rStyle w:val="FunctionTok"/>
-        </w:rPr>
-        <w:t xml:space="preserve">}</w:t>
-      </w:r>
+      <m:oMathPara>
+        <m:oMathParaPr>
+          <m:jc m:val="center"/>
+        </m:oMathParaPr>
+        <m:oMath>
+          <m:r>
+            <m:rPr>
+              <m:nor/>
+              <m:sty m:val="p"/>
+            </m:rPr>
+            <m:t>input budget</m:t>
+          </m:r>
+          <m:r>
+            <m:rPr>
+              <m:sty m:val="p"/>
+            </m:rPr>
+            <m:t>×</m:t>
+          </m:r>
+          <m:r>
+            <m:rPr>
+              <m:nor/>
+              <m:sty m:val="p"/>
+            </m:rPr>
+            <m:t>requests per minute</m:t>
+          </m:r>
+          <m:r>
+            <m:rPr>
+              <m:sty m:val="p"/>
+            </m:rPr>
+            <m:t>≤</m:t>
+          </m:r>
+          <m:r>
+            <m:rPr>
+              <m:nor/>
+              <m:sty m:val="p"/>
+            </m:rPr>
+            <m:t>ITPM</m:t>
+          </m:r>
+        </m:oMath>
+      </m:oMathPara>
     </w:p>
     <w:p>
       <w:pPr>
         <w:pStyle w:val="FirstParagraph"/>
       </w:pPr>
       <w:r>
-        <w:t xml:space="preserve">The extension already retries 429 responses</w:t>
-      </w:r>
-      <w:r>
-        <w:t xml:space="preserve"> </w:t>
-      </w:r>
-      <w:r>
-        <w:t xml:space="preserve">and doubles this base interval on successive attempts.</w:t>
-      </w:r>
-      <w:r>
-        <w:t xml:space="preserve"> </w:t>
-      </w:r>
-      <w:r>
-        <w:t xml:space="preserve">The longer starting interval gives Databricks’ sliding token window time to</w:t>
-      </w:r>
-      <w:r>
-        <w:t xml:space="preserve"> </w:t>
-      </w:r>
-      <w:r>
-        <w:t xml:space="preserve">recover.</w:t>
+        <w:t xml:space="preserve">The Claude row is tuned to sit just under that ceiling.</w:t>
+      </w:r>
+      <w:r>
+        <w:t xml:space="preserve"> </w:t>
+      </w:r>
+      <w:r>
+        <w:t xml:space="preserve">A 15,000 ms delay allows four requests per minute,</w:t>
+      </w:r>
+      <w:r>
+        <w:t xml:space="preserve"> </w:t>
+      </w:r>
+      <w:r>
+        <w:t xml:space="preserve">and each request carries the 48,000-token input budget derived above,</w:t>
+      </w:r>
+      <w:r>
+        <w:t xml:space="preserve"> </w:t>
+      </w:r>
+      <w:r>
+        <w:t xml:space="preserve">so a busy client draws about 192,000 against a 200,000 ITPM tier.</w:t>
+      </w:r>
+      <w:r>
+        <w:t xml:space="preserve"> </w:t>
+      </w:r>
+      <w:r>
+        <w:t xml:space="preserve">That is roughly 96 percent of the allowance,</w:t>
+      </w:r>
+      <w:r>
+        <w:t xml:space="preserve"> </w:t>
+      </w:r>
+      <w:r>
+        <w:t xml:space="preserve">which is why the 64,000 value looks conservative and is not.</w:t>
       </w:r>
     </w:p>
     <w:p>
@@ -36554,7 +36469,13 @@
         <w:pStyle w:val="BodyText"/>
       </w:pPr>
       <w:r>
-        <w:t xml:space="preserve">For GPT-5 and GPT OSS models,</w:t>
+        <w:t xml:space="preserve">This is what makes a larger window expensive.</w:t>
+      </w:r>
+      <w:r>
+        <w:t xml:space="preserve"> </w:t>
+      </w:r>
+      <w:r>
+        <w:t xml:space="preserve">Raising</w:t>
       </w:r>
       <w:r>
         <w:t xml:space="preserve"> </w:t>
@@ -36563,135 +36484,394 @@
         <w:rPr>
           <w:rStyle w:val="VerbatimChar"/>
         </w:rPr>
-        <w:t xml:space="preserve">reasoning_effort</w:t>
-      </w:r>
-      <w:r>
-        <w:t xml:space="preserve"> </w:t>
-      </w:r>
-      <w:r>
-        <w:t xml:space="preserve">adds a selector to the Copilot model configuration</w:t>
-      </w:r>
-      <w:r>
-        <w:t xml:space="preserve"> </w:t>
-      </w:r>
-      <w:r>
-        <w:t xml:space="preserve">and is forwarded to Databricks.</w:t>
-      </w:r>
-      <w:r>
-        <w:t xml:space="preserve"> </w:t>
-      </w:r>
-      <w:r>
-        <w:t xml:space="preserve">Start with</w:t>
-      </w:r>
-      <w:r>
-        <w:t xml:space="preserve"> </w:t>
-      </w:r>
-      <w:r>
-        <w:rPr>
-          <w:rStyle w:val="VerbatimChar"/>
-        </w:rPr>
-        <w:t xml:space="preserve">medium</w:t>
-      </w:r>
-      <w:r>
-        <w:t xml:space="preserve"> </w:t>
-      </w:r>
-      <w:r>
-        <w:t xml:space="preserve">for general work</w:t>
-      </w:r>
-      <w:r>
-        <w:t xml:space="preserve"> </w:t>
-      </w:r>
-      <w:r>
-        <w:t xml:space="preserve">and</w:t>
-      </w:r>
-      <w:r>
-        <w:t xml:space="preserve"> </w:t>
-      </w:r>
-      <w:r>
-        <w:rPr>
-          <w:rStyle w:val="VerbatimChar"/>
-        </w:rPr>
-        <w:t xml:space="preserve">high</w:t>
-      </w:r>
-      <w:r>
-        <w:t xml:space="preserve"> </w:t>
-      </w:r>
-      <w:r>
-        <w:t xml:space="preserve">for Codex or difficult agentic tasks.</w:t>
-      </w:r>
-      <w:r>
-        <w:t xml:space="preserve"> </w:t>
-      </w:r>
-      <w:r>
-        <w:t xml:space="preserve">Claude and Gemini 2.5 use provider-specific thinking controls;</w:t>
-      </w:r>
-      <w:r>
-        <w:t xml:space="preserve"> </w:t>
-      </w:r>
-      <w:r>
-        <w:t xml:space="preserve">do not copy</w:t>
-      </w:r>
-      <w:r>
-        <w:t xml:space="preserve"> </w:t>
-      </w:r>
-      <w:r>
-        <w:rPr>
-          <w:rStyle w:val="VerbatimChar"/>
-        </w:rPr>
-        <w:t xml:space="preserve">reasoning_effort</w:t>
-      </w:r>
-      <w:r>
-        <w:t xml:space="preserve"> </w:t>
-      </w:r>
-      <w:r>
-        <w:t xml:space="preserve">onto those entries.</w:t>
-      </w:r>
-    </w:p>
+        <w:t xml:space="preserve">context_length</w:t>
+      </w:r>
+      <w:r>
+        <w:t xml:space="preserve"> </w:t>
+      </w:r>
+      <w:r>
+        <w:t xml:space="preserve">while leaving the delay alone</w:t>
+      </w:r>
+      <w:r>
+        <w:t xml:space="preserve"> </w:t>
+      </w:r>
+      <w:r>
+        <w:t xml:space="preserve">multiplies straight through the inequality above.</w:t>
+      </w:r>
+      <w:r>
+        <w:t xml:space="preserve"> </w:t>
+      </w:r>
+      <w:hyperlink w:anchor="tbl-databricks-itpm-pacing">
+        <w:r>
+          <w:rPr>
+            <w:rStyle w:val="Hyperlink"/>
+          </w:rPr>
+          <w:t xml:space="preserve">Table 4</w:t>
+        </w:r>
+      </w:hyperlink>
+      <w:r>
+        <w:t xml:space="preserve"> </w:t>
+      </w:r>
+      <w:r>
+        <w:t xml:space="preserve">gives the largest input budget each tier sustains</w:t>
+      </w:r>
+      <w:r>
+        <w:t xml:space="preserve"> </w:t>
+      </w:r>
+      <w:r>
+        <w:t xml:space="preserve">at a given pace.</w:t>
+      </w:r>
+    </w:p>
+    <w:tbl>
+      <w:tblPr>
+        <w:tblStyle w:val="Table"/>
+        <w:tblW w:type="pct" w:w="5000"/>
+        <w:tblLayout w:type="fixed"/>
+        <w:tblLook w:firstRow="0" w:lastRow="0" w:firstColumn="0" w:lastColumn="0" w:noHBand="0" w:noVBand="0" w:val="0000"/>
+      </w:tblPr>
+      <w:tblGrid>
+        <w:gridCol w:w="7920"/>
+      </w:tblGrid>
+      <w:tr>
+        <w:tc>
+          <w:tcPr/>
+          <w:bookmarkStart w:id="256" w:name="tbl-databricks-itpm-pacing"/>
+          <w:p>
+            <w:pPr>
+              <w:jc w:val="center"/>
+            </w:pPr>
+            <w:pPr>
+              <w:jc w:val="left"/>
+              <w:spacing w:before="200"/>
+              <w:pStyle w:val="ImageCaption"/>
+            </w:pPr>
+            <w:r>
+              <w:t xml:space="preserve">Table 4: Largest sustainable input budget by tier and pacing</w:t>
+            </w:r>
+          </w:p>
+          <w:tbl>
+            <w:tblPr>
+              <w:tblStyle w:val="Table"/>
+              <w:tblW w:type="auto" w:w="0"/>
+              <w:tblLook w:firstRow="1" w:lastRow="0" w:firstColumn="0" w:lastColumn="0" w:noHBand="0" w:noVBand="0" w:val="0020"/>
+            </w:tblPr>
+            <w:tblGrid>
+              <w:gridCol w:w="1980"/>
+              <w:gridCol w:w="1980"/>
+              <w:gridCol w:w="1980"/>
+              <w:gridCol w:w="1980"/>
+            </w:tblGrid>
+            <w:tr>
+              <w:trPr>
+                <w:tblHeader w:val="on"/>
+              </w:trPr>
+              <w:tc>
+                <w:tcPr/>
+                <w:p>
+                  <w:pPr>
+                    <w:pStyle w:val="Compact"/>
+                    <w:jc w:val="center"/>
+                  </w:pPr>
+                  <w:r>
+                    <w:t xml:space="preserve">Workspace ITPM</w:t>
+                  </w:r>
+                </w:p>
+              </w:tc>
+              <w:tc>
+                <w:tcPr/>
+                <w:p>
+                  <w:pPr>
+                    <w:pStyle w:val="Compact"/>
+                    <w:jc w:val="right"/>
+                    <w:jc w:val="center"/>
+                  </w:pPr>
+                  <w:r>
+                    <w:t xml:space="preserve">15 s (4/min)</w:t>
+                  </w:r>
+                </w:p>
+              </w:tc>
+              <w:tc>
+                <w:tcPr/>
+                <w:p>
+                  <w:pPr>
+                    <w:pStyle w:val="Compact"/>
+                    <w:jc w:val="right"/>
+                    <w:jc w:val="center"/>
+                  </w:pPr>
+                  <w:r>
+                    <w:t xml:space="preserve">30 s (2/min)</w:t>
+                  </w:r>
+                </w:p>
+              </w:tc>
+              <w:tc>
+                <w:tcPr/>
+                <w:p>
+                  <w:pPr>
+                    <w:pStyle w:val="Compact"/>
+                    <w:jc w:val="right"/>
+                    <w:jc w:val="center"/>
+                  </w:pPr>
+                  <w:r>
+                    <w:t xml:space="preserve">60 s (1/min)</w:t>
+                  </w:r>
+                </w:p>
+              </w:tc>
+            </w:tr>
+            <w:tr>
+              <w:tc>
+                <w:tcPr/>
+                <w:p>
+                  <w:pPr>
+                    <w:pStyle w:val="Compact"/>
+                    <w:jc w:val="center"/>
+                  </w:pPr>
+                  <w:r>
+                    <w:t xml:space="preserve">200,000</w:t>
+                  </w:r>
+                </w:p>
+              </w:tc>
+              <w:tc>
+                <w:tcPr/>
+                <w:p>
+                  <w:pPr>
+                    <w:pStyle w:val="Compact"/>
+                    <w:jc w:val="right"/>
+                    <w:jc w:val="center"/>
+                  </w:pPr>
+                  <w:r>
+                    <w:t xml:space="preserve">50,000</w:t>
+                  </w:r>
+                </w:p>
+              </w:tc>
+              <w:tc>
+                <w:tcPr/>
+                <w:p>
+                  <w:pPr>
+                    <w:pStyle w:val="Compact"/>
+                    <w:jc w:val="right"/>
+                    <w:jc w:val="center"/>
+                  </w:pPr>
+                  <w:r>
+                    <w:t xml:space="preserve">100,000</w:t>
+                  </w:r>
+                </w:p>
+              </w:tc>
+              <w:tc>
+                <w:tcPr/>
+                <w:p>
+                  <w:pPr>
+                    <w:pStyle w:val="Compact"/>
+                    <w:jc w:val="right"/>
+                    <w:jc w:val="center"/>
+                  </w:pPr>
+                  <w:r>
+                    <w:t xml:space="preserve">200,000</w:t>
+                  </w:r>
+                </w:p>
+              </w:tc>
+            </w:tr>
+            <w:tr>
+              <w:tc>
+                <w:tcPr/>
+                <w:p>
+                  <w:pPr>
+                    <w:pStyle w:val="Compact"/>
+                    <w:jc w:val="center"/>
+                  </w:pPr>
+                  <w:r>
+                    <w:t xml:space="preserve">1,000,000</w:t>
+                  </w:r>
+                </w:p>
+              </w:tc>
+              <w:tc>
+                <w:tcPr/>
+                <w:p>
+                  <w:pPr>
+                    <w:pStyle w:val="Compact"/>
+                    <w:jc w:val="right"/>
+                    <w:jc w:val="center"/>
+                  </w:pPr>
+                  <w:r>
+                    <w:t xml:space="preserve">250,000</w:t>
+                  </w:r>
+                </w:p>
+              </w:tc>
+              <w:tc>
+                <w:tcPr/>
+                <w:p>
+                  <w:pPr>
+                    <w:pStyle w:val="Compact"/>
+                    <w:jc w:val="right"/>
+                    <w:jc w:val="center"/>
+                  </w:pPr>
+                  <w:r>
+                    <w:t xml:space="preserve">500,000</w:t>
+                  </w:r>
+                </w:p>
+              </w:tc>
+              <w:tc>
+                <w:tcPr/>
+                <w:p>
+                  <w:pPr>
+                    <w:pStyle w:val="Compact"/>
+                    <w:jc w:val="right"/>
+                    <w:jc w:val="center"/>
+                  </w:pPr>
+                  <w:r>
+                    <w:t xml:space="preserve">1,000,000</w:t>
+                  </w:r>
+                </w:p>
+              </w:tc>
+            </w:tr>
+            <w:tr>
+              <w:tc>
+                <w:tcPr/>
+                <w:p>
+                  <w:pPr>
+                    <w:pStyle w:val="Compact"/>
+                    <w:jc w:val="center"/>
+                  </w:pPr>
+                  <w:r>
+                    <w:t xml:space="preserve">2,000,000</w:t>
+                  </w:r>
+                </w:p>
+              </w:tc>
+              <w:tc>
+                <w:tcPr/>
+                <w:p>
+                  <w:pPr>
+                    <w:pStyle w:val="Compact"/>
+                    <w:jc w:val="right"/>
+                    <w:jc w:val="center"/>
+                  </w:pPr>
+                  <w:r>
+                    <w:t xml:space="preserve">500,000</w:t>
+                  </w:r>
+                </w:p>
+              </w:tc>
+              <w:tc>
+                <w:tcPr/>
+                <w:p>
+                  <w:pPr>
+                    <w:pStyle w:val="Compact"/>
+                    <w:jc w:val="right"/>
+                    <w:jc w:val="center"/>
+                  </w:pPr>
+                  <w:r>
+                    <w:t xml:space="preserve">1,000,000</w:t>
+                  </w:r>
+                </w:p>
+              </w:tc>
+              <w:tc>
+                <w:tcPr/>
+                <w:p>
+                  <w:pPr>
+                    <w:pStyle w:val="Compact"/>
+                    <w:jc w:val="right"/>
+                    <w:jc w:val="center"/>
+                  </w:pPr>
+                  <w:r>
+                    <w:t xml:space="preserve">2,000,000</w:t>
+                  </w:r>
+                </w:p>
+              </w:tc>
+            </w:tr>
+          </w:tbl>
+          <w:bookmarkEnd w:id="256"/>
+          <w:p/>
+        </w:tc>
+      </w:tr>
+    </w:tbl>
     <w:p>
       <w:pPr>
         <w:pStyle w:val="BodyText"/>
       </w:pPr>
       <w:r>
-        <w:t xml:space="preserve">Databricks retires model endpoints over time.</w:t>
-      </w:r>
-      <w:r>
-        <w:t xml:space="preserve"> </w:t>
-      </w:r>
-      <w:r>
-        <w:t xml:space="preserve">Before sharing or troubleshooting a configuration,</w:t>
-      </w:r>
-      <w:r>
-        <w:t xml:space="preserve"> </w:t>
-      </w:r>
-      <w:r>
-        <w:t xml:space="preserve">compare every</w:t>
-      </w:r>
-      <w:r>
-        <w:t xml:space="preserve"> </w:t>
-      </w:r>
-      <w:r>
-        <w:rPr>
-          <w:rStyle w:val="VerbatimChar"/>
-        </w:rPr>
-        <w:t xml:space="preserve">id</w:t>
-      </w:r>
-      <w:r>
-        <w:t xml:space="preserve"> </w:t>
-      </w:r>
-      <w:r>
-        <w:t xml:space="preserve">with the current model catalog</w:t>
-      </w:r>
-      <w:r>
-        <w:t xml:space="preserve"> </w:t>
-      </w:r>
-      <w:r>
-        <w:t xml:space="preserve">and remove entries that are no longer listed.</w:t>
-      </w:r>
-      <w:r>
-        <w:t xml:space="preserve"> </w:t>
-      </w:r>
-      <w:r>
-        <w:t xml:space="preserve">An accurate local entry cannot make a retired endpoint work.</w:t>
+        <w:t xml:space="preserve">A model’s own maximum window is a separate quantity from either column,</w:t>
+      </w:r>
+      <w:r>
+        <w:t xml:space="preserve"> </w:t>
+      </w:r>
+      <w:r>
+        <w:t xml:space="preserve">and it is usually far larger.</w:t>
+      </w:r>
+      <w:r>
+        <w:t xml:space="preserve"> </w:t>
+      </w:r>
+      <w:r>
+        <w:t xml:space="preserve">Registering it directly is the common mistake.</w:t>
+      </w:r>
+      <w:r>
+        <w:t xml:space="preserve"> </w:t>
+      </w:r>
+      <w:r>
+        <w:t xml:space="preserve">Advertising a 1,000,000-token window on a 200,000 ITPM tier</w:t>
+      </w:r>
+      <w:r>
+        <w:t xml:space="preserve"> </w:t>
+      </w:r>
+      <w:r>
+        <w:t xml:space="preserve">offers a single prompt of 984,000 input tokens,</w:t>
+      </w:r>
+      <w:r>
+        <w:t xml:space="preserve"> </w:t>
+      </w:r>
+      <w:r>
+        <w:t xml:space="preserve">which is 4.9 times the entire per-minute allowance,</w:t>
+      </w:r>
+      <w:r>
+        <w:t xml:space="preserve"> </w:t>
+      </w:r>
+      <w:r>
+        <w:t xml:space="preserve">so two full prompts would need about 295 seconds between them.</w:t>
+      </w:r>
+      <w:r>
+        <w:t xml:space="preserve"> </w:t>
+      </w:r>
+      <w:r>
+        <w:t xml:space="preserve">The window is a real capability of the model</w:t>
+      </w:r>
+      <w:r>
+        <w:t xml:space="preserve"> </w:t>
+      </w:r>
+      <w:r>
+        <w:t xml:space="preserve">and it is not available at that quota.</w:t>
+      </w:r>
+    </w:p>
+    <w:bookmarkEnd w:id="257"/>
+    <w:bookmarkStart w:id="258" w:name="choosing-a-model-for-agent-mode"/>
+    <w:p>
+      <w:pPr>
+        <w:pStyle w:val="Heading4"/>
+      </w:pPr>
+      <w:r>
+        <w:t xml:space="preserve">Choosing a model for agent mode</w:t>
+      </w:r>
+    </w:p>
+    <w:p>
+      <w:pPr>
+        <w:pStyle w:val="FirstParagraph"/>
+      </w:pPr>
+      <w:r>
+        <w:t xml:space="preserve">Agent mode spends the input budget faster than chat does,</w:t>
+      </w:r>
+      <w:r>
+        <w:t xml:space="preserve"> </w:t>
+      </w:r>
+      <w:r>
+        <w:t xml:space="preserve">because tool definitions and file contents are sent before any conversation.</w:t>
+      </w:r>
+      <w:r>
+        <w:t xml:space="preserve"> </w:t>
+      </w:r>
+      <w:r>
+        <w:t xml:space="preserve">Two configurations are possible,</w:t>
+      </w:r>
+      <w:r>
+        <w:t xml:space="preserve"> </w:t>
+      </w:r>
+      <w:r>
+        <w:t xml:space="preserve">and the tier decides which one is open.</w:t>
       </w:r>
     </w:p>
     <w:p>
@@ -36699,58 +36879,139 @@
         <w:pStyle w:val="BodyText"/>
       </w:pPr>
       <w:r>
-        <w:t xml:space="preserve">An individual endpoint page may also carry a banner reading</w:t>
-      </w:r>
-      <w:r>
-        <w:t xml:space="preserve"> </w:t>
-      </w:r>
-      <w:r>
-        <w:t xml:space="preserve">“This serving endpoint is deprecated.</w:t>
-      </w:r>
-      <w:r>
-        <w:t xml:space="preserve"> </w:t>
-      </w:r>
-      <w:r>
-        <w:t xml:space="preserve">Foundation models are now managed in Unity AI Gateway.”</w:t>
-      </w:r>
-      <w:r>
-        <w:t xml:space="preserve"> </w:t>
-      </w:r>
-      <w:r>
-        <w:t xml:space="preserve">That is a statement about where Databricks intends to manage these models,</w:t>
-      </w:r>
-      <w:r>
-        <w:t xml:space="preserve"> </w:t>
-      </w:r>
-      <w:r>
-        <w:t xml:space="preserve">not an outage:</w:t>
-      </w:r>
-      <w:r>
-        <w:t xml:space="preserve"> </w:t>
-      </w:r>
-      <w:r>
-        <w:t xml:space="preserve">the</w:t>
-      </w:r>
-      <w:r>
-        <w:t xml:space="preserve"> </w:t>
-      </w:r>
-      <w:r>
-        <w:rPr>
-          <w:rStyle w:val="VerbatimChar"/>
-        </w:rPr>
-        <w:t xml:space="preserve">/serving-endpoints</w:t>
-      </w:r>
-      <w:r>
-        <w:t xml:space="preserve"> </w:t>
-      </w:r>
-      <w:r>
-        <w:t xml:space="preserve">path keeps serving while the banner is up.</w:t>
-      </w:r>
-      <w:r>
-        <w:t xml:space="preserve"> </w:t>
-      </w:r>
-      <w:r>
-        <w:t xml:space="preserve">Unity AI Gateway’s</w:t>
+        <w:t xml:space="preserve">On a 200,000 ITPM tier the budget can be spent on a large window</w:t>
+      </w:r>
+      <w:r>
+        <w:t xml:space="preserve"> </w:t>
+      </w:r>
+      <w:r>
+        <w:t xml:space="preserve">or on frequent turns, and not on both.</w:t>
+      </w:r>
+      <w:r>
+        <w:t xml:space="preserve"> </w:t>
+      </w:r>
+      <w:r>
+        <w:t xml:space="preserve">Doubling the window means halving the pace,</w:t>
+      </w:r>
+      <w:r>
+        <w:t xml:space="preserve"> </w:t>
+      </w:r>
+      <w:r>
+        <w:t xml:space="preserve">so an agent that reads several files per turn slows to a crawl</w:t>
+      </w:r>
+      <w:r>
+        <w:t xml:space="preserve"> </w:t>
+      </w:r>
+      <w:r>
+        <w:t xml:space="preserve">exactly when it is doing the most work.</w:t>
+      </w:r>
+    </w:p>
+    <w:p>
+      <w:pPr>
+        <w:pStyle w:val="BodyText"/>
+      </w:pPr>
+      <w:r>
+        <w:t xml:space="preserve">The higher tiers change the answer rather than easing it.</w:t>
+      </w:r>
+      <w:r>
+        <w:t xml:space="preserve"> </w:t>
+      </w:r>
+      <w:r>
+        <w:t xml:space="preserve">GPT-5.6 Sol, Terra, and Luna sit on a 2,000,000 ITPM tier,</w:t>
+      </w:r>
+      <w:r>
+        <w:t xml:space="preserve"> </w:t>
+      </w:r>
+      <w:r>
+        <w:t xml:space="preserve">ten times the Claude and Gemini families,</w:t>
+      </w:r>
+      <w:r>
+        <w:t xml:space="preserve"> </w:t>
+      </w:r>
+      <w:r>
+        <w:t xml:space="preserve">and carry a 400,000 context with no delay.</w:t>
+      </w:r>
+      <w:r>
+        <w:t xml:space="preserve"> </w:t>
+      </w:r>
+      <w:r>
+        <w:t xml:space="preserve">That is 384,000 input tokens at roughly five requests per minute:</w:t>
+      </w:r>
+      <w:r>
+        <w:t xml:space="preserve"> </w:t>
+      </w:r>
+      <w:r>
+        <w:t xml:space="preserve">eight times the Claude window and faster turns at the same time.</w:t>
+      </w:r>
+      <w:r>
+        <w:t xml:space="preserve"> </w:t>
+      </w:r>
+      <w:r>
+        <w:t xml:space="preserve">Prefer that family for agent work on a standard pay-per-token workspace,</w:t>
+      </w:r>
+      <w:r>
+        <w:t xml:space="preserve"> </w:t>
+      </w:r>
+      <w:r>
+        <w:t xml:space="preserve">and keep the 200,000 ITPM families for chat.</w:t>
+      </w:r>
+    </w:p>
+    <w:p>
+      <w:pPr>
+        <w:pStyle w:val="BodyText"/>
+      </w:pPr>
+      <w:r>
+        <w:t xml:space="preserve">Note the direction of the trade,</w:t>
+      </w:r>
+      <w:r>
+        <w:t xml:space="preserve"> </w:t>
+      </w:r>
+      <w:r>
+        <w:t xml:space="preserve">which is the opposite of the intuition.</w:t>
+      </w:r>
+      <w:r>
+        <w:t xml:space="preserve"> </w:t>
+      </w:r>
+      <w:r>
+        <w:t xml:space="preserve">Within one tier a smaller window buys more turns per minute,</w:t>
+      </w:r>
+      <w:r>
+        <w:t xml:space="preserve"> </w:t>
+      </w:r>
+      <w:r>
+        <w:t xml:space="preserve">so the fastest agent configuration is rarely the widest one.</w:t>
+      </w:r>
+    </w:p>
+    <w:p>
+      <w:pPr>
+        <w:pStyle w:val="BodyText"/>
+      </w:pPr>
+      <w:r>
+        <w:t xml:space="preserve">Measure before tuning either column.</w:t>
+      </w:r>
+      <w:r>
+        <w:t xml:space="preserve"> </w:t>
+      </w:r>
+      <w:r>
+        <w:t xml:space="preserve">VS Code’s status bar reports tokens used against the advertised window for the</w:t>
+      </w:r>
+      <w:r>
+        <w:t xml:space="preserve"> </w:t>
+      </w:r>
+      <w:r>
+        <w:t xml:space="preserve">current chat,</w:t>
+      </w:r>
+      <w:r>
+        <w:t xml:space="preserve"> </w:t>
+      </w:r>
+      <w:r>
+        <w:t xml:space="preserve">which is the only reading that reflects what a client actually sends.</w:t>
+      </w:r>
+      <w:r>
+        <w:t xml:space="preserve"> </w:t>
+      </w:r>
+      <w:r>
+        <w:t xml:space="preserve">Read it in a</w:t>
       </w:r>
       <w:r>
         <w:t xml:space="preserve"> </w:t>
@@ -36760,13 +37021,510 @@
           <w:b/>
           <w:bCs/>
         </w:rPr>
-        <w:t xml:space="preserve">LLMs</w:t>
+        <w:t xml:space="preserve">new</w:t>
+      </w:r>
+      <w:r>
+        <w:t xml:space="preserve"> </w:t>
+      </w:r>
+      <w:r>
+        <w:t xml:space="preserve">chat,</w:t>
+      </w:r>
+      <w:r>
+        <w:t xml:space="preserve"> </w:t>
+      </w:r>
+      <w:r>
+        <w:t xml:space="preserve">since an existing one keeps the context metadata it was created with.</w:t>
+      </w:r>
+    </w:p>
+    <w:p>
+      <w:pPr>
+        <w:pStyle w:val="BodyText"/>
+      </w:pPr>
+      <w:r>
+        <w:t xml:space="preserve">The 64,000/16,000 combination limits one prompt to about 48,000 input tokens.</w:t>
+      </w:r>
+      <w:r>
+        <w:t xml:space="preserve"> </w:t>
+      </w:r>
+      <w:r>
+        <w:t xml:space="preserve">Together with 15-second pacing,</w:t>
+      </w:r>
+      <w:r>
+        <w:t xml:space="preserve"> </w:t>
+      </w:r>
+      <w:r>
+        <w:t xml:space="preserve">that keeps one busy client near rather than far above a 200,000 ITPM tier.</w:t>
+      </w:r>
+      <w:r>
+        <w:t xml:space="preserve"> </w:t>
+      </w:r>
+      <w:r>
+        <w:t xml:space="preserve">It is not a guarantee:</w:t>
+      </w:r>
+      <w:r>
+        <w:t xml:space="preserve"> </w:t>
+      </w:r>
+      <w:r>
+        <w:t xml:space="preserve">the quota is shared across the workspace,</w:t>
+      </w:r>
+      <w:r>
+        <w:t xml:space="preserve"> </w:t>
+      </w:r>
+      <w:r>
+        <w:t xml:space="preserve">prompt sizes vary,</w:t>
+      </w:r>
+      <w:r>
+        <w:t xml:space="preserve"> </w:t>
+      </w:r>
+      <w:r>
+        <w:t xml:space="preserve">and concurrent users or clients consume the same allowance.</w:t>
+      </w:r>
+      <w:r>
+        <w:t xml:space="preserve"> </w:t>
+      </w:r>
+      <w:r>
+        <w:t xml:space="preserve">Increase the delay or reduce</w:t>
+      </w:r>
+      <w:r>
+        <w:t xml:space="preserve"> </w:t>
+      </w:r>
+      <w:r>
+        <w:rPr>
+          <w:rStyle w:val="VerbatimChar"/>
+        </w:rPr>
+        <w:t xml:space="preserve">context_length</w:t>
+      </w:r>
+      <w:r>
+        <w:t xml:space="preserve"> </w:t>
+      </w:r>
+      <w:r>
+        <w:t xml:space="preserve">further when 429s continue.</w:t>
+      </w:r>
+    </w:p>
+    <w:p>
+      <w:pPr>
+        <w:pStyle w:val="BodyText"/>
+      </w:pPr>
+      <w:r>
+        <w:t xml:space="preserve">Use longer retry spacing than the extension’s one-second default:</w:t>
+      </w:r>
+    </w:p>
+    <w:p>
+      <w:pPr>
+        <w:pStyle w:val="SourceCode"/>
+      </w:pPr>
+      <w:r>
+        <w:rPr>
+          <w:rStyle w:val="StringTok"/>
+        </w:rPr>
+        <w:t xml:space="preserve">"oaicopilot.retry"</w:t>
+      </w:r>
+      <w:r>
+        <w:rPr>
+          <w:rStyle w:val="ErrorTok"/>
+        </w:rPr>
+        <w:t xml:space="preserve">:</w:t>
+      </w:r>
+      <w:r>
+        <w:rPr>
+          <w:rStyle w:val="NormalTok"/>
+        </w:rPr>
+        <w:t xml:space="preserve"> </w:t>
+      </w:r>
+      <w:r>
+        <w:rPr>
+          <w:rStyle w:val="FunctionTok"/>
+        </w:rPr>
+        <w:t xml:space="preserve">{</w:t>
+      </w:r>
+      <w:r>
+        <w:br/>
+      </w:r>
+      <w:r>
+        <w:rPr>
+          <w:rStyle w:val="NormalTok"/>
+        </w:rPr>
+        <w:t xml:space="preserve">  </w:t>
+      </w:r>
+      <w:r>
+        <w:rPr>
+          <w:rStyle w:val="DataTypeTok"/>
+        </w:rPr>
+        <w:t xml:space="preserve">"enabled"</w:t>
+      </w:r>
+      <w:r>
+        <w:rPr>
+          <w:rStyle w:val="FunctionTok"/>
+        </w:rPr>
+        <w:t xml:space="preserve">:</w:t>
+      </w:r>
+      <w:r>
+        <w:rPr>
+          <w:rStyle w:val="NormalTok"/>
+        </w:rPr>
+        <w:t xml:space="preserve"> </w:t>
+      </w:r>
+      <w:r>
+        <w:rPr>
+          <w:rStyle w:val="KeywordTok"/>
+        </w:rPr>
+        <w:t xml:space="preserve">true</w:t>
+      </w:r>
+      <w:r>
+        <w:rPr>
+          <w:rStyle w:val="FunctionTok"/>
+        </w:rPr>
+        <w:t xml:space="preserve">,</w:t>
+      </w:r>
+      <w:r>
+        <w:br/>
+      </w:r>
+      <w:r>
+        <w:rPr>
+          <w:rStyle w:val="NormalTok"/>
+        </w:rPr>
+        <w:t xml:space="preserve">  </w:t>
+      </w:r>
+      <w:r>
+        <w:rPr>
+          <w:rStyle w:val="DataTypeTok"/>
+        </w:rPr>
+        <w:t xml:space="preserve">"max_attempts"</w:t>
+      </w:r>
+      <w:r>
+        <w:rPr>
+          <w:rStyle w:val="FunctionTok"/>
+        </w:rPr>
+        <w:t xml:space="preserve">:</w:t>
+      </w:r>
+      <w:r>
+        <w:rPr>
+          <w:rStyle w:val="NormalTok"/>
+        </w:rPr>
+        <w:t xml:space="preserve"> </w:t>
+      </w:r>
+      <w:r>
+        <w:rPr>
+          <w:rStyle w:val="DecValTok"/>
+        </w:rPr>
+        <w:t xml:space="preserve">3</w:t>
+      </w:r>
+      <w:r>
+        <w:rPr>
+          <w:rStyle w:val="FunctionTok"/>
+        </w:rPr>
+        <w:t xml:space="preserve">,</w:t>
+      </w:r>
+      <w:r>
+        <w:br/>
+      </w:r>
+      <w:r>
+        <w:rPr>
+          <w:rStyle w:val="NormalTok"/>
+        </w:rPr>
+        <w:t xml:space="preserve">  </w:t>
+      </w:r>
+      <w:r>
+        <w:rPr>
+          <w:rStyle w:val="DataTypeTok"/>
+        </w:rPr>
+        <w:t xml:space="preserve">"interval_ms"</w:t>
+      </w:r>
+      <w:r>
+        <w:rPr>
+          <w:rStyle w:val="FunctionTok"/>
+        </w:rPr>
+        <w:t xml:space="preserve">:</w:t>
+      </w:r>
+      <w:r>
+        <w:rPr>
+          <w:rStyle w:val="NormalTok"/>
+        </w:rPr>
+        <w:t xml:space="preserve"> </w:t>
+      </w:r>
+      <w:r>
+        <w:rPr>
+          <w:rStyle w:val="DecValTok"/>
+        </w:rPr>
+        <w:t xml:space="preserve">15000</w:t>
+      </w:r>
+      <w:r>
+        <w:rPr>
+          <w:rStyle w:val="FunctionTok"/>
+        </w:rPr>
+        <w:t xml:space="preserve">,</w:t>
+      </w:r>
+      <w:r>
+        <w:br/>
+      </w:r>
+      <w:r>
+        <w:rPr>
+          <w:rStyle w:val="NormalTok"/>
+        </w:rPr>
+        <w:t xml:space="preserve">  </w:t>
+      </w:r>
+      <w:r>
+        <w:rPr>
+          <w:rStyle w:val="DataTypeTok"/>
+        </w:rPr>
+        <w:t xml:space="preserve">"status_codes"</w:t>
+      </w:r>
+      <w:r>
+        <w:rPr>
+          <w:rStyle w:val="FunctionTok"/>
+        </w:rPr>
+        <w:t xml:space="preserve">:</w:t>
+      </w:r>
+      <w:r>
+        <w:rPr>
+          <w:rStyle w:val="NormalTok"/>
+        </w:rPr>
+        <w:t xml:space="preserve"> </w:t>
+      </w:r>
+      <w:r>
+        <w:rPr>
+          <w:rStyle w:val="OtherTok"/>
+        </w:rPr>
+        <w:t xml:space="preserve">[]</w:t>
+      </w:r>
+      <w:r>
+        <w:br/>
+      </w:r>
+      <w:r>
+        <w:rPr>
+          <w:rStyle w:val="FunctionTok"/>
+        </w:rPr>
+        <w:t xml:space="preserve">}</w:t>
+      </w:r>
+    </w:p>
+    <w:p>
+      <w:pPr>
+        <w:pStyle w:val="FirstParagraph"/>
+      </w:pPr>
+      <w:r>
+        <w:t xml:space="preserve">The extension already retries 429 responses</w:t>
+      </w:r>
+      <w:r>
+        <w:t xml:space="preserve"> </w:t>
+      </w:r>
+      <w:r>
+        <w:t xml:space="preserve">and doubles this base interval on successive attempts.</w:t>
+      </w:r>
+      <w:r>
+        <w:t xml:space="preserve"> </w:t>
+      </w:r>
+      <w:r>
+        <w:t xml:space="preserve">The longer starting interval gives Databricks’ sliding token window time to</w:t>
+      </w:r>
+      <w:r>
+        <w:t xml:space="preserve"> </w:t>
+      </w:r>
+      <w:r>
+        <w:t xml:space="preserve">recover.</w:t>
+      </w:r>
+    </w:p>
+    <w:p>
+      <w:pPr>
+        <w:pStyle w:val="BodyText"/>
+      </w:pPr>
+      <w:r>
+        <w:t xml:space="preserve">For GPT-5 and GPT OSS models,</w:t>
+      </w:r>
+      <w:r>
+        <w:t xml:space="preserve"> </w:t>
+      </w:r>
+      <w:r>
+        <w:rPr>
+          <w:rStyle w:val="VerbatimChar"/>
+        </w:rPr>
+        <w:t xml:space="preserve">reasoning_effort</w:t>
+      </w:r>
+      <w:r>
+        <w:t xml:space="preserve"> </w:t>
+      </w:r>
+      <w:r>
+        <w:t xml:space="preserve">adds a selector to the Copilot model configuration</w:t>
+      </w:r>
+      <w:r>
+        <w:t xml:space="preserve"> </w:t>
+      </w:r>
+      <w:r>
+        <w:t xml:space="preserve">and is forwarded to Databricks.</w:t>
+      </w:r>
+      <w:r>
+        <w:t xml:space="preserve"> </w:t>
+      </w:r>
+      <w:r>
+        <w:t xml:space="preserve">Start with</w:t>
+      </w:r>
+      <w:r>
+        <w:t xml:space="preserve"> </w:t>
+      </w:r>
+      <w:r>
+        <w:rPr>
+          <w:rStyle w:val="VerbatimChar"/>
+        </w:rPr>
+        <w:t xml:space="preserve">medium</w:t>
+      </w:r>
+      <w:r>
+        <w:t xml:space="preserve"> </w:t>
+      </w:r>
+      <w:r>
+        <w:t xml:space="preserve">for general work</w:t>
       </w:r>
       <w:r>
         <w:t xml:space="preserve"> </w:t>
       </w:r>
       <w:r>
         <w:t xml:space="preserve">and</w:t>
+      </w:r>
+      <w:r>
+        <w:t xml:space="preserve"> </w:t>
+      </w:r>
+      <w:r>
+        <w:rPr>
+          <w:rStyle w:val="VerbatimChar"/>
+        </w:rPr>
+        <w:t xml:space="preserve">high</w:t>
+      </w:r>
+      <w:r>
+        <w:t xml:space="preserve"> </w:t>
+      </w:r>
+      <w:r>
+        <w:t xml:space="preserve">for Codex or difficult agentic tasks.</w:t>
+      </w:r>
+      <w:r>
+        <w:t xml:space="preserve"> </w:t>
+      </w:r>
+      <w:r>
+        <w:t xml:space="preserve">Claude and Gemini 2.5 use provider-specific thinking controls;</w:t>
+      </w:r>
+      <w:r>
+        <w:t xml:space="preserve"> </w:t>
+      </w:r>
+      <w:r>
+        <w:t xml:space="preserve">do not copy</w:t>
+      </w:r>
+      <w:r>
+        <w:t xml:space="preserve"> </w:t>
+      </w:r>
+      <w:r>
+        <w:rPr>
+          <w:rStyle w:val="VerbatimChar"/>
+        </w:rPr>
+        <w:t xml:space="preserve">reasoning_effort</w:t>
+      </w:r>
+      <w:r>
+        <w:t xml:space="preserve"> </w:t>
+      </w:r>
+      <w:r>
+        <w:t xml:space="preserve">onto those entries.</w:t>
+      </w:r>
+    </w:p>
+    <w:p>
+      <w:pPr>
+        <w:pStyle w:val="BodyText"/>
+      </w:pPr>
+      <w:r>
+        <w:t xml:space="preserve">Databricks retires model endpoints over time.</w:t>
+      </w:r>
+      <w:r>
+        <w:t xml:space="preserve"> </w:t>
+      </w:r>
+      <w:r>
+        <w:t xml:space="preserve">Before sharing or troubleshooting a configuration,</w:t>
+      </w:r>
+      <w:r>
+        <w:t xml:space="preserve"> </w:t>
+      </w:r>
+      <w:r>
+        <w:t xml:space="preserve">compare every</w:t>
+      </w:r>
+      <w:r>
+        <w:t xml:space="preserve"> </w:t>
+      </w:r>
+      <w:r>
+        <w:rPr>
+          <w:rStyle w:val="VerbatimChar"/>
+        </w:rPr>
+        <w:t xml:space="preserve">id</w:t>
+      </w:r>
+      <w:r>
+        <w:t xml:space="preserve"> </w:t>
+      </w:r>
+      <w:r>
+        <w:t xml:space="preserve">with the current model catalog</w:t>
+      </w:r>
+      <w:r>
+        <w:t xml:space="preserve"> </w:t>
+      </w:r>
+      <w:r>
+        <w:t xml:space="preserve">and remove entries that are no longer listed.</w:t>
+      </w:r>
+      <w:r>
+        <w:t xml:space="preserve"> </w:t>
+      </w:r>
+      <w:r>
+        <w:t xml:space="preserve">An accurate local entry cannot make a retired endpoint work.</w:t>
+      </w:r>
+    </w:p>
+    <w:p>
+      <w:pPr>
+        <w:pStyle w:val="BodyText"/>
+      </w:pPr>
+      <w:r>
+        <w:t xml:space="preserve">An individual endpoint page may also carry a banner reading</w:t>
+      </w:r>
+      <w:r>
+        <w:t xml:space="preserve"> </w:t>
+      </w:r>
+      <w:r>
+        <w:t xml:space="preserve">“This serving endpoint is deprecated.</w:t>
+      </w:r>
+      <w:r>
+        <w:t xml:space="preserve"> </w:t>
+      </w:r>
+      <w:r>
+        <w:t xml:space="preserve">Foundation models are now managed in Unity AI Gateway.”</w:t>
+      </w:r>
+      <w:r>
+        <w:t xml:space="preserve"> </w:t>
+      </w:r>
+      <w:r>
+        <w:t xml:space="preserve">That is a statement about where Databricks intends to manage these models,</w:t>
+      </w:r>
+      <w:r>
+        <w:t xml:space="preserve"> </w:t>
+      </w:r>
+      <w:r>
+        <w:t xml:space="preserve">not an outage:</w:t>
+      </w:r>
+      <w:r>
+        <w:t xml:space="preserve"> </w:t>
+      </w:r>
+      <w:r>
+        <w:t xml:space="preserve">the</w:t>
+      </w:r>
+      <w:r>
+        <w:t xml:space="preserve"> </w:t>
+      </w:r>
+      <w:r>
+        <w:rPr>
+          <w:rStyle w:val="VerbatimChar"/>
+        </w:rPr>
+        <w:t xml:space="preserve">/serving-endpoints</w:t>
+      </w:r>
+      <w:r>
+        <w:t xml:space="preserve"> </w:t>
+      </w:r>
+      <w:r>
+        <w:t xml:space="preserve">path keeps serving while the banner is up.</w:t>
+      </w:r>
+      <w:r>
+        <w:t xml:space="preserve"> </w:t>
+      </w:r>
+      <w:r>
+        <w:t xml:space="preserve">Unity AI Gateway’s</w:t>
       </w:r>
       <w:r>
         <w:t xml:space="preserve"> </w:t>
@@ -36776,6 +37534,22 @@
           <w:b/>
           <w:bCs/>
         </w:rPr>
+        <w:t xml:space="preserve">LLMs</w:t>
+      </w:r>
+      <w:r>
+        <w:t xml:space="preserve"> </w:t>
+      </w:r>
+      <w:r>
+        <w:t xml:space="preserve">and</w:t>
+      </w:r>
+      <w:r>
+        <w:t xml:space="preserve"> </w:t>
+      </w:r>
+      <w:r>
+        <w:rPr>
+          <w:b/>
+          <w:bCs/>
+        </w:rPr>
         <w:t xml:space="preserve">Providers</w:t>
       </w:r>
       <w:r>
@@ -36815,8 +37589,8 @@
         <w:t xml:space="preserve">Observed 2026-08-20.</w:t>
       </w:r>
     </w:p>
-    <w:bookmarkEnd w:id="255"/>
-    <w:bookmarkStart w:id="260" w:name="Xeefb66738a7cdd8d123f77fc3c435ee9098e612"/>
+    <w:bookmarkEnd w:id="258"/>
+    <w:bookmarkStart w:id="263" w:name="Xeefb66738a7cdd8d123f77fc3c435ee9098e612"/>
     <w:p>
       <w:pPr>
         <w:pStyle w:val="Heading4"/>
@@ -37745,12 +38519,12 @@
                 <wp:inline>
                   <wp:extent cx="152400" cy="152400"/>
                   <wp:effectExtent b="0" l="0" r="0" t="0"/>
-                  <wp:docPr descr="" title="" id="256" name="Picture"/>
+                  <wp:docPr descr="" title="" id="259" name="Picture"/>
                   <a:graphic>
                     <a:graphicData uri="http://schemas.openxmlformats.org/drawingml/2006/picture">
                       <pic:pic>
                         <pic:nvPicPr>
-                          <pic:cNvPr descr="/opt/quarto/share/formats/docx/tip.png" id="257" name="Picture"/>
+                          <pic:cNvPr descr="/opt/quarto/share/formats/docx/tip.png" id="260" name="Picture"/>
                           <pic:cNvPicPr>
                             <a:picLocks noChangeArrowheads="1" noChangeAspect="1"/>
                           </pic:cNvPicPr>
@@ -37887,12 +38661,12 @@
                 <wp:inline>
                   <wp:extent cx="152400" cy="152400"/>
                   <wp:effectExtent b="0" l="0" r="0" t="0"/>
-                  <wp:docPr descr="" title="" id="258" name="Picture"/>
+                  <wp:docPr descr="" title="" id="261" name="Picture"/>
                   <a:graphic>
                     <a:graphicData uri="http://schemas.openxmlformats.org/drawingml/2006/picture">
                       <pic:pic>
                         <pic:nvPicPr>
-                          <pic:cNvPr descr="/opt/quarto/share/formats/docx/important.png" id="259" name="Picture"/>
+                          <pic:cNvPr descr="/opt/quarto/share/formats/docx/important.png" id="262" name="Picture"/>
                           <pic:cNvPicPr>
                             <a:picLocks noChangeArrowheads="1" noChangeAspect="1"/>
                           </pic:cNvPicPr>
@@ -38157,8 +38931,8 @@
         </w:tc>
       </w:tr>
     </w:tbl>
-    <w:bookmarkEnd w:id="260"/>
-    <w:bookmarkStart w:id="263" w:name="X2af9a430a52e3ae5bb0cdcfef1e620fec8864fe"/>
+    <w:bookmarkEnd w:id="263"/>
+    <w:bookmarkStart w:id="266" w:name="X2af9a430a52e3ae5bb0cdcfef1e620fec8864fe"/>
     <w:p>
       <w:pPr>
         <w:pStyle w:val="Heading4"/>
@@ -38750,6 +39524,53 @@
       </w:r>
       <w:r>
         <w:t xml:space="preserve">so buying prompt headroom this way costs more 429s.</w:t>
+      </w:r>
+      <w:r>
+        <w:t xml:space="preserve"> </w:t>
+      </w:r>
+      <w:r>
+        <w:t xml:space="preserve">Raising the window without lengthening the delay breaks the pairing those two</w:t>
+      </w:r>
+      <w:r>
+        <w:t xml:space="preserve"> </w:t>
+      </w:r>
+      <w:r>
+        <w:t xml:space="preserve">columns encode,</w:t>
+      </w:r>
+      <w:r>
+        <w:t xml:space="preserve"> </w:t>
+      </w:r>
+      <w:r>
+        <w:t xml:space="preserve">and on a 200,000 ITPM tier the headroom is not there to buy.</w:t>
+      </w:r>
+      <w:r>
+        <w:t xml:space="preserve"> </w:t>
+      </w:r>
+      <w:r>
+        <w:t xml:space="preserve">Switching to a higher-tier family is the move that gets both,</w:t>
+      </w:r>
+      <w:r>
+        <w:t xml:space="preserve"> </w:t>
+      </w:r>
+      <w:r>
+        <w:t xml:space="preserve">as</w:t>
+      </w:r>
+      <w:r>
+        <w:t xml:space="preserve"> </w:t>
+      </w:r>
+      <w:hyperlink w:anchor="tbl-databricks-itpm-pacing">
+        <w:r>
+          <w:rPr>
+            <w:rStyle w:val="Hyperlink"/>
+          </w:rPr>
+          <w:t xml:space="preserve">Table 4</w:t>
+        </w:r>
+      </w:hyperlink>
+      <w:r>
+        <w:t xml:space="preserve"> </w:t>
+      </w:r>
+      <w:r>
+        <w:t xml:space="preserve">sets out.</w:t>
       </w:r>
     </w:p>
     <w:p>
@@ -38979,12 +39800,12 @@
                 <wp:inline>
                   <wp:extent cx="152400" cy="152400"/>
                   <wp:effectExtent b="0" l="0" r="0" t="0"/>
-                  <wp:docPr descr="" title="" id="261" name="Picture"/>
+                  <wp:docPr descr="" title="" id="264" name="Picture"/>
                   <a:graphic>
                     <a:graphicData uri="http://schemas.openxmlformats.org/drawingml/2006/picture">
                       <pic:pic>
                         <pic:nvPicPr>
-                          <pic:cNvPr descr="/opt/quarto/share/formats/docx/note.png" id="262" name="Picture"/>
+                          <pic:cNvPr descr="/opt/quarto/share/formats/docx/note.png" id="265" name="Picture"/>
                           <pic:cNvPicPr>
                             <a:picLocks noChangeArrowheads="1" noChangeAspect="1"/>
                           </pic:cNvPicPr>
@@ -39141,9 +39962,9 @@
         </w:tc>
       </w:tr>
     </w:tbl>
-    <w:bookmarkEnd w:id="263"/>
-    <w:bookmarkEnd w:id="264"/>
-    <w:bookmarkStart w:id="278" w:name="configuring-the-agent-environment"/>
+    <w:bookmarkEnd w:id="266"/>
+    <w:bookmarkEnd w:id="267"/>
+    <w:bookmarkStart w:id="281" w:name="configuring-the-agent-environment"/>
     <w:p>
       <w:pPr>
         <w:pStyle w:val="Heading1"/>
@@ -39199,7 +40020,7 @@
         <w:t xml:space="preserve">so that Copilot can build, test, and lint your code more reliably.</w:t>
       </w:r>
     </w:p>
-    <w:bookmarkStart w:id="265" w:name="why-configure-the-environment"/>
+    <w:bookmarkStart w:id="268" w:name="why-configure-the-environment"/>
     <w:p>
       <w:pPr>
         <w:pStyle w:val="Heading4"/>
@@ -39282,8 +40103,8 @@
         <w:t xml:space="preserve">Consistent development environment across all agent sessions</w:t>
       </w:r>
     </w:p>
-    <w:bookmarkEnd w:id="265"/>
-    <w:bookmarkStart w:id="266" w:name="file-location-and-structure"/>
+    <w:bookmarkEnd w:id="268"/>
+    <w:bookmarkStart w:id="269" w:name="file-location-and-structure"/>
     <w:p>
       <w:pPr>
         <w:pStyle w:val="Heading4"/>
@@ -39352,8 +40173,8 @@
         <w:t xml:space="preserve">.</w:t>
       </w:r>
     </w:p>
-    <w:bookmarkEnd w:id="266"/>
-    <w:bookmarkStart w:id="268" w:name="basic-configuration-example"/>
+    <w:bookmarkEnd w:id="269"/>
+    <w:bookmarkStart w:id="271" w:name="basic-configuration-example"/>
     <w:p>
       <w:pPr>
         <w:pStyle w:val="Heading4"/>
@@ -39372,7 +40193,7 @@
       <w:r>
         <w:t xml:space="preserve"> </w:t>
       </w:r>
-      <w:hyperlink r:id="rId267">
+      <w:hyperlink r:id="rId270">
         <w:r>
           <w:rPr>
             <w:rStyle w:val="VerbatimChar"/>
@@ -39387,8 +40208,8 @@
         <w:t xml:space="preserve">for a configuration adapted for R and Quarto projects.</w:t>
       </w:r>
     </w:p>
-    <w:bookmarkEnd w:id="268"/>
-    <w:bookmarkStart w:id="271" w:name="using-actionscheckout"/>
+    <w:bookmarkEnd w:id="271"/>
+    <w:bookmarkStart w:id="274" w:name="using-actionscheckout"/>
     <w:p>
       <w:pPr>
         <w:pStyle w:val="Heading4"/>
@@ -39416,7 +40237,7 @@
       <w:r>
         <w:t xml:space="preserve"> </w:t>
       </w:r>
-      <w:hyperlink r:id="rId269">
+      <w:hyperlink r:id="rId272">
         <w:r>
           <w:rPr>
             <w:rStyle w:val="VerbatimChar"/>
@@ -39755,7 +40576,7 @@
       <w:r>
         <w:t xml:space="preserve"> </w:t>
       </w:r>
-      <w:hyperlink r:id="rId270">
+      <w:hyperlink r:id="rId273">
         <w:r>
           <w:rPr>
             <w:rStyle w:val="Hyperlink"/>
@@ -39823,8 +40644,8 @@
         <w:t xml:space="preserve">including comparing changes and understanding the context of your pull request.</w:t>
       </w:r>
     </w:p>
-    <w:bookmarkEnd w:id="271"/>
-    <w:bookmarkStart w:id="272" w:name="configurable-options"/>
+    <w:bookmarkEnd w:id="274"/>
+    <w:bookmarkStart w:id="275" w:name="configurable-options"/>
     <w:p>
       <w:pPr>
         <w:pStyle w:val="Heading4"/>
@@ -39990,8 +40811,8 @@
         <w:t xml:space="preserve">All other workflow settings are ignored by Copilot.</w:t>
       </w:r>
     </w:p>
-    <w:bookmarkEnd w:id="272"/>
-    <w:bookmarkStart w:id="273" w:name="common-setup-tasks"/>
+    <w:bookmarkEnd w:id="275"/>
+    <w:bookmarkStart w:id="276" w:name="common-setup-tasks"/>
     <w:p>
       <w:pPr>
         <w:pStyle w:val="Heading4"/>
@@ -40606,8 +41427,8 @@
         <w:t xml:space="preserve"> r-lib/actions/setup-renv@v2</w:t>
       </w:r>
     </w:p>
-    <w:bookmarkEnd w:id="273"/>
-    <w:bookmarkStart w:id="274" w:name="environment-variables-and-secrets"/>
+    <w:bookmarkEnd w:id="276"/>
+    <w:bookmarkStart w:id="277" w:name="environment-variables-and-secrets"/>
     <w:p>
       <w:pPr>
         <w:pStyle w:val="Heading4"/>
@@ -40715,8 +41536,8 @@
         <w:t xml:space="preserve">Use secrets for sensitive values like API keys or passwords.</w:t>
       </w:r>
     </w:p>
-    <w:bookmarkEnd w:id="274"/>
-    <w:bookmarkStart w:id="275" w:name="testing-your-configuration"/>
+    <w:bookmarkEnd w:id="277"/>
+    <w:bookmarkStart w:id="278" w:name="testing-your-configuration"/>
     <w:p>
       <w:pPr>
         <w:pStyle w:val="Heading4"/>
@@ -40811,8 +41632,8 @@
         <w:t xml:space="preserve">and begin working with the current environment state.</w:t>
       </w:r>
     </w:p>
-    <w:bookmarkEnd w:id="275"/>
-    <w:bookmarkStart w:id="276" w:name="advanced-configuration"/>
+    <w:bookmarkEnd w:id="278"/>
+    <w:bookmarkStart w:id="279" w:name="advanced-configuration"/>
     <w:p>
       <w:pPr>
         <w:pStyle w:val="Heading4"/>
@@ -41132,8 +41953,8 @@
         <w:t xml:space="preserve">true</w:t>
       </w:r>
     </w:p>
-    <w:bookmarkEnd w:id="276"/>
-    <w:bookmarkStart w:id="277" w:name="further-reading-1"/>
+    <w:bookmarkEnd w:id="279"/>
+    <w:bookmarkStart w:id="280" w:name="further-reading-1"/>
     <w:p>
       <w:pPr>
         <w:pStyle w:val="Heading4"/>
@@ -41158,7 +41979,7 @@
       <w:r>
         <w:t xml:space="preserve"> </w:t>
       </w:r>
-      <w:hyperlink r:id="rId270">
+      <w:hyperlink r:id="rId273">
         <w:r>
           <w:rPr>
             <w:rStyle w:val="Hyperlink"/>
@@ -41170,9 +41991,9 @@
         <w:t xml:space="preserve">.</w:t>
       </w:r>
     </w:p>
-    <w:bookmarkEnd w:id="277"/>
-    <w:bookmarkEnd w:id="278"/>
-    <w:bookmarkStart w:id="286" w:name="sec-ai-agent-skills"/>
+    <w:bookmarkEnd w:id="280"/>
+    <w:bookmarkEnd w:id="281"/>
+    <w:bookmarkStart w:id="289" w:name="sec-ai-agent-skills"/>
     <w:p>
       <w:pPr>
         <w:pStyle w:val="Heading1"/>
@@ -41185,7 +42006,7 @@
       <w:pPr>
         <w:pStyle w:val="FirstParagraph"/>
       </w:pPr>
-      <w:hyperlink r:id="rId279">
+      <w:hyperlink r:id="rId282">
         <w:r>
           <w:rPr>
             <w:rStyle w:val="Hyperlink"/>
@@ -41220,7 +42041,7 @@
       <w:r>
         <w:t xml:space="preserve"> </w:t>
       </w:r>
-      <w:hyperlink r:id="rId280">
+      <w:hyperlink r:id="rId283">
         <w:r>
           <w:rPr>
             <w:rStyle w:val="Hyperlink"/>
@@ -41241,7 +42062,7 @@
         <w:t xml:space="preserve">tool-agnostic format that any compatible agent can load.</w:t>
       </w:r>
     </w:p>
-    <w:bookmarkStart w:id="281" w:name="what-is-a-skill"/>
+    <w:bookmarkStart w:id="284" w:name="what-is-a-skill"/>
     <w:p>
       <w:pPr>
         <w:pStyle w:val="Heading4"/>
@@ -41311,7 +42132,7 @@
       <w:r>
         <w:t xml:space="preserve"> </w:t>
       </w:r>
-      <w:hyperlink r:id="rId280">
+      <w:hyperlink r:id="rId283">
         <w:r>
           <w:rPr>
             <w:rStyle w:val="Hyperlink"/>
@@ -41418,8 +42239,8 @@
         <w:t xml:space="preserve">└── assets/           # Optional: templates, resources</w:t>
       </w:r>
     </w:p>
-    <w:bookmarkEnd w:id="281"/>
-    <w:bookmarkStart w:id="282" w:name="how-agents-load-skills"/>
+    <w:bookmarkEnd w:id="284"/>
+    <w:bookmarkStart w:id="285" w:name="how-agents-load-skills"/>
     <w:p>
       <w:pPr>
         <w:pStyle w:val="Heading4"/>
@@ -41562,8 +42383,8 @@
         <w:t xml:space="preserve">so agents can maintain many skills with a small context footprint.</w:t>
       </w:r>
     </w:p>
-    <w:bookmarkEnd w:id="282"/>
-    <w:bookmarkStart w:id="283" w:name="why-use-skills"/>
+    <w:bookmarkEnd w:id="285"/>
+    <w:bookmarkStart w:id="286" w:name="why-use-skills"/>
     <w:p>
       <w:pPr>
         <w:pStyle w:val="Heading4"/>
@@ -41649,8 +42470,8 @@
         <w:t xml:space="preserve">: Build a skill once and use it across any skills-compatible agent</w:t>
       </w:r>
     </w:p>
-    <w:bookmarkEnd w:id="283"/>
-    <w:bookmarkStart w:id="285" w:name="further-reading-2"/>
+    <w:bookmarkEnd w:id="286"/>
+    <w:bookmarkStart w:id="288" w:name="further-reading-2"/>
     <w:p>
       <w:pPr>
         <w:pStyle w:val="Heading4"/>
@@ -41675,7 +42496,7 @@
       <w:r>
         <w:t xml:space="preserve"> </w:t>
       </w:r>
-      <w:hyperlink r:id="rId279">
+      <w:hyperlink r:id="rId282">
         <w:r>
           <w:rPr>
             <w:rStyle w:val="Hyperlink"/>
@@ -41790,7 +42611,7 @@
       <w:r>
         <w:t xml:space="preserve"> </w:t>
       </w:r>
-      <w:hyperlink r:id="rId284">
+      <w:hyperlink r:id="rId287">
         <w:r>
           <w:rPr>
             <w:rStyle w:val="Hyperlink"/>
@@ -41817,9 +42638,9 @@
         <w:t xml:space="preserve">including user-level skills, hooks, and subagents, synced across machines via Git.</w:t>
       </w:r>
     </w:p>
-    <w:bookmarkEnd w:id="285"/>
-    <w:bookmarkEnd w:id="286"/>
-    <w:bookmarkStart w:id="292" w:name="sec-ai-useful-plugins"/>
+    <w:bookmarkEnd w:id="288"/>
+    <w:bookmarkEnd w:id="289"/>
+    <w:bookmarkStart w:id="295" w:name="sec-ai-useful-plugins"/>
     <w:p>
       <w:pPr>
         <w:pStyle w:val="Heading1"/>
@@ -41838,7 +42659,7 @@
       <w:r>
         <w:t xml:space="preserve"> </w:t>
       </w:r>
-      <w:hyperlink r:id="rId287">
+      <w:hyperlink r:id="rId290">
         <w:r>
           <w:rPr>
             <w:rStyle w:val="Hyperlink"/>
@@ -41875,7 +42696,7 @@
       <w:pPr>
         <w:pStyle w:val="BodyText"/>
       </w:pPr>
-      <w:hyperlink r:id="rId288">
+      <w:hyperlink r:id="rId291">
         <w:r>
           <w:rPr>
             <w:rStyle w:val="Hyperlink"/>
@@ -41937,7 +42758,7 @@
       <w:r>
         <w:t xml:space="preserve"> </w:t>
       </w:r>
-      <w:hyperlink r:id="rId289">
+      <w:hyperlink r:id="rId292">
         <w:r>
           <w:rPr>
             <w:rStyle w:val="Hyperlink"/>
@@ -42009,7 +42830,7 @@
           <w:numId w:val="1121"/>
         </w:numPr>
       </w:pPr>
-      <w:hyperlink r:id="rId290">
+      <w:hyperlink r:id="rId293">
         <w:r>
           <w:rPr>
             <w:rStyle w:val="Hyperlink"/>
@@ -42075,7 +42896,7 @@
       <w:r>
         <w:t xml:space="preserve"> </w:t>
       </w:r>
-      <w:hyperlink r:id="rId284">
+      <w:hyperlink r:id="rId287">
         <w:r>
           <w:rPr>
             <w:rStyle w:val="VerbatimChar"/>
@@ -42092,7 +42913,7 @@
       <w:r>
         <w:t xml:space="preserve"> </w:t>
       </w:r>
-      <w:hyperlink r:id="rId291">
+      <w:hyperlink r:id="rId294">
         <w:r>
           <w:rPr>
             <w:rStyle w:val="VerbatimChar"/>
@@ -42165,8 +42986,8 @@
         <w:t xml:space="preserve">is the worked example of what the corpus contains.</w:t>
       </w:r>
     </w:p>
-    <w:bookmarkEnd w:id="292"/>
-    <w:bookmarkStart w:id="312" w:name="sec-ai-customization"/>
+    <w:bookmarkEnd w:id="295"/>
+    <w:bookmarkStart w:id="315" w:name="sec-ai-customization"/>
     <w:p>
       <w:pPr>
         <w:pStyle w:val="Heading1"/>
@@ -42291,7 +43112,7 @@
         <w:t xml:space="preserve">.</w:t>
       </w:r>
     </w:p>
-    <w:bookmarkStart w:id="294" w:name="the-question-that-picks-the-mechanism"/>
+    <w:bookmarkStart w:id="297" w:name="the-question-that-picks-the-mechanism"/>
     <w:p>
       <w:pPr>
         <w:pStyle w:val="Heading4"/>
@@ -42392,7 +43213,7 @@
       <w:r>
         <w:t xml:space="preserve"> </w:t>
       </w:r>
-      <w:hyperlink r:id="rId293">
+      <w:hyperlink r:id="rId296">
         <w:r>
           <w:rPr>
             <w:rStyle w:val="Hyperlink"/>
@@ -42477,8 +43298,8 @@
         <w:t xml:space="preserve">.</w:t>
       </w:r>
     </w:p>
-    <w:bookmarkEnd w:id="294"/>
-    <w:bookmarkStart w:id="296" w:name="instruction-files-always-on-context"/>
+    <w:bookmarkEnd w:id="297"/>
+    <w:bookmarkStart w:id="299" w:name="instruction-files-always-on-context"/>
     <w:p>
       <w:pPr>
         <w:pStyle w:val="Heading4"/>
@@ -42582,7 +43403,7 @@
       <w:r>
         <w:t xml:space="preserve"> </w:t>
       </w:r>
-      <w:hyperlink r:id="rId293">
+      <w:hyperlink r:id="rId296">
         <w:r>
           <w:rPr>
             <w:rStyle w:val="Hyperlink"/>
@@ -42725,7 +43546,7 @@
       <w:r>
         <w:t xml:space="preserve"> </w:t>
       </w:r>
-      <w:hyperlink r:id="rId293">
+      <w:hyperlink r:id="rId296">
         <w:r>
           <w:rPr>
             <w:rStyle w:val="Hyperlink"/>
@@ -42829,7 +43650,7 @@
       <w:r>
         <w:t xml:space="preserve"> </w:t>
       </w:r>
-      <w:hyperlink r:id="rId295">
+      <w:hyperlink r:id="rId298">
         <w:r>
           <w:rPr>
             <w:rStyle w:val="Hyperlink"/>
@@ -42949,8 +43770,8 @@
         <w:t xml:space="preserve">and guaranteed nothing about acting on it alike.</w:t>
       </w:r>
     </w:p>
-    <w:bookmarkEnd w:id="296"/>
-    <w:bookmarkStart w:id="297" w:name="workspace-rules-and-activation-modes"/>
+    <w:bookmarkEnd w:id="299"/>
+    <w:bookmarkStart w:id="300" w:name="workspace-rules-and-activation-modes"/>
     <w:p>
       <w:pPr>
         <w:pStyle w:val="Heading4"/>
@@ -43219,8 +44040,8 @@
         <w:t xml:space="preserve">).</w:t>
       </w:r>
     </w:p>
-    <w:bookmarkEnd w:id="297"/>
-    <w:bookmarkStart w:id="300" w:name="skills-and-the-commands-that-became-them"/>
+    <w:bookmarkEnd w:id="300"/>
+    <w:bookmarkStart w:id="303" w:name="skills-and-the-commands-that-became-them"/>
     <w:p>
       <w:pPr>
         <w:pStyle w:val="Heading4"/>
@@ -43245,7 +44066,7 @@
       <w:r>
         <w:t xml:space="preserve"> </w:t>
       </w:r>
-      <w:hyperlink r:id="rId298">
+      <w:hyperlink r:id="rId301">
         <w:r>
           <w:rPr>
             <w:rStyle w:val="Hyperlink"/>
@@ -43684,7 +44505,7 @@
       <w:r>
         <w:t xml:space="preserve"> </w:t>
       </w:r>
-      <w:hyperlink r:id="rId280">
+      <w:hyperlink r:id="rId283">
         <w:r>
           <w:rPr>
             <w:rStyle w:val="Hyperlink"/>
@@ -43803,7 +44624,7 @@
       <w:r>
         <w:t xml:space="preserve"> </w:t>
       </w:r>
-      <w:hyperlink r:id="rId299">
+      <w:hyperlink r:id="rId302">
         <w:r>
           <w:rPr>
             <w:rStyle w:val="Hyperlink"/>
@@ -43869,8 +44690,8 @@
         <w:t xml:space="preserve">a competitor’s directory name.</w:t>
       </w:r>
     </w:p>
-    <w:bookmarkEnd w:id="300"/>
-    <w:bookmarkStart w:id="302" w:name="subagents-delegating-to-a-fresh-context"/>
+    <w:bookmarkEnd w:id="303"/>
+    <w:bookmarkStart w:id="305" w:name="subagents-delegating-to-a-fresh-context"/>
     <w:p>
       <w:pPr>
         <w:pStyle w:val="Heading4"/>
@@ -44019,6 +44840,29 @@
       <w:r>
         <w:t xml:space="preserve"> </w:t>
       </w:r>
+      <w:hyperlink r:id="rId304">
+        <w:r>
+          <w:rPr>
+            <w:rStyle w:val="Hyperlink"/>
+          </w:rPr>
+          <w:t xml:space="preserve">outranks</w:t>
+        </w:r>
+      </w:hyperlink>
+      <w:r>
+        <w:t xml:space="preserve"> </w:t>
+      </w:r>
+      <w:r>
+        <w:t xml:space="preserve">a personal one.</w:t>
+      </w:r>
+      <w:r>
+        <w:t xml:space="preserve"> </w:t>
+      </w:r>
+      <w:r>
+        <w:t xml:space="preserve">For skills, personal</w:t>
+      </w:r>
+      <w:r>
+        <w:t xml:space="preserve"> </w:t>
+      </w:r>
       <w:hyperlink r:id="rId301">
         <w:r>
           <w:rPr>
@@ -44031,29 +44875,6 @@
         <w:t xml:space="preserve"> </w:t>
       </w:r>
       <w:r>
-        <w:t xml:space="preserve">a personal one.</w:t>
-      </w:r>
-      <w:r>
-        <w:t xml:space="preserve"> </w:t>
-      </w:r>
-      <w:r>
-        <w:t xml:space="preserve">For skills, personal</w:t>
-      </w:r>
-      <w:r>
-        <w:t xml:space="preserve"> </w:t>
-      </w:r>
-      <w:hyperlink r:id="rId298">
-        <w:r>
-          <w:rPr>
-            <w:rStyle w:val="Hyperlink"/>
-          </w:rPr>
-          <w:t xml:space="preserve">outranks</w:t>
-        </w:r>
-      </w:hyperlink>
-      <w:r>
-        <w:t xml:space="preserve"> </w:t>
-      </w:r>
-      <w:r>
         <w:t xml:space="preserve">project.</w:t>
       </w:r>
       <w:r>
@@ -44107,8 +44928,8 @@
         <w:t xml:space="preserve">The @-mention controls which subagent Claude invokes, not what prompt it receives.</w:t>
       </w:r>
     </w:p>
-    <w:bookmarkEnd w:id="302"/>
-    <w:bookmarkStart w:id="304" w:name="Xf185306762ce2c53b5a7ee53d7e6e74f0af7607"/>
+    <w:bookmarkEnd w:id="305"/>
+    <w:bookmarkStart w:id="307" w:name="Xf185306762ce2c53b5a7ee53d7e6e74f0af7607"/>
     <w:p>
       <w:pPr>
         <w:pStyle w:val="Heading4"/>
@@ -44152,7 +44973,7 @@
       <w:r>
         <w:t xml:space="preserve"> </w:t>
       </w:r>
-      <w:hyperlink r:id="rId303">
+      <w:hyperlink r:id="rId306">
         <w:r>
           <w:rPr>
             <w:rStyle w:val="Hyperlink"/>
@@ -44187,7 +45008,7 @@
       <w:r>
         <w:t xml:space="preserve"> </w:t>
       </w:r>
-      <w:hyperlink r:id="rId293">
+      <w:hyperlink r:id="rId296">
         <w:r>
           <w:rPr>
             <w:rStyle w:val="Hyperlink"/>
@@ -44406,8 +45227,8 @@
         <w:t xml:space="preserve">hook decides.</w:t>
       </w:r>
     </w:p>
-    <w:bookmarkEnd w:id="304"/>
-    <w:bookmarkStart w:id="306" w:name="X661523c6623257371ddb85eca0962e6d24391f6"/>
+    <w:bookmarkEnd w:id="307"/>
+    <w:bookmarkStart w:id="309" w:name="X661523c6623257371ddb85eca0962e6d24391f6"/>
     <w:p>
       <w:pPr>
         <w:pStyle w:val="Heading4"/>
@@ -44489,7 +45310,7 @@
       <w:r>
         <w:t xml:space="preserve"> </w:t>
       </w:r>
-      <w:hyperlink r:id="rId305">
+      <w:hyperlink r:id="rId308">
         <w:r>
           <w:rPr>
             <w:rStyle w:val="Hyperlink"/>
@@ -44648,8 +45469,8 @@
         <w:t xml:space="preserve">a repository can tighten what you allow, and cannot quietly loosen it.</w:t>
       </w:r>
     </w:p>
-    <w:bookmarkEnd w:id="306"/>
-    <w:bookmarkStart w:id="307" w:name="Xb9141ee8bf4b59ff8b077a4423dd913151d282a"/>
+    <w:bookmarkEnd w:id="309"/>
+    <w:bookmarkStart w:id="310" w:name="Xb9141ee8bf4b59ff8b077a4423dd913151d282a"/>
     <w:p>
       <w:pPr>
         <w:pStyle w:val="Heading4"/>
@@ -44782,8 +45603,8 @@
         <w:t xml:space="preserve">covers configuration and its failure modes.</w:t>
       </w:r>
     </w:p>
-    <w:bookmarkEnd w:id="307"/>
-    <w:bookmarkStart w:id="308" w:name="choosing"/>
+    <w:bookmarkEnd w:id="310"/>
+    <w:bookmarkStart w:id="311" w:name="choosing"/>
     <w:p>
       <w:pPr>
         <w:pStyle w:val="Heading4"/>
@@ -45140,8 +45961,8 @@
         </w:tc>
       </w:tr>
     </w:tbl>
-    <w:bookmarkEnd w:id="308"/>
-    <w:bookmarkStart w:id="310" w:name="what-travels-between-tools"/>
+    <w:bookmarkEnd w:id="311"/>
+    <w:bookmarkStart w:id="313" w:name="what-travels-between-tools"/>
     <w:p>
       <w:pPr>
         <w:pStyle w:val="Heading4"/>
@@ -45594,7 +46415,7 @@
             <w:pPr>
               <w:pStyle w:val="Compact"/>
             </w:pPr>
-            <w:hyperlink r:id="rId309">
+            <w:hyperlink r:id="rId312">
               <w:r>
                 <w:rPr>
                   <w:rStyle w:val="Hyperlink"/>
@@ -45691,8 +46512,8 @@
         <w:t xml:space="preserve">and are worth writing as enforcement of rules that are also stated somewhere portable.</w:t>
       </w:r>
     </w:p>
-    <w:bookmarkEnd w:id="310"/>
-    <w:bookmarkStart w:id="311" w:name="a-worked-example"/>
+    <w:bookmarkEnd w:id="313"/>
+    <w:bookmarkStart w:id="314" w:name="a-worked-example"/>
     <w:p>
       <w:pPr>
         <w:pStyle w:val="Heading4"/>
@@ -45711,7 +46532,7 @@
       <w:r>
         <w:t xml:space="preserve"> </w:t>
       </w:r>
-      <w:hyperlink r:id="rId284">
+      <w:hyperlink r:id="rId287">
         <w:r>
           <w:rPr>
             <w:rStyle w:val="VerbatimChar"/>
@@ -45967,9 +46788,9 @@
         <w:t xml:space="preserve">globs attach them only when you edit a matching file.</w:t>
       </w:r>
     </w:p>
-    <w:bookmarkEnd w:id="311"/>
-    <w:bookmarkEnd w:id="312"/>
-    <w:bookmarkStart w:id="317" w:name="sec-ai-config-install"/>
+    <w:bookmarkEnd w:id="314"/>
+    <w:bookmarkEnd w:id="315"/>
+    <w:bookmarkStart w:id="320" w:name="sec-ai-config-install"/>
     <w:p>
       <w:pPr>
         <w:pStyle w:val="Heading1"/>
@@ -46075,7 +46896,7 @@
         <w:t xml:space="preserve">and a capability simply goes missing with no message that it existed.</w:t>
       </w:r>
     </w:p>
-    <w:bookmarkStart w:id="313" w:name="X09c076bdbd05e35ade785c409b9eb4387af137d"/>
+    <w:bookmarkStart w:id="316" w:name="X09c076bdbd05e35ade785c409b9eb4387af137d"/>
     <w:p>
       <w:pPr>
         <w:pStyle w:val="Heading4"/>
@@ -46309,8 +47130,8 @@
         <w:t xml:space="preserve">Pick one path.</w:t>
       </w:r>
     </w:p>
-    <w:bookmarkEnd w:id="313"/>
-    <w:bookmarkStart w:id="314" w:name="the-.claude-layout"/>
+    <w:bookmarkEnd w:id="316"/>
+    <w:bookmarkStart w:id="317" w:name="the-.claude-layout"/>
     <w:p>
       <w:pPr>
         <w:pStyle w:val="Heading4"/>
@@ -46555,8 +47376,8 @@
         <w:t xml:space="preserve">So verify both, and read the two results separately.</w:t>
       </w:r>
     </w:p>
-    <w:bookmarkEnd w:id="314"/>
-    <w:bookmarkStart w:id="315" w:name="one-plugin-per-capability"/>
+    <w:bookmarkEnd w:id="317"/>
+    <w:bookmarkStart w:id="318" w:name="one-plugin-per-capability"/>
     <w:p>
       <w:pPr>
         <w:pStyle w:val="Heading4"/>
@@ -46649,8 +47470,8 @@
         <w:t xml:space="preserve">Keep one copy enabled.</w:t>
       </w:r>
     </w:p>
-    <w:bookmarkEnd w:id="315"/>
-    <w:bookmarkStart w:id="316" w:name="failure-modes-and-their-symptoms"/>
+    <w:bookmarkEnd w:id="318"/>
+    <w:bookmarkStart w:id="319" w:name="failure-modes-and-their-symptoms"/>
     <w:p>
       <w:pPr>
         <w:pStyle w:val="Heading4"/>
@@ -46895,9 +47716,9 @@
         <w:t xml:space="preserve">suspect the install before you suspect the rule.</w:t>
       </w:r>
     </w:p>
-    <w:bookmarkEnd w:id="316"/>
-    <w:bookmarkEnd w:id="317"/>
-    <w:bookmarkStart w:id="324" w:name="sec-ai-claude-cloud-env"/>
+    <w:bookmarkEnd w:id="319"/>
+    <w:bookmarkEnd w:id="320"/>
+    <w:bookmarkStart w:id="327" w:name="sec-ai-claude-cloud-env"/>
     <w:p>
       <w:pPr>
         <w:pStyle w:val="Heading1"/>
@@ -46939,7 +47760,7 @@
       <w:r>
         <w:t xml:space="preserve"> </w:t>
       </w:r>
-      <w:hyperlink r:id="rId318">
+      <w:hyperlink r:id="rId321">
         <w:r>
           <w:rPr>
             <w:rStyle w:val="Hyperlink"/>
@@ -47137,7 +47958,7 @@
         <w:t xml:space="preserve">for example to install dependencies.</w:t>
       </w:r>
     </w:p>
-    <w:bookmarkStart w:id="323" w:name="X99b85cd9c84d17a9c31061ff898ea0b26b46932"/>
+    <w:bookmarkStart w:id="326" w:name="X99b85cd9c84d17a9c31061ff898ea0b26b46932"/>
     <w:p>
       <w:pPr>
         <w:pStyle w:val="Heading4"/>
@@ -47298,7 +48119,7 @@
       <w:r>
         <w:t xml:space="preserve"> </w:t>
       </w:r>
-      <w:hyperlink r:id="rId318">
+      <w:hyperlink r:id="rId321">
         <w:r>
           <w:rPr>
             <w:rStyle w:val="Hyperlink"/>
@@ -47393,12 +48214,12 @@
                 <wp:inline>
                   <wp:extent cx="152400" cy="152400"/>
                   <wp:effectExtent b="0" l="0" r="0" t="0"/>
-                  <wp:docPr descr="" title="" id="319" name="Picture"/>
+                  <wp:docPr descr="" title="" id="322" name="Picture"/>
                   <a:graphic>
                     <a:graphicData uri="http://schemas.openxmlformats.org/drawingml/2006/picture">
                       <pic:pic>
                         <pic:nvPicPr>
-                          <pic:cNvPr descr="/opt/quarto/share/formats/docx/note.png" id="320" name="Picture"/>
+                          <pic:cNvPr descr="/opt/quarto/share/formats/docx/note.png" id="323" name="Picture"/>
                           <pic:cNvPicPr>
                             <a:picLocks noChangeArrowheads="1" noChangeAspect="1"/>
                           </pic:cNvPicPr>
@@ -47514,7 +48335,7 @@
       <w:r>
         <w:t xml:space="preserve"> </w:t>
       </w:r>
-      <w:hyperlink r:id="rId321">
+      <w:hyperlink r:id="rId324">
         <w:r>
           <w:rPr>
             <w:rStyle w:val="Hyperlink"/>
@@ -47531,7 +48352,7 @@
       <w:r>
         <w:t xml:space="preserve"> </w:t>
       </w:r>
-      <w:hyperlink r:id="rId322">
+      <w:hyperlink r:id="rId325">
         <w:r>
           <w:rPr>
             <w:rStyle w:val="Hyperlink"/>
@@ -47543,9 +48364,9 @@
         <w:t xml:space="preserve">.</w:t>
       </w:r>
     </w:p>
-    <w:bookmarkEnd w:id="323"/>
-    <w:bookmarkEnd w:id="324"/>
-    <w:bookmarkStart w:id="331" w:name="sec-ai-codex-github-review"/>
+    <w:bookmarkEnd w:id="326"/>
+    <w:bookmarkEnd w:id="327"/>
+    <w:bookmarkStart w:id="334" w:name="sec-ai-codex-github-review"/>
     <w:p>
       <w:pPr>
         <w:pStyle w:val="Heading1"/>
@@ -47580,7 +48401,7 @@
         <w:t xml:space="preserve">It does not require you to build a separate GitHub Action.</w:t>
       </w:r>
     </w:p>
-    <w:bookmarkStart w:id="325" w:name="prerequisites"/>
+    <w:bookmarkStart w:id="328" w:name="prerequisites"/>
     <w:p>
       <w:pPr>
         <w:pStyle w:val="Heading4"/>
@@ -47705,8 +48526,8 @@
         <w:t xml:space="preserve">but it lets the reviewer follow repository-specific guidance.</w:t>
       </w:r>
     </w:p>
-    <w:bookmarkEnd w:id="325"/>
-    <w:bookmarkStart w:id="326" w:name="requesting-and-automating-reviews"/>
+    <w:bookmarkEnd w:id="328"/>
+    <w:bookmarkStart w:id="329" w:name="requesting-and-automating-reviews"/>
     <w:p>
       <w:pPr>
         <w:pStyle w:val="Heading4"/>
@@ -47857,8 +48678,8 @@
         <w:t xml:space="preserve">It can overlap with the general review’s security findings.</w:t>
       </w:r>
     </w:p>
-    <w:bookmarkEnd w:id="326"/>
-    <w:bookmarkStart w:id="327" w:name="Xcb3957535c68d0d36c3ddb2e418364eec25d64f"/>
+    <w:bookmarkEnd w:id="329"/>
+    <w:bookmarkStart w:id="330" w:name="Xcb3957535c68d0d36c3ddb2e418364eec25d64f"/>
     <w:p>
       <w:pPr>
         <w:pStyle w:val="Heading4"/>
@@ -48144,8 +48965,8 @@
         <w:t xml:space="preserve">both sides must permit the integration.</w:t>
       </w:r>
     </w:p>
-    <w:bookmarkEnd w:id="327"/>
-    <w:bookmarkStart w:id="328" w:name="X5db1f82696679006fc24d2d9f8d9499d172a6a5"/>
+    <w:bookmarkEnd w:id="330"/>
+    <w:bookmarkStart w:id="331" w:name="X5db1f82696679006fc24d2d9f8d9499d172a6a5"/>
     <w:p>
       <w:pPr>
         <w:pStyle w:val="Heading4"/>
@@ -48242,8 +49063,8 @@
         <w:t xml:space="preserve">Do not copy personal ChatGPT or Codex login credentials into CI secrets.</w:t>
       </w:r>
     </w:p>
-    <w:bookmarkEnd w:id="328"/>
-    <w:bookmarkStart w:id="330" w:name="adding-repository-specific-review-rules"/>
+    <w:bookmarkEnd w:id="331"/>
+    <w:bookmarkStart w:id="333" w:name="adding-repository-specific-review-rules"/>
     <w:p>
       <w:pPr>
         <w:pStyle w:val="Heading4"/>
@@ -48477,7 +49298,7 @@
       <w:r>
         <w:t xml:space="preserve"> </w:t>
       </w:r>
-      <w:hyperlink r:id="rId329">
+      <w:hyperlink r:id="rId332">
         <w:r>
           <w:rPr>
             <w:rStyle w:val="Hyperlink"/>
@@ -48489,9 +49310,9 @@
         <w:t xml:space="preserve">.</w:t>
       </w:r>
     </w:p>
-    <w:bookmarkEnd w:id="330"/>
-    <w:bookmarkEnd w:id="331"/>
-    <w:bookmarkStart w:id="346" w:name="sec-ai-claude-code-action-review"/>
+    <w:bookmarkEnd w:id="333"/>
+    <w:bookmarkEnd w:id="334"/>
+    <w:bookmarkStart w:id="349" w:name="sec-ai-claude-code-action-review"/>
     <w:p>
       <w:pPr>
         <w:pStyle w:val="Heading1"/>
@@ -48510,7 +49331,7 @@
       <w:r>
         <w:t xml:space="preserve"> </w:t>
       </w:r>
-      <w:hyperlink r:id="rId332">
+      <w:hyperlink r:id="rId335">
         <w:r>
           <w:rPr>
             <w:rStyle w:val="Hyperlink"/>
@@ -48616,7 +49437,7 @@
         <w:t xml:space="preserve">paths can move).</w:t>
       </w:r>
     </w:p>
-    <w:bookmarkStart w:id="336" w:name="one-action-many-behaviors"/>
+    <w:bookmarkStart w:id="339" w:name="one-action-many-behaviors"/>
     <w:p>
       <w:pPr>
         <w:pStyle w:val="Heading4"/>
@@ -48635,7 +49456,7 @@
       <w:r>
         <w:t xml:space="preserve"> </w:t>
       </w:r>
-      <w:hyperlink r:id="rId333">
+      <w:hyperlink r:id="rId336">
         <w:r>
           <w:rPr>
             <w:rStyle w:val="VerbatimChar"/>
@@ -48794,7 +49615,7 @@
       <w:r>
         <w:t xml:space="preserve"> </w:t>
       </w:r>
-      <w:hyperlink r:id="rId334">
+      <w:hyperlink r:id="rId337">
         <w:r>
           <w:rPr>
             <w:rStyle w:val="VerbatimChar"/>
@@ -48832,7 +49653,7 @@
       <w:r>
         <w:t xml:space="preserve"> </w:t>
       </w:r>
-      <w:hyperlink r:id="rId335">
+      <w:hyperlink r:id="rId338">
         <w:r>
           <w:rPr>
             <w:rStyle w:val="VerbatimChar"/>
@@ -48856,8 +49677,8 @@
         <w:t xml:space="preserve">not the in-repo path.</w:t>
       </w:r>
     </w:p>
-    <w:bookmarkEnd w:id="336"/>
-    <w:bookmarkStart w:id="341" w:name="where-the-repository-reviews-its-own-prs"/>
+    <w:bookmarkEnd w:id="339"/>
+    <w:bookmarkStart w:id="344" w:name="where-the-repository-reviews-its-own-prs"/>
     <w:p>
       <w:pPr>
         <w:pStyle w:val="Heading4"/>
@@ -48873,7 +49694,7 @@
           <w:numId w:val="1138"/>
         </w:numPr>
       </w:pPr>
-      <w:hyperlink r:id="rId337">
+      <w:hyperlink r:id="rId340">
         <w:r>
           <w:rPr>
             <w:rStyle w:val="VerbatimChar"/>
@@ -48958,7 +49779,7 @@
           <w:numId w:val="1138"/>
         </w:numPr>
       </w:pPr>
-      <w:hyperlink r:id="rId338">
+      <w:hyperlink r:id="rId341">
         <w:r>
           <w:rPr>
             <w:rStyle w:val="VerbatimChar"/>
@@ -49002,7 +49823,7 @@
       <w:r>
         <w:t xml:space="preserve"> </w:t>
       </w:r>
-      <w:hyperlink r:id="rId339">
+      <w:hyperlink r:id="rId342">
         <w:r>
           <w:rPr>
             <w:rStyle w:val="VerbatimChar"/>
@@ -49116,7 +49937,7 @@
           <w:numId w:val="1138"/>
         </w:numPr>
       </w:pPr>
-      <w:hyperlink r:id="rId340">
+      <w:hyperlink r:id="rId343">
         <w:r>
           <w:rPr>
             <w:rStyle w:val="VerbatimChar"/>
@@ -49143,8 +49964,8 @@
         <w:t xml:space="preserve">are copy-paste templates for adding review to another repository.</w:t>
       </w:r>
     </w:p>
-    <w:bookmarkEnd w:id="341"/>
-    <w:bookmarkStart w:id="342" w:name="adding-review-to-your-own-repository"/>
+    <w:bookmarkEnd w:id="344"/>
+    <w:bookmarkStart w:id="345" w:name="adding-review-to-your-own-repository"/>
     <w:p>
       <w:pPr>
         <w:pStyle w:val="Heading4"/>
@@ -49310,8 +50131,8 @@
         <w:t xml:space="preserve">so you edit it the way you would edit any review checklist.</w:t>
       </w:r>
     </w:p>
-    <w:bookmarkEnd w:id="342"/>
-    <w:bookmarkStart w:id="344" w:name="reviewer-versus-claude-agent"/>
+    <w:bookmarkEnd w:id="345"/>
+    <w:bookmarkStart w:id="347" w:name="reviewer-versus-claude-agent"/>
     <w:p>
       <w:pPr>
         <w:pStyle w:val="Heading4"/>
@@ -49345,7 +50166,7 @@
       <w:r>
         <w:t xml:space="preserve"> </w:t>
       </w:r>
-      <w:hyperlink r:id="rId343">
+      <w:hyperlink r:id="rId346">
         <w:r>
           <w:rPr>
             <w:rStyle w:val="VerbatimChar"/>
@@ -49593,8 +50414,8 @@
         <w:t xml:space="preserve">-triggered workflow does.</w:t>
       </w:r>
     </w:p>
-    <w:bookmarkEnd w:id="344"/>
-    <w:bookmarkStart w:id="345" w:name="relation-to-codex-native-review"/>
+    <w:bookmarkEnd w:id="347"/>
+    <w:bookmarkStart w:id="348" w:name="relation-to-codex-native-review"/>
     <w:p>
       <w:pPr>
         <w:pStyle w:val="Heading4"/>
@@ -49667,9 +50488,9 @@
         <w:t xml:space="preserve">and triggering events are all visible and editable in your repository.</w:t>
       </w:r>
     </w:p>
-    <w:bookmarkEnd w:id="345"/>
-    <w:bookmarkEnd w:id="346"/>
-    <w:bookmarkStart w:id="356" w:name="sec-ai-pr-activity-notifications"/>
+    <w:bookmarkEnd w:id="348"/>
+    <w:bookmarkEnd w:id="349"/>
+    <w:bookmarkStart w:id="359" w:name="sec-ai-pr-activity-notifications"/>
     <w:p>
       <w:pPr>
         <w:pStyle w:val="Heading1"/>
@@ -50013,7 +50834,7 @@
         </w:tc>
       </w:tr>
     </w:tbl>
-    <w:bookmarkStart w:id="347" w:name="the-channel-an-agent-controls"/>
+    <w:bookmarkStart w:id="350" w:name="the-channel-an-agent-controls"/>
     <w:p>
       <w:pPr>
         <w:pStyle w:val="Heading4"/>
@@ -50287,8 +51108,8 @@
         <w:t xml:space="preserve">real state, not a replacement for it.</w:t>
       </w:r>
     </w:p>
-    <w:bookmarkEnd w:id="347"/>
-    <w:bookmarkStart w:id="348" w:name="the-channel-only-a-human-controls"/>
+    <w:bookmarkEnd w:id="350"/>
+    <w:bookmarkStart w:id="351" w:name="the-channel-only-a-human-controls"/>
     <w:p>
       <w:pPr>
         <w:pStyle w:val="Heading4"/>
@@ -50591,8 +51412,8 @@
         <w:t xml:space="preserve">for the web-session context these run in.</w:t>
       </w:r>
     </w:p>
-    <w:bookmarkEnd w:id="348"/>
-    <w:bookmarkStart w:id="349" w:name="the-instruction-template-is-boilerplate"/>
+    <w:bookmarkEnd w:id="351"/>
+    <w:bookmarkStart w:id="352" w:name="the-instruction-template-is-boilerplate"/>
     <w:p>
       <w:pPr>
         <w:pStyle w:val="Heading4"/>
@@ -50858,8 +51679,8 @@
         <w:t xml:space="preserve">rather than as an instruction that a fix is owed.</w:t>
       </w:r>
     </w:p>
-    <w:bookmarkEnd w:id="349"/>
-    <w:bookmarkStart w:id="350" w:name="X3e28e99804e56791cb9e57e9eb83869f0ead0b2"/>
+    <w:bookmarkEnd w:id="352"/>
+    <w:bookmarkStart w:id="353" w:name="X3e28e99804e56791cb9e57e9eb83869f0ead0b2"/>
     <w:p>
       <w:pPr>
         <w:pStyle w:val="Heading4"/>
@@ -50988,8 +51809,8 @@
         <w:t xml:space="preserve">Toggling one says nothing about the other.</w:t>
       </w:r>
     </w:p>
-    <w:bookmarkEnd w:id="350"/>
-    <w:bookmarkStart w:id="355" w:name="treat-what-arrives-as-untrusted"/>
+    <w:bookmarkEnd w:id="353"/>
+    <w:bookmarkStart w:id="358" w:name="treat-what-arrives-as-untrusted"/>
     <w:p>
       <w:pPr>
         <w:pStyle w:val="Heading4"/>
@@ -51358,12 +52179,12 @@
                 <wp:inline>
                   <wp:extent cx="152400" cy="152400"/>
                   <wp:effectExtent b="0" l="0" r="0" t="0"/>
-                  <wp:docPr descr="" title="" id="351" name="Picture"/>
+                  <wp:docPr descr="" title="" id="354" name="Picture"/>
                   <a:graphic>
                     <a:graphicData uri="http://schemas.openxmlformats.org/drawingml/2006/picture">
                       <pic:pic>
                         <pic:nvPicPr>
-                          <pic:cNvPr descr="/opt/quarto/share/formats/docx/warning.png" id="352" name="Picture"/>
+                          <pic:cNvPr descr="/opt/quarto/share/formats/docx/warning.png" id="355" name="Picture"/>
                           <pic:cNvPicPr>
                             <a:picLocks noChangeArrowheads="1" noChangeAspect="1"/>
                           </pic:cNvPicPr>
@@ -51534,12 +52355,12 @@
                 <wp:inline>
                   <wp:extent cx="152400" cy="152400"/>
                   <wp:effectExtent b="0" l="0" r="0" t="0"/>
-                  <wp:docPr descr="" title="" id="353" name="Picture"/>
+                  <wp:docPr descr="" title="" id="356" name="Picture"/>
                   <a:graphic>
                     <a:graphicData uri="http://schemas.openxmlformats.org/drawingml/2006/picture">
                       <pic:pic>
                         <pic:nvPicPr>
-                          <pic:cNvPr descr="/opt/quarto/share/formats/docx/note.png" id="354" name="Picture"/>
+                          <pic:cNvPr descr="/opt/quarto/share/formats/docx/note.png" id="357" name="Picture"/>
                           <pic:cNvPicPr>
                             <a:picLocks noChangeArrowheads="1" noChangeAspect="1"/>
                           </pic:cNvPicPr>
@@ -51645,9 +52466,9 @@
         </w:tc>
       </w:tr>
     </w:tbl>
-    <w:bookmarkEnd w:id="355"/>
-    <w:bookmarkEnd w:id="356"/>
-    <w:bookmarkStart w:id="360" w:name="sec-ai-when-to-use"/>
+    <w:bookmarkEnd w:id="358"/>
+    <w:bookmarkEnd w:id="359"/>
+    <w:bookmarkStart w:id="363" w:name="sec-ai-when-to-use"/>
     <w:p>
       <w:pPr>
         <w:pStyle w:val="Heading1"/>
@@ -51667,7 +52488,7 @@
         <w:rPr>
           <w:rStyle w:val="FootnoteReference"/>
         </w:rPr>
-        <w:footnoteReference w:id="357"/>
+        <w:footnoteReference w:id="360"/>
       </w:r>
       <w:r>
         <w:t xml:space="preserve"> </w:t>
@@ -51699,7 +52520,7 @@
       <w:r>
         <w:t xml:space="preserve"> </w:t>
       </w:r>
-      <w:hyperlink r:id="rId358">
+      <w:hyperlink r:id="rId361">
         <w:r>
           <w:rPr>
             <w:rStyle w:val="Hyperlink"/>
@@ -51758,7 +52579,7 @@
       <w:r>
         <w:t xml:space="preserve"> </w:t>
       </w:r>
-      <w:hyperlink r:id="rId359">
+      <w:hyperlink r:id="rId362">
         <w:r>
           <w:rPr>
             <w:rStyle w:val="Hyperlink"/>
@@ -51877,8 +52698,8 @@
         <w:t xml:space="preserve">just like you would for any other skill you want to maintain.</w:t>
       </w:r>
     </w:p>
-    <w:bookmarkEnd w:id="360"/>
-    <w:bookmarkStart w:id="365" w:name="editing-with-.docx-files"/>
+    <w:bookmarkEnd w:id="363"/>
+    <w:bookmarkStart w:id="368" w:name="editing-with-.docx-files"/>
     <w:p>
       <w:pPr>
         <w:pStyle w:val="Heading1"/>
@@ -52058,7 +52879,7 @@
         <w:t xml:space="preserve">This approach makes it easier for collaborators who are more comfortable with Word to contribute while maintaining the source files in Quarto format.</w:t>
       </w:r>
     </w:p>
-    <w:bookmarkStart w:id="364" w:name="known-issue-document-1-warning-in-word"/>
+    <w:bookmarkStart w:id="367" w:name="known-issue-document-1-warning-in-word"/>
     <w:p>
       <w:pPr>
         <w:pStyle w:val="Heading4"/>
@@ -52143,7 +52964,7 @@
           <w:numId w:val="1146"/>
         </w:numPr>
       </w:pPr>
-      <w:hyperlink r:id="rId361">
+      <w:hyperlink r:id="rId364">
         <w:r>
           <w:rPr>
             <w:rStyle w:val="Hyperlink"/>
@@ -52160,7 +52981,7 @@
           <w:numId w:val="1146"/>
         </w:numPr>
       </w:pPr>
-      <w:hyperlink r:id="rId362">
+      <w:hyperlink r:id="rId365">
         <w:r>
           <w:rPr>
             <w:rStyle w:val="Hyperlink"/>
@@ -52177,7 +52998,7 @@
           <w:numId w:val="1146"/>
         </w:numPr>
       </w:pPr>
-      <w:hyperlink r:id="rId363">
+      <w:hyperlink r:id="rId366">
         <w:r>
           <w:rPr>
             <w:rStyle w:val="Hyperlink"/>
@@ -52290,9 +53111,9 @@
         <w:t xml:space="preserve">warning and can immediately add comments and track changes without issues.</w:t>
       </w:r>
     </w:p>
-    <w:bookmarkEnd w:id="364"/>
-    <w:bookmarkEnd w:id="365"/>
-    <w:bookmarkStart w:id="367" w:name="copilot-instructions-for-this-repository"/>
+    <w:bookmarkEnd w:id="367"/>
+    <w:bookmarkEnd w:id="368"/>
+    <w:bookmarkStart w:id="370" w:name="copilot-instructions-for-this-repository"/>
     <w:p>
       <w:pPr>
         <w:pStyle w:val="Heading1"/>
@@ -52524,7 +53345,7 @@
       <w:r>
         <w:t xml:space="preserve"> </w:t>
       </w:r>
-      <w:hyperlink r:id="rId366">
+      <w:hyperlink r:id="rId369">
         <w:r>
           <w:rPr>
             <w:rStyle w:val="VerbatimChar"/>
@@ -52539,8 +53360,8 @@
         <w:t xml:space="preserve">for a working example.</w:t>
       </w:r>
     </w:p>
-    <w:bookmarkEnd w:id="367"/>
-    <w:bookmarkStart w:id="368" w:name="using-copilot-review-before-human-review"/>
+    <w:bookmarkEnd w:id="370"/>
+    <w:bookmarkStart w:id="371" w:name="using-copilot-review-before-human-review"/>
     <w:p>
       <w:pPr>
         <w:pStyle w:val="Heading1"/>
@@ -53126,8 +53947,8 @@
         <w:t xml:space="preserve">This ensures you’re reviewing code that has already been through initial automated quality checks.</w:t>
       </w:r>
     </w:p>
-    <w:bookmarkEnd w:id="368"/>
-    <w:bookmarkStart w:id="370" w:name="reviewing-a-copilot-pr-you-didnt-create"/>
+    <w:bookmarkEnd w:id="371"/>
+    <w:bookmarkStart w:id="373" w:name="reviewing-a-copilot-pr-you-didnt-create"/>
     <w:p>
       <w:pPr>
         <w:pStyle w:val="Heading1"/>
@@ -53178,7 +53999,7 @@
       <w:r>
         <w:t xml:space="preserve"> </w:t>
       </w:r>
-      <w:hyperlink r:id="rId369">
+      <w:hyperlink r:id="rId372">
         <w:r>
           <w:rPr>
             <w:rStyle w:val="Hyperlink"/>
@@ -54082,8 +54903,8 @@
         <w:t xml:space="preserve">while benefiting from collaborative human review and Copilot’s implementation capabilities.</w:t>
       </w:r>
     </w:p>
-    <w:bookmarkEnd w:id="370"/>
-    <w:bookmarkStart w:id="389" w:name="sec-ai-claude-code-windows"/>
+    <w:bookmarkEnd w:id="373"/>
+    <w:bookmarkStart w:id="392" w:name="sec-ai-claude-code-windows"/>
     <w:p>
       <w:pPr>
         <w:pStyle w:val="Heading1"/>
@@ -54182,12 +55003,12 @@
                 <wp:inline>
                   <wp:extent cx="152400" cy="152400"/>
                   <wp:effectExtent b="0" l="0" r="0" t="0"/>
-                  <wp:docPr descr="" title="" id="371" name="Picture"/>
+                  <wp:docPr descr="" title="" id="374" name="Picture"/>
                   <a:graphic>
                     <a:graphicData uri="http://schemas.openxmlformats.org/drawingml/2006/picture">
                       <pic:pic>
                         <pic:nvPicPr>
-                          <pic:cNvPr descr="/opt/quarto/share/formats/docx/note.png" id="372" name="Picture"/>
+                          <pic:cNvPr descr="/opt/quarto/share/formats/docx/note.png" id="375" name="Picture"/>
                           <pic:cNvPicPr>
                             <a:picLocks noChangeArrowheads="1" noChangeAspect="1"/>
                           </pic:cNvPicPr>
@@ -54275,7 +55096,7 @@
         </w:tc>
       </w:tr>
     </w:tbl>
-    <w:bookmarkStart w:id="375" w:name="run-it-from-a-unix-like-terminal"/>
+    <w:bookmarkStart w:id="378" w:name="run-it-from-a-unix-like-terminal"/>
     <w:p>
       <w:pPr>
         <w:pStyle w:val="Heading4"/>
@@ -54322,7 +55143,7 @@
       <w:r>
         <w:t xml:space="preserve"> </w:t>
       </w:r>
-      <w:hyperlink r:id="rId373">
+      <w:hyperlink r:id="rId376">
         <w:r>
           <w:rPr>
             <w:rStyle w:val="Hyperlink"/>
@@ -54355,7 +55176,7 @@
       <w:r>
         <w:t xml:space="preserve">(</w:t>
       </w:r>
-      <w:hyperlink r:id="rId374">
+      <w:hyperlink r:id="rId377">
         <w:r>
           <w:rPr>
             <w:rStyle w:val="Hyperlink"/>
@@ -54506,8 +55327,8 @@
         <w:t xml:space="preserve">gotchas below don’t apply.</w:t>
       </w:r>
     </w:p>
-    <w:bookmarkEnd w:id="375"/>
-    <w:bookmarkStart w:id="380" w:name="install-claude-code"/>
+    <w:bookmarkEnd w:id="378"/>
+    <w:bookmarkStart w:id="383" w:name="install-claude-code"/>
     <w:p>
       <w:pPr>
         <w:pStyle w:val="Heading4"/>
@@ -54672,7 +55493,7 @@
       <w:r>
         <w:t xml:space="preserve"> </w:t>
       </w:r>
-      <w:hyperlink r:id="rId376">
+      <w:hyperlink r:id="rId379">
         <w:r>
           <w:rPr>
             <w:rStyle w:val="Hyperlink"/>
@@ -54758,12 +55579,12 @@
                 <wp:inline>
                   <wp:extent cx="152400" cy="152400"/>
                   <wp:effectExtent b="0" l="0" r="0" t="0"/>
-                  <wp:docPr descr="" title="" id="377" name="Picture"/>
+                  <wp:docPr descr="" title="" id="380" name="Picture"/>
                   <a:graphic>
                     <a:graphicData uri="http://schemas.openxmlformats.org/drawingml/2006/picture">
                       <pic:pic>
                         <pic:nvPicPr>
-                          <pic:cNvPr descr="/opt/quarto/share/formats/docx/important.png" id="378" name="Picture"/>
+                          <pic:cNvPr descr="/opt/quarto/share/formats/docx/important.png" id="381" name="Picture"/>
                           <pic:cNvPicPr>
                             <a:picLocks noChangeArrowheads="1" noChangeAspect="1"/>
                           </pic:cNvPicPr>
@@ -54919,7 +55740,7 @@
             <w:r>
               <w:t xml:space="preserve"> </w:t>
             </w:r>
-            <w:hyperlink r:id="rId379">
+            <w:hyperlink r:id="rId382">
               <w:r>
                 <w:rPr>
                   <w:rStyle w:val="Hyperlink"/>
@@ -55010,8 +55831,8 @@
         </w:tc>
       </w:tr>
     </w:tbl>
-    <w:bookmarkEnd w:id="380"/>
-    <w:bookmarkStart w:id="382" w:name="make-sure-your-shell-can-find-claude"/>
+    <w:bookmarkEnd w:id="383"/>
+    <w:bookmarkStart w:id="385" w:name="make-sure-your-shell-can-find-claude"/>
     <w:p>
       <w:pPr>
         <w:pStyle w:val="Heading4"/>
@@ -55609,7 +56430,7 @@
       <w:r>
         <w:t xml:space="preserve"> </w:t>
       </w:r>
-      <w:hyperlink r:id="rId381">
+      <w:hyperlink r:id="rId384">
         <w:r>
           <w:rPr>
             <w:rStyle w:val="Hyperlink"/>
@@ -55715,8 +56536,8 @@
         <w:t xml:space="preserve">initializes).</w:t>
       </w:r>
     </w:p>
-    <w:bookmarkEnd w:id="382"/>
-    <w:bookmarkStart w:id="385" w:name="X604325b0223e79803e04f87e7874b1d7f4a0663"/>
+    <w:bookmarkEnd w:id="385"/>
+    <w:bookmarkStart w:id="388" w:name="X604325b0223e79803e04f87e7874b1d7f4a0663"/>
     <w:p>
       <w:pPr>
         <w:pStyle w:val="Heading4"/>
@@ -55766,12 +56587,12 @@
                 <wp:inline>
                   <wp:extent cx="152400" cy="152400"/>
                   <wp:effectExtent b="0" l="0" r="0" t="0"/>
-                  <wp:docPr descr="" title="" id="383" name="Picture"/>
+                  <wp:docPr descr="" title="" id="386" name="Picture"/>
                   <a:graphic>
                     <a:graphicData uri="http://schemas.openxmlformats.org/drawingml/2006/picture">
                       <pic:pic>
                         <pic:nvPicPr>
-                          <pic:cNvPr descr="/opt/quarto/share/formats/docx/warning.png" id="384" name="Picture"/>
+                          <pic:cNvPr descr="/opt/quarto/share/formats/docx/warning.png" id="387" name="Picture"/>
                           <pic:cNvPicPr>
                             <a:picLocks noChangeArrowheads="1" noChangeAspect="1"/>
                           </pic:cNvPicPr>
@@ -56039,8 +56860,8 @@
         </w:tc>
       </w:tr>
     </w:tbl>
-    <w:bookmarkEnd w:id="385"/>
-    <w:bookmarkStart w:id="387" w:name="X1745fd502df7963ed7ce48d0465493b4d59ad92"/>
+    <w:bookmarkEnd w:id="388"/>
+    <w:bookmarkStart w:id="390" w:name="X1745fd502df7963ed7ce48d0465493b4d59ad92"/>
     <w:p>
       <w:pPr>
         <w:pStyle w:val="Heading4"/>
@@ -56059,7 +56880,7 @@
       <w:r>
         <w:t xml:space="preserve"> </w:t>
       </w:r>
-      <w:hyperlink r:id="rId386">
+      <w:hyperlink r:id="rId389">
         <w:r>
           <w:rPr>
             <w:rStyle w:val="Hyperlink"/>
@@ -56220,8 +57041,8 @@
         <w:t xml:space="preserve">.</w:t>
       </w:r>
     </w:p>
-    <w:bookmarkEnd w:id="387"/>
-    <w:bookmarkStart w:id="388" w:name="verify-the-install"/>
+    <w:bookmarkEnd w:id="390"/>
+    <w:bookmarkStart w:id="391" w:name="verify-the-install"/>
     <w:p>
       <w:pPr>
         <w:pStyle w:val="Heading4"/>
@@ -56390,9 +57211,9 @@
         <w:t xml:space="preserve">(or open a fresh window) after changing it.</w:t>
       </w:r>
     </w:p>
-    <w:bookmarkEnd w:id="388"/>
-    <w:bookmarkEnd w:id="389"/>
-    <w:bookmarkStart w:id="403" w:name="sec-ai-mcp-server-setup"/>
+    <w:bookmarkEnd w:id="391"/>
+    <w:bookmarkEnd w:id="392"/>
+    <w:bookmarkStart w:id="406" w:name="sec-ai-mcp-server-setup"/>
     <w:p>
       <w:pPr>
         <w:pStyle w:val="Heading1"/>
@@ -56513,12 +57334,12 @@
                 <wp:inline>
                   <wp:extent cx="152400" cy="152400"/>
                   <wp:effectExtent b="0" l="0" r="0" t="0"/>
-                  <wp:docPr descr="" title="" id="390" name="Picture"/>
+                  <wp:docPr descr="" title="" id="393" name="Picture"/>
                   <a:graphic>
                     <a:graphicData uri="http://schemas.openxmlformats.org/drawingml/2006/picture">
                       <pic:pic>
                         <pic:nvPicPr>
-                          <pic:cNvPr descr="/opt/quarto/share/formats/docx/note.png" id="391" name="Picture"/>
+                          <pic:cNvPr descr="/opt/quarto/share/formats/docx/note.png" id="394" name="Picture"/>
                           <pic:cNvPicPr>
                             <a:picLocks noChangeArrowheads="1" noChangeAspect="1"/>
                           </pic:cNvPicPr>
@@ -56612,7 +57433,7 @@
         </w:tc>
       </w:tr>
     </w:tbl>
-    <w:bookmarkStart w:id="393" w:name="installed-is-not-registered"/>
+    <w:bookmarkStart w:id="396" w:name="installed-is-not-registered"/>
     <w:p>
       <w:pPr>
         <w:pStyle w:val="Heading4"/>
@@ -56643,7 +57464,7 @@
       <w:r>
         <w:t xml:space="preserve"> </w:t>
       </w:r>
-      <w:hyperlink r:id="rId392">
+      <w:hyperlink r:id="rId395">
         <w:r>
           <w:rPr>
             <w:rStyle w:val="VerbatimChar"/>
@@ -56711,8 +57532,8 @@
         <w:t xml:space="preserve"> mcp list</w:t>
       </w:r>
     </w:p>
-    <w:bookmarkEnd w:id="393"/>
-    <w:bookmarkStart w:id="394" w:name="Xf6682145328c756d2e167d2c91be34f7f913a7f"/>
+    <w:bookmarkEnd w:id="396"/>
+    <w:bookmarkStart w:id="397" w:name="Xf6682145328c756d2e167d2c91be34f7f913a7f"/>
     <w:p>
       <w:pPr>
         <w:pStyle w:val="Heading4"/>
@@ -56911,8 +57732,8 @@
         <w:t xml:space="preserve">A local one shows a command path instead.</w:t>
       </w:r>
     </w:p>
-    <w:bookmarkEnd w:id="394"/>
-    <w:bookmarkStart w:id="395" w:name="and-401-mean-different-things"/>
+    <w:bookmarkEnd w:id="397"/>
+    <w:bookmarkStart w:id="398" w:name="and-401-mean-different-things"/>
     <w:p>
       <w:pPr>
         <w:pStyle w:val="Heading4"/>
@@ -57155,8 +57976,8 @@
         <w:t xml:space="preserve">sends you to the token-minting page for a problem that lives in a config file.</w:t>
       </w:r>
     </w:p>
-    <w:bookmarkEnd w:id="395"/>
-    <w:bookmarkStart w:id="396" w:name="install-the-binary-the-platforms-own-way"/>
+    <w:bookmarkEnd w:id="398"/>
+    <w:bookmarkStart w:id="399" w:name="install-the-binary-the-platforms-own-way"/>
     <w:p>
       <w:pPr>
         <w:pStyle w:val="Heading4"/>
@@ -57410,8 +58231,8 @@
         <w:t xml:space="preserve">with an override for the case where it isn’t on one.</w:t>
       </w:r>
     </w:p>
-    <w:bookmarkEnd w:id="396"/>
-    <w:bookmarkStart w:id="397" w:name="X2adb24e9b1a0644f0fbebe685525dadd8a56387"/>
+    <w:bookmarkEnd w:id="399"/>
+    <w:bookmarkStart w:id="400" w:name="X2adb24e9b1a0644f0fbebe685525dadd8a56387"/>
     <w:p>
       <w:pPr>
         <w:pStyle w:val="Heading4"/>
@@ -58288,8 +59109,8 @@
         <w:t xml:space="preserve">bug you just finished diagnosing.</w:t>
       </w:r>
     </w:p>
-    <w:bookmarkEnd w:id="397"/>
-    <w:bookmarkStart w:id="398" w:name="X448547516ab06679b064b391b05a896db41ea57"/>
+    <w:bookmarkEnd w:id="400"/>
+    <w:bookmarkStart w:id="401" w:name="X448547516ab06679b064b391b05a896db41ea57"/>
     <w:p>
       <w:pPr>
         <w:pStyle w:val="Heading4"/>
@@ -58611,8 +59432,8 @@
         <w:t xml:space="preserve">the count moving the right direction, as the check above expects.</w:t>
       </w:r>
     </w:p>
-    <w:bookmarkEnd w:id="398"/>
-    <w:bookmarkStart w:id="399" w:name="X4a4c9992603eee0123b58b5b37e7fedbb817150"/>
+    <w:bookmarkEnd w:id="401"/>
+    <w:bookmarkStart w:id="402" w:name="X4a4c9992603eee0123b58b5b37e7fedbb817150"/>
     <w:p>
       <w:pPr>
         <w:pStyle w:val="Heading4"/>
@@ -58712,8 +59533,8 @@
         <w:t xml:space="preserve">Reach for those instead when working from a local harness.</w:t>
       </w:r>
     </w:p>
-    <w:bookmarkEnd w:id="399"/>
-    <w:bookmarkStart w:id="400" w:name="Xb256c2a3c0a422f2f687a98903d3521fd60a1b1"/>
+    <w:bookmarkEnd w:id="402"/>
+    <w:bookmarkStart w:id="403" w:name="Xb256c2a3c0a422f2f687a98903d3521fd60a1b1"/>
     <w:p>
       <w:pPr>
         <w:pStyle w:val="Heading4"/>
@@ -58889,8 +59710,8 @@
         <w:t xml:space="preserve">not something an agent does in passing.</w:t>
       </w:r>
     </w:p>
-    <w:bookmarkEnd w:id="400"/>
-    <w:bookmarkStart w:id="402" w:name="Xd44df015462fcf288556a538677f0a762c9ef1d"/>
+    <w:bookmarkEnd w:id="403"/>
+    <w:bookmarkStart w:id="405" w:name="Xd44df015462fcf288556a538677f0a762c9ef1d"/>
     <w:p>
       <w:pPr>
         <w:pStyle w:val="Heading4"/>
@@ -59004,7 +59825,7 @@
       <w:r>
         <w:t xml:space="preserve"> </w:t>
       </w:r>
-      <w:hyperlink r:id="rId401">
+      <w:hyperlink r:id="rId404">
         <w:r>
           <w:rPr>
             <w:rStyle w:val="Hyperlink"/>
@@ -59187,9 +60008,9 @@
         <w:t xml:space="preserve">and expect it to work.</w:t>
       </w:r>
     </w:p>
-    <w:bookmarkEnd w:id="402"/>
-    <w:bookmarkEnd w:id="403"/>
-    <w:bookmarkStart w:id="411" w:name="sec-ai-gemini-spend-management"/>
+    <w:bookmarkEnd w:id="405"/>
+    <w:bookmarkEnd w:id="406"/>
+    <w:bookmarkStart w:id="414" w:name="sec-ai-gemini-spend-management"/>
     <w:p>
       <w:pPr>
         <w:pStyle w:val="Heading1"/>
@@ -59218,7 +60039,7 @@
         <w:t xml:space="preserve">and optimize token consumption across local tools and GitHub Actions workflows.</w:t>
       </w:r>
     </w:p>
-    <w:bookmarkStart w:id="405" w:name="Xd8c10be17edf039db5b664720f228274181ba18"/>
+    <w:bookmarkStart w:id="408" w:name="Xd8c10be17edf039db5b664720f228274181ba18"/>
     <w:p>
       <w:pPr>
         <w:pStyle w:val="Heading4"/>
@@ -59282,7 +60103,7 @@
       <w:r>
         <w:t xml:space="preserve"> </w:t>
       </w:r>
-      <w:hyperlink r:id="rId404">
+      <w:hyperlink r:id="rId407">
         <w:r>
           <w:rPr>
             <w:rStyle w:val="Hyperlink"/>
@@ -59377,7 +60198,7 @@
       <w:r>
         <w:t xml:space="preserve"> </w:t>
       </w:r>
-      <w:hyperlink r:id="rId404">
+      <w:hyperlink r:id="rId407">
         <w:r>
           <w:rPr>
             <w:rStyle w:val="Hyperlink"/>
@@ -59413,8 +60234,8 @@
         <w:t xml:space="preserve">Any project that has hit its monthly spend cap will have its API requests paused until the limit is updated.</w:t>
       </w:r>
     </w:p>
-    <w:bookmarkEnd w:id="405"/>
-    <w:bookmarkStart w:id="407" w:name="adjusting-and-unpausing-spend-caps"/>
+    <w:bookmarkEnd w:id="408"/>
+    <w:bookmarkStart w:id="410" w:name="adjusting-and-unpausing-spend-caps"/>
     <w:p>
       <w:pPr>
         <w:pStyle w:val="Heading4"/>
@@ -59445,7 +60266,7 @@
       <w:r>
         <w:t xml:space="preserve"> </w:t>
       </w:r>
-      <w:hyperlink r:id="rId406">
+      <w:hyperlink r:id="rId409">
         <w:r>
           <w:rPr>
             <w:rStyle w:val="Hyperlink"/>
@@ -59514,8 +60335,8 @@
         <w:t xml:space="preserve">and API service automatically resumes up to the configured cap.</w:t>
       </w:r>
     </w:p>
-    <w:bookmarkEnd w:id="407"/>
-    <w:bookmarkStart w:id="409" w:name="setting-up-google-cloud-budget-alerts"/>
+    <w:bookmarkEnd w:id="410"/>
+    <w:bookmarkStart w:id="412" w:name="setting-up-google-cloud-budget-alerts"/>
     <w:p>
       <w:pPr>
         <w:pStyle w:val="Heading4"/>
@@ -59546,7 +60367,7 @@
       <w:r>
         <w:t xml:space="preserve"> </w:t>
       </w:r>
-      <w:hyperlink r:id="rId408">
+      <w:hyperlink r:id="rId411">
         <w:r>
           <w:rPr>
             <w:rStyle w:val="Hyperlink"/>
@@ -59698,8 +60519,8 @@
         <w:t xml:space="preserve">. You will receive email alerts before any project hits its spend cap.</w:t>
       </w:r>
     </w:p>
-    <w:bookmarkEnd w:id="409"/>
-    <w:bookmarkStart w:id="410" w:name="cost-optimization-best-practices"/>
+    <w:bookmarkEnd w:id="412"/>
+    <w:bookmarkStart w:id="413" w:name="cost-optimization-best-practices"/>
     <w:p>
       <w:pPr>
         <w:pStyle w:val="Heading4"/>
@@ -60014,9 +60835,9 @@
         <w:t xml:space="preserve">to collapse them in GitHub’s web diff view and exclude them from repository language statistics.</w:t>
       </w:r>
     </w:p>
-    <w:bookmarkEnd w:id="410"/>
-    <w:bookmarkEnd w:id="411"/>
-    <w:bookmarkStart w:id="441" w:name="references"/>
+    <w:bookmarkEnd w:id="413"/>
+    <w:bookmarkEnd w:id="414"/>
+    <w:bookmarkStart w:id="444" w:name="references"/>
     <w:p>
       <w:pPr>
         <w:pStyle w:val="Heading1"/>
@@ -60025,8 +60846,8 @@
         <w:t xml:space="preserve">References</w:t>
       </w:r>
     </w:p>
-    <w:bookmarkStart w:id="440" w:name="refs"/>
-    <w:bookmarkStart w:id="413" w:name="ref-space_odyssey"/>
+    <w:bookmarkStart w:id="443" w:name="refs"/>
+    <w:bookmarkStart w:id="416" w:name="ref-space_odyssey"/>
     <w:p>
       <w:pPr>
         <w:pStyle w:val="Bibliography"/>
@@ -60044,7 +60865,7 @@
       <w:r>
         <w:t xml:space="preserve"> </w:t>
       </w:r>
-      <w:hyperlink r:id="rId412">
+      <w:hyperlink r:id="rId415">
         <w:r>
           <w:rPr>
             <w:rStyle w:val="Hyperlink"/>
@@ -60056,8 +60877,8 @@
         <w:t xml:space="preserve">.</w:t>
       </w:r>
     </w:p>
-    <w:bookmarkEnd w:id="413"/>
-    <w:bookmarkStart w:id="415" w:name="ref-i_robot"/>
+    <w:bookmarkEnd w:id="416"/>
+    <w:bookmarkStart w:id="418" w:name="ref-i_robot"/>
     <w:p>
       <w:pPr>
         <w:pStyle w:val="Bibliography"/>
@@ -60081,7 +60902,7 @@
       <w:r>
         <w:t xml:space="preserve"> </w:t>
       </w:r>
-      <w:hyperlink r:id="rId414">
+      <w:hyperlink r:id="rId417">
         <w:r>
           <w:rPr>
             <w:rStyle w:val="Hyperlink"/>
@@ -60093,8 +60914,8 @@
         <w:t xml:space="preserve">.</w:t>
       </w:r>
     </w:p>
-    <w:bookmarkEnd w:id="415"/>
-    <w:bookmarkStart w:id="417" w:name="ref-battlestar_galactica_2004"/>
+    <w:bookmarkEnd w:id="418"/>
+    <w:bookmarkStart w:id="420" w:name="ref-battlestar_galactica_2004"/>
     <w:p>
       <w:pPr>
         <w:pStyle w:val="Bibliography"/>
@@ -60112,7 +60933,7 @@
       <w:r>
         <w:t xml:space="preserve"> </w:t>
       </w:r>
-      <w:hyperlink r:id="rId416">
+      <w:hyperlink r:id="rId419">
         <w:r>
           <w:rPr>
             <w:rStyle w:val="Hyperlink"/>
@@ -60124,8 +60945,8 @@
         <w:t xml:space="preserve">.</w:t>
       </w:r>
     </w:p>
-    <w:bookmarkEnd w:id="417"/>
-    <w:bookmarkStart w:id="419" w:name="ref-slm_agentic_ai"/>
+    <w:bookmarkEnd w:id="420"/>
+    <w:bookmarkStart w:id="422" w:name="ref-slm_agentic_ai"/>
     <w:p>
       <w:pPr>
         <w:pStyle w:val="Bibliography"/>
@@ -60149,7 +60970,7 @@
       <w:r>
         <w:t xml:space="preserve"> </w:t>
       </w:r>
-      <w:hyperlink r:id="rId418">
+      <w:hyperlink r:id="rId421">
         <w:r>
           <w:rPr>
             <w:rStyle w:val="Hyperlink"/>
@@ -60161,8 +60982,8 @@
         <w:t xml:space="preserve">.</w:t>
       </w:r>
     </w:p>
-    <w:bookmarkEnd w:id="419"/>
-    <w:bookmarkStart w:id="421" w:name="ref-blade_runner"/>
+    <w:bookmarkEnd w:id="422"/>
+    <w:bookmarkStart w:id="424" w:name="ref-blade_runner"/>
     <w:p>
       <w:pPr>
         <w:pStyle w:val="Bibliography"/>
@@ -60180,7 +61001,7 @@
       <w:r>
         <w:t xml:space="preserve"> </w:t>
       </w:r>
-      <w:hyperlink r:id="rId420">
+      <w:hyperlink r:id="rId423">
         <w:r>
           <w:rPr>
             <w:rStyle w:val="Hyperlink"/>
@@ -60192,8 +61013,8 @@
         <w:t xml:space="preserve">.</w:t>
       </w:r>
     </w:p>
-    <w:bookmarkEnd w:id="421"/>
-    <w:bookmarkStart w:id="423" w:name="ref-enders_game"/>
+    <w:bookmarkEnd w:id="424"/>
+    <w:bookmarkStart w:id="426" w:name="ref-enders_game"/>
     <w:p>
       <w:pPr>
         <w:pStyle w:val="Bibliography"/>
@@ -60217,7 +61038,7 @@
       <w:r>
         <w:t xml:space="preserve"> </w:t>
       </w:r>
-      <w:hyperlink r:id="rId422">
+      <w:hyperlink r:id="rId425">
         <w:r>
           <w:rPr>
             <w:rStyle w:val="Hyperlink"/>
@@ -60229,8 +61050,8 @@
         <w:t xml:space="preserve">.</w:t>
       </w:r>
     </w:p>
-    <w:bookmarkEnd w:id="423"/>
-    <w:bookmarkStart w:id="425" w:name="ref-qlora"/>
+    <w:bookmarkEnd w:id="426"/>
+    <w:bookmarkStart w:id="428" w:name="ref-qlora"/>
     <w:p>
       <w:pPr>
         <w:pStyle w:val="Bibliography"/>
@@ -60254,7 +61075,7 @@
       <w:r>
         <w:t xml:space="preserve"> </w:t>
       </w:r>
-      <w:hyperlink r:id="rId424">
+      <w:hyperlink r:id="rId427">
         <w:r>
           <w:rPr>
             <w:rStyle w:val="Hyperlink"/>
@@ -60266,8 +61087,8 @@
         <w:t xml:space="preserve">.</w:t>
       </w:r>
     </w:p>
-    <w:bookmarkEnd w:id="425"/>
-    <w:bookmarkStart w:id="427" w:name="ref-humans_are_dead"/>
+    <w:bookmarkEnd w:id="428"/>
+    <w:bookmarkStart w:id="430" w:name="ref-humans_are_dead"/>
     <w:p>
       <w:pPr>
         <w:pStyle w:val="Bibliography"/>
@@ -60291,7 +61112,7 @@
       <w:r>
         <w:t xml:space="preserve"> </w:t>
       </w:r>
-      <w:hyperlink r:id="rId426">
+      <w:hyperlink r:id="rId429">
         <w:r>
           <w:rPr>
             <w:rStyle w:val="Hyperlink"/>
@@ -60303,8 +61124,8 @@
         <w:t xml:space="preserve">.</w:t>
       </w:r>
     </w:p>
-    <w:bookmarkEnd w:id="427"/>
-    <w:bookmarkStart w:id="429" w:name="ref-dune"/>
+    <w:bookmarkEnd w:id="430"/>
+    <w:bookmarkStart w:id="432" w:name="ref-dune"/>
     <w:p>
       <w:pPr>
         <w:pStyle w:val="Bibliography"/>
@@ -60328,7 +61149,7 @@
       <w:r>
         <w:t xml:space="preserve"> </w:t>
       </w:r>
-      <w:hyperlink r:id="rId428">
+      <w:hyperlink r:id="rId431">
         <w:r>
           <w:rPr>
             <w:rStyle w:val="Hyperlink"/>
@@ -60340,8 +61161,8 @@
         <w:t xml:space="preserve">.</w:t>
       </w:r>
     </w:p>
-    <w:bookmarkEnd w:id="429"/>
-    <w:bookmarkStart w:id="431" w:name="ref-lora"/>
+    <w:bookmarkEnd w:id="432"/>
+    <w:bookmarkStart w:id="434" w:name="ref-lora"/>
     <w:p>
       <w:pPr>
         <w:pStyle w:val="Bibliography"/>
@@ -60365,7 +61186,7 @@
       <w:r>
         <w:t xml:space="preserve"> </w:t>
       </w:r>
-      <w:hyperlink r:id="rId430">
+      <w:hyperlink r:id="rId433">
         <w:r>
           <w:rPr>
             <w:rStyle w:val="Hyperlink"/>
@@ -60377,8 +61198,8 @@
         <w:t xml:space="preserve">.</w:t>
       </w:r>
     </w:p>
-    <w:bookmarkEnd w:id="431"/>
-    <w:bookmarkStart w:id="433" w:name="ref-lecun_world_models"/>
+    <w:bookmarkEnd w:id="434"/>
+    <w:bookmarkStart w:id="436" w:name="ref-lecun_world_models"/>
     <w:p>
       <w:pPr>
         <w:pStyle w:val="Bibliography"/>
@@ -60402,7 +61223,7 @@
       <w:r>
         <w:t xml:space="preserve"> </w:t>
       </w:r>
-      <w:hyperlink r:id="rId432">
+      <w:hyperlink r:id="rId435">
         <w:r>
           <w:rPr>
             <w:rStyle w:val="Hyperlink"/>
@@ -60414,8 +61235,8 @@
         <w:t xml:space="preserve">.</w:t>
       </w:r>
     </w:p>
-    <w:bookmarkEnd w:id="433"/>
-    <w:bookmarkStart w:id="435" w:name="ref-terminator"/>
+    <w:bookmarkEnd w:id="436"/>
+    <w:bookmarkStart w:id="438" w:name="ref-terminator"/>
     <w:p>
       <w:pPr>
         <w:pStyle w:val="Bibliography"/>
@@ -60433,7 +61254,7 @@
       <w:r>
         <w:t xml:space="preserve"> </w:t>
       </w:r>
-      <w:hyperlink r:id="rId434">
+      <w:hyperlink r:id="rId437">
         <w:r>
           <w:rPr>
             <w:rStyle w:val="Hyperlink"/>
@@ -60445,8 +61266,8 @@
         <w:t xml:space="preserve">.</w:t>
       </w:r>
     </w:p>
-    <w:bookmarkEnd w:id="435"/>
-    <w:bookmarkStart w:id="437" w:name="ref-matrix"/>
+    <w:bookmarkEnd w:id="438"/>
+    <w:bookmarkStart w:id="440" w:name="ref-matrix"/>
     <w:p>
       <w:pPr>
         <w:pStyle w:val="Bibliography"/>
@@ -60464,7 +61285,7 @@
       <w:r>
         <w:t xml:space="preserve"> </w:t>
       </w:r>
-      <w:hyperlink r:id="rId436">
+      <w:hyperlink r:id="rId439">
         <w:r>
           <w:rPr>
             <w:rStyle w:val="Hyperlink"/>
@@ -60476,8 +61297,8 @@
         <w:t xml:space="preserve">.</w:t>
       </w:r>
     </w:p>
-    <w:bookmarkEnd w:id="437"/>
-    <w:bookmarkStart w:id="439" w:name="ref-wargames"/>
+    <w:bookmarkEnd w:id="440"/>
+    <w:bookmarkStart w:id="442" w:name="ref-wargames"/>
     <w:p>
       <w:pPr>
         <w:pStyle w:val="Bibliography"/>
@@ -60495,7 +61316,7 @@
       <w:r>
         <w:t xml:space="preserve"> </w:t>
       </w:r>
-      <w:hyperlink r:id="rId438">
+      <w:hyperlink r:id="rId441">
         <w:r>
           <w:rPr>
             <w:rStyle w:val="Hyperlink"/>
@@ -60507,9 +61328,9 @@
         <w:t xml:space="preserve">.</w:t>
       </w:r>
     </w:p>
-    <w:bookmarkEnd w:id="439"/>
-    <w:bookmarkEnd w:id="440"/>
-    <w:bookmarkEnd w:id="441"/>
+    <w:bookmarkEnd w:id="442"/>
+    <w:bookmarkEnd w:id="443"/>
+    <w:bookmarkEnd w:id="444"/>
     <w:sectPr>
       <w:footnotePr>
         <w:numRestart w:val="eachSect"/>
@@ -60539,7 +61360,7 @@
       </w:r>
     </w:p>
   </w:footnote>
-  <w:footnote w:id="357">
+  <w:footnote w:id="360">
     <w:p>
       <w:pPr>
         <w:pStyle w:val="FootnoteText"/>

</xml_diff>

<commit_message>
Deploying to gh-pages from @ Morrison-Lab/wai@dcab1d207674b47a9f2449a9b0798bd17c1f7802 🚀
</commit_message>
<xml_diff>
--- a/chapters/coding-agents.docx
+++ b/chapters/coding-agents.docx
@@ -15,7 +15,7 @@
         <w:pStyle w:val="Date"/>
       </w:pPr>
       <w:r>
-        <w:t xml:space="preserve">Last modified: 2026-08-27 00:29:31 (PDT)</w:t>
+        <w:t xml:space="preserve">Last modified: 2026-08-29 21:30:38 (PDT)</w:t>
       </w:r>
     </w:p>
     <w:p>
@@ -33567,7 +33567,7 @@
     </w:p>
     <w:bookmarkEnd w:id="248"/>
     <w:bookmarkEnd w:id="249"/>
-    <w:bookmarkStart w:id="267" w:name="sec-ai-byok-vscode"/>
+    <w:bookmarkStart w:id="269" w:name="sec-ai-byok-vscode"/>
     <w:p>
       <w:pPr>
         <w:pStyle w:val="Heading1"/>
@@ -37590,7 +37590,7 @@
       </w:r>
     </w:p>
     <w:bookmarkEnd w:id="258"/>
-    <w:bookmarkStart w:id="263" w:name="Xeefb66738a7cdd8d123f77fc3c435ee9098e612"/>
+    <w:bookmarkStart w:id="265" w:name="Xeefb66738a7cdd8d123f77fc3c435ee9098e612"/>
     <w:p>
       <w:pPr>
         <w:pStyle w:val="Heading4"/>
@@ -38605,7 +38605,19 @@
               <w:t xml:space="preserve"> </w:t>
             </w:r>
             <w:r>
-              <w:t xml:space="preserve">while a 403 means the token itself was rejected (an authentication problem).</w:t>
+              <w:t xml:space="preserve">while a 403 usually means the token itself was rejected (an authentication problem).</w:t>
+            </w:r>
+            <w:r>
+              <w:t xml:space="preserve"> </w:t>
+            </w:r>
+            <w:r>
+              <w:t xml:space="preserve">The IP access-list 403 below is the exception —</w:t>
+            </w:r>
+            <w:r>
+              <w:t xml:space="preserve"> </w:t>
+            </w:r>
+            <w:r>
+              <w:t xml:space="preserve">there the token is valid and the failure is at the network boundary.</w:t>
             </w:r>
           </w:p>
           <w:p/>
@@ -38931,8 +38943,485 @@
         </w:tc>
       </w:tr>
     </w:tbl>
-    <w:bookmarkEnd w:id="263"/>
-    <w:bookmarkStart w:id="266" w:name="X2af9a430a52e3ae5bb0cdcfef1e620fec8864fe"/>
+    <w:p>
+      <w:pPr>
+        <w:pStyle w:val="BodyText"/>
+      </w:pPr>
+      <w:r>
+        <w:t xml:space="preserve"> </w:t>
+      </w:r>
+    </w:p>
+    <w:tbl>
+      <w:tblPr>
+        <w:tblStyle w:val="Table"/>
+        <w:tblLook w:firstRow="0" w:lastRow="0" w:firstColumn="0" w:lastColumn="0" w:noHBand="0" w:noVBand="0" w:val="0000"/>
+        <w:tblBorders>
+          <w:top w:val="single" w:sz="4" w:space="0" w:color="CC1914"/>
+          <w:left w:val="single" w:sz="24" w:space="0" w:color="CC1914"/>
+          <w:bottom w:val="single" w:sz="4" w:space="0" w:color="CC1914"/>
+          <w:right w:val="single" w:sz="4" w:space="0" w:color="CC1914"/>
+        </w:tblBorders>
+        <w:tblCellMar>
+          <w:left w:w="144" w:type="dxa"/>
+          <w:right w:w="144" w:type="dxa"/>
+        </w:tblCellMar>
+        <w:tblLook w:firstRow="0" w:lastRow="0" w:firstColumn="0" w:lastColumn="0" w:noHBand="0" w:noVBand="0" w:val="0000"/>
+      </w:tblPr>
+      <w:tr>
+        <w:trPr>
+          <w:cantSplit/>
+        </w:trPr>
+        <w:tc>
+          <w:tcPr>
+            <w:shd w:color="auto" w:fill="f7dddc" w:val="clear"/>
+            <w:tcMar>
+              <w:top w:w="92" w:type="dxa"/>
+              <w:bottom w:w="92" w:type="dxa"/>
+            </w:tcMar>
+          </w:tcPr>
+          <w:p>
+            <w:pPr>
+              <w:pStyle w:val="BodyText"/>
+            </w:pPr>
+            <w:pPr>
+              <w:spacing w:before="0" w:after="0"/>
+              <w:textAlignment w:val="center"/>
+            </w:pPr>
+            <w:r>
+              <w:drawing>
+                <wp:inline>
+                  <wp:extent cx="152400" cy="152400"/>
+                  <wp:effectExtent b="0" l="0" r="0" t="0"/>
+                  <wp:docPr descr="" title="" id="263" name="Picture"/>
+                  <a:graphic>
+                    <a:graphicData uri="http://schemas.openxmlformats.org/drawingml/2006/picture">
+                      <pic:pic>
+                        <pic:nvPicPr>
+                          <pic:cNvPr descr="/opt/quarto/share/formats/docx/important.png" id="264" name="Picture"/>
+                          <pic:cNvPicPr>
+                            <a:picLocks noChangeArrowheads="1" noChangeAspect="1"/>
+                          </pic:cNvPicPr>
+                        </pic:nvPicPr>
+                        <pic:blipFill>
+                          <a:blip r:embed="rId156"/>
+                          <a:stretch>
+                            <a:fillRect/>
+                          </a:stretch>
+                        </pic:blipFill>
+                        <pic:spPr bwMode="auto">
+                          <a:xfrm>
+                            <a:off x="0" y="0"/>
+                            <a:ext cx="152400" cy="152400"/>
+                          </a:xfrm>
+                          <a:prstGeom prst="rect">
+                            <a:avLst/>
+                          </a:prstGeom>
+                          <a:noFill/>
+                          <a:ln w="9525">
+                            <a:noFill/>
+                            <a:headEnd/>
+                            <a:tailEnd/>
+                          </a:ln>
+                        </pic:spPr>
+                      </pic:pic>
+                    </a:graphicData>
+                  </a:graphic>
+                </wp:inline>
+              </w:drawing>
+            </w:r>
+            <w:r>
+              <w:t xml:space="preserve"> </w:t>
+            </w:r>
+            <w:r>
+              <w:t xml:space="preserve"> </w:t>
+            </w:r>
+            <w:r>
+              <w:t xml:space="preserve">A 403 that no new token can fix — IP access list</w:t>
+            </w:r>
+          </w:p>
+        </w:tc>
+      </w:tr>
+      <w:tr>
+        <w:trPr>
+          <w:cantSplit/>
+        </w:trPr>
+        <w:tc>
+          <w:tcPr>
+            <w:tcMar>
+              <w:top w:w="108" w:type="dxa"/>
+              <w:bottom w:w="108" w:type="dxa"/>
+            </w:tcMar>
+          </w:tcPr>
+          <w:p>
+            <w:pPr>
+              <w:pStyle w:val="BodyText"/>
+            </w:pPr>
+            <w:pPr>
+              <w:spacing w:before="16"/>
+            </w:pPr>
+            <w:r>
+              <w:t xml:space="preserve">There is a third 403 with the same status line</w:t>
+            </w:r>
+            <w:r>
+              <w:t xml:space="preserve"> </w:t>
+            </w:r>
+            <w:r>
+              <w:t xml:space="preserve">but a different message body and a different remedy:</w:t>
+            </w:r>
+          </w:p>
+          <w:p>
+            <w:pPr>
+              <w:pStyle w:val="SourceCode"/>
+            </w:pPr>
+            <w:r>
+              <w:rPr>
+                <w:rStyle w:val="VerbatimChar"/>
+              </w:rPr>
+              <w:t xml:space="preserve">[403] Forbidden</w:t>
+            </w:r>
+            <w:r>
+              <w:br/>
+            </w:r>
+            <w:r>
+              <w:rPr>
+                <w:rStyle w:val="VerbatimChar"/>
+              </w:rPr>
+              <w:t xml:space="preserve">{"error_code":403,"message":"Source IP address: &lt;ip&gt; is blocked by Databricks IP ACL for workspace: &lt;workspace-id&gt; [ReqId: ...]"}</w:t>
+            </w:r>
+          </w:p>
+          <w:p>
+            <w:pPr>
+              <w:pStyle w:val="FirstParagraph"/>
+            </w:pPr>
+            <w:r>
+              <w:t xml:space="preserve">The request left from an address outside the workspace’s IP access list,</w:t>
+            </w:r>
+            <w:r>
+              <w:t xml:space="preserve"> </w:t>
+            </w:r>
+            <w:r>
+              <w:t xml:space="preserve">typically because a VPN dropped or was never connected.</w:t>
+            </w:r>
+            <w:r>
+              <w:t xml:space="preserve"> </w:t>
+            </w:r>
+            <w:r>
+              <w:t xml:space="preserve">The token is valid,</w:t>
+            </w:r>
+            <w:r>
+              <w:t xml:space="preserve"> </w:t>
+            </w:r>
+            <w:r>
+              <w:t xml:space="preserve">the host is correct,</w:t>
+            </w:r>
+            <w:r>
+              <w:t xml:space="preserve"> </w:t>
+            </w:r>
+            <w:r>
+              <w:t xml:space="preserve">and the endpoint exists,</w:t>
+            </w:r>
+            <w:r>
+              <w:t xml:space="preserve"> </w:t>
+            </w:r>
+            <w:r>
+              <w:t xml:space="preserve">so the request succeeds in intent and fails at the network boundary.</w:t>
+            </w:r>
+            <w:r>
+              <w:t xml:space="preserve"> </w:t>
+            </w:r>
+            <w:r>
+              <w:t xml:space="preserve">No credential change resolves it —</w:t>
+            </w:r>
+            <w:r>
+              <w:t xml:space="preserve"> </w:t>
+            </w:r>
+            <w:r>
+              <w:t xml:space="preserve">minting a fresh token repeats the same failure indefinitely,</w:t>
+            </w:r>
+            <w:r>
+              <w:t xml:space="preserve"> </w:t>
+            </w:r>
+            <w:r>
+              <w:t xml:space="preserve">the same shape as the stale-host case one layer further out.</w:t>
+            </w:r>
+          </w:p>
+          <w:p>
+            <w:pPr>
+              <w:pStyle w:val="BodyText"/>
+            </w:pPr>
+            <w:r>
+              <w:t xml:space="preserve">Connect to the network that the workspace allows</w:t>
+            </w:r>
+            <w:r>
+              <w:t xml:space="preserve"> </w:t>
+            </w:r>
+            <w:r>
+              <w:t xml:space="preserve">(restore the VPN or move to an allowed address)</w:t>
+            </w:r>
+            <w:r>
+              <w:t xml:space="preserve"> </w:t>
+            </w:r>
+            <w:r>
+              <w:t xml:space="preserve">and retry;</w:t>
+            </w:r>
+            <w:r>
+              <w:t xml:space="preserve"> </w:t>
+            </w:r>
+            <w:r>
+              <w:t xml:space="preserve">the existing token will then succeed without replacement.</w:t>
+            </w:r>
+          </w:p>
+          <w:p>
+            <w:pPr>
+              <w:pStyle w:val="BodyText"/>
+            </w:pPr>
+            <w:r>
+              <w:t xml:space="preserve">The IP-ACL variant is distinguishable by its message body,</w:t>
+            </w:r>
+            <w:r>
+              <w:t xml:space="preserve"> </w:t>
+            </w:r>
+            <w:r>
+              <w:t xml:space="preserve">which names your source IP and a workspace id.</w:t>
+            </w:r>
+            <w:r>
+              <w:t xml:space="preserve"> </w:t>
+            </w:r>
+            <w:r>
+              <w:t xml:space="preserve">The other two 403 situations are not distinguishable by body alone —</w:t>
+            </w:r>
+            <w:r>
+              <w:t xml:space="preserve"> </w:t>
+            </w:r>
+            <w:r>
+              <w:t xml:space="preserve">both the expired-token case and the wrong-workspace case described</w:t>
+            </w:r>
+            <w:r>
+              <w:t xml:space="preserve"> </w:t>
+            </w:r>
+            <w:r>
+              <w:t xml:space="preserve">in the preceding callout surface as</w:t>
+            </w:r>
+            <w:r>
+              <w:t xml:space="preserve"> </w:t>
+            </w:r>
+            <w:r>
+              <w:rPr>
+                <w:rStyle w:val="VerbatimChar"/>
+              </w:rPr>
+              <w:t xml:space="preserve">Invalid access token</w:t>
+            </w:r>
+            <w:r>
+              <w:t xml:space="preserve"> </w:t>
+            </w:r>
+            <w:r>
+              <w:t xml:space="preserve">(and, for a missing endpoint, as</w:t>
+            </w:r>
+            <w:r>
+              <w:t xml:space="preserve"> </w:t>
+            </w:r>
+            <w:r>
+              <w:rPr>
+                <w:rStyle w:val="VerbatimChar"/>
+              </w:rPr>
+              <w:t xml:space="preserve">ENDPOINT_NOT_FOUND</w:t>
+            </w:r>
+            <w:r>
+              <w:t xml:space="preserve">):</w:t>
+            </w:r>
+          </w:p>
+          <w:tbl>
+            <w:tblPr>
+              <w:tblStyle w:val="Table"/>
+              <w:tblW w:type="pct" w:w="5000"/>
+              <w:tblLayout w:type="fixed"/>
+              <w:tblLook w:firstRow="1" w:lastRow="0" w:firstColumn="0" w:lastColumn="0" w:noHBand="0" w:noVBand="0" w:val="0020"/>
+            </w:tblPr>
+            <w:tblGrid>
+              <w:gridCol w:w="2640"/>
+              <w:gridCol w:w="2640"/>
+              <w:gridCol w:w="2640"/>
+            </w:tblGrid>
+            <w:tr>
+              <w:trPr>
+                <w:tblHeader w:val="on"/>
+              </w:trPr>
+              <w:tc>
+                <w:tcPr/>
+                <w:p>
+                  <w:pPr>
+                    <w:pStyle w:val="Compact"/>
+                  </w:pPr>
+                  <w:r>
+                    <w:t xml:space="preserve">Message body</w:t>
+                  </w:r>
+                </w:p>
+              </w:tc>
+              <w:tc>
+                <w:tcPr/>
+                <w:p>
+                  <w:pPr>
+                    <w:pStyle w:val="Compact"/>
+                  </w:pPr>
+                  <w:r>
+                    <w:t xml:space="preserve">Cause</w:t>
+                  </w:r>
+                </w:p>
+              </w:tc>
+              <w:tc>
+                <w:tcPr/>
+                <w:p>
+                  <w:pPr>
+                    <w:pStyle w:val="Compact"/>
+                  </w:pPr>
+                  <w:r>
+                    <w:t xml:space="preserve">Remedy</w:t>
+                  </w:r>
+                </w:p>
+              </w:tc>
+            </w:tr>
+            <w:tr>
+              <w:tc>
+                <w:tcPr/>
+                <w:p>
+                  <w:pPr>
+                    <w:pStyle w:val="Compact"/>
+                  </w:pPr>
+                  <w:r>
+                    <w:rPr>
+                      <w:rStyle w:val="VerbatimChar"/>
+                    </w:rPr>
+                    <w:t xml:space="preserve">Invalid access token</w:t>
+                  </w:r>
+                </w:p>
+              </w:tc>
+              <w:tc>
+                <w:tcPr/>
+                <w:p>
+                  <w:pPr>
+                    <w:pStyle w:val="Compact"/>
+                  </w:pPr>
+                  <w:r>
+                    <w:t xml:space="preserve">expired or revoked token, or</w:t>
+                  </w:r>
+                  <w:r>
+                    <w:t xml:space="preserve"> </w:t>
+                  </w:r>
+                  <w:r>
+                    <w:rPr>
+                      <w:rStyle w:val="VerbatimChar"/>
+                    </w:rPr>
+                    <w:t xml:space="preserve">baseUrl</w:t>
+                  </w:r>
+                  <w:r>
+                    <w:t xml:space="preserve"> </w:t>
+                  </w:r>
+                  <w:r>
+                    <w:t xml:space="preserve">names the wrong workspace</w:t>
+                  </w:r>
+                </w:p>
+              </w:tc>
+              <w:tc>
+                <w:tcPr/>
+                <w:p>
+                  <w:pPr>
+                    <w:pStyle w:val="Compact"/>
+                  </w:pPr>
+                  <w:r>
+                    <w:t xml:space="preserve">mint a new token or correct the host (see preceding callout)</w:t>
+                  </w:r>
+                </w:p>
+              </w:tc>
+            </w:tr>
+            <w:tr>
+              <w:tc>
+                <w:tcPr/>
+                <w:p>
+                  <w:pPr>
+                    <w:pStyle w:val="Compact"/>
+                  </w:pPr>
+                  <w:r>
+                    <w:rPr>
+                      <w:rStyle w:val="VerbatimChar"/>
+                    </w:rPr>
+                    <w:t xml:space="preserve">Source IP address: ... blocked by Databricks IP ACL for workspace: &lt;workspace-id&gt;</w:t>
+                  </w:r>
+                </w:p>
+              </w:tc>
+              <w:tc>
+                <w:tcPr/>
+                <w:p>
+                  <w:pPr>
+                    <w:pStyle w:val="Compact"/>
+                  </w:pPr>
+                  <w:r>
+                    <w:t xml:space="preserve">off-network / VPN down</w:t>
+                  </w:r>
+                </w:p>
+              </w:tc>
+              <w:tc>
+                <w:tcPr/>
+                <w:p>
+                  <w:pPr>
+                    <w:pStyle w:val="Compact"/>
+                  </w:pPr>
+                  <w:r>
+                    <w:t xml:space="preserve">connect to the allowed network; no credential change</w:t>
+                  </w:r>
+                </w:p>
+              </w:tc>
+            </w:tr>
+          </w:tbl>
+          <w:p>
+            <w:pPr>
+              <w:pStyle w:val="BodyText"/>
+            </w:pPr>
+            <w:pPr>
+              <w:spacing w:after="16"/>
+            </w:pPr>
+            <w:r>
+              <w:t xml:space="preserve">Observed 2026-08-26 on</w:t>
+            </w:r>
+            <w:r>
+              <w:t xml:space="preserve"> </w:t>
+            </w:r>
+            <w:r>
+              <w:rPr>
+                <w:rStyle w:val="VerbatimChar"/>
+              </w:rPr>
+              <w:t xml:space="preserve">databricks-gpt-5-6-sol</w:t>
+            </w:r>
+            <w:r>
+              <w:t xml:space="preserve"> </w:t>
+            </w:r>
+            <w:r>
+              <w:t xml:space="preserve">against</w:t>
+            </w:r>
+            <w:r>
+              <w:t xml:space="preserve"> </w:t>
+            </w:r>
+            <w:r>
+              <w:rPr>
+                <w:rStyle w:val="VerbatimChar"/>
+              </w:rPr>
+              <w:t xml:space="preserve">dbc-440c7148-9ff6</w:t>
+            </w:r>
+            <w:r>
+              <w:t xml:space="preserve">,</w:t>
+            </w:r>
+            <w:r>
+              <w:t xml:space="preserve"> </w:t>
+            </w:r>
+            <w:r>
+              <w:t xml:space="preserve">three consecutive requests while a VPN connection was down.</w:t>
+            </w:r>
+          </w:p>
+          <w:p/>
+        </w:tc>
+      </w:tr>
+    </w:tbl>
+    <w:bookmarkEnd w:id="265"/>
+    <w:bookmarkStart w:id="268" w:name="X2af9a430a52e3ae5bb0cdcfef1e620fec8864fe"/>
     <w:p>
       <w:pPr>
         <w:pStyle w:val="Heading4"/>
@@ -39800,12 +40289,12 @@
                 <wp:inline>
                   <wp:extent cx="152400" cy="152400"/>
                   <wp:effectExtent b="0" l="0" r="0" t="0"/>
-                  <wp:docPr descr="" title="" id="264" name="Picture"/>
+                  <wp:docPr descr="" title="" id="266" name="Picture"/>
                   <a:graphic>
                     <a:graphicData uri="http://schemas.openxmlformats.org/drawingml/2006/picture">
                       <pic:pic>
                         <pic:nvPicPr>
-                          <pic:cNvPr descr="/opt/quarto/share/formats/docx/note.png" id="265" name="Picture"/>
+                          <pic:cNvPr descr="/opt/quarto/share/formats/docx/note.png" id="267" name="Picture"/>
                           <pic:cNvPicPr>
                             <a:picLocks noChangeArrowheads="1" noChangeAspect="1"/>
                           </pic:cNvPicPr>
@@ -39962,9 +40451,9 @@
         </w:tc>
       </w:tr>
     </w:tbl>
-    <w:bookmarkEnd w:id="266"/>
-    <w:bookmarkEnd w:id="267"/>
-    <w:bookmarkStart w:id="281" w:name="configuring-the-agent-environment"/>
+    <w:bookmarkEnd w:id="268"/>
+    <w:bookmarkEnd w:id="269"/>
+    <w:bookmarkStart w:id="283" w:name="configuring-the-agent-environment"/>
     <w:p>
       <w:pPr>
         <w:pStyle w:val="Heading1"/>
@@ -40020,7 +40509,7 @@
         <w:t xml:space="preserve">so that Copilot can build, test, and lint your code more reliably.</w:t>
       </w:r>
     </w:p>
-    <w:bookmarkStart w:id="268" w:name="why-configure-the-environment"/>
+    <w:bookmarkStart w:id="270" w:name="why-configure-the-environment"/>
     <w:p>
       <w:pPr>
         <w:pStyle w:val="Heading4"/>
@@ -40103,8 +40592,8 @@
         <w:t xml:space="preserve">Consistent development environment across all agent sessions</w:t>
       </w:r>
     </w:p>
-    <w:bookmarkEnd w:id="268"/>
-    <w:bookmarkStart w:id="269" w:name="file-location-and-structure"/>
+    <w:bookmarkEnd w:id="270"/>
+    <w:bookmarkStart w:id="271" w:name="file-location-and-structure"/>
     <w:p>
       <w:pPr>
         <w:pStyle w:val="Heading4"/>
@@ -40173,8 +40662,8 @@
         <w:t xml:space="preserve">.</w:t>
       </w:r>
     </w:p>
-    <w:bookmarkEnd w:id="269"/>
-    <w:bookmarkStart w:id="271" w:name="basic-configuration-example"/>
+    <w:bookmarkEnd w:id="271"/>
+    <w:bookmarkStart w:id="273" w:name="basic-configuration-example"/>
     <w:p>
       <w:pPr>
         <w:pStyle w:val="Heading4"/>
@@ -40193,7 +40682,7 @@
       <w:r>
         <w:t xml:space="preserve"> </w:t>
       </w:r>
-      <w:hyperlink r:id="rId270">
+      <w:hyperlink r:id="rId272">
         <w:r>
           <w:rPr>
             <w:rStyle w:val="VerbatimChar"/>
@@ -40208,8 +40697,8 @@
         <w:t xml:space="preserve">for a configuration adapted for R and Quarto projects.</w:t>
       </w:r>
     </w:p>
-    <w:bookmarkEnd w:id="271"/>
-    <w:bookmarkStart w:id="274" w:name="using-actionscheckout"/>
+    <w:bookmarkEnd w:id="273"/>
+    <w:bookmarkStart w:id="276" w:name="using-actionscheckout"/>
     <w:p>
       <w:pPr>
         <w:pStyle w:val="Heading4"/>
@@ -40237,7 +40726,7 @@
       <w:r>
         <w:t xml:space="preserve"> </w:t>
       </w:r>
-      <w:hyperlink r:id="rId272">
+      <w:hyperlink r:id="rId274">
         <w:r>
           <w:rPr>
             <w:rStyle w:val="VerbatimChar"/>
@@ -40576,7 +41065,7 @@
       <w:r>
         <w:t xml:space="preserve"> </w:t>
       </w:r>
-      <w:hyperlink r:id="rId273">
+      <w:hyperlink r:id="rId275">
         <w:r>
           <w:rPr>
             <w:rStyle w:val="Hyperlink"/>
@@ -40644,8 +41133,8 @@
         <w:t xml:space="preserve">including comparing changes and understanding the context of your pull request.</w:t>
       </w:r>
     </w:p>
-    <w:bookmarkEnd w:id="274"/>
-    <w:bookmarkStart w:id="275" w:name="configurable-options"/>
+    <w:bookmarkEnd w:id="276"/>
+    <w:bookmarkStart w:id="277" w:name="configurable-options"/>
     <w:p>
       <w:pPr>
         <w:pStyle w:val="Heading4"/>
@@ -40811,8 +41300,8 @@
         <w:t xml:space="preserve">All other workflow settings are ignored by Copilot.</w:t>
       </w:r>
     </w:p>
-    <w:bookmarkEnd w:id="275"/>
-    <w:bookmarkStart w:id="276" w:name="common-setup-tasks"/>
+    <w:bookmarkEnd w:id="277"/>
+    <w:bookmarkStart w:id="278" w:name="common-setup-tasks"/>
     <w:p>
       <w:pPr>
         <w:pStyle w:val="Heading4"/>
@@ -41427,8 +41916,8 @@
         <w:t xml:space="preserve"> r-lib/actions/setup-renv@v2</w:t>
       </w:r>
     </w:p>
-    <w:bookmarkEnd w:id="276"/>
-    <w:bookmarkStart w:id="277" w:name="environment-variables-and-secrets"/>
+    <w:bookmarkEnd w:id="278"/>
+    <w:bookmarkStart w:id="279" w:name="environment-variables-and-secrets"/>
     <w:p>
       <w:pPr>
         <w:pStyle w:val="Heading4"/>
@@ -41536,8 +42025,8 @@
         <w:t xml:space="preserve">Use secrets for sensitive values like API keys or passwords.</w:t>
       </w:r>
     </w:p>
-    <w:bookmarkEnd w:id="277"/>
-    <w:bookmarkStart w:id="278" w:name="testing-your-configuration"/>
+    <w:bookmarkEnd w:id="279"/>
+    <w:bookmarkStart w:id="280" w:name="testing-your-configuration"/>
     <w:p>
       <w:pPr>
         <w:pStyle w:val="Heading4"/>
@@ -41632,8 +42121,8 @@
         <w:t xml:space="preserve">and begin working with the current environment state.</w:t>
       </w:r>
     </w:p>
-    <w:bookmarkEnd w:id="278"/>
-    <w:bookmarkStart w:id="279" w:name="advanced-configuration"/>
+    <w:bookmarkEnd w:id="280"/>
+    <w:bookmarkStart w:id="281" w:name="advanced-configuration"/>
     <w:p>
       <w:pPr>
         <w:pStyle w:val="Heading4"/>
@@ -41953,8 +42442,8 @@
         <w:t xml:space="preserve">true</w:t>
       </w:r>
     </w:p>
-    <w:bookmarkEnd w:id="279"/>
-    <w:bookmarkStart w:id="280" w:name="further-reading-1"/>
+    <w:bookmarkEnd w:id="281"/>
+    <w:bookmarkStart w:id="282" w:name="further-reading-1"/>
     <w:p>
       <w:pPr>
         <w:pStyle w:val="Heading4"/>
@@ -41979,7 +42468,7 @@
       <w:r>
         <w:t xml:space="preserve"> </w:t>
       </w:r>
-      <w:hyperlink r:id="rId273">
+      <w:hyperlink r:id="rId275">
         <w:r>
           <w:rPr>
             <w:rStyle w:val="Hyperlink"/>
@@ -41991,9 +42480,9 @@
         <w:t xml:space="preserve">.</w:t>
       </w:r>
     </w:p>
-    <w:bookmarkEnd w:id="280"/>
-    <w:bookmarkEnd w:id="281"/>
-    <w:bookmarkStart w:id="289" w:name="sec-ai-agent-skills"/>
+    <w:bookmarkEnd w:id="282"/>
+    <w:bookmarkEnd w:id="283"/>
+    <w:bookmarkStart w:id="291" w:name="sec-ai-agent-skills"/>
     <w:p>
       <w:pPr>
         <w:pStyle w:val="Heading1"/>
@@ -42006,7 +42495,7 @@
       <w:pPr>
         <w:pStyle w:val="FirstParagraph"/>
       </w:pPr>
-      <w:hyperlink r:id="rId282">
+      <w:hyperlink r:id="rId284">
         <w:r>
           <w:rPr>
             <w:rStyle w:val="Hyperlink"/>
@@ -42041,7 +42530,7 @@
       <w:r>
         <w:t xml:space="preserve"> </w:t>
       </w:r>
-      <w:hyperlink r:id="rId283">
+      <w:hyperlink r:id="rId285">
         <w:r>
           <w:rPr>
             <w:rStyle w:val="Hyperlink"/>
@@ -42062,7 +42551,7 @@
         <w:t xml:space="preserve">tool-agnostic format that any compatible agent can load.</w:t>
       </w:r>
     </w:p>
-    <w:bookmarkStart w:id="284" w:name="what-is-a-skill"/>
+    <w:bookmarkStart w:id="286" w:name="what-is-a-skill"/>
     <w:p>
       <w:pPr>
         <w:pStyle w:val="Heading4"/>
@@ -42132,7 +42621,7 @@
       <w:r>
         <w:t xml:space="preserve"> </w:t>
       </w:r>
-      <w:hyperlink r:id="rId283">
+      <w:hyperlink r:id="rId285">
         <w:r>
           <w:rPr>
             <w:rStyle w:val="Hyperlink"/>
@@ -42239,8 +42728,8 @@
         <w:t xml:space="preserve">└── assets/           # Optional: templates, resources</w:t>
       </w:r>
     </w:p>
-    <w:bookmarkEnd w:id="284"/>
-    <w:bookmarkStart w:id="285" w:name="how-agents-load-skills"/>
+    <w:bookmarkEnd w:id="286"/>
+    <w:bookmarkStart w:id="287" w:name="how-agents-load-skills"/>
     <w:p>
       <w:pPr>
         <w:pStyle w:val="Heading4"/>
@@ -42383,8 +42872,8 @@
         <w:t xml:space="preserve">so agents can maintain many skills with a small context footprint.</w:t>
       </w:r>
     </w:p>
-    <w:bookmarkEnd w:id="285"/>
-    <w:bookmarkStart w:id="286" w:name="why-use-skills"/>
+    <w:bookmarkEnd w:id="287"/>
+    <w:bookmarkStart w:id="288" w:name="why-use-skills"/>
     <w:p>
       <w:pPr>
         <w:pStyle w:val="Heading4"/>
@@ -42470,8 +42959,8 @@
         <w:t xml:space="preserve">: Build a skill once and use it across any skills-compatible agent</w:t>
       </w:r>
     </w:p>
-    <w:bookmarkEnd w:id="286"/>
-    <w:bookmarkStart w:id="288" w:name="further-reading-2"/>
+    <w:bookmarkEnd w:id="288"/>
+    <w:bookmarkStart w:id="290" w:name="further-reading-2"/>
     <w:p>
       <w:pPr>
         <w:pStyle w:val="Heading4"/>
@@ -42496,7 +42985,7 @@
       <w:r>
         <w:t xml:space="preserve"> </w:t>
       </w:r>
-      <w:hyperlink r:id="rId282">
+      <w:hyperlink r:id="rId284">
         <w:r>
           <w:rPr>
             <w:rStyle w:val="Hyperlink"/>
@@ -42611,7 +43100,7 @@
       <w:r>
         <w:t xml:space="preserve"> </w:t>
       </w:r>
-      <w:hyperlink r:id="rId287">
+      <w:hyperlink r:id="rId289">
         <w:r>
           <w:rPr>
             <w:rStyle w:val="Hyperlink"/>
@@ -42638,9 +43127,9 @@
         <w:t xml:space="preserve">including user-level skills, hooks, and subagents, synced across machines via Git.</w:t>
       </w:r>
     </w:p>
-    <w:bookmarkEnd w:id="288"/>
-    <w:bookmarkEnd w:id="289"/>
-    <w:bookmarkStart w:id="295" w:name="sec-ai-useful-plugins"/>
+    <w:bookmarkEnd w:id="290"/>
+    <w:bookmarkEnd w:id="291"/>
+    <w:bookmarkStart w:id="297" w:name="sec-ai-useful-plugins"/>
     <w:p>
       <w:pPr>
         <w:pStyle w:val="Heading1"/>
@@ -42659,7 +43148,7 @@
       <w:r>
         <w:t xml:space="preserve"> </w:t>
       </w:r>
-      <w:hyperlink r:id="rId290">
+      <w:hyperlink r:id="rId292">
         <w:r>
           <w:rPr>
             <w:rStyle w:val="Hyperlink"/>
@@ -42696,7 +43185,7 @@
       <w:pPr>
         <w:pStyle w:val="BodyText"/>
       </w:pPr>
-      <w:hyperlink r:id="rId291">
+      <w:hyperlink r:id="rId293">
         <w:r>
           <w:rPr>
             <w:rStyle w:val="Hyperlink"/>
@@ -42758,7 +43247,7 @@
       <w:r>
         <w:t xml:space="preserve"> </w:t>
       </w:r>
-      <w:hyperlink r:id="rId292">
+      <w:hyperlink r:id="rId294">
         <w:r>
           <w:rPr>
             <w:rStyle w:val="Hyperlink"/>
@@ -42830,7 +43319,7 @@
           <w:numId w:val="1121"/>
         </w:numPr>
       </w:pPr>
-      <w:hyperlink r:id="rId293">
+      <w:hyperlink r:id="rId295">
         <w:r>
           <w:rPr>
             <w:rStyle w:val="Hyperlink"/>
@@ -42896,7 +43385,7 @@
       <w:r>
         <w:t xml:space="preserve"> </w:t>
       </w:r>
-      <w:hyperlink r:id="rId287">
+      <w:hyperlink r:id="rId289">
         <w:r>
           <w:rPr>
             <w:rStyle w:val="VerbatimChar"/>
@@ -42913,7 +43402,7 @@
       <w:r>
         <w:t xml:space="preserve"> </w:t>
       </w:r>
-      <w:hyperlink r:id="rId294">
+      <w:hyperlink r:id="rId296">
         <w:r>
           <w:rPr>
             <w:rStyle w:val="VerbatimChar"/>
@@ -42986,8 +43475,8 @@
         <w:t xml:space="preserve">is the worked example of what the corpus contains.</w:t>
       </w:r>
     </w:p>
-    <w:bookmarkEnd w:id="295"/>
-    <w:bookmarkStart w:id="315" w:name="sec-ai-customization"/>
+    <w:bookmarkEnd w:id="297"/>
+    <w:bookmarkStart w:id="317" w:name="sec-ai-customization"/>
     <w:p>
       <w:pPr>
         <w:pStyle w:val="Heading1"/>
@@ -43112,7 +43601,7 @@
         <w:t xml:space="preserve">.</w:t>
       </w:r>
     </w:p>
-    <w:bookmarkStart w:id="297" w:name="the-question-that-picks-the-mechanism"/>
+    <w:bookmarkStart w:id="299" w:name="the-question-that-picks-the-mechanism"/>
     <w:p>
       <w:pPr>
         <w:pStyle w:val="Heading4"/>
@@ -43213,7 +43702,7 @@
       <w:r>
         <w:t xml:space="preserve"> </w:t>
       </w:r>
-      <w:hyperlink r:id="rId296">
+      <w:hyperlink r:id="rId298">
         <w:r>
           <w:rPr>
             <w:rStyle w:val="Hyperlink"/>
@@ -43298,8 +43787,8 @@
         <w:t xml:space="preserve">.</w:t>
       </w:r>
     </w:p>
-    <w:bookmarkEnd w:id="297"/>
-    <w:bookmarkStart w:id="299" w:name="instruction-files-always-on-context"/>
+    <w:bookmarkEnd w:id="299"/>
+    <w:bookmarkStart w:id="301" w:name="instruction-files-always-on-context"/>
     <w:p>
       <w:pPr>
         <w:pStyle w:val="Heading4"/>
@@ -43403,7 +43892,7 @@
       <w:r>
         <w:t xml:space="preserve"> </w:t>
       </w:r>
-      <w:hyperlink r:id="rId296">
+      <w:hyperlink r:id="rId298">
         <w:r>
           <w:rPr>
             <w:rStyle w:val="Hyperlink"/>
@@ -43546,7 +44035,7 @@
       <w:r>
         <w:t xml:space="preserve"> </w:t>
       </w:r>
-      <w:hyperlink r:id="rId296">
+      <w:hyperlink r:id="rId298">
         <w:r>
           <w:rPr>
             <w:rStyle w:val="Hyperlink"/>
@@ -43650,7 +44139,7 @@
       <w:r>
         <w:t xml:space="preserve"> </w:t>
       </w:r>
-      <w:hyperlink r:id="rId298">
+      <w:hyperlink r:id="rId300">
         <w:r>
           <w:rPr>
             <w:rStyle w:val="Hyperlink"/>
@@ -43770,8 +44259,8 @@
         <w:t xml:space="preserve">and guaranteed nothing about acting on it alike.</w:t>
       </w:r>
     </w:p>
-    <w:bookmarkEnd w:id="299"/>
-    <w:bookmarkStart w:id="300" w:name="workspace-rules-and-activation-modes"/>
+    <w:bookmarkEnd w:id="301"/>
+    <w:bookmarkStart w:id="302" w:name="workspace-rules-and-activation-modes"/>
     <w:p>
       <w:pPr>
         <w:pStyle w:val="Heading4"/>
@@ -44040,8 +44529,8 @@
         <w:t xml:space="preserve">).</w:t>
       </w:r>
     </w:p>
-    <w:bookmarkEnd w:id="300"/>
-    <w:bookmarkStart w:id="303" w:name="skills-and-the-commands-that-became-them"/>
+    <w:bookmarkEnd w:id="302"/>
+    <w:bookmarkStart w:id="305" w:name="skills-and-the-commands-that-became-them"/>
     <w:p>
       <w:pPr>
         <w:pStyle w:val="Heading4"/>
@@ -44066,7 +44555,7 @@
       <w:r>
         <w:t xml:space="preserve"> </w:t>
       </w:r>
-      <w:hyperlink r:id="rId301">
+      <w:hyperlink r:id="rId303">
         <w:r>
           <w:rPr>
             <w:rStyle w:val="Hyperlink"/>
@@ -44505,7 +44994,7 @@
       <w:r>
         <w:t xml:space="preserve"> </w:t>
       </w:r>
-      <w:hyperlink r:id="rId283">
+      <w:hyperlink r:id="rId285">
         <w:r>
           <w:rPr>
             <w:rStyle w:val="Hyperlink"/>
@@ -44624,7 +45113,7 @@
       <w:r>
         <w:t xml:space="preserve"> </w:t>
       </w:r>
-      <w:hyperlink r:id="rId302">
+      <w:hyperlink r:id="rId304">
         <w:r>
           <w:rPr>
             <w:rStyle w:val="Hyperlink"/>
@@ -44690,8 +45179,8 @@
         <w:t xml:space="preserve">a competitor’s directory name.</w:t>
       </w:r>
     </w:p>
-    <w:bookmarkEnd w:id="303"/>
-    <w:bookmarkStart w:id="305" w:name="subagents-delegating-to-a-fresh-context"/>
+    <w:bookmarkEnd w:id="305"/>
+    <w:bookmarkStart w:id="307" w:name="subagents-delegating-to-a-fresh-context"/>
     <w:p>
       <w:pPr>
         <w:pStyle w:val="Heading4"/>
@@ -44840,7 +45329,7 @@
       <w:r>
         <w:t xml:space="preserve"> </w:t>
       </w:r>
-      <w:hyperlink r:id="rId304">
+      <w:hyperlink r:id="rId306">
         <w:r>
           <w:rPr>
             <w:rStyle w:val="Hyperlink"/>
@@ -44863,7 +45352,7 @@
       <w:r>
         <w:t xml:space="preserve"> </w:t>
       </w:r>
-      <w:hyperlink r:id="rId301">
+      <w:hyperlink r:id="rId303">
         <w:r>
           <w:rPr>
             <w:rStyle w:val="Hyperlink"/>
@@ -44928,8 +45417,8 @@
         <w:t xml:space="preserve">The @-mention controls which subagent Claude invokes, not what prompt it receives.</w:t>
       </w:r>
     </w:p>
-    <w:bookmarkEnd w:id="305"/>
-    <w:bookmarkStart w:id="307" w:name="Xf185306762ce2c53b5a7ee53d7e6e74f0af7607"/>
+    <w:bookmarkEnd w:id="307"/>
+    <w:bookmarkStart w:id="309" w:name="Xf185306762ce2c53b5a7ee53d7e6e74f0af7607"/>
     <w:p>
       <w:pPr>
         <w:pStyle w:val="Heading4"/>
@@ -44973,7 +45462,7 @@
       <w:r>
         <w:t xml:space="preserve"> </w:t>
       </w:r>
-      <w:hyperlink r:id="rId306">
+      <w:hyperlink r:id="rId308">
         <w:r>
           <w:rPr>
             <w:rStyle w:val="Hyperlink"/>
@@ -45008,7 +45497,7 @@
       <w:r>
         <w:t xml:space="preserve"> </w:t>
       </w:r>
-      <w:hyperlink r:id="rId296">
+      <w:hyperlink r:id="rId298">
         <w:r>
           <w:rPr>
             <w:rStyle w:val="Hyperlink"/>
@@ -45227,8 +45716,8 @@
         <w:t xml:space="preserve">hook decides.</w:t>
       </w:r>
     </w:p>
-    <w:bookmarkEnd w:id="307"/>
-    <w:bookmarkStart w:id="309" w:name="X661523c6623257371ddb85eca0962e6d24391f6"/>
+    <w:bookmarkEnd w:id="309"/>
+    <w:bookmarkStart w:id="311" w:name="X661523c6623257371ddb85eca0962e6d24391f6"/>
     <w:p>
       <w:pPr>
         <w:pStyle w:val="Heading4"/>
@@ -45310,7 +45799,7 @@
       <w:r>
         <w:t xml:space="preserve"> </w:t>
       </w:r>
-      <w:hyperlink r:id="rId308">
+      <w:hyperlink r:id="rId310">
         <w:r>
           <w:rPr>
             <w:rStyle w:val="Hyperlink"/>
@@ -45469,8 +45958,8 @@
         <w:t xml:space="preserve">a repository can tighten what you allow, and cannot quietly loosen it.</w:t>
       </w:r>
     </w:p>
-    <w:bookmarkEnd w:id="309"/>
-    <w:bookmarkStart w:id="310" w:name="Xb9141ee8bf4b59ff8b077a4423dd913151d282a"/>
+    <w:bookmarkEnd w:id="311"/>
+    <w:bookmarkStart w:id="312" w:name="Xb9141ee8bf4b59ff8b077a4423dd913151d282a"/>
     <w:p>
       <w:pPr>
         <w:pStyle w:val="Heading4"/>
@@ -45603,8 +46092,8 @@
         <w:t xml:space="preserve">covers configuration and its failure modes.</w:t>
       </w:r>
     </w:p>
-    <w:bookmarkEnd w:id="310"/>
-    <w:bookmarkStart w:id="311" w:name="choosing"/>
+    <w:bookmarkEnd w:id="312"/>
+    <w:bookmarkStart w:id="313" w:name="choosing"/>
     <w:p>
       <w:pPr>
         <w:pStyle w:val="Heading4"/>
@@ -45961,8 +46450,8 @@
         </w:tc>
       </w:tr>
     </w:tbl>
-    <w:bookmarkEnd w:id="311"/>
-    <w:bookmarkStart w:id="313" w:name="what-travels-between-tools"/>
+    <w:bookmarkEnd w:id="313"/>
+    <w:bookmarkStart w:id="315" w:name="what-travels-between-tools"/>
     <w:p>
       <w:pPr>
         <w:pStyle w:val="Heading4"/>
@@ -46415,7 +46904,7 @@
             <w:pPr>
               <w:pStyle w:val="Compact"/>
             </w:pPr>
-            <w:hyperlink r:id="rId312">
+            <w:hyperlink r:id="rId314">
               <w:r>
                 <w:rPr>
                   <w:rStyle w:val="Hyperlink"/>
@@ -46512,8 +47001,8 @@
         <w:t xml:space="preserve">and are worth writing as enforcement of rules that are also stated somewhere portable.</w:t>
       </w:r>
     </w:p>
-    <w:bookmarkEnd w:id="313"/>
-    <w:bookmarkStart w:id="314" w:name="a-worked-example"/>
+    <w:bookmarkEnd w:id="315"/>
+    <w:bookmarkStart w:id="316" w:name="a-worked-example"/>
     <w:p>
       <w:pPr>
         <w:pStyle w:val="Heading4"/>
@@ -46532,7 +47021,7 @@
       <w:r>
         <w:t xml:space="preserve"> </w:t>
       </w:r>
-      <w:hyperlink r:id="rId287">
+      <w:hyperlink r:id="rId289">
         <w:r>
           <w:rPr>
             <w:rStyle w:val="VerbatimChar"/>
@@ -46788,9 +47277,9 @@
         <w:t xml:space="preserve">globs attach them only when you edit a matching file.</w:t>
       </w:r>
     </w:p>
-    <w:bookmarkEnd w:id="314"/>
-    <w:bookmarkEnd w:id="315"/>
-    <w:bookmarkStart w:id="320" w:name="sec-ai-config-install"/>
+    <w:bookmarkEnd w:id="316"/>
+    <w:bookmarkEnd w:id="317"/>
+    <w:bookmarkStart w:id="322" w:name="sec-ai-config-install"/>
     <w:p>
       <w:pPr>
         <w:pStyle w:val="Heading1"/>
@@ -46896,7 +47385,7 @@
         <w:t xml:space="preserve">and a capability simply goes missing with no message that it existed.</w:t>
       </w:r>
     </w:p>
-    <w:bookmarkStart w:id="316" w:name="X09c076bdbd05e35ade785c409b9eb4387af137d"/>
+    <w:bookmarkStart w:id="318" w:name="X09c076bdbd05e35ade785c409b9eb4387af137d"/>
     <w:p>
       <w:pPr>
         <w:pStyle w:val="Heading4"/>
@@ -47130,8 +47619,8 @@
         <w:t xml:space="preserve">Pick one path.</w:t>
       </w:r>
     </w:p>
-    <w:bookmarkEnd w:id="316"/>
-    <w:bookmarkStart w:id="317" w:name="the-.claude-layout"/>
+    <w:bookmarkEnd w:id="318"/>
+    <w:bookmarkStart w:id="319" w:name="the-.claude-layout"/>
     <w:p>
       <w:pPr>
         <w:pStyle w:val="Heading4"/>
@@ -47376,8 +47865,8 @@
         <w:t xml:space="preserve">So verify both, and read the two results separately.</w:t>
       </w:r>
     </w:p>
-    <w:bookmarkEnd w:id="317"/>
-    <w:bookmarkStart w:id="318" w:name="one-plugin-per-capability"/>
+    <w:bookmarkEnd w:id="319"/>
+    <w:bookmarkStart w:id="320" w:name="one-plugin-per-capability"/>
     <w:p>
       <w:pPr>
         <w:pStyle w:val="Heading4"/>
@@ -47470,8 +47959,8 @@
         <w:t xml:space="preserve">Keep one copy enabled.</w:t>
       </w:r>
     </w:p>
-    <w:bookmarkEnd w:id="318"/>
-    <w:bookmarkStart w:id="319" w:name="failure-modes-and-their-symptoms"/>
+    <w:bookmarkEnd w:id="320"/>
+    <w:bookmarkStart w:id="321" w:name="failure-modes-and-their-symptoms"/>
     <w:p>
       <w:pPr>
         <w:pStyle w:val="Heading4"/>
@@ -47716,9 +48205,9 @@
         <w:t xml:space="preserve">suspect the install before you suspect the rule.</w:t>
       </w:r>
     </w:p>
-    <w:bookmarkEnd w:id="319"/>
-    <w:bookmarkEnd w:id="320"/>
-    <w:bookmarkStart w:id="327" w:name="sec-ai-claude-cloud-env"/>
+    <w:bookmarkEnd w:id="321"/>
+    <w:bookmarkEnd w:id="322"/>
+    <w:bookmarkStart w:id="329" w:name="sec-ai-claude-cloud-env"/>
     <w:p>
       <w:pPr>
         <w:pStyle w:val="Heading1"/>
@@ -47760,7 +48249,7 @@
       <w:r>
         <w:t xml:space="preserve"> </w:t>
       </w:r>
-      <w:hyperlink r:id="rId321">
+      <w:hyperlink r:id="rId323">
         <w:r>
           <w:rPr>
             <w:rStyle w:val="Hyperlink"/>
@@ -47958,7 +48447,7 @@
         <w:t xml:space="preserve">for example to install dependencies.</w:t>
       </w:r>
     </w:p>
-    <w:bookmarkStart w:id="326" w:name="X99b85cd9c84d17a9c31061ff898ea0b26b46932"/>
+    <w:bookmarkStart w:id="328" w:name="X99b85cd9c84d17a9c31061ff898ea0b26b46932"/>
     <w:p>
       <w:pPr>
         <w:pStyle w:val="Heading4"/>
@@ -48119,7 +48608,7 @@
       <w:r>
         <w:t xml:space="preserve"> </w:t>
       </w:r>
-      <w:hyperlink r:id="rId321">
+      <w:hyperlink r:id="rId323">
         <w:r>
           <w:rPr>
             <w:rStyle w:val="Hyperlink"/>
@@ -48214,12 +48703,12 @@
                 <wp:inline>
                   <wp:extent cx="152400" cy="152400"/>
                   <wp:effectExtent b="0" l="0" r="0" t="0"/>
-                  <wp:docPr descr="" title="" id="322" name="Picture"/>
+                  <wp:docPr descr="" title="" id="324" name="Picture"/>
                   <a:graphic>
                     <a:graphicData uri="http://schemas.openxmlformats.org/drawingml/2006/picture">
                       <pic:pic>
                         <pic:nvPicPr>
-                          <pic:cNvPr descr="/opt/quarto/share/formats/docx/note.png" id="323" name="Picture"/>
+                          <pic:cNvPr descr="/opt/quarto/share/formats/docx/note.png" id="325" name="Picture"/>
                           <pic:cNvPicPr>
                             <a:picLocks noChangeArrowheads="1" noChangeAspect="1"/>
                           </pic:cNvPicPr>
@@ -48335,7 +48824,7 @@
       <w:r>
         <w:t xml:space="preserve"> </w:t>
       </w:r>
-      <w:hyperlink r:id="rId324">
+      <w:hyperlink r:id="rId326">
         <w:r>
           <w:rPr>
             <w:rStyle w:val="Hyperlink"/>
@@ -48352,7 +48841,7 @@
       <w:r>
         <w:t xml:space="preserve"> </w:t>
       </w:r>
-      <w:hyperlink r:id="rId325">
+      <w:hyperlink r:id="rId327">
         <w:r>
           <w:rPr>
             <w:rStyle w:val="Hyperlink"/>
@@ -48364,9 +48853,9 @@
         <w:t xml:space="preserve">.</w:t>
       </w:r>
     </w:p>
-    <w:bookmarkEnd w:id="326"/>
-    <w:bookmarkEnd w:id="327"/>
-    <w:bookmarkStart w:id="334" w:name="sec-ai-codex-github-review"/>
+    <w:bookmarkEnd w:id="328"/>
+    <w:bookmarkEnd w:id="329"/>
+    <w:bookmarkStart w:id="336" w:name="sec-ai-codex-github-review"/>
     <w:p>
       <w:pPr>
         <w:pStyle w:val="Heading1"/>
@@ -48401,7 +48890,7 @@
         <w:t xml:space="preserve">It does not require you to build a separate GitHub Action.</w:t>
       </w:r>
     </w:p>
-    <w:bookmarkStart w:id="328" w:name="prerequisites"/>
+    <w:bookmarkStart w:id="330" w:name="prerequisites"/>
     <w:p>
       <w:pPr>
         <w:pStyle w:val="Heading4"/>
@@ -48526,8 +49015,8 @@
         <w:t xml:space="preserve">but it lets the reviewer follow repository-specific guidance.</w:t>
       </w:r>
     </w:p>
-    <w:bookmarkEnd w:id="328"/>
-    <w:bookmarkStart w:id="329" w:name="requesting-and-automating-reviews"/>
+    <w:bookmarkEnd w:id="330"/>
+    <w:bookmarkStart w:id="331" w:name="requesting-and-automating-reviews"/>
     <w:p>
       <w:pPr>
         <w:pStyle w:val="Heading4"/>
@@ -48678,8 +49167,8 @@
         <w:t xml:space="preserve">It can overlap with the general review’s security findings.</w:t>
       </w:r>
     </w:p>
-    <w:bookmarkEnd w:id="329"/>
-    <w:bookmarkStart w:id="330" w:name="Xcb3957535c68d0d36c3ddb2e418364eec25d64f"/>
+    <w:bookmarkEnd w:id="331"/>
+    <w:bookmarkStart w:id="332" w:name="Xcb3957535c68d0d36c3ddb2e418364eec25d64f"/>
     <w:p>
       <w:pPr>
         <w:pStyle w:val="Heading4"/>
@@ -48965,8 +49454,8 @@
         <w:t xml:space="preserve">both sides must permit the integration.</w:t>
       </w:r>
     </w:p>
-    <w:bookmarkEnd w:id="330"/>
-    <w:bookmarkStart w:id="331" w:name="X5db1f82696679006fc24d2d9f8d9499d172a6a5"/>
+    <w:bookmarkEnd w:id="332"/>
+    <w:bookmarkStart w:id="333" w:name="X5db1f82696679006fc24d2d9f8d9499d172a6a5"/>
     <w:p>
       <w:pPr>
         <w:pStyle w:val="Heading4"/>
@@ -49063,8 +49552,8 @@
         <w:t xml:space="preserve">Do not copy personal ChatGPT or Codex login credentials into CI secrets.</w:t>
       </w:r>
     </w:p>
-    <w:bookmarkEnd w:id="331"/>
-    <w:bookmarkStart w:id="333" w:name="adding-repository-specific-review-rules"/>
+    <w:bookmarkEnd w:id="333"/>
+    <w:bookmarkStart w:id="335" w:name="adding-repository-specific-review-rules"/>
     <w:p>
       <w:pPr>
         <w:pStyle w:val="Heading4"/>
@@ -49298,7 +49787,7 @@
       <w:r>
         <w:t xml:space="preserve"> </w:t>
       </w:r>
-      <w:hyperlink r:id="rId332">
+      <w:hyperlink r:id="rId334">
         <w:r>
           <w:rPr>
             <w:rStyle w:val="Hyperlink"/>
@@ -49310,9 +49799,9 @@
         <w:t xml:space="preserve">.</w:t>
       </w:r>
     </w:p>
-    <w:bookmarkEnd w:id="333"/>
-    <w:bookmarkEnd w:id="334"/>
-    <w:bookmarkStart w:id="349" w:name="sec-ai-claude-code-action-review"/>
+    <w:bookmarkEnd w:id="335"/>
+    <w:bookmarkEnd w:id="336"/>
+    <w:bookmarkStart w:id="351" w:name="sec-ai-claude-code-action-review"/>
     <w:p>
       <w:pPr>
         <w:pStyle w:val="Heading1"/>
@@ -49331,7 +49820,7 @@
       <w:r>
         <w:t xml:space="preserve"> </w:t>
       </w:r>
-      <w:hyperlink r:id="rId335">
+      <w:hyperlink r:id="rId337">
         <w:r>
           <w:rPr>
             <w:rStyle w:val="Hyperlink"/>
@@ -49437,7 +49926,7 @@
         <w:t xml:space="preserve">paths can move).</w:t>
       </w:r>
     </w:p>
-    <w:bookmarkStart w:id="339" w:name="one-action-many-behaviors"/>
+    <w:bookmarkStart w:id="341" w:name="one-action-many-behaviors"/>
     <w:p>
       <w:pPr>
         <w:pStyle w:val="Heading4"/>
@@ -49456,7 +49945,7 @@
       <w:r>
         <w:t xml:space="preserve"> </w:t>
       </w:r>
-      <w:hyperlink r:id="rId336">
+      <w:hyperlink r:id="rId338">
         <w:r>
           <w:rPr>
             <w:rStyle w:val="VerbatimChar"/>
@@ -49615,7 +50104,7 @@
       <w:r>
         <w:t xml:space="preserve"> </w:t>
       </w:r>
-      <w:hyperlink r:id="rId337">
+      <w:hyperlink r:id="rId339">
         <w:r>
           <w:rPr>
             <w:rStyle w:val="VerbatimChar"/>
@@ -49653,7 +50142,7 @@
       <w:r>
         <w:t xml:space="preserve"> </w:t>
       </w:r>
-      <w:hyperlink r:id="rId338">
+      <w:hyperlink r:id="rId340">
         <w:r>
           <w:rPr>
             <w:rStyle w:val="VerbatimChar"/>
@@ -49677,8 +50166,8 @@
         <w:t xml:space="preserve">not the in-repo path.</w:t>
       </w:r>
     </w:p>
-    <w:bookmarkEnd w:id="339"/>
-    <w:bookmarkStart w:id="344" w:name="where-the-repository-reviews-its-own-prs"/>
+    <w:bookmarkEnd w:id="341"/>
+    <w:bookmarkStart w:id="346" w:name="where-the-repository-reviews-its-own-prs"/>
     <w:p>
       <w:pPr>
         <w:pStyle w:val="Heading4"/>
@@ -49694,7 +50183,7 @@
           <w:numId w:val="1138"/>
         </w:numPr>
       </w:pPr>
-      <w:hyperlink r:id="rId340">
+      <w:hyperlink r:id="rId342">
         <w:r>
           <w:rPr>
             <w:rStyle w:val="VerbatimChar"/>
@@ -49779,7 +50268,7 @@
           <w:numId w:val="1138"/>
         </w:numPr>
       </w:pPr>
-      <w:hyperlink r:id="rId341">
+      <w:hyperlink r:id="rId343">
         <w:r>
           <w:rPr>
             <w:rStyle w:val="VerbatimChar"/>
@@ -49823,7 +50312,7 @@
       <w:r>
         <w:t xml:space="preserve"> </w:t>
       </w:r>
-      <w:hyperlink r:id="rId342">
+      <w:hyperlink r:id="rId344">
         <w:r>
           <w:rPr>
             <w:rStyle w:val="VerbatimChar"/>
@@ -49937,7 +50426,7 @@
           <w:numId w:val="1138"/>
         </w:numPr>
       </w:pPr>
-      <w:hyperlink r:id="rId343">
+      <w:hyperlink r:id="rId345">
         <w:r>
           <w:rPr>
             <w:rStyle w:val="VerbatimChar"/>
@@ -49964,8 +50453,8 @@
         <w:t xml:space="preserve">are copy-paste templates for adding review to another repository.</w:t>
       </w:r>
     </w:p>
-    <w:bookmarkEnd w:id="344"/>
-    <w:bookmarkStart w:id="345" w:name="adding-review-to-your-own-repository"/>
+    <w:bookmarkEnd w:id="346"/>
+    <w:bookmarkStart w:id="347" w:name="adding-review-to-your-own-repository"/>
     <w:p>
       <w:pPr>
         <w:pStyle w:val="Heading4"/>
@@ -50131,8 +50620,8 @@
         <w:t xml:space="preserve">so you edit it the way you would edit any review checklist.</w:t>
       </w:r>
     </w:p>
-    <w:bookmarkEnd w:id="345"/>
-    <w:bookmarkStart w:id="347" w:name="reviewer-versus-claude-agent"/>
+    <w:bookmarkEnd w:id="347"/>
+    <w:bookmarkStart w:id="349" w:name="reviewer-versus-claude-agent"/>
     <w:p>
       <w:pPr>
         <w:pStyle w:val="Heading4"/>
@@ -50166,7 +50655,7 @@
       <w:r>
         <w:t xml:space="preserve"> </w:t>
       </w:r>
-      <w:hyperlink r:id="rId346">
+      <w:hyperlink r:id="rId348">
         <w:r>
           <w:rPr>
             <w:rStyle w:val="VerbatimChar"/>
@@ -50414,8 +50903,8 @@
         <w:t xml:space="preserve">-triggered workflow does.</w:t>
       </w:r>
     </w:p>
-    <w:bookmarkEnd w:id="347"/>
-    <w:bookmarkStart w:id="348" w:name="relation-to-codex-native-review"/>
+    <w:bookmarkEnd w:id="349"/>
+    <w:bookmarkStart w:id="350" w:name="relation-to-codex-native-review"/>
     <w:p>
       <w:pPr>
         <w:pStyle w:val="Heading4"/>
@@ -50488,9 +50977,9 @@
         <w:t xml:space="preserve">and triggering events are all visible and editable in your repository.</w:t>
       </w:r>
     </w:p>
-    <w:bookmarkEnd w:id="348"/>
-    <w:bookmarkEnd w:id="349"/>
-    <w:bookmarkStart w:id="359" w:name="sec-ai-pr-activity-notifications"/>
+    <w:bookmarkEnd w:id="350"/>
+    <w:bookmarkEnd w:id="351"/>
+    <w:bookmarkStart w:id="361" w:name="sec-ai-pr-activity-notifications"/>
     <w:p>
       <w:pPr>
         <w:pStyle w:val="Heading1"/>
@@ -50834,7 +51323,7 @@
         </w:tc>
       </w:tr>
     </w:tbl>
-    <w:bookmarkStart w:id="350" w:name="the-channel-an-agent-controls"/>
+    <w:bookmarkStart w:id="352" w:name="the-channel-an-agent-controls"/>
     <w:p>
       <w:pPr>
         <w:pStyle w:val="Heading4"/>
@@ -51108,8 +51597,8 @@
         <w:t xml:space="preserve">real state, not a replacement for it.</w:t>
       </w:r>
     </w:p>
-    <w:bookmarkEnd w:id="350"/>
-    <w:bookmarkStart w:id="351" w:name="the-channel-only-a-human-controls"/>
+    <w:bookmarkEnd w:id="352"/>
+    <w:bookmarkStart w:id="353" w:name="the-channel-only-a-human-controls"/>
     <w:p>
       <w:pPr>
         <w:pStyle w:val="Heading4"/>
@@ -51412,8 +51901,8 @@
         <w:t xml:space="preserve">for the web-session context these run in.</w:t>
       </w:r>
     </w:p>
-    <w:bookmarkEnd w:id="351"/>
-    <w:bookmarkStart w:id="352" w:name="the-instruction-template-is-boilerplate"/>
+    <w:bookmarkEnd w:id="353"/>
+    <w:bookmarkStart w:id="354" w:name="the-instruction-template-is-boilerplate"/>
     <w:p>
       <w:pPr>
         <w:pStyle w:val="Heading4"/>
@@ -51679,8 +52168,8 @@
         <w:t xml:space="preserve">rather than as an instruction that a fix is owed.</w:t>
       </w:r>
     </w:p>
-    <w:bookmarkEnd w:id="352"/>
-    <w:bookmarkStart w:id="353" w:name="X3e28e99804e56791cb9e57e9eb83869f0ead0b2"/>
+    <w:bookmarkEnd w:id="354"/>
+    <w:bookmarkStart w:id="355" w:name="X3e28e99804e56791cb9e57e9eb83869f0ead0b2"/>
     <w:p>
       <w:pPr>
         <w:pStyle w:val="Heading4"/>
@@ -51809,8 +52298,8 @@
         <w:t xml:space="preserve">Toggling one says nothing about the other.</w:t>
       </w:r>
     </w:p>
-    <w:bookmarkEnd w:id="353"/>
-    <w:bookmarkStart w:id="358" w:name="treat-what-arrives-as-untrusted"/>
+    <w:bookmarkEnd w:id="355"/>
+    <w:bookmarkStart w:id="360" w:name="treat-what-arrives-as-untrusted"/>
     <w:p>
       <w:pPr>
         <w:pStyle w:val="Heading4"/>
@@ -52179,12 +52668,12 @@
                 <wp:inline>
                   <wp:extent cx="152400" cy="152400"/>
                   <wp:effectExtent b="0" l="0" r="0" t="0"/>
-                  <wp:docPr descr="" title="" id="354" name="Picture"/>
+                  <wp:docPr descr="" title="" id="356" name="Picture"/>
                   <a:graphic>
                     <a:graphicData uri="http://schemas.openxmlformats.org/drawingml/2006/picture">
                       <pic:pic>
                         <pic:nvPicPr>
-                          <pic:cNvPr descr="/opt/quarto/share/formats/docx/warning.png" id="355" name="Picture"/>
+                          <pic:cNvPr descr="/opt/quarto/share/formats/docx/warning.png" id="357" name="Picture"/>
                           <pic:cNvPicPr>
                             <a:picLocks noChangeArrowheads="1" noChangeAspect="1"/>
                           </pic:cNvPicPr>
@@ -52355,12 +52844,12 @@
                 <wp:inline>
                   <wp:extent cx="152400" cy="152400"/>
                   <wp:effectExtent b="0" l="0" r="0" t="0"/>
-                  <wp:docPr descr="" title="" id="356" name="Picture"/>
+                  <wp:docPr descr="" title="" id="358" name="Picture"/>
                   <a:graphic>
                     <a:graphicData uri="http://schemas.openxmlformats.org/drawingml/2006/picture">
                       <pic:pic>
                         <pic:nvPicPr>
-                          <pic:cNvPr descr="/opt/quarto/share/formats/docx/note.png" id="357" name="Picture"/>
+                          <pic:cNvPr descr="/opt/quarto/share/formats/docx/note.png" id="359" name="Picture"/>
                           <pic:cNvPicPr>
                             <a:picLocks noChangeArrowheads="1" noChangeAspect="1"/>
                           </pic:cNvPicPr>
@@ -52466,9 +52955,9 @@
         </w:tc>
       </w:tr>
     </w:tbl>
-    <w:bookmarkEnd w:id="358"/>
-    <w:bookmarkEnd w:id="359"/>
-    <w:bookmarkStart w:id="363" w:name="sec-ai-when-to-use"/>
+    <w:bookmarkEnd w:id="360"/>
+    <w:bookmarkEnd w:id="361"/>
+    <w:bookmarkStart w:id="365" w:name="sec-ai-when-to-use"/>
     <w:p>
       <w:pPr>
         <w:pStyle w:val="Heading1"/>
@@ -52488,7 +52977,7 @@
         <w:rPr>
           <w:rStyle w:val="FootnoteReference"/>
         </w:rPr>
-        <w:footnoteReference w:id="360"/>
+        <w:footnoteReference w:id="362"/>
       </w:r>
       <w:r>
         <w:t xml:space="preserve"> </w:t>
@@ -52520,7 +53009,7 @@
       <w:r>
         <w:t xml:space="preserve"> </w:t>
       </w:r>
-      <w:hyperlink r:id="rId361">
+      <w:hyperlink r:id="rId363">
         <w:r>
           <w:rPr>
             <w:rStyle w:val="Hyperlink"/>
@@ -52579,7 +53068,7 @@
       <w:r>
         <w:t xml:space="preserve"> </w:t>
       </w:r>
-      <w:hyperlink r:id="rId362">
+      <w:hyperlink r:id="rId364">
         <w:r>
           <w:rPr>
             <w:rStyle w:val="Hyperlink"/>
@@ -52698,8 +53187,8 @@
         <w:t xml:space="preserve">just like you would for any other skill you want to maintain.</w:t>
       </w:r>
     </w:p>
-    <w:bookmarkEnd w:id="363"/>
-    <w:bookmarkStart w:id="368" w:name="editing-with-.docx-files"/>
+    <w:bookmarkEnd w:id="365"/>
+    <w:bookmarkStart w:id="370" w:name="editing-with-.docx-files"/>
     <w:p>
       <w:pPr>
         <w:pStyle w:val="Heading1"/>
@@ -52879,7 +53368,7 @@
         <w:t xml:space="preserve">This approach makes it easier for collaborators who are more comfortable with Word to contribute while maintaining the source files in Quarto format.</w:t>
       </w:r>
     </w:p>
-    <w:bookmarkStart w:id="367" w:name="known-issue-document-1-warning-in-word"/>
+    <w:bookmarkStart w:id="369" w:name="known-issue-document-1-warning-in-word"/>
     <w:p>
       <w:pPr>
         <w:pStyle w:val="Heading4"/>
@@ -52964,7 +53453,7 @@
           <w:numId w:val="1146"/>
         </w:numPr>
       </w:pPr>
-      <w:hyperlink r:id="rId364">
+      <w:hyperlink r:id="rId366">
         <w:r>
           <w:rPr>
             <w:rStyle w:val="Hyperlink"/>
@@ -52981,7 +53470,7 @@
           <w:numId w:val="1146"/>
         </w:numPr>
       </w:pPr>
-      <w:hyperlink r:id="rId365">
+      <w:hyperlink r:id="rId367">
         <w:r>
           <w:rPr>
             <w:rStyle w:val="Hyperlink"/>
@@ -52998,7 +53487,7 @@
           <w:numId w:val="1146"/>
         </w:numPr>
       </w:pPr>
-      <w:hyperlink r:id="rId366">
+      <w:hyperlink r:id="rId368">
         <w:r>
           <w:rPr>
             <w:rStyle w:val="Hyperlink"/>
@@ -53111,9 +53600,9 @@
         <w:t xml:space="preserve">warning and can immediately add comments and track changes without issues.</w:t>
       </w:r>
     </w:p>
-    <w:bookmarkEnd w:id="367"/>
-    <w:bookmarkEnd w:id="368"/>
-    <w:bookmarkStart w:id="370" w:name="copilot-instructions-for-this-repository"/>
+    <w:bookmarkEnd w:id="369"/>
+    <w:bookmarkEnd w:id="370"/>
+    <w:bookmarkStart w:id="372" w:name="copilot-instructions-for-this-repository"/>
     <w:p>
       <w:pPr>
         <w:pStyle w:val="Heading1"/>
@@ -53345,7 +53834,7 @@
       <w:r>
         <w:t xml:space="preserve"> </w:t>
       </w:r>
-      <w:hyperlink r:id="rId369">
+      <w:hyperlink r:id="rId371">
         <w:r>
           <w:rPr>
             <w:rStyle w:val="VerbatimChar"/>
@@ -53360,8 +53849,8 @@
         <w:t xml:space="preserve">for a working example.</w:t>
       </w:r>
     </w:p>
-    <w:bookmarkEnd w:id="370"/>
-    <w:bookmarkStart w:id="371" w:name="using-copilot-review-before-human-review"/>
+    <w:bookmarkEnd w:id="372"/>
+    <w:bookmarkStart w:id="373" w:name="using-copilot-review-before-human-review"/>
     <w:p>
       <w:pPr>
         <w:pStyle w:val="Heading1"/>
@@ -53947,8 +54436,8 @@
         <w:t xml:space="preserve">This ensures you’re reviewing code that has already been through initial automated quality checks.</w:t>
       </w:r>
     </w:p>
-    <w:bookmarkEnd w:id="371"/>
-    <w:bookmarkStart w:id="373" w:name="reviewing-a-copilot-pr-you-didnt-create"/>
+    <w:bookmarkEnd w:id="373"/>
+    <w:bookmarkStart w:id="375" w:name="reviewing-a-copilot-pr-you-didnt-create"/>
     <w:p>
       <w:pPr>
         <w:pStyle w:val="Heading1"/>
@@ -53999,7 +54488,7 @@
       <w:r>
         <w:t xml:space="preserve"> </w:t>
       </w:r>
-      <w:hyperlink r:id="rId372">
+      <w:hyperlink r:id="rId374">
         <w:r>
           <w:rPr>
             <w:rStyle w:val="Hyperlink"/>
@@ -54903,8 +55392,8 @@
         <w:t xml:space="preserve">while benefiting from collaborative human review and Copilot’s implementation capabilities.</w:t>
       </w:r>
     </w:p>
-    <w:bookmarkEnd w:id="373"/>
-    <w:bookmarkStart w:id="392" w:name="sec-ai-claude-code-windows"/>
+    <w:bookmarkEnd w:id="375"/>
+    <w:bookmarkStart w:id="394" w:name="sec-ai-claude-code-windows"/>
     <w:p>
       <w:pPr>
         <w:pStyle w:val="Heading1"/>
@@ -55003,12 +55492,12 @@
                 <wp:inline>
                   <wp:extent cx="152400" cy="152400"/>
                   <wp:effectExtent b="0" l="0" r="0" t="0"/>
-                  <wp:docPr descr="" title="" id="374" name="Picture"/>
+                  <wp:docPr descr="" title="" id="376" name="Picture"/>
                   <a:graphic>
                     <a:graphicData uri="http://schemas.openxmlformats.org/drawingml/2006/picture">
                       <pic:pic>
                         <pic:nvPicPr>
-                          <pic:cNvPr descr="/opt/quarto/share/formats/docx/note.png" id="375" name="Picture"/>
+                          <pic:cNvPr descr="/opt/quarto/share/formats/docx/note.png" id="377" name="Picture"/>
                           <pic:cNvPicPr>
                             <a:picLocks noChangeArrowheads="1" noChangeAspect="1"/>
                           </pic:cNvPicPr>
@@ -55096,7 +55585,7 @@
         </w:tc>
       </w:tr>
     </w:tbl>
-    <w:bookmarkStart w:id="378" w:name="run-it-from-a-unix-like-terminal"/>
+    <w:bookmarkStart w:id="380" w:name="run-it-from-a-unix-like-terminal"/>
     <w:p>
       <w:pPr>
         <w:pStyle w:val="Heading4"/>
@@ -55143,7 +55632,7 @@
       <w:r>
         <w:t xml:space="preserve"> </w:t>
       </w:r>
-      <w:hyperlink r:id="rId376">
+      <w:hyperlink r:id="rId378">
         <w:r>
           <w:rPr>
             <w:rStyle w:val="Hyperlink"/>
@@ -55176,7 +55665,7 @@
       <w:r>
         <w:t xml:space="preserve">(</w:t>
       </w:r>
-      <w:hyperlink r:id="rId377">
+      <w:hyperlink r:id="rId379">
         <w:r>
           <w:rPr>
             <w:rStyle w:val="Hyperlink"/>
@@ -55327,8 +55816,8 @@
         <w:t xml:space="preserve">gotchas below don’t apply.</w:t>
       </w:r>
     </w:p>
-    <w:bookmarkEnd w:id="378"/>
-    <w:bookmarkStart w:id="383" w:name="install-claude-code"/>
+    <w:bookmarkEnd w:id="380"/>
+    <w:bookmarkStart w:id="385" w:name="install-claude-code"/>
     <w:p>
       <w:pPr>
         <w:pStyle w:val="Heading4"/>
@@ -55493,7 +55982,7 @@
       <w:r>
         <w:t xml:space="preserve"> </w:t>
       </w:r>
-      <w:hyperlink r:id="rId379">
+      <w:hyperlink r:id="rId381">
         <w:r>
           <w:rPr>
             <w:rStyle w:val="Hyperlink"/>
@@ -55579,12 +56068,12 @@
                 <wp:inline>
                   <wp:extent cx="152400" cy="152400"/>
                   <wp:effectExtent b="0" l="0" r="0" t="0"/>
-                  <wp:docPr descr="" title="" id="380" name="Picture"/>
+                  <wp:docPr descr="" title="" id="382" name="Picture"/>
                   <a:graphic>
                     <a:graphicData uri="http://schemas.openxmlformats.org/drawingml/2006/picture">
                       <pic:pic>
                         <pic:nvPicPr>
-                          <pic:cNvPr descr="/opt/quarto/share/formats/docx/important.png" id="381" name="Picture"/>
+                          <pic:cNvPr descr="/opt/quarto/share/formats/docx/important.png" id="383" name="Picture"/>
                           <pic:cNvPicPr>
                             <a:picLocks noChangeArrowheads="1" noChangeAspect="1"/>
                           </pic:cNvPicPr>
@@ -55740,7 +56229,7 @@
             <w:r>
               <w:t xml:space="preserve"> </w:t>
             </w:r>
-            <w:hyperlink r:id="rId382">
+            <w:hyperlink r:id="rId384">
               <w:r>
                 <w:rPr>
                   <w:rStyle w:val="Hyperlink"/>
@@ -55831,8 +56320,8 @@
         </w:tc>
       </w:tr>
     </w:tbl>
-    <w:bookmarkEnd w:id="383"/>
-    <w:bookmarkStart w:id="385" w:name="make-sure-your-shell-can-find-claude"/>
+    <w:bookmarkEnd w:id="385"/>
+    <w:bookmarkStart w:id="387" w:name="make-sure-your-shell-can-find-claude"/>
     <w:p>
       <w:pPr>
         <w:pStyle w:val="Heading4"/>
@@ -56430,7 +56919,7 @@
       <w:r>
         <w:t xml:space="preserve"> </w:t>
       </w:r>
-      <w:hyperlink r:id="rId384">
+      <w:hyperlink r:id="rId386">
         <w:r>
           <w:rPr>
             <w:rStyle w:val="Hyperlink"/>
@@ -56536,8 +57025,8 @@
         <w:t xml:space="preserve">initializes).</w:t>
       </w:r>
     </w:p>
-    <w:bookmarkEnd w:id="385"/>
-    <w:bookmarkStart w:id="388" w:name="X604325b0223e79803e04f87e7874b1d7f4a0663"/>
+    <w:bookmarkEnd w:id="387"/>
+    <w:bookmarkStart w:id="390" w:name="X604325b0223e79803e04f87e7874b1d7f4a0663"/>
     <w:p>
       <w:pPr>
         <w:pStyle w:val="Heading4"/>
@@ -56587,12 +57076,12 @@
                 <wp:inline>
                   <wp:extent cx="152400" cy="152400"/>
                   <wp:effectExtent b="0" l="0" r="0" t="0"/>
-                  <wp:docPr descr="" title="" id="386" name="Picture"/>
+                  <wp:docPr descr="" title="" id="388" name="Picture"/>
                   <a:graphic>
                     <a:graphicData uri="http://schemas.openxmlformats.org/drawingml/2006/picture">
                       <pic:pic>
                         <pic:nvPicPr>
-                          <pic:cNvPr descr="/opt/quarto/share/formats/docx/warning.png" id="387" name="Picture"/>
+                          <pic:cNvPr descr="/opt/quarto/share/formats/docx/warning.png" id="389" name="Picture"/>
                           <pic:cNvPicPr>
                             <a:picLocks noChangeArrowheads="1" noChangeAspect="1"/>
                           </pic:cNvPicPr>
@@ -56860,8 +57349,8 @@
         </w:tc>
       </w:tr>
     </w:tbl>
-    <w:bookmarkEnd w:id="388"/>
-    <w:bookmarkStart w:id="390" w:name="X1745fd502df7963ed7ce48d0465493b4d59ad92"/>
+    <w:bookmarkEnd w:id="390"/>
+    <w:bookmarkStart w:id="392" w:name="X1745fd502df7963ed7ce48d0465493b4d59ad92"/>
     <w:p>
       <w:pPr>
         <w:pStyle w:val="Heading4"/>
@@ -56880,7 +57369,7 @@
       <w:r>
         <w:t xml:space="preserve"> </w:t>
       </w:r>
-      <w:hyperlink r:id="rId389">
+      <w:hyperlink r:id="rId391">
         <w:r>
           <w:rPr>
             <w:rStyle w:val="Hyperlink"/>
@@ -57041,8 +57530,8 @@
         <w:t xml:space="preserve">.</w:t>
       </w:r>
     </w:p>
-    <w:bookmarkEnd w:id="390"/>
-    <w:bookmarkStart w:id="391" w:name="verify-the-install"/>
+    <w:bookmarkEnd w:id="392"/>
+    <w:bookmarkStart w:id="393" w:name="verify-the-install"/>
     <w:p>
       <w:pPr>
         <w:pStyle w:val="Heading4"/>
@@ -57211,9 +57700,9 @@
         <w:t xml:space="preserve">(or open a fresh window) after changing it.</w:t>
       </w:r>
     </w:p>
-    <w:bookmarkEnd w:id="391"/>
-    <w:bookmarkEnd w:id="392"/>
-    <w:bookmarkStart w:id="406" w:name="sec-ai-mcp-server-setup"/>
+    <w:bookmarkEnd w:id="393"/>
+    <w:bookmarkEnd w:id="394"/>
+    <w:bookmarkStart w:id="408" w:name="sec-ai-mcp-server-setup"/>
     <w:p>
       <w:pPr>
         <w:pStyle w:val="Heading1"/>
@@ -57334,12 +57823,12 @@
                 <wp:inline>
                   <wp:extent cx="152400" cy="152400"/>
                   <wp:effectExtent b="0" l="0" r="0" t="0"/>
-                  <wp:docPr descr="" title="" id="393" name="Picture"/>
+                  <wp:docPr descr="" title="" id="395" name="Picture"/>
                   <a:graphic>
                     <a:graphicData uri="http://schemas.openxmlformats.org/drawingml/2006/picture">
                       <pic:pic>
                         <pic:nvPicPr>
-                          <pic:cNvPr descr="/opt/quarto/share/formats/docx/note.png" id="394" name="Picture"/>
+                          <pic:cNvPr descr="/opt/quarto/share/formats/docx/note.png" id="396" name="Picture"/>
                           <pic:cNvPicPr>
                             <a:picLocks noChangeArrowheads="1" noChangeAspect="1"/>
                           </pic:cNvPicPr>
@@ -57433,7 +57922,7 @@
         </w:tc>
       </w:tr>
     </w:tbl>
-    <w:bookmarkStart w:id="396" w:name="installed-is-not-registered"/>
+    <w:bookmarkStart w:id="398" w:name="installed-is-not-registered"/>
     <w:p>
       <w:pPr>
         <w:pStyle w:val="Heading4"/>
@@ -57464,7 +57953,7 @@
       <w:r>
         <w:t xml:space="preserve"> </w:t>
       </w:r>
-      <w:hyperlink r:id="rId395">
+      <w:hyperlink r:id="rId397">
         <w:r>
           <w:rPr>
             <w:rStyle w:val="VerbatimChar"/>
@@ -57532,8 +58021,8 @@
         <w:t xml:space="preserve"> mcp list</w:t>
       </w:r>
     </w:p>
-    <w:bookmarkEnd w:id="396"/>
-    <w:bookmarkStart w:id="397" w:name="Xf6682145328c756d2e167d2c91be34f7f913a7f"/>
+    <w:bookmarkEnd w:id="398"/>
+    <w:bookmarkStart w:id="399" w:name="Xf6682145328c756d2e167d2c91be34f7f913a7f"/>
     <w:p>
       <w:pPr>
         <w:pStyle w:val="Heading4"/>
@@ -57732,8 +58221,8 @@
         <w:t xml:space="preserve">A local one shows a command path instead.</w:t>
       </w:r>
     </w:p>
-    <w:bookmarkEnd w:id="397"/>
-    <w:bookmarkStart w:id="398" w:name="and-401-mean-different-things"/>
+    <w:bookmarkEnd w:id="399"/>
+    <w:bookmarkStart w:id="400" w:name="and-401-mean-different-things"/>
     <w:p>
       <w:pPr>
         <w:pStyle w:val="Heading4"/>
@@ -57976,8 +58465,8 @@
         <w:t xml:space="preserve">sends you to the token-minting page for a problem that lives in a config file.</w:t>
       </w:r>
     </w:p>
-    <w:bookmarkEnd w:id="398"/>
-    <w:bookmarkStart w:id="399" w:name="install-the-binary-the-platforms-own-way"/>
+    <w:bookmarkEnd w:id="400"/>
+    <w:bookmarkStart w:id="401" w:name="install-the-binary-the-platforms-own-way"/>
     <w:p>
       <w:pPr>
         <w:pStyle w:val="Heading4"/>
@@ -58231,8 +58720,8 @@
         <w:t xml:space="preserve">with an override for the case where it isn’t on one.</w:t>
       </w:r>
     </w:p>
-    <w:bookmarkEnd w:id="399"/>
-    <w:bookmarkStart w:id="400" w:name="X2adb24e9b1a0644f0fbebe685525dadd8a56387"/>
+    <w:bookmarkEnd w:id="401"/>
+    <w:bookmarkStart w:id="402" w:name="X2adb24e9b1a0644f0fbebe685525dadd8a56387"/>
     <w:p>
       <w:pPr>
         <w:pStyle w:val="Heading4"/>
@@ -59109,8 +59598,8 @@
         <w:t xml:space="preserve">bug you just finished diagnosing.</w:t>
       </w:r>
     </w:p>
-    <w:bookmarkEnd w:id="400"/>
-    <w:bookmarkStart w:id="401" w:name="X448547516ab06679b064b391b05a896db41ea57"/>
+    <w:bookmarkEnd w:id="402"/>
+    <w:bookmarkStart w:id="403" w:name="X448547516ab06679b064b391b05a896db41ea57"/>
     <w:p>
       <w:pPr>
         <w:pStyle w:val="Heading4"/>
@@ -59432,8 +59921,8 @@
         <w:t xml:space="preserve">the count moving the right direction, as the check above expects.</w:t>
       </w:r>
     </w:p>
-    <w:bookmarkEnd w:id="401"/>
-    <w:bookmarkStart w:id="402" w:name="X4a4c9992603eee0123b58b5b37e7fedbb817150"/>
+    <w:bookmarkEnd w:id="403"/>
+    <w:bookmarkStart w:id="404" w:name="X4a4c9992603eee0123b58b5b37e7fedbb817150"/>
     <w:p>
       <w:pPr>
         <w:pStyle w:val="Heading4"/>
@@ -59533,8 +60022,8 @@
         <w:t xml:space="preserve">Reach for those instead when working from a local harness.</w:t>
       </w:r>
     </w:p>
-    <w:bookmarkEnd w:id="402"/>
-    <w:bookmarkStart w:id="403" w:name="Xb256c2a3c0a422f2f687a98903d3521fd60a1b1"/>
+    <w:bookmarkEnd w:id="404"/>
+    <w:bookmarkStart w:id="405" w:name="Xb256c2a3c0a422f2f687a98903d3521fd60a1b1"/>
     <w:p>
       <w:pPr>
         <w:pStyle w:val="Heading4"/>
@@ -59710,8 +60199,8 @@
         <w:t xml:space="preserve">not something an agent does in passing.</w:t>
       </w:r>
     </w:p>
-    <w:bookmarkEnd w:id="403"/>
-    <w:bookmarkStart w:id="405" w:name="Xd44df015462fcf288556a538677f0a762c9ef1d"/>
+    <w:bookmarkEnd w:id="405"/>
+    <w:bookmarkStart w:id="407" w:name="Xd44df015462fcf288556a538677f0a762c9ef1d"/>
     <w:p>
       <w:pPr>
         <w:pStyle w:val="Heading4"/>
@@ -59825,7 +60314,7 @@
       <w:r>
         <w:t xml:space="preserve"> </w:t>
       </w:r>
-      <w:hyperlink r:id="rId404">
+      <w:hyperlink r:id="rId406">
         <w:r>
           <w:rPr>
             <w:rStyle w:val="Hyperlink"/>
@@ -60008,9 +60497,9 @@
         <w:t xml:space="preserve">and expect it to work.</w:t>
       </w:r>
     </w:p>
-    <w:bookmarkEnd w:id="405"/>
-    <w:bookmarkEnd w:id="406"/>
-    <w:bookmarkStart w:id="414" w:name="sec-ai-gemini-spend-management"/>
+    <w:bookmarkEnd w:id="407"/>
+    <w:bookmarkEnd w:id="408"/>
+    <w:bookmarkStart w:id="416" w:name="sec-ai-gemini-spend-management"/>
     <w:p>
       <w:pPr>
         <w:pStyle w:val="Heading1"/>
@@ -60039,7 +60528,7 @@
         <w:t xml:space="preserve">and optimize token consumption across local tools and GitHub Actions workflows.</w:t>
       </w:r>
     </w:p>
-    <w:bookmarkStart w:id="408" w:name="Xd8c10be17edf039db5b664720f228274181ba18"/>
+    <w:bookmarkStart w:id="410" w:name="Xd8c10be17edf039db5b664720f228274181ba18"/>
     <w:p>
       <w:pPr>
         <w:pStyle w:val="Heading4"/>
@@ -60103,7 +60592,7 @@
       <w:r>
         <w:t xml:space="preserve"> </w:t>
       </w:r>
-      <w:hyperlink r:id="rId407">
+      <w:hyperlink r:id="rId409">
         <w:r>
           <w:rPr>
             <w:rStyle w:val="Hyperlink"/>
@@ -60198,7 +60687,7 @@
       <w:r>
         <w:t xml:space="preserve"> </w:t>
       </w:r>
-      <w:hyperlink r:id="rId407">
+      <w:hyperlink r:id="rId409">
         <w:r>
           <w:rPr>
             <w:rStyle w:val="Hyperlink"/>
@@ -60234,8 +60723,8 @@
         <w:t xml:space="preserve">Any project that has hit its monthly spend cap will have its API requests paused until the limit is updated.</w:t>
       </w:r>
     </w:p>
-    <w:bookmarkEnd w:id="408"/>
-    <w:bookmarkStart w:id="410" w:name="adjusting-and-unpausing-spend-caps"/>
+    <w:bookmarkEnd w:id="410"/>
+    <w:bookmarkStart w:id="412" w:name="adjusting-and-unpausing-spend-caps"/>
     <w:p>
       <w:pPr>
         <w:pStyle w:val="Heading4"/>
@@ -60266,7 +60755,7 @@
       <w:r>
         <w:t xml:space="preserve"> </w:t>
       </w:r>
-      <w:hyperlink r:id="rId409">
+      <w:hyperlink r:id="rId411">
         <w:r>
           <w:rPr>
             <w:rStyle w:val="Hyperlink"/>
@@ -60335,8 +60824,8 @@
         <w:t xml:space="preserve">and API service automatically resumes up to the configured cap.</w:t>
       </w:r>
     </w:p>
-    <w:bookmarkEnd w:id="410"/>
-    <w:bookmarkStart w:id="412" w:name="setting-up-google-cloud-budget-alerts"/>
+    <w:bookmarkEnd w:id="412"/>
+    <w:bookmarkStart w:id="414" w:name="setting-up-google-cloud-budget-alerts"/>
     <w:p>
       <w:pPr>
         <w:pStyle w:val="Heading4"/>
@@ -60367,7 +60856,7 @@
       <w:r>
         <w:t xml:space="preserve"> </w:t>
       </w:r>
-      <w:hyperlink r:id="rId411">
+      <w:hyperlink r:id="rId413">
         <w:r>
           <w:rPr>
             <w:rStyle w:val="Hyperlink"/>
@@ -60519,8 +61008,8 @@
         <w:t xml:space="preserve">. You will receive email alerts before any project hits its spend cap.</w:t>
       </w:r>
     </w:p>
-    <w:bookmarkEnd w:id="412"/>
-    <w:bookmarkStart w:id="413" w:name="cost-optimization-best-practices"/>
+    <w:bookmarkEnd w:id="414"/>
+    <w:bookmarkStart w:id="415" w:name="cost-optimization-best-practices"/>
     <w:p>
       <w:pPr>
         <w:pStyle w:val="Heading4"/>
@@ -60835,9 +61324,9 @@
         <w:t xml:space="preserve">to collapse them in GitHub’s web diff view and exclude them from repository language statistics.</w:t>
       </w:r>
     </w:p>
-    <w:bookmarkEnd w:id="413"/>
-    <w:bookmarkEnd w:id="414"/>
-    <w:bookmarkStart w:id="444" w:name="references"/>
+    <w:bookmarkEnd w:id="415"/>
+    <w:bookmarkEnd w:id="416"/>
+    <w:bookmarkStart w:id="446" w:name="references"/>
     <w:p>
       <w:pPr>
         <w:pStyle w:val="Heading1"/>
@@ -60846,8 +61335,8 @@
         <w:t xml:space="preserve">References</w:t>
       </w:r>
     </w:p>
-    <w:bookmarkStart w:id="443" w:name="refs"/>
-    <w:bookmarkStart w:id="416" w:name="ref-space_odyssey"/>
+    <w:bookmarkStart w:id="445" w:name="refs"/>
+    <w:bookmarkStart w:id="418" w:name="ref-space_odyssey"/>
     <w:p>
       <w:pPr>
         <w:pStyle w:val="Bibliography"/>
@@ -60865,7 +61354,7 @@
       <w:r>
         <w:t xml:space="preserve"> </w:t>
       </w:r>
-      <w:hyperlink r:id="rId415">
+      <w:hyperlink r:id="rId417">
         <w:r>
           <w:rPr>
             <w:rStyle w:val="Hyperlink"/>
@@ -60877,8 +61366,8 @@
         <w:t xml:space="preserve">.</w:t>
       </w:r>
     </w:p>
-    <w:bookmarkEnd w:id="416"/>
-    <w:bookmarkStart w:id="418" w:name="ref-i_robot"/>
+    <w:bookmarkEnd w:id="418"/>
+    <w:bookmarkStart w:id="420" w:name="ref-i_robot"/>
     <w:p>
       <w:pPr>
         <w:pStyle w:val="Bibliography"/>
@@ -60902,7 +61391,7 @@
       <w:r>
         <w:t xml:space="preserve"> </w:t>
       </w:r>
-      <w:hyperlink r:id="rId417">
+      <w:hyperlink r:id="rId419">
         <w:r>
           <w:rPr>
             <w:rStyle w:val="Hyperlink"/>
@@ -60914,8 +61403,8 @@
         <w:t xml:space="preserve">.</w:t>
       </w:r>
     </w:p>
-    <w:bookmarkEnd w:id="418"/>
-    <w:bookmarkStart w:id="420" w:name="ref-battlestar_galactica_2004"/>
+    <w:bookmarkEnd w:id="420"/>
+    <w:bookmarkStart w:id="422" w:name="ref-battlestar_galactica_2004"/>
     <w:p>
       <w:pPr>
         <w:pStyle w:val="Bibliography"/>
@@ -60933,7 +61422,7 @@
       <w:r>
         <w:t xml:space="preserve"> </w:t>
       </w:r>
-      <w:hyperlink r:id="rId419">
+      <w:hyperlink r:id="rId421">
         <w:r>
           <w:rPr>
             <w:rStyle w:val="Hyperlink"/>
@@ -60945,8 +61434,8 @@
         <w:t xml:space="preserve">.</w:t>
       </w:r>
     </w:p>
-    <w:bookmarkEnd w:id="420"/>
-    <w:bookmarkStart w:id="422" w:name="ref-slm_agentic_ai"/>
+    <w:bookmarkEnd w:id="422"/>
+    <w:bookmarkStart w:id="424" w:name="ref-slm_agentic_ai"/>
     <w:p>
       <w:pPr>
         <w:pStyle w:val="Bibliography"/>
@@ -60970,7 +61459,7 @@
       <w:r>
         <w:t xml:space="preserve"> </w:t>
       </w:r>
-      <w:hyperlink r:id="rId421">
+      <w:hyperlink r:id="rId423">
         <w:r>
           <w:rPr>
             <w:rStyle w:val="Hyperlink"/>
@@ -60982,8 +61471,8 @@
         <w:t xml:space="preserve">.</w:t>
       </w:r>
     </w:p>
-    <w:bookmarkEnd w:id="422"/>
-    <w:bookmarkStart w:id="424" w:name="ref-blade_runner"/>
+    <w:bookmarkEnd w:id="424"/>
+    <w:bookmarkStart w:id="426" w:name="ref-blade_runner"/>
     <w:p>
       <w:pPr>
         <w:pStyle w:val="Bibliography"/>
@@ -61001,7 +61490,7 @@
       <w:r>
         <w:t xml:space="preserve"> </w:t>
       </w:r>
-      <w:hyperlink r:id="rId423">
+      <w:hyperlink r:id="rId425">
         <w:r>
           <w:rPr>
             <w:rStyle w:val="Hyperlink"/>
@@ -61013,8 +61502,8 @@
         <w:t xml:space="preserve">.</w:t>
       </w:r>
     </w:p>
-    <w:bookmarkEnd w:id="424"/>
-    <w:bookmarkStart w:id="426" w:name="ref-enders_game"/>
+    <w:bookmarkEnd w:id="426"/>
+    <w:bookmarkStart w:id="428" w:name="ref-enders_game"/>
     <w:p>
       <w:pPr>
         <w:pStyle w:val="Bibliography"/>
@@ -61038,7 +61527,7 @@
       <w:r>
         <w:t xml:space="preserve"> </w:t>
       </w:r>
-      <w:hyperlink r:id="rId425">
+      <w:hyperlink r:id="rId427">
         <w:r>
           <w:rPr>
             <w:rStyle w:val="Hyperlink"/>
@@ -61050,8 +61539,8 @@
         <w:t xml:space="preserve">.</w:t>
       </w:r>
     </w:p>
-    <w:bookmarkEnd w:id="426"/>
-    <w:bookmarkStart w:id="428" w:name="ref-qlora"/>
+    <w:bookmarkEnd w:id="428"/>
+    <w:bookmarkStart w:id="430" w:name="ref-qlora"/>
     <w:p>
       <w:pPr>
         <w:pStyle w:val="Bibliography"/>
@@ -61075,7 +61564,7 @@
       <w:r>
         <w:t xml:space="preserve"> </w:t>
       </w:r>
-      <w:hyperlink r:id="rId427">
+      <w:hyperlink r:id="rId429">
         <w:r>
           <w:rPr>
             <w:rStyle w:val="Hyperlink"/>
@@ -61087,8 +61576,8 @@
         <w:t xml:space="preserve">.</w:t>
       </w:r>
     </w:p>
-    <w:bookmarkEnd w:id="428"/>
-    <w:bookmarkStart w:id="430" w:name="ref-humans_are_dead"/>
+    <w:bookmarkEnd w:id="430"/>
+    <w:bookmarkStart w:id="432" w:name="ref-humans_are_dead"/>
     <w:p>
       <w:pPr>
         <w:pStyle w:val="Bibliography"/>
@@ -61112,7 +61601,7 @@
       <w:r>
         <w:t xml:space="preserve"> </w:t>
       </w:r>
-      <w:hyperlink r:id="rId429">
+      <w:hyperlink r:id="rId431">
         <w:r>
           <w:rPr>
             <w:rStyle w:val="Hyperlink"/>
@@ -61124,8 +61613,8 @@
         <w:t xml:space="preserve">.</w:t>
       </w:r>
     </w:p>
-    <w:bookmarkEnd w:id="430"/>
-    <w:bookmarkStart w:id="432" w:name="ref-dune"/>
+    <w:bookmarkEnd w:id="432"/>
+    <w:bookmarkStart w:id="434" w:name="ref-dune"/>
     <w:p>
       <w:pPr>
         <w:pStyle w:val="Bibliography"/>
@@ -61149,7 +61638,7 @@
       <w:r>
         <w:t xml:space="preserve"> </w:t>
       </w:r>
-      <w:hyperlink r:id="rId431">
+      <w:hyperlink r:id="rId433">
         <w:r>
           <w:rPr>
             <w:rStyle w:val="Hyperlink"/>
@@ -61161,8 +61650,8 @@
         <w:t xml:space="preserve">.</w:t>
       </w:r>
     </w:p>
-    <w:bookmarkEnd w:id="432"/>
-    <w:bookmarkStart w:id="434" w:name="ref-lora"/>
+    <w:bookmarkEnd w:id="434"/>
+    <w:bookmarkStart w:id="436" w:name="ref-lora"/>
     <w:p>
       <w:pPr>
         <w:pStyle w:val="Bibliography"/>
@@ -61186,7 +61675,7 @@
       <w:r>
         <w:t xml:space="preserve"> </w:t>
       </w:r>
-      <w:hyperlink r:id="rId433">
+      <w:hyperlink r:id="rId435">
         <w:r>
           <w:rPr>
             <w:rStyle w:val="Hyperlink"/>
@@ -61198,8 +61687,8 @@
         <w:t xml:space="preserve">.</w:t>
       </w:r>
     </w:p>
-    <w:bookmarkEnd w:id="434"/>
-    <w:bookmarkStart w:id="436" w:name="ref-lecun_world_models"/>
+    <w:bookmarkEnd w:id="436"/>
+    <w:bookmarkStart w:id="438" w:name="ref-lecun_world_models"/>
     <w:p>
       <w:pPr>
         <w:pStyle w:val="Bibliography"/>
@@ -61223,7 +61712,7 @@
       <w:r>
         <w:t xml:space="preserve"> </w:t>
       </w:r>
-      <w:hyperlink r:id="rId435">
+      <w:hyperlink r:id="rId437">
         <w:r>
           <w:rPr>
             <w:rStyle w:val="Hyperlink"/>
@@ -61235,8 +61724,8 @@
         <w:t xml:space="preserve">.</w:t>
       </w:r>
     </w:p>
-    <w:bookmarkEnd w:id="436"/>
-    <w:bookmarkStart w:id="438" w:name="ref-terminator"/>
+    <w:bookmarkEnd w:id="438"/>
+    <w:bookmarkStart w:id="440" w:name="ref-terminator"/>
     <w:p>
       <w:pPr>
         <w:pStyle w:val="Bibliography"/>
@@ -61254,7 +61743,7 @@
       <w:r>
         <w:t xml:space="preserve"> </w:t>
       </w:r>
-      <w:hyperlink r:id="rId437">
+      <w:hyperlink r:id="rId439">
         <w:r>
           <w:rPr>
             <w:rStyle w:val="Hyperlink"/>
@@ -61266,8 +61755,8 @@
         <w:t xml:space="preserve">.</w:t>
       </w:r>
     </w:p>
-    <w:bookmarkEnd w:id="438"/>
-    <w:bookmarkStart w:id="440" w:name="ref-matrix"/>
+    <w:bookmarkEnd w:id="440"/>
+    <w:bookmarkStart w:id="442" w:name="ref-matrix"/>
     <w:p>
       <w:pPr>
         <w:pStyle w:val="Bibliography"/>
@@ -61285,7 +61774,7 @@
       <w:r>
         <w:t xml:space="preserve"> </w:t>
       </w:r>
-      <w:hyperlink r:id="rId439">
+      <w:hyperlink r:id="rId441">
         <w:r>
           <w:rPr>
             <w:rStyle w:val="Hyperlink"/>
@@ -61297,8 +61786,8 @@
         <w:t xml:space="preserve">.</w:t>
       </w:r>
     </w:p>
-    <w:bookmarkEnd w:id="440"/>
-    <w:bookmarkStart w:id="442" w:name="ref-wargames"/>
+    <w:bookmarkEnd w:id="442"/>
+    <w:bookmarkStart w:id="444" w:name="ref-wargames"/>
     <w:p>
       <w:pPr>
         <w:pStyle w:val="Bibliography"/>
@@ -61316,7 +61805,7 @@
       <w:r>
         <w:t xml:space="preserve"> </w:t>
       </w:r>
-      <w:hyperlink r:id="rId441">
+      <w:hyperlink r:id="rId443">
         <w:r>
           <w:rPr>
             <w:rStyle w:val="Hyperlink"/>
@@ -61328,9 +61817,9 @@
         <w:t xml:space="preserve">.</w:t>
       </w:r>
     </w:p>
-    <w:bookmarkEnd w:id="442"/>
-    <w:bookmarkEnd w:id="443"/>
     <w:bookmarkEnd w:id="444"/>
+    <w:bookmarkEnd w:id="445"/>
+    <w:bookmarkEnd w:id="446"/>
     <w:sectPr>
       <w:footnotePr>
         <w:numRestart w:val="eachSect"/>
@@ -61360,7 +61849,7 @@
       </w:r>
     </w:p>
   </w:footnote>
-  <w:footnote w:id="360">
+  <w:footnote w:id="362">
     <w:p>
       <w:pPr>
         <w:pStyle w:val="FootnoteText"/>

</xml_diff>

<commit_message>
Deploying to gh-pages from @ Morrison-Lab/wai@d9c32045ecbf69636b455b316c3e14eeb3d8e108 🚀
</commit_message>
<xml_diff>
--- a/chapters/coding-agents.docx
+++ b/chapters/coding-agents.docx
@@ -15,7 +15,7 @@
         <w:pStyle w:val="Date"/>
       </w:pPr>
       <w:r>
-        <w:t xml:space="preserve">Last modified: 2026-08-29 21:30:44 (PDT)</w:t>
+        <w:t xml:space="preserve">Last modified: 2026-08-29 21:38:14 (PDT)</w:t>
       </w:r>
     </w:p>
     <w:p>
@@ -803,7 +803,7 @@
       </w:r>
     </w:p>
     <w:bookmarkEnd w:id="16"/>
-    <w:bookmarkStart w:id="26" w:name="sec-ai-coding-agent-platforms"/>
+    <w:bookmarkStart w:id="27" w:name="sec-ai-coding-agent-platforms"/>
     <w:p>
       <w:pPr>
         <w:pStyle w:val="Heading1"/>
@@ -832,7 +832,7 @@
         <w:t xml:space="preserve">model to the task and your repository’s security requirements.</w:t>
       </w:r>
     </w:p>
-    <w:bookmarkStart w:id="25" w:name="common-coding-agent-platforms"/>
+    <w:bookmarkStart w:id="26" w:name="common-coding-agent-platforms"/>
     <w:p>
       <w:pPr>
         <w:pStyle w:val="Heading4"/>
@@ -1234,7 +1234,97 @@
           </w:p>
         </w:tc>
       </w:tr>
+      <w:tr>
+        <w:tc>
+          <w:tcPr/>
+          <w:p>
+            <w:pPr>
+              <w:pStyle w:val="Compact"/>
+            </w:pPr>
+            <w:hyperlink r:id="rId24">
+              <w:r>
+                <w:rPr>
+                  <w:rStyle w:val="Hyperlink"/>
+                </w:rPr>
+                <w:t xml:space="preserve">GitKraken Kepler</w:t>
+              </w:r>
+            </w:hyperlink>
+          </w:p>
+        </w:tc>
+        <w:tc>
+          <w:tcPr/>
+          <w:p>
+            <w:pPr>
+              <w:pStyle w:val="Compact"/>
+            </w:pPr>
+            <w:r>
+              <w:t xml:space="preserve">Agentic development environment (desktop)</w:t>
+            </w:r>
+          </w:p>
+        </w:tc>
+        <w:tc>
+          <w:tcPr/>
+          <w:p>
+            <w:pPr>
+              <w:pStyle w:val="Compact"/>
+            </w:pPr>
+            <w:r>
+              <w:t xml:space="preserve">Start a Task from an issue, PR, or idea; run multiple agents in parallel isolated worktrees via reusable Actions; review per-branch diffs and open PRs</w:t>
+            </w:r>
+          </w:p>
+        </w:tc>
+      </w:tr>
     </w:tbl>
+    <w:p>
+      <w:pPr>
+        <w:pStyle w:val="BodyText"/>
+      </w:pPr>
+      <w:r>
+        <w:t xml:space="preserve">Kepler is not an agent itself but an orchestration layer.</w:t>
+      </w:r>
+      <w:r>
+        <w:t xml:space="preserve"> </w:t>
+      </w:r>
+      <w:r>
+        <w:t xml:space="preserve">It hosts agents you already use</w:t>
+      </w:r>
+      <w:r>
+        <w:t xml:space="preserve"> </w:t>
+      </w:r>
+      <w:r>
+        <w:t xml:space="preserve">(Claude Code, Codex, Copilot, Cursor, OpenCode)</w:t>
+      </w:r>
+      <w:r>
+        <w:t xml:space="preserve"> </w:t>
+      </w:r>
+      <w:r>
+        <w:t xml:space="preserve">rather than locking in one model,</w:t>
+      </w:r>
+      <w:r>
+        <w:t xml:space="preserve"> </w:t>
+      </w:r>
+      <w:r>
+        <w:t xml:space="preserve">and builds on a decade of GitKraken plumbing for branches, worktrees, diffs, and merges.</w:t>
+      </w:r>
+      <w:r>
+        <w:t xml:space="preserve"> </w:t>
+      </w:r>
+      <w:r>
+        <w:t xml:space="preserve">Where a single-agent platform handles one repo at a time,</w:t>
+      </w:r>
+      <w:r>
+        <w:t xml:space="preserve"> </w:t>
+      </w:r>
+      <w:r>
+        <w:t xml:space="preserve">a Kepler Task can span many repos,</w:t>
+      </w:r>
+      <w:r>
+        <w:t xml:space="preserve"> </w:t>
+      </w:r>
+      <w:r>
+        <w:t xml:space="preserve">and its Agent Graph visualizes every session, turn, tool call, and subagent live.</w:t>
+      </w:r>
+    </w:p>
     <w:p>
       <w:pPr>
         <w:pStyle w:val="BodyText"/>
@@ -1339,7 +1429,7 @@
       <w:r>
         <w:t xml:space="preserve"> </w:t>
       </w:r>
-      <w:hyperlink r:id="rId24">
+      <w:hyperlink r:id="rId25">
         <w:r>
           <w:rPr>
             <w:rStyle w:val="Hyperlink"/>
@@ -1357,9 +1447,9 @@
         <w:t xml:space="preserve">Those products do not replace the platforms above.</w:t>
       </w:r>
     </w:p>
-    <w:bookmarkEnd w:id="25"/>
     <w:bookmarkEnd w:id="26"/>
-    <w:bookmarkStart w:id="34" w:name="sec-ai-harnesses"/>
+    <w:bookmarkEnd w:id="27"/>
+    <w:bookmarkStart w:id="35" w:name="sec-ai-harnesses"/>
     <w:p>
       <w:pPr>
         <w:pStyle w:val="Heading1"/>
@@ -1428,7 +1518,7 @@
         <w:t xml:space="preserve">and carry state across turns and sessions.</w:t>
       </w:r>
     </w:p>
-    <w:bookmarkStart w:id="31" w:name="layers-of-a-harness"/>
+    <w:bookmarkStart w:id="32" w:name="layers-of-a-harness"/>
     <w:p>
       <w:pPr>
         <w:pStyle w:val="Heading4"/>
@@ -1470,7 +1560,7 @@
       <w:r>
         <w:t xml:space="preserve"> </w:t>
       </w:r>
-      <w:hyperlink r:id="rId27">
+      <w:hyperlink r:id="rId28">
         <w:r>
           <w:rPr>
             <w:rStyle w:val="Hyperlink"/>
@@ -1512,7 +1602,7 @@
       <w:r>
         <w:t xml:space="preserve"> </w:t>
       </w:r>
-      <w:hyperlink r:id="rId28">
+      <w:hyperlink r:id="rId29">
         <w:r>
           <w:rPr>
             <w:rStyle w:val="Hyperlink"/>
@@ -1676,7 +1766,7 @@
       <w:r>
         <w:t xml:space="preserve"> </w:t>
       </w:r>
-      <w:hyperlink r:id="rId29">
+      <w:hyperlink r:id="rId30">
         <w:r>
           <w:rPr>
             <w:rStyle w:val="Hyperlink"/>
@@ -1745,7 +1835,7 @@
       <w:r>
         <w:t xml:space="preserve">/</w:t>
       </w:r>
-      <w:hyperlink r:id="rId30">
+      <w:hyperlink r:id="rId31">
         <w:r>
           <w:rPr>
             <w:rStyle w:val="VerbatimChar"/>
@@ -1772,8 +1862,8 @@
         <w:t xml:space="preserve">so the harness does not relearn your conventions every time.</w:t>
       </w:r>
     </w:p>
-    <w:bookmarkEnd w:id="31"/>
-    <w:bookmarkStart w:id="33" w:name="using-harness-features-well"/>
+    <w:bookmarkEnd w:id="32"/>
+    <w:bookmarkStart w:id="34" w:name="using-harness-features-well"/>
     <w:p>
       <w:pPr>
         <w:pStyle w:val="Heading4"/>
@@ -2005,7 +2095,7 @@
       <w:r>
         <w:t xml:space="preserve"> </w:t>
       </w:r>
-      <w:hyperlink r:id="rId32">
+      <w:hyperlink r:id="rId33">
         <w:r>
           <w:rPr>
             <w:rStyle w:val="Hyperlink"/>
@@ -2017,9 +2107,9 @@
         <w:t xml:space="preserve">.</w:t>
       </w:r>
     </w:p>
-    <w:bookmarkEnd w:id="33"/>
     <w:bookmarkEnd w:id="34"/>
-    <w:bookmarkStart w:id="39" w:name="sec-ai-agent-implementation"/>
+    <w:bookmarkEnd w:id="35"/>
+    <w:bookmarkStart w:id="40" w:name="sec-ai-agent-implementation"/>
     <w:p>
       <w:pPr>
         <w:pStyle w:val="Heading1"/>
@@ -2096,7 +2186,7 @@
         <w:t xml:space="preserve">a main conversation, and any number of subagents it spawns.</w:t>
       </w:r>
     </w:p>
-    <w:bookmarkStart w:id="35" w:name="the-shape-of-an-agent"/>
+    <w:bookmarkStart w:id="36" w:name="the-shape-of-an-agent"/>
     <w:p>
       <w:pPr>
         <w:pStyle w:val="Heading4"/>
@@ -2268,8 +2358,8 @@
         <w:t xml:space="preserve">or must call a schema-validated tool to return a typed result.</w:t>
       </w:r>
     </w:p>
-    <w:bookmarkEnd w:id="35"/>
-    <w:bookmarkStart w:id="36" w:name="how-an-agent-runs"/>
+    <w:bookmarkEnd w:id="36"/>
+    <w:bookmarkStart w:id="37" w:name="how-an-agent-runs"/>
     <w:p>
       <w:pPr>
         <w:pStyle w:val="Heading4"/>
@@ -2456,8 +2546,8 @@
         <w:t xml:space="preserve">it is a context-isolation boundary, not just a prompt.</w:t>
       </w:r>
     </w:p>
-    <w:bookmarkEnd w:id="36"/>
-    <w:bookmarkStart w:id="37" w:name="composability-and-its-limits"/>
+    <w:bookmarkEnd w:id="37"/>
+    <w:bookmarkStart w:id="38" w:name="composability-and-its-limits"/>
     <w:p>
       <w:pPr>
         <w:pStyle w:val="Heading4"/>
@@ -2528,8 +2618,8 @@
         <w:t xml:space="preserve">not a different execution model.</w:t>
       </w:r>
     </w:p>
-    <w:bookmarkEnd w:id="37"/>
-    <w:bookmarkStart w:id="38" w:name="two-axes-that-define-an-agents-behavior"/>
+    <w:bookmarkEnd w:id="38"/>
+    <w:bookmarkStart w:id="39" w:name="two-axes-that-define-an-agents-behavior"/>
     <w:p>
       <w:pPr>
         <w:pStyle w:val="Heading4"/>
@@ -2636,9 +2726,9 @@
         <w:t xml:space="preserve">even though internally it is still a multi-turn loop.</w:t>
       </w:r>
     </w:p>
-    <w:bookmarkEnd w:id="38"/>
     <w:bookmarkEnd w:id="39"/>
-    <w:bookmarkStart w:id="48" w:name="sec-ai-harness-construction"/>
+    <w:bookmarkEnd w:id="40"/>
+    <w:bookmarkStart w:id="49" w:name="sec-ai-harness-construction"/>
     <w:p>
       <w:pPr>
         <w:pStyle w:val="Heading1"/>
@@ -2667,7 +2757,7 @@
         <w:t xml:space="preserve">others are just text files the harness reads at runtime.</w:t>
       </w:r>
     </w:p>
-    <w:bookmarkStart w:id="40" w:name="Xb3d1c69caf486dc703e7e8178df274f009cb4ba"/>
+    <w:bookmarkStart w:id="41" w:name="Xb3d1c69caf486dc703e7e8178df274f009cb4ba"/>
     <w:p>
       <w:pPr>
         <w:pStyle w:val="Heading4"/>
@@ -2738,8 +2828,8 @@
         <w:t xml:space="preserve">rather than just a prompt someone wrote.</w:t>
       </w:r>
     </w:p>
-    <w:bookmarkEnd w:id="40"/>
-    <w:bookmarkStart w:id="43" w:name="X34d81458ca858ec581962c07e58f97cb46499cc"/>
+    <w:bookmarkEnd w:id="41"/>
+    <w:bookmarkStart w:id="44" w:name="X34d81458ca858ec581962c07e58f97cb46499cc"/>
     <w:p>
       <w:pPr>
         <w:pStyle w:val="Heading4"/>
@@ -2770,7 +2860,7 @@
       <w:r>
         <w:t xml:space="preserve"> </w:t>
       </w:r>
-      <w:hyperlink r:id="rId41">
+      <w:hyperlink r:id="rId42">
         <w:r>
           <w:rPr>
             <w:rStyle w:val="Hyperlink"/>
@@ -2799,7 +2889,7 @@
       <w:r>
         <w:t xml:space="preserve"> </w:t>
       </w:r>
-      <w:hyperlink r:id="rId42">
+      <w:hyperlink r:id="rId43">
         <w:r>
           <w:rPr>
             <w:rStyle w:val="Hyperlink"/>
@@ -3015,8 +3105,8 @@
         <w:t xml:space="preserve">the harness reads the file and uses it directly.</w:t>
       </w:r>
     </w:p>
-    <w:bookmarkEnd w:id="43"/>
-    <w:bookmarkStart w:id="45" w:name="tools-are-a-schema-paired-with-a-handler"/>
+    <w:bookmarkEnd w:id="44"/>
+    <w:bookmarkStart w:id="46" w:name="tools-are-a-schema-paired-with-a-handler"/>
     <w:p>
       <w:pPr>
         <w:pStyle w:val="Heading4"/>
@@ -3041,7 +3131,7 @@
       <w:r>
         <w:t xml:space="preserve"> </w:t>
       </w:r>
-      <w:hyperlink r:id="rId44">
+      <w:hyperlink r:id="rId45">
         <w:r>
           <w:rPr>
             <w:rStyle w:val="Hyperlink"/>
@@ -3092,8 +3182,8 @@
         <w:t xml:space="preserve">the handler is real software the model never inspects or writes.</w:t>
       </w:r>
     </w:p>
-    <w:bookmarkEnd w:id="45"/>
-    <w:bookmarkStart w:id="46" w:name="orchestration-needs-real-code"/>
+    <w:bookmarkEnd w:id="46"/>
+    <w:bookmarkStart w:id="47" w:name="orchestration-needs-real-code"/>
     <w:p>
       <w:pPr>
         <w:pStyle w:val="Heading4"/>
@@ -3152,8 +3242,8 @@
         <w:t xml:space="preserve">not parsed as prompt text the way an agent definition is.</w:t>
       </w:r>
     </w:p>
-    <w:bookmarkEnd w:id="46"/>
-    <w:bookmarkStart w:id="47" w:name="memory-is-just-prose"/>
+    <w:bookmarkEnd w:id="47"/>
+    <w:bookmarkStart w:id="48" w:name="memory-is-just-prose"/>
     <w:p>
       <w:pPr>
         <w:pStyle w:val="Heading4"/>
@@ -3187,7 +3277,7 @@
       <w:r>
         <w:t xml:space="preserve">/</w:t>
       </w:r>
-      <w:hyperlink r:id="rId30">
+      <w:hyperlink r:id="rId31">
         <w:r>
           <w:rPr>
             <w:rStyle w:val="VerbatimChar"/>
@@ -3223,9 +3313,9 @@
         <w:t xml:space="preserve">the same way it follows any other instruction in its context.</w:t>
       </w:r>
     </w:p>
-    <w:bookmarkEnd w:id="47"/>
     <w:bookmarkEnd w:id="48"/>
-    <w:bookmarkStart w:id="58" w:name="sec-ai-agent-program-kind"/>
+    <w:bookmarkEnd w:id="49"/>
+    <w:bookmarkStart w:id="59" w:name="sec-ai-agent-program-kind"/>
     <w:p>
       <w:pPr>
         <w:pStyle w:val="Heading1"/>
@@ -3250,7 +3340,7 @@
       <w:r>
         <w:t xml:space="preserve"> </w:t>
       </w:r>
-      <w:hyperlink r:id="rId49">
+      <w:hyperlink r:id="rId50">
         <w:r>
           <w:rPr>
             <w:rStyle w:val="Hyperlink"/>
@@ -3279,7 +3369,7 @@
         <w:t xml:space="preserve">compiler or a web server.</w:t>
       </w:r>
     </w:p>
-    <w:bookmarkStart w:id="51" w:name="it-is-io-bound-not-compute-bound"/>
+    <w:bookmarkStart w:id="52" w:name="it-is-io-bound-not-compute-bound"/>
     <w:p>
       <w:pPr>
         <w:pStyle w:val="Heading4"/>
@@ -3340,7 +3430,7 @@
       <w:r>
         <w:t xml:space="preserve"> </w:t>
       </w:r>
-      <w:hyperlink r:id="rId50">
+      <w:hyperlink r:id="rId51">
         <w:r>
           <w:rPr>
             <w:rStyle w:val="Hyperlink"/>
@@ -3670,8 +3760,8 @@
         <w:t xml:space="preserve">not a replacement for it.</w:t>
       </w:r>
     </w:p>
-    <w:bookmarkEnd w:id="51"/>
-    <w:bookmarkStart w:id="55" w:name="real-open-source-examples"/>
+    <w:bookmarkEnd w:id="52"/>
+    <w:bookmarkStart w:id="56" w:name="real-open-source-examples"/>
     <w:p>
       <w:pPr>
         <w:pStyle w:val="Heading4"/>
@@ -3702,7 +3792,7 @@
           <w:numId w:val="1010"/>
         </w:numPr>
       </w:pPr>
-      <w:hyperlink r:id="rId52">
+      <w:hyperlink r:id="rId53">
         <w:r>
           <w:rPr>
             <w:rStyle w:val="Hyperlink"/>
@@ -3733,7 +3823,7 @@
           <w:numId w:val="1010"/>
         </w:numPr>
       </w:pPr>
-      <w:hyperlink r:id="rId53">
+      <w:hyperlink r:id="rId54">
         <w:r>
           <w:rPr>
             <w:rStyle w:val="Hyperlink"/>
@@ -3770,7 +3860,7 @@
           <w:numId w:val="1010"/>
         </w:numPr>
       </w:pPr>
-      <w:hyperlink r:id="rId54">
+      <w:hyperlink r:id="rId55">
         <w:r>
           <w:rPr>
             <w:rStyle w:val="Hyperlink"/>
@@ -3885,8 +3975,8 @@
         <w:t xml:space="preserve">).</w:t>
       </w:r>
     </w:p>
-    <w:bookmarkEnd w:id="55"/>
-    <w:bookmarkStart w:id="57" w:name="where-it-runs"/>
+    <w:bookmarkEnd w:id="56"/>
+    <w:bookmarkStart w:id="58" w:name="where-it-runs"/>
     <w:p>
       <w:pPr>
         <w:pStyle w:val="Heading4"/>
@@ -3993,7 +4083,7 @@
       <w:r>
         <w:t xml:space="preserve"> </w:t>
       </w:r>
-      <w:hyperlink r:id="rId56">
+      <w:hyperlink r:id="rId57">
         <w:r>
           <w:rPr>
             <w:rStyle w:val="Hyperlink"/>
@@ -4071,9 +4161,9 @@
         <w:t xml:space="preserve">tool calls, and ends the moment a stopping condition fires.</w:t>
       </w:r>
     </w:p>
-    <w:bookmarkEnd w:id="57"/>
     <w:bookmarkEnd w:id="58"/>
-    <w:bookmarkStart w:id="64" w:name="sec-ai-harness-agent-relationship"/>
+    <w:bookmarkEnd w:id="59"/>
+    <w:bookmarkStart w:id="65" w:name="sec-ai-harness-agent-relationship"/>
     <w:p>
       <w:pPr>
         <w:pStyle w:val="Heading1"/>
@@ -4092,7 +4182,7 @@
       <w:r>
         <w:t xml:space="preserve"> </w:t>
       </w:r>
-      <w:hyperlink r:id="rId59">
+      <w:hyperlink r:id="rId60">
         <w:r>
           <w:rPr>
             <w:rStyle w:val="Hyperlink"/>
@@ -4109,7 +4199,7 @@
         <w:t xml:space="preserve">running a program than to two peers calling each other.</w:t>
       </w:r>
     </w:p>
-    <w:bookmarkStart w:id="60" w:name="Xf124c0ed5ce5da7d4b2c70e70abc0080ffb56c4"/>
+    <w:bookmarkStart w:id="61" w:name="Xf124c0ed5ce5da7d4b2c70e70abc0080ffb56c4"/>
     <w:p>
       <w:pPr>
         <w:pStyle w:val="Heading4"/>
@@ -4252,7 +4342,7 @@
       <w:r>
         <w:t xml:space="preserve"> </w:t>
       </w:r>
-      <w:hyperlink r:id="rId28">
+      <w:hyperlink r:id="rId29">
         <w:r>
           <w:rPr>
             <w:rStyle w:val="Hyperlink"/>
@@ -4423,8 +4513,8 @@
         <w:t xml:space="preserve">harness returns that agent’s output to the parent.</w:t>
       </w:r>
     </w:p>
-    <w:bookmarkEnd w:id="60"/>
-    <w:bookmarkStart w:id="61" w:name="sketching-the-harnesss-own-loop"/>
+    <w:bookmarkEnd w:id="61"/>
+    <w:bookmarkStart w:id="62" w:name="sketching-the-harnesss-own-loop"/>
     <w:p>
       <w:pPr>
         <w:pStyle w:val="Heading4"/>
@@ -5193,8 +5283,8 @@
         <w:t xml:space="preserve">described in the previous subsection.</w:t>
       </w:r>
     </w:p>
-    <w:bookmarkEnd w:id="61"/>
-    <w:bookmarkStart w:id="63" w:name="what-do-you-launch-when-you-type-claude"/>
+    <w:bookmarkEnd w:id="62"/>
+    <w:bookmarkStart w:id="64" w:name="what-do-you-launch-when-you-type-claude"/>
     <w:p>
       <w:pPr>
         <w:pStyle w:val="Heading4"/>
@@ -5445,7 +5535,7 @@
       <w:r>
         <w:t xml:space="preserve"> </w:t>
       </w:r>
-      <w:hyperlink r:id="rId62">
+      <w:hyperlink r:id="rId63">
         <w:r>
           <w:rPr>
             <w:rStyle w:val="Hyperlink"/>
@@ -5636,9 +5726,9 @@
         <w:t xml:space="preserve">At startup, those two come into existence together.</w:t>
       </w:r>
     </w:p>
-    <w:bookmarkEnd w:id="63"/>
     <w:bookmarkEnd w:id="64"/>
-    <w:bookmarkStart w:id="72" w:name="X9f4c11ae04cc9485e43baf6a6309f5c2ca7049b"/>
+    <w:bookmarkEnd w:id="65"/>
+    <w:bookmarkStart w:id="73" w:name="X9f4c11ae04cc9485e43baf6a6309f5c2ca7049b"/>
     <w:p>
       <w:pPr>
         <w:pStyle w:val="Heading1"/>
@@ -5657,7 +5747,7 @@
       <w:r>
         <w:t xml:space="preserve"> </w:t>
       </w:r>
-      <w:hyperlink r:id="rId65">
+      <w:hyperlink r:id="rId66">
         <w:r>
           <w:rPr>
             <w:rStyle w:val="Hyperlink"/>
@@ -5680,7 +5770,7 @@
       <w:r>
         <w:t xml:space="preserve"> </w:t>
       </w:r>
-      <w:hyperlink r:id="rId66">
+      <w:hyperlink r:id="rId67">
         <w:r>
           <w:rPr>
             <w:rStyle w:val="Hyperlink"/>
@@ -5704,7 +5794,7 @@
         <w:t xml:space="preserve">and our responsibility in using them.</w:t>
       </w:r>
     </w:p>
-    <w:bookmarkStart w:id="67" w:name="what-is-the-technological-singularity"/>
+    <w:bookmarkStart w:id="68" w:name="what-is-the-technological-singularity"/>
     <w:p>
       <w:pPr>
         <w:pStyle w:val="Heading4"/>
@@ -5757,8 +5847,8 @@
         <w:t xml:space="preserve">leading to an intelligence explosion beyond human comprehension or control.</w:t>
       </w:r>
     </w:p>
-    <w:bookmarkEnd w:id="67"/>
-    <w:bookmarkStart w:id="68" w:name="X6232a8e050102ddacd6ff22d335da20b6c2adec"/>
+    <w:bookmarkEnd w:id="68"/>
+    <w:bookmarkStart w:id="69" w:name="X6232a8e050102ddacd6ff22d335da20b6c2adec"/>
     <w:p>
       <w:pPr>
         <w:pStyle w:val="Heading4"/>
@@ -6009,8 +6099,8 @@
         <w:t xml:space="preserve">or operate without human authorization.</w:t>
       </w:r>
     </w:p>
-    <w:bookmarkEnd w:id="68"/>
-    <w:bookmarkStart w:id="69" w:name="why-this-matters-for-responsible-ai-use"/>
+    <w:bookmarkEnd w:id="69"/>
+    <w:bookmarkStart w:id="70" w:name="why-this-matters-for-responsible-ai-use"/>
     <w:p>
       <w:pPr>
         <w:pStyle w:val="Heading4"/>
@@ -6191,8 +6281,8 @@
         <w:t xml:space="preserve">while remaining under human control and oversight.</w:t>
       </w:r>
     </w:p>
-    <w:bookmarkEnd w:id="69"/>
-    <w:bookmarkStart w:id="71" w:name="further-reading"/>
+    <w:bookmarkEnd w:id="70"/>
+    <w:bookmarkStart w:id="72" w:name="further-reading"/>
     <w:p>
       <w:pPr>
         <w:pStyle w:val="Heading4"/>
@@ -6217,7 +6307,7 @@
       <w:r>
         <w:t xml:space="preserve"> </w:t>
       </w:r>
-      <w:hyperlink r:id="rId70">
+      <w:hyperlink r:id="rId71">
         <w:r>
           <w:rPr>
             <w:rStyle w:val="Hyperlink"/>
@@ -6226,9 +6316,9 @@
         </w:r>
       </w:hyperlink>
     </w:p>
-    <w:bookmarkEnd w:id="71"/>
     <w:bookmarkEnd w:id="72"/>
-    <w:bookmarkStart w:id="89" w:name="relative-advantages-of-ai-and-humans"/>
+    <w:bookmarkEnd w:id="73"/>
+    <w:bookmarkStart w:id="90" w:name="relative-advantages-of-ai-and-humans"/>
     <w:p>
       <w:pPr>
         <w:pStyle w:val="Heading1"/>
@@ -6257,7 +6347,7 @@
         <w:t xml:space="preserve">and when to handle tasks yourself.</w:t>
       </w:r>
     </w:p>
-    <w:bookmarkStart w:id="87" w:name="Xd4b14538cacfc1a6b4e96642aaf3a62c42920b7"/>
+    <w:bookmarkStart w:id="88" w:name="Xd4b14538cacfc1a6b4e96642aaf3a62c42920b7"/>
     <w:p>
       <w:pPr>
         <w:pStyle w:val="Heading4"/>
@@ -6304,7 +6394,7 @@
       <w:tr>
         <w:tc>
           <w:tcPr/>
-          <w:bookmarkStart w:id="73" w:name="tbl-ai-human-comparison"/>
+          <w:bookmarkStart w:id="74" w:name="tbl-ai-human-comparison"/>
           <w:p>
             <w:pPr>
               <w:jc w:val="center"/>
@@ -6456,7 +6546,7 @@
               </w:tc>
             </w:tr>
           </w:tbl>
-          <w:bookmarkEnd w:id="73"/>
+          <w:bookmarkEnd w:id="74"/>
           <w:p/>
         </w:tc>
       </w:tr>
@@ -6489,7 +6579,7 @@
       <w:tr>
         <w:tc>
           <w:tcPr/>
-          <w:bookmarkStart w:id="86" w:name="tbl-matrix-meme-table"/>
+          <w:bookmarkStart w:id="87" w:name="tbl-matrix-meme-table"/>
           <w:p>
             <w:pPr>
               <w:jc w:val="center"/>
@@ -6581,18 +6671,18 @@
                       <wp:inline>
                         <wp:extent cx="4286250" cy="2946796"/>
                         <wp:effectExtent b="0" l="0" r="0" t="0"/>
-                        <wp:docPr descr="Happy Neo" title="" id="75" name="Picture"/>
+                        <wp:docPr descr="Happy Neo" title="" id="76" name="Picture"/>
                         <a:graphic>
                           <a:graphicData uri="http://schemas.openxmlformats.org/drawingml/2006/picture">
                             <pic:pic>
                               <pic:nvPicPr>
-                                <pic:cNvPr descr="assets/images/The-Matrix-Neo-Flying.png" id="76" name="Picture"/>
+                                <pic:cNvPr descr="assets/images/The-Matrix-Neo-Flying.png" id="77" name="Picture"/>
                                 <pic:cNvPicPr>
                                   <a:picLocks noChangeArrowheads="1" noChangeAspect="1"/>
                                 </pic:cNvPicPr>
                               </pic:nvPicPr>
                               <pic:blipFill>
-                                <a:blip r:embed="rId74"/>
+                                <a:blip r:embed="rId75"/>
                                 <a:stretch>
                                   <a:fillRect/>
                                 </a:stretch>
@@ -6632,18 +6722,18 @@
                       <wp:inline>
                         <wp:extent cx="4286250" cy="1785937"/>
                         <wp:effectExtent b="0" l="0" r="0" t="0"/>
-                        <wp:docPr descr="Angry Agent Smith" title="" id="78" name="Picture"/>
+                        <wp:docPr descr="Angry Agent Smith" title="" id="79" name="Picture"/>
                         <a:graphic>
                           <a:graphicData uri="http://schemas.openxmlformats.org/drawingml/2006/picture">
                             <pic:pic>
                               <pic:nvPicPr>
-                                <pic:cNvPr descr="assets/images/agent-smith-no-its-not-fair.jpg" id="79" name="Picture"/>
+                                <pic:cNvPr descr="assets/images/agent-smith-no-its-not-fair.jpg" id="80" name="Picture"/>
                                 <pic:cNvPicPr>
                                   <a:picLocks noChangeArrowheads="1" noChangeAspect="1"/>
                                 </pic:cNvPicPr>
                               </pic:nvPicPr>
                               <pic:blipFill>
-                                <a:blip r:embed="rId77"/>
+                                <a:blip r:embed="rId78"/>
                                 <a:stretch>
                                   <a:fillRect/>
                                 </a:stretch>
@@ -6701,18 +6791,18 @@
                       <wp:inline>
                         <wp:extent cx="4286250" cy="2703909"/>
                         <wp:effectExtent b="0" l="0" r="0" t="0"/>
-                        <wp:docPr descr="Sad Keanu" title="" id="81" name="Picture"/>
+                        <wp:docPr descr="Sad Keanu" title="" id="82" name="Picture"/>
                         <a:graphic>
                           <a:graphicData uri="http://schemas.openxmlformats.org/drawingml/2006/picture">
                             <pic:pic>
                               <pic:nvPicPr>
-                                <pic:cNvPr descr="assets/images/sad-keanu.png" id="82" name="Picture"/>
+                                <pic:cNvPr descr="assets/images/sad-keanu.png" id="83" name="Picture"/>
                                 <pic:cNvPicPr>
                                   <a:picLocks noChangeArrowheads="1" noChangeAspect="1"/>
                                 </pic:cNvPicPr>
                               </pic:nvPicPr>
                               <pic:blipFill>
-                                <a:blip r:embed="rId80"/>
+                                <a:blip r:embed="rId81"/>
                                 <a:stretch>
                                   <a:fillRect/>
                                 </a:stretch>
@@ -6752,18 +6842,18 @@
                       <wp:inline>
                         <wp:extent cx="4286250" cy="2143125"/>
                         <wp:effectExtent b="0" l="0" r="0" t="0"/>
-                        <wp:docPr descr="Happy Agent Smith" title="" id="84" name="Picture"/>
+                        <wp:docPr descr="Happy Agent Smith" title="" id="85" name="Picture"/>
                         <a:graphic>
                           <a:graphicData uri="http://schemas.openxmlformats.org/drawingml/2006/picture">
                             <pic:pic>
                               <pic:nvPicPr>
-                                <pic:cNvPr descr="assets/images/grinning-smith.png" id="85" name="Picture"/>
+                                <pic:cNvPr descr="assets/images/grinning-smith.png" id="86" name="Picture"/>
                                 <pic:cNvPicPr>
                                   <a:picLocks noChangeArrowheads="1" noChangeAspect="1"/>
                                 </pic:cNvPicPr>
                               </pic:nvPicPr>
                               <pic:blipFill>
-                                <a:blip r:embed="rId83"/>
+                                <a:blip r:embed="rId84"/>
                                 <a:stretch>
                                   <a:fillRect/>
                                 </a:stretch>
@@ -6793,7 +6883,7 @@
               </w:tc>
             </w:tr>
           </w:tbl>
-          <w:bookmarkEnd w:id="86"/>
+          <w:bookmarkEnd w:id="87"/>
           <w:p/>
         </w:tc>
       </w:tr>
@@ -6923,8 +7013,8 @@
         <w:t xml:space="preserve">Understand when agent suggestions are incorrect or suboptimal</w:t>
       </w:r>
     </w:p>
-    <w:bookmarkEnd w:id="87"/>
-    <w:bookmarkStart w:id="88" w:name="future-developments-world-models"/>
+    <w:bookmarkEnd w:id="88"/>
+    <w:bookmarkStart w:id="89" w:name="future-developments-world-models"/>
     <w:p>
       <w:pPr>
         <w:pStyle w:val="Heading4"/>
@@ -7122,9 +7212,9 @@
         <w:t xml:space="preserve">so you can effectively work with increasingly capable AI systems.</w:t>
       </w:r>
     </w:p>
-    <w:bookmarkEnd w:id="88"/>
     <w:bookmarkEnd w:id="89"/>
-    <w:bookmarkStart w:id="100" w:name="how-to-work-with-coding-agents"/>
+    <w:bookmarkEnd w:id="90"/>
+    <w:bookmarkStart w:id="101" w:name="how-to-work-with-coding-agents"/>
     <w:p>
       <w:pPr>
         <w:pStyle w:val="Heading1"/>
@@ -7159,7 +7249,7 @@
         <w:t xml:space="preserve">and collaboration style.</w:t>
       </w:r>
     </w:p>
-    <w:bookmarkStart w:id="90" w:name="ways-to-interact-with-coding-agents"/>
+    <w:bookmarkStart w:id="91" w:name="ways-to-interact-with-coding-agents"/>
     <w:p>
       <w:pPr>
         <w:pStyle w:val="Heading4"/>
@@ -7460,8 +7550,8 @@
         <w:t xml:space="preserve">for assigning and managing coding tasks.</w:t>
       </w:r>
     </w:p>
-    <w:bookmarkEnd w:id="90"/>
-    <w:bookmarkStart w:id="91" w:name="assigning-issues-to-copilot"/>
+    <w:bookmarkEnd w:id="91"/>
+    <w:bookmarkStart w:id="92" w:name="assigning-issues-to-copilot"/>
     <w:p>
       <w:pPr>
         <w:pStyle w:val="Heading4"/>
@@ -7577,8 +7667,8 @@
         <w:t xml:space="preserve">Delegate tasks to Copilot directly from the chat interface in supported editors</w:t>
       </w:r>
     </w:p>
-    <w:bookmarkEnd w:id="91"/>
-    <w:bookmarkStart w:id="92" w:name="the-agent-workflow"/>
+    <w:bookmarkEnd w:id="92"/>
+    <w:bookmarkStart w:id="93" w:name="the-agent-workflow"/>
     <w:p>
       <w:pPr>
         <w:pStyle w:val="Heading4"/>
@@ -7775,8 +7865,8 @@
         <w:t xml:space="preserve">the agent will iterate based on your feedback</w:t>
       </w:r>
     </w:p>
-    <w:bookmarkEnd w:id="92"/>
-    <w:bookmarkStart w:id="93" w:name="collaborating-with-coding-agents"/>
+    <w:bookmarkEnd w:id="93"/>
+    <w:bookmarkStart w:id="94" w:name="collaborating-with-coding-agents"/>
     <w:p>
       <w:pPr>
         <w:pStyle w:val="Heading4"/>
@@ -7949,8 +8039,8 @@
         <w:t xml:space="preserve">Then assign new work to the agent for the next iteration.</w:t>
       </w:r>
     </w:p>
-    <w:bookmarkEnd w:id="93"/>
-    <w:bookmarkStart w:id="94" w:name="directly-prompting-for-pull-requests"/>
+    <w:bookmarkEnd w:id="94"/>
+    <w:bookmarkStart w:id="95" w:name="directly-prompting-for-pull-requests"/>
     <w:p>
       <w:pPr>
         <w:pStyle w:val="Heading4"/>
@@ -8003,8 +8093,8 @@
         <w:t xml:space="preserve">This is useful for quick fixes or well-defined tasks</w:t>
       </w:r>
     </w:p>
-    <w:bookmarkEnd w:id="94"/>
-    <w:bookmarkStart w:id="95" w:name="important-safeguards"/>
+    <w:bookmarkEnd w:id="95"/>
+    <w:bookmarkStart w:id="96" w:name="important-safeguards"/>
     <w:p>
       <w:pPr>
         <w:pStyle w:val="Heading4"/>
@@ -8100,8 +8190,8 @@
         <w:t xml:space="preserve">All agent actions are logged and visible in the PR</w:t>
       </w:r>
     </w:p>
-    <w:bookmarkEnd w:id="95"/>
-    <w:bookmarkStart w:id="99" w:name="workflow-approval-requirements"/>
+    <w:bookmarkEnd w:id="96"/>
+    <w:bookmarkStart w:id="100" w:name="workflow-approval-requirements"/>
     <w:p>
       <w:pPr>
         <w:pStyle w:val="Heading4"/>
@@ -8358,7 +8448,7 @@
           <w:numId w:val="1024"/>
         </w:numPr>
       </w:pPr>
-      <w:hyperlink r:id="rId96">
+      <w:hyperlink r:id="rId97">
         <w:r>
           <w:rPr>
             <w:rStyle w:val="Hyperlink"/>
@@ -8384,7 +8474,7 @@
           <w:numId w:val="1024"/>
         </w:numPr>
       </w:pPr>
-      <w:hyperlink r:id="rId97">
+      <w:hyperlink r:id="rId98">
         <w:r>
           <w:rPr>
             <w:rStyle w:val="Hyperlink"/>
@@ -8418,7 +8508,7 @@
       <w:r>
         <w:t xml:space="preserve"> </w:t>
       </w:r>
-      <w:hyperlink r:id="rId98">
+      <w:hyperlink r:id="rId99">
         <w:r>
           <w:rPr>
             <w:rStyle w:val="Hyperlink"/>
@@ -8430,9 +8520,9 @@
         <w:t xml:space="preserve">.</w:t>
       </w:r>
     </w:p>
-    <w:bookmarkEnd w:id="99"/>
     <w:bookmarkEnd w:id="100"/>
-    <w:bookmarkStart w:id="103" w:name="useful-prompt-formats"/>
+    <w:bookmarkEnd w:id="101"/>
+    <w:bookmarkStart w:id="104" w:name="useful-prompt-formats"/>
     <w:p>
       <w:pPr>
         <w:pStyle w:val="Heading1"/>
@@ -8461,7 +8551,7 @@
         <w:t xml:space="preserve">Here are some useful prompt formats that you can use when requesting assistance from coding agents:</w:t>
       </w:r>
     </w:p>
-    <w:bookmarkStart w:id="101" w:name="common-task-patterns"/>
+    <w:bookmarkStart w:id="102" w:name="common-task-patterns"/>
     <w:p>
       <w:pPr>
         <w:pStyle w:val="Heading4"/>
@@ -8848,8 +8938,8 @@
         <w:t xml:space="preserve">“clarify the explanation of the analysis workflow”</w:t>
       </w:r>
     </w:p>
-    <w:bookmarkEnd w:id="101"/>
-    <w:bookmarkStart w:id="102" w:name="tips-for-effective-prompts"/>
+    <w:bookmarkEnd w:id="102"/>
+    <w:bookmarkStart w:id="103" w:name="tips-for-effective-prompts"/>
     <w:p>
       <w:pPr>
         <w:pStyle w:val="Heading4"/>
@@ -8934,9 +9024,9 @@
         <w:t xml:space="preserve">: Ask the agent to test or verify its changes when appropriate</w:t>
       </w:r>
     </w:p>
-    <w:bookmarkEnd w:id="102"/>
     <w:bookmarkEnd w:id="103"/>
-    <w:bookmarkStart w:id="113" w:name="sec-ai-addressing-failing-workflows"/>
+    <w:bookmarkEnd w:id="104"/>
+    <w:bookmarkStart w:id="114" w:name="sec-ai-addressing-failing-workflows"/>
     <w:p>
       <w:pPr>
         <w:pStyle w:val="Heading1"/>
@@ -8983,7 +9073,7 @@
         <w:t xml:space="preserve">or in the workflow configuration itself.</w:t>
       </w:r>
     </w:p>
-    <w:bookmarkStart w:id="104" w:name="X16724e8c4d0535f38e98d560729d113d43f9447"/>
+    <w:bookmarkStart w:id="105" w:name="X16724e8c4d0535f38e98d560729d113d43f9447"/>
     <w:p>
       <w:pPr>
         <w:pStyle w:val="Heading4"/>
@@ -9178,8 +9268,8 @@
         <w:t xml:space="preserve">your carefully-configured CI/CD pipeline.</w:t>
       </w:r>
     </w:p>
-    <w:bookmarkEnd w:id="104"/>
-    <w:bookmarkStart w:id="108" w:name="X609a80533191ba40baf6d2372d9b8d862b0620d"/>
+    <w:bookmarkEnd w:id="105"/>
+    <w:bookmarkStart w:id="109" w:name="X609a80533191ba40baf6d2372d9b8d862b0620d"/>
     <w:p>
       <w:pPr>
         <w:pStyle w:val="Heading4"/>
@@ -9337,18 +9427,18 @@
                 <wp:inline>
                   <wp:extent cx="152400" cy="152400"/>
                   <wp:effectExtent b="0" l="0" r="0" t="0"/>
-                  <wp:docPr descr="" title="" id="106" name="Picture"/>
+                  <wp:docPr descr="" title="" id="107" name="Picture"/>
                   <a:graphic>
                     <a:graphicData uri="http://schemas.openxmlformats.org/drawingml/2006/picture">
                       <pic:pic>
                         <pic:nvPicPr>
-                          <pic:cNvPr descr="/opt/quarto/share/formats/docx/warning.png" id="107" name="Picture"/>
+                          <pic:cNvPr descr="/opt/quarto/share/formats/docx/warning.png" id="108" name="Picture"/>
                           <pic:cNvPicPr>
                             <a:picLocks noChangeArrowheads="1" noChangeAspect="1"/>
                           </pic:cNvPicPr>
                         </pic:nvPicPr>
                         <pic:blipFill>
-                          <a:blip r:embed="rId105"/>
+                          <a:blip r:embed="rId106"/>
                           <a:stretch>
                             <a:fillRect/>
                           </a:stretch>
@@ -9599,8 +9689,8 @@
         <w:t xml:space="preserve">for more guidance.</w:t>
       </w:r>
     </w:p>
-    <w:bookmarkEnd w:id="108"/>
-    <w:bookmarkStart w:id="109" w:name="X73d86ac2fd20fdb79b2a5c7f2662f883788810e"/>
+    <w:bookmarkEnd w:id="109"/>
+    <w:bookmarkStart w:id="110" w:name="X73d86ac2fd20fdb79b2a5c7f2662f883788810e"/>
     <w:p>
       <w:pPr>
         <w:pStyle w:val="Heading4"/>
@@ -9836,8 +9926,8 @@
         <w:t xml:space="preserve">3. Prompt: "fix the linting errors in src/analysis.R"</w:t>
       </w:r>
     </w:p>
-    <w:bookmarkEnd w:id="109"/>
-    <w:bookmarkStart w:id="112" w:name="additional-resources"/>
+    <w:bookmarkEnd w:id="110"/>
+    <w:bookmarkStart w:id="113" w:name="additional-resources"/>
     <w:p>
       <w:pPr>
         <w:pStyle w:val="Heading4"/>
@@ -9860,7 +9950,7 @@
       <w:r>
         <w:t xml:space="preserve"> </w:t>
       </w:r>
-      <w:hyperlink r:id="rId110">
+      <w:hyperlink r:id="rId111">
         <w:r>
           <w:rPr>
             <w:rStyle w:val="Hyperlink"/>
@@ -9964,7 +10054,7 @@
       <w:r>
         <w:t xml:space="preserve"> </w:t>
       </w:r>
-      <w:hyperlink r:id="rId111">
+      <w:hyperlink r:id="rId112">
         <w:r>
           <w:rPr>
             <w:rStyle w:val="Hyperlink"/>
@@ -9979,9 +10069,9 @@
         <w:t xml:space="preserve">for workflow syntax and troubleshooting</w:t>
       </w:r>
     </w:p>
-    <w:bookmarkEnd w:id="112"/>
     <w:bookmarkEnd w:id="113"/>
-    <w:bookmarkStart w:id="119" w:name="sec-ai-benefits-hazards"/>
+    <w:bookmarkEnd w:id="114"/>
+    <w:bookmarkStart w:id="120" w:name="sec-ai-benefits-hazards"/>
     <w:p>
       <w:pPr>
         <w:pStyle w:val="Heading1"/>
@@ -10365,7 +10455,7 @@
         <w:t xml:space="preserve">) or setup configurations can inadvertently or maliciously compromise repository security, expose secrets, or execute harmful commands</w:t>
       </w:r>
     </w:p>
-    <w:bookmarkStart w:id="118" w:name="further-readingviewing"/>
+    <w:bookmarkStart w:id="119" w:name="further-readingviewing"/>
     <w:p>
       <w:pPr>
         <w:pStyle w:val="Heading4"/>
@@ -10618,18 +10708,18 @@
           <wp:inline>
             <wp:extent cx="5334000" cy="2224278"/>
             <wp:effectExtent b="0" l="0" r="0" t="0"/>
-            <wp:docPr descr="Agents" title="" id="115" name="Picture"/>
+            <wp:docPr descr="Agents" title="" id="116" name="Picture"/>
             <a:graphic>
               <a:graphicData uri="http://schemas.openxmlformats.org/drawingml/2006/picture">
                 <pic:pic>
                   <pic:nvPicPr>
-                    <pic:cNvPr descr="assets/images/matrix-agents.png" id="116" name="Picture"/>
+                    <pic:cNvPr descr="assets/images/matrix-agents.png" id="117" name="Picture"/>
                     <pic:cNvPicPr>
                       <a:picLocks noChangeArrowheads="1" noChangeAspect="1"/>
                     </pic:cNvPicPr>
                   </pic:nvPicPr>
                   <pic:blipFill>
-                    <a:blip r:embed="rId114"/>
+                    <a:blip r:embed="rId115"/>
                     <a:stretch>
                       <a:fillRect/>
                     </a:stretch>
@@ -10660,7 +10750,7 @@
       <w:pPr>
         <w:pStyle w:val="ImageCaption"/>
       </w:pPr>
-      <w:hyperlink r:id="rId117">
+      <w:hyperlink r:id="rId118">
         <w:r>
           <w:rPr>
             <w:rStyle w:val="Hyperlink"/>
@@ -10669,9 +10759,9 @@
         </w:r>
       </w:hyperlink>
     </w:p>
-    <w:bookmarkEnd w:id="118"/>
     <w:bookmarkEnd w:id="119"/>
-    <w:bookmarkStart w:id="126" w:name="sec-ai-best-practices"/>
+    <w:bookmarkEnd w:id="120"/>
+    <w:bookmarkStart w:id="127" w:name="sec-ai-best-practices"/>
     <w:p>
       <w:pPr>
         <w:pStyle w:val="Heading1"/>
@@ -11005,18 +11095,18 @@
                 <wp:inline>
                   <wp:extent cx="152400" cy="152400"/>
                   <wp:effectExtent b="0" l="0" r="0" t="0"/>
-                  <wp:docPr descr="" title="" id="121" name="Picture"/>
+                  <wp:docPr descr="" title="" id="122" name="Picture"/>
                   <a:graphic>
                     <a:graphicData uri="http://schemas.openxmlformats.org/drawingml/2006/picture">
                       <pic:pic>
                         <pic:nvPicPr>
-                          <pic:cNvPr descr="/opt/quarto/share/formats/docx/note.png" id="122" name="Picture"/>
+                          <pic:cNvPr descr="/opt/quarto/share/formats/docx/note.png" id="123" name="Picture"/>
                           <pic:cNvPicPr>
                             <a:picLocks noChangeArrowheads="1" noChangeAspect="1"/>
                           </pic:cNvPicPr>
                         </pic:nvPicPr>
                         <pic:blipFill>
-                          <a:blip r:embed="rId120"/>
+                          <a:blip r:embed="rId121"/>
                           <a:stretch>
                             <a:fillRect/>
                           </a:stretch>
@@ -11078,7 +11168,7 @@
             <w:r>
               <w:t xml:space="preserve"> </w:t>
             </w:r>
-            <w:hyperlink r:id="rId123">
+            <w:hyperlink r:id="rId124">
               <w:r>
                 <w:rPr>
                   <w:rStyle w:val="Hyperlink"/>
@@ -11185,18 +11275,18 @@
                 <wp:inline>
                   <wp:extent cx="152400" cy="152400"/>
                   <wp:effectExtent b="0" l="0" r="0" t="0"/>
-                  <wp:docPr descr="" title="" id="124" name="Picture"/>
+                  <wp:docPr descr="" title="" id="125" name="Picture"/>
                   <a:graphic>
                     <a:graphicData uri="http://schemas.openxmlformats.org/drawingml/2006/picture">
                       <pic:pic>
                         <pic:nvPicPr>
-                          <pic:cNvPr descr="/opt/quarto/share/formats/docx/warning.png" id="125" name="Picture"/>
+                          <pic:cNvPr descr="/opt/quarto/share/formats/docx/warning.png" id="126" name="Picture"/>
                           <pic:cNvPicPr>
                             <a:picLocks noChangeArrowheads="1" noChangeAspect="1"/>
                           </pic:cNvPicPr>
                         </pic:nvPicPr>
                         <pic:blipFill>
-                          <a:blip r:embed="rId105"/>
+                          <a:blip r:embed="rId106"/>
                           <a:stretch>
                             <a:fillRect/>
                           </a:stretch>
@@ -11462,8 +11552,8 @@
         <w:t xml:space="preserve">The quality and correctness of your work remains your responsibility.</w:t>
       </w:r>
     </w:p>
-    <w:bookmarkEnd w:id="126"/>
-    <w:bookmarkStart w:id="137" w:name="firewall-and-network-configuration"/>
+    <w:bookmarkEnd w:id="127"/>
+    <w:bookmarkStart w:id="138" w:name="firewall-and-network-configuration"/>
     <w:p>
       <w:pPr>
         <w:pStyle w:val="Heading1"/>
@@ -11492,7 +11582,7 @@
         <w:t xml:space="preserve">you may need to configure allowlists to enable coding agent functionality.</w:t>
       </w:r>
     </w:p>
-    <w:bookmarkStart w:id="128" w:name="built-in-agent-firewall"/>
+    <w:bookmarkStart w:id="129" w:name="built-in-agent-firewall"/>
     <w:p>
       <w:pPr>
         <w:pStyle w:val="Heading4"/>
@@ -11629,7 +11719,7 @@
       <w:r>
         <w:t xml:space="preserve"> </w:t>
       </w:r>
-      <w:hyperlink r:id="rId127">
+      <w:hyperlink r:id="rId128">
         <w:r>
           <w:rPr>
             <w:rStyle w:val="Hyperlink"/>
@@ -11641,8 +11731,8 @@
         <w:t xml:space="preserve">.</w:t>
       </w:r>
     </w:p>
-    <w:bookmarkEnd w:id="128"/>
-    <w:bookmarkStart w:id="130" w:name="customizing-agent-firewall-settings"/>
+    <w:bookmarkEnd w:id="129"/>
+    <w:bookmarkStart w:id="131" w:name="customizing-agent-firewall-settings"/>
     <w:p>
       <w:pPr>
         <w:pStyle w:val="Heading4"/>
@@ -11749,7 +11839,7 @@
       <w:r>
         <w:t xml:space="preserve"> </w:t>
       </w:r>
-      <w:hyperlink r:id="rId129">
+      <w:hyperlink r:id="rId130">
         <w:r>
           <w:rPr>
             <w:rStyle w:val="Hyperlink"/>
@@ -11761,8 +11851,8 @@
         <w:t xml:space="preserve">.</w:t>
       </w:r>
     </w:p>
-    <w:bookmarkEnd w:id="130"/>
-    <w:bookmarkStart w:id="136" w:name="Xbbad9df60dbc05443efb3cae36c1e0daa9b491b"/>
+    <w:bookmarkEnd w:id="131"/>
+    <w:bookmarkStart w:id="137" w:name="Xbbad9df60dbc05443efb3cae36c1e0daa9b491b"/>
     <w:p>
       <w:pPr>
         <w:pStyle w:val="Heading4"/>
@@ -12687,18 +12777,18 @@
                 <wp:inline>
                   <wp:extent cx="152400" cy="152400"/>
                   <wp:effectExtent b="0" l="0" r="0" t="0"/>
-                  <wp:docPr descr="" title="" id="132" name="Picture"/>
+                  <wp:docPr descr="" title="" id="133" name="Picture"/>
                   <a:graphic>
                     <a:graphicData uri="http://schemas.openxmlformats.org/drawingml/2006/picture">
                       <pic:pic>
                         <pic:nvPicPr>
-                          <pic:cNvPr descr="/opt/quarto/share/formats/docx/tip.png" id="133" name="Picture"/>
+                          <pic:cNvPr descr="/opt/quarto/share/formats/docx/tip.png" id="134" name="Picture"/>
                           <pic:cNvPicPr>
                             <a:picLocks noChangeArrowheads="1" noChangeAspect="1"/>
                           </pic:cNvPicPr>
                         </pic:nvPicPr>
                         <pic:blipFill>
-                          <a:blip r:embed="rId131"/>
+                          <a:blip r:embed="rId132"/>
                           <a:stretch>
                             <a:fillRect/>
                           </a:stretch>
@@ -12864,18 +12954,18 @@
                 <wp:inline>
                   <wp:extent cx="152400" cy="152400"/>
                   <wp:effectExtent b="0" l="0" r="0" t="0"/>
-                  <wp:docPr descr="" title="" id="134" name="Picture"/>
+                  <wp:docPr descr="" title="" id="135" name="Picture"/>
                   <a:graphic>
                     <a:graphicData uri="http://schemas.openxmlformats.org/drawingml/2006/picture">
                       <pic:pic>
                         <pic:nvPicPr>
-                          <pic:cNvPr descr="/opt/quarto/share/formats/docx/note.png" id="135" name="Picture"/>
+                          <pic:cNvPr descr="/opt/quarto/share/formats/docx/note.png" id="136" name="Picture"/>
                           <pic:cNvPicPr>
                             <a:picLocks noChangeArrowheads="1" noChangeAspect="1"/>
                           </pic:cNvPicPr>
                         </pic:nvPicPr>
                         <pic:blipFill>
-                          <a:blip r:embed="rId120"/>
+                          <a:blip r:embed="rId121"/>
                           <a:stretch>
                             <a:fillRect/>
                           </a:stretch>
@@ -13010,9 +13100,9 @@
         </w:tc>
       </w:tr>
     </w:tbl>
-    <w:bookmarkEnd w:id="136"/>
     <w:bookmarkEnd w:id="137"/>
-    <w:bookmarkStart w:id="188" w:name="sec-ai-offline"/>
+    <w:bookmarkEnd w:id="138"/>
+    <w:bookmarkStart w:id="189" w:name="sec-ai-offline"/>
     <w:p>
       <w:pPr>
         <w:pStyle w:val="Heading1"/>
@@ -13106,18 +13196,18 @@
                 <wp:inline>
                   <wp:extent cx="152400" cy="152400"/>
                   <wp:effectExtent b="0" l="0" r="0" t="0"/>
-                  <wp:docPr descr="" title="" id="138" name="Picture"/>
+                  <wp:docPr descr="" title="" id="139" name="Picture"/>
                   <a:graphic>
                     <a:graphicData uri="http://schemas.openxmlformats.org/drawingml/2006/picture">
                       <pic:pic>
                         <pic:nvPicPr>
-                          <pic:cNvPr descr="/opt/quarto/share/formats/docx/note.png" id="139" name="Picture"/>
+                          <pic:cNvPr descr="/opt/quarto/share/formats/docx/note.png" id="140" name="Picture"/>
                           <pic:cNvPicPr>
                             <a:picLocks noChangeArrowheads="1" noChangeAspect="1"/>
                           </pic:cNvPicPr>
                         </pic:nvPicPr>
                         <pic:blipFill>
-                          <a:blip r:embed="rId120"/>
+                          <a:blip r:embed="rId121"/>
                           <a:stretch>
                             <a:fillRect/>
                           </a:stretch>
@@ -13223,7 +13313,7 @@
         </w:tc>
       </w:tr>
     </w:tbl>
-    <w:bookmarkStart w:id="149" w:name="running-a-local-model-with-ollama"/>
+    <w:bookmarkStart w:id="150" w:name="running-a-local-model-with-ollama"/>
     <w:p>
       <w:pPr>
         <w:pStyle w:val="Heading4"/>
@@ -13236,7 +13326,7 @@
       <w:pPr>
         <w:pStyle w:val="FirstParagraph"/>
       </w:pPr>
-      <w:hyperlink r:id="rId140">
+      <w:hyperlink r:id="rId141">
         <w:r>
           <w:rPr>
             <w:rStyle w:val="Hyperlink"/>
@@ -13316,18 +13406,18 @@
                 <wp:inline>
                   <wp:extent cx="152400" cy="152400"/>
                   <wp:effectExtent b="0" l="0" r="0" t="0"/>
-                  <wp:docPr descr="" title="" id="142" name="Picture"/>
+                  <wp:docPr descr="" title="" id="143" name="Picture"/>
                   <a:graphic>
                     <a:graphicData uri="http://schemas.openxmlformats.org/drawingml/2006/picture">
                       <pic:pic>
                         <pic:nvPicPr>
-                          <pic:cNvPr descr="/opt/quarto/share/formats/docx/caution.png" id="143" name="Picture"/>
+                          <pic:cNvPr descr="/opt/quarto/share/formats/docx/caution.png" id="144" name="Picture"/>
                           <pic:cNvPicPr>
                             <a:picLocks noChangeArrowheads="1" noChangeAspect="1"/>
                           </pic:cNvPicPr>
                         </pic:nvPicPr>
                         <pic:blipFill>
-                          <a:blip r:embed="rId141"/>
+                          <a:blip r:embed="rId142"/>
                           <a:stretch>
                             <a:fillRect/>
                           </a:stretch>
@@ -13524,7 +13614,7 @@
             <w:r>
               <w:t xml:space="preserve"> </w:t>
             </w:r>
-            <w:hyperlink r:id="rId144">
+            <w:hyperlink r:id="rId145">
               <w:r>
                 <w:rPr>
                   <w:rStyle w:val="Hyperlink"/>
@@ -13644,7 +13734,7 @@
       <w:r>
         <w:t xml:space="preserve"> </w:t>
       </w:r>
-      <w:hyperlink r:id="rId145">
+      <w:hyperlink r:id="rId146">
         <w:r>
           <w:rPr>
             <w:rStyle w:val="Hyperlink"/>
@@ -13764,7 +13854,7 @@
       <w:r>
         <w:t xml:space="preserve"> </w:t>
       </w:r>
-      <w:hyperlink r:id="rId146">
+      <w:hyperlink r:id="rId147">
         <w:r>
           <w:rPr>
             <w:rStyle w:val="Hyperlink"/>
@@ -13832,18 +13922,18 @@
                 <wp:inline>
                   <wp:extent cx="152400" cy="152400"/>
                   <wp:effectExtent b="0" l="0" r="0" t="0"/>
-                  <wp:docPr descr="" title="" id="147" name="Picture"/>
+                  <wp:docPr descr="" title="" id="148" name="Picture"/>
                   <a:graphic>
                     <a:graphicData uri="http://schemas.openxmlformats.org/drawingml/2006/picture">
                       <pic:pic>
                         <pic:nvPicPr>
-                          <pic:cNvPr descr="/opt/quarto/share/formats/docx/warning.png" id="148" name="Picture"/>
+                          <pic:cNvPr descr="/opt/quarto/share/formats/docx/warning.png" id="149" name="Picture"/>
                           <pic:cNvPicPr>
                             <a:picLocks noChangeArrowheads="1" noChangeAspect="1"/>
                           </pic:cNvPicPr>
                         </pic:nvPicPr>
                         <pic:blipFill>
-                          <a:blip r:embed="rId105"/>
+                          <a:blip r:embed="rId106"/>
                           <a:stretch>
                             <a:fillRect/>
                           </a:stretch>
@@ -15395,8 +15485,8 @@
         <w:t xml:space="preserve">.</w:t>
       </w:r>
     </w:p>
-    <w:bookmarkEnd w:id="149"/>
-    <w:bookmarkStart w:id="152" w:name="connecting-positron-assistant-to-ollama"/>
+    <w:bookmarkEnd w:id="150"/>
+    <w:bookmarkStart w:id="153" w:name="connecting-positron-assistant-to-ollama"/>
     <w:p>
       <w:pPr>
         <w:pStyle w:val="Heading4"/>
@@ -15409,7 +15499,7 @@
       <w:pPr>
         <w:pStyle w:val="FirstParagraph"/>
       </w:pPr>
-      <w:hyperlink r:id="rId150">
+      <w:hyperlink r:id="rId151">
         <w:r>
           <w:rPr>
             <w:rStyle w:val="Hyperlink"/>
@@ -15426,7 +15516,7 @@
       <w:r>
         <w:t xml:space="preserve"> </w:t>
       </w:r>
-      <w:hyperlink r:id="rId151">
+      <w:hyperlink r:id="rId152">
         <w:r>
           <w:rPr>
             <w:rStyle w:val="Hyperlink"/>
@@ -15635,8 +15725,8 @@
         <w:t xml:space="preserve">instead of a cloud provider.</w:t>
       </w:r>
     </w:p>
-    <w:bookmarkEnd w:id="152"/>
-    <w:bookmarkStart w:id="154" w:name="Xdb900790d603e9eb1dbc219acfc2383290fd98a"/>
+    <w:bookmarkEnd w:id="153"/>
+    <w:bookmarkStart w:id="155" w:name="Xdb900790d603e9eb1dbc219acfc2383290fd98a"/>
     <w:p>
       <w:pPr>
         <w:pStyle w:val="Heading4"/>
@@ -15649,7 +15739,7 @@
       <w:pPr>
         <w:pStyle w:val="FirstParagraph"/>
       </w:pPr>
-      <w:hyperlink r:id="rId153">
+      <w:hyperlink r:id="rId154">
         <w:r>
           <w:rPr>
             <w:rStyle w:val="Hyperlink"/>
@@ -15758,8 +15848,8 @@
         <w:t xml:space="preserve">but routed entirely to your local model.</w:t>
       </w:r>
     </w:p>
-    <w:bookmarkEnd w:id="154"/>
-    <w:bookmarkStart w:id="161" w:name="Xa49787af61dbef3b2520e4c56cd107733cf2925"/>
+    <w:bookmarkEnd w:id="155"/>
+    <w:bookmarkStart w:id="162" w:name="Xa49787af61dbef3b2520e4c56cd107733cf2925"/>
     <w:p>
       <w:pPr>
         <w:pStyle w:val="Heading4"/>
@@ -15793,7 +15883,7 @@
       <w:r>
         <w:t xml:space="preserve">and commits them to git—the local counterpart to a cloud coding agent—</w:t>
       </w:r>
-      <w:hyperlink r:id="rId155">
+      <w:hyperlink r:id="rId156">
         <w:r>
           <w:rPr>
             <w:rStyle w:val="VerbatimChar"/>
@@ -16055,18 +16145,18 @@
                 <wp:inline>
                   <wp:extent cx="152400" cy="152400"/>
                   <wp:effectExtent b="0" l="0" r="0" t="0"/>
-                  <wp:docPr descr="" title="" id="157" name="Picture"/>
+                  <wp:docPr descr="" title="" id="158" name="Picture"/>
                   <a:graphic>
                     <a:graphicData uri="http://schemas.openxmlformats.org/drawingml/2006/picture">
                       <pic:pic>
                         <pic:nvPicPr>
-                          <pic:cNvPr descr="/opt/quarto/share/formats/docx/important.png" id="158" name="Picture"/>
+                          <pic:cNvPr descr="/opt/quarto/share/formats/docx/important.png" id="159" name="Picture"/>
                           <pic:cNvPicPr>
                             <a:picLocks noChangeArrowheads="1" noChangeAspect="1"/>
                           </pic:cNvPicPr>
                         </pic:nvPicPr>
                         <pic:blipFill>
-                          <a:blip r:embed="rId156"/>
+                          <a:blip r:embed="rId157"/>
                           <a:stretch>
                             <a:fillRect/>
                           </a:stretch>
@@ -16946,18 +17036,18 @@
                 <wp:inline>
                   <wp:extent cx="152400" cy="152400"/>
                   <wp:effectExtent b="0" l="0" r="0" t="0"/>
-                  <wp:docPr descr="" title="" id="159" name="Picture"/>
+                  <wp:docPr descr="" title="" id="160" name="Picture"/>
                   <a:graphic>
                     <a:graphicData uri="http://schemas.openxmlformats.org/drawingml/2006/picture">
                       <pic:pic>
                         <pic:nvPicPr>
-                          <pic:cNvPr descr="/opt/quarto/share/formats/docx/caution.png" id="160" name="Picture"/>
+                          <pic:cNvPr descr="/opt/quarto/share/formats/docx/caution.png" id="161" name="Picture"/>
                           <pic:cNvPicPr>
                             <a:picLocks noChangeArrowheads="1" noChangeAspect="1"/>
                           </pic:cNvPicPr>
                         </pic:nvPicPr>
                         <pic:blipFill>
-                          <a:blip r:embed="rId141"/>
+                          <a:blip r:embed="rId142"/>
                           <a:stretch>
                             <a:fillRect/>
                           </a:stretch>
@@ -17099,8 +17189,8 @@
         </w:tc>
       </w:tr>
     </w:tbl>
-    <w:bookmarkEnd w:id="161"/>
-    <w:bookmarkStart w:id="162" w:name="Xfaca38e7659e63d88eb8a6433eb2bd1e6d3e705"/>
+    <w:bookmarkEnd w:id="162"/>
+    <w:bookmarkStart w:id="163" w:name="Xfaca38e7659e63d88eb8a6433eb2bd1e6d3e705"/>
     <w:p>
       <w:pPr>
         <w:pStyle w:val="Heading4"/>
@@ -17217,8 +17307,8 @@
         <w:t xml:space="preserve">Speech-to-text voice input support</w:t>
       </w:r>
     </w:p>
-    <w:bookmarkEnd w:id="162"/>
-    <w:bookmarkStart w:id="165" w:name="integrating-aider-into-vs-code"/>
+    <w:bookmarkEnd w:id="163"/>
+    <w:bookmarkStart w:id="166" w:name="integrating-aider-into-vs-code"/>
     <w:p>
       <w:pPr>
         <w:pStyle w:val="Heading4"/>
@@ -17600,18 +17690,18 @@
                 <wp:inline>
                   <wp:extent cx="152400" cy="152400"/>
                   <wp:effectExtent b="0" l="0" r="0" t="0"/>
-                  <wp:docPr descr="" title="" id="163" name="Picture"/>
+                  <wp:docPr descr="" title="" id="164" name="Picture"/>
                   <a:graphic>
                     <a:graphicData uri="http://schemas.openxmlformats.org/drawingml/2006/picture">
                       <pic:pic>
                         <pic:nvPicPr>
-                          <pic:cNvPr descr="/opt/quarto/share/formats/docx/important.png" id="164" name="Picture"/>
+                          <pic:cNvPr descr="/opt/quarto/share/formats/docx/important.png" id="165" name="Picture"/>
                           <pic:cNvPicPr>
                             <a:picLocks noChangeArrowheads="1" noChangeAspect="1"/>
                           </pic:cNvPicPr>
                         </pic:nvPicPr>
                         <pic:blipFill>
-                          <a:blip r:embed="rId156"/>
+                          <a:blip r:embed="rId157"/>
                           <a:stretch>
                             <a:fillRect/>
                           </a:stretch>
@@ -18166,8 +18256,8 @@
         </w:tc>
       </w:tr>
     </w:tbl>
-    <w:bookmarkEnd w:id="165"/>
-    <w:bookmarkStart w:id="169" w:name="connecting-claude-code-to-ollama"/>
+    <w:bookmarkEnd w:id="166"/>
+    <w:bookmarkStart w:id="170" w:name="connecting-claude-code-to-ollama"/>
     <w:p>
       <w:pPr>
         <w:pStyle w:val="Heading4"/>
@@ -18232,7 +18322,7 @@
       <w:r>
         <w:t xml:space="preserve"> </w:t>
       </w:r>
-      <w:hyperlink r:id="rId166">
+      <w:hyperlink r:id="rId167">
         <w:r>
           <w:rPr>
             <w:rStyle w:val="Hyperlink"/>
@@ -18584,18 +18674,18 @@
                 <wp:inline>
                   <wp:extent cx="152400" cy="152400"/>
                   <wp:effectExtent b="0" l="0" r="0" t="0"/>
-                  <wp:docPr descr="" title="" id="167" name="Picture"/>
+                  <wp:docPr descr="" title="" id="168" name="Picture"/>
                   <a:graphic>
                     <a:graphicData uri="http://schemas.openxmlformats.org/drawingml/2006/picture">
                       <pic:pic>
                         <pic:nvPicPr>
-                          <pic:cNvPr descr="/opt/quarto/share/formats/docx/warning.png" id="168" name="Picture"/>
+                          <pic:cNvPr descr="/opt/quarto/share/formats/docx/warning.png" id="169" name="Picture"/>
                           <pic:cNvPicPr>
                             <a:picLocks noChangeArrowheads="1" noChangeAspect="1"/>
                           </pic:cNvPicPr>
                         </pic:nvPicPr>
                         <pic:blipFill>
-                          <a:blip r:embed="rId105"/>
+                          <a:blip r:embed="rId106"/>
                           <a:stretch>
                             <a:fillRect/>
                           </a:stretch>
@@ -19019,8 +19109,8 @@
         </w:tc>
       </w:tr>
     </w:tbl>
-    <w:bookmarkEnd w:id="169"/>
-    <w:bookmarkStart w:id="175" w:name="X59411e82da523ef2314b797b4d6b6b495bf0db8"/>
+    <w:bookmarkEnd w:id="170"/>
+    <w:bookmarkStart w:id="176" w:name="X59411e82da523ef2314b797b4d6b6b495bf0db8"/>
     <w:p>
       <w:pPr>
         <w:pStyle w:val="Heading4"/>
@@ -19071,7 +19161,7 @@
       <w:pPr>
         <w:pStyle w:val="BodyText"/>
       </w:pPr>
-      <w:hyperlink r:id="rId170">
+      <w:hyperlink r:id="rId171">
         <w:r>
           <w:rPr>
             <w:rStyle w:val="VerbatimChar"/>
@@ -19850,18 +19940,18 @@
                 <wp:inline>
                   <wp:extent cx="152400" cy="152400"/>
                   <wp:effectExtent b="0" l="0" r="0" t="0"/>
-                  <wp:docPr descr="" title="" id="171" name="Picture"/>
+                  <wp:docPr descr="" title="" id="172" name="Picture"/>
                   <a:graphic>
                     <a:graphicData uri="http://schemas.openxmlformats.org/drawingml/2006/picture">
                       <pic:pic>
                         <pic:nvPicPr>
-                          <pic:cNvPr descr="/opt/quarto/share/formats/docx/note.png" id="172" name="Picture"/>
+                          <pic:cNvPr descr="/opt/quarto/share/formats/docx/note.png" id="173" name="Picture"/>
                           <pic:cNvPicPr>
                             <a:picLocks noChangeArrowheads="1" noChangeAspect="1"/>
                           </pic:cNvPicPr>
                         </pic:nvPicPr>
                         <pic:blipFill>
-                          <a:blip r:embed="rId120"/>
+                          <a:blip r:embed="rId121"/>
                           <a:stretch>
                             <a:fillRect/>
                           </a:stretch>
@@ -20004,18 +20094,18 @@
                 <wp:inline>
                   <wp:extent cx="152400" cy="152400"/>
                   <wp:effectExtent b="0" l="0" r="0" t="0"/>
-                  <wp:docPr descr="" title="" id="173" name="Picture"/>
+                  <wp:docPr descr="" title="" id="174" name="Picture"/>
                   <a:graphic>
                     <a:graphicData uri="http://schemas.openxmlformats.org/drawingml/2006/picture">
                       <pic:pic>
                         <pic:nvPicPr>
-                          <pic:cNvPr descr="/opt/quarto/share/formats/docx/caution.png" id="174" name="Picture"/>
+                          <pic:cNvPr descr="/opt/quarto/share/formats/docx/caution.png" id="175" name="Picture"/>
                           <pic:cNvPicPr>
                             <a:picLocks noChangeArrowheads="1" noChangeAspect="1"/>
                           </pic:cNvPicPr>
                         </pic:nvPicPr>
                         <pic:blipFill>
-                          <a:blip r:embed="rId141"/>
+                          <a:blip r:embed="rId142"/>
                           <a:stretch>
                             <a:fillRect/>
                           </a:stretch>
@@ -20106,8 +20196,8 @@
         </w:tc>
       </w:tr>
     </w:tbl>
-    <w:bookmarkEnd w:id="175"/>
-    <w:bookmarkStart w:id="183" w:name="working-in-hpc-cluster-environments"/>
+    <w:bookmarkEnd w:id="176"/>
+    <w:bookmarkStart w:id="184" w:name="working-in-hpc-cluster-environments"/>
     <w:p>
       <w:pPr>
         <w:pStyle w:val="Heading4"/>
@@ -20171,18 +20261,18 @@
                 <wp:inline>
                   <wp:extent cx="152400" cy="152400"/>
                   <wp:effectExtent b="0" l="0" r="0" t="0"/>
-                  <wp:docPr descr="" title="" id="176" name="Picture"/>
+                  <wp:docPr descr="" title="" id="177" name="Picture"/>
                   <a:graphic>
                     <a:graphicData uri="http://schemas.openxmlformats.org/drawingml/2006/picture">
                       <pic:pic>
                         <pic:nvPicPr>
-                          <pic:cNvPr descr="/opt/quarto/share/formats/docx/note.png" id="177" name="Picture"/>
+                          <pic:cNvPr descr="/opt/quarto/share/formats/docx/note.png" id="178" name="Picture"/>
                           <pic:cNvPicPr>
                             <a:picLocks noChangeArrowheads="1" noChangeAspect="1"/>
                           </pic:cNvPicPr>
                         </pic:nvPicPr>
                         <pic:blipFill>
-                          <a:blip r:embed="rId120"/>
+                          <a:blip r:embed="rId121"/>
                           <a:stretch>
                             <a:fillRect/>
                           </a:stretch>
@@ -20319,7 +20409,7 @@
             <w:r>
               <w:t xml:space="preserve"> </w:t>
             </w:r>
-            <w:hyperlink r:id="rId144">
+            <w:hyperlink r:id="rId145">
               <w:r>
                 <w:rPr>
                   <w:rStyle w:val="Hyperlink"/>
@@ -20495,18 +20585,18 @@
                 <wp:inline>
                   <wp:extent cx="152400" cy="152400"/>
                   <wp:effectExtent b="0" l="0" r="0" t="0"/>
-                  <wp:docPr descr="" title="" id="178" name="Picture"/>
+                  <wp:docPr descr="" title="" id="179" name="Picture"/>
                   <a:graphic>
                     <a:graphicData uri="http://schemas.openxmlformats.org/drawingml/2006/picture">
                       <pic:pic>
                         <pic:nvPicPr>
-                          <pic:cNvPr descr="/opt/quarto/share/formats/docx/warning.png" id="179" name="Picture"/>
+                          <pic:cNvPr descr="/opt/quarto/share/formats/docx/warning.png" id="180" name="Picture"/>
                           <pic:cNvPicPr>
                             <a:picLocks noChangeArrowheads="1" noChangeAspect="1"/>
                           </pic:cNvPicPr>
                         </pic:nvPicPr>
                         <pic:blipFill>
-                          <a:blip r:embed="rId105"/>
+                          <a:blip r:embed="rId106"/>
                           <a:stretch>
                             <a:fillRect/>
                           </a:stretch>
@@ -21311,18 +21401,18 @@
                 <wp:inline>
                   <wp:extent cx="152400" cy="152400"/>
                   <wp:effectExtent b="0" l="0" r="0" t="0"/>
-                  <wp:docPr descr="" title="" id="180" name="Picture"/>
+                  <wp:docPr descr="" title="" id="181" name="Picture"/>
                   <a:graphic>
                     <a:graphicData uri="http://schemas.openxmlformats.org/drawingml/2006/picture">
                       <pic:pic>
                         <pic:nvPicPr>
-                          <pic:cNvPr descr="/opt/quarto/share/formats/docx/warning.png" id="181" name="Picture"/>
+                          <pic:cNvPr descr="/opt/quarto/share/formats/docx/warning.png" id="182" name="Picture"/>
                           <pic:cNvPicPr>
                             <a:picLocks noChangeArrowheads="1" noChangeAspect="1"/>
                           </pic:cNvPicPr>
                         </pic:nvPicPr>
                         <pic:blipFill>
-                          <a:blip r:embed="rId105"/>
+                          <a:blip r:embed="rId106"/>
                           <a:stretch>
                             <a:fillRect/>
                           </a:stretch>
@@ -21414,7 +21504,7 @@
             <w:r>
               <w:t xml:space="preserve"> </w:t>
             </w:r>
-            <w:hyperlink r:id="rId182">
+            <w:hyperlink r:id="rId183">
               <w:r>
                 <w:rPr>
                   <w:rStyle w:val="Hyperlink"/>
@@ -21433,8 +21523,8 @@
         </w:tc>
       </w:tr>
     </w:tbl>
-    <w:bookmarkEnd w:id="183"/>
-    <w:bookmarkStart w:id="186" w:name="privacy-considerations"/>
+    <w:bookmarkEnd w:id="184"/>
+    <w:bookmarkStart w:id="187" w:name="privacy-considerations"/>
     <w:p>
       <w:pPr>
         <w:pStyle w:val="Heading4"/>
@@ -21560,18 +21650,18 @@
                 <wp:inline>
                   <wp:extent cx="152400" cy="152400"/>
                   <wp:effectExtent b="0" l="0" r="0" t="0"/>
-                  <wp:docPr descr="" title="" id="184" name="Picture"/>
+                  <wp:docPr descr="" title="" id="185" name="Picture"/>
                   <a:graphic>
                     <a:graphicData uri="http://schemas.openxmlformats.org/drawingml/2006/picture">
                       <pic:pic>
                         <pic:nvPicPr>
-                          <pic:cNvPr descr="/opt/quarto/share/formats/docx/important.png" id="185" name="Picture"/>
+                          <pic:cNvPr descr="/opt/quarto/share/formats/docx/important.png" id="186" name="Picture"/>
                           <pic:cNvPicPr>
                             <a:picLocks noChangeArrowheads="1" noChangeAspect="1"/>
                           </pic:cNvPicPr>
                         </pic:nvPicPr>
                         <pic:blipFill>
-                          <a:blip r:embed="rId156"/>
+                          <a:blip r:embed="rId157"/>
                           <a:stretch>
                             <a:fillRect/>
                           </a:stretch>
@@ -21723,7 +21813,7 @@
             <w:r>
               <w:t xml:space="preserve"> </w:t>
             </w:r>
-            <w:hyperlink r:id="rId146">
+            <w:hyperlink r:id="rId147">
               <w:r>
                 <w:rPr>
                   <w:rStyle w:val="Hyperlink"/>
@@ -21863,8 +21953,8 @@
         </w:tc>
       </w:tr>
     </w:tbl>
-    <w:bookmarkEnd w:id="186"/>
-    <w:bookmarkStart w:id="187" w:name="verifying-you-are-genuinely-offline"/>
+    <w:bookmarkEnd w:id="187"/>
+    <w:bookmarkStart w:id="188" w:name="verifying-you-are-genuinely-offline"/>
     <w:p>
       <w:pPr>
         <w:pStyle w:val="Heading4"/>
@@ -22272,9 +22362,9 @@
         <w:t xml:space="preserve">and looks exactly like success.</w:t>
       </w:r>
     </w:p>
-    <w:bookmarkEnd w:id="187"/>
     <w:bookmarkEnd w:id="188"/>
-    <w:bookmarkStart w:id="194" w:name="sec-ai-opencode-ollama"/>
+    <w:bookmarkEnd w:id="189"/>
+    <w:bookmarkStart w:id="195" w:name="sec-ai-opencode-ollama"/>
     <w:p>
       <w:pPr>
         <w:pStyle w:val="Heading1"/>
@@ -22287,7 +22377,7 @@
       <w:pPr>
         <w:pStyle w:val="FirstParagraph"/>
       </w:pPr>
-      <w:hyperlink r:id="rId189">
+      <w:hyperlink r:id="rId190">
         <w:r>
           <w:rPr>
             <w:rStyle w:val="Hyperlink"/>
@@ -22478,7 +22568,7 @@
       <w:r>
         <w:t xml:space="preserve"> </w:t>
       </w:r>
-      <w:hyperlink r:id="rId190">
+      <w:hyperlink r:id="rId191">
         <w:r>
           <w:rPr>
             <w:rStyle w:val="VerbatimChar"/>
@@ -22725,18 +22815,18 @@
                 <wp:inline>
                   <wp:extent cx="152400" cy="152400"/>
                   <wp:effectExtent b="0" l="0" r="0" t="0"/>
-                  <wp:docPr descr="" title="" id="191" name="Picture"/>
+                  <wp:docPr descr="" title="" id="192" name="Picture"/>
                   <a:graphic>
                     <a:graphicData uri="http://schemas.openxmlformats.org/drawingml/2006/picture">
                       <pic:pic>
                         <pic:nvPicPr>
-                          <pic:cNvPr descr="/opt/quarto/share/formats/docx/note.png" id="192" name="Picture"/>
+                          <pic:cNvPr descr="/opt/quarto/share/formats/docx/note.png" id="193" name="Picture"/>
                           <pic:cNvPicPr>
                             <a:picLocks noChangeArrowheads="1" noChangeAspect="1"/>
                           </pic:cNvPicPr>
                         </pic:nvPicPr>
                         <pic:blipFill>
-                          <a:blip r:embed="rId120"/>
+                          <a:blip r:embed="rId121"/>
                           <a:stretch>
                             <a:fillRect/>
                           </a:stretch>
@@ -22804,7 +22894,7 @@
             <w:r>
               <w:t xml:space="preserve"> </w:t>
             </w:r>
-            <w:hyperlink r:id="rId193">
+            <w:hyperlink r:id="rId194">
               <w:r>
                 <w:rPr>
                   <w:rStyle w:val="VerbatimChar"/>
@@ -22909,8 +22999,8 @@
         <w:t xml:space="preserve">.</w:t>
       </w:r>
     </w:p>
-    <w:bookmarkEnd w:id="194"/>
-    <w:bookmarkStart w:id="199" w:name="sec-ai-opencode-openrouter"/>
+    <w:bookmarkEnd w:id="195"/>
+    <w:bookmarkStart w:id="200" w:name="sec-ai-opencode-openrouter"/>
     <w:p>
       <w:pPr>
         <w:pStyle w:val="Heading1"/>
@@ -22923,7 +23013,7 @@
       <w:pPr>
         <w:pStyle w:val="FirstParagraph"/>
       </w:pPr>
-      <w:hyperlink r:id="rId195">
+      <w:hyperlink r:id="rId196">
         <w:r>
           <w:rPr>
             <w:rStyle w:val="Hyperlink"/>
@@ -23032,7 +23122,7 @@
       <w:r>
         <w:t xml:space="preserve"> </w:t>
       </w:r>
-      <w:hyperlink r:id="rId196">
+      <w:hyperlink r:id="rId197">
         <w:r>
           <w:rPr>
             <w:rStyle w:val="Hyperlink"/>
@@ -23049,7 +23139,7 @@
       <w:r>
         <w:t xml:space="preserve"> </w:t>
       </w:r>
-      <w:hyperlink r:id="rId197">
+      <w:hyperlink r:id="rId198">
         <w:r>
           <w:rPr>
             <w:rStyle w:val="Hyperlink"/>
@@ -24095,7 +24185,7 @@
       <w:r>
         <w:t xml:space="preserve">(</w:t>
       </w:r>
-      <w:hyperlink r:id="rId198">
+      <w:hyperlink r:id="rId199">
         <w:r>
           <w:rPr>
             <w:rStyle w:val="Hyperlink"/>
@@ -24115,8 +24205,8 @@
         <w:t xml:space="preserve">Config loads at startup, so restart OpenCode after editing it.</w:t>
       </w:r>
     </w:p>
-    <w:bookmarkEnd w:id="199"/>
-    <w:bookmarkStart w:id="236" w:name="sec-ai-small-local-models"/>
+    <w:bookmarkEnd w:id="200"/>
+    <w:bookmarkStart w:id="237" w:name="sec-ai-small-local-models"/>
     <w:p>
       <w:pPr>
         <w:pStyle w:val="Heading1"/>
@@ -24264,18 +24354,18 @@
                 <wp:inline>
                   <wp:extent cx="152400" cy="152400"/>
                   <wp:effectExtent b="0" l="0" r="0" t="0"/>
-                  <wp:docPr descr="" title="" id="200" name="Picture"/>
+                  <wp:docPr descr="" title="" id="201" name="Picture"/>
                   <a:graphic>
                     <a:graphicData uri="http://schemas.openxmlformats.org/drawingml/2006/picture">
                       <pic:pic>
                         <pic:nvPicPr>
-                          <pic:cNvPr descr="/opt/quarto/share/formats/docx/warning.png" id="201" name="Picture"/>
+                          <pic:cNvPr descr="/opt/quarto/share/formats/docx/warning.png" id="202" name="Picture"/>
                           <pic:cNvPicPr>
                             <a:picLocks noChangeArrowheads="1" noChangeAspect="1"/>
                           </pic:cNvPicPr>
                         </pic:nvPicPr>
                         <pic:blipFill>
-                          <a:blip r:embed="rId105"/>
+                          <a:blip r:embed="rId106"/>
                           <a:stretch>
                             <a:fillRect/>
                           </a:stretch>
@@ -24405,7 +24495,7 @@
         </w:tc>
       </w:tr>
     </w:tbl>
-    <w:bookmarkStart w:id="202" w:name="the-honest-catch"/>
+    <w:bookmarkStart w:id="203" w:name="the-honest-catch"/>
     <w:p>
       <w:pPr>
         <w:pStyle w:val="Heading4"/>
@@ -24575,8 +24665,8 @@
         <w:t xml:space="preserve">below.</w:t>
       </w:r>
     </w:p>
-    <w:bookmarkEnd w:id="202"/>
-    <w:bookmarkStart w:id="217" w:name="model-landscape"/>
+    <w:bookmarkEnd w:id="203"/>
+    <w:bookmarkStart w:id="218" w:name="model-landscape"/>
     <w:p>
       <w:pPr>
         <w:pStyle w:val="Heading4"/>
@@ -24708,7 +24798,7 @@
             <w:pPr>
               <w:pStyle w:val="Compact"/>
             </w:pPr>
-            <w:hyperlink r:id="rId203">
+            <w:hyperlink r:id="rId204">
               <w:r>
                 <w:rPr>
                   <w:rStyle w:val="Hyperlink"/>
@@ -24783,7 +24873,7 @@
             <w:pPr>
               <w:pStyle w:val="Compact"/>
             </w:pPr>
-            <w:hyperlink r:id="rId204">
+            <w:hyperlink r:id="rId205">
               <w:r>
                 <w:rPr>
                   <w:rStyle w:val="Hyperlink"/>
@@ -24834,7 +24924,7 @@
             <w:pPr>
               <w:pStyle w:val="Compact"/>
             </w:pPr>
-            <w:hyperlink r:id="rId205">
+            <w:hyperlink r:id="rId206">
               <w:r>
                 <w:rPr>
                   <w:rStyle w:val="Hyperlink"/>
@@ -24909,7 +24999,7 @@
             <w:pPr>
               <w:pStyle w:val="Compact"/>
             </w:pPr>
-            <w:hyperlink r:id="rId206">
+            <w:hyperlink r:id="rId207">
               <w:r>
                 <w:rPr>
                   <w:rStyle w:val="Hyperlink"/>
@@ -24960,7 +25050,7 @@
             <w:pPr>
               <w:pStyle w:val="Compact"/>
             </w:pPr>
-            <w:hyperlink r:id="rId207">
+            <w:hyperlink r:id="rId208">
               <w:r>
                 <w:rPr>
                   <w:rStyle w:val="Hyperlink"/>
@@ -25011,7 +25101,7 @@
             <w:pPr>
               <w:pStyle w:val="Compact"/>
             </w:pPr>
-            <w:hyperlink r:id="rId208">
+            <w:hyperlink r:id="rId209">
               <w:r>
                 <w:rPr>
                   <w:rStyle w:val="Hyperlink"/>
@@ -25062,7 +25152,7 @@
             <w:pPr>
               <w:pStyle w:val="Compact"/>
             </w:pPr>
-            <w:hyperlink r:id="rId209">
+            <w:hyperlink r:id="rId210">
               <w:r>
                 <w:rPr>
                   <w:rStyle w:val="Hyperlink"/>
@@ -25113,7 +25203,7 @@
             <w:pPr>
               <w:pStyle w:val="Compact"/>
             </w:pPr>
-            <w:hyperlink r:id="rId210">
+            <w:hyperlink r:id="rId211">
               <w:r>
                 <w:rPr>
                   <w:rStyle w:val="Hyperlink"/>
@@ -25140,7 +25230,7 @@
             <w:pPr>
               <w:pStyle w:val="Compact"/>
             </w:pPr>
-            <w:hyperlink r:id="rId211">
+            <w:hyperlink r:id="rId212">
               <w:r>
                 <w:rPr>
                   <w:rStyle w:val="Hyperlink"/>
@@ -25169,7 +25259,7 @@
             <w:pPr>
               <w:pStyle w:val="Compact"/>
             </w:pPr>
-            <w:hyperlink r:id="rId212">
+            <w:hyperlink r:id="rId213">
               <w:r>
                 <w:rPr>
                   <w:rStyle w:val="Hyperlink"/>
@@ -25196,7 +25286,7 @@
             <w:pPr>
               <w:pStyle w:val="Compact"/>
             </w:pPr>
-            <w:hyperlink r:id="rId213">
+            <w:hyperlink r:id="rId214">
               <w:r>
                 <w:rPr>
                   <w:rStyle w:val="Hyperlink"/>
@@ -25231,7 +25321,7 @@
             <w:pPr>
               <w:pStyle w:val="Compact"/>
             </w:pPr>
-            <w:hyperlink r:id="rId214">
+            <w:hyperlink r:id="rId215">
               <w:r>
                 <w:rPr>
                   <w:rStyle w:val="Hyperlink"/>
@@ -25485,18 +25575,18 @@
                 <wp:inline>
                   <wp:extent cx="152400" cy="152400"/>
                   <wp:effectExtent b="0" l="0" r="0" t="0"/>
-                  <wp:docPr descr="" title="" id="215" name="Picture"/>
+                  <wp:docPr descr="" title="" id="216" name="Picture"/>
                   <a:graphic>
                     <a:graphicData uri="http://schemas.openxmlformats.org/drawingml/2006/picture">
                       <pic:pic>
                         <pic:nvPicPr>
-                          <pic:cNvPr descr="/opt/quarto/share/formats/docx/important.png" id="216" name="Picture"/>
+                          <pic:cNvPr descr="/opt/quarto/share/formats/docx/important.png" id="217" name="Picture"/>
                           <pic:cNvPicPr>
                             <a:picLocks noChangeArrowheads="1" noChangeAspect="1"/>
                           </pic:cNvPicPr>
                         </pic:nvPicPr>
                         <pic:blipFill>
-                          <a:blip r:embed="rId156"/>
+                          <a:blip r:embed="rId157"/>
                           <a:stretch>
                             <a:fillRect/>
                           </a:stretch>
@@ -25917,8 +26007,8 @@
         </w:tc>
       </w:tr>
     </w:tbl>
-    <w:bookmarkEnd w:id="217"/>
-    <w:bookmarkStart w:id="220" w:name="hardware-tiers"/>
+    <w:bookmarkEnd w:id="218"/>
+    <w:bookmarkStart w:id="221" w:name="hardware-tiers"/>
     <w:p>
       <w:pPr>
         <w:pStyle w:val="Heading4"/>
@@ -26170,7 +26260,7 @@
       <w:r>
         <w:t xml:space="preserve"> </w:t>
       </w:r>
-      <w:hyperlink r:id="rId146">
+      <w:hyperlink r:id="rId147">
         <w:r>
           <w:rPr>
             <w:rStyle w:val="Hyperlink"/>
@@ -26238,18 +26328,18 @@
                 <wp:inline>
                   <wp:extent cx="152400" cy="152400"/>
                   <wp:effectExtent b="0" l="0" r="0" t="0"/>
-                  <wp:docPr descr="" title="" id="218" name="Picture"/>
+                  <wp:docPr descr="" title="" id="219" name="Picture"/>
                   <a:graphic>
                     <a:graphicData uri="http://schemas.openxmlformats.org/drawingml/2006/picture">
                       <pic:pic>
                         <pic:nvPicPr>
-                          <pic:cNvPr descr="/opt/quarto/share/formats/docx/warning.png" id="219" name="Picture"/>
+                          <pic:cNvPr descr="/opt/quarto/share/formats/docx/warning.png" id="220" name="Picture"/>
                           <pic:cNvPicPr>
                             <a:picLocks noChangeArrowheads="1" noChangeAspect="1"/>
                           </pic:cNvPicPr>
                         </pic:nvPicPr>
                         <pic:blipFill>
-                          <a:blip r:embed="rId105"/>
+                          <a:blip r:embed="rId106"/>
                           <a:stretch>
                             <a:fillRect/>
                           </a:stretch>
@@ -26541,8 +26631,8 @@
         </w:tc>
       </w:tr>
     </w:tbl>
-    <w:bookmarkEnd w:id="220"/>
-    <w:bookmarkStart w:id="223" w:name="action-latency-and-memory-bandwidth"/>
+    <w:bookmarkEnd w:id="221"/>
+    <w:bookmarkStart w:id="224" w:name="action-latency-and-memory-bandwidth"/>
     <w:p>
       <w:pPr>
         <w:pStyle w:val="Heading4"/>
@@ -27249,18 +27339,18 @@
                 <wp:inline>
                   <wp:extent cx="152400" cy="152400"/>
                   <wp:effectExtent b="0" l="0" r="0" t="0"/>
-                  <wp:docPr descr="" title="" id="221" name="Picture"/>
+                  <wp:docPr descr="" title="" id="222" name="Picture"/>
                   <a:graphic>
                     <a:graphicData uri="http://schemas.openxmlformats.org/drawingml/2006/picture">
                       <pic:pic>
                         <pic:nvPicPr>
-                          <pic:cNvPr descr="/opt/quarto/share/formats/docx/note.png" id="222" name="Picture"/>
+                          <pic:cNvPr descr="/opt/quarto/share/formats/docx/note.png" id="223" name="Picture"/>
                           <pic:cNvPicPr>
                             <a:picLocks noChangeArrowheads="1" noChangeAspect="1"/>
                           </pic:cNvPicPr>
                         </pic:nvPicPr>
                         <pic:blipFill>
-                          <a:blip r:embed="rId120"/>
+                          <a:blip r:embed="rId121"/>
                           <a:stretch>
                             <a:fillRect/>
                           </a:stretch>
@@ -27384,8 +27474,8 @@
         </w:tc>
       </w:tr>
     </w:tbl>
-    <w:bookmarkEnd w:id="223"/>
-    <w:bookmarkStart w:id="224" w:name="X58a4330bb9d721536d3df1abbb820879339bea7"/>
+    <w:bookmarkEnd w:id="224"/>
+    <w:bookmarkStart w:id="225" w:name="X58a4330bb9d721536d3df1abbb820879339bea7"/>
     <w:p>
       <w:pPr>
         <w:pStyle w:val="Heading4"/>
@@ -27675,8 +27765,8 @@
         <w:t xml:space="preserve">Feeds the command outputs back into the conversation context as tool messages.</w:t>
       </w:r>
     </w:p>
-    <w:bookmarkEnd w:id="224"/>
-    <w:bookmarkStart w:id="225" w:name="X98fbc317b6061ff02292f6372a6a1c929c09878"/>
+    <w:bookmarkEnd w:id="225"/>
+    <w:bookmarkStart w:id="226" w:name="X98fbc317b6061ff02292f6372a6a1c929c09878"/>
     <w:p>
       <w:pPr>
         <w:pStyle w:val="Heading4"/>
@@ -27953,8 +28043,8 @@
         <w:t xml:space="preserve">) in favor of immediate tool invocation.</w:t>
       </w:r>
     </w:p>
-    <w:bookmarkEnd w:id="225"/>
-    <w:bookmarkStart w:id="226" w:name="X97e83cd81a11ec4a50ee2033f7ad0a1c352c515"/>
+    <w:bookmarkEnd w:id="226"/>
+    <w:bookmarkStart w:id="227" w:name="X97e83cd81a11ec4a50ee2033f7ad0a1c352c515"/>
     <w:p>
       <w:pPr>
         <w:pStyle w:val="Heading4"/>
@@ -28346,8 +28436,8 @@
         <w:t xml:space="preserve">and the loop still needs a way to catch that.</w:t>
       </w:r>
     </w:p>
-    <w:bookmarkEnd w:id="226"/>
-    <w:bookmarkStart w:id="229" w:name="guardrails-for-autonomy"/>
+    <w:bookmarkEnd w:id="227"/>
+    <w:bookmarkStart w:id="230" w:name="guardrails-for-autonomy"/>
     <w:p>
       <w:pPr>
         <w:pStyle w:val="Heading4"/>
@@ -28397,18 +28487,18 @@
                 <wp:inline>
                   <wp:extent cx="152400" cy="152400"/>
                   <wp:effectExtent b="0" l="0" r="0" t="0"/>
-                  <wp:docPr descr="" title="" id="227" name="Picture"/>
+                  <wp:docPr descr="" title="" id="228" name="Picture"/>
                   <a:graphic>
                     <a:graphicData uri="http://schemas.openxmlformats.org/drawingml/2006/picture">
                       <pic:pic>
                         <pic:nvPicPr>
-                          <pic:cNvPr descr="/opt/quarto/share/formats/docx/important.png" id="228" name="Picture"/>
+                          <pic:cNvPr descr="/opt/quarto/share/formats/docx/important.png" id="229" name="Picture"/>
                           <pic:cNvPicPr>
                             <a:picLocks noChangeArrowheads="1" noChangeAspect="1"/>
                           </pic:cNvPicPr>
                         </pic:nvPicPr>
                         <pic:blipFill>
-                          <a:blip r:embed="rId156"/>
+                          <a:blip r:embed="rId157"/>
                           <a:stretch>
                             <a:fillRect/>
                           </a:stretch>
@@ -28701,7 +28791,7 @@
       <w:r>
         <w:t xml:space="preserve"> </w:t>
       </w:r>
-      <w:hyperlink r:id="rId56">
+      <w:hyperlink r:id="rId57">
         <w:r>
           <w:rPr>
             <w:rStyle w:val="VerbatimChar"/>
@@ -29139,8 +29229,8 @@
         <w:t xml:space="preserve">below.</w:t>
       </w:r>
     </w:p>
-    <w:bookmarkEnd w:id="229"/>
-    <w:bookmarkStart w:id="230" w:name="stack-specific-notes"/>
+    <w:bookmarkEnd w:id="230"/>
+    <w:bookmarkStart w:id="231" w:name="stack-specific-notes"/>
     <w:p>
       <w:pPr>
         <w:pStyle w:val="Heading4"/>
@@ -29513,8 +29603,8 @@
         <w:t xml:space="preserve">Markdown fix run unattended.</w:t>
       </w:r>
     </w:p>
-    <w:bookmarkEnd w:id="230"/>
-    <w:bookmarkStart w:id="232" w:name="fine-tuning-closing-the-idiom-gap"/>
+    <w:bookmarkEnd w:id="231"/>
+    <w:bookmarkStart w:id="233" w:name="fine-tuning-closing-the-idiom-gap"/>
     <w:p>
       <w:pPr>
         <w:pStyle w:val="Heading4"/>
@@ -29749,7 +29839,7 @@
       <w:r>
         <w:t xml:space="preserve"> </w:t>
       </w:r>
-      <w:hyperlink r:id="rId231">
+      <w:hyperlink r:id="rId232">
         <w:r>
           <w:rPr>
             <w:rStyle w:val="Hyperlink"/>
@@ -29838,8 +29928,8 @@
         <w:t xml:space="preserve">performs on the next genuinely new task.</w:t>
       </w:r>
     </w:p>
-    <w:bookmarkEnd w:id="232"/>
-    <w:bookmarkStart w:id="235" w:name="companion-work"/>
+    <w:bookmarkEnd w:id="233"/>
+    <w:bookmarkStart w:id="236" w:name="companion-work"/>
     <w:p>
       <w:pPr>
         <w:pStyle w:val="Heading4"/>
@@ -29881,7 +29971,7 @@
           <w:numId w:val="1074"/>
         </w:numPr>
       </w:pPr>
-      <w:hyperlink r:id="rId233">
+      <w:hyperlink r:id="rId234">
         <w:r>
           <w:rPr>
             <w:rStyle w:val="VerbatimChar"/>
@@ -29951,7 +30041,7 @@
           <w:numId w:val="1074"/>
         </w:numPr>
       </w:pPr>
-      <w:hyperlink r:id="rId234">
+      <w:hyperlink r:id="rId235">
         <w:r>
           <w:rPr>
             <w:rStyle w:val="VerbatimChar"/>
@@ -30059,9 +30149,9 @@
         <w:t xml:space="preserve">bibliography DOIs</w:t>
       </w:r>
     </w:p>
-    <w:bookmarkEnd w:id="235"/>
     <w:bookmarkEnd w:id="236"/>
-    <w:bookmarkStart w:id="249" w:name="sec-ai-copilot-settings"/>
+    <w:bookmarkEnd w:id="237"/>
+    <w:bookmarkStart w:id="250" w:name="sec-ai-copilot-settings"/>
     <w:p>
       <w:pPr>
         <w:pStyle w:val="Heading1"/>
@@ -30096,7 +30186,7 @@
         <w:t xml:space="preserve">and provides guidance on which options to enable based on your use case.</w:t>
       </w:r>
     </w:p>
-    <w:bookmarkStart w:id="240" w:name="model-selection-options"/>
+    <w:bookmarkStart w:id="241" w:name="model-selection-options"/>
     <w:p>
       <w:pPr>
         <w:pStyle w:val="Heading4"/>
@@ -30545,7 +30635,7 @@
       <w:r>
         <w:t xml:space="preserve"> </w:t>
       </w:r>
-      <w:hyperlink r:id="rId237">
+      <w:hyperlink r:id="rId238">
         <w:r>
           <w:rPr>
             <w:rStyle w:val="VerbatimChar"/>
@@ -30589,7 +30679,7 @@
       <w:r>
         <w:t xml:space="preserve"> </w:t>
       </w:r>
-      <w:hyperlink r:id="rId238">
+      <w:hyperlink r:id="rId239">
         <w:r>
           <w:rPr>
             <w:rStyle w:val="Hyperlink"/>
@@ -30627,7 +30717,7 @@
       <w:r>
         <w:t xml:space="preserve"> </w:t>
       </w:r>
-      <w:hyperlink r:id="rId239">
+      <w:hyperlink r:id="rId240">
         <w:r>
           <w:rPr>
             <w:rStyle w:val="Hyperlink"/>
@@ -30930,8 +31020,8 @@
         <w:t xml:space="preserve">: Specific scenarios where variant optimizations matter</w:t>
       </w:r>
     </w:p>
-    <w:bookmarkEnd w:id="240"/>
-    <w:bookmarkStart w:id="245" w:name="connecting-positron-assistant-to-openai"/>
+    <w:bookmarkEnd w:id="241"/>
+    <w:bookmarkStart w:id="246" w:name="connecting-positron-assistant-to-openai"/>
     <w:p>
       <w:pPr>
         <w:pStyle w:val="Heading4"/>
@@ -30976,7 +31066,7 @@
       <w:r>
         <w:t xml:space="preserve"> </w:t>
       </w:r>
-      <w:hyperlink r:id="rId241">
+      <w:hyperlink r:id="rId242">
         <w:r>
           <w:rPr>
             <w:rStyle w:val="Hyperlink"/>
@@ -31132,7 +31222,7 @@
       <w:r>
         <w:t xml:space="preserve"> </w:t>
       </w:r>
-      <w:hyperlink r:id="rId242">
+      <w:hyperlink r:id="rId243">
         <w:r>
           <w:rPr>
             <w:rStyle w:val="Hyperlink"/>
@@ -31184,7 +31274,7 @@
       <w:r>
         <w:t xml:space="preserve"> </w:t>
       </w:r>
-      <w:hyperlink r:id="rId242">
+      <w:hyperlink r:id="rId243">
         <w:r>
           <w:rPr>
             <w:rStyle w:val="Hyperlink"/>
@@ -31198,7 +31288,7 @@
       <w:r>
         <w:t xml:space="preserve"> </w:t>
       </w:r>
-      <w:hyperlink r:id="rId243">
+      <w:hyperlink r:id="rId244">
         <w:r>
           <w:rPr>
             <w:rStyle w:val="Hyperlink"/>
@@ -31212,7 +31302,7 @@
       <w:r>
         <w:t xml:space="preserve"> </w:t>
       </w:r>
-      <w:hyperlink r:id="rId244">
+      <w:hyperlink r:id="rId245">
         <w:r>
           <w:rPr>
             <w:rStyle w:val="Hyperlink"/>
@@ -31481,8 +31571,8 @@
         <w:t xml:space="preserve">enabled for quick inline completions.</w:t>
       </w:r>
     </w:p>
-    <w:bookmarkEnd w:id="245"/>
-    <w:bookmarkStart w:id="246" w:name="feature-settings"/>
+    <w:bookmarkEnd w:id="246"/>
+    <w:bookmarkStart w:id="247" w:name="feature-settings"/>
     <w:p>
       <w:pPr>
         <w:pStyle w:val="Heading4"/>
@@ -32236,8 +32326,8 @@
         <w:t xml:space="preserve">for access to current information</w:t>
       </w:r>
     </w:p>
-    <w:bookmarkEnd w:id="246"/>
-    <w:bookmarkStart w:id="247" w:name="advanced-settings"/>
+    <w:bookmarkEnd w:id="247"/>
+    <w:bookmarkStart w:id="248" w:name="advanced-settings"/>
     <w:p>
       <w:pPr>
         <w:pStyle w:val="Heading4"/>
@@ -33303,8 +33393,8 @@
         <w:t xml:space="preserve">for sharing capability</w:t>
       </w:r>
     </w:p>
-    <w:bookmarkEnd w:id="247"/>
-    <w:bookmarkStart w:id="248" w:name="summary-of-recommended-settings"/>
+    <w:bookmarkEnd w:id="248"/>
+    <w:bookmarkStart w:id="249" w:name="summary-of-recommended-settings"/>
     <w:p>
       <w:pPr>
         <w:pStyle w:val="Heading4"/>
@@ -33565,9 +33655,9 @@
         <w:t xml:space="preserve">).</w:t>
       </w:r>
     </w:p>
-    <w:bookmarkEnd w:id="248"/>
     <w:bookmarkEnd w:id="249"/>
-    <w:bookmarkStart w:id="269" w:name="sec-ai-byok-vscode"/>
+    <w:bookmarkEnd w:id="250"/>
+    <w:bookmarkStart w:id="270" w:name="sec-ai-byok-vscode"/>
     <w:p>
       <w:pPr>
         <w:pStyle w:val="Heading1"/>
@@ -33628,7 +33718,7 @@
       <w:r>
         <w:t xml:space="preserve"> </w:t>
       </w:r>
-      <w:hyperlink r:id="rId250">
+      <w:hyperlink r:id="rId251">
         <w:r>
           <w:rPr>
             <w:rStyle w:val="VerbatimChar"/>
@@ -33660,7 +33750,7 @@
         <w:t xml:space="preserve">and three more that do not.</w:t>
       </w:r>
     </w:p>
-    <w:bookmarkStart w:id="252" w:name="wiring-the-extension-to-databricks"/>
+    <w:bookmarkStart w:id="253" w:name="wiring-the-extension-to-databricks"/>
     <w:p>
       <w:pPr>
         <w:pStyle w:val="Heading4"/>
@@ -34973,7 +35063,7 @@
       <w:r>
         <w:t xml:space="preserve"> </w:t>
       </w:r>
-      <w:hyperlink r:id="rId251">
+      <w:hyperlink r:id="rId252">
         <w:r>
           <w:rPr>
             <w:rStyle w:val="Hyperlink"/>
@@ -35162,8 +35252,8 @@
         <w:t xml:space="preserve">header.</w:t>
       </w:r>
     </w:p>
-    <w:bookmarkEnd w:id="252"/>
-    <w:bookmarkStart w:id="255" w:name="sizing-context-and-output-limits"/>
+    <w:bookmarkEnd w:id="253"/>
+    <w:bookmarkStart w:id="256" w:name="sizing-context-and-output-limits"/>
     <w:p>
       <w:pPr>
         <w:pStyle w:val="Heading4"/>
@@ -35408,7 +35498,7 @@
       <w:r>
         <w:t xml:space="preserve"> </w:t>
       </w:r>
-      <w:hyperlink r:id="rId253">
+      <w:hyperlink r:id="rId254">
         <w:r>
           <w:rPr>
             <w:rStyle w:val="Hyperlink"/>
@@ -35509,7 +35599,7 @@
       <w:tr>
         <w:tc>
           <w:tcPr/>
-          <w:bookmarkStart w:id="254" w:name="tbl-databricks-oaicopilot-defaults"/>
+          <w:bookmarkStart w:id="255" w:name="tbl-databricks-oaicopilot-defaults"/>
           <w:p>
             <w:pPr>
               <w:jc w:val="center"/>
@@ -36135,7 +36225,7 @@
               </w:tc>
             </w:tr>
           </w:tbl>
-          <w:bookmarkEnd w:id="254"/>
+          <w:bookmarkEnd w:id="255"/>
           <w:p/>
         </w:tc>
       </w:tr>
@@ -36286,8 +36376,8 @@
         <w:t xml:space="preserve">after checking their actual quota.</w:t>
       </w:r>
     </w:p>
-    <w:bookmarkEnd w:id="255"/>
-    <w:bookmarkStart w:id="257" w:name="X4ffc414c72f461a5c730b8d4c31add4bb84ada1"/>
+    <w:bookmarkEnd w:id="256"/>
+    <w:bookmarkStart w:id="258" w:name="X4ffc414c72f461a5c730b8d4c31add4bb84ada1"/>
     <w:p>
       <w:pPr>
         <w:pStyle w:val="Heading4"/>
@@ -36535,7 +36625,7 @@
       <w:tr>
         <w:tc>
           <w:tcPr/>
-          <w:bookmarkStart w:id="256" w:name="tbl-databricks-itpm-pacing"/>
+          <w:bookmarkStart w:id="257" w:name="tbl-databricks-itpm-pacing"/>
           <w:p>
             <w:pPr>
               <w:jc w:val="center"/>
@@ -36777,7 +36867,7 @@
               </w:tc>
             </w:tr>
           </w:tbl>
-          <w:bookmarkEnd w:id="256"/>
+          <w:bookmarkEnd w:id="257"/>
           <w:p/>
         </w:tc>
       </w:tr>
@@ -36838,8 +36928,8 @@
         <w:t xml:space="preserve">and it is not available at that quota.</w:t>
       </w:r>
     </w:p>
-    <w:bookmarkEnd w:id="257"/>
-    <w:bookmarkStart w:id="258" w:name="choosing-a-model-for-agent-mode"/>
+    <w:bookmarkEnd w:id="258"/>
+    <w:bookmarkStart w:id="259" w:name="choosing-a-model-for-agent-mode"/>
     <w:p>
       <w:pPr>
         <w:pStyle w:val="Heading4"/>
@@ -37589,8 +37679,8 @@
         <w:t xml:space="preserve">Observed 2026-08-20.</w:t>
       </w:r>
     </w:p>
-    <w:bookmarkEnd w:id="258"/>
-    <w:bookmarkStart w:id="265" w:name="Xeefb66738a7cdd8d123f77fc3c435ee9098e612"/>
+    <w:bookmarkEnd w:id="259"/>
+    <w:bookmarkStart w:id="266" w:name="Xeefb66738a7cdd8d123f77fc3c435ee9098e612"/>
     <w:p>
       <w:pPr>
         <w:pStyle w:val="Heading4"/>
@@ -38519,18 +38609,18 @@
                 <wp:inline>
                   <wp:extent cx="152400" cy="152400"/>
                   <wp:effectExtent b="0" l="0" r="0" t="0"/>
-                  <wp:docPr descr="" title="" id="259" name="Picture"/>
+                  <wp:docPr descr="" title="" id="260" name="Picture"/>
                   <a:graphic>
                     <a:graphicData uri="http://schemas.openxmlformats.org/drawingml/2006/picture">
                       <pic:pic>
                         <pic:nvPicPr>
-                          <pic:cNvPr descr="/opt/quarto/share/formats/docx/tip.png" id="260" name="Picture"/>
+                          <pic:cNvPr descr="/opt/quarto/share/formats/docx/tip.png" id="261" name="Picture"/>
                           <pic:cNvPicPr>
                             <a:picLocks noChangeArrowheads="1" noChangeAspect="1"/>
                           </pic:cNvPicPr>
                         </pic:nvPicPr>
                         <pic:blipFill>
-                          <a:blip r:embed="rId131"/>
+                          <a:blip r:embed="rId132"/>
                           <a:stretch>
                             <a:fillRect/>
                           </a:stretch>
@@ -38673,18 +38763,18 @@
                 <wp:inline>
                   <wp:extent cx="152400" cy="152400"/>
                   <wp:effectExtent b="0" l="0" r="0" t="0"/>
-                  <wp:docPr descr="" title="" id="261" name="Picture"/>
+                  <wp:docPr descr="" title="" id="262" name="Picture"/>
                   <a:graphic>
                     <a:graphicData uri="http://schemas.openxmlformats.org/drawingml/2006/picture">
                       <pic:pic>
                         <pic:nvPicPr>
-                          <pic:cNvPr descr="/opt/quarto/share/formats/docx/important.png" id="262" name="Picture"/>
+                          <pic:cNvPr descr="/opt/quarto/share/formats/docx/important.png" id="263" name="Picture"/>
                           <pic:cNvPicPr>
                             <a:picLocks noChangeArrowheads="1" noChangeAspect="1"/>
                           </pic:cNvPicPr>
                         </pic:nvPicPr>
                         <pic:blipFill>
-                          <a:blip r:embed="rId156"/>
+                          <a:blip r:embed="rId157"/>
                           <a:stretch>
                             <a:fillRect/>
                           </a:stretch>
@@ -38992,18 +39082,18 @@
                 <wp:inline>
                   <wp:extent cx="152400" cy="152400"/>
                   <wp:effectExtent b="0" l="0" r="0" t="0"/>
-                  <wp:docPr descr="" title="" id="263" name="Picture"/>
+                  <wp:docPr descr="" title="" id="264" name="Picture"/>
                   <a:graphic>
                     <a:graphicData uri="http://schemas.openxmlformats.org/drawingml/2006/picture">
                       <pic:pic>
                         <pic:nvPicPr>
-                          <pic:cNvPr descr="/opt/quarto/share/formats/docx/important.png" id="264" name="Picture"/>
+                          <pic:cNvPr descr="/opt/quarto/share/formats/docx/important.png" id="265" name="Picture"/>
                           <pic:cNvPicPr>
                             <a:picLocks noChangeArrowheads="1" noChangeAspect="1"/>
                           </pic:cNvPicPr>
                         </pic:nvPicPr>
                         <pic:blipFill>
-                          <a:blip r:embed="rId156"/>
+                          <a:blip r:embed="rId157"/>
                           <a:stretch>
                             <a:fillRect/>
                           </a:stretch>
@@ -39420,8 +39510,8 @@
         </w:tc>
       </w:tr>
     </w:tbl>
-    <w:bookmarkEnd w:id="265"/>
-    <w:bookmarkStart w:id="268" w:name="X2af9a430a52e3ae5bb0cdcfef1e620fec8864fe"/>
+    <w:bookmarkEnd w:id="266"/>
+    <w:bookmarkStart w:id="269" w:name="X2af9a430a52e3ae5bb0cdcfef1e620fec8864fe"/>
     <w:p>
       <w:pPr>
         <w:pStyle w:val="Heading4"/>
@@ -40289,18 +40379,18 @@
                 <wp:inline>
                   <wp:extent cx="152400" cy="152400"/>
                   <wp:effectExtent b="0" l="0" r="0" t="0"/>
-                  <wp:docPr descr="" title="" id="266" name="Picture"/>
+                  <wp:docPr descr="" title="" id="267" name="Picture"/>
                   <a:graphic>
                     <a:graphicData uri="http://schemas.openxmlformats.org/drawingml/2006/picture">
                       <pic:pic>
                         <pic:nvPicPr>
-                          <pic:cNvPr descr="/opt/quarto/share/formats/docx/note.png" id="267" name="Picture"/>
+                          <pic:cNvPr descr="/opt/quarto/share/formats/docx/note.png" id="268" name="Picture"/>
                           <pic:cNvPicPr>
                             <a:picLocks noChangeArrowheads="1" noChangeAspect="1"/>
                           </pic:cNvPicPr>
                         </pic:nvPicPr>
                         <pic:blipFill>
-                          <a:blip r:embed="rId120"/>
+                          <a:blip r:embed="rId121"/>
                           <a:stretch>
                             <a:fillRect/>
                           </a:stretch>
@@ -40451,9 +40541,9 @@
         </w:tc>
       </w:tr>
     </w:tbl>
-    <w:bookmarkEnd w:id="268"/>
     <w:bookmarkEnd w:id="269"/>
-    <w:bookmarkStart w:id="283" w:name="configuring-the-agent-environment"/>
+    <w:bookmarkEnd w:id="270"/>
+    <w:bookmarkStart w:id="284" w:name="configuring-the-agent-environment"/>
     <w:p>
       <w:pPr>
         <w:pStyle w:val="Heading1"/>
@@ -40509,7 +40599,7 @@
         <w:t xml:space="preserve">so that Copilot can build, test, and lint your code more reliably.</w:t>
       </w:r>
     </w:p>
-    <w:bookmarkStart w:id="270" w:name="why-configure-the-environment"/>
+    <w:bookmarkStart w:id="271" w:name="why-configure-the-environment"/>
     <w:p>
       <w:pPr>
         <w:pStyle w:val="Heading4"/>
@@ -40592,8 +40682,8 @@
         <w:t xml:space="preserve">Consistent development environment across all agent sessions</w:t>
       </w:r>
     </w:p>
-    <w:bookmarkEnd w:id="270"/>
-    <w:bookmarkStart w:id="271" w:name="file-location-and-structure"/>
+    <w:bookmarkEnd w:id="271"/>
+    <w:bookmarkStart w:id="272" w:name="file-location-and-structure"/>
     <w:p>
       <w:pPr>
         <w:pStyle w:val="Heading4"/>
@@ -40662,8 +40752,8 @@
         <w:t xml:space="preserve">.</w:t>
       </w:r>
     </w:p>
-    <w:bookmarkEnd w:id="271"/>
-    <w:bookmarkStart w:id="273" w:name="basic-configuration-example"/>
+    <w:bookmarkEnd w:id="272"/>
+    <w:bookmarkStart w:id="274" w:name="basic-configuration-example"/>
     <w:p>
       <w:pPr>
         <w:pStyle w:val="Heading4"/>
@@ -40682,7 +40772,7 @@
       <w:r>
         <w:t xml:space="preserve"> </w:t>
       </w:r>
-      <w:hyperlink r:id="rId272">
+      <w:hyperlink r:id="rId273">
         <w:r>
           <w:rPr>
             <w:rStyle w:val="VerbatimChar"/>
@@ -40697,8 +40787,8 @@
         <w:t xml:space="preserve">for a configuration adapted for R and Quarto projects.</w:t>
       </w:r>
     </w:p>
-    <w:bookmarkEnd w:id="273"/>
-    <w:bookmarkStart w:id="276" w:name="using-actionscheckout"/>
+    <w:bookmarkEnd w:id="274"/>
+    <w:bookmarkStart w:id="277" w:name="using-actionscheckout"/>
     <w:p>
       <w:pPr>
         <w:pStyle w:val="Heading4"/>
@@ -40726,7 +40816,7 @@
       <w:r>
         <w:t xml:space="preserve"> </w:t>
       </w:r>
-      <w:hyperlink r:id="rId274">
+      <w:hyperlink r:id="rId275">
         <w:r>
           <w:rPr>
             <w:rStyle w:val="VerbatimChar"/>
@@ -41065,7 +41155,7 @@
       <w:r>
         <w:t xml:space="preserve"> </w:t>
       </w:r>
-      <w:hyperlink r:id="rId275">
+      <w:hyperlink r:id="rId276">
         <w:r>
           <w:rPr>
             <w:rStyle w:val="Hyperlink"/>
@@ -41133,8 +41223,8 @@
         <w:t xml:space="preserve">including comparing changes and understanding the context of your pull request.</w:t>
       </w:r>
     </w:p>
-    <w:bookmarkEnd w:id="276"/>
-    <w:bookmarkStart w:id="277" w:name="configurable-options"/>
+    <w:bookmarkEnd w:id="277"/>
+    <w:bookmarkStart w:id="278" w:name="configurable-options"/>
     <w:p>
       <w:pPr>
         <w:pStyle w:val="Heading4"/>
@@ -41300,8 +41390,8 @@
         <w:t xml:space="preserve">All other workflow settings are ignored by Copilot.</w:t>
       </w:r>
     </w:p>
-    <w:bookmarkEnd w:id="277"/>
-    <w:bookmarkStart w:id="278" w:name="common-setup-tasks"/>
+    <w:bookmarkEnd w:id="278"/>
+    <w:bookmarkStart w:id="279" w:name="common-setup-tasks"/>
     <w:p>
       <w:pPr>
         <w:pStyle w:val="Heading4"/>
@@ -41916,8 +42006,8 @@
         <w:t xml:space="preserve"> r-lib/actions/setup-renv@v2</w:t>
       </w:r>
     </w:p>
-    <w:bookmarkEnd w:id="278"/>
-    <w:bookmarkStart w:id="279" w:name="environment-variables-and-secrets"/>
+    <w:bookmarkEnd w:id="279"/>
+    <w:bookmarkStart w:id="280" w:name="environment-variables-and-secrets"/>
     <w:p>
       <w:pPr>
         <w:pStyle w:val="Heading4"/>
@@ -42025,8 +42115,8 @@
         <w:t xml:space="preserve">Use secrets for sensitive values like API keys or passwords.</w:t>
       </w:r>
     </w:p>
-    <w:bookmarkEnd w:id="279"/>
-    <w:bookmarkStart w:id="280" w:name="testing-your-configuration"/>
+    <w:bookmarkEnd w:id="280"/>
+    <w:bookmarkStart w:id="281" w:name="testing-your-configuration"/>
     <w:p>
       <w:pPr>
         <w:pStyle w:val="Heading4"/>
@@ -42121,8 +42211,8 @@
         <w:t xml:space="preserve">and begin working with the current environment state.</w:t>
       </w:r>
     </w:p>
-    <w:bookmarkEnd w:id="280"/>
-    <w:bookmarkStart w:id="281" w:name="advanced-configuration"/>
+    <w:bookmarkEnd w:id="281"/>
+    <w:bookmarkStart w:id="282" w:name="advanced-configuration"/>
     <w:p>
       <w:pPr>
         <w:pStyle w:val="Heading4"/>
@@ -42442,8 +42532,8 @@
         <w:t xml:space="preserve">true</w:t>
       </w:r>
     </w:p>
-    <w:bookmarkEnd w:id="281"/>
-    <w:bookmarkStart w:id="282" w:name="further-reading-1"/>
+    <w:bookmarkEnd w:id="282"/>
+    <w:bookmarkStart w:id="283" w:name="further-reading-1"/>
     <w:p>
       <w:pPr>
         <w:pStyle w:val="Heading4"/>
@@ -42468,7 +42558,7 @@
       <w:r>
         <w:t xml:space="preserve"> </w:t>
       </w:r>
-      <w:hyperlink r:id="rId275">
+      <w:hyperlink r:id="rId276">
         <w:r>
           <w:rPr>
             <w:rStyle w:val="Hyperlink"/>
@@ -42480,9 +42570,9 @@
         <w:t xml:space="preserve">.</w:t>
       </w:r>
     </w:p>
-    <w:bookmarkEnd w:id="282"/>
     <w:bookmarkEnd w:id="283"/>
-    <w:bookmarkStart w:id="291" w:name="sec-ai-agent-skills"/>
+    <w:bookmarkEnd w:id="284"/>
+    <w:bookmarkStart w:id="292" w:name="sec-ai-agent-skills"/>
     <w:p>
       <w:pPr>
         <w:pStyle w:val="Heading1"/>
@@ -42495,7 +42585,7 @@
       <w:pPr>
         <w:pStyle w:val="FirstParagraph"/>
       </w:pPr>
-      <w:hyperlink r:id="rId284">
+      <w:hyperlink r:id="rId285">
         <w:r>
           <w:rPr>
             <w:rStyle w:val="Hyperlink"/>
@@ -42530,7 +42620,7 @@
       <w:r>
         <w:t xml:space="preserve"> </w:t>
       </w:r>
-      <w:hyperlink r:id="rId285">
+      <w:hyperlink r:id="rId286">
         <w:r>
           <w:rPr>
             <w:rStyle w:val="Hyperlink"/>
@@ -42551,7 +42641,7 @@
         <w:t xml:space="preserve">tool-agnostic format that any compatible agent can load.</w:t>
       </w:r>
     </w:p>
-    <w:bookmarkStart w:id="286" w:name="what-is-a-skill"/>
+    <w:bookmarkStart w:id="287" w:name="what-is-a-skill"/>
     <w:p>
       <w:pPr>
         <w:pStyle w:val="Heading4"/>
@@ -42621,7 +42711,7 @@
       <w:r>
         <w:t xml:space="preserve"> </w:t>
       </w:r>
-      <w:hyperlink r:id="rId285">
+      <w:hyperlink r:id="rId286">
         <w:r>
           <w:rPr>
             <w:rStyle w:val="Hyperlink"/>
@@ -42728,8 +42818,8 @@
         <w:t xml:space="preserve">└── assets/           # Optional: templates, resources</w:t>
       </w:r>
     </w:p>
-    <w:bookmarkEnd w:id="286"/>
-    <w:bookmarkStart w:id="287" w:name="how-agents-load-skills"/>
+    <w:bookmarkEnd w:id="287"/>
+    <w:bookmarkStart w:id="288" w:name="how-agents-load-skills"/>
     <w:p>
       <w:pPr>
         <w:pStyle w:val="Heading4"/>
@@ -42872,8 +42962,8 @@
         <w:t xml:space="preserve">so agents can maintain many skills with a small context footprint.</w:t>
       </w:r>
     </w:p>
-    <w:bookmarkEnd w:id="287"/>
-    <w:bookmarkStart w:id="288" w:name="why-use-skills"/>
+    <w:bookmarkEnd w:id="288"/>
+    <w:bookmarkStart w:id="289" w:name="why-use-skills"/>
     <w:p>
       <w:pPr>
         <w:pStyle w:val="Heading4"/>
@@ -42959,8 +43049,8 @@
         <w:t xml:space="preserve">: Build a skill once and use it across any skills-compatible agent</w:t>
       </w:r>
     </w:p>
-    <w:bookmarkEnd w:id="288"/>
-    <w:bookmarkStart w:id="290" w:name="further-reading-2"/>
+    <w:bookmarkEnd w:id="289"/>
+    <w:bookmarkStart w:id="291" w:name="further-reading-2"/>
     <w:p>
       <w:pPr>
         <w:pStyle w:val="Heading4"/>
@@ -42985,7 +43075,7 @@
       <w:r>
         <w:t xml:space="preserve"> </w:t>
       </w:r>
-      <w:hyperlink r:id="rId284">
+      <w:hyperlink r:id="rId285">
         <w:r>
           <w:rPr>
             <w:rStyle w:val="Hyperlink"/>
@@ -43100,7 +43190,7 @@
       <w:r>
         <w:t xml:space="preserve"> </w:t>
       </w:r>
-      <w:hyperlink r:id="rId289">
+      <w:hyperlink r:id="rId290">
         <w:r>
           <w:rPr>
             <w:rStyle w:val="Hyperlink"/>
@@ -43127,9 +43217,9 @@
         <w:t xml:space="preserve">including user-level skills, hooks, and subagents, synced across machines via Git.</w:t>
       </w:r>
     </w:p>
-    <w:bookmarkEnd w:id="290"/>
     <w:bookmarkEnd w:id="291"/>
-    <w:bookmarkStart w:id="297" w:name="sec-ai-useful-plugins"/>
+    <w:bookmarkEnd w:id="292"/>
+    <w:bookmarkStart w:id="298" w:name="sec-ai-useful-plugins"/>
     <w:p>
       <w:pPr>
         <w:pStyle w:val="Heading1"/>
@@ -43148,7 +43238,7 @@
       <w:r>
         <w:t xml:space="preserve"> </w:t>
       </w:r>
-      <w:hyperlink r:id="rId292">
+      <w:hyperlink r:id="rId293">
         <w:r>
           <w:rPr>
             <w:rStyle w:val="Hyperlink"/>
@@ -43185,7 +43275,7 @@
       <w:pPr>
         <w:pStyle w:val="BodyText"/>
       </w:pPr>
-      <w:hyperlink r:id="rId293">
+      <w:hyperlink r:id="rId294">
         <w:r>
           <w:rPr>
             <w:rStyle w:val="Hyperlink"/>
@@ -43247,7 +43337,7 @@
       <w:r>
         <w:t xml:space="preserve"> </w:t>
       </w:r>
-      <w:hyperlink r:id="rId294">
+      <w:hyperlink r:id="rId295">
         <w:r>
           <w:rPr>
             <w:rStyle w:val="Hyperlink"/>
@@ -43319,7 +43409,7 @@
           <w:numId w:val="1121"/>
         </w:numPr>
       </w:pPr>
-      <w:hyperlink r:id="rId295">
+      <w:hyperlink r:id="rId296">
         <w:r>
           <w:rPr>
             <w:rStyle w:val="Hyperlink"/>
@@ -43385,7 +43475,7 @@
       <w:r>
         <w:t xml:space="preserve"> </w:t>
       </w:r>
-      <w:hyperlink r:id="rId289">
+      <w:hyperlink r:id="rId290">
         <w:r>
           <w:rPr>
             <w:rStyle w:val="VerbatimChar"/>
@@ -43402,7 +43492,7 @@
       <w:r>
         <w:t xml:space="preserve"> </w:t>
       </w:r>
-      <w:hyperlink r:id="rId296">
+      <w:hyperlink r:id="rId297">
         <w:r>
           <w:rPr>
             <w:rStyle w:val="VerbatimChar"/>
@@ -43475,8 +43565,8 @@
         <w:t xml:space="preserve">is the worked example of what the corpus contains.</w:t>
       </w:r>
     </w:p>
-    <w:bookmarkEnd w:id="297"/>
-    <w:bookmarkStart w:id="317" w:name="sec-ai-customization"/>
+    <w:bookmarkEnd w:id="298"/>
+    <w:bookmarkStart w:id="318" w:name="sec-ai-customization"/>
     <w:p>
       <w:pPr>
         <w:pStyle w:val="Heading1"/>
@@ -43544,7 +43634,7 @@
       <w:r>
         <w:t xml:space="preserve"> </w:t>
       </w:r>
-      <w:hyperlink r:id="rId41">
+      <w:hyperlink r:id="rId42">
         <w:r>
           <w:rPr>
             <w:rStyle w:val="Hyperlink"/>
@@ -43601,7 +43691,7 @@
         <w:t xml:space="preserve">.</w:t>
       </w:r>
     </w:p>
-    <w:bookmarkStart w:id="299" w:name="the-question-that-picks-the-mechanism"/>
+    <w:bookmarkStart w:id="300" w:name="the-question-that-picks-the-mechanism"/>
     <w:p>
       <w:pPr>
         <w:pStyle w:val="Heading4"/>
@@ -43702,7 +43792,7 @@
       <w:r>
         <w:t xml:space="preserve"> </w:t>
       </w:r>
-      <w:hyperlink r:id="rId298">
+      <w:hyperlink r:id="rId299">
         <w:r>
           <w:rPr>
             <w:rStyle w:val="Hyperlink"/>
@@ -43787,8 +43877,8 @@
         <w:t xml:space="preserve">.</w:t>
       </w:r>
     </w:p>
-    <w:bookmarkEnd w:id="299"/>
-    <w:bookmarkStart w:id="301" w:name="instruction-files-always-on-context"/>
+    <w:bookmarkEnd w:id="300"/>
+    <w:bookmarkStart w:id="302" w:name="instruction-files-always-on-context"/>
     <w:p>
       <w:pPr>
         <w:pStyle w:val="Heading4"/>
@@ -43816,7 +43906,7 @@
       <w:r>
         <w:t xml:space="preserve"> </w:t>
       </w:r>
-      <w:hyperlink r:id="rId30">
+      <w:hyperlink r:id="rId31">
         <w:r>
           <w:rPr>
             <w:rStyle w:val="VerbatimChar"/>
@@ -43892,7 +43982,7 @@
       <w:r>
         <w:t xml:space="preserve"> </w:t>
       </w:r>
-      <w:hyperlink r:id="rId298">
+      <w:hyperlink r:id="rId299">
         <w:r>
           <w:rPr>
             <w:rStyle w:val="Hyperlink"/>
@@ -44035,7 +44125,7 @@
       <w:r>
         <w:t xml:space="preserve"> </w:t>
       </w:r>
-      <w:hyperlink r:id="rId298">
+      <w:hyperlink r:id="rId299">
         <w:r>
           <w:rPr>
             <w:rStyle w:val="Hyperlink"/>
@@ -44139,7 +44229,7 @@
       <w:r>
         <w:t xml:space="preserve"> </w:t>
       </w:r>
-      <w:hyperlink r:id="rId300">
+      <w:hyperlink r:id="rId301">
         <w:r>
           <w:rPr>
             <w:rStyle w:val="Hyperlink"/>
@@ -44259,8 +44349,8 @@
         <w:t xml:space="preserve">and guaranteed nothing about acting on it alike.</w:t>
       </w:r>
     </w:p>
-    <w:bookmarkEnd w:id="301"/>
-    <w:bookmarkStart w:id="302" w:name="workspace-rules-and-activation-modes"/>
+    <w:bookmarkEnd w:id="302"/>
+    <w:bookmarkStart w:id="303" w:name="workspace-rules-and-activation-modes"/>
     <w:p>
       <w:pPr>
         <w:pStyle w:val="Heading4"/>
@@ -44529,8 +44619,8 @@
         <w:t xml:space="preserve">).</w:t>
       </w:r>
     </w:p>
-    <w:bookmarkEnd w:id="302"/>
-    <w:bookmarkStart w:id="305" w:name="skills-and-the-commands-that-became-them"/>
+    <w:bookmarkEnd w:id="303"/>
+    <w:bookmarkStart w:id="306" w:name="skills-and-the-commands-that-became-them"/>
     <w:p>
       <w:pPr>
         <w:pStyle w:val="Heading4"/>
@@ -44555,7 +44645,7 @@
       <w:r>
         <w:t xml:space="preserve"> </w:t>
       </w:r>
-      <w:hyperlink r:id="rId303">
+      <w:hyperlink r:id="rId304">
         <w:r>
           <w:rPr>
             <w:rStyle w:val="Hyperlink"/>
@@ -44994,7 +45084,7 @@
       <w:r>
         <w:t xml:space="preserve"> </w:t>
       </w:r>
-      <w:hyperlink r:id="rId285">
+      <w:hyperlink r:id="rId286">
         <w:r>
           <w:rPr>
             <w:rStyle w:val="Hyperlink"/>
@@ -45113,7 +45203,7 @@
       <w:r>
         <w:t xml:space="preserve"> </w:t>
       </w:r>
-      <w:hyperlink r:id="rId304">
+      <w:hyperlink r:id="rId305">
         <w:r>
           <w:rPr>
             <w:rStyle w:val="Hyperlink"/>
@@ -45179,8 +45269,8 @@
         <w:t xml:space="preserve">a competitor’s directory name.</w:t>
       </w:r>
     </w:p>
-    <w:bookmarkEnd w:id="305"/>
-    <w:bookmarkStart w:id="307" w:name="subagents-delegating-to-a-fresh-context"/>
+    <w:bookmarkEnd w:id="306"/>
+    <w:bookmarkStart w:id="308" w:name="subagents-delegating-to-a-fresh-context"/>
     <w:p>
       <w:pPr>
         <w:pStyle w:val="Heading4"/>
@@ -45329,7 +45419,7 @@
       <w:r>
         <w:t xml:space="preserve"> </w:t>
       </w:r>
-      <w:hyperlink r:id="rId306">
+      <w:hyperlink r:id="rId307">
         <w:r>
           <w:rPr>
             <w:rStyle w:val="Hyperlink"/>
@@ -45352,7 +45442,7 @@
       <w:r>
         <w:t xml:space="preserve"> </w:t>
       </w:r>
-      <w:hyperlink r:id="rId303">
+      <w:hyperlink r:id="rId304">
         <w:r>
           <w:rPr>
             <w:rStyle w:val="Hyperlink"/>
@@ -45417,8 +45507,8 @@
         <w:t xml:space="preserve">The @-mention controls which subagent Claude invokes, not what prompt it receives.</w:t>
       </w:r>
     </w:p>
-    <w:bookmarkEnd w:id="307"/>
-    <w:bookmarkStart w:id="309" w:name="Xf185306762ce2c53b5a7ee53d7e6e74f0af7607"/>
+    <w:bookmarkEnd w:id="308"/>
+    <w:bookmarkStart w:id="310" w:name="Xf185306762ce2c53b5a7ee53d7e6e74f0af7607"/>
     <w:p>
       <w:pPr>
         <w:pStyle w:val="Heading4"/>
@@ -45462,7 +45552,7 @@
       <w:r>
         <w:t xml:space="preserve"> </w:t>
       </w:r>
-      <w:hyperlink r:id="rId308">
+      <w:hyperlink r:id="rId309">
         <w:r>
           <w:rPr>
             <w:rStyle w:val="Hyperlink"/>
@@ -45497,7 +45587,7 @@
       <w:r>
         <w:t xml:space="preserve"> </w:t>
       </w:r>
-      <w:hyperlink r:id="rId298">
+      <w:hyperlink r:id="rId299">
         <w:r>
           <w:rPr>
             <w:rStyle w:val="Hyperlink"/>
@@ -45716,8 +45806,8 @@
         <w:t xml:space="preserve">hook decides.</w:t>
       </w:r>
     </w:p>
-    <w:bookmarkEnd w:id="309"/>
-    <w:bookmarkStart w:id="311" w:name="X661523c6623257371ddb85eca0962e6d24391f6"/>
+    <w:bookmarkEnd w:id="310"/>
+    <w:bookmarkStart w:id="312" w:name="X661523c6623257371ddb85eca0962e6d24391f6"/>
     <w:p>
       <w:pPr>
         <w:pStyle w:val="Heading4"/>
@@ -45799,7 +45889,7 @@
       <w:r>
         <w:t xml:space="preserve"> </w:t>
       </w:r>
-      <w:hyperlink r:id="rId310">
+      <w:hyperlink r:id="rId311">
         <w:r>
           <w:rPr>
             <w:rStyle w:val="Hyperlink"/>
@@ -45958,8 +46048,8 @@
         <w:t xml:space="preserve">a repository can tighten what you allow, and cannot quietly loosen it.</w:t>
       </w:r>
     </w:p>
-    <w:bookmarkEnd w:id="311"/>
-    <w:bookmarkStart w:id="312" w:name="Xb9141ee8bf4b59ff8b077a4423dd913151d282a"/>
+    <w:bookmarkEnd w:id="312"/>
+    <w:bookmarkStart w:id="313" w:name="Xb9141ee8bf4b59ff8b077a4423dd913151d282a"/>
     <w:p>
       <w:pPr>
         <w:pStyle w:val="Heading4"/>
@@ -45997,7 +46087,7 @@
       <w:r>
         <w:t xml:space="preserve"> </w:t>
       </w:r>
-      <w:hyperlink r:id="rId29">
+      <w:hyperlink r:id="rId30">
         <w:r>
           <w:rPr>
             <w:rStyle w:val="Hyperlink"/>
@@ -46092,8 +46182,8 @@
         <w:t xml:space="preserve">covers configuration and its failure modes.</w:t>
       </w:r>
     </w:p>
-    <w:bookmarkEnd w:id="312"/>
-    <w:bookmarkStart w:id="313" w:name="choosing"/>
+    <w:bookmarkEnd w:id="313"/>
+    <w:bookmarkStart w:id="314" w:name="choosing"/>
     <w:p>
       <w:pPr>
         <w:pStyle w:val="Heading4"/>
@@ -46450,8 +46540,8 @@
         </w:tc>
       </w:tr>
     </w:tbl>
-    <w:bookmarkEnd w:id="313"/>
-    <w:bookmarkStart w:id="315" w:name="what-travels-between-tools"/>
+    <w:bookmarkEnd w:id="314"/>
+    <w:bookmarkStart w:id="316" w:name="what-travels-between-tools"/>
     <w:p>
       <w:pPr>
         <w:pStyle w:val="Heading4"/>
@@ -46904,7 +46994,7 @@
             <w:pPr>
               <w:pStyle w:val="Compact"/>
             </w:pPr>
-            <w:hyperlink r:id="rId314">
+            <w:hyperlink r:id="rId315">
               <w:r>
                 <w:rPr>
                   <w:rStyle w:val="Hyperlink"/>
@@ -47001,8 +47091,8 @@
         <w:t xml:space="preserve">and are worth writing as enforcement of rules that are also stated somewhere portable.</w:t>
       </w:r>
     </w:p>
-    <w:bookmarkEnd w:id="315"/>
-    <w:bookmarkStart w:id="316" w:name="a-worked-example"/>
+    <w:bookmarkEnd w:id="316"/>
+    <w:bookmarkStart w:id="317" w:name="a-worked-example"/>
     <w:p>
       <w:pPr>
         <w:pStyle w:val="Heading4"/>
@@ -47021,7 +47111,7 @@
       <w:r>
         <w:t xml:space="preserve"> </w:t>
       </w:r>
-      <w:hyperlink r:id="rId289">
+      <w:hyperlink r:id="rId290">
         <w:r>
           <w:rPr>
             <w:rStyle w:val="VerbatimChar"/>
@@ -47277,9 +47367,9 @@
         <w:t xml:space="preserve">globs attach them only when you edit a matching file.</w:t>
       </w:r>
     </w:p>
-    <w:bookmarkEnd w:id="316"/>
     <w:bookmarkEnd w:id="317"/>
-    <w:bookmarkStart w:id="322" w:name="sec-ai-config-install"/>
+    <w:bookmarkEnd w:id="318"/>
+    <w:bookmarkStart w:id="323" w:name="sec-ai-config-install"/>
     <w:p>
       <w:pPr>
         <w:pStyle w:val="Heading1"/>
@@ -47385,7 +47475,7 @@
         <w:t xml:space="preserve">and a capability simply goes missing with no message that it existed.</w:t>
       </w:r>
     </w:p>
-    <w:bookmarkStart w:id="318" w:name="X09c076bdbd05e35ade785c409b9eb4387af137d"/>
+    <w:bookmarkStart w:id="319" w:name="X09c076bdbd05e35ade785c409b9eb4387af137d"/>
     <w:p>
       <w:pPr>
         <w:pStyle w:val="Heading4"/>
@@ -47619,8 +47709,8 @@
         <w:t xml:space="preserve">Pick one path.</w:t>
       </w:r>
     </w:p>
-    <w:bookmarkEnd w:id="318"/>
-    <w:bookmarkStart w:id="319" w:name="the-.claude-layout"/>
+    <w:bookmarkEnd w:id="319"/>
+    <w:bookmarkStart w:id="320" w:name="the-.claude-layout"/>
     <w:p>
       <w:pPr>
         <w:pStyle w:val="Heading4"/>
@@ -47865,8 +47955,8 @@
         <w:t xml:space="preserve">So verify both, and read the two results separately.</w:t>
       </w:r>
     </w:p>
-    <w:bookmarkEnd w:id="319"/>
-    <w:bookmarkStart w:id="320" w:name="one-plugin-per-capability"/>
+    <w:bookmarkEnd w:id="320"/>
+    <w:bookmarkStart w:id="321" w:name="one-plugin-per-capability"/>
     <w:p>
       <w:pPr>
         <w:pStyle w:val="Heading4"/>
@@ -47959,8 +48049,8 @@
         <w:t xml:space="preserve">Keep one copy enabled.</w:t>
       </w:r>
     </w:p>
-    <w:bookmarkEnd w:id="320"/>
-    <w:bookmarkStart w:id="321" w:name="failure-modes-and-their-symptoms"/>
+    <w:bookmarkEnd w:id="321"/>
+    <w:bookmarkStart w:id="322" w:name="failure-modes-and-their-symptoms"/>
     <w:p>
       <w:pPr>
         <w:pStyle w:val="Heading4"/>
@@ -48205,9 +48295,9 @@
         <w:t xml:space="preserve">suspect the install before you suspect the rule.</w:t>
       </w:r>
     </w:p>
-    <w:bookmarkEnd w:id="321"/>
     <w:bookmarkEnd w:id="322"/>
-    <w:bookmarkStart w:id="329" w:name="sec-ai-claude-cloud-env"/>
+    <w:bookmarkEnd w:id="323"/>
+    <w:bookmarkStart w:id="330" w:name="sec-ai-claude-cloud-env"/>
     <w:p>
       <w:pPr>
         <w:pStyle w:val="Heading1"/>
@@ -48249,7 +48339,7 @@
       <w:r>
         <w:t xml:space="preserve"> </w:t>
       </w:r>
-      <w:hyperlink r:id="rId323">
+      <w:hyperlink r:id="rId324">
         <w:r>
           <w:rPr>
             <w:rStyle w:val="Hyperlink"/>
@@ -48447,7 +48537,7 @@
         <w:t xml:space="preserve">for example to install dependencies.</w:t>
       </w:r>
     </w:p>
-    <w:bookmarkStart w:id="328" w:name="X99b85cd9c84d17a9c31061ff898ea0b26b46932"/>
+    <w:bookmarkStart w:id="329" w:name="X99b85cd9c84d17a9c31061ff898ea0b26b46932"/>
     <w:p>
       <w:pPr>
         <w:pStyle w:val="Heading4"/>
@@ -48608,7 +48698,7 @@
       <w:r>
         <w:t xml:space="preserve"> </w:t>
       </w:r>
-      <w:hyperlink r:id="rId323">
+      <w:hyperlink r:id="rId324">
         <w:r>
           <w:rPr>
             <w:rStyle w:val="Hyperlink"/>
@@ -48703,18 +48793,18 @@
                 <wp:inline>
                   <wp:extent cx="152400" cy="152400"/>
                   <wp:effectExtent b="0" l="0" r="0" t="0"/>
-                  <wp:docPr descr="" title="" id="324" name="Picture"/>
+                  <wp:docPr descr="" title="" id="325" name="Picture"/>
                   <a:graphic>
                     <a:graphicData uri="http://schemas.openxmlformats.org/drawingml/2006/picture">
                       <pic:pic>
                         <pic:nvPicPr>
-                          <pic:cNvPr descr="/opt/quarto/share/formats/docx/note.png" id="325" name="Picture"/>
+                          <pic:cNvPr descr="/opt/quarto/share/formats/docx/note.png" id="326" name="Picture"/>
                           <pic:cNvPicPr>
                             <a:picLocks noChangeArrowheads="1" noChangeAspect="1"/>
                           </pic:cNvPicPr>
                         </pic:nvPicPr>
                         <pic:blipFill>
-                          <a:blip r:embed="rId120"/>
+                          <a:blip r:embed="rId121"/>
                           <a:stretch>
                             <a:fillRect/>
                           </a:stretch>
@@ -48824,7 +48914,7 @@
       <w:r>
         <w:t xml:space="preserve"> </w:t>
       </w:r>
-      <w:hyperlink r:id="rId326">
+      <w:hyperlink r:id="rId327">
         <w:r>
           <w:rPr>
             <w:rStyle w:val="Hyperlink"/>
@@ -48841,7 +48931,7 @@
       <w:r>
         <w:t xml:space="preserve"> </w:t>
       </w:r>
-      <w:hyperlink r:id="rId327">
+      <w:hyperlink r:id="rId328">
         <w:r>
           <w:rPr>
             <w:rStyle w:val="Hyperlink"/>
@@ -48853,9 +48943,9 @@
         <w:t xml:space="preserve">.</w:t>
       </w:r>
     </w:p>
-    <w:bookmarkEnd w:id="328"/>
     <w:bookmarkEnd w:id="329"/>
-    <w:bookmarkStart w:id="336" w:name="sec-ai-codex-github-review"/>
+    <w:bookmarkEnd w:id="330"/>
+    <w:bookmarkStart w:id="337" w:name="sec-ai-codex-github-review"/>
     <w:p>
       <w:pPr>
         <w:pStyle w:val="Heading1"/>
@@ -48890,7 +48980,7 @@
         <w:t xml:space="preserve">It does not require you to build a separate GitHub Action.</w:t>
       </w:r>
     </w:p>
-    <w:bookmarkStart w:id="330" w:name="prerequisites"/>
+    <w:bookmarkStart w:id="331" w:name="prerequisites"/>
     <w:p>
       <w:pPr>
         <w:pStyle w:val="Heading4"/>
@@ -49015,8 +49105,8 @@
         <w:t xml:space="preserve">but it lets the reviewer follow repository-specific guidance.</w:t>
       </w:r>
     </w:p>
-    <w:bookmarkEnd w:id="330"/>
-    <w:bookmarkStart w:id="331" w:name="requesting-and-automating-reviews"/>
+    <w:bookmarkEnd w:id="331"/>
+    <w:bookmarkStart w:id="332" w:name="requesting-and-automating-reviews"/>
     <w:p>
       <w:pPr>
         <w:pStyle w:val="Heading4"/>
@@ -49167,8 +49257,8 @@
         <w:t xml:space="preserve">It can overlap with the general review’s security findings.</w:t>
       </w:r>
     </w:p>
-    <w:bookmarkEnd w:id="331"/>
-    <w:bookmarkStart w:id="332" w:name="Xcb3957535c68d0d36c3ddb2e418364eec25d64f"/>
+    <w:bookmarkEnd w:id="332"/>
+    <w:bookmarkStart w:id="333" w:name="Xcb3957535c68d0d36c3ddb2e418364eec25d64f"/>
     <w:p>
       <w:pPr>
         <w:pStyle w:val="Heading4"/>
@@ -49454,8 +49544,8 @@
         <w:t xml:space="preserve">both sides must permit the integration.</w:t>
       </w:r>
     </w:p>
-    <w:bookmarkEnd w:id="332"/>
-    <w:bookmarkStart w:id="333" w:name="X5db1f82696679006fc24d2d9f8d9499d172a6a5"/>
+    <w:bookmarkEnd w:id="333"/>
+    <w:bookmarkStart w:id="334" w:name="X5db1f82696679006fc24d2d9f8d9499d172a6a5"/>
     <w:p>
       <w:pPr>
         <w:pStyle w:val="Heading4"/>
@@ -49552,8 +49642,8 @@
         <w:t xml:space="preserve">Do not copy personal ChatGPT or Codex login credentials into CI secrets.</w:t>
       </w:r>
     </w:p>
-    <w:bookmarkEnd w:id="333"/>
-    <w:bookmarkStart w:id="335" w:name="adding-repository-specific-review-rules"/>
+    <w:bookmarkEnd w:id="334"/>
+    <w:bookmarkStart w:id="336" w:name="adding-repository-specific-review-rules"/>
     <w:p>
       <w:pPr>
         <w:pStyle w:val="Heading4"/>
@@ -49787,7 +49877,7 @@
       <w:r>
         <w:t xml:space="preserve"> </w:t>
       </w:r>
-      <w:hyperlink r:id="rId334">
+      <w:hyperlink r:id="rId335">
         <w:r>
           <w:rPr>
             <w:rStyle w:val="Hyperlink"/>
@@ -49799,9 +49889,9 @@
         <w:t xml:space="preserve">.</w:t>
       </w:r>
     </w:p>
-    <w:bookmarkEnd w:id="335"/>
     <w:bookmarkEnd w:id="336"/>
-    <w:bookmarkStart w:id="351" w:name="sec-ai-claude-code-action-review"/>
+    <w:bookmarkEnd w:id="337"/>
+    <w:bookmarkStart w:id="352" w:name="sec-ai-claude-code-action-review"/>
     <w:p>
       <w:pPr>
         <w:pStyle w:val="Heading1"/>
@@ -49820,7 +49910,7 @@
       <w:r>
         <w:t xml:space="preserve"> </w:t>
       </w:r>
-      <w:hyperlink r:id="rId337">
+      <w:hyperlink r:id="rId338">
         <w:r>
           <w:rPr>
             <w:rStyle w:val="Hyperlink"/>
@@ -49926,7 +50016,7 @@
         <w:t xml:space="preserve">paths can move).</w:t>
       </w:r>
     </w:p>
-    <w:bookmarkStart w:id="341" w:name="one-action-many-behaviors"/>
+    <w:bookmarkStart w:id="342" w:name="one-action-many-behaviors"/>
     <w:p>
       <w:pPr>
         <w:pStyle w:val="Heading4"/>
@@ -49945,7 +50035,7 @@
       <w:r>
         <w:t xml:space="preserve"> </w:t>
       </w:r>
-      <w:hyperlink r:id="rId338">
+      <w:hyperlink r:id="rId339">
         <w:r>
           <w:rPr>
             <w:rStyle w:val="VerbatimChar"/>
@@ -50104,7 +50194,7 @@
       <w:r>
         <w:t xml:space="preserve"> </w:t>
       </w:r>
-      <w:hyperlink r:id="rId339">
+      <w:hyperlink r:id="rId340">
         <w:r>
           <w:rPr>
             <w:rStyle w:val="VerbatimChar"/>
@@ -50142,7 +50232,7 @@
       <w:r>
         <w:t xml:space="preserve"> </w:t>
       </w:r>
-      <w:hyperlink r:id="rId340">
+      <w:hyperlink r:id="rId341">
         <w:r>
           <w:rPr>
             <w:rStyle w:val="VerbatimChar"/>
@@ -50166,8 +50256,8 @@
         <w:t xml:space="preserve">not the in-repo path.</w:t>
       </w:r>
     </w:p>
-    <w:bookmarkEnd w:id="341"/>
-    <w:bookmarkStart w:id="346" w:name="where-the-repository-reviews-its-own-prs"/>
+    <w:bookmarkEnd w:id="342"/>
+    <w:bookmarkStart w:id="347" w:name="where-the-repository-reviews-its-own-prs"/>
     <w:p>
       <w:pPr>
         <w:pStyle w:val="Heading4"/>
@@ -50183,7 +50273,7 @@
           <w:numId w:val="1138"/>
         </w:numPr>
       </w:pPr>
-      <w:hyperlink r:id="rId342">
+      <w:hyperlink r:id="rId343">
         <w:r>
           <w:rPr>
             <w:rStyle w:val="VerbatimChar"/>
@@ -50268,7 +50358,7 @@
           <w:numId w:val="1138"/>
         </w:numPr>
       </w:pPr>
-      <w:hyperlink r:id="rId343">
+      <w:hyperlink r:id="rId344">
         <w:r>
           <w:rPr>
             <w:rStyle w:val="VerbatimChar"/>
@@ -50312,7 +50402,7 @@
       <w:r>
         <w:t xml:space="preserve"> </w:t>
       </w:r>
-      <w:hyperlink r:id="rId344">
+      <w:hyperlink r:id="rId345">
         <w:r>
           <w:rPr>
             <w:rStyle w:val="VerbatimChar"/>
@@ -50426,7 +50516,7 @@
           <w:numId w:val="1138"/>
         </w:numPr>
       </w:pPr>
-      <w:hyperlink r:id="rId345">
+      <w:hyperlink r:id="rId346">
         <w:r>
           <w:rPr>
             <w:rStyle w:val="VerbatimChar"/>
@@ -50453,8 +50543,8 @@
         <w:t xml:space="preserve">are copy-paste templates for adding review to another repository.</w:t>
       </w:r>
     </w:p>
-    <w:bookmarkEnd w:id="346"/>
-    <w:bookmarkStart w:id="347" w:name="adding-review-to-your-own-repository"/>
+    <w:bookmarkEnd w:id="347"/>
+    <w:bookmarkStart w:id="348" w:name="adding-review-to-your-own-repository"/>
     <w:p>
       <w:pPr>
         <w:pStyle w:val="Heading4"/>
@@ -50620,8 +50710,8 @@
         <w:t xml:space="preserve">so you edit it the way you would edit any review checklist.</w:t>
       </w:r>
     </w:p>
-    <w:bookmarkEnd w:id="347"/>
-    <w:bookmarkStart w:id="349" w:name="reviewer-versus-claude-agent"/>
+    <w:bookmarkEnd w:id="348"/>
+    <w:bookmarkStart w:id="350" w:name="reviewer-versus-claude-agent"/>
     <w:p>
       <w:pPr>
         <w:pStyle w:val="Heading4"/>
@@ -50655,7 +50745,7 @@
       <w:r>
         <w:t xml:space="preserve"> </w:t>
       </w:r>
-      <w:hyperlink r:id="rId348">
+      <w:hyperlink r:id="rId349">
         <w:r>
           <w:rPr>
             <w:rStyle w:val="VerbatimChar"/>
@@ -50903,8 +50993,8 @@
         <w:t xml:space="preserve">-triggered workflow does.</w:t>
       </w:r>
     </w:p>
-    <w:bookmarkEnd w:id="349"/>
-    <w:bookmarkStart w:id="350" w:name="relation-to-codex-native-review"/>
+    <w:bookmarkEnd w:id="350"/>
+    <w:bookmarkStart w:id="351" w:name="relation-to-codex-native-review"/>
     <w:p>
       <w:pPr>
         <w:pStyle w:val="Heading4"/>
@@ -50977,9 +51067,9 @@
         <w:t xml:space="preserve">and triggering events are all visible and editable in your repository.</w:t>
       </w:r>
     </w:p>
-    <w:bookmarkEnd w:id="350"/>
     <w:bookmarkEnd w:id="351"/>
-    <w:bookmarkStart w:id="361" w:name="sec-ai-pr-activity-notifications"/>
+    <w:bookmarkEnd w:id="352"/>
+    <w:bookmarkStart w:id="362" w:name="sec-ai-pr-activity-notifications"/>
     <w:p>
       <w:pPr>
         <w:pStyle w:val="Heading1"/>
@@ -51323,7 +51413,7 @@
         </w:tc>
       </w:tr>
     </w:tbl>
-    <w:bookmarkStart w:id="352" w:name="the-channel-an-agent-controls"/>
+    <w:bookmarkStart w:id="353" w:name="the-channel-an-agent-controls"/>
     <w:p>
       <w:pPr>
         <w:pStyle w:val="Heading4"/>
@@ -51597,8 +51687,8 @@
         <w:t xml:space="preserve">real state, not a replacement for it.</w:t>
       </w:r>
     </w:p>
-    <w:bookmarkEnd w:id="352"/>
-    <w:bookmarkStart w:id="353" w:name="the-channel-only-a-human-controls"/>
+    <w:bookmarkEnd w:id="353"/>
+    <w:bookmarkStart w:id="354" w:name="the-channel-only-a-human-controls"/>
     <w:p>
       <w:pPr>
         <w:pStyle w:val="Heading4"/>
@@ -51901,8 +51991,8 @@
         <w:t xml:space="preserve">for the web-session context these run in.</w:t>
       </w:r>
     </w:p>
-    <w:bookmarkEnd w:id="353"/>
-    <w:bookmarkStart w:id="354" w:name="the-instruction-template-is-boilerplate"/>
+    <w:bookmarkEnd w:id="354"/>
+    <w:bookmarkStart w:id="355" w:name="the-instruction-template-is-boilerplate"/>
     <w:p>
       <w:pPr>
         <w:pStyle w:val="Heading4"/>
@@ -52168,8 +52258,8 @@
         <w:t xml:space="preserve">rather than as an instruction that a fix is owed.</w:t>
       </w:r>
     </w:p>
-    <w:bookmarkEnd w:id="354"/>
-    <w:bookmarkStart w:id="355" w:name="X3e28e99804e56791cb9e57e9eb83869f0ead0b2"/>
+    <w:bookmarkEnd w:id="355"/>
+    <w:bookmarkStart w:id="356" w:name="X3e28e99804e56791cb9e57e9eb83869f0ead0b2"/>
     <w:p>
       <w:pPr>
         <w:pStyle w:val="Heading4"/>
@@ -52298,8 +52388,8 @@
         <w:t xml:space="preserve">Toggling one says nothing about the other.</w:t>
       </w:r>
     </w:p>
-    <w:bookmarkEnd w:id="355"/>
-    <w:bookmarkStart w:id="360" w:name="treat-what-arrives-as-untrusted"/>
+    <w:bookmarkEnd w:id="356"/>
+    <w:bookmarkStart w:id="361" w:name="treat-what-arrives-as-untrusted"/>
     <w:p>
       <w:pPr>
         <w:pStyle w:val="Heading4"/>
@@ -52668,18 +52758,18 @@
                 <wp:inline>
                   <wp:extent cx="152400" cy="152400"/>
                   <wp:effectExtent b="0" l="0" r="0" t="0"/>
-                  <wp:docPr descr="" title="" id="356" name="Picture"/>
+                  <wp:docPr descr="" title="" id="357" name="Picture"/>
                   <a:graphic>
                     <a:graphicData uri="http://schemas.openxmlformats.org/drawingml/2006/picture">
                       <pic:pic>
                         <pic:nvPicPr>
-                          <pic:cNvPr descr="/opt/quarto/share/formats/docx/warning.png" id="357" name="Picture"/>
+                          <pic:cNvPr descr="/opt/quarto/share/formats/docx/warning.png" id="358" name="Picture"/>
                           <pic:cNvPicPr>
                             <a:picLocks noChangeArrowheads="1" noChangeAspect="1"/>
                           </pic:cNvPicPr>
                         </pic:nvPicPr>
                         <pic:blipFill>
-                          <a:blip r:embed="rId105"/>
+                          <a:blip r:embed="rId106"/>
                           <a:stretch>
                             <a:fillRect/>
                           </a:stretch>
@@ -52844,18 +52934,18 @@
                 <wp:inline>
                   <wp:extent cx="152400" cy="152400"/>
                   <wp:effectExtent b="0" l="0" r="0" t="0"/>
-                  <wp:docPr descr="" title="" id="358" name="Picture"/>
+                  <wp:docPr descr="" title="" id="359" name="Picture"/>
                   <a:graphic>
                     <a:graphicData uri="http://schemas.openxmlformats.org/drawingml/2006/picture">
                       <pic:pic>
                         <pic:nvPicPr>
-                          <pic:cNvPr descr="/opt/quarto/share/formats/docx/note.png" id="359" name="Picture"/>
+                          <pic:cNvPr descr="/opt/quarto/share/formats/docx/note.png" id="360" name="Picture"/>
                           <pic:cNvPicPr>
                             <a:picLocks noChangeArrowheads="1" noChangeAspect="1"/>
                           </pic:cNvPicPr>
                         </pic:nvPicPr>
                         <pic:blipFill>
-                          <a:blip r:embed="rId120"/>
+                          <a:blip r:embed="rId121"/>
                           <a:stretch>
                             <a:fillRect/>
                           </a:stretch>
@@ -52955,9 +53045,9 @@
         </w:tc>
       </w:tr>
     </w:tbl>
-    <w:bookmarkEnd w:id="360"/>
     <w:bookmarkEnd w:id="361"/>
-    <w:bookmarkStart w:id="365" w:name="sec-ai-when-to-use"/>
+    <w:bookmarkEnd w:id="362"/>
+    <w:bookmarkStart w:id="366" w:name="sec-ai-when-to-use"/>
     <w:p>
       <w:pPr>
         <w:pStyle w:val="Heading1"/>
@@ -52977,7 +53067,7 @@
         <w:rPr>
           <w:rStyle w:val="FootnoteReference"/>
         </w:rPr>
-        <w:footnoteReference w:id="362"/>
+        <w:footnoteReference w:id="363"/>
       </w:r>
       <w:r>
         <w:t xml:space="preserve"> </w:t>
@@ -53009,7 +53099,7 @@
       <w:r>
         <w:t xml:space="preserve"> </w:t>
       </w:r>
-      <w:hyperlink r:id="rId363">
+      <w:hyperlink r:id="rId364">
         <w:r>
           <w:rPr>
             <w:rStyle w:val="Hyperlink"/>
@@ -53068,7 +53158,7 @@
       <w:r>
         <w:t xml:space="preserve"> </w:t>
       </w:r>
-      <w:hyperlink r:id="rId364">
+      <w:hyperlink r:id="rId365">
         <w:r>
           <w:rPr>
             <w:rStyle w:val="Hyperlink"/>
@@ -53187,8 +53277,8 @@
         <w:t xml:space="preserve">just like you would for any other skill you want to maintain.</w:t>
       </w:r>
     </w:p>
-    <w:bookmarkEnd w:id="365"/>
-    <w:bookmarkStart w:id="370" w:name="editing-with-.docx-files"/>
+    <w:bookmarkEnd w:id="366"/>
+    <w:bookmarkStart w:id="371" w:name="editing-with-.docx-files"/>
     <w:p>
       <w:pPr>
         <w:pStyle w:val="Heading1"/>
@@ -53368,7 +53458,7 @@
         <w:t xml:space="preserve">This approach makes it easier for collaborators who are more comfortable with Word to contribute while maintaining the source files in Quarto format.</w:t>
       </w:r>
     </w:p>
-    <w:bookmarkStart w:id="369" w:name="known-issue-document-1-warning-in-word"/>
+    <w:bookmarkStart w:id="370" w:name="known-issue-document-1-warning-in-word"/>
     <w:p>
       <w:pPr>
         <w:pStyle w:val="Heading4"/>
@@ -53453,7 +53543,7 @@
           <w:numId w:val="1146"/>
         </w:numPr>
       </w:pPr>
-      <w:hyperlink r:id="rId366">
+      <w:hyperlink r:id="rId367">
         <w:r>
           <w:rPr>
             <w:rStyle w:val="Hyperlink"/>
@@ -53470,7 +53560,7 @@
           <w:numId w:val="1146"/>
         </w:numPr>
       </w:pPr>
-      <w:hyperlink r:id="rId367">
+      <w:hyperlink r:id="rId368">
         <w:r>
           <w:rPr>
             <w:rStyle w:val="Hyperlink"/>
@@ -53487,7 +53577,7 @@
           <w:numId w:val="1146"/>
         </w:numPr>
       </w:pPr>
-      <w:hyperlink r:id="rId368">
+      <w:hyperlink r:id="rId369">
         <w:r>
           <w:rPr>
             <w:rStyle w:val="Hyperlink"/>
@@ -53600,9 +53690,9 @@
         <w:t xml:space="preserve">warning and can immediately add comments and track changes without issues.</w:t>
       </w:r>
     </w:p>
-    <w:bookmarkEnd w:id="369"/>
     <w:bookmarkEnd w:id="370"/>
-    <w:bookmarkStart w:id="372" w:name="copilot-instructions-for-this-repository"/>
+    <w:bookmarkEnd w:id="371"/>
+    <w:bookmarkStart w:id="373" w:name="copilot-instructions-for-this-repository"/>
     <w:p>
       <w:pPr>
         <w:pStyle w:val="Heading1"/>
@@ -53834,7 +53924,7 @@
       <w:r>
         <w:t xml:space="preserve"> </w:t>
       </w:r>
-      <w:hyperlink r:id="rId371">
+      <w:hyperlink r:id="rId372">
         <w:r>
           <w:rPr>
             <w:rStyle w:val="VerbatimChar"/>
@@ -53849,8 +53939,8 @@
         <w:t xml:space="preserve">for a working example.</w:t>
       </w:r>
     </w:p>
-    <w:bookmarkEnd w:id="372"/>
-    <w:bookmarkStart w:id="373" w:name="using-copilot-review-before-human-review"/>
+    <w:bookmarkEnd w:id="373"/>
+    <w:bookmarkStart w:id="374" w:name="using-copilot-review-before-human-review"/>
     <w:p>
       <w:pPr>
         <w:pStyle w:val="Heading1"/>
@@ -54436,8 +54526,8 @@
         <w:t xml:space="preserve">This ensures you’re reviewing code that has already been through initial automated quality checks.</w:t>
       </w:r>
     </w:p>
-    <w:bookmarkEnd w:id="373"/>
-    <w:bookmarkStart w:id="375" w:name="reviewing-a-copilot-pr-you-didnt-create"/>
+    <w:bookmarkEnd w:id="374"/>
+    <w:bookmarkStart w:id="376" w:name="reviewing-a-copilot-pr-you-didnt-create"/>
     <w:p>
       <w:pPr>
         <w:pStyle w:val="Heading1"/>
@@ -54488,7 +54578,7 @@
       <w:r>
         <w:t xml:space="preserve"> </w:t>
       </w:r>
-      <w:hyperlink r:id="rId374">
+      <w:hyperlink r:id="rId375">
         <w:r>
           <w:rPr>
             <w:rStyle w:val="Hyperlink"/>
@@ -55392,8 +55482,8 @@
         <w:t xml:space="preserve">while benefiting from collaborative human review and Copilot’s implementation capabilities.</w:t>
       </w:r>
     </w:p>
-    <w:bookmarkEnd w:id="375"/>
-    <w:bookmarkStart w:id="394" w:name="sec-ai-claude-code-windows"/>
+    <w:bookmarkEnd w:id="376"/>
+    <w:bookmarkStart w:id="395" w:name="sec-ai-claude-code-windows"/>
     <w:p>
       <w:pPr>
         <w:pStyle w:val="Heading1"/>
@@ -55492,18 +55582,18 @@
                 <wp:inline>
                   <wp:extent cx="152400" cy="152400"/>
                   <wp:effectExtent b="0" l="0" r="0" t="0"/>
-                  <wp:docPr descr="" title="" id="376" name="Picture"/>
+                  <wp:docPr descr="" title="" id="377" name="Picture"/>
                   <a:graphic>
                     <a:graphicData uri="http://schemas.openxmlformats.org/drawingml/2006/picture">
                       <pic:pic>
                         <pic:nvPicPr>
-                          <pic:cNvPr descr="/opt/quarto/share/formats/docx/note.png" id="377" name="Picture"/>
+                          <pic:cNvPr descr="/opt/quarto/share/formats/docx/note.png" id="378" name="Picture"/>
                           <pic:cNvPicPr>
                             <a:picLocks noChangeArrowheads="1" noChangeAspect="1"/>
                           </pic:cNvPicPr>
                         </pic:nvPicPr>
                         <pic:blipFill>
-                          <a:blip r:embed="rId120"/>
+                          <a:blip r:embed="rId121"/>
                           <a:stretch>
                             <a:fillRect/>
                           </a:stretch>
@@ -55585,7 +55675,7 @@
         </w:tc>
       </w:tr>
     </w:tbl>
-    <w:bookmarkStart w:id="380" w:name="run-it-from-a-unix-like-terminal"/>
+    <w:bookmarkStart w:id="381" w:name="run-it-from-a-unix-like-terminal"/>
     <w:p>
       <w:pPr>
         <w:pStyle w:val="Heading4"/>
@@ -55632,7 +55722,7 @@
       <w:r>
         <w:t xml:space="preserve"> </w:t>
       </w:r>
-      <w:hyperlink r:id="rId378">
+      <w:hyperlink r:id="rId379">
         <w:r>
           <w:rPr>
             <w:rStyle w:val="Hyperlink"/>
@@ -55665,7 +55755,7 @@
       <w:r>
         <w:t xml:space="preserve">(</w:t>
       </w:r>
-      <w:hyperlink r:id="rId379">
+      <w:hyperlink r:id="rId380">
         <w:r>
           <w:rPr>
             <w:rStyle w:val="Hyperlink"/>
@@ -55816,8 +55906,8 @@
         <w:t xml:space="preserve">gotchas below don’t apply.</w:t>
       </w:r>
     </w:p>
-    <w:bookmarkEnd w:id="380"/>
-    <w:bookmarkStart w:id="385" w:name="install-claude-code"/>
+    <w:bookmarkEnd w:id="381"/>
+    <w:bookmarkStart w:id="386" w:name="install-claude-code"/>
     <w:p>
       <w:pPr>
         <w:pStyle w:val="Heading4"/>
@@ -55982,7 +56072,7 @@
       <w:r>
         <w:t xml:space="preserve"> </w:t>
       </w:r>
-      <w:hyperlink r:id="rId381">
+      <w:hyperlink r:id="rId382">
         <w:r>
           <w:rPr>
             <w:rStyle w:val="Hyperlink"/>
@@ -56068,18 +56158,18 @@
                 <wp:inline>
                   <wp:extent cx="152400" cy="152400"/>
                   <wp:effectExtent b="0" l="0" r="0" t="0"/>
-                  <wp:docPr descr="" title="" id="382" name="Picture"/>
+                  <wp:docPr descr="" title="" id="383" name="Picture"/>
                   <a:graphic>
                     <a:graphicData uri="http://schemas.openxmlformats.org/drawingml/2006/picture">
                       <pic:pic>
                         <pic:nvPicPr>
-                          <pic:cNvPr descr="/opt/quarto/share/formats/docx/important.png" id="383" name="Picture"/>
+                          <pic:cNvPr descr="/opt/quarto/share/formats/docx/important.png" id="384" name="Picture"/>
                           <pic:cNvPicPr>
                             <a:picLocks noChangeArrowheads="1" noChangeAspect="1"/>
                           </pic:cNvPicPr>
                         </pic:nvPicPr>
                         <pic:blipFill>
-                          <a:blip r:embed="rId156"/>
+                          <a:blip r:embed="rId157"/>
                           <a:stretch>
                             <a:fillRect/>
                           </a:stretch>
@@ -56229,7 +56319,7 @@
             <w:r>
               <w:t xml:space="preserve"> </w:t>
             </w:r>
-            <w:hyperlink r:id="rId384">
+            <w:hyperlink r:id="rId385">
               <w:r>
                 <w:rPr>
                   <w:rStyle w:val="Hyperlink"/>
@@ -56320,8 +56410,8 @@
         </w:tc>
       </w:tr>
     </w:tbl>
-    <w:bookmarkEnd w:id="385"/>
-    <w:bookmarkStart w:id="387" w:name="make-sure-your-shell-can-find-claude"/>
+    <w:bookmarkEnd w:id="386"/>
+    <w:bookmarkStart w:id="388" w:name="make-sure-your-shell-can-find-claude"/>
     <w:p>
       <w:pPr>
         <w:pStyle w:val="Heading4"/>
@@ -56919,7 +57009,7 @@
       <w:r>
         <w:t xml:space="preserve"> </w:t>
       </w:r>
-      <w:hyperlink r:id="rId386">
+      <w:hyperlink r:id="rId387">
         <w:r>
           <w:rPr>
             <w:rStyle w:val="Hyperlink"/>
@@ -57025,8 +57115,8 @@
         <w:t xml:space="preserve">initializes).</w:t>
       </w:r>
     </w:p>
-    <w:bookmarkEnd w:id="387"/>
-    <w:bookmarkStart w:id="390" w:name="X604325b0223e79803e04f87e7874b1d7f4a0663"/>
+    <w:bookmarkEnd w:id="388"/>
+    <w:bookmarkStart w:id="391" w:name="X604325b0223e79803e04f87e7874b1d7f4a0663"/>
     <w:p>
       <w:pPr>
         <w:pStyle w:val="Heading4"/>
@@ -57076,18 +57166,18 @@
                 <wp:inline>
                   <wp:extent cx="152400" cy="152400"/>
                   <wp:effectExtent b="0" l="0" r="0" t="0"/>
-                  <wp:docPr descr="" title="" id="388" name="Picture"/>
+                  <wp:docPr descr="" title="" id="389" name="Picture"/>
                   <a:graphic>
                     <a:graphicData uri="http://schemas.openxmlformats.org/drawingml/2006/picture">
                       <pic:pic>
                         <pic:nvPicPr>
-                          <pic:cNvPr descr="/opt/quarto/share/formats/docx/warning.png" id="389" name="Picture"/>
+                          <pic:cNvPr descr="/opt/quarto/share/formats/docx/warning.png" id="390" name="Picture"/>
                           <pic:cNvPicPr>
                             <a:picLocks noChangeArrowheads="1" noChangeAspect="1"/>
                           </pic:cNvPicPr>
                         </pic:nvPicPr>
                         <pic:blipFill>
-                          <a:blip r:embed="rId105"/>
+                          <a:blip r:embed="rId106"/>
                           <a:stretch>
                             <a:fillRect/>
                           </a:stretch>
@@ -57349,8 +57439,8 @@
         </w:tc>
       </w:tr>
     </w:tbl>
-    <w:bookmarkEnd w:id="390"/>
-    <w:bookmarkStart w:id="392" w:name="X1745fd502df7963ed7ce48d0465493b4d59ad92"/>
+    <w:bookmarkEnd w:id="391"/>
+    <w:bookmarkStart w:id="393" w:name="X1745fd502df7963ed7ce48d0465493b4d59ad92"/>
     <w:p>
       <w:pPr>
         <w:pStyle w:val="Heading4"/>
@@ -57369,7 +57459,7 @@
       <w:r>
         <w:t xml:space="preserve"> </w:t>
       </w:r>
-      <w:hyperlink r:id="rId391">
+      <w:hyperlink r:id="rId392">
         <w:r>
           <w:rPr>
             <w:rStyle w:val="Hyperlink"/>
@@ -57530,8 +57620,8 @@
         <w:t xml:space="preserve">.</w:t>
       </w:r>
     </w:p>
-    <w:bookmarkEnd w:id="392"/>
-    <w:bookmarkStart w:id="393" w:name="verify-the-install"/>
+    <w:bookmarkEnd w:id="393"/>
+    <w:bookmarkStart w:id="394" w:name="verify-the-install"/>
     <w:p>
       <w:pPr>
         <w:pStyle w:val="Heading4"/>
@@ -57700,9 +57790,9 @@
         <w:t xml:space="preserve">(or open a fresh window) after changing it.</w:t>
       </w:r>
     </w:p>
-    <w:bookmarkEnd w:id="393"/>
     <w:bookmarkEnd w:id="394"/>
-    <w:bookmarkStart w:id="408" w:name="sec-ai-mcp-server-setup"/>
+    <w:bookmarkEnd w:id="395"/>
+    <w:bookmarkStart w:id="409" w:name="sec-ai-mcp-server-setup"/>
     <w:p>
       <w:pPr>
         <w:pStyle w:val="Heading1"/>
@@ -57721,7 +57811,7 @@
       <w:r>
         <w:t xml:space="preserve"> </w:t>
       </w:r>
-      <w:hyperlink r:id="rId29">
+      <w:hyperlink r:id="rId30">
         <w:r>
           <w:rPr>
             <w:rStyle w:val="Hyperlink"/>
@@ -57823,18 +57913,18 @@
                 <wp:inline>
                   <wp:extent cx="152400" cy="152400"/>
                   <wp:effectExtent b="0" l="0" r="0" t="0"/>
-                  <wp:docPr descr="" title="" id="395" name="Picture"/>
+                  <wp:docPr descr="" title="" id="396" name="Picture"/>
                   <a:graphic>
                     <a:graphicData uri="http://schemas.openxmlformats.org/drawingml/2006/picture">
                       <pic:pic>
                         <pic:nvPicPr>
-                          <pic:cNvPr descr="/opt/quarto/share/formats/docx/note.png" id="396" name="Picture"/>
+                          <pic:cNvPr descr="/opt/quarto/share/formats/docx/note.png" id="397" name="Picture"/>
                           <pic:cNvPicPr>
                             <a:picLocks noChangeArrowheads="1" noChangeAspect="1"/>
                           </pic:cNvPicPr>
                         </pic:nvPicPr>
                         <pic:blipFill>
-                          <a:blip r:embed="rId120"/>
+                          <a:blip r:embed="rId121"/>
                           <a:stretch>
                             <a:fillRect/>
                           </a:stretch>
@@ -57922,7 +58012,7 @@
         </w:tc>
       </w:tr>
     </w:tbl>
-    <w:bookmarkStart w:id="398" w:name="installed-is-not-registered"/>
+    <w:bookmarkStart w:id="399" w:name="installed-is-not-registered"/>
     <w:p>
       <w:pPr>
         <w:pStyle w:val="Heading4"/>
@@ -57953,7 +58043,7 @@
       <w:r>
         <w:t xml:space="preserve"> </w:t>
       </w:r>
-      <w:hyperlink r:id="rId397">
+      <w:hyperlink r:id="rId398">
         <w:r>
           <w:rPr>
             <w:rStyle w:val="VerbatimChar"/>
@@ -58021,8 +58111,8 @@
         <w:t xml:space="preserve"> mcp list</w:t>
       </w:r>
     </w:p>
-    <w:bookmarkEnd w:id="398"/>
-    <w:bookmarkStart w:id="399" w:name="Xf6682145328c756d2e167d2c91be34f7f913a7f"/>
+    <w:bookmarkEnd w:id="399"/>
+    <w:bookmarkStart w:id="400" w:name="Xf6682145328c756d2e167d2c91be34f7f913a7f"/>
     <w:p>
       <w:pPr>
         <w:pStyle w:val="Heading4"/>
@@ -58221,8 +58311,8 @@
         <w:t xml:space="preserve">A local one shows a command path instead.</w:t>
       </w:r>
     </w:p>
-    <w:bookmarkEnd w:id="399"/>
-    <w:bookmarkStart w:id="400" w:name="and-401-mean-different-things"/>
+    <w:bookmarkEnd w:id="400"/>
+    <w:bookmarkStart w:id="401" w:name="and-401-mean-different-things"/>
     <w:p>
       <w:pPr>
         <w:pStyle w:val="Heading4"/>
@@ -58465,8 +58555,8 @@
         <w:t xml:space="preserve">sends you to the token-minting page for a problem that lives in a config file.</w:t>
       </w:r>
     </w:p>
-    <w:bookmarkEnd w:id="400"/>
-    <w:bookmarkStart w:id="401" w:name="install-the-binary-the-platforms-own-way"/>
+    <w:bookmarkEnd w:id="401"/>
+    <w:bookmarkStart w:id="402" w:name="install-the-binary-the-platforms-own-way"/>
     <w:p>
       <w:pPr>
         <w:pStyle w:val="Heading4"/>
@@ -58720,8 +58810,8 @@
         <w:t xml:space="preserve">with an override for the case where it isn’t on one.</w:t>
       </w:r>
     </w:p>
-    <w:bookmarkEnd w:id="401"/>
-    <w:bookmarkStart w:id="402" w:name="X2adb24e9b1a0644f0fbebe685525dadd8a56387"/>
+    <w:bookmarkEnd w:id="402"/>
+    <w:bookmarkStart w:id="403" w:name="X2adb24e9b1a0644f0fbebe685525dadd8a56387"/>
     <w:p>
       <w:pPr>
         <w:pStyle w:val="Heading4"/>
@@ -59598,8 +59688,8 @@
         <w:t xml:space="preserve">bug you just finished diagnosing.</w:t>
       </w:r>
     </w:p>
-    <w:bookmarkEnd w:id="402"/>
-    <w:bookmarkStart w:id="403" w:name="X448547516ab06679b064b391b05a896db41ea57"/>
+    <w:bookmarkEnd w:id="403"/>
+    <w:bookmarkStart w:id="404" w:name="X448547516ab06679b064b391b05a896db41ea57"/>
     <w:p>
       <w:pPr>
         <w:pStyle w:val="Heading4"/>
@@ -59921,8 +60011,8 @@
         <w:t xml:space="preserve">the count moving the right direction, as the check above expects.</w:t>
       </w:r>
     </w:p>
-    <w:bookmarkEnd w:id="403"/>
-    <w:bookmarkStart w:id="404" w:name="X4a4c9992603eee0123b58b5b37e7fedbb817150"/>
+    <w:bookmarkEnd w:id="404"/>
+    <w:bookmarkStart w:id="405" w:name="X4a4c9992603eee0123b58b5b37e7fedbb817150"/>
     <w:p>
       <w:pPr>
         <w:pStyle w:val="Heading4"/>
@@ -60022,8 +60112,8 @@
         <w:t xml:space="preserve">Reach for those instead when working from a local harness.</w:t>
       </w:r>
     </w:p>
-    <w:bookmarkEnd w:id="404"/>
-    <w:bookmarkStart w:id="405" w:name="Xb256c2a3c0a422f2f687a98903d3521fd60a1b1"/>
+    <w:bookmarkEnd w:id="405"/>
+    <w:bookmarkStart w:id="406" w:name="Xb256c2a3c0a422f2f687a98903d3521fd60a1b1"/>
     <w:p>
       <w:pPr>
         <w:pStyle w:val="Heading4"/>
@@ -60199,8 +60289,8 @@
         <w:t xml:space="preserve">not something an agent does in passing.</w:t>
       </w:r>
     </w:p>
-    <w:bookmarkEnd w:id="405"/>
-    <w:bookmarkStart w:id="407" w:name="Xd44df015462fcf288556a538677f0a762c9ef1d"/>
+    <w:bookmarkEnd w:id="406"/>
+    <w:bookmarkStart w:id="408" w:name="Xd44df015462fcf288556a538677f0a762c9ef1d"/>
     <w:p>
       <w:pPr>
         <w:pStyle w:val="Heading4"/>
@@ -60314,7 +60404,7 @@
       <w:r>
         <w:t xml:space="preserve"> </w:t>
       </w:r>
-      <w:hyperlink r:id="rId406">
+      <w:hyperlink r:id="rId407">
         <w:r>
           <w:rPr>
             <w:rStyle w:val="Hyperlink"/>
@@ -60497,9 +60587,9 @@
         <w:t xml:space="preserve">and expect it to work.</w:t>
       </w:r>
     </w:p>
-    <w:bookmarkEnd w:id="407"/>
     <w:bookmarkEnd w:id="408"/>
-    <w:bookmarkStart w:id="416" w:name="sec-ai-gemini-spend-management"/>
+    <w:bookmarkEnd w:id="409"/>
+    <w:bookmarkStart w:id="417" w:name="sec-ai-gemini-spend-management"/>
     <w:p>
       <w:pPr>
         <w:pStyle w:val="Heading1"/>
@@ -60528,7 +60618,7 @@
         <w:t xml:space="preserve">and optimize token consumption across local tools and GitHub Actions workflows.</w:t>
       </w:r>
     </w:p>
-    <w:bookmarkStart w:id="410" w:name="Xd8c10be17edf039db5b664720f228274181ba18"/>
+    <w:bookmarkStart w:id="411" w:name="Xd8c10be17edf039db5b664720f228274181ba18"/>
     <w:p>
       <w:pPr>
         <w:pStyle w:val="Heading4"/>
@@ -60592,7 +60682,7 @@
       <w:r>
         <w:t xml:space="preserve"> </w:t>
       </w:r>
-      <w:hyperlink r:id="rId409">
+      <w:hyperlink r:id="rId410">
         <w:r>
           <w:rPr>
             <w:rStyle w:val="Hyperlink"/>
@@ -60687,7 +60777,7 @@
       <w:r>
         <w:t xml:space="preserve"> </w:t>
       </w:r>
-      <w:hyperlink r:id="rId409">
+      <w:hyperlink r:id="rId410">
         <w:r>
           <w:rPr>
             <w:rStyle w:val="Hyperlink"/>
@@ -60723,8 +60813,8 @@
         <w:t xml:space="preserve">Any project that has hit its monthly spend cap will have its API requests paused until the limit is updated.</w:t>
       </w:r>
     </w:p>
-    <w:bookmarkEnd w:id="410"/>
-    <w:bookmarkStart w:id="412" w:name="adjusting-and-unpausing-spend-caps"/>
+    <w:bookmarkEnd w:id="411"/>
+    <w:bookmarkStart w:id="413" w:name="adjusting-and-unpausing-spend-caps"/>
     <w:p>
       <w:pPr>
         <w:pStyle w:val="Heading4"/>
@@ -60755,7 +60845,7 @@
       <w:r>
         <w:t xml:space="preserve"> </w:t>
       </w:r>
-      <w:hyperlink r:id="rId411">
+      <w:hyperlink r:id="rId412">
         <w:r>
           <w:rPr>
             <w:rStyle w:val="Hyperlink"/>
@@ -60824,8 +60914,8 @@
         <w:t xml:space="preserve">and API service automatically resumes up to the configured cap.</w:t>
       </w:r>
     </w:p>
-    <w:bookmarkEnd w:id="412"/>
-    <w:bookmarkStart w:id="414" w:name="setting-up-google-cloud-budget-alerts"/>
+    <w:bookmarkEnd w:id="413"/>
+    <w:bookmarkStart w:id="415" w:name="setting-up-google-cloud-budget-alerts"/>
     <w:p>
       <w:pPr>
         <w:pStyle w:val="Heading4"/>
@@ -60856,7 +60946,7 @@
       <w:r>
         <w:t xml:space="preserve"> </w:t>
       </w:r>
-      <w:hyperlink r:id="rId413">
+      <w:hyperlink r:id="rId414">
         <w:r>
           <w:rPr>
             <w:rStyle w:val="Hyperlink"/>
@@ -61008,8 +61098,8 @@
         <w:t xml:space="preserve">. You will receive email alerts before any project hits its spend cap.</w:t>
       </w:r>
     </w:p>
-    <w:bookmarkEnd w:id="414"/>
-    <w:bookmarkStart w:id="415" w:name="cost-optimization-best-practices"/>
+    <w:bookmarkEnd w:id="415"/>
+    <w:bookmarkStart w:id="416" w:name="cost-optimization-best-practices"/>
     <w:p>
       <w:pPr>
         <w:pStyle w:val="Heading4"/>
@@ -61324,9 +61414,9 @@
         <w:t xml:space="preserve">to collapse them in GitHub’s web diff view and exclude them from repository language statistics.</w:t>
       </w:r>
     </w:p>
-    <w:bookmarkEnd w:id="415"/>
     <w:bookmarkEnd w:id="416"/>
-    <w:bookmarkStart w:id="446" w:name="references"/>
+    <w:bookmarkEnd w:id="417"/>
+    <w:bookmarkStart w:id="447" w:name="references"/>
     <w:p>
       <w:pPr>
         <w:pStyle w:val="Heading1"/>
@@ -61335,8 +61425,8 @@
         <w:t xml:space="preserve">References</w:t>
       </w:r>
     </w:p>
-    <w:bookmarkStart w:id="445" w:name="refs"/>
-    <w:bookmarkStart w:id="418" w:name="ref-space_odyssey"/>
+    <w:bookmarkStart w:id="446" w:name="refs"/>
+    <w:bookmarkStart w:id="419" w:name="ref-space_odyssey"/>
     <w:p>
       <w:pPr>
         <w:pStyle w:val="Bibliography"/>
@@ -61354,7 +61444,7 @@
       <w:r>
         <w:t xml:space="preserve"> </w:t>
       </w:r>
-      <w:hyperlink r:id="rId417">
+      <w:hyperlink r:id="rId418">
         <w:r>
           <w:rPr>
             <w:rStyle w:val="Hyperlink"/>
@@ -61366,8 +61456,8 @@
         <w:t xml:space="preserve">.</w:t>
       </w:r>
     </w:p>
-    <w:bookmarkEnd w:id="418"/>
-    <w:bookmarkStart w:id="420" w:name="ref-i_robot"/>
+    <w:bookmarkEnd w:id="419"/>
+    <w:bookmarkStart w:id="421" w:name="ref-i_robot"/>
     <w:p>
       <w:pPr>
         <w:pStyle w:val="Bibliography"/>
@@ -61391,7 +61481,7 @@
       <w:r>
         <w:t xml:space="preserve"> </w:t>
       </w:r>
-      <w:hyperlink r:id="rId419">
+      <w:hyperlink r:id="rId420">
         <w:r>
           <w:rPr>
             <w:rStyle w:val="Hyperlink"/>
@@ -61403,8 +61493,8 @@
         <w:t xml:space="preserve">.</w:t>
       </w:r>
     </w:p>
-    <w:bookmarkEnd w:id="420"/>
-    <w:bookmarkStart w:id="422" w:name="ref-battlestar_galactica_2004"/>
+    <w:bookmarkEnd w:id="421"/>
+    <w:bookmarkStart w:id="423" w:name="ref-battlestar_galactica_2004"/>
     <w:p>
       <w:pPr>
         <w:pStyle w:val="Bibliography"/>
@@ -61422,7 +61512,7 @@
       <w:r>
         <w:t xml:space="preserve"> </w:t>
       </w:r>
-      <w:hyperlink r:id="rId421">
+      <w:hyperlink r:id="rId422">
         <w:r>
           <w:rPr>
             <w:rStyle w:val="Hyperlink"/>
@@ -61434,8 +61524,8 @@
         <w:t xml:space="preserve">.</w:t>
       </w:r>
     </w:p>
-    <w:bookmarkEnd w:id="422"/>
-    <w:bookmarkStart w:id="424" w:name="ref-slm_agentic_ai"/>
+    <w:bookmarkEnd w:id="423"/>
+    <w:bookmarkStart w:id="425" w:name="ref-slm_agentic_ai"/>
     <w:p>
       <w:pPr>
         <w:pStyle w:val="Bibliography"/>
@@ -61459,7 +61549,7 @@
       <w:r>
         <w:t xml:space="preserve"> </w:t>
       </w:r>
-      <w:hyperlink r:id="rId423">
+      <w:hyperlink r:id="rId424">
         <w:r>
           <w:rPr>
             <w:rStyle w:val="Hyperlink"/>
@@ -61471,8 +61561,8 @@
         <w:t xml:space="preserve">.</w:t>
       </w:r>
     </w:p>
-    <w:bookmarkEnd w:id="424"/>
-    <w:bookmarkStart w:id="426" w:name="ref-blade_runner"/>
+    <w:bookmarkEnd w:id="425"/>
+    <w:bookmarkStart w:id="427" w:name="ref-blade_runner"/>
     <w:p>
       <w:pPr>
         <w:pStyle w:val="Bibliography"/>
@@ -61490,7 +61580,7 @@
       <w:r>
         <w:t xml:space="preserve"> </w:t>
       </w:r>
-      <w:hyperlink r:id="rId425">
+      <w:hyperlink r:id="rId426">
         <w:r>
           <w:rPr>
             <w:rStyle w:val="Hyperlink"/>
@@ -61502,8 +61592,8 @@
         <w:t xml:space="preserve">.</w:t>
       </w:r>
     </w:p>
-    <w:bookmarkEnd w:id="426"/>
-    <w:bookmarkStart w:id="428" w:name="ref-enders_game"/>
+    <w:bookmarkEnd w:id="427"/>
+    <w:bookmarkStart w:id="429" w:name="ref-enders_game"/>
     <w:p>
       <w:pPr>
         <w:pStyle w:val="Bibliography"/>
@@ -61527,7 +61617,7 @@
       <w:r>
         <w:t xml:space="preserve"> </w:t>
       </w:r>
-      <w:hyperlink r:id="rId427">
+      <w:hyperlink r:id="rId428">
         <w:r>
           <w:rPr>
             <w:rStyle w:val="Hyperlink"/>
@@ -61539,8 +61629,8 @@
         <w:t xml:space="preserve">.</w:t>
       </w:r>
     </w:p>
-    <w:bookmarkEnd w:id="428"/>
-    <w:bookmarkStart w:id="430" w:name="ref-qlora"/>
+    <w:bookmarkEnd w:id="429"/>
+    <w:bookmarkStart w:id="431" w:name="ref-qlora"/>
     <w:p>
       <w:pPr>
         <w:pStyle w:val="Bibliography"/>
@@ -61564,7 +61654,7 @@
       <w:r>
         <w:t xml:space="preserve"> </w:t>
       </w:r>
-      <w:hyperlink r:id="rId429">
+      <w:hyperlink r:id="rId430">
         <w:r>
           <w:rPr>
             <w:rStyle w:val="Hyperlink"/>
@@ -61576,8 +61666,8 @@
         <w:t xml:space="preserve">.</w:t>
       </w:r>
     </w:p>
-    <w:bookmarkEnd w:id="430"/>
-    <w:bookmarkStart w:id="432" w:name="ref-humans_are_dead"/>
+    <w:bookmarkEnd w:id="431"/>
+    <w:bookmarkStart w:id="433" w:name="ref-humans_are_dead"/>
     <w:p>
       <w:pPr>
         <w:pStyle w:val="Bibliography"/>
@@ -61601,7 +61691,7 @@
       <w:r>
         <w:t xml:space="preserve"> </w:t>
       </w:r>
-      <w:hyperlink r:id="rId431">
+      <w:hyperlink r:id="rId432">
         <w:r>
           <w:rPr>
             <w:rStyle w:val="Hyperlink"/>
@@ -61613,8 +61703,8 @@
         <w:t xml:space="preserve">.</w:t>
       </w:r>
     </w:p>
-    <w:bookmarkEnd w:id="432"/>
-    <w:bookmarkStart w:id="434" w:name="ref-dune"/>
+    <w:bookmarkEnd w:id="433"/>
+    <w:bookmarkStart w:id="435" w:name="ref-dune"/>
     <w:p>
       <w:pPr>
         <w:pStyle w:val="Bibliography"/>
@@ -61638,7 +61728,7 @@
       <w:r>
         <w:t xml:space="preserve"> </w:t>
       </w:r>
-      <w:hyperlink r:id="rId433">
+      <w:hyperlink r:id="rId434">
         <w:r>
           <w:rPr>
             <w:rStyle w:val="Hyperlink"/>
@@ -61650,8 +61740,8 @@
         <w:t xml:space="preserve">.</w:t>
       </w:r>
     </w:p>
-    <w:bookmarkEnd w:id="434"/>
-    <w:bookmarkStart w:id="436" w:name="ref-lora"/>
+    <w:bookmarkEnd w:id="435"/>
+    <w:bookmarkStart w:id="437" w:name="ref-lora"/>
     <w:p>
       <w:pPr>
         <w:pStyle w:val="Bibliography"/>
@@ -61675,7 +61765,7 @@
       <w:r>
         <w:t xml:space="preserve"> </w:t>
       </w:r>
-      <w:hyperlink r:id="rId435">
+      <w:hyperlink r:id="rId436">
         <w:r>
           <w:rPr>
             <w:rStyle w:val="Hyperlink"/>
@@ -61687,8 +61777,8 @@
         <w:t xml:space="preserve">.</w:t>
       </w:r>
     </w:p>
-    <w:bookmarkEnd w:id="436"/>
-    <w:bookmarkStart w:id="438" w:name="ref-lecun_world_models"/>
+    <w:bookmarkEnd w:id="437"/>
+    <w:bookmarkStart w:id="439" w:name="ref-lecun_world_models"/>
     <w:p>
       <w:pPr>
         <w:pStyle w:val="Bibliography"/>
@@ -61712,7 +61802,7 @@
       <w:r>
         <w:t xml:space="preserve"> </w:t>
       </w:r>
-      <w:hyperlink r:id="rId437">
+      <w:hyperlink r:id="rId438">
         <w:r>
           <w:rPr>
             <w:rStyle w:val="Hyperlink"/>
@@ -61724,8 +61814,8 @@
         <w:t xml:space="preserve">.</w:t>
       </w:r>
     </w:p>
-    <w:bookmarkEnd w:id="438"/>
-    <w:bookmarkStart w:id="440" w:name="ref-terminator"/>
+    <w:bookmarkEnd w:id="439"/>
+    <w:bookmarkStart w:id="441" w:name="ref-terminator"/>
     <w:p>
       <w:pPr>
         <w:pStyle w:val="Bibliography"/>
@@ -61743,7 +61833,7 @@
       <w:r>
         <w:t xml:space="preserve"> </w:t>
       </w:r>
-      <w:hyperlink r:id="rId439">
+      <w:hyperlink r:id="rId440">
         <w:r>
           <w:rPr>
             <w:rStyle w:val="Hyperlink"/>
@@ -61755,8 +61845,8 @@
         <w:t xml:space="preserve">.</w:t>
       </w:r>
     </w:p>
-    <w:bookmarkEnd w:id="440"/>
-    <w:bookmarkStart w:id="442" w:name="ref-matrix"/>
+    <w:bookmarkEnd w:id="441"/>
+    <w:bookmarkStart w:id="443" w:name="ref-matrix"/>
     <w:p>
       <w:pPr>
         <w:pStyle w:val="Bibliography"/>
@@ -61774,7 +61864,7 @@
       <w:r>
         <w:t xml:space="preserve"> </w:t>
       </w:r>
-      <w:hyperlink r:id="rId441">
+      <w:hyperlink r:id="rId442">
         <w:r>
           <w:rPr>
             <w:rStyle w:val="Hyperlink"/>
@@ -61786,8 +61876,8 @@
         <w:t xml:space="preserve">.</w:t>
       </w:r>
     </w:p>
-    <w:bookmarkEnd w:id="442"/>
-    <w:bookmarkStart w:id="444" w:name="ref-wargames"/>
+    <w:bookmarkEnd w:id="443"/>
+    <w:bookmarkStart w:id="445" w:name="ref-wargames"/>
     <w:p>
       <w:pPr>
         <w:pStyle w:val="Bibliography"/>
@@ -61805,7 +61895,7 @@
       <w:r>
         <w:t xml:space="preserve"> </w:t>
       </w:r>
-      <w:hyperlink r:id="rId443">
+      <w:hyperlink r:id="rId444">
         <w:r>
           <w:rPr>
             <w:rStyle w:val="Hyperlink"/>
@@ -61817,9 +61907,9 @@
         <w:t xml:space="preserve">.</w:t>
       </w:r>
     </w:p>
-    <w:bookmarkEnd w:id="444"/>
     <w:bookmarkEnd w:id="445"/>
     <w:bookmarkEnd w:id="446"/>
+    <w:bookmarkEnd w:id="447"/>
     <w:sectPr>
       <w:footnotePr>
         <w:numRestart w:val="eachSect"/>
@@ -61849,7 +61939,7 @@
       </w:r>
     </w:p>
   </w:footnote>
-  <w:footnote w:id="362">
+  <w:footnote w:id="363">
     <w:p>
       <w:pPr>
         <w:pStyle w:val="FootnoteText"/>

</xml_diff>

<commit_message>
Deploying to gh-pages from @ Morrison-Lab/wai@48e35d063a7006f621349c119af8aa9e2710a149 🚀
</commit_message>
<xml_diff>
--- a/chapters/coding-agents.docx
+++ b/chapters/coding-agents.docx
@@ -15,7 +15,7 @@
         <w:pStyle w:val="Date"/>
       </w:pPr>
       <w:r>
-        <w:t xml:space="preserve">Last modified: 2026-08-29 21:49:25 (PDT)</w:t>
+        <w:t xml:space="preserve">Last modified: 2026-08-29 21:57:39 (PDT)</w:t>
       </w:r>
     </w:p>
     <w:p>
@@ -37025,13 +37025,13 @@
         <w:t xml:space="preserve"> </w:t>
       </w:r>
       <w:r>
-        <w:t xml:space="preserve">That is 384,000 input tokens at roughly five requests per minute:</w:t>
-      </w:r>
-      <w:r>
-        <w:t xml:space="preserve"> </w:t>
-      </w:r>
-      <w:r>
-        <w:t xml:space="preserve">eight times the Claude window and faster turns at the same time.</w:t>
+        <w:t xml:space="preserve">That is 384,000 input tokens at roughly 5 requests per minute:</w:t>
+      </w:r>
+      <w:r>
+        <w:t xml:space="preserve"> </w:t>
+      </w:r>
+      <w:r>
+        <w:t xml:space="preserve">8 times the Claude window and faster turns at the same time.</w:t>
       </w:r>
       <w:r>
         <w:t xml:space="preserve"> </w:t>

</xml_diff>

<commit_message>
Deploying to gh-pages from @ Morrison-Lab/wai@9cd6994adc902d4e75b46c453e0e5a6736db496e 🚀
</commit_message>
<xml_diff>
--- a/chapters/coding-agents.docx
+++ b/chapters/coding-agents.docx
@@ -15,7 +15,7 @@
         <w:pStyle w:val="Date"/>
       </w:pPr>
       <w:r>
-        <w:t xml:space="preserve">Last modified: 2026-08-29 21:57:39 (PDT)</w:t>
+        <w:t xml:space="preserve">Last modified: 2026-08-29 21:59:18 (PDT)</w:t>
       </w:r>
     </w:p>
     <w:p>
@@ -57996,7 +57996,7 @@
     </w:p>
     <w:bookmarkEnd w:id="395"/>
     <w:bookmarkEnd w:id="396"/>
-    <w:bookmarkStart w:id="410" w:name="sec-ai-mcp-server-setup"/>
+    <w:bookmarkStart w:id="412" w:name="sec-ai-mcp-server-setup"/>
     <w:p>
       <w:pPr>
         <w:pStyle w:val="Heading1"/>
@@ -60792,8 +60792,207 @@
       </w:r>
     </w:p>
     <w:bookmarkEnd w:id="409"/>
-    <w:bookmarkEnd w:id="410"/>
-    <w:bookmarkStart w:id="418" w:name="sec-ai-gemini-spend-management"/>
+    <w:bookmarkStart w:id="411" w:name="granola-mcp-your-meetings-as-context"/>
+    <w:p>
+      <w:pPr>
+        <w:pStyle w:val="Heading4"/>
+      </w:pPr>
+      <w:r>
+        <w:t xml:space="preserve">Granola MCP: your meetings as context</w:t>
+      </w:r>
+    </w:p>
+    <w:p>
+      <w:pPr>
+        <w:pStyle w:val="FirstParagraph"/>
+      </w:pPr>
+      <w:hyperlink r:id="rId410">
+        <w:r>
+          <w:rPr>
+            <w:rStyle w:val="Hyperlink"/>
+          </w:rPr>
+          <w:t xml:space="preserve">Granola MCP</w:t>
+        </w:r>
+      </w:hyperlink>
+      <w:r>
+        <w:t xml:space="preserve"> </w:t>
+      </w:r>
+      <w:r>
+        <w:t xml:space="preserve">is the other side of that same pattern:</w:t>
+      </w:r>
+      <w:r>
+        <w:t xml:space="preserve"> </w:t>
+      </w:r>
+      <w:r>
+        <w:t xml:space="preserve">it is not a code-host server but a meeting-context server.</w:t>
+      </w:r>
+      <w:r>
+        <w:t xml:space="preserve"> </w:t>
+      </w:r>
+      <w:r>
+        <w:t xml:space="preserve">Granola is an AI notepad for back-to-back meetings;</w:t>
+      </w:r>
+      <w:r>
+        <w:t xml:space="preserve"> </w:t>
+      </w:r>
+      <w:r>
+        <w:t xml:space="preserve">its MCP exposes your meeting notes to any MCP client.</w:t>
+      </w:r>
+    </w:p>
+    <w:p>
+      <w:pPr>
+        <w:pStyle w:val="BodyText"/>
+      </w:pPr>
+      <w:r>
+        <w:t xml:space="preserve">The gap it closes is the copy-paste loop:</w:t>
+      </w:r>
+      <w:r>
+        <w:t xml:space="preserve"> </w:t>
+      </w:r>
+      <w:r>
+        <w:t xml:space="preserve">without it, using something you discussed in a meeting</w:t>
+      </w:r>
+      <w:r>
+        <w:t xml:space="preserve"> </w:t>
+      </w:r>
+      <w:r>
+        <w:t xml:space="preserve">while working in Claude, ChatGPT, or Cursor</w:t>
+      </w:r>
+      <w:r>
+        <w:t xml:space="preserve"> </w:t>
+      </w:r>
+      <w:r>
+        <w:t xml:space="preserve">means finding the note, copying the relevant bit, and pasting it in.</w:t>
+      </w:r>
+      <w:r>
+        <w:t xml:space="preserve"> </w:t>
+      </w:r>
+      <w:r>
+        <w:t xml:space="preserve">With the MCP connected, that context rides with you.</w:t>
+      </w:r>
+      <w:r>
+        <w:t xml:space="preserve"> </w:t>
+      </w:r>
+      <w:r>
+        <w:t xml:space="preserve">Use it to turn a standup into Linear tickets,</w:t>
+      </w:r>
+      <w:r>
+        <w:t xml:space="preserve"> </w:t>
+      </w:r>
+      <w:r>
+        <w:t xml:space="preserve">scaffold a feature from what was agreed,</w:t>
+      </w:r>
+      <w:r>
+        <w:t xml:space="preserve"> </w:t>
+      </w:r>
+      <w:r>
+        <w:t xml:space="preserve">or draft a follow-up from what was actually said.</w:t>
+      </w:r>
+    </w:p>
+    <w:p>
+      <w:pPr>
+        <w:pStyle w:val="BodyText"/>
+      </w:pPr>
+      <w:r>
+        <w:t xml:space="preserve">It connects through the standard</w:t>
+      </w:r>
+      <w:r>
+        <w:t xml:space="preserve"> </w:t>
+      </w:r>
+      <w:hyperlink r:id="rId30">
+        <w:r>
+          <w:rPr>
+            <w:rStyle w:val="Hyperlink"/>
+          </w:rPr>
+          <w:t xml:space="preserve">Model Context Protocol</w:t>
+        </w:r>
+      </w:hyperlink>
+      <w:r>
+        <w:t xml:space="preserve"> </w:t>
+      </w:r>
+      <w:r>
+        <w:t xml:space="preserve">(MCP)</w:t>
+      </w:r>
+      <w:r>
+        <w:t xml:space="preserve"> </w:t>
+      </w:r>
+      <w:r>
+        <w:t xml:space="preserve">as a remote server at</w:t>
+      </w:r>
+      <w:r>
+        <w:t xml:space="preserve"> </w:t>
+      </w:r>
+      <w:r>
+        <w:rPr>
+          <w:rStyle w:val="VerbatimChar"/>
+        </w:rPr>
+        <w:t xml:space="preserve">https://mcp.granola.ai/mcp</w:t>
+      </w:r>
+      <w:r>
+        <w:t xml:space="preserve">.</w:t>
+      </w:r>
+      <w:r>
+        <w:t xml:space="preserve"> </w:t>
+      </w:r>
+      <w:r>
+        <w:t xml:space="preserve">For Claude or ChatGPT, enable it from the app’s connector/app settings</w:t>
+      </w:r>
+      <w:r>
+        <w:t xml:space="preserve"> </w:t>
+      </w:r>
+      <w:r>
+        <w:t xml:space="preserve">and authenticate;</w:t>
+      </w:r>
+      <w:r>
+        <w:t xml:space="preserve"> </w:t>
+      </w:r>
+      <w:r>
+        <w:t xml:space="preserve">for Cursor, Claude Code, or any other MCP client that supports a manual URL,</w:t>
+      </w:r>
+      <w:r>
+        <w:t xml:space="preserve"> </w:t>
+      </w:r>
+      <w:r>
+        <w:t xml:space="preserve">register that URL directly</w:t>
+      </w:r>
+      <w:r>
+        <w:t xml:space="preserve"> </w:t>
+      </w:r>
+      <w:r>
+        <w:t xml:space="preserve">(see</w:t>
+      </w:r>
+      <w:r>
+        <w:t xml:space="preserve"> </w:t>
+      </w:r>
+      <w:hyperlink r:id="rId410">
+        <w:r>
+          <w:rPr>
+            <w:rStyle w:val="Hyperlink"/>
+          </w:rPr>
+          <w:t xml:space="preserve">the announcement</w:t>
+        </w:r>
+      </w:hyperlink>
+      <w:r>
+        <w:t xml:space="preserve"> </w:t>
+      </w:r>
+      <w:r>
+        <w:t xml:space="preserve">for per-client steps).</w:t>
+      </w:r>
+      <w:r>
+        <w:t xml:space="preserve"> </w:t>
+      </w:r>
+      <w:r>
+        <w:t xml:space="preserve">On an Enterprise plan it is an early-access beta,</w:t>
+      </w:r>
+      <w:r>
+        <w:t xml:space="preserve"> </w:t>
+      </w:r>
+      <w:r>
+        <w:t xml:space="preserve">off by default until an admin enables it.</w:t>
+      </w:r>
+    </w:p>
+    <w:bookmarkEnd w:id="411"/>
+    <w:bookmarkEnd w:id="412"/>
+    <w:bookmarkStart w:id="420" w:name="sec-ai-gemini-spend-management"/>
     <w:p>
       <w:pPr>
         <w:pStyle w:val="Heading1"/>
@@ -60822,7 +61021,7 @@
         <w:t xml:space="preserve">and optimize token consumption across local tools and GitHub Actions workflows.</w:t>
       </w:r>
     </w:p>
-    <w:bookmarkStart w:id="412" w:name="Xd8c10be17edf039db5b664720f228274181ba18"/>
+    <w:bookmarkStart w:id="414" w:name="Xd8c10be17edf039db5b664720f228274181ba18"/>
     <w:p>
       <w:pPr>
         <w:pStyle w:val="Heading4"/>
@@ -60886,7 +61085,7 @@
       <w:r>
         <w:t xml:space="preserve"> </w:t>
       </w:r>
-      <w:hyperlink r:id="rId411">
+      <w:hyperlink r:id="rId413">
         <w:r>
           <w:rPr>
             <w:rStyle w:val="Hyperlink"/>
@@ -60981,7 +61180,7 @@
       <w:r>
         <w:t xml:space="preserve"> </w:t>
       </w:r>
-      <w:hyperlink r:id="rId411">
+      <w:hyperlink r:id="rId413">
         <w:r>
           <w:rPr>
             <w:rStyle w:val="Hyperlink"/>
@@ -61017,8 +61216,8 @@
         <w:t xml:space="preserve">Any project that has hit its monthly spend cap will have its API requests paused until the limit is updated.</w:t>
       </w:r>
     </w:p>
-    <w:bookmarkEnd w:id="412"/>
-    <w:bookmarkStart w:id="414" w:name="adjusting-and-unpausing-spend-caps"/>
+    <w:bookmarkEnd w:id="414"/>
+    <w:bookmarkStart w:id="416" w:name="adjusting-and-unpausing-spend-caps"/>
     <w:p>
       <w:pPr>
         <w:pStyle w:val="Heading4"/>
@@ -61049,7 +61248,7 @@
       <w:r>
         <w:t xml:space="preserve"> </w:t>
       </w:r>
-      <w:hyperlink r:id="rId413">
+      <w:hyperlink r:id="rId415">
         <w:r>
           <w:rPr>
             <w:rStyle w:val="Hyperlink"/>
@@ -61118,8 +61317,8 @@
         <w:t xml:space="preserve">and API service automatically resumes up to the configured cap.</w:t>
       </w:r>
     </w:p>
-    <w:bookmarkEnd w:id="414"/>
-    <w:bookmarkStart w:id="416" w:name="setting-up-google-cloud-budget-alerts"/>
+    <w:bookmarkEnd w:id="416"/>
+    <w:bookmarkStart w:id="418" w:name="setting-up-google-cloud-budget-alerts"/>
     <w:p>
       <w:pPr>
         <w:pStyle w:val="Heading4"/>
@@ -61150,7 +61349,7 @@
       <w:r>
         <w:t xml:space="preserve"> </w:t>
       </w:r>
-      <w:hyperlink r:id="rId415">
+      <w:hyperlink r:id="rId417">
         <w:r>
           <w:rPr>
             <w:rStyle w:val="Hyperlink"/>
@@ -61302,8 +61501,8 @@
         <w:t xml:space="preserve">. You will receive email alerts before any project hits its spend cap.</w:t>
       </w:r>
     </w:p>
-    <w:bookmarkEnd w:id="416"/>
-    <w:bookmarkStart w:id="417" w:name="cost-optimization-best-practices"/>
+    <w:bookmarkEnd w:id="418"/>
+    <w:bookmarkStart w:id="419" w:name="cost-optimization-best-practices"/>
     <w:p>
       <w:pPr>
         <w:pStyle w:val="Heading4"/>
@@ -61618,9 +61817,9 @@
         <w:t xml:space="preserve">to collapse them in GitHub’s web diff view and exclude them from repository language statistics.</w:t>
       </w:r>
     </w:p>
-    <w:bookmarkEnd w:id="417"/>
-    <w:bookmarkEnd w:id="418"/>
-    <w:bookmarkStart w:id="448" w:name="references"/>
+    <w:bookmarkEnd w:id="419"/>
+    <w:bookmarkEnd w:id="420"/>
+    <w:bookmarkStart w:id="450" w:name="references"/>
     <w:p>
       <w:pPr>
         <w:pStyle w:val="Heading1"/>
@@ -61629,8 +61828,8 @@
         <w:t xml:space="preserve">References</w:t>
       </w:r>
     </w:p>
-    <w:bookmarkStart w:id="447" w:name="refs"/>
-    <w:bookmarkStart w:id="420" w:name="ref-space_odyssey"/>
+    <w:bookmarkStart w:id="449" w:name="refs"/>
+    <w:bookmarkStart w:id="422" w:name="ref-space_odyssey"/>
     <w:p>
       <w:pPr>
         <w:pStyle w:val="Bibliography"/>
@@ -61648,7 +61847,7 @@
       <w:r>
         <w:t xml:space="preserve"> </w:t>
       </w:r>
-      <w:hyperlink r:id="rId419">
+      <w:hyperlink r:id="rId421">
         <w:r>
           <w:rPr>
             <w:rStyle w:val="Hyperlink"/>
@@ -61660,8 +61859,8 @@
         <w:t xml:space="preserve">.</w:t>
       </w:r>
     </w:p>
-    <w:bookmarkEnd w:id="420"/>
-    <w:bookmarkStart w:id="422" w:name="ref-i_robot"/>
+    <w:bookmarkEnd w:id="422"/>
+    <w:bookmarkStart w:id="424" w:name="ref-i_robot"/>
     <w:p>
       <w:pPr>
         <w:pStyle w:val="Bibliography"/>
@@ -61685,7 +61884,7 @@
       <w:r>
         <w:t xml:space="preserve"> </w:t>
       </w:r>
-      <w:hyperlink r:id="rId421">
+      <w:hyperlink r:id="rId423">
         <w:r>
           <w:rPr>
             <w:rStyle w:val="Hyperlink"/>
@@ -61697,8 +61896,8 @@
         <w:t xml:space="preserve">.</w:t>
       </w:r>
     </w:p>
-    <w:bookmarkEnd w:id="422"/>
-    <w:bookmarkStart w:id="424" w:name="ref-battlestar_galactica_2004"/>
+    <w:bookmarkEnd w:id="424"/>
+    <w:bookmarkStart w:id="426" w:name="ref-battlestar_galactica_2004"/>
     <w:p>
       <w:pPr>
         <w:pStyle w:val="Bibliography"/>
@@ -61716,7 +61915,7 @@
       <w:r>
         <w:t xml:space="preserve"> </w:t>
       </w:r>
-      <w:hyperlink r:id="rId423">
+      <w:hyperlink r:id="rId425">
         <w:r>
           <w:rPr>
             <w:rStyle w:val="Hyperlink"/>
@@ -61728,8 +61927,8 @@
         <w:t xml:space="preserve">.</w:t>
       </w:r>
     </w:p>
-    <w:bookmarkEnd w:id="424"/>
-    <w:bookmarkStart w:id="426" w:name="ref-slm_agentic_ai"/>
+    <w:bookmarkEnd w:id="426"/>
+    <w:bookmarkStart w:id="428" w:name="ref-slm_agentic_ai"/>
     <w:p>
       <w:pPr>
         <w:pStyle w:val="Bibliography"/>
@@ -61753,7 +61952,7 @@
       <w:r>
         <w:t xml:space="preserve"> </w:t>
       </w:r>
-      <w:hyperlink r:id="rId425">
+      <w:hyperlink r:id="rId427">
         <w:r>
           <w:rPr>
             <w:rStyle w:val="Hyperlink"/>
@@ -61765,8 +61964,8 @@
         <w:t xml:space="preserve">.</w:t>
       </w:r>
     </w:p>
-    <w:bookmarkEnd w:id="426"/>
-    <w:bookmarkStart w:id="428" w:name="ref-blade_runner"/>
+    <w:bookmarkEnd w:id="428"/>
+    <w:bookmarkStart w:id="430" w:name="ref-blade_runner"/>
     <w:p>
       <w:pPr>
         <w:pStyle w:val="Bibliography"/>
@@ -61784,7 +61983,7 @@
       <w:r>
         <w:t xml:space="preserve"> </w:t>
       </w:r>
-      <w:hyperlink r:id="rId427">
+      <w:hyperlink r:id="rId429">
         <w:r>
           <w:rPr>
             <w:rStyle w:val="Hyperlink"/>
@@ -61796,8 +61995,8 @@
         <w:t xml:space="preserve">.</w:t>
       </w:r>
     </w:p>
-    <w:bookmarkEnd w:id="428"/>
-    <w:bookmarkStart w:id="430" w:name="ref-enders_game"/>
+    <w:bookmarkEnd w:id="430"/>
+    <w:bookmarkStart w:id="432" w:name="ref-enders_game"/>
     <w:p>
       <w:pPr>
         <w:pStyle w:val="Bibliography"/>
@@ -61821,7 +62020,7 @@
       <w:r>
         <w:t xml:space="preserve"> </w:t>
       </w:r>
-      <w:hyperlink r:id="rId429">
+      <w:hyperlink r:id="rId431">
         <w:r>
           <w:rPr>
             <w:rStyle w:val="Hyperlink"/>
@@ -61833,8 +62032,8 @@
         <w:t xml:space="preserve">.</w:t>
       </w:r>
     </w:p>
-    <w:bookmarkEnd w:id="430"/>
-    <w:bookmarkStart w:id="432" w:name="ref-qlora"/>
+    <w:bookmarkEnd w:id="432"/>
+    <w:bookmarkStart w:id="434" w:name="ref-qlora"/>
     <w:p>
       <w:pPr>
         <w:pStyle w:val="Bibliography"/>
@@ -61858,7 +62057,7 @@
       <w:r>
         <w:t xml:space="preserve"> </w:t>
       </w:r>
-      <w:hyperlink r:id="rId431">
+      <w:hyperlink r:id="rId433">
         <w:r>
           <w:rPr>
             <w:rStyle w:val="Hyperlink"/>
@@ -61870,8 +62069,8 @@
         <w:t xml:space="preserve">.</w:t>
       </w:r>
     </w:p>
-    <w:bookmarkEnd w:id="432"/>
-    <w:bookmarkStart w:id="434" w:name="ref-humans_are_dead"/>
+    <w:bookmarkEnd w:id="434"/>
+    <w:bookmarkStart w:id="436" w:name="ref-humans_are_dead"/>
     <w:p>
       <w:pPr>
         <w:pStyle w:val="Bibliography"/>
@@ -61895,7 +62094,7 @@
       <w:r>
         <w:t xml:space="preserve"> </w:t>
       </w:r>
-      <w:hyperlink r:id="rId433">
+      <w:hyperlink r:id="rId435">
         <w:r>
           <w:rPr>
             <w:rStyle w:val="Hyperlink"/>
@@ -61907,8 +62106,8 @@
         <w:t xml:space="preserve">.</w:t>
       </w:r>
     </w:p>
-    <w:bookmarkEnd w:id="434"/>
-    <w:bookmarkStart w:id="436" w:name="ref-dune"/>
+    <w:bookmarkEnd w:id="436"/>
+    <w:bookmarkStart w:id="438" w:name="ref-dune"/>
     <w:p>
       <w:pPr>
         <w:pStyle w:val="Bibliography"/>
@@ -61932,7 +62131,7 @@
       <w:r>
         <w:t xml:space="preserve"> </w:t>
       </w:r>
-      <w:hyperlink r:id="rId435">
+      <w:hyperlink r:id="rId437">
         <w:r>
           <w:rPr>
             <w:rStyle w:val="Hyperlink"/>
@@ -61944,8 +62143,8 @@
         <w:t xml:space="preserve">.</w:t>
       </w:r>
     </w:p>
-    <w:bookmarkEnd w:id="436"/>
-    <w:bookmarkStart w:id="438" w:name="ref-lora"/>
+    <w:bookmarkEnd w:id="438"/>
+    <w:bookmarkStart w:id="440" w:name="ref-lora"/>
     <w:p>
       <w:pPr>
         <w:pStyle w:val="Bibliography"/>
@@ -61969,7 +62168,7 @@
       <w:r>
         <w:t xml:space="preserve"> </w:t>
       </w:r>
-      <w:hyperlink r:id="rId437">
+      <w:hyperlink r:id="rId439">
         <w:r>
           <w:rPr>
             <w:rStyle w:val="Hyperlink"/>
@@ -61981,8 +62180,8 @@
         <w:t xml:space="preserve">.</w:t>
       </w:r>
     </w:p>
-    <w:bookmarkEnd w:id="438"/>
-    <w:bookmarkStart w:id="440" w:name="ref-lecun_world_models"/>
+    <w:bookmarkEnd w:id="440"/>
+    <w:bookmarkStart w:id="442" w:name="ref-lecun_world_models"/>
     <w:p>
       <w:pPr>
         <w:pStyle w:val="Bibliography"/>
@@ -62006,7 +62205,7 @@
       <w:r>
         <w:t xml:space="preserve"> </w:t>
       </w:r>
-      <w:hyperlink r:id="rId439">
+      <w:hyperlink r:id="rId441">
         <w:r>
           <w:rPr>
             <w:rStyle w:val="Hyperlink"/>
@@ -62018,8 +62217,8 @@
         <w:t xml:space="preserve">.</w:t>
       </w:r>
     </w:p>
-    <w:bookmarkEnd w:id="440"/>
-    <w:bookmarkStart w:id="442" w:name="ref-terminator"/>
+    <w:bookmarkEnd w:id="442"/>
+    <w:bookmarkStart w:id="444" w:name="ref-terminator"/>
     <w:p>
       <w:pPr>
         <w:pStyle w:val="Bibliography"/>
@@ -62037,7 +62236,7 @@
       <w:r>
         <w:t xml:space="preserve"> </w:t>
       </w:r>
-      <w:hyperlink r:id="rId441">
+      <w:hyperlink r:id="rId443">
         <w:r>
           <w:rPr>
             <w:rStyle w:val="Hyperlink"/>
@@ -62049,8 +62248,8 @@
         <w:t xml:space="preserve">.</w:t>
       </w:r>
     </w:p>
-    <w:bookmarkEnd w:id="442"/>
-    <w:bookmarkStart w:id="444" w:name="ref-matrix"/>
+    <w:bookmarkEnd w:id="444"/>
+    <w:bookmarkStart w:id="446" w:name="ref-matrix"/>
     <w:p>
       <w:pPr>
         <w:pStyle w:val="Bibliography"/>
@@ -62068,7 +62267,7 @@
       <w:r>
         <w:t xml:space="preserve"> </w:t>
       </w:r>
-      <w:hyperlink r:id="rId443">
+      <w:hyperlink r:id="rId445">
         <w:r>
           <w:rPr>
             <w:rStyle w:val="Hyperlink"/>
@@ -62080,8 +62279,8 @@
         <w:t xml:space="preserve">.</w:t>
       </w:r>
     </w:p>
-    <w:bookmarkEnd w:id="444"/>
-    <w:bookmarkStart w:id="446" w:name="ref-wargames"/>
+    <w:bookmarkEnd w:id="446"/>
+    <w:bookmarkStart w:id="448" w:name="ref-wargames"/>
     <w:p>
       <w:pPr>
         <w:pStyle w:val="Bibliography"/>
@@ -62099,7 +62298,7 @@
       <w:r>
         <w:t xml:space="preserve"> </w:t>
       </w:r>
-      <w:hyperlink r:id="rId445">
+      <w:hyperlink r:id="rId447">
         <w:r>
           <w:rPr>
             <w:rStyle w:val="Hyperlink"/>
@@ -62111,9 +62310,9 @@
         <w:t xml:space="preserve">.</w:t>
       </w:r>
     </w:p>
-    <w:bookmarkEnd w:id="446"/>
-    <w:bookmarkEnd w:id="447"/>
     <w:bookmarkEnd w:id="448"/>
+    <w:bookmarkEnd w:id="449"/>
+    <w:bookmarkEnd w:id="450"/>
     <w:sectPr>
       <w:footnotePr>
         <w:numRestart w:val="eachSect"/>

</xml_diff>

<commit_message>
Deploying to gh-pages from @ Morrison-Lab/wai@7416830946cde1f80d7057a8e3dec8c5e015ac6f 🚀
</commit_message>
<xml_diff>
--- a/chapters/coding-agents.docx
+++ b/chapters/coding-agents.docx
@@ -15,7 +15,7 @@
         <w:pStyle w:val="Date"/>
       </w:pPr>
       <w:r>
-        <w:t xml:space="preserve">Last modified: 2026-08-29 23:00:34 (PDT)</w:t>
+        <w:t xml:space="preserve">Last modified: 2026-08-29 23:08:45 (PDT)</w:t>
       </w:r>
     </w:p>
     <w:p>
@@ -43219,7 +43219,7 @@
     </w:p>
     <w:bookmarkEnd w:id="291"/>
     <w:bookmarkEnd w:id="292"/>
-    <w:bookmarkStart w:id="299" w:name="sec-ai-useful-plugins"/>
+    <w:bookmarkStart w:id="300" w:name="sec-ai-useful-plugins"/>
     <w:p>
       <w:pPr>
         <w:pStyle w:val="Heading1"/>
@@ -43673,6 +43673,91 @@
       <w:pPr>
         <w:pStyle w:val="BodyText"/>
       </w:pPr>
+      <w:hyperlink r:id="rId298">
+        <w:r>
+          <w:rPr>
+            <w:rStyle w:val="Hyperlink"/>
+          </w:rPr>
+          <w:t xml:space="preserve">Contextify</w:t>
+        </w:r>
+      </w:hyperlink>
+      <w:r>
+        <w:t xml:space="preserve"> </w:t>
+      </w:r>
+      <w:r>
+        <w:t xml:space="preserve">keeps your Claude Code and Codex history forever</w:t>
+      </w:r>
+      <w:r>
+        <w:t xml:space="preserve"> </w:t>
+      </w:r>
+      <w:r>
+        <w:t xml:space="preserve">in a private, searchable timeline.</w:t>
+      </w:r>
+      <w:r>
+        <w:t xml:space="preserve"> </w:t>
+      </w:r>
+      <w:r>
+        <w:t xml:space="preserve">Claude Code deletes history after 30 days;</w:t>
+      </w:r>
+      <w:r>
+        <w:t xml:space="preserve"> </w:t>
+      </w:r>
+      <w:r>
+        <w:t xml:space="preserve">Contextify watches both tools,</w:t>
+      </w:r>
+      <w:r>
+        <w:t xml:space="preserve"> </w:t>
+      </w:r>
+      <w:r>
+        <w:t xml:space="preserve">summarizes each message (on-device via Apple Intelligence on macOS 26,</w:t>
+      </w:r>
+      <w:r>
+        <w:t xml:space="preserve"> </w:t>
+      </w:r>
+      <w:r>
+        <w:t xml:space="preserve">or Lite Mode on macOS 15),</w:t>
+      </w:r>
+      <w:r>
+        <w:t xml:space="preserve"> </w:t>
+      </w:r>
+      <w:r>
+        <w:t xml:space="preserve">and lets you search every conversation you ever had.</w:t>
+      </w:r>
+      <w:r>
+        <w:t xml:space="preserve"> </w:t>
+      </w:r>
+      <w:r>
+        <w:t xml:space="preserve">It runs local-first with no account required,</w:t>
+      </w:r>
+      <w:r>
+        <w:t xml:space="preserve"> </w:t>
+      </w:r>
+      <w:r>
+        <w:t xml:space="preserve">and optionally syncs across devices via Cloud Sync</w:t>
+      </w:r>
+      <w:r>
+        <w:t xml:space="preserve"> </w:t>
+      </w:r>
+      <w:r>
+        <w:t xml:space="preserve">or a self-hosted instance you operate.</w:t>
+      </w:r>
+      <w:r>
+        <w:t xml:space="preserve"> </w:t>
+      </w:r>
+      <w:r>
+        <w:t xml:space="preserve">The ambient timeline lets you follow sessions in real time</w:t>
+      </w:r>
+      <w:r>
+        <w:t xml:space="preserve"> </w:t>
+      </w:r>
+      <w:r>
+        <w:t xml:space="preserve">or skim what happened while you were away.</w:t>
+      </w:r>
+    </w:p>
+    <w:p>
+      <w:pPr>
+        <w:pStyle w:val="BodyText"/>
+      </w:pPr>
       <w:r>
         <w:t xml:space="preserve">The lab’s portable agent config lives in</w:t>
       </w:r>
@@ -43696,7 +43781,7 @@
       <w:r>
         <w:t xml:space="preserve"> </w:t>
       </w:r>
-      <w:hyperlink r:id="rId298">
+      <w:hyperlink r:id="rId299">
         <w:r>
           <w:rPr>
             <w:rStyle w:val="VerbatimChar"/>
@@ -43769,8 +43854,8 @@
         <w:t xml:space="preserve">is the worked example of what the corpus contains.</w:t>
       </w:r>
     </w:p>
-    <w:bookmarkEnd w:id="299"/>
-    <w:bookmarkStart w:id="319" w:name="sec-ai-customization"/>
+    <w:bookmarkEnd w:id="300"/>
+    <w:bookmarkStart w:id="320" w:name="sec-ai-customization"/>
     <w:p>
       <w:pPr>
         <w:pStyle w:val="Heading1"/>
@@ -43895,7 +43980,7 @@
         <w:t xml:space="preserve">.</w:t>
       </w:r>
     </w:p>
-    <w:bookmarkStart w:id="301" w:name="the-question-that-picks-the-mechanism"/>
+    <w:bookmarkStart w:id="302" w:name="the-question-that-picks-the-mechanism"/>
     <w:p>
       <w:pPr>
         <w:pStyle w:val="Heading4"/>
@@ -43996,7 +44081,7 @@
       <w:r>
         <w:t xml:space="preserve"> </w:t>
       </w:r>
-      <w:hyperlink r:id="rId300">
+      <w:hyperlink r:id="rId301">
         <w:r>
           <w:rPr>
             <w:rStyle w:val="Hyperlink"/>
@@ -44081,8 +44166,8 @@
         <w:t xml:space="preserve">.</w:t>
       </w:r>
     </w:p>
-    <w:bookmarkEnd w:id="301"/>
-    <w:bookmarkStart w:id="303" w:name="instruction-files-always-on-context"/>
+    <w:bookmarkEnd w:id="302"/>
+    <w:bookmarkStart w:id="304" w:name="instruction-files-always-on-context"/>
     <w:p>
       <w:pPr>
         <w:pStyle w:val="Heading4"/>
@@ -44186,7 +44271,7 @@
       <w:r>
         <w:t xml:space="preserve"> </w:t>
       </w:r>
-      <w:hyperlink r:id="rId300">
+      <w:hyperlink r:id="rId301">
         <w:r>
           <w:rPr>
             <w:rStyle w:val="Hyperlink"/>
@@ -44329,7 +44414,7 @@
       <w:r>
         <w:t xml:space="preserve"> </w:t>
       </w:r>
-      <w:hyperlink r:id="rId300">
+      <w:hyperlink r:id="rId301">
         <w:r>
           <w:rPr>
             <w:rStyle w:val="Hyperlink"/>
@@ -44433,7 +44518,7 @@
       <w:r>
         <w:t xml:space="preserve"> </w:t>
       </w:r>
-      <w:hyperlink r:id="rId302">
+      <w:hyperlink r:id="rId303">
         <w:r>
           <w:rPr>
             <w:rStyle w:val="Hyperlink"/>
@@ -44553,8 +44638,8 @@
         <w:t xml:space="preserve">and guaranteed nothing about acting on it alike.</w:t>
       </w:r>
     </w:p>
-    <w:bookmarkEnd w:id="303"/>
-    <w:bookmarkStart w:id="304" w:name="workspace-rules-and-activation-modes"/>
+    <w:bookmarkEnd w:id="304"/>
+    <w:bookmarkStart w:id="305" w:name="workspace-rules-and-activation-modes"/>
     <w:p>
       <w:pPr>
         <w:pStyle w:val="Heading4"/>
@@ -44823,8 +44908,8 @@
         <w:t xml:space="preserve">).</w:t>
       </w:r>
     </w:p>
-    <w:bookmarkEnd w:id="304"/>
-    <w:bookmarkStart w:id="307" w:name="skills-and-the-commands-that-became-them"/>
+    <w:bookmarkEnd w:id="305"/>
+    <w:bookmarkStart w:id="308" w:name="skills-and-the-commands-that-became-them"/>
     <w:p>
       <w:pPr>
         <w:pStyle w:val="Heading4"/>
@@ -44849,7 +44934,7 @@
       <w:r>
         <w:t xml:space="preserve"> </w:t>
       </w:r>
-      <w:hyperlink r:id="rId305">
+      <w:hyperlink r:id="rId306">
         <w:r>
           <w:rPr>
             <w:rStyle w:val="Hyperlink"/>
@@ -45407,7 +45492,7 @@
       <w:r>
         <w:t xml:space="preserve"> </w:t>
       </w:r>
-      <w:hyperlink r:id="rId306">
+      <w:hyperlink r:id="rId307">
         <w:r>
           <w:rPr>
             <w:rStyle w:val="Hyperlink"/>
@@ -45473,8 +45558,8 @@
         <w:t xml:space="preserve">a competitor’s directory name.</w:t>
       </w:r>
     </w:p>
-    <w:bookmarkEnd w:id="307"/>
-    <w:bookmarkStart w:id="309" w:name="subagents-delegating-to-a-fresh-context"/>
+    <w:bookmarkEnd w:id="308"/>
+    <w:bookmarkStart w:id="310" w:name="subagents-delegating-to-a-fresh-context"/>
     <w:p>
       <w:pPr>
         <w:pStyle w:val="Heading4"/>
@@ -45623,7 +45708,7 @@
       <w:r>
         <w:t xml:space="preserve"> </w:t>
       </w:r>
-      <w:hyperlink r:id="rId308">
+      <w:hyperlink r:id="rId309">
         <w:r>
           <w:rPr>
             <w:rStyle w:val="Hyperlink"/>
@@ -45646,7 +45731,7 @@
       <w:r>
         <w:t xml:space="preserve"> </w:t>
       </w:r>
-      <w:hyperlink r:id="rId305">
+      <w:hyperlink r:id="rId306">
         <w:r>
           <w:rPr>
             <w:rStyle w:val="Hyperlink"/>
@@ -45711,8 +45796,8 @@
         <w:t xml:space="preserve">The @-mention controls which subagent Claude invokes, not what prompt it receives.</w:t>
       </w:r>
     </w:p>
-    <w:bookmarkEnd w:id="309"/>
-    <w:bookmarkStart w:id="311" w:name="Xf185306762ce2c53b5a7ee53d7e6e74f0af7607"/>
+    <w:bookmarkEnd w:id="310"/>
+    <w:bookmarkStart w:id="312" w:name="Xf185306762ce2c53b5a7ee53d7e6e74f0af7607"/>
     <w:p>
       <w:pPr>
         <w:pStyle w:val="Heading4"/>
@@ -45756,7 +45841,7 @@
       <w:r>
         <w:t xml:space="preserve"> </w:t>
       </w:r>
-      <w:hyperlink r:id="rId310">
+      <w:hyperlink r:id="rId311">
         <w:r>
           <w:rPr>
             <w:rStyle w:val="Hyperlink"/>
@@ -45791,7 +45876,7 @@
       <w:r>
         <w:t xml:space="preserve"> </w:t>
       </w:r>
-      <w:hyperlink r:id="rId300">
+      <w:hyperlink r:id="rId301">
         <w:r>
           <w:rPr>
             <w:rStyle w:val="Hyperlink"/>
@@ -46010,8 +46095,8 @@
         <w:t xml:space="preserve">hook decides.</w:t>
       </w:r>
     </w:p>
-    <w:bookmarkEnd w:id="311"/>
-    <w:bookmarkStart w:id="313" w:name="X661523c6623257371ddb85eca0962e6d24391f6"/>
+    <w:bookmarkEnd w:id="312"/>
+    <w:bookmarkStart w:id="314" w:name="X661523c6623257371ddb85eca0962e6d24391f6"/>
     <w:p>
       <w:pPr>
         <w:pStyle w:val="Heading4"/>
@@ -46093,7 +46178,7 @@
       <w:r>
         <w:t xml:space="preserve"> </w:t>
       </w:r>
-      <w:hyperlink r:id="rId312">
+      <w:hyperlink r:id="rId313">
         <w:r>
           <w:rPr>
             <w:rStyle w:val="Hyperlink"/>
@@ -46252,8 +46337,8 @@
         <w:t xml:space="preserve">a repository can tighten what you allow, and cannot quietly loosen it.</w:t>
       </w:r>
     </w:p>
-    <w:bookmarkEnd w:id="313"/>
-    <w:bookmarkStart w:id="314" w:name="Xb9141ee8bf4b59ff8b077a4423dd913151d282a"/>
+    <w:bookmarkEnd w:id="314"/>
+    <w:bookmarkStart w:id="315" w:name="Xb9141ee8bf4b59ff8b077a4423dd913151d282a"/>
     <w:p>
       <w:pPr>
         <w:pStyle w:val="Heading4"/>
@@ -46386,8 +46471,8 @@
         <w:t xml:space="preserve">covers configuration and its failure modes.</w:t>
       </w:r>
     </w:p>
-    <w:bookmarkEnd w:id="314"/>
-    <w:bookmarkStart w:id="315" w:name="choosing"/>
+    <w:bookmarkEnd w:id="315"/>
+    <w:bookmarkStart w:id="316" w:name="choosing"/>
     <w:p>
       <w:pPr>
         <w:pStyle w:val="Heading4"/>
@@ -46744,8 +46829,8 @@
         </w:tc>
       </w:tr>
     </w:tbl>
-    <w:bookmarkEnd w:id="315"/>
-    <w:bookmarkStart w:id="317" w:name="what-travels-between-tools"/>
+    <w:bookmarkEnd w:id="316"/>
+    <w:bookmarkStart w:id="318" w:name="what-travels-between-tools"/>
     <w:p>
       <w:pPr>
         <w:pStyle w:val="Heading4"/>
@@ -47198,7 +47283,7 @@
             <w:pPr>
               <w:pStyle w:val="Compact"/>
             </w:pPr>
-            <w:hyperlink r:id="rId316">
+            <w:hyperlink r:id="rId317">
               <w:r>
                 <w:rPr>
                   <w:rStyle w:val="Hyperlink"/>
@@ -47295,8 +47380,8 @@
         <w:t xml:space="preserve">and are worth writing as enforcement of rules that are also stated somewhere portable.</w:t>
       </w:r>
     </w:p>
-    <w:bookmarkEnd w:id="317"/>
-    <w:bookmarkStart w:id="318" w:name="a-worked-example"/>
+    <w:bookmarkEnd w:id="318"/>
+    <w:bookmarkStart w:id="319" w:name="a-worked-example"/>
     <w:p>
       <w:pPr>
         <w:pStyle w:val="Heading4"/>
@@ -47571,9 +47656,9 @@
         <w:t xml:space="preserve">globs attach them only when you edit a matching file.</w:t>
       </w:r>
     </w:p>
-    <w:bookmarkEnd w:id="318"/>
     <w:bookmarkEnd w:id="319"/>
-    <w:bookmarkStart w:id="324" w:name="sec-ai-config-install"/>
+    <w:bookmarkEnd w:id="320"/>
+    <w:bookmarkStart w:id="325" w:name="sec-ai-config-install"/>
     <w:p>
       <w:pPr>
         <w:pStyle w:val="Heading1"/>
@@ -47679,7 +47764,7 @@
         <w:t xml:space="preserve">and a capability simply goes missing with no message that it existed.</w:t>
       </w:r>
     </w:p>
-    <w:bookmarkStart w:id="320" w:name="X09c076bdbd05e35ade785c409b9eb4387af137d"/>
+    <w:bookmarkStart w:id="321" w:name="X09c076bdbd05e35ade785c409b9eb4387af137d"/>
     <w:p>
       <w:pPr>
         <w:pStyle w:val="Heading4"/>
@@ -47913,8 +47998,8 @@
         <w:t xml:space="preserve">Pick one path.</w:t>
       </w:r>
     </w:p>
-    <w:bookmarkEnd w:id="320"/>
-    <w:bookmarkStart w:id="321" w:name="the-.claude-layout"/>
+    <w:bookmarkEnd w:id="321"/>
+    <w:bookmarkStart w:id="322" w:name="the-.claude-layout"/>
     <w:p>
       <w:pPr>
         <w:pStyle w:val="Heading4"/>
@@ -48159,8 +48244,8 @@
         <w:t xml:space="preserve">So verify both, and read the two results separately.</w:t>
       </w:r>
     </w:p>
-    <w:bookmarkEnd w:id="321"/>
-    <w:bookmarkStart w:id="322" w:name="one-plugin-per-capability"/>
+    <w:bookmarkEnd w:id="322"/>
+    <w:bookmarkStart w:id="323" w:name="one-plugin-per-capability"/>
     <w:p>
       <w:pPr>
         <w:pStyle w:val="Heading4"/>
@@ -48253,8 +48338,8 @@
         <w:t xml:space="preserve">Keep one copy enabled.</w:t>
       </w:r>
     </w:p>
-    <w:bookmarkEnd w:id="322"/>
-    <w:bookmarkStart w:id="323" w:name="failure-modes-and-their-symptoms"/>
+    <w:bookmarkEnd w:id="323"/>
+    <w:bookmarkStart w:id="324" w:name="failure-modes-and-their-symptoms"/>
     <w:p>
       <w:pPr>
         <w:pStyle w:val="Heading4"/>
@@ -48499,9 +48584,9 @@
         <w:t xml:space="preserve">suspect the install before you suspect the rule.</w:t>
       </w:r>
     </w:p>
-    <w:bookmarkEnd w:id="323"/>
     <w:bookmarkEnd w:id="324"/>
-    <w:bookmarkStart w:id="331" w:name="sec-ai-claude-cloud-env"/>
+    <w:bookmarkEnd w:id="325"/>
+    <w:bookmarkStart w:id="332" w:name="sec-ai-claude-cloud-env"/>
     <w:p>
       <w:pPr>
         <w:pStyle w:val="Heading1"/>
@@ -48543,7 +48628,7 @@
       <w:r>
         <w:t xml:space="preserve"> </w:t>
       </w:r>
-      <w:hyperlink r:id="rId325">
+      <w:hyperlink r:id="rId326">
         <w:r>
           <w:rPr>
             <w:rStyle w:val="Hyperlink"/>
@@ -48741,7 +48826,7 @@
         <w:t xml:space="preserve">for example to install dependencies.</w:t>
       </w:r>
     </w:p>
-    <w:bookmarkStart w:id="330" w:name="X99b85cd9c84d17a9c31061ff898ea0b26b46932"/>
+    <w:bookmarkStart w:id="331" w:name="X99b85cd9c84d17a9c31061ff898ea0b26b46932"/>
     <w:p>
       <w:pPr>
         <w:pStyle w:val="Heading4"/>
@@ -48902,7 +48987,7 @@
       <w:r>
         <w:t xml:space="preserve"> </w:t>
       </w:r>
-      <w:hyperlink r:id="rId325">
+      <w:hyperlink r:id="rId326">
         <w:r>
           <w:rPr>
             <w:rStyle w:val="Hyperlink"/>
@@ -48997,12 +49082,12 @@
                 <wp:inline>
                   <wp:extent cx="152400" cy="152400"/>
                   <wp:effectExtent b="0" l="0" r="0" t="0"/>
-                  <wp:docPr descr="" title="" id="326" name="Picture"/>
+                  <wp:docPr descr="" title="" id="327" name="Picture"/>
                   <a:graphic>
                     <a:graphicData uri="http://schemas.openxmlformats.org/drawingml/2006/picture">
                       <pic:pic>
                         <pic:nvPicPr>
-                          <pic:cNvPr descr="/opt/quarto/share/formats/docx/note.png" id="327" name="Picture"/>
+                          <pic:cNvPr descr="/opt/quarto/share/formats/docx/note.png" id="328" name="Picture"/>
                           <pic:cNvPicPr>
                             <a:picLocks noChangeArrowheads="1" noChangeAspect="1"/>
                           </pic:cNvPicPr>
@@ -49118,7 +49203,7 @@
       <w:r>
         <w:t xml:space="preserve"> </w:t>
       </w:r>
-      <w:hyperlink r:id="rId328">
+      <w:hyperlink r:id="rId329">
         <w:r>
           <w:rPr>
             <w:rStyle w:val="Hyperlink"/>
@@ -49135,7 +49220,7 @@
       <w:r>
         <w:t xml:space="preserve"> </w:t>
       </w:r>
-      <w:hyperlink r:id="rId329">
+      <w:hyperlink r:id="rId330">
         <w:r>
           <w:rPr>
             <w:rStyle w:val="Hyperlink"/>
@@ -49147,9 +49232,9 @@
         <w:t xml:space="preserve">.</w:t>
       </w:r>
     </w:p>
-    <w:bookmarkEnd w:id="330"/>
     <w:bookmarkEnd w:id="331"/>
-    <w:bookmarkStart w:id="338" w:name="sec-ai-codex-github-review"/>
+    <w:bookmarkEnd w:id="332"/>
+    <w:bookmarkStart w:id="339" w:name="sec-ai-codex-github-review"/>
     <w:p>
       <w:pPr>
         <w:pStyle w:val="Heading1"/>
@@ -49184,7 +49269,7 @@
         <w:t xml:space="preserve">It does not require you to build a separate GitHub Action.</w:t>
       </w:r>
     </w:p>
-    <w:bookmarkStart w:id="332" w:name="prerequisites"/>
+    <w:bookmarkStart w:id="333" w:name="prerequisites"/>
     <w:p>
       <w:pPr>
         <w:pStyle w:val="Heading4"/>
@@ -49309,8 +49394,8 @@
         <w:t xml:space="preserve">but it lets the reviewer follow repository-specific guidance.</w:t>
       </w:r>
     </w:p>
-    <w:bookmarkEnd w:id="332"/>
-    <w:bookmarkStart w:id="333" w:name="requesting-and-automating-reviews"/>
+    <w:bookmarkEnd w:id="333"/>
+    <w:bookmarkStart w:id="334" w:name="requesting-and-automating-reviews"/>
     <w:p>
       <w:pPr>
         <w:pStyle w:val="Heading4"/>
@@ -49461,8 +49546,8 @@
         <w:t xml:space="preserve">It can overlap with the general review’s security findings.</w:t>
       </w:r>
     </w:p>
-    <w:bookmarkEnd w:id="333"/>
-    <w:bookmarkStart w:id="334" w:name="Xcb3957535c68d0d36c3ddb2e418364eec25d64f"/>
+    <w:bookmarkEnd w:id="334"/>
+    <w:bookmarkStart w:id="335" w:name="Xcb3957535c68d0d36c3ddb2e418364eec25d64f"/>
     <w:p>
       <w:pPr>
         <w:pStyle w:val="Heading4"/>
@@ -49748,8 +49833,8 @@
         <w:t xml:space="preserve">both sides must permit the integration.</w:t>
       </w:r>
     </w:p>
-    <w:bookmarkEnd w:id="334"/>
-    <w:bookmarkStart w:id="335" w:name="X5db1f82696679006fc24d2d9f8d9499d172a6a5"/>
+    <w:bookmarkEnd w:id="335"/>
+    <w:bookmarkStart w:id="336" w:name="X5db1f82696679006fc24d2d9f8d9499d172a6a5"/>
     <w:p>
       <w:pPr>
         <w:pStyle w:val="Heading4"/>
@@ -49846,8 +49931,8 @@
         <w:t xml:space="preserve">Do not copy personal ChatGPT or Codex login credentials into CI secrets.</w:t>
       </w:r>
     </w:p>
-    <w:bookmarkEnd w:id="335"/>
-    <w:bookmarkStart w:id="337" w:name="adding-repository-specific-review-rules"/>
+    <w:bookmarkEnd w:id="336"/>
+    <w:bookmarkStart w:id="338" w:name="adding-repository-specific-review-rules"/>
     <w:p>
       <w:pPr>
         <w:pStyle w:val="Heading4"/>
@@ -50081,7 +50166,7 @@
       <w:r>
         <w:t xml:space="preserve"> </w:t>
       </w:r>
-      <w:hyperlink r:id="rId336">
+      <w:hyperlink r:id="rId337">
         <w:r>
           <w:rPr>
             <w:rStyle w:val="Hyperlink"/>
@@ -50093,9 +50178,9 @@
         <w:t xml:space="preserve">.</w:t>
       </w:r>
     </w:p>
-    <w:bookmarkEnd w:id="337"/>
     <w:bookmarkEnd w:id="338"/>
-    <w:bookmarkStart w:id="353" w:name="sec-ai-claude-code-action-review"/>
+    <w:bookmarkEnd w:id="339"/>
+    <w:bookmarkStart w:id="354" w:name="sec-ai-claude-code-action-review"/>
     <w:p>
       <w:pPr>
         <w:pStyle w:val="Heading1"/>
@@ -50114,7 +50199,7 @@
       <w:r>
         <w:t xml:space="preserve"> </w:t>
       </w:r>
-      <w:hyperlink r:id="rId339">
+      <w:hyperlink r:id="rId340">
         <w:r>
           <w:rPr>
             <w:rStyle w:val="Hyperlink"/>
@@ -50220,7 +50305,7 @@
         <w:t xml:space="preserve">paths can move).</w:t>
       </w:r>
     </w:p>
-    <w:bookmarkStart w:id="343" w:name="one-action-many-behaviors"/>
+    <w:bookmarkStart w:id="344" w:name="one-action-many-behaviors"/>
     <w:p>
       <w:pPr>
         <w:pStyle w:val="Heading4"/>
@@ -50239,7 +50324,7 @@
       <w:r>
         <w:t xml:space="preserve"> </w:t>
       </w:r>
-      <w:hyperlink r:id="rId340">
+      <w:hyperlink r:id="rId341">
         <w:r>
           <w:rPr>
             <w:rStyle w:val="VerbatimChar"/>
@@ -50398,7 +50483,7 @@
       <w:r>
         <w:t xml:space="preserve"> </w:t>
       </w:r>
-      <w:hyperlink r:id="rId341">
+      <w:hyperlink r:id="rId342">
         <w:r>
           <w:rPr>
             <w:rStyle w:val="VerbatimChar"/>
@@ -50436,7 +50521,7 @@
       <w:r>
         <w:t xml:space="preserve"> </w:t>
       </w:r>
-      <w:hyperlink r:id="rId342">
+      <w:hyperlink r:id="rId343">
         <w:r>
           <w:rPr>
             <w:rStyle w:val="VerbatimChar"/>
@@ -50460,8 +50545,8 @@
         <w:t xml:space="preserve">not the in-repo path.</w:t>
       </w:r>
     </w:p>
-    <w:bookmarkEnd w:id="343"/>
-    <w:bookmarkStart w:id="348" w:name="where-the-repository-reviews-its-own-prs"/>
+    <w:bookmarkEnd w:id="344"/>
+    <w:bookmarkStart w:id="349" w:name="where-the-repository-reviews-its-own-prs"/>
     <w:p>
       <w:pPr>
         <w:pStyle w:val="Heading4"/>
@@ -50477,7 +50562,7 @@
           <w:numId w:val="1139"/>
         </w:numPr>
       </w:pPr>
-      <w:hyperlink r:id="rId344">
+      <w:hyperlink r:id="rId345">
         <w:r>
           <w:rPr>
             <w:rStyle w:val="VerbatimChar"/>
@@ -50562,7 +50647,7 @@
           <w:numId w:val="1139"/>
         </w:numPr>
       </w:pPr>
-      <w:hyperlink r:id="rId345">
+      <w:hyperlink r:id="rId346">
         <w:r>
           <w:rPr>
             <w:rStyle w:val="VerbatimChar"/>
@@ -50606,7 +50691,7 @@
       <w:r>
         <w:t xml:space="preserve"> </w:t>
       </w:r>
-      <w:hyperlink r:id="rId346">
+      <w:hyperlink r:id="rId347">
         <w:r>
           <w:rPr>
             <w:rStyle w:val="VerbatimChar"/>
@@ -50720,7 +50805,7 @@
           <w:numId w:val="1139"/>
         </w:numPr>
       </w:pPr>
-      <w:hyperlink r:id="rId347">
+      <w:hyperlink r:id="rId348">
         <w:r>
           <w:rPr>
             <w:rStyle w:val="VerbatimChar"/>
@@ -50747,8 +50832,8 @@
         <w:t xml:space="preserve">are copy-paste templates for adding review to another repository.</w:t>
       </w:r>
     </w:p>
-    <w:bookmarkEnd w:id="348"/>
-    <w:bookmarkStart w:id="349" w:name="adding-review-to-your-own-repository"/>
+    <w:bookmarkEnd w:id="349"/>
+    <w:bookmarkStart w:id="350" w:name="adding-review-to-your-own-repository"/>
     <w:p>
       <w:pPr>
         <w:pStyle w:val="Heading4"/>
@@ -50914,8 +50999,8 @@
         <w:t xml:space="preserve">so you edit it the way you would edit any review checklist.</w:t>
       </w:r>
     </w:p>
-    <w:bookmarkEnd w:id="349"/>
-    <w:bookmarkStart w:id="351" w:name="reviewer-versus-claude-agent"/>
+    <w:bookmarkEnd w:id="350"/>
+    <w:bookmarkStart w:id="352" w:name="reviewer-versus-claude-agent"/>
     <w:p>
       <w:pPr>
         <w:pStyle w:val="Heading4"/>
@@ -50949,7 +51034,7 @@
       <w:r>
         <w:t xml:space="preserve"> </w:t>
       </w:r>
-      <w:hyperlink r:id="rId350">
+      <w:hyperlink r:id="rId351">
         <w:r>
           <w:rPr>
             <w:rStyle w:val="VerbatimChar"/>
@@ -51197,8 +51282,8 @@
         <w:t xml:space="preserve">-triggered workflow does.</w:t>
       </w:r>
     </w:p>
-    <w:bookmarkEnd w:id="351"/>
-    <w:bookmarkStart w:id="352" w:name="relation-to-codex-native-review"/>
+    <w:bookmarkEnd w:id="352"/>
+    <w:bookmarkStart w:id="353" w:name="relation-to-codex-native-review"/>
     <w:p>
       <w:pPr>
         <w:pStyle w:val="Heading4"/>
@@ -51271,9 +51356,9 @@
         <w:t xml:space="preserve">and triggering events are all visible and editable in your repository.</w:t>
       </w:r>
     </w:p>
-    <w:bookmarkEnd w:id="352"/>
     <w:bookmarkEnd w:id="353"/>
-    <w:bookmarkStart w:id="363" w:name="sec-ai-pr-activity-notifications"/>
+    <w:bookmarkEnd w:id="354"/>
+    <w:bookmarkStart w:id="364" w:name="sec-ai-pr-activity-notifications"/>
     <w:p>
       <w:pPr>
         <w:pStyle w:val="Heading1"/>
@@ -51617,7 +51702,7 @@
         </w:tc>
       </w:tr>
     </w:tbl>
-    <w:bookmarkStart w:id="354" w:name="the-channel-an-agent-controls"/>
+    <w:bookmarkStart w:id="355" w:name="the-channel-an-agent-controls"/>
     <w:p>
       <w:pPr>
         <w:pStyle w:val="Heading4"/>
@@ -51891,8 +51976,8 @@
         <w:t xml:space="preserve">real state, not a replacement for it.</w:t>
       </w:r>
     </w:p>
-    <w:bookmarkEnd w:id="354"/>
-    <w:bookmarkStart w:id="355" w:name="the-channel-only-a-human-controls"/>
+    <w:bookmarkEnd w:id="355"/>
+    <w:bookmarkStart w:id="356" w:name="the-channel-only-a-human-controls"/>
     <w:p>
       <w:pPr>
         <w:pStyle w:val="Heading4"/>
@@ -52195,8 +52280,8 @@
         <w:t xml:space="preserve">for the web-session context these run in.</w:t>
       </w:r>
     </w:p>
-    <w:bookmarkEnd w:id="355"/>
-    <w:bookmarkStart w:id="356" w:name="the-instruction-template-is-boilerplate"/>
+    <w:bookmarkEnd w:id="356"/>
+    <w:bookmarkStart w:id="357" w:name="the-instruction-template-is-boilerplate"/>
     <w:p>
       <w:pPr>
         <w:pStyle w:val="Heading4"/>
@@ -52462,8 +52547,8 @@
         <w:t xml:space="preserve">rather than as an instruction that a fix is owed.</w:t>
       </w:r>
     </w:p>
-    <w:bookmarkEnd w:id="356"/>
-    <w:bookmarkStart w:id="357" w:name="X3e28e99804e56791cb9e57e9eb83869f0ead0b2"/>
+    <w:bookmarkEnd w:id="357"/>
+    <w:bookmarkStart w:id="358" w:name="X3e28e99804e56791cb9e57e9eb83869f0ead0b2"/>
     <w:p>
       <w:pPr>
         <w:pStyle w:val="Heading4"/>
@@ -52592,8 +52677,8 @@
         <w:t xml:space="preserve">Toggling one says nothing about the other.</w:t>
       </w:r>
     </w:p>
-    <w:bookmarkEnd w:id="357"/>
-    <w:bookmarkStart w:id="362" w:name="treat-what-arrives-as-untrusted"/>
+    <w:bookmarkEnd w:id="358"/>
+    <w:bookmarkStart w:id="363" w:name="treat-what-arrives-as-untrusted"/>
     <w:p>
       <w:pPr>
         <w:pStyle w:val="Heading4"/>
@@ -52962,12 +53047,12 @@
                 <wp:inline>
                   <wp:extent cx="152400" cy="152400"/>
                   <wp:effectExtent b="0" l="0" r="0" t="0"/>
-                  <wp:docPr descr="" title="" id="358" name="Picture"/>
+                  <wp:docPr descr="" title="" id="359" name="Picture"/>
                   <a:graphic>
                     <a:graphicData uri="http://schemas.openxmlformats.org/drawingml/2006/picture">
                       <pic:pic>
                         <pic:nvPicPr>
-                          <pic:cNvPr descr="/opt/quarto/share/formats/docx/warning.png" id="359" name="Picture"/>
+                          <pic:cNvPr descr="/opt/quarto/share/formats/docx/warning.png" id="360" name="Picture"/>
                           <pic:cNvPicPr>
                             <a:picLocks noChangeArrowheads="1" noChangeAspect="1"/>
                           </pic:cNvPicPr>
@@ -53138,12 +53223,12 @@
                 <wp:inline>
                   <wp:extent cx="152400" cy="152400"/>
                   <wp:effectExtent b="0" l="0" r="0" t="0"/>
-                  <wp:docPr descr="" title="" id="360" name="Picture"/>
+                  <wp:docPr descr="" title="" id="361" name="Picture"/>
                   <a:graphic>
                     <a:graphicData uri="http://schemas.openxmlformats.org/drawingml/2006/picture">
                       <pic:pic>
                         <pic:nvPicPr>
-                          <pic:cNvPr descr="/opt/quarto/share/formats/docx/note.png" id="361" name="Picture"/>
+                          <pic:cNvPr descr="/opt/quarto/share/formats/docx/note.png" id="362" name="Picture"/>
                           <pic:cNvPicPr>
                             <a:picLocks noChangeArrowheads="1" noChangeAspect="1"/>
                           </pic:cNvPicPr>
@@ -53249,9 +53334,9 @@
         </w:tc>
       </w:tr>
     </w:tbl>
-    <w:bookmarkEnd w:id="362"/>
     <w:bookmarkEnd w:id="363"/>
-    <w:bookmarkStart w:id="367" w:name="sec-ai-when-to-use"/>
+    <w:bookmarkEnd w:id="364"/>
+    <w:bookmarkStart w:id="368" w:name="sec-ai-when-to-use"/>
     <w:p>
       <w:pPr>
         <w:pStyle w:val="Heading1"/>
@@ -53271,7 +53356,7 @@
         <w:rPr>
           <w:rStyle w:val="FootnoteReference"/>
         </w:rPr>
-        <w:footnoteReference w:id="364"/>
+        <w:footnoteReference w:id="365"/>
       </w:r>
       <w:r>
         <w:t xml:space="preserve"> </w:t>
@@ -53303,7 +53388,7 @@
       <w:r>
         <w:t xml:space="preserve"> </w:t>
       </w:r>
-      <w:hyperlink r:id="rId365">
+      <w:hyperlink r:id="rId366">
         <w:r>
           <w:rPr>
             <w:rStyle w:val="Hyperlink"/>
@@ -53362,7 +53447,7 @@
       <w:r>
         <w:t xml:space="preserve"> </w:t>
       </w:r>
-      <w:hyperlink r:id="rId366">
+      <w:hyperlink r:id="rId367">
         <w:r>
           <w:rPr>
             <w:rStyle w:val="Hyperlink"/>
@@ -53481,8 +53566,8 @@
         <w:t xml:space="preserve">just like you would for any other skill you want to maintain.</w:t>
       </w:r>
     </w:p>
-    <w:bookmarkEnd w:id="367"/>
-    <w:bookmarkStart w:id="372" w:name="editing-with-.docx-files"/>
+    <w:bookmarkEnd w:id="368"/>
+    <w:bookmarkStart w:id="373" w:name="editing-with-.docx-files"/>
     <w:p>
       <w:pPr>
         <w:pStyle w:val="Heading1"/>
@@ -53662,7 +53747,7 @@
         <w:t xml:space="preserve">This approach makes it easier for collaborators who are more comfortable with Word to contribute while maintaining the source files in Quarto format.</w:t>
       </w:r>
     </w:p>
-    <w:bookmarkStart w:id="371" w:name="known-issue-document-1-warning-in-word"/>
+    <w:bookmarkStart w:id="372" w:name="known-issue-document-1-warning-in-word"/>
     <w:p>
       <w:pPr>
         <w:pStyle w:val="Heading4"/>
@@ -53747,7 +53832,7 @@
           <w:numId w:val="1147"/>
         </w:numPr>
       </w:pPr>
-      <w:hyperlink r:id="rId368">
+      <w:hyperlink r:id="rId369">
         <w:r>
           <w:rPr>
             <w:rStyle w:val="Hyperlink"/>
@@ -53764,7 +53849,7 @@
           <w:numId w:val="1147"/>
         </w:numPr>
       </w:pPr>
-      <w:hyperlink r:id="rId369">
+      <w:hyperlink r:id="rId370">
         <w:r>
           <w:rPr>
             <w:rStyle w:val="Hyperlink"/>
@@ -53781,7 +53866,7 @@
           <w:numId w:val="1147"/>
         </w:numPr>
       </w:pPr>
-      <w:hyperlink r:id="rId370">
+      <w:hyperlink r:id="rId371">
         <w:r>
           <w:rPr>
             <w:rStyle w:val="Hyperlink"/>
@@ -53894,9 +53979,9 @@
         <w:t xml:space="preserve">warning and can immediately add comments and track changes without issues.</w:t>
       </w:r>
     </w:p>
-    <w:bookmarkEnd w:id="371"/>
     <w:bookmarkEnd w:id="372"/>
-    <w:bookmarkStart w:id="374" w:name="copilot-instructions-for-this-repository"/>
+    <w:bookmarkEnd w:id="373"/>
+    <w:bookmarkStart w:id="375" w:name="copilot-instructions-for-this-repository"/>
     <w:p>
       <w:pPr>
         <w:pStyle w:val="Heading1"/>
@@ -54128,7 +54213,7 @@
       <w:r>
         <w:t xml:space="preserve"> </w:t>
       </w:r>
-      <w:hyperlink r:id="rId373">
+      <w:hyperlink r:id="rId374">
         <w:r>
           <w:rPr>
             <w:rStyle w:val="VerbatimChar"/>
@@ -54143,8 +54228,8 @@
         <w:t xml:space="preserve">for a working example.</w:t>
       </w:r>
     </w:p>
-    <w:bookmarkEnd w:id="374"/>
-    <w:bookmarkStart w:id="375" w:name="using-copilot-review-before-human-review"/>
+    <w:bookmarkEnd w:id="375"/>
+    <w:bookmarkStart w:id="376" w:name="using-copilot-review-before-human-review"/>
     <w:p>
       <w:pPr>
         <w:pStyle w:val="Heading1"/>
@@ -54730,8 +54815,8 @@
         <w:t xml:space="preserve">This ensures you’re reviewing code that has already been through initial automated quality checks.</w:t>
       </w:r>
     </w:p>
-    <w:bookmarkEnd w:id="375"/>
-    <w:bookmarkStart w:id="377" w:name="reviewing-a-copilot-pr-you-didnt-create"/>
+    <w:bookmarkEnd w:id="376"/>
+    <w:bookmarkStart w:id="378" w:name="reviewing-a-copilot-pr-you-didnt-create"/>
     <w:p>
       <w:pPr>
         <w:pStyle w:val="Heading1"/>
@@ -54782,7 +54867,7 @@
       <w:r>
         <w:t xml:space="preserve"> </w:t>
       </w:r>
-      <w:hyperlink r:id="rId376">
+      <w:hyperlink r:id="rId377">
         <w:r>
           <w:rPr>
             <w:rStyle w:val="Hyperlink"/>
@@ -55686,8 +55771,8 @@
         <w:t xml:space="preserve">while benefiting from collaborative human review and Copilot’s implementation capabilities.</w:t>
       </w:r>
     </w:p>
-    <w:bookmarkEnd w:id="377"/>
-    <w:bookmarkStart w:id="396" w:name="sec-ai-claude-code-windows"/>
+    <w:bookmarkEnd w:id="378"/>
+    <w:bookmarkStart w:id="397" w:name="sec-ai-claude-code-windows"/>
     <w:p>
       <w:pPr>
         <w:pStyle w:val="Heading1"/>
@@ -55786,12 +55871,12 @@
                 <wp:inline>
                   <wp:extent cx="152400" cy="152400"/>
                   <wp:effectExtent b="0" l="0" r="0" t="0"/>
-                  <wp:docPr descr="" title="" id="378" name="Picture"/>
+                  <wp:docPr descr="" title="" id="379" name="Picture"/>
                   <a:graphic>
                     <a:graphicData uri="http://schemas.openxmlformats.org/drawingml/2006/picture">
                       <pic:pic>
                         <pic:nvPicPr>
-                          <pic:cNvPr descr="/opt/quarto/share/formats/docx/note.png" id="379" name="Picture"/>
+                          <pic:cNvPr descr="/opt/quarto/share/formats/docx/note.png" id="380" name="Picture"/>
                           <pic:cNvPicPr>
                             <a:picLocks noChangeArrowheads="1" noChangeAspect="1"/>
                           </pic:cNvPicPr>
@@ -55879,7 +55964,7 @@
         </w:tc>
       </w:tr>
     </w:tbl>
-    <w:bookmarkStart w:id="382" w:name="run-it-from-a-unix-like-terminal"/>
+    <w:bookmarkStart w:id="383" w:name="run-it-from-a-unix-like-terminal"/>
     <w:p>
       <w:pPr>
         <w:pStyle w:val="Heading4"/>
@@ -55926,7 +56011,7 @@
       <w:r>
         <w:t xml:space="preserve"> </w:t>
       </w:r>
-      <w:hyperlink r:id="rId380">
+      <w:hyperlink r:id="rId381">
         <w:r>
           <w:rPr>
             <w:rStyle w:val="Hyperlink"/>
@@ -55959,7 +56044,7 @@
       <w:r>
         <w:t xml:space="preserve">(</w:t>
       </w:r>
-      <w:hyperlink r:id="rId381">
+      <w:hyperlink r:id="rId382">
         <w:r>
           <w:rPr>
             <w:rStyle w:val="Hyperlink"/>
@@ -56110,8 +56195,8 @@
         <w:t xml:space="preserve">gotchas below don’t apply.</w:t>
       </w:r>
     </w:p>
-    <w:bookmarkEnd w:id="382"/>
-    <w:bookmarkStart w:id="387" w:name="install-claude-code"/>
+    <w:bookmarkEnd w:id="383"/>
+    <w:bookmarkStart w:id="388" w:name="install-claude-code"/>
     <w:p>
       <w:pPr>
         <w:pStyle w:val="Heading4"/>
@@ -56276,7 +56361,7 @@
       <w:r>
         <w:t xml:space="preserve"> </w:t>
       </w:r>
-      <w:hyperlink r:id="rId383">
+      <w:hyperlink r:id="rId384">
         <w:r>
           <w:rPr>
             <w:rStyle w:val="Hyperlink"/>
@@ -56362,12 +56447,12 @@
                 <wp:inline>
                   <wp:extent cx="152400" cy="152400"/>
                   <wp:effectExtent b="0" l="0" r="0" t="0"/>
-                  <wp:docPr descr="" title="" id="384" name="Picture"/>
+                  <wp:docPr descr="" title="" id="385" name="Picture"/>
                   <a:graphic>
                     <a:graphicData uri="http://schemas.openxmlformats.org/drawingml/2006/picture">
                       <pic:pic>
                         <pic:nvPicPr>
-                          <pic:cNvPr descr="/opt/quarto/share/formats/docx/important.png" id="385" name="Picture"/>
+                          <pic:cNvPr descr="/opt/quarto/share/formats/docx/important.png" id="386" name="Picture"/>
                           <pic:cNvPicPr>
                             <a:picLocks noChangeArrowheads="1" noChangeAspect="1"/>
                           </pic:cNvPicPr>
@@ -56523,7 +56608,7 @@
             <w:r>
               <w:t xml:space="preserve"> </w:t>
             </w:r>
-            <w:hyperlink r:id="rId386">
+            <w:hyperlink r:id="rId387">
               <w:r>
                 <w:rPr>
                   <w:rStyle w:val="Hyperlink"/>
@@ -56614,8 +56699,8 @@
         </w:tc>
       </w:tr>
     </w:tbl>
-    <w:bookmarkEnd w:id="387"/>
-    <w:bookmarkStart w:id="389" w:name="make-sure-your-shell-can-find-claude"/>
+    <w:bookmarkEnd w:id="388"/>
+    <w:bookmarkStart w:id="390" w:name="make-sure-your-shell-can-find-claude"/>
     <w:p>
       <w:pPr>
         <w:pStyle w:val="Heading4"/>
@@ -57213,7 +57298,7 @@
       <w:r>
         <w:t xml:space="preserve"> </w:t>
       </w:r>
-      <w:hyperlink r:id="rId388">
+      <w:hyperlink r:id="rId389">
         <w:r>
           <w:rPr>
             <w:rStyle w:val="Hyperlink"/>
@@ -57319,8 +57404,8 @@
         <w:t xml:space="preserve">initializes).</w:t>
       </w:r>
     </w:p>
-    <w:bookmarkEnd w:id="389"/>
-    <w:bookmarkStart w:id="392" w:name="X604325b0223e79803e04f87e7874b1d7f4a0663"/>
+    <w:bookmarkEnd w:id="390"/>
+    <w:bookmarkStart w:id="393" w:name="X604325b0223e79803e04f87e7874b1d7f4a0663"/>
     <w:p>
       <w:pPr>
         <w:pStyle w:val="Heading4"/>
@@ -57370,12 +57455,12 @@
                 <wp:inline>
                   <wp:extent cx="152400" cy="152400"/>
                   <wp:effectExtent b="0" l="0" r="0" t="0"/>
-                  <wp:docPr descr="" title="" id="390" name="Picture"/>
+                  <wp:docPr descr="" title="" id="391" name="Picture"/>
                   <a:graphic>
                     <a:graphicData uri="http://schemas.openxmlformats.org/drawingml/2006/picture">
                       <pic:pic>
                         <pic:nvPicPr>
-                          <pic:cNvPr descr="/opt/quarto/share/formats/docx/warning.png" id="391" name="Picture"/>
+                          <pic:cNvPr descr="/opt/quarto/share/formats/docx/warning.png" id="392" name="Picture"/>
                           <pic:cNvPicPr>
                             <a:picLocks noChangeArrowheads="1" noChangeAspect="1"/>
                           </pic:cNvPicPr>
@@ -57643,8 +57728,8 @@
         </w:tc>
       </w:tr>
     </w:tbl>
-    <w:bookmarkEnd w:id="392"/>
-    <w:bookmarkStart w:id="394" w:name="X1745fd502df7963ed7ce48d0465493b4d59ad92"/>
+    <w:bookmarkEnd w:id="393"/>
+    <w:bookmarkStart w:id="395" w:name="X1745fd502df7963ed7ce48d0465493b4d59ad92"/>
     <w:p>
       <w:pPr>
         <w:pStyle w:val="Heading4"/>
@@ -57663,7 +57748,7 @@
       <w:r>
         <w:t xml:space="preserve"> </w:t>
       </w:r>
-      <w:hyperlink r:id="rId393">
+      <w:hyperlink r:id="rId394">
         <w:r>
           <w:rPr>
             <w:rStyle w:val="Hyperlink"/>
@@ -57824,8 +57909,8 @@
         <w:t xml:space="preserve">.</w:t>
       </w:r>
     </w:p>
-    <w:bookmarkEnd w:id="394"/>
-    <w:bookmarkStart w:id="395" w:name="verify-the-install"/>
+    <w:bookmarkEnd w:id="395"/>
+    <w:bookmarkStart w:id="396" w:name="verify-the-install"/>
     <w:p>
       <w:pPr>
         <w:pStyle w:val="Heading4"/>
@@ -57994,9 +58079,9 @@
         <w:t xml:space="preserve">(or open a fresh window) after changing it.</w:t>
       </w:r>
     </w:p>
-    <w:bookmarkEnd w:id="395"/>
     <w:bookmarkEnd w:id="396"/>
-    <w:bookmarkStart w:id="412" w:name="sec-ai-mcp-server-setup"/>
+    <w:bookmarkEnd w:id="397"/>
+    <w:bookmarkStart w:id="413" w:name="sec-ai-mcp-server-setup"/>
     <w:p>
       <w:pPr>
         <w:pStyle w:val="Heading1"/>
@@ -58117,12 +58202,12 @@
                 <wp:inline>
                   <wp:extent cx="152400" cy="152400"/>
                   <wp:effectExtent b="0" l="0" r="0" t="0"/>
-                  <wp:docPr descr="" title="" id="397" name="Picture"/>
+                  <wp:docPr descr="" title="" id="398" name="Picture"/>
                   <a:graphic>
                     <a:graphicData uri="http://schemas.openxmlformats.org/drawingml/2006/picture">
                       <pic:pic>
                         <pic:nvPicPr>
-                          <pic:cNvPr descr="/opt/quarto/share/formats/docx/note.png" id="398" name="Picture"/>
+                          <pic:cNvPr descr="/opt/quarto/share/formats/docx/note.png" id="399" name="Picture"/>
                           <pic:cNvPicPr>
                             <a:picLocks noChangeArrowheads="1" noChangeAspect="1"/>
                           </pic:cNvPicPr>
@@ -58216,7 +58301,7 @@
         </w:tc>
       </w:tr>
     </w:tbl>
-    <w:bookmarkStart w:id="400" w:name="installed-is-not-registered"/>
+    <w:bookmarkStart w:id="401" w:name="installed-is-not-registered"/>
     <w:p>
       <w:pPr>
         <w:pStyle w:val="Heading4"/>
@@ -58247,7 +58332,7 @@
       <w:r>
         <w:t xml:space="preserve"> </w:t>
       </w:r>
-      <w:hyperlink r:id="rId399">
+      <w:hyperlink r:id="rId400">
         <w:r>
           <w:rPr>
             <w:rStyle w:val="VerbatimChar"/>
@@ -58315,8 +58400,8 @@
         <w:t xml:space="preserve"> mcp list</w:t>
       </w:r>
     </w:p>
-    <w:bookmarkEnd w:id="400"/>
-    <w:bookmarkStart w:id="401" w:name="Xf6682145328c756d2e167d2c91be34f7f913a7f"/>
+    <w:bookmarkEnd w:id="401"/>
+    <w:bookmarkStart w:id="402" w:name="Xf6682145328c756d2e167d2c91be34f7f913a7f"/>
     <w:p>
       <w:pPr>
         <w:pStyle w:val="Heading4"/>
@@ -58515,8 +58600,8 @@
         <w:t xml:space="preserve">A local one shows a command path instead.</w:t>
       </w:r>
     </w:p>
-    <w:bookmarkEnd w:id="401"/>
-    <w:bookmarkStart w:id="402" w:name="and-401-mean-different-things"/>
+    <w:bookmarkEnd w:id="402"/>
+    <w:bookmarkStart w:id="403" w:name="and-401-mean-different-things"/>
     <w:p>
       <w:pPr>
         <w:pStyle w:val="Heading4"/>
@@ -58759,8 +58844,8 @@
         <w:t xml:space="preserve">sends you to the token-minting page for a problem that lives in a config file.</w:t>
       </w:r>
     </w:p>
-    <w:bookmarkEnd w:id="402"/>
-    <w:bookmarkStart w:id="403" w:name="install-the-binary-the-platforms-own-way"/>
+    <w:bookmarkEnd w:id="403"/>
+    <w:bookmarkStart w:id="404" w:name="install-the-binary-the-platforms-own-way"/>
     <w:p>
       <w:pPr>
         <w:pStyle w:val="Heading4"/>
@@ -59014,8 +59099,8 @@
         <w:t xml:space="preserve">with an override for the case where it isn’t on one.</w:t>
       </w:r>
     </w:p>
-    <w:bookmarkEnd w:id="403"/>
-    <w:bookmarkStart w:id="404" w:name="X2adb24e9b1a0644f0fbebe685525dadd8a56387"/>
+    <w:bookmarkEnd w:id="404"/>
+    <w:bookmarkStart w:id="405" w:name="X2adb24e9b1a0644f0fbebe685525dadd8a56387"/>
     <w:p>
       <w:pPr>
         <w:pStyle w:val="Heading4"/>
@@ -59892,8 +59977,8 @@
         <w:t xml:space="preserve">bug you just finished diagnosing.</w:t>
       </w:r>
     </w:p>
-    <w:bookmarkEnd w:id="404"/>
-    <w:bookmarkStart w:id="405" w:name="X448547516ab06679b064b391b05a896db41ea57"/>
+    <w:bookmarkEnd w:id="405"/>
+    <w:bookmarkStart w:id="406" w:name="X448547516ab06679b064b391b05a896db41ea57"/>
     <w:p>
       <w:pPr>
         <w:pStyle w:val="Heading4"/>
@@ -60215,8 +60300,8 @@
         <w:t xml:space="preserve">the count moving the right direction, as the check above expects.</w:t>
       </w:r>
     </w:p>
-    <w:bookmarkEnd w:id="405"/>
-    <w:bookmarkStart w:id="406" w:name="X4a4c9992603eee0123b58b5b37e7fedbb817150"/>
+    <w:bookmarkEnd w:id="406"/>
+    <w:bookmarkStart w:id="407" w:name="X4a4c9992603eee0123b58b5b37e7fedbb817150"/>
     <w:p>
       <w:pPr>
         <w:pStyle w:val="Heading4"/>
@@ -60316,8 +60401,8 @@
         <w:t xml:space="preserve">Reach for those instead when working from a local harness.</w:t>
       </w:r>
     </w:p>
-    <w:bookmarkEnd w:id="406"/>
-    <w:bookmarkStart w:id="407" w:name="Xb256c2a3c0a422f2f687a98903d3521fd60a1b1"/>
+    <w:bookmarkEnd w:id="407"/>
+    <w:bookmarkStart w:id="408" w:name="Xb256c2a3c0a422f2f687a98903d3521fd60a1b1"/>
     <w:p>
       <w:pPr>
         <w:pStyle w:val="Heading4"/>
@@ -60493,8 +60578,8 @@
         <w:t xml:space="preserve">not something an agent does in passing.</w:t>
       </w:r>
     </w:p>
-    <w:bookmarkEnd w:id="407"/>
-    <w:bookmarkStart w:id="409" w:name="Xd44df015462fcf288556a538677f0a762c9ef1d"/>
+    <w:bookmarkEnd w:id="408"/>
+    <w:bookmarkStart w:id="410" w:name="Xd44df015462fcf288556a538677f0a762c9ef1d"/>
     <w:p>
       <w:pPr>
         <w:pStyle w:val="Heading4"/>
@@ -60608,7 +60693,7 @@
       <w:r>
         <w:t xml:space="preserve"> </w:t>
       </w:r>
-      <w:hyperlink r:id="rId408">
+      <w:hyperlink r:id="rId409">
         <w:r>
           <w:rPr>
             <w:rStyle w:val="Hyperlink"/>
@@ -60791,8 +60876,8 @@
         <w:t xml:space="preserve">and expect it to work.</w:t>
       </w:r>
     </w:p>
-    <w:bookmarkEnd w:id="409"/>
-    <w:bookmarkStart w:id="411" w:name="granola-mcp-your-meetings-as-context"/>
+    <w:bookmarkEnd w:id="410"/>
+    <w:bookmarkStart w:id="412" w:name="granola-mcp-your-meetings-as-context"/>
     <w:p>
       <w:pPr>
         <w:pStyle w:val="Heading4"/>
@@ -60805,7 +60890,7 @@
       <w:pPr>
         <w:pStyle w:val="FirstParagraph"/>
       </w:pPr>
-      <w:hyperlink r:id="rId410">
+      <w:hyperlink r:id="rId411">
         <w:r>
           <w:rPr>
             <w:rStyle w:val="Hyperlink"/>
@@ -60963,7 +61048,7 @@
       <w:r>
         <w:t xml:space="preserve"> </w:t>
       </w:r>
-      <w:hyperlink r:id="rId410">
+      <w:hyperlink r:id="rId411">
         <w:r>
           <w:rPr>
             <w:rStyle w:val="Hyperlink"/>
@@ -60990,9 +61075,9 @@
         <w:t xml:space="preserve">off by default until an admin enables it.</w:t>
       </w:r>
     </w:p>
-    <w:bookmarkEnd w:id="411"/>
     <w:bookmarkEnd w:id="412"/>
-    <w:bookmarkStart w:id="420" w:name="sec-ai-gemini-spend-management"/>
+    <w:bookmarkEnd w:id="413"/>
+    <w:bookmarkStart w:id="421" w:name="sec-ai-gemini-spend-management"/>
     <w:p>
       <w:pPr>
         <w:pStyle w:val="Heading1"/>
@@ -61021,7 +61106,7 @@
         <w:t xml:space="preserve">and optimize token consumption across local tools and GitHub Actions workflows.</w:t>
       </w:r>
     </w:p>
-    <w:bookmarkStart w:id="414" w:name="Xd8c10be17edf039db5b664720f228274181ba18"/>
+    <w:bookmarkStart w:id="415" w:name="Xd8c10be17edf039db5b664720f228274181ba18"/>
     <w:p>
       <w:pPr>
         <w:pStyle w:val="Heading4"/>
@@ -61085,7 +61170,7 @@
       <w:r>
         <w:t xml:space="preserve"> </w:t>
       </w:r>
-      <w:hyperlink r:id="rId413">
+      <w:hyperlink r:id="rId414">
         <w:r>
           <w:rPr>
             <w:rStyle w:val="Hyperlink"/>
@@ -61180,7 +61265,7 @@
       <w:r>
         <w:t xml:space="preserve"> </w:t>
       </w:r>
-      <w:hyperlink r:id="rId413">
+      <w:hyperlink r:id="rId414">
         <w:r>
           <w:rPr>
             <w:rStyle w:val="Hyperlink"/>
@@ -61216,8 +61301,8 @@
         <w:t xml:space="preserve">Any project that has hit its monthly spend cap will have its API requests paused until the limit is updated.</w:t>
       </w:r>
     </w:p>
-    <w:bookmarkEnd w:id="414"/>
-    <w:bookmarkStart w:id="416" w:name="adjusting-and-unpausing-spend-caps"/>
+    <w:bookmarkEnd w:id="415"/>
+    <w:bookmarkStart w:id="417" w:name="adjusting-and-unpausing-spend-caps"/>
     <w:p>
       <w:pPr>
         <w:pStyle w:val="Heading4"/>
@@ -61248,7 +61333,7 @@
       <w:r>
         <w:t xml:space="preserve"> </w:t>
       </w:r>
-      <w:hyperlink r:id="rId415">
+      <w:hyperlink r:id="rId416">
         <w:r>
           <w:rPr>
             <w:rStyle w:val="Hyperlink"/>
@@ -61317,8 +61402,8 @@
         <w:t xml:space="preserve">and API service automatically resumes up to the configured cap.</w:t>
       </w:r>
     </w:p>
-    <w:bookmarkEnd w:id="416"/>
-    <w:bookmarkStart w:id="418" w:name="setting-up-google-cloud-budget-alerts"/>
+    <w:bookmarkEnd w:id="417"/>
+    <w:bookmarkStart w:id="419" w:name="setting-up-google-cloud-budget-alerts"/>
     <w:p>
       <w:pPr>
         <w:pStyle w:val="Heading4"/>
@@ -61349,7 +61434,7 @@
       <w:r>
         <w:t xml:space="preserve"> </w:t>
       </w:r>
-      <w:hyperlink r:id="rId417">
+      <w:hyperlink r:id="rId418">
         <w:r>
           <w:rPr>
             <w:rStyle w:val="Hyperlink"/>
@@ -61501,8 +61586,8 @@
         <w:t xml:space="preserve">. You will receive email alerts before any project hits its spend cap.</w:t>
       </w:r>
     </w:p>
-    <w:bookmarkEnd w:id="418"/>
-    <w:bookmarkStart w:id="419" w:name="cost-optimization-best-practices"/>
+    <w:bookmarkEnd w:id="419"/>
+    <w:bookmarkStart w:id="420" w:name="cost-optimization-best-practices"/>
     <w:p>
       <w:pPr>
         <w:pStyle w:val="Heading4"/>
@@ -61817,9 +61902,9 @@
         <w:t xml:space="preserve">to collapse them in GitHub’s web diff view and exclude them from repository language statistics.</w:t>
       </w:r>
     </w:p>
-    <w:bookmarkEnd w:id="419"/>
     <w:bookmarkEnd w:id="420"/>
-    <w:bookmarkStart w:id="450" w:name="references"/>
+    <w:bookmarkEnd w:id="421"/>
+    <w:bookmarkStart w:id="451" w:name="references"/>
     <w:p>
       <w:pPr>
         <w:pStyle w:val="Heading1"/>
@@ -61828,8 +61913,8 @@
         <w:t xml:space="preserve">References</w:t>
       </w:r>
     </w:p>
-    <w:bookmarkStart w:id="449" w:name="refs"/>
-    <w:bookmarkStart w:id="422" w:name="ref-space_odyssey"/>
+    <w:bookmarkStart w:id="450" w:name="refs"/>
+    <w:bookmarkStart w:id="423" w:name="ref-space_odyssey"/>
     <w:p>
       <w:pPr>
         <w:pStyle w:val="Bibliography"/>
@@ -61847,7 +61932,7 @@
       <w:r>
         <w:t xml:space="preserve"> </w:t>
       </w:r>
-      <w:hyperlink r:id="rId421">
+      <w:hyperlink r:id="rId422">
         <w:r>
           <w:rPr>
             <w:rStyle w:val="Hyperlink"/>
@@ -61859,8 +61944,8 @@
         <w:t xml:space="preserve">.</w:t>
       </w:r>
     </w:p>
-    <w:bookmarkEnd w:id="422"/>
-    <w:bookmarkStart w:id="424" w:name="ref-i_robot"/>
+    <w:bookmarkEnd w:id="423"/>
+    <w:bookmarkStart w:id="425" w:name="ref-i_robot"/>
     <w:p>
       <w:pPr>
         <w:pStyle w:val="Bibliography"/>
@@ -61884,7 +61969,7 @@
       <w:r>
         <w:t xml:space="preserve"> </w:t>
       </w:r>
-      <w:hyperlink r:id="rId423">
+      <w:hyperlink r:id="rId424">
         <w:r>
           <w:rPr>
             <w:rStyle w:val="Hyperlink"/>
@@ -61896,8 +61981,8 @@
         <w:t xml:space="preserve">.</w:t>
       </w:r>
     </w:p>
-    <w:bookmarkEnd w:id="424"/>
-    <w:bookmarkStart w:id="426" w:name="ref-battlestar_galactica_2004"/>
+    <w:bookmarkEnd w:id="425"/>
+    <w:bookmarkStart w:id="427" w:name="ref-battlestar_galactica_2004"/>
     <w:p>
       <w:pPr>
         <w:pStyle w:val="Bibliography"/>
@@ -61915,7 +62000,7 @@
       <w:r>
         <w:t xml:space="preserve"> </w:t>
       </w:r>
-      <w:hyperlink r:id="rId425">
+      <w:hyperlink r:id="rId426">
         <w:r>
           <w:rPr>
             <w:rStyle w:val="Hyperlink"/>
@@ -61927,8 +62012,8 @@
         <w:t xml:space="preserve">.</w:t>
       </w:r>
     </w:p>
-    <w:bookmarkEnd w:id="426"/>
-    <w:bookmarkStart w:id="428" w:name="ref-slm_agentic_ai"/>
+    <w:bookmarkEnd w:id="427"/>
+    <w:bookmarkStart w:id="429" w:name="ref-slm_agentic_ai"/>
     <w:p>
       <w:pPr>
         <w:pStyle w:val="Bibliography"/>
@@ -61952,7 +62037,7 @@
       <w:r>
         <w:t xml:space="preserve"> </w:t>
       </w:r>
-      <w:hyperlink r:id="rId427">
+      <w:hyperlink r:id="rId428">
         <w:r>
           <w:rPr>
             <w:rStyle w:val="Hyperlink"/>
@@ -61964,8 +62049,8 @@
         <w:t xml:space="preserve">.</w:t>
       </w:r>
     </w:p>
-    <w:bookmarkEnd w:id="428"/>
-    <w:bookmarkStart w:id="430" w:name="ref-blade_runner"/>
+    <w:bookmarkEnd w:id="429"/>
+    <w:bookmarkStart w:id="431" w:name="ref-blade_runner"/>
     <w:p>
       <w:pPr>
         <w:pStyle w:val="Bibliography"/>
@@ -61983,7 +62068,7 @@
       <w:r>
         <w:t xml:space="preserve"> </w:t>
       </w:r>
-      <w:hyperlink r:id="rId429">
+      <w:hyperlink r:id="rId430">
         <w:r>
           <w:rPr>
             <w:rStyle w:val="Hyperlink"/>
@@ -61995,8 +62080,8 @@
         <w:t xml:space="preserve">.</w:t>
       </w:r>
     </w:p>
-    <w:bookmarkEnd w:id="430"/>
-    <w:bookmarkStart w:id="432" w:name="ref-enders_game"/>
+    <w:bookmarkEnd w:id="431"/>
+    <w:bookmarkStart w:id="433" w:name="ref-enders_game"/>
     <w:p>
       <w:pPr>
         <w:pStyle w:val="Bibliography"/>
@@ -62020,7 +62105,7 @@
       <w:r>
         <w:t xml:space="preserve"> </w:t>
       </w:r>
-      <w:hyperlink r:id="rId431">
+      <w:hyperlink r:id="rId432">
         <w:r>
           <w:rPr>
             <w:rStyle w:val="Hyperlink"/>
@@ -62032,8 +62117,8 @@
         <w:t xml:space="preserve">.</w:t>
       </w:r>
     </w:p>
-    <w:bookmarkEnd w:id="432"/>
-    <w:bookmarkStart w:id="434" w:name="ref-qlora"/>
+    <w:bookmarkEnd w:id="433"/>
+    <w:bookmarkStart w:id="435" w:name="ref-qlora"/>
     <w:p>
       <w:pPr>
         <w:pStyle w:val="Bibliography"/>
@@ -62057,7 +62142,7 @@
       <w:r>
         <w:t xml:space="preserve"> </w:t>
       </w:r>
-      <w:hyperlink r:id="rId433">
+      <w:hyperlink r:id="rId434">
         <w:r>
           <w:rPr>
             <w:rStyle w:val="Hyperlink"/>
@@ -62069,8 +62154,8 @@
         <w:t xml:space="preserve">.</w:t>
       </w:r>
     </w:p>
-    <w:bookmarkEnd w:id="434"/>
-    <w:bookmarkStart w:id="436" w:name="ref-humans_are_dead"/>
+    <w:bookmarkEnd w:id="435"/>
+    <w:bookmarkStart w:id="437" w:name="ref-humans_are_dead"/>
     <w:p>
       <w:pPr>
         <w:pStyle w:val="Bibliography"/>
@@ -62094,7 +62179,7 @@
       <w:r>
         <w:t xml:space="preserve"> </w:t>
       </w:r>
-      <w:hyperlink r:id="rId435">
+      <w:hyperlink r:id="rId436">
         <w:r>
           <w:rPr>
             <w:rStyle w:val="Hyperlink"/>
@@ -62106,8 +62191,8 @@
         <w:t xml:space="preserve">.</w:t>
       </w:r>
     </w:p>
-    <w:bookmarkEnd w:id="436"/>
-    <w:bookmarkStart w:id="438" w:name="ref-dune"/>
+    <w:bookmarkEnd w:id="437"/>
+    <w:bookmarkStart w:id="439" w:name="ref-dune"/>
     <w:p>
       <w:pPr>
         <w:pStyle w:val="Bibliography"/>
@@ -62131,7 +62216,7 @@
       <w:r>
         <w:t xml:space="preserve"> </w:t>
       </w:r>
-      <w:hyperlink r:id="rId437">
+      <w:hyperlink r:id="rId438">
         <w:r>
           <w:rPr>
             <w:rStyle w:val="Hyperlink"/>
@@ -62143,8 +62228,8 @@
         <w:t xml:space="preserve">.</w:t>
       </w:r>
     </w:p>
-    <w:bookmarkEnd w:id="438"/>
-    <w:bookmarkStart w:id="440" w:name="ref-lora"/>
+    <w:bookmarkEnd w:id="439"/>
+    <w:bookmarkStart w:id="441" w:name="ref-lora"/>
     <w:p>
       <w:pPr>
         <w:pStyle w:val="Bibliography"/>
@@ -62168,7 +62253,7 @@
       <w:r>
         <w:t xml:space="preserve"> </w:t>
       </w:r>
-      <w:hyperlink r:id="rId439">
+      <w:hyperlink r:id="rId440">
         <w:r>
           <w:rPr>
             <w:rStyle w:val="Hyperlink"/>
@@ -62180,8 +62265,8 @@
         <w:t xml:space="preserve">.</w:t>
       </w:r>
     </w:p>
-    <w:bookmarkEnd w:id="440"/>
-    <w:bookmarkStart w:id="442" w:name="ref-lecun_world_models"/>
+    <w:bookmarkEnd w:id="441"/>
+    <w:bookmarkStart w:id="443" w:name="ref-lecun_world_models"/>
     <w:p>
       <w:pPr>
         <w:pStyle w:val="Bibliography"/>
@@ -62205,7 +62290,7 @@
       <w:r>
         <w:t xml:space="preserve"> </w:t>
       </w:r>
-      <w:hyperlink r:id="rId441">
+      <w:hyperlink r:id="rId442">
         <w:r>
           <w:rPr>
             <w:rStyle w:val="Hyperlink"/>
@@ -62217,8 +62302,8 @@
         <w:t xml:space="preserve">.</w:t>
       </w:r>
     </w:p>
-    <w:bookmarkEnd w:id="442"/>
-    <w:bookmarkStart w:id="444" w:name="ref-terminator"/>
+    <w:bookmarkEnd w:id="443"/>
+    <w:bookmarkStart w:id="445" w:name="ref-terminator"/>
     <w:p>
       <w:pPr>
         <w:pStyle w:val="Bibliography"/>
@@ -62236,7 +62321,7 @@
       <w:r>
         <w:t xml:space="preserve"> </w:t>
       </w:r>
-      <w:hyperlink r:id="rId443">
+      <w:hyperlink r:id="rId444">
         <w:r>
           <w:rPr>
             <w:rStyle w:val="Hyperlink"/>
@@ -62248,8 +62333,8 @@
         <w:t xml:space="preserve">.</w:t>
       </w:r>
     </w:p>
-    <w:bookmarkEnd w:id="444"/>
-    <w:bookmarkStart w:id="446" w:name="ref-matrix"/>
+    <w:bookmarkEnd w:id="445"/>
+    <w:bookmarkStart w:id="447" w:name="ref-matrix"/>
     <w:p>
       <w:pPr>
         <w:pStyle w:val="Bibliography"/>
@@ -62267,7 +62352,7 @@
       <w:r>
         <w:t xml:space="preserve"> </w:t>
       </w:r>
-      <w:hyperlink r:id="rId445">
+      <w:hyperlink r:id="rId446">
         <w:r>
           <w:rPr>
             <w:rStyle w:val="Hyperlink"/>
@@ -62279,8 +62364,8 @@
         <w:t xml:space="preserve">.</w:t>
       </w:r>
     </w:p>
-    <w:bookmarkEnd w:id="446"/>
-    <w:bookmarkStart w:id="448" w:name="ref-wargames"/>
+    <w:bookmarkEnd w:id="447"/>
+    <w:bookmarkStart w:id="449" w:name="ref-wargames"/>
     <w:p>
       <w:pPr>
         <w:pStyle w:val="Bibliography"/>
@@ -62298,7 +62383,7 @@
       <w:r>
         <w:t xml:space="preserve"> </w:t>
       </w:r>
-      <w:hyperlink r:id="rId447">
+      <w:hyperlink r:id="rId448">
         <w:r>
           <w:rPr>
             <w:rStyle w:val="Hyperlink"/>
@@ -62310,9 +62395,9 @@
         <w:t xml:space="preserve">.</w:t>
       </w:r>
     </w:p>
-    <w:bookmarkEnd w:id="448"/>
     <w:bookmarkEnd w:id="449"/>
     <w:bookmarkEnd w:id="450"/>
+    <w:bookmarkEnd w:id="451"/>
     <w:sectPr>
       <w:footnotePr>
         <w:numRestart w:val="eachSect"/>
@@ -62342,7 +62427,7 @@
       </w:r>
     </w:p>
   </w:footnote>
-  <w:footnote w:id="364">
+  <w:footnote w:id="365">
     <w:p>
       <w:pPr>
         <w:pStyle w:val="FootnoteText"/>

</xml_diff>

<commit_message>
Deploying to gh-pages from @ Morrison-Lab/wai@6d5e25e6739ea4ebda82efff9b8b3bc8853607f5 🚀
</commit_message>
<xml_diff>
--- a/chapters/coding-agents.docx
+++ b/chapters/coding-agents.docx
@@ -15,7 +15,7 @@
         <w:pStyle w:val="Date"/>
       </w:pPr>
       <w:r>
-        <w:t xml:space="preserve">Last modified: 2026-08-31 17:35:26 (PDT)</w:t>
+        <w:t xml:space="preserve">Last modified: 2026-08-31 20:22:45 (PDT)</w:t>
       </w:r>
     </w:p>
     <w:p>
@@ -46461,7 +46461,7 @@
           <w:rPr>
             <w:rStyle w:val="Hyperlink"/>
           </w:rPr>
-          <w:t xml:space="preserve">Section 40</w:t>
+          <w:t xml:space="preserve">Section 41</w:t>
         </w:r>
       </w:hyperlink>
       <w:r>
@@ -53759,7 +53759,7 @@
           <w:rPr>
             <w:rStyle w:val="Hyperlink"/>
           </w:rPr>
-          <w:t xml:space="preserve">Section 40</w:t>
+          <w:t xml:space="preserve">Section 41</w:t>
         </w:r>
       </w:hyperlink>
       <w:r>
@@ -57650,13 +57650,430 @@
       </w:r>
     </w:p>
     <w:bookmarkEnd w:id="388"/>
-    <w:bookmarkStart w:id="407" w:name="sec-ai-claude-code-windows"/>
+    <w:bookmarkStart w:id="393" w:name="sec-ai-vscode-agent-sessions"/>
     <w:p>
       <w:pPr>
         <w:pStyle w:val="Heading1"/>
       </w:pPr>
       <w:r>
-        <w:t xml:space="preserve">39. Installing Claude Code on Windows</w:t>
+        <w:t xml:space="preserve">39. Agent Sessions and Handoff in Visual Studio Code</w:t>
+      </w:r>
+    </w:p>
+    <w:p>
+      <w:pPr>
+        <w:pStyle w:val="FirstParagraph"/>
+      </w:pPr>
+      <w:r>
+        <w:t xml:space="preserve">In Visual Studio Code, interactions with AI coding assistants are structured around</w:t>
+      </w:r>
+      <w:r>
+        <w:t xml:space="preserve"> </w:t>
+      </w:r>
+      <w:hyperlink r:id="rId389">
+        <w:r>
+          <w:rPr>
+            <w:rStyle w:val="Hyperlink"/>
+          </w:rPr>
+          <w:t xml:space="preserve">Agent Sessions and Handoff</w:t>
+        </w:r>
+      </w:hyperlink>
+      <w:r>
+        <w:t xml:space="preserve"> </w:t>
+      </w:r>
+      <w:r>
+        <w:t xml:space="preserve">(measured 2026-08-31).</w:t>
+      </w:r>
+      <w:r>
+        <w:t xml:space="preserve"> </w:t>
+      </w:r>
+      <w:r>
+        <w:t xml:space="preserve">Understanding how sessions organize work and transfer state across tools</w:t>
+      </w:r>
+      <w:r>
+        <w:t xml:space="preserve"> </w:t>
+      </w:r>
+      <w:r>
+        <w:t xml:space="preserve">is essential for managing multi-step agent workflows.</w:t>
+      </w:r>
+    </w:p>
+    <w:bookmarkStart w:id="390" w:name="anatomy-of-an-agent-session"/>
+    <w:p>
+      <w:pPr>
+        <w:pStyle w:val="Heading4"/>
+      </w:pPr>
+      <w:r>
+        <w:t xml:space="preserve">Anatomy of an agent session</w:t>
+      </w:r>
+    </w:p>
+    <w:p>
+      <w:pPr>
+        <w:pStyle w:val="FirstParagraph"/>
+      </w:pPr>
+      <w:r>
+        <w:t xml:space="preserve">An agent session represents a stateful stream of interaction between a developer and an agent.</w:t>
+      </w:r>
+      <w:r>
+        <w:t xml:space="preserve"> </w:t>
+      </w:r>
+      <w:r>
+        <w:t xml:space="preserve">Each session maintains:</w:t>
+      </w:r>
+    </w:p>
+    <w:p>
+      <w:pPr>
+        <w:pStyle w:val="Compact"/>
+        <w:numPr>
+          <w:ilvl w:val="0"/>
+          <w:numId w:val="1170"/>
+        </w:numPr>
+      </w:pPr>
+      <w:r>
+        <w:rPr>
+          <w:b/>
+          <w:bCs/>
+        </w:rPr>
+        <w:t xml:space="preserve">Chats and model selection</w:t>
+      </w:r>
+      <w:r>
+        <w:t xml:space="preserve">:</w:t>
+      </w:r>
+      <w:r>
+        <w:t xml:space="preserve"> </w:t>
+      </w:r>
+      <w:r>
+        <w:t xml:space="preserve">One or more chats within a session,</w:t>
+      </w:r>
+      <w:r>
+        <w:t xml:space="preserve"> </w:t>
+      </w:r>
+      <w:r>
+        <w:t xml:space="preserve">each with its own agent or model selection.</w:t>
+      </w:r>
+    </w:p>
+    <w:p>
+      <w:pPr>
+        <w:pStyle w:val="Compact"/>
+        <w:numPr>
+          <w:ilvl w:val="0"/>
+          <w:numId w:val="1170"/>
+        </w:numPr>
+      </w:pPr>
+      <w:r>
+        <w:rPr>
+          <w:b/>
+          <w:bCs/>
+        </w:rPr>
+        <w:t xml:space="preserve">Interaction history</w:t>
+      </w:r>
+      <w:r>
+        <w:t xml:space="preserve">:</w:t>
+      </w:r>
+      <w:r>
+        <w:t xml:space="preserve"> </w:t>
+      </w:r>
+      <w:r>
+        <w:t xml:space="preserve">User prompts, assistant responses, and tool calls executed during the task.</w:t>
+      </w:r>
+    </w:p>
+    <w:p>
+      <w:pPr>
+        <w:pStyle w:val="Compact"/>
+        <w:numPr>
+          <w:ilvl w:val="0"/>
+          <w:numId w:val="1170"/>
+        </w:numPr>
+      </w:pPr>
+      <w:r>
+        <w:rPr>
+          <w:b/>
+          <w:bCs/>
+        </w:rPr>
+        <w:t xml:space="preserve">Accumulated context</w:t>
+      </w:r>
+      <w:r>
+        <w:t xml:space="preserve">:</w:t>
+      </w:r>
+      <w:r>
+        <w:t xml:space="preserve"> </w:t>
+      </w:r>
+      <w:r>
+        <w:t xml:space="preserve">Referenced files, code snippets, and conversational state gathered across turns.</w:t>
+      </w:r>
+    </w:p>
+    <w:p>
+      <w:pPr>
+        <w:pStyle w:val="Compact"/>
+        <w:numPr>
+          <w:ilvl w:val="0"/>
+          <w:numId w:val="1170"/>
+        </w:numPr>
+      </w:pPr>
+      <w:r>
+        <w:rPr>
+          <w:b/>
+          <w:bCs/>
+        </w:rPr>
+        <w:t xml:space="preserve">Checkpoints and branching</w:t>
+      </w:r>
+      <w:r>
+        <w:t xml:space="preserve">:</w:t>
+      </w:r>
+      <w:r>
+        <w:t xml:space="preserve"> </w:t>
+      </w:r>
+      <w:r>
+        <w:t xml:space="preserve">Points in session history allowing developers to fork or roll back state</w:t>
+      </w:r>
+      <w:r>
+        <w:t xml:space="preserve"> </w:t>
+      </w:r>
+      <w:r>
+        <w:t xml:space="preserve">when exploring alternative implementation paths.</w:t>
+      </w:r>
+    </w:p>
+    <w:bookmarkEnd w:id="390"/>
+    <w:bookmarkStart w:id="391" w:name="managing-sessions-across-surfaces"/>
+    <w:p>
+      <w:pPr>
+        <w:pStyle w:val="Heading4"/>
+      </w:pPr>
+      <w:r>
+        <w:t xml:space="preserve">Managing sessions across surfaces</w:t>
+      </w:r>
+    </w:p>
+    <w:p>
+      <w:pPr>
+        <w:pStyle w:val="FirstParagraph"/>
+      </w:pPr>
+      <w:r>
+        <w:t xml:space="preserve">VS Code provides unified session discovery and access across editor surfaces:</w:t>
+      </w:r>
+    </w:p>
+    <w:p>
+      <w:pPr>
+        <w:pStyle w:val="Compact"/>
+        <w:numPr>
+          <w:ilvl w:val="0"/>
+          <w:numId w:val="1171"/>
+        </w:numPr>
+      </w:pPr>
+      <w:r>
+        <w:rPr>
+          <w:b/>
+          <w:bCs/>
+        </w:rPr>
+        <w:t xml:space="preserve">Shared surfaces</w:t>
+      </w:r>
+      <w:r>
+        <w:t xml:space="preserve">:</w:t>
+      </w:r>
+      <w:r>
+        <w:t xml:space="preserve"> </w:t>
+      </w:r>
+      <w:r>
+        <w:t xml:space="preserve">The primary Chat view and the dedicated Agents window share the same sessions,</w:t>
+      </w:r>
+      <w:r>
+        <w:t xml:space="preserve"> </w:t>
+      </w:r>
+      <w:r>
+        <w:t xml:space="preserve">allowing developers to switch views without losing conversational context.</w:t>
+      </w:r>
+    </w:p>
+    <w:p>
+      <w:pPr>
+        <w:pStyle w:val="Compact"/>
+        <w:numPr>
+          <w:ilvl w:val="0"/>
+          <w:numId w:val="1171"/>
+        </w:numPr>
+      </w:pPr>
+      <w:r>
+        <w:rPr>
+          <w:b/>
+          <w:bCs/>
+        </w:rPr>
+        <w:t xml:space="preserve">External session discovery</w:t>
+      </w:r>
+      <w:r>
+        <w:t xml:space="preserve">:</w:t>
+      </w:r>
+      <w:r>
+        <w:t xml:space="preserve"> </w:t>
+      </w:r>
+      <w:r>
+        <w:t xml:space="preserve">VS Code discovers sessions initiated outside the primary GUI,</w:t>
+      </w:r>
+      <w:r>
+        <w:t xml:space="preserve"> </w:t>
+      </w:r>
+      <w:r>
+        <w:t xml:space="preserve">including CLI agent sessions (such as Copilot CLI, Claude Code, and Codex).</w:t>
+      </w:r>
+    </w:p>
+    <w:p>
+      <w:pPr>
+        <w:pStyle w:val="Compact"/>
+        <w:numPr>
+          <w:ilvl w:val="0"/>
+          <w:numId w:val="1171"/>
+        </w:numPr>
+      </w:pPr>
+      <w:r>
+        <w:rPr>
+          <w:b/>
+          <w:bCs/>
+        </w:rPr>
+        <w:t xml:space="preserve">Cloud synchronization</w:t>
+      </w:r>
+      <w:r>
+        <w:t xml:space="preserve">:</w:t>
+      </w:r>
+      <w:r>
+        <w:t xml:space="preserve"> </w:t>
+      </w:r>
+      <w:r>
+        <w:t xml:space="preserve">Synced sessions are backed up to your GitHub account,</w:t>
+      </w:r>
+      <w:r>
+        <w:t xml:space="preserve"> </w:t>
+      </w:r>
+      <w:r>
+        <w:t xml:space="preserve">enabling developers to access active and past sessions across devices.</w:t>
+      </w:r>
+    </w:p>
+    <w:bookmarkEnd w:id="391"/>
+    <w:bookmarkStart w:id="392" w:name="session-handoff-types"/>
+    <w:p>
+      <w:pPr>
+        <w:pStyle w:val="Heading4"/>
+      </w:pPr>
+      <w:r>
+        <w:t xml:space="preserve">Session handoff types</w:t>
+      </w:r>
+    </w:p>
+    <w:p>
+      <w:pPr>
+        <w:pStyle w:val="FirstParagraph"/>
+      </w:pPr>
+      <w:r>
+        <w:t xml:space="preserve">Session handoff transfers context and intent from an active session</w:t>
+      </w:r>
+      <w:r>
+        <w:t xml:space="preserve"> </w:t>
+      </w:r>
+      <w:r>
+        <w:t xml:space="preserve">to a specialized workflow without manual re-prompting:</w:t>
+      </w:r>
+    </w:p>
+    <w:p>
+      <w:pPr>
+        <w:pStyle w:val="Compact"/>
+        <w:numPr>
+          <w:ilvl w:val="0"/>
+          <w:numId w:val="1172"/>
+        </w:numPr>
+      </w:pPr>
+      <w:r>
+        <w:rPr>
+          <w:b/>
+          <w:bCs/>
+        </w:rPr>
+        <w:t xml:space="preserve">Harness to harness</w:t>
+      </w:r>
+      <w:r>
+        <w:t xml:space="preserve">:</w:t>
+      </w:r>
+      <w:r>
+        <w:t xml:space="preserve"> </w:t>
+      </w:r>
+      <w:r>
+        <w:t xml:space="preserve">Switch the active session between different agent harnesses</w:t>
+      </w:r>
+      <w:r>
+        <w:t xml:space="preserve"> </w:t>
+      </w:r>
+      <w:r>
+        <w:t xml:space="preserve">to leverage distinct agent runtime capabilities on the same task.</w:t>
+      </w:r>
+    </w:p>
+    <w:p>
+      <w:pPr>
+        <w:pStyle w:val="Compact"/>
+        <w:numPr>
+          <w:ilvl w:val="0"/>
+          <w:numId w:val="1172"/>
+        </w:numPr>
+      </w:pPr>
+      <w:r>
+        <w:rPr>
+          <w:b/>
+          <w:bCs/>
+        </w:rPr>
+        <w:t xml:space="preserve">Plan to implementation</w:t>
+      </w:r>
+      <w:r>
+        <w:t xml:space="preserve">:</w:t>
+      </w:r>
+      <w:r>
+        <w:t xml:space="preserve"> </w:t>
+      </w:r>
+      <w:r>
+        <w:t xml:space="preserve">Hand off a high-level architectural plan or task specification</w:t>
+      </w:r>
+      <w:r>
+        <w:t xml:space="preserve"> </w:t>
+      </w:r>
+      <w:r>
+        <w:t xml:space="preserve">directly to an implementation session to generate code.</w:t>
+      </w:r>
+    </w:p>
+    <w:p>
+      <w:pPr>
+        <w:pStyle w:val="Compact"/>
+        <w:numPr>
+          <w:ilvl w:val="0"/>
+          <w:numId w:val="1172"/>
+        </w:numPr>
+      </w:pPr>
+      <w:r>
+        <w:rPr>
+          <w:b/>
+          <w:bCs/>
+        </w:rPr>
+        <w:t xml:space="preserve">Continue in the cloud</w:t>
+      </w:r>
+      <w:r>
+        <w:t xml:space="preserve">:</w:t>
+      </w:r>
+      <w:r>
+        <w:t xml:space="preserve"> </w:t>
+      </w:r>
+      <w:r>
+        <w:t xml:space="preserve">Hand off a local session to run in a cloud-hosted agent environment</w:t>
+      </w:r>
+      <w:r>
+        <w:t xml:space="preserve"> </w:t>
+      </w:r>
+      <w:r>
+        <w:t xml:space="preserve">(such as background tasks leading to pull requests),</w:t>
+      </w:r>
+      <w:r>
+        <w:t xml:space="preserve"> </w:t>
+      </w:r>
+      <w:r>
+        <w:t xml:space="preserve">freeing local editor resources while the agent executes in the background.</w:t>
+      </w:r>
+    </w:p>
+    <w:bookmarkEnd w:id="392"/>
+    <w:bookmarkEnd w:id="393"/>
+    <w:bookmarkStart w:id="412" w:name="sec-ai-claude-code-windows"/>
+    <w:p>
+      <w:pPr>
+        <w:pStyle w:val="Heading1"/>
+      </w:pPr>
+      <w:r>
+        <w:t xml:space="preserve">40. Installing Claude Code on Windows</w:t>
       </w:r>
     </w:p>
     <w:p>
@@ -57749,12 +58166,12 @@
                 <wp:inline>
                   <wp:extent cx="152400" cy="152400"/>
                   <wp:effectExtent b="0" l="0" r="0" t="0"/>
-                  <wp:docPr descr="" title="" id="389" name="Picture"/>
+                  <wp:docPr descr="" title="" id="394" name="Picture"/>
                   <a:graphic>
                     <a:graphicData uri="http://schemas.openxmlformats.org/drawingml/2006/picture">
                       <pic:pic>
                         <pic:nvPicPr>
-                          <pic:cNvPr descr="/opt/quarto/share/formats/docx/note.png" id="390" name="Picture"/>
+                          <pic:cNvPr descr="/opt/quarto/share/formats/docx/note.png" id="395" name="Picture"/>
                           <pic:cNvPicPr>
                             <a:picLocks noChangeArrowheads="1" noChangeAspect="1"/>
                           </pic:cNvPicPr>
@@ -57842,7 +58259,7 @@
         </w:tc>
       </w:tr>
     </w:tbl>
-    <w:bookmarkStart w:id="393" w:name="run-it-from-a-unix-like-terminal"/>
+    <w:bookmarkStart w:id="398" w:name="run-it-from-a-unix-like-terminal"/>
     <w:p>
       <w:pPr>
         <w:pStyle w:val="Heading4"/>
@@ -57870,7 +58287,7 @@
         <w:pStyle w:val="Compact"/>
         <w:numPr>
           <w:ilvl w:val="0"/>
-          <w:numId w:val="1170"/>
+          <w:numId w:val="1173"/>
         </w:numPr>
       </w:pPr>
       <w:r>
@@ -57889,7 +58306,7 @@
       <w:r>
         <w:t xml:space="preserve"> </w:t>
       </w:r>
-      <w:hyperlink r:id="rId391">
+      <w:hyperlink r:id="rId396">
         <w:r>
           <w:rPr>
             <w:rStyle w:val="Hyperlink"/>
@@ -57906,7 +58323,7 @@
         <w:pStyle w:val="Compact"/>
         <w:numPr>
           <w:ilvl w:val="0"/>
-          <w:numId w:val="1170"/>
+          <w:numId w:val="1173"/>
         </w:numPr>
       </w:pPr>
       <w:r>
@@ -57922,7 +58339,7 @@
       <w:r>
         <w:t xml:space="preserve">(</w:t>
       </w:r>
-      <w:hyperlink r:id="rId392">
+      <w:hyperlink r:id="rId397">
         <w:r>
           <w:rPr>
             <w:rStyle w:val="Hyperlink"/>
@@ -57960,7 +58377,7 @@
         <w:pStyle w:val="Compact"/>
         <w:numPr>
           <w:ilvl w:val="0"/>
-          <w:numId w:val="1170"/>
+          <w:numId w:val="1173"/>
         </w:numPr>
       </w:pPr>
       <w:r>
@@ -58073,8 +58490,8 @@
         <w:t xml:space="preserve">gotchas below don’t apply.</w:t>
       </w:r>
     </w:p>
-    <w:bookmarkEnd w:id="393"/>
-    <w:bookmarkStart w:id="398" w:name="install-claude-code"/>
+    <w:bookmarkEnd w:id="398"/>
+    <w:bookmarkStart w:id="403" w:name="install-claude-code"/>
     <w:p>
       <w:pPr>
         <w:pStyle w:val="Heading4"/>
@@ -58095,7 +58512,7 @@
       <w:pPr>
         <w:numPr>
           <w:ilvl w:val="0"/>
-          <w:numId w:val="1171"/>
+          <w:numId w:val="1174"/>
         </w:numPr>
       </w:pPr>
       <w:r>
@@ -58220,7 +58637,7 @@
       <w:pPr>
         <w:numPr>
           <w:ilvl w:val="0"/>
-          <w:numId w:val="1171"/>
+          <w:numId w:val="1174"/>
         </w:numPr>
       </w:pPr>
       <w:r>
@@ -58239,7 +58656,7 @@
       <w:r>
         <w:t xml:space="preserve"> </w:t>
       </w:r>
-      <w:hyperlink r:id="rId394">
+      <w:hyperlink r:id="rId399">
         <w:r>
           <w:rPr>
             <w:rStyle w:val="Hyperlink"/>
@@ -58325,12 +58742,12 @@
                 <wp:inline>
                   <wp:extent cx="152400" cy="152400"/>
                   <wp:effectExtent b="0" l="0" r="0" t="0"/>
-                  <wp:docPr descr="" title="" id="395" name="Picture"/>
+                  <wp:docPr descr="" title="" id="400" name="Picture"/>
                   <a:graphic>
                     <a:graphicData uri="http://schemas.openxmlformats.org/drawingml/2006/picture">
                       <pic:pic>
                         <pic:nvPicPr>
-                          <pic:cNvPr descr="/opt/quarto/share/formats/docx/important.png" id="396" name="Picture"/>
+                          <pic:cNvPr descr="/opt/quarto/share/formats/docx/important.png" id="401" name="Picture"/>
                           <pic:cNvPicPr>
                             <a:picLocks noChangeArrowheads="1" noChangeAspect="1"/>
                           </pic:cNvPicPr>
@@ -58486,7 +58903,7 @@
             <w:r>
               <w:t xml:space="preserve"> </w:t>
             </w:r>
-            <w:hyperlink r:id="rId397">
+            <w:hyperlink r:id="rId402">
               <w:r>
                 <w:rPr>
                   <w:rStyle w:val="Hyperlink"/>
@@ -58577,8 +58994,8 @@
         </w:tc>
       </w:tr>
     </w:tbl>
-    <w:bookmarkEnd w:id="398"/>
-    <w:bookmarkStart w:id="400" w:name="make-sure-your-shell-can-find-claude"/>
+    <w:bookmarkEnd w:id="403"/>
+    <w:bookmarkStart w:id="405" w:name="make-sure-your-shell-can-find-claude"/>
     <w:p>
       <w:pPr>
         <w:pStyle w:val="Heading4"/>
@@ -59176,7 +59593,7 @@
       <w:r>
         <w:t xml:space="preserve"> </w:t>
       </w:r>
-      <w:hyperlink r:id="rId399">
+      <w:hyperlink r:id="rId404">
         <w:r>
           <w:rPr>
             <w:rStyle w:val="Hyperlink"/>
@@ -59282,8 +59699,8 @@
         <w:t xml:space="preserve">initializes).</w:t>
       </w:r>
     </w:p>
-    <w:bookmarkEnd w:id="400"/>
-    <w:bookmarkStart w:id="403" w:name="X604325b0223e79803e04f87e7874b1d7f4a0663"/>
+    <w:bookmarkEnd w:id="405"/>
+    <w:bookmarkStart w:id="408" w:name="X604325b0223e79803e04f87e7874b1d7f4a0663"/>
     <w:p>
       <w:pPr>
         <w:pStyle w:val="Heading4"/>
@@ -59333,12 +59750,12 @@
                 <wp:inline>
                   <wp:extent cx="152400" cy="152400"/>
                   <wp:effectExtent b="0" l="0" r="0" t="0"/>
-                  <wp:docPr descr="" title="" id="401" name="Picture"/>
+                  <wp:docPr descr="" title="" id="406" name="Picture"/>
                   <a:graphic>
                     <a:graphicData uri="http://schemas.openxmlformats.org/drawingml/2006/picture">
                       <pic:pic>
                         <pic:nvPicPr>
-                          <pic:cNvPr descr="/opt/quarto/share/formats/docx/warning.png" id="402" name="Picture"/>
+                          <pic:cNvPr descr="/opt/quarto/share/formats/docx/warning.png" id="407" name="Picture"/>
                           <pic:cNvPicPr>
                             <a:picLocks noChangeArrowheads="1" noChangeAspect="1"/>
                           </pic:cNvPicPr>
@@ -59606,8 +60023,8 @@
         </w:tc>
       </w:tr>
     </w:tbl>
-    <w:bookmarkEnd w:id="403"/>
-    <w:bookmarkStart w:id="405" w:name="X1745fd502df7963ed7ce48d0465493b4d59ad92"/>
+    <w:bookmarkEnd w:id="408"/>
+    <w:bookmarkStart w:id="410" w:name="X1745fd502df7963ed7ce48d0465493b4d59ad92"/>
     <w:p>
       <w:pPr>
         <w:pStyle w:val="Heading4"/>
@@ -59626,7 +60043,7 @@
       <w:r>
         <w:t xml:space="preserve"> </w:t>
       </w:r>
-      <w:hyperlink r:id="rId404">
+      <w:hyperlink r:id="rId409">
         <w:r>
           <w:rPr>
             <w:rStyle w:val="Hyperlink"/>
@@ -59787,8 +60204,8 @@
         <w:t xml:space="preserve">.</w:t>
       </w:r>
     </w:p>
-    <w:bookmarkEnd w:id="405"/>
-    <w:bookmarkStart w:id="406" w:name="verify-the-install"/>
+    <w:bookmarkEnd w:id="410"/>
+    <w:bookmarkStart w:id="411" w:name="verify-the-install"/>
     <w:p>
       <w:pPr>
         <w:pStyle w:val="Heading4"/>
@@ -59957,15 +60374,15 @@
         <w:t xml:space="preserve">(or open a fresh window) after changing it.</w:t>
       </w:r>
     </w:p>
-    <w:bookmarkEnd w:id="406"/>
-    <w:bookmarkEnd w:id="407"/>
-    <w:bookmarkStart w:id="423" w:name="sec-ai-mcp-server-setup"/>
+    <w:bookmarkEnd w:id="411"/>
+    <w:bookmarkEnd w:id="412"/>
+    <w:bookmarkStart w:id="428" w:name="sec-ai-mcp-server-setup"/>
     <w:p>
       <w:pPr>
         <w:pStyle w:val="Heading1"/>
       </w:pPr>
       <w:r>
-        <w:t xml:space="preserve">40. Setting up MCP servers</w:t>
+        <w:t xml:space="preserve">41. Setting up MCP servers</w:t>
       </w:r>
     </w:p>
     <w:p>
@@ -60080,12 +60497,12 @@
                 <wp:inline>
                   <wp:extent cx="152400" cy="152400"/>
                   <wp:effectExtent b="0" l="0" r="0" t="0"/>
-                  <wp:docPr descr="" title="" id="408" name="Picture"/>
+                  <wp:docPr descr="" title="" id="413" name="Picture"/>
                   <a:graphic>
                     <a:graphicData uri="http://schemas.openxmlformats.org/drawingml/2006/picture">
                       <pic:pic>
                         <pic:nvPicPr>
-                          <pic:cNvPr descr="/opt/quarto/share/formats/docx/note.png" id="409" name="Picture"/>
+                          <pic:cNvPr descr="/opt/quarto/share/formats/docx/note.png" id="414" name="Picture"/>
                           <pic:cNvPicPr>
                             <a:picLocks noChangeArrowheads="1" noChangeAspect="1"/>
                           </pic:cNvPicPr>
@@ -60179,7 +60596,7 @@
         </w:tc>
       </w:tr>
     </w:tbl>
-    <w:bookmarkStart w:id="411" w:name="installed-is-not-registered"/>
+    <w:bookmarkStart w:id="416" w:name="installed-is-not-registered"/>
     <w:p>
       <w:pPr>
         <w:pStyle w:val="Heading4"/>
@@ -60210,7 +60627,7 @@
       <w:r>
         <w:t xml:space="preserve"> </w:t>
       </w:r>
-      <w:hyperlink r:id="rId410">
+      <w:hyperlink r:id="rId415">
         <w:r>
           <w:rPr>
             <w:rStyle w:val="VerbatimChar"/>
@@ -60278,8 +60695,8 @@
         <w:t xml:space="preserve"> mcp list</w:t>
       </w:r>
     </w:p>
-    <w:bookmarkEnd w:id="411"/>
-    <w:bookmarkStart w:id="412" w:name="Xf6682145328c756d2e167d2c91be34f7f913a7f"/>
+    <w:bookmarkEnd w:id="416"/>
+    <w:bookmarkStart w:id="417" w:name="Xf6682145328c756d2e167d2c91be34f7f913a7f"/>
     <w:p>
       <w:pPr>
         <w:pStyle w:val="Heading4"/>
@@ -60478,8 +60895,8 @@
         <w:t xml:space="preserve">A local one shows a command path instead.</w:t>
       </w:r>
     </w:p>
-    <w:bookmarkEnd w:id="412"/>
-    <w:bookmarkStart w:id="413" w:name="and-401-mean-different-things"/>
+    <w:bookmarkEnd w:id="417"/>
+    <w:bookmarkStart w:id="418" w:name="and-401-mean-different-things"/>
     <w:p>
       <w:pPr>
         <w:pStyle w:val="Heading4"/>
@@ -60641,7 +61058,7 @@
         <w:pStyle w:val="Compact"/>
         <w:numPr>
           <w:ilvl w:val="0"/>
-          <w:numId w:val="1172"/>
+          <w:numId w:val="1175"/>
         </w:numPr>
       </w:pPr>
       <w:r>
@@ -60669,7 +61086,7 @@
         <w:pStyle w:val="Compact"/>
         <w:numPr>
           <w:ilvl w:val="0"/>
-          <w:numId w:val="1172"/>
+          <w:numId w:val="1175"/>
         </w:numPr>
       </w:pPr>
       <w:r>
@@ -60722,8 +61139,8 @@
         <w:t xml:space="preserve">sends you to the token-minting page for a problem that lives in a config file.</w:t>
       </w:r>
     </w:p>
-    <w:bookmarkEnd w:id="413"/>
-    <w:bookmarkStart w:id="414" w:name="install-the-binary-the-platforms-own-way"/>
+    <w:bookmarkEnd w:id="418"/>
+    <w:bookmarkStart w:id="419" w:name="install-the-binary-the-platforms-own-way"/>
     <w:p>
       <w:pPr>
         <w:pStyle w:val="Heading4"/>
@@ -60977,8 +61394,8 @@
         <w:t xml:space="preserve">with an override for the case where it isn’t on one.</w:t>
       </w:r>
     </w:p>
-    <w:bookmarkEnd w:id="414"/>
-    <w:bookmarkStart w:id="415" w:name="X2adb24e9b1a0644f0fbebe685525dadd8a56387"/>
+    <w:bookmarkEnd w:id="419"/>
+    <w:bookmarkStart w:id="420" w:name="X2adb24e9b1a0644f0fbebe685525dadd8a56387"/>
     <w:p>
       <w:pPr>
         <w:pStyle w:val="Heading4"/>
@@ -61855,8 +62272,8 @@
         <w:t xml:space="preserve">bug you just finished diagnosing.</w:t>
       </w:r>
     </w:p>
-    <w:bookmarkEnd w:id="415"/>
-    <w:bookmarkStart w:id="416" w:name="X448547516ab06679b064b391b05a896db41ea57"/>
+    <w:bookmarkEnd w:id="420"/>
+    <w:bookmarkStart w:id="421" w:name="X448547516ab06679b064b391b05a896db41ea57"/>
     <w:p>
       <w:pPr>
         <w:pStyle w:val="Heading4"/>
@@ -62178,8 +62595,8 @@
         <w:t xml:space="preserve">the count moving the right direction, as the check above expects.</w:t>
       </w:r>
     </w:p>
-    <w:bookmarkEnd w:id="416"/>
-    <w:bookmarkStart w:id="417" w:name="X4a4c9992603eee0123b58b5b37e7fedbb817150"/>
+    <w:bookmarkEnd w:id="421"/>
+    <w:bookmarkStart w:id="422" w:name="X4a4c9992603eee0123b58b5b37e7fedbb817150"/>
     <w:p>
       <w:pPr>
         <w:pStyle w:val="Heading4"/>
@@ -62279,8 +62696,8 @@
         <w:t xml:space="preserve">Reach for those instead when working from a local harness.</w:t>
       </w:r>
     </w:p>
-    <w:bookmarkEnd w:id="417"/>
-    <w:bookmarkStart w:id="418" w:name="Xb256c2a3c0a422f2f687a98903d3521fd60a1b1"/>
+    <w:bookmarkEnd w:id="422"/>
+    <w:bookmarkStart w:id="423" w:name="Xb256c2a3c0a422f2f687a98903d3521fd60a1b1"/>
     <w:p>
       <w:pPr>
         <w:pStyle w:val="Heading4"/>
@@ -62456,8 +62873,8 @@
         <w:t xml:space="preserve">not something an agent does in passing.</w:t>
       </w:r>
     </w:p>
-    <w:bookmarkEnd w:id="418"/>
-    <w:bookmarkStart w:id="420" w:name="Xd44df015462fcf288556a538677f0a762c9ef1d"/>
+    <w:bookmarkEnd w:id="423"/>
+    <w:bookmarkStart w:id="425" w:name="Xd44df015462fcf288556a538677f0a762c9ef1d"/>
     <w:p>
       <w:pPr>
         <w:pStyle w:val="Heading4"/>
@@ -62571,7 +62988,7 @@
       <w:r>
         <w:t xml:space="preserve"> </w:t>
       </w:r>
-      <w:hyperlink r:id="rId419">
+      <w:hyperlink r:id="rId424">
         <w:r>
           <w:rPr>
             <w:rStyle w:val="Hyperlink"/>
@@ -62597,7 +63014,7 @@
         <w:pStyle w:val="Compact"/>
         <w:numPr>
           <w:ilvl w:val="0"/>
-          <w:numId w:val="1173"/>
+          <w:numId w:val="1176"/>
         </w:numPr>
       </w:pPr>
       <w:r>
@@ -62609,7 +63026,7 @@
         <w:pStyle w:val="Compact"/>
         <w:numPr>
           <w:ilvl w:val="0"/>
-          <w:numId w:val="1173"/>
+          <w:numId w:val="1176"/>
         </w:numPr>
       </w:pPr>
       <w:r>
@@ -62627,7 +63044,7 @@
         <w:pStyle w:val="Compact"/>
         <w:numPr>
           <w:ilvl w:val="0"/>
-          <w:numId w:val="1173"/>
+          <w:numId w:val="1176"/>
         </w:numPr>
       </w:pPr>
       <w:r>
@@ -62655,7 +63072,7 @@
         <w:pStyle w:val="Compact"/>
         <w:numPr>
           <w:ilvl w:val="0"/>
-          <w:numId w:val="1173"/>
+          <w:numId w:val="1176"/>
         </w:numPr>
       </w:pPr>
       <w:r>
@@ -62667,7 +63084,7 @@
         <w:pStyle w:val="Compact"/>
         <w:numPr>
           <w:ilvl w:val="0"/>
-          <w:numId w:val="1173"/>
+          <w:numId w:val="1176"/>
         </w:numPr>
       </w:pPr>
       <w:r>
@@ -62700,7 +63117,7 @@
         <w:pStyle w:val="Compact"/>
         <w:numPr>
           <w:ilvl w:val="0"/>
-          <w:numId w:val="1173"/>
+          <w:numId w:val="1176"/>
         </w:numPr>
       </w:pPr>
       <w:r>
@@ -62754,8 +63171,8 @@
         <w:t xml:space="preserve">and expect it to work.</w:t>
       </w:r>
     </w:p>
-    <w:bookmarkEnd w:id="420"/>
-    <w:bookmarkStart w:id="422" w:name="granola-mcp-your-meetings-as-context"/>
+    <w:bookmarkEnd w:id="425"/>
+    <w:bookmarkStart w:id="427" w:name="granola-mcp-your-meetings-as-context"/>
     <w:p>
       <w:pPr>
         <w:pStyle w:val="Heading4"/>
@@ -62768,7 +63185,7 @@
       <w:pPr>
         <w:pStyle w:val="FirstParagraph"/>
       </w:pPr>
-      <w:hyperlink r:id="rId421">
+      <w:hyperlink r:id="rId426">
         <w:r>
           <w:rPr>
             <w:rStyle w:val="Hyperlink"/>
@@ -62926,7 +63343,7 @@
       <w:r>
         <w:t xml:space="preserve"> </w:t>
       </w:r>
-      <w:hyperlink r:id="rId421">
+      <w:hyperlink r:id="rId426">
         <w:r>
           <w:rPr>
             <w:rStyle w:val="Hyperlink"/>
@@ -62953,15 +63370,15 @@
         <w:t xml:space="preserve">off by default until an admin enables it.</w:t>
       </w:r>
     </w:p>
-    <w:bookmarkEnd w:id="422"/>
-    <w:bookmarkEnd w:id="423"/>
-    <w:bookmarkStart w:id="431" w:name="sec-ai-gemini-spend-management"/>
+    <w:bookmarkEnd w:id="427"/>
+    <w:bookmarkEnd w:id="428"/>
+    <w:bookmarkStart w:id="436" w:name="sec-ai-gemini-spend-management"/>
     <w:p>
       <w:pPr>
         <w:pStyle w:val="Heading1"/>
       </w:pPr>
       <w:r>
-        <w:t xml:space="preserve">41. Managing Gemini API Spend and Cost Optimization</w:t>
+        <w:t xml:space="preserve">42. Managing Gemini API Spend and Cost Optimization</w:t>
       </w:r>
     </w:p>
     <w:p>
@@ -62984,7 +63401,7 @@
         <w:t xml:space="preserve">and optimize token consumption across local tools and GitHub Actions workflows.</w:t>
       </w:r>
     </w:p>
-    <w:bookmarkStart w:id="425" w:name="Xd8c10be17edf039db5b664720f228274181ba18"/>
+    <w:bookmarkStart w:id="430" w:name="Xd8c10be17edf039db5b664720f228274181ba18"/>
     <w:p>
       <w:pPr>
         <w:pStyle w:val="Heading4"/>
@@ -63048,7 +63465,7 @@
       <w:r>
         <w:t xml:space="preserve"> </w:t>
       </w:r>
-      <w:hyperlink r:id="rId424">
+      <w:hyperlink r:id="rId429">
         <w:r>
           <w:rPr>
             <w:rStyle w:val="Hyperlink"/>
@@ -63134,7 +63551,7 @@
         <w:pStyle w:val="Compact"/>
         <w:numPr>
           <w:ilvl w:val="0"/>
-          <w:numId w:val="1174"/>
+          <w:numId w:val="1177"/>
         </w:numPr>
       </w:pPr>
       <w:r>
@@ -63143,7 +63560,7 @@
       <w:r>
         <w:t xml:space="preserve"> </w:t>
       </w:r>
-      <w:hyperlink r:id="rId424">
+      <w:hyperlink r:id="rId429">
         <w:r>
           <w:rPr>
             <w:rStyle w:val="Hyperlink"/>
@@ -63160,7 +63577,7 @@
         <w:pStyle w:val="Compact"/>
         <w:numPr>
           <w:ilvl w:val="0"/>
-          <w:numId w:val="1174"/>
+          <w:numId w:val="1177"/>
         </w:numPr>
       </w:pPr>
       <w:r>
@@ -63172,15 +63589,15 @@
         <w:pStyle w:val="Compact"/>
         <w:numPr>
           <w:ilvl w:val="0"/>
-          <w:numId w:val="1174"/>
+          <w:numId w:val="1177"/>
         </w:numPr>
       </w:pPr>
       <w:r>
         <w:t xml:space="preserve">Any project that has hit its monthly spend cap will have its API requests paused until the limit is updated.</w:t>
       </w:r>
     </w:p>
-    <w:bookmarkEnd w:id="425"/>
-    <w:bookmarkStart w:id="427" w:name="adjusting-and-unpausing-spend-caps"/>
+    <w:bookmarkEnd w:id="430"/>
+    <w:bookmarkStart w:id="432" w:name="adjusting-and-unpausing-spend-caps"/>
     <w:p>
       <w:pPr>
         <w:pStyle w:val="Heading4"/>
@@ -63202,7 +63619,7 @@
         <w:pStyle w:val="Compact"/>
         <w:numPr>
           <w:ilvl w:val="0"/>
-          <w:numId w:val="1175"/>
+          <w:numId w:val="1178"/>
         </w:numPr>
       </w:pPr>
       <w:r>
@@ -63211,7 +63628,7 @@
       <w:r>
         <w:t xml:space="preserve"> </w:t>
       </w:r>
-      <w:hyperlink r:id="rId426">
+      <w:hyperlink r:id="rId431">
         <w:r>
           <w:rPr>
             <w:rStyle w:val="Hyperlink"/>
@@ -63228,7 +63645,7 @@
         <w:pStyle w:val="Compact"/>
         <w:numPr>
           <w:ilvl w:val="0"/>
-          <w:numId w:val="1175"/>
+          <w:numId w:val="1178"/>
         </w:numPr>
       </w:pPr>
       <w:r>
@@ -63240,7 +63657,7 @@
         <w:pStyle w:val="Compact"/>
         <w:numPr>
           <w:ilvl w:val="0"/>
-          <w:numId w:val="1175"/>
+          <w:numId w:val="1178"/>
         </w:numPr>
       </w:pPr>
       <w:r>
@@ -63280,8 +63697,8 @@
         <w:t xml:space="preserve">and API service automatically resumes up to the configured cap.</w:t>
       </w:r>
     </w:p>
-    <w:bookmarkEnd w:id="427"/>
-    <w:bookmarkStart w:id="429" w:name="setting-up-google-cloud-budget-alerts"/>
+    <w:bookmarkEnd w:id="432"/>
+    <w:bookmarkStart w:id="434" w:name="setting-up-google-cloud-budget-alerts"/>
     <w:p>
       <w:pPr>
         <w:pStyle w:val="Heading4"/>
@@ -63303,7 +63720,7 @@
         <w:pStyle w:val="Compact"/>
         <w:numPr>
           <w:ilvl w:val="0"/>
-          <w:numId w:val="1176"/>
+          <w:numId w:val="1179"/>
         </w:numPr>
       </w:pPr>
       <w:r>
@@ -63312,7 +63729,7 @@
       <w:r>
         <w:t xml:space="preserve"> </w:t>
       </w:r>
-      <w:hyperlink r:id="rId428">
+      <w:hyperlink r:id="rId433">
         <w:r>
           <w:rPr>
             <w:rStyle w:val="Hyperlink"/>
@@ -63329,7 +63746,7 @@
         <w:pStyle w:val="Compact"/>
         <w:numPr>
           <w:ilvl w:val="0"/>
-          <w:numId w:val="1176"/>
+          <w:numId w:val="1179"/>
         </w:numPr>
       </w:pPr>
       <w:r>
@@ -63354,7 +63771,7 @@
         <w:pStyle w:val="Compact"/>
         <w:numPr>
           <w:ilvl w:val="0"/>
-          <w:numId w:val="1176"/>
+          <w:numId w:val="1179"/>
         </w:numPr>
       </w:pPr>
       <w:r>
@@ -63378,7 +63795,7 @@
         <w:pStyle w:val="Compact"/>
         <w:numPr>
           <w:ilvl w:val="0"/>
-          <w:numId w:val="1176"/>
+          <w:numId w:val="1179"/>
         </w:numPr>
       </w:pPr>
       <w:r>
@@ -63390,7 +63807,7 @@
         <w:pStyle w:val="Compact"/>
         <w:numPr>
           <w:ilvl w:val="0"/>
-          <w:numId w:val="1176"/>
+          <w:numId w:val="1179"/>
         </w:numPr>
       </w:pPr>
       <w:r>
@@ -63444,7 +63861,7 @@
         <w:pStyle w:val="Compact"/>
         <w:numPr>
           <w:ilvl w:val="0"/>
-          <w:numId w:val="1176"/>
+          <w:numId w:val="1179"/>
         </w:numPr>
       </w:pPr>
       <w:r>
@@ -63464,8 +63881,8 @@
         <w:t xml:space="preserve">. You will receive email alerts before any project hits its spend cap.</w:t>
       </w:r>
     </w:p>
-    <w:bookmarkEnd w:id="429"/>
-    <w:bookmarkStart w:id="430" w:name="cost-optimization-best-practices"/>
+    <w:bookmarkEnd w:id="434"/>
+    <w:bookmarkStart w:id="435" w:name="cost-optimization-best-practices"/>
     <w:p>
       <w:pPr>
         <w:pStyle w:val="Heading4"/>
@@ -63487,7 +63904,7 @@
         <w:pStyle w:val="Compact"/>
         <w:numPr>
           <w:ilvl w:val="0"/>
-          <w:numId w:val="1177"/>
+          <w:numId w:val="1180"/>
         </w:numPr>
       </w:pPr>
       <w:r>
@@ -63623,7 +64040,7 @@
         <w:pStyle w:val="Compact"/>
         <w:numPr>
           <w:ilvl w:val="0"/>
-          <w:numId w:val="1177"/>
+          <w:numId w:val="1180"/>
         </w:numPr>
       </w:pPr>
       <w:r>
@@ -63654,7 +64071,7 @@
         <w:pStyle w:val="Compact"/>
         <w:numPr>
           <w:ilvl w:val="0"/>
-          <w:numId w:val="1177"/>
+          <w:numId w:val="1180"/>
         </w:numPr>
       </w:pPr>
       <w:r>
@@ -63685,7 +64102,7 @@
         <w:pStyle w:val="Compact"/>
         <w:numPr>
           <w:ilvl w:val="0"/>
-          <w:numId w:val="1177"/>
+          <w:numId w:val="1180"/>
         </w:numPr>
       </w:pPr>
       <w:r>
@@ -63780,9 +64197,9 @@
         <w:t xml:space="preserve">to collapse them in GitHub’s web diff view and exclude them from repository language statistics.</w:t>
       </w:r>
     </w:p>
-    <w:bookmarkEnd w:id="430"/>
-    <w:bookmarkEnd w:id="431"/>
-    <w:bookmarkStart w:id="461" w:name="references"/>
+    <w:bookmarkEnd w:id="435"/>
+    <w:bookmarkEnd w:id="436"/>
+    <w:bookmarkStart w:id="466" w:name="references"/>
     <w:p>
       <w:pPr>
         <w:pStyle w:val="Heading1"/>
@@ -63791,8 +64208,8 @@
         <w:t xml:space="preserve">References</w:t>
       </w:r>
     </w:p>
-    <w:bookmarkStart w:id="460" w:name="refs"/>
-    <w:bookmarkStart w:id="433" w:name="ref-space_odyssey"/>
+    <w:bookmarkStart w:id="465" w:name="refs"/>
+    <w:bookmarkStart w:id="438" w:name="ref-space_odyssey"/>
     <w:p>
       <w:pPr>
         <w:pStyle w:val="Bibliography"/>
@@ -63810,7 +64227,7 @@
       <w:r>
         <w:t xml:space="preserve"> </w:t>
       </w:r>
-      <w:hyperlink r:id="rId432">
+      <w:hyperlink r:id="rId437">
         <w:r>
           <w:rPr>
             <w:rStyle w:val="Hyperlink"/>
@@ -63822,8 +64239,8 @@
         <w:t xml:space="preserve">.</w:t>
       </w:r>
     </w:p>
-    <w:bookmarkEnd w:id="433"/>
-    <w:bookmarkStart w:id="435" w:name="ref-i_robot"/>
+    <w:bookmarkEnd w:id="438"/>
+    <w:bookmarkStart w:id="440" w:name="ref-i_robot"/>
     <w:p>
       <w:pPr>
         <w:pStyle w:val="Bibliography"/>
@@ -63847,7 +64264,7 @@
       <w:r>
         <w:t xml:space="preserve"> </w:t>
       </w:r>
-      <w:hyperlink r:id="rId434">
+      <w:hyperlink r:id="rId439">
         <w:r>
           <w:rPr>
             <w:rStyle w:val="Hyperlink"/>
@@ -63859,8 +64276,8 @@
         <w:t xml:space="preserve">.</w:t>
       </w:r>
     </w:p>
-    <w:bookmarkEnd w:id="435"/>
-    <w:bookmarkStart w:id="437" w:name="ref-battlestar_galactica_2004"/>
+    <w:bookmarkEnd w:id="440"/>
+    <w:bookmarkStart w:id="442" w:name="ref-battlestar_galactica_2004"/>
     <w:p>
       <w:pPr>
         <w:pStyle w:val="Bibliography"/>
@@ -63878,7 +64295,7 @@
       <w:r>
         <w:t xml:space="preserve"> </w:t>
       </w:r>
-      <w:hyperlink r:id="rId436">
+      <w:hyperlink r:id="rId441">
         <w:r>
           <w:rPr>
             <w:rStyle w:val="Hyperlink"/>
@@ -63890,8 +64307,8 @@
         <w:t xml:space="preserve">.</w:t>
       </w:r>
     </w:p>
-    <w:bookmarkEnd w:id="437"/>
-    <w:bookmarkStart w:id="439" w:name="ref-slm_agentic_ai"/>
+    <w:bookmarkEnd w:id="442"/>
+    <w:bookmarkStart w:id="444" w:name="ref-slm_agentic_ai"/>
     <w:p>
       <w:pPr>
         <w:pStyle w:val="Bibliography"/>
@@ -63915,7 +64332,7 @@
       <w:r>
         <w:t xml:space="preserve"> </w:t>
       </w:r>
-      <w:hyperlink r:id="rId438">
+      <w:hyperlink r:id="rId443">
         <w:r>
           <w:rPr>
             <w:rStyle w:val="Hyperlink"/>
@@ -63927,8 +64344,8 @@
         <w:t xml:space="preserve">.</w:t>
       </w:r>
     </w:p>
-    <w:bookmarkEnd w:id="439"/>
-    <w:bookmarkStart w:id="441" w:name="ref-blade_runner"/>
+    <w:bookmarkEnd w:id="444"/>
+    <w:bookmarkStart w:id="446" w:name="ref-blade_runner"/>
     <w:p>
       <w:pPr>
         <w:pStyle w:val="Bibliography"/>
@@ -63946,7 +64363,7 @@
       <w:r>
         <w:t xml:space="preserve"> </w:t>
       </w:r>
-      <w:hyperlink r:id="rId440">
+      <w:hyperlink r:id="rId445">
         <w:r>
           <w:rPr>
             <w:rStyle w:val="Hyperlink"/>
@@ -63958,8 +64375,8 @@
         <w:t xml:space="preserve">.</w:t>
       </w:r>
     </w:p>
-    <w:bookmarkEnd w:id="441"/>
-    <w:bookmarkStart w:id="443" w:name="ref-enders_game"/>
+    <w:bookmarkEnd w:id="446"/>
+    <w:bookmarkStart w:id="448" w:name="ref-enders_game"/>
     <w:p>
       <w:pPr>
         <w:pStyle w:val="Bibliography"/>
@@ -63983,7 +64400,7 @@
       <w:r>
         <w:t xml:space="preserve"> </w:t>
       </w:r>
-      <w:hyperlink r:id="rId442">
+      <w:hyperlink r:id="rId447">
         <w:r>
           <w:rPr>
             <w:rStyle w:val="Hyperlink"/>
@@ -63995,8 +64412,8 @@
         <w:t xml:space="preserve">.</w:t>
       </w:r>
     </w:p>
-    <w:bookmarkEnd w:id="443"/>
-    <w:bookmarkStart w:id="445" w:name="ref-qlora"/>
+    <w:bookmarkEnd w:id="448"/>
+    <w:bookmarkStart w:id="450" w:name="ref-qlora"/>
     <w:p>
       <w:pPr>
         <w:pStyle w:val="Bibliography"/>
@@ -64020,7 +64437,7 @@
       <w:r>
         <w:t xml:space="preserve"> </w:t>
       </w:r>
-      <w:hyperlink r:id="rId444">
+      <w:hyperlink r:id="rId449">
         <w:r>
           <w:rPr>
             <w:rStyle w:val="Hyperlink"/>
@@ -64032,8 +64449,8 @@
         <w:t xml:space="preserve">.</w:t>
       </w:r>
     </w:p>
-    <w:bookmarkEnd w:id="445"/>
-    <w:bookmarkStart w:id="447" w:name="ref-humans_are_dead"/>
+    <w:bookmarkEnd w:id="450"/>
+    <w:bookmarkStart w:id="452" w:name="ref-humans_are_dead"/>
     <w:p>
       <w:pPr>
         <w:pStyle w:val="Bibliography"/>
@@ -64057,7 +64474,7 @@
       <w:r>
         <w:t xml:space="preserve"> </w:t>
       </w:r>
-      <w:hyperlink r:id="rId446">
+      <w:hyperlink r:id="rId451">
         <w:r>
           <w:rPr>
             <w:rStyle w:val="Hyperlink"/>
@@ -64069,8 +64486,8 @@
         <w:t xml:space="preserve">.</w:t>
       </w:r>
     </w:p>
-    <w:bookmarkEnd w:id="447"/>
-    <w:bookmarkStart w:id="449" w:name="ref-dune"/>
+    <w:bookmarkEnd w:id="452"/>
+    <w:bookmarkStart w:id="454" w:name="ref-dune"/>
     <w:p>
       <w:pPr>
         <w:pStyle w:val="Bibliography"/>
@@ -64094,7 +64511,7 @@
       <w:r>
         <w:t xml:space="preserve"> </w:t>
       </w:r>
-      <w:hyperlink r:id="rId448">
+      <w:hyperlink r:id="rId453">
         <w:r>
           <w:rPr>
             <w:rStyle w:val="Hyperlink"/>
@@ -64106,8 +64523,8 @@
         <w:t xml:space="preserve">.</w:t>
       </w:r>
     </w:p>
-    <w:bookmarkEnd w:id="449"/>
-    <w:bookmarkStart w:id="451" w:name="ref-lora"/>
+    <w:bookmarkEnd w:id="454"/>
+    <w:bookmarkStart w:id="456" w:name="ref-lora"/>
     <w:p>
       <w:pPr>
         <w:pStyle w:val="Bibliography"/>
@@ -64131,7 +64548,7 @@
       <w:r>
         <w:t xml:space="preserve"> </w:t>
       </w:r>
-      <w:hyperlink r:id="rId450">
+      <w:hyperlink r:id="rId455">
         <w:r>
           <w:rPr>
             <w:rStyle w:val="Hyperlink"/>
@@ -64143,8 +64560,8 @@
         <w:t xml:space="preserve">.</w:t>
       </w:r>
     </w:p>
-    <w:bookmarkEnd w:id="451"/>
-    <w:bookmarkStart w:id="453" w:name="ref-lecun_world_models"/>
+    <w:bookmarkEnd w:id="456"/>
+    <w:bookmarkStart w:id="458" w:name="ref-lecun_world_models"/>
     <w:p>
       <w:pPr>
         <w:pStyle w:val="Bibliography"/>
@@ -64168,7 +64585,7 @@
       <w:r>
         <w:t xml:space="preserve"> </w:t>
       </w:r>
-      <w:hyperlink r:id="rId452">
+      <w:hyperlink r:id="rId457">
         <w:r>
           <w:rPr>
             <w:rStyle w:val="Hyperlink"/>
@@ -64180,8 +64597,8 @@
         <w:t xml:space="preserve">.</w:t>
       </w:r>
     </w:p>
-    <w:bookmarkEnd w:id="453"/>
-    <w:bookmarkStart w:id="455" w:name="ref-terminator"/>
+    <w:bookmarkEnd w:id="458"/>
+    <w:bookmarkStart w:id="460" w:name="ref-terminator"/>
     <w:p>
       <w:pPr>
         <w:pStyle w:val="Bibliography"/>
@@ -64199,7 +64616,7 @@
       <w:r>
         <w:t xml:space="preserve"> </w:t>
       </w:r>
-      <w:hyperlink r:id="rId454">
+      <w:hyperlink r:id="rId459">
         <w:r>
           <w:rPr>
             <w:rStyle w:val="Hyperlink"/>
@@ -64211,8 +64628,8 @@
         <w:t xml:space="preserve">.</w:t>
       </w:r>
     </w:p>
-    <w:bookmarkEnd w:id="455"/>
-    <w:bookmarkStart w:id="457" w:name="ref-matrix"/>
+    <w:bookmarkEnd w:id="460"/>
+    <w:bookmarkStart w:id="462" w:name="ref-matrix"/>
     <w:p>
       <w:pPr>
         <w:pStyle w:val="Bibliography"/>
@@ -64230,7 +64647,7 @@
       <w:r>
         <w:t xml:space="preserve"> </w:t>
       </w:r>
-      <w:hyperlink r:id="rId456">
+      <w:hyperlink r:id="rId461">
         <w:r>
           <w:rPr>
             <w:rStyle w:val="Hyperlink"/>
@@ -64242,8 +64659,8 @@
         <w:t xml:space="preserve">.</w:t>
       </w:r>
     </w:p>
-    <w:bookmarkEnd w:id="457"/>
-    <w:bookmarkStart w:id="459" w:name="ref-wargames"/>
+    <w:bookmarkEnd w:id="462"/>
+    <w:bookmarkStart w:id="464" w:name="ref-wargames"/>
     <w:p>
       <w:pPr>
         <w:pStyle w:val="Bibliography"/>
@@ -64261,7 +64678,7 @@
       <w:r>
         <w:t xml:space="preserve"> </w:t>
       </w:r>
-      <w:hyperlink r:id="rId458">
+      <w:hyperlink r:id="rId463">
         <w:r>
           <w:rPr>
             <w:rStyle w:val="Hyperlink"/>
@@ -64273,9 +64690,9 @@
         <w:t xml:space="preserve">.</w:t>
       </w:r>
     </w:p>
-    <w:bookmarkEnd w:id="459"/>
-    <w:bookmarkEnd w:id="460"/>
-    <w:bookmarkEnd w:id="461"/>
+    <w:bookmarkEnd w:id="464"/>
+    <w:bookmarkEnd w:id="465"/>
+    <w:bookmarkEnd w:id="466"/>
     <w:sectPr>
       <w:footnotePr>
         <w:numRestart w:val="eachSect"/>
@@ -65782,34 +66199,7 @@
     <w:abstractNumId w:val="991"/>
   </w:num>
   <w:num w:numId="1171">
-    <w:abstractNumId w:val="99411"/>
-    <w:lvlOverride w:ilvl="0">
-      <w:startOverride w:val="1"/>
-    </w:lvlOverride>
-    <w:lvlOverride w:ilvl="1">
-      <w:startOverride w:val="1"/>
-    </w:lvlOverride>
-    <w:lvlOverride w:ilvl="2">
-      <w:startOverride w:val="1"/>
-    </w:lvlOverride>
-    <w:lvlOverride w:ilvl="3">
-      <w:startOverride w:val="1"/>
-    </w:lvlOverride>
-    <w:lvlOverride w:ilvl="4">
-      <w:startOverride w:val="1"/>
-    </w:lvlOverride>
-    <w:lvlOverride w:ilvl="5">
-      <w:startOverride w:val="1"/>
-    </w:lvlOverride>
-    <w:lvlOverride w:ilvl="6">
-      <w:startOverride w:val="1"/>
-    </w:lvlOverride>
-    <w:lvlOverride w:ilvl="7">
-      <w:startOverride w:val="1"/>
-    </w:lvlOverride>
-    <w:lvlOverride w:ilvl="8">
-      <w:startOverride w:val="1"/>
-    </w:lvlOverride>
+    <w:abstractNumId w:val="991"/>
   </w:num>
   <w:num w:numId="1172">
     <w:abstractNumId w:val="991"/>
@@ -65848,6 +66238,12 @@
     </w:lvlOverride>
   </w:num>
   <w:num w:numId="1175">
+    <w:abstractNumId w:val="991"/>
+  </w:num>
+  <w:num w:numId="1176">
+    <w:abstractNumId w:val="991"/>
+  </w:num>
+  <w:num w:numId="1177">
     <w:abstractNumId w:val="99411"/>
     <w:lvlOverride w:ilvl="0">
       <w:startOverride w:val="1"/>
@@ -65877,7 +66273,7 @@
       <w:startOverride w:val="1"/>
     </w:lvlOverride>
   </w:num>
-  <w:num w:numId="1176">
+  <w:num w:numId="1178">
     <w:abstractNumId w:val="99411"/>
     <w:lvlOverride w:ilvl="0">
       <w:startOverride w:val="1"/>
@@ -65907,7 +66303,37 @@
       <w:startOverride w:val="1"/>
     </w:lvlOverride>
   </w:num>
-  <w:num w:numId="1177">
+  <w:num w:numId="1179">
+    <w:abstractNumId w:val="99411"/>
+    <w:lvlOverride w:ilvl="0">
+      <w:startOverride w:val="1"/>
+    </w:lvlOverride>
+    <w:lvlOverride w:ilvl="1">
+      <w:startOverride w:val="1"/>
+    </w:lvlOverride>
+    <w:lvlOverride w:ilvl="2">
+      <w:startOverride w:val="1"/>
+    </w:lvlOverride>
+    <w:lvlOverride w:ilvl="3">
+      <w:startOverride w:val="1"/>
+    </w:lvlOverride>
+    <w:lvlOverride w:ilvl="4">
+      <w:startOverride w:val="1"/>
+    </w:lvlOverride>
+    <w:lvlOverride w:ilvl="5">
+      <w:startOverride w:val="1"/>
+    </w:lvlOverride>
+    <w:lvlOverride w:ilvl="6">
+      <w:startOverride w:val="1"/>
+    </w:lvlOverride>
+    <w:lvlOverride w:ilvl="7">
+      <w:startOverride w:val="1"/>
+    </w:lvlOverride>
+    <w:lvlOverride w:ilvl="8">
+      <w:startOverride w:val="1"/>
+    </w:lvlOverride>
+  </w:num>
+  <w:num w:numId="1180">
     <w:abstractNumId w:val="991"/>
   </w:num>
 </w:numbering>

</xml_diff>

<commit_message>
Deploying to gh-pages from @ Morrison-Lab/wai@d19865c327edb37fd23cfc551be189aed9be4993 🚀
</commit_message>
<xml_diff>
--- a/chapters/coding-agents.docx
+++ b/chapters/coding-agents.docx
@@ -15,7 +15,7 @@
         <w:pStyle w:val="Date"/>
       </w:pPr>
       <w:r>
-        <w:t xml:space="preserve">Last modified: 2026-08-31 20:22:45 (PDT)</w:t>
+        <w:t xml:space="preserve">Last modified: 2026-08-31 21:09:48 (PDT)</w:t>
       </w:r>
     </w:p>
     <w:p>
@@ -63372,13 +63372,13 @@
     </w:p>
     <w:bookmarkEnd w:id="427"/>
     <w:bookmarkEnd w:id="428"/>
-    <w:bookmarkStart w:id="436" w:name="sec-ai-gemini-spend-management"/>
+    <w:bookmarkStart w:id="433" w:name="sec-ai-antigravity-python-sdk"/>
     <w:p>
       <w:pPr>
         <w:pStyle w:val="Heading1"/>
       </w:pPr>
       <w:r>
-        <w:t xml:space="preserve">42. Managing Gemini API Spend and Cost Optimization</w:t>
+        <w:t xml:space="preserve">42. Google Antigravity Python SDK</w:t>
       </w:r>
     </w:p>
     <w:p>
@@ -63386,28 +63386,57 @@
         <w:pStyle w:val="FirstParagraph"/>
       </w:pPr>
       <w:r>
-        <w:t xml:space="preserve">This guide describes how to manage Google AI Studio and Google Cloud Gemini API spend caps,</w:t>
-      </w:r>
-      <w:r>
-        <w:t xml:space="preserve"> </w:t>
-      </w:r>
-      <w:r>
-        <w:t xml:space="preserve">unpause paused API services,</w:t>
-      </w:r>
-      <w:r>
-        <w:t xml:space="preserve"> </w:t>
-      </w:r>
-      <w:r>
-        <w:t xml:space="preserve">and optimize token consumption across local tools and GitHub Actions workflows.</w:t>
-      </w:r>
-    </w:p>
-    <w:bookmarkStart w:id="430" w:name="Xd8c10be17edf039db5b664720f228274181ba18"/>
+        <w:t xml:space="preserve">The</w:t>
+      </w:r>
+      <w:r>
+        <w:t xml:space="preserve"> </w:t>
+      </w:r>
+      <w:hyperlink r:id="rId429">
+        <w:r>
+          <w:rPr>
+            <w:rStyle w:val="VerbatimChar"/>
+          </w:rPr>
+          <w:t xml:space="preserve">google-antigravity/antigravity-sdk-python</w:t>
+        </w:r>
+      </w:hyperlink>
+      <w:r>
+        <w:t xml:space="preserve"> </w:t>
+      </w:r>
+      <w:r>
+        <w:t xml:space="preserve">repository provides the official Python SDK</w:t>
+      </w:r>
+      <w:r>
+        <w:t xml:space="preserve"> </w:t>
+      </w:r>
+      <w:r>
+        <w:t xml:space="preserve">for building and automating agents on the Google Antigravity agent runtime</w:t>
+      </w:r>
+      <w:r>
+        <w:t xml:space="preserve"> </w:t>
+      </w:r>
+      <w:r>
+        <w:t xml:space="preserve">(measured 2026-08-31; distributed via PyPI as</w:t>
+      </w:r>
+      <w:r>
+        <w:t xml:space="preserve"> </w:t>
+      </w:r>
+      <w:r>
+        <w:rPr>
+          <w:rStyle w:val="VerbatimChar"/>
+        </w:rPr>
+        <w:t xml:space="preserve">google-antigravity</w:t>
+      </w:r>
+      <w:r>
+        <w:t xml:space="preserve">).</w:t>
+      </w:r>
+    </w:p>
+    <w:bookmarkStart w:id="430" w:name="architecture-and-runtime-model"/>
     <w:p>
       <w:pPr>
         <w:pStyle w:val="Heading4"/>
       </w:pPr>
       <w:r>
-        <w:t xml:space="preserve">Identifying Paused Projects (Project Numbers vs. Friendly Names)</w:t>
+        <w:t xml:space="preserve">Architecture and runtime model</w:t>
       </w:r>
     </w:p>
     <w:p>
@@ -63415,28 +63444,551 @@
         <w:pStyle w:val="FirstParagraph"/>
       </w:pPr>
       <w:r>
-        <w:t xml:space="preserve">When a project reaches its monthly budget limit,</w:t>
-      </w:r>
-      <w:r>
-        <w:t xml:space="preserve"> </w:t>
-      </w:r>
-      <w:r>
-        <w:t xml:space="preserve">Google sends an email notification stating that Gemini API service has been paused.</w:t>
-      </w:r>
-      <w:r>
-        <w:t xml:space="preserve"> </w:t>
-      </w:r>
-      <w:r>
-        <w:t xml:space="preserve">These email notifications identify the affected project using its internal</w:t>
-      </w:r>
-      <w:r>
-        <w:t xml:space="preserve"> </w:t>
-      </w:r>
+        <w:t xml:space="preserve">The SDK embeds the compiled Antigravity runtime engine directly into Python applications:</w:t>
+      </w:r>
+    </w:p>
+    <w:p>
+      <w:pPr>
+        <w:pStyle w:val="Compact"/>
+        <w:numPr>
+          <w:ilvl w:val="0"/>
+          <w:numId w:val="1177"/>
+        </w:numPr>
+      </w:pPr>
       <w:r>
         <w:rPr>
           <w:b/>
           <w:bCs/>
         </w:rPr>
+        <w:t xml:space="preserve">Lifecycle management</w:t>
+      </w:r>
+      <w:r>
+        <w:t xml:space="preserve">:</w:t>
+      </w:r>
+      <w:r>
+        <w:t xml:space="preserve"> </w:t>
+      </w:r>
+      <w:r>
+        <w:t xml:space="preserve">Agents are instantiated through</w:t>
+      </w:r>
+      <w:r>
+        <w:t xml:space="preserve"> </w:t>
+      </w:r>
+      <w:r>
+        <w:rPr>
+          <w:rStyle w:val="VerbatimChar"/>
+        </w:rPr>
+        <w:t xml:space="preserve">Agent</w:t>
+      </w:r>
+      <w:r>
+        <w:t xml:space="preserve"> </w:t>
+      </w:r>
+      <w:r>
+        <w:t xml:space="preserve">objects configured via</w:t>
+      </w:r>
+      <w:r>
+        <w:t xml:space="preserve"> </w:t>
+      </w:r>
+      <w:r>
+        <w:rPr>
+          <w:rStyle w:val="VerbatimChar"/>
+        </w:rPr>
+        <w:t xml:space="preserve">LocalAgentConfig</w:t>
+      </w:r>
+      <w:r>
+        <w:t xml:space="preserve">,</w:t>
+      </w:r>
+      <w:r>
+        <w:t xml:space="preserve"> </w:t>
+      </w:r>
+      <w:r>
+        <w:t xml:space="preserve">managed within asynchronous Python context managers (</w:t>
+      </w:r>
+      <w:r>
+        <w:rPr>
+          <w:rStyle w:val="VerbatimChar"/>
+        </w:rPr>
+        <w:t xml:space="preserve">async with</w:t>
+      </w:r>
+      <w:r>
+        <w:t xml:space="preserve">).</w:t>
+      </w:r>
+    </w:p>
+    <w:p>
+      <w:pPr>
+        <w:pStyle w:val="Compact"/>
+        <w:numPr>
+          <w:ilvl w:val="0"/>
+          <w:numId w:val="1177"/>
+        </w:numPr>
+      </w:pPr>
+      <w:r>
+        <w:rPr>
+          <w:b/>
+          <w:bCs/>
+        </w:rPr>
+        <w:t xml:space="preserve">Autonomous agentic loop</w:t>
+      </w:r>
+      <w:r>
+        <w:t xml:space="preserve">:</w:t>
+      </w:r>
+      <w:r>
+        <w:t xml:space="preserve"> </w:t>
+      </w:r>
+      <w:r>
+        <w:t xml:space="preserve">The underlying runtime drives multi-turn reasoning, streaming model responses,</w:t>
+      </w:r>
+      <w:r>
+        <w:t xml:space="preserve"> </w:t>
+      </w:r>
+      <w:r>
+        <w:t xml:space="preserve">subagent spawning, and tool dispatch without requiring hand-rolled state machines.</w:t>
+      </w:r>
+    </w:p>
+    <w:p>
+      <w:pPr>
+        <w:pStyle w:val="Compact"/>
+        <w:numPr>
+          <w:ilvl w:val="0"/>
+          <w:numId w:val="1177"/>
+        </w:numPr>
+      </w:pPr>
+      <w:r>
+        <w:rPr>
+          <w:b/>
+          <w:bCs/>
+        </w:rPr>
+        <w:t xml:space="preserve">Binary distribution</w:t>
+      </w:r>
+      <w:r>
+        <w:t xml:space="preserve">:</w:t>
+      </w:r>
+      <w:r>
+        <w:t xml:space="preserve"> </w:t>
+      </w:r>
+      <w:r>
+        <w:t xml:space="preserve">The Python package packages the native runtime binary,</w:t>
+      </w:r>
+      <w:r>
+        <w:t xml:space="preserve"> </w:t>
+      </w:r>
+      <w:r>
+        <w:t xml:space="preserve">ensuring consistent agent execution across macOS and Linux environments.</w:t>
+      </w:r>
+    </w:p>
+    <w:bookmarkEnd w:id="430"/>
+    <w:bookmarkStart w:id="431" w:name="extensibility-and-policy-enforcement"/>
+    <w:p>
+      <w:pPr>
+        <w:pStyle w:val="Heading4"/>
+      </w:pPr>
+      <w:r>
+        <w:t xml:space="preserve">Extensibility and policy enforcement</w:t>
+      </w:r>
+    </w:p>
+    <w:p>
+      <w:pPr>
+        <w:pStyle w:val="FirstParagraph"/>
+      </w:pPr>
+      <w:r>
+        <w:t xml:space="preserve">Developers can customize agent behavior and enforce safety policies:</w:t>
+      </w:r>
+    </w:p>
+    <w:p>
+      <w:pPr>
+        <w:pStyle w:val="Compact"/>
+        <w:numPr>
+          <w:ilvl w:val="0"/>
+          <w:numId w:val="1178"/>
+        </w:numPr>
+      </w:pPr>
+      <w:r>
+        <w:rPr>
+          <w:b/>
+          <w:bCs/>
+        </w:rPr>
+        <w:t xml:space="preserve">Custom tools and MCP servers</w:t>
+      </w:r>
+      <w:r>
+        <w:t xml:space="preserve">:</w:t>
+      </w:r>
+      <w:r>
+        <w:t xml:space="preserve"> </w:t>
+      </w:r>
+      <w:r>
+        <w:t xml:space="preserve">Register custom Python functions as callable agent tools</w:t>
+      </w:r>
+      <w:r>
+        <w:t xml:space="preserve"> </w:t>
+      </w:r>
+      <w:r>
+        <w:t xml:space="preserve">or connect external Model Context Protocol (MCP) server endpoints.</w:t>
+      </w:r>
+    </w:p>
+    <w:p>
+      <w:pPr>
+        <w:pStyle w:val="Compact"/>
+        <w:numPr>
+          <w:ilvl w:val="0"/>
+          <w:numId w:val="1178"/>
+        </w:numPr>
+      </w:pPr>
+      <w:r>
+        <w:rPr>
+          <w:b/>
+          <w:bCs/>
+        </w:rPr>
+        <w:t xml:space="preserve">Steering hooks</w:t>
+      </w:r>
+      <w:r>
+        <w:t xml:space="preserve">:</w:t>
+      </w:r>
+      <w:r>
+        <w:t xml:space="preserve"> </w:t>
+      </w:r>
+      <w:r>
+        <w:t xml:space="preserve">Attach pre-tool and post-tool lifecycle hooks to inspect, steer,</w:t>
+      </w:r>
+      <w:r>
+        <w:t xml:space="preserve"> </w:t>
+      </w:r>
+      <w:r>
+        <w:t xml:space="preserve">or veto actions (such as restricting command execution or gating repository modifications).</w:t>
+      </w:r>
+    </w:p>
+    <w:p>
+      <w:pPr>
+        <w:pStyle w:val="Compact"/>
+        <w:numPr>
+          <w:ilvl w:val="0"/>
+          <w:numId w:val="1178"/>
+        </w:numPr>
+      </w:pPr>
+      <w:r>
+        <w:rPr>
+          <w:b/>
+          <w:bCs/>
+        </w:rPr>
+        <w:t xml:space="preserve">Skill discovery</w:t>
+      </w:r>
+      <w:r>
+        <w:t xml:space="preserve">:</w:t>
+      </w:r>
+      <w:r>
+        <w:t xml:space="preserve"> </w:t>
+      </w:r>
+      <w:r>
+        <w:t xml:space="preserve">Load skill catalogs (</w:t>
+      </w:r>
+      <w:r>
+        <w:rPr>
+          <w:rStyle w:val="VerbatimChar"/>
+        </w:rPr>
+        <w:t xml:space="preserve">skills/**/SKILL.md</w:t>
+      </w:r>
+      <w:r>
+        <w:t xml:space="preserve">) dynamically,</w:t>
+      </w:r>
+      <w:r>
+        <w:t xml:space="preserve"> </w:t>
+      </w:r>
+      <w:r>
+        <w:t xml:space="preserve">allowing agents to leverage shared procedural instructions.</w:t>
+      </w:r>
+    </w:p>
+    <w:bookmarkEnd w:id="431"/>
+    <w:bookmarkStart w:id="432" w:name="Xeddea508349c3fceeae23b1265edb60e3f99a32"/>
+    <w:p>
+      <w:pPr>
+        <w:pStyle w:val="Heading4"/>
+      </w:pPr>
+      <w:r>
+        <w:t xml:space="preserve">Comparison with interactive Antigravity surfaces</w:t>
+      </w:r>
+    </w:p>
+    <w:tbl>
+      <w:tblPr>
+        <w:tblStyle w:val="Table"/>
+        <w:tblW w:type="pct" w:w="5000"/>
+        <w:tblLayout w:type="fixed"/>
+        <w:tblLook w:firstRow="1" w:lastRow="0" w:firstColumn="0" w:lastColumn="0" w:noHBand="0" w:noVBand="0" w:val="0020"/>
+      </w:tblPr>
+      <w:tblGrid>
+        <w:gridCol w:w="2640"/>
+        <w:gridCol w:w="2640"/>
+        <w:gridCol w:w="2640"/>
+      </w:tblGrid>
+      <w:tr>
+        <w:trPr>
+          <w:tblHeader w:val="on"/>
+        </w:trPr>
+        <w:tc>
+          <w:tcPr/>
+          <w:p>
+            <w:pPr>
+              <w:pStyle w:val="Compact"/>
+            </w:pPr>
+            <w:r>
+              <w:t xml:space="preserve">Dimension</w:t>
+            </w:r>
+          </w:p>
+        </w:tc>
+        <w:tc>
+          <w:tcPr/>
+          <w:p>
+            <w:pPr>
+              <w:pStyle w:val="Compact"/>
+            </w:pPr>
+            <w:r>
+              <w:t xml:space="preserve">Antigravity Python SDK</w:t>
+            </w:r>
+          </w:p>
+        </w:tc>
+        <w:tc>
+          <w:tcPr/>
+          <w:p>
+            <w:pPr>
+              <w:pStyle w:val="Compact"/>
+            </w:pPr>
+            <w:r>
+              <w:t xml:space="preserve">Antigravity CLI &amp; IDE Extensions</w:t>
+            </w:r>
+          </w:p>
+        </w:tc>
+      </w:tr>
+      <w:tr>
+        <w:tc>
+          <w:tcPr/>
+          <w:p>
+            <w:pPr>
+              <w:pStyle w:val="Compact"/>
+            </w:pPr>
+            <w:r>
+              <w:rPr>
+                <w:b/>
+                <w:bCs/>
+              </w:rPr>
+              <w:t xml:space="preserve">Primary use case</w:t>
+            </w:r>
+          </w:p>
+        </w:tc>
+        <w:tc>
+          <w:tcPr/>
+          <w:p>
+            <w:pPr>
+              <w:pStyle w:val="Compact"/>
+            </w:pPr>
+            <w:r>
+              <w:t xml:space="preserve">Automated pipelines, CI evaluation, custom harnesses</w:t>
+            </w:r>
+          </w:p>
+        </w:tc>
+        <w:tc>
+          <w:tcPr/>
+          <w:p>
+            <w:pPr>
+              <w:pStyle w:val="Compact"/>
+            </w:pPr>
+            <w:r>
+              <w:t xml:space="preserve">Interactive terminal and GUI pair programming</w:t>
+            </w:r>
+          </w:p>
+        </w:tc>
+      </w:tr>
+      <w:tr>
+        <w:tc>
+          <w:tcPr/>
+          <w:p>
+            <w:pPr>
+              <w:pStyle w:val="Compact"/>
+            </w:pPr>
+            <w:r>
+              <w:rPr>
+                <w:b/>
+                <w:bCs/>
+              </w:rPr>
+              <w:t xml:space="preserve">Control plane</w:t>
+            </w:r>
+          </w:p>
+        </w:tc>
+        <w:tc>
+          <w:tcPr/>
+          <w:p>
+            <w:pPr>
+              <w:pStyle w:val="Compact"/>
+            </w:pPr>
+            <w:r>
+              <w:t xml:space="preserve">Python API (</w:t>
+            </w:r>
+            <w:r>
+              <w:rPr>
+                <w:rStyle w:val="VerbatimChar"/>
+              </w:rPr>
+              <w:t xml:space="preserve">async with Agent(...)</w:t>
+            </w:r>
+            <w:r>
+              <w:t xml:space="preserve">)</w:t>
+            </w:r>
+          </w:p>
+        </w:tc>
+        <w:tc>
+          <w:tcPr/>
+          <w:p>
+            <w:pPr>
+              <w:pStyle w:val="Compact"/>
+            </w:pPr>
+            <w:r>
+              <w:t xml:space="preserve">Interactive CLI prompt or editor chat panel</w:t>
+            </w:r>
+          </w:p>
+        </w:tc>
+      </w:tr>
+      <w:tr>
+        <w:tc>
+          <w:tcPr/>
+          <w:p>
+            <w:pPr>
+              <w:pStyle w:val="Compact"/>
+            </w:pPr>
+            <w:r>
+              <w:rPr>
+                <w:b/>
+                <w:bCs/>
+              </w:rPr>
+              <w:t xml:space="preserve">Tool definitions</w:t>
+            </w:r>
+          </w:p>
+        </w:tc>
+        <w:tc>
+          <w:tcPr/>
+          <w:p>
+            <w:pPr>
+              <w:pStyle w:val="Compact"/>
+            </w:pPr>
+            <w:r>
+              <w:t xml:space="preserve">In-process Python callables &amp; MCP</w:t>
+            </w:r>
+          </w:p>
+        </w:tc>
+        <w:tc>
+          <w:tcPr/>
+          <w:p>
+            <w:pPr>
+              <w:pStyle w:val="Compact"/>
+            </w:pPr>
+            <w:r>
+              <w:t xml:space="preserve">JSON manifests, plugins, and CLI scripts</w:t>
+            </w:r>
+          </w:p>
+        </w:tc>
+      </w:tr>
+      <w:tr>
+        <w:tc>
+          <w:tcPr/>
+          <w:p>
+            <w:pPr>
+              <w:pStyle w:val="Compact"/>
+            </w:pPr>
+            <w:r>
+              <w:rPr>
+                <w:b/>
+                <w:bCs/>
+              </w:rPr>
+              <w:t xml:space="preserve">Runtime engine</w:t>
+            </w:r>
+          </w:p>
+        </w:tc>
+        <w:tc>
+          <w:tcPr/>
+          <w:p>
+            <w:pPr>
+              <w:pStyle w:val="Compact"/>
+            </w:pPr>
+            <w:r>
+              <w:t xml:space="preserve">Embedded native binary</w:t>
+            </w:r>
+          </w:p>
+        </w:tc>
+        <w:tc>
+          <w:tcPr/>
+          <w:p>
+            <w:pPr>
+              <w:pStyle w:val="Compact"/>
+            </w:pPr>
+            <w:r>
+              <w:t xml:space="preserve">Managed local service</w:t>
+            </w:r>
+          </w:p>
+        </w:tc>
+      </w:tr>
+    </w:tbl>
+    <w:bookmarkEnd w:id="432"/>
+    <w:bookmarkEnd w:id="433"/>
+    <w:bookmarkStart w:id="441" w:name="sec-ai-gemini-spend-management"/>
+    <w:p>
+      <w:pPr>
+        <w:pStyle w:val="Heading1"/>
+      </w:pPr>
+      <w:r>
+        <w:t xml:space="preserve">43. Managing Gemini API Spend and Cost Optimization</w:t>
+      </w:r>
+    </w:p>
+    <w:p>
+      <w:pPr>
+        <w:pStyle w:val="FirstParagraph"/>
+      </w:pPr>
+      <w:r>
+        <w:t xml:space="preserve">This guide describes how to manage Google AI Studio and Google Cloud Gemini API spend caps,</w:t>
+      </w:r>
+      <w:r>
+        <w:t xml:space="preserve"> </w:t>
+      </w:r>
+      <w:r>
+        <w:t xml:space="preserve">unpause paused API services,</w:t>
+      </w:r>
+      <w:r>
+        <w:t xml:space="preserve"> </w:t>
+      </w:r>
+      <w:r>
+        <w:t xml:space="preserve">and optimize token consumption across local tools and GitHub Actions workflows.</w:t>
+      </w:r>
+    </w:p>
+    <w:bookmarkStart w:id="435" w:name="Xd8c10be17edf039db5b664720f228274181ba18"/>
+    <w:p>
+      <w:pPr>
+        <w:pStyle w:val="Heading4"/>
+      </w:pPr>
+      <w:r>
+        <w:t xml:space="preserve">Identifying Paused Projects (Project Numbers vs. Friendly Names)</w:t>
+      </w:r>
+    </w:p>
+    <w:p>
+      <w:pPr>
+        <w:pStyle w:val="FirstParagraph"/>
+      </w:pPr>
+      <w:r>
+        <w:t xml:space="preserve">When a project reaches its monthly budget limit,</w:t>
+      </w:r>
+      <w:r>
+        <w:t xml:space="preserve"> </w:t>
+      </w:r>
+      <w:r>
+        <w:t xml:space="preserve">Google sends an email notification stating that Gemini API service has been paused.</w:t>
+      </w:r>
+      <w:r>
+        <w:t xml:space="preserve"> </w:t>
+      </w:r>
+      <w:r>
+        <w:t xml:space="preserve">These email notifications identify the affected project using its internal</w:t>
+      </w:r>
+      <w:r>
+        <w:t xml:space="preserve"> </w:t>
+      </w:r>
+      <w:r>
+        <w:rPr>
+          <w:b/>
+          <w:bCs/>
+        </w:rPr>
         <w:t xml:space="preserve">numerical GCP Project Number</w:t>
       </w:r>
       <w:r>
@@ -63465,7 +64017,7 @@
       <w:r>
         <w:t xml:space="preserve"> </w:t>
       </w:r>
-      <w:hyperlink r:id="rId429">
+      <w:hyperlink r:id="rId434">
         <w:r>
           <w:rPr>
             <w:rStyle w:val="Hyperlink"/>
@@ -63551,7 +64103,7 @@
         <w:pStyle w:val="Compact"/>
         <w:numPr>
           <w:ilvl w:val="0"/>
-          <w:numId w:val="1177"/>
+          <w:numId w:val="1179"/>
         </w:numPr>
       </w:pPr>
       <w:r>
@@ -63560,7 +64112,7 @@
       <w:r>
         <w:t xml:space="preserve"> </w:t>
       </w:r>
-      <w:hyperlink r:id="rId429">
+      <w:hyperlink r:id="rId434">
         <w:r>
           <w:rPr>
             <w:rStyle w:val="Hyperlink"/>
@@ -63577,7 +64129,7 @@
         <w:pStyle w:val="Compact"/>
         <w:numPr>
           <w:ilvl w:val="0"/>
-          <w:numId w:val="1177"/>
+          <w:numId w:val="1179"/>
         </w:numPr>
       </w:pPr>
       <w:r>
@@ -63589,15 +64141,15 @@
         <w:pStyle w:val="Compact"/>
         <w:numPr>
           <w:ilvl w:val="0"/>
-          <w:numId w:val="1177"/>
+          <w:numId w:val="1179"/>
         </w:numPr>
       </w:pPr>
       <w:r>
         <w:t xml:space="preserve">Any project that has hit its monthly spend cap will have its API requests paused until the limit is updated.</w:t>
       </w:r>
     </w:p>
-    <w:bookmarkEnd w:id="430"/>
-    <w:bookmarkStart w:id="432" w:name="adjusting-and-unpausing-spend-caps"/>
+    <w:bookmarkEnd w:id="435"/>
+    <w:bookmarkStart w:id="437" w:name="adjusting-and-unpausing-spend-caps"/>
     <w:p>
       <w:pPr>
         <w:pStyle w:val="Heading4"/>
@@ -63619,7 +64171,7 @@
         <w:pStyle w:val="Compact"/>
         <w:numPr>
           <w:ilvl w:val="0"/>
-          <w:numId w:val="1178"/>
+          <w:numId w:val="1180"/>
         </w:numPr>
       </w:pPr>
       <w:r>
@@ -63628,7 +64180,7 @@
       <w:r>
         <w:t xml:space="preserve"> </w:t>
       </w:r>
-      <w:hyperlink r:id="rId431">
+      <w:hyperlink r:id="rId436">
         <w:r>
           <w:rPr>
             <w:rStyle w:val="Hyperlink"/>
@@ -63645,7 +64197,7 @@
         <w:pStyle w:val="Compact"/>
         <w:numPr>
           <w:ilvl w:val="0"/>
-          <w:numId w:val="1178"/>
+          <w:numId w:val="1180"/>
         </w:numPr>
       </w:pPr>
       <w:r>
@@ -63657,7 +64209,7 @@
         <w:pStyle w:val="Compact"/>
         <w:numPr>
           <w:ilvl w:val="0"/>
-          <w:numId w:val="1178"/>
+          <w:numId w:val="1180"/>
         </w:numPr>
       </w:pPr>
       <w:r>
@@ -63697,8 +64249,8 @@
         <w:t xml:space="preserve">and API service automatically resumes up to the configured cap.</w:t>
       </w:r>
     </w:p>
-    <w:bookmarkEnd w:id="432"/>
-    <w:bookmarkStart w:id="434" w:name="setting-up-google-cloud-budget-alerts"/>
+    <w:bookmarkEnd w:id="437"/>
+    <w:bookmarkStart w:id="439" w:name="setting-up-google-cloud-budget-alerts"/>
     <w:p>
       <w:pPr>
         <w:pStyle w:val="Heading4"/>
@@ -63720,7 +64272,7 @@
         <w:pStyle w:val="Compact"/>
         <w:numPr>
           <w:ilvl w:val="0"/>
-          <w:numId w:val="1179"/>
+          <w:numId w:val="1181"/>
         </w:numPr>
       </w:pPr>
       <w:r>
@@ -63729,7 +64281,7 @@
       <w:r>
         <w:t xml:space="preserve"> </w:t>
       </w:r>
-      <w:hyperlink r:id="rId433">
+      <w:hyperlink r:id="rId438">
         <w:r>
           <w:rPr>
             <w:rStyle w:val="Hyperlink"/>
@@ -63746,7 +64298,7 @@
         <w:pStyle w:val="Compact"/>
         <w:numPr>
           <w:ilvl w:val="0"/>
-          <w:numId w:val="1179"/>
+          <w:numId w:val="1181"/>
         </w:numPr>
       </w:pPr>
       <w:r>
@@ -63771,7 +64323,7 @@
         <w:pStyle w:val="Compact"/>
         <w:numPr>
           <w:ilvl w:val="0"/>
-          <w:numId w:val="1179"/>
+          <w:numId w:val="1181"/>
         </w:numPr>
       </w:pPr>
       <w:r>
@@ -63795,7 +64347,7 @@
         <w:pStyle w:val="Compact"/>
         <w:numPr>
           <w:ilvl w:val="0"/>
-          <w:numId w:val="1179"/>
+          <w:numId w:val="1181"/>
         </w:numPr>
       </w:pPr>
       <w:r>
@@ -63807,7 +64359,7 @@
         <w:pStyle w:val="Compact"/>
         <w:numPr>
           <w:ilvl w:val="0"/>
-          <w:numId w:val="1179"/>
+          <w:numId w:val="1181"/>
         </w:numPr>
       </w:pPr>
       <w:r>
@@ -63861,7 +64413,7 @@
         <w:pStyle w:val="Compact"/>
         <w:numPr>
           <w:ilvl w:val="0"/>
-          <w:numId w:val="1179"/>
+          <w:numId w:val="1181"/>
         </w:numPr>
       </w:pPr>
       <w:r>
@@ -63881,8 +64433,8 @@
         <w:t xml:space="preserve">. You will receive email alerts before any project hits its spend cap.</w:t>
       </w:r>
     </w:p>
-    <w:bookmarkEnd w:id="434"/>
-    <w:bookmarkStart w:id="435" w:name="cost-optimization-best-practices"/>
+    <w:bookmarkEnd w:id="439"/>
+    <w:bookmarkStart w:id="440" w:name="cost-optimization-best-practices"/>
     <w:p>
       <w:pPr>
         <w:pStyle w:val="Heading4"/>
@@ -63904,7 +64456,7 @@
         <w:pStyle w:val="Compact"/>
         <w:numPr>
           <w:ilvl w:val="0"/>
-          <w:numId w:val="1180"/>
+          <w:numId w:val="1182"/>
         </w:numPr>
       </w:pPr>
       <w:r>
@@ -64040,7 +64592,7 @@
         <w:pStyle w:val="Compact"/>
         <w:numPr>
           <w:ilvl w:val="0"/>
-          <w:numId w:val="1180"/>
+          <w:numId w:val="1182"/>
         </w:numPr>
       </w:pPr>
       <w:r>
@@ -64071,7 +64623,7 @@
         <w:pStyle w:val="Compact"/>
         <w:numPr>
           <w:ilvl w:val="0"/>
-          <w:numId w:val="1180"/>
+          <w:numId w:val="1182"/>
         </w:numPr>
       </w:pPr>
       <w:r>
@@ -64102,7 +64654,7 @@
         <w:pStyle w:val="Compact"/>
         <w:numPr>
           <w:ilvl w:val="0"/>
-          <w:numId w:val="1180"/>
+          <w:numId w:val="1182"/>
         </w:numPr>
       </w:pPr>
       <w:r>
@@ -64197,9 +64749,9 @@
         <w:t xml:space="preserve">to collapse them in GitHub’s web diff view and exclude them from repository language statistics.</w:t>
       </w:r>
     </w:p>
-    <w:bookmarkEnd w:id="435"/>
-    <w:bookmarkEnd w:id="436"/>
-    <w:bookmarkStart w:id="466" w:name="references"/>
+    <w:bookmarkEnd w:id="440"/>
+    <w:bookmarkEnd w:id="441"/>
+    <w:bookmarkStart w:id="471" w:name="references"/>
     <w:p>
       <w:pPr>
         <w:pStyle w:val="Heading1"/>
@@ -64208,8 +64760,8 @@
         <w:t xml:space="preserve">References</w:t>
       </w:r>
     </w:p>
-    <w:bookmarkStart w:id="465" w:name="refs"/>
-    <w:bookmarkStart w:id="438" w:name="ref-space_odyssey"/>
+    <w:bookmarkStart w:id="470" w:name="refs"/>
+    <w:bookmarkStart w:id="443" w:name="ref-space_odyssey"/>
     <w:p>
       <w:pPr>
         <w:pStyle w:val="Bibliography"/>
@@ -64227,7 +64779,7 @@
       <w:r>
         <w:t xml:space="preserve"> </w:t>
       </w:r>
-      <w:hyperlink r:id="rId437">
+      <w:hyperlink r:id="rId442">
         <w:r>
           <w:rPr>
             <w:rStyle w:val="Hyperlink"/>
@@ -64239,8 +64791,8 @@
         <w:t xml:space="preserve">.</w:t>
       </w:r>
     </w:p>
-    <w:bookmarkEnd w:id="438"/>
-    <w:bookmarkStart w:id="440" w:name="ref-i_robot"/>
+    <w:bookmarkEnd w:id="443"/>
+    <w:bookmarkStart w:id="445" w:name="ref-i_robot"/>
     <w:p>
       <w:pPr>
         <w:pStyle w:val="Bibliography"/>
@@ -64264,7 +64816,7 @@
       <w:r>
         <w:t xml:space="preserve"> </w:t>
       </w:r>
-      <w:hyperlink r:id="rId439">
+      <w:hyperlink r:id="rId444">
         <w:r>
           <w:rPr>
             <w:rStyle w:val="Hyperlink"/>
@@ -64276,8 +64828,8 @@
         <w:t xml:space="preserve">.</w:t>
       </w:r>
     </w:p>
-    <w:bookmarkEnd w:id="440"/>
-    <w:bookmarkStart w:id="442" w:name="ref-battlestar_galactica_2004"/>
+    <w:bookmarkEnd w:id="445"/>
+    <w:bookmarkStart w:id="447" w:name="ref-battlestar_galactica_2004"/>
     <w:p>
       <w:pPr>
         <w:pStyle w:val="Bibliography"/>
@@ -64295,7 +64847,7 @@
       <w:r>
         <w:t xml:space="preserve"> </w:t>
       </w:r>
-      <w:hyperlink r:id="rId441">
+      <w:hyperlink r:id="rId446">
         <w:r>
           <w:rPr>
             <w:rStyle w:val="Hyperlink"/>
@@ -64307,8 +64859,8 @@
         <w:t xml:space="preserve">.</w:t>
       </w:r>
     </w:p>
-    <w:bookmarkEnd w:id="442"/>
-    <w:bookmarkStart w:id="444" w:name="ref-slm_agentic_ai"/>
+    <w:bookmarkEnd w:id="447"/>
+    <w:bookmarkStart w:id="449" w:name="ref-slm_agentic_ai"/>
     <w:p>
       <w:pPr>
         <w:pStyle w:val="Bibliography"/>
@@ -64332,7 +64884,7 @@
       <w:r>
         <w:t xml:space="preserve"> </w:t>
       </w:r>
-      <w:hyperlink r:id="rId443">
+      <w:hyperlink r:id="rId448">
         <w:r>
           <w:rPr>
             <w:rStyle w:val="Hyperlink"/>
@@ -64344,8 +64896,8 @@
         <w:t xml:space="preserve">.</w:t>
       </w:r>
     </w:p>
-    <w:bookmarkEnd w:id="444"/>
-    <w:bookmarkStart w:id="446" w:name="ref-blade_runner"/>
+    <w:bookmarkEnd w:id="449"/>
+    <w:bookmarkStart w:id="451" w:name="ref-blade_runner"/>
     <w:p>
       <w:pPr>
         <w:pStyle w:val="Bibliography"/>
@@ -64363,7 +64915,7 @@
       <w:r>
         <w:t xml:space="preserve"> </w:t>
       </w:r>
-      <w:hyperlink r:id="rId445">
+      <w:hyperlink r:id="rId450">
         <w:r>
           <w:rPr>
             <w:rStyle w:val="Hyperlink"/>
@@ -64375,8 +64927,8 @@
         <w:t xml:space="preserve">.</w:t>
       </w:r>
     </w:p>
-    <w:bookmarkEnd w:id="446"/>
-    <w:bookmarkStart w:id="448" w:name="ref-enders_game"/>
+    <w:bookmarkEnd w:id="451"/>
+    <w:bookmarkStart w:id="453" w:name="ref-enders_game"/>
     <w:p>
       <w:pPr>
         <w:pStyle w:val="Bibliography"/>
@@ -64400,7 +64952,7 @@
       <w:r>
         <w:t xml:space="preserve"> </w:t>
       </w:r>
-      <w:hyperlink r:id="rId447">
+      <w:hyperlink r:id="rId452">
         <w:r>
           <w:rPr>
             <w:rStyle w:val="Hyperlink"/>
@@ -64412,8 +64964,8 @@
         <w:t xml:space="preserve">.</w:t>
       </w:r>
     </w:p>
-    <w:bookmarkEnd w:id="448"/>
-    <w:bookmarkStart w:id="450" w:name="ref-qlora"/>
+    <w:bookmarkEnd w:id="453"/>
+    <w:bookmarkStart w:id="455" w:name="ref-qlora"/>
     <w:p>
       <w:pPr>
         <w:pStyle w:val="Bibliography"/>
@@ -64437,7 +64989,7 @@
       <w:r>
         <w:t xml:space="preserve"> </w:t>
       </w:r>
-      <w:hyperlink r:id="rId449">
+      <w:hyperlink r:id="rId454">
         <w:r>
           <w:rPr>
             <w:rStyle w:val="Hyperlink"/>
@@ -64449,8 +65001,8 @@
         <w:t xml:space="preserve">.</w:t>
       </w:r>
     </w:p>
-    <w:bookmarkEnd w:id="450"/>
-    <w:bookmarkStart w:id="452" w:name="ref-humans_are_dead"/>
+    <w:bookmarkEnd w:id="455"/>
+    <w:bookmarkStart w:id="457" w:name="ref-humans_are_dead"/>
     <w:p>
       <w:pPr>
         <w:pStyle w:val="Bibliography"/>
@@ -64474,7 +65026,7 @@
       <w:r>
         <w:t xml:space="preserve"> </w:t>
       </w:r>
-      <w:hyperlink r:id="rId451">
+      <w:hyperlink r:id="rId456">
         <w:r>
           <w:rPr>
             <w:rStyle w:val="Hyperlink"/>
@@ -64486,8 +65038,8 @@
         <w:t xml:space="preserve">.</w:t>
       </w:r>
     </w:p>
-    <w:bookmarkEnd w:id="452"/>
-    <w:bookmarkStart w:id="454" w:name="ref-dune"/>
+    <w:bookmarkEnd w:id="457"/>
+    <w:bookmarkStart w:id="459" w:name="ref-dune"/>
     <w:p>
       <w:pPr>
         <w:pStyle w:val="Bibliography"/>
@@ -64511,7 +65063,7 @@
       <w:r>
         <w:t xml:space="preserve"> </w:t>
       </w:r>
-      <w:hyperlink r:id="rId453">
+      <w:hyperlink r:id="rId458">
         <w:r>
           <w:rPr>
             <w:rStyle w:val="Hyperlink"/>
@@ -64523,8 +65075,8 @@
         <w:t xml:space="preserve">.</w:t>
       </w:r>
     </w:p>
-    <w:bookmarkEnd w:id="454"/>
-    <w:bookmarkStart w:id="456" w:name="ref-lora"/>
+    <w:bookmarkEnd w:id="459"/>
+    <w:bookmarkStart w:id="461" w:name="ref-lora"/>
     <w:p>
       <w:pPr>
         <w:pStyle w:val="Bibliography"/>
@@ -64548,7 +65100,7 @@
       <w:r>
         <w:t xml:space="preserve"> </w:t>
       </w:r>
-      <w:hyperlink r:id="rId455">
+      <w:hyperlink r:id="rId460">
         <w:r>
           <w:rPr>
             <w:rStyle w:val="Hyperlink"/>
@@ -64560,8 +65112,8 @@
         <w:t xml:space="preserve">.</w:t>
       </w:r>
     </w:p>
-    <w:bookmarkEnd w:id="456"/>
-    <w:bookmarkStart w:id="458" w:name="ref-lecun_world_models"/>
+    <w:bookmarkEnd w:id="461"/>
+    <w:bookmarkStart w:id="463" w:name="ref-lecun_world_models"/>
     <w:p>
       <w:pPr>
         <w:pStyle w:val="Bibliography"/>
@@ -64585,7 +65137,7 @@
       <w:r>
         <w:t xml:space="preserve"> </w:t>
       </w:r>
-      <w:hyperlink r:id="rId457">
+      <w:hyperlink r:id="rId462">
         <w:r>
           <w:rPr>
             <w:rStyle w:val="Hyperlink"/>
@@ -64597,8 +65149,8 @@
         <w:t xml:space="preserve">.</w:t>
       </w:r>
     </w:p>
-    <w:bookmarkEnd w:id="458"/>
-    <w:bookmarkStart w:id="460" w:name="ref-terminator"/>
+    <w:bookmarkEnd w:id="463"/>
+    <w:bookmarkStart w:id="465" w:name="ref-terminator"/>
     <w:p>
       <w:pPr>
         <w:pStyle w:val="Bibliography"/>
@@ -64616,7 +65168,7 @@
       <w:r>
         <w:t xml:space="preserve"> </w:t>
       </w:r>
-      <w:hyperlink r:id="rId459">
+      <w:hyperlink r:id="rId464">
         <w:r>
           <w:rPr>
             <w:rStyle w:val="Hyperlink"/>
@@ -64628,8 +65180,8 @@
         <w:t xml:space="preserve">.</w:t>
       </w:r>
     </w:p>
-    <w:bookmarkEnd w:id="460"/>
-    <w:bookmarkStart w:id="462" w:name="ref-matrix"/>
+    <w:bookmarkEnd w:id="465"/>
+    <w:bookmarkStart w:id="467" w:name="ref-matrix"/>
     <w:p>
       <w:pPr>
         <w:pStyle w:val="Bibliography"/>
@@ -64647,7 +65199,7 @@
       <w:r>
         <w:t xml:space="preserve"> </w:t>
       </w:r>
-      <w:hyperlink r:id="rId461">
+      <w:hyperlink r:id="rId466">
         <w:r>
           <w:rPr>
             <w:rStyle w:val="Hyperlink"/>
@@ -64659,8 +65211,8 @@
         <w:t xml:space="preserve">.</w:t>
       </w:r>
     </w:p>
-    <w:bookmarkEnd w:id="462"/>
-    <w:bookmarkStart w:id="464" w:name="ref-wargames"/>
+    <w:bookmarkEnd w:id="467"/>
+    <w:bookmarkStart w:id="469" w:name="ref-wargames"/>
     <w:p>
       <w:pPr>
         <w:pStyle w:val="Bibliography"/>
@@ -64678,7 +65230,7 @@
       <w:r>
         <w:t xml:space="preserve"> </w:t>
       </w:r>
-      <w:hyperlink r:id="rId463">
+      <w:hyperlink r:id="rId468">
         <w:r>
           <w:rPr>
             <w:rStyle w:val="Hyperlink"/>
@@ -64690,9 +65242,9 @@
         <w:t xml:space="preserve">.</w:t>
       </w:r>
     </w:p>
-    <w:bookmarkEnd w:id="464"/>
-    <w:bookmarkEnd w:id="465"/>
-    <w:bookmarkEnd w:id="466"/>
+    <w:bookmarkEnd w:id="469"/>
+    <w:bookmarkEnd w:id="470"/>
+    <w:bookmarkEnd w:id="471"/>
     <w:sectPr>
       <w:footnotePr>
         <w:numRestart w:val="eachSect"/>
@@ -66244,64 +66796,10 @@
     <w:abstractNumId w:val="991"/>
   </w:num>
   <w:num w:numId="1177">
-    <w:abstractNumId w:val="99411"/>
-    <w:lvlOverride w:ilvl="0">
-      <w:startOverride w:val="1"/>
-    </w:lvlOverride>
-    <w:lvlOverride w:ilvl="1">
-      <w:startOverride w:val="1"/>
-    </w:lvlOverride>
-    <w:lvlOverride w:ilvl="2">
-      <w:startOverride w:val="1"/>
-    </w:lvlOverride>
-    <w:lvlOverride w:ilvl="3">
-      <w:startOverride w:val="1"/>
-    </w:lvlOverride>
-    <w:lvlOverride w:ilvl="4">
-      <w:startOverride w:val="1"/>
-    </w:lvlOverride>
-    <w:lvlOverride w:ilvl="5">
-      <w:startOverride w:val="1"/>
-    </w:lvlOverride>
-    <w:lvlOverride w:ilvl="6">
-      <w:startOverride w:val="1"/>
-    </w:lvlOverride>
-    <w:lvlOverride w:ilvl="7">
-      <w:startOverride w:val="1"/>
-    </w:lvlOverride>
-    <w:lvlOverride w:ilvl="8">
-      <w:startOverride w:val="1"/>
-    </w:lvlOverride>
+    <w:abstractNumId w:val="991"/>
   </w:num>
   <w:num w:numId="1178">
-    <w:abstractNumId w:val="99411"/>
-    <w:lvlOverride w:ilvl="0">
-      <w:startOverride w:val="1"/>
-    </w:lvlOverride>
-    <w:lvlOverride w:ilvl="1">
-      <w:startOverride w:val="1"/>
-    </w:lvlOverride>
-    <w:lvlOverride w:ilvl="2">
-      <w:startOverride w:val="1"/>
-    </w:lvlOverride>
-    <w:lvlOverride w:ilvl="3">
-      <w:startOverride w:val="1"/>
-    </w:lvlOverride>
-    <w:lvlOverride w:ilvl="4">
-      <w:startOverride w:val="1"/>
-    </w:lvlOverride>
-    <w:lvlOverride w:ilvl="5">
-      <w:startOverride w:val="1"/>
-    </w:lvlOverride>
-    <w:lvlOverride w:ilvl="6">
-      <w:startOverride w:val="1"/>
-    </w:lvlOverride>
-    <w:lvlOverride w:ilvl="7">
-      <w:startOverride w:val="1"/>
-    </w:lvlOverride>
-    <w:lvlOverride w:ilvl="8">
-      <w:startOverride w:val="1"/>
-    </w:lvlOverride>
+    <w:abstractNumId w:val="991"/>
   </w:num>
   <w:num w:numId="1179">
     <w:abstractNumId w:val="99411"/>
@@ -66334,6 +66832,66 @@
     </w:lvlOverride>
   </w:num>
   <w:num w:numId="1180">
+    <w:abstractNumId w:val="99411"/>
+    <w:lvlOverride w:ilvl="0">
+      <w:startOverride w:val="1"/>
+    </w:lvlOverride>
+    <w:lvlOverride w:ilvl="1">
+      <w:startOverride w:val="1"/>
+    </w:lvlOverride>
+    <w:lvlOverride w:ilvl="2">
+      <w:startOverride w:val="1"/>
+    </w:lvlOverride>
+    <w:lvlOverride w:ilvl="3">
+      <w:startOverride w:val="1"/>
+    </w:lvlOverride>
+    <w:lvlOverride w:ilvl="4">
+      <w:startOverride w:val="1"/>
+    </w:lvlOverride>
+    <w:lvlOverride w:ilvl="5">
+      <w:startOverride w:val="1"/>
+    </w:lvlOverride>
+    <w:lvlOverride w:ilvl="6">
+      <w:startOverride w:val="1"/>
+    </w:lvlOverride>
+    <w:lvlOverride w:ilvl="7">
+      <w:startOverride w:val="1"/>
+    </w:lvlOverride>
+    <w:lvlOverride w:ilvl="8">
+      <w:startOverride w:val="1"/>
+    </w:lvlOverride>
+  </w:num>
+  <w:num w:numId="1181">
+    <w:abstractNumId w:val="99411"/>
+    <w:lvlOverride w:ilvl="0">
+      <w:startOverride w:val="1"/>
+    </w:lvlOverride>
+    <w:lvlOverride w:ilvl="1">
+      <w:startOverride w:val="1"/>
+    </w:lvlOverride>
+    <w:lvlOverride w:ilvl="2">
+      <w:startOverride w:val="1"/>
+    </w:lvlOverride>
+    <w:lvlOverride w:ilvl="3">
+      <w:startOverride w:val="1"/>
+    </w:lvlOverride>
+    <w:lvlOverride w:ilvl="4">
+      <w:startOverride w:val="1"/>
+    </w:lvlOverride>
+    <w:lvlOverride w:ilvl="5">
+      <w:startOverride w:val="1"/>
+    </w:lvlOverride>
+    <w:lvlOverride w:ilvl="6">
+      <w:startOverride w:val="1"/>
+    </w:lvlOverride>
+    <w:lvlOverride w:ilvl="7">
+      <w:startOverride w:val="1"/>
+    </w:lvlOverride>
+    <w:lvlOverride w:ilvl="8">
+      <w:startOverride w:val="1"/>
+    </w:lvlOverride>
+  </w:num>
+  <w:num w:numId="1182">
     <w:abstractNumId w:val="991"/>
   </w:num>
 </w:numbering>

</xml_diff>

<commit_message>
Deploying to gh-pages from @ Morrison-Lab/wai@2aae4faeefd7281aee83c4f9b64ccad5fc279863 🚀
</commit_message>
<xml_diff>
--- a/chapters/coding-agents.docx
+++ b/chapters/coding-agents.docx
@@ -15,7 +15,7 @@
         <w:pStyle w:val="Date"/>
       </w:pPr>
       <w:r>
-        <w:t xml:space="preserve">Last modified: 2026-08-31 21:09:48 (PDT)</w:t>
+        <w:t xml:space="preserve">Last modified: 2026-09-01 09:56:36 (PDT)</w:t>
       </w:r>
     </w:p>
     <w:p>
@@ -63924,42 +63924,74 @@
     </w:tbl>
     <w:bookmarkEnd w:id="432"/>
     <w:bookmarkEnd w:id="433"/>
-    <w:bookmarkStart w:id="441" w:name="sec-ai-gemini-spend-management"/>
+    <w:bookmarkStart w:id="437" w:name="sec-ai-magic-context"/>
     <w:p>
       <w:pPr>
         <w:pStyle w:val="Heading1"/>
       </w:pPr>
       <w:r>
-        <w:t xml:space="preserve">43. Managing Gemini API Spend and Cost Optimization</w:t>
+        <w:t xml:space="preserve">43. Unbounded Context with Magic Context</w:t>
       </w:r>
     </w:p>
     <w:p>
       <w:pPr>
         <w:pStyle w:val="FirstParagraph"/>
       </w:pPr>
-      <w:r>
-        <w:t xml:space="preserve">This guide describes how to manage Google AI Studio and Google Cloud Gemini API spend caps,</w:t>
-      </w:r>
-      <w:r>
-        <w:t xml:space="preserve"> </w:t>
-      </w:r>
-      <w:r>
-        <w:t xml:space="preserve">unpause paused API services,</w:t>
-      </w:r>
-      <w:r>
-        <w:t xml:space="preserve"> </w:t>
-      </w:r>
-      <w:r>
-        <w:t xml:space="preserve">and optimize token consumption across local tools and GitHub Actions workflows.</w:t>
-      </w:r>
-    </w:p>
-    <w:bookmarkStart w:id="435" w:name="Xd8c10be17edf039db5b664720f228274181ba18"/>
+      <w:hyperlink r:id="rId434">
+        <w:r>
+          <w:rPr>
+            <w:rStyle w:val="VerbatimChar"/>
+          </w:rPr>
+          <w:t xml:space="preserve">cortexkit/magic-context</w:t>
+        </w:r>
+      </w:hyperlink>
+      <w:r>
+        <w:t xml:space="preserve"> </w:t>
+      </w:r>
+      <w:r>
+        <w:t xml:space="preserve">is an open-source self-managing memory engine</w:t>
+      </w:r>
+      <w:r>
+        <w:t xml:space="preserve"> </w:t>
+      </w:r>
+      <w:r>
+        <w:t xml:space="preserve">designed to provide unbounded context for AI coding agents</w:t>
+      </w:r>
+      <w:r>
+        <w:t xml:space="preserve"> </w:t>
+      </w:r>
+      <w:r>
+        <w:t xml:space="preserve">(measured 2026-08-31).</w:t>
+      </w:r>
+      <w:r>
+        <w:t xml:space="preserve"> </w:t>
+      </w:r>
+      <w:r>
+        <w:t xml:space="preserve">It operates as a background memory subsystem—often described as a</w:t>
+      </w:r>
+      <w:r>
+        <w:t xml:space="preserve"> </w:t>
+      </w:r>
+      <w:r>
+        <w:t xml:space="preserve">“hippocampus for coding agents”</w:t>
+      </w:r>
+      <w:r>
+        <w:t xml:space="preserve">—that extracts,</w:t>
+      </w:r>
+      <w:r>
+        <w:t xml:space="preserve"> </w:t>
+      </w:r>
+      <w:r>
+        <w:t xml:space="preserve">consolidates, and retrieves long-term repository state without pausing the active coding turn.</w:t>
+      </w:r>
+    </w:p>
+    <w:bookmarkStart w:id="435" w:name="core-architecture-and-agent-roles"/>
     <w:p>
       <w:pPr>
         <w:pStyle w:val="Heading4"/>
       </w:pPr>
       <w:r>
-        <w:t xml:space="preserve">Identifying Paused Projects (Project Numbers vs. Friendly Names)</w:t>
+        <w:t xml:space="preserve">Core architecture and agent roles</w:t>
       </w:r>
     </w:p>
     <w:p>
@@ -63967,28 +63999,310 @@
         <w:pStyle w:val="FirstParagraph"/>
       </w:pPr>
       <w:r>
-        <w:t xml:space="preserve">When a project reaches its monthly budget limit,</w:t>
-      </w:r>
-      <w:r>
-        <w:t xml:space="preserve"> </w:t>
-      </w:r>
-      <w:r>
-        <w:t xml:space="preserve">Google sends an email notification stating that Gemini API service has been paused.</w:t>
-      </w:r>
-      <w:r>
-        <w:t xml:space="preserve"> </w:t>
-      </w:r>
-      <w:r>
-        <w:t xml:space="preserve">These email notifications identify the affected project using its internal</w:t>
-      </w:r>
-      <w:r>
-        <w:t xml:space="preserve"> </w:t>
-      </w:r>
+        <w:t xml:space="preserve">Rather than requiring the primary coding agent to interrupt its execution to prune conversation buffers,</w:t>
+      </w:r>
+      <w:r>
+        <w:t xml:space="preserve"> </w:t>
+      </w:r>
+      <w:r>
+        <w:rPr>
+          <w:rStyle w:val="VerbatimChar"/>
+        </w:rPr>
+        <w:t xml:space="preserve">magic-context</w:t>
+      </w:r>
+      <w:r>
+        <w:t xml:space="preserve"> </w:t>
+      </w:r>
+      <w:r>
+        <w:t xml:space="preserve">delegates memory lifecycle operations to specialized background workers:</w:t>
+      </w:r>
+    </w:p>
+    <w:p>
+      <w:pPr>
+        <w:pStyle w:val="Compact"/>
+        <w:numPr>
+          <w:ilvl w:val="0"/>
+          <w:numId w:val="1179"/>
+        </w:numPr>
+      </w:pPr>
       <w:r>
         <w:rPr>
           <w:b/>
           <w:bCs/>
         </w:rPr>
+        <w:t xml:space="preserve">The Historian</w:t>
+      </w:r>
+      <w:r>
+        <w:t xml:space="preserve">:</w:t>
+      </w:r>
+      <w:r>
+        <w:t xml:space="preserve"> </w:t>
+      </w:r>
+      <w:r>
+        <w:t xml:space="preserve">Runs background context compaction on completed turns,</w:t>
+      </w:r>
+      <w:r>
+        <w:t xml:space="preserve"> </w:t>
+      </w:r>
+      <w:r>
+        <w:t xml:space="preserve">compressing verbose tool outputs and dialog history while preserving architectural decisions and code rationale.</w:t>
+      </w:r>
+    </w:p>
+    <w:p>
+      <w:pPr>
+        <w:pStyle w:val="Compact"/>
+        <w:numPr>
+          <w:ilvl w:val="0"/>
+          <w:numId w:val="1179"/>
+        </w:numPr>
+      </w:pPr>
+      <w:r>
+        <w:rPr>
+          <w:b/>
+          <w:bCs/>
+        </w:rPr>
+        <w:t xml:space="preserve">The Dreamer</w:t>
+      </w:r>
+      <w:r>
+        <w:t xml:space="preserve">:</w:t>
+      </w:r>
+      <w:r>
+        <w:t xml:space="preserve"> </w:t>
+      </w:r>
+      <w:r>
+        <w:t xml:space="preserve">Executes periodic consolidation passes to deduplicate memory records across multiple sessions,</w:t>
+      </w:r>
+      <w:r>
+        <w:t xml:space="preserve"> </w:t>
+      </w:r>
+      <w:r>
+        <w:t xml:space="preserve">distilling recurring observations into canonical project facts and persistent guidelines.</w:t>
+      </w:r>
+    </w:p>
+    <w:p>
+      <w:pPr>
+        <w:pStyle w:val="Compact"/>
+        <w:numPr>
+          <w:ilvl w:val="0"/>
+          <w:numId w:val="1179"/>
+        </w:numPr>
+      </w:pPr>
+      <w:r>
+        <w:rPr>
+          <w:b/>
+          <w:bCs/>
+        </w:rPr>
+        <w:t xml:space="preserve">The Sidekick</w:t>
+      </w:r>
+      <w:r>
+        <w:t xml:space="preserve">:</w:t>
+      </w:r>
+      <w:r>
+        <w:t xml:space="preserve"> </w:t>
+      </w:r>
+      <w:r>
+        <w:t xml:space="preserve">Acts as an on-demand retrieval companion that augments active prompts with relevant project context,</w:t>
+      </w:r>
+      <w:r>
+        <w:t xml:space="preserve"> </w:t>
+      </w:r>
+      <w:r>
+        <w:t xml:space="preserve">supplying historical context matched to the current file or task.</w:t>
+      </w:r>
+    </w:p>
+    <w:bookmarkEnd w:id="435"/>
+    <w:bookmarkStart w:id="436" w:name="cache-aware-memory-management"/>
+    <w:p>
+      <w:pPr>
+        <w:pStyle w:val="Heading4"/>
+      </w:pPr>
+      <w:r>
+        <w:t xml:space="preserve">Cache-aware memory management</w:t>
+      </w:r>
+    </w:p>
+    <w:p>
+      <w:pPr>
+        <w:pStyle w:val="FirstParagraph"/>
+      </w:pPr>
+      <w:r>
+        <w:t xml:space="preserve">A key challenge with dynamic prompt injection is preserving prompt caching efficiency.</w:t>
+      </w:r>
+      <w:r>
+        <w:t xml:space="preserve"> </w:t>
+      </w:r>
+      <w:r>
+        <w:rPr>
+          <w:rStyle w:val="VerbatimChar"/>
+        </w:rPr>
+        <w:t xml:space="preserve">magic-context</w:t>
+      </w:r>
+      <w:r>
+        <w:t xml:space="preserve"> </w:t>
+      </w:r>
+      <w:r>
+        <w:t xml:space="preserve">addresses this through cache-conscious orchestration:</w:t>
+      </w:r>
+    </w:p>
+    <w:p>
+      <w:pPr>
+        <w:pStyle w:val="Compact"/>
+        <w:numPr>
+          <w:ilvl w:val="0"/>
+          <w:numId w:val="1180"/>
+        </w:numPr>
+      </w:pPr>
+      <w:r>
+        <w:rPr>
+          <w:b/>
+          <w:bCs/>
+        </w:rPr>
+        <w:t xml:space="preserve">Cache-stable prompt layout</w:t>
+      </w:r>
+      <w:r>
+        <w:t xml:space="preserve">:</w:t>
+      </w:r>
+      <w:r>
+        <w:t xml:space="preserve"> </w:t>
+      </w:r>
+      <w:r>
+        <w:t xml:space="preserve">Maintains a deterministic prompt layout and replay ordering,</w:t>
+      </w:r>
+      <w:r>
+        <w:t xml:space="preserve"> </w:t>
+      </w:r>
+      <w:r>
+        <w:t xml:space="preserve">preserving provider prompt caching prefixes across conversational turns without invalidating cached tokens.</w:t>
+      </w:r>
+    </w:p>
+    <w:p>
+      <w:pPr>
+        <w:pStyle w:val="Compact"/>
+        <w:numPr>
+          <w:ilvl w:val="0"/>
+          <w:numId w:val="1180"/>
+        </w:numPr>
+      </w:pPr>
+      <w:r>
+        <w:rPr>
+          <w:b/>
+          <w:bCs/>
+        </w:rPr>
+        <w:t xml:space="preserve">Deferred background extraction</w:t>
+      </w:r>
+      <w:r>
+        <w:t xml:space="preserve">:</w:t>
+      </w:r>
+      <w:r>
+        <w:t xml:space="preserve"> </w:t>
+      </w:r>
+      <w:r>
+        <w:t xml:space="preserve">Memory analysis and summarization tasks are deferred to idle windows or subagent threads,</w:t>
+      </w:r>
+      <w:r>
+        <w:t xml:space="preserve"> </w:t>
+      </w:r>
+      <w:r>
+        <w:t xml:space="preserve">preventing token churn and latency spikes during high-tempo coding loops.</w:t>
+      </w:r>
+    </w:p>
+    <w:p>
+      <w:pPr>
+        <w:pStyle w:val="Compact"/>
+        <w:numPr>
+          <w:ilvl w:val="0"/>
+          <w:numId w:val="1180"/>
+        </w:numPr>
+      </w:pPr>
+      <w:r>
+        <w:rPr>
+          <w:b/>
+          <w:bCs/>
+        </w:rPr>
+        <w:t xml:space="preserve">Cross-session persistence</w:t>
+      </w:r>
+      <w:r>
+        <w:t xml:space="preserve">:</w:t>
+      </w:r>
+      <w:r>
+        <w:t xml:space="preserve"> </w:t>
+      </w:r>
+      <w:r>
+        <w:t xml:space="preserve">Extracted knowledge persists in lightweight local stores across IDE restarts,</w:t>
+      </w:r>
+      <w:r>
+        <w:t xml:space="preserve"> </w:t>
+      </w:r>
+      <w:r>
+        <w:t xml:space="preserve">enabling coding agents to resume work with full institutional memory of past decisions.</w:t>
+      </w:r>
+    </w:p>
+    <w:bookmarkEnd w:id="436"/>
+    <w:bookmarkEnd w:id="437"/>
+    <w:bookmarkStart w:id="445" w:name="sec-ai-gemini-spend-management"/>
+    <w:p>
+      <w:pPr>
+        <w:pStyle w:val="Heading1"/>
+      </w:pPr>
+      <w:r>
+        <w:t xml:space="preserve">44. Managing Gemini API Spend and Cost Optimization</w:t>
+      </w:r>
+    </w:p>
+    <w:p>
+      <w:pPr>
+        <w:pStyle w:val="FirstParagraph"/>
+      </w:pPr>
+      <w:r>
+        <w:t xml:space="preserve">This guide describes how to manage Google AI Studio and Google Cloud Gemini API spend caps,</w:t>
+      </w:r>
+      <w:r>
+        <w:t xml:space="preserve"> </w:t>
+      </w:r>
+      <w:r>
+        <w:t xml:space="preserve">unpause paused API services,</w:t>
+      </w:r>
+      <w:r>
+        <w:t xml:space="preserve"> </w:t>
+      </w:r>
+      <w:r>
+        <w:t xml:space="preserve">and optimize token consumption across local tools and GitHub Actions workflows.</w:t>
+      </w:r>
+    </w:p>
+    <w:bookmarkStart w:id="439" w:name="Xd8c10be17edf039db5b664720f228274181ba18"/>
+    <w:p>
+      <w:pPr>
+        <w:pStyle w:val="Heading4"/>
+      </w:pPr>
+      <w:r>
+        <w:t xml:space="preserve">Identifying Paused Projects (Project Numbers vs. Friendly Names)</w:t>
+      </w:r>
+    </w:p>
+    <w:p>
+      <w:pPr>
+        <w:pStyle w:val="FirstParagraph"/>
+      </w:pPr>
+      <w:r>
+        <w:t xml:space="preserve">When a project reaches its monthly budget limit,</w:t>
+      </w:r>
+      <w:r>
+        <w:t xml:space="preserve"> </w:t>
+      </w:r>
+      <w:r>
+        <w:t xml:space="preserve">Google sends an email notification stating that Gemini API service has been paused.</w:t>
+      </w:r>
+      <w:r>
+        <w:t xml:space="preserve"> </w:t>
+      </w:r>
+      <w:r>
+        <w:t xml:space="preserve">These email notifications identify the affected project using its internal</w:t>
+      </w:r>
+      <w:r>
+        <w:t xml:space="preserve"> </w:t>
+      </w:r>
+      <w:r>
+        <w:rPr>
+          <w:b/>
+          <w:bCs/>
+        </w:rPr>
         <w:t xml:space="preserve">numerical GCP Project Number</w:t>
       </w:r>
       <w:r>
@@ -64017,7 +64331,7 @@
       <w:r>
         <w:t xml:space="preserve"> </w:t>
       </w:r>
-      <w:hyperlink r:id="rId434">
+      <w:hyperlink r:id="rId438">
         <w:r>
           <w:rPr>
             <w:rStyle w:val="Hyperlink"/>
@@ -64103,7 +64417,7 @@
         <w:pStyle w:val="Compact"/>
         <w:numPr>
           <w:ilvl w:val="0"/>
-          <w:numId w:val="1179"/>
+          <w:numId w:val="1181"/>
         </w:numPr>
       </w:pPr>
       <w:r>
@@ -64112,7 +64426,7 @@
       <w:r>
         <w:t xml:space="preserve"> </w:t>
       </w:r>
-      <w:hyperlink r:id="rId434">
+      <w:hyperlink r:id="rId438">
         <w:r>
           <w:rPr>
             <w:rStyle w:val="Hyperlink"/>
@@ -64129,7 +64443,7 @@
         <w:pStyle w:val="Compact"/>
         <w:numPr>
           <w:ilvl w:val="0"/>
-          <w:numId w:val="1179"/>
+          <w:numId w:val="1181"/>
         </w:numPr>
       </w:pPr>
       <w:r>
@@ -64141,15 +64455,15 @@
         <w:pStyle w:val="Compact"/>
         <w:numPr>
           <w:ilvl w:val="0"/>
-          <w:numId w:val="1179"/>
+          <w:numId w:val="1181"/>
         </w:numPr>
       </w:pPr>
       <w:r>
         <w:t xml:space="preserve">Any project that has hit its monthly spend cap will have its API requests paused until the limit is updated.</w:t>
       </w:r>
     </w:p>
-    <w:bookmarkEnd w:id="435"/>
-    <w:bookmarkStart w:id="437" w:name="adjusting-and-unpausing-spend-caps"/>
+    <w:bookmarkEnd w:id="439"/>
+    <w:bookmarkStart w:id="441" w:name="adjusting-and-unpausing-spend-caps"/>
     <w:p>
       <w:pPr>
         <w:pStyle w:val="Heading4"/>
@@ -64171,7 +64485,7 @@
         <w:pStyle w:val="Compact"/>
         <w:numPr>
           <w:ilvl w:val="0"/>
-          <w:numId w:val="1180"/>
+          <w:numId w:val="1182"/>
         </w:numPr>
       </w:pPr>
       <w:r>
@@ -64180,7 +64494,7 @@
       <w:r>
         <w:t xml:space="preserve"> </w:t>
       </w:r>
-      <w:hyperlink r:id="rId436">
+      <w:hyperlink r:id="rId440">
         <w:r>
           <w:rPr>
             <w:rStyle w:val="Hyperlink"/>
@@ -64197,7 +64511,7 @@
         <w:pStyle w:val="Compact"/>
         <w:numPr>
           <w:ilvl w:val="0"/>
-          <w:numId w:val="1180"/>
+          <w:numId w:val="1182"/>
         </w:numPr>
       </w:pPr>
       <w:r>
@@ -64209,7 +64523,7 @@
         <w:pStyle w:val="Compact"/>
         <w:numPr>
           <w:ilvl w:val="0"/>
-          <w:numId w:val="1180"/>
+          <w:numId w:val="1182"/>
         </w:numPr>
       </w:pPr>
       <w:r>
@@ -64249,8 +64563,8 @@
         <w:t xml:space="preserve">and API service automatically resumes up to the configured cap.</w:t>
       </w:r>
     </w:p>
-    <w:bookmarkEnd w:id="437"/>
-    <w:bookmarkStart w:id="439" w:name="setting-up-google-cloud-budget-alerts"/>
+    <w:bookmarkEnd w:id="441"/>
+    <w:bookmarkStart w:id="443" w:name="setting-up-google-cloud-budget-alerts"/>
     <w:p>
       <w:pPr>
         <w:pStyle w:val="Heading4"/>
@@ -64272,7 +64586,7 @@
         <w:pStyle w:val="Compact"/>
         <w:numPr>
           <w:ilvl w:val="0"/>
-          <w:numId w:val="1181"/>
+          <w:numId w:val="1183"/>
         </w:numPr>
       </w:pPr>
       <w:r>
@@ -64281,7 +64595,7 @@
       <w:r>
         <w:t xml:space="preserve"> </w:t>
       </w:r>
-      <w:hyperlink r:id="rId438">
+      <w:hyperlink r:id="rId442">
         <w:r>
           <w:rPr>
             <w:rStyle w:val="Hyperlink"/>
@@ -64298,7 +64612,7 @@
         <w:pStyle w:val="Compact"/>
         <w:numPr>
           <w:ilvl w:val="0"/>
-          <w:numId w:val="1181"/>
+          <w:numId w:val="1183"/>
         </w:numPr>
       </w:pPr>
       <w:r>
@@ -64323,7 +64637,7 @@
         <w:pStyle w:val="Compact"/>
         <w:numPr>
           <w:ilvl w:val="0"/>
-          <w:numId w:val="1181"/>
+          <w:numId w:val="1183"/>
         </w:numPr>
       </w:pPr>
       <w:r>
@@ -64347,7 +64661,7 @@
         <w:pStyle w:val="Compact"/>
         <w:numPr>
           <w:ilvl w:val="0"/>
-          <w:numId w:val="1181"/>
+          <w:numId w:val="1183"/>
         </w:numPr>
       </w:pPr>
       <w:r>
@@ -64359,7 +64673,7 @@
         <w:pStyle w:val="Compact"/>
         <w:numPr>
           <w:ilvl w:val="0"/>
-          <w:numId w:val="1181"/>
+          <w:numId w:val="1183"/>
         </w:numPr>
       </w:pPr>
       <w:r>
@@ -64413,7 +64727,7 @@
         <w:pStyle w:val="Compact"/>
         <w:numPr>
           <w:ilvl w:val="0"/>
-          <w:numId w:val="1181"/>
+          <w:numId w:val="1183"/>
         </w:numPr>
       </w:pPr>
       <w:r>
@@ -64433,8 +64747,8 @@
         <w:t xml:space="preserve">. You will receive email alerts before any project hits its spend cap.</w:t>
       </w:r>
     </w:p>
-    <w:bookmarkEnd w:id="439"/>
-    <w:bookmarkStart w:id="440" w:name="cost-optimization-best-practices"/>
+    <w:bookmarkEnd w:id="443"/>
+    <w:bookmarkStart w:id="444" w:name="cost-optimization-best-practices"/>
     <w:p>
       <w:pPr>
         <w:pStyle w:val="Heading4"/>
@@ -64456,7 +64770,7 @@
         <w:pStyle w:val="Compact"/>
         <w:numPr>
           <w:ilvl w:val="0"/>
-          <w:numId w:val="1182"/>
+          <w:numId w:val="1184"/>
         </w:numPr>
       </w:pPr>
       <w:r>
@@ -64592,7 +64906,7 @@
         <w:pStyle w:val="Compact"/>
         <w:numPr>
           <w:ilvl w:val="0"/>
-          <w:numId w:val="1182"/>
+          <w:numId w:val="1184"/>
         </w:numPr>
       </w:pPr>
       <w:r>
@@ -64623,7 +64937,7 @@
         <w:pStyle w:val="Compact"/>
         <w:numPr>
           <w:ilvl w:val="0"/>
-          <w:numId w:val="1182"/>
+          <w:numId w:val="1184"/>
         </w:numPr>
       </w:pPr>
       <w:r>
@@ -64654,7 +64968,7 @@
         <w:pStyle w:val="Compact"/>
         <w:numPr>
           <w:ilvl w:val="0"/>
-          <w:numId w:val="1182"/>
+          <w:numId w:val="1184"/>
         </w:numPr>
       </w:pPr>
       <w:r>
@@ -64749,9 +65063,9 @@
         <w:t xml:space="preserve">to collapse them in GitHub’s web diff view and exclude them from repository language statistics.</w:t>
       </w:r>
     </w:p>
-    <w:bookmarkEnd w:id="440"/>
-    <w:bookmarkEnd w:id="441"/>
-    <w:bookmarkStart w:id="471" w:name="references"/>
+    <w:bookmarkEnd w:id="444"/>
+    <w:bookmarkEnd w:id="445"/>
+    <w:bookmarkStart w:id="475" w:name="references"/>
     <w:p>
       <w:pPr>
         <w:pStyle w:val="Heading1"/>
@@ -64760,8 +65074,8 @@
         <w:t xml:space="preserve">References</w:t>
       </w:r>
     </w:p>
-    <w:bookmarkStart w:id="470" w:name="refs"/>
-    <w:bookmarkStart w:id="443" w:name="ref-space_odyssey"/>
+    <w:bookmarkStart w:id="474" w:name="refs"/>
+    <w:bookmarkStart w:id="447" w:name="ref-space_odyssey"/>
     <w:p>
       <w:pPr>
         <w:pStyle w:val="Bibliography"/>
@@ -64779,7 +65093,7 @@
       <w:r>
         <w:t xml:space="preserve"> </w:t>
       </w:r>
-      <w:hyperlink r:id="rId442">
+      <w:hyperlink r:id="rId446">
         <w:r>
           <w:rPr>
             <w:rStyle w:val="Hyperlink"/>
@@ -64791,8 +65105,8 @@
         <w:t xml:space="preserve">.</w:t>
       </w:r>
     </w:p>
-    <w:bookmarkEnd w:id="443"/>
-    <w:bookmarkStart w:id="445" w:name="ref-i_robot"/>
+    <w:bookmarkEnd w:id="447"/>
+    <w:bookmarkStart w:id="449" w:name="ref-i_robot"/>
     <w:p>
       <w:pPr>
         <w:pStyle w:val="Bibliography"/>
@@ -64816,7 +65130,7 @@
       <w:r>
         <w:t xml:space="preserve"> </w:t>
       </w:r>
-      <w:hyperlink r:id="rId444">
+      <w:hyperlink r:id="rId448">
         <w:r>
           <w:rPr>
             <w:rStyle w:val="Hyperlink"/>
@@ -64828,8 +65142,8 @@
         <w:t xml:space="preserve">.</w:t>
       </w:r>
     </w:p>
-    <w:bookmarkEnd w:id="445"/>
-    <w:bookmarkStart w:id="447" w:name="ref-battlestar_galactica_2004"/>
+    <w:bookmarkEnd w:id="449"/>
+    <w:bookmarkStart w:id="451" w:name="ref-battlestar_galactica_2004"/>
     <w:p>
       <w:pPr>
         <w:pStyle w:val="Bibliography"/>
@@ -64847,7 +65161,7 @@
       <w:r>
         <w:t xml:space="preserve"> </w:t>
       </w:r>
-      <w:hyperlink r:id="rId446">
+      <w:hyperlink r:id="rId450">
         <w:r>
           <w:rPr>
             <w:rStyle w:val="Hyperlink"/>
@@ -64859,8 +65173,8 @@
         <w:t xml:space="preserve">.</w:t>
       </w:r>
     </w:p>
-    <w:bookmarkEnd w:id="447"/>
-    <w:bookmarkStart w:id="449" w:name="ref-slm_agentic_ai"/>
+    <w:bookmarkEnd w:id="451"/>
+    <w:bookmarkStart w:id="453" w:name="ref-slm_agentic_ai"/>
     <w:p>
       <w:pPr>
         <w:pStyle w:val="Bibliography"/>
@@ -64884,7 +65198,7 @@
       <w:r>
         <w:t xml:space="preserve"> </w:t>
       </w:r>
-      <w:hyperlink r:id="rId448">
+      <w:hyperlink r:id="rId452">
         <w:r>
           <w:rPr>
             <w:rStyle w:val="Hyperlink"/>
@@ -64896,8 +65210,8 @@
         <w:t xml:space="preserve">.</w:t>
       </w:r>
     </w:p>
-    <w:bookmarkEnd w:id="449"/>
-    <w:bookmarkStart w:id="451" w:name="ref-blade_runner"/>
+    <w:bookmarkEnd w:id="453"/>
+    <w:bookmarkStart w:id="455" w:name="ref-blade_runner"/>
     <w:p>
       <w:pPr>
         <w:pStyle w:val="Bibliography"/>
@@ -64915,7 +65229,7 @@
       <w:r>
         <w:t xml:space="preserve"> </w:t>
       </w:r>
-      <w:hyperlink r:id="rId450">
+      <w:hyperlink r:id="rId454">
         <w:r>
           <w:rPr>
             <w:rStyle w:val="Hyperlink"/>
@@ -64927,8 +65241,8 @@
         <w:t xml:space="preserve">.</w:t>
       </w:r>
     </w:p>
-    <w:bookmarkEnd w:id="451"/>
-    <w:bookmarkStart w:id="453" w:name="ref-enders_game"/>
+    <w:bookmarkEnd w:id="455"/>
+    <w:bookmarkStart w:id="457" w:name="ref-enders_game"/>
     <w:p>
       <w:pPr>
         <w:pStyle w:val="Bibliography"/>
@@ -64952,7 +65266,7 @@
       <w:r>
         <w:t xml:space="preserve"> </w:t>
       </w:r>
-      <w:hyperlink r:id="rId452">
+      <w:hyperlink r:id="rId456">
         <w:r>
           <w:rPr>
             <w:rStyle w:val="Hyperlink"/>
@@ -64964,8 +65278,8 @@
         <w:t xml:space="preserve">.</w:t>
       </w:r>
     </w:p>
-    <w:bookmarkEnd w:id="453"/>
-    <w:bookmarkStart w:id="455" w:name="ref-qlora"/>
+    <w:bookmarkEnd w:id="457"/>
+    <w:bookmarkStart w:id="459" w:name="ref-qlora"/>
     <w:p>
       <w:pPr>
         <w:pStyle w:val="Bibliography"/>
@@ -64989,7 +65303,7 @@
       <w:r>
         <w:t xml:space="preserve"> </w:t>
       </w:r>
-      <w:hyperlink r:id="rId454">
+      <w:hyperlink r:id="rId458">
         <w:r>
           <w:rPr>
             <w:rStyle w:val="Hyperlink"/>
@@ -65001,8 +65315,8 @@
         <w:t xml:space="preserve">.</w:t>
       </w:r>
     </w:p>
-    <w:bookmarkEnd w:id="455"/>
-    <w:bookmarkStart w:id="457" w:name="ref-humans_are_dead"/>
+    <w:bookmarkEnd w:id="459"/>
+    <w:bookmarkStart w:id="461" w:name="ref-humans_are_dead"/>
     <w:p>
       <w:pPr>
         <w:pStyle w:val="Bibliography"/>
@@ -65026,7 +65340,7 @@
       <w:r>
         <w:t xml:space="preserve"> </w:t>
       </w:r>
-      <w:hyperlink r:id="rId456">
+      <w:hyperlink r:id="rId460">
         <w:r>
           <w:rPr>
             <w:rStyle w:val="Hyperlink"/>
@@ -65038,8 +65352,8 @@
         <w:t xml:space="preserve">.</w:t>
       </w:r>
     </w:p>
-    <w:bookmarkEnd w:id="457"/>
-    <w:bookmarkStart w:id="459" w:name="ref-dune"/>
+    <w:bookmarkEnd w:id="461"/>
+    <w:bookmarkStart w:id="463" w:name="ref-dune"/>
     <w:p>
       <w:pPr>
         <w:pStyle w:val="Bibliography"/>
@@ -65063,7 +65377,7 @@
       <w:r>
         <w:t xml:space="preserve"> </w:t>
       </w:r>
-      <w:hyperlink r:id="rId458">
+      <w:hyperlink r:id="rId462">
         <w:r>
           <w:rPr>
             <w:rStyle w:val="Hyperlink"/>
@@ -65075,8 +65389,8 @@
         <w:t xml:space="preserve">.</w:t>
       </w:r>
     </w:p>
-    <w:bookmarkEnd w:id="459"/>
-    <w:bookmarkStart w:id="461" w:name="ref-lora"/>
+    <w:bookmarkEnd w:id="463"/>
+    <w:bookmarkStart w:id="465" w:name="ref-lora"/>
     <w:p>
       <w:pPr>
         <w:pStyle w:val="Bibliography"/>
@@ -65100,7 +65414,7 @@
       <w:r>
         <w:t xml:space="preserve"> </w:t>
       </w:r>
-      <w:hyperlink r:id="rId460">
+      <w:hyperlink r:id="rId464">
         <w:r>
           <w:rPr>
             <w:rStyle w:val="Hyperlink"/>
@@ -65112,8 +65426,8 @@
         <w:t xml:space="preserve">.</w:t>
       </w:r>
     </w:p>
-    <w:bookmarkEnd w:id="461"/>
-    <w:bookmarkStart w:id="463" w:name="ref-lecun_world_models"/>
+    <w:bookmarkEnd w:id="465"/>
+    <w:bookmarkStart w:id="467" w:name="ref-lecun_world_models"/>
     <w:p>
       <w:pPr>
         <w:pStyle w:val="Bibliography"/>
@@ -65137,7 +65451,7 @@
       <w:r>
         <w:t xml:space="preserve"> </w:t>
       </w:r>
-      <w:hyperlink r:id="rId462">
+      <w:hyperlink r:id="rId466">
         <w:r>
           <w:rPr>
             <w:rStyle w:val="Hyperlink"/>
@@ -65149,8 +65463,8 @@
         <w:t xml:space="preserve">.</w:t>
       </w:r>
     </w:p>
-    <w:bookmarkEnd w:id="463"/>
-    <w:bookmarkStart w:id="465" w:name="ref-terminator"/>
+    <w:bookmarkEnd w:id="467"/>
+    <w:bookmarkStart w:id="469" w:name="ref-terminator"/>
     <w:p>
       <w:pPr>
         <w:pStyle w:val="Bibliography"/>
@@ -65168,7 +65482,7 @@
       <w:r>
         <w:t xml:space="preserve"> </w:t>
       </w:r>
-      <w:hyperlink r:id="rId464">
+      <w:hyperlink r:id="rId468">
         <w:r>
           <w:rPr>
             <w:rStyle w:val="Hyperlink"/>
@@ -65180,8 +65494,8 @@
         <w:t xml:space="preserve">.</w:t>
       </w:r>
     </w:p>
-    <w:bookmarkEnd w:id="465"/>
-    <w:bookmarkStart w:id="467" w:name="ref-matrix"/>
+    <w:bookmarkEnd w:id="469"/>
+    <w:bookmarkStart w:id="471" w:name="ref-matrix"/>
     <w:p>
       <w:pPr>
         <w:pStyle w:val="Bibliography"/>
@@ -65199,7 +65513,7 @@
       <w:r>
         <w:t xml:space="preserve"> </w:t>
       </w:r>
-      <w:hyperlink r:id="rId466">
+      <w:hyperlink r:id="rId470">
         <w:r>
           <w:rPr>
             <w:rStyle w:val="Hyperlink"/>
@@ -65211,8 +65525,8 @@
         <w:t xml:space="preserve">.</w:t>
       </w:r>
     </w:p>
-    <w:bookmarkEnd w:id="467"/>
-    <w:bookmarkStart w:id="469" w:name="ref-wargames"/>
+    <w:bookmarkEnd w:id="471"/>
+    <w:bookmarkStart w:id="473" w:name="ref-wargames"/>
     <w:p>
       <w:pPr>
         <w:pStyle w:val="Bibliography"/>
@@ -65230,7 +65544,7 @@
       <w:r>
         <w:t xml:space="preserve"> </w:t>
       </w:r>
-      <w:hyperlink r:id="rId468">
+      <w:hyperlink r:id="rId472">
         <w:r>
           <w:rPr>
             <w:rStyle w:val="Hyperlink"/>
@@ -65242,9 +65556,9 @@
         <w:t xml:space="preserve">.</w:t>
       </w:r>
     </w:p>
-    <w:bookmarkEnd w:id="469"/>
-    <w:bookmarkEnd w:id="470"/>
-    <w:bookmarkEnd w:id="471"/>
+    <w:bookmarkEnd w:id="473"/>
+    <w:bookmarkEnd w:id="474"/>
+    <w:bookmarkEnd w:id="475"/>
     <w:sectPr>
       <w:footnotePr>
         <w:numRestart w:val="eachSect"/>
@@ -66802,64 +67116,10 @@
     <w:abstractNumId w:val="991"/>
   </w:num>
   <w:num w:numId="1179">
-    <w:abstractNumId w:val="99411"/>
-    <w:lvlOverride w:ilvl="0">
-      <w:startOverride w:val="1"/>
-    </w:lvlOverride>
-    <w:lvlOverride w:ilvl="1">
-      <w:startOverride w:val="1"/>
-    </w:lvlOverride>
-    <w:lvlOverride w:ilvl="2">
-      <w:startOverride w:val="1"/>
-    </w:lvlOverride>
-    <w:lvlOverride w:ilvl="3">
-      <w:startOverride w:val="1"/>
-    </w:lvlOverride>
-    <w:lvlOverride w:ilvl="4">
-      <w:startOverride w:val="1"/>
-    </w:lvlOverride>
-    <w:lvlOverride w:ilvl="5">
-      <w:startOverride w:val="1"/>
-    </w:lvlOverride>
-    <w:lvlOverride w:ilvl="6">
-      <w:startOverride w:val="1"/>
-    </w:lvlOverride>
-    <w:lvlOverride w:ilvl="7">
-      <w:startOverride w:val="1"/>
-    </w:lvlOverride>
-    <w:lvlOverride w:ilvl="8">
-      <w:startOverride w:val="1"/>
-    </w:lvlOverride>
+    <w:abstractNumId w:val="991"/>
   </w:num>
   <w:num w:numId="1180">
-    <w:abstractNumId w:val="99411"/>
-    <w:lvlOverride w:ilvl="0">
-      <w:startOverride w:val="1"/>
-    </w:lvlOverride>
-    <w:lvlOverride w:ilvl="1">
-      <w:startOverride w:val="1"/>
-    </w:lvlOverride>
-    <w:lvlOverride w:ilvl="2">
-      <w:startOverride w:val="1"/>
-    </w:lvlOverride>
-    <w:lvlOverride w:ilvl="3">
-      <w:startOverride w:val="1"/>
-    </w:lvlOverride>
-    <w:lvlOverride w:ilvl="4">
-      <w:startOverride w:val="1"/>
-    </w:lvlOverride>
-    <w:lvlOverride w:ilvl="5">
-      <w:startOverride w:val="1"/>
-    </w:lvlOverride>
-    <w:lvlOverride w:ilvl="6">
-      <w:startOverride w:val="1"/>
-    </w:lvlOverride>
-    <w:lvlOverride w:ilvl="7">
-      <w:startOverride w:val="1"/>
-    </w:lvlOverride>
-    <w:lvlOverride w:ilvl="8">
-      <w:startOverride w:val="1"/>
-    </w:lvlOverride>
+    <w:abstractNumId w:val="991"/>
   </w:num>
   <w:num w:numId="1181">
     <w:abstractNumId w:val="99411"/>
@@ -66892,6 +67152,66 @@
     </w:lvlOverride>
   </w:num>
   <w:num w:numId="1182">
+    <w:abstractNumId w:val="99411"/>
+    <w:lvlOverride w:ilvl="0">
+      <w:startOverride w:val="1"/>
+    </w:lvlOverride>
+    <w:lvlOverride w:ilvl="1">
+      <w:startOverride w:val="1"/>
+    </w:lvlOverride>
+    <w:lvlOverride w:ilvl="2">
+      <w:startOverride w:val="1"/>
+    </w:lvlOverride>
+    <w:lvlOverride w:ilvl="3">
+      <w:startOverride w:val="1"/>
+    </w:lvlOverride>
+    <w:lvlOverride w:ilvl="4">
+      <w:startOverride w:val="1"/>
+    </w:lvlOverride>
+    <w:lvlOverride w:ilvl="5">
+      <w:startOverride w:val="1"/>
+    </w:lvlOverride>
+    <w:lvlOverride w:ilvl="6">
+      <w:startOverride w:val="1"/>
+    </w:lvlOverride>
+    <w:lvlOverride w:ilvl="7">
+      <w:startOverride w:val="1"/>
+    </w:lvlOverride>
+    <w:lvlOverride w:ilvl="8">
+      <w:startOverride w:val="1"/>
+    </w:lvlOverride>
+  </w:num>
+  <w:num w:numId="1183">
+    <w:abstractNumId w:val="99411"/>
+    <w:lvlOverride w:ilvl="0">
+      <w:startOverride w:val="1"/>
+    </w:lvlOverride>
+    <w:lvlOverride w:ilvl="1">
+      <w:startOverride w:val="1"/>
+    </w:lvlOverride>
+    <w:lvlOverride w:ilvl="2">
+      <w:startOverride w:val="1"/>
+    </w:lvlOverride>
+    <w:lvlOverride w:ilvl="3">
+      <w:startOverride w:val="1"/>
+    </w:lvlOverride>
+    <w:lvlOverride w:ilvl="4">
+      <w:startOverride w:val="1"/>
+    </w:lvlOverride>
+    <w:lvlOverride w:ilvl="5">
+      <w:startOverride w:val="1"/>
+    </w:lvlOverride>
+    <w:lvlOverride w:ilvl="6">
+      <w:startOverride w:val="1"/>
+    </w:lvlOverride>
+    <w:lvlOverride w:ilvl="7">
+      <w:startOverride w:val="1"/>
+    </w:lvlOverride>
+    <w:lvlOverride w:ilvl="8">
+      <w:startOverride w:val="1"/>
+    </w:lvlOverride>
+  </w:num>
+  <w:num w:numId="1184">
     <w:abstractNumId w:val="991"/>
   </w:num>
 </w:numbering>

</xml_diff>

<commit_message>
Deploying to gh-pages from @ Morrison-Lab/wai@66a4da6a41640120e9ee42e5154966c08f253c92 🚀
</commit_message>
<xml_diff>
--- a/chapters/coding-agents.docx
+++ b/chapters/coding-agents.docx
@@ -15,7 +15,7 @@
         <w:pStyle w:val="Date"/>
       </w:pPr>
       <w:r>
-        <w:t xml:space="preserve">Last modified: 2026-09-01 09:56:36 (PDT)</w:t>
+        <w:t xml:space="preserve">Last modified: 2026-09-01 10:48:42 (PDT)</w:t>
       </w:r>
     </w:p>
     <w:p>
@@ -13102,7 +13102,7 @@
     </w:tbl>
     <w:bookmarkEnd w:id="137"/>
     <w:bookmarkEnd w:id="138"/>
-    <w:bookmarkStart w:id="189" w:name="sec-ai-offline"/>
+    <w:bookmarkStart w:id="188" w:name="sec-ai-offline"/>
     <w:p>
       <w:pPr>
         <w:pStyle w:val="Heading1"/>
@@ -18257,7 +18257,7 @@
       </w:tr>
     </w:tbl>
     <w:bookmarkEnd w:id="166"/>
-    <w:bookmarkStart w:id="170" w:name="connecting-claude-code-to-ollama"/>
+    <w:bookmarkStart w:id="169" w:name="connecting-claude-code-to-ollama"/>
     <w:p>
       <w:pPr>
         <w:pStyle w:val="Heading4"/>
@@ -18322,7 +18322,7 @@
       <w:r>
         <w:t xml:space="preserve"> </w:t>
       </w:r>
-      <w:hyperlink r:id="rId167">
+      <w:hyperlink r:id="rId28">
         <w:r>
           <w:rPr>
             <w:rStyle w:val="Hyperlink"/>
@@ -18674,12 +18674,12 @@
                 <wp:inline>
                   <wp:extent cx="152400" cy="152400"/>
                   <wp:effectExtent b="0" l="0" r="0" t="0"/>
-                  <wp:docPr descr="" title="" id="168" name="Picture"/>
+                  <wp:docPr descr="" title="" id="167" name="Picture"/>
                   <a:graphic>
                     <a:graphicData uri="http://schemas.openxmlformats.org/drawingml/2006/picture">
                       <pic:pic>
                         <pic:nvPicPr>
-                          <pic:cNvPr descr="/opt/quarto/share/formats/docx/warning.png" id="169" name="Picture"/>
+                          <pic:cNvPr descr="/opt/quarto/share/formats/docx/warning.png" id="168" name="Picture"/>
                           <pic:cNvPicPr>
                             <a:picLocks noChangeArrowheads="1" noChangeAspect="1"/>
                           </pic:cNvPicPr>
@@ -19109,8 +19109,8 @@
         </w:tc>
       </w:tr>
     </w:tbl>
-    <w:bookmarkEnd w:id="170"/>
-    <w:bookmarkStart w:id="176" w:name="X59411e82da523ef2314b797b4d6b6b495bf0db8"/>
+    <w:bookmarkEnd w:id="169"/>
+    <w:bookmarkStart w:id="175" w:name="X59411e82da523ef2314b797b4d6b6b495bf0db8"/>
     <w:p>
       <w:pPr>
         <w:pStyle w:val="Heading4"/>
@@ -19161,7 +19161,7 @@
       <w:pPr>
         <w:pStyle w:val="BodyText"/>
       </w:pPr>
-      <w:hyperlink r:id="rId171">
+      <w:hyperlink r:id="rId170">
         <w:r>
           <w:rPr>
             <w:rStyle w:val="VerbatimChar"/>
@@ -19940,12 +19940,12 @@
                 <wp:inline>
                   <wp:extent cx="152400" cy="152400"/>
                   <wp:effectExtent b="0" l="0" r="0" t="0"/>
-                  <wp:docPr descr="" title="" id="172" name="Picture"/>
+                  <wp:docPr descr="" title="" id="171" name="Picture"/>
                   <a:graphic>
                     <a:graphicData uri="http://schemas.openxmlformats.org/drawingml/2006/picture">
                       <pic:pic>
                         <pic:nvPicPr>
-                          <pic:cNvPr descr="/opt/quarto/share/formats/docx/note.png" id="173" name="Picture"/>
+                          <pic:cNvPr descr="/opt/quarto/share/formats/docx/note.png" id="172" name="Picture"/>
                           <pic:cNvPicPr>
                             <a:picLocks noChangeArrowheads="1" noChangeAspect="1"/>
                           </pic:cNvPicPr>
@@ -20094,12 +20094,12 @@
                 <wp:inline>
                   <wp:extent cx="152400" cy="152400"/>
                   <wp:effectExtent b="0" l="0" r="0" t="0"/>
-                  <wp:docPr descr="" title="" id="174" name="Picture"/>
+                  <wp:docPr descr="" title="" id="173" name="Picture"/>
                   <a:graphic>
                     <a:graphicData uri="http://schemas.openxmlformats.org/drawingml/2006/picture">
                       <pic:pic>
                         <pic:nvPicPr>
-                          <pic:cNvPr descr="/opt/quarto/share/formats/docx/caution.png" id="175" name="Picture"/>
+                          <pic:cNvPr descr="/opt/quarto/share/formats/docx/caution.png" id="174" name="Picture"/>
                           <pic:cNvPicPr>
                             <a:picLocks noChangeArrowheads="1" noChangeAspect="1"/>
                           </pic:cNvPicPr>
@@ -20196,8 +20196,8 @@
         </w:tc>
       </w:tr>
     </w:tbl>
-    <w:bookmarkEnd w:id="176"/>
-    <w:bookmarkStart w:id="184" w:name="working-in-hpc-cluster-environments"/>
+    <w:bookmarkEnd w:id="175"/>
+    <w:bookmarkStart w:id="183" w:name="working-in-hpc-cluster-environments"/>
     <w:p>
       <w:pPr>
         <w:pStyle w:val="Heading4"/>
@@ -20261,12 +20261,12 @@
                 <wp:inline>
                   <wp:extent cx="152400" cy="152400"/>
                   <wp:effectExtent b="0" l="0" r="0" t="0"/>
-                  <wp:docPr descr="" title="" id="177" name="Picture"/>
+                  <wp:docPr descr="" title="" id="176" name="Picture"/>
                   <a:graphic>
                     <a:graphicData uri="http://schemas.openxmlformats.org/drawingml/2006/picture">
                       <pic:pic>
                         <pic:nvPicPr>
-                          <pic:cNvPr descr="/opt/quarto/share/formats/docx/note.png" id="178" name="Picture"/>
+                          <pic:cNvPr descr="/opt/quarto/share/formats/docx/note.png" id="177" name="Picture"/>
                           <pic:cNvPicPr>
                             <a:picLocks noChangeArrowheads="1" noChangeAspect="1"/>
                           </pic:cNvPicPr>
@@ -20585,12 +20585,12 @@
                 <wp:inline>
                   <wp:extent cx="152400" cy="152400"/>
                   <wp:effectExtent b="0" l="0" r="0" t="0"/>
-                  <wp:docPr descr="" title="" id="179" name="Picture"/>
+                  <wp:docPr descr="" title="" id="178" name="Picture"/>
                   <a:graphic>
                     <a:graphicData uri="http://schemas.openxmlformats.org/drawingml/2006/picture">
                       <pic:pic>
                         <pic:nvPicPr>
-                          <pic:cNvPr descr="/opt/quarto/share/formats/docx/warning.png" id="180" name="Picture"/>
+                          <pic:cNvPr descr="/opt/quarto/share/formats/docx/warning.png" id="179" name="Picture"/>
                           <pic:cNvPicPr>
                             <a:picLocks noChangeArrowheads="1" noChangeAspect="1"/>
                           </pic:cNvPicPr>
@@ -21401,12 +21401,12 @@
                 <wp:inline>
                   <wp:extent cx="152400" cy="152400"/>
                   <wp:effectExtent b="0" l="0" r="0" t="0"/>
-                  <wp:docPr descr="" title="" id="181" name="Picture"/>
+                  <wp:docPr descr="" title="" id="180" name="Picture"/>
                   <a:graphic>
                     <a:graphicData uri="http://schemas.openxmlformats.org/drawingml/2006/picture">
                       <pic:pic>
                         <pic:nvPicPr>
-                          <pic:cNvPr descr="/opt/quarto/share/formats/docx/warning.png" id="182" name="Picture"/>
+                          <pic:cNvPr descr="/opt/quarto/share/formats/docx/warning.png" id="181" name="Picture"/>
                           <pic:cNvPicPr>
                             <a:picLocks noChangeArrowheads="1" noChangeAspect="1"/>
                           </pic:cNvPicPr>
@@ -21504,7 +21504,7 @@
             <w:r>
               <w:t xml:space="preserve"> </w:t>
             </w:r>
-            <w:hyperlink r:id="rId183">
+            <w:hyperlink r:id="rId182">
               <w:r>
                 <w:rPr>
                   <w:rStyle w:val="Hyperlink"/>
@@ -21523,8 +21523,8 @@
         </w:tc>
       </w:tr>
     </w:tbl>
-    <w:bookmarkEnd w:id="184"/>
-    <w:bookmarkStart w:id="187" w:name="privacy-considerations"/>
+    <w:bookmarkEnd w:id="183"/>
+    <w:bookmarkStart w:id="186" w:name="privacy-considerations"/>
     <w:p>
       <w:pPr>
         <w:pStyle w:val="Heading4"/>
@@ -21650,12 +21650,12 @@
                 <wp:inline>
                   <wp:extent cx="152400" cy="152400"/>
                   <wp:effectExtent b="0" l="0" r="0" t="0"/>
-                  <wp:docPr descr="" title="" id="185" name="Picture"/>
+                  <wp:docPr descr="" title="" id="184" name="Picture"/>
                   <a:graphic>
                     <a:graphicData uri="http://schemas.openxmlformats.org/drawingml/2006/picture">
                       <pic:pic>
                         <pic:nvPicPr>
-                          <pic:cNvPr descr="/opt/quarto/share/formats/docx/important.png" id="186" name="Picture"/>
+                          <pic:cNvPr descr="/opt/quarto/share/formats/docx/important.png" id="185" name="Picture"/>
                           <pic:cNvPicPr>
                             <a:picLocks noChangeArrowheads="1" noChangeAspect="1"/>
                           </pic:cNvPicPr>
@@ -21953,431 +21953,431 @@
         </w:tc>
       </w:tr>
     </w:tbl>
+    <w:bookmarkEnd w:id="186"/>
+    <w:bookmarkStart w:id="187" w:name="verifying-you-are-genuinely-offline"/>
+    <w:p>
+      <w:pPr>
+        <w:pStyle w:val="Heading4"/>
+      </w:pPr>
+      <w:r>
+        <w:t xml:space="preserve">Verifying you are genuinely offline</w:t>
+      </w:r>
+    </w:p>
+    <w:p>
+      <w:pPr>
+        <w:pStyle w:val="FirstParagraph"/>
+      </w:pPr>
+      <w:r>
+        <w:t xml:space="preserve">A local setup that has never been tested without a network</w:t>
+      </w:r>
+      <w:r>
+        <w:t xml:space="preserve"> </w:t>
+      </w:r>
+      <w:r>
+        <w:t xml:space="preserve">is a local setup you are guessing about.</w:t>
+      </w:r>
+      <w:r>
+        <w:t xml:space="preserve"> </w:t>
+      </w:r>
+      <w:r>
+        <w:t xml:space="preserve">Cutting the machine off entirely is the honest test.</w:t>
+      </w:r>
+      <w:r>
+        <w:t xml:space="preserve"> </w:t>
+      </w:r>
+      <w:r>
+        <w:t xml:space="preserve">A lighter one that does not disturb the rest of your session</w:t>
+      </w:r>
+      <w:r>
+        <w:t xml:space="preserve"> </w:t>
+      </w:r>
+      <w:r>
+        <w:t xml:space="preserve">is to make outbound traffic fail for a single command,</w:t>
+      </w:r>
+      <w:r>
+        <w:t xml:space="preserve"> </w:t>
+      </w:r>
+      <w:r>
+        <w:t xml:space="preserve">while leaving</w:t>
+      </w:r>
+      <w:r>
+        <w:t xml:space="preserve"> </w:t>
+      </w:r>
+      <w:r>
+        <w:rPr>
+          <w:rStyle w:val="VerbatimChar"/>
+        </w:rPr>
+        <w:t xml:space="preserve">localhost</w:t>
+      </w:r>
+      <w:r>
+        <w:t xml:space="preserve"> </w:t>
+      </w:r>
+      <w:r>
+        <w:t xml:space="preserve">reachable:</w:t>
+      </w:r>
+    </w:p>
+    <w:p>
+      <w:pPr>
+        <w:pStyle w:val="SourceCode"/>
+      </w:pPr>
+      <w:r>
+        <w:rPr>
+          <w:rStyle w:val="BuiltInTok"/>
+        </w:rPr>
+        <w:t xml:space="preserve">export</w:t>
+      </w:r>
+      <w:r>
+        <w:rPr>
+          <w:rStyle w:val="NormalTok"/>
+        </w:rPr>
+        <w:t xml:space="preserve"> </w:t>
+      </w:r>
+      <w:r>
+        <w:rPr>
+          <w:rStyle w:val="VariableTok"/>
+        </w:rPr>
+        <w:t xml:space="preserve">HTTPS_PROXY</w:t>
+      </w:r>
+      <w:r>
+        <w:rPr>
+          <w:rStyle w:val="OperatorTok"/>
+        </w:rPr>
+        <w:t xml:space="preserve">=</w:t>
+      </w:r>
+      <w:r>
+        <w:rPr>
+          <w:rStyle w:val="NormalTok"/>
+        </w:rPr>
+        <w:t xml:space="preserve">http://127.0.0.1:9 </w:t>
+      </w:r>
+      <w:r>
+        <w:rPr>
+          <w:rStyle w:val="VariableTok"/>
+        </w:rPr>
+        <w:t xml:space="preserve">HTTP_PROXY</w:t>
+      </w:r>
+      <w:r>
+        <w:rPr>
+          <w:rStyle w:val="OperatorTok"/>
+        </w:rPr>
+        <w:t xml:space="preserve">=</w:t>
+      </w:r>
+      <w:r>
+        <w:rPr>
+          <w:rStyle w:val="NormalTok"/>
+        </w:rPr>
+        <w:t xml:space="preserve">http://127.0.0.1:9</w:t>
+      </w:r>
+      <w:r>
+        <w:br/>
+      </w:r>
+      <w:r>
+        <w:rPr>
+          <w:rStyle w:val="BuiltInTok"/>
+        </w:rPr>
+        <w:t xml:space="preserve">export</w:t>
+      </w:r>
+      <w:r>
+        <w:rPr>
+          <w:rStyle w:val="NormalTok"/>
+        </w:rPr>
+        <w:t xml:space="preserve"> </w:t>
+      </w:r>
+      <w:r>
+        <w:rPr>
+          <w:rStyle w:val="VariableTok"/>
+        </w:rPr>
+        <w:t xml:space="preserve">NO_PROXY</w:t>
+      </w:r>
+      <w:r>
+        <w:rPr>
+          <w:rStyle w:val="OperatorTok"/>
+        </w:rPr>
+        <w:t xml:space="preserve">=</w:t>
+      </w:r>
+      <w:r>
+        <w:rPr>
+          <w:rStyle w:val="NormalTok"/>
+        </w:rPr>
+        <w:t xml:space="preserve">localhost,127.0.0.1</w:t>
+      </w:r>
+      <w:r>
+        <w:br/>
+      </w:r>
+      <w:r>
+        <w:br/>
+      </w:r>
+      <w:r>
+        <w:rPr>
+          <w:rStyle w:val="CommentTok"/>
+        </w:rPr>
+        <w:t xml:space="preserve"># Confirm the block is real before trusting the result:</w:t>
+      </w:r>
+      <w:r>
+        <w:br/>
+      </w:r>
+      <w:r>
+        <w:rPr>
+          <w:rStyle w:val="ExtensionTok"/>
+        </w:rPr>
+        <w:t xml:space="preserve">curl</w:t>
+      </w:r>
+      <w:r>
+        <w:rPr>
+          <w:rStyle w:val="NormalTok"/>
+        </w:rPr>
+        <w:t xml:space="preserve"> </w:t>
+      </w:r>
+      <w:r>
+        <w:rPr>
+          <w:rStyle w:val="AttributeTok"/>
+        </w:rPr>
+        <w:t xml:space="preserve">-s</w:t>
+      </w:r>
+      <w:r>
+        <w:rPr>
+          <w:rStyle w:val="NormalTok"/>
+        </w:rPr>
+        <w:t xml:space="preserve"> </w:t>
+      </w:r>
+      <w:r>
+        <w:rPr>
+          <w:rStyle w:val="AttributeTok"/>
+        </w:rPr>
+        <w:t xml:space="preserve">-m</w:t>
+      </w:r>
+      <w:r>
+        <w:rPr>
+          <w:rStyle w:val="NormalTok"/>
+        </w:rPr>
+        <w:t xml:space="preserve"> 5 </w:t>
+      </w:r>
+      <w:r>
+        <w:rPr>
+          <w:rStyle w:val="AttributeTok"/>
+        </w:rPr>
+        <w:t xml:space="preserve">-o</w:t>
+      </w:r>
+      <w:r>
+        <w:rPr>
+          <w:rStyle w:val="NormalTok"/>
+        </w:rPr>
+        <w:t xml:space="preserve"> /dev/null </w:t>
+      </w:r>
+      <w:r>
+        <w:rPr>
+          <w:rStyle w:val="AttributeTok"/>
+        </w:rPr>
+        <w:t xml:space="preserve">-w</w:t>
+      </w:r>
+      <w:r>
+        <w:rPr>
+          <w:rStyle w:val="NormalTok"/>
+        </w:rPr>
+        <w:t xml:space="preserve"> </w:t>
+      </w:r>
+      <w:r>
+        <w:rPr>
+          <w:rStyle w:val="StringTok"/>
+        </w:rPr>
+        <w:t xml:space="preserve">'%{http_code}\n'</w:t>
+      </w:r>
+      <w:r>
+        <w:rPr>
+          <w:rStyle w:val="NormalTok"/>
+        </w:rPr>
+        <w:t xml:space="preserve"> https://example.com  </w:t>
+      </w:r>
+      <w:r>
+        <w:rPr>
+          <w:rStyle w:val="CommentTok"/>
+        </w:rPr>
+        <w:t xml:space="preserve"># 000 = blocked</w:t>
+      </w:r>
+      <w:r>
+        <w:br/>
+      </w:r>
+      <w:r>
+        <w:rPr>
+          <w:rStyle w:val="ExtensionTok"/>
+        </w:rPr>
+        <w:t xml:space="preserve">curl</w:t>
+      </w:r>
+      <w:r>
+        <w:rPr>
+          <w:rStyle w:val="NormalTok"/>
+        </w:rPr>
+        <w:t xml:space="preserve"> </w:t>
+      </w:r>
+      <w:r>
+        <w:rPr>
+          <w:rStyle w:val="AttributeTok"/>
+        </w:rPr>
+        <w:t xml:space="preserve">-s</w:t>
+      </w:r>
+      <w:r>
+        <w:rPr>
+          <w:rStyle w:val="NormalTok"/>
+        </w:rPr>
+        <w:t xml:space="preserve"> </w:t>
+      </w:r>
+      <w:r>
+        <w:rPr>
+          <w:rStyle w:val="AttributeTok"/>
+        </w:rPr>
+        <w:t xml:space="preserve">-m</w:t>
+      </w:r>
+      <w:r>
+        <w:rPr>
+          <w:rStyle w:val="NormalTok"/>
+        </w:rPr>
+        <w:t xml:space="preserve"> 5 </w:t>
+      </w:r>
+      <w:r>
+        <w:rPr>
+          <w:rStyle w:val="AttributeTok"/>
+        </w:rPr>
+        <w:t xml:space="preserve">-o</w:t>
+      </w:r>
+      <w:r>
+        <w:rPr>
+          <w:rStyle w:val="NormalTok"/>
+        </w:rPr>
+        <w:t xml:space="preserve"> /dev/null </w:t>
+      </w:r>
+      <w:r>
+        <w:rPr>
+          <w:rStyle w:val="AttributeTok"/>
+        </w:rPr>
+        <w:t xml:space="preserve">-w</w:t>
+      </w:r>
+      <w:r>
+        <w:rPr>
+          <w:rStyle w:val="NormalTok"/>
+        </w:rPr>
+        <w:t xml:space="preserve"> </w:t>
+      </w:r>
+      <w:r>
+        <w:rPr>
+          <w:rStyle w:val="StringTok"/>
+        </w:rPr>
+        <w:t xml:space="preserve">'%{http_code}\n'</w:t>
+      </w:r>
+      <w:r>
+        <w:rPr>
+          <w:rStyle w:val="NormalTok"/>
+        </w:rPr>
+        <w:t xml:space="preserve"> http://localhost:11434/api/version  </w:t>
+      </w:r>
+      <w:r>
+        <w:rPr>
+          <w:rStyle w:val="CommentTok"/>
+        </w:rPr>
+        <w:t xml:space="preserve"># 200 = local</w:t>
+      </w:r>
+      <w:r>
+        <w:br/>
+      </w:r>
+      <w:r>
+        <w:br/>
+      </w:r>
+      <w:r>
+        <w:rPr>
+          <w:rStyle w:val="ExtensionTok"/>
+        </w:rPr>
+        <w:t xml:space="preserve">aider</w:t>
+      </w:r>
+      <w:r>
+        <w:rPr>
+          <w:rStyle w:val="NormalTok"/>
+        </w:rPr>
+        <w:t xml:space="preserve"> </w:t>
+      </w:r>
+      <w:r>
+        <w:rPr>
+          <w:rStyle w:val="AttributeTok"/>
+        </w:rPr>
+        <w:t xml:space="preserve">--yes</w:t>
+      </w:r>
+      <w:r>
+        <w:rPr>
+          <w:rStyle w:val="NormalTok"/>
+        </w:rPr>
+        <w:t xml:space="preserve"> </w:t>
+      </w:r>
+      <w:r>
+        <w:rPr>
+          <w:rStyle w:val="AttributeTok"/>
+        </w:rPr>
+        <w:t xml:space="preserve">--message</w:t>
+      </w:r>
+      <w:r>
+        <w:rPr>
+          <w:rStyle w:val="NormalTok"/>
+        </w:rPr>
+        <w:t xml:space="preserve"> </w:t>
+      </w:r>
+      <w:r>
+        <w:rPr>
+          <w:rStyle w:val="StringTok"/>
+        </w:rPr>
+        <w:t xml:space="preserve">"Fix the off-by-one error in mean()."</w:t>
+      </w:r>
+      <w:r>
+        <w:rPr>
+          <w:rStyle w:val="NormalTok"/>
+        </w:rPr>
+        <w:t xml:space="preserve"> stats.py</w:t>
+      </w:r>
+    </w:p>
+    <w:p>
+      <w:pPr>
+        <w:pStyle w:val="FirstParagraph"/>
+      </w:pPr>
+      <w:r>
+        <w:t xml:space="preserve">Check the block itself first,</w:t>
+      </w:r>
+      <w:r>
+        <w:t xml:space="preserve"> </w:t>
+      </w:r>
+      <w:r>
+        <w:t xml:space="preserve">as above.</w:t>
+      </w:r>
+      <w:r>
+        <w:t xml:space="preserve"> </w:t>
+      </w:r>
+      <w:r>
+        <w:t xml:space="preserve">A test that passes because the proxy was never applied</w:t>
+      </w:r>
+      <w:r>
+        <w:t xml:space="preserve"> </w:t>
+      </w:r>
+      <w:r>
+        <w:t xml:space="preserve">tells you nothing,</w:t>
+      </w:r>
+      <w:r>
+        <w:t xml:space="preserve"> </w:t>
+      </w:r>
+      <w:r>
+        <w:t xml:space="preserve">and looks exactly like success.</w:t>
+      </w:r>
+    </w:p>
     <w:bookmarkEnd w:id="187"/>
-    <w:bookmarkStart w:id="188" w:name="verifying-you-are-genuinely-offline"/>
-    <w:p>
-      <w:pPr>
-        <w:pStyle w:val="Heading4"/>
-      </w:pPr>
-      <w:r>
-        <w:t xml:space="preserve">Verifying you are genuinely offline</w:t>
+    <w:bookmarkEnd w:id="188"/>
+    <w:bookmarkStart w:id="194" w:name="sec-ai-opencode-ollama"/>
+    <w:p>
+      <w:pPr>
+        <w:pStyle w:val="Heading1"/>
+      </w:pPr>
+      <w:r>
+        <w:t xml:space="preserve">18. Connecting OpenCode to Local Models</w:t>
       </w:r>
     </w:p>
     <w:p>
       <w:pPr>
         <w:pStyle w:val="FirstParagraph"/>
       </w:pPr>
-      <w:r>
-        <w:t xml:space="preserve">A local setup that has never been tested without a network</w:t>
-      </w:r>
-      <w:r>
-        <w:t xml:space="preserve"> </w:t>
-      </w:r>
-      <w:r>
-        <w:t xml:space="preserve">is a local setup you are guessing about.</w:t>
-      </w:r>
-      <w:r>
-        <w:t xml:space="preserve"> </w:t>
-      </w:r>
-      <w:r>
-        <w:t xml:space="preserve">Cutting the machine off entirely is the honest test.</w:t>
-      </w:r>
-      <w:r>
-        <w:t xml:space="preserve"> </w:t>
-      </w:r>
-      <w:r>
-        <w:t xml:space="preserve">A lighter one that does not disturb the rest of your session</w:t>
-      </w:r>
-      <w:r>
-        <w:t xml:space="preserve"> </w:t>
-      </w:r>
-      <w:r>
-        <w:t xml:space="preserve">is to make outbound traffic fail for a single command,</w:t>
-      </w:r>
-      <w:r>
-        <w:t xml:space="preserve"> </w:t>
-      </w:r>
-      <w:r>
-        <w:t xml:space="preserve">while leaving</w:t>
-      </w:r>
-      <w:r>
-        <w:t xml:space="preserve"> </w:t>
-      </w:r>
-      <w:r>
-        <w:rPr>
-          <w:rStyle w:val="VerbatimChar"/>
-        </w:rPr>
-        <w:t xml:space="preserve">localhost</w:t>
-      </w:r>
-      <w:r>
-        <w:t xml:space="preserve"> </w:t>
-      </w:r>
-      <w:r>
-        <w:t xml:space="preserve">reachable:</w:t>
-      </w:r>
-    </w:p>
-    <w:p>
-      <w:pPr>
-        <w:pStyle w:val="SourceCode"/>
-      </w:pPr>
-      <w:r>
-        <w:rPr>
-          <w:rStyle w:val="BuiltInTok"/>
-        </w:rPr>
-        <w:t xml:space="preserve">export</w:t>
-      </w:r>
-      <w:r>
-        <w:rPr>
-          <w:rStyle w:val="NormalTok"/>
-        </w:rPr>
-        <w:t xml:space="preserve"> </w:t>
-      </w:r>
-      <w:r>
-        <w:rPr>
-          <w:rStyle w:val="VariableTok"/>
-        </w:rPr>
-        <w:t xml:space="preserve">HTTPS_PROXY</w:t>
-      </w:r>
-      <w:r>
-        <w:rPr>
-          <w:rStyle w:val="OperatorTok"/>
-        </w:rPr>
-        <w:t xml:space="preserve">=</w:t>
-      </w:r>
-      <w:r>
-        <w:rPr>
-          <w:rStyle w:val="NormalTok"/>
-        </w:rPr>
-        <w:t xml:space="preserve">http://127.0.0.1:9 </w:t>
-      </w:r>
-      <w:r>
-        <w:rPr>
-          <w:rStyle w:val="VariableTok"/>
-        </w:rPr>
-        <w:t xml:space="preserve">HTTP_PROXY</w:t>
-      </w:r>
-      <w:r>
-        <w:rPr>
-          <w:rStyle w:val="OperatorTok"/>
-        </w:rPr>
-        <w:t xml:space="preserve">=</w:t>
-      </w:r>
-      <w:r>
-        <w:rPr>
-          <w:rStyle w:val="NormalTok"/>
-        </w:rPr>
-        <w:t xml:space="preserve">http://127.0.0.1:9</w:t>
-      </w:r>
-      <w:r>
-        <w:br/>
-      </w:r>
-      <w:r>
-        <w:rPr>
-          <w:rStyle w:val="BuiltInTok"/>
-        </w:rPr>
-        <w:t xml:space="preserve">export</w:t>
-      </w:r>
-      <w:r>
-        <w:rPr>
-          <w:rStyle w:val="NormalTok"/>
-        </w:rPr>
-        <w:t xml:space="preserve"> </w:t>
-      </w:r>
-      <w:r>
-        <w:rPr>
-          <w:rStyle w:val="VariableTok"/>
-        </w:rPr>
-        <w:t xml:space="preserve">NO_PROXY</w:t>
-      </w:r>
-      <w:r>
-        <w:rPr>
-          <w:rStyle w:val="OperatorTok"/>
-        </w:rPr>
-        <w:t xml:space="preserve">=</w:t>
-      </w:r>
-      <w:r>
-        <w:rPr>
-          <w:rStyle w:val="NormalTok"/>
-        </w:rPr>
-        <w:t xml:space="preserve">localhost,127.0.0.1</w:t>
-      </w:r>
-      <w:r>
-        <w:br/>
-      </w:r>
-      <w:r>
-        <w:br/>
-      </w:r>
-      <w:r>
-        <w:rPr>
-          <w:rStyle w:val="CommentTok"/>
-        </w:rPr>
-        <w:t xml:space="preserve"># Confirm the block is real before trusting the result:</w:t>
-      </w:r>
-      <w:r>
-        <w:br/>
-      </w:r>
-      <w:r>
-        <w:rPr>
-          <w:rStyle w:val="ExtensionTok"/>
-        </w:rPr>
-        <w:t xml:space="preserve">curl</w:t>
-      </w:r>
-      <w:r>
-        <w:rPr>
-          <w:rStyle w:val="NormalTok"/>
-        </w:rPr>
-        <w:t xml:space="preserve"> </w:t>
-      </w:r>
-      <w:r>
-        <w:rPr>
-          <w:rStyle w:val="AttributeTok"/>
-        </w:rPr>
-        <w:t xml:space="preserve">-s</w:t>
-      </w:r>
-      <w:r>
-        <w:rPr>
-          <w:rStyle w:val="NormalTok"/>
-        </w:rPr>
-        <w:t xml:space="preserve"> </w:t>
-      </w:r>
-      <w:r>
-        <w:rPr>
-          <w:rStyle w:val="AttributeTok"/>
-        </w:rPr>
-        <w:t xml:space="preserve">-m</w:t>
-      </w:r>
-      <w:r>
-        <w:rPr>
-          <w:rStyle w:val="NormalTok"/>
-        </w:rPr>
-        <w:t xml:space="preserve"> 5 </w:t>
-      </w:r>
-      <w:r>
-        <w:rPr>
-          <w:rStyle w:val="AttributeTok"/>
-        </w:rPr>
-        <w:t xml:space="preserve">-o</w:t>
-      </w:r>
-      <w:r>
-        <w:rPr>
-          <w:rStyle w:val="NormalTok"/>
-        </w:rPr>
-        <w:t xml:space="preserve"> /dev/null </w:t>
-      </w:r>
-      <w:r>
-        <w:rPr>
-          <w:rStyle w:val="AttributeTok"/>
-        </w:rPr>
-        <w:t xml:space="preserve">-w</w:t>
-      </w:r>
-      <w:r>
-        <w:rPr>
-          <w:rStyle w:val="NormalTok"/>
-        </w:rPr>
-        <w:t xml:space="preserve"> </w:t>
-      </w:r>
-      <w:r>
-        <w:rPr>
-          <w:rStyle w:val="StringTok"/>
-        </w:rPr>
-        <w:t xml:space="preserve">'%{http_code}\n'</w:t>
-      </w:r>
-      <w:r>
-        <w:rPr>
-          <w:rStyle w:val="NormalTok"/>
-        </w:rPr>
-        <w:t xml:space="preserve"> https://example.com  </w:t>
-      </w:r>
-      <w:r>
-        <w:rPr>
-          <w:rStyle w:val="CommentTok"/>
-        </w:rPr>
-        <w:t xml:space="preserve"># 000 = blocked</w:t>
-      </w:r>
-      <w:r>
-        <w:br/>
-      </w:r>
-      <w:r>
-        <w:rPr>
-          <w:rStyle w:val="ExtensionTok"/>
-        </w:rPr>
-        <w:t xml:space="preserve">curl</w:t>
-      </w:r>
-      <w:r>
-        <w:rPr>
-          <w:rStyle w:val="NormalTok"/>
-        </w:rPr>
-        <w:t xml:space="preserve"> </w:t>
-      </w:r>
-      <w:r>
-        <w:rPr>
-          <w:rStyle w:val="AttributeTok"/>
-        </w:rPr>
-        <w:t xml:space="preserve">-s</w:t>
-      </w:r>
-      <w:r>
-        <w:rPr>
-          <w:rStyle w:val="NormalTok"/>
-        </w:rPr>
-        <w:t xml:space="preserve"> </w:t>
-      </w:r>
-      <w:r>
-        <w:rPr>
-          <w:rStyle w:val="AttributeTok"/>
-        </w:rPr>
-        <w:t xml:space="preserve">-m</w:t>
-      </w:r>
-      <w:r>
-        <w:rPr>
-          <w:rStyle w:val="NormalTok"/>
-        </w:rPr>
-        <w:t xml:space="preserve"> 5 </w:t>
-      </w:r>
-      <w:r>
-        <w:rPr>
-          <w:rStyle w:val="AttributeTok"/>
-        </w:rPr>
-        <w:t xml:space="preserve">-o</w:t>
-      </w:r>
-      <w:r>
-        <w:rPr>
-          <w:rStyle w:val="NormalTok"/>
-        </w:rPr>
-        <w:t xml:space="preserve"> /dev/null </w:t>
-      </w:r>
-      <w:r>
-        <w:rPr>
-          <w:rStyle w:val="AttributeTok"/>
-        </w:rPr>
-        <w:t xml:space="preserve">-w</w:t>
-      </w:r>
-      <w:r>
-        <w:rPr>
-          <w:rStyle w:val="NormalTok"/>
-        </w:rPr>
-        <w:t xml:space="preserve"> </w:t>
-      </w:r>
-      <w:r>
-        <w:rPr>
-          <w:rStyle w:val="StringTok"/>
-        </w:rPr>
-        <w:t xml:space="preserve">'%{http_code}\n'</w:t>
-      </w:r>
-      <w:r>
-        <w:rPr>
-          <w:rStyle w:val="NormalTok"/>
-        </w:rPr>
-        <w:t xml:space="preserve"> http://localhost:11434/api/version  </w:t>
-      </w:r>
-      <w:r>
-        <w:rPr>
-          <w:rStyle w:val="CommentTok"/>
-        </w:rPr>
-        <w:t xml:space="preserve"># 200 = local</w:t>
-      </w:r>
-      <w:r>
-        <w:br/>
-      </w:r>
-      <w:r>
-        <w:br/>
-      </w:r>
-      <w:r>
-        <w:rPr>
-          <w:rStyle w:val="ExtensionTok"/>
-        </w:rPr>
-        <w:t xml:space="preserve">aider</w:t>
-      </w:r>
-      <w:r>
-        <w:rPr>
-          <w:rStyle w:val="NormalTok"/>
-        </w:rPr>
-        <w:t xml:space="preserve"> </w:t>
-      </w:r>
-      <w:r>
-        <w:rPr>
-          <w:rStyle w:val="AttributeTok"/>
-        </w:rPr>
-        <w:t xml:space="preserve">--yes</w:t>
-      </w:r>
-      <w:r>
-        <w:rPr>
-          <w:rStyle w:val="NormalTok"/>
-        </w:rPr>
-        <w:t xml:space="preserve"> </w:t>
-      </w:r>
-      <w:r>
-        <w:rPr>
-          <w:rStyle w:val="AttributeTok"/>
-        </w:rPr>
-        <w:t xml:space="preserve">--message</w:t>
-      </w:r>
-      <w:r>
-        <w:rPr>
-          <w:rStyle w:val="NormalTok"/>
-        </w:rPr>
-        <w:t xml:space="preserve"> </w:t>
-      </w:r>
-      <w:r>
-        <w:rPr>
-          <w:rStyle w:val="StringTok"/>
-        </w:rPr>
-        <w:t xml:space="preserve">"Fix the off-by-one error in mean()."</w:t>
-      </w:r>
-      <w:r>
-        <w:rPr>
-          <w:rStyle w:val="NormalTok"/>
-        </w:rPr>
-        <w:t xml:space="preserve"> stats.py</w:t>
-      </w:r>
-    </w:p>
-    <w:p>
-      <w:pPr>
-        <w:pStyle w:val="FirstParagraph"/>
-      </w:pPr>
-      <w:r>
-        <w:t xml:space="preserve">Check the block itself first,</w:t>
-      </w:r>
-      <w:r>
-        <w:t xml:space="preserve"> </w:t>
-      </w:r>
-      <w:r>
-        <w:t xml:space="preserve">as above.</w:t>
-      </w:r>
-      <w:r>
-        <w:t xml:space="preserve"> </w:t>
-      </w:r>
-      <w:r>
-        <w:t xml:space="preserve">A test that passes because the proxy was never applied</w:t>
-      </w:r>
-      <w:r>
-        <w:t xml:space="preserve"> </w:t>
-      </w:r>
-      <w:r>
-        <w:t xml:space="preserve">tells you nothing,</w:t>
-      </w:r>
-      <w:r>
-        <w:t xml:space="preserve"> </w:t>
-      </w:r>
-      <w:r>
-        <w:t xml:space="preserve">and looks exactly like success.</w:t>
-      </w:r>
-    </w:p>
-    <w:bookmarkEnd w:id="188"/>
-    <w:bookmarkEnd w:id="189"/>
-    <w:bookmarkStart w:id="195" w:name="sec-ai-opencode-ollama"/>
-    <w:p>
-      <w:pPr>
-        <w:pStyle w:val="Heading1"/>
-      </w:pPr>
-      <w:r>
-        <w:t xml:space="preserve">18. Connecting OpenCode to Local Models</w:t>
-      </w:r>
-    </w:p>
-    <w:p>
-      <w:pPr>
-        <w:pStyle w:val="FirstParagraph"/>
-      </w:pPr>
-      <w:hyperlink r:id="rId190">
+      <w:hyperlink r:id="rId189">
         <w:r>
           <w:rPr>
             <w:rStyle w:val="Hyperlink"/>
@@ -22568,7 +22568,7 @@
       <w:r>
         <w:t xml:space="preserve"> </w:t>
       </w:r>
-      <w:hyperlink r:id="rId191">
+      <w:hyperlink r:id="rId190">
         <w:r>
           <w:rPr>
             <w:rStyle w:val="VerbatimChar"/>
@@ -22815,12 +22815,12 @@
                 <wp:inline>
                   <wp:extent cx="152400" cy="152400"/>
                   <wp:effectExtent b="0" l="0" r="0" t="0"/>
-                  <wp:docPr descr="" title="" id="192" name="Picture"/>
+                  <wp:docPr descr="" title="" id="191" name="Picture"/>
                   <a:graphic>
                     <a:graphicData uri="http://schemas.openxmlformats.org/drawingml/2006/picture">
                       <pic:pic>
                         <pic:nvPicPr>
-                          <pic:cNvPr descr="/opt/quarto/share/formats/docx/note.png" id="193" name="Picture"/>
+                          <pic:cNvPr descr="/opt/quarto/share/formats/docx/note.png" id="192" name="Picture"/>
                           <pic:cNvPicPr>
                             <a:picLocks noChangeArrowheads="1" noChangeAspect="1"/>
                           </pic:cNvPicPr>
@@ -22894,7 +22894,7 @@
             <w:r>
               <w:t xml:space="preserve"> </w:t>
             </w:r>
-            <w:hyperlink r:id="rId194">
+            <w:hyperlink r:id="rId193">
               <w:r>
                 <w:rPr>
                   <w:rStyle w:val="VerbatimChar"/>
@@ -22999,8 +22999,8 @@
         <w:t xml:space="preserve">.</w:t>
       </w:r>
     </w:p>
-    <w:bookmarkEnd w:id="195"/>
-    <w:bookmarkStart w:id="200" w:name="sec-ai-opencode-openrouter"/>
+    <w:bookmarkEnd w:id="194"/>
+    <w:bookmarkStart w:id="199" w:name="sec-ai-opencode-openrouter"/>
     <w:p>
       <w:pPr>
         <w:pStyle w:val="Heading1"/>
@@ -23013,7 +23013,7 @@
       <w:pPr>
         <w:pStyle w:val="FirstParagraph"/>
       </w:pPr>
-      <w:hyperlink r:id="rId196">
+      <w:hyperlink r:id="rId195">
         <w:r>
           <w:rPr>
             <w:rStyle w:val="Hyperlink"/>
@@ -23122,7 +23122,7 @@
       <w:r>
         <w:t xml:space="preserve"> </w:t>
       </w:r>
-      <w:hyperlink r:id="rId197">
+      <w:hyperlink r:id="rId196">
         <w:r>
           <w:rPr>
             <w:rStyle w:val="Hyperlink"/>
@@ -23139,7 +23139,7 @@
       <w:r>
         <w:t xml:space="preserve"> </w:t>
       </w:r>
-      <w:hyperlink r:id="rId198">
+      <w:hyperlink r:id="rId197">
         <w:r>
           <w:rPr>
             <w:rStyle w:val="Hyperlink"/>
@@ -24185,7 +24185,7 @@
       <w:r>
         <w:t xml:space="preserve">(</w:t>
       </w:r>
-      <w:hyperlink r:id="rId199">
+      <w:hyperlink r:id="rId198">
         <w:r>
           <w:rPr>
             <w:rStyle w:val="Hyperlink"/>
@@ -24205,8 +24205,8 @@
         <w:t xml:space="preserve">Config loads at startup, so restart OpenCode after editing it.</w:t>
       </w:r>
     </w:p>
-    <w:bookmarkEnd w:id="200"/>
-    <w:bookmarkStart w:id="237" w:name="sec-ai-small-local-models"/>
+    <w:bookmarkEnd w:id="199"/>
+    <w:bookmarkStart w:id="236" w:name="sec-ai-small-local-models"/>
     <w:p>
       <w:pPr>
         <w:pStyle w:val="Heading1"/>
@@ -24354,12 +24354,12 @@
                 <wp:inline>
                   <wp:extent cx="152400" cy="152400"/>
                   <wp:effectExtent b="0" l="0" r="0" t="0"/>
-                  <wp:docPr descr="" title="" id="201" name="Picture"/>
+                  <wp:docPr descr="" title="" id="200" name="Picture"/>
                   <a:graphic>
                     <a:graphicData uri="http://schemas.openxmlformats.org/drawingml/2006/picture">
                       <pic:pic>
                         <pic:nvPicPr>
-                          <pic:cNvPr descr="/opt/quarto/share/formats/docx/warning.png" id="202" name="Picture"/>
+                          <pic:cNvPr descr="/opt/quarto/share/formats/docx/warning.png" id="201" name="Picture"/>
                           <pic:cNvPicPr>
                             <a:picLocks noChangeArrowheads="1" noChangeAspect="1"/>
                           </pic:cNvPicPr>
@@ -24495,7 +24495,7 @@
         </w:tc>
       </w:tr>
     </w:tbl>
-    <w:bookmarkStart w:id="203" w:name="the-honest-catch"/>
+    <w:bookmarkStart w:id="202" w:name="the-honest-catch"/>
     <w:p>
       <w:pPr>
         <w:pStyle w:val="Heading4"/>
@@ -24665,8 +24665,8 @@
         <w:t xml:space="preserve">below.</w:t>
       </w:r>
     </w:p>
-    <w:bookmarkEnd w:id="203"/>
-    <w:bookmarkStart w:id="218" w:name="model-landscape"/>
+    <w:bookmarkEnd w:id="202"/>
+    <w:bookmarkStart w:id="217" w:name="model-landscape"/>
     <w:p>
       <w:pPr>
         <w:pStyle w:val="Heading4"/>
@@ -24798,7 +24798,7 @@
             <w:pPr>
               <w:pStyle w:val="Compact"/>
             </w:pPr>
-            <w:hyperlink r:id="rId204">
+            <w:hyperlink r:id="rId203">
               <w:r>
                 <w:rPr>
                   <w:rStyle w:val="Hyperlink"/>
@@ -24873,7 +24873,7 @@
             <w:pPr>
               <w:pStyle w:val="Compact"/>
             </w:pPr>
-            <w:hyperlink r:id="rId205">
+            <w:hyperlink r:id="rId204">
               <w:r>
                 <w:rPr>
                   <w:rStyle w:val="Hyperlink"/>
@@ -24924,7 +24924,7 @@
             <w:pPr>
               <w:pStyle w:val="Compact"/>
             </w:pPr>
-            <w:hyperlink r:id="rId206">
+            <w:hyperlink r:id="rId205">
               <w:r>
                 <w:rPr>
                   <w:rStyle w:val="Hyperlink"/>
@@ -24999,7 +24999,7 @@
             <w:pPr>
               <w:pStyle w:val="Compact"/>
             </w:pPr>
-            <w:hyperlink r:id="rId207">
+            <w:hyperlink r:id="rId206">
               <w:r>
                 <w:rPr>
                   <w:rStyle w:val="Hyperlink"/>
@@ -25050,7 +25050,7 @@
             <w:pPr>
               <w:pStyle w:val="Compact"/>
             </w:pPr>
-            <w:hyperlink r:id="rId208">
+            <w:hyperlink r:id="rId207">
               <w:r>
                 <w:rPr>
                   <w:rStyle w:val="Hyperlink"/>
@@ -25101,7 +25101,7 @@
             <w:pPr>
               <w:pStyle w:val="Compact"/>
             </w:pPr>
-            <w:hyperlink r:id="rId209">
+            <w:hyperlink r:id="rId208">
               <w:r>
                 <w:rPr>
                   <w:rStyle w:val="Hyperlink"/>
@@ -25152,7 +25152,7 @@
             <w:pPr>
               <w:pStyle w:val="Compact"/>
             </w:pPr>
-            <w:hyperlink r:id="rId210">
+            <w:hyperlink r:id="rId209">
               <w:r>
                 <w:rPr>
                   <w:rStyle w:val="Hyperlink"/>
@@ -25203,7 +25203,7 @@
             <w:pPr>
               <w:pStyle w:val="Compact"/>
             </w:pPr>
-            <w:hyperlink r:id="rId211">
+            <w:hyperlink r:id="rId210">
               <w:r>
                 <w:rPr>
                   <w:rStyle w:val="Hyperlink"/>
@@ -25230,7 +25230,7 @@
             <w:pPr>
               <w:pStyle w:val="Compact"/>
             </w:pPr>
-            <w:hyperlink r:id="rId212">
+            <w:hyperlink r:id="rId211">
               <w:r>
                 <w:rPr>
                   <w:rStyle w:val="Hyperlink"/>
@@ -25259,7 +25259,7 @@
             <w:pPr>
               <w:pStyle w:val="Compact"/>
             </w:pPr>
-            <w:hyperlink r:id="rId213">
+            <w:hyperlink r:id="rId212">
               <w:r>
                 <w:rPr>
                   <w:rStyle w:val="Hyperlink"/>
@@ -25286,7 +25286,7 @@
             <w:pPr>
               <w:pStyle w:val="Compact"/>
             </w:pPr>
-            <w:hyperlink r:id="rId214">
+            <w:hyperlink r:id="rId213">
               <w:r>
                 <w:rPr>
                   <w:rStyle w:val="Hyperlink"/>
@@ -25321,7 +25321,7 @@
             <w:pPr>
               <w:pStyle w:val="Compact"/>
             </w:pPr>
-            <w:hyperlink r:id="rId215">
+            <w:hyperlink r:id="rId214">
               <w:r>
                 <w:rPr>
                   <w:rStyle w:val="Hyperlink"/>
@@ -25575,12 +25575,12 @@
                 <wp:inline>
                   <wp:extent cx="152400" cy="152400"/>
                   <wp:effectExtent b="0" l="0" r="0" t="0"/>
-                  <wp:docPr descr="" title="" id="216" name="Picture"/>
+                  <wp:docPr descr="" title="" id="215" name="Picture"/>
                   <a:graphic>
                     <a:graphicData uri="http://schemas.openxmlformats.org/drawingml/2006/picture">
                       <pic:pic>
                         <pic:nvPicPr>
-                          <pic:cNvPr descr="/opt/quarto/share/formats/docx/important.png" id="217" name="Picture"/>
+                          <pic:cNvPr descr="/opt/quarto/share/formats/docx/important.png" id="216" name="Picture"/>
                           <pic:cNvPicPr>
                             <a:picLocks noChangeArrowheads="1" noChangeAspect="1"/>
                           </pic:cNvPicPr>
@@ -26007,8 +26007,8 @@
         </w:tc>
       </w:tr>
     </w:tbl>
-    <w:bookmarkEnd w:id="218"/>
-    <w:bookmarkStart w:id="221" w:name="hardware-tiers"/>
+    <w:bookmarkEnd w:id="217"/>
+    <w:bookmarkStart w:id="220" w:name="hardware-tiers"/>
     <w:p>
       <w:pPr>
         <w:pStyle w:val="Heading4"/>
@@ -26328,12 +26328,12 @@
                 <wp:inline>
                   <wp:extent cx="152400" cy="152400"/>
                   <wp:effectExtent b="0" l="0" r="0" t="0"/>
-                  <wp:docPr descr="" title="" id="219" name="Picture"/>
+                  <wp:docPr descr="" title="" id="218" name="Picture"/>
                   <a:graphic>
                     <a:graphicData uri="http://schemas.openxmlformats.org/drawingml/2006/picture">
                       <pic:pic>
                         <pic:nvPicPr>
-                          <pic:cNvPr descr="/opt/quarto/share/formats/docx/warning.png" id="220" name="Picture"/>
+                          <pic:cNvPr descr="/opt/quarto/share/formats/docx/warning.png" id="219" name="Picture"/>
                           <pic:cNvPicPr>
                             <a:picLocks noChangeArrowheads="1" noChangeAspect="1"/>
                           </pic:cNvPicPr>
@@ -26631,8 +26631,8 @@
         </w:tc>
       </w:tr>
     </w:tbl>
-    <w:bookmarkEnd w:id="221"/>
-    <w:bookmarkStart w:id="224" w:name="action-latency-and-memory-bandwidth"/>
+    <w:bookmarkEnd w:id="220"/>
+    <w:bookmarkStart w:id="223" w:name="action-latency-and-memory-bandwidth"/>
     <w:p>
       <w:pPr>
         <w:pStyle w:val="Heading4"/>
@@ -27339,12 +27339,12 @@
                 <wp:inline>
                   <wp:extent cx="152400" cy="152400"/>
                   <wp:effectExtent b="0" l="0" r="0" t="0"/>
-                  <wp:docPr descr="" title="" id="222" name="Picture"/>
+                  <wp:docPr descr="" title="" id="221" name="Picture"/>
                   <a:graphic>
                     <a:graphicData uri="http://schemas.openxmlformats.org/drawingml/2006/picture">
                       <pic:pic>
                         <pic:nvPicPr>
-                          <pic:cNvPr descr="/opt/quarto/share/formats/docx/note.png" id="223" name="Picture"/>
+                          <pic:cNvPr descr="/opt/quarto/share/formats/docx/note.png" id="222" name="Picture"/>
                           <pic:cNvPicPr>
                             <a:picLocks noChangeArrowheads="1" noChangeAspect="1"/>
                           </pic:cNvPicPr>
@@ -27474,8 +27474,8 @@
         </w:tc>
       </w:tr>
     </w:tbl>
-    <w:bookmarkEnd w:id="224"/>
-    <w:bookmarkStart w:id="225" w:name="X58a4330bb9d721536d3df1abbb820879339bea7"/>
+    <w:bookmarkEnd w:id="223"/>
+    <w:bookmarkStart w:id="224" w:name="X58a4330bb9d721536d3df1abbb820879339bea7"/>
     <w:p>
       <w:pPr>
         <w:pStyle w:val="Heading4"/>
@@ -27765,8 +27765,8 @@
         <w:t xml:space="preserve">Feeds the command outputs back into the conversation context as tool messages.</w:t>
       </w:r>
     </w:p>
-    <w:bookmarkEnd w:id="225"/>
-    <w:bookmarkStart w:id="226" w:name="X98fbc317b6061ff02292f6372a6a1c929c09878"/>
+    <w:bookmarkEnd w:id="224"/>
+    <w:bookmarkStart w:id="225" w:name="X98fbc317b6061ff02292f6372a6a1c929c09878"/>
     <w:p>
       <w:pPr>
         <w:pStyle w:val="Heading4"/>
@@ -28043,8 +28043,8 @@
         <w:t xml:space="preserve">) in favor of immediate tool invocation.</w:t>
       </w:r>
     </w:p>
-    <w:bookmarkEnd w:id="226"/>
-    <w:bookmarkStart w:id="227" w:name="X97e83cd81a11ec4a50ee2033f7ad0a1c352c515"/>
+    <w:bookmarkEnd w:id="225"/>
+    <w:bookmarkStart w:id="226" w:name="X97e83cd81a11ec4a50ee2033f7ad0a1c352c515"/>
     <w:p>
       <w:pPr>
         <w:pStyle w:val="Heading4"/>
@@ -28436,8 +28436,8 @@
         <w:t xml:space="preserve">and the loop still needs a way to catch that.</w:t>
       </w:r>
     </w:p>
-    <w:bookmarkEnd w:id="227"/>
-    <w:bookmarkStart w:id="230" w:name="guardrails-for-autonomy"/>
+    <w:bookmarkEnd w:id="226"/>
+    <w:bookmarkStart w:id="229" w:name="guardrails-for-autonomy"/>
     <w:p>
       <w:pPr>
         <w:pStyle w:val="Heading4"/>
@@ -28487,12 +28487,12 @@
                 <wp:inline>
                   <wp:extent cx="152400" cy="152400"/>
                   <wp:effectExtent b="0" l="0" r="0" t="0"/>
-                  <wp:docPr descr="" title="" id="228" name="Picture"/>
+                  <wp:docPr descr="" title="" id="227" name="Picture"/>
                   <a:graphic>
                     <a:graphicData uri="http://schemas.openxmlformats.org/drawingml/2006/picture">
                       <pic:pic>
                         <pic:nvPicPr>
-                          <pic:cNvPr descr="/opt/quarto/share/formats/docx/important.png" id="229" name="Picture"/>
+                          <pic:cNvPr descr="/opt/quarto/share/formats/docx/important.png" id="228" name="Picture"/>
                           <pic:cNvPicPr>
                             <a:picLocks noChangeArrowheads="1" noChangeAspect="1"/>
                           </pic:cNvPicPr>
@@ -29229,8 +29229,8 @@
         <w:t xml:space="preserve">below.</w:t>
       </w:r>
     </w:p>
-    <w:bookmarkEnd w:id="230"/>
-    <w:bookmarkStart w:id="231" w:name="stack-specific-notes"/>
+    <w:bookmarkEnd w:id="229"/>
+    <w:bookmarkStart w:id="230" w:name="stack-specific-notes"/>
     <w:p>
       <w:pPr>
         <w:pStyle w:val="Heading4"/>
@@ -29603,8 +29603,8 @@
         <w:t xml:space="preserve">Markdown fix run unattended.</w:t>
       </w:r>
     </w:p>
-    <w:bookmarkEnd w:id="231"/>
-    <w:bookmarkStart w:id="233" w:name="fine-tuning-closing-the-idiom-gap"/>
+    <w:bookmarkEnd w:id="230"/>
+    <w:bookmarkStart w:id="232" w:name="fine-tuning-closing-the-idiom-gap"/>
     <w:p>
       <w:pPr>
         <w:pStyle w:val="Heading4"/>
@@ -29839,7 +29839,7 @@
       <w:r>
         <w:t xml:space="preserve"> </w:t>
       </w:r>
-      <w:hyperlink r:id="rId232">
+      <w:hyperlink r:id="rId231">
         <w:r>
           <w:rPr>
             <w:rStyle w:val="Hyperlink"/>
@@ -29928,8 +29928,8 @@
         <w:t xml:space="preserve">performs on the next genuinely new task.</w:t>
       </w:r>
     </w:p>
-    <w:bookmarkEnd w:id="233"/>
-    <w:bookmarkStart w:id="236" w:name="companion-work"/>
+    <w:bookmarkEnd w:id="232"/>
+    <w:bookmarkStart w:id="235" w:name="companion-work"/>
     <w:p>
       <w:pPr>
         <w:pStyle w:val="Heading4"/>
@@ -29971,7 +29971,7 @@
           <w:numId w:val="1074"/>
         </w:numPr>
       </w:pPr>
-      <w:hyperlink r:id="rId234">
+      <w:hyperlink r:id="rId233">
         <w:r>
           <w:rPr>
             <w:rStyle w:val="VerbatimChar"/>
@@ -30041,7 +30041,7 @@
           <w:numId w:val="1074"/>
         </w:numPr>
       </w:pPr>
-      <w:hyperlink r:id="rId235">
+      <w:hyperlink r:id="rId234">
         <w:r>
           <w:rPr>
             <w:rStyle w:val="VerbatimChar"/>
@@ -30149,9 +30149,9 @@
         <w:t xml:space="preserve">bibliography DOIs</w:t>
       </w:r>
     </w:p>
+    <w:bookmarkEnd w:id="235"/>
     <w:bookmarkEnd w:id="236"/>
-    <w:bookmarkEnd w:id="237"/>
-    <w:bookmarkStart w:id="250" w:name="sec-ai-copilot-settings"/>
+    <w:bookmarkStart w:id="249" w:name="sec-ai-copilot-settings"/>
     <w:p>
       <w:pPr>
         <w:pStyle w:val="Heading1"/>
@@ -30186,7 +30186,7 @@
         <w:t xml:space="preserve">and provides guidance on which options to enable based on your use case.</w:t>
       </w:r>
     </w:p>
-    <w:bookmarkStart w:id="241" w:name="model-selection-options"/>
+    <w:bookmarkStart w:id="240" w:name="model-selection-options"/>
     <w:p>
       <w:pPr>
         <w:pStyle w:val="Heading4"/>
@@ -30635,7 +30635,7 @@
       <w:r>
         <w:t xml:space="preserve"> </w:t>
       </w:r>
-      <w:hyperlink r:id="rId238">
+      <w:hyperlink r:id="rId237">
         <w:r>
           <w:rPr>
             <w:rStyle w:val="VerbatimChar"/>
@@ -30679,7 +30679,7 @@
       <w:r>
         <w:t xml:space="preserve"> </w:t>
       </w:r>
-      <w:hyperlink r:id="rId239">
+      <w:hyperlink r:id="rId238">
         <w:r>
           <w:rPr>
             <w:rStyle w:val="Hyperlink"/>
@@ -30717,7 +30717,7 @@
       <w:r>
         <w:t xml:space="preserve"> </w:t>
       </w:r>
-      <w:hyperlink r:id="rId240">
+      <w:hyperlink r:id="rId239">
         <w:r>
           <w:rPr>
             <w:rStyle w:val="Hyperlink"/>
@@ -31020,8 +31020,8 @@
         <w:t xml:space="preserve">: Specific scenarios where variant optimizations matter</w:t>
       </w:r>
     </w:p>
-    <w:bookmarkEnd w:id="241"/>
-    <w:bookmarkStart w:id="246" w:name="connecting-positron-assistant-to-openai"/>
+    <w:bookmarkEnd w:id="240"/>
+    <w:bookmarkStart w:id="245" w:name="connecting-positron-assistant-to-openai"/>
     <w:p>
       <w:pPr>
         <w:pStyle w:val="Heading4"/>
@@ -31066,7 +31066,7 @@
       <w:r>
         <w:t xml:space="preserve"> </w:t>
       </w:r>
-      <w:hyperlink r:id="rId242">
+      <w:hyperlink r:id="rId241">
         <w:r>
           <w:rPr>
             <w:rStyle w:val="Hyperlink"/>
@@ -31222,7 +31222,7 @@
       <w:r>
         <w:t xml:space="preserve"> </w:t>
       </w:r>
-      <w:hyperlink r:id="rId243">
+      <w:hyperlink r:id="rId242">
         <w:r>
           <w:rPr>
             <w:rStyle w:val="Hyperlink"/>
@@ -31274,7 +31274,7 @@
       <w:r>
         <w:t xml:space="preserve"> </w:t>
       </w:r>
-      <w:hyperlink r:id="rId243">
+      <w:hyperlink r:id="rId242">
         <w:r>
           <w:rPr>
             <w:rStyle w:val="Hyperlink"/>
@@ -31288,7 +31288,7 @@
       <w:r>
         <w:t xml:space="preserve"> </w:t>
       </w:r>
-      <w:hyperlink r:id="rId244">
+      <w:hyperlink r:id="rId243">
         <w:r>
           <w:rPr>
             <w:rStyle w:val="Hyperlink"/>
@@ -31302,7 +31302,7 @@
       <w:r>
         <w:t xml:space="preserve"> </w:t>
       </w:r>
-      <w:hyperlink r:id="rId245">
+      <w:hyperlink r:id="rId244">
         <w:r>
           <w:rPr>
             <w:rStyle w:val="Hyperlink"/>
@@ -31571,8 +31571,8 @@
         <w:t xml:space="preserve">enabled for quick inline completions.</w:t>
       </w:r>
     </w:p>
-    <w:bookmarkEnd w:id="246"/>
-    <w:bookmarkStart w:id="247" w:name="feature-settings"/>
+    <w:bookmarkEnd w:id="245"/>
+    <w:bookmarkStart w:id="246" w:name="feature-settings"/>
     <w:p>
       <w:pPr>
         <w:pStyle w:val="Heading4"/>
@@ -32326,8 +32326,8 @@
         <w:t xml:space="preserve">for access to current information</w:t>
       </w:r>
     </w:p>
-    <w:bookmarkEnd w:id="247"/>
-    <w:bookmarkStart w:id="248" w:name="advanced-settings"/>
+    <w:bookmarkEnd w:id="246"/>
+    <w:bookmarkStart w:id="247" w:name="advanced-settings"/>
     <w:p>
       <w:pPr>
         <w:pStyle w:val="Heading4"/>
@@ -33393,8 +33393,8 @@
         <w:t xml:space="preserve">for sharing capability</w:t>
       </w:r>
     </w:p>
-    <w:bookmarkEnd w:id="248"/>
-    <w:bookmarkStart w:id="249" w:name="summary-of-recommended-settings"/>
+    <w:bookmarkEnd w:id="247"/>
+    <w:bookmarkStart w:id="248" w:name="summary-of-recommended-settings"/>
     <w:p>
       <w:pPr>
         <w:pStyle w:val="Heading4"/>
@@ -33655,9 +33655,9 @@
         <w:t xml:space="preserve">).</w:t>
       </w:r>
     </w:p>
+    <w:bookmarkEnd w:id="248"/>
     <w:bookmarkEnd w:id="249"/>
-    <w:bookmarkEnd w:id="250"/>
-    <w:bookmarkStart w:id="270" w:name="sec-ai-byok-vscode"/>
+    <w:bookmarkStart w:id="269" w:name="sec-ai-byok-vscode"/>
     <w:p>
       <w:pPr>
         <w:pStyle w:val="Heading1"/>
@@ -33718,7 +33718,7 @@
       <w:r>
         <w:t xml:space="preserve"> </w:t>
       </w:r>
-      <w:hyperlink r:id="rId251">
+      <w:hyperlink r:id="rId250">
         <w:r>
           <w:rPr>
             <w:rStyle w:val="VerbatimChar"/>
@@ -33750,7 +33750,7 @@
         <w:t xml:space="preserve">and three more that do not.</w:t>
       </w:r>
     </w:p>
-    <w:bookmarkStart w:id="253" w:name="wiring-the-extension-to-databricks"/>
+    <w:bookmarkStart w:id="252" w:name="wiring-the-extension-to-databricks"/>
     <w:p>
       <w:pPr>
         <w:pStyle w:val="Heading4"/>
@@ -35063,7 +35063,7 @@
       <w:r>
         <w:t xml:space="preserve"> </w:t>
       </w:r>
-      <w:hyperlink r:id="rId252">
+      <w:hyperlink r:id="rId251">
         <w:r>
           <w:rPr>
             <w:rStyle w:val="Hyperlink"/>
@@ -35252,8 +35252,8 @@
         <w:t xml:space="preserve">header.</w:t>
       </w:r>
     </w:p>
-    <w:bookmarkEnd w:id="253"/>
-    <w:bookmarkStart w:id="256" w:name="sizing-context-and-output-limits"/>
+    <w:bookmarkEnd w:id="252"/>
+    <w:bookmarkStart w:id="255" w:name="sizing-context-and-output-limits"/>
     <w:p>
       <w:pPr>
         <w:pStyle w:val="Heading4"/>
@@ -35498,7 +35498,7 @@
       <w:r>
         <w:t xml:space="preserve"> </w:t>
       </w:r>
-      <w:hyperlink r:id="rId254">
+      <w:hyperlink r:id="rId253">
         <w:r>
           <w:rPr>
             <w:rStyle w:val="Hyperlink"/>
@@ -35599,7 +35599,7 @@
       <w:tr>
         <w:tc>
           <w:tcPr/>
-          <w:bookmarkStart w:id="255" w:name="tbl-databricks-oaicopilot-defaults"/>
+          <w:bookmarkStart w:id="254" w:name="tbl-databricks-oaicopilot-defaults"/>
           <w:p>
             <w:pPr>
               <w:jc w:val="center"/>
@@ -36225,7 +36225,7 @@
               </w:tc>
             </w:tr>
           </w:tbl>
-          <w:bookmarkEnd w:id="255"/>
+          <w:bookmarkEnd w:id="254"/>
           <w:p/>
         </w:tc>
       </w:tr>
@@ -36376,8 +36376,8 @@
         <w:t xml:space="preserve">after checking their actual quota.</w:t>
       </w:r>
     </w:p>
-    <w:bookmarkEnd w:id="256"/>
-    <w:bookmarkStart w:id="258" w:name="X4ffc414c72f461a5c730b8d4c31add4bb84ada1"/>
+    <w:bookmarkEnd w:id="255"/>
+    <w:bookmarkStart w:id="257" w:name="X4ffc414c72f461a5c730b8d4c31add4bb84ada1"/>
     <w:p>
       <w:pPr>
         <w:pStyle w:val="Heading4"/>
@@ -36625,7 +36625,7 @@
       <w:tr>
         <w:tc>
           <w:tcPr/>
-          <w:bookmarkStart w:id="257" w:name="tbl-databricks-itpm-pacing"/>
+          <w:bookmarkStart w:id="256" w:name="tbl-databricks-itpm-pacing"/>
           <w:p>
             <w:pPr>
               <w:jc w:val="center"/>
@@ -36867,7 +36867,7 @@
               </w:tc>
             </w:tr>
           </w:tbl>
-          <w:bookmarkEnd w:id="257"/>
+          <w:bookmarkEnd w:id="256"/>
           <w:p/>
         </w:tc>
       </w:tr>
@@ -36928,8 +36928,8 @@
         <w:t xml:space="preserve">and it is not available at that quota.</w:t>
       </w:r>
     </w:p>
-    <w:bookmarkEnd w:id="258"/>
-    <w:bookmarkStart w:id="259" w:name="choosing-a-model-for-agent-mode"/>
+    <w:bookmarkEnd w:id="257"/>
+    <w:bookmarkStart w:id="258" w:name="choosing-a-model-for-agent-mode"/>
     <w:p>
       <w:pPr>
         <w:pStyle w:val="Heading4"/>
@@ -37679,8 +37679,8 @@
         <w:t xml:space="preserve">Observed 2026-08-20.</w:t>
       </w:r>
     </w:p>
-    <w:bookmarkEnd w:id="259"/>
-    <w:bookmarkStart w:id="266" w:name="Xeefb66738a7cdd8d123f77fc3c435ee9098e612"/>
+    <w:bookmarkEnd w:id="258"/>
+    <w:bookmarkStart w:id="265" w:name="Xeefb66738a7cdd8d123f77fc3c435ee9098e612"/>
     <w:p>
       <w:pPr>
         <w:pStyle w:val="Heading4"/>
@@ -38609,12 +38609,12 @@
                 <wp:inline>
                   <wp:extent cx="152400" cy="152400"/>
                   <wp:effectExtent b="0" l="0" r="0" t="0"/>
-                  <wp:docPr descr="" title="" id="260" name="Picture"/>
+                  <wp:docPr descr="" title="" id="259" name="Picture"/>
                   <a:graphic>
                     <a:graphicData uri="http://schemas.openxmlformats.org/drawingml/2006/picture">
                       <pic:pic>
                         <pic:nvPicPr>
-                          <pic:cNvPr descr="/opt/quarto/share/formats/docx/tip.png" id="261" name="Picture"/>
+                          <pic:cNvPr descr="/opt/quarto/share/formats/docx/tip.png" id="260" name="Picture"/>
                           <pic:cNvPicPr>
                             <a:picLocks noChangeArrowheads="1" noChangeAspect="1"/>
                           </pic:cNvPicPr>
@@ -38763,12 +38763,12 @@
                 <wp:inline>
                   <wp:extent cx="152400" cy="152400"/>
                   <wp:effectExtent b="0" l="0" r="0" t="0"/>
-                  <wp:docPr descr="" title="" id="262" name="Picture"/>
+                  <wp:docPr descr="" title="" id="261" name="Picture"/>
                   <a:graphic>
                     <a:graphicData uri="http://schemas.openxmlformats.org/drawingml/2006/picture">
                       <pic:pic>
                         <pic:nvPicPr>
-                          <pic:cNvPr descr="/opt/quarto/share/formats/docx/important.png" id="263" name="Picture"/>
+                          <pic:cNvPr descr="/opt/quarto/share/formats/docx/important.png" id="262" name="Picture"/>
                           <pic:cNvPicPr>
                             <a:picLocks noChangeArrowheads="1" noChangeAspect="1"/>
                           </pic:cNvPicPr>
@@ -39082,12 +39082,12 @@
                 <wp:inline>
                   <wp:extent cx="152400" cy="152400"/>
                   <wp:effectExtent b="0" l="0" r="0" t="0"/>
-                  <wp:docPr descr="" title="" id="264" name="Picture"/>
+                  <wp:docPr descr="" title="" id="263" name="Picture"/>
                   <a:graphic>
                     <a:graphicData uri="http://schemas.openxmlformats.org/drawingml/2006/picture">
                       <pic:pic>
                         <pic:nvPicPr>
-                          <pic:cNvPr descr="/opt/quarto/share/formats/docx/important.png" id="265" name="Picture"/>
+                          <pic:cNvPr descr="/opt/quarto/share/formats/docx/important.png" id="264" name="Picture"/>
                           <pic:cNvPicPr>
                             <a:picLocks noChangeArrowheads="1" noChangeAspect="1"/>
                           </pic:cNvPicPr>
@@ -39510,8 +39510,8 @@
         </w:tc>
       </w:tr>
     </w:tbl>
-    <w:bookmarkEnd w:id="266"/>
-    <w:bookmarkStart w:id="269" w:name="X2af9a430a52e3ae5bb0cdcfef1e620fec8864fe"/>
+    <w:bookmarkEnd w:id="265"/>
+    <w:bookmarkStart w:id="268" w:name="X2af9a430a52e3ae5bb0cdcfef1e620fec8864fe"/>
     <w:p>
       <w:pPr>
         <w:pStyle w:val="Heading4"/>
@@ -40379,12 +40379,12 @@
                 <wp:inline>
                   <wp:extent cx="152400" cy="152400"/>
                   <wp:effectExtent b="0" l="0" r="0" t="0"/>
-                  <wp:docPr descr="" title="" id="267" name="Picture"/>
+                  <wp:docPr descr="" title="" id="266" name="Picture"/>
                   <a:graphic>
                     <a:graphicData uri="http://schemas.openxmlformats.org/drawingml/2006/picture">
                       <pic:pic>
                         <pic:nvPicPr>
-                          <pic:cNvPr descr="/opt/quarto/share/formats/docx/note.png" id="268" name="Picture"/>
+                          <pic:cNvPr descr="/opt/quarto/share/formats/docx/note.png" id="267" name="Picture"/>
                           <pic:cNvPicPr>
                             <a:picLocks noChangeArrowheads="1" noChangeAspect="1"/>
                           </pic:cNvPicPr>
@@ -40541,9 +40541,9 @@
         </w:tc>
       </w:tr>
     </w:tbl>
+    <w:bookmarkEnd w:id="268"/>
     <w:bookmarkEnd w:id="269"/>
-    <w:bookmarkEnd w:id="270"/>
-    <w:bookmarkStart w:id="284" w:name="configuring-the-agent-environment"/>
+    <w:bookmarkStart w:id="283" w:name="configuring-the-agent-environment"/>
     <w:p>
       <w:pPr>
         <w:pStyle w:val="Heading1"/>
@@ -40599,7 +40599,7 @@
         <w:t xml:space="preserve">so that Copilot can build, test, and lint your code more reliably.</w:t>
       </w:r>
     </w:p>
-    <w:bookmarkStart w:id="271" w:name="why-configure-the-environment"/>
+    <w:bookmarkStart w:id="270" w:name="why-configure-the-environment"/>
     <w:p>
       <w:pPr>
         <w:pStyle w:val="Heading4"/>
@@ -40682,8 +40682,8 @@
         <w:t xml:space="preserve">Consistent development environment across all agent sessions</w:t>
       </w:r>
     </w:p>
-    <w:bookmarkEnd w:id="271"/>
-    <w:bookmarkStart w:id="272" w:name="file-location-and-structure"/>
+    <w:bookmarkEnd w:id="270"/>
+    <w:bookmarkStart w:id="271" w:name="file-location-and-structure"/>
     <w:p>
       <w:pPr>
         <w:pStyle w:val="Heading4"/>
@@ -40752,8 +40752,8 @@
         <w:t xml:space="preserve">.</w:t>
       </w:r>
     </w:p>
-    <w:bookmarkEnd w:id="272"/>
-    <w:bookmarkStart w:id="274" w:name="basic-configuration-example"/>
+    <w:bookmarkEnd w:id="271"/>
+    <w:bookmarkStart w:id="273" w:name="basic-configuration-example"/>
     <w:p>
       <w:pPr>
         <w:pStyle w:val="Heading4"/>
@@ -40772,7 +40772,7 @@
       <w:r>
         <w:t xml:space="preserve"> </w:t>
       </w:r>
-      <w:hyperlink r:id="rId273">
+      <w:hyperlink r:id="rId272">
         <w:r>
           <w:rPr>
             <w:rStyle w:val="VerbatimChar"/>
@@ -40787,8 +40787,8 @@
         <w:t xml:space="preserve">for a configuration adapted for R and Quarto projects.</w:t>
       </w:r>
     </w:p>
-    <w:bookmarkEnd w:id="274"/>
-    <w:bookmarkStart w:id="277" w:name="using-actionscheckout"/>
+    <w:bookmarkEnd w:id="273"/>
+    <w:bookmarkStart w:id="276" w:name="using-actionscheckout"/>
     <w:p>
       <w:pPr>
         <w:pStyle w:val="Heading4"/>
@@ -40816,7 +40816,7 @@
       <w:r>
         <w:t xml:space="preserve"> </w:t>
       </w:r>
-      <w:hyperlink r:id="rId275">
+      <w:hyperlink r:id="rId274">
         <w:r>
           <w:rPr>
             <w:rStyle w:val="VerbatimChar"/>
@@ -41155,7 +41155,7 @@
       <w:r>
         <w:t xml:space="preserve"> </w:t>
       </w:r>
-      <w:hyperlink r:id="rId276">
+      <w:hyperlink r:id="rId275">
         <w:r>
           <w:rPr>
             <w:rStyle w:val="Hyperlink"/>
@@ -41223,8 +41223,8 @@
         <w:t xml:space="preserve">including comparing changes and understanding the context of your pull request.</w:t>
       </w:r>
     </w:p>
-    <w:bookmarkEnd w:id="277"/>
-    <w:bookmarkStart w:id="278" w:name="configurable-options"/>
+    <w:bookmarkEnd w:id="276"/>
+    <w:bookmarkStart w:id="277" w:name="configurable-options"/>
     <w:p>
       <w:pPr>
         <w:pStyle w:val="Heading4"/>
@@ -41390,8 +41390,8 @@
         <w:t xml:space="preserve">All other workflow settings are ignored by Copilot.</w:t>
       </w:r>
     </w:p>
-    <w:bookmarkEnd w:id="278"/>
-    <w:bookmarkStart w:id="279" w:name="common-setup-tasks"/>
+    <w:bookmarkEnd w:id="277"/>
+    <w:bookmarkStart w:id="278" w:name="common-setup-tasks"/>
     <w:p>
       <w:pPr>
         <w:pStyle w:val="Heading4"/>
@@ -42006,8 +42006,8 @@
         <w:t xml:space="preserve"> r-lib/actions/setup-renv@v2</w:t>
       </w:r>
     </w:p>
-    <w:bookmarkEnd w:id="279"/>
-    <w:bookmarkStart w:id="280" w:name="environment-variables-and-secrets"/>
+    <w:bookmarkEnd w:id="278"/>
+    <w:bookmarkStart w:id="279" w:name="environment-variables-and-secrets"/>
     <w:p>
       <w:pPr>
         <w:pStyle w:val="Heading4"/>
@@ -42115,8 +42115,8 @@
         <w:t xml:space="preserve">Use secrets for sensitive values like API keys or passwords.</w:t>
       </w:r>
     </w:p>
-    <w:bookmarkEnd w:id="280"/>
-    <w:bookmarkStart w:id="281" w:name="testing-your-configuration"/>
+    <w:bookmarkEnd w:id="279"/>
+    <w:bookmarkStart w:id="280" w:name="testing-your-configuration"/>
     <w:p>
       <w:pPr>
         <w:pStyle w:val="Heading4"/>
@@ -42211,8 +42211,8 @@
         <w:t xml:space="preserve">and begin working with the current environment state.</w:t>
       </w:r>
     </w:p>
-    <w:bookmarkEnd w:id="281"/>
-    <w:bookmarkStart w:id="282" w:name="advanced-configuration"/>
+    <w:bookmarkEnd w:id="280"/>
+    <w:bookmarkStart w:id="281" w:name="advanced-configuration"/>
     <w:p>
       <w:pPr>
         <w:pStyle w:val="Heading4"/>
@@ -42532,8 +42532,8 @@
         <w:t xml:space="preserve">true</w:t>
       </w:r>
     </w:p>
-    <w:bookmarkEnd w:id="282"/>
-    <w:bookmarkStart w:id="283" w:name="further-reading-1"/>
+    <w:bookmarkEnd w:id="281"/>
+    <w:bookmarkStart w:id="282" w:name="further-reading-1"/>
     <w:p>
       <w:pPr>
         <w:pStyle w:val="Heading4"/>
@@ -42558,7 +42558,7 @@
       <w:r>
         <w:t xml:space="preserve"> </w:t>
       </w:r>
-      <w:hyperlink r:id="rId276">
+      <w:hyperlink r:id="rId275">
         <w:r>
           <w:rPr>
             <w:rStyle w:val="Hyperlink"/>
@@ -42570,9 +42570,9 @@
         <w:t xml:space="preserve">.</w:t>
       </w:r>
     </w:p>
+    <w:bookmarkEnd w:id="282"/>
     <w:bookmarkEnd w:id="283"/>
-    <w:bookmarkEnd w:id="284"/>
-    <w:bookmarkStart w:id="292" w:name="sec-ai-agent-skills"/>
+    <w:bookmarkStart w:id="291" w:name="sec-ai-agent-skills"/>
     <w:p>
       <w:pPr>
         <w:pStyle w:val="Heading1"/>
@@ -42585,7 +42585,7 @@
       <w:pPr>
         <w:pStyle w:val="FirstParagraph"/>
       </w:pPr>
-      <w:hyperlink r:id="rId285">
+      <w:hyperlink r:id="rId284">
         <w:r>
           <w:rPr>
             <w:rStyle w:val="Hyperlink"/>
@@ -42620,7 +42620,7 @@
       <w:r>
         <w:t xml:space="preserve"> </w:t>
       </w:r>
-      <w:hyperlink r:id="rId286">
+      <w:hyperlink r:id="rId285">
         <w:r>
           <w:rPr>
             <w:rStyle w:val="Hyperlink"/>
@@ -42641,7 +42641,7 @@
         <w:t xml:space="preserve">tool-agnostic format that any compatible agent can load.</w:t>
       </w:r>
     </w:p>
-    <w:bookmarkStart w:id="287" w:name="what-is-a-skill"/>
+    <w:bookmarkStart w:id="286" w:name="what-is-a-skill"/>
     <w:p>
       <w:pPr>
         <w:pStyle w:val="Heading4"/>
@@ -42711,7 +42711,7 @@
       <w:r>
         <w:t xml:space="preserve"> </w:t>
       </w:r>
-      <w:hyperlink r:id="rId286">
+      <w:hyperlink r:id="rId285">
         <w:r>
           <w:rPr>
             <w:rStyle w:val="Hyperlink"/>
@@ -42818,8 +42818,8 @@
         <w:t xml:space="preserve">└── assets/           # Optional: templates, resources</w:t>
       </w:r>
     </w:p>
-    <w:bookmarkEnd w:id="287"/>
-    <w:bookmarkStart w:id="288" w:name="how-agents-load-skills"/>
+    <w:bookmarkEnd w:id="286"/>
+    <w:bookmarkStart w:id="287" w:name="how-agents-load-skills"/>
     <w:p>
       <w:pPr>
         <w:pStyle w:val="Heading4"/>
@@ -42962,8 +42962,8 @@
         <w:t xml:space="preserve">so agents can maintain many skills with a small context footprint.</w:t>
       </w:r>
     </w:p>
-    <w:bookmarkEnd w:id="288"/>
-    <w:bookmarkStart w:id="289" w:name="why-use-skills"/>
+    <w:bookmarkEnd w:id="287"/>
+    <w:bookmarkStart w:id="288" w:name="why-use-skills"/>
     <w:p>
       <w:pPr>
         <w:pStyle w:val="Heading4"/>
@@ -43049,8 +43049,8 @@
         <w:t xml:space="preserve">: Build a skill once and use it across any skills-compatible agent</w:t>
       </w:r>
     </w:p>
-    <w:bookmarkEnd w:id="289"/>
-    <w:bookmarkStart w:id="291" w:name="further-reading-2"/>
+    <w:bookmarkEnd w:id="288"/>
+    <w:bookmarkStart w:id="290" w:name="further-reading-2"/>
     <w:p>
       <w:pPr>
         <w:pStyle w:val="Heading4"/>
@@ -43075,7 +43075,7 @@
       <w:r>
         <w:t xml:space="preserve"> </w:t>
       </w:r>
-      <w:hyperlink r:id="rId285">
+      <w:hyperlink r:id="rId284">
         <w:r>
           <w:rPr>
             <w:rStyle w:val="Hyperlink"/>
@@ -43190,7 +43190,7 @@
       <w:r>
         <w:t xml:space="preserve"> </w:t>
       </w:r>
-      <w:hyperlink r:id="rId290">
+      <w:hyperlink r:id="rId289">
         <w:r>
           <w:rPr>
             <w:rStyle w:val="Hyperlink"/>
@@ -43217,9 +43217,9 @@
         <w:t xml:space="preserve">including user-level skills, hooks, and subagents, synced across machines via Git.</w:t>
       </w:r>
     </w:p>
+    <w:bookmarkEnd w:id="290"/>
     <w:bookmarkEnd w:id="291"/>
-    <w:bookmarkEnd w:id="292"/>
-    <w:bookmarkStart w:id="300" w:name="sec-ai-useful-plugins"/>
+    <w:bookmarkStart w:id="298" w:name="sec-ai-useful-plugins"/>
     <w:p>
       <w:pPr>
         <w:pStyle w:val="Heading1"/>
@@ -43238,7 +43238,7 @@
       <w:r>
         <w:t xml:space="preserve"> </w:t>
       </w:r>
-      <w:hyperlink r:id="rId293">
+      <w:hyperlink r:id="rId292">
         <w:r>
           <w:rPr>
             <w:rStyle w:val="Hyperlink"/>
@@ -43275,7 +43275,7 @@
       <w:pPr>
         <w:pStyle w:val="BodyText"/>
       </w:pPr>
-      <w:hyperlink r:id="rId294">
+      <w:hyperlink r:id="rId293">
         <w:r>
           <w:rPr>
             <w:rStyle w:val="Hyperlink"/>
@@ -43337,7 +43337,7 @@
       <w:r>
         <w:t xml:space="preserve"> </w:t>
       </w:r>
-      <w:hyperlink r:id="rId295">
+      <w:hyperlink r:id="rId294">
         <w:r>
           <w:rPr>
             <w:rStyle w:val="Hyperlink"/>
@@ -43409,7 +43409,7 @@
           <w:numId w:val="1121"/>
         </w:numPr>
       </w:pPr>
-      <w:hyperlink r:id="rId296">
+      <w:hyperlink r:id="rId295">
         <w:r>
           <w:rPr>
             <w:rStyle w:val="Hyperlink"/>
@@ -43469,7 +43469,7 @@
       <w:pPr>
         <w:pStyle w:val="BodyText"/>
       </w:pPr>
-      <w:hyperlink r:id="rId297">
+      <w:hyperlink r:id="rId296">
         <w:r>
           <w:rPr>
             <w:rStyle w:val="Hyperlink"/>
@@ -43673,7 +43673,7 @@
       <w:pPr>
         <w:pStyle w:val="BodyText"/>
       </w:pPr>
-      <w:hyperlink r:id="rId298">
+      <w:hyperlink r:id="rId297">
         <w:r>
           <w:rPr>
             <w:rStyle w:val="Hyperlink"/>
@@ -43764,7 +43764,7 @@
       <w:r>
         <w:t xml:space="preserve"> </w:t>
       </w:r>
-      <w:hyperlink r:id="rId290">
+      <w:hyperlink r:id="rId289">
         <w:r>
           <w:rPr>
             <w:rStyle w:val="VerbatimChar"/>
@@ -43773,24 +43773,7 @@
         </w:r>
       </w:hyperlink>
       <w:r>
-        <w:t xml:space="preserve"> </w:t>
-      </w:r>
-      <w:r>
-        <w:t xml:space="preserve">(the same repository as</w:t>
-      </w:r>
-      <w:r>
-        <w:t xml:space="preserve"> </w:t>
-      </w:r>
-      <w:hyperlink r:id="rId299">
-        <w:r>
-          <w:rPr>
-            <w:rStyle w:val="VerbatimChar"/>
-          </w:rPr>
-          <w:t xml:space="preserve">d-morrison/ai-config</w:t>
-        </w:r>
-      </w:hyperlink>
-      <w:r>
-        <w:t xml:space="preserve">).</w:t>
+        <w:t xml:space="preserve">.</w:t>
       </w:r>
       <w:r>
         <w:t xml:space="preserve"> </w:t>
@@ -43854,8 +43837,8 @@
         <w:t xml:space="preserve">is the worked example of what the corpus contains.</w:t>
       </w:r>
     </w:p>
-    <w:bookmarkEnd w:id="300"/>
-    <w:bookmarkStart w:id="320" w:name="sec-ai-customization"/>
+    <w:bookmarkEnd w:id="298"/>
+    <w:bookmarkStart w:id="318" w:name="sec-ai-customization"/>
     <w:p>
       <w:pPr>
         <w:pStyle w:val="Heading1"/>
@@ -43980,7 +43963,7 @@
         <w:t xml:space="preserve">.</w:t>
       </w:r>
     </w:p>
-    <w:bookmarkStart w:id="302" w:name="the-question-that-picks-the-mechanism"/>
+    <w:bookmarkStart w:id="300" w:name="the-question-that-picks-the-mechanism"/>
     <w:p>
       <w:pPr>
         <w:pStyle w:val="Heading4"/>
@@ -44081,7 +44064,7 @@
       <w:r>
         <w:t xml:space="preserve"> </w:t>
       </w:r>
-      <w:hyperlink r:id="rId301">
+      <w:hyperlink r:id="rId299">
         <w:r>
           <w:rPr>
             <w:rStyle w:val="Hyperlink"/>
@@ -44166,8 +44149,8 @@
         <w:t xml:space="preserve">.</w:t>
       </w:r>
     </w:p>
-    <w:bookmarkEnd w:id="302"/>
-    <w:bookmarkStart w:id="304" w:name="instruction-files-always-on-context"/>
+    <w:bookmarkEnd w:id="300"/>
+    <w:bookmarkStart w:id="302" w:name="instruction-files-always-on-context"/>
     <w:p>
       <w:pPr>
         <w:pStyle w:val="Heading4"/>
@@ -44271,7 +44254,7 @@
       <w:r>
         <w:t xml:space="preserve"> </w:t>
       </w:r>
-      <w:hyperlink r:id="rId301">
+      <w:hyperlink r:id="rId299">
         <w:r>
           <w:rPr>
             <w:rStyle w:val="Hyperlink"/>
@@ -44414,7 +44397,7 @@
       <w:r>
         <w:t xml:space="preserve"> </w:t>
       </w:r>
-      <w:hyperlink r:id="rId301">
+      <w:hyperlink r:id="rId299">
         <w:r>
           <w:rPr>
             <w:rStyle w:val="Hyperlink"/>
@@ -44518,7 +44501,7 @@
       <w:r>
         <w:t xml:space="preserve"> </w:t>
       </w:r>
-      <w:hyperlink r:id="rId303">
+      <w:hyperlink r:id="rId301">
         <w:r>
           <w:rPr>
             <w:rStyle w:val="Hyperlink"/>
@@ -44638,8 +44621,8 @@
         <w:t xml:space="preserve">and guaranteed nothing about acting on it alike.</w:t>
       </w:r>
     </w:p>
-    <w:bookmarkEnd w:id="304"/>
-    <w:bookmarkStart w:id="305" w:name="workspace-rules-and-activation-modes"/>
+    <w:bookmarkEnd w:id="302"/>
+    <w:bookmarkStart w:id="303" w:name="workspace-rules-and-activation-modes"/>
     <w:p>
       <w:pPr>
         <w:pStyle w:val="Heading4"/>
@@ -44908,8 +44891,8 @@
         <w:t xml:space="preserve">).</w:t>
       </w:r>
     </w:p>
-    <w:bookmarkEnd w:id="305"/>
-    <w:bookmarkStart w:id="308" w:name="skills-and-the-commands-that-became-them"/>
+    <w:bookmarkEnd w:id="303"/>
+    <w:bookmarkStart w:id="306" w:name="skills-and-the-commands-that-became-them"/>
     <w:p>
       <w:pPr>
         <w:pStyle w:val="Heading4"/>
@@ -44934,7 +44917,7 @@
       <w:r>
         <w:t xml:space="preserve"> </w:t>
       </w:r>
-      <w:hyperlink r:id="rId306">
+      <w:hyperlink r:id="rId304">
         <w:r>
           <w:rPr>
             <w:rStyle w:val="Hyperlink"/>
@@ -45373,7 +45356,7 @@
       <w:r>
         <w:t xml:space="preserve"> </w:t>
       </w:r>
-      <w:hyperlink r:id="rId286">
+      <w:hyperlink r:id="rId285">
         <w:r>
           <w:rPr>
             <w:rStyle w:val="Hyperlink"/>
@@ -45492,7 +45475,7 @@
       <w:r>
         <w:t xml:space="preserve"> </w:t>
       </w:r>
-      <w:hyperlink r:id="rId307">
+      <w:hyperlink r:id="rId305">
         <w:r>
           <w:rPr>
             <w:rStyle w:val="Hyperlink"/>
@@ -45558,8 +45541,8 @@
         <w:t xml:space="preserve">a competitor’s directory name.</w:t>
       </w:r>
     </w:p>
-    <w:bookmarkEnd w:id="308"/>
-    <w:bookmarkStart w:id="310" w:name="subagents-delegating-to-a-fresh-context"/>
+    <w:bookmarkEnd w:id="306"/>
+    <w:bookmarkStart w:id="308" w:name="subagents-delegating-to-a-fresh-context"/>
     <w:p>
       <w:pPr>
         <w:pStyle w:val="Heading4"/>
@@ -45708,7 +45691,7 @@
       <w:r>
         <w:t xml:space="preserve"> </w:t>
       </w:r>
-      <w:hyperlink r:id="rId309">
+      <w:hyperlink r:id="rId307">
         <w:r>
           <w:rPr>
             <w:rStyle w:val="Hyperlink"/>
@@ -45731,7 +45714,7 @@
       <w:r>
         <w:t xml:space="preserve"> </w:t>
       </w:r>
-      <w:hyperlink r:id="rId306">
+      <w:hyperlink r:id="rId304">
         <w:r>
           <w:rPr>
             <w:rStyle w:val="Hyperlink"/>
@@ -45796,8 +45779,8 @@
         <w:t xml:space="preserve">The @-mention controls which subagent Claude invokes, not what prompt it receives.</w:t>
       </w:r>
     </w:p>
-    <w:bookmarkEnd w:id="310"/>
-    <w:bookmarkStart w:id="312" w:name="Xf185306762ce2c53b5a7ee53d7e6e74f0af7607"/>
+    <w:bookmarkEnd w:id="308"/>
+    <w:bookmarkStart w:id="310" w:name="Xf185306762ce2c53b5a7ee53d7e6e74f0af7607"/>
     <w:p>
       <w:pPr>
         <w:pStyle w:val="Heading4"/>
@@ -45841,7 +45824,7 @@
       <w:r>
         <w:t xml:space="preserve"> </w:t>
       </w:r>
-      <w:hyperlink r:id="rId311">
+      <w:hyperlink r:id="rId309">
         <w:r>
           <w:rPr>
             <w:rStyle w:val="Hyperlink"/>
@@ -45876,7 +45859,7 @@
       <w:r>
         <w:t xml:space="preserve"> </w:t>
       </w:r>
-      <w:hyperlink r:id="rId301">
+      <w:hyperlink r:id="rId299">
         <w:r>
           <w:rPr>
             <w:rStyle w:val="Hyperlink"/>
@@ -46095,8 +46078,8 @@
         <w:t xml:space="preserve">hook decides.</w:t>
       </w:r>
     </w:p>
-    <w:bookmarkEnd w:id="312"/>
-    <w:bookmarkStart w:id="314" w:name="X661523c6623257371ddb85eca0962e6d24391f6"/>
+    <w:bookmarkEnd w:id="310"/>
+    <w:bookmarkStart w:id="312" w:name="X661523c6623257371ddb85eca0962e6d24391f6"/>
     <w:p>
       <w:pPr>
         <w:pStyle w:val="Heading4"/>
@@ -46178,7 +46161,7 @@
       <w:r>
         <w:t xml:space="preserve"> </w:t>
       </w:r>
-      <w:hyperlink r:id="rId313">
+      <w:hyperlink r:id="rId311">
         <w:r>
           <w:rPr>
             <w:rStyle w:val="Hyperlink"/>
@@ -46337,8 +46320,8 @@
         <w:t xml:space="preserve">a repository can tighten what you allow, and cannot quietly loosen it.</w:t>
       </w:r>
     </w:p>
-    <w:bookmarkEnd w:id="314"/>
-    <w:bookmarkStart w:id="315" w:name="Xb9141ee8bf4b59ff8b077a4423dd913151d282a"/>
+    <w:bookmarkEnd w:id="312"/>
+    <w:bookmarkStart w:id="313" w:name="Xb9141ee8bf4b59ff8b077a4423dd913151d282a"/>
     <w:p>
       <w:pPr>
         <w:pStyle w:val="Heading4"/>
@@ -46471,8 +46454,8 @@
         <w:t xml:space="preserve">covers configuration and its failure modes.</w:t>
       </w:r>
     </w:p>
-    <w:bookmarkEnd w:id="315"/>
-    <w:bookmarkStart w:id="316" w:name="choosing"/>
+    <w:bookmarkEnd w:id="313"/>
+    <w:bookmarkStart w:id="314" w:name="choosing"/>
     <w:p>
       <w:pPr>
         <w:pStyle w:val="Heading4"/>
@@ -46829,8 +46812,8 @@
         </w:tc>
       </w:tr>
     </w:tbl>
-    <w:bookmarkEnd w:id="316"/>
-    <w:bookmarkStart w:id="318" w:name="what-travels-between-tools"/>
+    <w:bookmarkEnd w:id="314"/>
+    <w:bookmarkStart w:id="316" w:name="what-travels-between-tools"/>
     <w:p>
       <w:pPr>
         <w:pStyle w:val="Heading4"/>
@@ -47283,7 +47266,7 @@
             <w:pPr>
               <w:pStyle w:val="Compact"/>
             </w:pPr>
-            <w:hyperlink r:id="rId317">
+            <w:hyperlink r:id="rId315">
               <w:r>
                 <w:rPr>
                   <w:rStyle w:val="Hyperlink"/>
@@ -47380,8 +47363,8 @@
         <w:t xml:space="preserve">and are worth writing as enforcement of rules that are also stated somewhere portable.</w:t>
       </w:r>
     </w:p>
-    <w:bookmarkEnd w:id="318"/>
-    <w:bookmarkStart w:id="319" w:name="a-worked-example"/>
+    <w:bookmarkEnd w:id="316"/>
+    <w:bookmarkStart w:id="317" w:name="a-worked-example"/>
     <w:p>
       <w:pPr>
         <w:pStyle w:val="Heading4"/>
@@ -47400,7 +47383,7 @@
       <w:r>
         <w:t xml:space="preserve"> </w:t>
       </w:r>
-      <w:hyperlink r:id="rId290">
+      <w:hyperlink r:id="rId289">
         <w:r>
           <w:rPr>
             <w:rStyle w:val="VerbatimChar"/>
@@ -47656,9 +47639,9 @@
         <w:t xml:space="preserve">globs attach them only when you edit a matching file.</w:t>
       </w:r>
     </w:p>
-    <w:bookmarkEnd w:id="319"/>
-    <w:bookmarkEnd w:id="320"/>
-    <w:bookmarkStart w:id="325" w:name="sec-ai-config-install"/>
+    <w:bookmarkEnd w:id="317"/>
+    <w:bookmarkEnd w:id="318"/>
+    <w:bookmarkStart w:id="323" w:name="sec-ai-config-install"/>
     <w:p>
       <w:pPr>
         <w:pStyle w:val="Heading1"/>
@@ -47764,7 +47747,7 @@
         <w:t xml:space="preserve">and a capability simply goes missing with no message that it existed.</w:t>
       </w:r>
     </w:p>
-    <w:bookmarkStart w:id="321" w:name="X09c076bdbd05e35ade785c409b9eb4387af137d"/>
+    <w:bookmarkStart w:id="319" w:name="X09c076bdbd05e35ade785c409b9eb4387af137d"/>
     <w:p>
       <w:pPr>
         <w:pStyle w:val="Heading4"/>
@@ -47998,8 +47981,8 @@
         <w:t xml:space="preserve">Pick one path.</w:t>
       </w:r>
     </w:p>
-    <w:bookmarkEnd w:id="321"/>
-    <w:bookmarkStart w:id="322" w:name="the-.claude-layout"/>
+    <w:bookmarkEnd w:id="319"/>
+    <w:bookmarkStart w:id="320" w:name="the-.claude-layout"/>
     <w:p>
       <w:pPr>
         <w:pStyle w:val="Heading4"/>
@@ -48244,8 +48227,8 @@
         <w:t xml:space="preserve">So verify both, and read the two results separately.</w:t>
       </w:r>
     </w:p>
-    <w:bookmarkEnd w:id="322"/>
-    <w:bookmarkStart w:id="323" w:name="one-plugin-per-capability"/>
+    <w:bookmarkEnd w:id="320"/>
+    <w:bookmarkStart w:id="321" w:name="one-plugin-per-capability"/>
     <w:p>
       <w:pPr>
         <w:pStyle w:val="Heading4"/>
@@ -48338,8 +48321,8 @@
         <w:t xml:space="preserve">Keep one copy enabled.</w:t>
       </w:r>
     </w:p>
-    <w:bookmarkEnd w:id="323"/>
-    <w:bookmarkStart w:id="324" w:name="failure-modes-and-their-symptoms"/>
+    <w:bookmarkEnd w:id="321"/>
+    <w:bookmarkStart w:id="322" w:name="failure-modes-and-their-symptoms"/>
     <w:p>
       <w:pPr>
         <w:pStyle w:val="Heading4"/>
@@ -48584,9 +48567,9 @@
         <w:t xml:space="preserve">suspect the install before you suspect the rule.</w:t>
       </w:r>
     </w:p>
-    <w:bookmarkEnd w:id="324"/>
-    <w:bookmarkEnd w:id="325"/>
-    <w:bookmarkStart w:id="332" w:name="sec-ai-claude-cloud-env"/>
+    <w:bookmarkEnd w:id="322"/>
+    <w:bookmarkEnd w:id="323"/>
+    <w:bookmarkStart w:id="330" w:name="sec-ai-claude-cloud-env"/>
     <w:p>
       <w:pPr>
         <w:pStyle w:val="Heading1"/>
@@ -48628,7 +48611,7 @@
       <w:r>
         <w:t xml:space="preserve"> </w:t>
       </w:r>
-      <w:hyperlink r:id="rId326">
+      <w:hyperlink r:id="rId324">
         <w:r>
           <w:rPr>
             <w:rStyle w:val="Hyperlink"/>
@@ -48826,7 +48809,7 @@
         <w:t xml:space="preserve">for example to install dependencies.</w:t>
       </w:r>
     </w:p>
-    <w:bookmarkStart w:id="331" w:name="X99b85cd9c84d17a9c31061ff898ea0b26b46932"/>
+    <w:bookmarkStart w:id="329" w:name="X99b85cd9c84d17a9c31061ff898ea0b26b46932"/>
     <w:p>
       <w:pPr>
         <w:pStyle w:val="Heading4"/>
@@ -48987,7 +48970,7 @@
       <w:r>
         <w:t xml:space="preserve"> </w:t>
       </w:r>
-      <w:hyperlink r:id="rId326">
+      <w:hyperlink r:id="rId324">
         <w:r>
           <w:rPr>
             <w:rStyle w:val="Hyperlink"/>
@@ -49082,12 +49065,12 @@
                 <wp:inline>
                   <wp:extent cx="152400" cy="152400"/>
                   <wp:effectExtent b="0" l="0" r="0" t="0"/>
-                  <wp:docPr descr="" title="" id="327" name="Picture"/>
+                  <wp:docPr descr="" title="" id="325" name="Picture"/>
                   <a:graphic>
                     <a:graphicData uri="http://schemas.openxmlformats.org/drawingml/2006/picture">
                       <pic:pic>
                         <pic:nvPicPr>
-                          <pic:cNvPr descr="/opt/quarto/share/formats/docx/note.png" id="328" name="Picture"/>
+                          <pic:cNvPr descr="/opt/quarto/share/formats/docx/note.png" id="326" name="Picture"/>
                           <pic:cNvPicPr>
                             <a:picLocks noChangeArrowheads="1" noChangeAspect="1"/>
                           </pic:cNvPicPr>
@@ -49203,7 +49186,7 @@
       <w:r>
         <w:t xml:space="preserve"> </w:t>
       </w:r>
-      <w:hyperlink r:id="rId329">
+      <w:hyperlink r:id="rId327">
         <w:r>
           <w:rPr>
             <w:rStyle w:val="Hyperlink"/>
@@ -49220,7 +49203,7 @@
       <w:r>
         <w:t xml:space="preserve"> </w:t>
       </w:r>
-      <w:hyperlink r:id="rId330">
+      <w:hyperlink r:id="rId328">
         <w:r>
           <w:rPr>
             <w:rStyle w:val="Hyperlink"/>
@@ -49232,9 +49215,9 @@
         <w:t xml:space="preserve">.</w:t>
       </w:r>
     </w:p>
-    <w:bookmarkEnd w:id="331"/>
-    <w:bookmarkEnd w:id="332"/>
-    <w:bookmarkStart w:id="339" w:name="sec-ai-codex-github-review"/>
+    <w:bookmarkEnd w:id="329"/>
+    <w:bookmarkEnd w:id="330"/>
+    <w:bookmarkStart w:id="337" w:name="sec-ai-codex-github-review"/>
     <w:p>
       <w:pPr>
         <w:pStyle w:val="Heading1"/>
@@ -49269,7 +49252,7 @@
         <w:t xml:space="preserve">It does not require you to build a separate GitHub Action.</w:t>
       </w:r>
     </w:p>
-    <w:bookmarkStart w:id="333" w:name="prerequisites"/>
+    <w:bookmarkStart w:id="331" w:name="prerequisites"/>
     <w:p>
       <w:pPr>
         <w:pStyle w:val="Heading4"/>
@@ -49394,8 +49377,8 @@
         <w:t xml:space="preserve">but it lets the reviewer follow repository-specific guidance.</w:t>
       </w:r>
     </w:p>
-    <w:bookmarkEnd w:id="333"/>
-    <w:bookmarkStart w:id="334" w:name="requesting-and-automating-reviews"/>
+    <w:bookmarkEnd w:id="331"/>
+    <w:bookmarkStart w:id="332" w:name="requesting-and-automating-reviews"/>
     <w:p>
       <w:pPr>
         <w:pStyle w:val="Heading4"/>
@@ -49546,8 +49529,8 @@
         <w:t xml:space="preserve">It can overlap with the general review’s security findings.</w:t>
       </w:r>
     </w:p>
-    <w:bookmarkEnd w:id="334"/>
-    <w:bookmarkStart w:id="335" w:name="Xcb3957535c68d0d36c3ddb2e418364eec25d64f"/>
+    <w:bookmarkEnd w:id="332"/>
+    <w:bookmarkStart w:id="333" w:name="Xcb3957535c68d0d36c3ddb2e418364eec25d64f"/>
     <w:p>
       <w:pPr>
         <w:pStyle w:val="Heading4"/>
@@ -49833,8 +49816,8 @@
         <w:t xml:space="preserve">both sides must permit the integration.</w:t>
       </w:r>
     </w:p>
-    <w:bookmarkEnd w:id="335"/>
-    <w:bookmarkStart w:id="336" w:name="X5db1f82696679006fc24d2d9f8d9499d172a6a5"/>
+    <w:bookmarkEnd w:id="333"/>
+    <w:bookmarkStart w:id="334" w:name="X5db1f82696679006fc24d2d9f8d9499d172a6a5"/>
     <w:p>
       <w:pPr>
         <w:pStyle w:val="Heading4"/>
@@ -49931,8 +49914,8 @@
         <w:t xml:space="preserve">Do not copy personal ChatGPT or Codex login credentials into CI secrets.</w:t>
       </w:r>
     </w:p>
-    <w:bookmarkEnd w:id="336"/>
-    <w:bookmarkStart w:id="338" w:name="adding-repository-specific-review-rules"/>
+    <w:bookmarkEnd w:id="334"/>
+    <w:bookmarkStart w:id="336" w:name="adding-repository-specific-review-rules"/>
     <w:p>
       <w:pPr>
         <w:pStyle w:val="Heading4"/>
@@ -50166,7 +50149,7 @@
       <w:r>
         <w:t xml:space="preserve"> </w:t>
       </w:r>
-      <w:hyperlink r:id="rId337">
+      <w:hyperlink r:id="rId335">
         <w:r>
           <w:rPr>
             <w:rStyle w:val="Hyperlink"/>
@@ -50178,9 +50161,9 @@
         <w:t xml:space="preserve">.</w:t>
       </w:r>
     </w:p>
-    <w:bookmarkEnd w:id="338"/>
-    <w:bookmarkEnd w:id="339"/>
-    <w:bookmarkStart w:id="354" w:name="sec-ai-claude-code-action-review"/>
+    <w:bookmarkEnd w:id="336"/>
+    <w:bookmarkEnd w:id="337"/>
+    <w:bookmarkStart w:id="352" w:name="sec-ai-claude-code-action-review"/>
     <w:p>
       <w:pPr>
         <w:pStyle w:val="Heading1"/>
@@ -50199,7 +50182,7 @@
       <w:r>
         <w:t xml:space="preserve"> </w:t>
       </w:r>
-      <w:hyperlink r:id="rId340">
+      <w:hyperlink r:id="rId338">
         <w:r>
           <w:rPr>
             <w:rStyle w:val="Hyperlink"/>
@@ -50305,7 +50288,7 @@
         <w:t xml:space="preserve">paths can move).</w:t>
       </w:r>
     </w:p>
-    <w:bookmarkStart w:id="344" w:name="one-action-many-behaviors"/>
+    <w:bookmarkStart w:id="342" w:name="one-action-many-behaviors"/>
     <w:p>
       <w:pPr>
         <w:pStyle w:val="Heading4"/>
@@ -50324,7 +50307,7 @@
       <w:r>
         <w:t xml:space="preserve"> </w:t>
       </w:r>
-      <w:hyperlink r:id="rId341">
+      <w:hyperlink r:id="rId339">
         <w:r>
           <w:rPr>
             <w:rStyle w:val="VerbatimChar"/>
@@ -50483,7 +50466,7 @@
       <w:r>
         <w:t xml:space="preserve"> </w:t>
       </w:r>
-      <w:hyperlink r:id="rId342">
+      <w:hyperlink r:id="rId340">
         <w:r>
           <w:rPr>
             <w:rStyle w:val="VerbatimChar"/>
@@ -50521,7 +50504,7 @@
       <w:r>
         <w:t xml:space="preserve"> </w:t>
       </w:r>
-      <w:hyperlink r:id="rId343">
+      <w:hyperlink r:id="rId341">
         <w:r>
           <w:rPr>
             <w:rStyle w:val="VerbatimChar"/>
@@ -50545,8 +50528,8 @@
         <w:t xml:space="preserve">not the in-repo path.</w:t>
       </w:r>
     </w:p>
-    <w:bookmarkEnd w:id="344"/>
-    <w:bookmarkStart w:id="349" w:name="where-the-repository-reviews-its-own-prs"/>
+    <w:bookmarkEnd w:id="342"/>
+    <w:bookmarkStart w:id="347" w:name="where-the-repository-reviews-its-own-prs"/>
     <w:p>
       <w:pPr>
         <w:pStyle w:val="Heading4"/>
@@ -50562,7 +50545,7 @@
           <w:numId w:val="1139"/>
         </w:numPr>
       </w:pPr>
-      <w:hyperlink r:id="rId345">
+      <w:hyperlink r:id="rId343">
         <w:r>
           <w:rPr>
             <w:rStyle w:val="VerbatimChar"/>
@@ -50647,7 +50630,7 @@
           <w:numId w:val="1139"/>
         </w:numPr>
       </w:pPr>
-      <w:hyperlink r:id="rId346">
+      <w:hyperlink r:id="rId344">
         <w:r>
           <w:rPr>
             <w:rStyle w:val="VerbatimChar"/>
@@ -50691,7 +50674,7 @@
       <w:r>
         <w:t xml:space="preserve"> </w:t>
       </w:r>
-      <w:hyperlink r:id="rId347">
+      <w:hyperlink r:id="rId345">
         <w:r>
           <w:rPr>
             <w:rStyle w:val="VerbatimChar"/>
@@ -50805,7 +50788,7 @@
           <w:numId w:val="1139"/>
         </w:numPr>
       </w:pPr>
-      <w:hyperlink r:id="rId348">
+      <w:hyperlink r:id="rId346">
         <w:r>
           <w:rPr>
             <w:rStyle w:val="VerbatimChar"/>
@@ -50832,8 +50815,8 @@
         <w:t xml:space="preserve">are copy-paste templates for adding review to another repository.</w:t>
       </w:r>
     </w:p>
-    <w:bookmarkEnd w:id="349"/>
-    <w:bookmarkStart w:id="350" w:name="adding-review-to-your-own-repository"/>
+    <w:bookmarkEnd w:id="347"/>
+    <w:bookmarkStart w:id="348" w:name="adding-review-to-your-own-repository"/>
     <w:p>
       <w:pPr>
         <w:pStyle w:val="Heading4"/>
@@ -50999,8 +50982,8 @@
         <w:t xml:space="preserve">so you edit it the way you would edit any review checklist.</w:t>
       </w:r>
     </w:p>
-    <w:bookmarkEnd w:id="350"/>
-    <w:bookmarkStart w:id="352" w:name="reviewer-versus-claude-agent"/>
+    <w:bookmarkEnd w:id="348"/>
+    <w:bookmarkStart w:id="350" w:name="reviewer-versus-claude-agent"/>
     <w:p>
       <w:pPr>
         <w:pStyle w:val="Heading4"/>
@@ -51034,7 +51017,7 @@
       <w:r>
         <w:t xml:space="preserve"> </w:t>
       </w:r>
-      <w:hyperlink r:id="rId351">
+      <w:hyperlink r:id="rId349">
         <w:r>
           <w:rPr>
             <w:rStyle w:val="VerbatimChar"/>
@@ -51282,8 +51265,8 @@
         <w:t xml:space="preserve">-triggered workflow does.</w:t>
       </w:r>
     </w:p>
-    <w:bookmarkEnd w:id="352"/>
-    <w:bookmarkStart w:id="353" w:name="relation-to-codex-native-review"/>
+    <w:bookmarkEnd w:id="350"/>
+    <w:bookmarkStart w:id="351" w:name="relation-to-codex-native-review"/>
     <w:p>
       <w:pPr>
         <w:pStyle w:val="Heading4"/>
@@ -51356,9 +51339,9 @@
         <w:t xml:space="preserve">and triggering events are all visible and editable in your repository.</w:t>
       </w:r>
     </w:p>
-    <w:bookmarkEnd w:id="353"/>
-    <w:bookmarkEnd w:id="354"/>
-    <w:bookmarkStart w:id="359" w:name="sec-ai-gemini-review-action"/>
+    <w:bookmarkEnd w:id="351"/>
+    <w:bookmarkEnd w:id="352"/>
+    <w:bookmarkStart w:id="357" w:name="sec-ai-gemini-review-action"/>
     <w:p>
       <w:pPr>
         <w:pStyle w:val="Heading1"/>
@@ -51371,7 +51354,7 @@
       <w:pPr>
         <w:pStyle w:val="FirstParagraph"/>
       </w:pPr>
-      <w:hyperlink r:id="rId355">
+      <w:hyperlink r:id="rId353">
         <w:r>
           <w:rPr>
             <w:rStyle w:val="VerbatimChar"/>
@@ -51422,7 +51405,7 @@
         <w:t xml:space="preserve">).</w:t>
       </w:r>
     </w:p>
-    <w:bookmarkStart w:id="356" w:name="key-capabilities"/>
+    <w:bookmarkStart w:id="354" w:name="key-capabilities"/>
     <w:p>
       <w:pPr>
         <w:pStyle w:val="Heading4"/>
@@ -51802,8 +51785,8 @@
         <w:t xml:space="preserve">to reduce API spend on repetitive large-context reviews.</w:t>
       </w:r>
     </w:p>
-    <w:bookmarkEnd w:id="356"/>
-    <w:bookmarkStart w:id="357" w:name="basic-workflow-configuration"/>
+    <w:bookmarkEnd w:id="354"/>
+    <w:bookmarkStart w:id="355" w:name="basic-workflow-configuration"/>
     <w:p>
       <w:pPr>
         <w:pStyle w:val="Heading4"/>
@@ -52449,8 +52432,8 @@
         <w:t xml:space="preserve"> gemini-3.7-flash</w:t>
       </w:r>
     </w:p>
-    <w:bookmarkEnd w:id="357"/>
-    <w:bookmarkStart w:id="358" w:name="X0407c9dfed0c8e884799eb9991d5ff672d4ffda"/>
+    <w:bookmarkEnd w:id="355"/>
+    <w:bookmarkStart w:id="356" w:name="X0407c9dfed0c8e884799eb9991d5ff672d4ffda"/>
     <w:p>
       <w:pPr>
         <w:pStyle w:val="Heading4"/>
@@ -52526,9 +52509,9 @@
         <w:t xml:space="preserve">with credentials scoped to GitHub Actions secrets or Google Cloud IAM roles.</w:t>
       </w:r>
     </w:p>
-    <w:bookmarkEnd w:id="358"/>
-    <w:bookmarkEnd w:id="359"/>
-    <w:bookmarkStart w:id="364" w:name="sec-ai-gemini-code-assist-review"/>
+    <w:bookmarkEnd w:id="356"/>
+    <w:bookmarkEnd w:id="357"/>
+    <w:bookmarkStart w:id="362" w:name="sec-ai-gemini-code-assist-review"/>
     <w:p>
       <w:pPr>
         <w:pStyle w:val="Heading1"/>
@@ -52547,7 +52530,7 @@
       <w:r>
         <w:t xml:space="preserve"> </w:t>
       </w:r>
-      <w:hyperlink r:id="rId360">
+      <w:hyperlink r:id="rId358">
         <w:r>
           <w:rPr>
             <w:rStyle w:val="Hyperlink"/>
@@ -52574,7 +52557,7 @@
         <w:t xml:space="preserve">Gemini Code Assist operates as a managed service connected at the organization or repository level.</w:t>
       </w:r>
     </w:p>
-    <w:bookmarkStart w:id="361" w:name="architecture-and-setup"/>
+    <w:bookmarkStart w:id="359" w:name="architecture-and-setup"/>
     <w:p>
       <w:pPr>
         <w:pStyle w:val="Heading4"/>
@@ -52779,8 +52762,8 @@
         <w:t xml:space="preserve">directly in the pull-request thread.</w:t>
       </w:r>
     </w:p>
-    <w:bookmarkEnd w:id="361"/>
-    <w:bookmarkStart w:id="362" w:name="review-scope-and-security-boundaries"/>
+    <w:bookmarkEnd w:id="359"/>
+    <w:bookmarkStart w:id="360" w:name="review-scope-and-security-boundaries"/>
     <w:p>
       <w:pPr>
         <w:pStyle w:val="Heading4"/>
@@ -52917,8 +52900,8 @@
         <w:t xml:space="preserve">without checking workflow files into individual repositories.</w:t>
       </w:r>
     </w:p>
-    <w:bookmarkEnd w:id="362"/>
-    <w:bookmarkStart w:id="363" w:name="trade-offs-versus-action-based-reviews"/>
+    <w:bookmarkEnd w:id="360"/>
+    <w:bookmarkStart w:id="361" w:name="trade-offs-versus-action-based-reviews"/>
     <w:p>
       <w:pPr>
         <w:pStyle w:val="Heading4"/>
@@ -53234,9 +53217,9 @@
         </w:tc>
       </w:tr>
     </w:tbl>
-    <w:bookmarkEnd w:id="363"/>
-    <w:bookmarkEnd w:id="364"/>
-    <w:bookmarkStart w:id="374" w:name="sec-ai-pr-activity-notifications"/>
+    <w:bookmarkEnd w:id="361"/>
+    <w:bookmarkEnd w:id="362"/>
+    <w:bookmarkStart w:id="372" w:name="sec-ai-pr-activity-notifications"/>
     <w:p>
       <w:pPr>
         <w:pStyle w:val="Heading1"/>
@@ -53580,7 +53563,7 @@
         </w:tc>
       </w:tr>
     </w:tbl>
-    <w:bookmarkStart w:id="365" w:name="the-channel-an-agent-controls"/>
+    <w:bookmarkStart w:id="363" w:name="the-channel-an-agent-controls"/>
     <w:p>
       <w:pPr>
         <w:pStyle w:val="Heading4"/>
@@ -53854,8 +53837,8 @@
         <w:t xml:space="preserve">real state, not a replacement for it.</w:t>
       </w:r>
     </w:p>
-    <w:bookmarkEnd w:id="365"/>
-    <w:bookmarkStart w:id="366" w:name="the-channel-only-a-human-controls"/>
+    <w:bookmarkEnd w:id="363"/>
+    <w:bookmarkStart w:id="364" w:name="the-channel-only-a-human-controls"/>
     <w:p>
       <w:pPr>
         <w:pStyle w:val="Heading4"/>
@@ -54158,8 +54141,8 @@
         <w:t xml:space="preserve">for the web-session context these run in.</w:t>
       </w:r>
     </w:p>
-    <w:bookmarkEnd w:id="366"/>
-    <w:bookmarkStart w:id="367" w:name="the-instruction-template-is-boilerplate"/>
+    <w:bookmarkEnd w:id="364"/>
+    <w:bookmarkStart w:id="365" w:name="the-instruction-template-is-boilerplate"/>
     <w:p>
       <w:pPr>
         <w:pStyle w:val="Heading4"/>
@@ -54425,8 +54408,8 @@
         <w:t xml:space="preserve">rather than as an instruction that a fix is owed.</w:t>
       </w:r>
     </w:p>
-    <w:bookmarkEnd w:id="367"/>
-    <w:bookmarkStart w:id="368" w:name="X3e28e99804e56791cb9e57e9eb83869f0ead0b2"/>
+    <w:bookmarkEnd w:id="365"/>
+    <w:bookmarkStart w:id="366" w:name="X3e28e99804e56791cb9e57e9eb83869f0ead0b2"/>
     <w:p>
       <w:pPr>
         <w:pStyle w:val="Heading4"/>
@@ -54555,8 +54538,8 @@
         <w:t xml:space="preserve">Toggling one says nothing about the other.</w:t>
       </w:r>
     </w:p>
-    <w:bookmarkEnd w:id="368"/>
-    <w:bookmarkStart w:id="373" w:name="treat-what-arrives-as-untrusted"/>
+    <w:bookmarkEnd w:id="366"/>
+    <w:bookmarkStart w:id="371" w:name="treat-what-arrives-as-untrusted"/>
     <w:p>
       <w:pPr>
         <w:pStyle w:val="Heading4"/>
@@ -54925,12 +54908,12 @@
                 <wp:inline>
                   <wp:extent cx="152400" cy="152400"/>
                   <wp:effectExtent b="0" l="0" r="0" t="0"/>
-                  <wp:docPr descr="" title="" id="369" name="Picture"/>
+                  <wp:docPr descr="" title="" id="367" name="Picture"/>
                   <a:graphic>
                     <a:graphicData uri="http://schemas.openxmlformats.org/drawingml/2006/picture">
                       <pic:pic>
                         <pic:nvPicPr>
-                          <pic:cNvPr descr="/opt/quarto/share/formats/docx/warning.png" id="370" name="Picture"/>
+                          <pic:cNvPr descr="/opt/quarto/share/formats/docx/warning.png" id="368" name="Picture"/>
                           <pic:cNvPicPr>
                             <a:picLocks noChangeArrowheads="1" noChangeAspect="1"/>
                           </pic:cNvPicPr>
@@ -55101,12 +55084,12 @@
                 <wp:inline>
                   <wp:extent cx="152400" cy="152400"/>
                   <wp:effectExtent b="0" l="0" r="0" t="0"/>
-                  <wp:docPr descr="" title="" id="371" name="Picture"/>
+                  <wp:docPr descr="" title="" id="369" name="Picture"/>
                   <a:graphic>
                     <a:graphicData uri="http://schemas.openxmlformats.org/drawingml/2006/picture">
                       <pic:pic>
                         <pic:nvPicPr>
-                          <pic:cNvPr descr="/opt/quarto/share/formats/docx/note.png" id="372" name="Picture"/>
+                          <pic:cNvPr descr="/opt/quarto/share/formats/docx/note.png" id="370" name="Picture"/>
                           <pic:cNvPicPr>
                             <a:picLocks noChangeArrowheads="1" noChangeAspect="1"/>
                           </pic:cNvPicPr>
@@ -55212,9 +55195,9 @@
         </w:tc>
       </w:tr>
     </w:tbl>
-    <w:bookmarkEnd w:id="373"/>
-    <w:bookmarkEnd w:id="374"/>
-    <w:bookmarkStart w:id="378" w:name="sec-ai-when-to-use"/>
+    <w:bookmarkEnd w:id="371"/>
+    <w:bookmarkEnd w:id="372"/>
+    <w:bookmarkStart w:id="376" w:name="sec-ai-when-to-use"/>
     <w:p>
       <w:pPr>
         <w:pStyle w:val="Heading1"/>
@@ -55234,7 +55217,7 @@
         <w:rPr>
           <w:rStyle w:val="FootnoteReference"/>
         </w:rPr>
-        <w:footnoteReference w:id="375"/>
+        <w:footnoteReference w:id="373"/>
       </w:r>
       <w:r>
         <w:t xml:space="preserve"> </w:t>
@@ -55266,7 +55249,7 @@
       <w:r>
         <w:t xml:space="preserve"> </w:t>
       </w:r>
-      <w:hyperlink r:id="rId376">
+      <w:hyperlink r:id="rId374">
         <w:r>
           <w:rPr>
             <w:rStyle w:val="Hyperlink"/>
@@ -55325,7 +55308,7 @@
       <w:r>
         <w:t xml:space="preserve"> </w:t>
       </w:r>
-      <w:hyperlink r:id="rId377">
+      <w:hyperlink r:id="rId375">
         <w:r>
           <w:rPr>
             <w:rStyle w:val="Hyperlink"/>
@@ -55444,8 +55427,8 @@
         <w:t xml:space="preserve">just like you would for any other skill you want to maintain.</w:t>
       </w:r>
     </w:p>
-    <w:bookmarkEnd w:id="378"/>
-    <w:bookmarkStart w:id="383" w:name="editing-with-.docx-files"/>
+    <w:bookmarkEnd w:id="376"/>
+    <w:bookmarkStart w:id="381" w:name="editing-with-.docx-files"/>
     <w:p>
       <w:pPr>
         <w:pStyle w:val="Heading1"/>
@@ -55625,7 +55608,7 @@
         <w:t xml:space="preserve">This approach makes it easier for collaborators who are more comfortable with Word to contribute while maintaining the source files in Quarto format.</w:t>
       </w:r>
     </w:p>
-    <w:bookmarkStart w:id="382" w:name="known-issue-document-1-warning-in-word"/>
+    <w:bookmarkStart w:id="380" w:name="known-issue-document-1-warning-in-word"/>
     <w:p>
       <w:pPr>
         <w:pStyle w:val="Heading4"/>
@@ -55710,7 +55693,7 @@
           <w:numId w:val="1150"/>
         </w:numPr>
       </w:pPr>
-      <w:hyperlink r:id="rId379">
+      <w:hyperlink r:id="rId377">
         <w:r>
           <w:rPr>
             <w:rStyle w:val="Hyperlink"/>
@@ -55727,7 +55710,7 @@
           <w:numId w:val="1150"/>
         </w:numPr>
       </w:pPr>
-      <w:hyperlink r:id="rId380">
+      <w:hyperlink r:id="rId378">
         <w:r>
           <w:rPr>
             <w:rStyle w:val="Hyperlink"/>
@@ -55744,7 +55727,7 @@
           <w:numId w:val="1150"/>
         </w:numPr>
       </w:pPr>
-      <w:hyperlink r:id="rId381">
+      <w:hyperlink r:id="rId379">
         <w:r>
           <w:rPr>
             <w:rStyle w:val="Hyperlink"/>
@@ -55857,9 +55840,9 @@
         <w:t xml:space="preserve">warning and can immediately add comments and track changes without issues.</w:t>
       </w:r>
     </w:p>
-    <w:bookmarkEnd w:id="382"/>
-    <w:bookmarkEnd w:id="383"/>
-    <w:bookmarkStart w:id="385" w:name="copilot-instructions-for-this-repository"/>
+    <w:bookmarkEnd w:id="380"/>
+    <w:bookmarkEnd w:id="381"/>
+    <w:bookmarkStart w:id="383" w:name="copilot-instructions-for-this-repository"/>
     <w:p>
       <w:pPr>
         <w:pStyle w:val="Heading1"/>
@@ -56091,7 +56074,7 @@
       <w:r>
         <w:t xml:space="preserve"> </w:t>
       </w:r>
-      <w:hyperlink r:id="rId384">
+      <w:hyperlink r:id="rId382">
         <w:r>
           <w:rPr>
             <w:rStyle w:val="VerbatimChar"/>
@@ -56106,8 +56089,8 @@
         <w:t xml:space="preserve">for a working example.</w:t>
       </w:r>
     </w:p>
-    <w:bookmarkEnd w:id="385"/>
-    <w:bookmarkStart w:id="386" w:name="using-copilot-review-before-human-review"/>
+    <w:bookmarkEnd w:id="383"/>
+    <w:bookmarkStart w:id="384" w:name="using-copilot-review-before-human-review"/>
     <w:p>
       <w:pPr>
         <w:pStyle w:val="Heading1"/>
@@ -56693,8 +56676,8 @@
         <w:t xml:space="preserve">This ensures you’re reviewing code that has already been through initial automated quality checks.</w:t>
       </w:r>
     </w:p>
-    <w:bookmarkEnd w:id="386"/>
-    <w:bookmarkStart w:id="388" w:name="reviewing-a-copilot-pr-you-didnt-create"/>
+    <w:bookmarkEnd w:id="384"/>
+    <w:bookmarkStart w:id="386" w:name="reviewing-a-copilot-pr-you-didnt-create"/>
     <w:p>
       <w:pPr>
         <w:pStyle w:val="Heading1"/>
@@ -56745,7 +56728,7 @@
       <w:r>
         <w:t xml:space="preserve"> </w:t>
       </w:r>
-      <w:hyperlink r:id="rId387">
+      <w:hyperlink r:id="rId385">
         <w:r>
           <w:rPr>
             <w:rStyle w:val="Hyperlink"/>
@@ -57649,8 +57632,8 @@
         <w:t xml:space="preserve">while benefiting from collaborative human review and Copilot’s implementation capabilities.</w:t>
       </w:r>
     </w:p>
-    <w:bookmarkEnd w:id="388"/>
-    <w:bookmarkStart w:id="393" w:name="sec-ai-vscode-agent-sessions"/>
+    <w:bookmarkEnd w:id="386"/>
+    <w:bookmarkStart w:id="391" w:name="sec-ai-vscode-agent-sessions"/>
     <w:p>
       <w:pPr>
         <w:pStyle w:val="Heading1"/>
@@ -57669,7 +57652,7 @@
       <w:r>
         <w:t xml:space="preserve"> </w:t>
       </w:r>
-      <w:hyperlink r:id="rId389">
+      <w:hyperlink r:id="rId387">
         <w:r>
           <w:rPr>
             <w:rStyle w:val="Hyperlink"/>
@@ -57696,7 +57679,7 @@
         <w:t xml:space="preserve">is essential for managing multi-step agent workflows.</w:t>
       </w:r>
     </w:p>
-    <w:bookmarkStart w:id="390" w:name="anatomy-of-an-agent-session"/>
+    <w:bookmarkStart w:id="388" w:name="anatomy-of-an-agent-session"/>
     <w:p>
       <w:pPr>
         <w:pStyle w:val="Heading4"/>
@@ -57831,8 +57814,8 @@
         <w:t xml:space="preserve">when exploring alternative implementation paths.</w:t>
       </w:r>
     </w:p>
-    <w:bookmarkEnd w:id="390"/>
-    <w:bookmarkStart w:id="391" w:name="managing-sessions-across-surfaces"/>
+    <w:bookmarkEnd w:id="388"/>
+    <w:bookmarkStart w:id="389" w:name="managing-sessions-across-surfaces"/>
     <w:p>
       <w:pPr>
         <w:pStyle w:val="Heading4"/>
@@ -57942,8 +57925,8 @@
         <w:t xml:space="preserve">enabling developers to access active and past sessions across devices.</w:t>
       </w:r>
     </w:p>
-    <w:bookmarkEnd w:id="391"/>
-    <w:bookmarkStart w:id="392" w:name="session-handoff-types"/>
+    <w:bookmarkEnd w:id="389"/>
+    <w:bookmarkStart w:id="390" w:name="session-handoff-types"/>
     <w:p>
       <w:pPr>
         <w:pStyle w:val="Heading4"/>
@@ -58065,9 +58048,9 @@
         <w:t xml:space="preserve">freeing local editor resources while the agent executes in the background.</w:t>
       </w:r>
     </w:p>
-    <w:bookmarkEnd w:id="392"/>
-    <w:bookmarkEnd w:id="393"/>
-    <w:bookmarkStart w:id="412" w:name="sec-ai-claude-code-windows"/>
+    <w:bookmarkEnd w:id="390"/>
+    <w:bookmarkEnd w:id="391"/>
+    <w:bookmarkStart w:id="410" w:name="sec-ai-claude-code-windows"/>
     <w:p>
       <w:pPr>
         <w:pStyle w:val="Heading1"/>
@@ -58166,12 +58149,12 @@
                 <wp:inline>
                   <wp:extent cx="152400" cy="152400"/>
                   <wp:effectExtent b="0" l="0" r="0" t="0"/>
-                  <wp:docPr descr="" title="" id="394" name="Picture"/>
+                  <wp:docPr descr="" title="" id="392" name="Picture"/>
                   <a:graphic>
                     <a:graphicData uri="http://schemas.openxmlformats.org/drawingml/2006/picture">
                       <pic:pic>
                         <pic:nvPicPr>
-                          <pic:cNvPr descr="/opt/quarto/share/formats/docx/note.png" id="395" name="Picture"/>
+                          <pic:cNvPr descr="/opt/quarto/share/formats/docx/note.png" id="393" name="Picture"/>
                           <pic:cNvPicPr>
                             <a:picLocks noChangeArrowheads="1" noChangeAspect="1"/>
                           </pic:cNvPicPr>
@@ -58259,7 +58242,7 @@
         </w:tc>
       </w:tr>
     </w:tbl>
-    <w:bookmarkStart w:id="398" w:name="run-it-from-a-unix-like-terminal"/>
+    <w:bookmarkStart w:id="396" w:name="run-it-from-a-unix-like-terminal"/>
     <w:p>
       <w:pPr>
         <w:pStyle w:val="Heading4"/>
@@ -58306,7 +58289,7 @@
       <w:r>
         <w:t xml:space="preserve"> </w:t>
       </w:r>
-      <w:hyperlink r:id="rId396">
+      <w:hyperlink r:id="rId394">
         <w:r>
           <w:rPr>
             <w:rStyle w:val="Hyperlink"/>
@@ -58339,7 +58322,7 @@
       <w:r>
         <w:t xml:space="preserve">(</w:t>
       </w:r>
-      <w:hyperlink r:id="rId397">
+      <w:hyperlink r:id="rId395">
         <w:r>
           <w:rPr>
             <w:rStyle w:val="Hyperlink"/>
@@ -58490,8 +58473,8 @@
         <w:t xml:space="preserve">gotchas below don’t apply.</w:t>
       </w:r>
     </w:p>
-    <w:bookmarkEnd w:id="398"/>
-    <w:bookmarkStart w:id="403" w:name="install-claude-code"/>
+    <w:bookmarkEnd w:id="396"/>
+    <w:bookmarkStart w:id="401" w:name="install-claude-code"/>
     <w:p>
       <w:pPr>
         <w:pStyle w:val="Heading4"/>
@@ -58656,7 +58639,7 @@
       <w:r>
         <w:t xml:space="preserve"> </w:t>
       </w:r>
-      <w:hyperlink r:id="rId399">
+      <w:hyperlink r:id="rId397">
         <w:r>
           <w:rPr>
             <w:rStyle w:val="Hyperlink"/>
@@ -58742,12 +58725,12 @@
                 <wp:inline>
                   <wp:extent cx="152400" cy="152400"/>
                   <wp:effectExtent b="0" l="0" r="0" t="0"/>
-                  <wp:docPr descr="" title="" id="400" name="Picture"/>
+                  <wp:docPr descr="" title="" id="398" name="Picture"/>
                   <a:graphic>
                     <a:graphicData uri="http://schemas.openxmlformats.org/drawingml/2006/picture">
                       <pic:pic>
                         <pic:nvPicPr>
-                          <pic:cNvPr descr="/opt/quarto/share/formats/docx/important.png" id="401" name="Picture"/>
+                          <pic:cNvPr descr="/opt/quarto/share/formats/docx/important.png" id="399" name="Picture"/>
                           <pic:cNvPicPr>
                             <a:picLocks noChangeArrowheads="1" noChangeAspect="1"/>
                           </pic:cNvPicPr>
@@ -58903,7 +58886,7 @@
             <w:r>
               <w:t xml:space="preserve"> </w:t>
             </w:r>
-            <w:hyperlink r:id="rId402">
+            <w:hyperlink r:id="rId400">
               <w:r>
                 <w:rPr>
                   <w:rStyle w:val="Hyperlink"/>
@@ -58994,8 +58977,8 @@
         </w:tc>
       </w:tr>
     </w:tbl>
-    <w:bookmarkEnd w:id="403"/>
-    <w:bookmarkStart w:id="405" w:name="make-sure-your-shell-can-find-claude"/>
+    <w:bookmarkEnd w:id="401"/>
+    <w:bookmarkStart w:id="403" w:name="make-sure-your-shell-can-find-claude"/>
     <w:p>
       <w:pPr>
         <w:pStyle w:val="Heading4"/>
@@ -59593,7 +59576,7 @@
       <w:r>
         <w:t xml:space="preserve"> </w:t>
       </w:r>
-      <w:hyperlink r:id="rId404">
+      <w:hyperlink r:id="rId402">
         <w:r>
           <w:rPr>
             <w:rStyle w:val="Hyperlink"/>
@@ -59699,8 +59682,8 @@
         <w:t xml:space="preserve">initializes).</w:t>
       </w:r>
     </w:p>
-    <w:bookmarkEnd w:id="405"/>
-    <w:bookmarkStart w:id="408" w:name="X604325b0223e79803e04f87e7874b1d7f4a0663"/>
+    <w:bookmarkEnd w:id="403"/>
+    <w:bookmarkStart w:id="406" w:name="X604325b0223e79803e04f87e7874b1d7f4a0663"/>
     <w:p>
       <w:pPr>
         <w:pStyle w:val="Heading4"/>
@@ -59750,12 +59733,12 @@
                 <wp:inline>
                   <wp:extent cx="152400" cy="152400"/>
                   <wp:effectExtent b="0" l="0" r="0" t="0"/>
-                  <wp:docPr descr="" title="" id="406" name="Picture"/>
+                  <wp:docPr descr="" title="" id="404" name="Picture"/>
                   <a:graphic>
                     <a:graphicData uri="http://schemas.openxmlformats.org/drawingml/2006/picture">
                       <pic:pic>
                         <pic:nvPicPr>
-                          <pic:cNvPr descr="/opt/quarto/share/formats/docx/warning.png" id="407" name="Picture"/>
+                          <pic:cNvPr descr="/opt/quarto/share/formats/docx/warning.png" id="405" name="Picture"/>
                           <pic:cNvPicPr>
                             <a:picLocks noChangeArrowheads="1" noChangeAspect="1"/>
                           </pic:cNvPicPr>
@@ -60023,8 +60006,8 @@
         </w:tc>
       </w:tr>
     </w:tbl>
-    <w:bookmarkEnd w:id="408"/>
-    <w:bookmarkStart w:id="410" w:name="X1745fd502df7963ed7ce48d0465493b4d59ad92"/>
+    <w:bookmarkEnd w:id="406"/>
+    <w:bookmarkStart w:id="408" w:name="X1745fd502df7963ed7ce48d0465493b4d59ad92"/>
     <w:p>
       <w:pPr>
         <w:pStyle w:val="Heading4"/>
@@ -60043,7 +60026,7 @@
       <w:r>
         <w:t xml:space="preserve"> </w:t>
       </w:r>
-      <w:hyperlink r:id="rId409">
+      <w:hyperlink r:id="rId407">
         <w:r>
           <w:rPr>
             <w:rStyle w:val="Hyperlink"/>
@@ -60204,8 +60187,8 @@
         <w:t xml:space="preserve">.</w:t>
       </w:r>
     </w:p>
-    <w:bookmarkEnd w:id="410"/>
-    <w:bookmarkStart w:id="411" w:name="verify-the-install"/>
+    <w:bookmarkEnd w:id="408"/>
+    <w:bookmarkStart w:id="409" w:name="verify-the-install"/>
     <w:p>
       <w:pPr>
         <w:pStyle w:val="Heading4"/>
@@ -60374,9 +60357,9 @@
         <w:t xml:space="preserve">(or open a fresh window) after changing it.</w:t>
       </w:r>
     </w:p>
-    <w:bookmarkEnd w:id="411"/>
-    <w:bookmarkEnd w:id="412"/>
-    <w:bookmarkStart w:id="428" w:name="sec-ai-mcp-server-setup"/>
+    <w:bookmarkEnd w:id="409"/>
+    <w:bookmarkEnd w:id="410"/>
+    <w:bookmarkStart w:id="426" w:name="sec-ai-mcp-server-setup"/>
     <w:p>
       <w:pPr>
         <w:pStyle w:val="Heading1"/>
@@ -60497,12 +60480,12 @@
                 <wp:inline>
                   <wp:extent cx="152400" cy="152400"/>
                   <wp:effectExtent b="0" l="0" r="0" t="0"/>
-                  <wp:docPr descr="" title="" id="413" name="Picture"/>
+                  <wp:docPr descr="" title="" id="411" name="Picture"/>
                   <a:graphic>
                     <a:graphicData uri="http://schemas.openxmlformats.org/drawingml/2006/picture">
                       <pic:pic>
                         <pic:nvPicPr>
-                          <pic:cNvPr descr="/opt/quarto/share/formats/docx/note.png" id="414" name="Picture"/>
+                          <pic:cNvPr descr="/opt/quarto/share/formats/docx/note.png" id="412" name="Picture"/>
                           <pic:cNvPicPr>
                             <a:picLocks noChangeArrowheads="1" noChangeAspect="1"/>
                           </pic:cNvPicPr>
@@ -60596,7 +60579,7 @@
         </w:tc>
       </w:tr>
     </w:tbl>
-    <w:bookmarkStart w:id="416" w:name="installed-is-not-registered"/>
+    <w:bookmarkStart w:id="414" w:name="installed-is-not-registered"/>
     <w:p>
       <w:pPr>
         <w:pStyle w:val="Heading4"/>
@@ -60627,7 +60610,7 @@
       <w:r>
         <w:t xml:space="preserve"> </w:t>
       </w:r>
-      <w:hyperlink r:id="rId415">
+      <w:hyperlink r:id="rId413">
         <w:r>
           <w:rPr>
             <w:rStyle w:val="VerbatimChar"/>
@@ -60695,8 +60678,8 @@
         <w:t xml:space="preserve"> mcp list</w:t>
       </w:r>
     </w:p>
-    <w:bookmarkEnd w:id="416"/>
-    <w:bookmarkStart w:id="417" w:name="Xf6682145328c756d2e167d2c91be34f7f913a7f"/>
+    <w:bookmarkEnd w:id="414"/>
+    <w:bookmarkStart w:id="415" w:name="Xf6682145328c756d2e167d2c91be34f7f913a7f"/>
     <w:p>
       <w:pPr>
         <w:pStyle w:val="Heading4"/>
@@ -60895,8 +60878,8 @@
         <w:t xml:space="preserve">A local one shows a command path instead.</w:t>
       </w:r>
     </w:p>
-    <w:bookmarkEnd w:id="417"/>
-    <w:bookmarkStart w:id="418" w:name="and-401-mean-different-things"/>
+    <w:bookmarkEnd w:id="415"/>
+    <w:bookmarkStart w:id="416" w:name="and-401-mean-different-things"/>
     <w:p>
       <w:pPr>
         <w:pStyle w:val="Heading4"/>
@@ -61139,8 +61122,8 @@
         <w:t xml:space="preserve">sends you to the token-minting page for a problem that lives in a config file.</w:t>
       </w:r>
     </w:p>
-    <w:bookmarkEnd w:id="418"/>
-    <w:bookmarkStart w:id="419" w:name="install-the-binary-the-platforms-own-way"/>
+    <w:bookmarkEnd w:id="416"/>
+    <w:bookmarkStart w:id="417" w:name="install-the-binary-the-platforms-own-way"/>
     <w:p>
       <w:pPr>
         <w:pStyle w:val="Heading4"/>
@@ -61394,8 +61377,8 @@
         <w:t xml:space="preserve">with an override for the case where it isn’t on one.</w:t>
       </w:r>
     </w:p>
-    <w:bookmarkEnd w:id="419"/>
-    <w:bookmarkStart w:id="420" w:name="X2adb24e9b1a0644f0fbebe685525dadd8a56387"/>
+    <w:bookmarkEnd w:id="417"/>
+    <w:bookmarkStart w:id="418" w:name="X2adb24e9b1a0644f0fbebe685525dadd8a56387"/>
     <w:p>
       <w:pPr>
         <w:pStyle w:val="Heading4"/>
@@ -62272,8 +62255,8 @@
         <w:t xml:space="preserve">bug you just finished diagnosing.</w:t>
       </w:r>
     </w:p>
-    <w:bookmarkEnd w:id="420"/>
-    <w:bookmarkStart w:id="421" w:name="X448547516ab06679b064b391b05a896db41ea57"/>
+    <w:bookmarkEnd w:id="418"/>
+    <w:bookmarkStart w:id="419" w:name="X448547516ab06679b064b391b05a896db41ea57"/>
     <w:p>
       <w:pPr>
         <w:pStyle w:val="Heading4"/>
@@ -62595,8 +62578,8 @@
         <w:t xml:space="preserve">the count moving the right direction, as the check above expects.</w:t>
       </w:r>
     </w:p>
-    <w:bookmarkEnd w:id="421"/>
-    <w:bookmarkStart w:id="422" w:name="X4a4c9992603eee0123b58b5b37e7fedbb817150"/>
+    <w:bookmarkEnd w:id="419"/>
+    <w:bookmarkStart w:id="420" w:name="X4a4c9992603eee0123b58b5b37e7fedbb817150"/>
     <w:p>
       <w:pPr>
         <w:pStyle w:val="Heading4"/>
@@ -62696,8 +62679,8 @@
         <w:t xml:space="preserve">Reach for those instead when working from a local harness.</w:t>
       </w:r>
     </w:p>
-    <w:bookmarkEnd w:id="422"/>
-    <w:bookmarkStart w:id="423" w:name="Xb256c2a3c0a422f2f687a98903d3521fd60a1b1"/>
+    <w:bookmarkEnd w:id="420"/>
+    <w:bookmarkStart w:id="421" w:name="Xb256c2a3c0a422f2f687a98903d3521fd60a1b1"/>
     <w:p>
       <w:pPr>
         <w:pStyle w:val="Heading4"/>
@@ -62873,8 +62856,8 @@
         <w:t xml:space="preserve">not something an agent does in passing.</w:t>
       </w:r>
     </w:p>
-    <w:bookmarkEnd w:id="423"/>
-    <w:bookmarkStart w:id="425" w:name="Xd44df015462fcf288556a538677f0a762c9ef1d"/>
+    <w:bookmarkEnd w:id="421"/>
+    <w:bookmarkStart w:id="423" w:name="Xd44df015462fcf288556a538677f0a762c9ef1d"/>
     <w:p>
       <w:pPr>
         <w:pStyle w:val="Heading4"/>
@@ -62988,7 +62971,7 @@
       <w:r>
         <w:t xml:space="preserve"> </w:t>
       </w:r>
-      <w:hyperlink r:id="rId424">
+      <w:hyperlink r:id="rId422">
         <w:r>
           <w:rPr>
             <w:rStyle w:val="Hyperlink"/>
@@ -63171,8 +63154,8 @@
         <w:t xml:space="preserve">and expect it to work.</w:t>
       </w:r>
     </w:p>
-    <w:bookmarkEnd w:id="425"/>
-    <w:bookmarkStart w:id="427" w:name="granola-mcp-your-meetings-as-context"/>
+    <w:bookmarkEnd w:id="423"/>
+    <w:bookmarkStart w:id="425" w:name="granola-mcp-your-meetings-as-context"/>
     <w:p>
       <w:pPr>
         <w:pStyle w:val="Heading4"/>
@@ -63185,7 +63168,7 @@
       <w:pPr>
         <w:pStyle w:val="FirstParagraph"/>
       </w:pPr>
-      <w:hyperlink r:id="rId426">
+      <w:hyperlink r:id="rId424">
         <w:r>
           <w:rPr>
             <w:rStyle w:val="Hyperlink"/>
@@ -63343,7 +63326,7 @@
       <w:r>
         <w:t xml:space="preserve"> </w:t>
       </w:r>
-      <w:hyperlink r:id="rId426">
+      <w:hyperlink r:id="rId424">
         <w:r>
           <w:rPr>
             <w:rStyle w:val="Hyperlink"/>
@@ -63370,9 +63353,9 @@
         <w:t xml:space="preserve">off by default until an admin enables it.</w:t>
       </w:r>
     </w:p>
-    <w:bookmarkEnd w:id="427"/>
-    <w:bookmarkEnd w:id="428"/>
-    <w:bookmarkStart w:id="433" w:name="sec-ai-antigravity-python-sdk"/>
+    <w:bookmarkEnd w:id="425"/>
+    <w:bookmarkEnd w:id="426"/>
+    <w:bookmarkStart w:id="431" w:name="sec-ai-antigravity-python-sdk"/>
     <w:p>
       <w:pPr>
         <w:pStyle w:val="Heading1"/>
@@ -63391,7 +63374,7 @@
       <w:r>
         <w:t xml:space="preserve"> </w:t>
       </w:r>
-      <w:hyperlink r:id="rId429">
+      <w:hyperlink r:id="rId427">
         <w:r>
           <w:rPr>
             <w:rStyle w:val="VerbatimChar"/>
@@ -63430,7 +63413,7 @@
         <w:t xml:space="preserve">).</w:t>
       </w:r>
     </w:p>
-    <w:bookmarkStart w:id="430" w:name="architecture-and-runtime-model"/>
+    <w:bookmarkStart w:id="428" w:name="architecture-and-runtime-model"/>
     <w:p>
       <w:pPr>
         <w:pStyle w:val="Heading4"/>
@@ -63576,8 +63559,8 @@
         <w:t xml:space="preserve">ensuring consistent agent execution across macOS and Linux environments.</w:t>
       </w:r>
     </w:p>
-    <w:bookmarkEnd w:id="430"/>
-    <w:bookmarkStart w:id="431" w:name="extensibility-and-policy-enforcement"/>
+    <w:bookmarkEnd w:id="428"/>
+    <w:bookmarkStart w:id="429" w:name="extensibility-and-policy-enforcement"/>
     <w:p>
       <w:pPr>
         <w:pStyle w:val="Heading4"/>
@@ -63696,8 +63679,8 @@
         <w:t xml:space="preserve">allowing agents to leverage shared procedural instructions.</w:t>
       </w:r>
     </w:p>
-    <w:bookmarkEnd w:id="431"/>
-    <w:bookmarkStart w:id="432" w:name="Xeddea508349c3fceeae23b1265edb60e3f99a32"/>
+    <w:bookmarkEnd w:id="429"/>
+    <w:bookmarkStart w:id="430" w:name="Xeddea508349c3fceeae23b1265edb60e3f99a32"/>
     <w:p>
       <w:pPr>
         <w:pStyle w:val="Heading4"/>
@@ -63922,9 +63905,9 @@
         </w:tc>
       </w:tr>
     </w:tbl>
-    <w:bookmarkEnd w:id="432"/>
-    <w:bookmarkEnd w:id="433"/>
-    <w:bookmarkStart w:id="437" w:name="sec-ai-magic-context"/>
+    <w:bookmarkEnd w:id="430"/>
+    <w:bookmarkEnd w:id="431"/>
+    <w:bookmarkStart w:id="435" w:name="sec-ai-magic-context"/>
     <w:p>
       <w:pPr>
         <w:pStyle w:val="Heading1"/>
@@ -63937,7 +63920,7 @@
       <w:pPr>
         <w:pStyle w:val="FirstParagraph"/>
       </w:pPr>
-      <w:hyperlink r:id="rId434">
+      <w:hyperlink r:id="rId432">
         <w:r>
           <w:rPr>
             <w:rStyle w:val="VerbatimChar"/>
@@ -63985,7 +63968,7 @@
         <w:t xml:space="preserve">consolidates, and retrieves long-term repository state without pausing the active coding turn.</w:t>
       </w:r>
     </w:p>
-    <w:bookmarkStart w:id="435" w:name="core-architecture-and-agent-roles"/>
+    <w:bookmarkStart w:id="433" w:name="core-architecture-and-agent-roles"/>
     <w:p>
       <w:pPr>
         <w:pStyle w:val="Heading4"/>
@@ -64110,8 +64093,8 @@
         <w:t xml:space="preserve">supplying historical context matched to the current file or task.</w:t>
       </w:r>
     </w:p>
-    <w:bookmarkEnd w:id="435"/>
-    <w:bookmarkStart w:id="436" w:name="cache-aware-memory-management"/>
+    <w:bookmarkEnd w:id="433"/>
+    <w:bookmarkStart w:id="434" w:name="cache-aware-memory-management"/>
     <w:p>
       <w:pPr>
         <w:pStyle w:val="Heading4"/>
@@ -64236,9 +64219,9 @@
         <w:t xml:space="preserve">enabling coding agents to resume work with full institutional memory of past decisions.</w:t>
       </w:r>
     </w:p>
-    <w:bookmarkEnd w:id="436"/>
-    <w:bookmarkEnd w:id="437"/>
-    <w:bookmarkStart w:id="445" w:name="sec-ai-gemini-spend-management"/>
+    <w:bookmarkEnd w:id="434"/>
+    <w:bookmarkEnd w:id="435"/>
+    <w:bookmarkStart w:id="443" w:name="sec-ai-gemini-spend-management"/>
     <w:p>
       <w:pPr>
         <w:pStyle w:val="Heading1"/>
@@ -64267,7 +64250,7 @@
         <w:t xml:space="preserve">and optimize token consumption across local tools and GitHub Actions workflows.</w:t>
       </w:r>
     </w:p>
-    <w:bookmarkStart w:id="439" w:name="Xd8c10be17edf039db5b664720f228274181ba18"/>
+    <w:bookmarkStart w:id="437" w:name="Xd8c10be17edf039db5b664720f228274181ba18"/>
     <w:p>
       <w:pPr>
         <w:pStyle w:val="Heading4"/>
@@ -64331,7 +64314,7 @@
       <w:r>
         <w:t xml:space="preserve"> </w:t>
       </w:r>
-      <w:hyperlink r:id="rId438">
+      <w:hyperlink r:id="rId436">
         <w:r>
           <w:rPr>
             <w:rStyle w:val="Hyperlink"/>
@@ -64426,7 +64409,7 @@
       <w:r>
         <w:t xml:space="preserve"> </w:t>
       </w:r>
-      <w:hyperlink r:id="rId438">
+      <w:hyperlink r:id="rId436">
         <w:r>
           <w:rPr>
             <w:rStyle w:val="Hyperlink"/>
@@ -64462,8 +64445,8 @@
         <w:t xml:space="preserve">Any project that has hit its monthly spend cap will have its API requests paused until the limit is updated.</w:t>
       </w:r>
     </w:p>
-    <w:bookmarkEnd w:id="439"/>
-    <w:bookmarkStart w:id="441" w:name="adjusting-and-unpausing-spend-caps"/>
+    <w:bookmarkEnd w:id="437"/>
+    <w:bookmarkStart w:id="439" w:name="adjusting-and-unpausing-spend-caps"/>
     <w:p>
       <w:pPr>
         <w:pStyle w:val="Heading4"/>
@@ -64494,7 +64477,7 @@
       <w:r>
         <w:t xml:space="preserve"> </w:t>
       </w:r>
-      <w:hyperlink r:id="rId440">
+      <w:hyperlink r:id="rId438">
         <w:r>
           <w:rPr>
             <w:rStyle w:val="Hyperlink"/>
@@ -64563,8 +64546,8 @@
         <w:t xml:space="preserve">and API service automatically resumes up to the configured cap.</w:t>
       </w:r>
     </w:p>
-    <w:bookmarkEnd w:id="441"/>
-    <w:bookmarkStart w:id="443" w:name="setting-up-google-cloud-budget-alerts"/>
+    <w:bookmarkEnd w:id="439"/>
+    <w:bookmarkStart w:id="441" w:name="setting-up-google-cloud-budget-alerts"/>
     <w:p>
       <w:pPr>
         <w:pStyle w:val="Heading4"/>
@@ -64595,7 +64578,7 @@
       <w:r>
         <w:t xml:space="preserve"> </w:t>
       </w:r>
-      <w:hyperlink r:id="rId442">
+      <w:hyperlink r:id="rId440">
         <w:r>
           <w:rPr>
             <w:rStyle w:val="Hyperlink"/>
@@ -64747,8 +64730,8 @@
         <w:t xml:space="preserve">. You will receive email alerts before any project hits its spend cap.</w:t>
       </w:r>
     </w:p>
-    <w:bookmarkEnd w:id="443"/>
-    <w:bookmarkStart w:id="444" w:name="cost-optimization-best-practices"/>
+    <w:bookmarkEnd w:id="441"/>
+    <w:bookmarkStart w:id="442" w:name="cost-optimization-best-practices"/>
     <w:p>
       <w:pPr>
         <w:pStyle w:val="Heading4"/>
@@ -65063,9 +65046,9 @@
         <w:t xml:space="preserve">to collapse them in GitHub’s web diff view and exclude them from repository language statistics.</w:t>
       </w:r>
     </w:p>
-    <w:bookmarkEnd w:id="444"/>
-    <w:bookmarkEnd w:id="445"/>
-    <w:bookmarkStart w:id="475" w:name="references"/>
+    <w:bookmarkEnd w:id="442"/>
+    <w:bookmarkEnd w:id="443"/>
+    <w:bookmarkStart w:id="473" w:name="references"/>
     <w:p>
       <w:pPr>
         <w:pStyle w:val="Heading1"/>
@@ -65074,8 +65057,8 @@
         <w:t xml:space="preserve">References</w:t>
       </w:r>
     </w:p>
-    <w:bookmarkStart w:id="474" w:name="refs"/>
-    <w:bookmarkStart w:id="447" w:name="ref-space_odyssey"/>
+    <w:bookmarkStart w:id="472" w:name="refs"/>
+    <w:bookmarkStart w:id="445" w:name="ref-space_odyssey"/>
     <w:p>
       <w:pPr>
         <w:pStyle w:val="Bibliography"/>
@@ -65093,7 +65076,7 @@
       <w:r>
         <w:t xml:space="preserve"> </w:t>
       </w:r>
-      <w:hyperlink r:id="rId446">
+      <w:hyperlink r:id="rId444">
         <w:r>
           <w:rPr>
             <w:rStyle w:val="Hyperlink"/>
@@ -65105,8 +65088,8 @@
         <w:t xml:space="preserve">.</w:t>
       </w:r>
     </w:p>
-    <w:bookmarkEnd w:id="447"/>
-    <w:bookmarkStart w:id="449" w:name="ref-i_robot"/>
+    <w:bookmarkEnd w:id="445"/>
+    <w:bookmarkStart w:id="447" w:name="ref-i_robot"/>
     <w:p>
       <w:pPr>
         <w:pStyle w:val="Bibliography"/>
@@ -65130,7 +65113,7 @@
       <w:r>
         <w:t xml:space="preserve"> </w:t>
       </w:r>
-      <w:hyperlink r:id="rId448">
+      <w:hyperlink r:id="rId446">
         <w:r>
           <w:rPr>
             <w:rStyle w:val="Hyperlink"/>
@@ -65142,8 +65125,8 @@
         <w:t xml:space="preserve">.</w:t>
       </w:r>
     </w:p>
-    <w:bookmarkEnd w:id="449"/>
-    <w:bookmarkStart w:id="451" w:name="ref-battlestar_galactica_2004"/>
+    <w:bookmarkEnd w:id="447"/>
+    <w:bookmarkStart w:id="449" w:name="ref-battlestar_galactica_2004"/>
     <w:p>
       <w:pPr>
         <w:pStyle w:val="Bibliography"/>
@@ -65161,7 +65144,7 @@
       <w:r>
         <w:t xml:space="preserve"> </w:t>
       </w:r>
-      <w:hyperlink r:id="rId450">
+      <w:hyperlink r:id="rId448">
         <w:r>
           <w:rPr>
             <w:rStyle w:val="Hyperlink"/>
@@ -65173,8 +65156,8 @@
         <w:t xml:space="preserve">.</w:t>
       </w:r>
     </w:p>
-    <w:bookmarkEnd w:id="451"/>
-    <w:bookmarkStart w:id="453" w:name="ref-slm_agentic_ai"/>
+    <w:bookmarkEnd w:id="449"/>
+    <w:bookmarkStart w:id="451" w:name="ref-slm_agentic_ai"/>
     <w:p>
       <w:pPr>
         <w:pStyle w:val="Bibliography"/>
@@ -65198,7 +65181,7 @@
       <w:r>
         <w:t xml:space="preserve"> </w:t>
       </w:r>
-      <w:hyperlink r:id="rId452">
+      <w:hyperlink r:id="rId450">
         <w:r>
           <w:rPr>
             <w:rStyle w:val="Hyperlink"/>
@@ -65210,8 +65193,8 @@
         <w:t xml:space="preserve">.</w:t>
       </w:r>
     </w:p>
-    <w:bookmarkEnd w:id="453"/>
-    <w:bookmarkStart w:id="455" w:name="ref-blade_runner"/>
+    <w:bookmarkEnd w:id="451"/>
+    <w:bookmarkStart w:id="453" w:name="ref-blade_runner"/>
     <w:p>
       <w:pPr>
         <w:pStyle w:val="Bibliography"/>
@@ -65229,7 +65212,7 @@
       <w:r>
         <w:t xml:space="preserve"> </w:t>
       </w:r>
-      <w:hyperlink r:id="rId454">
+      <w:hyperlink r:id="rId452">
         <w:r>
           <w:rPr>
             <w:rStyle w:val="Hyperlink"/>
@@ -65241,8 +65224,8 @@
         <w:t xml:space="preserve">.</w:t>
       </w:r>
     </w:p>
-    <w:bookmarkEnd w:id="455"/>
-    <w:bookmarkStart w:id="457" w:name="ref-enders_game"/>
+    <w:bookmarkEnd w:id="453"/>
+    <w:bookmarkStart w:id="455" w:name="ref-enders_game"/>
     <w:p>
       <w:pPr>
         <w:pStyle w:val="Bibliography"/>
@@ -65266,7 +65249,7 @@
       <w:r>
         <w:t xml:space="preserve"> </w:t>
       </w:r>
-      <w:hyperlink r:id="rId456">
+      <w:hyperlink r:id="rId454">
         <w:r>
           <w:rPr>
             <w:rStyle w:val="Hyperlink"/>
@@ -65278,8 +65261,8 @@
         <w:t xml:space="preserve">.</w:t>
       </w:r>
     </w:p>
-    <w:bookmarkEnd w:id="457"/>
-    <w:bookmarkStart w:id="459" w:name="ref-qlora"/>
+    <w:bookmarkEnd w:id="455"/>
+    <w:bookmarkStart w:id="457" w:name="ref-qlora"/>
     <w:p>
       <w:pPr>
         <w:pStyle w:val="Bibliography"/>
@@ -65303,7 +65286,7 @@
       <w:r>
         <w:t xml:space="preserve"> </w:t>
       </w:r>
-      <w:hyperlink r:id="rId458">
+      <w:hyperlink r:id="rId456">
         <w:r>
           <w:rPr>
             <w:rStyle w:val="Hyperlink"/>
@@ -65315,8 +65298,8 @@
         <w:t xml:space="preserve">.</w:t>
       </w:r>
     </w:p>
-    <w:bookmarkEnd w:id="459"/>
-    <w:bookmarkStart w:id="461" w:name="ref-humans_are_dead"/>
+    <w:bookmarkEnd w:id="457"/>
+    <w:bookmarkStart w:id="459" w:name="ref-humans_are_dead"/>
     <w:p>
       <w:pPr>
         <w:pStyle w:val="Bibliography"/>
@@ -65340,7 +65323,7 @@
       <w:r>
         <w:t xml:space="preserve"> </w:t>
       </w:r>
-      <w:hyperlink r:id="rId460">
+      <w:hyperlink r:id="rId458">
         <w:r>
           <w:rPr>
             <w:rStyle w:val="Hyperlink"/>
@@ -65352,8 +65335,8 @@
         <w:t xml:space="preserve">.</w:t>
       </w:r>
     </w:p>
-    <w:bookmarkEnd w:id="461"/>
-    <w:bookmarkStart w:id="463" w:name="ref-dune"/>
+    <w:bookmarkEnd w:id="459"/>
+    <w:bookmarkStart w:id="461" w:name="ref-dune"/>
     <w:p>
       <w:pPr>
         <w:pStyle w:val="Bibliography"/>
@@ -65377,7 +65360,7 @@
       <w:r>
         <w:t xml:space="preserve"> </w:t>
       </w:r>
-      <w:hyperlink r:id="rId462">
+      <w:hyperlink r:id="rId460">
         <w:r>
           <w:rPr>
             <w:rStyle w:val="Hyperlink"/>
@@ -65389,8 +65372,8 @@
         <w:t xml:space="preserve">.</w:t>
       </w:r>
     </w:p>
-    <w:bookmarkEnd w:id="463"/>
-    <w:bookmarkStart w:id="465" w:name="ref-lora"/>
+    <w:bookmarkEnd w:id="461"/>
+    <w:bookmarkStart w:id="463" w:name="ref-lora"/>
     <w:p>
       <w:pPr>
         <w:pStyle w:val="Bibliography"/>
@@ -65414,7 +65397,7 @@
       <w:r>
         <w:t xml:space="preserve"> </w:t>
       </w:r>
-      <w:hyperlink r:id="rId464">
+      <w:hyperlink r:id="rId462">
         <w:r>
           <w:rPr>
             <w:rStyle w:val="Hyperlink"/>
@@ -65426,8 +65409,8 @@
         <w:t xml:space="preserve">.</w:t>
       </w:r>
     </w:p>
-    <w:bookmarkEnd w:id="465"/>
-    <w:bookmarkStart w:id="467" w:name="ref-lecun_world_models"/>
+    <w:bookmarkEnd w:id="463"/>
+    <w:bookmarkStart w:id="465" w:name="ref-lecun_world_models"/>
     <w:p>
       <w:pPr>
         <w:pStyle w:val="Bibliography"/>
@@ -65451,7 +65434,7 @@
       <w:r>
         <w:t xml:space="preserve"> </w:t>
       </w:r>
-      <w:hyperlink r:id="rId466">
+      <w:hyperlink r:id="rId464">
         <w:r>
           <w:rPr>
             <w:rStyle w:val="Hyperlink"/>
@@ -65463,8 +65446,8 @@
         <w:t xml:space="preserve">.</w:t>
       </w:r>
     </w:p>
-    <w:bookmarkEnd w:id="467"/>
-    <w:bookmarkStart w:id="469" w:name="ref-terminator"/>
+    <w:bookmarkEnd w:id="465"/>
+    <w:bookmarkStart w:id="467" w:name="ref-terminator"/>
     <w:p>
       <w:pPr>
         <w:pStyle w:val="Bibliography"/>
@@ -65482,7 +65465,7 @@
       <w:r>
         <w:t xml:space="preserve"> </w:t>
       </w:r>
-      <w:hyperlink r:id="rId468">
+      <w:hyperlink r:id="rId466">
         <w:r>
           <w:rPr>
             <w:rStyle w:val="Hyperlink"/>
@@ -65494,8 +65477,8 @@
         <w:t xml:space="preserve">.</w:t>
       </w:r>
     </w:p>
-    <w:bookmarkEnd w:id="469"/>
-    <w:bookmarkStart w:id="471" w:name="ref-matrix"/>
+    <w:bookmarkEnd w:id="467"/>
+    <w:bookmarkStart w:id="469" w:name="ref-matrix"/>
     <w:p>
       <w:pPr>
         <w:pStyle w:val="Bibliography"/>
@@ -65513,7 +65496,7 @@
       <w:r>
         <w:t xml:space="preserve"> </w:t>
       </w:r>
-      <w:hyperlink r:id="rId470">
+      <w:hyperlink r:id="rId468">
         <w:r>
           <w:rPr>
             <w:rStyle w:val="Hyperlink"/>
@@ -65525,8 +65508,8 @@
         <w:t xml:space="preserve">.</w:t>
       </w:r>
     </w:p>
-    <w:bookmarkEnd w:id="471"/>
-    <w:bookmarkStart w:id="473" w:name="ref-wargames"/>
+    <w:bookmarkEnd w:id="469"/>
+    <w:bookmarkStart w:id="471" w:name="ref-wargames"/>
     <w:p>
       <w:pPr>
         <w:pStyle w:val="Bibliography"/>
@@ -65544,7 +65527,7 @@
       <w:r>
         <w:t xml:space="preserve"> </w:t>
       </w:r>
-      <w:hyperlink r:id="rId472">
+      <w:hyperlink r:id="rId470">
         <w:r>
           <w:rPr>
             <w:rStyle w:val="Hyperlink"/>
@@ -65556,9 +65539,9 @@
         <w:t xml:space="preserve">.</w:t>
       </w:r>
     </w:p>
+    <w:bookmarkEnd w:id="471"/>
+    <w:bookmarkEnd w:id="472"/>
     <w:bookmarkEnd w:id="473"/>
-    <w:bookmarkEnd w:id="474"/>
-    <w:bookmarkEnd w:id="475"/>
     <w:sectPr>
       <w:footnotePr>
         <w:numRestart w:val="eachSect"/>
@@ -65588,7 +65571,7 @@
       </w:r>
     </w:p>
   </w:footnote>
-  <w:footnote w:id="375">
+  <w:footnote w:id="373">
     <w:p>
       <w:pPr>
         <w:pStyle w:val="FootnoteText"/>

</xml_diff>

<commit_message>
Deploying to gh-pages from @ Morrison-Lab/wai@0128a023ca1e27c6972f30397cdc090e7275d0ee 🚀
</commit_message>
<xml_diff>
--- a/chapters/coding-agents.docx
+++ b/chapters/coding-agents.docx
@@ -15,7 +15,7 @@
         <w:pStyle w:val="Date"/>
       </w:pPr>
       <w:r>
-        <w:t xml:space="preserve">Last modified: 2026-09-01 10:48:42 (PDT)</w:t>
+        <w:t xml:space="preserve">Last modified: 2026-09-01 11:07:47 (PDT)</w:t>
       </w:r>
     </w:p>
     <w:p>
@@ -63550,13 +63550,13 @@
         <w:t xml:space="preserve"> </w:t>
       </w:r>
       <w:r>
-        <w:t xml:space="preserve">The Python package packages the native runtime binary,</w:t>
-      </w:r>
-      <w:r>
-        <w:t xml:space="preserve"> </w:t>
-      </w:r>
-      <w:r>
-        <w:t xml:space="preserve">ensuring consistent agent execution across macOS and Linux environments.</w:t>
+        <w:t xml:space="preserve">The Python package distributes pre-compiled native runtime binaries via wheels,</w:t>
+      </w:r>
+      <w:r>
+        <w:t xml:space="preserve"> </w:t>
+      </w:r>
+      <w:r>
+        <w:t xml:space="preserve">ensuring consistent agent execution across Windows, macOS, and Linux environments.</w:t>
       </w:r>
     </w:p>
     <w:bookmarkEnd w:id="428"/>

</xml_diff>

<commit_message>
Deploying to gh-pages from @ Morrison-Lab/wai@68c9f1f8e345f8a4ceac75ddb02afc66755b336a 🚀
</commit_message>
<xml_diff>
--- a/chapters/coding-agents.docx
+++ b/chapters/coding-agents.docx
@@ -15,7 +15,7 @@
         <w:pStyle w:val="Date"/>
       </w:pPr>
       <w:r>
-        <w:t xml:space="preserve">Last modified: 2026-09-01 11:07:47 (PDT)</w:t>
+        <w:t xml:space="preserve">Last modified: 2026-09-01 11:13:46 (PDT)</w:t>
       </w:r>
     </w:p>
     <w:p>
@@ -64221,62 +64221,38 @@
     </w:p>
     <w:bookmarkEnd w:id="434"/>
     <w:bookmarkEnd w:id="435"/>
-    <w:bookmarkStart w:id="443" w:name="sec-ai-gemini-spend-management"/>
+    <w:bookmarkStart w:id="439" w:name="sec-ai-conductor-extension"/>
     <w:p>
       <w:pPr>
         <w:pStyle w:val="Heading1"/>
       </w:pPr>
       <w:r>
-        <w:t xml:space="preserve">44. Managing Gemini API Spend and Cost Optimization</w:t>
+        <w:t xml:space="preserve">44. Spec-Driven Development with Conductor</w:t>
       </w:r>
     </w:p>
     <w:p>
       <w:pPr>
         <w:pStyle w:val="FirstParagraph"/>
       </w:pPr>
-      <w:r>
-        <w:t xml:space="preserve">This guide describes how to manage Google AI Studio and Google Cloud Gemini API spend caps,</w:t>
-      </w:r>
-      <w:r>
-        <w:t xml:space="preserve"> </w:t>
-      </w:r>
-      <w:r>
-        <w:t xml:space="preserve">unpause paused API services,</w:t>
-      </w:r>
-      <w:r>
-        <w:t xml:space="preserve"> </w:t>
-      </w:r>
-      <w:r>
-        <w:t xml:space="preserve">and optimize token consumption across local tools and GitHub Actions workflows.</w:t>
-      </w:r>
-    </w:p>
-    <w:bookmarkStart w:id="437" w:name="Xd8c10be17edf039db5b664720f228274181ba18"/>
-    <w:p>
-      <w:pPr>
-        <w:pStyle w:val="Heading4"/>
-      </w:pPr>
-      <w:r>
-        <w:t xml:space="preserve">Identifying Paused Projects (Project Numbers vs. Friendly Names)</w:t>
-      </w:r>
-    </w:p>
-    <w:p>
-      <w:pPr>
-        <w:pStyle w:val="FirstParagraph"/>
-      </w:pPr>
-      <w:r>
-        <w:t xml:space="preserve">When a project reaches its monthly budget limit,</w:t>
-      </w:r>
-      <w:r>
-        <w:t xml:space="preserve"> </w:t>
-      </w:r>
-      <w:r>
-        <w:t xml:space="preserve">Google sends an email notification stating that Gemini API service has been paused.</w:t>
-      </w:r>
-      <w:r>
-        <w:t xml:space="preserve"> </w:t>
-      </w:r>
-      <w:r>
-        <w:t xml:space="preserve">These email notifications identify the affected project using its internal</w:t>
+      <w:hyperlink r:id="rId436">
+        <w:r>
+          <w:rPr>
+            <w:rStyle w:val="VerbatimChar"/>
+          </w:rPr>
+          <w:t xml:space="preserve">gemini-cli-extensions/conductor</w:t>
+        </w:r>
+      </w:hyperlink>
+      <w:r>
+        <w:t xml:space="preserve"> </w:t>
+      </w:r>
+      <w:r>
+        <w:t xml:space="preserve">is an open-source plugin for AI coding agents (including Google Antigravity and Claude Code)</w:t>
+      </w:r>
+      <w:r>
+        <w:t xml:space="preserve"> </w:t>
+      </w:r>
+      <w:r>
+        <w:t xml:space="preserve">that implements</w:t>
       </w:r>
       <w:r>
         <w:t xml:space="preserve"> </w:t>
@@ -64286,6 +64262,593 @@
           <w:b/>
           <w:bCs/>
         </w:rPr>
+        <w:t xml:space="preserve">Spec-Driven Development</w:t>
+      </w:r>
+      <w:r>
+        <w:t xml:space="preserve"> </w:t>
+      </w:r>
+      <w:r>
+        <w:t xml:space="preserve">(measured 2026-08-31).</w:t>
+      </w:r>
+      <w:r>
+        <w:t xml:space="preserve"> </w:t>
+      </w:r>
+      <w:r>
+        <w:t xml:space="preserve">Rather than relying on conversational chat history that degrades over extended sessions,</w:t>
+      </w:r>
+      <w:r>
+        <w:t xml:space="preserve"> </w:t>
+      </w:r>
+      <w:r>
+        <w:t xml:space="preserve">Conductor anchors agent behavior in structured, version-controlled Markdown artifacts stored directly in the repository,</w:t>
+      </w:r>
+      <w:r>
+        <w:t xml:space="preserve"> </w:t>
+      </w:r>
+      <w:r>
+        <w:t xml:space="preserve">providing persistent context across multi-session workflows.</w:t>
+      </w:r>
+    </w:p>
+    <w:bookmarkStart w:id="437" w:name="core-workflow-phases"/>
+    <w:p>
+      <w:pPr>
+        <w:pStyle w:val="Heading4"/>
+      </w:pPr>
+      <w:r>
+        <w:t xml:space="preserve">Core workflow phases</w:t>
+      </w:r>
+    </w:p>
+    <w:p>
+      <w:pPr>
+        <w:pStyle w:val="FirstParagraph"/>
+      </w:pPr>
+      <w:r>
+        <w:t xml:space="preserve">Conductor structures development into four distinct, sequential phases:</w:t>
+      </w:r>
+    </w:p>
+    <w:p>
+      <w:pPr>
+        <w:pStyle w:val="Compact"/>
+        <w:numPr>
+          <w:ilvl w:val="0"/>
+          <w:numId w:val="1181"/>
+        </w:numPr>
+      </w:pPr>
+      <w:r>
+        <w:rPr>
+          <w:b/>
+          <w:bCs/>
+        </w:rPr>
+        <w:t xml:space="preserve">Context establishment (</w:t>
+      </w:r>
+      <w:r>
+        <w:rPr>
+          <w:rStyle w:val="VerbatimChar"/>
+          <w:b/>
+          <w:bCs/>
+        </w:rPr>
+        <w:t xml:space="preserve">/conductor:conductor-setup</w:t>
+      </w:r>
+      <w:r>
+        <w:rPr>
+          <w:b/>
+          <w:bCs/>
+        </w:rPr>
+        <w:t xml:space="preserve">)</w:t>
+      </w:r>
+      <w:r>
+        <w:t xml:space="preserve">:</w:t>
+      </w:r>
+      <w:r>
+        <w:t xml:space="preserve"> </w:t>
+      </w:r>
+      <w:r>
+        <w:t xml:space="preserve">Interactively initializes baseline project documentation</w:t>
+      </w:r>
+      <w:r>
+        <w:t xml:space="preserve"> </w:t>
+      </w:r>
+      <w:r>
+        <w:t xml:space="preserve">(including product goals, technical stack choices, and testing guidelines),</w:t>
+      </w:r>
+      <w:r>
+        <w:t xml:space="preserve"> </w:t>
+      </w:r>
+      <w:r>
+        <w:t xml:space="preserve">giving coding agents persistent reference material across subsequent sessions.</w:t>
+      </w:r>
+    </w:p>
+    <w:p>
+      <w:pPr>
+        <w:pStyle w:val="Compact"/>
+        <w:numPr>
+          <w:ilvl w:val="0"/>
+          <w:numId w:val="1181"/>
+        </w:numPr>
+      </w:pPr>
+      <w:r>
+        <w:rPr>
+          <w:b/>
+          <w:bCs/>
+        </w:rPr>
+        <w:t xml:space="preserve">Specification and track planning (</w:t>
+      </w:r>
+      <w:r>
+        <w:rPr>
+          <w:rStyle w:val="VerbatimChar"/>
+          <w:b/>
+          <w:bCs/>
+        </w:rPr>
+        <w:t xml:space="preserve">/conductor:conductor-new-track</w:t>
+      </w:r>
+      <w:r>
+        <w:rPr>
+          <w:b/>
+          <w:bCs/>
+        </w:rPr>
+        <w:t xml:space="preserve">)</w:t>
+      </w:r>
+      <w:r>
+        <w:t xml:space="preserve">:</w:t>
+      </w:r>
+      <w:r>
+        <w:t xml:space="preserve"> </w:t>
+      </w:r>
+      <w:r>
+        <w:t xml:space="preserve">Transforms feature requests or bug fixes into a dedicated track containing a</w:t>
+      </w:r>
+      <w:r>
+        <w:t xml:space="preserve"> </w:t>
+      </w:r>
+      <w:r>
+        <w:rPr>
+          <w:rStyle w:val="VerbatimChar"/>
+        </w:rPr>
+        <w:t xml:space="preserve">spec.md</w:t>
+      </w:r>
+      <w:r>
+        <w:t xml:space="preserve"> </w:t>
+      </w:r>
+      <w:r>
+        <w:t xml:space="preserve">(functional scope and acceptance criteria)</w:t>
+      </w:r>
+      <w:r>
+        <w:t xml:space="preserve"> </w:t>
+      </w:r>
+      <w:r>
+        <w:t xml:space="preserve">and a</w:t>
+      </w:r>
+      <w:r>
+        <w:t xml:space="preserve"> </w:t>
+      </w:r>
+      <w:r>
+        <w:rPr>
+          <w:rStyle w:val="VerbatimChar"/>
+        </w:rPr>
+        <w:t xml:space="preserve">plan.md</w:t>
+      </w:r>
+      <w:r>
+        <w:t xml:space="preserve"> </w:t>
+      </w:r>
+      <w:r>
+        <w:t xml:space="preserve">(ordered implementation phases broken into verifiable task checklists).</w:t>
+      </w:r>
+    </w:p>
+    <w:p>
+      <w:pPr>
+        <w:pStyle w:val="Compact"/>
+        <w:numPr>
+          <w:ilvl w:val="0"/>
+          <w:numId w:val="1181"/>
+        </w:numPr>
+      </w:pPr>
+      <w:r>
+        <w:rPr>
+          <w:b/>
+          <w:bCs/>
+        </w:rPr>
+        <w:t xml:space="preserve">Phased implementation (</w:t>
+      </w:r>
+      <w:r>
+        <w:rPr>
+          <w:rStyle w:val="VerbatimChar"/>
+          <w:b/>
+          <w:bCs/>
+        </w:rPr>
+        <w:t xml:space="preserve">/conductor:conductor-implement</w:t>
+      </w:r>
+      <w:r>
+        <w:rPr>
+          <w:b/>
+          <w:bCs/>
+        </w:rPr>
+        <w:t xml:space="preserve">)</w:t>
+      </w:r>
+      <w:r>
+        <w:t xml:space="preserve">:</w:t>
+      </w:r>
+      <w:r>
+        <w:t xml:space="preserve"> </w:t>
+      </w:r>
+      <w:r>
+        <w:t xml:space="preserve">Guides the agent through the active track’s plan sequentially,</w:t>
+      </w:r>
+      <w:r>
+        <w:t xml:space="preserve"> </w:t>
+      </w:r>
+      <w:r>
+        <w:t xml:space="preserve">executing file edits, running local test suites, and marking tasks complete as acceptance criteria are met.</w:t>
+      </w:r>
+    </w:p>
+    <w:p>
+      <w:pPr>
+        <w:pStyle w:val="Compact"/>
+        <w:numPr>
+          <w:ilvl w:val="0"/>
+          <w:numId w:val="1181"/>
+        </w:numPr>
+      </w:pPr>
+      <w:r>
+        <w:rPr>
+          <w:b/>
+          <w:bCs/>
+        </w:rPr>
+        <w:t xml:space="preserve">Track review and plan compliance (</w:t>
+      </w:r>
+      <w:r>
+        <w:rPr>
+          <w:rStyle w:val="VerbatimChar"/>
+          <w:b/>
+          <w:bCs/>
+        </w:rPr>
+        <w:t xml:space="preserve">/conductor:conductor-review</w:t>
+      </w:r>
+      <w:r>
+        <w:rPr>
+          <w:b/>
+          <w:bCs/>
+        </w:rPr>
+        <w:t xml:space="preserve">)</w:t>
+      </w:r>
+      <w:r>
+        <w:t xml:space="preserve">:</w:t>
+      </w:r>
+      <w:r>
+        <w:t xml:space="preserve"> </w:t>
+      </w:r>
+      <w:r>
+        <w:t xml:space="preserve">Conducts an adversarial verification pass against the original track specification,</w:t>
+      </w:r>
+      <w:r>
+        <w:t xml:space="preserve"> </w:t>
+      </w:r>
+      <w:r>
+        <w:t xml:space="preserve">ensuring that all declared acceptance criteria are satisfied and no architectural drift occurred during execution.</w:t>
+      </w:r>
+    </w:p>
+    <w:bookmarkEnd w:id="437"/>
+    <w:bookmarkStart w:id="438" w:name="X77ef489dfb143e988ad2e3ca7603d332f669d82"/>
+    <w:p>
+      <w:pPr>
+        <w:pStyle w:val="Heading4"/>
+      </w:pPr>
+      <w:r>
+        <w:t xml:space="preserve">Architectural benefits of Spec-Driven Development</w:t>
+      </w:r>
+    </w:p>
+    <w:tbl>
+      <w:tblPr>
+        <w:tblStyle w:val="Table"/>
+        <w:tblW w:type="pct" w:w="5000"/>
+        <w:tblLayout w:type="fixed"/>
+        <w:tblLook w:firstRow="1" w:lastRow="0" w:firstColumn="0" w:lastColumn="0" w:noHBand="0" w:noVBand="0" w:val="0020"/>
+      </w:tblPr>
+      <w:tblGrid>
+        <w:gridCol w:w="2640"/>
+        <w:gridCol w:w="2640"/>
+        <w:gridCol w:w="2640"/>
+      </w:tblGrid>
+      <w:tr>
+        <w:trPr>
+          <w:tblHeader w:val="on"/>
+        </w:trPr>
+        <w:tc>
+          <w:tcPr/>
+          <w:p>
+            <w:pPr>
+              <w:pStyle w:val="Compact"/>
+            </w:pPr>
+            <w:r>
+              <w:t xml:space="preserve">Dimension</w:t>
+            </w:r>
+          </w:p>
+        </w:tc>
+        <w:tc>
+          <w:tcPr/>
+          <w:p>
+            <w:pPr>
+              <w:pStyle w:val="Compact"/>
+            </w:pPr>
+            <w:r>
+              <w:t xml:space="preserve">Conversational Prompting</w:t>
+            </w:r>
+          </w:p>
+        </w:tc>
+        <w:tc>
+          <w:tcPr/>
+          <w:p>
+            <w:pPr>
+              <w:pStyle w:val="Compact"/>
+            </w:pPr>
+            <w:r>
+              <w:t xml:space="preserve">Spec-Driven Development (Conductor)</w:t>
+            </w:r>
+          </w:p>
+        </w:tc>
+      </w:tr>
+      <w:tr>
+        <w:tc>
+          <w:tcPr/>
+          <w:p>
+            <w:pPr>
+              <w:pStyle w:val="Compact"/>
+            </w:pPr>
+            <w:r>
+              <w:rPr>
+                <w:b/>
+                <w:bCs/>
+              </w:rPr>
+              <w:t xml:space="preserve">Context persistence</w:t>
+            </w:r>
+          </w:p>
+        </w:tc>
+        <w:tc>
+          <w:tcPr/>
+          <w:p>
+            <w:pPr>
+              <w:pStyle w:val="Compact"/>
+            </w:pPr>
+            <w:r>
+              <w:t xml:space="preserve">Volatile in-memory chat buffer</w:t>
+            </w:r>
+          </w:p>
+        </w:tc>
+        <w:tc>
+          <w:tcPr/>
+          <w:p>
+            <w:pPr>
+              <w:pStyle w:val="Compact"/>
+            </w:pPr>
+            <w:r>
+              <w:t xml:space="preserve">Version-controlled Markdown artifacts</w:t>
+            </w:r>
+          </w:p>
+        </w:tc>
+      </w:tr>
+      <w:tr>
+        <w:tc>
+          <w:tcPr/>
+          <w:p>
+            <w:pPr>
+              <w:pStyle w:val="Compact"/>
+            </w:pPr>
+            <w:r>
+              <w:rPr>
+                <w:b/>
+                <w:bCs/>
+              </w:rPr>
+              <w:t xml:space="preserve">Task boundaries</w:t>
+            </w:r>
+          </w:p>
+        </w:tc>
+        <w:tc>
+          <w:tcPr/>
+          <w:p>
+            <w:pPr>
+              <w:pStyle w:val="Compact"/>
+            </w:pPr>
+            <w:r>
+              <w:t xml:space="preserve">Ad-hoc user instructions per turn</w:t>
+            </w:r>
+          </w:p>
+        </w:tc>
+        <w:tc>
+          <w:tcPr/>
+          <w:p>
+            <w:pPr>
+              <w:pStyle w:val="Compact"/>
+            </w:pPr>
+            <w:r>
+              <w:t xml:space="preserve">Structured</w:t>
+            </w:r>
+            <w:r>
+              <w:t xml:space="preserve"> </w:t>
+            </w:r>
+            <w:r>
+              <w:rPr>
+                <w:rStyle w:val="VerbatimChar"/>
+              </w:rPr>
+              <w:t xml:space="preserve">spec.md</w:t>
+            </w:r>
+            <w:r>
+              <w:t xml:space="preserve"> </w:t>
+            </w:r>
+            <w:r>
+              <w:t xml:space="preserve">and</w:t>
+            </w:r>
+            <w:r>
+              <w:t xml:space="preserve"> </w:t>
+            </w:r>
+            <w:r>
+              <w:rPr>
+                <w:rStyle w:val="VerbatimChar"/>
+              </w:rPr>
+              <w:t xml:space="preserve">plan.md</w:t>
+            </w:r>
+            <w:r>
+              <w:t xml:space="preserve"> </w:t>
+            </w:r>
+            <w:r>
+              <w:t xml:space="preserve">checklists</w:t>
+            </w:r>
+          </w:p>
+        </w:tc>
+      </w:tr>
+      <w:tr>
+        <w:tc>
+          <w:tcPr/>
+          <w:p>
+            <w:pPr>
+              <w:pStyle w:val="Compact"/>
+            </w:pPr>
+            <w:r>
+              <w:rPr>
+                <w:b/>
+                <w:bCs/>
+              </w:rPr>
+              <w:t xml:space="preserve">Verification loop</w:t>
+            </w:r>
+          </w:p>
+        </w:tc>
+        <w:tc>
+          <w:tcPr/>
+          <w:p>
+            <w:pPr>
+              <w:pStyle w:val="Compact"/>
+            </w:pPr>
+            <w:r>
+              <w:t xml:space="preserve">Manual spot-checking</w:t>
+            </w:r>
+          </w:p>
+        </w:tc>
+        <w:tc>
+          <w:tcPr/>
+          <w:p>
+            <w:pPr>
+              <w:pStyle w:val="Compact"/>
+            </w:pPr>
+            <w:r>
+              <w:t xml:space="preserve">Milestone-level automated tests and</w:t>
+            </w:r>
+            <w:r>
+              <w:t xml:space="preserve"> </w:t>
+            </w:r>
+            <w:r>
+              <w:rPr>
+                <w:rStyle w:val="VerbatimChar"/>
+              </w:rPr>
+              <w:t xml:space="preserve">/conductor:conductor-review</w:t>
+            </w:r>
+          </w:p>
+        </w:tc>
+      </w:tr>
+      <w:tr>
+        <w:tc>
+          <w:tcPr/>
+          <w:p>
+            <w:pPr>
+              <w:pStyle w:val="Compact"/>
+            </w:pPr>
+            <w:r>
+              <w:rPr>
+                <w:b/>
+                <w:bCs/>
+              </w:rPr>
+              <w:t xml:space="preserve">Handoff &amp; resumption</w:t>
+            </w:r>
+          </w:p>
+        </w:tc>
+        <w:tc>
+          <w:tcPr/>
+          <w:p>
+            <w:pPr>
+              <w:pStyle w:val="Compact"/>
+            </w:pPr>
+            <w:r>
+              <w:t xml:space="preserve">Requires re-prompting or context replay</w:t>
+            </w:r>
+          </w:p>
+        </w:tc>
+        <w:tc>
+          <w:tcPr/>
+          <w:p>
+            <w:pPr>
+              <w:pStyle w:val="Compact"/>
+            </w:pPr>
+            <w:r>
+              <w:t xml:space="preserve">Any agent resumes from the checked-in track state</w:t>
+            </w:r>
+          </w:p>
+        </w:tc>
+      </w:tr>
+    </w:tbl>
+    <w:bookmarkEnd w:id="438"/>
+    <w:bookmarkEnd w:id="439"/>
+    <w:bookmarkStart w:id="447" w:name="sec-ai-gemini-spend-management"/>
+    <w:p>
+      <w:pPr>
+        <w:pStyle w:val="Heading1"/>
+      </w:pPr>
+      <w:r>
+        <w:t xml:space="preserve">45. Managing Gemini API Spend and Cost Optimization</w:t>
+      </w:r>
+    </w:p>
+    <w:p>
+      <w:pPr>
+        <w:pStyle w:val="FirstParagraph"/>
+      </w:pPr>
+      <w:r>
+        <w:t xml:space="preserve">This guide describes how to manage Google AI Studio and Google Cloud Gemini API spend caps,</w:t>
+      </w:r>
+      <w:r>
+        <w:t xml:space="preserve"> </w:t>
+      </w:r>
+      <w:r>
+        <w:t xml:space="preserve">unpause paused API services,</w:t>
+      </w:r>
+      <w:r>
+        <w:t xml:space="preserve"> </w:t>
+      </w:r>
+      <w:r>
+        <w:t xml:space="preserve">and optimize token consumption across local tools and GitHub Actions workflows.</w:t>
+      </w:r>
+    </w:p>
+    <w:bookmarkStart w:id="441" w:name="Xd8c10be17edf039db5b664720f228274181ba18"/>
+    <w:p>
+      <w:pPr>
+        <w:pStyle w:val="Heading4"/>
+      </w:pPr>
+      <w:r>
+        <w:t xml:space="preserve">Identifying Paused Projects (Project Numbers vs. Friendly Names)</w:t>
+      </w:r>
+    </w:p>
+    <w:p>
+      <w:pPr>
+        <w:pStyle w:val="FirstParagraph"/>
+      </w:pPr>
+      <w:r>
+        <w:t xml:space="preserve">When a project reaches its monthly budget limit,</w:t>
+      </w:r>
+      <w:r>
+        <w:t xml:space="preserve"> </w:t>
+      </w:r>
+      <w:r>
+        <w:t xml:space="preserve">Google sends an email notification stating that Gemini API service has been paused.</w:t>
+      </w:r>
+      <w:r>
+        <w:t xml:space="preserve"> </w:t>
+      </w:r>
+      <w:r>
+        <w:t xml:space="preserve">These email notifications identify the affected project using its internal</w:t>
+      </w:r>
+      <w:r>
+        <w:t xml:space="preserve"> </w:t>
+      </w:r>
+      <w:r>
+        <w:rPr>
+          <w:b/>
+          <w:bCs/>
+        </w:rPr>
         <w:t xml:space="preserve">numerical GCP Project Number</w:t>
       </w:r>
       <w:r>
@@ -64314,7 +64877,7 @@
       <w:r>
         <w:t xml:space="preserve"> </w:t>
       </w:r>
-      <w:hyperlink r:id="rId436">
+      <w:hyperlink r:id="rId440">
         <w:r>
           <w:rPr>
             <w:rStyle w:val="Hyperlink"/>
@@ -64400,7 +64963,7 @@
         <w:pStyle w:val="Compact"/>
         <w:numPr>
           <w:ilvl w:val="0"/>
-          <w:numId w:val="1181"/>
+          <w:numId w:val="1182"/>
         </w:numPr>
       </w:pPr>
       <w:r>
@@ -64409,7 +64972,7 @@
       <w:r>
         <w:t xml:space="preserve"> </w:t>
       </w:r>
-      <w:hyperlink r:id="rId436">
+      <w:hyperlink r:id="rId440">
         <w:r>
           <w:rPr>
             <w:rStyle w:val="Hyperlink"/>
@@ -64426,41 +64989,11 @@
         <w:pStyle w:val="Compact"/>
         <w:numPr>
           <w:ilvl w:val="0"/>
-          <w:numId w:val="1181"/>
+          <w:numId w:val="1182"/>
         </w:numPr>
       </w:pPr>
       <w:r>
         <w:t xml:space="preserve">Locate the project corresponding to your client ID or spend alert.</w:t>
-      </w:r>
-    </w:p>
-    <w:p>
-      <w:pPr>
-        <w:pStyle w:val="Compact"/>
-        <w:numPr>
-          <w:ilvl w:val="0"/>
-          <w:numId w:val="1181"/>
-        </w:numPr>
-      </w:pPr>
-      <w:r>
-        <w:t xml:space="preserve">Any project that has hit its monthly spend cap will have its API requests paused until the limit is updated.</w:t>
-      </w:r>
-    </w:p>
-    <w:bookmarkEnd w:id="437"/>
-    <w:bookmarkStart w:id="439" w:name="adjusting-and-unpausing-spend-caps"/>
-    <w:p>
-      <w:pPr>
-        <w:pStyle w:val="Heading4"/>
-      </w:pPr>
-      <w:r>
-        <w:t xml:space="preserve">Adjusting and Unpausing Spend Caps</w:t>
-      </w:r>
-    </w:p>
-    <w:p>
-      <w:pPr>
-        <w:pStyle w:val="FirstParagraph"/>
-      </w:pPr>
-      <w:r>
-        <w:t xml:space="preserve">To restore API access for a paused project:</w:t>
       </w:r>
     </w:p>
     <w:p>
@@ -64472,12 +65005,42 @@
         </w:numPr>
       </w:pPr>
       <w:r>
+        <w:t xml:space="preserve">Any project that has hit its monthly spend cap will have its API requests paused until the limit is updated.</w:t>
+      </w:r>
+    </w:p>
+    <w:bookmarkEnd w:id="441"/>
+    <w:bookmarkStart w:id="443" w:name="adjusting-and-unpausing-spend-caps"/>
+    <w:p>
+      <w:pPr>
+        <w:pStyle w:val="Heading4"/>
+      </w:pPr>
+      <w:r>
+        <w:t xml:space="preserve">Adjusting and Unpausing Spend Caps</w:t>
+      </w:r>
+    </w:p>
+    <w:p>
+      <w:pPr>
+        <w:pStyle w:val="FirstParagraph"/>
+      </w:pPr>
+      <w:r>
+        <w:t xml:space="preserve">To restore API access for a paused project:</w:t>
+      </w:r>
+    </w:p>
+    <w:p>
+      <w:pPr>
+        <w:pStyle w:val="Compact"/>
+        <w:numPr>
+          <w:ilvl w:val="0"/>
+          <w:numId w:val="1183"/>
+        </w:numPr>
+      </w:pPr>
+      <w:r>
         <w:t xml:space="preserve">Open</w:t>
       </w:r>
       <w:r>
         <w:t xml:space="preserve"> </w:t>
       </w:r>
-      <w:hyperlink r:id="rId438">
+      <w:hyperlink r:id="rId442">
         <w:r>
           <w:rPr>
             <w:rStyle w:val="Hyperlink"/>
@@ -64494,74 +65057,11 @@
         <w:pStyle w:val="Compact"/>
         <w:numPr>
           <w:ilvl w:val="0"/>
-          <w:numId w:val="1182"/>
+          <w:numId w:val="1183"/>
         </w:numPr>
       </w:pPr>
       <w:r>
         <w:t xml:space="preserve">Increase the monthly spend cap dollar amount or set it to unlimited.</w:t>
-      </w:r>
-    </w:p>
-    <w:p>
-      <w:pPr>
-        <w:pStyle w:val="Compact"/>
-        <w:numPr>
-          <w:ilvl w:val="0"/>
-          <w:numId w:val="1182"/>
-        </w:numPr>
-      </w:pPr>
-      <w:r>
-        <w:t xml:space="preserve">Save your changes. API requests will automatically resume within a few minutes.</w:t>
-      </w:r>
-    </w:p>
-    <w:p>
-      <w:pPr>
-        <w:pStyle w:val="FirstParagraph"/>
-      </w:pPr>
-      <w:r>
-        <w:t xml:space="preserve">If no manual action is taken,</w:t>
-      </w:r>
-      <w:r>
-        <w:t xml:space="preserve"> </w:t>
-      </w:r>
-      <w:r>
-        <w:t xml:space="preserve">accumulated spend resets to</w:t>
-      </w:r>
-      <w:r>
-        <w:t xml:space="preserve"> </w:t>
-      </w:r>
-      <w:r>
-        <w:rPr>
-          <w:b/>
-          <w:bCs/>
-        </w:rPr>
-        <w:t xml:space="preserve">$0 on the 1st of the next month</w:t>
-      </w:r>
-      <w:r>
-        <w:t xml:space="preserve">,</w:t>
-      </w:r>
-      <w:r>
-        <w:t xml:space="preserve"> </w:t>
-      </w:r>
-      <w:r>
-        <w:t xml:space="preserve">and API service automatically resumes up to the configured cap.</w:t>
-      </w:r>
-    </w:p>
-    <w:bookmarkEnd w:id="439"/>
-    <w:bookmarkStart w:id="441" w:name="setting-up-google-cloud-budget-alerts"/>
-    <w:p>
-      <w:pPr>
-        <w:pStyle w:val="Heading4"/>
-      </w:pPr>
-      <w:r>
-        <w:t xml:space="preserve">Setting Up Google Cloud Budget Alerts</w:t>
-      </w:r>
-    </w:p>
-    <w:p>
-      <w:pPr>
-        <w:pStyle w:val="FirstParagraph"/>
-      </w:pPr>
-      <w:r>
-        <w:t xml:space="preserve">To receive early warnings before reaching a spend cap:</w:t>
       </w:r>
     </w:p>
     <w:p>
@@ -64573,12 +65073,75 @@
         </w:numPr>
       </w:pPr>
       <w:r>
+        <w:t xml:space="preserve">Save your changes. API requests will automatically resume within a few minutes.</w:t>
+      </w:r>
+    </w:p>
+    <w:p>
+      <w:pPr>
+        <w:pStyle w:val="FirstParagraph"/>
+      </w:pPr>
+      <w:r>
+        <w:t xml:space="preserve">If no manual action is taken,</w:t>
+      </w:r>
+      <w:r>
+        <w:t xml:space="preserve"> </w:t>
+      </w:r>
+      <w:r>
+        <w:t xml:space="preserve">accumulated spend resets to</w:t>
+      </w:r>
+      <w:r>
+        <w:t xml:space="preserve"> </w:t>
+      </w:r>
+      <w:r>
+        <w:rPr>
+          <w:b/>
+          <w:bCs/>
+        </w:rPr>
+        <w:t xml:space="preserve">$0 on the 1st of the next month</w:t>
+      </w:r>
+      <w:r>
+        <w:t xml:space="preserve">,</w:t>
+      </w:r>
+      <w:r>
+        <w:t xml:space="preserve"> </w:t>
+      </w:r>
+      <w:r>
+        <w:t xml:space="preserve">and API service automatically resumes up to the configured cap.</w:t>
+      </w:r>
+    </w:p>
+    <w:bookmarkEnd w:id="443"/>
+    <w:bookmarkStart w:id="445" w:name="setting-up-google-cloud-budget-alerts"/>
+    <w:p>
+      <w:pPr>
+        <w:pStyle w:val="Heading4"/>
+      </w:pPr>
+      <w:r>
+        <w:t xml:space="preserve">Setting Up Google Cloud Budget Alerts</w:t>
+      </w:r>
+    </w:p>
+    <w:p>
+      <w:pPr>
+        <w:pStyle w:val="FirstParagraph"/>
+      </w:pPr>
+      <w:r>
+        <w:t xml:space="preserve">To receive early warnings before reaching a spend cap:</w:t>
+      </w:r>
+    </w:p>
+    <w:p>
+      <w:pPr>
+        <w:pStyle w:val="Compact"/>
+        <w:numPr>
+          <w:ilvl w:val="0"/>
+          <w:numId w:val="1184"/>
+        </w:numPr>
+      </w:pPr>
+      <w:r>
         <w:t xml:space="preserve">Open</w:t>
       </w:r>
       <w:r>
         <w:t xml:space="preserve"> </w:t>
       </w:r>
-      <w:hyperlink r:id="rId440">
+      <w:hyperlink r:id="rId444">
         <w:r>
           <w:rPr>
             <w:rStyle w:val="Hyperlink"/>
@@ -64595,7 +65158,7 @@
         <w:pStyle w:val="Compact"/>
         <w:numPr>
           <w:ilvl w:val="0"/>
-          <w:numId w:val="1183"/>
+          <w:numId w:val="1184"/>
         </w:numPr>
       </w:pPr>
       <w:r>
@@ -64613,139 +65176,6 @@
       </w:r>
       <w:r>
         <w:t xml:space="preserve">.</w:t>
-      </w:r>
-    </w:p>
-    <w:p>
-      <w:pPr>
-        <w:pStyle w:val="Compact"/>
-        <w:numPr>
-          <w:ilvl w:val="0"/>
-          <w:numId w:val="1183"/>
-        </w:numPr>
-      </w:pPr>
-      <w:r>
-        <w:t xml:space="preserve">Name the budget (e.g.,</w:t>
-      </w:r>
-      <w:r>
-        <w:t xml:space="preserve"> </w:t>
-      </w:r>
-      <w:r>
-        <w:rPr>
-          <w:rStyle w:val="VerbatimChar"/>
-        </w:rPr>
-        <w:t xml:space="preserve">Lab AI API Monthly Budget</w:t>
-      </w:r>
-      <w:r>
-        <w:t xml:space="preserve">) and select the relevant GCP projects.</w:t>
-      </w:r>
-    </w:p>
-    <w:p>
-      <w:pPr>
-        <w:pStyle w:val="Compact"/>
-        <w:numPr>
-          <w:ilvl w:val="0"/>
-          <w:numId w:val="1183"/>
-        </w:numPr>
-      </w:pPr>
-      <w:r>
-        <w:t xml:space="preserve">Set your target monthly budget amount.</w:t>
-      </w:r>
-    </w:p>
-    <w:p>
-      <w:pPr>
-        <w:pStyle w:val="Compact"/>
-        <w:numPr>
-          <w:ilvl w:val="0"/>
-          <w:numId w:val="1183"/>
-        </w:numPr>
-      </w:pPr>
-      <w:r>
-        <w:t xml:space="preserve">Configure trigger rules for email notifications at</w:t>
-      </w:r>
-      <w:r>
-        <w:t xml:space="preserve"> </w:t>
-      </w:r>
-      <w:r>
-        <w:rPr>
-          <w:b/>
-          <w:bCs/>
-        </w:rPr>
-        <w:t xml:space="preserve">50%</w:t>
-      </w:r>
-      <w:r>
-        <w:t xml:space="preserve">,</w:t>
-      </w:r>
-      <w:r>
-        <w:t xml:space="preserve"> </w:t>
-      </w:r>
-      <w:r>
-        <w:rPr>
-          <w:b/>
-          <w:bCs/>
-        </w:rPr>
-        <w:t xml:space="preserve">75%</w:t>
-      </w:r>
-      <w:r>
-        <w:t xml:space="preserve">, and</w:t>
-      </w:r>
-      <w:r>
-        <w:t xml:space="preserve"> </w:t>
-      </w:r>
-      <w:r>
-        <w:rPr>
-          <w:b/>
-          <w:bCs/>
-        </w:rPr>
-        <w:t xml:space="preserve">90%</w:t>
-      </w:r>
-      <w:r>
-        <w:t xml:space="preserve"> </w:t>
-      </w:r>
-      <w:r>
-        <w:t xml:space="preserve">of the budget.</w:t>
-      </w:r>
-    </w:p>
-    <w:p>
-      <w:pPr>
-        <w:pStyle w:val="Compact"/>
-        <w:numPr>
-          <w:ilvl w:val="0"/>
-          <w:numId w:val="1183"/>
-        </w:numPr>
-      </w:pPr>
-      <w:r>
-        <w:t xml:space="preserve">Click</w:t>
-      </w:r>
-      <w:r>
-        <w:t xml:space="preserve"> </w:t>
-      </w:r>
-      <w:r>
-        <w:rPr>
-          <w:b/>
-          <w:bCs/>
-        </w:rPr>
-        <w:t xml:space="preserve">Finish</w:t>
-      </w:r>
-      <w:r>
-        <w:t xml:space="preserve">. You will receive email alerts before any project hits its spend cap.</w:t>
-      </w:r>
-    </w:p>
-    <w:bookmarkEnd w:id="441"/>
-    <w:bookmarkStart w:id="442" w:name="cost-optimization-best-practices"/>
-    <w:p>
-      <w:pPr>
-        <w:pStyle w:val="Heading4"/>
-      </w:pPr>
-      <w:r>
-        <w:t xml:space="preserve">Cost Optimization Best Practices</w:t>
-      </w:r>
-    </w:p>
-    <w:p>
-      <w:pPr>
-        <w:pStyle w:val="FirstParagraph"/>
-      </w:pPr>
-      <w:r>
-        <w:t xml:space="preserve">To maximize the efficiency of your API spend across local CLI sessions, subagents, and automated workflows:</w:t>
       </w:r>
     </w:p>
     <w:p>
@@ -64757,20 +65187,7 @@
         </w:numPr>
       </w:pPr>
       <w:r>
-        <w:rPr>
-          <w:b/>
-          <w:bCs/>
-        </w:rPr>
-        <w:t xml:space="preserve">Right-Size Model Selection</w:t>
-      </w:r>
-      <w:r>
-        <w:t xml:space="preserve">:</w:t>
-      </w:r>
-      <w:r>
-        <w:t xml:space="preserve"> </w:t>
-      </w:r>
-      <w:r>
-        <w:t xml:space="preserve">For general Gemini API, Python SDK, or custom scripts, prefer Flash-tier models (such as</w:t>
+        <w:t xml:space="preserve">Name the budget (e.g.,</w:t>
       </w:r>
       <w:r>
         <w:t xml:space="preserve"> </w:t>
@@ -64779,109 +65196,10 @@
         <w:rPr>
           <w:rStyle w:val="VerbatimChar"/>
         </w:rPr>
-        <w:t xml:space="preserve">gemini-2.5-flash</w:t>
-      </w:r>
-      <w:r>
-        <w:t xml:space="preserve">) over Pro-tier models (</w:t>
-      </w:r>
-      <w:r>
-        <w:rPr>
-          <w:rStyle w:val="VerbatimChar"/>
-        </w:rPr>
-        <w:t xml:space="preserve">gemini-2.5-pro</w:t>
-      </w:r>
-      <w:r>
-        <w:t xml:space="preserve">).</w:t>
-      </w:r>
-      <w:r>
-        <w:t xml:space="preserve"> </w:t>
-      </w:r>
-      <w:r>
-        <w:t xml:space="preserve">Flash models provide a substantially lower token cost for routine search, log parsing, and background processing.</w:t>
-      </w:r>
-      <w:r>
-        <w:t xml:space="preserve"> </w:t>
-      </w:r>
-      <w:r>
-        <w:t xml:space="preserve">For Antigravity Agent workflows (</w:t>
-      </w:r>
-      <w:r>
-        <w:rPr>
-          <w:rStyle w:val="VerbatimChar"/>
-        </w:rPr>
-        <w:t xml:space="preserve">google-antigravity</w:t>
-      </w:r>
-      <w:r>
-        <w:t xml:space="preserve">), the agent defaults to</w:t>
-      </w:r>
-      <w:r>
-        <w:t xml:space="preserve"> </w:t>
-      </w:r>
-      <w:r>
-        <w:rPr>
-          <w:rStyle w:val="VerbatimChar"/>
-        </w:rPr>
-        <w:t xml:space="preserve">gemini-3.7-flash</w:t>
-      </w:r>
-      <w:r>
-        <w:t xml:space="preserve"> </w:t>
-      </w:r>
-      <w:r>
-        <w:t xml:space="preserve">(already a Flash-tier model).</w:t>
-      </w:r>
-      <w:r>
-        <w:t xml:space="preserve"> </w:t>
-      </w:r>
-      <w:r>
-        <w:t xml:space="preserve">Supported Antigravity Agent model options include</w:t>
-      </w:r>
-      <w:r>
-        <w:t xml:space="preserve"> </w:t>
-      </w:r>
-      <w:r>
-        <w:rPr>
-          <w:rStyle w:val="VerbatimChar"/>
-        </w:rPr>
-        <w:t xml:space="preserve">gemini-3.7-flash</w:t>
-      </w:r>
-      <w:r>
-        <w:t xml:space="preserve">,</w:t>
-      </w:r>
-      <w:r>
-        <w:t xml:space="preserve"> </w:t>
-      </w:r>
-      <w:r>
-        <w:rPr>
-          <w:rStyle w:val="VerbatimChar"/>
-        </w:rPr>
-        <w:t xml:space="preserve">gemini-3.6-flash</w:t>
-      </w:r>
-      <w:r>
-        <w:t xml:space="preserve">,</w:t>
-      </w:r>
-      <w:r>
-        <w:t xml:space="preserve"> </w:t>
-      </w:r>
-      <w:r>
-        <w:rPr>
-          <w:rStyle w:val="VerbatimChar"/>
-        </w:rPr>
-        <w:t xml:space="preserve">gemini-3.5-flash</w:t>
-      </w:r>
-      <w:r>
-        <w:t xml:space="preserve">, and</w:t>
-      </w:r>
-      <w:r>
-        <w:t xml:space="preserve"> </w:t>
-      </w:r>
-      <w:r>
-        <w:rPr>
-          <w:rStyle w:val="VerbatimChar"/>
-        </w:rPr>
-        <w:t xml:space="preserve">gemini-3.5-flash-lite</w:t>
-      </w:r>
-      <w:r>
-        <w:t xml:space="preserve">.</w:t>
+        <w:t xml:space="preserve">Lab AI API Monthly Budget</w:t>
+      </w:r>
+      <w:r>
+        <w:t xml:space="preserve">) and select the relevant GCP projects.</w:t>
       </w:r>
     </w:p>
     <w:p>
@@ -64893,26 +65211,7 @@
         </w:numPr>
       </w:pPr>
       <w:r>
-        <w:rPr>
-          <w:b/>
-          <w:bCs/>
-        </w:rPr>
-        <w:t xml:space="preserve">Use Context Caching</w:t>
-      </w:r>
-      <w:r>
-        <w:t xml:space="preserve">:</w:t>
-      </w:r>
-      <w:r>
-        <w:t xml:space="preserve"> </w:t>
-      </w:r>
-      <w:r>
-        <w:t xml:space="preserve">For workloads that repeatedly pass static context over 2,048 tokens (such as large reference docs, system prompts, or codebase indices),</w:t>
-      </w:r>
-      <w:r>
-        <w:t xml:space="preserve"> </w:t>
-      </w:r>
-      <w:r>
-        <w:t xml:space="preserve">use Gemini Context Caching. Cached input tokens receive a substantial discount compared to standard input tokens.</w:t>
+        <w:t xml:space="preserve">Set your target monthly budget amount.</w:t>
       </w:r>
     </w:p>
     <w:p>
@@ -64924,26 +65223,49 @@
         </w:numPr>
       </w:pPr>
       <w:r>
+        <w:t xml:space="preserve">Configure trigger rules for email notifications at</w:t>
+      </w:r>
+      <w:r>
+        <w:t xml:space="preserve"> </w:t>
+      </w:r>
+      <w:r>
         <w:rPr>
           <w:b/>
           <w:bCs/>
         </w:rPr>
-        <w:t xml:space="preserve">Use the Batch API for Non-Realtime Tasks</w:t>
-      </w:r>
-      <w:r>
-        <w:t xml:space="preserve">:</w:t>
-      </w:r>
-      <w:r>
-        <w:t xml:space="preserve"> </w:t>
-      </w:r>
-      <w:r>
-        <w:t xml:space="preserve">For offline batch processing, evaluation suites, or background doc updates,</w:t>
-      </w:r>
-      <w:r>
-        <w:t xml:space="preserve"> </w:t>
-      </w:r>
-      <w:r>
-        <w:t xml:space="preserve">submit requests via the Gemini Batch API to receive a 50% discount on input and output tokens.</w:t>
+        <w:t xml:space="preserve">50%</w:t>
+      </w:r>
+      <w:r>
+        <w:t xml:space="preserve">,</w:t>
+      </w:r>
+      <w:r>
+        <w:t xml:space="preserve"> </w:t>
+      </w:r>
+      <w:r>
+        <w:rPr>
+          <w:b/>
+          <w:bCs/>
+        </w:rPr>
+        <w:t xml:space="preserve">75%</w:t>
+      </w:r>
+      <w:r>
+        <w:t xml:space="preserve">, and</w:t>
+      </w:r>
+      <w:r>
+        <w:t xml:space="preserve"> </w:t>
+      </w:r>
+      <w:r>
+        <w:rPr>
+          <w:b/>
+          <w:bCs/>
+        </w:rPr>
+        <w:t xml:space="preserve">90%</w:t>
+      </w:r>
+      <w:r>
+        <w:t xml:space="preserve"> </w:t>
+      </w:r>
+      <w:r>
+        <w:t xml:space="preserve">of the budget.</w:t>
       </w:r>
     </w:p>
     <w:p>
@@ -64955,10 +65277,251 @@
         </w:numPr>
       </w:pPr>
       <w:r>
+        <w:t xml:space="preserve">Click</w:t>
+      </w:r>
+      <w:r>
+        <w:t xml:space="preserve"> </w:t>
+      </w:r>
+      <w:r>
         <w:rPr>
           <w:b/>
           <w:bCs/>
         </w:rPr>
+        <w:t xml:space="preserve">Finish</w:t>
+      </w:r>
+      <w:r>
+        <w:t xml:space="preserve">. You will receive email alerts before any project hits its spend cap.</w:t>
+      </w:r>
+    </w:p>
+    <w:bookmarkEnd w:id="445"/>
+    <w:bookmarkStart w:id="446" w:name="cost-optimization-best-practices"/>
+    <w:p>
+      <w:pPr>
+        <w:pStyle w:val="Heading4"/>
+      </w:pPr>
+      <w:r>
+        <w:t xml:space="preserve">Cost Optimization Best Practices</w:t>
+      </w:r>
+    </w:p>
+    <w:p>
+      <w:pPr>
+        <w:pStyle w:val="FirstParagraph"/>
+      </w:pPr>
+      <w:r>
+        <w:t xml:space="preserve">To maximize the efficiency of your API spend across local CLI sessions, subagents, and automated workflows:</w:t>
+      </w:r>
+    </w:p>
+    <w:p>
+      <w:pPr>
+        <w:pStyle w:val="Compact"/>
+        <w:numPr>
+          <w:ilvl w:val="0"/>
+          <w:numId w:val="1185"/>
+        </w:numPr>
+      </w:pPr>
+      <w:r>
+        <w:rPr>
+          <w:b/>
+          <w:bCs/>
+        </w:rPr>
+        <w:t xml:space="preserve">Right-Size Model Selection</w:t>
+      </w:r>
+      <w:r>
+        <w:t xml:space="preserve">:</w:t>
+      </w:r>
+      <w:r>
+        <w:t xml:space="preserve"> </w:t>
+      </w:r>
+      <w:r>
+        <w:t xml:space="preserve">For general Gemini API, Python SDK, or custom scripts, prefer Flash-tier models (such as</w:t>
+      </w:r>
+      <w:r>
+        <w:t xml:space="preserve"> </w:t>
+      </w:r>
+      <w:r>
+        <w:rPr>
+          <w:rStyle w:val="VerbatimChar"/>
+        </w:rPr>
+        <w:t xml:space="preserve">gemini-2.5-flash</w:t>
+      </w:r>
+      <w:r>
+        <w:t xml:space="preserve">) over Pro-tier models (</w:t>
+      </w:r>
+      <w:r>
+        <w:rPr>
+          <w:rStyle w:val="VerbatimChar"/>
+        </w:rPr>
+        <w:t xml:space="preserve">gemini-2.5-pro</w:t>
+      </w:r>
+      <w:r>
+        <w:t xml:space="preserve">).</w:t>
+      </w:r>
+      <w:r>
+        <w:t xml:space="preserve"> </w:t>
+      </w:r>
+      <w:r>
+        <w:t xml:space="preserve">Flash models provide a substantially lower token cost for routine search, log parsing, and background processing.</w:t>
+      </w:r>
+      <w:r>
+        <w:t xml:space="preserve"> </w:t>
+      </w:r>
+      <w:r>
+        <w:t xml:space="preserve">For Antigravity Agent workflows (</w:t>
+      </w:r>
+      <w:r>
+        <w:rPr>
+          <w:rStyle w:val="VerbatimChar"/>
+        </w:rPr>
+        <w:t xml:space="preserve">google-antigravity</w:t>
+      </w:r>
+      <w:r>
+        <w:t xml:space="preserve">), the agent defaults to</w:t>
+      </w:r>
+      <w:r>
+        <w:t xml:space="preserve"> </w:t>
+      </w:r>
+      <w:r>
+        <w:rPr>
+          <w:rStyle w:val="VerbatimChar"/>
+        </w:rPr>
+        <w:t xml:space="preserve">gemini-3.7-flash</w:t>
+      </w:r>
+      <w:r>
+        <w:t xml:space="preserve"> </w:t>
+      </w:r>
+      <w:r>
+        <w:t xml:space="preserve">(already a Flash-tier model).</w:t>
+      </w:r>
+      <w:r>
+        <w:t xml:space="preserve"> </w:t>
+      </w:r>
+      <w:r>
+        <w:t xml:space="preserve">Supported Antigravity Agent model options include</w:t>
+      </w:r>
+      <w:r>
+        <w:t xml:space="preserve"> </w:t>
+      </w:r>
+      <w:r>
+        <w:rPr>
+          <w:rStyle w:val="VerbatimChar"/>
+        </w:rPr>
+        <w:t xml:space="preserve">gemini-3.7-flash</w:t>
+      </w:r>
+      <w:r>
+        <w:t xml:space="preserve">,</w:t>
+      </w:r>
+      <w:r>
+        <w:t xml:space="preserve"> </w:t>
+      </w:r>
+      <w:r>
+        <w:rPr>
+          <w:rStyle w:val="VerbatimChar"/>
+        </w:rPr>
+        <w:t xml:space="preserve">gemini-3.6-flash</w:t>
+      </w:r>
+      <w:r>
+        <w:t xml:space="preserve">,</w:t>
+      </w:r>
+      <w:r>
+        <w:t xml:space="preserve"> </w:t>
+      </w:r>
+      <w:r>
+        <w:rPr>
+          <w:rStyle w:val="VerbatimChar"/>
+        </w:rPr>
+        <w:t xml:space="preserve">gemini-3.5-flash</w:t>
+      </w:r>
+      <w:r>
+        <w:t xml:space="preserve">, and</w:t>
+      </w:r>
+      <w:r>
+        <w:t xml:space="preserve"> </w:t>
+      </w:r>
+      <w:r>
+        <w:rPr>
+          <w:rStyle w:val="VerbatimChar"/>
+        </w:rPr>
+        <w:t xml:space="preserve">gemini-3.5-flash-lite</w:t>
+      </w:r>
+      <w:r>
+        <w:t xml:space="preserve">.</w:t>
+      </w:r>
+    </w:p>
+    <w:p>
+      <w:pPr>
+        <w:pStyle w:val="Compact"/>
+        <w:numPr>
+          <w:ilvl w:val="0"/>
+          <w:numId w:val="1185"/>
+        </w:numPr>
+      </w:pPr>
+      <w:r>
+        <w:rPr>
+          <w:b/>
+          <w:bCs/>
+        </w:rPr>
+        <w:t xml:space="preserve">Use Context Caching</w:t>
+      </w:r>
+      <w:r>
+        <w:t xml:space="preserve">:</w:t>
+      </w:r>
+      <w:r>
+        <w:t xml:space="preserve"> </w:t>
+      </w:r>
+      <w:r>
+        <w:t xml:space="preserve">For workloads that repeatedly pass static context over 2,048 tokens (such as large reference docs, system prompts, or codebase indices),</w:t>
+      </w:r>
+      <w:r>
+        <w:t xml:space="preserve"> </w:t>
+      </w:r>
+      <w:r>
+        <w:t xml:space="preserve">use Gemini Context Caching. Cached input tokens receive a substantial discount compared to standard input tokens.</w:t>
+      </w:r>
+    </w:p>
+    <w:p>
+      <w:pPr>
+        <w:pStyle w:val="Compact"/>
+        <w:numPr>
+          <w:ilvl w:val="0"/>
+          <w:numId w:val="1185"/>
+        </w:numPr>
+      </w:pPr>
+      <w:r>
+        <w:rPr>
+          <w:b/>
+          <w:bCs/>
+        </w:rPr>
+        <w:t xml:space="preserve">Use the Batch API for Non-Realtime Tasks</w:t>
+      </w:r>
+      <w:r>
+        <w:t xml:space="preserve">:</w:t>
+      </w:r>
+      <w:r>
+        <w:t xml:space="preserve"> </w:t>
+      </w:r>
+      <w:r>
+        <w:t xml:space="preserve">For offline batch processing, evaluation suites, or background doc updates,</w:t>
+      </w:r>
+      <w:r>
+        <w:t xml:space="preserve"> </w:t>
+      </w:r>
+      <w:r>
+        <w:t xml:space="preserve">submit requests via the Gemini Batch API to receive a 50% discount on input and output tokens.</w:t>
+      </w:r>
+    </w:p>
+    <w:p>
+      <w:pPr>
+        <w:pStyle w:val="Compact"/>
+        <w:numPr>
+          <w:ilvl w:val="0"/>
+          <w:numId w:val="1185"/>
+        </w:numPr>
+      </w:pPr>
+      <w:r>
+        <w:rPr>
+          <w:b/>
+          <w:bCs/>
+        </w:rPr>
         <w:t xml:space="preserve">GitHub UI Diff Collapsing</w:t>
       </w:r>
       <w:r>
@@ -65046,9 +65609,9 @@
         <w:t xml:space="preserve">to collapse them in GitHub’s web diff view and exclude them from repository language statistics.</w:t>
       </w:r>
     </w:p>
-    <w:bookmarkEnd w:id="442"/>
-    <w:bookmarkEnd w:id="443"/>
-    <w:bookmarkStart w:id="473" w:name="references"/>
+    <w:bookmarkEnd w:id="446"/>
+    <w:bookmarkEnd w:id="447"/>
+    <w:bookmarkStart w:id="477" w:name="references"/>
     <w:p>
       <w:pPr>
         <w:pStyle w:val="Heading1"/>
@@ -65057,8 +65620,8 @@
         <w:t xml:space="preserve">References</w:t>
       </w:r>
     </w:p>
-    <w:bookmarkStart w:id="472" w:name="refs"/>
-    <w:bookmarkStart w:id="445" w:name="ref-space_odyssey"/>
+    <w:bookmarkStart w:id="476" w:name="refs"/>
+    <w:bookmarkStart w:id="449" w:name="ref-space_odyssey"/>
     <w:p>
       <w:pPr>
         <w:pStyle w:val="Bibliography"/>
@@ -65076,7 +65639,7 @@
       <w:r>
         <w:t xml:space="preserve"> </w:t>
       </w:r>
-      <w:hyperlink r:id="rId444">
+      <w:hyperlink r:id="rId448">
         <w:r>
           <w:rPr>
             <w:rStyle w:val="Hyperlink"/>
@@ -65088,8 +65651,8 @@
         <w:t xml:space="preserve">.</w:t>
       </w:r>
     </w:p>
-    <w:bookmarkEnd w:id="445"/>
-    <w:bookmarkStart w:id="447" w:name="ref-i_robot"/>
+    <w:bookmarkEnd w:id="449"/>
+    <w:bookmarkStart w:id="451" w:name="ref-i_robot"/>
     <w:p>
       <w:pPr>
         <w:pStyle w:val="Bibliography"/>
@@ -65113,7 +65676,7 @@
       <w:r>
         <w:t xml:space="preserve"> </w:t>
       </w:r>
-      <w:hyperlink r:id="rId446">
+      <w:hyperlink r:id="rId450">
         <w:r>
           <w:rPr>
             <w:rStyle w:val="Hyperlink"/>
@@ -65125,8 +65688,8 @@
         <w:t xml:space="preserve">.</w:t>
       </w:r>
     </w:p>
-    <w:bookmarkEnd w:id="447"/>
-    <w:bookmarkStart w:id="449" w:name="ref-battlestar_galactica_2004"/>
+    <w:bookmarkEnd w:id="451"/>
+    <w:bookmarkStart w:id="453" w:name="ref-battlestar_galactica_2004"/>
     <w:p>
       <w:pPr>
         <w:pStyle w:val="Bibliography"/>
@@ -65144,7 +65707,7 @@
       <w:r>
         <w:t xml:space="preserve"> </w:t>
       </w:r>
-      <w:hyperlink r:id="rId448">
+      <w:hyperlink r:id="rId452">
         <w:r>
           <w:rPr>
             <w:rStyle w:val="Hyperlink"/>
@@ -65156,8 +65719,8 @@
         <w:t xml:space="preserve">.</w:t>
       </w:r>
     </w:p>
-    <w:bookmarkEnd w:id="449"/>
-    <w:bookmarkStart w:id="451" w:name="ref-slm_agentic_ai"/>
+    <w:bookmarkEnd w:id="453"/>
+    <w:bookmarkStart w:id="455" w:name="ref-slm_agentic_ai"/>
     <w:p>
       <w:pPr>
         <w:pStyle w:val="Bibliography"/>
@@ -65181,7 +65744,7 @@
       <w:r>
         <w:t xml:space="preserve"> </w:t>
       </w:r>
-      <w:hyperlink r:id="rId450">
+      <w:hyperlink r:id="rId454">
         <w:r>
           <w:rPr>
             <w:rStyle w:val="Hyperlink"/>
@@ -65193,8 +65756,8 @@
         <w:t xml:space="preserve">.</w:t>
       </w:r>
     </w:p>
-    <w:bookmarkEnd w:id="451"/>
-    <w:bookmarkStart w:id="453" w:name="ref-blade_runner"/>
+    <w:bookmarkEnd w:id="455"/>
+    <w:bookmarkStart w:id="457" w:name="ref-blade_runner"/>
     <w:p>
       <w:pPr>
         <w:pStyle w:val="Bibliography"/>
@@ -65212,7 +65775,7 @@
       <w:r>
         <w:t xml:space="preserve"> </w:t>
       </w:r>
-      <w:hyperlink r:id="rId452">
+      <w:hyperlink r:id="rId456">
         <w:r>
           <w:rPr>
             <w:rStyle w:val="Hyperlink"/>
@@ -65224,8 +65787,8 @@
         <w:t xml:space="preserve">.</w:t>
       </w:r>
     </w:p>
-    <w:bookmarkEnd w:id="453"/>
-    <w:bookmarkStart w:id="455" w:name="ref-enders_game"/>
+    <w:bookmarkEnd w:id="457"/>
+    <w:bookmarkStart w:id="459" w:name="ref-enders_game"/>
     <w:p>
       <w:pPr>
         <w:pStyle w:val="Bibliography"/>
@@ -65249,7 +65812,7 @@
       <w:r>
         <w:t xml:space="preserve"> </w:t>
       </w:r>
-      <w:hyperlink r:id="rId454">
+      <w:hyperlink r:id="rId458">
         <w:r>
           <w:rPr>
             <w:rStyle w:val="Hyperlink"/>
@@ -65261,8 +65824,8 @@
         <w:t xml:space="preserve">.</w:t>
       </w:r>
     </w:p>
-    <w:bookmarkEnd w:id="455"/>
-    <w:bookmarkStart w:id="457" w:name="ref-qlora"/>
+    <w:bookmarkEnd w:id="459"/>
+    <w:bookmarkStart w:id="461" w:name="ref-qlora"/>
     <w:p>
       <w:pPr>
         <w:pStyle w:val="Bibliography"/>
@@ -65286,7 +65849,7 @@
       <w:r>
         <w:t xml:space="preserve"> </w:t>
       </w:r>
-      <w:hyperlink r:id="rId456">
+      <w:hyperlink r:id="rId460">
         <w:r>
           <w:rPr>
             <w:rStyle w:val="Hyperlink"/>
@@ -65298,8 +65861,8 @@
         <w:t xml:space="preserve">.</w:t>
       </w:r>
     </w:p>
-    <w:bookmarkEnd w:id="457"/>
-    <w:bookmarkStart w:id="459" w:name="ref-humans_are_dead"/>
+    <w:bookmarkEnd w:id="461"/>
+    <w:bookmarkStart w:id="463" w:name="ref-humans_are_dead"/>
     <w:p>
       <w:pPr>
         <w:pStyle w:val="Bibliography"/>
@@ -65323,7 +65886,7 @@
       <w:r>
         <w:t xml:space="preserve"> </w:t>
       </w:r>
-      <w:hyperlink r:id="rId458">
+      <w:hyperlink r:id="rId462">
         <w:r>
           <w:rPr>
             <w:rStyle w:val="Hyperlink"/>
@@ -65335,8 +65898,8 @@
         <w:t xml:space="preserve">.</w:t>
       </w:r>
     </w:p>
-    <w:bookmarkEnd w:id="459"/>
-    <w:bookmarkStart w:id="461" w:name="ref-dune"/>
+    <w:bookmarkEnd w:id="463"/>
+    <w:bookmarkStart w:id="465" w:name="ref-dune"/>
     <w:p>
       <w:pPr>
         <w:pStyle w:val="Bibliography"/>
@@ -65360,7 +65923,7 @@
       <w:r>
         <w:t xml:space="preserve"> </w:t>
       </w:r>
-      <w:hyperlink r:id="rId460">
+      <w:hyperlink r:id="rId464">
         <w:r>
           <w:rPr>
             <w:rStyle w:val="Hyperlink"/>
@@ -65372,8 +65935,8 @@
         <w:t xml:space="preserve">.</w:t>
       </w:r>
     </w:p>
-    <w:bookmarkEnd w:id="461"/>
-    <w:bookmarkStart w:id="463" w:name="ref-lora"/>
+    <w:bookmarkEnd w:id="465"/>
+    <w:bookmarkStart w:id="467" w:name="ref-lora"/>
     <w:p>
       <w:pPr>
         <w:pStyle w:val="Bibliography"/>
@@ -65397,7 +65960,7 @@
       <w:r>
         <w:t xml:space="preserve"> </w:t>
       </w:r>
-      <w:hyperlink r:id="rId462">
+      <w:hyperlink r:id="rId466">
         <w:r>
           <w:rPr>
             <w:rStyle w:val="Hyperlink"/>
@@ -65409,8 +65972,8 @@
         <w:t xml:space="preserve">.</w:t>
       </w:r>
     </w:p>
-    <w:bookmarkEnd w:id="463"/>
-    <w:bookmarkStart w:id="465" w:name="ref-lecun_world_models"/>
+    <w:bookmarkEnd w:id="467"/>
+    <w:bookmarkStart w:id="469" w:name="ref-lecun_world_models"/>
     <w:p>
       <w:pPr>
         <w:pStyle w:val="Bibliography"/>
@@ -65434,7 +65997,7 @@
       <w:r>
         <w:t xml:space="preserve"> </w:t>
       </w:r>
-      <w:hyperlink r:id="rId464">
+      <w:hyperlink r:id="rId468">
         <w:r>
           <w:rPr>
             <w:rStyle w:val="Hyperlink"/>
@@ -65446,8 +66009,8 @@
         <w:t xml:space="preserve">.</w:t>
       </w:r>
     </w:p>
-    <w:bookmarkEnd w:id="465"/>
-    <w:bookmarkStart w:id="467" w:name="ref-terminator"/>
+    <w:bookmarkEnd w:id="469"/>
+    <w:bookmarkStart w:id="471" w:name="ref-terminator"/>
     <w:p>
       <w:pPr>
         <w:pStyle w:val="Bibliography"/>
@@ -65465,7 +66028,7 @@
       <w:r>
         <w:t xml:space="preserve"> </w:t>
       </w:r>
-      <w:hyperlink r:id="rId466">
+      <w:hyperlink r:id="rId470">
         <w:r>
           <w:rPr>
             <w:rStyle w:val="Hyperlink"/>
@@ -65477,8 +66040,8 @@
         <w:t xml:space="preserve">.</w:t>
       </w:r>
     </w:p>
-    <w:bookmarkEnd w:id="467"/>
-    <w:bookmarkStart w:id="469" w:name="ref-matrix"/>
+    <w:bookmarkEnd w:id="471"/>
+    <w:bookmarkStart w:id="473" w:name="ref-matrix"/>
     <w:p>
       <w:pPr>
         <w:pStyle w:val="Bibliography"/>
@@ -65496,7 +66059,7 @@
       <w:r>
         <w:t xml:space="preserve"> </w:t>
       </w:r>
-      <w:hyperlink r:id="rId468">
+      <w:hyperlink r:id="rId472">
         <w:r>
           <w:rPr>
             <w:rStyle w:val="Hyperlink"/>
@@ -65508,8 +66071,8 @@
         <w:t xml:space="preserve">.</w:t>
       </w:r>
     </w:p>
-    <w:bookmarkEnd w:id="469"/>
-    <w:bookmarkStart w:id="471" w:name="ref-wargames"/>
+    <w:bookmarkEnd w:id="473"/>
+    <w:bookmarkStart w:id="475" w:name="ref-wargames"/>
     <w:p>
       <w:pPr>
         <w:pStyle w:val="Bibliography"/>
@@ -65527,7 +66090,7 @@
       <w:r>
         <w:t xml:space="preserve"> </w:t>
       </w:r>
-      <w:hyperlink r:id="rId470">
+      <w:hyperlink r:id="rId474">
         <w:r>
           <w:rPr>
             <w:rStyle w:val="Hyperlink"/>
@@ -65539,9 +66102,9 @@
         <w:t xml:space="preserve">.</w:t>
       </w:r>
     </w:p>
-    <w:bookmarkEnd w:id="471"/>
-    <w:bookmarkEnd w:id="472"/>
-    <w:bookmarkEnd w:id="473"/>
+    <w:bookmarkEnd w:id="475"/>
+    <w:bookmarkEnd w:id="476"/>
+    <w:bookmarkEnd w:id="477"/>
     <w:sectPr>
       <w:footnotePr>
         <w:numRestart w:val="eachSect"/>
@@ -67105,34 +67668,7 @@
     <w:abstractNumId w:val="991"/>
   </w:num>
   <w:num w:numId="1181">
-    <w:abstractNumId w:val="99411"/>
-    <w:lvlOverride w:ilvl="0">
-      <w:startOverride w:val="1"/>
-    </w:lvlOverride>
-    <w:lvlOverride w:ilvl="1">
-      <w:startOverride w:val="1"/>
-    </w:lvlOverride>
-    <w:lvlOverride w:ilvl="2">
-      <w:startOverride w:val="1"/>
-    </w:lvlOverride>
-    <w:lvlOverride w:ilvl="3">
-      <w:startOverride w:val="1"/>
-    </w:lvlOverride>
-    <w:lvlOverride w:ilvl="4">
-      <w:startOverride w:val="1"/>
-    </w:lvlOverride>
-    <w:lvlOverride w:ilvl="5">
-      <w:startOverride w:val="1"/>
-    </w:lvlOverride>
-    <w:lvlOverride w:ilvl="6">
-      <w:startOverride w:val="1"/>
-    </w:lvlOverride>
-    <w:lvlOverride w:ilvl="7">
-      <w:startOverride w:val="1"/>
-    </w:lvlOverride>
-    <w:lvlOverride w:ilvl="8">
-      <w:startOverride w:val="1"/>
-    </w:lvlOverride>
+    <w:abstractNumId w:val="991"/>
   </w:num>
   <w:num w:numId="1182">
     <w:abstractNumId w:val="99411"/>
@@ -67195,6 +67731,36 @@
     </w:lvlOverride>
   </w:num>
   <w:num w:numId="1184">
+    <w:abstractNumId w:val="99411"/>
+    <w:lvlOverride w:ilvl="0">
+      <w:startOverride w:val="1"/>
+    </w:lvlOverride>
+    <w:lvlOverride w:ilvl="1">
+      <w:startOverride w:val="1"/>
+    </w:lvlOverride>
+    <w:lvlOverride w:ilvl="2">
+      <w:startOverride w:val="1"/>
+    </w:lvlOverride>
+    <w:lvlOverride w:ilvl="3">
+      <w:startOverride w:val="1"/>
+    </w:lvlOverride>
+    <w:lvlOverride w:ilvl="4">
+      <w:startOverride w:val="1"/>
+    </w:lvlOverride>
+    <w:lvlOverride w:ilvl="5">
+      <w:startOverride w:val="1"/>
+    </w:lvlOverride>
+    <w:lvlOverride w:ilvl="6">
+      <w:startOverride w:val="1"/>
+    </w:lvlOverride>
+    <w:lvlOverride w:ilvl="7">
+      <w:startOverride w:val="1"/>
+    </w:lvlOverride>
+    <w:lvlOverride w:ilvl="8">
+      <w:startOverride w:val="1"/>
+    </w:lvlOverride>
+  </w:num>
+  <w:num w:numId="1185">
     <w:abstractNumId w:val="991"/>
   </w:num>
 </w:numbering>

</xml_diff>

<commit_message>
Deploying to gh-pages from @ Morrison-Lab/wai@e0c30c072d6328ec47bc008f2a268b707224b518 🚀
</commit_message>
<xml_diff>
--- a/chapters/coding-agents.docx
+++ b/chapters/coding-agents.docx
@@ -15,7 +15,7 @@
         <w:pStyle w:val="Date"/>
       </w:pPr>
       <w:r>
-        <w:t xml:space="preserve">Last modified: 2026-09-01 11:13:46 (PDT)</w:t>
+        <w:t xml:space="preserve">Last modified: 2026-09-01 11:41:54 (PDT)</w:t>
       </w:r>
     </w:p>
     <w:p>
@@ -64784,13 +64784,13 @@
     </w:tbl>
     <w:bookmarkEnd w:id="438"/>
     <w:bookmarkEnd w:id="439"/>
-    <w:bookmarkStart w:id="447" w:name="sec-ai-gemini-spend-management"/>
+    <w:bookmarkStart w:id="443" w:name="sec-ai-plugins-deep-dive"/>
     <w:p>
       <w:pPr>
         <w:pStyle w:val="Heading1"/>
       </w:pPr>
       <w:r>
-        <w:t xml:space="preserve">45. Managing Gemini API Spend and Cost Optimization</w:t>
+        <w:t xml:space="preserve">45. Anatomy of Agent Plugins</w:t>
       </w:r>
     </w:p>
     <w:p>
@@ -64798,48 +64798,7 @@
         <w:pStyle w:val="FirstParagraph"/>
       </w:pPr>
       <w:r>
-        <w:t xml:space="preserve">This guide describes how to manage Google AI Studio and Google Cloud Gemini API spend caps,</w:t>
-      </w:r>
-      <w:r>
-        <w:t xml:space="preserve"> </w:t>
-      </w:r>
-      <w:r>
-        <w:t xml:space="preserve">unpause paused API services,</w:t>
-      </w:r>
-      <w:r>
-        <w:t xml:space="preserve"> </w:t>
-      </w:r>
-      <w:r>
-        <w:t xml:space="preserve">and optimize token consumption across local tools and GitHub Actions workflows.</w:t>
-      </w:r>
-    </w:p>
-    <w:bookmarkStart w:id="441" w:name="Xd8c10be17edf039db5b664720f228274181ba18"/>
-    <w:p>
-      <w:pPr>
-        <w:pStyle w:val="Heading4"/>
-      </w:pPr>
-      <w:r>
-        <w:t xml:space="preserve">Identifying Paused Projects (Project Numbers vs. Friendly Names)</w:t>
-      </w:r>
-    </w:p>
-    <w:p>
-      <w:pPr>
-        <w:pStyle w:val="FirstParagraph"/>
-      </w:pPr>
-      <w:r>
-        <w:t xml:space="preserve">When a project reaches its monthly budget limit,</w:t>
-      </w:r>
-      <w:r>
-        <w:t xml:space="preserve"> </w:t>
-      </w:r>
-      <w:r>
-        <w:t xml:space="preserve">Google sends an email notification stating that Gemini API service has been paused.</w:t>
-      </w:r>
-      <w:r>
-        <w:t xml:space="preserve"> </w:t>
-      </w:r>
-      <w:r>
-        <w:t xml:space="preserve">These email notifications identify the affected project using its internal</w:t>
+        <w:t xml:space="preserve">In modern AI coding assistants (such as Google Antigravity, Gemini CLI, and Claude Code),</w:t>
       </w:r>
       <w:r>
         <w:t xml:space="preserve"> </w:t>
@@ -64849,6 +64808,771 @@
           <w:b/>
           <w:bCs/>
         </w:rPr>
+        <w:t xml:space="preserve">plugins</w:t>
+      </w:r>
+      <w:r>
+        <w:t xml:space="preserve"> </w:t>
+      </w:r>
+      <w:r>
+        <w:t xml:space="preserve">serve as the top-level packaging and distribution layer for agent capabilities</w:t>
+      </w:r>
+      <w:r>
+        <w:t xml:space="preserve"> </w:t>
+      </w:r>
+      <w:r>
+        <w:t xml:space="preserve">(measured 2026-09-01).</w:t>
+      </w:r>
+      <w:r>
+        <w:t xml:space="preserve"> </w:t>
+      </w:r>
+      <w:r>
+        <w:t xml:space="preserve">While individual skills or Model Context Protocol (MCP) servers extend specific tasks,</w:t>
+      </w:r>
+      <w:r>
+        <w:t xml:space="preserve"> </w:t>
+      </w:r>
+      <w:r>
+        <w:t xml:space="preserve">a plugin aggregates multiple extensibility primitives into a unified, version-controlled bundle.</w:t>
+      </w:r>
+    </w:p>
+    <w:bookmarkStart w:id="440" w:name="anatomy-of-a-plugin-bundle"/>
+    <w:p>
+      <w:pPr>
+        <w:pStyle w:val="Heading4"/>
+      </w:pPr>
+      <w:r>
+        <w:t xml:space="preserve">Anatomy of a plugin bundle</w:t>
+      </w:r>
+    </w:p>
+    <w:p>
+      <w:pPr>
+        <w:pStyle w:val="FirstParagraph"/>
+      </w:pPr>
+      <w:r>
+        <w:t xml:space="preserve">A plugin manifest (such as</w:t>
+      </w:r>
+      <w:r>
+        <w:t xml:space="preserve"> </w:t>
+      </w:r>
+      <w:r>
+        <w:rPr>
+          <w:rStyle w:val="VerbatimChar"/>
+        </w:rPr>
+        <w:t xml:space="preserve">plugin.json</w:t>
+      </w:r>
+      <w:r>
+        <w:t xml:space="preserve"> </w:t>
+      </w:r>
+      <w:r>
+        <w:t xml:space="preserve">or</w:t>
+      </w:r>
+      <w:r>
+        <w:t xml:space="preserve"> </w:t>
+      </w:r>
+      <w:r>
+        <w:rPr>
+          <w:rStyle w:val="VerbatimChar"/>
+        </w:rPr>
+        <w:t xml:space="preserve">.claude-plugin/plugin.json</w:t>
+      </w:r>
+      <w:r>
+        <w:t xml:space="preserve">) orchestrates four distinct architectural components:</w:t>
+      </w:r>
+    </w:p>
+    <w:p>
+      <w:pPr>
+        <w:pStyle w:val="Compact"/>
+        <w:numPr>
+          <w:ilvl w:val="0"/>
+          <w:numId w:val="1182"/>
+        </w:numPr>
+      </w:pPr>
+      <w:r>
+        <w:rPr>
+          <w:b/>
+          <w:bCs/>
+        </w:rPr>
+        <w:t xml:space="preserve">Skills (</w:t>
+      </w:r>
+      <w:r>
+        <w:rPr>
+          <w:rStyle w:val="VerbatimChar"/>
+          <w:b/>
+          <w:bCs/>
+        </w:rPr>
+        <w:t xml:space="preserve">skills/**/SKILL.md</w:t>
+      </w:r>
+      <w:r>
+        <w:rPr>
+          <w:b/>
+          <w:bCs/>
+        </w:rPr>
+        <w:t xml:space="preserve">)</w:t>
+      </w:r>
+      <w:r>
+        <w:t xml:space="preserve">:</w:t>
+      </w:r>
+      <w:r>
+        <w:t xml:space="preserve"> </w:t>
+      </w:r>
+      <w:r>
+        <w:t xml:space="preserve">Procedural Markdown instructions that teach the agent domain-specific workflows,</w:t>
+      </w:r>
+      <w:r>
+        <w:t xml:space="preserve"> </w:t>
+      </w:r>
+      <w:r>
+        <w:t xml:space="preserve">coding conventions, and structured checklists.</w:t>
+      </w:r>
+    </w:p>
+    <w:p>
+      <w:pPr>
+        <w:pStyle w:val="Compact"/>
+        <w:numPr>
+          <w:ilvl w:val="0"/>
+          <w:numId w:val="1182"/>
+        </w:numPr>
+      </w:pPr>
+      <w:r>
+        <w:rPr>
+          <w:b/>
+          <w:bCs/>
+        </w:rPr>
+        <w:t xml:space="preserve">Model Context Protocol (MCP) servers</w:t>
+      </w:r>
+      <w:r>
+        <w:t xml:space="preserve">:</w:t>
+      </w:r>
+      <w:r>
+        <w:t xml:space="preserve"> </w:t>
+      </w:r>
+      <w:r>
+        <w:t xml:space="preserve">External process definitions exposing executable tool functions,</w:t>
+      </w:r>
+      <w:r>
+        <w:t xml:space="preserve"> </w:t>
+      </w:r>
+      <w:r>
+        <w:t xml:space="preserve">database connectors, and live workspace resources via standard MCP JSON-RPC endpoints.</w:t>
+      </w:r>
+    </w:p>
+    <w:p>
+      <w:pPr>
+        <w:pStyle w:val="Compact"/>
+        <w:numPr>
+          <w:ilvl w:val="0"/>
+          <w:numId w:val="1182"/>
+        </w:numPr>
+      </w:pPr>
+      <w:r>
+        <w:rPr>
+          <w:b/>
+          <w:bCs/>
+        </w:rPr>
+        <w:t xml:space="preserve">Lifecycle hooks</w:t>
+      </w:r>
+      <w:r>
+        <w:t xml:space="preserve">:</w:t>
+      </w:r>
+      <w:r>
+        <w:t xml:space="preserve"> </w:t>
+      </w:r>
+      <w:r>
+        <w:t xml:space="preserve">Deterministic executable scripts configured via hook manifests (such as</w:t>
+      </w:r>
+      <w:r>
+        <w:t xml:space="preserve"> </w:t>
+      </w:r>
+      <w:r>
+        <w:rPr>
+          <w:rStyle w:val="VerbatimChar"/>
+        </w:rPr>
+        <w:t xml:space="preserve">hooks.json</w:t>
+      </w:r>
+      <w:r>
+        <w:t xml:space="preserve">)</w:t>
+      </w:r>
+      <w:r>
+        <w:t xml:space="preserve"> </w:t>
+      </w:r>
+      <w:r>
+        <w:t xml:space="preserve">attached to agent lifecycle events</w:t>
+      </w:r>
+      <w:r>
+        <w:t xml:space="preserve"> </w:t>
+      </w:r>
+      <w:r>
+        <w:t xml:space="preserve">(such as</w:t>
+      </w:r>
+      <w:r>
+        <w:t xml:space="preserve"> </w:t>
+      </w:r>
+      <w:r>
+        <w:rPr>
+          <w:rStyle w:val="VerbatimChar"/>
+        </w:rPr>
+        <w:t xml:space="preserve">PreToolUse</w:t>
+      </w:r>
+      <w:r>
+        <w:t xml:space="preserve"> </w:t>
+      </w:r>
+      <w:r>
+        <w:t xml:space="preserve">command inspection,</w:t>
+      </w:r>
+      <w:r>
+        <w:t xml:space="preserve"> </w:t>
+      </w:r>
+      <w:r>
+        <w:rPr>
+          <w:rStyle w:val="VerbatimChar"/>
+        </w:rPr>
+        <w:t xml:space="preserve">Stop</w:t>
+      </w:r>
+      <w:r>
+        <w:t xml:space="preserve"> </w:t>
+      </w:r>
+      <w:r>
+        <w:t xml:space="preserve">review-gate verification, and</w:t>
+      </w:r>
+      <w:r>
+        <w:t xml:space="preserve"> </w:t>
+      </w:r>
+      <w:r>
+        <w:rPr>
+          <w:rStyle w:val="VerbatimChar"/>
+        </w:rPr>
+        <w:t xml:space="preserve">UserPromptSubmit</w:t>
+      </w:r>
+      <w:r>
+        <w:t xml:space="preserve"> </w:t>
+      </w:r>
+      <w:r>
+        <w:t xml:space="preserve">context injection).</w:t>
+      </w:r>
+    </w:p>
+    <w:p>
+      <w:pPr>
+        <w:pStyle w:val="Compact"/>
+        <w:numPr>
+          <w:ilvl w:val="0"/>
+          <w:numId w:val="1182"/>
+        </w:numPr>
+      </w:pPr>
+      <w:r>
+        <w:rPr>
+          <w:b/>
+          <w:bCs/>
+        </w:rPr>
+        <w:t xml:space="preserve">Specialized agent roles and slash commands</w:t>
+      </w:r>
+      <w:r>
+        <w:t xml:space="preserve">:</w:t>
+      </w:r>
+      <w:r>
+        <w:t xml:space="preserve"> </w:t>
+      </w:r>
+      <w:r>
+        <w:t xml:space="preserve">Pre-configured subagent personas (such as dedicated reviewers or researchers)</w:t>
+      </w:r>
+      <w:r>
+        <w:t xml:space="preserve"> </w:t>
+      </w:r>
+      <w:r>
+        <w:t xml:space="preserve">and user-facing shortcut commands (</w:t>
+      </w:r>
+      <w:r>
+        <w:rPr>
+          <w:rStyle w:val="VerbatimChar"/>
+        </w:rPr>
+        <w:t xml:space="preserve">/command</w:t>
+      </w:r>
+      <w:r>
+        <w:t xml:space="preserve">).</w:t>
+      </w:r>
+    </w:p>
+    <w:bookmarkEnd w:id="440"/>
+    <w:bookmarkStart w:id="441" w:name="Xb156bac2e0c888c1ab3d0e38107d9942105af8d"/>
+    <w:p>
+      <w:pPr>
+        <w:pStyle w:val="Heading4"/>
+      </w:pPr>
+      <w:r>
+        <w:t xml:space="preserve">Comparison: Skills vs. MCP Servers &amp; Tools vs. Plugins</w:t>
+      </w:r>
+    </w:p>
+    <w:tbl>
+      <w:tblPr>
+        <w:tblStyle w:val="Table"/>
+        <w:tblW w:type="pct" w:w="5000"/>
+        <w:tblLayout w:type="fixed"/>
+        <w:tblLook w:firstRow="1" w:lastRow="0" w:firstColumn="0" w:lastColumn="0" w:noHBand="0" w:noVBand="0" w:val="0020"/>
+      </w:tblPr>
+      <w:tblGrid>
+        <w:gridCol w:w="1980"/>
+        <w:gridCol w:w="1980"/>
+        <w:gridCol w:w="1980"/>
+        <w:gridCol w:w="1980"/>
+      </w:tblGrid>
+      <w:tr>
+        <w:trPr>
+          <w:tblHeader w:val="on"/>
+        </w:trPr>
+        <w:tc>
+          <w:tcPr/>
+          <w:p>
+            <w:pPr>
+              <w:pStyle w:val="Compact"/>
+            </w:pPr>
+            <w:r>
+              <w:t xml:space="preserve">Dimension</w:t>
+            </w:r>
+          </w:p>
+        </w:tc>
+        <w:tc>
+          <w:tcPr/>
+          <w:p>
+            <w:pPr>
+              <w:pStyle w:val="Compact"/>
+            </w:pPr>
+            <w:r>
+              <w:t xml:space="preserve">Skills (</w:t>
+            </w:r>
+            <w:r>
+              <w:rPr>
+                <w:rStyle w:val="VerbatimChar"/>
+              </w:rPr>
+              <w:t xml:space="preserve">SKILL.md</w:t>
+            </w:r>
+            <w:r>
+              <w:t xml:space="preserve">)</w:t>
+            </w:r>
+          </w:p>
+        </w:tc>
+        <w:tc>
+          <w:tcPr/>
+          <w:p>
+            <w:pPr>
+              <w:pStyle w:val="Compact"/>
+            </w:pPr>
+            <w:r>
+              <w:t xml:space="preserve">MCP Servers &amp; Tools</w:t>
+            </w:r>
+          </w:p>
+        </w:tc>
+        <w:tc>
+          <w:tcPr/>
+          <w:p>
+            <w:pPr>
+              <w:pStyle w:val="Compact"/>
+            </w:pPr>
+            <w:r>
+              <w:t xml:space="preserve">Plugins (</w:t>
+            </w:r>
+            <w:r>
+              <w:rPr>
+                <w:rStyle w:val="VerbatimChar"/>
+              </w:rPr>
+              <w:t xml:space="preserve">plugin.json</w:t>
+            </w:r>
+            <w:r>
+              <w:t xml:space="preserve">)</w:t>
+            </w:r>
+          </w:p>
+        </w:tc>
+      </w:tr>
+      <w:tr>
+        <w:tc>
+          <w:tcPr/>
+          <w:p>
+            <w:pPr>
+              <w:pStyle w:val="Compact"/>
+            </w:pPr>
+            <w:r>
+              <w:rPr>
+                <w:b/>
+                <w:bCs/>
+              </w:rPr>
+              <w:t xml:space="preserve">Primary purpose</w:t>
+            </w:r>
+          </w:p>
+        </w:tc>
+        <w:tc>
+          <w:tcPr/>
+          <w:p>
+            <w:pPr>
+              <w:pStyle w:val="Compact"/>
+            </w:pPr>
+            <w:r>
+              <w:t xml:space="preserve">Procedural guidance &amp; workflows</w:t>
+            </w:r>
+          </w:p>
+        </w:tc>
+        <w:tc>
+          <w:tcPr/>
+          <w:p>
+            <w:pPr>
+              <w:pStyle w:val="Compact"/>
+            </w:pPr>
+            <w:r>
+              <w:t xml:space="preserve">External tool execution &amp; data access</w:t>
+            </w:r>
+          </w:p>
+        </w:tc>
+        <w:tc>
+          <w:tcPr/>
+          <w:p>
+            <w:pPr>
+              <w:pStyle w:val="Compact"/>
+            </w:pPr>
+            <w:r>
+              <w:t xml:space="preserve">Unified packaging &amp; distribution</w:t>
+            </w:r>
+          </w:p>
+        </w:tc>
+      </w:tr>
+      <w:tr>
+        <w:tc>
+          <w:tcPr/>
+          <w:p>
+            <w:pPr>
+              <w:pStyle w:val="Compact"/>
+            </w:pPr>
+            <w:r>
+              <w:rPr>
+                <w:b/>
+                <w:bCs/>
+              </w:rPr>
+              <w:t xml:space="preserve">Execution model</w:t>
+            </w:r>
+          </w:p>
+        </w:tc>
+        <w:tc>
+          <w:tcPr/>
+          <w:p>
+            <w:pPr>
+              <w:pStyle w:val="Compact"/>
+            </w:pPr>
+            <w:r>
+              <w:t xml:space="preserve">Progressively loaded on demand</w:t>
+            </w:r>
+          </w:p>
+        </w:tc>
+        <w:tc>
+          <w:tcPr/>
+          <w:p>
+            <w:pPr>
+              <w:pStyle w:val="Compact"/>
+            </w:pPr>
+            <w:r>
+              <w:t xml:space="preserve">Executed by agent harness over IPC</w:t>
+            </w:r>
+          </w:p>
+        </w:tc>
+        <w:tc>
+          <w:tcPr/>
+          <w:p>
+            <w:pPr>
+              <w:pStyle w:val="Compact"/>
+            </w:pPr>
+            <w:r>
+              <w:t xml:space="preserve">Discovered &amp; loaded by agent platform</w:t>
+            </w:r>
+          </w:p>
+        </w:tc>
+      </w:tr>
+      <w:tr>
+        <w:tc>
+          <w:tcPr/>
+          <w:p>
+            <w:pPr>
+              <w:pStyle w:val="Compact"/>
+            </w:pPr>
+            <w:r>
+              <w:rPr>
+                <w:b/>
+                <w:bCs/>
+              </w:rPr>
+              <w:t xml:space="preserve">Dependencies</w:t>
+            </w:r>
+          </w:p>
+        </w:tc>
+        <w:tc>
+          <w:tcPr/>
+          <w:p>
+            <w:pPr>
+              <w:pStyle w:val="Compact"/>
+            </w:pPr>
+            <w:r>
+              <w:t xml:space="preserve">Plain Markdown &amp; scripts</w:t>
+            </w:r>
+          </w:p>
+        </w:tc>
+        <w:tc>
+          <w:tcPr/>
+          <w:p>
+            <w:pPr>
+              <w:pStyle w:val="Compact"/>
+            </w:pPr>
+            <w:r>
+              <w:t xml:space="preserve">Language runtimes (Node.js, Python, binaries)</w:t>
+            </w:r>
+          </w:p>
+        </w:tc>
+        <w:tc>
+          <w:tcPr/>
+          <w:p>
+            <w:pPr>
+              <w:pStyle w:val="Compact"/>
+            </w:pPr>
+            <w:r>
+              <w:t xml:space="preserve">Bundles skills, MCP configs, and hooks</w:t>
+            </w:r>
+          </w:p>
+        </w:tc>
+      </w:tr>
+      <w:tr>
+        <w:tc>
+          <w:tcPr/>
+          <w:p>
+            <w:pPr>
+              <w:pStyle w:val="Compact"/>
+            </w:pPr>
+            <w:r>
+              <w:rPr>
+                <w:b/>
+                <w:bCs/>
+              </w:rPr>
+              <w:t xml:space="preserve">Lifecycle control</w:t>
+            </w:r>
+          </w:p>
+        </w:tc>
+        <w:tc>
+          <w:tcPr/>
+          <w:p>
+            <w:pPr>
+              <w:pStyle w:val="Compact"/>
+            </w:pPr>
+            <w:r>
+              <w:t xml:space="preserve">Passive context instructions</w:t>
+            </w:r>
+          </w:p>
+        </w:tc>
+        <w:tc>
+          <w:tcPr/>
+          <w:p>
+            <w:pPr>
+              <w:pStyle w:val="Compact"/>
+            </w:pPr>
+            <w:r>
+              <w:t xml:space="preserve">Dynamic tool calls during agent turn</w:t>
+            </w:r>
+          </w:p>
+        </w:tc>
+        <w:tc>
+          <w:tcPr/>
+          <w:p>
+            <w:pPr>
+              <w:pStyle w:val="Compact"/>
+            </w:pPr>
+            <w:r>
+              <w:t xml:space="preserve">Active deterministic hook gates</w:t>
+            </w:r>
+          </w:p>
+        </w:tc>
+      </w:tr>
+    </w:tbl>
+    <w:bookmarkEnd w:id="441"/>
+    <w:bookmarkStart w:id="442" w:name="managing-token-budget-and-context-bloat"/>
+    <w:p>
+      <w:pPr>
+        <w:pStyle w:val="Heading4"/>
+      </w:pPr>
+      <w:r>
+        <w:t xml:space="preserve">Managing token budget and context bloat</w:t>
+      </w:r>
+    </w:p>
+    <w:p>
+      <w:pPr>
+        <w:pStyle w:val="FirstParagraph"/>
+      </w:pPr>
+      <w:r>
+        <w:t xml:space="preserve">A common hazard when adopting large community plugin bundles is context window saturation.</w:t>
+      </w:r>
+      <w:r>
+        <w:t xml:space="preserve"> </w:t>
+      </w:r>
+      <w:r>
+        <w:t xml:space="preserve">When multiple plugins eagerly inject verbose instructions and exhaustive tool schemas into every turn,</w:t>
+      </w:r>
+      <w:r>
+        <w:t xml:space="preserve"> </w:t>
+      </w:r>
+      <w:r>
+        <w:t xml:space="preserve">available context for actual code and reasoning shrinks.</w:t>
+      </w:r>
+    </w:p>
+    <w:p>
+      <w:pPr>
+        <w:pStyle w:val="BodyText"/>
+      </w:pPr>
+      <w:r>
+        <w:t xml:space="preserve">Effective plugin architectures mitigate this through several strategies:</w:t>
+      </w:r>
+    </w:p>
+    <w:p>
+      <w:pPr>
+        <w:pStyle w:val="Compact"/>
+        <w:numPr>
+          <w:ilvl w:val="0"/>
+          <w:numId w:val="1183"/>
+        </w:numPr>
+      </w:pPr>
+      <w:r>
+        <w:rPr>
+          <w:b/>
+          <w:bCs/>
+        </w:rPr>
+        <w:t xml:space="preserve">Lazy tool discovery</w:t>
+      </w:r>
+      <w:r>
+        <w:t xml:space="preserve">:</w:t>
+      </w:r>
+      <w:r>
+        <w:t xml:space="preserve"> </w:t>
+      </w:r>
+      <w:r>
+        <w:t xml:space="preserve">Only core system tools load eagerly; specialized plugin tools declare schemas that load lazily on demand.</w:t>
+      </w:r>
+    </w:p>
+    <w:p>
+      <w:pPr>
+        <w:pStyle w:val="Compact"/>
+        <w:numPr>
+          <w:ilvl w:val="0"/>
+          <w:numId w:val="1183"/>
+        </w:numPr>
+      </w:pPr>
+      <w:r>
+        <w:rPr>
+          <w:b/>
+          <w:bCs/>
+        </w:rPr>
+        <w:t xml:space="preserve">On-demand skill activation</w:t>
+      </w:r>
+      <w:r>
+        <w:t xml:space="preserve">:</w:t>
+      </w:r>
+      <w:r>
+        <w:t xml:space="preserve"> </w:t>
+      </w:r>
+      <w:r>
+        <w:t xml:space="preserve">Agents search skill catalogs dynamically when relevant keywords appear,</w:t>
+      </w:r>
+      <w:r>
+        <w:t xml:space="preserve"> </w:t>
+      </w:r>
+      <w:r>
+        <w:t xml:space="preserve">rather than loading the entire skill directory into the initial system prompt.</w:t>
+      </w:r>
+    </w:p>
+    <w:p>
+      <w:pPr>
+        <w:pStyle w:val="Compact"/>
+        <w:numPr>
+          <w:ilvl w:val="0"/>
+          <w:numId w:val="1183"/>
+        </w:numPr>
+      </w:pPr>
+      <w:r>
+        <w:rPr>
+          <w:b/>
+          <w:bCs/>
+        </w:rPr>
+        <w:t xml:space="preserve">Prefix caching preservation</w:t>
+      </w:r>
+      <w:r>
+        <w:t xml:space="preserve">:</w:t>
+      </w:r>
+      <w:r>
+        <w:t xml:space="preserve"> </w:t>
+      </w:r>
+      <w:r>
+        <w:t xml:space="preserve">Static plugin definitions are placed at the root of prompt structures</w:t>
+      </w:r>
+      <w:r>
+        <w:t xml:space="preserve"> </w:t>
+      </w:r>
+      <w:r>
+        <w:t xml:space="preserve">so provider-level prompt caching remains undisturbed during multi-turn sessions.</w:t>
+      </w:r>
+    </w:p>
+    <w:bookmarkEnd w:id="442"/>
+    <w:bookmarkEnd w:id="443"/>
+    <w:bookmarkStart w:id="451" w:name="sec-ai-gemini-spend-management"/>
+    <w:p>
+      <w:pPr>
+        <w:pStyle w:val="Heading1"/>
+      </w:pPr>
+      <w:r>
+        <w:t xml:space="preserve">46. Managing Gemini API Spend and Cost Optimization</w:t>
+      </w:r>
+    </w:p>
+    <w:p>
+      <w:pPr>
+        <w:pStyle w:val="FirstParagraph"/>
+      </w:pPr>
+      <w:r>
+        <w:t xml:space="preserve">This guide describes how to manage Google AI Studio and Google Cloud Gemini API spend caps,</w:t>
+      </w:r>
+      <w:r>
+        <w:t xml:space="preserve"> </w:t>
+      </w:r>
+      <w:r>
+        <w:t xml:space="preserve">unpause paused API services,</w:t>
+      </w:r>
+      <w:r>
+        <w:t xml:space="preserve"> </w:t>
+      </w:r>
+      <w:r>
+        <w:t xml:space="preserve">and optimize token consumption across local tools and GitHub Actions workflows.</w:t>
+      </w:r>
+    </w:p>
+    <w:bookmarkStart w:id="445" w:name="Xd8c10be17edf039db5b664720f228274181ba18"/>
+    <w:p>
+      <w:pPr>
+        <w:pStyle w:val="Heading4"/>
+      </w:pPr>
+      <w:r>
+        <w:t xml:space="preserve">Identifying Paused Projects (Project Numbers vs. Friendly Names)</w:t>
+      </w:r>
+    </w:p>
+    <w:p>
+      <w:pPr>
+        <w:pStyle w:val="FirstParagraph"/>
+      </w:pPr>
+      <w:r>
+        <w:t xml:space="preserve">When a project reaches its monthly budget limit,</w:t>
+      </w:r>
+      <w:r>
+        <w:t xml:space="preserve"> </w:t>
+      </w:r>
+      <w:r>
+        <w:t xml:space="preserve">Google sends an email notification stating that Gemini API service has been paused.</w:t>
+      </w:r>
+      <w:r>
+        <w:t xml:space="preserve"> </w:t>
+      </w:r>
+      <w:r>
+        <w:t xml:space="preserve">These email notifications identify the affected project using its internal</w:t>
+      </w:r>
+      <w:r>
+        <w:t xml:space="preserve"> </w:t>
+      </w:r>
+      <w:r>
+        <w:rPr>
+          <w:b/>
+          <w:bCs/>
+        </w:rPr>
         <w:t xml:space="preserve">numerical GCP Project Number</w:t>
       </w:r>
       <w:r>
@@ -64877,7 +65601,7 @@
       <w:r>
         <w:t xml:space="preserve"> </w:t>
       </w:r>
-      <w:hyperlink r:id="rId440">
+      <w:hyperlink r:id="rId444">
         <w:r>
           <w:rPr>
             <w:rStyle w:val="Hyperlink"/>
@@ -64963,7 +65687,7 @@
         <w:pStyle w:val="Compact"/>
         <w:numPr>
           <w:ilvl w:val="0"/>
-          <w:numId w:val="1182"/>
+          <w:numId w:val="1184"/>
         </w:numPr>
       </w:pPr>
       <w:r>
@@ -64972,7 +65696,7 @@
       <w:r>
         <w:t xml:space="preserve"> </w:t>
       </w:r>
-      <w:hyperlink r:id="rId440">
+      <w:hyperlink r:id="rId444">
         <w:r>
           <w:rPr>
             <w:rStyle w:val="Hyperlink"/>
@@ -64989,7 +65713,7 @@
         <w:pStyle w:val="Compact"/>
         <w:numPr>
           <w:ilvl w:val="0"/>
-          <w:numId w:val="1182"/>
+          <w:numId w:val="1184"/>
         </w:numPr>
       </w:pPr>
       <w:r>
@@ -65001,15 +65725,15 @@
         <w:pStyle w:val="Compact"/>
         <w:numPr>
           <w:ilvl w:val="0"/>
-          <w:numId w:val="1182"/>
+          <w:numId w:val="1184"/>
         </w:numPr>
       </w:pPr>
       <w:r>
         <w:t xml:space="preserve">Any project that has hit its monthly spend cap will have its API requests paused until the limit is updated.</w:t>
       </w:r>
     </w:p>
-    <w:bookmarkEnd w:id="441"/>
-    <w:bookmarkStart w:id="443" w:name="adjusting-and-unpausing-spend-caps"/>
+    <w:bookmarkEnd w:id="445"/>
+    <w:bookmarkStart w:id="447" w:name="adjusting-and-unpausing-spend-caps"/>
     <w:p>
       <w:pPr>
         <w:pStyle w:val="Heading4"/>
@@ -65031,7 +65755,7 @@
         <w:pStyle w:val="Compact"/>
         <w:numPr>
           <w:ilvl w:val="0"/>
-          <w:numId w:val="1183"/>
+          <w:numId w:val="1185"/>
         </w:numPr>
       </w:pPr>
       <w:r>
@@ -65040,7 +65764,7 @@
       <w:r>
         <w:t xml:space="preserve"> </w:t>
       </w:r>
-      <w:hyperlink r:id="rId442">
+      <w:hyperlink r:id="rId446">
         <w:r>
           <w:rPr>
             <w:rStyle w:val="Hyperlink"/>
@@ -65057,7 +65781,7 @@
         <w:pStyle w:val="Compact"/>
         <w:numPr>
           <w:ilvl w:val="0"/>
-          <w:numId w:val="1183"/>
+          <w:numId w:val="1185"/>
         </w:numPr>
       </w:pPr>
       <w:r>
@@ -65069,7 +65793,7 @@
         <w:pStyle w:val="Compact"/>
         <w:numPr>
           <w:ilvl w:val="0"/>
-          <w:numId w:val="1183"/>
+          <w:numId w:val="1185"/>
         </w:numPr>
       </w:pPr>
       <w:r>
@@ -65109,8 +65833,8 @@
         <w:t xml:space="preserve">and API service automatically resumes up to the configured cap.</w:t>
       </w:r>
     </w:p>
-    <w:bookmarkEnd w:id="443"/>
-    <w:bookmarkStart w:id="445" w:name="setting-up-google-cloud-budget-alerts"/>
+    <w:bookmarkEnd w:id="447"/>
+    <w:bookmarkStart w:id="449" w:name="setting-up-google-cloud-budget-alerts"/>
     <w:p>
       <w:pPr>
         <w:pStyle w:val="Heading4"/>
@@ -65132,7 +65856,7 @@
         <w:pStyle w:val="Compact"/>
         <w:numPr>
           <w:ilvl w:val="0"/>
-          <w:numId w:val="1184"/>
+          <w:numId w:val="1186"/>
         </w:numPr>
       </w:pPr>
       <w:r>
@@ -65141,7 +65865,7 @@
       <w:r>
         <w:t xml:space="preserve"> </w:t>
       </w:r>
-      <w:hyperlink r:id="rId444">
+      <w:hyperlink r:id="rId448">
         <w:r>
           <w:rPr>
             <w:rStyle w:val="Hyperlink"/>
@@ -65158,7 +65882,7 @@
         <w:pStyle w:val="Compact"/>
         <w:numPr>
           <w:ilvl w:val="0"/>
-          <w:numId w:val="1184"/>
+          <w:numId w:val="1186"/>
         </w:numPr>
       </w:pPr>
       <w:r>
@@ -65183,7 +65907,7 @@
         <w:pStyle w:val="Compact"/>
         <w:numPr>
           <w:ilvl w:val="0"/>
-          <w:numId w:val="1184"/>
+          <w:numId w:val="1186"/>
         </w:numPr>
       </w:pPr>
       <w:r>
@@ -65207,7 +65931,7 @@
         <w:pStyle w:val="Compact"/>
         <w:numPr>
           <w:ilvl w:val="0"/>
-          <w:numId w:val="1184"/>
+          <w:numId w:val="1186"/>
         </w:numPr>
       </w:pPr>
       <w:r>
@@ -65219,7 +65943,7 @@
         <w:pStyle w:val="Compact"/>
         <w:numPr>
           <w:ilvl w:val="0"/>
-          <w:numId w:val="1184"/>
+          <w:numId w:val="1186"/>
         </w:numPr>
       </w:pPr>
       <w:r>
@@ -65273,7 +65997,7 @@
         <w:pStyle w:val="Compact"/>
         <w:numPr>
           <w:ilvl w:val="0"/>
-          <w:numId w:val="1184"/>
+          <w:numId w:val="1186"/>
         </w:numPr>
       </w:pPr>
       <w:r>
@@ -65293,8 +66017,8 @@
         <w:t xml:space="preserve">. You will receive email alerts before any project hits its spend cap.</w:t>
       </w:r>
     </w:p>
-    <w:bookmarkEnd w:id="445"/>
-    <w:bookmarkStart w:id="446" w:name="cost-optimization-best-practices"/>
+    <w:bookmarkEnd w:id="449"/>
+    <w:bookmarkStart w:id="450" w:name="cost-optimization-best-practices"/>
     <w:p>
       <w:pPr>
         <w:pStyle w:val="Heading4"/>
@@ -65316,7 +66040,7 @@
         <w:pStyle w:val="Compact"/>
         <w:numPr>
           <w:ilvl w:val="0"/>
-          <w:numId w:val="1185"/>
+          <w:numId w:val="1187"/>
         </w:numPr>
       </w:pPr>
       <w:r>
@@ -65452,7 +66176,7 @@
         <w:pStyle w:val="Compact"/>
         <w:numPr>
           <w:ilvl w:val="0"/>
-          <w:numId w:val="1185"/>
+          <w:numId w:val="1187"/>
         </w:numPr>
       </w:pPr>
       <w:r>
@@ -65483,7 +66207,7 @@
         <w:pStyle w:val="Compact"/>
         <w:numPr>
           <w:ilvl w:val="0"/>
-          <w:numId w:val="1185"/>
+          <w:numId w:val="1187"/>
         </w:numPr>
       </w:pPr>
       <w:r>
@@ -65514,7 +66238,7 @@
         <w:pStyle w:val="Compact"/>
         <w:numPr>
           <w:ilvl w:val="0"/>
-          <w:numId w:val="1185"/>
+          <w:numId w:val="1187"/>
         </w:numPr>
       </w:pPr>
       <w:r>
@@ -65609,9 +66333,9 @@
         <w:t xml:space="preserve">to collapse them in GitHub’s web diff view and exclude them from repository language statistics.</w:t>
       </w:r>
     </w:p>
-    <w:bookmarkEnd w:id="446"/>
-    <w:bookmarkEnd w:id="447"/>
-    <w:bookmarkStart w:id="477" w:name="references"/>
+    <w:bookmarkEnd w:id="450"/>
+    <w:bookmarkEnd w:id="451"/>
+    <w:bookmarkStart w:id="481" w:name="references"/>
     <w:p>
       <w:pPr>
         <w:pStyle w:val="Heading1"/>
@@ -65620,8 +66344,8 @@
         <w:t xml:space="preserve">References</w:t>
       </w:r>
     </w:p>
-    <w:bookmarkStart w:id="476" w:name="refs"/>
-    <w:bookmarkStart w:id="449" w:name="ref-space_odyssey"/>
+    <w:bookmarkStart w:id="480" w:name="refs"/>
+    <w:bookmarkStart w:id="453" w:name="ref-space_odyssey"/>
     <w:p>
       <w:pPr>
         <w:pStyle w:val="Bibliography"/>
@@ -65639,7 +66363,7 @@
       <w:r>
         <w:t xml:space="preserve"> </w:t>
       </w:r>
-      <w:hyperlink r:id="rId448">
+      <w:hyperlink r:id="rId452">
         <w:r>
           <w:rPr>
             <w:rStyle w:val="Hyperlink"/>
@@ -65651,8 +66375,8 @@
         <w:t xml:space="preserve">.</w:t>
       </w:r>
     </w:p>
-    <w:bookmarkEnd w:id="449"/>
-    <w:bookmarkStart w:id="451" w:name="ref-i_robot"/>
+    <w:bookmarkEnd w:id="453"/>
+    <w:bookmarkStart w:id="455" w:name="ref-i_robot"/>
     <w:p>
       <w:pPr>
         <w:pStyle w:val="Bibliography"/>
@@ -65676,7 +66400,7 @@
       <w:r>
         <w:t xml:space="preserve"> </w:t>
       </w:r>
-      <w:hyperlink r:id="rId450">
+      <w:hyperlink r:id="rId454">
         <w:r>
           <w:rPr>
             <w:rStyle w:val="Hyperlink"/>
@@ -65688,8 +66412,8 @@
         <w:t xml:space="preserve">.</w:t>
       </w:r>
     </w:p>
-    <w:bookmarkEnd w:id="451"/>
-    <w:bookmarkStart w:id="453" w:name="ref-battlestar_galactica_2004"/>
+    <w:bookmarkEnd w:id="455"/>
+    <w:bookmarkStart w:id="457" w:name="ref-battlestar_galactica_2004"/>
     <w:p>
       <w:pPr>
         <w:pStyle w:val="Bibliography"/>
@@ -65707,7 +66431,7 @@
       <w:r>
         <w:t xml:space="preserve"> </w:t>
       </w:r>
-      <w:hyperlink r:id="rId452">
+      <w:hyperlink r:id="rId456">
         <w:r>
           <w:rPr>
             <w:rStyle w:val="Hyperlink"/>
@@ -65719,8 +66443,8 @@
         <w:t xml:space="preserve">.</w:t>
       </w:r>
     </w:p>
-    <w:bookmarkEnd w:id="453"/>
-    <w:bookmarkStart w:id="455" w:name="ref-slm_agentic_ai"/>
+    <w:bookmarkEnd w:id="457"/>
+    <w:bookmarkStart w:id="459" w:name="ref-slm_agentic_ai"/>
     <w:p>
       <w:pPr>
         <w:pStyle w:val="Bibliography"/>
@@ -65744,7 +66468,7 @@
       <w:r>
         <w:t xml:space="preserve"> </w:t>
       </w:r>
-      <w:hyperlink r:id="rId454">
+      <w:hyperlink r:id="rId458">
         <w:r>
           <w:rPr>
             <w:rStyle w:val="Hyperlink"/>
@@ -65756,8 +66480,8 @@
         <w:t xml:space="preserve">.</w:t>
       </w:r>
     </w:p>
-    <w:bookmarkEnd w:id="455"/>
-    <w:bookmarkStart w:id="457" w:name="ref-blade_runner"/>
+    <w:bookmarkEnd w:id="459"/>
+    <w:bookmarkStart w:id="461" w:name="ref-blade_runner"/>
     <w:p>
       <w:pPr>
         <w:pStyle w:val="Bibliography"/>
@@ -65775,7 +66499,7 @@
       <w:r>
         <w:t xml:space="preserve"> </w:t>
       </w:r>
-      <w:hyperlink r:id="rId456">
+      <w:hyperlink r:id="rId460">
         <w:r>
           <w:rPr>
             <w:rStyle w:val="Hyperlink"/>
@@ -65787,8 +66511,8 @@
         <w:t xml:space="preserve">.</w:t>
       </w:r>
     </w:p>
-    <w:bookmarkEnd w:id="457"/>
-    <w:bookmarkStart w:id="459" w:name="ref-enders_game"/>
+    <w:bookmarkEnd w:id="461"/>
+    <w:bookmarkStart w:id="463" w:name="ref-enders_game"/>
     <w:p>
       <w:pPr>
         <w:pStyle w:val="Bibliography"/>
@@ -65812,7 +66536,7 @@
       <w:r>
         <w:t xml:space="preserve"> </w:t>
       </w:r>
-      <w:hyperlink r:id="rId458">
+      <w:hyperlink r:id="rId462">
         <w:r>
           <w:rPr>
             <w:rStyle w:val="Hyperlink"/>
@@ -65824,8 +66548,8 @@
         <w:t xml:space="preserve">.</w:t>
       </w:r>
     </w:p>
-    <w:bookmarkEnd w:id="459"/>
-    <w:bookmarkStart w:id="461" w:name="ref-qlora"/>
+    <w:bookmarkEnd w:id="463"/>
+    <w:bookmarkStart w:id="465" w:name="ref-qlora"/>
     <w:p>
       <w:pPr>
         <w:pStyle w:val="Bibliography"/>
@@ -65849,7 +66573,7 @@
       <w:r>
         <w:t xml:space="preserve"> </w:t>
       </w:r>
-      <w:hyperlink r:id="rId460">
+      <w:hyperlink r:id="rId464">
         <w:r>
           <w:rPr>
             <w:rStyle w:val="Hyperlink"/>
@@ -65861,8 +66585,8 @@
         <w:t xml:space="preserve">.</w:t>
       </w:r>
     </w:p>
-    <w:bookmarkEnd w:id="461"/>
-    <w:bookmarkStart w:id="463" w:name="ref-humans_are_dead"/>
+    <w:bookmarkEnd w:id="465"/>
+    <w:bookmarkStart w:id="467" w:name="ref-humans_are_dead"/>
     <w:p>
       <w:pPr>
         <w:pStyle w:val="Bibliography"/>
@@ -65886,7 +66610,7 @@
       <w:r>
         <w:t xml:space="preserve"> </w:t>
       </w:r>
-      <w:hyperlink r:id="rId462">
+      <w:hyperlink r:id="rId466">
         <w:r>
           <w:rPr>
             <w:rStyle w:val="Hyperlink"/>
@@ -65898,8 +66622,8 @@
         <w:t xml:space="preserve">.</w:t>
       </w:r>
     </w:p>
-    <w:bookmarkEnd w:id="463"/>
-    <w:bookmarkStart w:id="465" w:name="ref-dune"/>
+    <w:bookmarkEnd w:id="467"/>
+    <w:bookmarkStart w:id="469" w:name="ref-dune"/>
     <w:p>
       <w:pPr>
         <w:pStyle w:val="Bibliography"/>
@@ -65923,7 +66647,7 @@
       <w:r>
         <w:t xml:space="preserve"> </w:t>
       </w:r>
-      <w:hyperlink r:id="rId464">
+      <w:hyperlink r:id="rId468">
         <w:r>
           <w:rPr>
             <w:rStyle w:val="Hyperlink"/>
@@ -65935,8 +66659,8 @@
         <w:t xml:space="preserve">.</w:t>
       </w:r>
     </w:p>
-    <w:bookmarkEnd w:id="465"/>
-    <w:bookmarkStart w:id="467" w:name="ref-lora"/>
+    <w:bookmarkEnd w:id="469"/>
+    <w:bookmarkStart w:id="471" w:name="ref-lora"/>
     <w:p>
       <w:pPr>
         <w:pStyle w:val="Bibliography"/>
@@ -65960,7 +66684,7 @@
       <w:r>
         <w:t xml:space="preserve"> </w:t>
       </w:r>
-      <w:hyperlink r:id="rId466">
+      <w:hyperlink r:id="rId470">
         <w:r>
           <w:rPr>
             <w:rStyle w:val="Hyperlink"/>
@@ -65972,8 +66696,8 @@
         <w:t xml:space="preserve">.</w:t>
       </w:r>
     </w:p>
-    <w:bookmarkEnd w:id="467"/>
-    <w:bookmarkStart w:id="469" w:name="ref-lecun_world_models"/>
+    <w:bookmarkEnd w:id="471"/>
+    <w:bookmarkStart w:id="473" w:name="ref-lecun_world_models"/>
     <w:p>
       <w:pPr>
         <w:pStyle w:val="Bibliography"/>
@@ -65997,7 +66721,7 @@
       <w:r>
         <w:t xml:space="preserve"> </w:t>
       </w:r>
-      <w:hyperlink r:id="rId468">
+      <w:hyperlink r:id="rId472">
         <w:r>
           <w:rPr>
             <w:rStyle w:val="Hyperlink"/>
@@ -66009,8 +66733,8 @@
         <w:t xml:space="preserve">.</w:t>
       </w:r>
     </w:p>
-    <w:bookmarkEnd w:id="469"/>
-    <w:bookmarkStart w:id="471" w:name="ref-terminator"/>
+    <w:bookmarkEnd w:id="473"/>
+    <w:bookmarkStart w:id="475" w:name="ref-terminator"/>
     <w:p>
       <w:pPr>
         <w:pStyle w:val="Bibliography"/>
@@ -66028,7 +66752,7 @@
       <w:r>
         <w:t xml:space="preserve"> </w:t>
       </w:r>
-      <w:hyperlink r:id="rId470">
+      <w:hyperlink r:id="rId474">
         <w:r>
           <w:rPr>
             <w:rStyle w:val="Hyperlink"/>
@@ -66040,8 +66764,8 @@
         <w:t xml:space="preserve">.</w:t>
       </w:r>
     </w:p>
-    <w:bookmarkEnd w:id="471"/>
-    <w:bookmarkStart w:id="473" w:name="ref-matrix"/>
+    <w:bookmarkEnd w:id="475"/>
+    <w:bookmarkStart w:id="477" w:name="ref-matrix"/>
     <w:p>
       <w:pPr>
         <w:pStyle w:val="Bibliography"/>
@@ -66059,7 +66783,7 @@
       <w:r>
         <w:t xml:space="preserve"> </w:t>
       </w:r>
-      <w:hyperlink r:id="rId472">
+      <w:hyperlink r:id="rId476">
         <w:r>
           <w:rPr>
             <w:rStyle w:val="Hyperlink"/>
@@ -66071,8 +66795,8 @@
         <w:t xml:space="preserve">.</w:t>
       </w:r>
     </w:p>
-    <w:bookmarkEnd w:id="473"/>
-    <w:bookmarkStart w:id="475" w:name="ref-wargames"/>
+    <w:bookmarkEnd w:id="477"/>
+    <w:bookmarkStart w:id="479" w:name="ref-wargames"/>
     <w:p>
       <w:pPr>
         <w:pStyle w:val="Bibliography"/>
@@ -66090,7 +66814,7 @@
       <w:r>
         <w:t xml:space="preserve"> </w:t>
       </w:r>
-      <w:hyperlink r:id="rId474">
+      <w:hyperlink r:id="rId478">
         <w:r>
           <w:rPr>
             <w:rStyle w:val="Hyperlink"/>
@@ -66102,9 +66826,9 @@
         <w:t xml:space="preserve">.</w:t>
       </w:r>
     </w:p>
-    <w:bookmarkEnd w:id="475"/>
-    <w:bookmarkEnd w:id="476"/>
-    <w:bookmarkEnd w:id="477"/>
+    <w:bookmarkEnd w:id="479"/>
+    <w:bookmarkEnd w:id="480"/>
+    <w:bookmarkEnd w:id="481"/>
     <w:sectPr>
       <w:footnotePr>
         <w:numRestart w:val="eachSect"/>
@@ -67671,64 +68395,10 @@
     <w:abstractNumId w:val="991"/>
   </w:num>
   <w:num w:numId="1182">
-    <w:abstractNumId w:val="99411"/>
-    <w:lvlOverride w:ilvl="0">
-      <w:startOverride w:val="1"/>
-    </w:lvlOverride>
-    <w:lvlOverride w:ilvl="1">
-      <w:startOverride w:val="1"/>
-    </w:lvlOverride>
-    <w:lvlOverride w:ilvl="2">
-      <w:startOverride w:val="1"/>
-    </w:lvlOverride>
-    <w:lvlOverride w:ilvl="3">
-      <w:startOverride w:val="1"/>
-    </w:lvlOverride>
-    <w:lvlOverride w:ilvl="4">
-      <w:startOverride w:val="1"/>
-    </w:lvlOverride>
-    <w:lvlOverride w:ilvl="5">
-      <w:startOverride w:val="1"/>
-    </w:lvlOverride>
-    <w:lvlOverride w:ilvl="6">
-      <w:startOverride w:val="1"/>
-    </w:lvlOverride>
-    <w:lvlOverride w:ilvl="7">
-      <w:startOverride w:val="1"/>
-    </w:lvlOverride>
-    <w:lvlOverride w:ilvl="8">
-      <w:startOverride w:val="1"/>
-    </w:lvlOverride>
+    <w:abstractNumId w:val="991"/>
   </w:num>
   <w:num w:numId="1183">
-    <w:abstractNumId w:val="99411"/>
-    <w:lvlOverride w:ilvl="0">
-      <w:startOverride w:val="1"/>
-    </w:lvlOverride>
-    <w:lvlOverride w:ilvl="1">
-      <w:startOverride w:val="1"/>
-    </w:lvlOverride>
-    <w:lvlOverride w:ilvl="2">
-      <w:startOverride w:val="1"/>
-    </w:lvlOverride>
-    <w:lvlOverride w:ilvl="3">
-      <w:startOverride w:val="1"/>
-    </w:lvlOverride>
-    <w:lvlOverride w:ilvl="4">
-      <w:startOverride w:val="1"/>
-    </w:lvlOverride>
-    <w:lvlOverride w:ilvl="5">
-      <w:startOverride w:val="1"/>
-    </w:lvlOverride>
-    <w:lvlOverride w:ilvl="6">
-      <w:startOverride w:val="1"/>
-    </w:lvlOverride>
-    <w:lvlOverride w:ilvl="7">
-      <w:startOverride w:val="1"/>
-    </w:lvlOverride>
-    <w:lvlOverride w:ilvl="8">
-      <w:startOverride w:val="1"/>
-    </w:lvlOverride>
+    <w:abstractNumId w:val="991"/>
   </w:num>
   <w:num w:numId="1184">
     <w:abstractNumId w:val="99411"/>
@@ -67761,6 +68431,66 @@
     </w:lvlOverride>
   </w:num>
   <w:num w:numId="1185">
+    <w:abstractNumId w:val="99411"/>
+    <w:lvlOverride w:ilvl="0">
+      <w:startOverride w:val="1"/>
+    </w:lvlOverride>
+    <w:lvlOverride w:ilvl="1">
+      <w:startOverride w:val="1"/>
+    </w:lvlOverride>
+    <w:lvlOverride w:ilvl="2">
+      <w:startOverride w:val="1"/>
+    </w:lvlOverride>
+    <w:lvlOverride w:ilvl="3">
+      <w:startOverride w:val="1"/>
+    </w:lvlOverride>
+    <w:lvlOverride w:ilvl="4">
+      <w:startOverride w:val="1"/>
+    </w:lvlOverride>
+    <w:lvlOverride w:ilvl="5">
+      <w:startOverride w:val="1"/>
+    </w:lvlOverride>
+    <w:lvlOverride w:ilvl="6">
+      <w:startOverride w:val="1"/>
+    </w:lvlOverride>
+    <w:lvlOverride w:ilvl="7">
+      <w:startOverride w:val="1"/>
+    </w:lvlOverride>
+    <w:lvlOverride w:ilvl="8">
+      <w:startOverride w:val="1"/>
+    </w:lvlOverride>
+  </w:num>
+  <w:num w:numId="1186">
+    <w:abstractNumId w:val="99411"/>
+    <w:lvlOverride w:ilvl="0">
+      <w:startOverride w:val="1"/>
+    </w:lvlOverride>
+    <w:lvlOverride w:ilvl="1">
+      <w:startOverride w:val="1"/>
+    </w:lvlOverride>
+    <w:lvlOverride w:ilvl="2">
+      <w:startOverride w:val="1"/>
+    </w:lvlOverride>
+    <w:lvlOverride w:ilvl="3">
+      <w:startOverride w:val="1"/>
+    </w:lvlOverride>
+    <w:lvlOverride w:ilvl="4">
+      <w:startOverride w:val="1"/>
+    </w:lvlOverride>
+    <w:lvlOverride w:ilvl="5">
+      <w:startOverride w:val="1"/>
+    </w:lvlOverride>
+    <w:lvlOverride w:ilvl="6">
+      <w:startOverride w:val="1"/>
+    </w:lvlOverride>
+    <w:lvlOverride w:ilvl="7">
+      <w:startOverride w:val="1"/>
+    </w:lvlOverride>
+    <w:lvlOverride w:ilvl="8">
+      <w:startOverride w:val="1"/>
+    </w:lvlOverride>
+  </w:num>
+  <w:num w:numId="1187">
     <w:abstractNumId w:val="991"/>
   </w:num>
 </w:numbering>

</xml_diff>

<commit_message>
Deploying to gh-pages from @ Morrison-Lab/wai@77d875bd9737e5af1ea242911aa0cd17e4443c85 🚀
</commit_message>
<xml_diff>
--- a/chapters/coding-agents.docx
+++ b/chapters/coding-agents.docx
@@ -15,7 +15,7 @@
         <w:pStyle w:val="Date"/>
       </w:pPr>
       <w:r>
-        <w:t xml:space="preserve">Last modified: 2026-09-01 13:06:56 (PDT)</w:t>
+        <w:t xml:space="preserve">Last modified: 2026-09-01 13:54:49 (PDT)</w:t>
       </w:r>
     </w:p>
     <w:p>
@@ -67720,62 +67720,32 @@
     </w:p>
     <w:bookmarkEnd w:id="472"/>
     <w:bookmarkEnd w:id="473"/>
-    <w:bookmarkStart w:id="481" w:name="sec-ai-gemini-spend-management"/>
+    <w:bookmarkStart w:id="479" w:name="sec-ai-oh-my-opencode"/>
     <w:p>
       <w:pPr>
         <w:pStyle w:val="Heading1"/>
       </w:pPr>
       <w:r>
-        <w:t xml:space="preserve">47. Managing Gemini API Spend and Cost Optimization</w:t>
+        <w:t xml:space="preserve">47. Multi-Agent Orchestration with Oh My OpenCode / Oh My OpenAgent</w:t>
       </w:r>
     </w:p>
     <w:p>
       <w:pPr>
         <w:pStyle w:val="FirstParagraph"/>
       </w:pPr>
-      <w:r>
-        <w:t xml:space="preserve">This guide describes how to manage Google AI Studio and Google Cloud Gemini API spend caps,</w:t>
-      </w:r>
-      <w:r>
-        <w:t xml:space="preserve"> </w:t>
-      </w:r>
-      <w:r>
-        <w:t xml:space="preserve">unpause paused API services,</w:t>
-      </w:r>
-      <w:r>
-        <w:t xml:space="preserve"> </w:t>
-      </w:r>
-      <w:r>
-        <w:t xml:space="preserve">and optimize token consumption across local tools and GitHub Actions workflows.</w:t>
-      </w:r>
-    </w:p>
-    <w:bookmarkStart w:id="475" w:name="Xd8c10be17edf039db5b664720f228274181ba18"/>
-    <w:p>
-      <w:pPr>
-        <w:pStyle w:val="Heading4"/>
-      </w:pPr>
-      <w:r>
-        <w:t xml:space="preserve">Identifying Paused Projects (Project Numbers vs. Friendly Names)</w:t>
-      </w:r>
-    </w:p>
-    <w:p>
-      <w:pPr>
-        <w:pStyle w:val="FirstParagraph"/>
-      </w:pPr>
-      <w:r>
-        <w:t xml:space="preserve">When a project reaches its monthly budget limit,</w:t>
-      </w:r>
-      <w:r>
-        <w:t xml:space="preserve"> </w:t>
-      </w:r>
-      <w:r>
-        <w:t xml:space="preserve">Google sends an email notification stating that Gemini API service has been paused.</w:t>
-      </w:r>
-      <w:r>
-        <w:t xml:space="preserve"> </w:t>
-      </w:r>
-      <w:r>
-        <w:t xml:space="preserve">These email notifications identify the affected project using its internal</w:t>
+      <w:hyperlink r:id="rId474">
+        <w:r>
+          <w:rPr>
+            <w:rStyle w:val="VerbatimChar"/>
+          </w:rPr>
+          <w:t xml:space="preserve">code-yeongyu/oh-my-openagent</w:t>
+        </w:r>
+      </w:hyperlink>
+      <w:r>
+        <w:t xml:space="preserve"> </w:t>
+      </w:r>
+      <w:r>
+        <w:t xml:space="preserve">(originally published as</w:t>
       </w:r>
       <w:r>
         <w:t xml:space="preserve"> </w:t>
@@ -67785,6 +67755,797 @@
           <w:b/>
           <w:bCs/>
         </w:rPr>
+        <w:t xml:space="preserve">Oh My OpenCode</w:t>
+      </w:r>
+      <w:r>
+        <w:t xml:space="preserve"> </w:t>
+      </w:r>
+      <w:r>
+        <w:t xml:space="preserve">or</w:t>
+      </w:r>
+      <w:r>
+        <w:t xml:space="preserve"> </w:t>
+      </w:r>
+      <w:r>
+        <w:rPr>
+          <w:rStyle w:val="VerbatimChar"/>
+        </w:rPr>
+        <w:t xml:space="preserve">omo</w:t>
+      </w:r>
+      <w:r>
+        <w:t xml:space="preserve">,</w:t>
+      </w:r>
+      <w:r>
+        <w:t xml:space="preserve"> </w:t>
+      </w:r>
+      <w:r>
+        <w:t xml:space="preserve">with community forks such as</w:t>
+      </w:r>
+      <w:r>
+        <w:t xml:space="preserve"> </w:t>
+      </w:r>
+      <w:hyperlink r:id="rId475">
+        <w:r>
+          <w:rPr>
+            <w:rStyle w:val="VerbatimChar"/>
+          </w:rPr>
+          <w:t xml:space="preserve">opensoft/oh-my-opencode</w:t>
+        </w:r>
+      </w:hyperlink>
+      <w:r>
+        <w:t xml:space="preserve">)</w:t>
+      </w:r>
+      <w:r>
+        <w:t xml:space="preserve"> </w:t>
+      </w:r>
+      <w:r>
+        <w:t xml:space="preserve">is an open-source multi-agent orchestration framework and plugin</w:t>
+      </w:r>
+      <w:r>
+        <w:t xml:space="preserve"> </w:t>
+      </w:r>
+      <w:r>
+        <w:t xml:space="preserve">for AI coding agent harnesses (including OpenCode and OpenAI Codex CLI)</w:t>
+      </w:r>
+      <w:r>
+        <w:t xml:space="preserve"> </w:t>
+      </w:r>
+      <w:r>
+        <w:t xml:space="preserve">with over 65,000 GitHub stars</w:t>
+      </w:r>
+      <w:r>
+        <w:t xml:space="preserve"> </w:t>
+      </w:r>
+      <w:r>
+        <w:t xml:space="preserve">(measured 2026-09-01).</w:t>
+      </w:r>
+      <w:r>
+        <w:t xml:space="preserve"> </w:t>
+      </w:r>
+      <w:r>
+        <w:t xml:space="preserve">Inspired by modular terminal configuration frameworks</w:t>
+      </w:r>
+      <w:r>
+        <w:t xml:space="preserve"> </w:t>
+      </w:r>
+      <w:r>
+        <w:t xml:space="preserve">(such as</w:t>
+      </w:r>
+      <w:r>
+        <w:t xml:space="preserve"> </w:t>
+      </w:r>
+      <w:hyperlink r:id="rId432">
+        <w:r>
+          <w:rPr>
+            <w:rStyle w:val="Hyperlink"/>
+          </w:rPr>
+          <w:t xml:space="preserve">Oh My Zsh</w:t>
+        </w:r>
+      </w:hyperlink>
+      <w:r>
+        <w:t xml:space="preserve">),</w:t>
+      </w:r>
+      <w:r>
+        <w:t xml:space="preserve"> </w:t>
+      </w:r>
+      <w:r>
+        <w:t xml:space="preserve">it expands single-agent coding into a specialized multi-agent system</w:t>
+      </w:r>
+      <w:r>
+        <w:t xml:space="preserve"> </w:t>
+      </w:r>
+      <w:r>
+        <w:t xml:space="preserve">with automated model routing and background task execution.</w:t>
+      </w:r>
+    </w:p>
+    <w:bookmarkStart w:id="476" w:name="hub-and-spoke-agent-architecture"/>
+    <w:p>
+      <w:pPr>
+        <w:pStyle w:val="Heading4"/>
+      </w:pPr>
+      <w:r>
+        <w:t xml:space="preserve">Hub-and-spoke agent architecture</w:t>
+      </w:r>
+    </w:p>
+    <w:p>
+      <w:pPr>
+        <w:pStyle w:val="FirstParagraph"/>
+      </w:pPr>
+      <w:r>
+        <w:t xml:space="preserve">Rather than relying on a single generalist agent to perform all research, design, coding, and review steps,</w:t>
+      </w:r>
+      <w:r>
+        <w:t xml:space="preserve"> </w:t>
+      </w:r>
+      <w:r>
+        <w:t xml:space="preserve">the framework implements a hub-and-spoke delegation model</w:t>
+      </w:r>
+      <w:r>
+        <w:t xml:space="preserve"> </w:t>
+      </w:r>
+      <w:r>
+        <w:t xml:space="preserve">with specialized agent personas:</w:t>
+      </w:r>
+    </w:p>
+    <w:p>
+      <w:pPr>
+        <w:pStyle w:val="Compact"/>
+        <w:numPr>
+          <w:ilvl w:val="0"/>
+          <w:numId w:val="1191"/>
+        </w:numPr>
+      </w:pPr>
+      <w:r>
+        <w:rPr>
+          <w:b/>
+          <w:bCs/>
+        </w:rPr>
+        <w:t xml:space="preserve">Sisyphus (Primary Orchestrator &amp; Task Lead)</w:t>
+      </w:r>
+      <w:r>
+        <w:t xml:space="preserve">:</w:t>
+      </w:r>
+      <w:r>
+        <w:t xml:space="preserve"> </w:t>
+      </w:r>
+      <w:r>
+        <w:t xml:space="preserve">Acts as the lead coordinator that breaks complex user requests into discrete work packages,</w:t>
+      </w:r>
+      <w:r>
+        <w:t xml:space="preserve"> </w:t>
+      </w:r>
+      <w:r>
+        <w:t xml:space="preserve">delegates subtasks to specialized agents, and aggregates results into a coherent solution.</w:t>
+      </w:r>
+    </w:p>
+    <w:p>
+      <w:pPr>
+        <w:pStyle w:val="Compact"/>
+        <w:numPr>
+          <w:ilvl w:val="0"/>
+          <w:numId w:val="1191"/>
+        </w:numPr>
+      </w:pPr>
+      <w:r>
+        <w:rPr>
+          <w:b/>
+          <w:bCs/>
+        </w:rPr>
+        <w:t xml:space="preserve">Prometheus (Strategic Planner)</w:t>
+      </w:r>
+      <w:r>
+        <w:t xml:space="preserve">:</w:t>
+      </w:r>
+      <w:r>
+        <w:t xml:space="preserve"> </w:t>
+      </w:r>
+      <w:r>
+        <w:t xml:space="preserve">Interviews the user to clarify scope and ambiguities,</w:t>
+      </w:r>
+      <w:r>
+        <w:t xml:space="preserve"> </w:t>
+      </w:r>
+      <w:r>
+        <w:t xml:space="preserve">formulating detailed implementation plans before code modifications begin.</w:t>
+      </w:r>
+    </w:p>
+    <w:p>
+      <w:pPr>
+        <w:pStyle w:val="Compact"/>
+        <w:numPr>
+          <w:ilvl w:val="0"/>
+          <w:numId w:val="1191"/>
+        </w:numPr>
+      </w:pPr>
+      <w:r>
+        <w:rPr>
+          <w:b/>
+          <w:bCs/>
+        </w:rPr>
+        <w:t xml:space="preserve">Metis (Pre-Planning Gap Analyzer)</w:t>
+      </w:r>
+      <w:r>
+        <w:t xml:space="preserve">:</w:t>
+      </w:r>
+      <w:r>
+        <w:t xml:space="preserve"> </w:t>
+      </w:r>
+      <w:r>
+        <w:t xml:space="preserve">Conducts pre-planning analysis alongside Prometheus to identify hidden requirements,</w:t>
+      </w:r>
+      <w:r>
+        <w:t xml:space="preserve"> </w:t>
+      </w:r>
+      <w:r>
+        <w:t xml:space="preserve">ambiguities, and potential failure points before plans are finalized.</w:t>
+      </w:r>
+    </w:p>
+    <w:p>
+      <w:pPr>
+        <w:pStyle w:val="Compact"/>
+        <w:numPr>
+          <w:ilvl w:val="0"/>
+          <w:numId w:val="1191"/>
+        </w:numPr>
+      </w:pPr>
+      <w:r>
+        <w:rPr>
+          <w:b/>
+          <w:bCs/>
+        </w:rPr>
+        <w:t xml:space="preserve">Momus (Plan Reviewer)</w:t>
+      </w:r>
+      <w:r>
+        <w:t xml:space="preserve">:</w:t>
+      </w:r>
+      <w:r>
+        <w:t xml:space="preserve"> </w:t>
+      </w:r>
+      <w:r>
+        <w:t xml:space="preserve">Validates proposed execution plans against clarity, verification,</w:t>
+      </w:r>
+      <w:r>
+        <w:t xml:space="preserve"> </w:t>
+      </w:r>
+      <w:r>
+        <w:t xml:space="preserve">and context criteria before execution.</w:t>
+      </w:r>
+    </w:p>
+    <w:p>
+      <w:pPr>
+        <w:pStyle w:val="Compact"/>
+        <w:numPr>
+          <w:ilvl w:val="0"/>
+          <w:numId w:val="1191"/>
+        </w:numPr>
+      </w:pPr>
+      <w:r>
+        <w:rPr>
+          <w:b/>
+          <w:bCs/>
+        </w:rPr>
+        <w:t xml:space="preserve">Atlas (Plan Executor)</w:t>
+      </w:r>
+      <w:r>
+        <w:t xml:space="preserve">:</w:t>
+      </w:r>
+      <w:r>
+        <w:t xml:space="preserve"> </w:t>
+      </w:r>
+      <w:r>
+        <w:t xml:space="preserve">Executes approved Prometheus plans step-by-step,</w:t>
+      </w:r>
+      <w:r>
+        <w:t xml:space="preserve"> </w:t>
+      </w:r>
+      <w:r>
+        <w:t xml:space="preserve">managing task progress and session continuity across execution sessions.</w:t>
+      </w:r>
+    </w:p>
+    <w:p>
+      <w:pPr>
+        <w:pStyle w:val="Compact"/>
+        <w:numPr>
+          <w:ilvl w:val="0"/>
+          <w:numId w:val="1191"/>
+        </w:numPr>
+      </w:pPr>
+      <w:r>
+        <w:rPr>
+          <w:b/>
+          <w:bCs/>
+        </w:rPr>
+        <w:t xml:space="preserve">Hephaestus (Autonomous Deep Worker)</w:t>
+      </w:r>
+      <w:r>
+        <w:t xml:space="preserve">:</w:t>
+      </w:r>
+      <w:r>
+        <w:t xml:space="preserve"> </w:t>
+      </w:r>
+      <w:r>
+        <w:t xml:space="preserve">Specializes in autonomous architectural refactoring and complex multi-file debugging.</w:t>
+      </w:r>
+    </w:p>
+    <w:p>
+      <w:pPr>
+        <w:pStyle w:val="Compact"/>
+        <w:numPr>
+          <w:ilvl w:val="0"/>
+          <w:numId w:val="1191"/>
+        </w:numPr>
+      </w:pPr>
+      <w:r>
+        <w:rPr>
+          <w:b/>
+          <w:bCs/>
+        </w:rPr>
+        <w:t xml:space="preserve">Oracle (Architecture &amp; Debugging Consultant)</w:t>
+      </w:r>
+      <w:r>
+        <w:t xml:space="preserve">:</w:t>
+      </w:r>
+      <w:r>
+        <w:t xml:space="preserve"> </w:t>
+      </w:r>
+      <w:r>
+        <w:t xml:space="preserve">Serves as a read-only architecture and deep debugging consultant,</w:t>
+      </w:r>
+      <w:r>
+        <w:t xml:space="preserve"> </w:t>
+      </w:r>
+      <w:r>
+        <w:t xml:space="preserve">analyzing system design trade-offs and diagnosing subtle runtime failures.</w:t>
+      </w:r>
+    </w:p>
+    <w:p>
+      <w:pPr>
+        <w:pStyle w:val="Compact"/>
+        <w:numPr>
+          <w:ilvl w:val="0"/>
+          <w:numId w:val="1191"/>
+        </w:numPr>
+      </w:pPr>
+      <w:r>
+        <w:rPr>
+          <w:b/>
+          <w:bCs/>
+        </w:rPr>
+        <w:t xml:space="preserve">Librarian (Documentation &amp; Code Search)</w:t>
+      </w:r>
+      <w:r>
+        <w:t xml:space="preserve">:</w:t>
+      </w:r>
+      <w:r>
+        <w:t xml:space="preserve"> </w:t>
+      </w:r>
+      <w:r>
+        <w:t xml:space="preserve">Conducts targeted external documentation lookups and code search</w:t>
+      </w:r>
+      <w:r>
+        <w:t xml:space="preserve"> </w:t>
+      </w:r>
+      <w:r>
+        <w:t xml:space="preserve">to supply focused context without bloating the orchestrator’s context window.</w:t>
+      </w:r>
+    </w:p>
+    <w:p>
+      <w:pPr>
+        <w:pStyle w:val="Compact"/>
+        <w:numPr>
+          <w:ilvl w:val="0"/>
+          <w:numId w:val="1191"/>
+        </w:numPr>
+      </w:pPr>
+      <w:r>
+        <w:rPr>
+          <w:b/>
+          <w:bCs/>
+        </w:rPr>
+        <w:t xml:space="preserve">Explore (Codebase Navigation &amp; Fast Grep)</w:t>
+      </w:r>
+      <w:r>
+        <w:t xml:space="preserve">:</w:t>
+      </w:r>
+      <w:r>
+        <w:t xml:space="preserve"> </w:t>
+      </w:r>
+      <w:r>
+        <w:t xml:space="preserve">Specializes in fast pattern searches, codebase navigation,</w:t>
+      </w:r>
+      <w:r>
+        <w:t xml:space="preserve"> </w:t>
+      </w:r>
+      <w:r>
+        <w:t xml:space="preserve">and file structure discovery.</w:t>
+      </w:r>
+    </w:p>
+    <w:bookmarkEnd w:id="476"/>
+    <w:bookmarkStart w:id="477" w:name="heterogeneous-model-routing"/>
+    <w:p>
+      <w:pPr>
+        <w:pStyle w:val="Heading4"/>
+      </w:pPr>
+      <w:r>
+        <w:t xml:space="preserve">Heterogeneous model routing</w:t>
+      </w:r>
+    </w:p>
+    <w:p>
+      <w:pPr>
+        <w:pStyle w:val="FirstParagraph"/>
+      </w:pPr>
+      <w:r>
+        <w:t xml:space="preserve">A central capability of the framework is decoupling agent roles from a single model provider.</w:t>
+      </w:r>
+      <w:r>
+        <w:t xml:space="preserve"> </w:t>
+      </w:r>
+      <w:r>
+        <w:t xml:space="preserve">Developers can route distinct tasks to the model family best suited for each workload:</w:t>
+      </w:r>
+    </w:p>
+    <w:p>
+      <w:pPr>
+        <w:pStyle w:val="Compact"/>
+        <w:numPr>
+          <w:ilvl w:val="0"/>
+          <w:numId w:val="1192"/>
+        </w:numPr>
+      </w:pPr>
+      <w:r>
+        <w:rPr>
+          <w:b/>
+          <w:bCs/>
+        </w:rPr>
+        <w:t xml:space="preserve">High-reasoning tiers</w:t>
+      </w:r>
+      <w:r>
+        <w:t xml:space="preserve"> </w:t>
+      </w:r>
+      <w:r>
+        <w:t xml:space="preserve">(such as Anthropic Claude Sonnet or Opus) for architectural planning and deep refactoring.</w:t>
+      </w:r>
+    </w:p>
+    <w:p>
+      <w:pPr>
+        <w:pStyle w:val="Compact"/>
+        <w:numPr>
+          <w:ilvl w:val="0"/>
+          <w:numId w:val="1192"/>
+        </w:numPr>
+      </w:pPr>
+      <w:r>
+        <w:rPr>
+          <w:b/>
+          <w:bCs/>
+        </w:rPr>
+        <w:t xml:space="preserve">High-throughput models</w:t>
+      </w:r>
+      <w:r>
+        <w:t xml:space="preserve"> </w:t>
+      </w:r>
+      <w:r>
+        <w:t xml:space="preserve">(such as OpenAI GPT models) for rapid code generation and unit testing.</w:t>
+      </w:r>
+    </w:p>
+    <w:p>
+      <w:pPr>
+        <w:pStyle w:val="Compact"/>
+        <w:numPr>
+          <w:ilvl w:val="0"/>
+          <w:numId w:val="1192"/>
+        </w:numPr>
+      </w:pPr>
+      <w:r>
+        <w:rPr>
+          <w:b/>
+          <w:bCs/>
+        </w:rPr>
+        <w:t xml:space="preserve">Large-context models</w:t>
+      </w:r>
+      <w:r>
+        <w:t xml:space="preserve"> </w:t>
+      </w:r>
+      <w:r>
+        <w:t xml:space="preserve">(such as Google Gemini) for extensive repository research and multi-file context indexing.</w:t>
+      </w:r>
+    </w:p>
+    <w:bookmarkEnd w:id="477"/>
+    <w:bookmarkStart w:id="478" w:name="operational-capabilities"/>
+    <w:p>
+      <w:pPr>
+        <w:pStyle w:val="Heading4"/>
+      </w:pPr>
+      <w:r>
+        <w:t xml:space="preserve">Operational capabilities</w:t>
+      </w:r>
+    </w:p>
+    <w:tbl>
+      <w:tblPr>
+        <w:tblStyle w:val="Table"/>
+        <w:tblW w:type="pct" w:w="5000"/>
+        <w:tblLayout w:type="fixed"/>
+        <w:tblLook w:firstRow="1" w:lastRow="0" w:firstColumn="0" w:lastColumn="0" w:noHBand="0" w:noVBand="0" w:val="0020"/>
+      </w:tblPr>
+      <w:tblGrid>
+        <w:gridCol w:w="2640"/>
+        <w:gridCol w:w="2640"/>
+        <w:gridCol w:w="2640"/>
+      </w:tblGrid>
+      <w:tr>
+        <w:trPr>
+          <w:tblHeader w:val="on"/>
+        </w:trPr>
+        <w:tc>
+          <w:tcPr/>
+          <w:p>
+            <w:pPr>
+              <w:pStyle w:val="Compact"/>
+            </w:pPr>
+            <w:r>
+              <w:t xml:space="preserve">Dimension</w:t>
+            </w:r>
+          </w:p>
+        </w:tc>
+        <w:tc>
+          <w:tcPr/>
+          <w:p>
+            <w:pPr>
+              <w:pStyle w:val="Compact"/>
+            </w:pPr>
+            <w:r>
+              <w:t xml:space="preserve">Standard OpenCode</w:t>
+            </w:r>
+          </w:p>
+        </w:tc>
+        <w:tc>
+          <w:tcPr/>
+          <w:p>
+            <w:pPr>
+              <w:pStyle w:val="Compact"/>
+            </w:pPr>
+            <w:r>
+              <w:t xml:space="preserve">Oh My OpenCode / Oh My OpenAgent</w:t>
+            </w:r>
+          </w:p>
+        </w:tc>
+      </w:tr>
+      <w:tr>
+        <w:tc>
+          <w:tcPr/>
+          <w:p>
+            <w:pPr>
+              <w:pStyle w:val="Compact"/>
+            </w:pPr>
+            <w:r>
+              <w:rPr>
+                <w:b/>
+                <w:bCs/>
+              </w:rPr>
+              <w:t xml:space="preserve">Agent topology</w:t>
+            </w:r>
+          </w:p>
+        </w:tc>
+        <w:tc>
+          <w:tcPr/>
+          <w:p>
+            <w:pPr>
+              <w:pStyle w:val="Compact"/>
+            </w:pPr>
+            <w:r>
+              <w:t xml:space="preserve">Single sequential agent loop</w:t>
+            </w:r>
+          </w:p>
+        </w:tc>
+        <w:tc>
+          <w:tcPr/>
+          <w:p>
+            <w:pPr>
+              <w:pStyle w:val="Compact"/>
+            </w:pPr>
+            <w:r>
+              <w:t xml:space="preserve">Hub-and-spoke multi-agent team</w:t>
+            </w:r>
+          </w:p>
+        </w:tc>
+      </w:tr>
+      <w:tr>
+        <w:tc>
+          <w:tcPr/>
+          <w:p>
+            <w:pPr>
+              <w:pStyle w:val="Compact"/>
+            </w:pPr>
+            <w:r>
+              <w:rPr>
+                <w:b/>
+                <w:bCs/>
+              </w:rPr>
+              <w:t xml:space="preserve">Model routing</w:t>
+            </w:r>
+          </w:p>
+        </w:tc>
+        <w:tc>
+          <w:tcPr/>
+          <w:p>
+            <w:pPr>
+              <w:pStyle w:val="Compact"/>
+            </w:pPr>
+            <w:r>
+              <w:t xml:space="preserve">Single active model per session</w:t>
+            </w:r>
+          </w:p>
+        </w:tc>
+        <w:tc>
+          <w:tcPr/>
+          <w:p>
+            <w:pPr>
+              <w:pStyle w:val="Compact"/>
+            </w:pPr>
+            <w:r>
+              <w:t xml:space="preserve">Dynamic per-agent model assignment</w:t>
+            </w:r>
+          </w:p>
+        </w:tc>
+      </w:tr>
+      <w:tr>
+        <w:tc>
+          <w:tcPr/>
+          <w:p>
+            <w:pPr>
+              <w:pStyle w:val="Compact"/>
+            </w:pPr>
+            <w:r>
+              <w:rPr>
+                <w:b/>
+                <w:bCs/>
+              </w:rPr>
+              <w:t xml:space="preserve">Execution monitoring</w:t>
+            </w:r>
+          </w:p>
+        </w:tc>
+        <w:tc>
+          <w:tcPr/>
+          <w:p>
+            <w:pPr>
+              <w:pStyle w:val="Compact"/>
+            </w:pPr>
+            <w:r>
+              <w:t xml:space="preserve">Standard terminal output</w:t>
+            </w:r>
+          </w:p>
+        </w:tc>
+        <w:tc>
+          <w:tcPr/>
+          <w:p>
+            <w:pPr>
+              <w:pStyle w:val="Compact"/>
+            </w:pPr>
+            <w:r>
+              <w:t xml:space="preserve">Interactive</w:t>
+            </w:r>
+            <w:r>
+              <w:t xml:space="preserve"> </w:t>
+            </w:r>
+            <w:r>
+              <w:rPr>
+                <w:rStyle w:val="VerbatimChar"/>
+              </w:rPr>
+              <w:t xml:space="preserve">tmux</w:t>
+            </w:r>
+            <w:r>
+              <w:t xml:space="preserve">-backed session management</w:t>
+            </w:r>
+          </w:p>
+        </w:tc>
+      </w:tr>
+      <w:tr>
+        <w:tc>
+          <w:tcPr/>
+          <w:p>
+            <w:pPr>
+              <w:pStyle w:val="Compact"/>
+            </w:pPr>
+            <w:r>
+              <w:rPr>
+                <w:b/>
+                <w:bCs/>
+              </w:rPr>
+              <w:t xml:space="preserve">Extensibility</w:t>
+            </w:r>
+          </w:p>
+        </w:tc>
+        <w:tc>
+          <w:tcPr/>
+          <w:p>
+            <w:pPr>
+              <w:pStyle w:val="Compact"/>
+            </w:pPr>
+            <w:r>
+              <w:t xml:space="preserve">Individual plugins and MCPs</w:t>
+            </w:r>
+          </w:p>
+        </w:tc>
+        <w:tc>
+          <w:tcPr/>
+          <w:p>
+            <w:pPr>
+              <w:pStyle w:val="Compact"/>
+            </w:pPr>
+            <w:r>
+              <w:t xml:space="preserve">Curated bundle of tools, agents, and MCP integrations</w:t>
+            </w:r>
+          </w:p>
+        </w:tc>
+      </w:tr>
+    </w:tbl>
+    <w:bookmarkEnd w:id="478"/>
+    <w:bookmarkEnd w:id="479"/>
+    <w:bookmarkStart w:id="487" w:name="sec-ai-gemini-spend-management"/>
+    <w:p>
+      <w:pPr>
+        <w:pStyle w:val="Heading1"/>
+      </w:pPr>
+      <w:r>
+        <w:t xml:space="preserve">48. Managing Gemini API Spend and Cost Optimization</w:t>
+      </w:r>
+    </w:p>
+    <w:p>
+      <w:pPr>
+        <w:pStyle w:val="FirstParagraph"/>
+      </w:pPr>
+      <w:r>
+        <w:t xml:space="preserve">This guide describes how to manage Google AI Studio and Google Cloud Gemini API spend caps,</w:t>
+      </w:r>
+      <w:r>
+        <w:t xml:space="preserve"> </w:t>
+      </w:r>
+      <w:r>
+        <w:t xml:space="preserve">unpause paused API services,</w:t>
+      </w:r>
+      <w:r>
+        <w:t xml:space="preserve"> </w:t>
+      </w:r>
+      <w:r>
+        <w:t xml:space="preserve">and optimize token consumption across local tools and GitHub Actions workflows.</w:t>
+      </w:r>
+    </w:p>
+    <w:bookmarkStart w:id="481" w:name="Xd8c10be17edf039db5b664720f228274181ba18"/>
+    <w:p>
+      <w:pPr>
+        <w:pStyle w:val="Heading4"/>
+      </w:pPr>
+      <w:r>
+        <w:t xml:space="preserve">Identifying Paused Projects (Project Numbers vs. Friendly Names)</w:t>
+      </w:r>
+    </w:p>
+    <w:p>
+      <w:pPr>
+        <w:pStyle w:val="FirstParagraph"/>
+      </w:pPr>
+      <w:r>
+        <w:t xml:space="preserve">When a project reaches its monthly budget limit,</w:t>
+      </w:r>
+      <w:r>
+        <w:t xml:space="preserve"> </w:t>
+      </w:r>
+      <w:r>
+        <w:t xml:space="preserve">Google sends an email notification stating that Gemini API service has been paused.</w:t>
+      </w:r>
+      <w:r>
+        <w:t xml:space="preserve"> </w:t>
+      </w:r>
+      <w:r>
+        <w:t xml:space="preserve">These email notifications identify the affected project using its internal</w:t>
+      </w:r>
+      <w:r>
+        <w:t xml:space="preserve"> </w:t>
+      </w:r>
+      <w:r>
+        <w:rPr>
+          <w:b/>
+          <w:bCs/>
+        </w:rPr>
         <w:t xml:space="preserve">numerical GCP Project Number</w:t>
       </w:r>
       <w:r>
@@ -67813,7 +68574,7 @@
       <w:r>
         <w:t xml:space="preserve"> </w:t>
       </w:r>
-      <w:hyperlink r:id="rId474">
+      <w:hyperlink r:id="rId480">
         <w:r>
           <w:rPr>
             <w:rStyle w:val="Hyperlink"/>
@@ -67899,7 +68660,7 @@
         <w:pStyle w:val="Compact"/>
         <w:numPr>
           <w:ilvl w:val="0"/>
-          <w:numId w:val="1191"/>
+          <w:numId w:val="1193"/>
         </w:numPr>
       </w:pPr>
       <w:r>
@@ -67908,7 +68669,7 @@
       <w:r>
         <w:t xml:space="preserve"> </w:t>
       </w:r>
-      <w:hyperlink r:id="rId474">
+      <w:hyperlink r:id="rId480">
         <w:r>
           <w:rPr>
             <w:rStyle w:val="Hyperlink"/>
@@ -67925,7 +68686,7 @@
         <w:pStyle w:val="Compact"/>
         <w:numPr>
           <w:ilvl w:val="0"/>
-          <w:numId w:val="1191"/>
+          <w:numId w:val="1193"/>
         </w:numPr>
       </w:pPr>
       <w:r>
@@ -67937,15 +68698,15 @@
         <w:pStyle w:val="Compact"/>
         <w:numPr>
           <w:ilvl w:val="0"/>
-          <w:numId w:val="1191"/>
+          <w:numId w:val="1193"/>
         </w:numPr>
       </w:pPr>
       <w:r>
         <w:t xml:space="preserve">Any project that has hit its monthly spend cap will have its API requests paused until the limit is updated.</w:t>
       </w:r>
     </w:p>
-    <w:bookmarkEnd w:id="475"/>
-    <w:bookmarkStart w:id="477" w:name="adjusting-and-unpausing-spend-caps"/>
+    <w:bookmarkEnd w:id="481"/>
+    <w:bookmarkStart w:id="483" w:name="adjusting-and-unpausing-spend-caps"/>
     <w:p>
       <w:pPr>
         <w:pStyle w:val="Heading4"/>
@@ -67967,7 +68728,7 @@
         <w:pStyle w:val="Compact"/>
         <w:numPr>
           <w:ilvl w:val="0"/>
-          <w:numId w:val="1192"/>
+          <w:numId w:val="1194"/>
         </w:numPr>
       </w:pPr>
       <w:r>
@@ -67976,7 +68737,7 @@
       <w:r>
         <w:t xml:space="preserve"> </w:t>
       </w:r>
-      <w:hyperlink r:id="rId476">
+      <w:hyperlink r:id="rId482">
         <w:r>
           <w:rPr>
             <w:rStyle w:val="Hyperlink"/>
@@ -67993,7 +68754,7 @@
         <w:pStyle w:val="Compact"/>
         <w:numPr>
           <w:ilvl w:val="0"/>
-          <w:numId w:val="1192"/>
+          <w:numId w:val="1194"/>
         </w:numPr>
       </w:pPr>
       <w:r>
@@ -68005,7 +68766,7 @@
         <w:pStyle w:val="Compact"/>
         <w:numPr>
           <w:ilvl w:val="0"/>
-          <w:numId w:val="1192"/>
+          <w:numId w:val="1194"/>
         </w:numPr>
       </w:pPr>
       <w:r>
@@ -68045,8 +68806,8 @@
         <w:t xml:space="preserve">and API service automatically resumes up to the configured cap.</w:t>
       </w:r>
     </w:p>
-    <w:bookmarkEnd w:id="477"/>
-    <w:bookmarkStart w:id="479" w:name="setting-up-google-cloud-budget-alerts"/>
+    <w:bookmarkEnd w:id="483"/>
+    <w:bookmarkStart w:id="485" w:name="setting-up-google-cloud-budget-alerts"/>
     <w:p>
       <w:pPr>
         <w:pStyle w:val="Heading4"/>
@@ -68068,7 +68829,7 @@
         <w:pStyle w:val="Compact"/>
         <w:numPr>
           <w:ilvl w:val="0"/>
-          <w:numId w:val="1193"/>
+          <w:numId w:val="1195"/>
         </w:numPr>
       </w:pPr>
       <w:r>
@@ -68077,7 +68838,7 @@
       <w:r>
         <w:t xml:space="preserve"> </w:t>
       </w:r>
-      <w:hyperlink r:id="rId478">
+      <w:hyperlink r:id="rId484">
         <w:r>
           <w:rPr>
             <w:rStyle w:val="Hyperlink"/>
@@ -68094,7 +68855,7 @@
         <w:pStyle w:val="Compact"/>
         <w:numPr>
           <w:ilvl w:val="0"/>
-          <w:numId w:val="1193"/>
+          <w:numId w:val="1195"/>
         </w:numPr>
       </w:pPr>
       <w:r>
@@ -68119,7 +68880,7 @@
         <w:pStyle w:val="Compact"/>
         <w:numPr>
           <w:ilvl w:val="0"/>
-          <w:numId w:val="1193"/>
+          <w:numId w:val="1195"/>
         </w:numPr>
       </w:pPr>
       <w:r>
@@ -68143,7 +68904,7 @@
         <w:pStyle w:val="Compact"/>
         <w:numPr>
           <w:ilvl w:val="0"/>
-          <w:numId w:val="1193"/>
+          <w:numId w:val="1195"/>
         </w:numPr>
       </w:pPr>
       <w:r>
@@ -68155,7 +68916,7 @@
         <w:pStyle w:val="Compact"/>
         <w:numPr>
           <w:ilvl w:val="0"/>
-          <w:numId w:val="1193"/>
+          <w:numId w:val="1195"/>
         </w:numPr>
       </w:pPr>
       <w:r>
@@ -68209,7 +68970,7 @@
         <w:pStyle w:val="Compact"/>
         <w:numPr>
           <w:ilvl w:val="0"/>
-          <w:numId w:val="1193"/>
+          <w:numId w:val="1195"/>
         </w:numPr>
       </w:pPr>
       <w:r>
@@ -68229,8 +68990,8 @@
         <w:t xml:space="preserve">. You will receive email alerts before any project hits its spend cap.</w:t>
       </w:r>
     </w:p>
-    <w:bookmarkEnd w:id="479"/>
-    <w:bookmarkStart w:id="480" w:name="cost-optimization-best-practices"/>
+    <w:bookmarkEnd w:id="485"/>
+    <w:bookmarkStart w:id="486" w:name="cost-optimization-best-practices"/>
     <w:p>
       <w:pPr>
         <w:pStyle w:val="Heading4"/>
@@ -68252,7 +69013,7 @@
         <w:pStyle w:val="Compact"/>
         <w:numPr>
           <w:ilvl w:val="0"/>
-          <w:numId w:val="1194"/>
+          <w:numId w:val="1196"/>
         </w:numPr>
       </w:pPr>
       <w:r>
@@ -68388,7 +69149,7 @@
         <w:pStyle w:val="Compact"/>
         <w:numPr>
           <w:ilvl w:val="0"/>
-          <w:numId w:val="1194"/>
+          <w:numId w:val="1196"/>
         </w:numPr>
       </w:pPr>
       <w:r>
@@ -68419,7 +69180,7 @@
         <w:pStyle w:val="Compact"/>
         <w:numPr>
           <w:ilvl w:val="0"/>
-          <w:numId w:val="1194"/>
+          <w:numId w:val="1196"/>
         </w:numPr>
       </w:pPr>
       <w:r>
@@ -68450,7 +69211,7 @@
         <w:pStyle w:val="Compact"/>
         <w:numPr>
           <w:ilvl w:val="0"/>
-          <w:numId w:val="1194"/>
+          <w:numId w:val="1196"/>
         </w:numPr>
       </w:pPr>
       <w:r>
@@ -68545,9 +69306,9 @@
         <w:t xml:space="preserve">to collapse them in GitHub’s web diff view and exclude them from repository language statistics.</w:t>
       </w:r>
     </w:p>
-    <w:bookmarkEnd w:id="480"/>
-    <w:bookmarkEnd w:id="481"/>
-    <w:bookmarkStart w:id="511" w:name="references"/>
+    <w:bookmarkEnd w:id="486"/>
+    <w:bookmarkEnd w:id="487"/>
+    <w:bookmarkStart w:id="517" w:name="references"/>
     <w:p>
       <w:pPr>
         <w:pStyle w:val="Heading1"/>
@@ -68556,8 +69317,8 @@
         <w:t xml:space="preserve">References</w:t>
       </w:r>
     </w:p>
-    <w:bookmarkStart w:id="510" w:name="refs"/>
-    <w:bookmarkStart w:id="483" w:name="ref-space_odyssey"/>
+    <w:bookmarkStart w:id="516" w:name="refs"/>
+    <w:bookmarkStart w:id="489" w:name="ref-space_odyssey"/>
     <w:p>
       <w:pPr>
         <w:pStyle w:val="Bibliography"/>
@@ -68575,7 +69336,7 @@
       <w:r>
         <w:t xml:space="preserve"> </w:t>
       </w:r>
-      <w:hyperlink r:id="rId482">
+      <w:hyperlink r:id="rId488">
         <w:r>
           <w:rPr>
             <w:rStyle w:val="Hyperlink"/>
@@ -68587,8 +69348,8 @@
         <w:t xml:space="preserve">.</w:t>
       </w:r>
     </w:p>
-    <w:bookmarkEnd w:id="483"/>
-    <w:bookmarkStart w:id="485" w:name="ref-i_robot"/>
+    <w:bookmarkEnd w:id="489"/>
+    <w:bookmarkStart w:id="491" w:name="ref-i_robot"/>
     <w:p>
       <w:pPr>
         <w:pStyle w:val="Bibliography"/>
@@ -68612,7 +69373,7 @@
       <w:r>
         <w:t xml:space="preserve"> </w:t>
       </w:r>
-      <w:hyperlink r:id="rId484">
+      <w:hyperlink r:id="rId490">
         <w:r>
           <w:rPr>
             <w:rStyle w:val="Hyperlink"/>
@@ -68624,8 +69385,8 @@
         <w:t xml:space="preserve">.</w:t>
       </w:r>
     </w:p>
-    <w:bookmarkEnd w:id="485"/>
-    <w:bookmarkStart w:id="487" w:name="ref-battlestar_galactica_2004"/>
+    <w:bookmarkEnd w:id="491"/>
+    <w:bookmarkStart w:id="493" w:name="ref-battlestar_galactica_2004"/>
     <w:p>
       <w:pPr>
         <w:pStyle w:val="Bibliography"/>
@@ -68643,7 +69404,7 @@
       <w:r>
         <w:t xml:space="preserve"> </w:t>
       </w:r>
-      <w:hyperlink r:id="rId486">
+      <w:hyperlink r:id="rId492">
         <w:r>
           <w:rPr>
             <w:rStyle w:val="Hyperlink"/>
@@ -68655,8 +69416,8 @@
         <w:t xml:space="preserve">.</w:t>
       </w:r>
     </w:p>
-    <w:bookmarkEnd w:id="487"/>
-    <w:bookmarkStart w:id="489" w:name="ref-slm_agentic_ai"/>
+    <w:bookmarkEnd w:id="493"/>
+    <w:bookmarkStart w:id="495" w:name="ref-slm_agentic_ai"/>
     <w:p>
       <w:pPr>
         <w:pStyle w:val="Bibliography"/>
@@ -68680,7 +69441,7 @@
       <w:r>
         <w:t xml:space="preserve"> </w:t>
       </w:r>
-      <w:hyperlink r:id="rId488">
+      <w:hyperlink r:id="rId494">
         <w:r>
           <w:rPr>
             <w:rStyle w:val="Hyperlink"/>
@@ -68692,8 +69453,8 @@
         <w:t xml:space="preserve">.</w:t>
       </w:r>
     </w:p>
-    <w:bookmarkEnd w:id="489"/>
-    <w:bookmarkStart w:id="491" w:name="ref-blade_runner"/>
+    <w:bookmarkEnd w:id="495"/>
+    <w:bookmarkStart w:id="497" w:name="ref-blade_runner"/>
     <w:p>
       <w:pPr>
         <w:pStyle w:val="Bibliography"/>
@@ -68711,7 +69472,7 @@
       <w:r>
         <w:t xml:space="preserve"> </w:t>
       </w:r>
-      <w:hyperlink r:id="rId490">
+      <w:hyperlink r:id="rId496">
         <w:r>
           <w:rPr>
             <w:rStyle w:val="Hyperlink"/>
@@ -68723,8 +69484,8 @@
         <w:t xml:space="preserve">.</w:t>
       </w:r>
     </w:p>
-    <w:bookmarkEnd w:id="491"/>
-    <w:bookmarkStart w:id="493" w:name="ref-enders_game"/>
+    <w:bookmarkEnd w:id="497"/>
+    <w:bookmarkStart w:id="499" w:name="ref-enders_game"/>
     <w:p>
       <w:pPr>
         <w:pStyle w:val="Bibliography"/>
@@ -68748,7 +69509,7 @@
       <w:r>
         <w:t xml:space="preserve"> </w:t>
       </w:r>
-      <w:hyperlink r:id="rId492">
+      <w:hyperlink r:id="rId498">
         <w:r>
           <w:rPr>
             <w:rStyle w:val="Hyperlink"/>
@@ -68760,8 +69521,8 @@
         <w:t xml:space="preserve">.</w:t>
       </w:r>
     </w:p>
-    <w:bookmarkEnd w:id="493"/>
-    <w:bookmarkStart w:id="495" w:name="ref-qlora"/>
+    <w:bookmarkEnd w:id="499"/>
+    <w:bookmarkStart w:id="501" w:name="ref-qlora"/>
     <w:p>
       <w:pPr>
         <w:pStyle w:val="Bibliography"/>
@@ -68785,7 +69546,7 @@
       <w:r>
         <w:t xml:space="preserve"> </w:t>
       </w:r>
-      <w:hyperlink r:id="rId494">
+      <w:hyperlink r:id="rId500">
         <w:r>
           <w:rPr>
             <w:rStyle w:val="Hyperlink"/>
@@ -68797,8 +69558,8 @@
         <w:t xml:space="preserve">.</w:t>
       </w:r>
     </w:p>
-    <w:bookmarkEnd w:id="495"/>
-    <w:bookmarkStart w:id="497" w:name="ref-humans_are_dead"/>
+    <w:bookmarkEnd w:id="501"/>
+    <w:bookmarkStart w:id="503" w:name="ref-humans_are_dead"/>
     <w:p>
       <w:pPr>
         <w:pStyle w:val="Bibliography"/>
@@ -68822,7 +69583,7 @@
       <w:r>
         <w:t xml:space="preserve"> </w:t>
       </w:r>
-      <w:hyperlink r:id="rId496">
+      <w:hyperlink r:id="rId502">
         <w:r>
           <w:rPr>
             <w:rStyle w:val="Hyperlink"/>
@@ -68834,8 +69595,8 @@
         <w:t xml:space="preserve">.</w:t>
       </w:r>
     </w:p>
-    <w:bookmarkEnd w:id="497"/>
-    <w:bookmarkStart w:id="499" w:name="ref-dune"/>
+    <w:bookmarkEnd w:id="503"/>
+    <w:bookmarkStart w:id="505" w:name="ref-dune"/>
     <w:p>
       <w:pPr>
         <w:pStyle w:val="Bibliography"/>
@@ -68859,7 +69620,7 @@
       <w:r>
         <w:t xml:space="preserve"> </w:t>
       </w:r>
-      <w:hyperlink r:id="rId498">
+      <w:hyperlink r:id="rId504">
         <w:r>
           <w:rPr>
             <w:rStyle w:val="Hyperlink"/>
@@ -68871,8 +69632,8 @@
         <w:t xml:space="preserve">.</w:t>
       </w:r>
     </w:p>
-    <w:bookmarkEnd w:id="499"/>
-    <w:bookmarkStart w:id="501" w:name="ref-lora"/>
+    <w:bookmarkEnd w:id="505"/>
+    <w:bookmarkStart w:id="507" w:name="ref-lora"/>
     <w:p>
       <w:pPr>
         <w:pStyle w:val="Bibliography"/>
@@ -68896,7 +69657,7 @@
       <w:r>
         <w:t xml:space="preserve"> </w:t>
       </w:r>
-      <w:hyperlink r:id="rId500">
+      <w:hyperlink r:id="rId506">
         <w:r>
           <w:rPr>
             <w:rStyle w:val="Hyperlink"/>
@@ -68908,8 +69669,8 @@
         <w:t xml:space="preserve">.</w:t>
       </w:r>
     </w:p>
-    <w:bookmarkEnd w:id="501"/>
-    <w:bookmarkStart w:id="503" w:name="ref-lecun_world_models"/>
+    <w:bookmarkEnd w:id="507"/>
+    <w:bookmarkStart w:id="509" w:name="ref-lecun_world_models"/>
     <w:p>
       <w:pPr>
         <w:pStyle w:val="Bibliography"/>
@@ -68933,7 +69694,7 @@
       <w:r>
         <w:t xml:space="preserve"> </w:t>
       </w:r>
-      <w:hyperlink r:id="rId502">
+      <w:hyperlink r:id="rId508">
         <w:r>
           <w:rPr>
             <w:rStyle w:val="Hyperlink"/>
@@ -68945,8 +69706,8 @@
         <w:t xml:space="preserve">.</w:t>
       </w:r>
     </w:p>
-    <w:bookmarkEnd w:id="503"/>
-    <w:bookmarkStart w:id="505" w:name="ref-terminator"/>
+    <w:bookmarkEnd w:id="509"/>
+    <w:bookmarkStart w:id="511" w:name="ref-terminator"/>
     <w:p>
       <w:pPr>
         <w:pStyle w:val="Bibliography"/>
@@ -68964,7 +69725,7 @@
       <w:r>
         <w:t xml:space="preserve"> </w:t>
       </w:r>
-      <w:hyperlink r:id="rId504">
+      <w:hyperlink r:id="rId510">
         <w:r>
           <w:rPr>
             <w:rStyle w:val="Hyperlink"/>
@@ -68976,8 +69737,8 @@
         <w:t xml:space="preserve">.</w:t>
       </w:r>
     </w:p>
-    <w:bookmarkEnd w:id="505"/>
-    <w:bookmarkStart w:id="507" w:name="ref-matrix"/>
+    <w:bookmarkEnd w:id="511"/>
+    <w:bookmarkStart w:id="513" w:name="ref-matrix"/>
     <w:p>
       <w:pPr>
         <w:pStyle w:val="Bibliography"/>
@@ -68995,7 +69756,7 @@
       <w:r>
         <w:t xml:space="preserve"> </w:t>
       </w:r>
-      <w:hyperlink r:id="rId506">
+      <w:hyperlink r:id="rId512">
         <w:r>
           <w:rPr>
             <w:rStyle w:val="Hyperlink"/>
@@ -69007,8 +69768,8 @@
         <w:t xml:space="preserve">.</w:t>
       </w:r>
     </w:p>
-    <w:bookmarkEnd w:id="507"/>
-    <w:bookmarkStart w:id="509" w:name="ref-wargames"/>
+    <w:bookmarkEnd w:id="513"/>
+    <w:bookmarkStart w:id="515" w:name="ref-wargames"/>
     <w:p>
       <w:pPr>
         <w:pStyle w:val="Bibliography"/>
@@ -69026,7 +69787,7 @@
       <w:r>
         <w:t xml:space="preserve"> </w:t>
       </w:r>
-      <w:hyperlink r:id="rId508">
+      <w:hyperlink r:id="rId514">
         <w:r>
           <w:rPr>
             <w:rStyle w:val="Hyperlink"/>
@@ -69038,9 +69799,9 @@
         <w:t xml:space="preserve">.</w:t>
       </w:r>
     </w:p>
-    <w:bookmarkEnd w:id="509"/>
-    <w:bookmarkEnd w:id="510"/>
-    <w:bookmarkEnd w:id="511"/>
+    <w:bookmarkEnd w:id="515"/>
+    <w:bookmarkEnd w:id="516"/>
+    <w:bookmarkEnd w:id="517"/>
     <w:sectPr>
       <w:footnotePr>
         <w:numRestart w:val="eachSect"/>
@@ -70634,64 +71395,10 @@
     <w:abstractNumId w:val="991"/>
   </w:num>
   <w:num w:numId="1191">
-    <w:abstractNumId w:val="99411"/>
-    <w:lvlOverride w:ilvl="0">
-      <w:startOverride w:val="1"/>
-    </w:lvlOverride>
-    <w:lvlOverride w:ilvl="1">
-      <w:startOverride w:val="1"/>
-    </w:lvlOverride>
-    <w:lvlOverride w:ilvl="2">
-      <w:startOverride w:val="1"/>
-    </w:lvlOverride>
-    <w:lvlOverride w:ilvl="3">
-      <w:startOverride w:val="1"/>
-    </w:lvlOverride>
-    <w:lvlOverride w:ilvl="4">
-      <w:startOverride w:val="1"/>
-    </w:lvlOverride>
-    <w:lvlOverride w:ilvl="5">
-      <w:startOverride w:val="1"/>
-    </w:lvlOverride>
-    <w:lvlOverride w:ilvl="6">
-      <w:startOverride w:val="1"/>
-    </w:lvlOverride>
-    <w:lvlOverride w:ilvl="7">
-      <w:startOverride w:val="1"/>
-    </w:lvlOverride>
-    <w:lvlOverride w:ilvl="8">
-      <w:startOverride w:val="1"/>
-    </w:lvlOverride>
+    <w:abstractNumId w:val="991"/>
   </w:num>
   <w:num w:numId="1192">
-    <w:abstractNumId w:val="99411"/>
-    <w:lvlOverride w:ilvl="0">
-      <w:startOverride w:val="1"/>
-    </w:lvlOverride>
-    <w:lvlOverride w:ilvl="1">
-      <w:startOverride w:val="1"/>
-    </w:lvlOverride>
-    <w:lvlOverride w:ilvl="2">
-      <w:startOverride w:val="1"/>
-    </w:lvlOverride>
-    <w:lvlOverride w:ilvl="3">
-      <w:startOverride w:val="1"/>
-    </w:lvlOverride>
-    <w:lvlOverride w:ilvl="4">
-      <w:startOverride w:val="1"/>
-    </w:lvlOverride>
-    <w:lvlOverride w:ilvl="5">
-      <w:startOverride w:val="1"/>
-    </w:lvlOverride>
-    <w:lvlOverride w:ilvl="6">
-      <w:startOverride w:val="1"/>
-    </w:lvlOverride>
-    <w:lvlOverride w:ilvl="7">
-      <w:startOverride w:val="1"/>
-    </w:lvlOverride>
-    <w:lvlOverride w:ilvl="8">
-      <w:startOverride w:val="1"/>
-    </w:lvlOverride>
+    <w:abstractNumId w:val="991"/>
   </w:num>
   <w:num w:numId="1193">
     <w:abstractNumId w:val="99411"/>
@@ -70724,6 +71431,66 @@
     </w:lvlOverride>
   </w:num>
   <w:num w:numId="1194">
+    <w:abstractNumId w:val="99411"/>
+    <w:lvlOverride w:ilvl="0">
+      <w:startOverride w:val="1"/>
+    </w:lvlOverride>
+    <w:lvlOverride w:ilvl="1">
+      <w:startOverride w:val="1"/>
+    </w:lvlOverride>
+    <w:lvlOverride w:ilvl="2">
+      <w:startOverride w:val="1"/>
+    </w:lvlOverride>
+    <w:lvlOverride w:ilvl="3">
+      <w:startOverride w:val="1"/>
+    </w:lvlOverride>
+    <w:lvlOverride w:ilvl="4">
+      <w:startOverride w:val="1"/>
+    </w:lvlOverride>
+    <w:lvlOverride w:ilvl="5">
+      <w:startOverride w:val="1"/>
+    </w:lvlOverride>
+    <w:lvlOverride w:ilvl="6">
+      <w:startOverride w:val="1"/>
+    </w:lvlOverride>
+    <w:lvlOverride w:ilvl="7">
+      <w:startOverride w:val="1"/>
+    </w:lvlOverride>
+    <w:lvlOverride w:ilvl="8">
+      <w:startOverride w:val="1"/>
+    </w:lvlOverride>
+  </w:num>
+  <w:num w:numId="1195">
+    <w:abstractNumId w:val="99411"/>
+    <w:lvlOverride w:ilvl="0">
+      <w:startOverride w:val="1"/>
+    </w:lvlOverride>
+    <w:lvlOverride w:ilvl="1">
+      <w:startOverride w:val="1"/>
+    </w:lvlOverride>
+    <w:lvlOverride w:ilvl="2">
+      <w:startOverride w:val="1"/>
+    </w:lvlOverride>
+    <w:lvlOverride w:ilvl="3">
+      <w:startOverride w:val="1"/>
+    </w:lvlOverride>
+    <w:lvlOverride w:ilvl="4">
+      <w:startOverride w:val="1"/>
+    </w:lvlOverride>
+    <w:lvlOverride w:ilvl="5">
+      <w:startOverride w:val="1"/>
+    </w:lvlOverride>
+    <w:lvlOverride w:ilvl="6">
+      <w:startOverride w:val="1"/>
+    </w:lvlOverride>
+    <w:lvlOverride w:ilvl="7">
+      <w:startOverride w:val="1"/>
+    </w:lvlOverride>
+    <w:lvlOverride w:ilvl="8">
+      <w:startOverride w:val="1"/>
+    </w:lvlOverride>
+  </w:num>
+  <w:num w:numId="1196">
     <w:abstractNumId w:val="991"/>
   </w:num>
 </w:numbering>

</xml_diff>